<commit_message>
docs: restore requirement traceability and links
</commit_message>
<xml_diff>
--- a/docs/VESKIFY_DEVELOPMENT_DELIVERY_TRACKER_v1.3.0.docx
+++ b/docs/VESKIFY_DEVELOPMENT_DELIVERY_TRACKER_v1.3.0.docx
@@ -335,14 +335,16 @@
               <w:pStyle w:val="TableText"/>
               <w:widowControl/>
             </w:pPr>
-            <w:r>
-              <w:rPr>
-                <w:rFonts w:ascii="Calibri" w:hAnsi="Calibri" w:cs="Calibri"/>
-                <w:color w:val="2E74B5"/>
-                <w:u w:val="single"/>
-              </w:rPr>
-              <w:t>VESKIFY_SDD.md</w:t>
-            </w:r>
+            <w:hyperlink r:id="rIdHyperlink1" w:history="1">
+              <w:r>
+                <w:rPr>
+                  <w:rFonts w:ascii="Calibri" w:hAnsi="Calibri" w:cs="Calibri"/>
+                  <w:color w:val="2E74B5"/>
+                  <w:u w:val="single"/>
+                </w:rPr>
+                <w:t>VESKIFY_SDD.md</w:t>
+              </w:r>
+            </w:hyperlink>
           </w:p>
         </w:tc>
       </w:tr>
@@ -376,14 +378,16 @@
               <w:pStyle w:val="TableText"/>
               <w:widowControl/>
             </w:pPr>
-            <w:r>
-              <w:rPr>
-                <w:rFonts w:ascii="Calibri" w:hAnsi="Calibri" w:cs="Calibri"/>
-                <w:color w:val="2E74B5"/>
-                <w:u w:val="single"/>
-              </w:rPr>
-              <w:t>VESKIFY_DEVELOPMENT_ROADMAP.md</w:t>
-            </w:r>
+            <w:hyperlink r:id="rIdHyperlink2" w:history="1">
+              <w:r>
+                <w:rPr>
+                  <w:rFonts w:ascii="Calibri" w:hAnsi="Calibri" w:cs="Calibri"/>
+                  <w:color w:val="2E74B5"/>
+                  <w:u w:val="single"/>
+                </w:rPr>
+                <w:t>VESKIFY_DEVELOPMENT_ROADMAP.md</w:t>
+              </w:r>
+            </w:hyperlink>
           </w:p>
         </w:tc>
       </w:tr>
@@ -11994,28 +11998,32 @@
         </w:rPr>
         <w:t xml:space="preserve"> </w:t>
       </w:r>
-      <w:r>
-        <w:rPr>
-          <w:rFonts w:ascii="Calibri" w:hAnsi="Calibri" w:cs="Calibri"/>
-          <w:color w:val="2E74B5"/>
-          <w:u w:val="single"/>
-        </w:rPr>
-        <w:t>VESKO_OPENAPI_CONTRACT_AUDIT.md</w:t>
-      </w:r>
+      <w:hyperlink r:id="rIdHyperlink3" w:history="1">
+        <w:r>
+          <w:rPr>
+            <w:rFonts w:ascii="Calibri" w:hAnsi="Calibri" w:cs="Calibri"/>
+            <w:color w:val="2E74B5"/>
+            <w:u w:val="single"/>
+          </w:rPr>
+          <w:t>VESKO_OPENAPI_CONTRACT_AUDIT.md</w:t>
+        </w:r>
+      </w:hyperlink>
       <w:r>
         <w:rPr>
           <w:rFonts w:ascii="Calibri" w:hAnsi="Calibri" w:cs="Calibri"/>
         </w:rPr>
         <w:t xml:space="preserve"> and </w:t>
       </w:r>
-      <w:r>
-        <w:rPr>
-          <w:rFonts w:ascii="Calibri" w:hAnsi="Calibri" w:cs="Calibri"/>
-          <w:color w:val="2E74B5"/>
-          <w:u w:val="single"/>
-        </w:rPr>
-        <w:t>VESKO_VESKIFY_INTEGRATION_MATRIX.md</w:t>
-      </w:r>
+      <w:hyperlink r:id="rIdHyperlink4" w:history="1">
+        <w:r>
+          <w:rPr>
+            <w:rFonts w:ascii="Calibri" w:hAnsi="Calibri" w:cs="Calibri"/>
+            <w:color w:val="2E74B5"/>
+            <w:u w:val="single"/>
+          </w:rPr>
+          <w:t>VESKO_VESKIFY_INTEGRATION_MATRIX.md</w:t>
+        </w:r>
+      </w:hyperlink>
       <w:r>
         <w:rPr>
           <w:rFonts w:ascii="Calibri" w:hAnsi="Calibri" w:cs="Calibri"/>
@@ -15435,6 +15443,17 @@
       <w:szCs w:val="15"/>
     </w:rPr>
   </w:style>
+  <w:style w:type="paragraph" w:styleId="TraceabilityTableText">
+    <w:name w:val="Traceability Table Text"/>
+    <w:basedOn w:val="TableText"/>
+    <w:pPr>
+      <w:spacing w:before="0" w:after="0" w:line="220" w:lineRule="auto"/>
+    </w:pPr>
+    <w:rPr>
+      <w:sz w:val="16"/>
+      <w:szCs w:val="16"/>
+    </w:rPr>
+  </w:style>
   <w:style w:type="paragraph" w:styleId="TableHeader">
     <w:name w:val="Table Header"/>
     <w:basedOn w:val="TableText"/>

</xml_diff>

<commit_message>
feat: wire accepted AI receipts to publishing
</commit_message>
<xml_diff>
--- a/docs/VESKIFY_DEVELOPMENT_DELIVERY_TRACKER_v1.3.0.docx
+++ b/docs/VESKIFY_DEVELOPMENT_DELIVERY_TRACKER_v1.3.0.docx
@@ -1837,7 +1837,7 @@
                 <w:b/>
                 <w:bCs/>
               </w:rPr>
-              <w:t>Partial</w:t>
+              <w:t>Baseline</w:t>
             </w:r>
           </w:p>
         </w:tc>
@@ -7406,7 +7406,7 @@
           <w:b/>
           <w:bCs/>
         </w:rPr>
-        <w:t>Partial</w:t>
+        <w:t>Baseline</w:t>
       </w:r>
       <w:r>
         <w:rPr>

</xml_diff>

<commit_message>
docs: record controlled provider acceptance
</commit_message>
<xml_diff>
--- a/docs/VESKIFY_DEVELOPMENT_DELIVERY_TRACKER_v1.3.0.docx
+++ b/docs/VESKIFY_DEVELOPMENT_DELIVERY_TRACKER_v1.3.0.docx
@@ -1647,7 +1647,7 @@
               <w:rPr>
                 <w:rFonts w:ascii="Calibri" w:hAnsi="Calibri" w:cs="Calibri"/>
               </w:rPr>
-              <w:t>☐</w:t>
+              <w:t>☑</w:t>
             </w:r>
           </w:p>
         </w:tc>
@@ -1704,7 +1704,7 @@
                 <w:b/>
                 <w:bCs/>
               </w:rPr>
-              <w:t>Blocked</w:t>
+              <w:t>Baseline</w:t>
             </w:r>
           </w:p>
         </w:tc>
@@ -7235,13 +7235,13 @@
           <w:b/>
           <w:bCs/>
         </w:rPr>
-        <w:t>Blocked</w:t>
-      </w:r>
-      <w:r>
-        <w:rPr>
-          <w:rFonts w:ascii="Calibri" w:hAnsi="Calibri" w:cs="Calibri"/>
-        </w:rPr>
-        <w:t>.</w:t>
+        <w:t>Baseline</w:t>
+      </w:r>
+      <w:r>
+        <w:rPr>
+          <w:rFonts w:ascii="Calibri" w:hAnsi="Calibri" w:cs="Calibri"/>
+        </w:rPr>
+        <w:t>. Completed 7 August 2026 with one successful initial-generation call before one successful hero follow-up call, safe retained evidence, and no retry.</w:t>
       </w:r>
     </w:p>
     <w:p>

</xml_diff>

<commit_message>
feat: add atomic compiled publication history
</commit_message>
<xml_diff>
--- a/docs/VESKIFY_DEVELOPMENT_DELIVERY_TRACKER_v1.3.0.docx
+++ b/docs/VESKIFY_DEVELOPMENT_DELIVERY_TRACKER_v1.3.0.docx
@@ -1913,7 +1913,7 @@
               <w:rPr>
                 <w:rFonts w:ascii="Calibri" w:hAnsi="Calibri" w:cs="Calibri"/>
               </w:rPr>
-              <w:t>☐</w:t>
+              <w:t>☑</w:t>
             </w:r>
           </w:p>
         </w:tc>
@@ -1970,7 +1970,7 @@
                 <w:b/>
                 <w:bCs/>
               </w:rPr>
-              <w:t>Planned</w:t>
+              <w:t>Baseline</w:t>
             </w:r>
           </w:p>
         </w:tc>
@@ -7577,7 +7577,7 @@
           <w:b/>
           <w:bCs/>
         </w:rPr>
-        <w:t>Planned</w:t>
+        <w:t>Baseline</w:t>
       </w:r>
       <w:r>
         <w:rPr>
@@ -7625,13 +7625,13 @@
           <w:b/>
           <w:bCs/>
         </w:rPr>
-        <w:t>Done when:</w:t>
-      </w:r>
-      <w:r>
-        <w:rPr>
-          <w:rFonts w:ascii="Calibri" w:hAnsi="Calibri" w:cs="Calibri"/>
-        </w:rPr>
-        <w:t xml:space="preserve"> The stated outcome and required evidence are accepted.</w:t>
+        <w:t>Done:</w:t>
+      </w:r>
+      <w:r>
+        <w:rPr>
+          <w:rFonts w:ascii="Calibri" w:hAnsi="Calibri" w:cs="Calibri"/>
+        </w:rPr>
+        <w:t xml:space="preserve"> One authoritative transaction retains the snapshot, artifact, version/history, operation, and active pointer; failures preserve prior live state; historical versions restore only to a new draft and require a fresh explicit publish.</w:t>
       </w:r>
     </w:p>
     <w:p>

</xml_diff>

<commit_message>
test: retain complete publication evidence
</commit_message>
<xml_diff>
--- a/docs/VESKIFY_DEVELOPMENT_DELIVERY_TRACKER_v1.3.0.docx
+++ b/docs/VESKIFY_DEVELOPMENT_DELIVERY_TRACKER_v1.3.0.docx
@@ -2046,7 +2046,7 @@
               <w:rPr>
                 <w:rFonts w:ascii="Calibri" w:hAnsi="Calibri" w:cs="Calibri"/>
               </w:rPr>
-              <w:t>☐</w:t>
+              <w:t>☑</w:t>
             </w:r>
           </w:p>
         </w:tc>
@@ -2103,7 +2103,7 @@
                 <w:b/>
                 <w:bCs/>
               </w:rPr>
-              <w:t>Planned</w:t>
+              <w:t>Baseline</w:t>
             </w:r>
           </w:p>
         </w:tc>
@@ -7748,7 +7748,7 @@
           <w:b/>
           <w:bCs/>
         </w:rPr>
-        <w:t>Planned</w:t>
+        <w:t>Baseline</w:t>
       </w:r>
       <w:r>
         <w:rPr>
@@ -7796,13 +7796,13 @@
           <w:b/>
           <w:bCs/>
         </w:rPr>
-        <w:t>Done when:</w:t>
-      </w:r>
-      <w:r>
-        <w:rPr>
-          <w:rFonts w:ascii="Calibri" w:hAnsi="Calibri" w:cs="Calibri"/>
-        </w:rPr>
-        <w:t xml:space="preserve"> The stated outcome and required evidence are accepted.</w:t>
+        <w:t>Done:</w:t>
+      </w:r>
+      <w:r>
+        <w:rPr>
+          <w:rFonts w:ascii="Calibri" w:hAnsi="Calibri" w:cs="Calibri"/>
+        </w:rPr>
+        <w:t xml:space="preserve"> Manual and accepted-AI authority are correlated through preparation, deterministic compilation, atomic artifact/version publication, the active pointer, and exact published home, collection, and PDP routes. Browser and repository evidence also preserves live state on stale or injected failure, isolates later draft edits, restores history only to a new draft, and creates a fresh version on explicit republish with zero external provider calls during publication.</w:t>
       </w:r>
     </w:p>
     <w:p>

</xml_diff>

<commit_message>
docs: close P10A orchestration and publishing phase
</commit_message>
<xml_diff>
--- a/docs/VESKIFY_DEVELOPMENT_DELIVERY_TRACKER_v1.3.0.docx
+++ b/docs/VESKIFY_DEVELOPMENT_DELIVERY_TRACKER_v1.3.0.docx
@@ -38,7 +38,7 @@
         <w:rPr>
           <w:rFonts w:ascii="Calibri" w:hAnsi="Calibri" w:cs="Calibri"/>
         </w:rPr>
-        <w:t>Delivery status baseline: 6 August 2026</w:t>
+        <w:t>Delivery status baseline: 7 August 2026, current main after merged PR #170</w:t>
       </w:r>
     </w:p>
     <w:p>
@@ -64,7 +64,7 @@
         <w:rPr>
           <w:rFonts w:ascii="Calibri" w:hAnsi="Calibri" w:cs="Calibri"/>
         </w:rPr>
-        <w:t>Active phase: P10A grounded orchestration and publishing closure</w:t>
+        <w:t>Active phase: P10B Commercial Storefront Design System v1 (Planned)</w:t>
       </w:r>
     </w:p>
     <w:p>
@@ -245,7 +245,7 @@
               <w:rPr>
                 <w:rFonts w:ascii="Calibri" w:hAnsi="Calibri" w:cs="Calibri"/>
               </w:rPr>
-              <w:t xml:space="preserve">6 August 2026, current </w:t>
+              <w:t xml:space="preserve">7 August 2026, current </w:t>
             </w:r>
             <w:r>
               <w:rPr>
@@ -259,7 +259,60 @@
               <w:rPr>
                 <w:rFonts w:ascii="Calibri" w:hAnsi="Calibri" w:cs="Calibri"/>
               </w:rPr>
-              <w:t xml:space="preserve"> after PR #165</w:t>
+              <w:t xml:space="preserve"> after PR #170</w:t>
+            </w:r>
+          </w:p>
+        </w:tc>
+      </w:tr>
+      <w:tr>
+        <w:trPr/>
+        <w:tc>
+          <w:tcPr>
+            <w:tcW w:w="2600" w:type="dxa"/>
+            <w:vAlign w:val="center"/>
+          </w:tcPr>
+          <w:p>
+            <w:pPr>
+              <w:pStyle w:val="TableText"/>
+              <w:widowControl/>
+            </w:pPr>
+            <w:r>
+              <w:rPr>
+                <w:rFonts w:ascii="Calibri" w:hAnsi="Calibri" w:cs="Calibri"/>
+              </w:rPr>
+              <w:t>Active development phase</w:t>
+            </w:r>
+          </w:p>
+        </w:tc>
+        <w:tc>
+          <w:tcPr>
+            <w:tcW w:w="10360" w:type="dxa"/>
+            <w:vAlign w:val="center"/>
+          </w:tcPr>
+          <w:p>
+            <w:pPr>
+              <w:pStyle w:val="TableText"/>
+              <w:widowControl/>
+            </w:pPr>
+            <w:r>
+              <w:rPr>
+                <w:rFonts w:ascii="Calibri" w:hAnsi="Calibri" w:cs="Calibri"/>
+              </w:rPr>
+              <w:t>P10B — Commercial Storefront Design System v1 (</w:t>
+            </w:r>
+            <w:r>
+              <w:rPr>
+                <w:rFonts w:ascii="Calibri" w:hAnsi="Calibri" w:cs="Calibri"/>
+                <w:b/>
+                <w:bCs/>
+              </w:rPr>
+              <w:t>Planned</w:t>
+            </w:r>
+            <w:r>
+              <w:rPr>
+                <w:rFonts w:ascii="Calibri" w:hAnsi="Calibri" w:cs="Calibri"/>
+              </w:rPr>
+              <w:t>)</w:t>
             </w:r>
           </w:p>
         </w:tc>
@@ -654,7 +707,7 @@
               <w:rPr>
                 <w:rFonts w:ascii="Calibri" w:hAnsi="Calibri" w:cs="Calibri"/>
               </w:rPr>
-              <w:t>☐</w:t>
+              <w:t>☑</w:t>
             </w:r>
           </w:p>
         </w:tc>
@@ -711,7 +764,7 @@
                 <w:b/>
                 <w:bCs/>
               </w:rPr>
-              <w:t>Partial</w:t>
+              <w:t>Baseline / closed</w:t>
             </w:r>
           </w:p>
         </w:tc>
@@ -1780,7 +1833,7 @@
               <w:rPr>
                 <w:rFonts w:ascii="Calibri" w:hAnsi="Calibri" w:cs="Calibri"/>
               </w:rPr>
-              <w:t>☐</w:t>
+              <w:t>☑</w:t>
             </w:r>
           </w:p>
         </w:tc>
@@ -2179,7 +2232,7 @@
               <w:rPr>
                 <w:rFonts w:ascii="Calibri" w:hAnsi="Calibri" w:cs="Calibri"/>
               </w:rPr>
-              <w:t>☐</w:t>
+              <w:t>☑</w:t>
             </w:r>
           </w:p>
         </w:tc>
@@ -2236,7 +2289,7 @@
                 <w:b/>
                 <w:bCs/>
               </w:rPr>
-              <w:t>Planned</w:t>
+              <w:t>Baseline</w:t>
             </w:r>
           </w:p>
         </w:tc>
@@ -7919,8 +7972,24 @@
           <w:b/>
           <w:bCs/>
         </w:rPr>
-        <w:t>Planned</w:t>
-      </w:r>
+        <w:t>Baseline</w:t>
+      </w:r>
+      <w:r>
+        <w:rPr>
+          <w:rFonts w:ascii="Calibri" w:hAnsi="Calibri" w:cs="Calibri"/>
+        </w:rPr>
+        <w:t xml:space="preserve">. Completed 7 August 2026; see </w:t>
+      </w:r>
+      <w:hyperlink r:id="rIdHyperlink3" w:history="1">
+        <w:r>
+          <w:rPr>
+            <w:rFonts w:ascii="Calibri" w:hAnsi="Calibri" w:cs="Calibri"/>
+            <w:color w:val="2E74B5"/>
+            <w:u w:val="single"/>
+          </w:rPr>
+          <w:t>P10A_PHASE_CLOSURE.md</w:t>
+        </w:r>
+      </w:hyperlink>
       <w:r>
         <w:rPr>
           <w:rFonts w:ascii="Calibri" w:hAnsi="Calibri" w:cs="Calibri"/>
@@ -7967,13 +8036,13 @@
           <w:b/>
           <w:bCs/>
         </w:rPr>
-        <w:t>Done when:</w:t>
-      </w:r>
-      <w:r>
-        <w:rPr>
-          <w:rFonts w:ascii="Calibri" w:hAnsi="Calibri" w:cs="Calibri"/>
-        </w:rPr>
-        <w:t xml:space="preserve"> The stated outcome and required evidence are accepted.</w:t>
+        <w:t>Done:</w:t>
+      </w:r>
+      <w:r>
+        <w:rPr>
+          <w:rFonts w:ascii="Calibri" w:hAnsi="Calibri" w:cs="Calibri"/>
+        </w:rPr>
+        <w:t xml:space="preserve"> All 20 exit items were classified explicitly, every required P10A item passed at Baseline, active documentation was synchronized, and P10B became the next active development phase while remaining Planned.</w:t>
       </w:r>
     </w:p>
     <w:p>
@@ -11998,7 +12067,7 @@
         </w:rPr>
         <w:t xml:space="preserve"> </w:t>
       </w:r>
-      <w:hyperlink r:id="rIdHyperlink3" w:history="1">
+      <w:hyperlink r:id="rIdHyperlink4" w:history="1">
         <w:r>
           <w:rPr>
             <w:rFonts w:ascii="Calibri" w:hAnsi="Calibri" w:cs="Calibri"/>
@@ -12014,7 +12083,7 @@
         </w:rPr>
         <w:t xml:space="preserve"> and </w:t>
       </w:r>
-      <w:hyperlink r:id="rIdHyperlink4" w:history="1">
+      <w:hyperlink r:id="rIdHyperlink5" w:history="1">
         <w:r>
           <w:rPr>
             <w:rFonts w:ascii="Calibri" w:hAnsi="Calibri" w:cs="Calibri"/>

</xml_diff>

<commit_message>
feat: add commercial design grammar authority
</commit_message>
<xml_diff>
--- a/docs/VESKIFY_DEVELOPMENT_DELIVERY_TRACKER_v1.3.0.docx
+++ b/docs/VESKIFY_DEVELOPMENT_DELIVERY_TRACKER_v1.3.0.docx
@@ -38,7 +38,7 @@
         <w:rPr>
           <w:rFonts w:ascii="Calibri" w:hAnsi="Calibri" w:cs="Calibri"/>
         </w:rPr>
-        <w:t>Delivery status baseline: 7 August 2026, current main after merged PR #171</w:t>
+        <w:t>Delivery status baseline: 8 August 2026, current main after merged PR #172</w:t>
       </w:r>
     </w:p>
     <w:p>
@@ -64,7 +64,7 @@
         <w:rPr>
           <w:rFonts w:ascii="Calibri" w:hAnsi="Calibri" w:cs="Calibri"/>
         </w:rPr>
-        <w:t>Active phase: P10B Commercial Storefront Generation System v1 (Planned)</w:t>
+        <w:t>Active phase: P10B Commercial Storefront Generation System v1 (Partial)</w:t>
       </w:r>
     </w:p>
     <w:p>
@@ -245,7 +245,7 @@
               <w:rPr>
                 <w:rFonts w:ascii="Calibri" w:hAnsi="Calibri" w:cs="Calibri"/>
               </w:rPr>
-              <w:t xml:space="preserve">7 August 2026, current </w:t>
+              <w:t xml:space="preserve">8 August 2026, current </w:t>
             </w:r>
             <w:r>
               <w:rPr>
@@ -259,7 +259,7 @@
               <w:rPr>
                 <w:rFonts w:ascii="Calibri" w:hAnsi="Calibri" w:cs="Calibri"/>
               </w:rPr>
-              <w:t xml:space="preserve"> after PR #171</w:t>
+              <w:t xml:space="preserve"> after PR #172</w:t>
             </w:r>
           </w:p>
         </w:tc>
@@ -306,7 +306,7 @@
                 <w:b/>
                 <w:bCs/>
               </w:rPr>
-              <w:t>Planned</w:t>
+              <w:t>Partial</w:t>
             </w:r>
             <w:r>
               <w:rPr>
@@ -901,7 +901,7 @@
                 <w:b/>
                 <w:bCs/>
               </w:rPr>
-              <w:t>Planned</w:t>
+              <w:t>Partial</w:t>
             </w:r>
           </w:p>
         </w:tc>
@@ -2584,7 +2584,7 @@
               <w:rPr>
                 <w:rFonts w:ascii="Calibri" w:hAnsi="Calibri" w:cs="Calibri"/>
               </w:rPr>
-              <w:t>☐</w:t>
+              <w:t>☑</w:t>
             </w:r>
           </w:p>
         </w:tc>
@@ -2641,7 +2641,7 @@
                 <w:b/>
                 <w:bCs/>
               </w:rPr>
-              <w:t>Planned</w:t>
+              <w:t>Baseline</w:t>
             </w:r>
           </w:p>
         </w:tc>
@@ -9218,7 +9218,21 @@
         <w:rPr>
           <w:rFonts w:ascii="Calibri" w:hAnsi="Calibri" w:cs="Calibri"/>
         </w:rPr>
-        <w:t xml:space="preserve">. Every task below is </w:t>
+        <w:t xml:space="preserve">. P10B-01 is </w:t>
+      </w:r>
+      <w:r>
+        <w:rPr>
+          <w:rFonts w:ascii="Calibri" w:hAnsi="Calibri" w:cs="Calibri"/>
+          <w:b/>
+          <w:bCs/>
+        </w:rPr>
+        <w:t>Baseline</w:t>
+      </w:r>
+      <w:r>
+        <w:rPr>
+          <w:rFonts w:ascii="Calibri" w:hAnsi="Calibri" w:cs="Calibri"/>
+        </w:rPr>
+        <w:t xml:space="preserve">. P10B-02 through P10B-18 remain </w:t>
       </w:r>
       <w:r>
         <w:rPr>
@@ -9232,7 +9246,7 @@
         <w:rPr>
           <w:rFonts w:ascii="Calibri" w:hAnsi="Calibri" w:cs="Calibri"/>
         </w:rPr>
-        <w:t>. The Done conditions are implementation gates, not claims about the current repository.</w:t>
+        <w:t>. The remaining Done conditions are implementation gates, not claims about the current repository.</w:t>
       </w:r>
     </w:p>
     <w:p>
@@ -9432,6 +9446,60 @@
     </w:p>
     <w:p>
       <w:pPr>
+        <w:pStyle w:val="Normal"/>
+        <w:numPr>
+          <w:ilvl w:val="0"/>
+          <w:numId w:val="1"/>
+        </w:numPr>
+        <w:widowControl/>
+      </w:pPr>
+      <w:r>
+        <w:rPr>
+          <w:rFonts w:ascii="Calibri" w:hAnsi="Calibri" w:cs="Calibri"/>
+          <w:b/>
+          <w:bCs/>
+        </w:rPr>
+        <w:t>Status:</w:t>
+      </w:r>
+      <w:r>
+        <w:rPr>
+          <w:rFonts w:ascii="Calibri" w:hAnsi="Calibri" w:cs="Calibri"/>
+        </w:rPr>
+        <w:t xml:space="preserve"> </w:t>
+      </w:r>
+      <w:r>
+        <w:rPr>
+          <w:rFonts w:ascii="Calibri" w:hAnsi="Calibri" w:cs="Calibri"/>
+          <w:b/>
+          <w:bCs/>
+        </w:rPr>
+        <w:t>Baseline</w:t>
+      </w:r>
+      <w:r>
+        <w:rPr>
+          <w:rFonts w:ascii="Calibri" w:hAnsi="Calibri" w:cs="Calibri"/>
+        </w:rPr>
+        <w:t xml:space="preserve">. See </w:t>
+      </w:r>
+      <w:hyperlink r:id="rIdHyperlink5" w:history="1">
+        <w:r>
+          <w:rPr>
+            <w:rFonts w:ascii="Calibri" w:hAnsi="Calibri" w:cs="Calibri"/>
+            <w:color w:val="2E74B5"/>
+            <w:u w:val="single"/>
+          </w:rPr>
+          <w:t>P10B_01_COMMERCIAL_DESIGN_GRAMMAR.md</w:t>
+        </w:r>
+      </w:hyperlink>
+      <w:r>
+        <w:rPr>
+          <w:rFonts w:ascii="Calibri" w:hAnsi="Calibri" w:cs="Calibri"/>
+        </w:rPr>
+        <w:t>.</w:t>
+      </w:r>
+    </w:p>
+    <w:p>
+      <w:pPr>
         <w:pStyle w:val="Heading3"/>
         <w:keepNext/>
         <w:widowControl/>
@@ -14500,7 +14568,7 @@
         </w:rPr>
         <w:t xml:space="preserve"> </w:t>
       </w:r>
-      <w:hyperlink r:id="rIdHyperlink5" w:history="1">
+      <w:hyperlink r:id="rIdHyperlink6" w:history="1">
         <w:r>
           <w:rPr>
             <w:rFonts w:ascii="Calibri" w:hAnsi="Calibri" w:cs="Calibri"/>
@@ -14516,7 +14584,7 @@
         </w:rPr>
         <w:t xml:space="preserve"> and </w:t>
       </w:r>
-      <w:hyperlink r:id="rIdHyperlink6" w:history="1">
+      <w:hyperlink r:id="rIdHyperlink7" w:history="1">
         <w:r>
           <w:rPr>
             <w:rFonts w:ascii="Calibri" w:hAnsi="Calibri" w:cs="Calibri"/>

</xml_diff>

<commit_message>
feat: add component anatomy authority
</commit_message>
<xml_diff>
--- a/docs/VESKIFY_DEVELOPMENT_DELIVERY_TRACKER_v1.3.0.docx
+++ b/docs/VESKIFY_DEVELOPMENT_DELIVERY_TRACKER_v1.3.0.docx
@@ -38,7 +38,7 @@
         <w:rPr>
           <w:rFonts w:ascii="Calibri" w:hAnsi="Calibri" w:cs="Calibri"/>
         </w:rPr>
-        <w:t>Delivery status baseline: 8 August 2026, current main after merged PR #172</w:t>
+        <w:t>Delivery status baseline: 8 August 2026, current main after merged PR #173</w:t>
       </w:r>
     </w:p>
     <w:p>
@@ -259,7 +259,7 @@
               <w:rPr>
                 <w:rFonts w:ascii="Calibri" w:hAnsi="Calibri" w:cs="Calibri"/>
               </w:rPr>
-              <w:t xml:space="preserve"> after PR #172</w:t>
+              <w:t xml:space="preserve"> after PR #173</w:t>
             </w:r>
           </w:p>
         </w:tc>
@@ -2854,7 +2854,7 @@
               <w:rPr>
                 <w:rFonts w:ascii="Calibri" w:hAnsi="Calibri" w:cs="Calibri"/>
               </w:rPr>
-              <w:t>☐</w:t>
+              <w:t>☑</w:t>
             </w:r>
           </w:p>
         </w:tc>
@@ -2911,7 +2911,7 @@
                 <w:b/>
                 <w:bCs/>
               </w:rPr>
-              <w:t>Planned</w:t>
+              <w:t>Baseline</w:t>
             </w:r>
           </w:p>
         </w:tc>
@@ -2965,7 +2965,7 @@
               <w:rPr>
                 <w:rFonts w:ascii="Calibri" w:hAnsi="Calibri" w:cs="Calibri"/>
               </w:rPr>
-              <w:t>Structural difference, queryability, renderer and rejection evidence</w:t>
+              <w:t>25 definitions/91 variants; structural, query, migration and rejection evidence</w:t>
             </w:r>
           </w:p>
         </w:tc>
@@ -9218,7 +9218,7 @@
         <w:rPr>
           <w:rFonts w:ascii="Calibri" w:hAnsi="Calibri" w:cs="Calibri"/>
         </w:rPr>
-        <w:t xml:space="preserve">. P10B-01 is </w:t>
+        <w:t xml:space="preserve">. P10B-01 and P10B-03 are </w:t>
       </w:r>
       <w:r>
         <w:rPr>
@@ -9232,7 +9232,7 @@
         <w:rPr>
           <w:rFonts w:ascii="Calibri" w:hAnsi="Calibri" w:cs="Calibri"/>
         </w:rPr>
-        <w:t xml:space="preserve">. P10B-02 through P10B-18 remain </w:t>
+        <w:t xml:space="preserve">. P10B-02 and P10B-04 through P10B-18 remain </w:t>
       </w:r>
       <w:r>
         <w:rPr>
@@ -9890,6 +9890,60 @@
     </w:p>
     <w:p>
       <w:pPr>
+        <w:pStyle w:val="Normal"/>
+        <w:numPr>
+          <w:ilvl w:val="0"/>
+          <w:numId w:val="1"/>
+        </w:numPr>
+        <w:widowControl/>
+      </w:pPr>
+      <w:r>
+        <w:rPr>
+          <w:rFonts w:ascii="Calibri" w:hAnsi="Calibri" w:cs="Calibri"/>
+          <w:b/>
+          <w:bCs/>
+        </w:rPr>
+        <w:t>Status:</w:t>
+      </w:r>
+      <w:r>
+        <w:rPr>
+          <w:rFonts w:ascii="Calibri" w:hAnsi="Calibri" w:cs="Calibri"/>
+        </w:rPr>
+        <w:t xml:space="preserve"> </w:t>
+      </w:r>
+      <w:r>
+        <w:rPr>
+          <w:rFonts w:ascii="Calibri" w:hAnsi="Calibri" w:cs="Calibri"/>
+          <w:b/>
+          <w:bCs/>
+        </w:rPr>
+        <w:t>Baseline</w:t>
+      </w:r>
+      <w:r>
+        <w:rPr>
+          <w:rFonts w:ascii="Calibri" w:hAnsi="Calibri" w:cs="Calibri"/>
+        </w:rPr>
+        <w:t xml:space="preserve">. All 25 current V2 definitions and 91 variants are classified explicitly without false commercial-ready promotion. See </w:t>
+      </w:r>
+      <w:hyperlink r:id="rIdHyperlink6" w:history="1">
+        <w:r>
+          <w:rPr>
+            <w:rFonts w:ascii="Calibri" w:hAnsi="Calibri" w:cs="Calibri"/>
+            <w:color w:val="2E74B5"/>
+            <w:u w:val="single"/>
+          </w:rPr>
+          <w:t>P10B_03_COMPONENT_ANATOMY_AND_MEANINGFUL_VARIANTS.md</w:t>
+        </w:r>
+      </w:hyperlink>
+      <w:r>
+        <w:rPr>
+          <w:rFonts w:ascii="Calibri" w:hAnsi="Calibri" w:cs="Calibri"/>
+        </w:rPr>
+        <w:t>.</w:t>
+      </w:r>
+    </w:p>
+    <w:p>
+      <w:pPr>
         <w:pStyle w:val="Heading3"/>
         <w:keepNext/>
         <w:widowControl/>
@@ -14568,7 +14622,7 @@
         </w:rPr>
         <w:t xml:space="preserve"> </w:t>
       </w:r>
-      <w:hyperlink r:id="rIdHyperlink6" w:history="1">
+      <w:hyperlink r:id="rIdHyperlink7" w:history="1">
         <w:r>
           <w:rPr>
             <w:rFonts w:ascii="Calibri" w:hAnsi="Calibri" w:cs="Calibri"/>
@@ -14584,7 +14638,7 @@
         </w:rPr>
         <w:t xml:space="preserve"> and </w:t>
       </w:r>
-      <w:hyperlink r:id="rIdHyperlink7" w:history="1">
+      <w:hyperlink r:id="rIdHyperlink8" w:history="1">
         <w:r>
           <w:rPr>
             <w:rFonts w:ascii="Calibri" w:hAnsi="Calibri" w:cs="Calibri"/>

</xml_diff>

<commit_message>
feat: add canonical storefront site-map authority
</commit_message>
<xml_diff>
--- a/docs/VESKIFY_DEVELOPMENT_DELIVERY_TRACKER_v1.3.0.docx
+++ b/docs/VESKIFY_DEVELOPMENT_DELIVERY_TRACKER_v1.3.0.docx
@@ -38,7 +38,7 @@
         <w:rPr>
           <w:rFonts w:ascii="Calibri" w:hAnsi="Calibri" w:cs="Calibri"/>
         </w:rPr>
-        <w:t>Delivery status baseline: 8 August 2026, current main after merged PR #172</w:t>
+        <w:t>Delivery status baseline: 8 August 2026, current main after merged PR #173</w:t>
       </w:r>
     </w:p>
     <w:p>
@@ -259,7 +259,7 @@
               <w:rPr>
                 <w:rFonts w:ascii="Calibri" w:hAnsi="Calibri" w:cs="Calibri"/>
               </w:rPr>
-              <w:t xml:space="preserve"> after PR #172</w:t>
+              <w:t xml:space="preserve"> after PR #173</w:t>
             </w:r>
           </w:p>
         </w:tc>
@@ -3124,7 +3124,7 @@
               <w:rPr>
                 <w:rFonts w:ascii="Calibri" w:hAnsi="Calibri" w:cs="Calibri"/>
               </w:rPr>
-              <w:t>☐</w:t>
+              <w:t>☑</w:t>
             </w:r>
           </w:p>
         </w:tc>
@@ -3181,7 +3181,7 @@
                 <w:b/>
                 <w:bCs/>
               </w:rPr>
-              <w:t>Planned</w:t>
+              <w:t>Baseline</w:t>
             </w:r>
           </w:p>
         </w:tc>
@@ -9218,7 +9218,7 @@
         <w:rPr>
           <w:rFonts w:ascii="Calibri" w:hAnsi="Calibri" w:cs="Calibri"/>
         </w:rPr>
-        <w:t xml:space="preserve">. P10B-01 is </w:t>
+        <w:t xml:space="preserve">. P10B-01 and P10B-05 are </w:t>
       </w:r>
       <w:r>
         <w:rPr>
@@ -9232,7 +9232,7 @@
         <w:rPr>
           <w:rFonts w:ascii="Calibri" w:hAnsi="Calibri" w:cs="Calibri"/>
         </w:rPr>
-        <w:t xml:space="preserve">. P10B-02 through P10B-18 remain </w:t>
+        <w:t xml:space="preserve">. P10B-02 through P10B-04 and P10B-06 through P10B-18 remain </w:t>
       </w:r>
       <w:r>
         <w:rPr>
@@ -10266,6 +10266,60 @@
     </w:p>
     <w:p>
       <w:pPr>
+        <w:pStyle w:val="Normal"/>
+        <w:numPr>
+          <w:ilvl w:val="0"/>
+          <w:numId w:val="1"/>
+        </w:numPr>
+        <w:widowControl/>
+      </w:pPr>
+      <w:r>
+        <w:rPr>
+          <w:rFonts w:ascii="Calibri" w:hAnsi="Calibri" w:cs="Calibri"/>
+          <w:b/>
+          <w:bCs/>
+        </w:rPr>
+        <w:t>Status:</w:t>
+      </w:r>
+      <w:r>
+        <w:rPr>
+          <w:rFonts w:ascii="Calibri" w:hAnsi="Calibri" w:cs="Calibri"/>
+        </w:rPr>
+        <w:t xml:space="preserve"> </w:t>
+      </w:r>
+      <w:r>
+        <w:rPr>
+          <w:rFonts w:ascii="Calibri" w:hAnsi="Calibri" w:cs="Calibri"/>
+          <w:b/>
+          <w:bCs/>
+        </w:rPr>
+        <w:t>Baseline</w:t>
+      </w:r>
+      <w:r>
+        <w:rPr>
+          <w:rFonts w:ascii="Calibri" w:hAnsi="Calibri" w:cs="Calibri"/>
+        </w:rPr>
+        <w:t xml:space="preserve">. See </w:t>
+      </w:r>
+      <w:hyperlink r:id="rIdHyperlink6" w:history="1">
+        <w:r>
+          <w:rPr>
+            <w:rFonts w:ascii="Calibri" w:hAnsi="Calibri" w:cs="Calibri"/>
+            <w:color w:val="2E74B5"/>
+            <w:u w:val="single"/>
+          </w:rPr>
+          <w:t>P10B_05_SITE_MAP_AND_PAGE_FAMILY_AUTHORITY.md</w:t>
+        </w:r>
+      </w:hyperlink>
+      <w:r>
+        <w:rPr>
+          <w:rFonts w:ascii="Calibri" w:hAnsi="Calibri" w:cs="Calibri"/>
+        </w:rPr>
+        <w:t>.</w:t>
+      </w:r>
+    </w:p>
+    <w:p>
+      <w:pPr>
         <w:pStyle w:val="Heading3"/>
         <w:keepNext/>
         <w:widowControl/>
@@ -14568,7 +14622,7 @@
         </w:rPr>
         <w:t xml:space="preserve"> </w:t>
       </w:r>
-      <w:hyperlink r:id="rIdHyperlink6" w:history="1">
+      <w:hyperlink r:id="rIdHyperlink7" w:history="1">
         <w:r>
           <w:rPr>
             <w:rFonts w:ascii="Calibri" w:hAnsi="Calibri" w:cs="Calibri"/>
@@ -14584,7 +14638,7 @@
         </w:rPr>
         <w:t xml:space="preserve"> and </w:t>
       </w:r>
-      <w:hyperlink r:id="rIdHyperlink7" w:history="1">
+      <w:hyperlink r:id="rIdHyperlink8" w:history="1">
         <w:r>
           <w:rPr>
             <w:rFonts w:ascii="Calibri" w:hAnsi="Calibri" w:cs="Calibri"/>

</xml_diff>

<commit_message>
feat: add parametric BrandSystem design DNA
</commit_message>
<xml_diff>
--- a/docs/VESKIFY_DEVELOPMENT_DELIVERY_TRACKER_v1.3.0.docx
+++ b/docs/VESKIFY_DEVELOPMENT_DELIVERY_TRACKER_v1.3.0.docx
@@ -2719,7 +2719,7 @@
               <w:rPr>
                 <w:rFonts w:ascii="Calibri" w:hAnsi="Calibri" w:cs="Calibri"/>
               </w:rPr>
-              <w:t>☐</w:t>
+              <w:t>☑</w:t>
             </w:r>
           </w:p>
         </w:tc>
@@ -2776,7 +2776,7 @@
                 <w:b/>
                 <w:bCs/>
               </w:rPr>
-              <w:t>Planned</w:t>
+              <w:t>Baseline</w:t>
             </w:r>
           </w:p>
         </w:tc>
@@ -9218,7 +9218,7 @@
         <w:rPr>
           <w:rFonts w:ascii="Calibri" w:hAnsi="Calibri" w:cs="Calibri"/>
         </w:rPr>
-        <w:t xml:space="preserve">. P10B-01 is </w:t>
+        <w:t xml:space="preserve">. P10B-01 and P10B-02 are </w:t>
       </w:r>
       <w:r>
         <w:rPr>
@@ -9232,7 +9232,7 @@
         <w:rPr>
           <w:rFonts w:ascii="Calibri" w:hAnsi="Calibri" w:cs="Calibri"/>
         </w:rPr>
-        <w:t xml:space="preserve">. P10B-02 through P10B-18 remain </w:t>
+        <w:t xml:space="preserve">. P10B-03 through P10B-18 remain </w:t>
       </w:r>
       <w:r>
         <w:rPr>
@@ -9695,6 +9695,60 @@
     </w:p>
     <w:p>
       <w:pPr>
+        <w:pStyle w:val="Normal"/>
+        <w:numPr>
+          <w:ilvl w:val="0"/>
+          <w:numId w:val="1"/>
+        </w:numPr>
+        <w:widowControl/>
+      </w:pPr>
+      <w:r>
+        <w:rPr>
+          <w:rFonts w:ascii="Calibri" w:hAnsi="Calibri" w:cs="Calibri"/>
+          <w:b/>
+          <w:bCs/>
+        </w:rPr>
+        <w:t>Status:</w:t>
+      </w:r>
+      <w:r>
+        <w:rPr>
+          <w:rFonts w:ascii="Calibri" w:hAnsi="Calibri" w:cs="Calibri"/>
+        </w:rPr>
+        <w:t xml:space="preserve"> </w:t>
+      </w:r>
+      <w:r>
+        <w:rPr>
+          <w:rFonts w:ascii="Calibri" w:hAnsi="Calibri" w:cs="Calibri"/>
+          <w:b/>
+          <w:bCs/>
+        </w:rPr>
+        <w:t>Baseline</w:t>
+      </w:r>
+      <w:r>
+        <w:rPr>
+          <w:rFonts w:ascii="Calibri" w:hAnsi="Calibri" w:cs="Calibri"/>
+        </w:rPr>
+        <w:t xml:space="preserve">. See </w:t>
+      </w:r>
+      <w:hyperlink r:id="rIdHyperlink6" w:history="1">
+        <w:r>
+          <w:rPr>
+            <w:rFonts w:ascii="Calibri" w:hAnsi="Calibri" w:cs="Calibri"/>
+            <w:color w:val="2E74B5"/>
+            <w:u w:val="single"/>
+          </w:rPr>
+          <w:t>P10B_02_PARAMETRIC_BRAND_SYSTEM.md</w:t>
+        </w:r>
+      </w:hyperlink>
+      <w:r>
+        <w:rPr>
+          <w:rFonts w:ascii="Calibri" w:hAnsi="Calibri" w:cs="Calibri"/>
+        </w:rPr>
+        <w:t>.</w:t>
+      </w:r>
+    </w:p>
+    <w:p>
+      <w:pPr>
         <w:pStyle w:val="Heading3"/>
         <w:keepNext/>
         <w:widowControl/>
@@ -14568,7 +14622,7 @@
         </w:rPr>
         <w:t xml:space="preserve"> </w:t>
       </w:r>
-      <w:hyperlink r:id="rIdHyperlink6" w:history="1">
+      <w:hyperlink r:id="rIdHyperlink7" w:history="1">
         <w:r>
           <w:rPr>
             <w:rFonts w:ascii="Calibri" w:hAnsi="Calibri" w:cs="Calibri"/>
@@ -14584,7 +14638,7 @@
         </w:rPr>
         <w:t xml:space="preserve"> and </w:t>
       </w:r>
-      <w:hyperlink r:id="rIdHyperlink7" w:history="1">
+      <w:hyperlink r:id="rIdHyperlink8" w:history="1">
         <w:r>
           <w:rPr>
             <w:rFonts w:ascii="Calibri" w:hAnsi="Calibri" w:cs="Calibri"/>

</xml_diff>

<commit_message>
feat: add responsive image art direction authority
</commit_message>
<xml_diff>
--- a/docs/VESKIFY_DEVELOPMENT_DELIVERY_TRACKER_v1.3.0.docx
+++ b/docs/VESKIFY_DEVELOPMENT_DELIVERY_TRACKER_v1.3.0.docx
@@ -245,21 +245,7 @@
               <w:rPr>
                 <w:rFonts w:ascii="Calibri" w:hAnsi="Calibri" w:cs="Calibri"/>
               </w:rPr>
-              <w:t xml:space="preserve">8 August 2026, current </w:t>
-            </w:r>
-            <w:r>
-              <w:rPr>
-                <w:rFonts w:ascii="Consolas" w:hAnsi="Consolas" w:cs="Consolas"/>
-                <w:sz w:val="19"/>
-                <w:szCs w:val="19"/>
-              </w:rPr>
-              <w:t>main</w:t>
-            </w:r>
-            <w:r>
-              <w:rPr>
-                <w:rFonts w:ascii="Calibri" w:hAnsi="Calibri" w:cs="Calibri"/>
-              </w:rPr>
-              <w:t xml:space="preserve"> after PR #176</w:t>
+              <w:t>8 August 2026, P10B-04 implementation and evidence branch</w:t>
             </w:r>
           </w:p>
         </w:tc>
@@ -2989,7 +2975,7 @@
               <w:rPr>
                 <w:rFonts w:ascii="Calibri" w:hAnsi="Calibri" w:cs="Calibri"/>
               </w:rPr>
-              <w:t>☐</w:t>
+              <w:t>☑</w:t>
             </w:r>
           </w:p>
         </w:tc>
@@ -3046,7 +3032,7 @@
                 <w:b/>
                 <w:bCs/>
               </w:rPr>
-              <w:t>Planned</w:t>
+              <w:t>Baseline</w:t>
             </w:r>
           </w:p>
         </w:tc>
@@ -3100,7 +3086,7 @@
               <w:rPr>
                 <w:rFonts w:ascii="Calibri" w:hAnsi="Calibri" w:cs="Calibri"/>
               </w:rPr>
-              <w:t>Provenance/crop/fallback and four-width visual evidence</w:t>
+              <w:t>35-case authority, integration/lifecycle and four-width browser evidence</w:t>
             </w:r>
           </w:p>
         </w:tc>
@@ -9218,7 +9204,7 @@
         <w:rPr>
           <w:rFonts w:ascii="Calibri" w:hAnsi="Calibri" w:cs="Calibri"/>
         </w:rPr>
-        <w:t xml:space="preserve">. P10B-01, P10B-02, P10B-03, and P10B-05 are </w:t>
+        <w:t xml:space="preserve">. P10B-01 through P10B-05 are </w:t>
       </w:r>
       <w:r>
         <w:rPr>
@@ -9232,7 +9218,7 @@
         <w:rPr>
           <w:rFonts w:ascii="Calibri" w:hAnsi="Calibri" w:cs="Calibri"/>
         </w:rPr>
-        <w:t xml:space="preserve">. P10B-04 and P10B-06 through P10B-18 remain </w:t>
+        <w:t xml:space="preserve">. P10B-06 through P10B-18 remain </w:t>
       </w:r>
       <w:r>
         <w:rPr>
@@ -10179,39 +10165,40 @@
     </w:p>
     <w:p>
       <w:pPr>
-        <w:pStyle w:val="Heading3"/>
-        <w:keepNext/>
-        <w:widowControl/>
-      </w:pPr>
-      <w:r>
-        <w:rPr>
-          <w:rFonts w:ascii="Calibri" w:hAnsi="Calibri" w:cs="Calibri"/>
-        </w:rPr>
-        <w:t>P10B-05 — Veskify site-map and page-family authority</w:t>
-      </w:r>
-    </w:p>
-    <w:p>
-      <w:pPr>
-        <w:pStyle w:val="Normal"/>
-        <w:numPr>
-          <w:ilvl w:val="0"/>
-          <w:numId w:val="1"/>
-        </w:numPr>
-        <w:widowControl/>
-      </w:pPr>
-      <w:r>
-        <w:rPr>
-          <w:rFonts w:ascii="Calibri" w:hAnsi="Calibri" w:cs="Calibri"/>
-          <w:b/>
-          <w:bCs/>
-        </w:rPr>
-        <w:t>Outcome:</w:t>
-      </w:r>
-      <w:r>
-        <w:rPr>
-          <w:rFonts w:ascii="Calibri" w:hAnsi="Calibri" w:cs="Calibri"/>
-        </w:rPr>
-        <w:t xml:space="preserve"> Create and validate complete storefront page sets, navigation, routes, and registered page families through PageBlueprint and </w:t>
+        <w:pStyle w:val="Normal"/>
+        <w:numPr>
+          <w:ilvl w:val="0"/>
+          <w:numId w:val="1"/>
+        </w:numPr>
+        <w:widowControl/>
+      </w:pPr>
+      <w:r>
+        <w:rPr>
+          <w:rFonts w:ascii="Calibri" w:hAnsi="Calibri" w:cs="Calibri"/>
+          <w:b/>
+          <w:bCs/>
+        </w:rPr>
+        <w:t>Status:</w:t>
+      </w:r>
+      <w:r>
+        <w:rPr>
+          <w:rFonts w:ascii="Calibri" w:hAnsi="Calibri" w:cs="Calibri"/>
+        </w:rPr>
+        <w:t xml:space="preserve"> </w:t>
+      </w:r>
+      <w:r>
+        <w:rPr>
+          <w:rFonts w:ascii="Calibri" w:hAnsi="Calibri" w:cs="Calibri"/>
+          <w:b/>
+          <w:bCs/>
+        </w:rPr>
+        <w:t>Baseline</w:t>
+      </w:r>
+      <w:r>
+        <w:rPr>
+          <w:rFonts w:ascii="Calibri" w:hAnsi="Calibri" w:cs="Calibri"/>
+        </w:rPr>
+        <w:t xml:space="preserve">. Contract </w:t>
       </w:r>
       <w:r>
         <w:rPr>
@@ -10219,6 +10206,73 @@
           <w:sz w:val="19"/>
           <w:szCs w:val="19"/>
         </w:rPr>
+        <w:t>1.0.0</w:t>
+      </w:r>
+      <w:r>
+        <w:rPr>
+          <w:rFonts w:ascii="Calibri" w:hAnsi="Calibri" w:cs="Calibri"/>
+        </w:rPr>
+        <w:t xml:space="preserve"> embeds exact lineage and bounded treatment in the existing approved presentation, consumes Design DNA and registered anatomy, projects protected same-product media, preserves authority through lifecycle/compiler boundaries, and renders semantic four-breakpoint evidence. Production CDN transforms and retained commercial visual acceptance remain deferred. See </w:t>
+      </w:r>
+      <w:hyperlink r:id="rIdHyperlink8" w:history="1">
+        <w:r>
+          <w:rPr>
+            <w:rFonts w:ascii="Calibri" w:hAnsi="Calibri" w:cs="Calibri"/>
+            <w:color w:val="2E74B5"/>
+            <w:u w:val="single"/>
+          </w:rPr>
+          <w:t>P10B_04_RESPONSIVE_IMAGE_ART_DIRECTION.md</w:t>
+        </w:r>
+      </w:hyperlink>
+      <w:r>
+        <w:rPr>
+          <w:rFonts w:ascii="Calibri" w:hAnsi="Calibri" w:cs="Calibri"/>
+        </w:rPr>
+        <w:t>.</w:t>
+      </w:r>
+    </w:p>
+    <w:p>
+      <w:pPr>
+        <w:pStyle w:val="Heading3"/>
+        <w:keepNext/>
+        <w:widowControl/>
+      </w:pPr>
+      <w:r>
+        <w:rPr>
+          <w:rFonts w:ascii="Calibri" w:hAnsi="Calibri" w:cs="Calibri"/>
+        </w:rPr>
+        <w:t>P10B-05 — Veskify site-map and page-family authority</w:t>
+      </w:r>
+    </w:p>
+    <w:p>
+      <w:pPr>
+        <w:pStyle w:val="Normal"/>
+        <w:numPr>
+          <w:ilvl w:val="0"/>
+          <w:numId w:val="1"/>
+        </w:numPr>
+        <w:widowControl/>
+      </w:pPr>
+      <w:r>
+        <w:rPr>
+          <w:rFonts w:ascii="Calibri" w:hAnsi="Calibri" w:cs="Calibri"/>
+          <w:b/>
+          <w:bCs/>
+        </w:rPr>
+        <w:t>Outcome:</w:t>
+      </w:r>
+      <w:r>
+        <w:rPr>
+          <w:rFonts w:ascii="Calibri" w:hAnsi="Calibri" w:cs="Calibri"/>
+        </w:rPr>
+        <w:t xml:space="preserve"> Create and validate complete storefront page sets, navigation, routes, and registered page families through PageBlueprint and </w:t>
+      </w:r>
+      <w:r>
+        <w:rPr>
+          <w:rFonts w:ascii="Consolas" w:hAnsi="Consolas" w:cs="Consolas"/>
+          <w:sz w:val="19"/>
+          <w:szCs w:val="19"/>
+        </w:rPr>
         <w:t>StorefrontSnapshot</w:t>
       </w:r>
       <w:r>
@@ -10409,7 +10463,7 @@
         </w:rPr>
         <w:t xml:space="preserve">. See </w:t>
       </w:r>
-      <w:hyperlink r:id="rIdHyperlink8" w:history="1">
+      <w:hyperlink r:id="rIdHyperlink9" w:history="1">
         <w:r>
           <w:rPr>
             <w:rFonts w:ascii="Calibri" w:hAnsi="Calibri" w:cs="Calibri"/>
@@ -14730,7 +14784,7 @@
         </w:rPr>
         <w:t xml:space="preserve"> </w:t>
       </w:r>
-      <w:hyperlink r:id="rIdHyperlink9" w:history="1">
+      <w:hyperlink r:id="rIdHyperlink10" w:history="1">
         <w:r>
           <w:rPr>
             <w:rFonts w:ascii="Calibri" w:hAnsi="Calibri" w:cs="Calibri"/>
@@ -14746,7 +14800,7 @@
         </w:rPr>
         <w:t xml:space="preserve"> and </w:t>
       </w:r>
-      <w:hyperlink r:id="rIdHyperlink10" w:history="1">
+      <w:hyperlink r:id="rIdHyperlink11" w:history="1">
         <w:r>
           <w:rPr>
             <w:rFonts w:ascii="Calibri" w:hAnsi="Calibri" w:cs="Calibri"/>

</xml_diff>

<commit_message>
feat: add canonical product card family
</commit_message>
<xml_diff>
--- a/docs/VESKIFY_DEVELOPMENT_DELIVERY_TRACKER_v1.3.0.docx
+++ b/docs/VESKIFY_DEVELOPMENT_DELIVERY_TRACKER_v1.3.0.docx
@@ -38,7 +38,7 @@
         <w:rPr>
           <w:rFonts w:ascii="Calibri" w:hAnsi="Calibri" w:cs="Calibri"/>
         </w:rPr>
-        <w:t>Delivery status baseline: 8 August 2026, current main after merged PR #176</w:t>
+        <w:t>Delivery status baseline: 8 August 2026, P10B-08 branch based on current main after merged PR #177</w:t>
       </w:r>
     </w:p>
     <w:p>
@@ -245,7 +245,21 @@
               <w:rPr>
                 <w:rFonts w:ascii="Calibri" w:hAnsi="Calibri" w:cs="Calibri"/>
               </w:rPr>
-              <w:t>8 August 2026, P10B-04 implementation and evidence branch</w:t>
+              <w:t xml:space="preserve">8 August 2026, P10B-08 implementation and evidence branch based on current </w:t>
+            </w:r>
+            <w:r>
+              <w:rPr>
+                <w:rFonts w:ascii="Consolas" w:hAnsi="Consolas" w:cs="Consolas"/>
+                <w:sz w:val="19"/>
+                <w:szCs w:val="19"/>
+              </w:rPr>
+              <w:t>main</w:t>
+            </w:r>
+            <w:r>
+              <w:rPr>
+                <w:rFonts w:ascii="Calibri" w:hAnsi="Calibri" w:cs="Calibri"/>
+              </w:rPr>
+              <w:t xml:space="preserve"> after PR #177</w:t>
             </w:r>
           </w:p>
         </w:tc>
@@ -3515,7 +3529,7 @@
               <w:rPr>
                 <w:rFonts w:ascii="Calibri" w:hAnsi="Calibri" w:cs="Calibri"/>
               </w:rPr>
-              <w:t>☐</w:t>
+              <w:t>☑</w:t>
             </w:r>
           </w:p>
         </w:tc>
@@ -3572,7 +3586,7 @@
                 <w:b/>
                 <w:bCs/>
               </w:rPr>
-              <w:t>Planned</w:t>
+              <w:t>Baseline</w:t>
             </w:r>
           </w:p>
         </w:tc>
@@ -3626,7 +3640,7 @@
               <w:rPr>
                 <w:rFonts w:ascii="Calibri" w:hAnsi="Calibri" w:cs="Calibri"/>
               </w:rPr>
-              <w:t>Five anatomies, protected commerce, full chain and visual review</w:t>
+              <w:t>One renderer; five anatomies; protected facts/media; lifecycle and four-width browser evidence</w:t>
             </w:r>
           </w:p>
         </w:tc>
@@ -9204,7 +9218,7 @@
         <w:rPr>
           <w:rFonts w:ascii="Calibri" w:hAnsi="Calibri" w:cs="Calibri"/>
         </w:rPr>
-        <w:t xml:space="preserve">. P10B-01 through P10B-05 are </w:t>
+        <w:t xml:space="preserve">. P10B-01 through P10B-05 and P10B-08 are </w:t>
       </w:r>
       <w:r>
         <w:rPr>
@@ -9218,7 +9232,7 @@
         <w:rPr>
           <w:rFonts w:ascii="Calibri" w:hAnsi="Calibri" w:cs="Calibri"/>
         </w:rPr>
-        <w:t xml:space="preserve">. P10B-06 through P10B-18 remain </w:t>
+        <w:t xml:space="preserve">. P10B-06, P10B-07, and P10B-09 through P10B-18 remain </w:t>
       </w:r>
       <w:r>
         <w:rPr>
@@ -10858,6 +10872,42 @@
     <w:p>
       <w:pPr>
         <w:pStyle w:val="Normal"/>
+        <w:widowControl/>
+      </w:pPr>
+      <w:r>
+        <w:rPr>
+          <w:rFonts w:ascii="Calibri" w:hAnsi="Calibri" w:cs="Calibri"/>
+          <w:b/>
+          <w:bCs/>
+        </w:rPr>
+        <w:t>Status:</w:t>
+      </w:r>
+      <w:r>
+        <w:rPr>
+          <w:rFonts w:ascii="Calibri" w:hAnsi="Calibri" w:cs="Calibri"/>
+        </w:rPr>
+        <w:t xml:space="preserve"> Baseline. One fingerprinted authority and renderer now serve homepage merchandising, collection/results, related products, and legacy compatibility. Five meaningful anatomies preserve canonical facts and P10B-04 media lineage through plan, proposal, snapshot, save/reload, publish, and responsive browser evidence. See </w:t>
+      </w:r>
+      <w:hyperlink r:id="rIdHyperlink10" w:history="1">
+        <w:r>
+          <w:rPr>
+            <w:rFonts w:ascii="Calibri" w:hAnsi="Calibri" w:cs="Calibri"/>
+            <w:color w:val="2E74B5"/>
+            <w:u w:val="single"/>
+          </w:rPr>
+          <w:t>P10B_08_CANONICAL_PRODUCT_CARD_AND_MERCHANDISING.md</w:t>
+        </w:r>
+      </w:hyperlink>
+      <w:r>
+        <w:rPr>
+          <w:rFonts w:ascii="Calibri" w:hAnsi="Calibri" w:cs="Calibri"/>
+        </w:rPr>
+        <w:t>.</w:t>
+      </w:r>
+    </w:p>
+    <w:p>
+      <w:pPr>
+        <w:pStyle w:val="Normal"/>
         <w:numPr>
           <w:ilvl w:val="0"/>
           <w:numId w:val="1"/>
@@ -14784,7 +14834,7 @@
         </w:rPr>
         <w:t xml:space="preserve"> </w:t>
       </w:r>
-      <w:hyperlink r:id="rIdHyperlink10" w:history="1">
+      <w:hyperlink r:id="rIdHyperlink11" w:history="1">
         <w:r>
           <w:rPr>
             <w:rFonts w:ascii="Calibri" w:hAnsi="Calibri" w:cs="Calibri"/>
@@ -14800,7 +14850,7 @@
         </w:rPr>
         <w:t xml:space="preserve"> and </w:t>
       </w:r>
-      <w:hyperlink r:id="rIdHyperlink11" w:history="1">
+      <w:hyperlink r:id="rIdHyperlink12" w:history="1">
         <w:r>
           <w:rPr>
             <w:rFonts w:ascii="Calibri" w:hAnsi="Calibri" w:cs="Calibri"/>

</xml_diff>

<commit_message>
feat: add commercial shared-frame families
</commit_message>
<xml_diff>
--- a/docs/VESKIFY_DEVELOPMENT_DELIVERY_TRACKER_v1.3.0.docx
+++ b/docs/VESKIFY_DEVELOPMENT_DELIVERY_TRACKER_v1.3.0.docx
@@ -38,7 +38,7 @@
         <w:rPr>
           <w:rFonts w:ascii="Calibri" w:hAnsi="Calibri" w:cs="Calibri"/>
         </w:rPr>
-        <w:t>Delivery status baseline: 8 August 2026, current main after merged PR #176</w:t>
+        <w:t>Delivery status baseline: 8 August 2026, P10B-06 delivery</w:t>
       </w:r>
     </w:p>
     <w:p>
@@ -245,7 +245,7 @@
               <w:rPr>
                 <w:rFonts w:ascii="Calibri" w:hAnsi="Calibri" w:cs="Calibri"/>
               </w:rPr>
-              <w:t>8 August 2026, P10B-04 implementation and evidence branch</w:t>
+              <w:t>8 August 2026, P10B-06 commercial shared-frame delivery</w:t>
             </w:r>
           </w:p>
         </w:tc>
@@ -3245,7 +3245,7 @@
               <w:rPr>
                 <w:rFonts w:ascii="Calibri" w:hAnsi="Calibri" w:cs="Calibri"/>
               </w:rPr>
-              <w:t>☐</w:t>
+              <w:t>☑</w:t>
             </w:r>
           </w:p>
         </w:tc>
@@ -3302,7 +3302,7 @@
                 <w:b/>
                 <w:bCs/>
               </w:rPr>
-              <w:t>Planned</w:t>
+              <w:t>Baseline</w:t>
             </w:r>
           </w:p>
         </w:tc>
@@ -3356,7 +3356,7 @@
               <w:rPr>
                 <w:rFonts w:ascii="Calibri" w:hAnsi="Calibri" w:cs="Calibri"/>
               </w:rPr>
-              <w:t>Minimum frame/mobile/footer coverage and responsive human review</w:t>
+              <w:t>Four frames, three mobile modes, four footers, lifecycle and retained browser review</w:t>
             </w:r>
           </w:p>
         </w:tc>
@@ -9204,7 +9204,7 @@
         <w:rPr>
           <w:rFonts w:ascii="Calibri" w:hAnsi="Calibri" w:cs="Calibri"/>
         </w:rPr>
-        <w:t xml:space="preserve">. P10B-01 through P10B-05 are </w:t>
+        <w:t xml:space="preserve">. P10B-01 through P10B-06 are </w:t>
       </w:r>
       <w:r>
         <w:rPr>
@@ -9218,7 +9218,7 @@
         <w:rPr>
           <w:rFonts w:ascii="Calibri" w:hAnsi="Calibri" w:cs="Calibri"/>
         </w:rPr>
-        <w:t xml:space="preserve">. P10B-06 through P10B-18 remain </w:t>
+        <w:t xml:space="preserve">. P10B-07 through P10B-18 remain </w:t>
       </w:r>
       <w:r>
         <w:rPr>
@@ -10663,6 +10663,60 @@
     </w:p>
     <w:p>
       <w:pPr>
+        <w:pStyle w:val="Normal"/>
+        <w:numPr>
+          <w:ilvl w:val="0"/>
+          <w:numId w:val="1"/>
+        </w:numPr>
+        <w:widowControl/>
+      </w:pPr>
+      <w:r>
+        <w:rPr>
+          <w:rFonts w:ascii="Calibri" w:hAnsi="Calibri" w:cs="Calibri"/>
+          <w:b/>
+          <w:bCs/>
+        </w:rPr>
+        <w:t>Status:</w:t>
+      </w:r>
+      <w:r>
+        <w:rPr>
+          <w:rFonts w:ascii="Calibri" w:hAnsi="Calibri" w:cs="Calibri"/>
+        </w:rPr>
+        <w:t xml:space="preserve"> </w:t>
+      </w:r>
+      <w:r>
+        <w:rPr>
+          <w:rFonts w:ascii="Calibri" w:hAnsi="Calibri" w:cs="Calibri"/>
+          <w:b/>
+          <w:bCs/>
+        </w:rPr>
+        <w:t>Baseline</w:t>
+      </w:r>
+      <w:r>
+        <w:rPr>
+          <w:rFonts w:ascii="Calibri" w:hAnsi="Calibri" w:cs="Calibri"/>
+        </w:rPr>
+        <w:t xml:space="preserve">. Four exact root-frame profiles, three mobile modes, and four footer compositions preserve canonical navigation and frame identity through snapshot, save/reload, Puck root, preview, publication compilation, EN/FI, and 375/768/1024/1440 px evidence. See </w:t>
+      </w:r>
+      <w:hyperlink r:id="rIdHyperlink10" w:history="1">
+        <w:r>
+          <w:rPr>
+            <w:rFonts w:ascii="Calibri" w:hAnsi="Calibri" w:cs="Calibri"/>
+            <w:color w:val="2E74B5"/>
+            <w:u w:val="single"/>
+          </w:rPr>
+          <w:t>P10B_06_COMMERCIAL_SHARED_FRAME_FAMILIES.md</w:t>
+        </w:r>
+      </w:hyperlink>
+      <w:r>
+        <w:rPr>
+          <w:rFonts w:ascii="Calibri" w:hAnsi="Calibri" w:cs="Calibri"/>
+        </w:rPr>
+        <w:t>.</w:t>
+      </w:r>
+    </w:p>
+    <w:p>
+      <w:pPr>
         <w:pStyle w:val="Heading3"/>
         <w:keepNext/>
         <w:widowControl/>
@@ -14784,7 +14838,7 @@
         </w:rPr>
         <w:t xml:space="preserve"> </w:t>
       </w:r>
-      <w:hyperlink r:id="rIdHyperlink10" w:history="1">
+      <w:hyperlink r:id="rIdHyperlink11" w:history="1">
         <w:r>
           <w:rPr>
             <w:rFonts w:ascii="Calibri" w:hAnsi="Calibri" w:cs="Calibri"/>
@@ -14800,7 +14854,7 @@
         </w:rPr>
         <w:t xml:space="preserve"> and </w:t>
       </w:r>
-      <w:hyperlink r:id="rIdHyperlink11" w:history="1">
+      <w:hyperlink r:id="rIdHyperlink12" w:history="1">
         <w:r>
           <w:rPr>
             <w:rFonts w:ascii="Calibri" w:hAnsi="Calibri" w:cs="Calibri"/>
@@ -16442,7 +16496,7 @@
         <w:rPr>
           <w:rFonts w:ascii="Calibri" w:hAnsi="Calibri" w:cs="Calibri"/>
         </w:rPr>
-        <w:t xml:space="preserve"> Prove one real pilot has onboarding, diagnostics, audit records, observability, recovery guidance, and documented limitations.</w:t>
+        <w:t xml:space="preserve"> Prove one real pilot has complete diagnostics, audit, observability, recovery, and documented limitations.</w:t>
       </w:r>
     </w:p>
     <w:p>
@@ -16594,19 +16648,6 @@
     </w:p>
     <w:p>
       <w:pPr>
-        <w:pStyle w:val="Heading3"/>
-        <w:keepNext/>
-        <w:widowControl/>
-      </w:pPr>
-      <w:r>
-        <w:rPr>
-          <w:rFonts w:ascii="Calibri" w:hAnsi="Calibri" w:cs="Calibri"/>
-        </w:rPr>
-        <w:t>P12 — Production and pilot closure</w:t>
-      </w:r>
-    </w:p>
-    <w:p>
-      <w:pPr>
         <w:pStyle w:val="Normal"/>
         <w:numPr>
           <w:ilvl w:val="0"/>
@@ -16626,7 +16667,7 @@
         <w:rPr>
           <w:rFonts w:ascii="Calibri" w:hAnsi="Calibri" w:cs="Calibri"/>
         </w:rPr>
-        <w:t xml:space="preserve"> Establish authentication, tenant isolation, security, observability, performance, backup/recovery, deployment, incidents, and controlled pilot operations.</w:t>
+        <w:t xml:space="preserve"> Close production authentication, tenancy, security, observability, recovery, deployment, incident response, and controlled-pilot operations.</w:t>
       </w:r>
     </w:p>
     <w:p>
@@ -16736,18 +16777,8 @@
         <w:rPr>
           <w:rFonts w:ascii="Calibri" w:hAnsi="Calibri" w:cs="Calibri"/>
         </w:rPr>
-        <w:t xml:space="preserve"> Security/load/recovery exercises, production telemetry, and controlled pilot evidence.</w:t>
-      </w:r>
-    </w:p>
-    <w:p>
-      <w:pPr>
-        <w:pStyle w:val="Normal"/>
-        <w:numPr>
-          <w:ilvl w:val="0"/>
-          <w:numId w:val="1"/>
-        </w:numPr>
-        <w:widowControl/>
-      </w:pPr>
+        <w:t xml:space="preserve"> Security, load, recovery, telemetry, and controlled-pilot evidence. </w:t>
+      </w:r>
       <w:r>
         <w:rPr>
           <w:rFonts w:ascii="Calibri" w:hAnsi="Calibri" w:cs="Calibri"/>

</xml_diff>

<commit_message>
feat: add commercial storytelling families
</commit_message>
<xml_diff>
--- a/docs/VESKIFY_DEVELOPMENT_DELIVERY_TRACKER_v1.3.0.docx
+++ b/docs/VESKIFY_DEVELOPMENT_DELIVERY_TRACKER_v1.3.0.docx
@@ -38,7 +38,7 @@
         <w:rPr>
           <w:rFonts w:ascii="Calibri" w:hAnsi="Calibri" w:cs="Calibri"/>
         </w:rPr>
-        <w:t>Delivery status baseline: 8 August 2026, current main after merged PR #176</w:t>
+        <w:t>Delivery status baseline: 8 August 2026, current main after merged PR #177</w:t>
       </w:r>
     </w:p>
     <w:p>
@@ -245,7 +245,7 @@
               <w:rPr>
                 <w:rFonts w:ascii="Calibri" w:hAnsi="Calibri" w:cs="Calibri"/>
               </w:rPr>
-              <w:t>8 August 2026, P10B-04 implementation and evidence branch</w:t>
+              <w:t>8 August 2026, P10B-07 implementation and evidence branch</w:t>
             </w:r>
           </w:p>
         </w:tc>
@@ -2951,7 +2951,7 @@
               <w:rPr>
                 <w:rFonts w:ascii="Calibri" w:hAnsi="Calibri" w:cs="Calibri"/>
               </w:rPr>
-              <w:t>25 definitions/91 variants; structural, query, migration and rejection evidence</w:t>
+              <w:t>Complete classification; structural, query, migration and rejection evidence</w:t>
             </w:r>
           </w:p>
         </w:tc>
@@ -3380,7 +3380,7 @@
               <w:rPr>
                 <w:rFonts w:ascii="Calibri" w:hAnsi="Calibri" w:cs="Calibri"/>
               </w:rPr>
-              <w:t>☐</w:t>
+              <w:t>☑</w:t>
             </w:r>
           </w:p>
         </w:tc>
@@ -3437,7 +3437,7 @@
                 <w:b/>
                 <w:bCs/>
               </w:rPr>
-              <w:t>Planned</w:t>
+              <w:t>Baseline</w:t>
             </w:r>
           </w:p>
         </w:tc>
@@ -3491,7 +3491,7 @@
               <w:rPr>
                 <w:rFonts w:ascii="Calibri" w:hAnsi="Calibri" w:cs="Calibri"/>
               </w:rPr>
-              <w:t>Minimum anatomy coverage, provenance, full chain and visual review</w:t>
+              <w:t>Six heroes, story/campaign/proof chain, provenance and four-width browser review</w:t>
             </w:r>
           </w:p>
         </w:tc>
@@ -9204,7 +9204,7 @@
         <w:rPr>
           <w:rFonts w:ascii="Calibri" w:hAnsi="Calibri" w:cs="Calibri"/>
         </w:rPr>
-        <w:t xml:space="preserve">. P10B-01 through P10B-05 are </w:t>
+        <w:t xml:space="preserve">. P10B-01 through P10B-05 and P10B-07 are </w:t>
       </w:r>
       <w:r>
         <w:rPr>
@@ -9218,7 +9218,7 @@
         <w:rPr>
           <w:rFonts w:ascii="Calibri" w:hAnsi="Calibri" w:cs="Calibri"/>
         </w:rPr>
-        <w:t xml:space="preserve">. P10B-06 through P10B-18 remain </w:t>
+        <w:t xml:space="preserve">. P10B-06 and P10B-08 through P10B-18 remain </w:t>
       </w:r>
       <w:r>
         <w:rPr>
@@ -9963,7 +9963,7 @@
         <w:rPr>
           <w:rFonts w:ascii="Calibri" w:hAnsi="Calibri" w:cs="Calibri"/>
         </w:rPr>
-        <w:t xml:space="preserve">. All 25 current V2 definitions and 91 variants are classified explicitly without false commercial-ready promotion. See </w:t>
+        <w:t xml:space="preserve">. At P10B-03 delivery, all then-current 25 V2 definitions and 91 variants were classified explicitly without false commercial-ready promotion. Later family tasks extend that same authority rather than replacing it. See </w:t>
       </w:r>
       <w:hyperlink r:id="rIdHyperlink7" w:history="1">
         <w:r>
@@ -10844,6 +10844,60 @@
     </w:p>
     <w:p>
       <w:pPr>
+        <w:pStyle w:val="Normal"/>
+        <w:numPr>
+          <w:ilvl w:val="0"/>
+          <w:numId w:val="1"/>
+        </w:numPr>
+        <w:widowControl/>
+      </w:pPr>
+      <w:r>
+        <w:rPr>
+          <w:rFonts w:ascii="Calibri" w:hAnsi="Calibri" w:cs="Calibri"/>
+          <w:b/>
+          <w:bCs/>
+        </w:rPr>
+        <w:t>Status:</w:t>
+      </w:r>
+      <w:r>
+        <w:rPr>
+          <w:rFonts w:ascii="Calibri" w:hAnsi="Calibri" w:cs="Calibri"/>
+        </w:rPr>
+        <w:t xml:space="preserve"> </w:t>
+      </w:r>
+      <w:r>
+        <w:rPr>
+          <w:rFonts w:ascii="Calibri" w:hAnsi="Calibri" w:cs="Calibri"/>
+          <w:b/>
+          <w:bCs/>
+        </w:rPr>
+        <w:t>Baseline</w:t>
+      </w:r>
+      <w:r>
+        <w:rPr>
+          <w:rFonts w:ascii="Calibri" w:hAnsi="Calibri" w:cs="Calibri"/>
+        </w:rPr>
+        <w:t xml:space="preserve">. Six meaningful hero anatomies, five editorial/story anatomies, five campaign/promotion anatomies and three evidence-grounded proof/service anatomies are registered, PageBlueprint-selectable, deterministically generated, snapshot/publish preserved and rendered through one shared implementation. Focused deterministic coverage and a zero-provider Chromium scenario retain evidence at 375, 768, 1024 and 1440 px. See </w:t>
+      </w:r>
+      <w:hyperlink r:id="rIdHyperlink10" w:history="1">
+        <w:r>
+          <w:rPr>
+            <w:rFonts w:ascii="Calibri" w:hAnsi="Calibri" w:cs="Calibri"/>
+            <w:color w:val="2E74B5"/>
+            <w:u w:val="single"/>
+          </w:rPr>
+          <w:t>P10B_07_HERO_EDITORIAL_CAMPAIGN_PROOF_FAMILIES.md</w:t>
+        </w:r>
+      </w:hyperlink>
+      <w:r>
+        <w:rPr>
+          <w:rFonts w:ascii="Calibri" w:hAnsi="Calibri" w:cs="Calibri"/>
+        </w:rPr>
+        <w:t>.</w:t>
+      </w:r>
+    </w:p>
+    <w:p>
+      <w:pPr>
         <w:pStyle w:val="Heading3"/>
         <w:keepNext/>
         <w:widowControl/>
@@ -14784,7 +14838,7 @@
         </w:rPr>
         <w:t xml:space="preserve"> </w:t>
       </w:r>
-      <w:hyperlink r:id="rIdHyperlink10" w:history="1">
+      <w:hyperlink r:id="rIdHyperlink11" w:history="1">
         <w:r>
           <w:rPr>
             <w:rFonts w:ascii="Calibri" w:hAnsi="Calibri" w:cs="Calibri"/>
@@ -14800,7 +14854,7 @@
         </w:rPr>
         <w:t xml:space="preserve"> and </w:t>
       </w:r>
-      <w:hyperlink r:id="rIdHyperlink11" w:history="1">
+      <w:hyperlink r:id="rIdHyperlink12" w:history="1">
         <w:r>
           <w:rPr>
             <w:rFonts w:ascii="Calibri" w:hAnsi="Calibri" w:cs="Calibri"/>

</xml_diff>

<commit_message>
feat: add commercial homepage profile library
</commit_message>
<xml_diff>
--- a/docs/VESKIFY_DEVELOPMENT_DELIVERY_TRACKER_v1.3.0.docx
+++ b/docs/VESKIFY_DEVELOPMENT_DELIVERY_TRACKER_v1.3.0.docx
@@ -245,7 +245,7 @@
               <w:rPr>
                 <w:rFonts w:ascii="Calibri" w:hAnsi="Calibri" w:cs="Calibri"/>
               </w:rPr>
-              <w:t>9 August 2026, P10B-06 shared frame, P10B-07 storytelling and P10B-08 product cards</w:t>
+              <w:t>9 August 2026, P10B-09 commercial homepage profiles</w:t>
             </w:r>
           </w:p>
         </w:tc>
@@ -3650,7 +3650,7 @@
               <w:rPr>
                 <w:rFonts w:ascii="Calibri" w:hAnsi="Calibri" w:cs="Calibri"/>
               </w:rPr>
-              <w:t>☐</w:t>
+              <w:t>☑</w:t>
             </w:r>
           </w:p>
         </w:tc>
@@ -3707,7 +3707,7 @@
                 <w:b/>
                 <w:bCs/>
               </w:rPr>
-              <w:t>Planned</w:t>
+              <w:t>Baseline</w:t>
             </w:r>
           </w:p>
         </w:tc>
@@ -3761,7 +3761,7 @@
               <w:rPr>
                 <w:rFonts w:ascii="Calibri" w:hAnsi="Calibri" w:cs="Calibri"/>
               </w:rPr>
-              <w:t>Six profiles, materialization-to-render and visual review</w:t>
+              <w:t>Six profiles, materialization-to-render and 24-view visual review</w:t>
             </w:r>
           </w:p>
         </w:tc>
@@ -9204,7 +9204,7 @@
         <w:rPr>
           <w:rFonts w:ascii="Calibri" w:hAnsi="Calibri" w:cs="Calibri"/>
         </w:rPr>
-        <w:t xml:space="preserve">. P10B-01 through P10B-08 are </w:t>
+        <w:t xml:space="preserve">. P10B-01 through P10B-09 are </w:t>
       </w:r>
       <w:r>
         <w:rPr>
@@ -9218,7 +9218,7 @@
         <w:rPr>
           <w:rFonts w:ascii="Calibri" w:hAnsi="Calibri" w:cs="Calibri"/>
         </w:rPr>
-        <w:t xml:space="preserve">. P10B-09 through P10B-18 remain </w:t>
+        <w:t xml:space="preserve">. P10B-10 through P10B-18 remain </w:t>
       </w:r>
       <w:r>
         <w:rPr>
@@ -11183,6 +11183,42 @@
     <w:p>
       <w:pPr>
         <w:pStyle w:val="Normal"/>
+        <w:widowControl/>
+      </w:pPr>
+      <w:r>
+        <w:rPr>
+          <w:rFonts w:ascii="Calibri" w:hAnsi="Calibri" w:cs="Calibri"/>
+          <w:b/>
+          <w:bCs/>
+        </w:rPr>
+        <w:t>Status:</w:t>
+      </w:r>
+      <w:r>
+        <w:rPr>
+          <w:rFonts w:ascii="Calibri" w:hAnsi="Calibri" w:cs="Calibri"/>
+        </w:rPr>
+        <w:t xml:space="preserve"> Baseline. Six versioned, structurally fingerprinted homepage PageBlueprint profiles compose current shared-frame, commercial storytelling, canonical product-card, approved-media, and Design DNA authority. Evidence/cardinality guards fail closed; deterministic lifecycle and 24 retained four-width browser images pass. See </w:t>
+      </w:r>
+      <w:hyperlink r:id="rIdHyperlink13" w:history="1">
+        <w:r>
+          <w:rPr>
+            <w:rFonts w:ascii="Calibri" w:hAnsi="Calibri" w:cs="Calibri"/>
+            <w:color w:val="2E74B5"/>
+            <w:u w:val="single"/>
+          </w:rPr>
+          <w:t>P10B_09_COMMERCIAL_HOMEPAGE_PROFILE_LIBRARY.md</w:t>
+        </w:r>
+      </w:hyperlink>
+      <w:r>
+        <w:rPr>
+          <w:rFonts w:ascii="Calibri" w:hAnsi="Calibri" w:cs="Calibri"/>
+        </w:rPr>
+        <w:t>.</w:t>
+      </w:r>
+    </w:p>
+    <w:p>
+      <w:pPr>
+        <w:pStyle w:val="Normal"/>
         <w:numPr>
           <w:ilvl w:val="0"/>
           <w:numId w:val="1"/>
@@ -14928,7 +14964,7 @@
         </w:rPr>
         <w:t xml:space="preserve"> </w:t>
       </w:r>
-      <w:hyperlink r:id="rIdHyperlink13" w:history="1">
+      <w:hyperlink r:id="rIdHyperlink14" w:history="1">
         <w:r>
           <w:rPr>
             <w:rFonts w:ascii="Calibri" w:hAnsi="Calibri" w:cs="Calibri"/>
@@ -14944,7 +14980,7 @@
         </w:rPr>
         <w:t xml:space="preserve"> and </w:t>
       </w:r>
-      <w:hyperlink r:id="rIdHyperlink14" w:history="1">
+      <w:hyperlink r:id="rIdHyperlink15" w:history="1">
         <w:r>
           <w:rPr>
             <w:rFonts w:ascii="Calibri" w:hAnsi="Calibri" w:cs="Calibri"/>

</xml_diff>

<commit_message>
feat: add commercial PDP profile library
</commit_message>
<xml_diff>
--- a/docs/VESKIFY_DEVELOPMENT_DELIVERY_TRACKER_v1.3.0.docx
+++ b/docs/VESKIFY_DEVELOPMENT_DELIVERY_TRACKER_v1.3.0.docx
@@ -38,7 +38,7 @@
         <w:rPr>
           <w:rFonts w:ascii="Calibri" w:hAnsi="Calibri" w:cs="Calibri"/>
         </w:rPr>
-        <w:t>Delivery status baseline: 9 August 2026, P10B-06, P10B-07 and P10B-08</w:t>
+        <w:t>Delivery status baseline: 9 August 2026, P10B-11 commercial PDP profiles</w:t>
       </w:r>
     </w:p>
     <w:p>
@@ -245,7 +245,7 @@
               <w:rPr>
                 <w:rFonts w:ascii="Calibri" w:hAnsi="Calibri" w:cs="Calibri"/>
               </w:rPr>
-              <w:t>9 August 2026, P10B-09 commercial homepage profiles</w:t>
+              <w:t>9 August 2026, P10B-11 commercial PDP profiles</w:t>
             </w:r>
           </w:p>
         </w:tc>
@@ -4111,7 +4111,7 @@
               <w:rPr>
                 <w:rFonts w:ascii="Calibri" w:hAnsi="Calibri" w:cs="Calibri"/>
               </w:rPr>
-              <w:t>☐</w:t>
+              <w:t>☑</w:t>
             </w:r>
           </w:p>
         </w:tc>
@@ -4168,7 +4168,7 @@
                 <w:b/>
                 <w:bCs/>
               </w:rPr>
-              <w:t>Planned</w:t>
+              <w:t>Baseline</w:t>
             </w:r>
           </w:p>
         </w:tc>
@@ -4222,7 +4222,7 @@
               <w:rPr>
                 <w:rFonts w:ascii="Calibri" w:hAnsi="Calibri" w:cs="Calibri"/>
               </w:rPr>
-              <w:t>Four profiles, generic options/commerce and visual review</w:t>
+              <w:t>Four fingerprinted profiles, generic simple/configurable commerce, lifecycle and 16-view review</w:t>
             </w:r>
           </w:p>
         </w:tc>
@@ -9204,7 +9204,7 @@
         <w:rPr>
           <w:rFonts w:ascii="Calibri" w:hAnsi="Calibri" w:cs="Calibri"/>
         </w:rPr>
-        <w:t xml:space="preserve">. P10B-01 through P10B-09 are </w:t>
+        <w:t xml:space="preserve">. P10B-01 through P10B-09 and P10B-11 are </w:t>
       </w:r>
       <w:r>
         <w:rPr>
@@ -9218,7 +9218,7 @@
         <w:rPr>
           <w:rFonts w:ascii="Calibri" w:hAnsi="Calibri" w:cs="Calibri"/>
         </w:rPr>
-        <w:t xml:space="preserve">. P10B-10 through P10B-18 remain </w:t>
+        <w:t xml:space="preserve">. P10B-10 and P10B-12 through P10B-18 remain </w:t>
       </w:r>
       <w:r>
         <w:rPr>
@@ -11595,49 +11595,35 @@
     <w:p>
       <w:pPr>
         <w:pStyle w:val="Normal"/>
-        <w:numPr>
-          <w:ilvl w:val="0"/>
-          <w:numId w:val="1"/>
-        </w:numPr>
-        <w:widowControl/>
-      </w:pPr>
-      <w:r>
-        <w:rPr>
-          <w:rFonts w:ascii="Calibri" w:hAnsi="Calibri" w:cs="Calibri"/>
-          <w:b/>
-          <w:bCs/>
-        </w:rPr>
-        <w:t>Outcome:</w:t>
-      </w:r>
-      <w:r>
-        <w:rPr>
-          <w:rFonts w:ascii="Calibri" w:hAnsi="Calibri" w:cs="Calibri"/>
-        </w:rPr>
-        <w:t xml:space="preserve"> Deliver distinct standard, high-consideration, gallery-led, and variant-led purchase experiences.</w:t>
-      </w:r>
-    </w:p>
-    <w:p>
-      <w:pPr>
-        <w:pStyle w:val="Normal"/>
-        <w:numPr>
-          <w:ilvl w:val="0"/>
-          <w:numId w:val="1"/>
-        </w:numPr>
-        <w:widowControl/>
-      </w:pPr>
-      <w:r>
-        <w:rPr>
-          <w:rFonts w:ascii="Calibri" w:hAnsi="Calibri" w:cs="Calibri"/>
-          <w:b/>
-          <w:bCs/>
-        </w:rPr>
-        <w:t>Authority:</w:t>
-      </w:r>
-      <w:r>
-        <w:rPr>
-          <w:rFonts w:ascii="Calibri" w:hAnsi="Calibri" w:cs="Calibri"/>
-        </w:rPr>
-        <w:t xml:space="preserve"> Existing PageBlueprint profiles, </w:t>
+        <w:widowControl/>
+      </w:pPr>
+      <w:r>
+        <w:rPr>
+          <w:rFonts w:ascii="Calibri" w:hAnsi="Calibri" w:cs="Calibri"/>
+          <w:b/>
+          <w:bCs/>
+        </w:rPr>
+        <w:t>Status:</w:t>
+      </w:r>
+      <w:r>
+        <w:rPr>
+          <w:rFonts w:ascii="Calibri" w:hAnsi="Calibri" w:cs="Calibri"/>
+        </w:rPr>
+        <w:t xml:space="preserve"> </w:t>
+      </w:r>
+      <w:r>
+        <w:rPr>
+          <w:rFonts w:ascii="Calibri" w:hAnsi="Calibri" w:cs="Calibri"/>
+          <w:b/>
+          <w:bCs/>
+        </w:rPr>
+        <w:t>Baseline</w:t>
+      </w:r>
+      <w:r>
+        <w:rPr>
+          <w:rFonts w:ascii="Calibri" w:hAnsi="Calibri" w:cs="Calibri"/>
+        </w:rPr>
+        <w:t xml:space="preserve">. Four fingerprinted PageBlueprint profiles select the existing generic </w:t>
       </w:r>
       <w:r>
         <w:rPr>
@@ -11651,140 +11637,23 @@
         <w:rPr>
           <w:rFonts w:ascii="Calibri" w:hAnsi="Calibri" w:cs="Calibri"/>
         </w:rPr>
-        <w:t>, and P6 generic option resolution.</w:t>
-      </w:r>
-    </w:p>
-    <w:p>
-      <w:pPr>
-        <w:pStyle w:val="Normal"/>
-        <w:numPr>
-          <w:ilvl w:val="0"/>
-          <w:numId w:val="1"/>
-        </w:numPr>
-        <w:widowControl/>
-      </w:pPr>
-      <w:r>
-        <w:rPr>
-          <w:rFonts w:ascii="Calibri" w:hAnsi="Calibri" w:cs="Calibri"/>
-          <w:b/>
-          <w:bCs/>
-        </w:rPr>
-        <w:t>Depends on:</w:t>
-      </w:r>
-      <w:r>
-        <w:rPr>
-          <w:rFonts w:ascii="Calibri" w:hAnsi="Calibri" w:cs="Calibri"/>
-        </w:rPr>
-        <w:t xml:space="preserve"> P10B-03 through P10B-06 and P10B-08.</w:t>
-      </w:r>
-    </w:p>
-    <w:p>
-      <w:pPr>
-        <w:pStyle w:val="Normal"/>
-        <w:numPr>
-          <w:ilvl w:val="0"/>
-          <w:numId w:val="1"/>
-        </w:numPr>
-        <w:widowControl/>
-      </w:pPr>
-      <w:r>
-        <w:rPr>
-          <w:rFonts w:ascii="Calibri" w:hAnsi="Calibri" w:cs="Calibri"/>
-          <w:b/>
-          <w:bCs/>
-        </w:rPr>
-        <w:t>Done when:</w:t>
-      </w:r>
-      <w:r>
-        <w:rPr>
-          <w:rFonts w:ascii="Calibri" w:hAnsi="Calibri" w:cs="Calibri"/>
-        </w:rPr>
-        <w:t xml:space="preserve"> At least four profiles preserve all simple/configurable option groups, dependencies, incomplete/unavailable states, resolved price/availability/media, related products, responsive modes, snapshot, and published rendering.</w:t>
-      </w:r>
-    </w:p>
-    <w:p>
-      <w:pPr>
-        <w:pStyle w:val="Normal"/>
-        <w:numPr>
-          <w:ilvl w:val="0"/>
-          <w:numId w:val="1"/>
-        </w:numPr>
-        <w:widowControl/>
-      </w:pPr>
-      <w:r>
-        <w:rPr>
-          <w:rFonts w:ascii="Calibri" w:hAnsi="Calibri" w:cs="Calibri"/>
-          <w:b/>
-          <w:bCs/>
-        </w:rPr>
-        <w:t>Fail closed:</w:t>
-      </w:r>
-      <w:r>
-        <w:rPr>
-          <w:rFonts w:ascii="Calibri" w:hAnsi="Calibri" w:cs="Calibri"/>
-        </w:rPr>
-        <w:t xml:space="preserve"> Product-type forks, dropped options, missing bindings, shallow duplicates, and protected commerce/media mutation are rejected.</w:t>
-      </w:r>
-    </w:p>
-    <w:p>
-      <w:pPr>
-        <w:pStyle w:val="Normal"/>
-        <w:numPr>
-          <w:ilvl w:val="0"/>
-          <w:numId w:val="1"/>
-        </w:numPr>
-        <w:widowControl/>
-      </w:pPr>
-      <w:r>
-        <w:rPr>
-          <w:rFonts w:ascii="Calibri" w:hAnsi="Calibri" w:cs="Calibri"/>
-          <w:b/>
-          <w:bCs/>
-        </w:rPr>
-        <w:t>Evidence:</w:t>
-      </w:r>
-      <w:r>
-        <w:rPr>
-          <w:rFonts w:ascii="Calibri" w:hAnsi="Calibri" w:cs="Calibri"/>
-        </w:rPr>
-        <w:t xml:space="preserve"> Dynamic PDP/option/media/commerce regression, capability chain, four-width browser, and retained visual review.</w:t>
-      </w:r>
-    </w:p>
-    <w:p>
-      <w:pPr>
-        <w:pStyle w:val="Normal"/>
-        <w:numPr>
-          <w:ilvl w:val="0"/>
-          <w:numId w:val="1"/>
-        </w:numPr>
-        <w:widowControl/>
-      </w:pPr>
-      <w:r>
-        <w:rPr>
-          <w:rFonts w:ascii="Calibri" w:hAnsi="Calibri" w:cs="Calibri"/>
-          <w:b/>
-          <w:bCs/>
-        </w:rPr>
-        <w:t>Non-goal:</w:t>
-      </w:r>
-      <w:r>
-        <w:rPr>
-          <w:rFonts w:ascii="Calibri" w:hAnsi="Calibri" w:cs="Calibri"/>
-        </w:rPr>
-        <w:t xml:space="preserve"> Product-specific component architecture.</w:t>
-      </w:r>
-    </w:p>
-    <w:p>
-      <w:pPr>
-        <w:pStyle w:val="Heading3"/>
-        <w:keepNext/>
-        <w:widowControl/>
-      </w:pPr>
-      <w:r>
-        <w:rPr>
-          <w:rFonts w:ascii="Calibri" w:hAnsi="Calibri" w:cs="Calibri"/>
-        </w:rPr>
-        <w:t>P10B-12 — Content and support page families</w:t>
+        <w:t xml:space="preserve">: balanced standard commerce, approved-evidence high consideration, P10B-04 gallery-led, and configuration-led. Generic simple/configurable option resolution, canonical product media, P10B-08 related cards, shared-frame compatibility, save/reload and publication remain exact; sixteen browser captures cover 375/768/1024/1440 px. See </w:t>
+      </w:r>
+      <w:hyperlink r:id="rIdHyperlink14" w:history="1">
+        <w:r>
+          <w:rPr>
+            <w:rFonts w:ascii="Calibri" w:hAnsi="Calibri" w:cs="Calibri"/>
+            <w:color w:val="2E74B5"/>
+            <w:u w:val="single"/>
+          </w:rPr>
+          <w:t>P10B_11_COMMERCIAL_PDP_PROFILE_LIBRARY.md</w:t>
+        </w:r>
+      </w:hyperlink>
+      <w:r>
+        <w:rPr>
+          <w:rFonts w:ascii="Calibri" w:hAnsi="Calibri" w:cs="Calibri"/>
+        </w:rPr>
+        <w:t>.</w:t>
       </w:r>
     </w:p>
     <w:p>
@@ -11808,7 +11677,7 @@
         <w:rPr>
           <w:rFonts w:ascii="Calibri" w:hAnsi="Calibri" w:cs="Calibri"/>
         </w:rPr>
-        <w:t xml:space="preserve"> Generate About/brand story, Contact/locations, FAQ, shipping/returns, policy, campaign/editorial, and reusable generic content pages.</w:t>
+        <w:t xml:space="preserve"> Deliver distinct standard, high-consideration, gallery-led, and variant-led purchase experiences.</w:t>
       </w:r>
     </w:p>
     <w:p>
@@ -11832,550 +11701,7 @@
         <w:rPr>
           <w:rFonts w:ascii="Calibri" w:hAnsi="Calibri" w:cs="Calibri"/>
         </w:rPr>
-        <w:t xml:space="preserve"> Existing PageBlueprint, content/evidence, localization, navigation, and snapshot contracts.</w:t>
-      </w:r>
-    </w:p>
-    <w:p>
-      <w:pPr>
-        <w:pStyle w:val="Normal"/>
-        <w:numPr>
-          <w:ilvl w:val="0"/>
-          <w:numId w:val="1"/>
-        </w:numPr>
-        <w:widowControl/>
-      </w:pPr>
-      <w:r>
-        <w:rPr>
-          <w:rFonts w:ascii="Calibri" w:hAnsi="Calibri" w:cs="Calibri"/>
-          <w:b/>
-          <w:bCs/>
-        </w:rPr>
-        <w:t>Depends on:</w:t>
-      </w:r>
-      <w:r>
-        <w:rPr>
-          <w:rFonts w:ascii="Calibri" w:hAnsi="Calibri" w:cs="Calibri"/>
-        </w:rPr>
-        <w:t xml:space="preserve"> P10B-03 through P10B-07.</w:t>
-      </w:r>
-    </w:p>
-    <w:p>
-      <w:pPr>
-        <w:pStyle w:val="Normal"/>
-        <w:numPr>
-          <w:ilvl w:val="0"/>
-          <w:numId w:val="1"/>
-        </w:numPr>
-        <w:widowControl/>
-      </w:pPr>
-      <w:r>
-        <w:rPr>
-          <w:rFonts w:ascii="Calibri" w:hAnsi="Calibri" w:cs="Calibri"/>
-          <w:b/>
-          <w:bCs/>
-        </w:rPr>
-        <w:t>Done when:</w:t>
-      </w:r>
-      <w:r>
-        <w:rPr>
-          <w:rFonts w:ascii="Calibri" w:hAnsi="Calibri" w:cs="Calibri"/>
-        </w:rPr>
-        <w:t xml:space="preserve"> Every named family has registered profiles and approved-fact provenance, localization, navigation reachability, omission/fallback, responsive output, snapshot preservation, and publication; major types have multiple compositions where commercially useful.</w:t>
-      </w:r>
-    </w:p>
-    <w:p>
-      <w:pPr>
-        <w:pStyle w:val="Normal"/>
-        <w:numPr>
-          <w:ilvl w:val="0"/>
-          <w:numId w:val="1"/>
-        </w:numPr>
-        <w:widowControl/>
-      </w:pPr>
-      <w:r>
-        <w:rPr>
-          <w:rFonts w:ascii="Calibri" w:hAnsi="Calibri" w:cs="Calibri"/>
-          <w:b/>
-          <w:bCs/>
-        </w:rPr>
-        <w:t>Fail closed:</w:t>
-      </w:r>
-      <w:r>
-        <w:rPr>
-          <w:rFonts w:ascii="Calibri" w:hAnsi="Calibri" w:cs="Calibri"/>
-        </w:rPr>
-        <w:t xml:space="preserve"> Fabricated locations, policies, certifications, guarantees, delivery, compliance, and service claims are rejected or omitted through registered rules.</w:t>
-      </w:r>
-    </w:p>
-    <w:p>
-      <w:pPr>
-        <w:pStyle w:val="Normal"/>
-        <w:numPr>
-          <w:ilvl w:val="0"/>
-          <w:numId w:val="1"/>
-        </w:numPr>
-        <w:widowControl/>
-      </w:pPr>
-      <w:r>
-        <w:rPr>
-          <w:rFonts w:ascii="Calibri" w:hAnsi="Calibri" w:cs="Calibri"/>
-          <w:b/>
-          <w:bCs/>
-        </w:rPr>
-        <w:t>Evidence:</w:t>
-      </w:r>
-      <w:r>
-        <w:rPr>
-          <w:rFonts w:ascii="Calibri" w:hAnsi="Calibri" w:cs="Calibri"/>
-        </w:rPr>
-        <w:t xml:space="preserve"> Contract/profile, evidence/provenance, generation/lifecycle, localization, responsive/a11y, and retained visual evidence.</w:t>
-      </w:r>
-    </w:p>
-    <w:p>
-      <w:pPr>
-        <w:pStyle w:val="Normal"/>
-        <w:numPr>
-          <w:ilvl w:val="0"/>
-          <w:numId w:val="1"/>
-        </w:numPr>
-        <w:widowControl/>
-      </w:pPr>
-      <w:r>
-        <w:rPr>
-          <w:rFonts w:ascii="Calibri" w:hAnsi="Calibri" w:cs="Calibri"/>
-          <w:b/>
-          <w:bCs/>
-        </w:rPr>
-        <w:t>Non-goal:</w:t>
-      </w:r>
-      <w:r>
-        <w:rPr>
-          <w:rFonts w:ascii="Calibri" w:hAnsi="Calibri" w:cs="Calibri"/>
-        </w:rPr>
-        <w:t xml:space="preserve"> Unrestricted CMS or legal-content generation.</w:t>
-      </w:r>
-    </w:p>
-    <w:p>
-      <w:pPr>
-        <w:pStyle w:val="Heading3"/>
-        <w:keepNext/>
-        <w:widowControl/>
-      </w:pPr>
-      <w:r>
-        <w:rPr>
-          <w:rFonts w:ascii="Calibri" w:hAnsi="Calibri" w:cs="Calibri"/>
-        </w:rPr>
-        <w:t>P10B-13 — Commerce utility presentation pages</w:t>
-      </w:r>
-    </w:p>
-    <w:p>
-      <w:pPr>
-        <w:pStyle w:val="Normal"/>
-        <w:numPr>
-          <w:ilvl w:val="0"/>
-          <w:numId w:val="1"/>
-        </w:numPr>
-        <w:widowControl/>
-      </w:pPr>
-      <w:r>
-        <w:rPr>
-          <w:rFonts w:ascii="Calibri" w:hAnsi="Calibri" w:cs="Calibri"/>
-          <w:b/>
-          <w:bCs/>
-        </w:rPr>
-        <w:t>Outcome:</w:t>
-      </w:r>
-      <w:r>
-        <w:rPr>
-          <w:rFonts w:ascii="Calibri" w:hAnsi="Calibri" w:cs="Calibri"/>
-        </w:rPr>
-        <w:t xml:space="preserve"> Deliver governed search/no-results, cart, checkout, empty, error, and 404 presentation.</w:t>
-      </w:r>
-    </w:p>
-    <w:p>
-      <w:pPr>
-        <w:pStyle w:val="Normal"/>
-        <w:numPr>
-          <w:ilvl w:val="0"/>
-          <w:numId w:val="1"/>
-        </w:numPr>
-        <w:widowControl/>
-      </w:pPr>
-      <w:r>
-        <w:rPr>
-          <w:rFonts w:ascii="Calibri" w:hAnsi="Calibri" w:cs="Calibri"/>
-          <w:b/>
-          <w:bCs/>
-        </w:rPr>
-        <w:t>Authority:</w:t>
-      </w:r>
-      <w:r>
-        <w:rPr>
-          <w:rFonts w:ascii="Calibri" w:hAnsi="Calibri" w:cs="Calibri"/>
-        </w:rPr>
-        <w:t xml:space="preserve"> Existing page/profile, shared frame, canonical commerce projection, and operational adapter seams.</w:t>
-      </w:r>
-    </w:p>
-    <w:p>
-      <w:pPr>
-        <w:pStyle w:val="Normal"/>
-        <w:numPr>
-          <w:ilvl w:val="0"/>
-          <w:numId w:val="1"/>
-        </w:numPr>
-        <w:widowControl/>
-      </w:pPr>
-      <w:r>
-        <w:rPr>
-          <w:rFonts w:ascii="Calibri" w:hAnsi="Calibri" w:cs="Calibri"/>
-          <w:b/>
-          <w:bCs/>
-        </w:rPr>
-        <w:t>Depends on:</w:t>
-      </w:r>
-      <w:r>
-        <w:rPr>
-          <w:rFonts w:ascii="Calibri" w:hAnsi="Calibri" w:cs="Calibri"/>
-        </w:rPr>
-        <w:t xml:space="preserve"> P10B-03, P10B-05, P10B-06, P10B-08.</w:t>
-      </w:r>
-    </w:p>
-    <w:p>
-      <w:pPr>
-        <w:pStyle w:val="Normal"/>
-        <w:numPr>
-          <w:ilvl w:val="0"/>
-          <w:numId w:val="1"/>
-        </w:numPr>
-        <w:widowControl/>
-      </w:pPr>
-      <w:r>
-        <w:rPr>
-          <w:rFonts w:ascii="Calibri" w:hAnsi="Calibri" w:cs="Calibri"/>
-          <w:b/>
-          <w:bCs/>
-        </w:rPr>
-        <w:t>Done when:</w:t>
-      </w:r>
-      <w:r>
-        <w:rPr>
-          <w:rFonts w:ascii="Calibri" w:hAnsi="Calibri" w:cs="Calibri"/>
-        </w:rPr>
-        <w:t xml:space="preserve"> Every state presents canonical facts/actions with coherent Design DNA/frame, useful empty/error behavior, complete page-set reachability, responsive accessibility, snapshot, and publication preservation.</w:t>
-      </w:r>
-    </w:p>
-    <w:p>
-      <w:pPr>
-        <w:pStyle w:val="Normal"/>
-        <w:numPr>
-          <w:ilvl w:val="0"/>
-          <w:numId w:val="1"/>
-        </w:numPr>
-        <w:widowControl/>
-      </w:pPr>
-      <w:r>
-        <w:rPr>
-          <w:rFonts w:ascii="Calibri" w:hAnsi="Calibri" w:cs="Calibri"/>
-          <w:b/>
-          <w:bCs/>
-        </w:rPr>
-        <w:t>Fail closed:</w:t>
-      </w:r>
-      <w:r>
-        <w:rPr>
-          <w:rFonts w:ascii="Calibri" w:hAnsi="Calibri" w:cs="Calibri"/>
-        </w:rPr>
-        <w:t xml:space="preserve"> Local commerce operations/writes, invented totals or availability, unsupported actions, and executable payment/checkout behavior outside Vesko adapters are rejected.</w:t>
-      </w:r>
-    </w:p>
-    <w:p>
-      <w:pPr>
-        <w:pStyle w:val="Normal"/>
-        <w:numPr>
-          <w:ilvl w:val="0"/>
-          <w:numId w:val="1"/>
-        </w:numPr>
-        <w:widowControl/>
-      </w:pPr>
-      <w:r>
-        <w:rPr>
-          <w:rFonts w:ascii="Calibri" w:hAnsi="Calibri" w:cs="Calibri"/>
-          <w:b/>
-          <w:bCs/>
-        </w:rPr>
-        <w:t>Evidence:</w:t>
-      </w:r>
-      <w:r>
-        <w:rPr>
-          <w:rFonts w:ascii="Calibri" w:hAnsi="Calibri" w:cs="Calibri"/>
-        </w:rPr>
-        <w:t xml:space="preserve"> Contract/integration, adapter-boundary, state matrix, responsive/a11y browser, and retained visual evidence.</w:t>
-      </w:r>
-    </w:p>
-    <w:p>
-      <w:pPr>
-        <w:pStyle w:val="Normal"/>
-        <w:numPr>
-          <w:ilvl w:val="0"/>
-          <w:numId w:val="1"/>
-        </w:numPr>
-        <w:widowControl/>
-      </w:pPr>
-      <w:r>
-        <w:rPr>
-          <w:rFonts w:ascii="Calibri" w:hAnsi="Calibri" w:cs="Calibri"/>
-          <w:b/>
-          <w:bCs/>
-        </w:rPr>
-        <w:t>Non-goal:</w:t>
-      </w:r>
-      <w:r>
-        <w:rPr>
-          <w:rFonts w:ascii="Calibri" w:hAnsi="Calibri" w:cs="Calibri"/>
-        </w:rPr>
-        <w:t xml:space="preserve"> Owning cart, checkout, payment, order, tax, shipping, or returns operations.</w:t>
-      </w:r>
-    </w:p>
-    <w:p>
-      <w:pPr>
-        <w:pStyle w:val="Heading3"/>
-        <w:keepNext/>
-        <w:widowControl/>
-      </w:pPr>
-      <w:r>
-        <w:rPr>
-          <w:rFonts w:ascii="Calibri" w:hAnsi="Calibri" w:cs="Calibri"/>
-        </w:rPr>
-        <w:t>P10B-14 — Premium Editorial complete-storefront vertical slice</w:t>
-      </w:r>
-    </w:p>
-    <w:p>
-      <w:pPr>
-        <w:pStyle w:val="Normal"/>
-        <w:numPr>
-          <w:ilvl w:val="0"/>
-          <w:numId w:val="1"/>
-        </w:numPr>
-        <w:widowControl/>
-      </w:pPr>
-      <w:r>
-        <w:rPr>
-          <w:rFonts w:ascii="Calibri" w:hAnsi="Calibri" w:cs="Calibri"/>
-          <w:b/>
-          <w:bCs/>
-        </w:rPr>
-        <w:t>Outcome:</w:t>
-      </w:r>
-      <w:r>
-        <w:rPr>
-          <w:rFonts w:ascii="Calibri" w:hAnsi="Calibri" w:cs="Calibri"/>
-        </w:rPr>
-        <w:t xml:space="preserve"> Prove one commercially credible complete multi-page storefront early.</w:t>
-      </w:r>
-    </w:p>
-    <w:p>
-      <w:pPr>
-        <w:pStyle w:val="Normal"/>
-        <w:numPr>
-          <w:ilvl w:val="0"/>
-          <w:numId w:val="1"/>
-        </w:numPr>
-        <w:widowControl/>
-      </w:pPr>
-      <w:r>
-        <w:rPr>
-          <w:rFonts w:ascii="Calibri" w:hAnsi="Calibri" w:cs="Calibri"/>
-          <w:b/>
-          <w:bCs/>
-        </w:rPr>
-        <w:t>Authority:</w:t>
-      </w:r>
-      <w:r>
-        <w:rPr>
-          <w:rFonts w:ascii="Calibri" w:hAnsi="Calibri" w:cs="Calibri"/>
-        </w:rPr>
-        <w:t xml:space="preserve"> Existing canonical generation/proposal/snapshot/preview/publication chain using the implemented P10B authorities.</w:t>
-      </w:r>
-    </w:p>
-    <w:p>
-      <w:pPr>
-        <w:pStyle w:val="Normal"/>
-        <w:numPr>
-          <w:ilvl w:val="0"/>
-          <w:numId w:val="1"/>
-        </w:numPr>
-        <w:widowControl/>
-      </w:pPr>
-      <w:r>
-        <w:rPr>
-          <w:rFonts w:ascii="Calibri" w:hAnsi="Calibri" w:cs="Calibri"/>
-          <w:b/>
-          <w:bCs/>
-        </w:rPr>
-        <w:t>Depends on:</w:t>
-      </w:r>
-      <w:r>
-        <w:rPr>
-          <w:rFonts w:ascii="Calibri" w:hAnsi="Calibri" w:cs="Calibri"/>
-        </w:rPr>
-        <w:t xml:space="preserve"> Minimum accepted P10B-02 through P10B-13 capability.</w:t>
-      </w:r>
-    </w:p>
-    <w:p>
-      <w:pPr>
-        <w:pStyle w:val="Normal"/>
-        <w:numPr>
-          <w:ilvl w:val="0"/>
-          <w:numId w:val="1"/>
-        </w:numPr>
-        <w:widowControl/>
-      </w:pPr>
-      <w:r>
-        <w:rPr>
-          <w:rFonts w:ascii="Calibri" w:hAnsi="Calibri" w:cs="Calibri"/>
-          <w:b/>
-          <w:bCs/>
-        </w:rPr>
-        <w:t>Done when:</w:t>
-      </w:r>
-      <w:r>
-        <w:rPr>
-          <w:rFonts w:ascii="Calibri" w:hAnsi="Calibri" w:cs="Calibri"/>
-        </w:rPr>
-        <w:t xml:space="preserve"> One approved brief with realistic commerce and credible assets generates shared frame, home, collection, simple/configurable PDP, About, Contact/locations, FAQ/service, and required utility/error states; navigation, EN/FI where supported, four widths, protected state, preview/publish, and retained human review pass.</w:t>
-      </w:r>
-    </w:p>
-    <w:p>
-      <w:pPr>
-        <w:pStyle w:val="Normal"/>
-        <w:numPr>
-          <w:ilvl w:val="0"/>
-          <w:numId w:val="1"/>
-        </w:numPr>
-        <w:widowControl/>
-      </w:pPr>
-      <w:r>
-        <w:rPr>
-          <w:rFonts w:ascii="Calibri" w:hAnsi="Calibri" w:cs="Calibri"/>
-          <w:b/>
-          <w:bCs/>
-        </w:rPr>
-        <w:t>Fail closed:</w:t>
-      </w:r>
-      <w:r>
-        <w:rPr>
-          <w:rFonts w:ascii="Calibri" w:hAnsi="Calibri" w:cs="Calibri"/>
-        </w:rPr>
-        <w:t xml:space="preserve"> Missing/disconnected/generic required pages, manual reconstruction, stale authority, or schema-only visual evidence fails the slice.</w:t>
-      </w:r>
-    </w:p>
-    <w:p>
-      <w:pPr>
-        <w:pStyle w:val="Normal"/>
-        <w:numPr>
-          <w:ilvl w:val="0"/>
-          <w:numId w:val="1"/>
-        </w:numPr>
-        <w:widowControl/>
-      </w:pPr>
-      <w:r>
-        <w:rPr>
-          <w:rFonts w:ascii="Calibri" w:hAnsi="Calibri" w:cs="Calibri"/>
-          <w:b/>
-          <w:bCs/>
-        </w:rPr>
-        <w:t>Evidence:</w:t>
-      </w:r>
-      <w:r>
-        <w:rPr>
-          <w:rFonts w:ascii="Calibri" w:hAnsi="Calibri" w:cs="Calibri"/>
-        </w:rPr>
-        <w:t xml:space="preserve"> Complete capability chain, correlated browser/screenshots, protected parity, and signed human commercial review.</w:t>
-      </w:r>
-    </w:p>
-    <w:p>
-      <w:pPr>
-        <w:pStyle w:val="Normal"/>
-        <w:numPr>
-          <w:ilvl w:val="0"/>
-          <w:numId w:val="1"/>
-        </w:numPr>
-        <w:widowControl/>
-      </w:pPr>
-      <w:r>
-        <w:rPr>
-          <w:rFonts w:ascii="Calibri" w:hAnsi="Calibri" w:cs="Calibri"/>
-          <w:b/>
-          <w:bCs/>
-        </w:rPr>
-        <w:t>Non-goal:</w:t>
-      </w:r>
-      <w:r>
-        <w:rPr>
-          <w:rFonts w:ascii="Calibri" w:hAnsi="Calibri" w:cs="Calibri"/>
-        </w:rPr>
-        <w:t xml:space="preserve"> P10B closure or broad direction/diversity proof.</w:t>
-      </w:r>
-    </w:p>
-    <w:p>
-      <w:pPr>
-        <w:pStyle w:val="Heading3"/>
-        <w:keepNext/>
-        <w:widowControl/>
-      </w:pPr>
-      <w:r>
-        <w:rPr>
-          <w:rFonts w:ascii="Calibri" w:hAnsi="Calibri" w:cs="Calibri"/>
-        </w:rPr>
-        <w:t>P10B-15 — Bounded storefront synthesis and narrative engine</w:t>
-      </w:r>
-    </w:p>
-    <w:p>
-      <w:pPr>
-        <w:pStyle w:val="Normal"/>
-        <w:numPr>
-          <w:ilvl w:val="0"/>
-          <w:numId w:val="1"/>
-        </w:numPr>
-        <w:widowControl/>
-      </w:pPr>
-      <w:r>
-        <w:rPr>
-          <w:rFonts w:ascii="Calibri" w:hAnsi="Calibri" w:cs="Calibri"/>
-          <w:b/>
-          <w:bCs/>
-        </w:rPr>
-        <w:t>Outcome:</w:t>
-      </w:r>
-      <w:r>
-        <w:rPr>
-          <w:rFonts w:ascii="Calibri" w:hAnsi="Calibri" w:cs="Calibri"/>
-        </w:rPr>
-        <w:t xml:space="preserve"> Generate complete coherent storefronts from compatible Design DNA, page set, profiles, families/variants, parameters, assets, and narrative roles.</w:t>
-      </w:r>
-    </w:p>
-    <w:p>
-      <w:pPr>
-        <w:pStyle w:val="Normal"/>
-        <w:numPr>
-          <w:ilvl w:val="0"/>
-          <w:numId w:val="1"/>
-        </w:numPr>
-        <w:widowControl/>
-      </w:pPr>
-      <w:r>
-        <w:rPr>
-          <w:rFonts w:ascii="Calibri" w:hAnsi="Calibri" w:cs="Calibri"/>
-          <w:b/>
-          <w:bCs/>
-        </w:rPr>
-        <w:t>Authority:</w:t>
-      </w:r>
-      <w:r>
-        <w:rPr>
-          <w:rFonts w:ascii="Calibri" w:hAnsi="Calibri" w:cs="Calibri"/>
-        </w:rPr>
-        <w:t xml:space="preserve"> Existing governed planning/proposal compiler plus the registered P10B authorities; output remains one </w:t>
+        <w:t xml:space="preserve"> Existing PageBlueprint profiles, </w:t>
       </w:r>
       <w:r>
         <w:rPr>
@@ -12383,13 +11709,13 @@
           <w:sz w:val="19"/>
           <w:szCs w:val="19"/>
         </w:rPr>
-        <w:t>StorefrontSnapshot</w:t>
-      </w:r>
-      <w:r>
-        <w:rPr>
-          <w:rFonts w:ascii="Calibri" w:hAnsi="Calibri" w:cs="Calibri"/>
-        </w:rPr>
-        <w:t>.</w:t>
+        <w:t>dynamicProductDetail</w:t>
+      </w:r>
+      <w:r>
+        <w:rPr>
+          <w:rFonts w:ascii="Calibri" w:hAnsi="Calibri" w:cs="Calibri"/>
+        </w:rPr>
+        <w:t>, and P6 generic option resolution.</w:t>
       </w:r>
     </w:p>
     <w:p>
@@ -12413,7 +11739,7 @@
         <w:rPr>
           <w:rFonts w:ascii="Calibri" w:hAnsi="Calibri" w:cs="Calibri"/>
         </w:rPr>
-        <w:t xml:space="preserve"> P10B-14 and sufficient real family/profile capability.</w:t>
+        <w:t xml:space="preserve"> P10B-03 through P10B-06 and P10B-08.</w:t>
       </w:r>
     </w:p>
     <w:p>
@@ -12437,7 +11763,7 @@
         <w:rPr>
           <w:rFonts w:ascii="Calibri" w:hAnsi="Calibri" w:cs="Calibri"/>
         </w:rPr>
-        <w:t xml:space="preserve"> Deterministic selection preserves cross-page identity, narrative adjacency/ cardinality, repetition limits, bindings/assets, and complete snapshot/lifecycle output for representative inputs.</w:t>
+        <w:t xml:space="preserve"> At least four profiles preserve all simple/configurable option groups, dependencies, incomplete/unavailable states, resolved price/availability/media, related products, responsive modes, snapshot, and published rendering.</w:t>
       </w:r>
     </w:p>
     <w:p>
@@ -12461,7 +11787,7 @@
         <w:rPr>
           <w:rFonts w:ascii="Calibri" w:hAnsi="Calibri" w:cs="Calibri"/>
         </w:rPr>
-        <w:t xml:space="preserve"> Missing, stale, ambiguous, incompatible, unregistered, repetitive, or protected-state-divergent combinations produce no partial proposal/snapshot.</w:t>
+        <w:t xml:space="preserve"> Product-type forks, dropped options, missing bindings, shallow duplicates, and protected commerce/media mutation are rejected.</w:t>
       </w:r>
     </w:p>
     <w:p>
@@ -12485,7 +11811,7 @@
         <w:rPr>
           <w:rFonts w:ascii="Calibri" w:hAnsi="Calibri" w:cs="Calibri"/>
         </w:rPr>
-        <w:t xml:space="preserve"> Selection/compatibility/unit, proposal/compiler/lifecycle integration, no-partial- write, deterministic fingerprint inputs, and complete-store browser evidence.</w:t>
+        <w:t xml:space="preserve"> Dynamic PDP/option/media/commerce regression, capability chain, four-width browser, and retained visual review.</w:t>
       </w:r>
     </w:p>
     <w:p>
@@ -12509,7 +11835,7 @@
         <w:rPr>
           <w:rFonts w:ascii="Calibri" w:hAnsi="Calibri" w:cs="Calibri"/>
         </w:rPr>
-        <w:t xml:space="preserve"> Arbitrary trees/styles or a second synthesis representation.</w:t>
+        <w:t xml:space="preserve"> Product-specific component architecture.</w:t>
       </w:r>
     </w:p>
     <w:p>
@@ -12522,7 +11848,7 @@
         <w:rPr>
           <w:rFonts w:ascii="Calibri" w:hAnsi="Calibri" w:cs="Calibri"/>
         </w:rPr>
-        <w:t>P10B-16 — Coordinated directions and diversity control</w:t>
+        <w:t>P10B-12 — Content and support page families</w:t>
       </w:r>
     </w:p>
     <w:p>
@@ -12546,7 +11872,7 @@
         <w:rPr>
           <w:rFonts w:ascii="Calibri" w:hAnsi="Calibri" w:cs="Calibri"/>
         </w:rPr>
-        <w:t xml:space="preserve"> Make Premium Editorial, Modern Technical, and Minimal Commerce coordinated constraint packages and prevent duplicates/near duplicates.</w:t>
+        <w:t xml:space="preserve"> Generate About/brand story, Contact/locations, FAQ, shipping/returns, policy, campaign/editorial, and reusable generic content pages.</w:t>
       </w:r>
     </w:p>
     <w:p>
@@ -12570,7 +11896,7 @@
         <w:rPr>
           <w:rFonts w:ascii="Calibri" w:hAnsi="Calibri" w:cs="Calibri"/>
         </w:rPr>
-        <w:t xml:space="preserve"> Existing direction-selection authority plus deterministic storefront-design fingerprint/evaluation.</w:t>
+        <w:t xml:space="preserve"> Existing PageBlueprint, content/evidence, localization, navigation, and snapshot contracts.</w:t>
       </w:r>
     </w:p>
     <w:p>
@@ -12594,7 +11920,7 @@
         <w:rPr>
           <w:rFonts w:ascii="Calibri" w:hAnsi="Calibri" w:cs="Calibri"/>
         </w:rPr>
-        <w:t xml:space="preserve"> P10B-15.</w:t>
+        <w:t xml:space="preserve"> P10B-03 through P10B-07.</w:t>
       </w:r>
     </w:p>
     <w:p>
@@ -12618,7 +11944,7 @@
         <w:rPr>
           <w:rFonts w:ascii="Calibri" w:hAnsi="Calibri" w:cs="Calibri"/>
         </w:rPr>
-        <w:t xml:space="preserve"> Fingerprints cover Design DNA, page set/profiles, frame, anatomies/variants, structural parameters, image posture, density/responsive posture, and narrative composition; exact and meaningful near duplicates fail, and pairwise stores differ materially beyond colour.</w:t>
+        <w:t xml:space="preserve"> Every named family has registered profiles and approved-fact provenance, localization, navigation reachability, omission/fallback, responsive output, snapshot preservation, and publication; major types have multiple compositions where commercially useful.</w:t>
       </w:r>
     </w:p>
     <w:p>
@@ -12642,7 +11968,7 @@
         <w:rPr>
           <w:rFonts w:ascii="Calibri" w:hAnsi="Calibri" w:cs="Calibri"/>
         </w:rPr>
-        <w:t xml:space="preserve"> Fixed-template/token/page direction authority, incompatible references, colour-only differences, and fingerprints that omit material structure are rejected.</w:t>
+        <w:t xml:space="preserve"> Fabricated locations, policies, certifications, guarantees, delivery, compliance, and service claims are rejected or omitted through registered rules.</w:t>
       </w:r>
     </w:p>
     <w:p>
@@ -12666,7 +11992,7 @@
         <w:rPr>
           <w:rFonts w:ascii="Calibri" w:hAnsi="Calibri" w:cs="Calibri"/>
         </w:rPr>
-        <w:t xml:space="preserve"> Determinism, exact/near-duplicate fixtures, pairwise structural scoring, direction compatibility, complete-store generation, and representative visual evidence.</w:t>
+        <w:t xml:space="preserve"> Contract/profile, evidence/provenance, generation/lifecycle, localization, responsive/a11y, and retained visual evidence.</w:t>
       </w:r>
     </w:p>
     <w:p>
@@ -12690,7 +12016,7 @@
         <w:rPr>
           <w:rFonts w:ascii="Calibri" w:hAnsi="Calibri" w:cs="Calibri"/>
         </w:rPr>
-        <w:t xml:space="preserve"> Thousands of manually authored templates.</w:t>
+        <w:t xml:space="preserve"> Unrestricted CMS or legal-content generation.</w:t>
       </w:r>
     </w:p>
     <w:p>
@@ -12703,7 +12029,7 @@
         <w:rPr>
           <w:rFonts w:ascii="Calibri" w:hAnsi="Calibri" w:cs="Calibri"/>
         </w:rPr>
-        <w:t>P10B-17 — Responsive, accessibility and performance closure</w:t>
+        <w:t>P10B-13 — Commerce utility presentation pages</w:t>
       </w:r>
     </w:p>
     <w:p>
@@ -12727,7 +12053,7 @@
         <w:rPr>
           <w:rFonts w:ascii="Calibri" w:hAnsi="Calibri" w:cs="Calibri"/>
         </w:rPr>
-        <w:t xml:space="preserve"> Preserve deliberate commercial hierarchy and usability across target widths, locales, accessibility, and bounded performance budgets.</w:t>
+        <w:t xml:space="preserve"> Deliver governed search/no-results, cart, checkout, empty, error, and 404 presentation.</w:t>
       </w:r>
     </w:p>
     <w:p>
@@ -12751,7 +12077,7 @@
         <w:rPr>
           <w:rFonts w:ascii="Calibri" w:hAnsi="Calibri" w:cs="Calibri"/>
         </w:rPr>
-        <w:t xml:space="preserve"> Existing responsive/a11y contracts, registered transformations, renderers, and evidence protocol.</w:t>
+        <w:t xml:space="preserve"> Existing page/profile, shared frame, canonical commerce projection, and operational adapter seams.</w:t>
       </w:r>
     </w:p>
     <w:p>
@@ -12775,7 +12101,7 @@
         <w:rPr>
           <w:rFonts w:ascii="Calibri" w:hAnsi="Calibri" w:cs="Calibri"/>
         </w:rPr>
-        <w:t xml:space="preserve"> Implemented commercial families/profiles/directions through P10B-16.</w:t>
+        <w:t xml:space="preserve"> P10B-03, P10B-05, P10B-06, P10B-08.</w:t>
       </w:r>
     </w:p>
     <w:p>
@@ -12799,7 +12125,7 @@
         <w:rPr>
           <w:rFonts w:ascii="Calibri" w:hAnsi="Calibri" w:cs="Calibri"/>
         </w:rPr>
-        <w:t xml:space="preserve"> All supported page families/directions pass 375/768/1024/1440 and EN/FI geometry, declared transformations, keyboard/focus/semantics/contrast, content/commerce retention, and explicit performance budgets with correlated evidence.</w:t>
+        <w:t xml:space="preserve"> Every state presents canonical facts/actions with coherent Design DNA/frame, useful empty/error behavior, complete page-set reachability, responsive accessibility, snapshot, and publication preservation.</w:t>
       </w:r>
     </w:p>
     <w:p>
@@ -12823,7 +12149,7 @@
         <w:rPr>
           <w:rFonts w:ascii="Calibri" w:hAnsi="Calibri" w:cs="Calibri"/>
         </w:rPr>
-        <w:t xml:space="preserve"> Clipping, overlap, inaccessible controls, lost content/commerce, desktop-only approval, or undispositioned budget failure blocks completion.</w:t>
+        <w:t xml:space="preserve"> Local commerce operations/writes, invented totals or availability, unsupported actions, and executable payment/checkout behavior outside Vesko adapters are rejected.</w:t>
       </w:r>
     </w:p>
     <w:p>
@@ -12847,7 +12173,7 @@
         <w:rPr>
           <w:rFonts w:ascii="Calibri" w:hAnsi="Calibri" w:cs="Calibri"/>
         </w:rPr>
-        <w:t xml:space="preserve"> Automated geometry/a11y/performance/browser matrices plus retained representative human review.</w:t>
+        <w:t xml:space="preserve"> Contract/integration, adapter-boundary, state matrix, responsive/a11y browser, and retained visual evidence.</w:t>
       </w:r>
     </w:p>
     <w:p>
@@ -12871,7 +12197,7 @@
         <w:rPr>
           <w:rFonts w:ascii="Calibri" w:hAnsi="Calibri" w:cs="Calibri"/>
         </w:rPr>
-        <w:t xml:space="preserve"> Visual approval from isolated component screenshots.</w:t>
+        <w:t xml:space="preserve"> Owning cart, checkout, payment, order, tax, shipping, or returns operations.</w:t>
       </w:r>
     </w:p>
     <w:p>
@@ -12884,7 +12210,7 @@
         <w:rPr>
           <w:rFonts w:ascii="Calibri" w:hAnsi="Calibri" w:cs="Calibri"/>
         </w:rPr>
-        <w:t>P10B-18 — Commercial quality and scale gate</w:t>
+        <w:t>P10B-14 — Premium Editorial complete-storefront vertical slice</w:t>
       </w:r>
     </w:p>
     <w:p>
@@ -12908,7 +12234,7 @@
         <w:rPr>
           <w:rFonts w:ascii="Calibri" w:hAnsi="Calibri" w:cs="Calibri"/>
         </w:rPr>
-        <w:t xml:space="preserve"> Prove repeated generation of publishable, premium, materially different complete storefronts.</w:t>
+        <w:t xml:space="preserve"> Prove one commercially credible complete multi-page storefront early.</w:t>
       </w:r>
     </w:p>
     <w:p>
@@ -12932,7 +12258,7 @@
         <w:rPr>
           <w:rFonts w:ascii="Calibri" w:hAnsi="Calibri" w:cs="Calibri"/>
         </w:rPr>
-        <w:t xml:space="preserve"> Existing golden-store/human-review evidence plus the P10B synthesis and fingerprint authorities.</w:t>
+        <w:t xml:space="preserve"> Existing canonical generation/proposal/snapshot/preview/publication chain using the implemented P10B authorities.</w:t>
       </w:r>
     </w:p>
     <w:p>
@@ -12956,7 +12282,7 @@
         <w:rPr>
           <w:rFonts w:ascii="Calibri" w:hAnsi="Calibri" w:cs="Calibri"/>
         </w:rPr>
-        <w:t xml:space="preserve"> P10B-17 and every prior P10B task.</w:t>
+        <w:t xml:space="preserve"> Minimum accepted P10B-02 through P10B-13 capability.</w:t>
       </w:r>
     </w:p>
     <w:p>
@@ -12980,7 +12306,7 @@
         <w:rPr>
           <w:rFonts w:ascii="Calibri" w:hAnsi="Calibri" w:cs="Calibri"/>
         </w:rPr>
-        <w:t xml:space="preserve"> At least 100 deterministic complete configurations across representative catalogue/evidence/asset/locale/page-set/direction contexts pass snapshot validity, protected parity, exact-duplicate, near-duplicate, and structural-distribution gates; a fingerprint- stratified subset passes retained four-width human commercial review.</w:t>
+        <w:t xml:space="preserve"> One approved brief with realistic commerce and credible assets generates shared frame, home, collection, simple/configurable PDP, About, Contact/locations, FAQ/service, and required utility/error states; navigation, EN/FI where supported, four widths, protected state, preview/publish, and retained human review pass.</w:t>
       </w:r>
     </w:p>
     <w:p>
@@ -13004,7 +12330,7 @@
         <w:rPr>
           <w:rFonts w:ascii="Calibri" w:hAnsi="Calibri" w:cs="Calibri"/>
         </w:rPr>
-        <w:t xml:space="preserve"> One polished store, automated checks alone, placeholder assets, registry counts, screenshots without exact authority, or colour-only diversity cannot close P10B.</w:t>
+        <w:t xml:space="preserve"> Missing/disconnected/generic required pages, manual reconstruction, stale authority, or schema-only visual evidence fails the slice.</w:t>
       </w:r>
     </w:p>
     <w:p>
@@ -13028,7 +12354,7 @@
         <w:rPr>
           <w:rFonts w:ascii="Calibri" w:hAnsi="Calibri" w:cs="Calibri"/>
         </w:rPr>
-        <w:t xml:space="preserve"> Scale-generation ledger, fingerprint/diversity analysis, complete capability-chain correlations, retained screenshots, and explicit human acceptance.</w:t>
+        <w:t xml:space="preserve"> Complete capability chain, correlated browser/screenshots, protected parity, and signed human commercial review.</w:t>
       </w:r>
     </w:p>
     <w:p>
@@ -13052,20 +12378,7 @@
         <w:rPr>
           <w:rFonts w:ascii="Calibri" w:hAnsi="Calibri" w:cs="Calibri"/>
         </w:rPr>
-        <w:t xml:space="preserve"> P10C merchant editing, Vesko staging, or production-readiness claims.</w:t>
-      </w:r>
-    </w:p>
-    <w:p>
-      <w:pPr>
-        <w:pStyle w:val="Heading2"/>
-        <w:keepNext/>
-        <w:widowControl/>
-      </w:pPr>
-      <w:r>
-        <w:rPr>
-          <w:rFonts w:ascii="Calibri" w:hAnsi="Calibri" w:cs="Calibri"/>
-        </w:rPr>
-        <w:t>P10C — Storefront Studio Editing Experience v1</w:t>
+        <w:t xml:space="preserve"> P10B closure or broad direction/diversity proof.</w:t>
       </w:r>
     </w:p>
     <w:p>
@@ -13078,7 +12391,7 @@
         <w:rPr>
           <w:rFonts w:ascii="Calibri" w:hAnsi="Calibri" w:cs="Calibri"/>
         </w:rPr>
-        <w:t>P10C-01 — Brand asset library</w:t>
+        <w:t>P10B-15 — Bounded storefront synthesis and narrative engine</w:t>
       </w:r>
     </w:p>
     <w:p>
@@ -13102,349 +12415,31 @@
         <w:rPr>
           <w:rFonts w:ascii="Calibri" w:hAnsi="Calibri" w:cs="Calibri"/>
         </w:rPr>
-        <w:t xml:space="preserve"> Let merchants view and choose approved presentation assets in Storefront Studio.</w:t>
-      </w:r>
-    </w:p>
-    <w:p>
-      <w:pPr>
-        <w:pStyle w:val="Normal"/>
-        <w:numPr>
-          <w:ilvl w:val="0"/>
-          <w:numId w:val="1"/>
-        </w:numPr>
-        <w:widowControl/>
-      </w:pPr>
-      <w:r>
-        <w:rPr>
-          <w:rFonts w:ascii="Calibri" w:hAnsi="Calibri" w:cs="Calibri"/>
-          <w:b/>
-          <w:bCs/>
-        </w:rPr>
-        <w:t>Status:</w:t>
-      </w:r>
-      <w:r>
-        <w:rPr>
-          <w:rFonts w:ascii="Calibri" w:hAnsi="Calibri" w:cs="Calibri"/>
-        </w:rPr>
-        <w:t xml:space="preserve"> </w:t>
-      </w:r>
-      <w:r>
-        <w:rPr>
-          <w:rFonts w:ascii="Calibri" w:hAnsi="Calibri" w:cs="Calibri"/>
-          <w:b/>
-          <w:bCs/>
-        </w:rPr>
-        <w:t>Planned</w:t>
-      </w:r>
-      <w:r>
-        <w:rPr>
-          <w:rFonts w:ascii="Calibri" w:hAnsi="Calibri" w:cs="Calibri"/>
-        </w:rPr>
-        <w:t>.</w:t>
-      </w:r>
-    </w:p>
-    <w:p>
-      <w:pPr>
-        <w:pStyle w:val="Normal"/>
-        <w:numPr>
-          <w:ilvl w:val="0"/>
-          <w:numId w:val="1"/>
-        </w:numPr>
-        <w:widowControl/>
-      </w:pPr>
-      <w:r>
-        <w:rPr>
-          <w:rFonts w:ascii="Calibri" w:hAnsi="Calibri" w:cs="Calibri"/>
-          <w:b/>
-          <w:bCs/>
-        </w:rPr>
-        <w:t>Depends on:</w:t>
-      </w:r>
-      <w:r>
-        <w:rPr>
-          <w:rFonts w:ascii="Calibri" w:hAnsi="Calibri" w:cs="Calibri"/>
-        </w:rPr>
-        <w:t xml:space="preserve"> P10B asset authority.</w:t>
-      </w:r>
-    </w:p>
-    <w:p>
-      <w:pPr>
-        <w:pStyle w:val="Normal"/>
-        <w:numPr>
-          <w:ilvl w:val="0"/>
-          <w:numId w:val="1"/>
-        </w:numPr>
-        <w:widowControl/>
-      </w:pPr>
-      <w:r>
-        <w:rPr>
-          <w:rFonts w:ascii="Calibri" w:hAnsi="Calibri" w:cs="Calibri"/>
-          <w:b/>
-          <w:bCs/>
-        </w:rPr>
-        <w:t>Done when:</w:t>
-      </w:r>
-      <w:r>
-        <w:rPr>
-          <w:rFonts w:ascii="Calibri" w:hAnsi="Calibri" w:cs="Calibri"/>
-        </w:rPr>
-        <w:t xml:space="preserve"> The stated outcome and required evidence are accepted.</w:t>
-      </w:r>
-    </w:p>
-    <w:p>
-      <w:pPr>
-        <w:pStyle w:val="Normal"/>
-        <w:numPr>
-          <w:ilvl w:val="0"/>
-          <w:numId w:val="1"/>
-        </w:numPr>
-        <w:widowControl/>
-      </w:pPr>
-      <w:r>
-        <w:rPr>
-          <w:rFonts w:ascii="Calibri" w:hAnsi="Calibri" w:cs="Calibri"/>
-          <w:b/>
-          <w:bCs/>
-        </w:rPr>
-        <w:t>Required evidence:</w:t>
-      </w:r>
-      <w:r>
-        <w:rPr>
-          <w:rFonts w:ascii="Calibri" w:hAnsi="Calibri" w:cs="Calibri"/>
-        </w:rPr>
-        <w:t xml:space="preserve"> Contract, integration, browser/E2E.</w:t>
-      </w:r>
-    </w:p>
-    <w:p>
-      <w:pPr>
-        <w:pStyle w:val="Normal"/>
-        <w:numPr>
-          <w:ilvl w:val="0"/>
-          <w:numId w:val="1"/>
-        </w:numPr>
-        <w:widowControl/>
-      </w:pPr>
-      <w:r>
-        <w:rPr>
-          <w:rFonts w:ascii="Calibri" w:hAnsi="Calibri" w:cs="Calibri"/>
-          <w:b/>
-          <w:bCs/>
-        </w:rPr>
-        <w:t>Non-goal:</w:t>
-      </w:r>
-      <w:r>
-        <w:rPr>
-          <w:rFonts w:ascii="Calibri" w:hAnsi="Calibri" w:cs="Calibri"/>
-        </w:rPr>
-        <w:t xml:space="preserve"> Product-media replacement or generic DAM scope.</w:t>
-      </w:r>
-    </w:p>
-    <w:p>
-      <w:pPr>
-        <w:pStyle w:val="Heading3"/>
-        <w:keepNext/>
-        <w:widowControl/>
-      </w:pPr>
-      <w:r>
-        <w:rPr>
-          <w:rFonts w:ascii="Calibri" w:hAnsi="Calibri" w:cs="Calibri"/>
-        </w:rPr>
-        <w:t>P10C-02 — Asset roles and provenance</w:t>
-      </w:r>
-    </w:p>
-    <w:p>
-      <w:pPr>
-        <w:pStyle w:val="Normal"/>
-        <w:numPr>
-          <w:ilvl w:val="0"/>
-          <w:numId w:val="1"/>
-        </w:numPr>
-        <w:widowControl/>
-      </w:pPr>
-      <w:r>
-        <w:rPr>
-          <w:rFonts w:ascii="Calibri" w:hAnsi="Calibri" w:cs="Calibri"/>
-          <w:b/>
-          <w:bCs/>
-        </w:rPr>
-        <w:t>Outcome:</w:t>
-      </w:r>
-      <w:r>
-        <w:rPr>
-          <w:rFonts w:ascii="Calibri" w:hAnsi="Calibri" w:cs="Calibri"/>
-        </w:rPr>
-        <w:t xml:space="preserve"> Show and preserve role, source, approval, revision, and assignment authority.</w:t>
-      </w:r>
-    </w:p>
-    <w:p>
-      <w:pPr>
-        <w:pStyle w:val="Normal"/>
-        <w:numPr>
-          <w:ilvl w:val="0"/>
-          <w:numId w:val="1"/>
-        </w:numPr>
-        <w:widowControl/>
-      </w:pPr>
-      <w:r>
-        <w:rPr>
-          <w:rFonts w:ascii="Calibri" w:hAnsi="Calibri" w:cs="Calibri"/>
-          <w:b/>
-          <w:bCs/>
-        </w:rPr>
-        <w:t>Status:</w:t>
-      </w:r>
-      <w:r>
-        <w:rPr>
-          <w:rFonts w:ascii="Calibri" w:hAnsi="Calibri" w:cs="Calibri"/>
-        </w:rPr>
-        <w:t xml:space="preserve"> </w:t>
-      </w:r>
-      <w:r>
-        <w:rPr>
-          <w:rFonts w:ascii="Calibri" w:hAnsi="Calibri" w:cs="Calibri"/>
-          <w:b/>
-          <w:bCs/>
-        </w:rPr>
-        <w:t>Planned</w:t>
-      </w:r>
-      <w:r>
-        <w:rPr>
-          <w:rFonts w:ascii="Calibri" w:hAnsi="Calibri" w:cs="Calibri"/>
-        </w:rPr>
-        <w:t>.</w:t>
-      </w:r>
-    </w:p>
-    <w:p>
-      <w:pPr>
-        <w:pStyle w:val="Normal"/>
-        <w:numPr>
-          <w:ilvl w:val="0"/>
-          <w:numId w:val="1"/>
-        </w:numPr>
-        <w:widowControl/>
-      </w:pPr>
-      <w:r>
-        <w:rPr>
-          <w:rFonts w:ascii="Calibri" w:hAnsi="Calibri" w:cs="Calibri"/>
-          <w:b/>
-          <w:bCs/>
-        </w:rPr>
-        <w:t>Depends on:</w:t>
-      </w:r>
-      <w:r>
-        <w:rPr>
-          <w:rFonts w:ascii="Calibri" w:hAnsi="Calibri" w:cs="Calibri"/>
-        </w:rPr>
-        <w:t xml:space="preserve"> P10C-01.</w:t>
-      </w:r>
-    </w:p>
-    <w:p>
-      <w:pPr>
-        <w:pStyle w:val="Normal"/>
-        <w:numPr>
-          <w:ilvl w:val="0"/>
-          <w:numId w:val="1"/>
-        </w:numPr>
-        <w:widowControl/>
-      </w:pPr>
-      <w:r>
-        <w:rPr>
-          <w:rFonts w:ascii="Calibri" w:hAnsi="Calibri" w:cs="Calibri"/>
-          <w:b/>
-          <w:bCs/>
-        </w:rPr>
-        <w:t>Done when:</w:t>
-      </w:r>
-      <w:r>
-        <w:rPr>
-          <w:rFonts w:ascii="Calibri" w:hAnsi="Calibri" w:cs="Calibri"/>
-        </w:rPr>
-        <w:t xml:space="preserve"> The stated outcome and required evidence are accepted.</w:t>
-      </w:r>
-    </w:p>
-    <w:p>
-      <w:pPr>
-        <w:pStyle w:val="Normal"/>
-        <w:numPr>
-          <w:ilvl w:val="0"/>
-          <w:numId w:val="1"/>
-        </w:numPr>
-        <w:widowControl/>
-      </w:pPr>
-      <w:r>
-        <w:rPr>
-          <w:rFonts w:ascii="Calibri" w:hAnsi="Calibri" w:cs="Calibri"/>
-          <w:b/>
-          <w:bCs/>
-        </w:rPr>
-        <w:t>Required evidence:</w:t>
-      </w:r>
-      <w:r>
-        <w:rPr>
-          <w:rFonts w:ascii="Calibri" w:hAnsi="Calibri" w:cs="Calibri"/>
-        </w:rPr>
-        <w:t xml:space="preserve"> Valid assignment and stale/unknown/role-mismatch rejection.</w:t>
-      </w:r>
-    </w:p>
-    <w:p>
-      <w:pPr>
-        <w:pStyle w:val="Normal"/>
-        <w:numPr>
-          <w:ilvl w:val="0"/>
-          <w:numId w:val="1"/>
-        </w:numPr>
-        <w:widowControl/>
-      </w:pPr>
-      <w:r>
-        <w:rPr>
-          <w:rFonts w:ascii="Calibri" w:hAnsi="Calibri" w:cs="Calibri"/>
-          <w:b/>
-          <w:bCs/>
-        </w:rPr>
-        <w:t>Non-goal:</w:t>
-      </w:r>
-      <w:r>
-        <w:rPr>
-          <w:rFonts w:ascii="Calibri" w:hAnsi="Calibri" w:cs="Calibri"/>
-        </w:rPr>
-        <w:t xml:space="preserve"> Untyped uploads or hidden provenance.</w:t>
-      </w:r>
-    </w:p>
-    <w:p>
-      <w:pPr>
-        <w:pStyle w:val="Heading3"/>
-        <w:keepNext/>
-        <w:widowControl/>
-      </w:pPr>
-      <w:r>
-        <w:rPr>
-          <w:rFonts w:ascii="Calibri" w:hAnsi="Calibri" w:cs="Calibri"/>
-        </w:rPr>
-        <w:t>P10C-03 — Canonical Puck boundary</w:t>
-      </w:r>
-    </w:p>
-    <w:p>
-      <w:pPr>
-        <w:pStyle w:val="Normal"/>
-        <w:numPr>
-          <w:ilvl w:val="0"/>
-          <w:numId w:val="1"/>
-        </w:numPr>
-        <w:widowControl/>
-      </w:pPr>
-      <w:r>
-        <w:rPr>
-          <w:rFonts w:ascii="Calibri" w:hAnsi="Calibri" w:cs="Calibri"/>
-          <w:b/>
-          <w:bCs/>
-        </w:rPr>
-        <w:t>Outcome:</w:t>
-      </w:r>
-      <w:r>
-        <w:rPr>
-          <w:rFonts w:ascii="Calibri" w:hAnsi="Calibri" w:cs="Calibri"/>
-        </w:rPr>
-        <w:t xml:space="preserve"> Project registered canonical content into Puck and validate edits back into the same </w:t>
+        <w:t xml:space="preserve"> Generate complete coherent storefronts from compatible Design DNA, page set, profiles, families/variants, parameters, assets, and narrative roles.</w:t>
+      </w:r>
+    </w:p>
+    <w:p>
+      <w:pPr>
+        <w:pStyle w:val="Normal"/>
+        <w:numPr>
+          <w:ilvl w:val="0"/>
+          <w:numId w:val="1"/>
+        </w:numPr>
+        <w:widowControl/>
+      </w:pPr>
+      <w:r>
+        <w:rPr>
+          <w:rFonts w:ascii="Calibri" w:hAnsi="Calibri" w:cs="Calibri"/>
+          <w:b/>
+          <w:bCs/>
+        </w:rPr>
+        <w:t>Authority:</w:t>
+      </w:r>
+      <w:r>
+        <w:rPr>
+          <w:rFonts w:ascii="Calibri" w:hAnsi="Calibri" w:cs="Calibri"/>
+        </w:rPr>
+        <w:t xml:space="preserve"> Existing governed planning/proposal compiler plus the registered P10B authorities; output remains one </w:t>
       </w:r>
       <w:r>
         <w:rPr>
@@ -13476,51 +12471,13 @@
           <w:b/>
           <w:bCs/>
         </w:rPr>
-        <w:t>Status:</w:t>
-      </w:r>
-      <w:r>
-        <w:rPr>
-          <w:rFonts w:ascii="Calibri" w:hAnsi="Calibri" w:cs="Calibri"/>
-        </w:rPr>
-        <w:t xml:space="preserve"> </w:t>
-      </w:r>
-      <w:r>
-        <w:rPr>
-          <w:rFonts w:ascii="Calibri" w:hAnsi="Calibri" w:cs="Calibri"/>
-          <w:b/>
-          <w:bCs/>
-        </w:rPr>
-        <w:t>Planned</w:t>
-      </w:r>
-      <w:r>
-        <w:rPr>
-          <w:rFonts w:ascii="Calibri" w:hAnsi="Calibri" w:cs="Calibri"/>
-        </w:rPr>
-        <w:t>.</w:t>
-      </w:r>
-    </w:p>
-    <w:p>
-      <w:pPr>
-        <w:pStyle w:val="Normal"/>
-        <w:numPr>
-          <w:ilvl w:val="0"/>
-          <w:numId w:val="1"/>
-        </w:numPr>
-        <w:widowControl/>
-      </w:pPr>
-      <w:r>
-        <w:rPr>
-          <w:rFonts w:ascii="Calibri" w:hAnsi="Calibri" w:cs="Calibri"/>
-          <w:b/>
-          <w:bCs/>
-        </w:rPr>
         <w:t>Depends on:</w:t>
       </w:r>
       <w:r>
         <w:rPr>
           <w:rFonts w:ascii="Calibri" w:hAnsi="Calibri" w:cs="Calibri"/>
         </w:rPr>
-        <w:t xml:space="preserve"> P10B component/profile authority.</w:t>
+        <w:t xml:space="preserve"> P10B-14 and sufficient real family/profile capability.</w:t>
       </w:r>
     </w:p>
     <w:p>
@@ -13544,31 +12501,55 @@
         <w:rPr>
           <w:rFonts w:ascii="Calibri" w:hAnsi="Calibri" w:cs="Calibri"/>
         </w:rPr>
-        <w:t xml:space="preserve"> The stated outcome and required evidence are accepted.</w:t>
-      </w:r>
-    </w:p>
-    <w:p>
-      <w:pPr>
-        <w:pStyle w:val="Normal"/>
-        <w:numPr>
-          <w:ilvl w:val="0"/>
-          <w:numId w:val="1"/>
-        </w:numPr>
-        <w:widowControl/>
-      </w:pPr>
-      <w:r>
-        <w:rPr>
-          <w:rFonts w:ascii="Calibri" w:hAnsi="Calibri" w:cs="Calibri"/>
-          <w:b/>
-          <w:bCs/>
-        </w:rPr>
-        <w:t>Required evidence:</w:t>
-      </w:r>
-      <w:r>
-        <w:rPr>
-          <w:rFonts w:ascii="Calibri" w:hAnsi="Calibri" w:cs="Calibri"/>
-        </w:rPr>
-        <w:t xml:space="preserve"> Adapter conformance and save/reload preservation.</w:t>
+        <w:t xml:space="preserve"> Deterministic selection preserves cross-page identity, narrative adjacency/ cardinality, repetition limits, bindings/assets, and complete snapshot/lifecycle output for representative inputs.</w:t>
+      </w:r>
+    </w:p>
+    <w:p>
+      <w:pPr>
+        <w:pStyle w:val="Normal"/>
+        <w:numPr>
+          <w:ilvl w:val="0"/>
+          <w:numId w:val="1"/>
+        </w:numPr>
+        <w:widowControl/>
+      </w:pPr>
+      <w:r>
+        <w:rPr>
+          <w:rFonts w:ascii="Calibri" w:hAnsi="Calibri" w:cs="Calibri"/>
+          <w:b/>
+          <w:bCs/>
+        </w:rPr>
+        <w:t>Fail closed:</w:t>
+      </w:r>
+      <w:r>
+        <w:rPr>
+          <w:rFonts w:ascii="Calibri" w:hAnsi="Calibri" w:cs="Calibri"/>
+        </w:rPr>
+        <w:t xml:space="preserve"> Missing, stale, ambiguous, incompatible, unregistered, repetitive, or protected-state-divergent combinations produce no partial proposal/snapshot.</w:t>
+      </w:r>
+    </w:p>
+    <w:p>
+      <w:pPr>
+        <w:pStyle w:val="Normal"/>
+        <w:numPr>
+          <w:ilvl w:val="0"/>
+          <w:numId w:val="1"/>
+        </w:numPr>
+        <w:widowControl/>
+      </w:pPr>
+      <w:r>
+        <w:rPr>
+          <w:rFonts w:ascii="Calibri" w:hAnsi="Calibri" w:cs="Calibri"/>
+          <w:b/>
+          <w:bCs/>
+        </w:rPr>
+        <w:t>Evidence:</w:t>
+      </w:r>
+      <w:r>
+        <w:rPr>
+          <w:rFonts w:ascii="Calibri" w:hAnsi="Calibri" w:cs="Calibri"/>
+        </w:rPr>
+        <w:t xml:space="preserve"> Selection/compatibility/unit, proposal/compiler/lifecycle integration, no-partial- write, deterministic fingerprint inputs, and complete-store browser evidence.</w:t>
       </w:r>
     </w:p>
     <w:p>
@@ -13592,7 +12573,7 @@
         <w:rPr>
           <w:rFonts w:ascii="Calibri" w:hAnsi="Calibri" w:cs="Calibri"/>
         </w:rPr>
-        <w:t xml:space="preserve"> Raw Puck persistence or a second page tree.</w:t>
+        <w:t xml:space="preserve"> Arbitrary trees/styles or a second synthesis representation.</w:t>
       </w:r>
     </w:p>
     <w:p>
@@ -13605,7 +12586,7 @@
         <w:rPr>
           <w:rFonts w:ascii="Calibri" w:hAnsi="Calibri" w:cs="Calibri"/>
         </w:rPr>
-        <w:t>P10C-04 — Stable frame identity and selection</w:t>
+        <w:t>P10B-16 — Coordinated directions and diversity control</w:t>
       </w:r>
     </w:p>
     <w:p>
@@ -13629,45 +12610,31 @@
         <w:rPr>
           <w:rFonts w:ascii="Calibri" w:hAnsi="Calibri" w:cs="Calibri"/>
         </w:rPr>
-        <w:t xml:space="preserve"> Select and edit one shared frame consistently from every page context.</w:t>
-      </w:r>
-    </w:p>
-    <w:p>
-      <w:pPr>
-        <w:pStyle w:val="Normal"/>
-        <w:numPr>
-          <w:ilvl w:val="0"/>
-          <w:numId w:val="1"/>
-        </w:numPr>
-        <w:widowControl/>
-      </w:pPr>
-      <w:r>
-        <w:rPr>
-          <w:rFonts w:ascii="Calibri" w:hAnsi="Calibri" w:cs="Calibri"/>
-          <w:b/>
-          <w:bCs/>
-        </w:rPr>
-        <w:t>Status:</w:t>
-      </w:r>
-      <w:r>
-        <w:rPr>
-          <w:rFonts w:ascii="Calibri" w:hAnsi="Calibri" w:cs="Calibri"/>
-        </w:rPr>
-        <w:t xml:space="preserve"> </w:t>
-      </w:r>
-      <w:r>
-        <w:rPr>
-          <w:rFonts w:ascii="Calibri" w:hAnsi="Calibri" w:cs="Calibri"/>
-          <w:b/>
-          <w:bCs/>
-        </w:rPr>
-        <w:t>Planned</w:t>
-      </w:r>
-      <w:r>
-        <w:rPr>
-          <w:rFonts w:ascii="Calibri" w:hAnsi="Calibri" w:cs="Calibri"/>
-        </w:rPr>
-        <w:t>.</w:t>
+        <w:t xml:space="preserve"> Make Premium Editorial, Modern Technical, and Minimal Commerce coordinated constraint packages and prevent duplicates/near duplicates.</w:t>
+      </w:r>
+    </w:p>
+    <w:p>
+      <w:pPr>
+        <w:pStyle w:val="Normal"/>
+        <w:numPr>
+          <w:ilvl w:val="0"/>
+          <w:numId w:val="1"/>
+        </w:numPr>
+        <w:widowControl/>
+      </w:pPr>
+      <w:r>
+        <w:rPr>
+          <w:rFonts w:ascii="Calibri" w:hAnsi="Calibri" w:cs="Calibri"/>
+          <w:b/>
+          <w:bCs/>
+        </w:rPr>
+        <w:t>Authority:</w:t>
+      </w:r>
+      <w:r>
+        <w:rPr>
+          <w:rFonts w:ascii="Calibri" w:hAnsi="Calibri" w:cs="Calibri"/>
+        </w:rPr>
+        <w:t xml:space="preserve"> Existing direction-selection authority plus deterministic storefront-design fingerprint/evaluation.</w:t>
       </w:r>
     </w:p>
     <w:p>
@@ -13691,7 +12658,7 @@
         <w:rPr>
           <w:rFonts w:ascii="Calibri" w:hAnsi="Calibri" w:cs="Calibri"/>
         </w:rPr>
-        <w:t xml:space="preserve"> P10C-03.</w:t>
+        <w:t xml:space="preserve"> P10B-15.</w:t>
       </w:r>
     </w:p>
     <w:p>
@@ -13715,31 +12682,55 @@
         <w:rPr>
           <w:rFonts w:ascii="Calibri" w:hAnsi="Calibri" w:cs="Calibri"/>
         </w:rPr>
-        <w:t xml:space="preserve"> The stated outcome and required evidence are accepted.</w:t>
-      </w:r>
-    </w:p>
-    <w:p>
-      <w:pPr>
-        <w:pStyle w:val="Normal"/>
-        <w:numPr>
-          <w:ilvl w:val="0"/>
-          <w:numId w:val="1"/>
-        </w:numPr>
-        <w:widowControl/>
-      </w:pPr>
-      <w:r>
-        <w:rPr>
-          <w:rFonts w:ascii="Calibri" w:hAnsi="Calibri" w:cs="Calibri"/>
-          <w:b/>
-          <w:bCs/>
-        </w:rPr>
-        <w:t>Required evidence:</w:t>
-      </w:r>
-      <w:r>
-        <w:rPr>
-          <w:rFonts w:ascii="Calibri" w:hAnsi="Calibri" w:cs="Calibri"/>
-        </w:rPr>
-        <w:t xml:space="preserve"> Stable identity, scope, history, and browser behavior.</w:t>
+        <w:t xml:space="preserve"> Fingerprints cover Design DNA, page set/profiles, frame, anatomies/variants, structural parameters, image posture, density/responsive posture, and narrative composition; exact and meaningful near duplicates fail, and pairwise stores differ materially beyond colour.</w:t>
+      </w:r>
+    </w:p>
+    <w:p>
+      <w:pPr>
+        <w:pStyle w:val="Normal"/>
+        <w:numPr>
+          <w:ilvl w:val="0"/>
+          <w:numId w:val="1"/>
+        </w:numPr>
+        <w:widowControl/>
+      </w:pPr>
+      <w:r>
+        <w:rPr>
+          <w:rFonts w:ascii="Calibri" w:hAnsi="Calibri" w:cs="Calibri"/>
+          <w:b/>
+          <w:bCs/>
+        </w:rPr>
+        <w:t>Fail closed:</w:t>
+      </w:r>
+      <w:r>
+        <w:rPr>
+          <w:rFonts w:ascii="Calibri" w:hAnsi="Calibri" w:cs="Calibri"/>
+        </w:rPr>
+        <w:t xml:space="preserve"> Fixed-template/token/page direction authority, incompatible references, colour-only differences, and fingerprints that omit material structure are rejected.</w:t>
+      </w:r>
+    </w:p>
+    <w:p>
+      <w:pPr>
+        <w:pStyle w:val="Normal"/>
+        <w:numPr>
+          <w:ilvl w:val="0"/>
+          <w:numId w:val="1"/>
+        </w:numPr>
+        <w:widowControl/>
+      </w:pPr>
+      <w:r>
+        <w:rPr>
+          <w:rFonts w:ascii="Calibri" w:hAnsi="Calibri" w:cs="Calibri"/>
+          <w:b/>
+          <w:bCs/>
+        </w:rPr>
+        <w:t>Evidence:</w:t>
+      </w:r>
+      <w:r>
+        <w:rPr>
+          <w:rFonts w:ascii="Calibri" w:hAnsi="Calibri" w:cs="Calibri"/>
+        </w:rPr>
+        <w:t xml:space="preserve"> Determinism, exact/near-duplicate fixtures, pairwise structural scoring, direction compatibility, complete-store generation, and representative visual evidence.</w:t>
       </w:r>
     </w:p>
     <w:p>
@@ -13763,7 +12754,7 @@
         <w:rPr>
           <w:rFonts w:ascii="Calibri" w:hAnsi="Calibri" w:cs="Calibri"/>
         </w:rPr>
-        <w:t xml:space="preserve"> Duplicating frame state per page.</w:t>
+        <w:t xml:space="preserve"> Thousands of manually authored templates.</w:t>
       </w:r>
     </w:p>
     <w:p>
@@ -13776,7 +12767,7 @@
         <w:rPr>
           <w:rFonts w:ascii="Calibri" w:hAnsi="Calibri" w:cs="Calibri"/>
         </w:rPr>
-        <w:t>P10C-05 — Approved manual frame operations</w:t>
+        <w:t>P10B-17 — Responsive, accessibility and performance closure</w:t>
       </w:r>
     </w:p>
     <w:p>
@@ -13800,45 +12791,31 @@
         <w:rPr>
           <w:rFonts w:ascii="Calibri" w:hAnsi="Calibri" w:cs="Calibri"/>
         </w:rPr>
-        <w:t xml:space="preserve"> Support bounded manual shared-frame add, remove, reorder, field, asset, and presentation operations.</w:t>
-      </w:r>
-    </w:p>
-    <w:p>
-      <w:pPr>
-        <w:pStyle w:val="Normal"/>
-        <w:numPr>
-          <w:ilvl w:val="0"/>
-          <w:numId w:val="1"/>
-        </w:numPr>
-        <w:widowControl/>
-      </w:pPr>
-      <w:r>
-        <w:rPr>
-          <w:rFonts w:ascii="Calibri" w:hAnsi="Calibri" w:cs="Calibri"/>
-          <w:b/>
-          <w:bCs/>
-        </w:rPr>
-        <w:t>Status:</w:t>
-      </w:r>
-      <w:r>
-        <w:rPr>
-          <w:rFonts w:ascii="Calibri" w:hAnsi="Calibri" w:cs="Calibri"/>
-        </w:rPr>
-        <w:t xml:space="preserve"> </w:t>
-      </w:r>
-      <w:r>
-        <w:rPr>
-          <w:rFonts w:ascii="Calibri" w:hAnsi="Calibri" w:cs="Calibri"/>
-          <w:b/>
-          <w:bCs/>
-        </w:rPr>
-        <w:t>Planned</w:t>
-      </w:r>
-      <w:r>
-        <w:rPr>
-          <w:rFonts w:ascii="Calibri" w:hAnsi="Calibri" w:cs="Calibri"/>
-        </w:rPr>
-        <w:t>.</w:t>
+        <w:t xml:space="preserve"> Preserve deliberate commercial hierarchy and usability across target widths, locales, accessibility, and bounded performance budgets.</w:t>
+      </w:r>
+    </w:p>
+    <w:p>
+      <w:pPr>
+        <w:pStyle w:val="Normal"/>
+        <w:numPr>
+          <w:ilvl w:val="0"/>
+          <w:numId w:val="1"/>
+        </w:numPr>
+        <w:widowControl/>
+      </w:pPr>
+      <w:r>
+        <w:rPr>
+          <w:rFonts w:ascii="Calibri" w:hAnsi="Calibri" w:cs="Calibri"/>
+          <w:b/>
+          <w:bCs/>
+        </w:rPr>
+        <w:t>Authority:</w:t>
+      </w:r>
+      <w:r>
+        <w:rPr>
+          <w:rFonts w:ascii="Calibri" w:hAnsi="Calibri" w:cs="Calibri"/>
+        </w:rPr>
+        <w:t xml:space="preserve"> Existing responsive/a11y contracts, registered transformations, renderers, and evidence protocol.</w:t>
       </w:r>
     </w:p>
     <w:p>
@@ -13862,7 +12839,7 @@
         <w:rPr>
           <w:rFonts w:ascii="Calibri" w:hAnsi="Calibri" w:cs="Calibri"/>
         </w:rPr>
-        <w:t xml:space="preserve"> P10C-02 through P10C-04.</w:t>
+        <w:t xml:space="preserve"> Implemented commercial families/profiles/directions through P10B-16.</w:t>
       </w:r>
     </w:p>
     <w:p>
@@ -13886,31 +12863,55 @@
         <w:rPr>
           <w:rFonts w:ascii="Calibri" w:hAnsi="Calibri" w:cs="Calibri"/>
         </w:rPr>
-        <w:t xml:space="preserve"> The stated outcome and required evidence are accepted.</w:t>
-      </w:r>
-    </w:p>
-    <w:p>
-      <w:pPr>
-        <w:pStyle w:val="Normal"/>
-        <w:numPr>
-          <w:ilvl w:val="0"/>
-          <w:numId w:val="1"/>
-        </w:numPr>
-        <w:widowControl/>
-      </w:pPr>
-      <w:r>
-        <w:rPr>
-          <w:rFonts w:ascii="Calibri" w:hAnsi="Calibri" w:cs="Calibri"/>
-          <w:b/>
-          <w:bCs/>
-        </w:rPr>
-        <w:t>Required evidence:</w:t>
-      </w:r>
-      <w:r>
-        <w:rPr>
-          <w:rFonts w:ascii="Calibri" w:hAnsi="Calibri" w:cs="Calibri"/>
-        </w:rPr>
-        <w:t xml:space="preserve"> Positive and fail-closed integration, undo/redo, browser/E2E.</w:t>
+        <w:t xml:space="preserve"> All supported page families/directions pass 375/768/1024/1440 and EN/FI geometry, declared transformations, keyboard/focus/semantics/contrast, content/commerce retention, and explicit performance budgets with correlated evidence.</w:t>
+      </w:r>
+    </w:p>
+    <w:p>
+      <w:pPr>
+        <w:pStyle w:val="Normal"/>
+        <w:numPr>
+          <w:ilvl w:val="0"/>
+          <w:numId w:val="1"/>
+        </w:numPr>
+        <w:widowControl/>
+      </w:pPr>
+      <w:r>
+        <w:rPr>
+          <w:rFonts w:ascii="Calibri" w:hAnsi="Calibri" w:cs="Calibri"/>
+          <w:b/>
+          <w:bCs/>
+        </w:rPr>
+        <w:t>Fail closed:</w:t>
+      </w:r>
+      <w:r>
+        <w:rPr>
+          <w:rFonts w:ascii="Calibri" w:hAnsi="Calibri" w:cs="Calibri"/>
+        </w:rPr>
+        <w:t xml:space="preserve"> Clipping, overlap, inaccessible controls, lost content/commerce, desktop-only approval, or undispositioned budget failure blocks completion.</w:t>
+      </w:r>
+    </w:p>
+    <w:p>
+      <w:pPr>
+        <w:pStyle w:val="Normal"/>
+        <w:numPr>
+          <w:ilvl w:val="0"/>
+          <w:numId w:val="1"/>
+        </w:numPr>
+        <w:widowControl/>
+      </w:pPr>
+      <w:r>
+        <w:rPr>
+          <w:rFonts w:ascii="Calibri" w:hAnsi="Calibri" w:cs="Calibri"/>
+          <w:b/>
+          <w:bCs/>
+        </w:rPr>
+        <w:t>Evidence:</w:t>
+      </w:r>
+      <w:r>
+        <w:rPr>
+          <w:rFonts w:ascii="Calibri" w:hAnsi="Calibri" w:cs="Calibri"/>
+        </w:rPr>
+        <w:t xml:space="preserve"> Automated geometry/a11y/performance/browser matrices plus retained representative human review.</w:t>
       </w:r>
     </w:p>
     <w:p>
@@ -13934,7 +12935,7 @@
         <w:rPr>
           <w:rFonts w:ascii="Calibri" w:hAnsi="Calibri" w:cs="Calibri"/>
         </w:rPr>
-        <w:t xml:space="preserve"> Arbitrary code/CSS/components or commerce mutation.</w:t>
+        <w:t xml:space="preserve"> Visual approval from isolated component screenshots.</w:t>
       </w:r>
     </w:p>
     <w:p>
@@ -13947,7 +12948,7 @@
         <w:rPr>
           <w:rFonts w:ascii="Calibri" w:hAnsi="Calibri" w:cs="Calibri"/>
         </w:rPr>
-        <w:t>P10C-06 — Scoped AI editing</w:t>
+        <w:t>P10B-18 — Commercial quality and scale gate</w:t>
       </w:r>
     </w:p>
     <w:p>
@@ -13971,45 +12972,31 @@
         <w:rPr>
           <w:rFonts w:ascii="Calibri" w:hAnsi="Calibri" w:cs="Calibri"/>
         </w:rPr>
-        <w:t xml:space="preserve"> Connect merchant routing, clarification, frame/page scope, and proposal review to the existing P10A governed authorities.</w:t>
-      </w:r>
-    </w:p>
-    <w:p>
-      <w:pPr>
-        <w:pStyle w:val="Normal"/>
-        <w:numPr>
-          <w:ilvl w:val="0"/>
-          <w:numId w:val="1"/>
-        </w:numPr>
-        <w:widowControl/>
-      </w:pPr>
-      <w:r>
-        <w:rPr>
-          <w:rFonts w:ascii="Calibri" w:hAnsi="Calibri" w:cs="Calibri"/>
-          <w:b/>
-          <w:bCs/>
-        </w:rPr>
-        <w:t>Status:</w:t>
-      </w:r>
-      <w:r>
-        <w:rPr>
-          <w:rFonts w:ascii="Calibri" w:hAnsi="Calibri" w:cs="Calibri"/>
-        </w:rPr>
-        <w:t xml:space="preserve"> </w:t>
-      </w:r>
-      <w:r>
-        <w:rPr>
-          <w:rFonts w:ascii="Calibri" w:hAnsi="Calibri" w:cs="Calibri"/>
-          <w:b/>
-          <w:bCs/>
-        </w:rPr>
-        <w:t>Planned</w:t>
-      </w:r>
-      <w:r>
-        <w:rPr>
-          <w:rFonts w:ascii="Calibri" w:hAnsi="Calibri" w:cs="Calibri"/>
-        </w:rPr>
-        <w:t>.</w:t>
+        <w:t xml:space="preserve"> Prove repeated generation of publishable, premium, materially different complete storefronts.</w:t>
+      </w:r>
+    </w:p>
+    <w:p>
+      <w:pPr>
+        <w:pStyle w:val="Normal"/>
+        <w:numPr>
+          <w:ilvl w:val="0"/>
+          <w:numId w:val="1"/>
+        </w:numPr>
+        <w:widowControl/>
+      </w:pPr>
+      <w:r>
+        <w:rPr>
+          <w:rFonts w:ascii="Calibri" w:hAnsi="Calibri" w:cs="Calibri"/>
+          <w:b/>
+          <w:bCs/>
+        </w:rPr>
+        <w:t>Authority:</w:t>
+      </w:r>
+      <w:r>
+        <w:rPr>
+          <w:rFonts w:ascii="Calibri" w:hAnsi="Calibri" w:cs="Calibri"/>
+        </w:rPr>
+        <w:t xml:space="preserve"> Existing golden-store/human-review evidence plus the P10B synthesis and fingerprint authorities.</w:t>
       </w:r>
     </w:p>
     <w:p>
@@ -14033,7 +13020,7 @@
         <w:rPr>
           <w:rFonts w:ascii="Calibri" w:hAnsi="Calibri" w:cs="Calibri"/>
         </w:rPr>
-        <w:t xml:space="preserve"> P10C-03 through P10C-05 and P10A internal router/packages.</w:t>
+        <w:t xml:space="preserve"> P10B-17 and every prior P10B task.</w:t>
       </w:r>
     </w:p>
     <w:p>
@@ -14057,31 +13044,55 @@
         <w:rPr>
           <w:rFonts w:ascii="Calibri" w:hAnsi="Calibri" w:cs="Calibri"/>
         </w:rPr>
-        <w:t xml:space="preserve"> The stated outcome and required evidence are accepted.</w:t>
-      </w:r>
-    </w:p>
-    <w:p>
-      <w:pPr>
-        <w:pStyle w:val="Normal"/>
-        <w:numPr>
-          <w:ilvl w:val="0"/>
-          <w:numId w:val="1"/>
-        </w:numPr>
-        <w:widowControl/>
-      </w:pPr>
-      <w:r>
-        <w:rPr>
-          <w:rFonts w:ascii="Calibri" w:hAnsi="Calibri" w:cs="Calibri"/>
-          <w:b/>
-          <w:bCs/>
-        </w:rPr>
-        <w:t>Required evidence:</w:t>
-      </w:r>
-      <w:r>
-        <w:rPr>
-          <w:rFonts w:ascii="Calibri" w:hAnsi="Calibri" w:cs="Calibri"/>
-        </w:rPr>
-        <w:t xml:space="preserve"> Selected-section, frame, page, storefront, ambiguity, stale, and failure browser flows.</w:t>
+        <w:t xml:space="preserve"> At least 100 deterministic complete configurations across representative catalogue/evidence/asset/locale/page-set/direction contexts pass snapshot validity, protected parity, exact-duplicate, near-duplicate, and structural-distribution gates; a fingerprint- stratified subset passes retained four-width human commercial review.</w:t>
+      </w:r>
+    </w:p>
+    <w:p>
+      <w:pPr>
+        <w:pStyle w:val="Normal"/>
+        <w:numPr>
+          <w:ilvl w:val="0"/>
+          <w:numId w:val="1"/>
+        </w:numPr>
+        <w:widowControl/>
+      </w:pPr>
+      <w:r>
+        <w:rPr>
+          <w:rFonts w:ascii="Calibri" w:hAnsi="Calibri" w:cs="Calibri"/>
+          <w:b/>
+          <w:bCs/>
+        </w:rPr>
+        <w:t>Fail closed:</w:t>
+      </w:r>
+      <w:r>
+        <w:rPr>
+          <w:rFonts w:ascii="Calibri" w:hAnsi="Calibri" w:cs="Calibri"/>
+        </w:rPr>
+        <w:t xml:space="preserve"> One polished store, automated checks alone, placeholder assets, registry counts, screenshots without exact authority, or colour-only diversity cannot close P10B.</w:t>
+      </w:r>
+    </w:p>
+    <w:p>
+      <w:pPr>
+        <w:pStyle w:val="Normal"/>
+        <w:numPr>
+          <w:ilvl w:val="0"/>
+          <w:numId w:val="1"/>
+        </w:numPr>
+        <w:widowControl/>
+      </w:pPr>
+      <w:r>
+        <w:rPr>
+          <w:rFonts w:ascii="Calibri" w:hAnsi="Calibri" w:cs="Calibri"/>
+          <w:b/>
+          <w:bCs/>
+        </w:rPr>
+        <w:t>Evidence:</w:t>
+      </w:r>
+      <w:r>
+        <w:rPr>
+          <w:rFonts w:ascii="Calibri" w:hAnsi="Calibri" w:cs="Calibri"/>
+        </w:rPr>
+        <w:t xml:space="preserve"> Scale-generation ledger, fingerprint/diversity analysis, complete capability-chain correlations, retained screenshots, and explicit human acceptance.</w:t>
       </w:r>
     </w:p>
     <w:p>
@@ -14105,7 +13116,20 @@
         <w:rPr>
           <w:rFonts w:ascii="Calibri" w:hAnsi="Calibri" w:cs="Calibri"/>
         </w:rPr>
-        <w:t xml:space="preserve"> Rebuilding the router, packages, proposals, or provider boundary.</w:t>
+        <w:t xml:space="preserve"> P10C merchant editing, Vesko staging, or production-readiness claims.</w:t>
+      </w:r>
+    </w:p>
+    <w:p>
+      <w:pPr>
+        <w:pStyle w:val="Heading2"/>
+        <w:keepNext/>
+        <w:widowControl/>
+      </w:pPr>
+      <w:r>
+        <w:rPr>
+          <w:rFonts w:ascii="Calibri" w:hAnsi="Calibri" w:cs="Calibri"/>
+        </w:rPr>
+        <w:t>P10C — Storefront Studio Editing Experience v1</w:t>
       </w:r>
     </w:p>
     <w:p>
@@ -14118,7 +13142,7 @@
         <w:rPr>
           <w:rFonts w:ascii="Calibri" w:hAnsi="Calibri" w:cs="Calibri"/>
         </w:rPr>
-        <w:t>P10C-07 — Unified AI/manual history</w:t>
+        <w:t>P10C-01 — Brand asset library</w:t>
       </w:r>
     </w:p>
     <w:p>
@@ -14142,7 +13166,7 @@
         <w:rPr>
           <w:rFonts w:ascii="Calibri" w:hAnsi="Calibri" w:cs="Calibri"/>
         </w:rPr>
-        <w:t xml:space="preserve"> Put manual and accepted AI operations into one atomic canonical undo/redo history.</w:t>
+        <w:t xml:space="preserve"> Let merchants view and choose approved presentation assets in Storefront Studio.</w:t>
       </w:r>
     </w:p>
     <w:p>
@@ -14204,7 +13228,7 @@
         <w:rPr>
           <w:rFonts w:ascii="Calibri" w:hAnsi="Calibri" w:cs="Calibri"/>
         </w:rPr>
-        <w:t xml:space="preserve"> P10C-05, P10C-06.</w:t>
+        <w:t xml:space="preserve"> P10B asset authority.</w:t>
       </w:r>
     </w:p>
     <w:p>
@@ -14252,7 +13276,7 @@
         <w:rPr>
           <w:rFonts w:ascii="Calibri" w:hAnsi="Calibri" w:cs="Calibri"/>
         </w:rPr>
-        <w:t xml:space="preserve"> Mixed edits, undo/redo, save/reload, stale protection.</w:t>
+        <w:t xml:space="preserve"> Contract, integration, browser/E2E.</w:t>
       </w:r>
     </w:p>
     <w:p>
@@ -14276,7 +13300,7 @@
         <w:rPr>
           <w:rFonts w:ascii="Calibri" w:hAnsi="Calibri" w:cs="Calibri"/>
         </w:rPr>
-        <w:t xml:space="preserve"> A Puck-only or AI-only history.</w:t>
+        <w:t xml:space="preserve"> Product-media replacement or generic DAM scope.</w:t>
       </w:r>
     </w:p>
     <w:p>
@@ -14289,7 +13313,7 @@
         <w:rPr>
           <w:rFonts w:ascii="Calibri" w:hAnsi="Calibri" w:cs="Calibri"/>
         </w:rPr>
-        <w:t>P10C-08 — Brand and asset editor with Studio shell</w:t>
+        <w:t>P10C-02 — Asset roles and provenance</w:t>
       </w:r>
     </w:p>
     <w:p>
@@ -14313,7 +13337,7 @@
         <w:rPr>
           <w:rFonts w:ascii="Calibri" w:hAnsi="Calibri" w:cs="Calibri"/>
         </w:rPr>
-        <w:t xml:space="preserve"> Deliver the merchant shell subset required to operate assets, canvas, review, save, preview, and publish.</w:t>
+        <w:t xml:space="preserve"> Show and preserve role, source, approval, revision, and assignment authority.</w:t>
       </w:r>
     </w:p>
     <w:p>
@@ -14375,7 +13399,7 @@
         <w:rPr>
           <w:rFonts w:ascii="Calibri" w:hAnsi="Calibri" w:cs="Calibri"/>
         </w:rPr>
-        <w:t xml:space="preserve"> P10C-01 through P10C-07.</w:t>
+        <w:t xml:space="preserve"> P10C-01.</w:t>
       </w:r>
     </w:p>
     <w:p>
@@ -14423,7 +13447,7 @@
         <w:rPr>
           <w:rFonts w:ascii="Calibri" w:hAnsi="Calibri" w:cs="Calibri"/>
         </w:rPr>
-        <w:t xml:space="preserve"> Default/loading/empty/error/stale/success/unsaved states, accessibility, responsive browser/E2E.</w:t>
+        <w:t xml:space="preserve"> Valid assignment and stale/unknown/role-mismatch rejection.</w:t>
       </w:r>
     </w:p>
     <w:p>
@@ -14447,7 +13471,7 @@
         <w:rPr>
           <w:rFonts w:ascii="Calibri" w:hAnsi="Calibri" w:cs="Calibri"/>
         </w:rPr>
-        <w:t xml:space="preserve"> Full CMS or exposure of implementation internals.</w:t>
+        <w:t xml:space="preserve"> Untyped uploads or hidden provenance.</w:t>
       </w:r>
     </w:p>
     <w:p>
@@ -14460,6 +13484,1046 @@
         <w:rPr>
           <w:rFonts w:ascii="Calibri" w:hAnsi="Calibri" w:cs="Calibri"/>
         </w:rPr>
+        <w:t>P10C-03 — Canonical Puck boundary</w:t>
+      </w:r>
+    </w:p>
+    <w:p>
+      <w:pPr>
+        <w:pStyle w:val="Normal"/>
+        <w:numPr>
+          <w:ilvl w:val="0"/>
+          <w:numId w:val="1"/>
+        </w:numPr>
+        <w:widowControl/>
+      </w:pPr>
+      <w:r>
+        <w:rPr>
+          <w:rFonts w:ascii="Calibri" w:hAnsi="Calibri" w:cs="Calibri"/>
+          <w:b/>
+          <w:bCs/>
+        </w:rPr>
+        <w:t>Outcome:</w:t>
+      </w:r>
+      <w:r>
+        <w:rPr>
+          <w:rFonts w:ascii="Calibri" w:hAnsi="Calibri" w:cs="Calibri"/>
+        </w:rPr>
+        <w:t xml:space="preserve"> Project registered canonical content into Puck and validate edits back into the same </w:t>
+      </w:r>
+      <w:r>
+        <w:rPr>
+          <w:rFonts w:ascii="Consolas" w:hAnsi="Consolas" w:cs="Consolas"/>
+          <w:sz w:val="19"/>
+          <w:szCs w:val="19"/>
+        </w:rPr>
+        <w:t>StorefrontSnapshot</w:t>
+      </w:r>
+      <w:r>
+        <w:rPr>
+          <w:rFonts w:ascii="Calibri" w:hAnsi="Calibri" w:cs="Calibri"/>
+        </w:rPr>
+        <w:t>.</w:t>
+      </w:r>
+    </w:p>
+    <w:p>
+      <w:pPr>
+        <w:pStyle w:val="Normal"/>
+        <w:numPr>
+          <w:ilvl w:val="0"/>
+          <w:numId w:val="1"/>
+        </w:numPr>
+        <w:widowControl/>
+      </w:pPr>
+      <w:r>
+        <w:rPr>
+          <w:rFonts w:ascii="Calibri" w:hAnsi="Calibri" w:cs="Calibri"/>
+          <w:b/>
+          <w:bCs/>
+        </w:rPr>
+        <w:t>Status:</w:t>
+      </w:r>
+      <w:r>
+        <w:rPr>
+          <w:rFonts w:ascii="Calibri" w:hAnsi="Calibri" w:cs="Calibri"/>
+        </w:rPr>
+        <w:t xml:space="preserve"> </w:t>
+      </w:r>
+      <w:r>
+        <w:rPr>
+          <w:rFonts w:ascii="Calibri" w:hAnsi="Calibri" w:cs="Calibri"/>
+          <w:b/>
+          <w:bCs/>
+        </w:rPr>
+        <w:t>Planned</w:t>
+      </w:r>
+      <w:r>
+        <w:rPr>
+          <w:rFonts w:ascii="Calibri" w:hAnsi="Calibri" w:cs="Calibri"/>
+        </w:rPr>
+        <w:t>.</w:t>
+      </w:r>
+    </w:p>
+    <w:p>
+      <w:pPr>
+        <w:pStyle w:val="Normal"/>
+        <w:numPr>
+          <w:ilvl w:val="0"/>
+          <w:numId w:val="1"/>
+        </w:numPr>
+        <w:widowControl/>
+      </w:pPr>
+      <w:r>
+        <w:rPr>
+          <w:rFonts w:ascii="Calibri" w:hAnsi="Calibri" w:cs="Calibri"/>
+          <w:b/>
+          <w:bCs/>
+        </w:rPr>
+        <w:t>Depends on:</w:t>
+      </w:r>
+      <w:r>
+        <w:rPr>
+          <w:rFonts w:ascii="Calibri" w:hAnsi="Calibri" w:cs="Calibri"/>
+        </w:rPr>
+        <w:t xml:space="preserve"> P10B component/profile authority.</w:t>
+      </w:r>
+    </w:p>
+    <w:p>
+      <w:pPr>
+        <w:pStyle w:val="Normal"/>
+        <w:numPr>
+          <w:ilvl w:val="0"/>
+          <w:numId w:val="1"/>
+        </w:numPr>
+        <w:widowControl/>
+      </w:pPr>
+      <w:r>
+        <w:rPr>
+          <w:rFonts w:ascii="Calibri" w:hAnsi="Calibri" w:cs="Calibri"/>
+          <w:b/>
+          <w:bCs/>
+        </w:rPr>
+        <w:t>Done when:</w:t>
+      </w:r>
+      <w:r>
+        <w:rPr>
+          <w:rFonts w:ascii="Calibri" w:hAnsi="Calibri" w:cs="Calibri"/>
+        </w:rPr>
+        <w:t xml:space="preserve"> The stated outcome and required evidence are accepted.</w:t>
+      </w:r>
+    </w:p>
+    <w:p>
+      <w:pPr>
+        <w:pStyle w:val="Normal"/>
+        <w:numPr>
+          <w:ilvl w:val="0"/>
+          <w:numId w:val="1"/>
+        </w:numPr>
+        <w:widowControl/>
+      </w:pPr>
+      <w:r>
+        <w:rPr>
+          <w:rFonts w:ascii="Calibri" w:hAnsi="Calibri" w:cs="Calibri"/>
+          <w:b/>
+          <w:bCs/>
+        </w:rPr>
+        <w:t>Required evidence:</w:t>
+      </w:r>
+      <w:r>
+        <w:rPr>
+          <w:rFonts w:ascii="Calibri" w:hAnsi="Calibri" w:cs="Calibri"/>
+        </w:rPr>
+        <w:t xml:space="preserve"> Adapter conformance and save/reload preservation.</w:t>
+      </w:r>
+    </w:p>
+    <w:p>
+      <w:pPr>
+        <w:pStyle w:val="Normal"/>
+        <w:numPr>
+          <w:ilvl w:val="0"/>
+          <w:numId w:val="1"/>
+        </w:numPr>
+        <w:widowControl/>
+      </w:pPr>
+      <w:r>
+        <w:rPr>
+          <w:rFonts w:ascii="Calibri" w:hAnsi="Calibri" w:cs="Calibri"/>
+          <w:b/>
+          <w:bCs/>
+        </w:rPr>
+        <w:t>Non-goal:</w:t>
+      </w:r>
+      <w:r>
+        <w:rPr>
+          <w:rFonts w:ascii="Calibri" w:hAnsi="Calibri" w:cs="Calibri"/>
+        </w:rPr>
+        <w:t xml:space="preserve"> Raw Puck persistence or a second page tree.</w:t>
+      </w:r>
+    </w:p>
+    <w:p>
+      <w:pPr>
+        <w:pStyle w:val="Heading3"/>
+        <w:keepNext/>
+        <w:widowControl/>
+      </w:pPr>
+      <w:r>
+        <w:rPr>
+          <w:rFonts w:ascii="Calibri" w:hAnsi="Calibri" w:cs="Calibri"/>
+        </w:rPr>
+        <w:t>P10C-04 — Stable frame identity and selection</w:t>
+      </w:r>
+    </w:p>
+    <w:p>
+      <w:pPr>
+        <w:pStyle w:val="Normal"/>
+        <w:numPr>
+          <w:ilvl w:val="0"/>
+          <w:numId w:val="1"/>
+        </w:numPr>
+        <w:widowControl/>
+      </w:pPr>
+      <w:r>
+        <w:rPr>
+          <w:rFonts w:ascii="Calibri" w:hAnsi="Calibri" w:cs="Calibri"/>
+          <w:b/>
+          <w:bCs/>
+        </w:rPr>
+        <w:t>Outcome:</w:t>
+      </w:r>
+      <w:r>
+        <w:rPr>
+          <w:rFonts w:ascii="Calibri" w:hAnsi="Calibri" w:cs="Calibri"/>
+        </w:rPr>
+        <w:t xml:space="preserve"> Select and edit one shared frame consistently from every page context.</w:t>
+      </w:r>
+    </w:p>
+    <w:p>
+      <w:pPr>
+        <w:pStyle w:val="Normal"/>
+        <w:numPr>
+          <w:ilvl w:val="0"/>
+          <w:numId w:val="1"/>
+        </w:numPr>
+        <w:widowControl/>
+      </w:pPr>
+      <w:r>
+        <w:rPr>
+          <w:rFonts w:ascii="Calibri" w:hAnsi="Calibri" w:cs="Calibri"/>
+          <w:b/>
+          <w:bCs/>
+        </w:rPr>
+        <w:t>Status:</w:t>
+      </w:r>
+      <w:r>
+        <w:rPr>
+          <w:rFonts w:ascii="Calibri" w:hAnsi="Calibri" w:cs="Calibri"/>
+        </w:rPr>
+        <w:t xml:space="preserve"> </w:t>
+      </w:r>
+      <w:r>
+        <w:rPr>
+          <w:rFonts w:ascii="Calibri" w:hAnsi="Calibri" w:cs="Calibri"/>
+          <w:b/>
+          <w:bCs/>
+        </w:rPr>
+        <w:t>Planned</w:t>
+      </w:r>
+      <w:r>
+        <w:rPr>
+          <w:rFonts w:ascii="Calibri" w:hAnsi="Calibri" w:cs="Calibri"/>
+        </w:rPr>
+        <w:t>.</w:t>
+      </w:r>
+    </w:p>
+    <w:p>
+      <w:pPr>
+        <w:pStyle w:val="Normal"/>
+        <w:numPr>
+          <w:ilvl w:val="0"/>
+          <w:numId w:val="1"/>
+        </w:numPr>
+        <w:widowControl/>
+      </w:pPr>
+      <w:r>
+        <w:rPr>
+          <w:rFonts w:ascii="Calibri" w:hAnsi="Calibri" w:cs="Calibri"/>
+          <w:b/>
+          <w:bCs/>
+        </w:rPr>
+        <w:t>Depends on:</w:t>
+      </w:r>
+      <w:r>
+        <w:rPr>
+          <w:rFonts w:ascii="Calibri" w:hAnsi="Calibri" w:cs="Calibri"/>
+        </w:rPr>
+        <w:t xml:space="preserve"> P10C-03.</w:t>
+      </w:r>
+    </w:p>
+    <w:p>
+      <w:pPr>
+        <w:pStyle w:val="Normal"/>
+        <w:numPr>
+          <w:ilvl w:val="0"/>
+          <w:numId w:val="1"/>
+        </w:numPr>
+        <w:widowControl/>
+      </w:pPr>
+      <w:r>
+        <w:rPr>
+          <w:rFonts w:ascii="Calibri" w:hAnsi="Calibri" w:cs="Calibri"/>
+          <w:b/>
+          <w:bCs/>
+        </w:rPr>
+        <w:t>Done when:</w:t>
+      </w:r>
+      <w:r>
+        <w:rPr>
+          <w:rFonts w:ascii="Calibri" w:hAnsi="Calibri" w:cs="Calibri"/>
+        </w:rPr>
+        <w:t xml:space="preserve"> The stated outcome and required evidence are accepted.</w:t>
+      </w:r>
+    </w:p>
+    <w:p>
+      <w:pPr>
+        <w:pStyle w:val="Normal"/>
+        <w:numPr>
+          <w:ilvl w:val="0"/>
+          <w:numId w:val="1"/>
+        </w:numPr>
+        <w:widowControl/>
+      </w:pPr>
+      <w:r>
+        <w:rPr>
+          <w:rFonts w:ascii="Calibri" w:hAnsi="Calibri" w:cs="Calibri"/>
+          <w:b/>
+          <w:bCs/>
+        </w:rPr>
+        <w:t>Required evidence:</w:t>
+      </w:r>
+      <w:r>
+        <w:rPr>
+          <w:rFonts w:ascii="Calibri" w:hAnsi="Calibri" w:cs="Calibri"/>
+        </w:rPr>
+        <w:t xml:space="preserve"> Stable identity, scope, history, and browser behavior.</w:t>
+      </w:r>
+    </w:p>
+    <w:p>
+      <w:pPr>
+        <w:pStyle w:val="Normal"/>
+        <w:numPr>
+          <w:ilvl w:val="0"/>
+          <w:numId w:val="1"/>
+        </w:numPr>
+        <w:widowControl/>
+      </w:pPr>
+      <w:r>
+        <w:rPr>
+          <w:rFonts w:ascii="Calibri" w:hAnsi="Calibri" w:cs="Calibri"/>
+          <w:b/>
+          <w:bCs/>
+        </w:rPr>
+        <w:t>Non-goal:</w:t>
+      </w:r>
+      <w:r>
+        <w:rPr>
+          <w:rFonts w:ascii="Calibri" w:hAnsi="Calibri" w:cs="Calibri"/>
+        </w:rPr>
+        <w:t xml:space="preserve"> Duplicating frame state per page.</w:t>
+      </w:r>
+    </w:p>
+    <w:p>
+      <w:pPr>
+        <w:pStyle w:val="Heading3"/>
+        <w:keepNext/>
+        <w:widowControl/>
+      </w:pPr>
+      <w:r>
+        <w:rPr>
+          <w:rFonts w:ascii="Calibri" w:hAnsi="Calibri" w:cs="Calibri"/>
+        </w:rPr>
+        <w:t>P10C-05 — Approved manual frame operations</w:t>
+      </w:r>
+    </w:p>
+    <w:p>
+      <w:pPr>
+        <w:pStyle w:val="Normal"/>
+        <w:numPr>
+          <w:ilvl w:val="0"/>
+          <w:numId w:val="1"/>
+        </w:numPr>
+        <w:widowControl/>
+      </w:pPr>
+      <w:r>
+        <w:rPr>
+          <w:rFonts w:ascii="Calibri" w:hAnsi="Calibri" w:cs="Calibri"/>
+          <w:b/>
+          <w:bCs/>
+        </w:rPr>
+        <w:t>Outcome:</w:t>
+      </w:r>
+      <w:r>
+        <w:rPr>
+          <w:rFonts w:ascii="Calibri" w:hAnsi="Calibri" w:cs="Calibri"/>
+        </w:rPr>
+        <w:t xml:space="preserve"> Support bounded manual shared-frame add, remove, reorder, field, asset, and presentation operations.</w:t>
+      </w:r>
+    </w:p>
+    <w:p>
+      <w:pPr>
+        <w:pStyle w:val="Normal"/>
+        <w:numPr>
+          <w:ilvl w:val="0"/>
+          <w:numId w:val="1"/>
+        </w:numPr>
+        <w:widowControl/>
+      </w:pPr>
+      <w:r>
+        <w:rPr>
+          <w:rFonts w:ascii="Calibri" w:hAnsi="Calibri" w:cs="Calibri"/>
+          <w:b/>
+          <w:bCs/>
+        </w:rPr>
+        <w:t>Status:</w:t>
+      </w:r>
+      <w:r>
+        <w:rPr>
+          <w:rFonts w:ascii="Calibri" w:hAnsi="Calibri" w:cs="Calibri"/>
+        </w:rPr>
+        <w:t xml:space="preserve"> </w:t>
+      </w:r>
+      <w:r>
+        <w:rPr>
+          <w:rFonts w:ascii="Calibri" w:hAnsi="Calibri" w:cs="Calibri"/>
+          <w:b/>
+          <w:bCs/>
+        </w:rPr>
+        <w:t>Planned</w:t>
+      </w:r>
+      <w:r>
+        <w:rPr>
+          <w:rFonts w:ascii="Calibri" w:hAnsi="Calibri" w:cs="Calibri"/>
+        </w:rPr>
+        <w:t>.</w:t>
+      </w:r>
+    </w:p>
+    <w:p>
+      <w:pPr>
+        <w:pStyle w:val="Normal"/>
+        <w:numPr>
+          <w:ilvl w:val="0"/>
+          <w:numId w:val="1"/>
+        </w:numPr>
+        <w:widowControl/>
+      </w:pPr>
+      <w:r>
+        <w:rPr>
+          <w:rFonts w:ascii="Calibri" w:hAnsi="Calibri" w:cs="Calibri"/>
+          <w:b/>
+          <w:bCs/>
+        </w:rPr>
+        <w:t>Depends on:</w:t>
+      </w:r>
+      <w:r>
+        <w:rPr>
+          <w:rFonts w:ascii="Calibri" w:hAnsi="Calibri" w:cs="Calibri"/>
+        </w:rPr>
+        <w:t xml:space="preserve"> P10C-02 through P10C-04.</w:t>
+      </w:r>
+    </w:p>
+    <w:p>
+      <w:pPr>
+        <w:pStyle w:val="Normal"/>
+        <w:numPr>
+          <w:ilvl w:val="0"/>
+          <w:numId w:val="1"/>
+        </w:numPr>
+        <w:widowControl/>
+      </w:pPr>
+      <w:r>
+        <w:rPr>
+          <w:rFonts w:ascii="Calibri" w:hAnsi="Calibri" w:cs="Calibri"/>
+          <w:b/>
+          <w:bCs/>
+        </w:rPr>
+        <w:t>Done when:</w:t>
+      </w:r>
+      <w:r>
+        <w:rPr>
+          <w:rFonts w:ascii="Calibri" w:hAnsi="Calibri" w:cs="Calibri"/>
+        </w:rPr>
+        <w:t xml:space="preserve"> The stated outcome and required evidence are accepted.</w:t>
+      </w:r>
+    </w:p>
+    <w:p>
+      <w:pPr>
+        <w:pStyle w:val="Normal"/>
+        <w:numPr>
+          <w:ilvl w:val="0"/>
+          <w:numId w:val="1"/>
+        </w:numPr>
+        <w:widowControl/>
+      </w:pPr>
+      <w:r>
+        <w:rPr>
+          <w:rFonts w:ascii="Calibri" w:hAnsi="Calibri" w:cs="Calibri"/>
+          <w:b/>
+          <w:bCs/>
+        </w:rPr>
+        <w:t>Required evidence:</w:t>
+      </w:r>
+      <w:r>
+        <w:rPr>
+          <w:rFonts w:ascii="Calibri" w:hAnsi="Calibri" w:cs="Calibri"/>
+        </w:rPr>
+        <w:t xml:space="preserve"> Positive and fail-closed integration, undo/redo, browser/E2E.</w:t>
+      </w:r>
+    </w:p>
+    <w:p>
+      <w:pPr>
+        <w:pStyle w:val="Normal"/>
+        <w:numPr>
+          <w:ilvl w:val="0"/>
+          <w:numId w:val="1"/>
+        </w:numPr>
+        <w:widowControl/>
+      </w:pPr>
+      <w:r>
+        <w:rPr>
+          <w:rFonts w:ascii="Calibri" w:hAnsi="Calibri" w:cs="Calibri"/>
+          <w:b/>
+          <w:bCs/>
+        </w:rPr>
+        <w:t>Non-goal:</w:t>
+      </w:r>
+      <w:r>
+        <w:rPr>
+          <w:rFonts w:ascii="Calibri" w:hAnsi="Calibri" w:cs="Calibri"/>
+        </w:rPr>
+        <w:t xml:space="preserve"> Arbitrary code/CSS/components or commerce mutation.</w:t>
+      </w:r>
+    </w:p>
+    <w:p>
+      <w:pPr>
+        <w:pStyle w:val="Heading3"/>
+        <w:keepNext/>
+        <w:widowControl/>
+      </w:pPr>
+      <w:r>
+        <w:rPr>
+          <w:rFonts w:ascii="Calibri" w:hAnsi="Calibri" w:cs="Calibri"/>
+        </w:rPr>
+        <w:t>P10C-06 — Scoped AI editing</w:t>
+      </w:r>
+    </w:p>
+    <w:p>
+      <w:pPr>
+        <w:pStyle w:val="Normal"/>
+        <w:numPr>
+          <w:ilvl w:val="0"/>
+          <w:numId w:val="1"/>
+        </w:numPr>
+        <w:widowControl/>
+      </w:pPr>
+      <w:r>
+        <w:rPr>
+          <w:rFonts w:ascii="Calibri" w:hAnsi="Calibri" w:cs="Calibri"/>
+          <w:b/>
+          <w:bCs/>
+        </w:rPr>
+        <w:t>Outcome:</w:t>
+      </w:r>
+      <w:r>
+        <w:rPr>
+          <w:rFonts w:ascii="Calibri" w:hAnsi="Calibri" w:cs="Calibri"/>
+        </w:rPr>
+        <w:t xml:space="preserve"> Connect merchant routing, clarification, frame/page scope, and proposal review to the existing P10A governed authorities.</w:t>
+      </w:r>
+    </w:p>
+    <w:p>
+      <w:pPr>
+        <w:pStyle w:val="Normal"/>
+        <w:numPr>
+          <w:ilvl w:val="0"/>
+          <w:numId w:val="1"/>
+        </w:numPr>
+        <w:widowControl/>
+      </w:pPr>
+      <w:r>
+        <w:rPr>
+          <w:rFonts w:ascii="Calibri" w:hAnsi="Calibri" w:cs="Calibri"/>
+          <w:b/>
+          <w:bCs/>
+        </w:rPr>
+        <w:t>Status:</w:t>
+      </w:r>
+      <w:r>
+        <w:rPr>
+          <w:rFonts w:ascii="Calibri" w:hAnsi="Calibri" w:cs="Calibri"/>
+        </w:rPr>
+        <w:t xml:space="preserve"> </w:t>
+      </w:r>
+      <w:r>
+        <w:rPr>
+          <w:rFonts w:ascii="Calibri" w:hAnsi="Calibri" w:cs="Calibri"/>
+          <w:b/>
+          <w:bCs/>
+        </w:rPr>
+        <w:t>Planned</w:t>
+      </w:r>
+      <w:r>
+        <w:rPr>
+          <w:rFonts w:ascii="Calibri" w:hAnsi="Calibri" w:cs="Calibri"/>
+        </w:rPr>
+        <w:t>.</w:t>
+      </w:r>
+    </w:p>
+    <w:p>
+      <w:pPr>
+        <w:pStyle w:val="Normal"/>
+        <w:numPr>
+          <w:ilvl w:val="0"/>
+          <w:numId w:val="1"/>
+        </w:numPr>
+        <w:widowControl/>
+      </w:pPr>
+      <w:r>
+        <w:rPr>
+          <w:rFonts w:ascii="Calibri" w:hAnsi="Calibri" w:cs="Calibri"/>
+          <w:b/>
+          <w:bCs/>
+        </w:rPr>
+        <w:t>Depends on:</w:t>
+      </w:r>
+      <w:r>
+        <w:rPr>
+          <w:rFonts w:ascii="Calibri" w:hAnsi="Calibri" w:cs="Calibri"/>
+        </w:rPr>
+        <w:t xml:space="preserve"> P10C-03 through P10C-05 and P10A internal router/packages.</w:t>
+      </w:r>
+    </w:p>
+    <w:p>
+      <w:pPr>
+        <w:pStyle w:val="Normal"/>
+        <w:numPr>
+          <w:ilvl w:val="0"/>
+          <w:numId w:val="1"/>
+        </w:numPr>
+        <w:widowControl/>
+      </w:pPr>
+      <w:r>
+        <w:rPr>
+          <w:rFonts w:ascii="Calibri" w:hAnsi="Calibri" w:cs="Calibri"/>
+          <w:b/>
+          <w:bCs/>
+        </w:rPr>
+        <w:t>Done when:</w:t>
+      </w:r>
+      <w:r>
+        <w:rPr>
+          <w:rFonts w:ascii="Calibri" w:hAnsi="Calibri" w:cs="Calibri"/>
+        </w:rPr>
+        <w:t xml:space="preserve"> The stated outcome and required evidence are accepted.</w:t>
+      </w:r>
+    </w:p>
+    <w:p>
+      <w:pPr>
+        <w:pStyle w:val="Normal"/>
+        <w:numPr>
+          <w:ilvl w:val="0"/>
+          <w:numId w:val="1"/>
+        </w:numPr>
+        <w:widowControl/>
+      </w:pPr>
+      <w:r>
+        <w:rPr>
+          <w:rFonts w:ascii="Calibri" w:hAnsi="Calibri" w:cs="Calibri"/>
+          <w:b/>
+          <w:bCs/>
+        </w:rPr>
+        <w:t>Required evidence:</w:t>
+      </w:r>
+      <w:r>
+        <w:rPr>
+          <w:rFonts w:ascii="Calibri" w:hAnsi="Calibri" w:cs="Calibri"/>
+        </w:rPr>
+        <w:t xml:space="preserve"> Selected-section, frame, page, storefront, ambiguity, stale, and failure browser flows.</w:t>
+      </w:r>
+    </w:p>
+    <w:p>
+      <w:pPr>
+        <w:pStyle w:val="Normal"/>
+        <w:numPr>
+          <w:ilvl w:val="0"/>
+          <w:numId w:val="1"/>
+        </w:numPr>
+        <w:widowControl/>
+      </w:pPr>
+      <w:r>
+        <w:rPr>
+          <w:rFonts w:ascii="Calibri" w:hAnsi="Calibri" w:cs="Calibri"/>
+          <w:b/>
+          <w:bCs/>
+        </w:rPr>
+        <w:t>Non-goal:</w:t>
+      </w:r>
+      <w:r>
+        <w:rPr>
+          <w:rFonts w:ascii="Calibri" w:hAnsi="Calibri" w:cs="Calibri"/>
+        </w:rPr>
+        <w:t xml:space="preserve"> Rebuilding the router, packages, proposals, or provider boundary.</w:t>
+      </w:r>
+    </w:p>
+    <w:p>
+      <w:pPr>
+        <w:pStyle w:val="Heading3"/>
+        <w:keepNext/>
+        <w:widowControl/>
+      </w:pPr>
+      <w:r>
+        <w:rPr>
+          <w:rFonts w:ascii="Calibri" w:hAnsi="Calibri" w:cs="Calibri"/>
+        </w:rPr>
+        <w:t>P10C-07 — Unified AI/manual history</w:t>
+      </w:r>
+    </w:p>
+    <w:p>
+      <w:pPr>
+        <w:pStyle w:val="Normal"/>
+        <w:numPr>
+          <w:ilvl w:val="0"/>
+          <w:numId w:val="1"/>
+        </w:numPr>
+        <w:widowControl/>
+      </w:pPr>
+      <w:r>
+        <w:rPr>
+          <w:rFonts w:ascii="Calibri" w:hAnsi="Calibri" w:cs="Calibri"/>
+          <w:b/>
+          <w:bCs/>
+        </w:rPr>
+        <w:t>Outcome:</w:t>
+      </w:r>
+      <w:r>
+        <w:rPr>
+          <w:rFonts w:ascii="Calibri" w:hAnsi="Calibri" w:cs="Calibri"/>
+        </w:rPr>
+        <w:t xml:space="preserve"> Put manual and accepted AI operations into one atomic canonical undo/redo history.</w:t>
+      </w:r>
+    </w:p>
+    <w:p>
+      <w:pPr>
+        <w:pStyle w:val="Normal"/>
+        <w:numPr>
+          <w:ilvl w:val="0"/>
+          <w:numId w:val="1"/>
+        </w:numPr>
+        <w:widowControl/>
+      </w:pPr>
+      <w:r>
+        <w:rPr>
+          <w:rFonts w:ascii="Calibri" w:hAnsi="Calibri" w:cs="Calibri"/>
+          <w:b/>
+          <w:bCs/>
+        </w:rPr>
+        <w:t>Status:</w:t>
+      </w:r>
+      <w:r>
+        <w:rPr>
+          <w:rFonts w:ascii="Calibri" w:hAnsi="Calibri" w:cs="Calibri"/>
+        </w:rPr>
+        <w:t xml:space="preserve"> </w:t>
+      </w:r>
+      <w:r>
+        <w:rPr>
+          <w:rFonts w:ascii="Calibri" w:hAnsi="Calibri" w:cs="Calibri"/>
+          <w:b/>
+          <w:bCs/>
+        </w:rPr>
+        <w:t>Planned</w:t>
+      </w:r>
+      <w:r>
+        <w:rPr>
+          <w:rFonts w:ascii="Calibri" w:hAnsi="Calibri" w:cs="Calibri"/>
+        </w:rPr>
+        <w:t>.</w:t>
+      </w:r>
+    </w:p>
+    <w:p>
+      <w:pPr>
+        <w:pStyle w:val="Normal"/>
+        <w:numPr>
+          <w:ilvl w:val="0"/>
+          <w:numId w:val="1"/>
+        </w:numPr>
+        <w:widowControl/>
+      </w:pPr>
+      <w:r>
+        <w:rPr>
+          <w:rFonts w:ascii="Calibri" w:hAnsi="Calibri" w:cs="Calibri"/>
+          <w:b/>
+          <w:bCs/>
+        </w:rPr>
+        <w:t>Depends on:</w:t>
+      </w:r>
+      <w:r>
+        <w:rPr>
+          <w:rFonts w:ascii="Calibri" w:hAnsi="Calibri" w:cs="Calibri"/>
+        </w:rPr>
+        <w:t xml:space="preserve"> P10C-05, P10C-06.</w:t>
+      </w:r>
+    </w:p>
+    <w:p>
+      <w:pPr>
+        <w:pStyle w:val="Normal"/>
+        <w:numPr>
+          <w:ilvl w:val="0"/>
+          <w:numId w:val="1"/>
+        </w:numPr>
+        <w:widowControl/>
+      </w:pPr>
+      <w:r>
+        <w:rPr>
+          <w:rFonts w:ascii="Calibri" w:hAnsi="Calibri" w:cs="Calibri"/>
+          <w:b/>
+          <w:bCs/>
+        </w:rPr>
+        <w:t>Done when:</w:t>
+      </w:r>
+      <w:r>
+        <w:rPr>
+          <w:rFonts w:ascii="Calibri" w:hAnsi="Calibri" w:cs="Calibri"/>
+        </w:rPr>
+        <w:t xml:space="preserve"> The stated outcome and required evidence are accepted.</w:t>
+      </w:r>
+    </w:p>
+    <w:p>
+      <w:pPr>
+        <w:pStyle w:val="Normal"/>
+        <w:numPr>
+          <w:ilvl w:val="0"/>
+          <w:numId w:val="1"/>
+        </w:numPr>
+        <w:widowControl/>
+      </w:pPr>
+      <w:r>
+        <w:rPr>
+          <w:rFonts w:ascii="Calibri" w:hAnsi="Calibri" w:cs="Calibri"/>
+          <w:b/>
+          <w:bCs/>
+        </w:rPr>
+        <w:t>Required evidence:</w:t>
+      </w:r>
+      <w:r>
+        <w:rPr>
+          <w:rFonts w:ascii="Calibri" w:hAnsi="Calibri" w:cs="Calibri"/>
+        </w:rPr>
+        <w:t xml:space="preserve"> Mixed edits, undo/redo, save/reload, stale protection.</w:t>
+      </w:r>
+    </w:p>
+    <w:p>
+      <w:pPr>
+        <w:pStyle w:val="Normal"/>
+        <w:numPr>
+          <w:ilvl w:val="0"/>
+          <w:numId w:val="1"/>
+        </w:numPr>
+        <w:widowControl/>
+      </w:pPr>
+      <w:r>
+        <w:rPr>
+          <w:rFonts w:ascii="Calibri" w:hAnsi="Calibri" w:cs="Calibri"/>
+          <w:b/>
+          <w:bCs/>
+        </w:rPr>
+        <w:t>Non-goal:</w:t>
+      </w:r>
+      <w:r>
+        <w:rPr>
+          <w:rFonts w:ascii="Calibri" w:hAnsi="Calibri" w:cs="Calibri"/>
+        </w:rPr>
+        <w:t xml:space="preserve"> A Puck-only or AI-only history.</w:t>
+      </w:r>
+    </w:p>
+    <w:p>
+      <w:pPr>
+        <w:pStyle w:val="Heading3"/>
+        <w:keepNext/>
+        <w:widowControl/>
+      </w:pPr>
+      <w:r>
+        <w:rPr>
+          <w:rFonts w:ascii="Calibri" w:hAnsi="Calibri" w:cs="Calibri"/>
+        </w:rPr>
+        <w:t>P10C-08 — Brand and asset editor with Studio shell</w:t>
+      </w:r>
+    </w:p>
+    <w:p>
+      <w:pPr>
+        <w:pStyle w:val="Normal"/>
+        <w:numPr>
+          <w:ilvl w:val="0"/>
+          <w:numId w:val="1"/>
+        </w:numPr>
+        <w:widowControl/>
+      </w:pPr>
+      <w:r>
+        <w:rPr>
+          <w:rFonts w:ascii="Calibri" w:hAnsi="Calibri" w:cs="Calibri"/>
+          <w:b/>
+          <w:bCs/>
+        </w:rPr>
+        <w:t>Outcome:</w:t>
+      </w:r>
+      <w:r>
+        <w:rPr>
+          <w:rFonts w:ascii="Calibri" w:hAnsi="Calibri" w:cs="Calibri"/>
+        </w:rPr>
+        <w:t xml:space="preserve"> Deliver the merchant shell subset required to operate assets, canvas, review, save, preview, and publish.</w:t>
+      </w:r>
+    </w:p>
+    <w:p>
+      <w:pPr>
+        <w:pStyle w:val="Normal"/>
+        <w:numPr>
+          <w:ilvl w:val="0"/>
+          <w:numId w:val="1"/>
+        </w:numPr>
+        <w:widowControl/>
+      </w:pPr>
+      <w:r>
+        <w:rPr>
+          <w:rFonts w:ascii="Calibri" w:hAnsi="Calibri" w:cs="Calibri"/>
+          <w:b/>
+          <w:bCs/>
+        </w:rPr>
+        <w:t>Status:</w:t>
+      </w:r>
+      <w:r>
+        <w:rPr>
+          <w:rFonts w:ascii="Calibri" w:hAnsi="Calibri" w:cs="Calibri"/>
+        </w:rPr>
+        <w:t xml:space="preserve"> </w:t>
+      </w:r>
+      <w:r>
+        <w:rPr>
+          <w:rFonts w:ascii="Calibri" w:hAnsi="Calibri" w:cs="Calibri"/>
+          <w:b/>
+          <w:bCs/>
+        </w:rPr>
+        <w:t>Planned</w:t>
+      </w:r>
+      <w:r>
+        <w:rPr>
+          <w:rFonts w:ascii="Calibri" w:hAnsi="Calibri" w:cs="Calibri"/>
+        </w:rPr>
+        <w:t>.</w:t>
+      </w:r>
+    </w:p>
+    <w:p>
+      <w:pPr>
+        <w:pStyle w:val="Normal"/>
+        <w:numPr>
+          <w:ilvl w:val="0"/>
+          <w:numId w:val="1"/>
+        </w:numPr>
+        <w:widowControl/>
+      </w:pPr>
+      <w:r>
+        <w:rPr>
+          <w:rFonts w:ascii="Calibri" w:hAnsi="Calibri" w:cs="Calibri"/>
+          <w:b/>
+          <w:bCs/>
+        </w:rPr>
+        <w:t>Depends on:</w:t>
+      </w:r>
+      <w:r>
+        <w:rPr>
+          <w:rFonts w:ascii="Calibri" w:hAnsi="Calibri" w:cs="Calibri"/>
+        </w:rPr>
+        <w:t xml:space="preserve"> P10C-01 through P10C-07.</w:t>
+      </w:r>
+    </w:p>
+    <w:p>
+      <w:pPr>
+        <w:pStyle w:val="Normal"/>
+        <w:numPr>
+          <w:ilvl w:val="0"/>
+          <w:numId w:val="1"/>
+        </w:numPr>
+        <w:widowControl/>
+      </w:pPr>
+      <w:r>
+        <w:rPr>
+          <w:rFonts w:ascii="Calibri" w:hAnsi="Calibri" w:cs="Calibri"/>
+          <w:b/>
+          <w:bCs/>
+        </w:rPr>
+        <w:t>Done when:</w:t>
+      </w:r>
+      <w:r>
+        <w:rPr>
+          <w:rFonts w:ascii="Calibri" w:hAnsi="Calibri" w:cs="Calibri"/>
+        </w:rPr>
+        <w:t xml:space="preserve"> The stated outcome and required evidence are accepted.</w:t>
+      </w:r>
+    </w:p>
+    <w:p>
+      <w:pPr>
+        <w:pStyle w:val="Normal"/>
+        <w:numPr>
+          <w:ilvl w:val="0"/>
+          <w:numId w:val="1"/>
+        </w:numPr>
+        <w:widowControl/>
+      </w:pPr>
+      <w:r>
+        <w:rPr>
+          <w:rFonts w:ascii="Calibri" w:hAnsi="Calibri" w:cs="Calibri"/>
+          <w:b/>
+          <w:bCs/>
+        </w:rPr>
+        <w:t>Required evidence:</w:t>
+      </w:r>
+      <w:r>
+        <w:rPr>
+          <w:rFonts w:ascii="Calibri" w:hAnsi="Calibri" w:cs="Calibri"/>
+        </w:rPr>
+        <w:t xml:space="preserve"> Default/loading/empty/error/stale/success/unsaved states, accessibility, responsive browser/E2E.</w:t>
+      </w:r>
+    </w:p>
+    <w:p>
+      <w:pPr>
+        <w:pStyle w:val="Normal"/>
+        <w:numPr>
+          <w:ilvl w:val="0"/>
+          <w:numId w:val="1"/>
+        </w:numPr>
+        <w:widowControl/>
+      </w:pPr>
+      <w:r>
+        <w:rPr>
+          <w:rFonts w:ascii="Calibri" w:hAnsi="Calibri" w:cs="Calibri"/>
+          <w:b/>
+          <w:bCs/>
+        </w:rPr>
+        <w:t>Non-goal:</w:t>
+      </w:r>
+      <w:r>
+        <w:rPr>
+          <w:rFonts w:ascii="Calibri" w:hAnsi="Calibri" w:cs="Calibri"/>
+        </w:rPr>
+        <w:t xml:space="preserve"> Full CMS or exposure of implementation internals.</w:t>
+      </w:r>
+    </w:p>
+    <w:p>
+      <w:pPr>
+        <w:pStyle w:val="Heading3"/>
+        <w:keepNext/>
+        <w:widowControl/>
+      </w:pPr>
+      <w:r>
+        <w:rPr>
+          <w:rFonts w:ascii="Calibri" w:hAnsi="Calibri" w:cs="Calibri"/>
+        </w:rPr>
         <w:t>P10C-09 — Studio commercial QA</w:t>
       </w:r>
     </w:p>
@@ -14964,7 +15028,7 @@
         </w:rPr>
         <w:t xml:space="preserve"> </w:t>
       </w:r>
-      <w:hyperlink r:id="rIdHyperlink14" w:history="1">
+      <w:hyperlink r:id="rIdHyperlink15" w:history="1">
         <w:r>
           <w:rPr>
             <w:rFonts w:ascii="Calibri" w:hAnsi="Calibri" w:cs="Calibri"/>
@@ -14980,7 +15044,7 @@
         </w:rPr>
         <w:t xml:space="preserve"> and </w:t>
       </w:r>
-      <w:hyperlink r:id="rIdHyperlink15" w:history="1">
+      <w:hyperlink r:id="rIdHyperlink16" w:history="1">
         <w:r>
           <w:rPr>
             <w:rFonts w:ascii="Calibri" w:hAnsi="Calibri" w:cs="Calibri"/>

</xml_diff>

<commit_message>
feat: add commercial collection search profiles
</commit_message>
<xml_diff>
--- a/docs/VESKIFY_DEVELOPMENT_DELIVERY_TRACKER_v1.3.0.docx
+++ b/docs/VESKIFY_DEVELOPMENT_DELIVERY_TRACKER_v1.3.0.docx
@@ -38,7 +38,7 @@
         <w:rPr>
           <w:rFonts w:ascii="Calibri" w:hAnsi="Calibri" w:cs="Calibri"/>
         </w:rPr>
-        <w:t>Delivery status baseline: 9 August 2026, P10B-06, P10B-07 and P10B-08</w:t>
+        <w:t>Delivery status baseline: 9 August 2026, P10B-10 commercial collection/search profiles</w:t>
       </w:r>
     </w:p>
     <w:p>
@@ -245,7 +245,7 @@
               <w:rPr>
                 <w:rFonts w:ascii="Calibri" w:hAnsi="Calibri" w:cs="Calibri"/>
               </w:rPr>
-              <w:t>9 August 2026, P10B-09 commercial homepage profiles</w:t>
+              <w:t>9 August 2026, P10B-10 commercial collection/search profiles</w:t>
             </w:r>
           </w:p>
         </w:tc>
@@ -2951,7 +2951,7 @@
               <w:rPr>
                 <w:rFonts w:ascii="Calibri" w:hAnsi="Calibri" w:cs="Calibri"/>
               </w:rPr>
-              <w:t>27 definitions/100 variants; structural, query, migration and rejection evidence</w:t>
+              <w:t>27 definitions/104 variants; structural, query, migration and rejection evidence</w:t>
             </w:r>
           </w:p>
         </w:tc>
@@ -3976,7 +3976,7 @@
               <w:rPr>
                 <w:rFonts w:ascii="Calibri" w:hAnsi="Calibri" w:cs="Calibri"/>
               </w:rPr>
-              <w:t>☐</w:t>
+              <w:t>☑</w:t>
             </w:r>
           </w:p>
         </w:tc>
@@ -4033,7 +4033,7 @@
                 <w:b/>
                 <w:bCs/>
               </w:rPr>
-              <w:t>Planned</w:t>
+              <w:t>Baseline</w:t>
             </w:r>
           </w:p>
         </w:tc>
@@ -4087,7 +4087,7 @@
               <w:rPr>
                 <w:rFonts w:ascii="Calibri" w:hAnsi="Calibri" w:cs="Calibri"/>
               </w:rPr>
-              <w:t>Four profiles, commerce/intents and visual review</w:t>
+              <w:t>Four profiles, exact commerce/intents, lifecycle and 16-view browser review</w:t>
             </w:r>
           </w:p>
         </w:tc>
@@ -9204,7 +9204,7 @@
         <w:rPr>
           <w:rFonts w:ascii="Calibri" w:hAnsi="Calibri" w:cs="Calibri"/>
         </w:rPr>
-        <w:t xml:space="preserve">. P10B-01 through P10B-09 are </w:t>
+        <w:t xml:space="preserve">. P10B-01 through P10B-10 are </w:t>
       </w:r>
       <w:r>
         <w:rPr>
@@ -9218,7 +9218,7 @@
         <w:rPr>
           <w:rFonts w:ascii="Calibri" w:hAnsi="Calibri" w:cs="Calibri"/>
         </w:rPr>
-        <w:t xml:space="preserve">. P10B-10 through P10B-18 remain </w:t>
+        <w:t xml:space="preserve">. P10B-11 through P10B-18 remain </w:t>
       </w:r>
       <w:r>
         <w:rPr>
@@ -11400,49 +11400,21 @@
     <w:p>
       <w:pPr>
         <w:pStyle w:val="Normal"/>
-        <w:numPr>
-          <w:ilvl w:val="0"/>
-          <w:numId w:val="1"/>
-        </w:numPr>
-        <w:widowControl/>
-      </w:pPr>
-      <w:r>
-        <w:rPr>
-          <w:rFonts w:ascii="Calibri" w:hAnsi="Calibri" w:cs="Calibri"/>
-          <w:b/>
-          <w:bCs/>
-        </w:rPr>
-        <w:t>Outcome:</w:t>
-      </w:r>
-      <w:r>
-        <w:rPr>
-          <w:rFonts w:ascii="Calibri" w:hAnsi="Calibri" w:cs="Calibri"/>
-        </w:rPr>
-        <w:t xml:space="preserve"> Deliver editorial discovery, catalogue comparison, campaign-led, and dense/search experiences.</w:t>
-      </w:r>
-    </w:p>
-    <w:p>
-      <w:pPr>
-        <w:pStyle w:val="Normal"/>
-        <w:numPr>
-          <w:ilvl w:val="0"/>
-          <w:numId w:val="1"/>
-        </w:numPr>
-        <w:widowControl/>
-      </w:pPr>
-      <w:r>
-        <w:rPr>
-          <w:rFonts w:ascii="Calibri" w:hAnsi="Calibri" w:cs="Calibri"/>
-          <w:b/>
-          <w:bCs/>
-        </w:rPr>
-        <w:t>Authority:</w:t>
-      </w:r>
-      <w:r>
-        <w:rPr>
-          <w:rFonts w:ascii="Calibri" w:hAnsi="Calibri" w:cs="Calibri"/>
-        </w:rPr>
-        <w:t xml:space="preserve"> Existing PageBlueprint profiles and </w:t>
+        <w:widowControl/>
+      </w:pPr>
+      <w:r>
+        <w:rPr>
+          <w:rFonts w:ascii="Calibri" w:hAnsi="Calibri" w:cs="Calibri"/>
+          <w:b/>
+          <w:bCs/>
+        </w:rPr>
+        <w:t>Status:</w:t>
+      </w:r>
+      <w:r>
+        <w:rPr>
+          <w:rFonts w:ascii="Calibri" w:hAnsi="Calibri" w:cs="Calibri"/>
+        </w:rPr>
+        <w:t xml:space="preserve"> Baseline. Four fingerprinted executable PageBlueprint profiles now select the existing P10B-06 shared frame, P10B-03 </w:t>
       </w:r>
       <w:r>
         <w:rPr>
@@ -11456,6 +11428,22 @@
         <w:rPr>
           <w:rFonts w:ascii="Calibri" w:hAnsi="Calibri" w:cs="Calibri"/>
         </w:rPr>
+        <w:t xml:space="preserve"> anatomy, P10B-08 canonical card anatomy, and P10B-04 approved media treatment. Exact canonical catalogue bindings preserve product membership/order, facts, product media, filters/sort state, and child-collection order. Campaign media is approved collection/editorial media, not a product-media replacement. A transient revision-checked zero-result context keeps the query without fabricating products. Deterministic lifecycle and 16-view Chromium evidence pass with zero provider calls. See </w:t>
+      </w:r>
+      <w:hyperlink r:id="rIdHyperlink14" w:history="1">
+        <w:r>
+          <w:rPr>
+            <w:rFonts w:ascii="Calibri" w:hAnsi="Calibri" w:cs="Calibri"/>
+            <w:color w:val="2E74B5"/>
+            <w:u w:val="single"/>
+          </w:rPr>
+          <w:t>P10B_10_COMMERCIAL_COLLECTION_SEARCH_PROFILES.md</w:t>
+        </w:r>
+      </w:hyperlink>
+      <w:r>
+        <w:rPr>
+          <w:rFonts w:ascii="Calibri" w:hAnsi="Calibri" w:cs="Calibri"/>
+        </w:rPr>
         <w:t>.</w:t>
       </w:r>
     </w:p>
@@ -11474,146 +11462,13 @@
           <w:b/>
           <w:bCs/>
         </w:rPr>
-        <w:t>Depends on:</w:t>
-      </w:r>
-      <w:r>
-        <w:rPr>
-          <w:rFonts w:ascii="Calibri" w:hAnsi="Calibri" w:cs="Calibri"/>
-        </w:rPr>
-        <w:t xml:space="preserve"> P10B-04 through P10B-06 and P10B-08.</w:t>
-      </w:r>
-    </w:p>
-    <w:p>
-      <w:pPr>
-        <w:pStyle w:val="Normal"/>
-        <w:numPr>
-          <w:ilvl w:val="0"/>
-          <w:numId w:val="1"/>
-        </w:numPr>
-        <w:widowControl/>
-      </w:pPr>
-      <w:r>
-        <w:rPr>
-          <w:rFonts w:ascii="Calibri" w:hAnsi="Calibri" w:cs="Calibri"/>
-          <w:b/>
-          <w:bCs/>
-        </w:rPr>
-        <w:t>Done when:</w:t>
-      </w:r>
-      <w:r>
-        <w:rPr>
-          <w:rFonts w:ascii="Calibri" w:hAnsi="Calibri" w:cs="Calibri"/>
-        </w:rPr>
-        <w:t xml:space="preserve"> At least four profiles preserve canonical collection membership/order, typed filter/sort intents, child collections, product cards, results/no-results, responsive behavior, snapshot, and published rendering.</w:t>
-      </w:r>
-    </w:p>
-    <w:p>
-      <w:pPr>
-        <w:pStyle w:val="Normal"/>
-        <w:numPr>
-          <w:ilvl w:val="0"/>
-          <w:numId w:val="1"/>
-        </w:numPr>
-        <w:widowControl/>
-      </w:pPr>
-      <w:r>
-        <w:rPr>
-          <w:rFonts w:ascii="Calibri" w:hAnsi="Calibri" w:cs="Calibri"/>
-          <w:b/>
-          <w:bCs/>
-        </w:rPr>
-        <w:t>Fail closed:</w:t>
-      </w:r>
-      <w:r>
-        <w:rPr>
-          <w:rFonts w:ascii="Calibri" w:hAnsi="Calibri" w:cs="Calibri"/>
-        </w:rPr>
-        <w:t xml:space="preserve"> Membership/order/price/media mutation, incompatible card/filter combinations, missing bindings, and finishing-only duplicate profiles are rejected.</w:t>
-      </w:r>
-    </w:p>
-    <w:p>
-      <w:pPr>
-        <w:pStyle w:val="Normal"/>
-        <w:numPr>
-          <w:ilvl w:val="0"/>
-          <w:numId w:val="1"/>
-        </w:numPr>
-        <w:widowControl/>
-      </w:pPr>
-      <w:r>
-        <w:rPr>
-          <w:rFonts w:ascii="Calibri" w:hAnsi="Calibri" w:cs="Calibri"/>
-          <w:b/>
-          <w:bCs/>
-        </w:rPr>
-        <w:t>Evidence:</w:t>
-      </w:r>
-      <w:r>
-        <w:rPr>
-          <w:rFonts w:ascii="Calibri" w:hAnsi="Calibri" w:cs="Calibri"/>
-        </w:rPr>
-        <w:t xml:space="preserve"> Materialization, commerce/intents, capability chain, responsive browser, and retained visual review.</w:t>
-      </w:r>
-    </w:p>
-    <w:p>
-      <w:pPr>
-        <w:pStyle w:val="Normal"/>
-        <w:numPr>
-          <w:ilvl w:val="0"/>
-          <w:numId w:val="1"/>
-        </w:numPr>
-        <w:widowControl/>
-      </w:pPr>
-      <w:r>
-        <w:rPr>
-          <w:rFonts w:ascii="Calibri" w:hAnsi="Calibri" w:cs="Calibri"/>
-          <w:b/>
-          <w:bCs/>
-        </w:rPr>
-        <w:t>Non-goal:</w:t>
-      </w:r>
-      <w:r>
-        <w:rPr>
-          <w:rFonts w:ascii="Calibri" w:hAnsi="Calibri" w:cs="Calibri"/>
-        </w:rPr>
-        <w:t xml:space="preserve"> A second collection/search engine.</w:t>
-      </w:r>
-    </w:p>
-    <w:p>
-      <w:pPr>
-        <w:pStyle w:val="Heading3"/>
-        <w:keepNext/>
-        <w:widowControl/>
-      </w:pPr>
-      <w:r>
-        <w:rPr>
-          <w:rFonts w:ascii="Calibri" w:hAnsi="Calibri" w:cs="Calibri"/>
-        </w:rPr>
-        <w:t>P10B-11 — Commercial PDP profile library</w:t>
-      </w:r>
-    </w:p>
-    <w:p>
-      <w:pPr>
-        <w:pStyle w:val="Normal"/>
-        <w:numPr>
-          <w:ilvl w:val="0"/>
-          <w:numId w:val="1"/>
-        </w:numPr>
-        <w:widowControl/>
-      </w:pPr>
-      <w:r>
-        <w:rPr>
-          <w:rFonts w:ascii="Calibri" w:hAnsi="Calibri" w:cs="Calibri"/>
-          <w:b/>
-          <w:bCs/>
-        </w:rPr>
         <w:t>Outcome:</w:t>
       </w:r>
       <w:r>
         <w:rPr>
           <w:rFonts w:ascii="Calibri" w:hAnsi="Calibri" w:cs="Calibri"/>
         </w:rPr>
-        <w:t xml:space="preserve"> Deliver distinct standard, high-consideration, gallery-led, and variant-led purchase experiences.</w:t>
+        <w:t xml:space="preserve"> Deliver editorial discovery, catalogue comparison, campaign-led, and dense/search experiences.</w:t>
       </w:r>
     </w:p>
     <w:p>
@@ -11637,7 +11492,7 @@
         <w:rPr>
           <w:rFonts w:ascii="Calibri" w:hAnsi="Calibri" w:cs="Calibri"/>
         </w:rPr>
-        <w:t xml:space="preserve"> Existing PageBlueprint profiles, </w:t>
+        <w:t xml:space="preserve"> Existing PageBlueprint profiles and </w:t>
       </w:r>
       <w:r>
         <w:rPr>
@@ -11645,13 +11500,13 @@
           <w:sz w:val="19"/>
           <w:szCs w:val="19"/>
         </w:rPr>
-        <w:t>dynamicProductDetail</w:t>
-      </w:r>
-      <w:r>
-        <w:rPr>
-          <w:rFonts w:ascii="Calibri" w:hAnsi="Calibri" w:cs="Calibri"/>
-        </w:rPr>
-        <w:t>, and P6 generic option resolution.</w:t>
+        <w:t>dynamicCollectionCommerce</w:t>
+      </w:r>
+      <w:r>
+        <w:rPr>
+          <w:rFonts w:ascii="Calibri" w:hAnsi="Calibri" w:cs="Calibri"/>
+        </w:rPr>
+        <w:t>.</w:t>
       </w:r>
     </w:p>
     <w:p>
@@ -11675,7 +11530,7 @@
         <w:rPr>
           <w:rFonts w:ascii="Calibri" w:hAnsi="Calibri" w:cs="Calibri"/>
         </w:rPr>
-        <w:t xml:space="preserve"> P10B-03 through P10B-06 and P10B-08.</w:t>
+        <w:t xml:space="preserve"> P10B-04 through P10B-06 and P10B-08.</w:t>
       </w:r>
     </w:p>
     <w:p>
@@ -11699,7 +11554,7 @@
         <w:rPr>
           <w:rFonts w:ascii="Calibri" w:hAnsi="Calibri" w:cs="Calibri"/>
         </w:rPr>
-        <w:t xml:space="preserve"> At least four profiles preserve all simple/configurable option groups, dependencies, incomplete/unavailable states, resolved price/availability/media, related products, responsive modes, snapshot, and published rendering.</w:t>
+        <w:t xml:space="preserve"> At least four profiles preserve canonical collection membership/order, typed filter/sort intents, child collections, product cards, results/no-results, responsive behavior, snapshot, and published rendering.</w:t>
       </w:r>
     </w:p>
     <w:p>
@@ -11723,7 +11578,7 @@
         <w:rPr>
           <w:rFonts w:ascii="Calibri" w:hAnsi="Calibri" w:cs="Calibri"/>
         </w:rPr>
-        <w:t xml:space="preserve"> Product-type forks, dropped options, missing bindings, shallow duplicates, and protected commerce/media mutation are rejected.</w:t>
+        <w:t xml:space="preserve"> Membership/order/price/media mutation, incompatible card/filter combinations, missing bindings, and finishing-only duplicate profiles are rejected.</w:t>
       </w:r>
     </w:p>
     <w:p>
@@ -11747,7 +11602,7 @@
         <w:rPr>
           <w:rFonts w:ascii="Calibri" w:hAnsi="Calibri" w:cs="Calibri"/>
         </w:rPr>
-        <w:t xml:space="preserve"> Dynamic PDP/option/media/commerce regression, capability chain, four-width browser, and retained visual review.</w:t>
+        <w:t xml:space="preserve"> Materialization, commerce/intents, capability chain, responsive browser, and retained visual review.</w:t>
       </w:r>
     </w:p>
     <w:p>
@@ -11771,7 +11626,7 @@
         <w:rPr>
           <w:rFonts w:ascii="Calibri" w:hAnsi="Calibri" w:cs="Calibri"/>
         </w:rPr>
-        <w:t xml:space="preserve"> Product-specific component architecture.</w:t>
+        <w:t xml:space="preserve"> A second collection/search engine.</w:t>
       </w:r>
     </w:p>
     <w:p>
@@ -11784,7 +11639,7 @@
         <w:rPr>
           <w:rFonts w:ascii="Calibri" w:hAnsi="Calibri" w:cs="Calibri"/>
         </w:rPr>
-        <w:t>P10B-12 — Content and support page families</w:t>
+        <w:t>P10B-11 — Commercial PDP profile library</w:t>
       </w:r>
     </w:p>
     <w:p>
@@ -11808,7 +11663,7 @@
         <w:rPr>
           <w:rFonts w:ascii="Calibri" w:hAnsi="Calibri" w:cs="Calibri"/>
         </w:rPr>
-        <w:t xml:space="preserve"> Generate About/brand story, Contact/locations, FAQ, shipping/returns, policy, campaign/editorial, and reusable generic content pages.</w:t>
+        <w:t xml:space="preserve"> Deliver distinct standard, high-consideration, gallery-led, and variant-led purchase experiences.</w:t>
       </w:r>
     </w:p>
     <w:p>
@@ -11832,550 +11687,7 @@
         <w:rPr>
           <w:rFonts w:ascii="Calibri" w:hAnsi="Calibri" w:cs="Calibri"/>
         </w:rPr>
-        <w:t xml:space="preserve"> Existing PageBlueprint, content/evidence, localization, navigation, and snapshot contracts.</w:t>
-      </w:r>
-    </w:p>
-    <w:p>
-      <w:pPr>
-        <w:pStyle w:val="Normal"/>
-        <w:numPr>
-          <w:ilvl w:val="0"/>
-          <w:numId w:val="1"/>
-        </w:numPr>
-        <w:widowControl/>
-      </w:pPr>
-      <w:r>
-        <w:rPr>
-          <w:rFonts w:ascii="Calibri" w:hAnsi="Calibri" w:cs="Calibri"/>
-          <w:b/>
-          <w:bCs/>
-        </w:rPr>
-        <w:t>Depends on:</w:t>
-      </w:r>
-      <w:r>
-        <w:rPr>
-          <w:rFonts w:ascii="Calibri" w:hAnsi="Calibri" w:cs="Calibri"/>
-        </w:rPr>
-        <w:t xml:space="preserve"> P10B-03 through P10B-07.</w:t>
-      </w:r>
-    </w:p>
-    <w:p>
-      <w:pPr>
-        <w:pStyle w:val="Normal"/>
-        <w:numPr>
-          <w:ilvl w:val="0"/>
-          <w:numId w:val="1"/>
-        </w:numPr>
-        <w:widowControl/>
-      </w:pPr>
-      <w:r>
-        <w:rPr>
-          <w:rFonts w:ascii="Calibri" w:hAnsi="Calibri" w:cs="Calibri"/>
-          <w:b/>
-          <w:bCs/>
-        </w:rPr>
-        <w:t>Done when:</w:t>
-      </w:r>
-      <w:r>
-        <w:rPr>
-          <w:rFonts w:ascii="Calibri" w:hAnsi="Calibri" w:cs="Calibri"/>
-        </w:rPr>
-        <w:t xml:space="preserve"> Every named family has registered profiles and approved-fact provenance, localization, navigation reachability, omission/fallback, responsive output, snapshot preservation, and publication; major types have multiple compositions where commercially useful.</w:t>
-      </w:r>
-    </w:p>
-    <w:p>
-      <w:pPr>
-        <w:pStyle w:val="Normal"/>
-        <w:numPr>
-          <w:ilvl w:val="0"/>
-          <w:numId w:val="1"/>
-        </w:numPr>
-        <w:widowControl/>
-      </w:pPr>
-      <w:r>
-        <w:rPr>
-          <w:rFonts w:ascii="Calibri" w:hAnsi="Calibri" w:cs="Calibri"/>
-          <w:b/>
-          <w:bCs/>
-        </w:rPr>
-        <w:t>Fail closed:</w:t>
-      </w:r>
-      <w:r>
-        <w:rPr>
-          <w:rFonts w:ascii="Calibri" w:hAnsi="Calibri" w:cs="Calibri"/>
-        </w:rPr>
-        <w:t xml:space="preserve"> Fabricated locations, policies, certifications, guarantees, delivery, compliance, and service claims are rejected or omitted through registered rules.</w:t>
-      </w:r>
-    </w:p>
-    <w:p>
-      <w:pPr>
-        <w:pStyle w:val="Normal"/>
-        <w:numPr>
-          <w:ilvl w:val="0"/>
-          <w:numId w:val="1"/>
-        </w:numPr>
-        <w:widowControl/>
-      </w:pPr>
-      <w:r>
-        <w:rPr>
-          <w:rFonts w:ascii="Calibri" w:hAnsi="Calibri" w:cs="Calibri"/>
-          <w:b/>
-          <w:bCs/>
-        </w:rPr>
-        <w:t>Evidence:</w:t>
-      </w:r>
-      <w:r>
-        <w:rPr>
-          <w:rFonts w:ascii="Calibri" w:hAnsi="Calibri" w:cs="Calibri"/>
-        </w:rPr>
-        <w:t xml:space="preserve"> Contract/profile, evidence/provenance, generation/lifecycle, localization, responsive/a11y, and retained visual evidence.</w:t>
-      </w:r>
-    </w:p>
-    <w:p>
-      <w:pPr>
-        <w:pStyle w:val="Normal"/>
-        <w:numPr>
-          <w:ilvl w:val="0"/>
-          <w:numId w:val="1"/>
-        </w:numPr>
-        <w:widowControl/>
-      </w:pPr>
-      <w:r>
-        <w:rPr>
-          <w:rFonts w:ascii="Calibri" w:hAnsi="Calibri" w:cs="Calibri"/>
-          <w:b/>
-          <w:bCs/>
-        </w:rPr>
-        <w:t>Non-goal:</w:t>
-      </w:r>
-      <w:r>
-        <w:rPr>
-          <w:rFonts w:ascii="Calibri" w:hAnsi="Calibri" w:cs="Calibri"/>
-        </w:rPr>
-        <w:t xml:space="preserve"> Unrestricted CMS or legal-content generation.</w:t>
-      </w:r>
-    </w:p>
-    <w:p>
-      <w:pPr>
-        <w:pStyle w:val="Heading3"/>
-        <w:keepNext/>
-        <w:widowControl/>
-      </w:pPr>
-      <w:r>
-        <w:rPr>
-          <w:rFonts w:ascii="Calibri" w:hAnsi="Calibri" w:cs="Calibri"/>
-        </w:rPr>
-        <w:t>P10B-13 — Commerce utility presentation pages</w:t>
-      </w:r>
-    </w:p>
-    <w:p>
-      <w:pPr>
-        <w:pStyle w:val="Normal"/>
-        <w:numPr>
-          <w:ilvl w:val="0"/>
-          <w:numId w:val="1"/>
-        </w:numPr>
-        <w:widowControl/>
-      </w:pPr>
-      <w:r>
-        <w:rPr>
-          <w:rFonts w:ascii="Calibri" w:hAnsi="Calibri" w:cs="Calibri"/>
-          <w:b/>
-          <w:bCs/>
-        </w:rPr>
-        <w:t>Outcome:</w:t>
-      </w:r>
-      <w:r>
-        <w:rPr>
-          <w:rFonts w:ascii="Calibri" w:hAnsi="Calibri" w:cs="Calibri"/>
-        </w:rPr>
-        <w:t xml:space="preserve"> Deliver governed search/no-results, cart, checkout, empty, error, and 404 presentation.</w:t>
-      </w:r>
-    </w:p>
-    <w:p>
-      <w:pPr>
-        <w:pStyle w:val="Normal"/>
-        <w:numPr>
-          <w:ilvl w:val="0"/>
-          <w:numId w:val="1"/>
-        </w:numPr>
-        <w:widowControl/>
-      </w:pPr>
-      <w:r>
-        <w:rPr>
-          <w:rFonts w:ascii="Calibri" w:hAnsi="Calibri" w:cs="Calibri"/>
-          <w:b/>
-          <w:bCs/>
-        </w:rPr>
-        <w:t>Authority:</w:t>
-      </w:r>
-      <w:r>
-        <w:rPr>
-          <w:rFonts w:ascii="Calibri" w:hAnsi="Calibri" w:cs="Calibri"/>
-        </w:rPr>
-        <w:t xml:space="preserve"> Existing page/profile, shared frame, canonical commerce projection, and operational adapter seams.</w:t>
-      </w:r>
-    </w:p>
-    <w:p>
-      <w:pPr>
-        <w:pStyle w:val="Normal"/>
-        <w:numPr>
-          <w:ilvl w:val="0"/>
-          <w:numId w:val="1"/>
-        </w:numPr>
-        <w:widowControl/>
-      </w:pPr>
-      <w:r>
-        <w:rPr>
-          <w:rFonts w:ascii="Calibri" w:hAnsi="Calibri" w:cs="Calibri"/>
-          <w:b/>
-          <w:bCs/>
-        </w:rPr>
-        <w:t>Depends on:</w:t>
-      </w:r>
-      <w:r>
-        <w:rPr>
-          <w:rFonts w:ascii="Calibri" w:hAnsi="Calibri" w:cs="Calibri"/>
-        </w:rPr>
-        <w:t xml:space="preserve"> P10B-03, P10B-05, P10B-06, P10B-08.</w:t>
-      </w:r>
-    </w:p>
-    <w:p>
-      <w:pPr>
-        <w:pStyle w:val="Normal"/>
-        <w:numPr>
-          <w:ilvl w:val="0"/>
-          <w:numId w:val="1"/>
-        </w:numPr>
-        <w:widowControl/>
-      </w:pPr>
-      <w:r>
-        <w:rPr>
-          <w:rFonts w:ascii="Calibri" w:hAnsi="Calibri" w:cs="Calibri"/>
-          <w:b/>
-          <w:bCs/>
-        </w:rPr>
-        <w:t>Done when:</w:t>
-      </w:r>
-      <w:r>
-        <w:rPr>
-          <w:rFonts w:ascii="Calibri" w:hAnsi="Calibri" w:cs="Calibri"/>
-        </w:rPr>
-        <w:t xml:space="preserve"> Every state presents canonical facts/actions with coherent Design DNA/frame, useful empty/error behavior, complete page-set reachability, responsive accessibility, snapshot, and publication preservation.</w:t>
-      </w:r>
-    </w:p>
-    <w:p>
-      <w:pPr>
-        <w:pStyle w:val="Normal"/>
-        <w:numPr>
-          <w:ilvl w:val="0"/>
-          <w:numId w:val="1"/>
-        </w:numPr>
-        <w:widowControl/>
-      </w:pPr>
-      <w:r>
-        <w:rPr>
-          <w:rFonts w:ascii="Calibri" w:hAnsi="Calibri" w:cs="Calibri"/>
-          <w:b/>
-          <w:bCs/>
-        </w:rPr>
-        <w:t>Fail closed:</w:t>
-      </w:r>
-      <w:r>
-        <w:rPr>
-          <w:rFonts w:ascii="Calibri" w:hAnsi="Calibri" w:cs="Calibri"/>
-        </w:rPr>
-        <w:t xml:space="preserve"> Local commerce operations/writes, invented totals or availability, unsupported actions, and executable payment/checkout behavior outside Vesko adapters are rejected.</w:t>
-      </w:r>
-    </w:p>
-    <w:p>
-      <w:pPr>
-        <w:pStyle w:val="Normal"/>
-        <w:numPr>
-          <w:ilvl w:val="0"/>
-          <w:numId w:val="1"/>
-        </w:numPr>
-        <w:widowControl/>
-      </w:pPr>
-      <w:r>
-        <w:rPr>
-          <w:rFonts w:ascii="Calibri" w:hAnsi="Calibri" w:cs="Calibri"/>
-          <w:b/>
-          <w:bCs/>
-        </w:rPr>
-        <w:t>Evidence:</w:t>
-      </w:r>
-      <w:r>
-        <w:rPr>
-          <w:rFonts w:ascii="Calibri" w:hAnsi="Calibri" w:cs="Calibri"/>
-        </w:rPr>
-        <w:t xml:space="preserve"> Contract/integration, adapter-boundary, state matrix, responsive/a11y browser, and retained visual evidence.</w:t>
-      </w:r>
-    </w:p>
-    <w:p>
-      <w:pPr>
-        <w:pStyle w:val="Normal"/>
-        <w:numPr>
-          <w:ilvl w:val="0"/>
-          <w:numId w:val="1"/>
-        </w:numPr>
-        <w:widowControl/>
-      </w:pPr>
-      <w:r>
-        <w:rPr>
-          <w:rFonts w:ascii="Calibri" w:hAnsi="Calibri" w:cs="Calibri"/>
-          <w:b/>
-          <w:bCs/>
-        </w:rPr>
-        <w:t>Non-goal:</w:t>
-      </w:r>
-      <w:r>
-        <w:rPr>
-          <w:rFonts w:ascii="Calibri" w:hAnsi="Calibri" w:cs="Calibri"/>
-        </w:rPr>
-        <w:t xml:space="preserve"> Owning cart, checkout, payment, order, tax, shipping, or returns operations.</w:t>
-      </w:r>
-    </w:p>
-    <w:p>
-      <w:pPr>
-        <w:pStyle w:val="Heading3"/>
-        <w:keepNext/>
-        <w:widowControl/>
-      </w:pPr>
-      <w:r>
-        <w:rPr>
-          <w:rFonts w:ascii="Calibri" w:hAnsi="Calibri" w:cs="Calibri"/>
-        </w:rPr>
-        <w:t>P10B-14 — Premium Editorial complete-storefront vertical slice</w:t>
-      </w:r>
-    </w:p>
-    <w:p>
-      <w:pPr>
-        <w:pStyle w:val="Normal"/>
-        <w:numPr>
-          <w:ilvl w:val="0"/>
-          <w:numId w:val="1"/>
-        </w:numPr>
-        <w:widowControl/>
-      </w:pPr>
-      <w:r>
-        <w:rPr>
-          <w:rFonts w:ascii="Calibri" w:hAnsi="Calibri" w:cs="Calibri"/>
-          <w:b/>
-          <w:bCs/>
-        </w:rPr>
-        <w:t>Outcome:</w:t>
-      </w:r>
-      <w:r>
-        <w:rPr>
-          <w:rFonts w:ascii="Calibri" w:hAnsi="Calibri" w:cs="Calibri"/>
-        </w:rPr>
-        <w:t xml:space="preserve"> Prove one commercially credible complete multi-page storefront early.</w:t>
-      </w:r>
-    </w:p>
-    <w:p>
-      <w:pPr>
-        <w:pStyle w:val="Normal"/>
-        <w:numPr>
-          <w:ilvl w:val="0"/>
-          <w:numId w:val="1"/>
-        </w:numPr>
-        <w:widowControl/>
-      </w:pPr>
-      <w:r>
-        <w:rPr>
-          <w:rFonts w:ascii="Calibri" w:hAnsi="Calibri" w:cs="Calibri"/>
-          <w:b/>
-          <w:bCs/>
-        </w:rPr>
-        <w:t>Authority:</w:t>
-      </w:r>
-      <w:r>
-        <w:rPr>
-          <w:rFonts w:ascii="Calibri" w:hAnsi="Calibri" w:cs="Calibri"/>
-        </w:rPr>
-        <w:t xml:space="preserve"> Existing canonical generation/proposal/snapshot/preview/publication chain using the implemented P10B authorities.</w:t>
-      </w:r>
-    </w:p>
-    <w:p>
-      <w:pPr>
-        <w:pStyle w:val="Normal"/>
-        <w:numPr>
-          <w:ilvl w:val="0"/>
-          <w:numId w:val="1"/>
-        </w:numPr>
-        <w:widowControl/>
-      </w:pPr>
-      <w:r>
-        <w:rPr>
-          <w:rFonts w:ascii="Calibri" w:hAnsi="Calibri" w:cs="Calibri"/>
-          <w:b/>
-          <w:bCs/>
-        </w:rPr>
-        <w:t>Depends on:</w:t>
-      </w:r>
-      <w:r>
-        <w:rPr>
-          <w:rFonts w:ascii="Calibri" w:hAnsi="Calibri" w:cs="Calibri"/>
-        </w:rPr>
-        <w:t xml:space="preserve"> Minimum accepted P10B-02 through P10B-13 capability.</w:t>
-      </w:r>
-    </w:p>
-    <w:p>
-      <w:pPr>
-        <w:pStyle w:val="Normal"/>
-        <w:numPr>
-          <w:ilvl w:val="0"/>
-          <w:numId w:val="1"/>
-        </w:numPr>
-        <w:widowControl/>
-      </w:pPr>
-      <w:r>
-        <w:rPr>
-          <w:rFonts w:ascii="Calibri" w:hAnsi="Calibri" w:cs="Calibri"/>
-          <w:b/>
-          <w:bCs/>
-        </w:rPr>
-        <w:t>Done when:</w:t>
-      </w:r>
-      <w:r>
-        <w:rPr>
-          <w:rFonts w:ascii="Calibri" w:hAnsi="Calibri" w:cs="Calibri"/>
-        </w:rPr>
-        <w:t xml:space="preserve"> One approved brief with realistic commerce and credible assets generates shared frame, home, collection, simple/configurable PDP, About, Contact/locations, FAQ/service, and required utility/error states; navigation, EN/FI where supported, four widths, protected state, preview/publish, and retained human review pass.</w:t>
-      </w:r>
-    </w:p>
-    <w:p>
-      <w:pPr>
-        <w:pStyle w:val="Normal"/>
-        <w:numPr>
-          <w:ilvl w:val="0"/>
-          <w:numId w:val="1"/>
-        </w:numPr>
-        <w:widowControl/>
-      </w:pPr>
-      <w:r>
-        <w:rPr>
-          <w:rFonts w:ascii="Calibri" w:hAnsi="Calibri" w:cs="Calibri"/>
-          <w:b/>
-          <w:bCs/>
-        </w:rPr>
-        <w:t>Fail closed:</w:t>
-      </w:r>
-      <w:r>
-        <w:rPr>
-          <w:rFonts w:ascii="Calibri" w:hAnsi="Calibri" w:cs="Calibri"/>
-        </w:rPr>
-        <w:t xml:space="preserve"> Missing/disconnected/generic required pages, manual reconstruction, stale authority, or schema-only visual evidence fails the slice.</w:t>
-      </w:r>
-    </w:p>
-    <w:p>
-      <w:pPr>
-        <w:pStyle w:val="Normal"/>
-        <w:numPr>
-          <w:ilvl w:val="0"/>
-          <w:numId w:val="1"/>
-        </w:numPr>
-        <w:widowControl/>
-      </w:pPr>
-      <w:r>
-        <w:rPr>
-          <w:rFonts w:ascii="Calibri" w:hAnsi="Calibri" w:cs="Calibri"/>
-          <w:b/>
-          <w:bCs/>
-        </w:rPr>
-        <w:t>Evidence:</w:t>
-      </w:r>
-      <w:r>
-        <w:rPr>
-          <w:rFonts w:ascii="Calibri" w:hAnsi="Calibri" w:cs="Calibri"/>
-        </w:rPr>
-        <w:t xml:space="preserve"> Complete capability chain, correlated browser/screenshots, protected parity, and signed human commercial review.</w:t>
-      </w:r>
-    </w:p>
-    <w:p>
-      <w:pPr>
-        <w:pStyle w:val="Normal"/>
-        <w:numPr>
-          <w:ilvl w:val="0"/>
-          <w:numId w:val="1"/>
-        </w:numPr>
-        <w:widowControl/>
-      </w:pPr>
-      <w:r>
-        <w:rPr>
-          <w:rFonts w:ascii="Calibri" w:hAnsi="Calibri" w:cs="Calibri"/>
-          <w:b/>
-          <w:bCs/>
-        </w:rPr>
-        <w:t>Non-goal:</w:t>
-      </w:r>
-      <w:r>
-        <w:rPr>
-          <w:rFonts w:ascii="Calibri" w:hAnsi="Calibri" w:cs="Calibri"/>
-        </w:rPr>
-        <w:t xml:space="preserve"> P10B closure or broad direction/diversity proof.</w:t>
-      </w:r>
-    </w:p>
-    <w:p>
-      <w:pPr>
-        <w:pStyle w:val="Heading3"/>
-        <w:keepNext/>
-        <w:widowControl/>
-      </w:pPr>
-      <w:r>
-        <w:rPr>
-          <w:rFonts w:ascii="Calibri" w:hAnsi="Calibri" w:cs="Calibri"/>
-        </w:rPr>
-        <w:t>P10B-15 — Bounded storefront synthesis and narrative engine</w:t>
-      </w:r>
-    </w:p>
-    <w:p>
-      <w:pPr>
-        <w:pStyle w:val="Normal"/>
-        <w:numPr>
-          <w:ilvl w:val="0"/>
-          <w:numId w:val="1"/>
-        </w:numPr>
-        <w:widowControl/>
-      </w:pPr>
-      <w:r>
-        <w:rPr>
-          <w:rFonts w:ascii="Calibri" w:hAnsi="Calibri" w:cs="Calibri"/>
-          <w:b/>
-          <w:bCs/>
-        </w:rPr>
-        <w:t>Outcome:</w:t>
-      </w:r>
-      <w:r>
-        <w:rPr>
-          <w:rFonts w:ascii="Calibri" w:hAnsi="Calibri" w:cs="Calibri"/>
-        </w:rPr>
-        <w:t xml:space="preserve"> Generate complete coherent storefronts from compatible Design DNA, page set, profiles, families/variants, parameters, assets, and narrative roles.</w:t>
-      </w:r>
-    </w:p>
-    <w:p>
-      <w:pPr>
-        <w:pStyle w:val="Normal"/>
-        <w:numPr>
-          <w:ilvl w:val="0"/>
-          <w:numId w:val="1"/>
-        </w:numPr>
-        <w:widowControl/>
-      </w:pPr>
-      <w:r>
-        <w:rPr>
-          <w:rFonts w:ascii="Calibri" w:hAnsi="Calibri" w:cs="Calibri"/>
-          <w:b/>
-          <w:bCs/>
-        </w:rPr>
-        <w:t>Authority:</w:t>
-      </w:r>
-      <w:r>
-        <w:rPr>
-          <w:rFonts w:ascii="Calibri" w:hAnsi="Calibri" w:cs="Calibri"/>
-        </w:rPr>
-        <w:t xml:space="preserve"> Existing governed planning/proposal compiler plus the registered P10B authorities; output remains one </w:t>
+        <w:t xml:space="preserve"> Existing PageBlueprint profiles, </w:t>
       </w:r>
       <w:r>
         <w:rPr>
@@ -12383,13 +11695,13 @@
           <w:sz w:val="19"/>
           <w:szCs w:val="19"/>
         </w:rPr>
-        <w:t>StorefrontSnapshot</w:t>
-      </w:r>
-      <w:r>
-        <w:rPr>
-          <w:rFonts w:ascii="Calibri" w:hAnsi="Calibri" w:cs="Calibri"/>
-        </w:rPr>
-        <w:t>.</w:t>
+        <w:t>dynamicProductDetail</w:t>
+      </w:r>
+      <w:r>
+        <w:rPr>
+          <w:rFonts w:ascii="Calibri" w:hAnsi="Calibri" w:cs="Calibri"/>
+        </w:rPr>
+        <w:t>, and P6 generic option resolution.</w:t>
       </w:r>
     </w:p>
     <w:p>
@@ -12413,7 +11725,7 @@
         <w:rPr>
           <w:rFonts w:ascii="Calibri" w:hAnsi="Calibri" w:cs="Calibri"/>
         </w:rPr>
-        <w:t xml:space="preserve"> P10B-14 and sufficient real family/profile capability.</w:t>
+        <w:t xml:space="preserve"> P10B-03 through P10B-06 and P10B-08.</w:t>
       </w:r>
     </w:p>
     <w:p>
@@ -12437,7 +11749,7 @@
         <w:rPr>
           <w:rFonts w:ascii="Calibri" w:hAnsi="Calibri" w:cs="Calibri"/>
         </w:rPr>
-        <w:t xml:space="preserve"> Deterministic selection preserves cross-page identity, narrative adjacency/ cardinality, repetition limits, bindings/assets, and complete snapshot/lifecycle output for representative inputs.</w:t>
+        <w:t xml:space="preserve"> At least four profiles preserve all simple/configurable option groups, dependencies, incomplete/unavailable states, resolved price/availability/media, related products, responsive modes, snapshot, and published rendering.</w:t>
       </w:r>
     </w:p>
     <w:p>
@@ -12461,7 +11773,7 @@
         <w:rPr>
           <w:rFonts w:ascii="Calibri" w:hAnsi="Calibri" w:cs="Calibri"/>
         </w:rPr>
-        <w:t xml:space="preserve"> Missing, stale, ambiguous, incompatible, unregistered, repetitive, or protected-state-divergent combinations produce no partial proposal/snapshot.</w:t>
+        <w:t xml:space="preserve"> Product-type forks, dropped options, missing bindings, shallow duplicates, and protected commerce/media mutation are rejected.</w:t>
       </w:r>
     </w:p>
     <w:p>
@@ -12485,7 +11797,7 @@
         <w:rPr>
           <w:rFonts w:ascii="Calibri" w:hAnsi="Calibri" w:cs="Calibri"/>
         </w:rPr>
-        <w:t xml:space="preserve"> Selection/compatibility/unit, proposal/compiler/lifecycle integration, no-partial- write, deterministic fingerprint inputs, and complete-store browser evidence.</w:t>
+        <w:t xml:space="preserve"> Dynamic PDP/option/media/commerce regression, capability chain, four-width browser, and retained visual review.</w:t>
       </w:r>
     </w:p>
     <w:p>
@@ -12509,7 +11821,7 @@
         <w:rPr>
           <w:rFonts w:ascii="Calibri" w:hAnsi="Calibri" w:cs="Calibri"/>
         </w:rPr>
-        <w:t xml:space="preserve"> Arbitrary trees/styles or a second synthesis representation.</w:t>
+        <w:t xml:space="preserve"> Product-specific component architecture.</w:t>
       </w:r>
     </w:p>
     <w:p>
@@ -12522,7 +11834,7 @@
         <w:rPr>
           <w:rFonts w:ascii="Calibri" w:hAnsi="Calibri" w:cs="Calibri"/>
         </w:rPr>
-        <w:t>P10B-16 — Coordinated directions and diversity control</w:t>
+        <w:t>P10B-12 — Content and support page families</w:t>
       </w:r>
     </w:p>
     <w:p>
@@ -12546,7 +11858,7 @@
         <w:rPr>
           <w:rFonts w:ascii="Calibri" w:hAnsi="Calibri" w:cs="Calibri"/>
         </w:rPr>
-        <w:t xml:space="preserve"> Make Premium Editorial, Modern Technical, and Minimal Commerce coordinated constraint packages and prevent duplicates/near duplicates.</w:t>
+        <w:t xml:space="preserve"> Generate About/brand story, Contact/locations, FAQ, shipping/returns, policy, campaign/editorial, and reusable generic content pages.</w:t>
       </w:r>
     </w:p>
     <w:p>
@@ -12570,7 +11882,7 @@
         <w:rPr>
           <w:rFonts w:ascii="Calibri" w:hAnsi="Calibri" w:cs="Calibri"/>
         </w:rPr>
-        <w:t xml:space="preserve"> Existing direction-selection authority plus deterministic storefront-design fingerprint/evaluation.</w:t>
+        <w:t xml:space="preserve"> Existing PageBlueprint, content/evidence, localization, navigation, and snapshot contracts.</w:t>
       </w:r>
     </w:p>
     <w:p>
@@ -12594,7 +11906,7 @@
         <w:rPr>
           <w:rFonts w:ascii="Calibri" w:hAnsi="Calibri" w:cs="Calibri"/>
         </w:rPr>
-        <w:t xml:space="preserve"> P10B-15.</w:t>
+        <w:t xml:space="preserve"> P10B-03 through P10B-07.</w:t>
       </w:r>
     </w:p>
     <w:p>
@@ -12618,7 +11930,7 @@
         <w:rPr>
           <w:rFonts w:ascii="Calibri" w:hAnsi="Calibri" w:cs="Calibri"/>
         </w:rPr>
-        <w:t xml:space="preserve"> Fingerprints cover Design DNA, page set/profiles, frame, anatomies/variants, structural parameters, image posture, density/responsive posture, and narrative composition; exact and meaningful near duplicates fail, and pairwise stores differ materially beyond colour.</w:t>
+        <w:t xml:space="preserve"> Every named family has registered profiles and approved-fact provenance, localization, navigation reachability, omission/fallback, responsive output, snapshot preservation, and publication; major types have multiple compositions where commercially useful.</w:t>
       </w:r>
     </w:p>
     <w:p>
@@ -12642,7 +11954,7 @@
         <w:rPr>
           <w:rFonts w:ascii="Calibri" w:hAnsi="Calibri" w:cs="Calibri"/>
         </w:rPr>
-        <w:t xml:space="preserve"> Fixed-template/token/page direction authority, incompatible references, colour-only differences, and fingerprints that omit material structure are rejected.</w:t>
+        <w:t xml:space="preserve"> Fabricated locations, policies, certifications, guarantees, delivery, compliance, and service claims are rejected or omitted through registered rules.</w:t>
       </w:r>
     </w:p>
     <w:p>
@@ -12666,7 +11978,7 @@
         <w:rPr>
           <w:rFonts w:ascii="Calibri" w:hAnsi="Calibri" w:cs="Calibri"/>
         </w:rPr>
-        <w:t xml:space="preserve"> Determinism, exact/near-duplicate fixtures, pairwise structural scoring, direction compatibility, complete-store generation, and representative visual evidence.</w:t>
+        <w:t xml:space="preserve"> Contract/profile, evidence/provenance, generation/lifecycle, localization, responsive/a11y, and retained visual evidence.</w:t>
       </w:r>
     </w:p>
     <w:p>
@@ -12690,7 +12002,7 @@
         <w:rPr>
           <w:rFonts w:ascii="Calibri" w:hAnsi="Calibri" w:cs="Calibri"/>
         </w:rPr>
-        <w:t xml:space="preserve"> Thousands of manually authored templates.</w:t>
+        <w:t xml:space="preserve"> Unrestricted CMS or legal-content generation.</w:t>
       </w:r>
     </w:p>
     <w:p>
@@ -12703,7 +12015,7 @@
         <w:rPr>
           <w:rFonts w:ascii="Calibri" w:hAnsi="Calibri" w:cs="Calibri"/>
         </w:rPr>
-        <w:t>P10B-17 — Responsive, accessibility and performance closure</w:t>
+        <w:t>P10B-13 — Commerce utility presentation pages</w:t>
       </w:r>
     </w:p>
     <w:p>
@@ -12727,7 +12039,7 @@
         <w:rPr>
           <w:rFonts w:ascii="Calibri" w:hAnsi="Calibri" w:cs="Calibri"/>
         </w:rPr>
-        <w:t xml:space="preserve"> Preserve deliberate commercial hierarchy and usability across target widths, locales, accessibility, and bounded performance budgets.</w:t>
+        <w:t xml:space="preserve"> Deliver governed search/no-results, cart, checkout, empty, error, and 404 presentation.</w:t>
       </w:r>
     </w:p>
     <w:p>
@@ -12751,7 +12063,7 @@
         <w:rPr>
           <w:rFonts w:ascii="Calibri" w:hAnsi="Calibri" w:cs="Calibri"/>
         </w:rPr>
-        <w:t xml:space="preserve"> Existing responsive/a11y contracts, registered transformations, renderers, and evidence protocol.</w:t>
+        <w:t xml:space="preserve"> Existing page/profile, shared frame, canonical commerce projection, and operational adapter seams.</w:t>
       </w:r>
     </w:p>
     <w:p>
@@ -12775,7 +12087,7 @@
         <w:rPr>
           <w:rFonts w:ascii="Calibri" w:hAnsi="Calibri" w:cs="Calibri"/>
         </w:rPr>
-        <w:t xml:space="preserve"> Implemented commercial families/profiles/directions through P10B-16.</w:t>
+        <w:t xml:space="preserve"> P10B-03, P10B-05, P10B-06, P10B-08.</w:t>
       </w:r>
     </w:p>
     <w:p>
@@ -12799,7 +12111,7 @@
         <w:rPr>
           <w:rFonts w:ascii="Calibri" w:hAnsi="Calibri" w:cs="Calibri"/>
         </w:rPr>
-        <w:t xml:space="preserve"> All supported page families/directions pass 375/768/1024/1440 and EN/FI geometry, declared transformations, keyboard/focus/semantics/contrast, content/commerce retention, and explicit performance budgets with correlated evidence.</w:t>
+        <w:t xml:space="preserve"> Every state presents canonical facts/actions with coherent Design DNA/frame, useful empty/error behavior, complete page-set reachability, responsive accessibility, snapshot, and publication preservation.</w:t>
       </w:r>
     </w:p>
     <w:p>
@@ -12823,7 +12135,7 @@
         <w:rPr>
           <w:rFonts w:ascii="Calibri" w:hAnsi="Calibri" w:cs="Calibri"/>
         </w:rPr>
-        <w:t xml:space="preserve"> Clipping, overlap, inaccessible controls, lost content/commerce, desktop-only approval, or undispositioned budget failure blocks completion.</w:t>
+        <w:t xml:space="preserve"> Local commerce operations/writes, invented totals or availability, unsupported actions, and executable payment/checkout behavior outside Vesko adapters are rejected.</w:t>
       </w:r>
     </w:p>
     <w:p>
@@ -12847,7 +12159,7 @@
         <w:rPr>
           <w:rFonts w:ascii="Calibri" w:hAnsi="Calibri" w:cs="Calibri"/>
         </w:rPr>
-        <w:t xml:space="preserve"> Automated geometry/a11y/performance/browser matrices plus retained representative human review.</w:t>
+        <w:t xml:space="preserve"> Contract/integration, adapter-boundary, state matrix, responsive/a11y browser, and retained visual evidence.</w:t>
       </w:r>
     </w:p>
     <w:p>
@@ -12871,7 +12183,7 @@
         <w:rPr>
           <w:rFonts w:ascii="Calibri" w:hAnsi="Calibri" w:cs="Calibri"/>
         </w:rPr>
-        <w:t xml:space="preserve"> Visual approval from isolated component screenshots.</w:t>
+        <w:t xml:space="preserve"> Owning cart, checkout, payment, order, tax, shipping, or returns operations.</w:t>
       </w:r>
     </w:p>
     <w:p>
@@ -12884,7 +12196,7 @@
         <w:rPr>
           <w:rFonts w:ascii="Calibri" w:hAnsi="Calibri" w:cs="Calibri"/>
         </w:rPr>
-        <w:t>P10B-18 — Commercial quality and scale gate</w:t>
+        <w:t>P10B-14 — Premium Editorial complete-storefront vertical slice</w:t>
       </w:r>
     </w:p>
     <w:p>
@@ -12908,7 +12220,7 @@
         <w:rPr>
           <w:rFonts w:ascii="Calibri" w:hAnsi="Calibri" w:cs="Calibri"/>
         </w:rPr>
-        <w:t xml:space="preserve"> Prove repeated generation of publishable, premium, materially different complete storefronts.</w:t>
+        <w:t xml:space="preserve"> Prove one commercially credible complete multi-page storefront early.</w:t>
       </w:r>
     </w:p>
     <w:p>
@@ -12932,7 +12244,7 @@
         <w:rPr>
           <w:rFonts w:ascii="Calibri" w:hAnsi="Calibri" w:cs="Calibri"/>
         </w:rPr>
-        <w:t xml:space="preserve"> Existing golden-store/human-review evidence plus the P10B synthesis and fingerprint authorities.</w:t>
+        <w:t xml:space="preserve"> Existing canonical generation/proposal/snapshot/preview/publication chain using the implemented P10B authorities.</w:t>
       </w:r>
     </w:p>
     <w:p>
@@ -12956,7 +12268,7 @@
         <w:rPr>
           <w:rFonts w:ascii="Calibri" w:hAnsi="Calibri" w:cs="Calibri"/>
         </w:rPr>
-        <w:t xml:space="preserve"> P10B-17 and every prior P10B task.</w:t>
+        <w:t xml:space="preserve"> Minimum accepted P10B-02 through P10B-13 capability.</w:t>
       </w:r>
     </w:p>
     <w:p>
@@ -12980,7 +12292,7 @@
         <w:rPr>
           <w:rFonts w:ascii="Calibri" w:hAnsi="Calibri" w:cs="Calibri"/>
         </w:rPr>
-        <w:t xml:space="preserve"> At least 100 deterministic complete configurations across representative catalogue/evidence/asset/locale/page-set/direction contexts pass snapshot validity, protected parity, exact-duplicate, near-duplicate, and structural-distribution gates; a fingerprint- stratified subset passes retained four-width human commercial review.</w:t>
+        <w:t xml:space="preserve"> One approved brief with realistic commerce and credible assets generates shared frame, home, collection, simple/configurable PDP, About, Contact/locations, FAQ/service, and required utility/error states; navigation, EN/FI where supported, four widths, protected state, preview/publish, and retained human review pass.</w:t>
       </w:r>
     </w:p>
     <w:p>
@@ -13004,7 +12316,7 @@
         <w:rPr>
           <w:rFonts w:ascii="Calibri" w:hAnsi="Calibri" w:cs="Calibri"/>
         </w:rPr>
-        <w:t xml:space="preserve"> One polished store, automated checks alone, placeholder assets, registry counts, screenshots without exact authority, or colour-only diversity cannot close P10B.</w:t>
+        <w:t xml:space="preserve"> Missing/disconnected/generic required pages, manual reconstruction, stale authority, or schema-only visual evidence fails the slice.</w:t>
       </w:r>
     </w:p>
     <w:p>
@@ -13028,7 +12340,7 @@
         <w:rPr>
           <w:rFonts w:ascii="Calibri" w:hAnsi="Calibri" w:cs="Calibri"/>
         </w:rPr>
-        <w:t xml:space="preserve"> Scale-generation ledger, fingerprint/diversity analysis, complete capability-chain correlations, retained screenshots, and explicit human acceptance.</w:t>
+        <w:t xml:space="preserve"> Complete capability chain, correlated browser/screenshots, protected parity, and signed human commercial review.</w:t>
       </w:r>
     </w:p>
     <w:p>
@@ -13052,20 +12364,7 @@
         <w:rPr>
           <w:rFonts w:ascii="Calibri" w:hAnsi="Calibri" w:cs="Calibri"/>
         </w:rPr>
-        <w:t xml:space="preserve"> P10C merchant editing, Vesko staging, or production-readiness claims.</w:t>
-      </w:r>
-    </w:p>
-    <w:p>
-      <w:pPr>
-        <w:pStyle w:val="Heading2"/>
-        <w:keepNext/>
-        <w:widowControl/>
-      </w:pPr>
-      <w:r>
-        <w:rPr>
-          <w:rFonts w:ascii="Calibri" w:hAnsi="Calibri" w:cs="Calibri"/>
-        </w:rPr>
-        <w:t>P10C — Storefront Studio Editing Experience v1</w:t>
+        <w:t xml:space="preserve"> P10B closure or broad direction/diversity proof.</w:t>
       </w:r>
     </w:p>
     <w:p>
@@ -13078,7 +12377,7 @@
         <w:rPr>
           <w:rFonts w:ascii="Calibri" w:hAnsi="Calibri" w:cs="Calibri"/>
         </w:rPr>
-        <w:t>P10C-01 — Brand asset library</w:t>
+        <w:t>P10B-15 — Bounded storefront synthesis and narrative engine</w:t>
       </w:r>
     </w:p>
     <w:p>
@@ -13102,349 +12401,31 @@
         <w:rPr>
           <w:rFonts w:ascii="Calibri" w:hAnsi="Calibri" w:cs="Calibri"/>
         </w:rPr>
-        <w:t xml:space="preserve"> Let merchants view and choose approved presentation assets in Storefront Studio.</w:t>
-      </w:r>
-    </w:p>
-    <w:p>
-      <w:pPr>
-        <w:pStyle w:val="Normal"/>
-        <w:numPr>
-          <w:ilvl w:val="0"/>
-          <w:numId w:val="1"/>
-        </w:numPr>
-        <w:widowControl/>
-      </w:pPr>
-      <w:r>
-        <w:rPr>
-          <w:rFonts w:ascii="Calibri" w:hAnsi="Calibri" w:cs="Calibri"/>
-          <w:b/>
-          <w:bCs/>
-        </w:rPr>
-        <w:t>Status:</w:t>
-      </w:r>
-      <w:r>
-        <w:rPr>
-          <w:rFonts w:ascii="Calibri" w:hAnsi="Calibri" w:cs="Calibri"/>
-        </w:rPr>
-        <w:t xml:space="preserve"> </w:t>
-      </w:r>
-      <w:r>
-        <w:rPr>
-          <w:rFonts w:ascii="Calibri" w:hAnsi="Calibri" w:cs="Calibri"/>
-          <w:b/>
-          <w:bCs/>
-        </w:rPr>
-        <w:t>Planned</w:t>
-      </w:r>
-      <w:r>
-        <w:rPr>
-          <w:rFonts w:ascii="Calibri" w:hAnsi="Calibri" w:cs="Calibri"/>
-        </w:rPr>
-        <w:t>.</w:t>
-      </w:r>
-    </w:p>
-    <w:p>
-      <w:pPr>
-        <w:pStyle w:val="Normal"/>
-        <w:numPr>
-          <w:ilvl w:val="0"/>
-          <w:numId w:val="1"/>
-        </w:numPr>
-        <w:widowControl/>
-      </w:pPr>
-      <w:r>
-        <w:rPr>
-          <w:rFonts w:ascii="Calibri" w:hAnsi="Calibri" w:cs="Calibri"/>
-          <w:b/>
-          <w:bCs/>
-        </w:rPr>
-        <w:t>Depends on:</w:t>
-      </w:r>
-      <w:r>
-        <w:rPr>
-          <w:rFonts w:ascii="Calibri" w:hAnsi="Calibri" w:cs="Calibri"/>
-        </w:rPr>
-        <w:t xml:space="preserve"> P10B asset authority.</w:t>
-      </w:r>
-    </w:p>
-    <w:p>
-      <w:pPr>
-        <w:pStyle w:val="Normal"/>
-        <w:numPr>
-          <w:ilvl w:val="0"/>
-          <w:numId w:val="1"/>
-        </w:numPr>
-        <w:widowControl/>
-      </w:pPr>
-      <w:r>
-        <w:rPr>
-          <w:rFonts w:ascii="Calibri" w:hAnsi="Calibri" w:cs="Calibri"/>
-          <w:b/>
-          <w:bCs/>
-        </w:rPr>
-        <w:t>Done when:</w:t>
-      </w:r>
-      <w:r>
-        <w:rPr>
-          <w:rFonts w:ascii="Calibri" w:hAnsi="Calibri" w:cs="Calibri"/>
-        </w:rPr>
-        <w:t xml:space="preserve"> The stated outcome and required evidence are accepted.</w:t>
-      </w:r>
-    </w:p>
-    <w:p>
-      <w:pPr>
-        <w:pStyle w:val="Normal"/>
-        <w:numPr>
-          <w:ilvl w:val="0"/>
-          <w:numId w:val="1"/>
-        </w:numPr>
-        <w:widowControl/>
-      </w:pPr>
-      <w:r>
-        <w:rPr>
-          <w:rFonts w:ascii="Calibri" w:hAnsi="Calibri" w:cs="Calibri"/>
-          <w:b/>
-          <w:bCs/>
-        </w:rPr>
-        <w:t>Required evidence:</w:t>
-      </w:r>
-      <w:r>
-        <w:rPr>
-          <w:rFonts w:ascii="Calibri" w:hAnsi="Calibri" w:cs="Calibri"/>
-        </w:rPr>
-        <w:t xml:space="preserve"> Contract, integration, browser/E2E.</w:t>
-      </w:r>
-    </w:p>
-    <w:p>
-      <w:pPr>
-        <w:pStyle w:val="Normal"/>
-        <w:numPr>
-          <w:ilvl w:val="0"/>
-          <w:numId w:val="1"/>
-        </w:numPr>
-        <w:widowControl/>
-      </w:pPr>
-      <w:r>
-        <w:rPr>
-          <w:rFonts w:ascii="Calibri" w:hAnsi="Calibri" w:cs="Calibri"/>
-          <w:b/>
-          <w:bCs/>
-        </w:rPr>
-        <w:t>Non-goal:</w:t>
-      </w:r>
-      <w:r>
-        <w:rPr>
-          <w:rFonts w:ascii="Calibri" w:hAnsi="Calibri" w:cs="Calibri"/>
-        </w:rPr>
-        <w:t xml:space="preserve"> Product-media replacement or generic DAM scope.</w:t>
-      </w:r>
-    </w:p>
-    <w:p>
-      <w:pPr>
-        <w:pStyle w:val="Heading3"/>
-        <w:keepNext/>
-        <w:widowControl/>
-      </w:pPr>
-      <w:r>
-        <w:rPr>
-          <w:rFonts w:ascii="Calibri" w:hAnsi="Calibri" w:cs="Calibri"/>
-        </w:rPr>
-        <w:t>P10C-02 — Asset roles and provenance</w:t>
-      </w:r>
-    </w:p>
-    <w:p>
-      <w:pPr>
-        <w:pStyle w:val="Normal"/>
-        <w:numPr>
-          <w:ilvl w:val="0"/>
-          <w:numId w:val="1"/>
-        </w:numPr>
-        <w:widowControl/>
-      </w:pPr>
-      <w:r>
-        <w:rPr>
-          <w:rFonts w:ascii="Calibri" w:hAnsi="Calibri" w:cs="Calibri"/>
-          <w:b/>
-          <w:bCs/>
-        </w:rPr>
-        <w:t>Outcome:</w:t>
-      </w:r>
-      <w:r>
-        <w:rPr>
-          <w:rFonts w:ascii="Calibri" w:hAnsi="Calibri" w:cs="Calibri"/>
-        </w:rPr>
-        <w:t xml:space="preserve"> Show and preserve role, source, approval, revision, and assignment authority.</w:t>
-      </w:r>
-    </w:p>
-    <w:p>
-      <w:pPr>
-        <w:pStyle w:val="Normal"/>
-        <w:numPr>
-          <w:ilvl w:val="0"/>
-          <w:numId w:val="1"/>
-        </w:numPr>
-        <w:widowControl/>
-      </w:pPr>
-      <w:r>
-        <w:rPr>
-          <w:rFonts w:ascii="Calibri" w:hAnsi="Calibri" w:cs="Calibri"/>
-          <w:b/>
-          <w:bCs/>
-        </w:rPr>
-        <w:t>Status:</w:t>
-      </w:r>
-      <w:r>
-        <w:rPr>
-          <w:rFonts w:ascii="Calibri" w:hAnsi="Calibri" w:cs="Calibri"/>
-        </w:rPr>
-        <w:t xml:space="preserve"> </w:t>
-      </w:r>
-      <w:r>
-        <w:rPr>
-          <w:rFonts w:ascii="Calibri" w:hAnsi="Calibri" w:cs="Calibri"/>
-          <w:b/>
-          <w:bCs/>
-        </w:rPr>
-        <w:t>Planned</w:t>
-      </w:r>
-      <w:r>
-        <w:rPr>
-          <w:rFonts w:ascii="Calibri" w:hAnsi="Calibri" w:cs="Calibri"/>
-        </w:rPr>
-        <w:t>.</w:t>
-      </w:r>
-    </w:p>
-    <w:p>
-      <w:pPr>
-        <w:pStyle w:val="Normal"/>
-        <w:numPr>
-          <w:ilvl w:val="0"/>
-          <w:numId w:val="1"/>
-        </w:numPr>
-        <w:widowControl/>
-      </w:pPr>
-      <w:r>
-        <w:rPr>
-          <w:rFonts w:ascii="Calibri" w:hAnsi="Calibri" w:cs="Calibri"/>
-          <w:b/>
-          <w:bCs/>
-        </w:rPr>
-        <w:t>Depends on:</w:t>
-      </w:r>
-      <w:r>
-        <w:rPr>
-          <w:rFonts w:ascii="Calibri" w:hAnsi="Calibri" w:cs="Calibri"/>
-        </w:rPr>
-        <w:t xml:space="preserve"> P10C-01.</w:t>
-      </w:r>
-    </w:p>
-    <w:p>
-      <w:pPr>
-        <w:pStyle w:val="Normal"/>
-        <w:numPr>
-          <w:ilvl w:val="0"/>
-          <w:numId w:val="1"/>
-        </w:numPr>
-        <w:widowControl/>
-      </w:pPr>
-      <w:r>
-        <w:rPr>
-          <w:rFonts w:ascii="Calibri" w:hAnsi="Calibri" w:cs="Calibri"/>
-          <w:b/>
-          <w:bCs/>
-        </w:rPr>
-        <w:t>Done when:</w:t>
-      </w:r>
-      <w:r>
-        <w:rPr>
-          <w:rFonts w:ascii="Calibri" w:hAnsi="Calibri" w:cs="Calibri"/>
-        </w:rPr>
-        <w:t xml:space="preserve"> The stated outcome and required evidence are accepted.</w:t>
-      </w:r>
-    </w:p>
-    <w:p>
-      <w:pPr>
-        <w:pStyle w:val="Normal"/>
-        <w:numPr>
-          <w:ilvl w:val="0"/>
-          <w:numId w:val="1"/>
-        </w:numPr>
-        <w:widowControl/>
-      </w:pPr>
-      <w:r>
-        <w:rPr>
-          <w:rFonts w:ascii="Calibri" w:hAnsi="Calibri" w:cs="Calibri"/>
-          <w:b/>
-          <w:bCs/>
-        </w:rPr>
-        <w:t>Required evidence:</w:t>
-      </w:r>
-      <w:r>
-        <w:rPr>
-          <w:rFonts w:ascii="Calibri" w:hAnsi="Calibri" w:cs="Calibri"/>
-        </w:rPr>
-        <w:t xml:space="preserve"> Valid assignment and stale/unknown/role-mismatch rejection.</w:t>
-      </w:r>
-    </w:p>
-    <w:p>
-      <w:pPr>
-        <w:pStyle w:val="Normal"/>
-        <w:numPr>
-          <w:ilvl w:val="0"/>
-          <w:numId w:val="1"/>
-        </w:numPr>
-        <w:widowControl/>
-      </w:pPr>
-      <w:r>
-        <w:rPr>
-          <w:rFonts w:ascii="Calibri" w:hAnsi="Calibri" w:cs="Calibri"/>
-          <w:b/>
-          <w:bCs/>
-        </w:rPr>
-        <w:t>Non-goal:</w:t>
-      </w:r>
-      <w:r>
-        <w:rPr>
-          <w:rFonts w:ascii="Calibri" w:hAnsi="Calibri" w:cs="Calibri"/>
-        </w:rPr>
-        <w:t xml:space="preserve"> Untyped uploads or hidden provenance.</w:t>
-      </w:r>
-    </w:p>
-    <w:p>
-      <w:pPr>
-        <w:pStyle w:val="Heading3"/>
-        <w:keepNext/>
-        <w:widowControl/>
-      </w:pPr>
-      <w:r>
-        <w:rPr>
-          <w:rFonts w:ascii="Calibri" w:hAnsi="Calibri" w:cs="Calibri"/>
-        </w:rPr>
-        <w:t>P10C-03 — Canonical Puck boundary</w:t>
-      </w:r>
-    </w:p>
-    <w:p>
-      <w:pPr>
-        <w:pStyle w:val="Normal"/>
-        <w:numPr>
-          <w:ilvl w:val="0"/>
-          <w:numId w:val="1"/>
-        </w:numPr>
-        <w:widowControl/>
-      </w:pPr>
-      <w:r>
-        <w:rPr>
-          <w:rFonts w:ascii="Calibri" w:hAnsi="Calibri" w:cs="Calibri"/>
-          <w:b/>
-          <w:bCs/>
-        </w:rPr>
-        <w:t>Outcome:</w:t>
-      </w:r>
-      <w:r>
-        <w:rPr>
-          <w:rFonts w:ascii="Calibri" w:hAnsi="Calibri" w:cs="Calibri"/>
-        </w:rPr>
-        <w:t xml:space="preserve"> Project registered canonical content into Puck and validate edits back into the same </w:t>
+        <w:t xml:space="preserve"> Generate complete coherent storefronts from compatible Design DNA, page set, profiles, families/variants, parameters, assets, and narrative roles.</w:t>
+      </w:r>
+    </w:p>
+    <w:p>
+      <w:pPr>
+        <w:pStyle w:val="Normal"/>
+        <w:numPr>
+          <w:ilvl w:val="0"/>
+          <w:numId w:val="1"/>
+        </w:numPr>
+        <w:widowControl/>
+      </w:pPr>
+      <w:r>
+        <w:rPr>
+          <w:rFonts w:ascii="Calibri" w:hAnsi="Calibri" w:cs="Calibri"/>
+          <w:b/>
+          <w:bCs/>
+        </w:rPr>
+        <w:t>Authority:</w:t>
+      </w:r>
+      <w:r>
+        <w:rPr>
+          <w:rFonts w:ascii="Calibri" w:hAnsi="Calibri" w:cs="Calibri"/>
+        </w:rPr>
+        <w:t xml:space="preserve"> Existing governed planning/proposal compiler plus the registered P10B authorities; output remains one </w:t>
       </w:r>
       <w:r>
         <w:rPr>
@@ -13476,51 +12457,13 @@
           <w:b/>
           <w:bCs/>
         </w:rPr>
-        <w:t>Status:</w:t>
-      </w:r>
-      <w:r>
-        <w:rPr>
-          <w:rFonts w:ascii="Calibri" w:hAnsi="Calibri" w:cs="Calibri"/>
-        </w:rPr>
-        <w:t xml:space="preserve"> </w:t>
-      </w:r>
-      <w:r>
-        <w:rPr>
-          <w:rFonts w:ascii="Calibri" w:hAnsi="Calibri" w:cs="Calibri"/>
-          <w:b/>
-          <w:bCs/>
-        </w:rPr>
-        <w:t>Planned</w:t>
-      </w:r>
-      <w:r>
-        <w:rPr>
-          <w:rFonts w:ascii="Calibri" w:hAnsi="Calibri" w:cs="Calibri"/>
-        </w:rPr>
-        <w:t>.</w:t>
-      </w:r>
-    </w:p>
-    <w:p>
-      <w:pPr>
-        <w:pStyle w:val="Normal"/>
-        <w:numPr>
-          <w:ilvl w:val="0"/>
-          <w:numId w:val="1"/>
-        </w:numPr>
-        <w:widowControl/>
-      </w:pPr>
-      <w:r>
-        <w:rPr>
-          <w:rFonts w:ascii="Calibri" w:hAnsi="Calibri" w:cs="Calibri"/>
-          <w:b/>
-          <w:bCs/>
-        </w:rPr>
         <w:t>Depends on:</w:t>
       </w:r>
       <w:r>
         <w:rPr>
           <w:rFonts w:ascii="Calibri" w:hAnsi="Calibri" w:cs="Calibri"/>
         </w:rPr>
-        <w:t xml:space="preserve"> P10B component/profile authority.</w:t>
+        <w:t xml:space="preserve"> P10B-14 and sufficient real family/profile capability.</w:t>
       </w:r>
     </w:p>
     <w:p>
@@ -13544,31 +12487,55 @@
         <w:rPr>
           <w:rFonts w:ascii="Calibri" w:hAnsi="Calibri" w:cs="Calibri"/>
         </w:rPr>
-        <w:t xml:space="preserve"> The stated outcome and required evidence are accepted.</w:t>
-      </w:r>
-    </w:p>
-    <w:p>
-      <w:pPr>
-        <w:pStyle w:val="Normal"/>
-        <w:numPr>
-          <w:ilvl w:val="0"/>
-          <w:numId w:val="1"/>
-        </w:numPr>
-        <w:widowControl/>
-      </w:pPr>
-      <w:r>
-        <w:rPr>
-          <w:rFonts w:ascii="Calibri" w:hAnsi="Calibri" w:cs="Calibri"/>
-          <w:b/>
-          <w:bCs/>
-        </w:rPr>
-        <w:t>Required evidence:</w:t>
-      </w:r>
-      <w:r>
-        <w:rPr>
-          <w:rFonts w:ascii="Calibri" w:hAnsi="Calibri" w:cs="Calibri"/>
-        </w:rPr>
-        <w:t xml:space="preserve"> Adapter conformance and save/reload preservation.</w:t>
+        <w:t xml:space="preserve"> Deterministic selection preserves cross-page identity, narrative adjacency/ cardinality, repetition limits, bindings/assets, and complete snapshot/lifecycle output for representative inputs.</w:t>
+      </w:r>
+    </w:p>
+    <w:p>
+      <w:pPr>
+        <w:pStyle w:val="Normal"/>
+        <w:numPr>
+          <w:ilvl w:val="0"/>
+          <w:numId w:val="1"/>
+        </w:numPr>
+        <w:widowControl/>
+      </w:pPr>
+      <w:r>
+        <w:rPr>
+          <w:rFonts w:ascii="Calibri" w:hAnsi="Calibri" w:cs="Calibri"/>
+          <w:b/>
+          <w:bCs/>
+        </w:rPr>
+        <w:t>Fail closed:</w:t>
+      </w:r>
+      <w:r>
+        <w:rPr>
+          <w:rFonts w:ascii="Calibri" w:hAnsi="Calibri" w:cs="Calibri"/>
+        </w:rPr>
+        <w:t xml:space="preserve"> Missing, stale, ambiguous, incompatible, unregistered, repetitive, or protected-state-divergent combinations produce no partial proposal/snapshot.</w:t>
+      </w:r>
+    </w:p>
+    <w:p>
+      <w:pPr>
+        <w:pStyle w:val="Normal"/>
+        <w:numPr>
+          <w:ilvl w:val="0"/>
+          <w:numId w:val="1"/>
+        </w:numPr>
+        <w:widowControl/>
+      </w:pPr>
+      <w:r>
+        <w:rPr>
+          <w:rFonts w:ascii="Calibri" w:hAnsi="Calibri" w:cs="Calibri"/>
+          <w:b/>
+          <w:bCs/>
+        </w:rPr>
+        <w:t>Evidence:</w:t>
+      </w:r>
+      <w:r>
+        <w:rPr>
+          <w:rFonts w:ascii="Calibri" w:hAnsi="Calibri" w:cs="Calibri"/>
+        </w:rPr>
+        <w:t xml:space="preserve"> Selection/compatibility/unit, proposal/compiler/lifecycle integration, no-partial- write, deterministic fingerprint inputs, and complete-store browser evidence.</w:t>
       </w:r>
     </w:p>
     <w:p>
@@ -13592,7 +12559,7 @@
         <w:rPr>
           <w:rFonts w:ascii="Calibri" w:hAnsi="Calibri" w:cs="Calibri"/>
         </w:rPr>
-        <w:t xml:space="preserve"> Raw Puck persistence or a second page tree.</w:t>
+        <w:t xml:space="preserve"> Arbitrary trees/styles or a second synthesis representation.</w:t>
       </w:r>
     </w:p>
     <w:p>
@@ -13605,7 +12572,7 @@
         <w:rPr>
           <w:rFonts w:ascii="Calibri" w:hAnsi="Calibri" w:cs="Calibri"/>
         </w:rPr>
-        <w:t>P10C-04 — Stable frame identity and selection</w:t>
+        <w:t>P10B-16 — Coordinated directions and diversity control</w:t>
       </w:r>
     </w:p>
     <w:p>
@@ -13629,45 +12596,31 @@
         <w:rPr>
           <w:rFonts w:ascii="Calibri" w:hAnsi="Calibri" w:cs="Calibri"/>
         </w:rPr>
-        <w:t xml:space="preserve"> Select and edit one shared frame consistently from every page context.</w:t>
-      </w:r>
-    </w:p>
-    <w:p>
-      <w:pPr>
-        <w:pStyle w:val="Normal"/>
-        <w:numPr>
-          <w:ilvl w:val="0"/>
-          <w:numId w:val="1"/>
-        </w:numPr>
-        <w:widowControl/>
-      </w:pPr>
-      <w:r>
-        <w:rPr>
-          <w:rFonts w:ascii="Calibri" w:hAnsi="Calibri" w:cs="Calibri"/>
-          <w:b/>
-          <w:bCs/>
-        </w:rPr>
-        <w:t>Status:</w:t>
-      </w:r>
-      <w:r>
-        <w:rPr>
-          <w:rFonts w:ascii="Calibri" w:hAnsi="Calibri" w:cs="Calibri"/>
-        </w:rPr>
-        <w:t xml:space="preserve"> </w:t>
-      </w:r>
-      <w:r>
-        <w:rPr>
-          <w:rFonts w:ascii="Calibri" w:hAnsi="Calibri" w:cs="Calibri"/>
-          <w:b/>
-          <w:bCs/>
-        </w:rPr>
-        <w:t>Planned</w:t>
-      </w:r>
-      <w:r>
-        <w:rPr>
-          <w:rFonts w:ascii="Calibri" w:hAnsi="Calibri" w:cs="Calibri"/>
-        </w:rPr>
-        <w:t>.</w:t>
+        <w:t xml:space="preserve"> Make Premium Editorial, Modern Technical, and Minimal Commerce coordinated constraint packages and prevent duplicates/near duplicates.</w:t>
+      </w:r>
+    </w:p>
+    <w:p>
+      <w:pPr>
+        <w:pStyle w:val="Normal"/>
+        <w:numPr>
+          <w:ilvl w:val="0"/>
+          <w:numId w:val="1"/>
+        </w:numPr>
+        <w:widowControl/>
+      </w:pPr>
+      <w:r>
+        <w:rPr>
+          <w:rFonts w:ascii="Calibri" w:hAnsi="Calibri" w:cs="Calibri"/>
+          <w:b/>
+          <w:bCs/>
+        </w:rPr>
+        <w:t>Authority:</w:t>
+      </w:r>
+      <w:r>
+        <w:rPr>
+          <w:rFonts w:ascii="Calibri" w:hAnsi="Calibri" w:cs="Calibri"/>
+        </w:rPr>
+        <w:t xml:space="preserve"> Existing direction-selection authority plus deterministic storefront-design fingerprint/evaluation.</w:t>
       </w:r>
     </w:p>
     <w:p>
@@ -13691,7 +12644,7 @@
         <w:rPr>
           <w:rFonts w:ascii="Calibri" w:hAnsi="Calibri" w:cs="Calibri"/>
         </w:rPr>
-        <w:t xml:space="preserve"> P10C-03.</w:t>
+        <w:t xml:space="preserve"> P10B-15.</w:t>
       </w:r>
     </w:p>
     <w:p>
@@ -13715,31 +12668,55 @@
         <w:rPr>
           <w:rFonts w:ascii="Calibri" w:hAnsi="Calibri" w:cs="Calibri"/>
         </w:rPr>
-        <w:t xml:space="preserve"> The stated outcome and required evidence are accepted.</w:t>
-      </w:r>
-    </w:p>
-    <w:p>
-      <w:pPr>
-        <w:pStyle w:val="Normal"/>
-        <w:numPr>
-          <w:ilvl w:val="0"/>
-          <w:numId w:val="1"/>
-        </w:numPr>
-        <w:widowControl/>
-      </w:pPr>
-      <w:r>
-        <w:rPr>
-          <w:rFonts w:ascii="Calibri" w:hAnsi="Calibri" w:cs="Calibri"/>
-          <w:b/>
-          <w:bCs/>
-        </w:rPr>
-        <w:t>Required evidence:</w:t>
-      </w:r>
-      <w:r>
-        <w:rPr>
-          <w:rFonts w:ascii="Calibri" w:hAnsi="Calibri" w:cs="Calibri"/>
-        </w:rPr>
-        <w:t xml:space="preserve"> Stable identity, scope, history, and browser behavior.</w:t>
+        <w:t xml:space="preserve"> Fingerprints cover Design DNA, page set/profiles, frame, anatomies/variants, structural parameters, image posture, density/responsive posture, and narrative composition; exact and meaningful near duplicates fail, and pairwise stores differ materially beyond colour.</w:t>
+      </w:r>
+    </w:p>
+    <w:p>
+      <w:pPr>
+        <w:pStyle w:val="Normal"/>
+        <w:numPr>
+          <w:ilvl w:val="0"/>
+          <w:numId w:val="1"/>
+        </w:numPr>
+        <w:widowControl/>
+      </w:pPr>
+      <w:r>
+        <w:rPr>
+          <w:rFonts w:ascii="Calibri" w:hAnsi="Calibri" w:cs="Calibri"/>
+          <w:b/>
+          <w:bCs/>
+        </w:rPr>
+        <w:t>Fail closed:</w:t>
+      </w:r>
+      <w:r>
+        <w:rPr>
+          <w:rFonts w:ascii="Calibri" w:hAnsi="Calibri" w:cs="Calibri"/>
+        </w:rPr>
+        <w:t xml:space="preserve"> Fixed-template/token/page direction authority, incompatible references, colour-only differences, and fingerprints that omit material structure are rejected.</w:t>
+      </w:r>
+    </w:p>
+    <w:p>
+      <w:pPr>
+        <w:pStyle w:val="Normal"/>
+        <w:numPr>
+          <w:ilvl w:val="0"/>
+          <w:numId w:val="1"/>
+        </w:numPr>
+        <w:widowControl/>
+      </w:pPr>
+      <w:r>
+        <w:rPr>
+          <w:rFonts w:ascii="Calibri" w:hAnsi="Calibri" w:cs="Calibri"/>
+          <w:b/>
+          <w:bCs/>
+        </w:rPr>
+        <w:t>Evidence:</w:t>
+      </w:r>
+      <w:r>
+        <w:rPr>
+          <w:rFonts w:ascii="Calibri" w:hAnsi="Calibri" w:cs="Calibri"/>
+        </w:rPr>
+        <w:t xml:space="preserve"> Determinism, exact/near-duplicate fixtures, pairwise structural scoring, direction compatibility, complete-store generation, and representative visual evidence.</w:t>
       </w:r>
     </w:p>
     <w:p>
@@ -13763,7 +12740,7 @@
         <w:rPr>
           <w:rFonts w:ascii="Calibri" w:hAnsi="Calibri" w:cs="Calibri"/>
         </w:rPr>
-        <w:t xml:space="preserve"> Duplicating frame state per page.</w:t>
+        <w:t xml:space="preserve"> Thousands of manually authored templates.</w:t>
       </w:r>
     </w:p>
     <w:p>
@@ -13776,7 +12753,7 @@
         <w:rPr>
           <w:rFonts w:ascii="Calibri" w:hAnsi="Calibri" w:cs="Calibri"/>
         </w:rPr>
-        <w:t>P10C-05 — Approved manual frame operations</w:t>
+        <w:t>P10B-17 — Responsive, accessibility and performance closure</w:t>
       </w:r>
     </w:p>
     <w:p>
@@ -13800,45 +12777,31 @@
         <w:rPr>
           <w:rFonts w:ascii="Calibri" w:hAnsi="Calibri" w:cs="Calibri"/>
         </w:rPr>
-        <w:t xml:space="preserve"> Support bounded manual shared-frame add, remove, reorder, field, asset, and presentation operations.</w:t>
-      </w:r>
-    </w:p>
-    <w:p>
-      <w:pPr>
-        <w:pStyle w:val="Normal"/>
-        <w:numPr>
-          <w:ilvl w:val="0"/>
-          <w:numId w:val="1"/>
-        </w:numPr>
-        <w:widowControl/>
-      </w:pPr>
-      <w:r>
-        <w:rPr>
-          <w:rFonts w:ascii="Calibri" w:hAnsi="Calibri" w:cs="Calibri"/>
-          <w:b/>
-          <w:bCs/>
-        </w:rPr>
-        <w:t>Status:</w:t>
-      </w:r>
-      <w:r>
-        <w:rPr>
-          <w:rFonts w:ascii="Calibri" w:hAnsi="Calibri" w:cs="Calibri"/>
-        </w:rPr>
-        <w:t xml:space="preserve"> </w:t>
-      </w:r>
-      <w:r>
-        <w:rPr>
-          <w:rFonts w:ascii="Calibri" w:hAnsi="Calibri" w:cs="Calibri"/>
-          <w:b/>
-          <w:bCs/>
-        </w:rPr>
-        <w:t>Planned</w:t>
-      </w:r>
-      <w:r>
-        <w:rPr>
-          <w:rFonts w:ascii="Calibri" w:hAnsi="Calibri" w:cs="Calibri"/>
-        </w:rPr>
-        <w:t>.</w:t>
+        <w:t xml:space="preserve"> Preserve deliberate commercial hierarchy and usability across target widths, locales, accessibility, and bounded performance budgets.</w:t>
+      </w:r>
+    </w:p>
+    <w:p>
+      <w:pPr>
+        <w:pStyle w:val="Normal"/>
+        <w:numPr>
+          <w:ilvl w:val="0"/>
+          <w:numId w:val="1"/>
+        </w:numPr>
+        <w:widowControl/>
+      </w:pPr>
+      <w:r>
+        <w:rPr>
+          <w:rFonts w:ascii="Calibri" w:hAnsi="Calibri" w:cs="Calibri"/>
+          <w:b/>
+          <w:bCs/>
+        </w:rPr>
+        <w:t>Authority:</w:t>
+      </w:r>
+      <w:r>
+        <w:rPr>
+          <w:rFonts w:ascii="Calibri" w:hAnsi="Calibri" w:cs="Calibri"/>
+        </w:rPr>
+        <w:t xml:space="preserve"> Existing responsive/a11y contracts, registered transformations, renderers, and evidence protocol.</w:t>
       </w:r>
     </w:p>
     <w:p>
@@ -13862,7 +12825,7 @@
         <w:rPr>
           <w:rFonts w:ascii="Calibri" w:hAnsi="Calibri" w:cs="Calibri"/>
         </w:rPr>
-        <w:t xml:space="preserve"> P10C-02 through P10C-04.</w:t>
+        <w:t xml:space="preserve"> Implemented commercial families/profiles/directions through P10B-16.</w:t>
       </w:r>
     </w:p>
     <w:p>
@@ -13886,31 +12849,55 @@
         <w:rPr>
           <w:rFonts w:ascii="Calibri" w:hAnsi="Calibri" w:cs="Calibri"/>
         </w:rPr>
-        <w:t xml:space="preserve"> The stated outcome and required evidence are accepted.</w:t>
-      </w:r>
-    </w:p>
-    <w:p>
-      <w:pPr>
-        <w:pStyle w:val="Normal"/>
-        <w:numPr>
-          <w:ilvl w:val="0"/>
-          <w:numId w:val="1"/>
-        </w:numPr>
-        <w:widowControl/>
-      </w:pPr>
-      <w:r>
-        <w:rPr>
-          <w:rFonts w:ascii="Calibri" w:hAnsi="Calibri" w:cs="Calibri"/>
-          <w:b/>
-          <w:bCs/>
-        </w:rPr>
-        <w:t>Required evidence:</w:t>
-      </w:r>
-      <w:r>
-        <w:rPr>
-          <w:rFonts w:ascii="Calibri" w:hAnsi="Calibri" w:cs="Calibri"/>
-        </w:rPr>
-        <w:t xml:space="preserve"> Positive and fail-closed integration, undo/redo, browser/E2E.</w:t>
+        <w:t xml:space="preserve"> All supported page families/directions pass 375/768/1024/1440 and EN/FI geometry, declared transformations, keyboard/focus/semantics/contrast, content/commerce retention, and explicit performance budgets with correlated evidence.</w:t>
+      </w:r>
+    </w:p>
+    <w:p>
+      <w:pPr>
+        <w:pStyle w:val="Normal"/>
+        <w:numPr>
+          <w:ilvl w:val="0"/>
+          <w:numId w:val="1"/>
+        </w:numPr>
+        <w:widowControl/>
+      </w:pPr>
+      <w:r>
+        <w:rPr>
+          <w:rFonts w:ascii="Calibri" w:hAnsi="Calibri" w:cs="Calibri"/>
+          <w:b/>
+          <w:bCs/>
+        </w:rPr>
+        <w:t>Fail closed:</w:t>
+      </w:r>
+      <w:r>
+        <w:rPr>
+          <w:rFonts w:ascii="Calibri" w:hAnsi="Calibri" w:cs="Calibri"/>
+        </w:rPr>
+        <w:t xml:space="preserve"> Clipping, overlap, inaccessible controls, lost content/commerce, desktop-only approval, or undispositioned budget failure blocks completion.</w:t>
+      </w:r>
+    </w:p>
+    <w:p>
+      <w:pPr>
+        <w:pStyle w:val="Normal"/>
+        <w:numPr>
+          <w:ilvl w:val="0"/>
+          <w:numId w:val="1"/>
+        </w:numPr>
+        <w:widowControl/>
+      </w:pPr>
+      <w:r>
+        <w:rPr>
+          <w:rFonts w:ascii="Calibri" w:hAnsi="Calibri" w:cs="Calibri"/>
+          <w:b/>
+          <w:bCs/>
+        </w:rPr>
+        <w:t>Evidence:</w:t>
+      </w:r>
+      <w:r>
+        <w:rPr>
+          <w:rFonts w:ascii="Calibri" w:hAnsi="Calibri" w:cs="Calibri"/>
+        </w:rPr>
+        <w:t xml:space="preserve"> Automated geometry/a11y/performance/browser matrices plus retained representative human review.</w:t>
       </w:r>
     </w:p>
     <w:p>
@@ -13934,7 +12921,7 @@
         <w:rPr>
           <w:rFonts w:ascii="Calibri" w:hAnsi="Calibri" w:cs="Calibri"/>
         </w:rPr>
-        <w:t xml:space="preserve"> Arbitrary code/CSS/components or commerce mutation.</w:t>
+        <w:t xml:space="preserve"> Visual approval from isolated component screenshots.</w:t>
       </w:r>
     </w:p>
     <w:p>
@@ -13947,7 +12934,7 @@
         <w:rPr>
           <w:rFonts w:ascii="Calibri" w:hAnsi="Calibri" w:cs="Calibri"/>
         </w:rPr>
-        <w:t>P10C-06 — Scoped AI editing</w:t>
+        <w:t>P10B-18 — Commercial quality and scale gate</w:t>
       </w:r>
     </w:p>
     <w:p>
@@ -13971,45 +12958,31 @@
         <w:rPr>
           <w:rFonts w:ascii="Calibri" w:hAnsi="Calibri" w:cs="Calibri"/>
         </w:rPr>
-        <w:t xml:space="preserve"> Connect merchant routing, clarification, frame/page scope, and proposal review to the existing P10A governed authorities.</w:t>
-      </w:r>
-    </w:p>
-    <w:p>
-      <w:pPr>
-        <w:pStyle w:val="Normal"/>
-        <w:numPr>
-          <w:ilvl w:val="0"/>
-          <w:numId w:val="1"/>
-        </w:numPr>
-        <w:widowControl/>
-      </w:pPr>
-      <w:r>
-        <w:rPr>
-          <w:rFonts w:ascii="Calibri" w:hAnsi="Calibri" w:cs="Calibri"/>
-          <w:b/>
-          <w:bCs/>
-        </w:rPr>
-        <w:t>Status:</w:t>
-      </w:r>
-      <w:r>
-        <w:rPr>
-          <w:rFonts w:ascii="Calibri" w:hAnsi="Calibri" w:cs="Calibri"/>
-        </w:rPr>
-        <w:t xml:space="preserve"> </w:t>
-      </w:r>
-      <w:r>
-        <w:rPr>
-          <w:rFonts w:ascii="Calibri" w:hAnsi="Calibri" w:cs="Calibri"/>
-          <w:b/>
-          <w:bCs/>
-        </w:rPr>
-        <w:t>Planned</w:t>
-      </w:r>
-      <w:r>
-        <w:rPr>
-          <w:rFonts w:ascii="Calibri" w:hAnsi="Calibri" w:cs="Calibri"/>
-        </w:rPr>
-        <w:t>.</w:t>
+        <w:t xml:space="preserve"> Prove repeated generation of publishable, premium, materially different complete storefronts.</w:t>
+      </w:r>
+    </w:p>
+    <w:p>
+      <w:pPr>
+        <w:pStyle w:val="Normal"/>
+        <w:numPr>
+          <w:ilvl w:val="0"/>
+          <w:numId w:val="1"/>
+        </w:numPr>
+        <w:widowControl/>
+      </w:pPr>
+      <w:r>
+        <w:rPr>
+          <w:rFonts w:ascii="Calibri" w:hAnsi="Calibri" w:cs="Calibri"/>
+          <w:b/>
+          <w:bCs/>
+        </w:rPr>
+        <w:t>Authority:</w:t>
+      </w:r>
+      <w:r>
+        <w:rPr>
+          <w:rFonts w:ascii="Calibri" w:hAnsi="Calibri" w:cs="Calibri"/>
+        </w:rPr>
+        <w:t xml:space="preserve"> Existing golden-store/human-review evidence plus the P10B synthesis and fingerprint authorities.</w:t>
       </w:r>
     </w:p>
     <w:p>
@@ -14033,7 +13006,7 @@
         <w:rPr>
           <w:rFonts w:ascii="Calibri" w:hAnsi="Calibri" w:cs="Calibri"/>
         </w:rPr>
-        <w:t xml:space="preserve"> P10C-03 through P10C-05 and P10A internal router/packages.</w:t>
+        <w:t xml:space="preserve"> P10B-17 and every prior P10B task.</w:t>
       </w:r>
     </w:p>
     <w:p>
@@ -14057,31 +13030,55 @@
         <w:rPr>
           <w:rFonts w:ascii="Calibri" w:hAnsi="Calibri" w:cs="Calibri"/>
         </w:rPr>
-        <w:t xml:space="preserve"> The stated outcome and required evidence are accepted.</w:t>
-      </w:r>
-    </w:p>
-    <w:p>
-      <w:pPr>
-        <w:pStyle w:val="Normal"/>
-        <w:numPr>
-          <w:ilvl w:val="0"/>
-          <w:numId w:val="1"/>
-        </w:numPr>
-        <w:widowControl/>
-      </w:pPr>
-      <w:r>
-        <w:rPr>
-          <w:rFonts w:ascii="Calibri" w:hAnsi="Calibri" w:cs="Calibri"/>
-          <w:b/>
-          <w:bCs/>
-        </w:rPr>
-        <w:t>Required evidence:</w:t>
-      </w:r>
-      <w:r>
-        <w:rPr>
-          <w:rFonts w:ascii="Calibri" w:hAnsi="Calibri" w:cs="Calibri"/>
-        </w:rPr>
-        <w:t xml:space="preserve"> Selected-section, frame, page, storefront, ambiguity, stale, and failure browser flows.</w:t>
+        <w:t xml:space="preserve"> At least 100 deterministic complete configurations across representative catalogue/evidence/asset/locale/page-set/direction contexts pass snapshot validity, protected parity, exact-duplicate, near-duplicate, and structural-distribution gates; a fingerprint- stratified subset passes retained four-width human commercial review.</w:t>
+      </w:r>
+    </w:p>
+    <w:p>
+      <w:pPr>
+        <w:pStyle w:val="Normal"/>
+        <w:numPr>
+          <w:ilvl w:val="0"/>
+          <w:numId w:val="1"/>
+        </w:numPr>
+        <w:widowControl/>
+      </w:pPr>
+      <w:r>
+        <w:rPr>
+          <w:rFonts w:ascii="Calibri" w:hAnsi="Calibri" w:cs="Calibri"/>
+          <w:b/>
+          <w:bCs/>
+        </w:rPr>
+        <w:t>Fail closed:</w:t>
+      </w:r>
+      <w:r>
+        <w:rPr>
+          <w:rFonts w:ascii="Calibri" w:hAnsi="Calibri" w:cs="Calibri"/>
+        </w:rPr>
+        <w:t xml:space="preserve"> One polished store, automated checks alone, placeholder assets, registry counts, screenshots without exact authority, or colour-only diversity cannot close P10B.</w:t>
+      </w:r>
+    </w:p>
+    <w:p>
+      <w:pPr>
+        <w:pStyle w:val="Normal"/>
+        <w:numPr>
+          <w:ilvl w:val="0"/>
+          <w:numId w:val="1"/>
+        </w:numPr>
+        <w:widowControl/>
+      </w:pPr>
+      <w:r>
+        <w:rPr>
+          <w:rFonts w:ascii="Calibri" w:hAnsi="Calibri" w:cs="Calibri"/>
+          <w:b/>
+          <w:bCs/>
+        </w:rPr>
+        <w:t>Evidence:</w:t>
+      </w:r>
+      <w:r>
+        <w:rPr>
+          <w:rFonts w:ascii="Calibri" w:hAnsi="Calibri" w:cs="Calibri"/>
+        </w:rPr>
+        <w:t xml:space="preserve"> Scale-generation ledger, fingerprint/diversity analysis, complete capability-chain correlations, retained screenshots, and explicit human acceptance.</w:t>
       </w:r>
     </w:p>
     <w:p>
@@ -14105,7 +13102,20 @@
         <w:rPr>
           <w:rFonts w:ascii="Calibri" w:hAnsi="Calibri" w:cs="Calibri"/>
         </w:rPr>
-        <w:t xml:space="preserve"> Rebuilding the router, packages, proposals, or provider boundary.</w:t>
+        <w:t xml:space="preserve"> P10C merchant editing, Vesko staging, or production-readiness claims.</w:t>
+      </w:r>
+    </w:p>
+    <w:p>
+      <w:pPr>
+        <w:pStyle w:val="Heading2"/>
+        <w:keepNext/>
+        <w:widowControl/>
+      </w:pPr>
+      <w:r>
+        <w:rPr>
+          <w:rFonts w:ascii="Calibri" w:hAnsi="Calibri" w:cs="Calibri"/>
+        </w:rPr>
+        <w:t>P10C — Storefront Studio Editing Experience v1</w:t>
       </w:r>
     </w:p>
     <w:p>
@@ -14118,7 +13128,7 @@
         <w:rPr>
           <w:rFonts w:ascii="Calibri" w:hAnsi="Calibri" w:cs="Calibri"/>
         </w:rPr>
-        <w:t>P10C-07 — Unified AI/manual history</w:t>
+        <w:t>P10C-01 — Brand asset library</w:t>
       </w:r>
     </w:p>
     <w:p>
@@ -14142,7 +13152,7 @@
         <w:rPr>
           <w:rFonts w:ascii="Calibri" w:hAnsi="Calibri" w:cs="Calibri"/>
         </w:rPr>
-        <w:t xml:space="preserve"> Put manual and accepted AI operations into one atomic canonical undo/redo history.</w:t>
+        <w:t xml:space="preserve"> Let merchants view and choose approved presentation assets in Storefront Studio.</w:t>
       </w:r>
     </w:p>
     <w:p>
@@ -14204,7 +13214,7 @@
         <w:rPr>
           <w:rFonts w:ascii="Calibri" w:hAnsi="Calibri" w:cs="Calibri"/>
         </w:rPr>
-        <w:t xml:space="preserve"> P10C-05, P10C-06.</w:t>
+        <w:t xml:space="preserve"> P10B asset authority.</w:t>
       </w:r>
     </w:p>
     <w:p>
@@ -14252,7 +13262,7 @@
         <w:rPr>
           <w:rFonts w:ascii="Calibri" w:hAnsi="Calibri" w:cs="Calibri"/>
         </w:rPr>
-        <w:t xml:space="preserve"> Mixed edits, undo/redo, save/reload, stale protection.</w:t>
+        <w:t xml:space="preserve"> Contract, integration, browser/E2E.</w:t>
       </w:r>
     </w:p>
     <w:p>
@@ -14276,7 +13286,7 @@
         <w:rPr>
           <w:rFonts w:ascii="Calibri" w:hAnsi="Calibri" w:cs="Calibri"/>
         </w:rPr>
-        <w:t xml:space="preserve"> A Puck-only or AI-only history.</w:t>
+        <w:t xml:space="preserve"> Product-media replacement or generic DAM scope.</w:t>
       </w:r>
     </w:p>
     <w:p>
@@ -14289,7 +13299,7 @@
         <w:rPr>
           <w:rFonts w:ascii="Calibri" w:hAnsi="Calibri" w:cs="Calibri"/>
         </w:rPr>
-        <w:t>P10C-08 — Brand and asset editor with Studio shell</w:t>
+        <w:t>P10C-02 — Asset roles and provenance</w:t>
       </w:r>
     </w:p>
     <w:p>
@@ -14313,7 +13323,7 @@
         <w:rPr>
           <w:rFonts w:ascii="Calibri" w:hAnsi="Calibri" w:cs="Calibri"/>
         </w:rPr>
-        <w:t xml:space="preserve"> Deliver the merchant shell subset required to operate assets, canvas, review, save, preview, and publish.</w:t>
+        <w:t xml:space="preserve"> Show and preserve role, source, approval, revision, and assignment authority.</w:t>
       </w:r>
     </w:p>
     <w:p>
@@ -14375,7 +13385,7 @@
         <w:rPr>
           <w:rFonts w:ascii="Calibri" w:hAnsi="Calibri" w:cs="Calibri"/>
         </w:rPr>
-        <w:t xml:space="preserve"> P10C-01 through P10C-07.</w:t>
+        <w:t xml:space="preserve"> P10C-01.</w:t>
       </w:r>
     </w:p>
     <w:p>
@@ -14423,7 +13433,7 @@
         <w:rPr>
           <w:rFonts w:ascii="Calibri" w:hAnsi="Calibri" w:cs="Calibri"/>
         </w:rPr>
-        <w:t xml:space="preserve"> Default/loading/empty/error/stale/success/unsaved states, accessibility, responsive browser/E2E.</w:t>
+        <w:t xml:space="preserve"> Valid assignment and stale/unknown/role-mismatch rejection.</w:t>
       </w:r>
     </w:p>
     <w:p>
@@ -14447,7 +13457,7 @@
         <w:rPr>
           <w:rFonts w:ascii="Calibri" w:hAnsi="Calibri" w:cs="Calibri"/>
         </w:rPr>
-        <w:t xml:space="preserve"> Full CMS or exposure of implementation internals.</w:t>
+        <w:t xml:space="preserve"> Untyped uploads or hidden provenance.</w:t>
       </w:r>
     </w:p>
     <w:p>
@@ -14460,6 +13470,1046 @@
         <w:rPr>
           <w:rFonts w:ascii="Calibri" w:hAnsi="Calibri" w:cs="Calibri"/>
         </w:rPr>
+        <w:t>P10C-03 — Canonical Puck boundary</w:t>
+      </w:r>
+    </w:p>
+    <w:p>
+      <w:pPr>
+        <w:pStyle w:val="Normal"/>
+        <w:numPr>
+          <w:ilvl w:val="0"/>
+          <w:numId w:val="1"/>
+        </w:numPr>
+        <w:widowControl/>
+      </w:pPr>
+      <w:r>
+        <w:rPr>
+          <w:rFonts w:ascii="Calibri" w:hAnsi="Calibri" w:cs="Calibri"/>
+          <w:b/>
+          <w:bCs/>
+        </w:rPr>
+        <w:t>Outcome:</w:t>
+      </w:r>
+      <w:r>
+        <w:rPr>
+          <w:rFonts w:ascii="Calibri" w:hAnsi="Calibri" w:cs="Calibri"/>
+        </w:rPr>
+        <w:t xml:space="preserve"> Project registered canonical content into Puck and validate edits back into the same </w:t>
+      </w:r>
+      <w:r>
+        <w:rPr>
+          <w:rFonts w:ascii="Consolas" w:hAnsi="Consolas" w:cs="Consolas"/>
+          <w:sz w:val="19"/>
+          <w:szCs w:val="19"/>
+        </w:rPr>
+        <w:t>StorefrontSnapshot</w:t>
+      </w:r>
+      <w:r>
+        <w:rPr>
+          <w:rFonts w:ascii="Calibri" w:hAnsi="Calibri" w:cs="Calibri"/>
+        </w:rPr>
+        <w:t>.</w:t>
+      </w:r>
+    </w:p>
+    <w:p>
+      <w:pPr>
+        <w:pStyle w:val="Normal"/>
+        <w:numPr>
+          <w:ilvl w:val="0"/>
+          <w:numId w:val="1"/>
+        </w:numPr>
+        <w:widowControl/>
+      </w:pPr>
+      <w:r>
+        <w:rPr>
+          <w:rFonts w:ascii="Calibri" w:hAnsi="Calibri" w:cs="Calibri"/>
+          <w:b/>
+          <w:bCs/>
+        </w:rPr>
+        <w:t>Status:</w:t>
+      </w:r>
+      <w:r>
+        <w:rPr>
+          <w:rFonts w:ascii="Calibri" w:hAnsi="Calibri" w:cs="Calibri"/>
+        </w:rPr>
+        <w:t xml:space="preserve"> </w:t>
+      </w:r>
+      <w:r>
+        <w:rPr>
+          <w:rFonts w:ascii="Calibri" w:hAnsi="Calibri" w:cs="Calibri"/>
+          <w:b/>
+          <w:bCs/>
+        </w:rPr>
+        <w:t>Planned</w:t>
+      </w:r>
+      <w:r>
+        <w:rPr>
+          <w:rFonts w:ascii="Calibri" w:hAnsi="Calibri" w:cs="Calibri"/>
+        </w:rPr>
+        <w:t>.</w:t>
+      </w:r>
+    </w:p>
+    <w:p>
+      <w:pPr>
+        <w:pStyle w:val="Normal"/>
+        <w:numPr>
+          <w:ilvl w:val="0"/>
+          <w:numId w:val="1"/>
+        </w:numPr>
+        <w:widowControl/>
+      </w:pPr>
+      <w:r>
+        <w:rPr>
+          <w:rFonts w:ascii="Calibri" w:hAnsi="Calibri" w:cs="Calibri"/>
+          <w:b/>
+          <w:bCs/>
+        </w:rPr>
+        <w:t>Depends on:</w:t>
+      </w:r>
+      <w:r>
+        <w:rPr>
+          <w:rFonts w:ascii="Calibri" w:hAnsi="Calibri" w:cs="Calibri"/>
+        </w:rPr>
+        <w:t xml:space="preserve"> P10B component/profile authority.</w:t>
+      </w:r>
+    </w:p>
+    <w:p>
+      <w:pPr>
+        <w:pStyle w:val="Normal"/>
+        <w:numPr>
+          <w:ilvl w:val="0"/>
+          <w:numId w:val="1"/>
+        </w:numPr>
+        <w:widowControl/>
+      </w:pPr>
+      <w:r>
+        <w:rPr>
+          <w:rFonts w:ascii="Calibri" w:hAnsi="Calibri" w:cs="Calibri"/>
+          <w:b/>
+          <w:bCs/>
+        </w:rPr>
+        <w:t>Done when:</w:t>
+      </w:r>
+      <w:r>
+        <w:rPr>
+          <w:rFonts w:ascii="Calibri" w:hAnsi="Calibri" w:cs="Calibri"/>
+        </w:rPr>
+        <w:t xml:space="preserve"> The stated outcome and required evidence are accepted.</w:t>
+      </w:r>
+    </w:p>
+    <w:p>
+      <w:pPr>
+        <w:pStyle w:val="Normal"/>
+        <w:numPr>
+          <w:ilvl w:val="0"/>
+          <w:numId w:val="1"/>
+        </w:numPr>
+        <w:widowControl/>
+      </w:pPr>
+      <w:r>
+        <w:rPr>
+          <w:rFonts w:ascii="Calibri" w:hAnsi="Calibri" w:cs="Calibri"/>
+          <w:b/>
+          <w:bCs/>
+        </w:rPr>
+        <w:t>Required evidence:</w:t>
+      </w:r>
+      <w:r>
+        <w:rPr>
+          <w:rFonts w:ascii="Calibri" w:hAnsi="Calibri" w:cs="Calibri"/>
+        </w:rPr>
+        <w:t xml:space="preserve"> Adapter conformance and save/reload preservation.</w:t>
+      </w:r>
+    </w:p>
+    <w:p>
+      <w:pPr>
+        <w:pStyle w:val="Normal"/>
+        <w:numPr>
+          <w:ilvl w:val="0"/>
+          <w:numId w:val="1"/>
+        </w:numPr>
+        <w:widowControl/>
+      </w:pPr>
+      <w:r>
+        <w:rPr>
+          <w:rFonts w:ascii="Calibri" w:hAnsi="Calibri" w:cs="Calibri"/>
+          <w:b/>
+          <w:bCs/>
+        </w:rPr>
+        <w:t>Non-goal:</w:t>
+      </w:r>
+      <w:r>
+        <w:rPr>
+          <w:rFonts w:ascii="Calibri" w:hAnsi="Calibri" w:cs="Calibri"/>
+        </w:rPr>
+        <w:t xml:space="preserve"> Raw Puck persistence or a second page tree.</w:t>
+      </w:r>
+    </w:p>
+    <w:p>
+      <w:pPr>
+        <w:pStyle w:val="Heading3"/>
+        <w:keepNext/>
+        <w:widowControl/>
+      </w:pPr>
+      <w:r>
+        <w:rPr>
+          <w:rFonts w:ascii="Calibri" w:hAnsi="Calibri" w:cs="Calibri"/>
+        </w:rPr>
+        <w:t>P10C-04 — Stable frame identity and selection</w:t>
+      </w:r>
+    </w:p>
+    <w:p>
+      <w:pPr>
+        <w:pStyle w:val="Normal"/>
+        <w:numPr>
+          <w:ilvl w:val="0"/>
+          <w:numId w:val="1"/>
+        </w:numPr>
+        <w:widowControl/>
+      </w:pPr>
+      <w:r>
+        <w:rPr>
+          <w:rFonts w:ascii="Calibri" w:hAnsi="Calibri" w:cs="Calibri"/>
+          <w:b/>
+          <w:bCs/>
+        </w:rPr>
+        <w:t>Outcome:</w:t>
+      </w:r>
+      <w:r>
+        <w:rPr>
+          <w:rFonts w:ascii="Calibri" w:hAnsi="Calibri" w:cs="Calibri"/>
+        </w:rPr>
+        <w:t xml:space="preserve"> Select and edit one shared frame consistently from every page context.</w:t>
+      </w:r>
+    </w:p>
+    <w:p>
+      <w:pPr>
+        <w:pStyle w:val="Normal"/>
+        <w:numPr>
+          <w:ilvl w:val="0"/>
+          <w:numId w:val="1"/>
+        </w:numPr>
+        <w:widowControl/>
+      </w:pPr>
+      <w:r>
+        <w:rPr>
+          <w:rFonts w:ascii="Calibri" w:hAnsi="Calibri" w:cs="Calibri"/>
+          <w:b/>
+          <w:bCs/>
+        </w:rPr>
+        <w:t>Status:</w:t>
+      </w:r>
+      <w:r>
+        <w:rPr>
+          <w:rFonts w:ascii="Calibri" w:hAnsi="Calibri" w:cs="Calibri"/>
+        </w:rPr>
+        <w:t xml:space="preserve"> </w:t>
+      </w:r>
+      <w:r>
+        <w:rPr>
+          <w:rFonts w:ascii="Calibri" w:hAnsi="Calibri" w:cs="Calibri"/>
+          <w:b/>
+          <w:bCs/>
+        </w:rPr>
+        <w:t>Planned</w:t>
+      </w:r>
+      <w:r>
+        <w:rPr>
+          <w:rFonts w:ascii="Calibri" w:hAnsi="Calibri" w:cs="Calibri"/>
+        </w:rPr>
+        <w:t>.</w:t>
+      </w:r>
+    </w:p>
+    <w:p>
+      <w:pPr>
+        <w:pStyle w:val="Normal"/>
+        <w:numPr>
+          <w:ilvl w:val="0"/>
+          <w:numId w:val="1"/>
+        </w:numPr>
+        <w:widowControl/>
+      </w:pPr>
+      <w:r>
+        <w:rPr>
+          <w:rFonts w:ascii="Calibri" w:hAnsi="Calibri" w:cs="Calibri"/>
+          <w:b/>
+          <w:bCs/>
+        </w:rPr>
+        <w:t>Depends on:</w:t>
+      </w:r>
+      <w:r>
+        <w:rPr>
+          <w:rFonts w:ascii="Calibri" w:hAnsi="Calibri" w:cs="Calibri"/>
+        </w:rPr>
+        <w:t xml:space="preserve"> P10C-03.</w:t>
+      </w:r>
+    </w:p>
+    <w:p>
+      <w:pPr>
+        <w:pStyle w:val="Normal"/>
+        <w:numPr>
+          <w:ilvl w:val="0"/>
+          <w:numId w:val="1"/>
+        </w:numPr>
+        <w:widowControl/>
+      </w:pPr>
+      <w:r>
+        <w:rPr>
+          <w:rFonts w:ascii="Calibri" w:hAnsi="Calibri" w:cs="Calibri"/>
+          <w:b/>
+          <w:bCs/>
+        </w:rPr>
+        <w:t>Done when:</w:t>
+      </w:r>
+      <w:r>
+        <w:rPr>
+          <w:rFonts w:ascii="Calibri" w:hAnsi="Calibri" w:cs="Calibri"/>
+        </w:rPr>
+        <w:t xml:space="preserve"> The stated outcome and required evidence are accepted.</w:t>
+      </w:r>
+    </w:p>
+    <w:p>
+      <w:pPr>
+        <w:pStyle w:val="Normal"/>
+        <w:numPr>
+          <w:ilvl w:val="0"/>
+          <w:numId w:val="1"/>
+        </w:numPr>
+        <w:widowControl/>
+      </w:pPr>
+      <w:r>
+        <w:rPr>
+          <w:rFonts w:ascii="Calibri" w:hAnsi="Calibri" w:cs="Calibri"/>
+          <w:b/>
+          <w:bCs/>
+        </w:rPr>
+        <w:t>Required evidence:</w:t>
+      </w:r>
+      <w:r>
+        <w:rPr>
+          <w:rFonts w:ascii="Calibri" w:hAnsi="Calibri" w:cs="Calibri"/>
+        </w:rPr>
+        <w:t xml:space="preserve"> Stable identity, scope, history, and browser behavior.</w:t>
+      </w:r>
+    </w:p>
+    <w:p>
+      <w:pPr>
+        <w:pStyle w:val="Normal"/>
+        <w:numPr>
+          <w:ilvl w:val="0"/>
+          <w:numId w:val="1"/>
+        </w:numPr>
+        <w:widowControl/>
+      </w:pPr>
+      <w:r>
+        <w:rPr>
+          <w:rFonts w:ascii="Calibri" w:hAnsi="Calibri" w:cs="Calibri"/>
+          <w:b/>
+          <w:bCs/>
+        </w:rPr>
+        <w:t>Non-goal:</w:t>
+      </w:r>
+      <w:r>
+        <w:rPr>
+          <w:rFonts w:ascii="Calibri" w:hAnsi="Calibri" w:cs="Calibri"/>
+        </w:rPr>
+        <w:t xml:space="preserve"> Duplicating frame state per page.</w:t>
+      </w:r>
+    </w:p>
+    <w:p>
+      <w:pPr>
+        <w:pStyle w:val="Heading3"/>
+        <w:keepNext/>
+        <w:widowControl/>
+      </w:pPr>
+      <w:r>
+        <w:rPr>
+          <w:rFonts w:ascii="Calibri" w:hAnsi="Calibri" w:cs="Calibri"/>
+        </w:rPr>
+        <w:t>P10C-05 — Approved manual frame operations</w:t>
+      </w:r>
+    </w:p>
+    <w:p>
+      <w:pPr>
+        <w:pStyle w:val="Normal"/>
+        <w:numPr>
+          <w:ilvl w:val="0"/>
+          <w:numId w:val="1"/>
+        </w:numPr>
+        <w:widowControl/>
+      </w:pPr>
+      <w:r>
+        <w:rPr>
+          <w:rFonts w:ascii="Calibri" w:hAnsi="Calibri" w:cs="Calibri"/>
+          <w:b/>
+          <w:bCs/>
+        </w:rPr>
+        <w:t>Outcome:</w:t>
+      </w:r>
+      <w:r>
+        <w:rPr>
+          <w:rFonts w:ascii="Calibri" w:hAnsi="Calibri" w:cs="Calibri"/>
+        </w:rPr>
+        <w:t xml:space="preserve"> Support bounded manual shared-frame add, remove, reorder, field, asset, and presentation operations.</w:t>
+      </w:r>
+    </w:p>
+    <w:p>
+      <w:pPr>
+        <w:pStyle w:val="Normal"/>
+        <w:numPr>
+          <w:ilvl w:val="0"/>
+          <w:numId w:val="1"/>
+        </w:numPr>
+        <w:widowControl/>
+      </w:pPr>
+      <w:r>
+        <w:rPr>
+          <w:rFonts w:ascii="Calibri" w:hAnsi="Calibri" w:cs="Calibri"/>
+          <w:b/>
+          <w:bCs/>
+        </w:rPr>
+        <w:t>Status:</w:t>
+      </w:r>
+      <w:r>
+        <w:rPr>
+          <w:rFonts w:ascii="Calibri" w:hAnsi="Calibri" w:cs="Calibri"/>
+        </w:rPr>
+        <w:t xml:space="preserve"> </w:t>
+      </w:r>
+      <w:r>
+        <w:rPr>
+          <w:rFonts w:ascii="Calibri" w:hAnsi="Calibri" w:cs="Calibri"/>
+          <w:b/>
+          <w:bCs/>
+        </w:rPr>
+        <w:t>Planned</w:t>
+      </w:r>
+      <w:r>
+        <w:rPr>
+          <w:rFonts w:ascii="Calibri" w:hAnsi="Calibri" w:cs="Calibri"/>
+        </w:rPr>
+        <w:t>.</w:t>
+      </w:r>
+    </w:p>
+    <w:p>
+      <w:pPr>
+        <w:pStyle w:val="Normal"/>
+        <w:numPr>
+          <w:ilvl w:val="0"/>
+          <w:numId w:val="1"/>
+        </w:numPr>
+        <w:widowControl/>
+      </w:pPr>
+      <w:r>
+        <w:rPr>
+          <w:rFonts w:ascii="Calibri" w:hAnsi="Calibri" w:cs="Calibri"/>
+          <w:b/>
+          <w:bCs/>
+        </w:rPr>
+        <w:t>Depends on:</w:t>
+      </w:r>
+      <w:r>
+        <w:rPr>
+          <w:rFonts w:ascii="Calibri" w:hAnsi="Calibri" w:cs="Calibri"/>
+        </w:rPr>
+        <w:t xml:space="preserve"> P10C-02 through P10C-04.</w:t>
+      </w:r>
+    </w:p>
+    <w:p>
+      <w:pPr>
+        <w:pStyle w:val="Normal"/>
+        <w:numPr>
+          <w:ilvl w:val="0"/>
+          <w:numId w:val="1"/>
+        </w:numPr>
+        <w:widowControl/>
+      </w:pPr>
+      <w:r>
+        <w:rPr>
+          <w:rFonts w:ascii="Calibri" w:hAnsi="Calibri" w:cs="Calibri"/>
+          <w:b/>
+          <w:bCs/>
+        </w:rPr>
+        <w:t>Done when:</w:t>
+      </w:r>
+      <w:r>
+        <w:rPr>
+          <w:rFonts w:ascii="Calibri" w:hAnsi="Calibri" w:cs="Calibri"/>
+        </w:rPr>
+        <w:t xml:space="preserve"> The stated outcome and required evidence are accepted.</w:t>
+      </w:r>
+    </w:p>
+    <w:p>
+      <w:pPr>
+        <w:pStyle w:val="Normal"/>
+        <w:numPr>
+          <w:ilvl w:val="0"/>
+          <w:numId w:val="1"/>
+        </w:numPr>
+        <w:widowControl/>
+      </w:pPr>
+      <w:r>
+        <w:rPr>
+          <w:rFonts w:ascii="Calibri" w:hAnsi="Calibri" w:cs="Calibri"/>
+          <w:b/>
+          <w:bCs/>
+        </w:rPr>
+        <w:t>Required evidence:</w:t>
+      </w:r>
+      <w:r>
+        <w:rPr>
+          <w:rFonts w:ascii="Calibri" w:hAnsi="Calibri" w:cs="Calibri"/>
+        </w:rPr>
+        <w:t xml:space="preserve"> Positive and fail-closed integration, undo/redo, browser/E2E.</w:t>
+      </w:r>
+    </w:p>
+    <w:p>
+      <w:pPr>
+        <w:pStyle w:val="Normal"/>
+        <w:numPr>
+          <w:ilvl w:val="0"/>
+          <w:numId w:val="1"/>
+        </w:numPr>
+        <w:widowControl/>
+      </w:pPr>
+      <w:r>
+        <w:rPr>
+          <w:rFonts w:ascii="Calibri" w:hAnsi="Calibri" w:cs="Calibri"/>
+          <w:b/>
+          <w:bCs/>
+        </w:rPr>
+        <w:t>Non-goal:</w:t>
+      </w:r>
+      <w:r>
+        <w:rPr>
+          <w:rFonts w:ascii="Calibri" w:hAnsi="Calibri" w:cs="Calibri"/>
+        </w:rPr>
+        <w:t xml:space="preserve"> Arbitrary code/CSS/components or commerce mutation.</w:t>
+      </w:r>
+    </w:p>
+    <w:p>
+      <w:pPr>
+        <w:pStyle w:val="Heading3"/>
+        <w:keepNext/>
+        <w:widowControl/>
+      </w:pPr>
+      <w:r>
+        <w:rPr>
+          <w:rFonts w:ascii="Calibri" w:hAnsi="Calibri" w:cs="Calibri"/>
+        </w:rPr>
+        <w:t>P10C-06 — Scoped AI editing</w:t>
+      </w:r>
+    </w:p>
+    <w:p>
+      <w:pPr>
+        <w:pStyle w:val="Normal"/>
+        <w:numPr>
+          <w:ilvl w:val="0"/>
+          <w:numId w:val="1"/>
+        </w:numPr>
+        <w:widowControl/>
+      </w:pPr>
+      <w:r>
+        <w:rPr>
+          <w:rFonts w:ascii="Calibri" w:hAnsi="Calibri" w:cs="Calibri"/>
+          <w:b/>
+          <w:bCs/>
+        </w:rPr>
+        <w:t>Outcome:</w:t>
+      </w:r>
+      <w:r>
+        <w:rPr>
+          <w:rFonts w:ascii="Calibri" w:hAnsi="Calibri" w:cs="Calibri"/>
+        </w:rPr>
+        <w:t xml:space="preserve"> Connect merchant routing, clarification, frame/page scope, and proposal review to the existing P10A governed authorities.</w:t>
+      </w:r>
+    </w:p>
+    <w:p>
+      <w:pPr>
+        <w:pStyle w:val="Normal"/>
+        <w:numPr>
+          <w:ilvl w:val="0"/>
+          <w:numId w:val="1"/>
+        </w:numPr>
+        <w:widowControl/>
+      </w:pPr>
+      <w:r>
+        <w:rPr>
+          <w:rFonts w:ascii="Calibri" w:hAnsi="Calibri" w:cs="Calibri"/>
+          <w:b/>
+          <w:bCs/>
+        </w:rPr>
+        <w:t>Status:</w:t>
+      </w:r>
+      <w:r>
+        <w:rPr>
+          <w:rFonts w:ascii="Calibri" w:hAnsi="Calibri" w:cs="Calibri"/>
+        </w:rPr>
+        <w:t xml:space="preserve"> </w:t>
+      </w:r>
+      <w:r>
+        <w:rPr>
+          <w:rFonts w:ascii="Calibri" w:hAnsi="Calibri" w:cs="Calibri"/>
+          <w:b/>
+          <w:bCs/>
+        </w:rPr>
+        <w:t>Planned</w:t>
+      </w:r>
+      <w:r>
+        <w:rPr>
+          <w:rFonts w:ascii="Calibri" w:hAnsi="Calibri" w:cs="Calibri"/>
+        </w:rPr>
+        <w:t>.</w:t>
+      </w:r>
+    </w:p>
+    <w:p>
+      <w:pPr>
+        <w:pStyle w:val="Normal"/>
+        <w:numPr>
+          <w:ilvl w:val="0"/>
+          <w:numId w:val="1"/>
+        </w:numPr>
+        <w:widowControl/>
+      </w:pPr>
+      <w:r>
+        <w:rPr>
+          <w:rFonts w:ascii="Calibri" w:hAnsi="Calibri" w:cs="Calibri"/>
+          <w:b/>
+          <w:bCs/>
+        </w:rPr>
+        <w:t>Depends on:</w:t>
+      </w:r>
+      <w:r>
+        <w:rPr>
+          <w:rFonts w:ascii="Calibri" w:hAnsi="Calibri" w:cs="Calibri"/>
+        </w:rPr>
+        <w:t xml:space="preserve"> P10C-03 through P10C-05 and P10A internal router/packages.</w:t>
+      </w:r>
+    </w:p>
+    <w:p>
+      <w:pPr>
+        <w:pStyle w:val="Normal"/>
+        <w:numPr>
+          <w:ilvl w:val="0"/>
+          <w:numId w:val="1"/>
+        </w:numPr>
+        <w:widowControl/>
+      </w:pPr>
+      <w:r>
+        <w:rPr>
+          <w:rFonts w:ascii="Calibri" w:hAnsi="Calibri" w:cs="Calibri"/>
+          <w:b/>
+          <w:bCs/>
+        </w:rPr>
+        <w:t>Done when:</w:t>
+      </w:r>
+      <w:r>
+        <w:rPr>
+          <w:rFonts w:ascii="Calibri" w:hAnsi="Calibri" w:cs="Calibri"/>
+        </w:rPr>
+        <w:t xml:space="preserve"> The stated outcome and required evidence are accepted.</w:t>
+      </w:r>
+    </w:p>
+    <w:p>
+      <w:pPr>
+        <w:pStyle w:val="Normal"/>
+        <w:numPr>
+          <w:ilvl w:val="0"/>
+          <w:numId w:val="1"/>
+        </w:numPr>
+        <w:widowControl/>
+      </w:pPr>
+      <w:r>
+        <w:rPr>
+          <w:rFonts w:ascii="Calibri" w:hAnsi="Calibri" w:cs="Calibri"/>
+          <w:b/>
+          <w:bCs/>
+        </w:rPr>
+        <w:t>Required evidence:</w:t>
+      </w:r>
+      <w:r>
+        <w:rPr>
+          <w:rFonts w:ascii="Calibri" w:hAnsi="Calibri" w:cs="Calibri"/>
+        </w:rPr>
+        <w:t xml:space="preserve"> Selected-section, frame, page, storefront, ambiguity, stale, and failure browser flows.</w:t>
+      </w:r>
+    </w:p>
+    <w:p>
+      <w:pPr>
+        <w:pStyle w:val="Normal"/>
+        <w:numPr>
+          <w:ilvl w:val="0"/>
+          <w:numId w:val="1"/>
+        </w:numPr>
+        <w:widowControl/>
+      </w:pPr>
+      <w:r>
+        <w:rPr>
+          <w:rFonts w:ascii="Calibri" w:hAnsi="Calibri" w:cs="Calibri"/>
+          <w:b/>
+          <w:bCs/>
+        </w:rPr>
+        <w:t>Non-goal:</w:t>
+      </w:r>
+      <w:r>
+        <w:rPr>
+          <w:rFonts w:ascii="Calibri" w:hAnsi="Calibri" w:cs="Calibri"/>
+        </w:rPr>
+        <w:t xml:space="preserve"> Rebuilding the router, packages, proposals, or provider boundary.</w:t>
+      </w:r>
+    </w:p>
+    <w:p>
+      <w:pPr>
+        <w:pStyle w:val="Heading3"/>
+        <w:keepNext/>
+        <w:widowControl/>
+      </w:pPr>
+      <w:r>
+        <w:rPr>
+          <w:rFonts w:ascii="Calibri" w:hAnsi="Calibri" w:cs="Calibri"/>
+        </w:rPr>
+        <w:t>P10C-07 — Unified AI/manual history</w:t>
+      </w:r>
+    </w:p>
+    <w:p>
+      <w:pPr>
+        <w:pStyle w:val="Normal"/>
+        <w:numPr>
+          <w:ilvl w:val="0"/>
+          <w:numId w:val="1"/>
+        </w:numPr>
+        <w:widowControl/>
+      </w:pPr>
+      <w:r>
+        <w:rPr>
+          <w:rFonts w:ascii="Calibri" w:hAnsi="Calibri" w:cs="Calibri"/>
+          <w:b/>
+          <w:bCs/>
+        </w:rPr>
+        <w:t>Outcome:</w:t>
+      </w:r>
+      <w:r>
+        <w:rPr>
+          <w:rFonts w:ascii="Calibri" w:hAnsi="Calibri" w:cs="Calibri"/>
+        </w:rPr>
+        <w:t xml:space="preserve"> Put manual and accepted AI operations into one atomic canonical undo/redo history.</w:t>
+      </w:r>
+    </w:p>
+    <w:p>
+      <w:pPr>
+        <w:pStyle w:val="Normal"/>
+        <w:numPr>
+          <w:ilvl w:val="0"/>
+          <w:numId w:val="1"/>
+        </w:numPr>
+        <w:widowControl/>
+      </w:pPr>
+      <w:r>
+        <w:rPr>
+          <w:rFonts w:ascii="Calibri" w:hAnsi="Calibri" w:cs="Calibri"/>
+          <w:b/>
+          <w:bCs/>
+        </w:rPr>
+        <w:t>Status:</w:t>
+      </w:r>
+      <w:r>
+        <w:rPr>
+          <w:rFonts w:ascii="Calibri" w:hAnsi="Calibri" w:cs="Calibri"/>
+        </w:rPr>
+        <w:t xml:space="preserve"> </w:t>
+      </w:r>
+      <w:r>
+        <w:rPr>
+          <w:rFonts w:ascii="Calibri" w:hAnsi="Calibri" w:cs="Calibri"/>
+          <w:b/>
+          <w:bCs/>
+        </w:rPr>
+        <w:t>Planned</w:t>
+      </w:r>
+      <w:r>
+        <w:rPr>
+          <w:rFonts w:ascii="Calibri" w:hAnsi="Calibri" w:cs="Calibri"/>
+        </w:rPr>
+        <w:t>.</w:t>
+      </w:r>
+    </w:p>
+    <w:p>
+      <w:pPr>
+        <w:pStyle w:val="Normal"/>
+        <w:numPr>
+          <w:ilvl w:val="0"/>
+          <w:numId w:val="1"/>
+        </w:numPr>
+        <w:widowControl/>
+      </w:pPr>
+      <w:r>
+        <w:rPr>
+          <w:rFonts w:ascii="Calibri" w:hAnsi="Calibri" w:cs="Calibri"/>
+          <w:b/>
+          <w:bCs/>
+        </w:rPr>
+        <w:t>Depends on:</w:t>
+      </w:r>
+      <w:r>
+        <w:rPr>
+          <w:rFonts w:ascii="Calibri" w:hAnsi="Calibri" w:cs="Calibri"/>
+        </w:rPr>
+        <w:t xml:space="preserve"> P10C-05, P10C-06.</w:t>
+      </w:r>
+    </w:p>
+    <w:p>
+      <w:pPr>
+        <w:pStyle w:val="Normal"/>
+        <w:numPr>
+          <w:ilvl w:val="0"/>
+          <w:numId w:val="1"/>
+        </w:numPr>
+        <w:widowControl/>
+      </w:pPr>
+      <w:r>
+        <w:rPr>
+          <w:rFonts w:ascii="Calibri" w:hAnsi="Calibri" w:cs="Calibri"/>
+          <w:b/>
+          <w:bCs/>
+        </w:rPr>
+        <w:t>Done when:</w:t>
+      </w:r>
+      <w:r>
+        <w:rPr>
+          <w:rFonts w:ascii="Calibri" w:hAnsi="Calibri" w:cs="Calibri"/>
+        </w:rPr>
+        <w:t xml:space="preserve"> The stated outcome and required evidence are accepted.</w:t>
+      </w:r>
+    </w:p>
+    <w:p>
+      <w:pPr>
+        <w:pStyle w:val="Normal"/>
+        <w:numPr>
+          <w:ilvl w:val="0"/>
+          <w:numId w:val="1"/>
+        </w:numPr>
+        <w:widowControl/>
+      </w:pPr>
+      <w:r>
+        <w:rPr>
+          <w:rFonts w:ascii="Calibri" w:hAnsi="Calibri" w:cs="Calibri"/>
+          <w:b/>
+          <w:bCs/>
+        </w:rPr>
+        <w:t>Required evidence:</w:t>
+      </w:r>
+      <w:r>
+        <w:rPr>
+          <w:rFonts w:ascii="Calibri" w:hAnsi="Calibri" w:cs="Calibri"/>
+        </w:rPr>
+        <w:t xml:space="preserve"> Mixed edits, undo/redo, save/reload, stale protection.</w:t>
+      </w:r>
+    </w:p>
+    <w:p>
+      <w:pPr>
+        <w:pStyle w:val="Normal"/>
+        <w:numPr>
+          <w:ilvl w:val="0"/>
+          <w:numId w:val="1"/>
+        </w:numPr>
+        <w:widowControl/>
+      </w:pPr>
+      <w:r>
+        <w:rPr>
+          <w:rFonts w:ascii="Calibri" w:hAnsi="Calibri" w:cs="Calibri"/>
+          <w:b/>
+          <w:bCs/>
+        </w:rPr>
+        <w:t>Non-goal:</w:t>
+      </w:r>
+      <w:r>
+        <w:rPr>
+          <w:rFonts w:ascii="Calibri" w:hAnsi="Calibri" w:cs="Calibri"/>
+        </w:rPr>
+        <w:t xml:space="preserve"> A Puck-only or AI-only history.</w:t>
+      </w:r>
+    </w:p>
+    <w:p>
+      <w:pPr>
+        <w:pStyle w:val="Heading3"/>
+        <w:keepNext/>
+        <w:widowControl/>
+      </w:pPr>
+      <w:r>
+        <w:rPr>
+          <w:rFonts w:ascii="Calibri" w:hAnsi="Calibri" w:cs="Calibri"/>
+        </w:rPr>
+        <w:t>P10C-08 — Brand and asset editor with Studio shell</w:t>
+      </w:r>
+    </w:p>
+    <w:p>
+      <w:pPr>
+        <w:pStyle w:val="Normal"/>
+        <w:numPr>
+          <w:ilvl w:val="0"/>
+          <w:numId w:val="1"/>
+        </w:numPr>
+        <w:widowControl/>
+      </w:pPr>
+      <w:r>
+        <w:rPr>
+          <w:rFonts w:ascii="Calibri" w:hAnsi="Calibri" w:cs="Calibri"/>
+          <w:b/>
+          <w:bCs/>
+        </w:rPr>
+        <w:t>Outcome:</w:t>
+      </w:r>
+      <w:r>
+        <w:rPr>
+          <w:rFonts w:ascii="Calibri" w:hAnsi="Calibri" w:cs="Calibri"/>
+        </w:rPr>
+        <w:t xml:space="preserve"> Deliver the merchant shell subset required to operate assets, canvas, review, save, preview, and publish.</w:t>
+      </w:r>
+    </w:p>
+    <w:p>
+      <w:pPr>
+        <w:pStyle w:val="Normal"/>
+        <w:numPr>
+          <w:ilvl w:val="0"/>
+          <w:numId w:val="1"/>
+        </w:numPr>
+        <w:widowControl/>
+      </w:pPr>
+      <w:r>
+        <w:rPr>
+          <w:rFonts w:ascii="Calibri" w:hAnsi="Calibri" w:cs="Calibri"/>
+          <w:b/>
+          <w:bCs/>
+        </w:rPr>
+        <w:t>Status:</w:t>
+      </w:r>
+      <w:r>
+        <w:rPr>
+          <w:rFonts w:ascii="Calibri" w:hAnsi="Calibri" w:cs="Calibri"/>
+        </w:rPr>
+        <w:t xml:space="preserve"> </w:t>
+      </w:r>
+      <w:r>
+        <w:rPr>
+          <w:rFonts w:ascii="Calibri" w:hAnsi="Calibri" w:cs="Calibri"/>
+          <w:b/>
+          <w:bCs/>
+        </w:rPr>
+        <w:t>Planned</w:t>
+      </w:r>
+      <w:r>
+        <w:rPr>
+          <w:rFonts w:ascii="Calibri" w:hAnsi="Calibri" w:cs="Calibri"/>
+        </w:rPr>
+        <w:t>.</w:t>
+      </w:r>
+    </w:p>
+    <w:p>
+      <w:pPr>
+        <w:pStyle w:val="Normal"/>
+        <w:numPr>
+          <w:ilvl w:val="0"/>
+          <w:numId w:val="1"/>
+        </w:numPr>
+        <w:widowControl/>
+      </w:pPr>
+      <w:r>
+        <w:rPr>
+          <w:rFonts w:ascii="Calibri" w:hAnsi="Calibri" w:cs="Calibri"/>
+          <w:b/>
+          <w:bCs/>
+        </w:rPr>
+        <w:t>Depends on:</w:t>
+      </w:r>
+      <w:r>
+        <w:rPr>
+          <w:rFonts w:ascii="Calibri" w:hAnsi="Calibri" w:cs="Calibri"/>
+        </w:rPr>
+        <w:t xml:space="preserve"> P10C-01 through P10C-07.</w:t>
+      </w:r>
+    </w:p>
+    <w:p>
+      <w:pPr>
+        <w:pStyle w:val="Normal"/>
+        <w:numPr>
+          <w:ilvl w:val="0"/>
+          <w:numId w:val="1"/>
+        </w:numPr>
+        <w:widowControl/>
+      </w:pPr>
+      <w:r>
+        <w:rPr>
+          <w:rFonts w:ascii="Calibri" w:hAnsi="Calibri" w:cs="Calibri"/>
+          <w:b/>
+          <w:bCs/>
+        </w:rPr>
+        <w:t>Done when:</w:t>
+      </w:r>
+      <w:r>
+        <w:rPr>
+          <w:rFonts w:ascii="Calibri" w:hAnsi="Calibri" w:cs="Calibri"/>
+        </w:rPr>
+        <w:t xml:space="preserve"> The stated outcome and required evidence are accepted.</w:t>
+      </w:r>
+    </w:p>
+    <w:p>
+      <w:pPr>
+        <w:pStyle w:val="Normal"/>
+        <w:numPr>
+          <w:ilvl w:val="0"/>
+          <w:numId w:val="1"/>
+        </w:numPr>
+        <w:widowControl/>
+      </w:pPr>
+      <w:r>
+        <w:rPr>
+          <w:rFonts w:ascii="Calibri" w:hAnsi="Calibri" w:cs="Calibri"/>
+          <w:b/>
+          <w:bCs/>
+        </w:rPr>
+        <w:t>Required evidence:</w:t>
+      </w:r>
+      <w:r>
+        <w:rPr>
+          <w:rFonts w:ascii="Calibri" w:hAnsi="Calibri" w:cs="Calibri"/>
+        </w:rPr>
+        <w:t xml:space="preserve"> Default/loading/empty/error/stale/success/unsaved states, accessibility, responsive browser/E2E.</w:t>
+      </w:r>
+    </w:p>
+    <w:p>
+      <w:pPr>
+        <w:pStyle w:val="Normal"/>
+        <w:numPr>
+          <w:ilvl w:val="0"/>
+          <w:numId w:val="1"/>
+        </w:numPr>
+        <w:widowControl/>
+      </w:pPr>
+      <w:r>
+        <w:rPr>
+          <w:rFonts w:ascii="Calibri" w:hAnsi="Calibri" w:cs="Calibri"/>
+          <w:b/>
+          <w:bCs/>
+        </w:rPr>
+        <w:t>Non-goal:</w:t>
+      </w:r>
+      <w:r>
+        <w:rPr>
+          <w:rFonts w:ascii="Calibri" w:hAnsi="Calibri" w:cs="Calibri"/>
+        </w:rPr>
+        <w:t xml:space="preserve"> Full CMS or exposure of implementation internals.</w:t>
+      </w:r>
+    </w:p>
+    <w:p>
+      <w:pPr>
+        <w:pStyle w:val="Heading3"/>
+        <w:keepNext/>
+        <w:widowControl/>
+      </w:pPr>
+      <w:r>
+        <w:rPr>
+          <w:rFonts w:ascii="Calibri" w:hAnsi="Calibri" w:cs="Calibri"/>
+        </w:rPr>
         <w:t>P10C-09 — Studio commercial QA</w:t>
       </w:r>
     </w:p>
@@ -14964,7 +15014,7 @@
         </w:rPr>
         <w:t xml:space="preserve"> </w:t>
       </w:r>
-      <w:hyperlink r:id="rIdHyperlink14" w:history="1">
+      <w:hyperlink r:id="rIdHyperlink15" w:history="1">
         <w:r>
           <w:rPr>
             <w:rFonts w:ascii="Calibri" w:hAnsi="Calibri" w:cs="Calibri"/>
@@ -14980,7 +15030,7 @@
         </w:rPr>
         <w:t xml:space="preserve"> and </w:t>
       </w:r>
-      <w:hyperlink r:id="rIdHyperlink15" w:history="1">
+      <w:hyperlink r:id="rIdHyperlink16" w:history="1">
         <w:r>
           <w:rPr>
             <w:rFonts w:ascii="Calibri" w:hAnsi="Calibri" w:cs="Calibri"/>

</xml_diff>

<commit_message>
feat: add P10B-12 content and support page families
</commit_message>
<xml_diff>
--- a/docs/VESKIFY_DEVELOPMENT_DELIVERY_TRACKER_v1.3.0.docx
+++ b/docs/VESKIFY_DEVELOPMENT_DELIVERY_TRACKER_v1.3.0.docx
@@ -38,7 +38,7 @@
         <w:rPr>
           <w:rFonts w:ascii="Calibri" w:hAnsi="Calibri" w:cs="Calibri"/>
         </w:rPr>
-        <w:t>Delivery status baseline: 9 August 2026, P10B-06, P10B-07 and P10B-08</w:t>
+        <w:t>Delivery status baseline: 9 August 2026, P10B-09 and P10B-12</w:t>
       </w:r>
     </w:p>
     <w:p>
@@ -245,7 +245,7 @@
               <w:rPr>
                 <w:rFonts w:ascii="Calibri" w:hAnsi="Calibri" w:cs="Calibri"/>
               </w:rPr>
-              <w:t>9 August 2026, P10B-09 commercial homepage profiles</w:t>
+              <w:t>9 August 2026, P10B-12 content and support page families</w:t>
             </w:r>
           </w:p>
         </w:tc>
@@ -4246,7 +4246,7 @@
               <w:rPr>
                 <w:rFonts w:ascii="Calibri" w:hAnsi="Calibri" w:cs="Calibri"/>
               </w:rPr>
-              <w:t>☐</w:t>
+              <w:t>☑</w:t>
             </w:r>
           </w:p>
         </w:tc>
@@ -4303,7 +4303,7 @@
                 <w:b/>
                 <w:bCs/>
               </w:rPr>
-              <w:t>Planned</w:t>
+              <w:t>Baseline</w:t>
             </w:r>
           </w:p>
         </w:tc>
@@ -4357,7 +4357,7 @@
               <w:rPr>
                 <w:rFonts w:ascii="Calibri" w:hAnsi="Calibri" w:cs="Calibri"/>
               </w:rPr>
-              <w:t>Approved-fact provenance, localization, lifecycle and visual review</w:t>
+              <w:t>15 profiles; current approved facts; locale/navigation; save/reload/compiler; 61 zero-provider Chromium checks</w:t>
             </w:r>
           </w:p>
         </w:tc>
@@ -9204,7 +9204,7 @@
         <w:rPr>
           <w:rFonts w:ascii="Calibri" w:hAnsi="Calibri" w:cs="Calibri"/>
         </w:rPr>
-        <w:t xml:space="preserve">. P10B-01 through P10B-09 are </w:t>
+        <w:t xml:space="preserve">. P10B-01 through P10B-09 and P10B-12 are </w:t>
       </w:r>
       <w:r>
         <w:rPr>
@@ -9218,7 +9218,7 @@
         <w:rPr>
           <w:rFonts w:ascii="Calibri" w:hAnsi="Calibri" w:cs="Calibri"/>
         </w:rPr>
-        <w:t xml:space="preserve">. P10B-10 through P10B-18 remain </w:t>
+        <w:t xml:space="preserve">. P10B-10, P10B-11, and P10B-13 through P10B-18 remain </w:t>
       </w:r>
       <w:r>
         <w:rPr>
@@ -11808,7 +11808,7 @@
         <w:rPr>
           <w:rFonts w:ascii="Calibri" w:hAnsi="Calibri" w:cs="Calibri"/>
         </w:rPr>
-        <w:t xml:space="preserve"> Generate About/brand story, Contact/locations, FAQ, shipping/returns, policy, campaign/editorial, and reusable generic content pages.</w:t>
+        <w:t xml:space="preserve"> Generate About/brand story, Contact/locations, FAQ, shipping/returns, policy, campaign/editorial, and reusable generic content pages from current approved facts.</w:t>
       </w:r>
     </w:p>
     <w:p>
@@ -11832,550 +11832,7 @@
         <w:rPr>
           <w:rFonts w:ascii="Calibri" w:hAnsi="Calibri" w:cs="Calibri"/>
         </w:rPr>
-        <w:t xml:space="preserve"> Existing PageBlueprint, content/evidence, localization, navigation, and snapshot contracts.</w:t>
-      </w:r>
-    </w:p>
-    <w:p>
-      <w:pPr>
-        <w:pStyle w:val="Normal"/>
-        <w:numPr>
-          <w:ilvl w:val="0"/>
-          <w:numId w:val="1"/>
-        </w:numPr>
-        <w:widowControl/>
-      </w:pPr>
-      <w:r>
-        <w:rPr>
-          <w:rFonts w:ascii="Calibri" w:hAnsi="Calibri" w:cs="Calibri"/>
-          <w:b/>
-          <w:bCs/>
-        </w:rPr>
-        <w:t>Depends on:</w:t>
-      </w:r>
-      <w:r>
-        <w:rPr>
-          <w:rFonts w:ascii="Calibri" w:hAnsi="Calibri" w:cs="Calibri"/>
-        </w:rPr>
-        <w:t xml:space="preserve"> P10B-03 through P10B-07.</w:t>
-      </w:r>
-    </w:p>
-    <w:p>
-      <w:pPr>
-        <w:pStyle w:val="Normal"/>
-        <w:numPr>
-          <w:ilvl w:val="0"/>
-          <w:numId w:val="1"/>
-        </w:numPr>
-        <w:widowControl/>
-      </w:pPr>
-      <w:r>
-        <w:rPr>
-          <w:rFonts w:ascii="Calibri" w:hAnsi="Calibri" w:cs="Calibri"/>
-          <w:b/>
-          <w:bCs/>
-        </w:rPr>
-        <w:t>Done when:</w:t>
-      </w:r>
-      <w:r>
-        <w:rPr>
-          <w:rFonts w:ascii="Calibri" w:hAnsi="Calibri" w:cs="Calibri"/>
-        </w:rPr>
-        <w:t xml:space="preserve"> Every named family has registered profiles and approved-fact provenance, localization, navigation reachability, omission/fallback, responsive output, snapshot preservation, and publication; major types have multiple compositions where commercially useful.</w:t>
-      </w:r>
-    </w:p>
-    <w:p>
-      <w:pPr>
-        <w:pStyle w:val="Normal"/>
-        <w:numPr>
-          <w:ilvl w:val="0"/>
-          <w:numId w:val="1"/>
-        </w:numPr>
-        <w:widowControl/>
-      </w:pPr>
-      <w:r>
-        <w:rPr>
-          <w:rFonts w:ascii="Calibri" w:hAnsi="Calibri" w:cs="Calibri"/>
-          <w:b/>
-          <w:bCs/>
-        </w:rPr>
-        <w:t>Fail closed:</w:t>
-      </w:r>
-      <w:r>
-        <w:rPr>
-          <w:rFonts w:ascii="Calibri" w:hAnsi="Calibri" w:cs="Calibri"/>
-        </w:rPr>
-        <w:t xml:space="preserve"> Fabricated locations, policies, certifications, guarantees, delivery, compliance, and service claims are rejected or omitted through registered rules.</w:t>
-      </w:r>
-    </w:p>
-    <w:p>
-      <w:pPr>
-        <w:pStyle w:val="Normal"/>
-        <w:numPr>
-          <w:ilvl w:val="0"/>
-          <w:numId w:val="1"/>
-        </w:numPr>
-        <w:widowControl/>
-      </w:pPr>
-      <w:r>
-        <w:rPr>
-          <w:rFonts w:ascii="Calibri" w:hAnsi="Calibri" w:cs="Calibri"/>
-          <w:b/>
-          <w:bCs/>
-        </w:rPr>
-        <w:t>Evidence:</w:t>
-      </w:r>
-      <w:r>
-        <w:rPr>
-          <w:rFonts w:ascii="Calibri" w:hAnsi="Calibri" w:cs="Calibri"/>
-        </w:rPr>
-        <w:t xml:space="preserve"> Contract/profile, evidence/provenance, generation/lifecycle, localization, responsive/a11y, and retained visual evidence.</w:t>
-      </w:r>
-    </w:p>
-    <w:p>
-      <w:pPr>
-        <w:pStyle w:val="Normal"/>
-        <w:numPr>
-          <w:ilvl w:val="0"/>
-          <w:numId w:val="1"/>
-        </w:numPr>
-        <w:widowControl/>
-      </w:pPr>
-      <w:r>
-        <w:rPr>
-          <w:rFonts w:ascii="Calibri" w:hAnsi="Calibri" w:cs="Calibri"/>
-          <w:b/>
-          <w:bCs/>
-        </w:rPr>
-        <w:t>Non-goal:</w:t>
-      </w:r>
-      <w:r>
-        <w:rPr>
-          <w:rFonts w:ascii="Calibri" w:hAnsi="Calibri" w:cs="Calibri"/>
-        </w:rPr>
-        <w:t xml:space="preserve"> Unrestricted CMS or legal-content generation.</w:t>
-      </w:r>
-    </w:p>
-    <w:p>
-      <w:pPr>
-        <w:pStyle w:val="Heading3"/>
-        <w:keepNext/>
-        <w:widowControl/>
-      </w:pPr>
-      <w:r>
-        <w:rPr>
-          <w:rFonts w:ascii="Calibri" w:hAnsi="Calibri" w:cs="Calibri"/>
-        </w:rPr>
-        <w:t>P10B-13 — Commerce utility presentation pages</w:t>
-      </w:r>
-    </w:p>
-    <w:p>
-      <w:pPr>
-        <w:pStyle w:val="Normal"/>
-        <w:numPr>
-          <w:ilvl w:val="0"/>
-          <w:numId w:val="1"/>
-        </w:numPr>
-        <w:widowControl/>
-      </w:pPr>
-      <w:r>
-        <w:rPr>
-          <w:rFonts w:ascii="Calibri" w:hAnsi="Calibri" w:cs="Calibri"/>
-          <w:b/>
-          <w:bCs/>
-        </w:rPr>
-        <w:t>Outcome:</w:t>
-      </w:r>
-      <w:r>
-        <w:rPr>
-          <w:rFonts w:ascii="Calibri" w:hAnsi="Calibri" w:cs="Calibri"/>
-        </w:rPr>
-        <w:t xml:space="preserve"> Deliver governed search/no-results, cart, checkout, empty, error, and 404 presentation.</w:t>
-      </w:r>
-    </w:p>
-    <w:p>
-      <w:pPr>
-        <w:pStyle w:val="Normal"/>
-        <w:numPr>
-          <w:ilvl w:val="0"/>
-          <w:numId w:val="1"/>
-        </w:numPr>
-        <w:widowControl/>
-      </w:pPr>
-      <w:r>
-        <w:rPr>
-          <w:rFonts w:ascii="Calibri" w:hAnsi="Calibri" w:cs="Calibri"/>
-          <w:b/>
-          <w:bCs/>
-        </w:rPr>
-        <w:t>Authority:</w:t>
-      </w:r>
-      <w:r>
-        <w:rPr>
-          <w:rFonts w:ascii="Calibri" w:hAnsi="Calibri" w:cs="Calibri"/>
-        </w:rPr>
-        <w:t xml:space="preserve"> Existing page/profile, shared frame, canonical commerce projection, and operational adapter seams.</w:t>
-      </w:r>
-    </w:p>
-    <w:p>
-      <w:pPr>
-        <w:pStyle w:val="Normal"/>
-        <w:numPr>
-          <w:ilvl w:val="0"/>
-          <w:numId w:val="1"/>
-        </w:numPr>
-        <w:widowControl/>
-      </w:pPr>
-      <w:r>
-        <w:rPr>
-          <w:rFonts w:ascii="Calibri" w:hAnsi="Calibri" w:cs="Calibri"/>
-          <w:b/>
-          <w:bCs/>
-        </w:rPr>
-        <w:t>Depends on:</w:t>
-      </w:r>
-      <w:r>
-        <w:rPr>
-          <w:rFonts w:ascii="Calibri" w:hAnsi="Calibri" w:cs="Calibri"/>
-        </w:rPr>
-        <w:t xml:space="preserve"> P10B-03, P10B-05, P10B-06, P10B-08.</w:t>
-      </w:r>
-    </w:p>
-    <w:p>
-      <w:pPr>
-        <w:pStyle w:val="Normal"/>
-        <w:numPr>
-          <w:ilvl w:val="0"/>
-          <w:numId w:val="1"/>
-        </w:numPr>
-        <w:widowControl/>
-      </w:pPr>
-      <w:r>
-        <w:rPr>
-          <w:rFonts w:ascii="Calibri" w:hAnsi="Calibri" w:cs="Calibri"/>
-          <w:b/>
-          <w:bCs/>
-        </w:rPr>
-        <w:t>Done when:</w:t>
-      </w:r>
-      <w:r>
-        <w:rPr>
-          <w:rFonts w:ascii="Calibri" w:hAnsi="Calibri" w:cs="Calibri"/>
-        </w:rPr>
-        <w:t xml:space="preserve"> Every state presents canonical facts/actions with coherent Design DNA/frame, useful empty/error behavior, complete page-set reachability, responsive accessibility, snapshot, and publication preservation.</w:t>
-      </w:r>
-    </w:p>
-    <w:p>
-      <w:pPr>
-        <w:pStyle w:val="Normal"/>
-        <w:numPr>
-          <w:ilvl w:val="0"/>
-          <w:numId w:val="1"/>
-        </w:numPr>
-        <w:widowControl/>
-      </w:pPr>
-      <w:r>
-        <w:rPr>
-          <w:rFonts w:ascii="Calibri" w:hAnsi="Calibri" w:cs="Calibri"/>
-          <w:b/>
-          <w:bCs/>
-        </w:rPr>
-        <w:t>Fail closed:</w:t>
-      </w:r>
-      <w:r>
-        <w:rPr>
-          <w:rFonts w:ascii="Calibri" w:hAnsi="Calibri" w:cs="Calibri"/>
-        </w:rPr>
-        <w:t xml:space="preserve"> Local commerce operations/writes, invented totals or availability, unsupported actions, and executable payment/checkout behavior outside Vesko adapters are rejected.</w:t>
-      </w:r>
-    </w:p>
-    <w:p>
-      <w:pPr>
-        <w:pStyle w:val="Normal"/>
-        <w:numPr>
-          <w:ilvl w:val="0"/>
-          <w:numId w:val="1"/>
-        </w:numPr>
-        <w:widowControl/>
-      </w:pPr>
-      <w:r>
-        <w:rPr>
-          <w:rFonts w:ascii="Calibri" w:hAnsi="Calibri" w:cs="Calibri"/>
-          <w:b/>
-          <w:bCs/>
-        </w:rPr>
-        <w:t>Evidence:</w:t>
-      </w:r>
-      <w:r>
-        <w:rPr>
-          <w:rFonts w:ascii="Calibri" w:hAnsi="Calibri" w:cs="Calibri"/>
-        </w:rPr>
-        <w:t xml:space="preserve"> Contract/integration, adapter-boundary, state matrix, responsive/a11y browser, and retained visual evidence.</w:t>
-      </w:r>
-    </w:p>
-    <w:p>
-      <w:pPr>
-        <w:pStyle w:val="Normal"/>
-        <w:numPr>
-          <w:ilvl w:val="0"/>
-          <w:numId w:val="1"/>
-        </w:numPr>
-        <w:widowControl/>
-      </w:pPr>
-      <w:r>
-        <w:rPr>
-          <w:rFonts w:ascii="Calibri" w:hAnsi="Calibri" w:cs="Calibri"/>
-          <w:b/>
-          <w:bCs/>
-        </w:rPr>
-        <w:t>Non-goal:</w:t>
-      </w:r>
-      <w:r>
-        <w:rPr>
-          <w:rFonts w:ascii="Calibri" w:hAnsi="Calibri" w:cs="Calibri"/>
-        </w:rPr>
-        <w:t xml:space="preserve"> Owning cart, checkout, payment, order, tax, shipping, or returns operations.</w:t>
-      </w:r>
-    </w:p>
-    <w:p>
-      <w:pPr>
-        <w:pStyle w:val="Heading3"/>
-        <w:keepNext/>
-        <w:widowControl/>
-      </w:pPr>
-      <w:r>
-        <w:rPr>
-          <w:rFonts w:ascii="Calibri" w:hAnsi="Calibri" w:cs="Calibri"/>
-        </w:rPr>
-        <w:t>P10B-14 — Premium Editorial complete-storefront vertical slice</w:t>
-      </w:r>
-    </w:p>
-    <w:p>
-      <w:pPr>
-        <w:pStyle w:val="Normal"/>
-        <w:numPr>
-          <w:ilvl w:val="0"/>
-          <w:numId w:val="1"/>
-        </w:numPr>
-        <w:widowControl/>
-      </w:pPr>
-      <w:r>
-        <w:rPr>
-          <w:rFonts w:ascii="Calibri" w:hAnsi="Calibri" w:cs="Calibri"/>
-          <w:b/>
-          <w:bCs/>
-        </w:rPr>
-        <w:t>Outcome:</w:t>
-      </w:r>
-      <w:r>
-        <w:rPr>
-          <w:rFonts w:ascii="Calibri" w:hAnsi="Calibri" w:cs="Calibri"/>
-        </w:rPr>
-        <w:t xml:space="preserve"> Prove one commercially credible complete multi-page storefront early.</w:t>
-      </w:r>
-    </w:p>
-    <w:p>
-      <w:pPr>
-        <w:pStyle w:val="Normal"/>
-        <w:numPr>
-          <w:ilvl w:val="0"/>
-          <w:numId w:val="1"/>
-        </w:numPr>
-        <w:widowControl/>
-      </w:pPr>
-      <w:r>
-        <w:rPr>
-          <w:rFonts w:ascii="Calibri" w:hAnsi="Calibri" w:cs="Calibri"/>
-          <w:b/>
-          <w:bCs/>
-        </w:rPr>
-        <w:t>Authority:</w:t>
-      </w:r>
-      <w:r>
-        <w:rPr>
-          <w:rFonts w:ascii="Calibri" w:hAnsi="Calibri" w:cs="Calibri"/>
-        </w:rPr>
-        <w:t xml:space="preserve"> Existing canonical generation/proposal/snapshot/preview/publication chain using the implemented P10B authorities.</w:t>
-      </w:r>
-    </w:p>
-    <w:p>
-      <w:pPr>
-        <w:pStyle w:val="Normal"/>
-        <w:numPr>
-          <w:ilvl w:val="0"/>
-          <w:numId w:val="1"/>
-        </w:numPr>
-        <w:widowControl/>
-      </w:pPr>
-      <w:r>
-        <w:rPr>
-          <w:rFonts w:ascii="Calibri" w:hAnsi="Calibri" w:cs="Calibri"/>
-          <w:b/>
-          <w:bCs/>
-        </w:rPr>
-        <w:t>Depends on:</w:t>
-      </w:r>
-      <w:r>
-        <w:rPr>
-          <w:rFonts w:ascii="Calibri" w:hAnsi="Calibri" w:cs="Calibri"/>
-        </w:rPr>
-        <w:t xml:space="preserve"> Minimum accepted P10B-02 through P10B-13 capability.</w:t>
-      </w:r>
-    </w:p>
-    <w:p>
-      <w:pPr>
-        <w:pStyle w:val="Normal"/>
-        <w:numPr>
-          <w:ilvl w:val="0"/>
-          <w:numId w:val="1"/>
-        </w:numPr>
-        <w:widowControl/>
-      </w:pPr>
-      <w:r>
-        <w:rPr>
-          <w:rFonts w:ascii="Calibri" w:hAnsi="Calibri" w:cs="Calibri"/>
-          <w:b/>
-          <w:bCs/>
-        </w:rPr>
-        <w:t>Done when:</w:t>
-      </w:r>
-      <w:r>
-        <w:rPr>
-          <w:rFonts w:ascii="Calibri" w:hAnsi="Calibri" w:cs="Calibri"/>
-        </w:rPr>
-        <w:t xml:space="preserve"> One approved brief with realistic commerce and credible assets generates shared frame, home, collection, simple/configurable PDP, About, Contact/locations, FAQ/service, and required utility/error states; navigation, EN/FI where supported, four widths, protected state, preview/publish, and retained human review pass.</w:t>
-      </w:r>
-    </w:p>
-    <w:p>
-      <w:pPr>
-        <w:pStyle w:val="Normal"/>
-        <w:numPr>
-          <w:ilvl w:val="0"/>
-          <w:numId w:val="1"/>
-        </w:numPr>
-        <w:widowControl/>
-      </w:pPr>
-      <w:r>
-        <w:rPr>
-          <w:rFonts w:ascii="Calibri" w:hAnsi="Calibri" w:cs="Calibri"/>
-          <w:b/>
-          <w:bCs/>
-        </w:rPr>
-        <w:t>Fail closed:</w:t>
-      </w:r>
-      <w:r>
-        <w:rPr>
-          <w:rFonts w:ascii="Calibri" w:hAnsi="Calibri" w:cs="Calibri"/>
-        </w:rPr>
-        <w:t xml:space="preserve"> Missing/disconnected/generic required pages, manual reconstruction, stale authority, or schema-only visual evidence fails the slice.</w:t>
-      </w:r>
-    </w:p>
-    <w:p>
-      <w:pPr>
-        <w:pStyle w:val="Normal"/>
-        <w:numPr>
-          <w:ilvl w:val="0"/>
-          <w:numId w:val="1"/>
-        </w:numPr>
-        <w:widowControl/>
-      </w:pPr>
-      <w:r>
-        <w:rPr>
-          <w:rFonts w:ascii="Calibri" w:hAnsi="Calibri" w:cs="Calibri"/>
-          <w:b/>
-          <w:bCs/>
-        </w:rPr>
-        <w:t>Evidence:</w:t>
-      </w:r>
-      <w:r>
-        <w:rPr>
-          <w:rFonts w:ascii="Calibri" w:hAnsi="Calibri" w:cs="Calibri"/>
-        </w:rPr>
-        <w:t xml:space="preserve"> Complete capability chain, correlated browser/screenshots, protected parity, and signed human commercial review.</w:t>
-      </w:r>
-    </w:p>
-    <w:p>
-      <w:pPr>
-        <w:pStyle w:val="Normal"/>
-        <w:numPr>
-          <w:ilvl w:val="0"/>
-          <w:numId w:val="1"/>
-        </w:numPr>
-        <w:widowControl/>
-      </w:pPr>
-      <w:r>
-        <w:rPr>
-          <w:rFonts w:ascii="Calibri" w:hAnsi="Calibri" w:cs="Calibri"/>
-          <w:b/>
-          <w:bCs/>
-        </w:rPr>
-        <w:t>Non-goal:</w:t>
-      </w:r>
-      <w:r>
-        <w:rPr>
-          <w:rFonts w:ascii="Calibri" w:hAnsi="Calibri" w:cs="Calibri"/>
-        </w:rPr>
-        <w:t xml:space="preserve"> P10B closure or broad direction/diversity proof.</w:t>
-      </w:r>
-    </w:p>
-    <w:p>
-      <w:pPr>
-        <w:pStyle w:val="Heading3"/>
-        <w:keepNext/>
-        <w:widowControl/>
-      </w:pPr>
-      <w:r>
-        <w:rPr>
-          <w:rFonts w:ascii="Calibri" w:hAnsi="Calibri" w:cs="Calibri"/>
-        </w:rPr>
-        <w:t>P10B-15 — Bounded storefront synthesis and narrative engine</w:t>
-      </w:r>
-    </w:p>
-    <w:p>
-      <w:pPr>
-        <w:pStyle w:val="Normal"/>
-        <w:numPr>
-          <w:ilvl w:val="0"/>
-          <w:numId w:val="1"/>
-        </w:numPr>
-        <w:widowControl/>
-      </w:pPr>
-      <w:r>
-        <w:rPr>
-          <w:rFonts w:ascii="Calibri" w:hAnsi="Calibri" w:cs="Calibri"/>
-          <w:b/>
-          <w:bCs/>
-        </w:rPr>
-        <w:t>Outcome:</w:t>
-      </w:r>
-      <w:r>
-        <w:rPr>
-          <w:rFonts w:ascii="Calibri" w:hAnsi="Calibri" w:cs="Calibri"/>
-        </w:rPr>
-        <w:t xml:space="preserve"> Generate complete coherent storefronts from compatible Design DNA, page set, profiles, families/variants, parameters, assets, and narrative roles.</w:t>
-      </w:r>
-    </w:p>
-    <w:p>
-      <w:pPr>
-        <w:pStyle w:val="Normal"/>
-        <w:numPr>
-          <w:ilvl w:val="0"/>
-          <w:numId w:val="1"/>
-        </w:numPr>
-        <w:widowControl/>
-      </w:pPr>
-      <w:r>
-        <w:rPr>
-          <w:rFonts w:ascii="Calibri" w:hAnsi="Calibri" w:cs="Calibri"/>
-          <w:b/>
-          <w:bCs/>
-        </w:rPr>
-        <w:t>Authority:</w:t>
-      </w:r>
-      <w:r>
-        <w:rPr>
-          <w:rFonts w:ascii="Calibri" w:hAnsi="Calibri" w:cs="Calibri"/>
-        </w:rPr>
-        <w:t xml:space="preserve"> Existing governed planning/proposal compiler plus the registered P10B authorities; output remains one </w:t>
+        <w:t xml:space="preserve"> Existing P10B-05 PageBlueprint/page-family, content/evidence, localization, navigation, and </w:t>
       </w:r>
       <w:r>
         <w:rPr>
@@ -12389,6 +11846,84 @@
         <w:rPr>
           <w:rFonts w:ascii="Calibri" w:hAnsi="Calibri" w:cs="Calibri"/>
         </w:rPr>
+        <w:t xml:space="preserve"> contracts.</w:t>
+      </w:r>
+    </w:p>
+    <w:p>
+      <w:pPr>
+        <w:pStyle w:val="Normal"/>
+        <w:numPr>
+          <w:ilvl w:val="0"/>
+          <w:numId w:val="1"/>
+        </w:numPr>
+        <w:widowControl/>
+      </w:pPr>
+      <w:r>
+        <w:rPr>
+          <w:rFonts w:ascii="Calibri" w:hAnsi="Calibri" w:cs="Calibri"/>
+          <w:b/>
+          <w:bCs/>
+        </w:rPr>
+        <w:t>Depends on:</w:t>
+      </w:r>
+      <w:r>
+        <w:rPr>
+          <w:rFonts w:ascii="Calibri" w:hAnsi="Calibri" w:cs="Calibri"/>
+        </w:rPr>
+        <w:t xml:space="preserve"> P10B-03 through P10B-07.</w:t>
+      </w:r>
+    </w:p>
+    <w:p>
+      <w:pPr>
+        <w:pStyle w:val="Normal"/>
+        <w:numPr>
+          <w:ilvl w:val="0"/>
+          <w:numId w:val="1"/>
+        </w:numPr>
+        <w:widowControl/>
+      </w:pPr>
+      <w:r>
+        <w:rPr>
+          <w:rFonts w:ascii="Calibri" w:hAnsi="Calibri" w:cs="Calibri"/>
+          <w:b/>
+          <w:bCs/>
+        </w:rPr>
+        <w:t>Status:</w:t>
+      </w:r>
+      <w:r>
+        <w:rPr>
+          <w:rFonts w:ascii="Calibri" w:hAnsi="Calibri" w:cs="Calibri"/>
+        </w:rPr>
+        <w:t xml:space="preserve"> </w:t>
+      </w:r>
+      <w:r>
+        <w:rPr>
+          <w:rFonts w:ascii="Calibri" w:hAnsi="Calibri" w:cs="Calibri"/>
+          <w:b/>
+          <w:bCs/>
+        </w:rPr>
+        <w:t>Baseline</w:t>
+      </w:r>
+      <w:r>
+        <w:rPr>
+          <w:rFonts w:ascii="Calibri" w:hAnsi="Calibri" w:cs="Calibri"/>
+        </w:rPr>
+        <w:t xml:space="preserve">. Fifteen structurally distinct registered profiles resolve exact current approved brief evidence into strict localized fact documents. P10B-05 preserves page-set, route, locale, and transitive navigation authority; P10B-06 frames and P10B-07 editorial/campaign renderers are reused. Snapshot save/reload and deterministic publication preserve the exact document. See </w:t>
+      </w:r>
+      <w:hyperlink r:id="rIdHyperlink14" w:history="1">
+        <w:r>
+          <w:rPr>
+            <w:rFonts w:ascii="Calibri" w:hAnsi="Calibri" w:cs="Calibri"/>
+            <w:color w:val="2E74B5"/>
+            <w:u w:val="single"/>
+          </w:rPr>
+          <w:t>P10B_12_CONTENT_AND_SUPPORT_PAGE_FAMILIES.md</w:t>
+        </w:r>
+      </w:hyperlink>
+      <w:r>
+        <w:rPr>
+          <w:rFonts w:ascii="Calibri" w:hAnsi="Calibri" w:cs="Calibri"/>
+        </w:rPr>
         <w:t>.</w:t>
       </w:r>
     </w:p>
@@ -12407,61 +11942,13 @@
           <w:b/>
           <w:bCs/>
         </w:rPr>
-        <w:t>Depends on:</w:t>
-      </w:r>
-      <w:r>
-        <w:rPr>
-          <w:rFonts w:ascii="Calibri" w:hAnsi="Calibri" w:cs="Calibri"/>
-        </w:rPr>
-        <w:t xml:space="preserve"> P10B-14 and sufficient real family/profile capability.</w:t>
-      </w:r>
-    </w:p>
-    <w:p>
-      <w:pPr>
-        <w:pStyle w:val="Normal"/>
-        <w:numPr>
-          <w:ilvl w:val="0"/>
-          <w:numId w:val="1"/>
-        </w:numPr>
-        <w:widowControl/>
-      </w:pPr>
-      <w:r>
-        <w:rPr>
-          <w:rFonts w:ascii="Calibri" w:hAnsi="Calibri" w:cs="Calibri"/>
-          <w:b/>
-          <w:bCs/>
-        </w:rPr>
-        <w:t>Done when:</w:t>
-      </w:r>
-      <w:r>
-        <w:rPr>
-          <w:rFonts w:ascii="Calibri" w:hAnsi="Calibri" w:cs="Calibri"/>
-        </w:rPr>
-        <w:t xml:space="preserve"> Deterministic selection preserves cross-page identity, narrative adjacency/ cardinality, repetition limits, bindings/assets, and complete snapshot/lifecycle output for representative inputs.</w:t>
-      </w:r>
-    </w:p>
-    <w:p>
-      <w:pPr>
-        <w:pStyle w:val="Normal"/>
-        <w:numPr>
-          <w:ilvl w:val="0"/>
-          <w:numId w:val="1"/>
-        </w:numPr>
-        <w:widowControl/>
-      </w:pPr>
-      <w:r>
-        <w:rPr>
-          <w:rFonts w:ascii="Calibri" w:hAnsi="Calibri" w:cs="Calibri"/>
-          <w:b/>
-          <w:bCs/>
-        </w:rPr>
         <w:t>Fail closed:</w:t>
       </w:r>
       <w:r>
         <w:rPr>
           <w:rFonts w:ascii="Calibri" w:hAnsi="Calibri" w:cs="Calibri"/>
         </w:rPr>
-        <w:t xml:space="preserve"> Missing, stale, ambiguous, incompatible, unregistered, repetitive, or protected-state-divergent combinations produce no partial proposal/snapshot.</w:t>
+        <w:t xml:space="preserve"> Caller bodies cannot authorize facts. Missing, stale, revoked, superseded, unapproved, malformed, mismatched, or wrong-family evidence fails; required unsupported facts fail while optional content omits only through registered P10B-05 policy.</w:t>
       </w:r>
     </w:p>
     <w:p>
@@ -12485,7 +11972,7 @@
         <w:rPr>
           <w:rFonts w:ascii="Calibri" w:hAnsi="Calibri" w:cs="Calibri"/>
         </w:rPr>
-        <w:t xml:space="preserve"> Selection/compatibility/unit, proposal/compiler/lifecycle integration, no-partial- write, deterministic fingerprint inputs, and complete-store browser evidence.</w:t>
+        <w:t xml:space="preserve"> Contract/profile, source fact/provenance, generation/lifecycle, locale/navigation, protected-commerce, compiler, and 61 zero-provider Chromium checks at 375/768/1024/1440 px.</w:t>
       </w:r>
     </w:p>
     <w:p>
@@ -12509,7 +11996,7 @@
         <w:rPr>
           <w:rFonts w:ascii="Calibri" w:hAnsi="Calibri" w:cs="Calibri"/>
         </w:rPr>
-        <w:t xml:space="preserve"> Arbitrary trees/styles or a second synthesis representation.</w:t>
+        <w:t xml:space="preserve"> Unrestricted CMS, legal-content generation, a second page graph, or a provider path.</w:t>
       </w:r>
     </w:p>
     <w:p>
@@ -12522,7 +12009,7 @@
         <w:rPr>
           <w:rFonts w:ascii="Calibri" w:hAnsi="Calibri" w:cs="Calibri"/>
         </w:rPr>
-        <w:t>P10B-16 — Coordinated directions and diversity control</w:t>
+        <w:t>P10B-13 — Commerce utility presentation pages</w:t>
       </w:r>
     </w:p>
     <w:p>
@@ -12546,7 +12033,7 @@
         <w:rPr>
           <w:rFonts w:ascii="Calibri" w:hAnsi="Calibri" w:cs="Calibri"/>
         </w:rPr>
-        <w:t xml:space="preserve"> Make Premium Editorial, Modern Technical, and Minimal Commerce coordinated constraint packages and prevent duplicates/near duplicates.</w:t>
+        <w:t xml:space="preserve"> Deliver governed search/no-results, cart, checkout, empty, error, and 404 presentation.</w:t>
       </w:r>
     </w:p>
     <w:p>
@@ -12570,7 +12057,7 @@
         <w:rPr>
           <w:rFonts w:ascii="Calibri" w:hAnsi="Calibri" w:cs="Calibri"/>
         </w:rPr>
-        <w:t xml:space="preserve"> Existing direction-selection authority plus deterministic storefront-design fingerprint/evaluation.</w:t>
+        <w:t xml:space="preserve"> Existing page/profile, shared frame, canonical commerce projection, and operational adapter seams.</w:t>
       </w:r>
     </w:p>
     <w:p>
@@ -12594,7 +12081,7 @@
         <w:rPr>
           <w:rFonts w:ascii="Calibri" w:hAnsi="Calibri" w:cs="Calibri"/>
         </w:rPr>
-        <w:t xml:space="preserve"> P10B-15.</w:t>
+        <w:t xml:space="preserve"> P10B-03, P10B-05, P10B-06, P10B-08.</w:t>
       </w:r>
     </w:p>
     <w:p>
@@ -12618,7 +12105,7 @@
         <w:rPr>
           <w:rFonts w:ascii="Calibri" w:hAnsi="Calibri" w:cs="Calibri"/>
         </w:rPr>
-        <w:t xml:space="preserve"> Fingerprints cover Design DNA, page set/profiles, frame, anatomies/variants, structural parameters, image posture, density/responsive posture, and narrative composition; exact and meaningful near duplicates fail, and pairwise stores differ materially beyond colour.</w:t>
+        <w:t xml:space="preserve"> Every state presents canonical facts/actions with coherent Design DNA/frame, useful empty/error behavior, complete page-set reachability, responsive accessibility, snapshot, and publication preservation.</w:t>
       </w:r>
     </w:p>
     <w:p>
@@ -12642,7 +12129,7 @@
         <w:rPr>
           <w:rFonts w:ascii="Calibri" w:hAnsi="Calibri" w:cs="Calibri"/>
         </w:rPr>
-        <w:t xml:space="preserve"> Fixed-template/token/page direction authority, incompatible references, colour-only differences, and fingerprints that omit material structure are rejected.</w:t>
+        <w:t xml:space="preserve"> Local commerce operations/writes, invented totals or availability, unsupported actions, and executable payment/checkout behavior outside Vesko adapters are rejected.</w:t>
       </w:r>
     </w:p>
     <w:p>
@@ -12666,7 +12153,7 @@
         <w:rPr>
           <w:rFonts w:ascii="Calibri" w:hAnsi="Calibri" w:cs="Calibri"/>
         </w:rPr>
-        <w:t xml:space="preserve"> Determinism, exact/near-duplicate fixtures, pairwise structural scoring, direction compatibility, complete-store generation, and representative visual evidence.</w:t>
+        <w:t xml:space="preserve"> Contract/integration, adapter-boundary, state matrix, responsive/a11y browser, and retained visual evidence.</w:t>
       </w:r>
     </w:p>
     <w:p>
@@ -12690,7 +12177,7 @@
         <w:rPr>
           <w:rFonts w:ascii="Calibri" w:hAnsi="Calibri" w:cs="Calibri"/>
         </w:rPr>
-        <w:t xml:space="preserve"> Thousands of manually authored templates.</w:t>
+        <w:t xml:space="preserve"> Owning cart, checkout, payment, order, tax, shipping, or returns operations.</w:t>
       </w:r>
     </w:p>
     <w:p>
@@ -12703,7 +12190,7 @@
         <w:rPr>
           <w:rFonts w:ascii="Calibri" w:hAnsi="Calibri" w:cs="Calibri"/>
         </w:rPr>
-        <w:t>P10B-17 — Responsive, accessibility and performance closure</w:t>
+        <w:t>P10B-14 — Premium Editorial complete-storefront vertical slice</w:t>
       </w:r>
     </w:p>
     <w:p>
@@ -12727,7 +12214,7 @@
         <w:rPr>
           <w:rFonts w:ascii="Calibri" w:hAnsi="Calibri" w:cs="Calibri"/>
         </w:rPr>
-        <w:t xml:space="preserve"> Preserve deliberate commercial hierarchy and usability across target widths, locales, accessibility, and bounded performance budgets.</w:t>
+        <w:t xml:space="preserve"> Prove one commercially credible complete multi-page storefront early.</w:t>
       </w:r>
     </w:p>
     <w:p>
@@ -12751,7 +12238,7 @@
         <w:rPr>
           <w:rFonts w:ascii="Calibri" w:hAnsi="Calibri" w:cs="Calibri"/>
         </w:rPr>
-        <w:t xml:space="preserve"> Existing responsive/a11y contracts, registered transformations, renderers, and evidence protocol.</w:t>
+        <w:t xml:space="preserve"> Existing canonical generation/proposal/snapshot/preview/publication chain using the implemented P10B authorities.</w:t>
       </w:r>
     </w:p>
     <w:p>
@@ -12775,7 +12262,7 @@
         <w:rPr>
           <w:rFonts w:ascii="Calibri" w:hAnsi="Calibri" w:cs="Calibri"/>
         </w:rPr>
-        <w:t xml:space="preserve"> Implemented commercial families/profiles/directions through P10B-16.</w:t>
+        <w:t xml:space="preserve"> Minimum accepted P10B-02 through P10B-13 capability.</w:t>
       </w:r>
     </w:p>
     <w:p>
@@ -12799,7 +12286,7 @@
         <w:rPr>
           <w:rFonts w:ascii="Calibri" w:hAnsi="Calibri" w:cs="Calibri"/>
         </w:rPr>
-        <w:t xml:space="preserve"> All supported page families/directions pass 375/768/1024/1440 and EN/FI geometry, declared transformations, keyboard/focus/semantics/contrast, content/commerce retention, and explicit performance budgets with correlated evidence.</w:t>
+        <w:t xml:space="preserve"> One approved brief with realistic commerce and credible assets generates shared frame, home, collection, simple/configurable PDP, About, Contact/locations, FAQ/service, and required utility/error states; navigation, EN/FI where supported, four widths, protected state, preview/publish, and retained human review pass.</w:t>
       </w:r>
     </w:p>
     <w:p>
@@ -12823,7 +12310,7 @@
         <w:rPr>
           <w:rFonts w:ascii="Calibri" w:hAnsi="Calibri" w:cs="Calibri"/>
         </w:rPr>
-        <w:t xml:space="preserve"> Clipping, overlap, inaccessible controls, lost content/commerce, desktop-only approval, or undispositioned budget failure blocks completion.</w:t>
+        <w:t xml:space="preserve"> Missing/disconnected/generic required pages, manual reconstruction, stale authority, or schema-only visual evidence fails the slice.</w:t>
       </w:r>
     </w:p>
     <w:p>
@@ -12847,7 +12334,7 @@
         <w:rPr>
           <w:rFonts w:ascii="Calibri" w:hAnsi="Calibri" w:cs="Calibri"/>
         </w:rPr>
-        <w:t xml:space="preserve"> Automated geometry/a11y/performance/browser matrices plus retained representative human review.</w:t>
+        <w:t xml:space="preserve"> Complete capability chain, correlated browser/screenshots, protected parity, and signed human commercial review.</w:t>
       </w:r>
     </w:p>
     <w:p>
@@ -12871,7 +12358,7 @@
         <w:rPr>
           <w:rFonts w:ascii="Calibri" w:hAnsi="Calibri" w:cs="Calibri"/>
         </w:rPr>
-        <w:t xml:space="preserve"> Visual approval from isolated component screenshots.</w:t>
+        <w:t xml:space="preserve"> P10B closure or broad direction/diversity proof.</w:t>
       </w:r>
     </w:p>
     <w:p>
@@ -12884,7 +12371,7 @@
         <w:rPr>
           <w:rFonts w:ascii="Calibri" w:hAnsi="Calibri" w:cs="Calibri"/>
         </w:rPr>
-        <w:t>P10B-18 — Commercial quality and scale gate</w:t>
+        <w:t>P10B-15 — Bounded storefront synthesis and narrative engine</w:t>
       </w:r>
     </w:p>
     <w:p>
@@ -12908,7 +12395,7 @@
         <w:rPr>
           <w:rFonts w:ascii="Calibri" w:hAnsi="Calibri" w:cs="Calibri"/>
         </w:rPr>
-        <w:t xml:space="preserve"> Prove repeated generation of publishable, premium, materially different complete storefronts.</w:t>
+        <w:t xml:space="preserve"> Generate complete coherent storefronts from compatible Design DNA, page set, profiles, families/variants, parameters, assets, and narrative roles.</w:t>
       </w:r>
     </w:p>
     <w:p>
@@ -12932,519 +12419,7 @@
         <w:rPr>
           <w:rFonts w:ascii="Calibri" w:hAnsi="Calibri" w:cs="Calibri"/>
         </w:rPr>
-        <w:t xml:space="preserve"> Existing golden-store/human-review evidence plus the P10B synthesis and fingerprint authorities.</w:t>
-      </w:r>
-    </w:p>
-    <w:p>
-      <w:pPr>
-        <w:pStyle w:val="Normal"/>
-        <w:numPr>
-          <w:ilvl w:val="0"/>
-          <w:numId w:val="1"/>
-        </w:numPr>
-        <w:widowControl/>
-      </w:pPr>
-      <w:r>
-        <w:rPr>
-          <w:rFonts w:ascii="Calibri" w:hAnsi="Calibri" w:cs="Calibri"/>
-          <w:b/>
-          <w:bCs/>
-        </w:rPr>
-        <w:t>Depends on:</w:t>
-      </w:r>
-      <w:r>
-        <w:rPr>
-          <w:rFonts w:ascii="Calibri" w:hAnsi="Calibri" w:cs="Calibri"/>
-        </w:rPr>
-        <w:t xml:space="preserve"> P10B-17 and every prior P10B task.</w:t>
-      </w:r>
-    </w:p>
-    <w:p>
-      <w:pPr>
-        <w:pStyle w:val="Normal"/>
-        <w:numPr>
-          <w:ilvl w:val="0"/>
-          <w:numId w:val="1"/>
-        </w:numPr>
-        <w:widowControl/>
-      </w:pPr>
-      <w:r>
-        <w:rPr>
-          <w:rFonts w:ascii="Calibri" w:hAnsi="Calibri" w:cs="Calibri"/>
-          <w:b/>
-          <w:bCs/>
-        </w:rPr>
-        <w:t>Done when:</w:t>
-      </w:r>
-      <w:r>
-        <w:rPr>
-          <w:rFonts w:ascii="Calibri" w:hAnsi="Calibri" w:cs="Calibri"/>
-        </w:rPr>
-        <w:t xml:space="preserve"> At least 100 deterministic complete configurations across representative catalogue/evidence/asset/locale/page-set/direction contexts pass snapshot validity, protected parity, exact-duplicate, near-duplicate, and structural-distribution gates; a fingerprint- stratified subset passes retained four-width human commercial review.</w:t>
-      </w:r>
-    </w:p>
-    <w:p>
-      <w:pPr>
-        <w:pStyle w:val="Normal"/>
-        <w:numPr>
-          <w:ilvl w:val="0"/>
-          <w:numId w:val="1"/>
-        </w:numPr>
-        <w:widowControl/>
-      </w:pPr>
-      <w:r>
-        <w:rPr>
-          <w:rFonts w:ascii="Calibri" w:hAnsi="Calibri" w:cs="Calibri"/>
-          <w:b/>
-          <w:bCs/>
-        </w:rPr>
-        <w:t>Fail closed:</w:t>
-      </w:r>
-      <w:r>
-        <w:rPr>
-          <w:rFonts w:ascii="Calibri" w:hAnsi="Calibri" w:cs="Calibri"/>
-        </w:rPr>
-        <w:t xml:space="preserve"> One polished store, automated checks alone, placeholder assets, registry counts, screenshots without exact authority, or colour-only diversity cannot close P10B.</w:t>
-      </w:r>
-    </w:p>
-    <w:p>
-      <w:pPr>
-        <w:pStyle w:val="Normal"/>
-        <w:numPr>
-          <w:ilvl w:val="0"/>
-          <w:numId w:val="1"/>
-        </w:numPr>
-        <w:widowControl/>
-      </w:pPr>
-      <w:r>
-        <w:rPr>
-          <w:rFonts w:ascii="Calibri" w:hAnsi="Calibri" w:cs="Calibri"/>
-          <w:b/>
-          <w:bCs/>
-        </w:rPr>
-        <w:t>Evidence:</w:t>
-      </w:r>
-      <w:r>
-        <w:rPr>
-          <w:rFonts w:ascii="Calibri" w:hAnsi="Calibri" w:cs="Calibri"/>
-        </w:rPr>
-        <w:t xml:space="preserve"> Scale-generation ledger, fingerprint/diversity analysis, complete capability-chain correlations, retained screenshots, and explicit human acceptance.</w:t>
-      </w:r>
-    </w:p>
-    <w:p>
-      <w:pPr>
-        <w:pStyle w:val="Normal"/>
-        <w:numPr>
-          <w:ilvl w:val="0"/>
-          <w:numId w:val="1"/>
-        </w:numPr>
-        <w:widowControl/>
-      </w:pPr>
-      <w:r>
-        <w:rPr>
-          <w:rFonts w:ascii="Calibri" w:hAnsi="Calibri" w:cs="Calibri"/>
-          <w:b/>
-          <w:bCs/>
-        </w:rPr>
-        <w:t>Non-goal:</w:t>
-      </w:r>
-      <w:r>
-        <w:rPr>
-          <w:rFonts w:ascii="Calibri" w:hAnsi="Calibri" w:cs="Calibri"/>
-        </w:rPr>
-        <w:t xml:space="preserve"> P10C merchant editing, Vesko staging, or production-readiness claims.</w:t>
-      </w:r>
-    </w:p>
-    <w:p>
-      <w:pPr>
-        <w:pStyle w:val="Heading2"/>
-        <w:keepNext/>
-        <w:widowControl/>
-      </w:pPr>
-      <w:r>
-        <w:rPr>
-          <w:rFonts w:ascii="Calibri" w:hAnsi="Calibri" w:cs="Calibri"/>
-        </w:rPr>
-        <w:t>P10C — Storefront Studio Editing Experience v1</w:t>
-      </w:r>
-    </w:p>
-    <w:p>
-      <w:pPr>
-        <w:pStyle w:val="Heading3"/>
-        <w:keepNext/>
-        <w:widowControl/>
-      </w:pPr>
-      <w:r>
-        <w:rPr>
-          <w:rFonts w:ascii="Calibri" w:hAnsi="Calibri" w:cs="Calibri"/>
-        </w:rPr>
-        <w:t>P10C-01 — Brand asset library</w:t>
-      </w:r>
-    </w:p>
-    <w:p>
-      <w:pPr>
-        <w:pStyle w:val="Normal"/>
-        <w:numPr>
-          <w:ilvl w:val="0"/>
-          <w:numId w:val="1"/>
-        </w:numPr>
-        <w:widowControl/>
-      </w:pPr>
-      <w:r>
-        <w:rPr>
-          <w:rFonts w:ascii="Calibri" w:hAnsi="Calibri" w:cs="Calibri"/>
-          <w:b/>
-          <w:bCs/>
-        </w:rPr>
-        <w:t>Outcome:</w:t>
-      </w:r>
-      <w:r>
-        <w:rPr>
-          <w:rFonts w:ascii="Calibri" w:hAnsi="Calibri" w:cs="Calibri"/>
-        </w:rPr>
-        <w:t xml:space="preserve"> Let merchants view and choose approved presentation assets in Storefront Studio.</w:t>
-      </w:r>
-    </w:p>
-    <w:p>
-      <w:pPr>
-        <w:pStyle w:val="Normal"/>
-        <w:numPr>
-          <w:ilvl w:val="0"/>
-          <w:numId w:val="1"/>
-        </w:numPr>
-        <w:widowControl/>
-      </w:pPr>
-      <w:r>
-        <w:rPr>
-          <w:rFonts w:ascii="Calibri" w:hAnsi="Calibri" w:cs="Calibri"/>
-          <w:b/>
-          <w:bCs/>
-        </w:rPr>
-        <w:t>Status:</w:t>
-      </w:r>
-      <w:r>
-        <w:rPr>
-          <w:rFonts w:ascii="Calibri" w:hAnsi="Calibri" w:cs="Calibri"/>
-        </w:rPr>
-        <w:t xml:space="preserve"> </w:t>
-      </w:r>
-      <w:r>
-        <w:rPr>
-          <w:rFonts w:ascii="Calibri" w:hAnsi="Calibri" w:cs="Calibri"/>
-          <w:b/>
-          <w:bCs/>
-        </w:rPr>
-        <w:t>Planned</w:t>
-      </w:r>
-      <w:r>
-        <w:rPr>
-          <w:rFonts w:ascii="Calibri" w:hAnsi="Calibri" w:cs="Calibri"/>
-        </w:rPr>
-        <w:t>.</w:t>
-      </w:r>
-    </w:p>
-    <w:p>
-      <w:pPr>
-        <w:pStyle w:val="Normal"/>
-        <w:numPr>
-          <w:ilvl w:val="0"/>
-          <w:numId w:val="1"/>
-        </w:numPr>
-        <w:widowControl/>
-      </w:pPr>
-      <w:r>
-        <w:rPr>
-          <w:rFonts w:ascii="Calibri" w:hAnsi="Calibri" w:cs="Calibri"/>
-          <w:b/>
-          <w:bCs/>
-        </w:rPr>
-        <w:t>Depends on:</w:t>
-      </w:r>
-      <w:r>
-        <w:rPr>
-          <w:rFonts w:ascii="Calibri" w:hAnsi="Calibri" w:cs="Calibri"/>
-        </w:rPr>
-        <w:t xml:space="preserve"> P10B asset authority.</w:t>
-      </w:r>
-    </w:p>
-    <w:p>
-      <w:pPr>
-        <w:pStyle w:val="Normal"/>
-        <w:numPr>
-          <w:ilvl w:val="0"/>
-          <w:numId w:val="1"/>
-        </w:numPr>
-        <w:widowControl/>
-      </w:pPr>
-      <w:r>
-        <w:rPr>
-          <w:rFonts w:ascii="Calibri" w:hAnsi="Calibri" w:cs="Calibri"/>
-          <w:b/>
-          <w:bCs/>
-        </w:rPr>
-        <w:t>Done when:</w:t>
-      </w:r>
-      <w:r>
-        <w:rPr>
-          <w:rFonts w:ascii="Calibri" w:hAnsi="Calibri" w:cs="Calibri"/>
-        </w:rPr>
-        <w:t xml:space="preserve"> The stated outcome and required evidence are accepted.</w:t>
-      </w:r>
-    </w:p>
-    <w:p>
-      <w:pPr>
-        <w:pStyle w:val="Normal"/>
-        <w:numPr>
-          <w:ilvl w:val="0"/>
-          <w:numId w:val="1"/>
-        </w:numPr>
-        <w:widowControl/>
-      </w:pPr>
-      <w:r>
-        <w:rPr>
-          <w:rFonts w:ascii="Calibri" w:hAnsi="Calibri" w:cs="Calibri"/>
-          <w:b/>
-          <w:bCs/>
-        </w:rPr>
-        <w:t>Required evidence:</w:t>
-      </w:r>
-      <w:r>
-        <w:rPr>
-          <w:rFonts w:ascii="Calibri" w:hAnsi="Calibri" w:cs="Calibri"/>
-        </w:rPr>
-        <w:t xml:space="preserve"> Contract, integration, browser/E2E.</w:t>
-      </w:r>
-    </w:p>
-    <w:p>
-      <w:pPr>
-        <w:pStyle w:val="Normal"/>
-        <w:numPr>
-          <w:ilvl w:val="0"/>
-          <w:numId w:val="1"/>
-        </w:numPr>
-        <w:widowControl/>
-      </w:pPr>
-      <w:r>
-        <w:rPr>
-          <w:rFonts w:ascii="Calibri" w:hAnsi="Calibri" w:cs="Calibri"/>
-          <w:b/>
-          <w:bCs/>
-        </w:rPr>
-        <w:t>Non-goal:</w:t>
-      </w:r>
-      <w:r>
-        <w:rPr>
-          <w:rFonts w:ascii="Calibri" w:hAnsi="Calibri" w:cs="Calibri"/>
-        </w:rPr>
-        <w:t xml:space="preserve"> Product-media replacement or generic DAM scope.</w:t>
-      </w:r>
-    </w:p>
-    <w:p>
-      <w:pPr>
-        <w:pStyle w:val="Heading3"/>
-        <w:keepNext/>
-        <w:widowControl/>
-      </w:pPr>
-      <w:r>
-        <w:rPr>
-          <w:rFonts w:ascii="Calibri" w:hAnsi="Calibri" w:cs="Calibri"/>
-        </w:rPr>
-        <w:t>P10C-02 — Asset roles and provenance</w:t>
-      </w:r>
-    </w:p>
-    <w:p>
-      <w:pPr>
-        <w:pStyle w:val="Normal"/>
-        <w:numPr>
-          <w:ilvl w:val="0"/>
-          <w:numId w:val="1"/>
-        </w:numPr>
-        <w:widowControl/>
-      </w:pPr>
-      <w:r>
-        <w:rPr>
-          <w:rFonts w:ascii="Calibri" w:hAnsi="Calibri" w:cs="Calibri"/>
-          <w:b/>
-          <w:bCs/>
-        </w:rPr>
-        <w:t>Outcome:</w:t>
-      </w:r>
-      <w:r>
-        <w:rPr>
-          <w:rFonts w:ascii="Calibri" w:hAnsi="Calibri" w:cs="Calibri"/>
-        </w:rPr>
-        <w:t xml:space="preserve"> Show and preserve role, source, approval, revision, and assignment authority.</w:t>
-      </w:r>
-    </w:p>
-    <w:p>
-      <w:pPr>
-        <w:pStyle w:val="Normal"/>
-        <w:numPr>
-          <w:ilvl w:val="0"/>
-          <w:numId w:val="1"/>
-        </w:numPr>
-        <w:widowControl/>
-      </w:pPr>
-      <w:r>
-        <w:rPr>
-          <w:rFonts w:ascii="Calibri" w:hAnsi="Calibri" w:cs="Calibri"/>
-          <w:b/>
-          <w:bCs/>
-        </w:rPr>
-        <w:t>Status:</w:t>
-      </w:r>
-      <w:r>
-        <w:rPr>
-          <w:rFonts w:ascii="Calibri" w:hAnsi="Calibri" w:cs="Calibri"/>
-        </w:rPr>
-        <w:t xml:space="preserve"> </w:t>
-      </w:r>
-      <w:r>
-        <w:rPr>
-          <w:rFonts w:ascii="Calibri" w:hAnsi="Calibri" w:cs="Calibri"/>
-          <w:b/>
-          <w:bCs/>
-        </w:rPr>
-        <w:t>Planned</w:t>
-      </w:r>
-      <w:r>
-        <w:rPr>
-          <w:rFonts w:ascii="Calibri" w:hAnsi="Calibri" w:cs="Calibri"/>
-        </w:rPr>
-        <w:t>.</w:t>
-      </w:r>
-    </w:p>
-    <w:p>
-      <w:pPr>
-        <w:pStyle w:val="Normal"/>
-        <w:numPr>
-          <w:ilvl w:val="0"/>
-          <w:numId w:val="1"/>
-        </w:numPr>
-        <w:widowControl/>
-      </w:pPr>
-      <w:r>
-        <w:rPr>
-          <w:rFonts w:ascii="Calibri" w:hAnsi="Calibri" w:cs="Calibri"/>
-          <w:b/>
-          <w:bCs/>
-        </w:rPr>
-        <w:t>Depends on:</w:t>
-      </w:r>
-      <w:r>
-        <w:rPr>
-          <w:rFonts w:ascii="Calibri" w:hAnsi="Calibri" w:cs="Calibri"/>
-        </w:rPr>
-        <w:t xml:space="preserve"> P10C-01.</w:t>
-      </w:r>
-    </w:p>
-    <w:p>
-      <w:pPr>
-        <w:pStyle w:val="Normal"/>
-        <w:numPr>
-          <w:ilvl w:val="0"/>
-          <w:numId w:val="1"/>
-        </w:numPr>
-        <w:widowControl/>
-      </w:pPr>
-      <w:r>
-        <w:rPr>
-          <w:rFonts w:ascii="Calibri" w:hAnsi="Calibri" w:cs="Calibri"/>
-          <w:b/>
-          <w:bCs/>
-        </w:rPr>
-        <w:t>Done when:</w:t>
-      </w:r>
-      <w:r>
-        <w:rPr>
-          <w:rFonts w:ascii="Calibri" w:hAnsi="Calibri" w:cs="Calibri"/>
-        </w:rPr>
-        <w:t xml:space="preserve"> The stated outcome and required evidence are accepted.</w:t>
-      </w:r>
-    </w:p>
-    <w:p>
-      <w:pPr>
-        <w:pStyle w:val="Normal"/>
-        <w:numPr>
-          <w:ilvl w:val="0"/>
-          <w:numId w:val="1"/>
-        </w:numPr>
-        <w:widowControl/>
-      </w:pPr>
-      <w:r>
-        <w:rPr>
-          <w:rFonts w:ascii="Calibri" w:hAnsi="Calibri" w:cs="Calibri"/>
-          <w:b/>
-          <w:bCs/>
-        </w:rPr>
-        <w:t>Required evidence:</w:t>
-      </w:r>
-      <w:r>
-        <w:rPr>
-          <w:rFonts w:ascii="Calibri" w:hAnsi="Calibri" w:cs="Calibri"/>
-        </w:rPr>
-        <w:t xml:space="preserve"> Valid assignment and stale/unknown/role-mismatch rejection.</w:t>
-      </w:r>
-    </w:p>
-    <w:p>
-      <w:pPr>
-        <w:pStyle w:val="Normal"/>
-        <w:numPr>
-          <w:ilvl w:val="0"/>
-          <w:numId w:val="1"/>
-        </w:numPr>
-        <w:widowControl/>
-      </w:pPr>
-      <w:r>
-        <w:rPr>
-          <w:rFonts w:ascii="Calibri" w:hAnsi="Calibri" w:cs="Calibri"/>
-          <w:b/>
-          <w:bCs/>
-        </w:rPr>
-        <w:t>Non-goal:</w:t>
-      </w:r>
-      <w:r>
-        <w:rPr>
-          <w:rFonts w:ascii="Calibri" w:hAnsi="Calibri" w:cs="Calibri"/>
-        </w:rPr>
-        <w:t xml:space="preserve"> Untyped uploads or hidden provenance.</w:t>
-      </w:r>
-    </w:p>
-    <w:p>
-      <w:pPr>
-        <w:pStyle w:val="Heading3"/>
-        <w:keepNext/>
-        <w:widowControl/>
-      </w:pPr>
-      <w:r>
-        <w:rPr>
-          <w:rFonts w:ascii="Calibri" w:hAnsi="Calibri" w:cs="Calibri"/>
-        </w:rPr>
-        <w:t>P10C-03 — Canonical Puck boundary</w:t>
-      </w:r>
-    </w:p>
-    <w:p>
-      <w:pPr>
-        <w:pStyle w:val="Normal"/>
-        <w:numPr>
-          <w:ilvl w:val="0"/>
-          <w:numId w:val="1"/>
-        </w:numPr>
-        <w:widowControl/>
-      </w:pPr>
-      <w:r>
-        <w:rPr>
-          <w:rFonts w:ascii="Calibri" w:hAnsi="Calibri" w:cs="Calibri"/>
-          <w:b/>
-          <w:bCs/>
-        </w:rPr>
-        <w:t>Outcome:</w:t>
-      </w:r>
-      <w:r>
-        <w:rPr>
-          <w:rFonts w:ascii="Calibri" w:hAnsi="Calibri" w:cs="Calibri"/>
-        </w:rPr>
-        <w:t xml:space="preserve"> Project registered canonical content into Puck and validate edits back into the same </w:t>
+        <w:t xml:space="preserve"> Existing governed planning/proposal compiler plus the registered P10B authorities; output remains one </w:t>
       </w:r>
       <w:r>
         <w:rPr>
@@ -13476,51 +12451,13 @@
           <w:b/>
           <w:bCs/>
         </w:rPr>
-        <w:t>Status:</w:t>
-      </w:r>
-      <w:r>
-        <w:rPr>
-          <w:rFonts w:ascii="Calibri" w:hAnsi="Calibri" w:cs="Calibri"/>
-        </w:rPr>
-        <w:t xml:space="preserve"> </w:t>
-      </w:r>
-      <w:r>
-        <w:rPr>
-          <w:rFonts w:ascii="Calibri" w:hAnsi="Calibri" w:cs="Calibri"/>
-          <w:b/>
-          <w:bCs/>
-        </w:rPr>
-        <w:t>Planned</w:t>
-      </w:r>
-      <w:r>
-        <w:rPr>
-          <w:rFonts w:ascii="Calibri" w:hAnsi="Calibri" w:cs="Calibri"/>
-        </w:rPr>
-        <w:t>.</w:t>
-      </w:r>
-    </w:p>
-    <w:p>
-      <w:pPr>
-        <w:pStyle w:val="Normal"/>
-        <w:numPr>
-          <w:ilvl w:val="0"/>
-          <w:numId w:val="1"/>
-        </w:numPr>
-        <w:widowControl/>
-      </w:pPr>
-      <w:r>
-        <w:rPr>
-          <w:rFonts w:ascii="Calibri" w:hAnsi="Calibri" w:cs="Calibri"/>
-          <w:b/>
-          <w:bCs/>
-        </w:rPr>
         <w:t>Depends on:</w:t>
       </w:r>
       <w:r>
         <w:rPr>
           <w:rFonts w:ascii="Calibri" w:hAnsi="Calibri" w:cs="Calibri"/>
         </w:rPr>
-        <w:t xml:space="preserve"> P10B component/profile authority.</w:t>
+        <w:t xml:space="preserve"> P10B-14 and sufficient real family/profile capability.</w:t>
       </w:r>
     </w:p>
     <w:p>
@@ -13544,31 +12481,55 @@
         <w:rPr>
           <w:rFonts w:ascii="Calibri" w:hAnsi="Calibri" w:cs="Calibri"/>
         </w:rPr>
-        <w:t xml:space="preserve"> The stated outcome and required evidence are accepted.</w:t>
-      </w:r>
-    </w:p>
-    <w:p>
-      <w:pPr>
-        <w:pStyle w:val="Normal"/>
-        <w:numPr>
-          <w:ilvl w:val="0"/>
-          <w:numId w:val="1"/>
-        </w:numPr>
-        <w:widowControl/>
-      </w:pPr>
-      <w:r>
-        <w:rPr>
-          <w:rFonts w:ascii="Calibri" w:hAnsi="Calibri" w:cs="Calibri"/>
-          <w:b/>
-          <w:bCs/>
-        </w:rPr>
-        <w:t>Required evidence:</w:t>
-      </w:r>
-      <w:r>
-        <w:rPr>
-          <w:rFonts w:ascii="Calibri" w:hAnsi="Calibri" w:cs="Calibri"/>
-        </w:rPr>
-        <w:t xml:space="preserve"> Adapter conformance and save/reload preservation.</w:t>
+        <w:t xml:space="preserve"> Deterministic selection preserves cross-page identity, narrative adjacency/ cardinality, repetition limits, bindings/assets, and complete snapshot/lifecycle output for representative inputs.</w:t>
+      </w:r>
+    </w:p>
+    <w:p>
+      <w:pPr>
+        <w:pStyle w:val="Normal"/>
+        <w:numPr>
+          <w:ilvl w:val="0"/>
+          <w:numId w:val="1"/>
+        </w:numPr>
+        <w:widowControl/>
+      </w:pPr>
+      <w:r>
+        <w:rPr>
+          <w:rFonts w:ascii="Calibri" w:hAnsi="Calibri" w:cs="Calibri"/>
+          <w:b/>
+          <w:bCs/>
+        </w:rPr>
+        <w:t>Fail closed:</w:t>
+      </w:r>
+      <w:r>
+        <w:rPr>
+          <w:rFonts w:ascii="Calibri" w:hAnsi="Calibri" w:cs="Calibri"/>
+        </w:rPr>
+        <w:t xml:space="preserve"> Missing, stale, ambiguous, incompatible, unregistered, repetitive, or protected-state-divergent combinations produce no partial proposal/snapshot.</w:t>
+      </w:r>
+    </w:p>
+    <w:p>
+      <w:pPr>
+        <w:pStyle w:val="Normal"/>
+        <w:numPr>
+          <w:ilvl w:val="0"/>
+          <w:numId w:val="1"/>
+        </w:numPr>
+        <w:widowControl/>
+      </w:pPr>
+      <w:r>
+        <w:rPr>
+          <w:rFonts w:ascii="Calibri" w:hAnsi="Calibri" w:cs="Calibri"/>
+          <w:b/>
+          <w:bCs/>
+        </w:rPr>
+        <w:t>Evidence:</w:t>
+      </w:r>
+      <w:r>
+        <w:rPr>
+          <w:rFonts w:ascii="Calibri" w:hAnsi="Calibri" w:cs="Calibri"/>
+        </w:rPr>
+        <w:t xml:space="preserve"> Selection/compatibility/unit, proposal/compiler/lifecycle integration, no-partial- write, deterministic fingerprint inputs, and complete-store browser evidence.</w:t>
       </w:r>
     </w:p>
     <w:p>
@@ -13592,7 +12553,7 @@
         <w:rPr>
           <w:rFonts w:ascii="Calibri" w:hAnsi="Calibri" w:cs="Calibri"/>
         </w:rPr>
-        <w:t xml:space="preserve"> Raw Puck persistence or a second page tree.</w:t>
+        <w:t xml:space="preserve"> Arbitrary trees/styles or a second synthesis representation.</w:t>
       </w:r>
     </w:p>
     <w:p>
@@ -13605,7 +12566,7 @@
         <w:rPr>
           <w:rFonts w:ascii="Calibri" w:hAnsi="Calibri" w:cs="Calibri"/>
         </w:rPr>
-        <w:t>P10C-04 — Stable frame identity and selection</w:t>
+        <w:t>P10B-16 — Coordinated directions and diversity control</w:t>
       </w:r>
     </w:p>
     <w:p>
@@ -13629,45 +12590,31 @@
         <w:rPr>
           <w:rFonts w:ascii="Calibri" w:hAnsi="Calibri" w:cs="Calibri"/>
         </w:rPr>
-        <w:t xml:space="preserve"> Select and edit one shared frame consistently from every page context.</w:t>
-      </w:r>
-    </w:p>
-    <w:p>
-      <w:pPr>
-        <w:pStyle w:val="Normal"/>
-        <w:numPr>
-          <w:ilvl w:val="0"/>
-          <w:numId w:val="1"/>
-        </w:numPr>
-        <w:widowControl/>
-      </w:pPr>
-      <w:r>
-        <w:rPr>
-          <w:rFonts w:ascii="Calibri" w:hAnsi="Calibri" w:cs="Calibri"/>
-          <w:b/>
-          <w:bCs/>
-        </w:rPr>
-        <w:t>Status:</w:t>
-      </w:r>
-      <w:r>
-        <w:rPr>
-          <w:rFonts w:ascii="Calibri" w:hAnsi="Calibri" w:cs="Calibri"/>
-        </w:rPr>
-        <w:t xml:space="preserve"> </w:t>
-      </w:r>
-      <w:r>
-        <w:rPr>
-          <w:rFonts w:ascii="Calibri" w:hAnsi="Calibri" w:cs="Calibri"/>
-          <w:b/>
-          <w:bCs/>
-        </w:rPr>
-        <w:t>Planned</w:t>
-      </w:r>
-      <w:r>
-        <w:rPr>
-          <w:rFonts w:ascii="Calibri" w:hAnsi="Calibri" w:cs="Calibri"/>
-        </w:rPr>
-        <w:t>.</w:t>
+        <w:t xml:space="preserve"> Make Premium Editorial, Modern Technical, and Minimal Commerce coordinated constraint packages and prevent duplicates/near duplicates.</w:t>
+      </w:r>
+    </w:p>
+    <w:p>
+      <w:pPr>
+        <w:pStyle w:val="Normal"/>
+        <w:numPr>
+          <w:ilvl w:val="0"/>
+          <w:numId w:val="1"/>
+        </w:numPr>
+        <w:widowControl/>
+      </w:pPr>
+      <w:r>
+        <w:rPr>
+          <w:rFonts w:ascii="Calibri" w:hAnsi="Calibri" w:cs="Calibri"/>
+          <w:b/>
+          <w:bCs/>
+        </w:rPr>
+        <w:t>Authority:</w:t>
+      </w:r>
+      <w:r>
+        <w:rPr>
+          <w:rFonts w:ascii="Calibri" w:hAnsi="Calibri" w:cs="Calibri"/>
+        </w:rPr>
+        <w:t xml:space="preserve"> Existing direction-selection authority plus deterministic storefront-design fingerprint/evaluation.</w:t>
       </w:r>
     </w:p>
     <w:p>
@@ -13691,7 +12638,7 @@
         <w:rPr>
           <w:rFonts w:ascii="Calibri" w:hAnsi="Calibri" w:cs="Calibri"/>
         </w:rPr>
-        <w:t xml:space="preserve"> P10C-03.</w:t>
+        <w:t xml:space="preserve"> P10B-15.</w:t>
       </w:r>
     </w:p>
     <w:p>
@@ -13715,31 +12662,55 @@
         <w:rPr>
           <w:rFonts w:ascii="Calibri" w:hAnsi="Calibri" w:cs="Calibri"/>
         </w:rPr>
-        <w:t xml:space="preserve"> The stated outcome and required evidence are accepted.</w:t>
-      </w:r>
-    </w:p>
-    <w:p>
-      <w:pPr>
-        <w:pStyle w:val="Normal"/>
-        <w:numPr>
-          <w:ilvl w:val="0"/>
-          <w:numId w:val="1"/>
-        </w:numPr>
-        <w:widowControl/>
-      </w:pPr>
-      <w:r>
-        <w:rPr>
-          <w:rFonts w:ascii="Calibri" w:hAnsi="Calibri" w:cs="Calibri"/>
-          <w:b/>
-          <w:bCs/>
-        </w:rPr>
-        <w:t>Required evidence:</w:t>
-      </w:r>
-      <w:r>
-        <w:rPr>
-          <w:rFonts w:ascii="Calibri" w:hAnsi="Calibri" w:cs="Calibri"/>
-        </w:rPr>
-        <w:t xml:space="preserve"> Stable identity, scope, history, and browser behavior.</w:t>
+        <w:t xml:space="preserve"> Fingerprints cover Design DNA, page set/profiles, frame, anatomies/variants, structural parameters, image posture, density/responsive posture, and narrative composition; exact and meaningful near duplicates fail, and pairwise stores differ materially beyond colour.</w:t>
+      </w:r>
+    </w:p>
+    <w:p>
+      <w:pPr>
+        <w:pStyle w:val="Normal"/>
+        <w:numPr>
+          <w:ilvl w:val="0"/>
+          <w:numId w:val="1"/>
+        </w:numPr>
+        <w:widowControl/>
+      </w:pPr>
+      <w:r>
+        <w:rPr>
+          <w:rFonts w:ascii="Calibri" w:hAnsi="Calibri" w:cs="Calibri"/>
+          <w:b/>
+          <w:bCs/>
+        </w:rPr>
+        <w:t>Fail closed:</w:t>
+      </w:r>
+      <w:r>
+        <w:rPr>
+          <w:rFonts w:ascii="Calibri" w:hAnsi="Calibri" w:cs="Calibri"/>
+        </w:rPr>
+        <w:t xml:space="preserve"> Fixed-template/token/page direction authority, incompatible references, colour-only differences, and fingerprints that omit material structure are rejected.</w:t>
+      </w:r>
+    </w:p>
+    <w:p>
+      <w:pPr>
+        <w:pStyle w:val="Normal"/>
+        <w:numPr>
+          <w:ilvl w:val="0"/>
+          <w:numId w:val="1"/>
+        </w:numPr>
+        <w:widowControl/>
+      </w:pPr>
+      <w:r>
+        <w:rPr>
+          <w:rFonts w:ascii="Calibri" w:hAnsi="Calibri" w:cs="Calibri"/>
+          <w:b/>
+          <w:bCs/>
+        </w:rPr>
+        <w:t>Evidence:</w:t>
+      </w:r>
+      <w:r>
+        <w:rPr>
+          <w:rFonts w:ascii="Calibri" w:hAnsi="Calibri" w:cs="Calibri"/>
+        </w:rPr>
+        <w:t xml:space="preserve"> Determinism, exact/near-duplicate fixtures, pairwise structural scoring, direction compatibility, complete-store generation, and representative visual evidence.</w:t>
       </w:r>
     </w:p>
     <w:p>
@@ -13763,7 +12734,7 @@
         <w:rPr>
           <w:rFonts w:ascii="Calibri" w:hAnsi="Calibri" w:cs="Calibri"/>
         </w:rPr>
-        <w:t xml:space="preserve"> Duplicating frame state per page.</w:t>
+        <w:t xml:space="preserve"> Thousands of manually authored templates.</w:t>
       </w:r>
     </w:p>
     <w:p>
@@ -13776,7 +12747,7 @@
         <w:rPr>
           <w:rFonts w:ascii="Calibri" w:hAnsi="Calibri" w:cs="Calibri"/>
         </w:rPr>
-        <w:t>P10C-05 — Approved manual frame operations</w:t>
+        <w:t>P10B-17 — Responsive, accessibility and performance closure</w:t>
       </w:r>
     </w:p>
     <w:p>
@@ -13800,45 +12771,31 @@
         <w:rPr>
           <w:rFonts w:ascii="Calibri" w:hAnsi="Calibri" w:cs="Calibri"/>
         </w:rPr>
-        <w:t xml:space="preserve"> Support bounded manual shared-frame add, remove, reorder, field, asset, and presentation operations.</w:t>
-      </w:r>
-    </w:p>
-    <w:p>
-      <w:pPr>
-        <w:pStyle w:val="Normal"/>
-        <w:numPr>
-          <w:ilvl w:val="0"/>
-          <w:numId w:val="1"/>
-        </w:numPr>
-        <w:widowControl/>
-      </w:pPr>
-      <w:r>
-        <w:rPr>
-          <w:rFonts w:ascii="Calibri" w:hAnsi="Calibri" w:cs="Calibri"/>
-          <w:b/>
-          <w:bCs/>
-        </w:rPr>
-        <w:t>Status:</w:t>
-      </w:r>
-      <w:r>
-        <w:rPr>
-          <w:rFonts w:ascii="Calibri" w:hAnsi="Calibri" w:cs="Calibri"/>
-        </w:rPr>
-        <w:t xml:space="preserve"> </w:t>
-      </w:r>
-      <w:r>
-        <w:rPr>
-          <w:rFonts w:ascii="Calibri" w:hAnsi="Calibri" w:cs="Calibri"/>
-          <w:b/>
-          <w:bCs/>
-        </w:rPr>
-        <w:t>Planned</w:t>
-      </w:r>
-      <w:r>
-        <w:rPr>
-          <w:rFonts w:ascii="Calibri" w:hAnsi="Calibri" w:cs="Calibri"/>
-        </w:rPr>
-        <w:t>.</w:t>
+        <w:t xml:space="preserve"> Preserve deliberate commercial hierarchy and usability across target widths, locales, accessibility, and bounded performance budgets.</w:t>
+      </w:r>
+    </w:p>
+    <w:p>
+      <w:pPr>
+        <w:pStyle w:val="Normal"/>
+        <w:numPr>
+          <w:ilvl w:val="0"/>
+          <w:numId w:val="1"/>
+        </w:numPr>
+        <w:widowControl/>
+      </w:pPr>
+      <w:r>
+        <w:rPr>
+          <w:rFonts w:ascii="Calibri" w:hAnsi="Calibri" w:cs="Calibri"/>
+          <w:b/>
+          <w:bCs/>
+        </w:rPr>
+        <w:t>Authority:</w:t>
+      </w:r>
+      <w:r>
+        <w:rPr>
+          <w:rFonts w:ascii="Calibri" w:hAnsi="Calibri" w:cs="Calibri"/>
+        </w:rPr>
+        <w:t xml:space="preserve"> Existing responsive/a11y contracts, registered transformations, renderers, and evidence protocol.</w:t>
       </w:r>
     </w:p>
     <w:p>
@@ -13862,7 +12819,7 @@
         <w:rPr>
           <w:rFonts w:ascii="Calibri" w:hAnsi="Calibri" w:cs="Calibri"/>
         </w:rPr>
-        <w:t xml:space="preserve"> P10C-02 through P10C-04.</w:t>
+        <w:t xml:space="preserve"> Implemented commercial families/profiles/directions through P10B-16.</w:t>
       </w:r>
     </w:p>
     <w:p>
@@ -13886,31 +12843,55 @@
         <w:rPr>
           <w:rFonts w:ascii="Calibri" w:hAnsi="Calibri" w:cs="Calibri"/>
         </w:rPr>
-        <w:t xml:space="preserve"> The stated outcome and required evidence are accepted.</w:t>
-      </w:r>
-    </w:p>
-    <w:p>
-      <w:pPr>
-        <w:pStyle w:val="Normal"/>
-        <w:numPr>
-          <w:ilvl w:val="0"/>
-          <w:numId w:val="1"/>
-        </w:numPr>
-        <w:widowControl/>
-      </w:pPr>
-      <w:r>
-        <w:rPr>
-          <w:rFonts w:ascii="Calibri" w:hAnsi="Calibri" w:cs="Calibri"/>
-          <w:b/>
-          <w:bCs/>
-        </w:rPr>
-        <w:t>Required evidence:</w:t>
-      </w:r>
-      <w:r>
-        <w:rPr>
-          <w:rFonts w:ascii="Calibri" w:hAnsi="Calibri" w:cs="Calibri"/>
-        </w:rPr>
-        <w:t xml:space="preserve"> Positive and fail-closed integration, undo/redo, browser/E2E.</w:t>
+        <w:t xml:space="preserve"> All supported page families/directions pass 375/768/1024/1440 and EN/FI geometry, declared transformations, keyboard/focus/semantics/contrast, content/commerce retention, and explicit performance budgets with correlated evidence.</w:t>
+      </w:r>
+    </w:p>
+    <w:p>
+      <w:pPr>
+        <w:pStyle w:val="Normal"/>
+        <w:numPr>
+          <w:ilvl w:val="0"/>
+          <w:numId w:val="1"/>
+        </w:numPr>
+        <w:widowControl/>
+      </w:pPr>
+      <w:r>
+        <w:rPr>
+          <w:rFonts w:ascii="Calibri" w:hAnsi="Calibri" w:cs="Calibri"/>
+          <w:b/>
+          <w:bCs/>
+        </w:rPr>
+        <w:t>Fail closed:</w:t>
+      </w:r>
+      <w:r>
+        <w:rPr>
+          <w:rFonts w:ascii="Calibri" w:hAnsi="Calibri" w:cs="Calibri"/>
+        </w:rPr>
+        <w:t xml:space="preserve"> Clipping, overlap, inaccessible controls, lost content/commerce, desktop-only approval, or undispositioned budget failure blocks completion.</w:t>
+      </w:r>
+    </w:p>
+    <w:p>
+      <w:pPr>
+        <w:pStyle w:val="Normal"/>
+        <w:numPr>
+          <w:ilvl w:val="0"/>
+          <w:numId w:val="1"/>
+        </w:numPr>
+        <w:widowControl/>
+      </w:pPr>
+      <w:r>
+        <w:rPr>
+          <w:rFonts w:ascii="Calibri" w:hAnsi="Calibri" w:cs="Calibri"/>
+          <w:b/>
+          <w:bCs/>
+        </w:rPr>
+        <w:t>Evidence:</w:t>
+      </w:r>
+      <w:r>
+        <w:rPr>
+          <w:rFonts w:ascii="Calibri" w:hAnsi="Calibri" w:cs="Calibri"/>
+        </w:rPr>
+        <w:t xml:space="preserve"> Automated geometry/a11y/performance/browser matrices plus retained representative human review.</w:t>
       </w:r>
     </w:p>
     <w:p>
@@ -13934,7 +12915,7 @@
         <w:rPr>
           <w:rFonts w:ascii="Calibri" w:hAnsi="Calibri" w:cs="Calibri"/>
         </w:rPr>
-        <w:t xml:space="preserve"> Arbitrary code/CSS/components or commerce mutation.</w:t>
+        <w:t xml:space="preserve"> Visual approval from isolated component screenshots.</w:t>
       </w:r>
     </w:p>
     <w:p>
@@ -13947,7 +12928,7 @@
         <w:rPr>
           <w:rFonts w:ascii="Calibri" w:hAnsi="Calibri" w:cs="Calibri"/>
         </w:rPr>
-        <w:t>P10C-06 — Scoped AI editing</w:t>
+        <w:t>P10B-18 — Commercial quality and scale gate</w:t>
       </w:r>
     </w:p>
     <w:p>
@@ -13971,45 +12952,31 @@
         <w:rPr>
           <w:rFonts w:ascii="Calibri" w:hAnsi="Calibri" w:cs="Calibri"/>
         </w:rPr>
-        <w:t xml:space="preserve"> Connect merchant routing, clarification, frame/page scope, and proposal review to the existing P10A governed authorities.</w:t>
-      </w:r>
-    </w:p>
-    <w:p>
-      <w:pPr>
-        <w:pStyle w:val="Normal"/>
-        <w:numPr>
-          <w:ilvl w:val="0"/>
-          <w:numId w:val="1"/>
-        </w:numPr>
-        <w:widowControl/>
-      </w:pPr>
-      <w:r>
-        <w:rPr>
-          <w:rFonts w:ascii="Calibri" w:hAnsi="Calibri" w:cs="Calibri"/>
-          <w:b/>
-          <w:bCs/>
-        </w:rPr>
-        <w:t>Status:</w:t>
-      </w:r>
-      <w:r>
-        <w:rPr>
-          <w:rFonts w:ascii="Calibri" w:hAnsi="Calibri" w:cs="Calibri"/>
-        </w:rPr>
-        <w:t xml:space="preserve"> </w:t>
-      </w:r>
-      <w:r>
-        <w:rPr>
-          <w:rFonts w:ascii="Calibri" w:hAnsi="Calibri" w:cs="Calibri"/>
-          <w:b/>
-          <w:bCs/>
-        </w:rPr>
-        <w:t>Planned</w:t>
-      </w:r>
-      <w:r>
-        <w:rPr>
-          <w:rFonts w:ascii="Calibri" w:hAnsi="Calibri" w:cs="Calibri"/>
-        </w:rPr>
-        <w:t>.</w:t>
+        <w:t xml:space="preserve"> Prove repeated generation of publishable, premium, materially different complete storefronts.</w:t>
+      </w:r>
+    </w:p>
+    <w:p>
+      <w:pPr>
+        <w:pStyle w:val="Normal"/>
+        <w:numPr>
+          <w:ilvl w:val="0"/>
+          <w:numId w:val="1"/>
+        </w:numPr>
+        <w:widowControl/>
+      </w:pPr>
+      <w:r>
+        <w:rPr>
+          <w:rFonts w:ascii="Calibri" w:hAnsi="Calibri" w:cs="Calibri"/>
+          <w:b/>
+          <w:bCs/>
+        </w:rPr>
+        <w:t>Authority:</w:t>
+      </w:r>
+      <w:r>
+        <w:rPr>
+          <w:rFonts w:ascii="Calibri" w:hAnsi="Calibri" w:cs="Calibri"/>
+        </w:rPr>
+        <w:t xml:space="preserve"> Existing golden-store/human-review evidence plus the P10B synthesis and fingerprint authorities.</w:t>
       </w:r>
     </w:p>
     <w:p>
@@ -14033,7 +13000,7 @@
         <w:rPr>
           <w:rFonts w:ascii="Calibri" w:hAnsi="Calibri" w:cs="Calibri"/>
         </w:rPr>
-        <w:t xml:space="preserve"> P10C-03 through P10C-05 and P10A internal router/packages.</w:t>
+        <w:t xml:space="preserve"> P10B-17 and every prior P10B task.</w:t>
       </w:r>
     </w:p>
     <w:p>
@@ -14057,31 +13024,55 @@
         <w:rPr>
           <w:rFonts w:ascii="Calibri" w:hAnsi="Calibri" w:cs="Calibri"/>
         </w:rPr>
-        <w:t xml:space="preserve"> The stated outcome and required evidence are accepted.</w:t>
-      </w:r>
-    </w:p>
-    <w:p>
-      <w:pPr>
-        <w:pStyle w:val="Normal"/>
-        <w:numPr>
-          <w:ilvl w:val="0"/>
-          <w:numId w:val="1"/>
-        </w:numPr>
-        <w:widowControl/>
-      </w:pPr>
-      <w:r>
-        <w:rPr>
-          <w:rFonts w:ascii="Calibri" w:hAnsi="Calibri" w:cs="Calibri"/>
-          <w:b/>
-          <w:bCs/>
-        </w:rPr>
-        <w:t>Required evidence:</w:t>
-      </w:r>
-      <w:r>
-        <w:rPr>
-          <w:rFonts w:ascii="Calibri" w:hAnsi="Calibri" w:cs="Calibri"/>
-        </w:rPr>
-        <w:t xml:space="preserve"> Selected-section, frame, page, storefront, ambiguity, stale, and failure browser flows.</w:t>
+        <w:t xml:space="preserve"> At least 100 deterministic complete configurations across representative catalogue/evidence/asset/locale/page-set/direction contexts pass snapshot validity, protected parity, exact-duplicate, near-duplicate, and structural-distribution gates; a fingerprint- stratified subset passes retained four-width human commercial review.</w:t>
+      </w:r>
+    </w:p>
+    <w:p>
+      <w:pPr>
+        <w:pStyle w:val="Normal"/>
+        <w:numPr>
+          <w:ilvl w:val="0"/>
+          <w:numId w:val="1"/>
+        </w:numPr>
+        <w:widowControl/>
+      </w:pPr>
+      <w:r>
+        <w:rPr>
+          <w:rFonts w:ascii="Calibri" w:hAnsi="Calibri" w:cs="Calibri"/>
+          <w:b/>
+          <w:bCs/>
+        </w:rPr>
+        <w:t>Fail closed:</w:t>
+      </w:r>
+      <w:r>
+        <w:rPr>
+          <w:rFonts w:ascii="Calibri" w:hAnsi="Calibri" w:cs="Calibri"/>
+        </w:rPr>
+        <w:t xml:space="preserve"> One polished store, automated checks alone, placeholder assets, registry counts, screenshots without exact authority, or colour-only diversity cannot close P10B.</w:t>
+      </w:r>
+    </w:p>
+    <w:p>
+      <w:pPr>
+        <w:pStyle w:val="Normal"/>
+        <w:numPr>
+          <w:ilvl w:val="0"/>
+          <w:numId w:val="1"/>
+        </w:numPr>
+        <w:widowControl/>
+      </w:pPr>
+      <w:r>
+        <w:rPr>
+          <w:rFonts w:ascii="Calibri" w:hAnsi="Calibri" w:cs="Calibri"/>
+          <w:b/>
+          <w:bCs/>
+        </w:rPr>
+        <w:t>Evidence:</w:t>
+      </w:r>
+      <w:r>
+        <w:rPr>
+          <w:rFonts w:ascii="Calibri" w:hAnsi="Calibri" w:cs="Calibri"/>
+        </w:rPr>
+        <w:t xml:space="preserve"> Scale-generation ledger, fingerprint/diversity analysis, complete capability-chain correlations, retained screenshots, and explicit human acceptance.</w:t>
       </w:r>
     </w:p>
     <w:p>
@@ -14105,7 +13096,20 @@
         <w:rPr>
           <w:rFonts w:ascii="Calibri" w:hAnsi="Calibri" w:cs="Calibri"/>
         </w:rPr>
-        <w:t xml:space="preserve"> Rebuilding the router, packages, proposals, or provider boundary.</w:t>
+        <w:t xml:space="preserve"> P10C merchant editing, Vesko staging, or production-readiness claims.</w:t>
+      </w:r>
+    </w:p>
+    <w:p>
+      <w:pPr>
+        <w:pStyle w:val="Heading2"/>
+        <w:keepNext/>
+        <w:widowControl/>
+      </w:pPr>
+      <w:r>
+        <w:rPr>
+          <w:rFonts w:ascii="Calibri" w:hAnsi="Calibri" w:cs="Calibri"/>
+        </w:rPr>
+        <w:t>P10C — Storefront Studio Editing Experience v1</w:t>
       </w:r>
     </w:p>
     <w:p>
@@ -14118,7 +13122,7 @@
         <w:rPr>
           <w:rFonts w:ascii="Calibri" w:hAnsi="Calibri" w:cs="Calibri"/>
         </w:rPr>
-        <w:t>P10C-07 — Unified AI/manual history</w:t>
+        <w:t>P10C-01 — Brand asset library</w:t>
       </w:r>
     </w:p>
     <w:p>
@@ -14142,7 +13146,7 @@
         <w:rPr>
           <w:rFonts w:ascii="Calibri" w:hAnsi="Calibri" w:cs="Calibri"/>
         </w:rPr>
-        <w:t xml:space="preserve"> Put manual and accepted AI operations into one atomic canonical undo/redo history.</w:t>
+        <w:t xml:space="preserve"> Let merchants view and choose approved presentation assets in Storefront Studio.</w:t>
       </w:r>
     </w:p>
     <w:p>
@@ -14204,7 +13208,7 @@
         <w:rPr>
           <w:rFonts w:ascii="Calibri" w:hAnsi="Calibri" w:cs="Calibri"/>
         </w:rPr>
-        <w:t xml:space="preserve"> P10C-05, P10C-06.</w:t>
+        <w:t xml:space="preserve"> P10B asset authority.</w:t>
       </w:r>
     </w:p>
     <w:p>
@@ -14252,7 +13256,7 @@
         <w:rPr>
           <w:rFonts w:ascii="Calibri" w:hAnsi="Calibri" w:cs="Calibri"/>
         </w:rPr>
-        <w:t xml:space="preserve"> Mixed edits, undo/redo, save/reload, stale protection.</w:t>
+        <w:t xml:space="preserve"> Contract, integration, browser/E2E.</w:t>
       </w:r>
     </w:p>
     <w:p>
@@ -14276,7 +13280,7 @@
         <w:rPr>
           <w:rFonts w:ascii="Calibri" w:hAnsi="Calibri" w:cs="Calibri"/>
         </w:rPr>
-        <w:t xml:space="preserve"> A Puck-only or AI-only history.</w:t>
+        <w:t xml:space="preserve"> Product-media replacement or generic DAM scope.</w:t>
       </w:r>
     </w:p>
     <w:p>
@@ -14289,7 +13293,7 @@
         <w:rPr>
           <w:rFonts w:ascii="Calibri" w:hAnsi="Calibri" w:cs="Calibri"/>
         </w:rPr>
-        <w:t>P10C-08 — Brand and asset editor with Studio shell</w:t>
+        <w:t>P10C-02 — Asset roles and provenance</w:t>
       </w:r>
     </w:p>
     <w:p>
@@ -14313,7 +13317,7 @@
         <w:rPr>
           <w:rFonts w:ascii="Calibri" w:hAnsi="Calibri" w:cs="Calibri"/>
         </w:rPr>
-        <w:t xml:space="preserve"> Deliver the merchant shell subset required to operate assets, canvas, review, save, preview, and publish.</w:t>
+        <w:t xml:space="preserve"> Show and preserve role, source, approval, revision, and assignment authority.</w:t>
       </w:r>
     </w:p>
     <w:p>
@@ -14375,7 +13379,7 @@
         <w:rPr>
           <w:rFonts w:ascii="Calibri" w:hAnsi="Calibri" w:cs="Calibri"/>
         </w:rPr>
-        <w:t xml:space="preserve"> P10C-01 through P10C-07.</w:t>
+        <w:t xml:space="preserve"> P10C-01.</w:t>
       </w:r>
     </w:p>
     <w:p>
@@ -14423,7 +13427,7 @@
         <w:rPr>
           <w:rFonts w:ascii="Calibri" w:hAnsi="Calibri" w:cs="Calibri"/>
         </w:rPr>
-        <w:t xml:space="preserve"> Default/loading/empty/error/stale/success/unsaved states, accessibility, responsive browser/E2E.</w:t>
+        <w:t xml:space="preserve"> Valid assignment and stale/unknown/role-mismatch rejection.</w:t>
       </w:r>
     </w:p>
     <w:p>
@@ -14447,7 +13451,7 @@
         <w:rPr>
           <w:rFonts w:ascii="Calibri" w:hAnsi="Calibri" w:cs="Calibri"/>
         </w:rPr>
-        <w:t xml:space="preserve"> Full CMS or exposure of implementation internals.</w:t>
+        <w:t xml:space="preserve"> Untyped uploads or hidden provenance.</w:t>
       </w:r>
     </w:p>
     <w:p>
@@ -14460,6 +13464,1046 @@
         <w:rPr>
           <w:rFonts w:ascii="Calibri" w:hAnsi="Calibri" w:cs="Calibri"/>
         </w:rPr>
+        <w:t>P10C-03 — Canonical Puck boundary</w:t>
+      </w:r>
+    </w:p>
+    <w:p>
+      <w:pPr>
+        <w:pStyle w:val="Normal"/>
+        <w:numPr>
+          <w:ilvl w:val="0"/>
+          <w:numId w:val="1"/>
+        </w:numPr>
+        <w:widowControl/>
+      </w:pPr>
+      <w:r>
+        <w:rPr>
+          <w:rFonts w:ascii="Calibri" w:hAnsi="Calibri" w:cs="Calibri"/>
+          <w:b/>
+          <w:bCs/>
+        </w:rPr>
+        <w:t>Outcome:</w:t>
+      </w:r>
+      <w:r>
+        <w:rPr>
+          <w:rFonts w:ascii="Calibri" w:hAnsi="Calibri" w:cs="Calibri"/>
+        </w:rPr>
+        <w:t xml:space="preserve"> Project registered canonical content into Puck and validate edits back into the same </w:t>
+      </w:r>
+      <w:r>
+        <w:rPr>
+          <w:rFonts w:ascii="Consolas" w:hAnsi="Consolas" w:cs="Consolas"/>
+          <w:sz w:val="19"/>
+          <w:szCs w:val="19"/>
+        </w:rPr>
+        <w:t>StorefrontSnapshot</w:t>
+      </w:r>
+      <w:r>
+        <w:rPr>
+          <w:rFonts w:ascii="Calibri" w:hAnsi="Calibri" w:cs="Calibri"/>
+        </w:rPr>
+        <w:t>.</w:t>
+      </w:r>
+    </w:p>
+    <w:p>
+      <w:pPr>
+        <w:pStyle w:val="Normal"/>
+        <w:numPr>
+          <w:ilvl w:val="0"/>
+          <w:numId w:val="1"/>
+        </w:numPr>
+        <w:widowControl/>
+      </w:pPr>
+      <w:r>
+        <w:rPr>
+          <w:rFonts w:ascii="Calibri" w:hAnsi="Calibri" w:cs="Calibri"/>
+          <w:b/>
+          <w:bCs/>
+        </w:rPr>
+        <w:t>Status:</w:t>
+      </w:r>
+      <w:r>
+        <w:rPr>
+          <w:rFonts w:ascii="Calibri" w:hAnsi="Calibri" w:cs="Calibri"/>
+        </w:rPr>
+        <w:t xml:space="preserve"> </w:t>
+      </w:r>
+      <w:r>
+        <w:rPr>
+          <w:rFonts w:ascii="Calibri" w:hAnsi="Calibri" w:cs="Calibri"/>
+          <w:b/>
+          <w:bCs/>
+        </w:rPr>
+        <w:t>Planned</w:t>
+      </w:r>
+      <w:r>
+        <w:rPr>
+          <w:rFonts w:ascii="Calibri" w:hAnsi="Calibri" w:cs="Calibri"/>
+        </w:rPr>
+        <w:t>.</w:t>
+      </w:r>
+    </w:p>
+    <w:p>
+      <w:pPr>
+        <w:pStyle w:val="Normal"/>
+        <w:numPr>
+          <w:ilvl w:val="0"/>
+          <w:numId w:val="1"/>
+        </w:numPr>
+        <w:widowControl/>
+      </w:pPr>
+      <w:r>
+        <w:rPr>
+          <w:rFonts w:ascii="Calibri" w:hAnsi="Calibri" w:cs="Calibri"/>
+          <w:b/>
+          <w:bCs/>
+        </w:rPr>
+        <w:t>Depends on:</w:t>
+      </w:r>
+      <w:r>
+        <w:rPr>
+          <w:rFonts w:ascii="Calibri" w:hAnsi="Calibri" w:cs="Calibri"/>
+        </w:rPr>
+        <w:t xml:space="preserve"> P10B component/profile authority.</w:t>
+      </w:r>
+    </w:p>
+    <w:p>
+      <w:pPr>
+        <w:pStyle w:val="Normal"/>
+        <w:numPr>
+          <w:ilvl w:val="0"/>
+          <w:numId w:val="1"/>
+        </w:numPr>
+        <w:widowControl/>
+      </w:pPr>
+      <w:r>
+        <w:rPr>
+          <w:rFonts w:ascii="Calibri" w:hAnsi="Calibri" w:cs="Calibri"/>
+          <w:b/>
+          <w:bCs/>
+        </w:rPr>
+        <w:t>Done when:</w:t>
+      </w:r>
+      <w:r>
+        <w:rPr>
+          <w:rFonts w:ascii="Calibri" w:hAnsi="Calibri" w:cs="Calibri"/>
+        </w:rPr>
+        <w:t xml:space="preserve"> The stated outcome and required evidence are accepted.</w:t>
+      </w:r>
+    </w:p>
+    <w:p>
+      <w:pPr>
+        <w:pStyle w:val="Normal"/>
+        <w:numPr>
+          <w:ilvl w:val="0"/>
+          <w:numId w:val="1"/>
+        </w:numPr>
+        <w:widowControl/>
+      </w:pPr>
+      <w:r>
+        <w:rPr>
+          <w:rFonts w:ascii="Calibri" w:hAnsi="Calibri" w:cs="Calibri"/>
+          <w:b/>
+          <w:bCs/>
+        </w:rPr>
+        <w:t>Required evidence:</w:t>
+      </w:r>
+      <w:r>
+        <w:rPr>
+          <w:rFonts w:ascii="Calibri" w:hAnsi="Calibri" w:cs="Calibri"/>
+        </w:rPr>
+        <w:t xml:space="preserve"> Adapter conformance and save/reload preservation.</w:t>
+      </w:r>
+    </w:p>
+    <w:p>
+      <w:pPr>
+        <w:pStyle w:val="Normal"/>
+        <w:numPr>
+          <w:ilvl w:val="0"/>
+          <w:numId w:val="1"/>
+        </w:numPr>
+        <w:widowControl/>
+      </w:pPr>
+      <w:r>
+        <w:rPr>
+          <w:rFonts w:ascii="Calibri" w:hAnsi="Calibri" w:cs="Calibri"/>
+          <w:b/>
+          <w:bCs/>
+        </w:rPr>
+        <w:t>Non-goal:</w:t>
+      </w:r>
+      <w:r>
+        <w:rPr>
+          <w:rFonts w:ascii="Calibri" w:hAnsi="Calibri" w:cs="Calibri"/>
+        </w:rPr>
+        <w:t xml:space="preserve"> Raw Puck persistence or a second page tree.</w:t>
+      </w:r>
+    </w:p>
+    <w:p>
+      <w:pPr>
+        <w:pStyle w:val="Heading3"/>
+        <w:keepNext/>
+        <w:widowControl/>
+      </w:pPr>
+      <w:r>
+        <w:rPr>
+          <w:rFonts w:ascii="Calibri" w:hAnsi="Calibri" w:cs="Calibri"/>
+        </w:rPr>
+        <w:t>P10C-04 — Stable frame identity and selection</w:t>
+      </w:r>
+    </w:p>
+    <w:p>
+      <w:pPr>
+        <w:pStyle w:val="Normal"/>
+        <w:numPr>
+          <w:ilvl w:val="0"/>
+          <w:numId w:val="1"/>
+        </w:numPr>
+        <w:widowControl/>
+      </w:pPr>
+      <w:r>
+        <w:rPr>
+          <w:rFonts w:ascii="Calibri" w:hAnsi="Calibri" w:cs="Calibri"/>
+          <w:b/>
+          <w:bCs/>
+        </w:rPr>
+        <w:t>Outcome:</w:t>
+      </w:r>
+      <w:r>
+        <w:rPr>
+          <w:rFonts w:ascii="Calibri" w:hAnsi="Calibri" w:cs="Calibri"/>
+        </w:rPr>
+        <w:t xml:space="preserve"> Select and edit one shared frame consistently from every page context.</w:t>
+      </w:r>
+    </w:p>
+    <w:p>
+      <w:pPr>
+        <w:pStyle w:val="Normal"/>
+        <w:numPr>
+          <w:ilvl w:val="0"/>
+          <w:numId w:val="1"/>
+        </w:numPr>
+        <w:widowControl/>
+      </w:pPr>
+      <w:r>
+        <w:rPr>
+          <w:rFonts w:ascii="Calibri" w:hAnsi="Calibri" w:cs="Calibri"/>
+          <w:b/>
+          <w:bCs/>
+        </w:rPr>
+        <w:t>Status:</w:t>
+      </w:r>
+      <w:r>
+        <w:rPr>
+          <w:rFonts w:ascii="Calibri" w:hAnsi="Calibri" w:cs="Calibri"/>
+        </w:rPr>
+        <w:t xml:space="preserve"> </w:t>
+      </w:r>
+      <w:r>
+        <w:rPr>
+          <w:rFonts w:ascii="Calibri" w:hAnsi="Calibri" w:cs="Calibri"/>
+          <w:b/>
+          <w:bCs/>
+        </w:rPr>
+        <w:t>Planned</w:t>
+      </w:r>
+      <w:r>
+        <w:rPr>
+          <w:rFonts w:ascii="Calibri" w:hAnsi="Calibri" w:cs="Calibri"/>
+        </w:rPr>
+        <w:t>.</w:t>
+      </w:r>
+    </w:p>
+    <w:p>
+      <w:pPr>
+        <w:pStyle w:val="Normal"/>
+        <w:numPr>
+          <w:ilvl w:val="0"/>
+          <w:numId w:val="1"/>
+        </w:numPr>
+        <w:widowControl/>
+      </w:pPr>
+      <w:r>
+        <w:rPr>
+          <w:rFonts w:ascii="Calibri" w:hAnsi="Calibri" w:cs="Calibri"/>
+          <w:b/>
+          <w:bCs/>
+        </w:rPr>
+        <w:t>Depends on:</w:t>
+      </w:r>
+      <w:r>
+        <w:rPr>
+          <w:rFonts w:ascii="Calibri" w:hAnsi="Calibri" w:cs="Calibri"/>
+        </w:rPr>
+        <w:t xml:space="preserve"> P10C-03.</w:t>
+      </w:r>
+    </w:p>
+    <w:p>
+      <w:pPr>
+        <w:pStyle w:val="Normal"/>
+        <w:numPr>
+          <w:ilvl w:val="0"/>
+          <w:numId w:val="1"/>
+        </w:numPr>
+        <w:widowControl/>
+      </w:pPr>
+      <w:r>
+        <w:rPr>
+          <w:rFonts w:ascii="Calibri" w:hAnsi="Calibri" w:cs="Calibri"/>
+          <w:b/>
+          <w:bCs/>
+        </w:rPr>
+        <w:t>Done when:</w:t>
+      </w:r>
+      <w:r>
+        <w:rPr>
+          <w:rFonts w:ascii="Calibri" w:hAnsi="Calibri" w:cs="Calibri"/>
+        </w:rPr>
+        <w:t xml:space="preserve"> The stated outcome and required evidence are accepted.</w:t>
+      </w:r>
+    </w:p>
+    <w:p>
+      <w:pPr>
+        <w:pStyle w:val="Normal"/>
+        <w:numPr>
+          <w:ilvl w:val="0"/>
+          <w:numId w:val="1"/>
+        </w:numPr>
+        <w:widowControl/>
+      </w:pPr>
+      <w:r>
+        <w:rPr>
+          <w:rFonts w:ascii="Calibri" w:hAnsi="Calibri" w:cs="Calibri"/>
+          <w:b/>
+          <w:bCs/>
+        </w:rPr>
+        <w:t>Required evidence:</w:t>
+      </w:r>
+      <w:r>
+        <w:rPr>
+          <w:rFonts w:ascii="Calibri" w:hAnsi="Calibri" w:cs="Calibri"/>
+        </w:rPr>
+        <w:t xml:space="preserve"> Stable identity, scope, history, and browser behavior.</w:t>
+      </w:r>
+    </w:p>
+    <w:p>
+      <w:pPr>
+        <w:pStyle w:val="Normal"/>
+        <w:numPr>
+          <w:ilvl w:val="0"/>
+          <w:numId w:val="1"/>
+        </w:numPr>
+        <w:widowControl/>
+      </w:pPr>
+      <w:r>
+        <w:rPr>
+          <w:rFonts w:ascii="Calibri" w:hAnsi="Calibri" w:cs="Calibri"/>
+          <w:b/>
+          <w:bCs/>
+        </w:rPr>
+        <w:t>Non-goal:</w:t>
+      </w:r>
+      <w:r>
+        <w:rPr>
+          <w:rFonts w:ascii="Calibri" w:hAnsi="Calibri" w:cs="Calibri"/>
+        </w:rPr>
+        <w:t xml:space="preserve"> Duplicating frame state per page.</w:t>
+      </w:r>
+    </w:p>
+    <w:p>
+      <w:pPr>
+        <w:pStyle w:val="Heading3"/>
+        <w:keepNext/>
+        <w:widowControl/>
+      </w:pPr>
+      <w:r>
+        <w:rPr>
+          <w:rFonts w:ascii="Calibri" w:hAnsi="Calibri" w:cs="Calibri"/>
+        </w:rPr>
+        <w:t>P10C-05 — Approved manual frame operations</w:t>
+      </w:r>
+    </w:p>
+    <w:p>
+      <w:pPr>
+        <w:pStyle w:val="Normal"/>
+        <w:numPr>
+          <w:ilvl w:val="0"/>
+          <w:numId w:val="1"/>
+        </w:numPr>
+        <w:widowControl/>
+      </w:pPr>
+      <w:r>
+        <w:rPr>
+          <w:rFonts w:ascii="Calibri" w:hAnsi="Calibri" w:cs="Calibri"/>
+          <w:b/>
+          <w:bCs/>
+        </w:rPr>
+        <w:t>Outcome:</w:t>
+      </w:r>
+      <w:r>
+        <w:rPr>
+          <w:rFonts w:ascii="Calibri" w:hAnsi="Calibri" w:cs="Calibri"/>
+        </w:rPr>
+        <w:t xml:space="preserve"> Support bounded manual shared-frame add, remove, reorder, field, asset, and presentation operations.</w:t>
+      </w:r>
+    </w:p>
+    <w:p>
+      <w:pPr>
+        <w:pStyle w:val="Normal"/>
+        <w:numPr>
+          <w:ilvl w:val="0"/>
+          <w:numId w:val="1"/>
+        </w:numPr>
+        <w:widowControl/>
+      </w:pPr>
+      <w:r>
+        <w:rPr>
+          <w:rFonts w:ascii="Calibri" w:hAnsi="Calibri" w:cs="Calibri"/>
+          <w:b/>
+          <w:bCs/>
+        </w:rPr>
+        <w:t>Status:</w:t>
+      </w:r>
+      <w:r>
+        <w:rPr>
+          <w:rFonts w:ascii="Calibri" w:hAnsi="Calibri" w:cs="Calibri"/>
+        </w:rPr>
+        <w:t xml:space="preserve"> </w:t>
+      </w:r>
+      <w:r>
+        <w:rPr>
+          <w:rFonts w:ascii="Calibri" w:hAnsi="Calibri" w:cs="Calibri"/>
+          <w:b/>
+          <w:bCs/>
+        </w:rPr>
+        <w:t>Planned</w:t>
+      </w:r>
+      <w:r>
+        <w:rPr>
+          <w:rFonts w:ascii="Calibri" w:hAnsi="Calibri" w:cs="Calibri"/>
+        </w:rPr>
+        <w:t>.</w:t>
+      </w:r>
+    </w:p>
+    <w:p>
+      <w:pPr>
+        <w:pStyle w:val="Normal"/>
+        <w:numPr>
+          <w:ilvl w:val="0"/>
+          <w:numId w:val="1"/>
+        </w:numPr>
+        <w:widowControl/>
+      </w:pPr>
+      <w:r>
+        <w:rPr>
+          <w:rFonts w:ascii="Calibri" w:hAnsi="Calibri" w:cs="Calibri"/>
+          <w:b/>
+          <w:bCs/>
+        </w:rPr>
+        <w:t>Depends on:</w:t>
+      </w:r>
+      <w:r>
+        <w:rPr>
+          <w:rFonts w:ascii="Calibri" w:hAnsi="Calibri" w:cs="Calibri"/>
+        </w:rPr>
+        <w:t xml:space="preserve"> P10C-02 through P10C-04.</w:t>
+      </w:r>
+    </w:p>
+    <w:p>
+      <w:pPr>
+        <w:pStyle w:val="Normal"/>
+        <w:numPr>
+          <w:ilvl w:val="0"/>
+          <w:numId w:val="1"/>
+        </w:numPr>
+        <w:widowControl/>
+      </w:pPr>
+      <w:r>
+        <w:rPr>
+          <w:rFonts w:ascii="Calibri" w:hAnsi="Calibri" w:cs="Calibri"/>
+          <w:b/>
+          <w:bCs/>
+        </w:rPr>
+        <w:t>Done when:</w:t>
+      </w:r>
+      <w:r>
+        <w:rPr>
+          <w:rFonts w:ascii="Calibri" w:hAnsi="Calibri" w:cs="Calibri"/>
+        </w:rPr>
+        <w:t xml:space="preserve"> The stated outcome and required evidence are accepted.</w:t>
+      </w:r>
+    </w:p>
+    <w:p>
+      <w:pPr>
+        <w:pStyle w:val="Normal"/>
+        <w:numPr>
+          <w:ilvl w:val="0"/>
+          <w:numId w:val="1"/>
+        </w:numPr>
+        <w:widowControl/>
+      </w:pPr>
+      <w:r>
+        <w:rPr>
+          <w:rFonts w:ascii="Calibri" w:hAnsi="Calibri" w:cs="Calibri"/>
+          <w:b/>
+          <w:bCs/>
+        </w:rPr>
+        <w:t>Required evidence:</w:t>
+      </w:r>
+      <w:r>
+        <w:rPr>
+          <w:rFonts w:ascii="Calibri" w:hAnsi="Calibri" w:cs="Calibri"/>
+        </w:rPr>
+        <w:t xml:space="preserve"> Positive and fail-closed integration, undo/redo, browser/E2E.</w:t>
+      </w:r>
+    </w:p>
+    <w:p>
+      <w:pPr>
+        <w:pStyle w:val="Normal"/>
+        <w:numPr>
+          <w:ilvl w:val="0"/>
+          <w:numId w:val="1"/>
+        </w:numPr>
+        <w:widowControl/>
+      </w:pPr>
+      <w:r>
+        <w:rPr>
+          <w:rFonts w:ascii="Calibri" w:hAnsi="Calibri" w:cs="Calibri"/>
+          <w:b/>
+          <w:bCs/>
+        </w:rPr>
+        <w:t>Non-goal:</w:t>
+      </w:r>
+      <w:r>
+        <w:rPr>
+          <w:rFonts w:ascii="Calibri" w:hAnsi="Calibri" w:cs="Calibri"/>
+        </w:rPr>
+        <w:t xml:space="preserve"> Arbitrary code/CSS/components or commerce mutation.</w:t>
+      </w:r>
+    </w:p>
+    <w:p>
+      <w:pPr>
+        <w:pStyle w:val="Heading3"/>
+        <w:keepNext/>
+        <w:widowControl/>
+      </w:pPr>
+      <w:r>
+        <w:rPr>
+          <w:rFonts w:ascii="Calibri" w:hAnsi="Calibri" w:cs="Calibri"/>
+        </w:rPr>
+        <w:t>P10C-06 — Scoped AI editing</w:t>
+      </w:r>
+    </w:p>
+    <w:p>
+      <w:pPr>
+        <w:pStyle w:val="Normal"/>
+        <w:numPr>
+          <w:ilvl w:val="0"/>
+          <w:numId w:val="1"/>
+        </w:numPr>
+        <w:widowControl/>
+      </w:pPr>
+      <w:r>
+        <w:rPr>
+          <w:rFonts w:ascii="Calibri" w:hAnsi="Calibri" w:cs="Calibri"/>
+          <w:b/>
+          <w:bCs/>
+        </w:rPr>
+        <w:t>Outcome:</w:t>
+      </w:r>
+      <w:r>
+        <w:rPr>
+          <w:rFonts w:ascii="Calibri" w:hAnsi="Calibri" w:cs="Calibri"/>
+        </w:rPr>
+        <w:t xml:space="preserve"> Connect merchant routing, clarification, frame/page scope, and proposal review to the existing P10A governed authorities.</w:t>
+      </w:r>
+    </w:p>
+    <w:p>
+      <w:pPr>
+        <w:pStyle w:val="Normal"/>
+        <w:numPr>
+          <w:ilvl w:val="0"/>
+          <w:numId w:val="1"/>
+        </w:numPr>
+        <w:widowControl/>
+      </w:pPr>
+      <w:r>
+        <w:rPr>
+          <w:rFonts w:ascii="Calibri" w:hAnsi="Calibri" w:cs="Calibri"/>
+          <w:b/>
+          <w:bCs/>
+        </w:rPr>
+        <w:t>Status:</w:t>
+      </w:r>
+      <w:r>
+        <w:rPr>
+          <w:rFonts w:ascii="Calibri" w:hAnsi="Calibri" w:cs="Calibri"/>
+        </w:rPr>
+        <w:t xml:space="preserve"> </w:t>
+      </w:r>
+      <w:r>
+        <w:rPr>
+          <w:rFonts w:ascii="Calibri" w:hAnsi="Calibri" w:cs="Calibri"/>
+          <w:b/>
+          <w:bCs/>
+        </w:rPr>
+        <w:t>Planned</w:t>
+      </w:r>
+      <w:r>
+        <w:rPr>
+          <w:rFonts w:ascii="Calibri" w:hAnsi="Calibri" w:cs="Calibri"/>
+        </w:rPr>
+        <w:t>.</w:t>
+      </w:r>
+    </w:p>
+    <w:p>
+      <w:pPr>
+        <w:pStyle w:val="Normal"/>
+        <w:numPr>
+          <w:ilvl w:val="0"/>
+          <w:numId w:val="1"/>
+        </w:numPr>
+        <w:widowControl/>
+      </w:pPr>
+      <w:r>
+        <w:rPr>
+          <w:rFonts w:ascii="Calibri" w:hAnsi="Calibri" w:cs="Calibri"/>
+          <w:b/>
+          <w:bCs/>
+        </w:rPr>
+        <w:t>Depends on:</w:t>
+      </w:r>
+      <w:r>
+        <w:rPr>
+          <w:rFonts w:ascii="Calibri" w:hAnsi="Calibri" w:cs="Calibri"/>
+        </w:rPr>
+        <w:t xml:space="preserve"> P10C-03 through P10C-05 and P10A internal router/packages.</w:t>
+      </w:r>
+    </w:p>
+    <w:p>
+      <w:pPr>
+        <w:pStyle w:val="Normal"/>
+        <w:numPr>
+          <w:ilvl w:val="0"/>
+          <w:numId w:val="1"/>
+        </w:numPr>
+        <w:widowControl/>
+      </w:pPr>
+      <w:r>
+        <w:rPr>
+          <w:rFonts w:ascii="Calibri" w:hAnsi="Calibri" w:cs="Calibri"/>
+          <w:b/>
+          <w:bCs/>
+        </w:rPr>
+        <w:t>Done when:</w:t>
+      </w:r>
+      <w:r>
+        <w:rPr>
+          <w:rFonts w:ascii="Calibri" w:hAnsi="Calibri" w:cs="Calibri"/>
+        </w:rPr>
+        <w:t xml:space="preserve"> The stated outcome and required evidence are accepted.</w:t>
+      </w:r>
+    </w:p>
+    <w:p>
+      <w:pPr>
+        <w:pStyle w:val="Normal"/>
+        <w:numPr>
+          <w:ilvl w:val="0"/>
+          <w:numId w:val="1"/>
+        </w:numPr>
+        <w:widowControl/>
+      </w:pPr>
+      <w:r>
+        <w:rPr>
+          <w:rFonts w:ascii="Calibri" w:hAnsi="Calibri" w:cs="Calibri"/>
+          <w:b/>
+          <w:bCs/>
+        </w:rPr>
+        <w:t>Required evidence:</w:t>
+      </w:r>
+      <w:r>
+        <w:rPr>
+          <w:rFonts w:ascii="Calibri" w:hAnsi="Calibri" w:cs="Calibri"/>
+        </w:rPr>
+        <w:t xml:space="preserve"> Selected-section, frame, page, storefront, ambiguity, stale, and failure browser flows.</w:t>
+      </w:r>
+    </w:p>
+    <w:p>
+      <w:pPr>
+        <w:pStyle w:val="Normal"/>
+        <w:numPr>
+          <w:ilvl w:val="0"/>
+          <w:numId w:val="1"/>
+        </w:numPr>
+        <w:widowControl/>
+      </w:pPr>
+      <w:r>
+        <w:rPr>
+          <w:rFonts w:ascii="Calibri" w:hAnsi="Calibri" w:cs="Calibri"/>
+          <w:b/>
+          <w:bCs/>
+        </w:rPr>
+        <w:t>Non-goal:</w:t>
+      </w:r>
+      <w:r>
+        <w:rPr>
+          <w:rFonts w:ascii="Calibri" w:hAnsi="Calibri" w:cs="Calibri"/>
+        </w:rPr>
+        <w:t xml:space="preserve"> Rebuilding the router, packages, proposals, or provider boundary.</w:t>
+      </w:r>
+    </w:p>
+    <w:p>
+      <w:pPr>
+        <w:pStyle w:val="Heading3"/>
+        <w:keepNext/>
+        <w:widowControl/>
+      </w:pPr>
+      <w:r>
+        <w:rPr>
+          <w:rFonts w:ascii="Calibri" w:hAnsi="Calibri" w:cs="Calibri"/>
+        </w:rPr>
+        <w:t>P10C-07 — Unified AI/manual history</w:t>
+      </w:r>
+    </w:p>
+    <w:p>
+      <w:pPr>
+        <w:pStyle w:val="Normal"/>
+        <w:numPr>
+          <w:ilvl w:val="0"/>
+          <w:numId w:val="1"/>
+        </w:numPr>
+        <w:widowControl/>
+      </w:pPr>
+      <w:r>
+        <w:rPr>
+          <w:rFonts w:ascii="Calibri" w:hAnsi="Calibri" w:cs="Calibri"/>
+          <w:b/>
+          <w:bCs/>
+        </w:rPr>
+        <w:t>Outcome:</w:t>
+      </w:r>
+      <w:r>
+        <w:rPr>
+          <w:rFonts w:ascii="Calibri" w:hAnsi="Calibri" w:cs="Calibri"/>
+        </w:rPr>
+        <w:t xml:space="preserve"> Put manual and accepted AI operations into one atomic canonical undo/redo history.</w:t>
+      </w:r>
+    </w:p>
+    <w:p>
+      <w:pPr>
+        <w:pStyle w:val="Normal"/>
+        <w:numPr>
+          <w:ilvl w:val="0"/>
+          <w:numId w:val="1"/>
+        </w:numPr>
+        <w:widowControl/>
+      </w:pPr>
+      <w:r>
+        <w:rPr>
+          <w:rFonts w:ascii="Calibri" w:hAnsi="Calibri" w:cs="Calibri"/>
+          <w:b/>
+          <w:bCs/>
+        </w:rPr>
+        <w:t>Status:</w:t>
+      </w:r>
+      <w:r>
+        <w:rPr>
+          <w:rFonts w:ascii="Calibri" w:hAnsi="Calibri" w:cs="Calibri"/>
+        </w:rPr>
+        <w:t xml:space="preserve"> </w:t>
+      </w:r>
+      <w:r>
+        <w:rPr>
+          <w:rFonts w:ascii="Calibri" w:hAnsi="Calibri" w:cs="Calibri"/>
+          <w:b/>
+          <w:bCs/>
+        </w:rPr>
+        <w:t>Planned</w:t>
+      </w:r>
+      <w:r>
+        <w:rPr>
+          <w:rFonts w:ascii="Calibri" w:hAnsi="Calibri" w:cs="Calibri"/>
+        </w:rPr>
+        <w:t>.</w:t>
+      </w:r>
+    </w:p>
+    <w:p>
+      <w:pPr>
+        <w:pStyle w:val="Normal"/>
+        <w:numPr>
+          <w:ilvl w:val="0"/>
+          <w:numId w:val="1"/>
+        </w:numPr>
+        <w:widowControl/>
+      </w:pPr>
+      <w:r>
+        <w:rPr>
+          <w:rFonts w:ascii="Calibri" w:hAnsi="Calibri" w:cs="Calibri"/>
+          <w:b/>
+          <w:bCs/>
+        </w:rPr>
+        <w:t>Depends on:</w:t>
+      </w:r>
+      <w:r>
+        <w:rPr>
+          <w:rFonts w:ascii="Calibri" w:hAnsi="Calibri" w:cs="Calibri"/>
+        </w:rPr>
+        <w:t xml:space="preserve"> P10C-05, P10C-06.</w:t>
+      </w:r>
+    </w:p>
+    <w:p>
+      <w:pPr>
+        <w:pStyle w:val="Normal"/>
+        <w:numPr>
+          <w:ilvl w:val="0"/>
+          <w:numId w:val="1"/>
+        </w:numPr>
+        <w:widowControl/>
+      </w:pPr>
+      <w:r>
+        <w:rPr>
+          <w:rFonts w:ascii="Calibri" w:hAnsi="Calibri" w:cs="Calibri"/>
+          <w:b/>
+          <w:bCs/>
+        </w:rPr>
+        <w:t>Done when:</w:t>
+      </w:r>
+      <w:r>
+        <w:rPr>
+          <w:rFonts w:ascii="Calibri" w:hAnsi="Calibri" w:cs="Calibri"/>
+        </w:rPr>
+        <w:t xml:space="preserve"> The stated outcome and required evidence are accepted.</w:t>
+      </w:r>
+    </w:p>
+    <w:p>
+      <w:pPr>
+        <w:pStyle w:val="Normal"/>
+        <w:numPr>
+          <w:ilvl w:val="0"/>
+          <w:numId w:val="1"/>
+        </w:numPr>
+        <w:widowControl/>
+      </w:pPr>
+      <w:r>
+        <w:rPr>
+          <w:rFonts w:ascii="Calibri" w:hAnsi="Calibri" w:cs="Calibri"/>
+          <w:b/>
+          <w:bCs/>
+        </w:rPr>
+        <w:t>Required evidence:</w:t>
+      </w:r>
+      <w:r>
+        <w:rPr>
+          <w:rFonts w:ascii="Calibri" w:hAnsi="Calibri" w:cs="Calibri"/>
+        </w:rPr>
+        <w:t xml:space="preserve"> Mixed edits, undo/redo, save/reload, stale protection.</w:t>
+      </w:r>
+    </w:p>
+    <w:p>
+      <w:pPr>
+        <w:pStyle w:val="Normal"/>
+        <w:numPr>
+          <w:ilvl w:val="0"/>
+          <w:numId w:val="1"/>
+        </w:numPr>
+        <w:widowControl/>
+      </w:pPr>
+      <w:r>
+        <w:rPr>
+          <w:rFonts w:ascii="Calibri" w:hAnsi="Calibri" w:cs="Calibri"/>
+          <w:b/>
+          <w:bCs/>
+        </w:rPr>
+        <w:t>Non-goal:</w:t>
+      </w:r>
+      <w:r>
+        <w:rPr>
+          <w:rFonts w:ascii="Calibri" w:hAnsi="Calibri" w:cs="Calibri"/>
+        </w:rPr>
+        <w:t xml:space="preserve"> A Puck-only or AI-only history.</w:t>
+      </w:r>
+    </w:p>
+    <w:p>
+      <w:pPr>
+        <w:pStyle w:val="Heading3"/>
+        <w:keepNext/>
+        <w:widowControl/>
+      </w:pPr>
+      <w:r>
+        <w:rPr>
+          <w:rFonts w:ascii="Calibri" w:hAnsi="Calibri" w:cs="Calibri"/>
+        </w:rPr>
+        <w:t>P10C-08 — Brand and asset editor with Studio shell</w:t>
+      </w:r>
+    </w:p>
+    <w:p>
+      <w:pPr>
+        <w:pStyle w:val="Normal"/>
+        <w:numPr>
+          <w:ilvl w:val="0"/>
+          <w:numId w:val="1"/>
+        </w:numPr>
+        <w:widowControl/>
+      </w:pPr>
+      <w:r>
+        <w:rPr>
+          <w:rFonts w:ascii="Calibri" w:hAnsi="Calibri" w:cs="Calibri"/>
+          <w:b/>
+          <w:bCs/>
+        </w:rPr>
+        <w:t>Outcome:</w:t>
+      </w:r>
+      <w:r>
+        <w:rPr>
+          <w:rFonts w:ascii="Calibri" w:hAnsi="Calibri" w:cs="Calibri"/>
+        </w:rPr>
+        <w:t xml:space="preserve"> Deliver the merchant shell subset required to operate assets, canvas, review, save, preview, and publish.</w:t>
+      </w:r>
+    </w:p>
+    <w:p>
+      <w:pPr>
+        <w:pStyle w:val="Normal"/>
+        <w:numPr>
+          <w:ilvl w:val="0"/>
+          <w:numId w:val="1"/>
+        </w:numPr>
+        <w:widowControl/>
+      </w:pPr>
+      <w:r>
+        <w:rPr>
+          <w:rFonts w:ascii="Calibri" w:hAnsi="Calibri" w:cs="Calibri"/>
+          <w:b/>
+          <w:bCs/>
+        </w:rPr>
+        <w:t>Status:</w:t>
+      </w:r>
+      <w:r>
+        <w:rPr>
+          <w:rFonts w:ascii="Calibri" w:hAnsi="Calibri" w:cs="Calibri"/>
+        </w:rPr>
+        <w:t xml:space="preserve"> </w:t>
+      </w:r>
+      <w:r>
+        <w:rPr>
+          <w:rFonts w:ascii="Calibri" w:hAnsi="Calibri" w:cs="Calibri"/>
+          <w:b/>
+          <w:bCs/>
+        </w:rPr>
+        <w:t>Planned</w:t>
+      </w:r>
+      <w:r>
+        <w:rPr>
+          <w:rFonts w:ascii="Calibri" w:hAnsi="Calibri" w:cs="Calibri"/>
+        </w:rPr>
+        <w:t>.</w:t>
+      </w:r>
+    </w:p>
+    <w:p>
+      <w:pPr>
+        <w:pStyle w:val="Normal"/>
+        <w:numPr>
+          <w:ilvl w:val="0"/>
+          <w:numId w:val="1"/>
+        </w:numPr>
+        <w:widowControl/>
+      </w:pPr>
+      <w:r>
+        <w:rPr>
+          <w:rFonts w:ascii="Calibri" w:hAnsi="Calibri" w:cs="Calibri"/>
+          <w:b/>
+          <w:bCs/>
+        </w:rPr>
+        <w:t>Depends on:</w:t>
+      </w:r>
+      <w:r>
+        <w:rPr>
+          <w:rFonts w:ascii="Calibri" w:hAnsi="Calibri" w:cs="Calibri"/>
+        </w:rPr>
+        <w:t xml:space="preserve"> P10C-01 through P10C-07.</w:t>
+      </w:r>
+    </w:p>
+    <w:p>
+      <w:pPr>
+        <w:pStyle w:val="Normal"/>
+        <w:numPr>
+          <w:ilvl w:val="0"/>
+          <w:numId w:val="1"/>
+        </w:numPr>
+        <w:widowControl/>
+      </w:pPr>
+      <w:r>
+        <w:rPr>
+          <w:rFonts w:ascii="Calibri" w:hAnsi="Calibri" w:cs="Calibri"/>
+          <w:b/>
+          <w:bCs/>
+        </w:rPr>
+        <w:t>Done when:</w:t>
+      </w:r>
+      <w:r>
+        <w:rPr>
+          <w:rFonts w:ascii="Calibri" w:hAnsi="Calibri" w:cs="Calibri"/>
+        </w:rPr>
+        <w:t xml:space="preserve"> The stated outcome and required evidence are accepted.</w:t>
+      </w:r>
+    </w:p>
+    <w:p>
+      <w:pPr>
+        <w:pStyle w:val="Normal"/>
+        <w:numPr>
+          <w:ilvl w:val="0"/>
+          <w:numId w:val="1"/>
+        </w:numPr>
+        <w:widowControl/>
+      </w:pPr>
+      <w:r>
+        <w:rPr>
+          <w:rFonts w:ascii="Calibri" w:hAnsi="Calibri" w:cs="Calibri"/>
+          <w:b/>
+          <w:bCs/>
+        </w:rPr>
+        <w:t>Required evidence:</w:t>
+      </w:r>
+      <w:r>
+        <w:rPr>
+          <w:rFonts w:ascii="Calibri" w:hAnsi="Calibri" w:cs="Calibri"/>
+        </w:rPr>
+        <w:t xml:space="preserve"> Default/loading/empty/error/stale/success/unsaved states, accessibility, responsive browser/E2E.</w:t>
+      </w:r>
+    </w:p>
+    <w:p>
+      <w:pPr>
+        <w:pStyle w:val="Normal"/>
+        <w:numPr>
+          <w:ilvl w:val="0"/>
+          <w:numId w:val="1"/>
+        </w:numPr>
+        <w:widowControl/>
+      </w:pPr>
+      <w:r>
+        <w:rPr>
+          <w:rFonts w:ascii="Calibri" w:hAnsi="Calibri" w:cs="Calibri"/>
+          <w:b/>
+          <w:bCs/>
+        </w:rPr>
+        <w:t>Non-goal:</w:t>
+      </w:r>
+      <w:r>
+        <w:rPr>
+          <w:rFonts w:ascii="Calibri" w:hAnsi="Calibri" w:cs="Calibri"/>
+        </w:rPr>
+        <w:t xml:space="preserve"> Full CMS or exposure of implementation internals.</w:t>
+      </w:r>
+    </w:p>
+    <w:p>
+      <w:pPr>
+        <w:pStyle w:val="Heading3"/>
+        <w:keepNext/>
+        <w:widowControl/>
+      </w:pPr>
+      <w:r>
+        <w:rPr>
+          <w:rFonts w:ascii="Calibri" w:hAnsi="Calibri" w:cs="Calibri"/>
+        </w:rPr>
         <w:t>P10C-09 — Studio commercial QA</w:t>
       </w:r>
     </w:p>
@@ -14964,7 +15008,7 @@
         </w:rPr>
         <w:t xml:space="preserve"> </w:t>
       </w:r>
-      <w:hyperlink r:id="rIdHyperlink14" w:history="1">
+      <w:hyperlink r:id="rIdHyperlink15" w:history="1">
         <w:r>
           <w:rPr>
             <w:rFonts w:ascii="Calibri" w:hAnsi="Calibri" w:cs="Calibri"/>
@@ -14980,7 +15024,7 @@
         </w:rPr>
         <w:t xml:space="preserve"> and </w:t>
       </w:r>
-      <w:hyperlink r:id="rIdHyperlink15" w:history="1">
+      <w:hyperlink r:id="rIdHyperlink16" w:history="1">
         <w:r>
           <w:rPr>
             <w:rFonts w:ascii="Calibri" w:hAnsi="Calibri" w:cs="Calibri"/>

</xml_diff>

<commit_message>
feat: add commerce utility presentation pages
</commit_message>
<xml_diff>
--- a/docs/VESKIFY_DEVELOPMENT_DELIVERY_TRACKER_v1.3.0.docx
+++ b/docs/VESKIFY_DEVELOPMENT_DELIVERY_TRACKER_v1.3.0.docx
@@ -245,7 +245,7 @@
               <w:rPr>
                 <w:rFonts w:ascii="Calibri" w:hAnsi="Calibri" w:cs="Calibri"/>
               </w:rPr>
-              <w:t>9 August 2026, P10B-10 commercial collection/search profiles</w:t>
+              <w:t>9 August 2026, P10B-13 commerce utility presentation pages</w:t>
             </w:r>
           </w:p>
         </w:tc>
@@ -4381,7 +4381,7 @@
               <w:rPr>
                 <w:rFonts w:ascii="Calibri" w:hAnsi="Calibri" w:cs="Calibri"/>
               </w:rPr>
-              <w:t>☐</w:t>
+              <w:t>☑</w:t>
             </w:r>
           </w:p>
         </w:tc>
@@ -4438,7 +4438,7 @@
                 <w:b/>
                 <w:bCs/>
               </w:rPr>
-              <w:t>Planned</w:t>
+              <w:t>Baseline</w:t>
             </w:r>
           </w:p>
         </w:tc>
@@ -4492,7 +4492,7 @@
               <w:rPr>
                 <w:rFonts w:ascii="Calibri" w:hAnsi="Calibri" w:cs="Calibri"/>
               </w:rPr>
-              <w:t>Search/cart/checkout/state/a11y evidence</w:t>
+              <w:t>Seven profiles, canonical action boundary, snapshot/publication preservation, 16 responsive views</w:t>
             </w:r>
           </w:p>
         </w:tc>
@@ -9204,7 +9204,7 @@
         <w:rPr>
           <w:rFonts w:ascii="Calibri" w:hAnsi="Calibri" w:cs="Calibri"/>
         </w:rPr>
-        <w:t xml:space="preserve">. P10B-01 through P10B-10 are </w:t>
+        <w:t xml:space="preserve">. P10B-01 through P10B-10 and P10B-13 are </w:t>
       </w:r>
       <w:r>
         <w:rPr>
@@ -9218,7 +9218,7 @@
         <w:rPr>
           <w:rFonts w:ascii="Calibri" w:hAnsi="Calibri" w:cs="Calibri"/>
         </w:rPr>
-        <w:t xml:space="preserve">. P10B-11 through P10B-18 remain </w:t>
+        <w:t xml:space="preserve">. P10B-11, P10B-12, and P10B-14 through P10B-18 remain </w:t>
       </w:r>
       <w:r>
         <w:rPr>
@@ -12015,7 +12015,7 @@
         <w:rPr>
           <w:rFonts w:ascii="Calibri" w:hAnsi="Calibri" w:cs="Calibri"/>
         </w:rPr>
-        <w:t>P10B-13 — Commerce utility presentation pages</w:t>
+        <w:t>P10B-13 — Commerce utility presentation pages — Baseline</w:t>
       </w:r>
     </w:p>
     <w:p>
@@ -12105,327 +12105,13 @@
           <w:b/>
           <w:bCs/>
         </w:rPr>
-        <w:t>Done when:</w:t>
-      </w:r>
-      <w:r>
-        <w:rPr>
-          <w:rFonts w:ascii="Calibri" w:hAnsi="Calibri" w:cs="Calibri"/>
-        </w:rPr>
-        <w:t xml:space="preserve"> Every state presents canonical facts/actions with coherent Design DNA/frame, useful empty/error behavior, complete page-set reachability, responsive accessibility, snapshot, and publication preservation.</w:t>
-      </w:r>
-    </w:p>
-    <w:p>
-      <w:pPr>
-        <w:pStyle w:val="Normal"/>
-        <w:numPr>
-          <w:ilvl w:val="0"/>
-          <w:numId w:val="1"/>
-        </w:numPr>
-        <w:widowControl/>
-      </w:pPr>
-      <w:r>
-        <w:rPr>
-          <w:rFonts w:ascii="Calibri" w:hAnsi="Calibri" w:cs="Calibri"/>
-          <w:b/>
-          <w:bCs/>
-        </w:rPr>
-        <w:t>Fail closed:</w:t>
-      </w:r>
-      <w:r>
-        <w:rPr>
-          <w:rFonts w:ascii="Calibri" w:hAnsi="Calibri" w:cs="Calibri"/>
-        </w:rPr>
-        <w:t xml:space="preserve"> Local commerce operations/writes, invented totals or availability, unsupported actions, and executable payment/checkout behavior outside Vesko adapters are rejected.</w:t>
-      </w:r>
-    </w:p>
-    <w:p>
-      <w:pPr>
-        <w:pStyle w:val="Normal"/>
-        <w:numPr>
-          <w:ilvl w:val="0"/>
-          <w:numId w:val="1"/>
-        </w:numPr>
-        <w:widowControl/>
-      </w:pPr>
-      <w:r>
-        <w:rPr>
-          <w:rFonts w:ascii="Calibri" w:hAnsi="Calibri" w:cs="Calibri"/>
-          <w:b/>
-          <w:bCs/>
-        </w:rPr>
-        <w:t>Evidence:</w:t>
-      </w:r>
-      <w:r>
-        <w:rPr>
-          <w:rFonts w:ascii="Calibri" w:hAnsi="Calibri" w:cs="Calibri"/>
-        </w:rPr>
-        <w:t xml:space="preserve"> Contract/integration, adapter-boundary, state matrix, responsive/a11y browser, and retained visual evidence.</w:t>
-      </w:r>
-    </w:p>
-    <w:p>
-      <w:pPr>
-        <w:pStyle w:val="Normal"/>
-        <w:numPr>
-          <w:ilvl w:val="0"/>
-          <w:numId w:val="1"/>
-        </w:numPr>
-        <w:widowControl/>
-      </w:pPr>
-      <w:r>
-        <w:rPr>
-          <w:rFonts w:ascii="Calibri" w:hAnsi="Calibri" w:cs="Calibri"/>
-          <w:b/>
-          <w:bCs/>
-        </w:rPr>
-        <w:t>Non-goal:</w:t>
-      </w:r>
-      <w:r>
-        <w:rPr>
-          <w:rFonts w:ascii="Calibri" w:hAnsi="Calibri" w:cs="Calibri"/>
-        </w:rPr>
-        <w:t xml:space="preserve"> Owning cart, checkout, payment, order, tax, shipping, or returns operations.</w:t>
-      </w:r>
-    </w:p>
-    <w:p>
-      <w:pPr>
-        <w:pStyle w:val="Heading3"/>
-        <w:keepNext/>
-        <w:widowControl/>
-      </w:pPr>
-      <w:r>
-        <w:rPr>
-          <w:rFonts w:ascii="Calibri" w:hAnsi="Calibri" w:cs="Calibri"/>
-        </w:rPr>
-        <w:t>P10B-14 — Premium Editorial complete-storefront vertical slice</w:t>
-      </w:r>
-    </w:p>
-    <w:p>
-      <w:pPr>
-        <w:pStyle w:val="Normal"/>
-        <w:numPr>
-          <w:ilvl w:val="0"/>
-          <w:numId w:val="1"/>
-        </w:numPr>
-        <w:widowControl/>
-      </w:pPr>
-      <w:r>
-        <w:rPr>
-          <w:rFonts w:ascii="Calibri" w:hAnsi="Calibri" w:cs="Calibri"/>
-          <w:b/>
-          <w:bCs/>
-        </w:rPr>
-        <w:t>Outcome:</w:t>
-      </w:r>
-      <w:r>
-        <w:rPr>
-          <w:rFonts w:ascii="Calibri" w:hAnsi="Calibri" w:cs="Calibri"/>
-        </w:rPr>
-        <w:t xml:space="preserve"> Prove one commercially credible complete multi-page storefront early.</w:t>
-      </w:r>
-    </w:p>
-    <w:p>
-      <w:pPr>
-        <w:pStyle w:val="Normal"/>
-        <w:numPr>
-          <w:ilvl w:val="0"/>
-          <w:numId w:val="1"/>
-        </w:numPr>
-        <w:widowControl/>
-      </w:pPr>
-      <w:r>
-        <w:rPr>
-          <w:rFonts w:ascii="Calibri" w:hAnsi="Calibri" w:cs="Calibri"/>
-          <w:b/>
-          <w:bCs/>
-        </w:rPr>
-        <w:t>Authority:</w:t>
-      </w:r>
-      <w:r>
-        <w:rPr>
-          <w:rFonts w:ascii="Calibri" w:hAnsi="Calibri" w:cs="Calibri"/>
-        </w:rPr>
-        <w:t xml:space="preserve"> Existing canonical generation/proposal/snapshot/preview/publication chain using the implemented P10B authorities.</w:t>
-      </w:r>
-    </w:p>
-    <w:p>
-      <w:pPr>
-        <w:pStyle w:val="Normal"/>
-        <w:numPr>
-          <w:ilvl w:val="0"/>
-          <w:numId w:val="1"/>
-        </w:numPr>
-        <w:widowControl/>
-      </w:pPr>
-      <w:r>
-        <w:rPr>
-          <w:rFonts w:ascii="Calibri" w:hAnsi="Calibri" w:cs="Calibri"/>
-          <w:b/>
-          <w:bCs/>
-        </w:rPr>
-        <w:t>Depends on:</w:t>
-      </w:r>
-      <w:r>
-        <w:rPr>
-          <w:rFonts w:ascii="Calibri" w:hAnsi="Calibri" w:cs="Calibri"/>
-        </w:rPr>
-        <w:t xml:space="preserve"> Minimum accepted P10B-02 through P10B-13 capability.</w:t>
-      </w:r>
-    </w:p>
-    <w:p>
-      <w:pPr>
-        <w:pStyle w:val="Normal"/>
-        <w:numPr>
-          <w:ilvl w:val="0"/>
-          <w:numId w:val="1"/>
-        </w:numPr>
-        <w:widowControl/>
-      </w:pPr>
-      <w:r>
-        <w:rPr>
-          <w:rFonts w:ascii="Calibri" w:hAnsi="Calibri" w:cs="Calibri"/>
-          <w:b/>
-          <w:bCs/>
-        </w:rPr>
-        <w:t>Done when:</w:t>
-      </w:r>
-      <w:r>
-        <w:rPr>
-          <w:rFonts w:ascii="Calibri" w:hAnsi="Calibri" w:cs="Calibri"/>
-        </w:rPr>
-        <w:t xml:space="preserve"> One approved brief with realistic commerce and credible assets generates shared frame, home, collection, simple/configurable PDP, About, Contact/locations, FAQ/service, and required utility/error states; navigation, EN/FI where supported, four widths, protected state, preview/publish, and retained human review pass.</w:t>
-      </w:r>
-    </w:p>
-    <w:p>
-      <w:pPr>
-        <w:pStyle w:val="Normal"/>
-        <w:numPr>
-          <w:ilvl w:val="0"/>
-          <w:numId w:val="1"/>
-        </w:numPr>
-        <w:widowControl/>
-      </w:pPr>
-      <w:r>
-        <w:rPr>
-          <w:rFonts w:ascii="Calibri" w:hAnsi="Calibri" w:cs="Calibri"/>
-          <w:b/>
-          <w:bCs/>
-        </w:rPr>
-        <w:t>Fail closed:</w:t>
-      </w:r>
-      <w:r>
-        <w:rPr>
-          <w:rFonts w:ascii="Calibri" w:hAnsi="Calibri" w:cs="Calibri"/>
-        </w:rPr>
-        <w:t xml:space="preserve"> Missing/disconnected/generic required pages, manual reconstruction, stale authority, or schema-only visual evidence fails the slice.</w:t>
-      </w:r>
-    </w:p>
-    <w:p>
-      <w:pPr>
-        <w:pStyle w:val="Normal"/>
-        <w:numPr>
-          <w:ilvl w:val="0"/>
-          <w:numId w:val="1"/>
-        </w:numPr>
-        <w:widowControl/>
-      </w:pPr>
-      <w:r>
-        <w:rPr>
-          <w:rFonts w:ascii="Calibri" w:hAnsi="Calibri" w:cs="Calibri"/>
-          <w:b/>
-          <w:bCs/>
-        </w:rPr>
-        <w:t>Evidence:</w:t>
-      </w:r>
-      <w:r>
-        <w:rPr>
-          <w:rFonts w:ascii="Calibri" w:hAnsi="Calibri" w:cs="Calibri"/>
-        </w:rPr>
-        <w:t xml:space="preserve"> Complete capability chain, correlated browser/screenshots, protected parity, and signed human commercial review.</w:t>
-      </w:r>
-    </w:p>
-    <w:p>
-      <w:pPr>
-        <w:pStyle w:val="Normal"/>
-        <w:numPr>
-          <w:ilvl w:val="0"/>
-          <w:numId w:val="1"/>
-        </w:numPr>
-        <w:widowControl/>
-      </w:pPr>
-      <w:r>
-        <w:rPr>
-          <w:rFonts w:ascii="Calibri" w:hAnsi="Calibri" w:cs="Calibri"/>
-          <w:b/>
-          <w:bCs/>
-        </w:rPr>
-        <w:t>Non-goal:</w:t>
-      </w:r>
-      <w:r>
-        <w:rPr>
-          <w:rFonts w:ascii="Calibri" w:hAnsi="Calibri" w:cs="Calibri"/>
-        </w:rPr>
-        <w:t xml:space="preserve"> P10B closure or broad direction/diversity proof.</w:t>
-      </w:r>
-    </w:p>
-    <w:p>
-      <w:pPr>
-        <w:pStyle w:val="Heading3"/>
-        <w:keepNext/>
-        <w:widowControl/>
-      </w:pPr>
-      <w:r>
-        <w:rPr>
-          <w:rFonts w:ascii="Calibri" w:hAnsi="Calibri" w:cs="Calibri"/>
-        </w:rPr>
-        <w:t>P10B-15 — Bounded storefront synthesis and narrative engine</w:t>
-      </w:r>
-    </w:p>
-    <w:p>
-      <w:pPr>
-        <w:pStyle w:val="Normal"/>
-        <w:numPr>
-          <w:ilvl w:val="0"/>
-          <w:numId w:val="1"/>
-        </w:numPr>
-        <w:widowControl/>
-      </w:pPr>
-      <w:r>
-        <w:rPr>
-          <w:rFonts w:ascii="Calibri" w:hAnsi="Calibri" w:cs="Calibri"/>
-          <w:b/>
-          <w:bCs/>
-        </w:rPr>
-        <w:t>Outcome:</w:t>
-      </w:r>
-      <w:r>
-        <w:rPr>
-          <w:rFonts w:ascii="Calibri" w:hAnsi="Calibri" w:cs="Calibri"/>
-        </w:rPr>
-        <w:t xml:space="preserve"> Generate complete coherent storefronts from compatible Design DNA, page set, profiles, families/variants, parameters, assets, and narrative roles.</w:t>
-      </w:r>
-    </w:p>
-    <w:p>
-      <w:pPr>
-        <w:pStyle w:val="Normal"/>
-        <w:numPr>
-          <w:ilvl w:val="0"/>
-          <w:numId w:val="1"/>
-        </w:numPr>
-        <w:widowControl/>
-      </w:pPr>
-      <w:r>
-        <w:rPr>
-          <w:rFonts w:ascii="Calibri" w:hAnsi="Calibri" w:cs="Calibri"/>
-          <w:b/>
-          <w:bCs/>
-        </w:rPr>
-        <w:t>Authority:</w:t>
-      </w:r>
-      <w:r>
-        <w:rPr>
-          <w:rFonts w:ascii="Calibri" w:hAnsi="Calibri" w:cs="Calibri"/>
-        </w:rPr>
-        <w:t xml:space="preserve"> Existing governed planning/proposal compiler plus the registered P10B authorities; output remains one </w:t>
+        <w:t>Delivered:</w:t>
+      </w:r>
+      <w:r>
+        <w:rPr>
+          <w:rFonts w:ascii="Calibri" w:hAnsi="Calibri" w:cs="Calibri"/>
+        </w:rPr>
+        <w:t xml:space="preserve"> Seven deterministic PageBlueprint profiles materialize one </w:t>
       </w:r>
       <w:r>
         <w:rPr>
@@ -12433,8 +12119,24 @@
           <w:sz w:val="19"/>
           <w:szCs w:val="19"/>
         </w:rPr>
-        <w:t>StorefrontSnapshot</w:t>
-      </w:r>
+        <w:t>commerceUtility</w:t>
+      </w:r>
+      <w:r>
+        <w:rPr>
+          <w:rFonts w:ascii="Calibri" w:hAnsi="Calibri" w:cs="Calibri"/>
+        </w:rPr>
+        <w:t xml:space="preserve"> component through the P10B-05 family page. Read-only runtime state supplies canonical cart facts, checkout continuation, P10B-10 query/filter context, and bounded recovery actions while the snapshot preserves presentation only. Shared-frame/Design DNA, save/reload, publication, four- width browser evidence, and no-provider behavior are covered under </w:t>
+      </w:r>
+      <w:hyperlink r:id="rIdHyperlink15" w:history="1">
+        <w:r>
+          <w:rPr>
+            <w:rFonts w:ascii="Calibri" w:hAnsi="Calibri" w:cs="Calibri"/>
+            <w:color w:val="2E74B5"/>
+            <w:u w:val="single"/>
+          </w:rPr>
+          <w:t>P10B_13_COMMERCE_UTILITY_PRESENTATION_PAGES.md</w:t>
+        </w:r>
+      </w:hyperlink>
       <w:r>
         <w:rPr>
           <w:rFonts w:ascii="Calibri" w:hAnsi="Calibri" w:cs="Calibri"/>
@@ -12457,61 +12159,13 @@
           <w:b/>
           <w:bCs/>
         </w:rPr>
-        <w:t>Depends on:</w:t>
-      </w:r>
-      <w:r>
-        <w:rPr>
-          <w:rFonts w:ascii="Calibri" w:hAnsi="Calibri" w:cs="Calibri"/>
-        </w:rPr>
-        <w:t xml:space="preserve"> P10B-14 and sufficient real family/profile capability.</w:t>
-      </w:r>
-    </w:p>
-    <w:p>
-      <w:pPr>
-        <w:pStyle w:val="Normal"/>
-        <w:numPr>
-          <w:ilvl w:val="0"/>
-          <w:numId w:val="1"/>
-        </w:numPr>
-        <w:widowControl/>
-      </w:pPr>
-      <w:r>
-        <w:rPr>
-          <w:rFonts w:ascii="Calibri" w:hAnsi="Calibri" w:cs="Calibri"/>
-          <w:b/>
-          <w:bCs/>
-        </w:rPr>
-        <w:t>Done when:</w:t>
-      </w:r>
-      <w:r>
-        <w:rPr>
-          <w:rFonts w:ascii="Calibri" w:hAnsi="Calibri" w:cs="Calibri"/>
-        </w:rPr>
-        <w:t xml:space="preserve"> Deterministic selection preserves cross-page identity, narrative adjacency/ cardinality, repetition limits, bindings/assets, and complete snapshot/lifecycle output for representative inputs.</w:t>
-      </w:r>
-    </w:p>
-    <w:p>
-      <w:pPr>
-        <w:pStyle w:val="Normal"/>
-        <w:numPr>
-          <w:ilvl w:val="0"/>
-          <w:numId w:val="1"/>
-        </w:numPr>
-        <w:widowControl/>
-      </w:pPr>
-      <w:r>
-        <w:rPr>
-          <w:rFonts w:ascii="Calibri" w:hAnsi="Calibri" w:cs="Calibri"/>
-          <w:b/>
-          <w:bCs/>
-        </w:rPr>
         <w:t>Fail closed:</w:t>
       </w:r>
       <w:r>
         <w:rPr>
           <w:rFonts w:ascii="Calibri" w:hAnsi="Calibri" w:cs="Calibri"/>
         </w:rPr>
-        <w:t xml:space="preserve"> Missing, stale, ambiguous, incompatible, unregistered, repetitive, or protected-state-divergent combinations produce no partial proposal/snapshot.</w:t>
+        <w:t xml:space="preserve"> Local commerce operations/writes, invented totals or availability, unsupported actions, and executable payment/checkout behavior outside Vesko adapters are rejected.</w:t>
       </w:r>
     </w:p>
     <w:p>
@@ -12535,7 +12189,7 @@
         <w:rPr>
           <w:rFonts w:ascii="Calibri" w:hAnsi="Calibri" w:cs="Calibri"/>
         </w:rPr>
-        <w:t xml:space="preserve"> Selection/compatibility/unit, proposal/compiler/lifecycle integration, no-partial- write, deterministic fingerprint inputs, and complete-store browser evidence.</w:t>
+        <w:t xml:space="preserve"> Contract/integration, adapter-boundary, state matrix, responsive/a11y browser, and retained visual evidence.</w:t>
       </w:r>
     </w:p>
     <w:p>
@@ -12559,7 +12213,7 @@
         <w:rPr>
           <w:rFonts w:ascii="Calibri" w:hAnsi="Calibri" w:cs="Calibri"/>
         </w:rPr>
-        <w:t xml:space="preserve"> Arbitrary trees/styles or a second synthesis representation.</w:t>
+        <w:t xml:space="preserve"> Owning cart, checkout, payment, order, tax, shipping, or returns operations.</w:t>
       </w:r>
     </w:p>
     <w:p>
@@ -12572,7 +12226,7 @@
         <w:rPr>
           <w:rFonts w:ascii="Calibri" w:hAnsi="Calibri" w:cs="Calibri"/>
         </w:rPr>
-        <w:t>P10B-16 — Coordinated directions and diversity control</w:t>
+        <w:t>P10B-14 — Premium Editorial complete-storefront vertical slice</w:t>
       </w:r>
     </w:p>
     <w:p>
@@ -12596,7 +12250,7 @@
         <w:rPr>
           <w:rFonts w:ascii="Calibri" w:hAnsi="Calibri" w:cs="Calibri"/>
         </w:rPr>
-        <w:t xml:space="preserve"> Make Premium Editorial, Modern Technical, and Minimal Commerce coordinated constraint packages and prevent duplicates/near duplicates.</w:t>
+        <w:t xml:space="preserve"> Prove one commercially credible complete multi-page storefront early.</w:t>
       </w:r>
     </w:p>
     <w:p>
@@ -12620,7 +12274,7 @@
         <w:rPr>
           <w:rFonts w:ascii="Calibri" w:hAnsi="Calibri" w:cs="Calibri"/>
         </w:rPr>
-        <w:t xml:space="preserve"> Existing direction-selection authority plus deterministic storefront-design fingerprint/evaluation.</w:t>
+        <w:t xml:space="preserve"> Existing canonical generation/proposal/snapshot/preview/publication chain using the implemented P10B authorities.</w:t>
       </w:r>
     </w:p>
     <w:p>
@@ -12644,7 +12298,7 @@
         <w:rPr>
           <w:rFonts w:ascii="Calibri" w:hAnsi="Calibri" w:cs="Calibri"/>
         </w:rPr>
-        <w:t xml:space="preserve"> P10B-15.</w:t>
+        <w:t xml:space="preserve"> Minimum accepted P10B-02 through P10B-13 capability.</w:t>
       </w:r>
     </w:p>
     <w:p>
@@ -12668,7 +12322,7 @@
         <w:rPr>
           <w:rFonts w:ascii="Calibri" w:hAnsi="Calibri" w:cs="Calibri"/>
         </w:rPr>
-        <w:t xml:space="preserve"> Fingerprints cover Design DNA, page set/profiles, frame, anatomies/variants, structural parameters, image posture, density/responsive posture, and narrative composition; exact and meaningful near duplicates fail, and pairwise stores differ materially beyond colour.</w:t>
+        <w:t xml:space="preserve"> One approved brief with realistic commerce and credible assets generates shared frame, home, collection, simple/configurable PDP, About, Contact/locations, FAQ/service, and required utility/error states; navigation, EN/FI where supported, four widths, protected state, preview/publish, and retained human review pass.</w:t>
       </w:r>
     </w:p>
     <w:p>
@@ -12692,7 +12346,7 @@
         <w:rPr>
           <w:rFonts w:ascii="Calibri" w:hAnsi="Calibri" w:cs="Calibri"/>
         </w:rPr>
-        <w:t xml:space="preserve"> Fixed-template/token/page direction authority, incompatible references, colour-only differences, and fingerprints that omit material structure are rejected.</w:t>
+        <w:t xml:space="preserve"> Missing/disconnected/generic required pages, manual reconstruction, stale authority, or schema-only visual evidence fails the slice.</w:t>
       </w:r>
     </w:p>
     <w:p>
@@ -12716,7 +12370,7 @@
         <w:rPr>
           <w:rFonts w:ascii="Calibri" w:hAnsi="Calibri" w:cs="Calibri"/>
         </w:rPr>
-        <w:t xml:space="preserve"> Determinism, exact/near-duplicate fixtures, pairwise structural scoring, direction compatibility, complete-store generation, and representative visual evidence.</w:t>
+        <w:t xml:space="preserve"> Complete capability chain, correlated browser/screenshots, protected parity, and signed human commercial review.</w:t>
       </w:r>
     </w:p>
     <w:p>
@@ -12740,7 +12394,7 @@
         <w:rPr>
           <w:rFonts w:ascii="Calibri" w:hAnsi="Calibri" w:cs="Calibri"/>
         </w:rPr>
-        <w:t xml:space="preserve"> Thousands of manually authored templates.</w:t>
+        <w:t xml:space="preserve"> P10B closure or broad direction/diversity proof.</w:t>
       </w:r>
     </w:p>
     <w:p>
@@ -12753,7 +12407,7 @@
         <w:rPr>
           <w:rFonts w:ascii="Calibri" w:hAnsi="Calibri" w:cs="Calibri"/>
         </w:rPr>
-        <w:t>P10B-17 — Responsive, accessibility and performance closure</w:t>
+        <w:t>P10B-15 — Bounded storefront synthesis and narrative engine</w:t>
       </w:r>
     </w:p>
     <w:p>
@@ -12777,7 +12431,7 @@
         <w:rPr>
           <w:rFonts w:ascii="Calibri" w:hAnsi="Calibri" w:cs="Calibri"/>
         </w:rPr>
-        <w:t xml:space="preserve"> Preserve deliberate commercial hierarchy and usability across target widths, locales, accessibility, and bounded performance budgets.</w:t>
+        <w:t xml:space="preserve"> Generate complete coherent storefronts from compatible Design DNA, page set, profiles, families/variants, parameters, assets, and narrative roles.</w:t>
       </w:r>
     </w:p>
     <w:p>
@@ -12801,700 +12455,7 @@
         <w:rPr>
           <w:rFonts w:ascii="Calibri" w:hAnsi="Calibri" w:cs="Calibri"/>
         </w:rPr>
-        <w:t xml:space="preserve"> Existing responsive/a11y contracts, registered transformations, renderers, and evidence protocol.</w:t>
-      </w:r>
-    </w:p>
-    <w:p>
-      <w:pPr>
-        <w:pStyle w:val="Normal"/>
-        <w:numPr>
-          <w:ilvl w:val="0"/>
-          <w:numId w:val="1"/>
-        </w:numPr>
-        <w:widowControl/>
-      </w:pPr>
-      <w:r>
-        <w:rPr>
-          <w:rFonts w:ascii="Calibri" w:hAnsi="Calibri" w:cs="Calibri"/>
-          <w:b/>
-          <w:bCs/>
-        </w:rPr>
-        <w:t>Depends on:</w:t>
-      </w:r>
-      <w:r>
-        <w:rPr>
-          <w:rFonts w:ascii="Calibri" w:hAnsi="Calibri" w:cs="Calibri"/>
-        </w:rPr>
-        <w:t xml:space="preserve"> Implemented commercial families/profiles/directions through P10B-16.</w:t>
-      </w:r>
-    </w:p>
-    <w:p>
-      <w:pPr>
-        <w:pStyle w:val="Normal"/>
-        <w:numPr>
-          <w:ilvl w:val="0"/>
-          <w:numId w:val="1"/>
-        </w:numPr>
-        <w:widowControl/>
-      </w:pPr>
-      <w:r>
-        <w:rPr>
-          <w:rFonts w:ascii="Calibri" w:hAnsi="Calibri" w:cs="Calibri"/>
-          <w:b/>
-          <w:bCs/>
-        </w:rPr>
-        <w:t>Done when:</w:t>
-      </w:r>
-      <w:r>
-        <w:rPr>
-          <w:rFonts w:ascii="Calibri" w:hAnsi="Calibri" w:cs="Calibri"/>
-        </w:rPr>
-        <w:t xml:space="preserve"> All supported page families/directions pass 375/768/1024/1440 and EN/FI geometry, declared transformations, keyboard/focus/semantics/contrast, content/commerce retention, and explicit performance budgets with correlated evidence.</w:t>
-      </w:r>
-    </w:p>
-    <w:p>
-      <w:pPr>
-        <w:pStyle w:val="Normal"/>
-        <w:numPr>
-          <w:ilvl w:val="0"/>
-          <w:numId w:val="1"/>
-        </w:numPr>
-        <w:widowControl/>
-      </w:pPr>
-      <w:r>
-        <w:rPr>
-          <w:rFonts w:ascii="Calibri" w:hAnsi="Calibri" w:cs="Calibri"/>
-          <w:b/>
-          <w:bCs/>
-        </w:rPr>
-        <w:t>Fail closed:</w:t>
-      </w:r>
-      <w:r>
-        <w:rPr>
-          <w:rFonts w:ascii="Calibri" w:hAnsi="Calibri" w:cs="Calibri"/>
-        </w:rPr>
-        <w:t xml:space="preserve"> Clipping, overlap, inaccessible controls, lost content/commerce, desktop-only approval, or undispositioned budget failure blocks completion.</w:t>
-      </w:r>
-    </w:p>
-    <w:p>
-      <w:pPr>
-        <w:pStyle w:val="Normal"/>
-        <w:numPr>
-          <w:ilvl w:val="0"/>
-          <w:numId w:val="1"/>
-        </w:numPr>
-        <w:widowControl/>
-      </w:pPr>
-      <w:r>
-        <w:rPr>
-          <w:rFonts w:ascii="Calibri" w:hAnsi="Calibri" w:cs="Calibri"/>
-          <w:b/>
-          <w:bCs/>
-        </w:rPr>
-        <w:t>Evidence:</w:t>
-      </w:r>
-      <w:r>
-        <w:rPr>
-          <w:rFonts w:ascii="Calibri" w:hAnsi="Calibri" w:cs="Calibri"/>
-        </w:rPr>
-        <w:t xml:space="preserve"> Automated geometry/a11y/performance/browser matrices plus retained representative human review.</w:t>
-      </w:r>
-    </w:p>
-    <w:p>
-      <w:pPr>
-        <w:pStyle w:val="Normal"/>
-        <w:numPr>
-          <w:ilvl w:val="0"/>
-          <w:numId w:val="1"/>
-        </w:numPr>
-        <w:widowControl/>
-      </w:pPr>
-      <w:r>
-        <w:rPr>
-          <w:rFonts w:ascii="Calibri" w:hAnsi="Calibri" w:cs="Calibri"/>
-          <w:b/>
-          <w:bCs/>
-        </w:rPr>
-        <w:t>Non-goal:</w:t>
-      </w:r>
-      <w:r>
-        <w:rPr>
-          <w:rFonts w:ascii="Calibri" w:hAnsi="Calibri" w:cs="Calibri"/>
-        </w:rPr>
-        <w:t xml:space="preserve"> Visual approval from isolated component screenshots.</w:t>
-      </w:r>
-    </w:p>
-    <w:p>
-      <w:pPr>
-        <w:pStyle w:val="Heading3"/>
-        <w:keepNext/>
-        <w:widowControl/>
-      </w:pPr>
-      <w:r>
-        <w:rPr>
-          <w:rFonts w:ascii="Calibri" w:hAnsi="Calibri" w:cs="Calibri"/>
-        </w:rPr>
-        <w:t>P10B-18 — Commercial quality and scale gate</w:t>
-      </w:r>
-    </w:p>
-    <w:p>
-      <w:pPr>
-        <w:pStyle w:val="Normal"/>
-        <w:numPr>
-          <w:ilvl w:val="0"/>
-          <w:numId w:val="1"/>
-        </w:numPr>
-        <w:widowControl/>
-      </w:pPr>
-      <w:r>
-        <w:rPr>
-          <w:rFonts w:ascii="Calibri" w:hAnsi="Calibri" w:cs="Calibri"/>
-          <w:b/>
-          <w:bCs/>
-        </w:rPr>
-        <w:t>Outcome:</w:t>
-      </w:r>
-      <w:r>
-        <w:rPr>
-          <w:rFonts w:ascii="Calibri" w:hAnsi="Calibri" w:cs="Calibri"/>
-        </w:rPr>
-        <w:t xml:space="preserve"> Prove repeated generation of publishable, premium, materially different complete storefronts.</w:t>
-      </w:r>
-    </w:p>
-    <w:p>
-      <w:pPr>
-        <w:pStyle w:val="Normal"/>
-        <w:numPr>
-          <w:ilvl w:val="0"/>
-          <w:numId w:val="1"/>
-        </w:numPr>
-        <w:widowControl/>
-      </w:pPr>
-      <w:r>
-        <w:rPr>
-          <w:rFonts w:ascii="Calibri" w:hAnsi="Calibri" w:cs="Calibri"/>
-          <w:b/>
-          <w:bCs/>
-        </w:rPr>
-        <w:t>Authority:</w:t>
-      </w:r>
-      <w:r>
-        <w:rPr>
-          <w:rFonts w:ascii="Calibri" w:hAnsi="Calibri" w:cs="Calibri"/>
-        </w:rPr>
-        <w:t xml:space="preserve"> Existing golden-store/human-review evidence plus the P10B synthesis and fingerprint authorities.</w:t>
-      </w:r>
-    </w:p>
-    <w:p>
-      <w:pPr>
-        <w:pStyle w:val="Normal"/>
-        <w:numPr>
-          <w:ilvl w:val="0"/>
-          <w:numId w:val="1"/>
-        </w:numPr>
-        <w:widowControl/>
-      </w:pPr>
-      <w:r>
-        <w:rPr>
-          <w:rFonts w:ascii="Calibri" w:hAnsi="Calibri" w:cs="Calibri"/>
-          <w:b/>
-          <w:bCs/>
-        </w:rPr>
-        <w:t>Depends on:</w:t>
-      </w:r>
-      <w:r>
-        <w:rPr>
-          <w:rFonts w:ascii="Calibri" w:hAnsi="Calibri" w:cs="Calibri"/>
-        </w:rPr>
-        <w:t xml:space="preserve"> P10B-17 and every prior P10B task.</w:t>
-      </w:r>
-    </w:p>
-    <w:p>
-      <w:pPr>
-        <w:pStyle w:val="Normal"/>
-        <w:numPr>
-          <w:ilvl w:val="0"/>
-          <w:numId w:val="1"/>
-        </w:numPr>
-        <w:widowControl/>
-      </w:pPr>
-      <w:r>
-        <w:rPr>
-          <w:rFonts w:ascii="Calibri" w:hAnsi="Calibri" w:cs="Calibri"/>
-          <w:b/>
-          <w:bCs/>
-        </w:rPr>
-        <w:t>Done when:</w:t>
-      </w:r>
-      <w:r>
-        <w:rPr>
-          <w:rFonts w:ascii="Calibri" w:hAnsi="Calibri" w:cs="Calibri"/>
-        </w:rPr>
-        <w:t xml:space="preserve"> At least 100 deterministic complete configurations across representative catalogue/evidence/asset/locale/page-set/direction contexts pass snapshot validity, protected parity, exact-duplicate, near-duplicate, and structural-distribution gates; a fingerprint- stratified subset passes retained four-width human commercial review.</w:t>
-      </w:r>
-    </w:p>
-    <w:p>
-      <w:pPr>
-        <w:pStyle w:val="Normal"/>
-        <w:numPr>
-          <w:ilvl w:val="0"/>
-          <w:numId w:val="1"/>
-        </w:numPr>
-        <w:widowControl/>
-      </w:pPr>
-      <w:r>
-        <w:rPr>
-          <w:rFonts w:ascii="Calibri" w:hAnsi="Calibri" w:cs="Calibri"/>
-          <w:b/>
-          <w:bCs/>
-        </w:rPr>
-        <w:t>Fail closed:</w:t>
-      </w:r>
-      <w:r>
-        <w:rPr>
-          <w:rFonts w:ascii="Calibri" w:hAnsi="Calibri" w:cs="Calibri"/>
-        </w:rPr>
-        <w:t xml:space="preserve"> One polished store, automated checks alone, placeholder assets, registry counts, screenshots without exact authority, or colour-only diversity cannot close P10B.</w:t>
-      </w:r>
-    </w:p>
-    <w:p>
-      <w:pPr>
-        <w:pStyle w:val="Normal"/>
-        <w:numPr>
-          <w:ilvl w:val="0"/>
-          <w:numId w:val="1"/>
-        </w:numPr>
-        <w:widowControl/>
-      </w:pPr>
-      <w:r>
-        <w:rPr>
-          <w:rFonts w:ascii="Calibri" w:hAnsi="Calibri" w:cs="Calibri"/>
-          <w:b/>
-          <w:bCs/>
-        </w:rPr>
-        <w:t>Evidence:</w:t>
-      </w:r>
-      <w:r>
-        <w:rPr>
-          <w:rFonts w:ascii="Calibri" w:hAnsi="Calibri" w:cs="Calibri"/>
-        </w:rPr>
-        <w:t xml:space="preserve"> Scale-generation ledger, fingerprint/diversity analysis, complete capability-chain correlations, retained screenshots, and explicit human acceptance.</w:t>
-      </w:r>
-    </w:p>
-    <w:p>
-      <w:pPr>
-        <w:pStyle w:val="Normal"/>
-        <w:numPr>
-          <w:ilvl w:val="0"/>
-          <w:numId w:val="1"/>
-        </w:numPr>
-        <w:widowControl/>
-      </w:pPr>
-      <w:r>
-        <w:rPr>
-          <w:rFonts w:ascii="Calibri" w:hAnsi="Calibri" w:cs="Calibri"/>
-          <w:b/>
-          <w:bCs/>
-        </w:rPr>
-        <w:t>Non-goal:</w:t>
-      </w:r>
-      <w:r>
-        <w:rPr>
-          <w:rFonts w:ascii="Calibri" w:hAnsi="Calibri" w:cs="Calibri"/>
-        </w:rPr>
-        <w:t xml:space="preserve"> P10C merchant editing, Vesko staging, or production-readiness claims.</w:t>
-      </w:r>
-    </w:p>
-    <w:p>
-      <w:pPr>
-        <w:pStyle w:val="Heading2"/>
-        <w:keepNext/>
-        <w:widowControl/>
-      </w:pPr>
-      <w:r>
-        <w:rPr>
-          <w:rFonts w:ascii="Calibri" w:hAnsi="Calibri" w:cs="Calibri"/>
-        </w:rPr>
-        <w:t>P10C — Storefront Studio Editing Experience v1</w:t>
-      </w:r>
-    </w:p>
-    <w:p>
-      <w:pPr>
-        <w:pStyle w:val="Heading3"/>
-        <w:keepNext/>
-        <w:widowControl/>
-      </w:pPr>
-      <w:r>
-        <w:rPr>
-          <w:rFonts w:ascii="Calibri" w:hAnsi="Calibri" w:cs="Calibri"/>
-        </w:rPr>
-        <w:t>P10C-01 — Brand asset library</w:t>
-      </w:r>
-    </w:p>
-    <w:p>
-      <w:pPr>
-        <w:pStyle w:val="Normal"/>
-        <w:numPr>
-          <w:ilvl w:val="0"/>
-          <w:numId w:val="1"/>
-        </w:numPr>
-        <w:widowControl/>
-      </w:pPr>
-      <w:r>
-        <w:rPr>
-          <w:rFonts w:ascii="Calibri" w:hAnsi="Calibri" w:cs="Calibri"/>
-          <w:b/>
-          <w:bCs/>
-        </w:rPr>
-        <w:t>Outcome:</w:t>
-      </w:r>
-      <w:r>
-        <w:rPr>
-          <w:rFonts w:ascii="Calibri" w:hAnsi="Calibri" w:cs="Calibri"/>
-        </w:rPr>
-        <w:t xml:space="preserve"> Let merchants view and choose approved presentation assets in Storefront Studio.</w:t>
-      </w:r>
-    </w:p>
-    <w:p>
-      <w:pPr>
-        <w:pStyle w:val="Normal"/>
-        <w:numPr>
-          <w:ilvl w:val="0"/>
-          <w:numId w:val="1"/>
-        </w:numPr>
-        <w:widowControl/>
-      </w:pPr>
-      <w:r>
-        <w:rPr>
-          <w:rFonts w:ascii="Calibri" w:hAnsi="Calibri" w:cs="Calibri"/>
-          <w:b/>
-          <w:bCs/>
-        </w:rPr>
-        <w:t>Status:</w:t>
-      </w:r>
-      <w:r>
-        <w:rPr>
-          <w:rFonts w:ascii="Calibri" w:hAnsi="Calibri" w:cs="Calibri"/>
-        </w:rPr>
-        <w:t xml:space="preserve"> </w:t>
-      </w:r>
-      <w:r>
-        <w:rPr>
-          <w:rFonts w:ascii="Calibri" w:hAnsi="Calibri" w:cs="Calibri"/>
-          <w:b/>
-          <w:bCs/>
-        </w:rPr>
-        <w:t>Planned</w:t>
-      </w:r>
-      <w:r>
-        <w:rPr>
-          <w:rFonts w:ascii="Calibri" w:hAnsi="Calibri" w:cs="Calibri"/>
-        </w:rPr>
-        <w:t>.</w:t>
-      </w:r>
-    </w:p>
-    <w:p>
-      <w:pPr>
-        <w:pStyle w:val="Normal"/>
-        <w:numPr>
-          <w:ilvl w:val="0"/>
-          <w:numId w:val="1"/>
-        </w:numPr>
-        <w:widowControl/>
-      </w:pPr>
-      <w:r>
-        <w:rPr>
-          <w:rFonts w:ascii="Calibri" w:hAnsi="Calibri" w:cs="Calibri"/>
-          <w:b/>
-          <w:bCs/>
-        </w:rPr>
-        <w:t>Depends on:</w:t>
-      </w:r>
-      <w:r>
-        <w:rPr>
-          <w:rFonts w:ascii="Calibri" w:hAnsi="Calibri" w:cs="Calibri"/>
-        </w:rPr>
-        <w:t xml:space="preserve"> P10B asset authority.</w:t>
-      </w:r>
-    </w:p>
-    <w:p>
-      <w:pPr>
-        <w:pStyle w:val="Normal"/>
-        <w:numPr>
-          <w:ilvl w:val="0"/>
-          <w:numId w:val="1"/>
-        </w:numPr>
-        <w:widowControl/>
-      </w:pPr>
-      <w:r>
-        <w:rPr>
-          <w:rFonts w:ascii="Calibri" w:hAnsi="Calibri" w:cs="Calibri"/>
-          <w:b/>
-          <w:bCs/>
-        </w:rPr>
-        <w:t>Done when:</w:t>
-      </w:r>
-      <w:r>
-        <w:rPr>
-          <w:rFonts w:ascii="Calibri" w:hAnsi="Calibri" w:cs="Calibri"/>
-        </w:rPr>
-        <w:t xml:space="preserve"> The stated outcome and required evidence are accepted.</w:t>
-      </w:r>
-    </w:p>
-    <w:p>
-      <w:pPr>
-        <w:pStyle w:val="Normal"/>
-        <w:numPr>
-          <w:ilvl w:val="0"/>
-          <w:numId w:val="1"/>
-        </w:numPr>
-        <w:widowControl/>
-      </w:pPr>
-      <w:r>
-        <w:rPr>
-          <w:rFonts w:ascii="Calibri" w:hAnsi="Calibri" w:cs="Calibri"/>
-          <w:b/>
-          <w:bCs/>
-        </w:rPr>
-        <w:t>Required evidence:</w:t>
-      </w:r>
-      <w:r>
-        <w:rPr>
-          <w:rFonts w:ascii="Calibri" w:hAnsi="Calibri" w:cs="Calibri"/>
-        </w:rPr>
-        <w:t xml:space="preserve"> Contract, integration, browser/E2E.</w:t>
-      </w:r>
-    </w:p>
-    <w:p>
-      <w:pPr>
-        <w:pStyle w:val="Normal"/>
-        <w:numPr>
-          <w:ilvl w:val="0"/>
-          <w:numId w:val="1"/>
-        </w:numPr>
-        <w:widowControl/>
-      </w:pPr>
-      <w:r>
-        <w:rPr>
-          <w:rFonts w:ascii="Calibri" w:hAnsi="Calibri" w:cs="Calibri"/>
-          <w:b/>
-          <w:bCs/>
-        </w:rPr>
-        <w:t>Non-goal:</w:t>
-      </w:r>
-      <w:r>
-        <w:rPr>
-          <w:rFonts w:ascii="Calibri" w:hAnsi="Calibri" w:cs="Calibri"/>
-        </w:rPr>
-        <w:t xml:space="preserve"> Product-media replacement or generic DAM scope.</w:t>
-      </w:r>
-    </w:p>
-    <w:p>
-      <w:pPr>
-        <w:pStyle w:val="Heading3"/>
-        <w:keepNext/>
-        <w:widowControl/>
-      </w:pPr>
-      <w:r>
-        <w:rPr>
-          <w:rFonts w:ascii="Calibri" w:hAnsi="Calibri" w:cs="Calibri"/>
-        </w:rPr>
-        <w:t>P10C-02 — Asset roles and provenance</w:t>
-      </w:r>
-    </w:p>
-    <w:p>
-      <w:pPr>
-        <w:pStyle w:val="Normal"/>
-        <w:numPr>
-          <w:ilvl w:val="0"/>
-          <w:numId w:val="1"/>
-        </w:numPr>
-        <w:widowControl/>
-      </w:pPr>
-      <w:r>
-        <w:rPr>
-          <w:rFonts w:ascii="Calibri" w:hAnsi="Calibri" w:cs="Calibri"/>
-          <w:b/>
-          <w:bCs/>
-        </w:rPr>
-        <w:t>Outcome:</w:t>
-      </w:r>
-      <w:r>
-        <w:rPr>
-          <w:rFonts w:ascii="Calibri" w:hAnsi="Calibri" w:cs="Calibri"/>
-        </w:rPr>
-        <w:t xml:space="preserve"> Show and preserve role, source, approval, revision, and assignment authority.</w:t>
-      </w:r>
-    </w:p>
-    <w:p>
-      <w:pPr>
-        <w:pStyle w:val="Normal"/>
-        <w:numPr>
-          <w:ilvl w:val="0"/>
-          <w:numId w:val="1"/>
-        </w:numPr>
-        <w:widowControl/>
-      </w:pPr>
-      <w:r>
-        <w:rPr>
-          <w:rFonts w:ascii="Calibri" w:hAnsi="Calibri" w:cs="Calibri"/>
-          <w:b/>
-          <w:bCs/>
-        </w:rPr>
-        <w:t>Status:</w:t>
-      </w:r>
-      <w:r>
-        <w:rPr>
-          <w:rFonts w:ascii="Calibri" w:hAnsi="Calibri" w:cs="Calibri"/>
-        </w:rPr>
-        <w:t xml:space="preserve"> </w:t>
-      </w:r>
-      <w:r>
-        <w:rPr>
-          <w:rFonts w:ascii="Calibri" w:hAnsi="Calibri" w:cs="Calibri"/>
-          <w:b/>
-          <w:bCs/>
-        </w:rPr>
-        <w:t>Planned</w:t>
-      </w:r>
-      <w:r>
-        <w:rPr>
-          <w:rFonts w:ascii="Calibri" w:hAnsi="Calibri" w:cs="Calibri"/>
-        </w:rPr>
-        <w:t>.</w:t>
-      </w:r>
-    </w:p>
-    <w:p>
-      <w:pPr>
-        <w:pStyle w:val="Normal"/>
-        <w:numPr>
-          <w:ilvl w:val="0"/>
-          <w:numId w:val="1"/>
-        </w:numPr>
-        <w:widowControl/>
-      </w:pPr>
-      <w:r>
-        <w:rPr>
-          <w:rFonts w:ascii="Calibri" w:hAnsi="Calibri" w:cs="Calibri"/>
-          <w:b/>
-          <w:bCs/>
-        </w:rPr>
-        <w:t>Depends on:</w:t>
-      </w:r>
-      <w:r>
-        <w:rPr>
-          <w:rFonts w:ascii="Calibri" w:hAnsi="Calibri" w:cs="Calibri"/>
-        </w:rPr>
-        <w:t xml:space="preserve"> P10C-01.</w:t>
-      </w:r>
-    </w:p>
-    <w:p>
-      <w:pPr>
-        <w:pStyle w:val="Normal"/>
-        <w:numPr>
-          <w:ilvl w:val="0"/>
-          <w:numId w:val="1"/>
-        </w:numPr>
-        <w:widowControl/>
-      </w:pPr>
-      <w:r>
-        <w:rPr>
-          <w:rFonts w:ascii="Calibri" w:hAnsi="Calibri" w:cs="Calibri"/>
-          <w:b/>
-          <w:bCs/>
-        </w:rPr>
-        <w:t>Done when:</w:t>
-      </w:r>
-      <w:r>
-        <w:rPr>
-          <w:rFonts w:ascii="Calibri" w:hAnsi="Calibri" w:cs="Calibri"/>
-        </w:rPr>
-        <w:t xml:space="preserve"> The stated outcome and required evidence are accepted.</w:t>
-      </w:r>
-    </w:p>
-    <w:p>
-      <w:pPr>
-        <w:pStyle w:val="Normal"/>
-        <w:numPr>
-          <w:ilvl w:val="0"/>
-          <w:numId w:val="1"/>
-        </w:numPr>
-        <w:widowControl/>
-      </w:pPr>
-      <w:r>
-        <w:rPr>
-          <w:rFonts w:ascii="Calibri" w:hAnsi="Calibri" w:cs="Calibri"/>
-          <w:b/>
-          <w:bCs/>
-        </w:rPr>
-        <w:t>Required evidence:</w:t>
-      </w:r>
-      <w:r>
-        <w:rPr>
-          <w:rFonts w:ascii="Calibri" w:hAnsi="Calibri" w:cs="Calibri"/>
-        </w:rPr>
-        <w:t xml:space="preserve"> Valid assignment and stale/unknown/role-mismatch rejection.</w:t>
-      </w:r>
-    </w:p>
-    <w:p>
-      <w:pPr>
-        <w:pStyle w:val="Normal"/>
-        <w:numPr>
-          <w:ilvl w:val="0"/>
-          <w:numId w:val="1"/>
-        </w:numPr>
-        <w:widowControl/>
-      </w:pPr>
-      <w:r>
-        <w:rPr>
-          <w:rFonts w:ascii="Calibri" w:hAnsi="Calibri" w:cs="Calibri"/>
-          <w:b/>
-          <w:bCs/>
-        </w:rPr>
-        <w:t>Non-goal:</w:t>
-      </w:r>
-      <w:r>
-        <w:rPr>
-          <w:rFonts w:ascii="Calibri" w:hAnsi="Calibri" w:cs="Calibri"/>
-        </w:rPr>
-        <w:t xml:space="preserve"> Untyped uploads or hidden provenance.</w:t>
-      </w:r>
-    </w:p>
-    <w:p>
-      <w:pPr>
-        <w:pStyle w:val="Heading3"/>
-        <w:keepNext/>
-        <w:widowControl/>
-      </w:pPr>
-      <w:r>
-        <w:rPr>
-          <w:rFonts w:ascii="Calibri" w:hAnsi="Calibri" w:cs="Calibri"/>
-        </w:rPr>
-        <w:t>P10C-03 — Canonical Puck boundary</w:t>
-      </w:r>
-    </w:p>
-    <w:p>
-      <w:pPr>
-        <w:pStyle w:val="Normal"/>
-        <w:numPr>
-          <w:ilvl w:val="0"/>
-          <w:numId w:val="1"/>
-        </w:numPr>
-        <w:widowControl/>
-      </w:pPr>
-      <w:r>
-        <w:rPr>
-          <w:rFonts w:ascii="Calibri" w:hAnsi="Calibri" w:cs="Calibri"/>
-          <w:b/>
-          <w:bCs/>
-        </w:rPr>
-        <w:t>Outcome:</w:t>
-      </w:r>
-      <w:r>
-        <w:rPr>
-          <w:rFonts w:ascii="Calibri" w:hAnsi="Calibri" w:cs="Calibri"/>
-        </w:rPr>
-        <w:t xml:space="preserve"> Project registered canonical content into Puck and validate edits back into the same </w:t>
+        <w:t xml:space="preserve"> Existing governed planning/proposal compiler plus the registered P10B authorities; output remains one </w:t>
       </w:r>
       <w:r>
         <w:rPr>
@@ -13526,51 +12487,13 @@
           <w:b/>
           <w:bCs/>
         </w:rPr>
-        <w:t>Status:</w:t>
-      </w:r>
-      <w:r>
-        <w:rPr>
-          <w:rFonts w:ascii="Calibri" w:hAnsi="Calibri" w:cs="Calibri"/>
-        </w:rPr>
-        <w:t xml:space="preserve"> </w:t>
-      </w:r>
-      <w:r>
-        <w:rPr>
-          <w:rFonts w:ascii="Calibri" w:hAnsi="Calibri" w:cs="Calibri"/>
-          <w:b/>
-          <w:bCs/>
-        </w:rPr>
-        <w:t>Planned</w:t>
-      </w:r>
-      <w:r>
-        <w:rPr>
-          <w:rFonts w:ascii="Calibri" w:hAnsi="Calibri" w:cs="Calibri"/>
-        </w:rPr>
-        <w:t>.</w:t>
-      </w:r>
-    </w:p>
-    <w:p>
-      <w:pPr>
-        <w:pStyle w:val="Normal"/>
-        <w:numPr>
-          <w:ilvl w:val="0"/>
-          <w:numId w:val="1"/>
-        </w:numPr>
-        <w:widowControl/>
-      </w:pPr>
-      <w:r>
-        <w:rPr>
-          <w:rFonts w:ascii="Calibri" w:hAnsi="Calibri" w:cs="Calibri"/>
-          <w:b/>
-          <w:bCs/>
-        </w:rPr>
         <w:t>Depends on:</w:t>
       </w:r>
       <w:r>
         <w:rPr>
           <w:rFonts w:ascii="Calibri" w:hAnsi="Calibri" w:cs="Calibri"/>
         </w:rPr>
-        <w:t xml:space="preserve"> P10B component/profile authority.</w:t>
+        <w:t xml:space="preserve"> P10B-14 and sufficient real family/profile capability.</w:t>
       </w:r>
     </w:p>
     <w:p>
@@ -13594,31 +12517,55 @@
         <w:rPr>
           <w:rFonts w:ascii="Calibri" w:hAnsi="Calibri" w:cs="Calibri"/>
         </w:rPr>
-        <w:t xml:space="preserve"> The stated outcome and required evidence are accepted.</w:t>
-      </w:r>
-    </w:p>
-    <w:p>
-      <w:pPr>
-        <w:pStyle w:val="Normal"/>
-        <w:numPr>
-          <w:ilvl w:val="0"/>
-          <w:numId w:val="1"/>
-        </w:numPr>
-        <w:widowControl/>
-      </w:pPr>
-      <w:r>
-        <w:rPr>
-          <w:rFonts w:ascii="Calibri" w:hAnsi="Calibri" w:cs="Calibri"/>
-          <w:b/>
-          <w:bCs/>
-        </w:rPr>
-        <w:t>Required evidence:</w:t>
-      </w:r>
-      <w:r>
-        <w:rPr>
-          <w:rFonts w:ascii="Calibri" w:hAnsi="Calibri" w:cs="Calibri"/>
-        </w:rPr>
-        <w:t xml:space="preserve"> Adapter conformance and save/reload preservation.</w:t>
+        <w:t xml:space="preserve"> Deterministic selection preserves cross-page identity, narrative adjacency/ cardinality, repetition limits, bindings/assets, and complete snapshot/lifecycle output for representative inputs.</w:t>
+      </w:r>
+    </w:p>
+    <w:p>
+      <w:pPr>
+        <w:pStyle w:val="Normal"/>
+        <w:numPr>
+          <w:ilvl w:val="0"/>
+          <w:numId w:val="1"/>
+        </w:numPr>
+        <w:widowControl/>
+      </w:pPr>
+      <w:r>
+        <w:rPr>
+          <w:rFonts w:ascii="Calibri" w:hAnsi="Calibri" w:cs="Calibri"/>
+          <w:b/>
+          <w:bCs/>
+        </w:rPr>
+        <w:t>Fail closed:</w:t>
+      </w:r>
+      <w:r>
+        <w:rPr>
+          <w:rFonts w:ascii="Calibri" w:hAnsi="Calibri" w:cs="Calibri"/>
+        </w:rPr>
+        <w:t xml:space="preserve"> Missing, stale, ambiguous, incompatible, unregistered, repetitive, or protected-state-divergent combinations produce no partial proposal/snapshot.</w:t>
+      </w:r>
+    </w:p>
+    <w:p>
+      <w:pPr>
+        <w:pStyle w:val="Normal"/>
+        <w:numPr>
+          <w:ilvl w:val="0"/>
+          <w:numId w:val="1"/>
+        </w:numPr>
+        <w:widowControl/>
+      </w:pPr>
+      <w:r>
+        <w:rPr>
+          <w:rFonts w:ascii="Calibri" w:hAnsi="Calibri" w:cs="Calibri"/>
+          <w:b/>
+          <w:bCs/>
+        </w:rPr>
+        <w:t>Evidence:</w:t>
+      </w:r>
+      <w:r>
+        <w:rPr>
+          <w:rFonts w:ascii="Calibri" w:hAnsi="Calibri" w:cs="Calibri"/>
+        </w:rPr>
+        <w:t xml:space="preserve"> Selection/compatibility/unit, proposal/compiler/lifecycle integration, no-partial- write, deterministic fingerprint inputs, and complete-store browser evidence.</w:t>
       </w:r>
     </w:p>
     <w:p>
@@ -13642,7 +12589,7 @@
         <w:rPr>
           <w:rFonts w:ascii="Calibri" w:hAnsi="Calibri" w:cs="Calibri"/>
         </w:rPr>
-        <w:t xml:space="preserve"> Raw Puck persistence or a second page tree.</w:t>
+        <w:t xml:space="preserve"> Arbitrary trees/styles or a second synthesis representation.</w:t>
       </w:r>
     </w:p>
     <w:p>
@@ -13655,7 +12602,7 @@
         <w:rPr>
           <w:rFonts w:ascii="Calibri" w:hAnsi="Calibri" w:cs="Calibri"/>
         </w:rPr>
-        <w:t>P10C-04 — Stable frame identity and selection</w:t>
+        <w:t>P10B-16 — Coordinated directions and diversity control</w:t>
       </w:r>
     </w:p>
     <w:p>
@@ -13679,45 +12626,31 @@
         <w:rPr>
           <w:rFonts w:ascii="Calibri" w:hAnsi="Calibri" w:cs="Calibri"/>
         </w:rPr>
-        <w:t xml:space="preserve"> Select and edit one shared frame consistently from every page context.</w:t>
-      </w:r>
-    </w:p>
-    <w:p>
-      <w:pPr>
-        <w:pStyle w:val="Normal"/>
-        <w:numPr>
-          <w:ilvl w:val="0"/>
-          <w:numId w:val="1"/>
-        </w:numPr>
-        <w:widowControl/>
-      </w:pPr>
-      <w:r>
-        <w:rPr>
-          <w:rFonts w:ascii="Calibri" w:hAnsi="Calibri" w:cs="Calibri"/>
-          <w:b/>
-          <w:bCs/>
-        </w:rPr>
-        <w:t>Status:</w:t>
-      </w:r>
-      <w:r>
-        <w:rPr>
-          <w:rFonts w:ascii="Calibri" w:hAnsi="Calibri" w:cs="Calibri"/>
-        </w:rPr>
-        <w:t xml:space="preserve"> </w:t>
-      </w:r>
-      <w:r>
-        <w:rPr>
-          <w:rFonts w:ascii="Calibri" w:hAnsi="Calibri" w:cs="Calibri"/>
-          <w:b/>
-          <w:bCs/>
-        </w:rPr>
-        <w:t>Planned</w:t>
-      </w:r>
-      <w:r>
-        <w:rPr>
-          <w:rFonts w:ascii="Calibri" w:hAnsi="Calibri" w:cs="Calibri"/>
-        </w:rPr>
-        <w:t>.</w:t>
+        <w:t xml:space="preserve"> Make Premium Editorial, Modern Technical, and Minimal Commerce coordinated constraint packages and prevent duplicates/near duplicates.</w:t>
+      </w:r>
+    </w:p>
+    <w:p>
+      <w:pPr>
+        <w:pStyle w:val="Normal"/>
+        <w:numPr>
+          <w:ilvl w:val="0"/>
+          <w:numId w:val="1"/>
+        </w:numPr>
+        <w:widowControl/>
+      </w:pPr>
+      <w:r>
+        <w:rPr>
+          <w:rFonts w:ascii="Calibri" w:hAnsi="Calibri" w:cs="Calibri"/>
+          <w:b/>
+          <w:bCs/>
+        </w:rPr>
+        <w:t>Authority:</w:t>
+      </w:r>
+      <w:r>
+        <w:rPr>
+          <w:rFonts w:ascii="Calibri" w:hAnsi="Calibri" w:cs="Calibri"/>
+        </w:rPr>
+        <w:t xml:space="preserve"> Existing direction-selection authority plus deterministic storefront-design fingerprint/evaluation.</w:t>
       </w:r>
     </w:p>
     <w:p>
@@ -13741,7 +12674,7 @@
         <w:rPr>
           <w:rFonts w:ascii="Calibri" w:hAnsi="Calibri" w:cs="Calibri"/>
         </w:rPr>
-        <w:t xml:space="preserve"> P10C-03.</w:t>
+        <w:t xml:space="preserve"> P10B-15.</w:t>
       </w:r>
     </w:p>
     <w:p>
@@ -13765,31 +12698,55 @@
         <w:rPr>
           <w:rFonts w:ascii="Calibri" w:hAnsi="Calibri" w:cs="Calibri"/>
         </w:rPr>
-        <w:t xml:space="preserve"> The stated outcome and required evidence are accepted.</w:t>
-      </w:r>
-    </w:p>
-    <w:p>
-      <w:pPr>
-        <w:pStyle w:val="Normal"/>
-        <w:numPr>
-          <w:ilvl w:val="0"/>
-          <w:numId w:val="1"/>
-        </w:numPr>
-        <w:widowControl/>
-      </w:pPr>
-      <w:r>
-        <w:rPr>
-          <w:rFonts w:ascii="Calibri" w:hAnsi="Calibri" w:cs="Calibri"/>
-          <w:b/>
-          <w:bCs/>
-        </w:rPr>
-        <w:t>Required evidence:</w:t>
-      </w:r>
-      <w:r>
-        <w:rPr>
-          <w:rFonts w:ascii="Calibri" w:hAnsi="Calibri" w:cs="Calibri"/>
-        </w:rPr>
-        <w:t xml:space="preserve"> Stable identity, scope, history, and browser behavior.</w:t>
+        <w:t xml:space="preserve"> Fingerprints cover Design DNA, page set/profiles, frame, anatomies/variants, structural parameters, image posture, density/responsive posture, and narrative composition; exact and meaningful near duplicates fail, and pairwise stores differ materially beyond colour.</w:t>
+      </w:r>
+    </w:p>
+    <w:p>
+      <w:pPr>
+        <w:pStyle w:val="Normal"/>
+        <w:numPr>
+          <w:ilvl w:val="0"/>
+          <w:numId w:val="1"/>
+        </w:numPr>
+        <w:widowControl/>
+      </w:pPr>
+      <w:r>
+        <w:rPr>
+          <w:rFonts w:ascii="Calibri" w:hAnsi="Calibri" w:cs="Calibri"/>
+          <w:b/>
+          <w:bCs/>
+        </w:rPr>
+        <w:t>Fail closed:</w:t>
+      </w:r>
+      <w:r>
+        <w:rPr>
+          <w:rFonts w:ascii="Calibri" w:hAnsi="Calibri" w:cs="Calibri"/>
+        </w:rPr>
+        <w:t xml:space="preserve"> Fixed-template/token/page direction authority, incompatible references, colour-only differences, and fingerprints that omit material structure are rejected.</w:t>
+      </w:r>
+    </w:p>
+    <w:p>
+      <w:pPr>
+        <w:pStyle w:val="Normal"/>
+        <w:numPr>
+          <w:ilvl w:val="0"/>
+          <w:numId w:val="1"/>
+        </w:numPr>
+        <w:widowControl/>
+      </w:pPr>
+      <w:r>
+        <w:rPr>
+          <w:rFonts w:ascii="Calibri" w:hAnsi="Calibri" w:cs="Calibri"/>
+          <w:b/>
+          <w:bCs/>
+        </w:rPr>
+        <w:t>Evidence:</w:t>
+      </w:r>
+      <w:r>
+        <w:rPr>
+          <w:rFonts w:ascii="Calibri" w:hAnsi="Calibri" w:cs="Calibri"/>
+        </w:rPr>
+        <w:t xml:space="preserve"> Determinism, exact/near-duplicate fixtures, pairwise structural scoring, direction compatibility, complete-store generation, and representative visual evidence.</w:t>
       </w:r>
     </w:p>
     <w:p>
@@ -13813,7 +12770,7 @@
         <w:rPr>
           <w:rFonts w:ascii="Calibri" w:hAnsi="Calibri" w:cs="Calibri"/>
         </w:rPr>
-        <w:t xml:space="preserve"> Duplicating frame state per page.</w:t>
+        <w:t xml:space="preserve"> Thousands of manually authored templates.</w:t>
       </w:r>
     </w:p>
     <w:p>
@@ -13826,7 +12783,7 @@
         <w:rPr>
           <w:rFonts w:ascii="Calibri" w:hAnsi="Calibri" w:cs="Calibri"/>
         </w:rPr>
-        <w:t>P10C-05 — Approved manual frame operations</w:t>
+        <w:t>P10B-17 — Responsive, accessibility and performance closure</w:t>
       </w:r>
     </w:p>
     <w:p>
@@ -13850,45 +12807,31 @@
         <w:rPr>
           <w:rFonts w:ascii="Calibri" w:hAnsi="Calibri" w:cs="Calibri"/>
         </w:rPr>
-        <w:t xml:space="preserve"> Support bounded manual shared-frame add, remove, reorder, field, asset, and presentation operations.</w:t>
-      </w:r>
-    </w:p>
-    <w:p>
-      <w:pPr>
-        <w:pStyle w:val="Normal"/>
-        <w:numPr>
-          <w:ilvl w:val="0"/>
-          <w:numId w:val="1"/>
-        </w:numPr>
-        <w:widowControl/>
-      </w:pPr>
-      <w:r>
-        <w:rPr>
-          <w:rFonts w:ascii="Calibri" w:hAnsi="Calibri" w:cs="Calibri"/>
-          <w:b/>
-          <w:bCs/>
-        </w:rPr>
-        <w:t>Status:</w:t>
-      </w:r>
-      <w:r>
-        <w:rPr>
-          <w:rFonts w:ascii="Calibri" w:hAnsi="Calibri" w:cs="Calibri"/>
-        </w:rPr>
-        <w:t xml:space="preserve"> </w:t>
-      </w:r>
-      <w:r>
-        <w:rPr>
-          <w:rFonts w:ascii="Calibri" w:hAnsi="Calibri" w:cs="Calibri"/>
-          <w:b/>
-          <w:bCs/>
-        </w:rPr>
-        <w:t>Planned</w:t>
-      </w:r>
-      <w:r>
-        <w:rPr>
-          <w:rFonts w:ascii="Calibri" w:hAnsi="Calibri" w:cs="Calibri"/>
-        </w:rPr>
-        <w:t>.</w:t>
+        <w:t xml:space="preserve"> Preserve deliberate commercial hierarchy and usability across target widths, locales, accessibility, and bounded performance budgets.</w:t>
+      </w:r>
+    </w:p>
+    <w:p>
+      <w:pPr>
+        <w:pStyle w:val="Normal"/>
+        <w:numPr>
+          <w:ilvl w:val="0"/>
+          <w:numId w:val="1"/>
+        </w:numPr>
+        <w:widowControl/>
+      </w:pPr>
+      <w:r>
+        <w:rPr>
+          <w:rFonts w:ascii="Calibri" w:hAnsi="Calibri" w:cs="Calibri"/>
+          <w:b/>
+          <w:bCs/>
+        </w:rPr>
+        <w:t>Authority:</w:t>
+      </w:r>
+      <w:r>
+        <w:rPr>
+          <w:rFonts w:ascii="Calibri" w:hAnsi="Calibri" w:cs="Calibri"/>
+        </w:rPr>
+        <w:t xml:space="preserve"> Existing responsive/a11y contracts, registered transformations, renderers, and evidence protocol.</w:t>
       </w:r>
     </w:p>
     <w:p>
@@ -13912,7 +12855,7 @@
         <w:rPr>
           <w:rFonts w:ascii="Calibri" w:hAnsi="Calibri" w:cs="Calibri"/>
         </w:rPr>
-        <w:t xml:space="preserve"> P10C-02 through P10C-04.</w:t>
+        <w:t xml:space="preserve"> Implemented commercial families/profiles/directions through P10B-16.</w:t>
       </w:r>
     </w:p>
     <w:p>
@@ -13936,31 +12879,55 @@
         <w:rPr>
           <w:rFonts w:ascii="Calibri" w:hAnsi="Calibri" w:cs="Calibri"/>
         </w:rPr>
-        <w:t xml:space="preserve"> The stated outcome and required evidence are accepted.</w:t>
-      </w:r>
-    </w:p>
-    <w:p>
-      <w:pPr>
-        <w:pStyle w:val="Normal"/>
-        <w:numPr>
-          <w:ilvl w:val="0"/>
-          <w:numId w:val="1"/>
-        </w:numPr>
-        <w:widowControl/>
-      </w:pPr>
-      <w:r>
-        <w:rPr>
-          <w:rFonts w:ascii="Calibri" w:hAnsi="Calibri" w:cs="Calibri"/>
-          <w:b/>
-          <w:bCs/>
-        </w:rPr>
-        <w:t>Required evidence:</w:t>
-      </w:r>
-      <w:r>
-        <w:rPr>
-          <w:rFonts w:ascii="Calibri" w:hAnsi="Calibri" w:cs="Calibri"/>
-        </w:rPr>
-        <w:t xml:space="preserve"> Positive and fail-closed integration, undo/redo, browser/E2E.</w:t>
+        <w:t xml:space="preserve"> All supported page families/directions pass 375/768/1024/1440 and EN/FI geometry, declared transformations, keyboard/focus/semantics/contrast, content/commerce retention, and explicit performance budgets with correlated evidence.</w:t>
+      </w:r>
+    </w:p>
+    <w:p>
+      <w:pPr>
+        <w:pStyle w:val="Normal"/>
+        <w:numPr>
+          <w:ilvl w:val="0"/>
+          <w:numId w:val="1"/>
+        </w:numPr>
+        <w:widowControl/>
+      </w:pPr>
+      <w:r>
+        <w:rPr>
+          <w:rFonts w:ascii="Calibri" w:hAnsi="Calibri" w:cs="Calibri"/>
+          <w:b/>
+          <w:bCs/>
+        </w:rPr>
+        <w:t>Fail closed:</w:t>
+      </w:r>
+      <w:r>
+        <w:rPr>
+          <w:rFonts w:ascii="Calibri" w:hAnsi="Calibri" w:cs="Calibri"/>
+        </w:rPr>
+        <w:t xml:space="preserve"> Clipping, overlap, inaccessible controls, lost content/commerce, desktop-only approval, or undispositioned budget failure blocks completion.</w:t>
+      </w:r>
+    </w:p>
+    <w:p>
+      <w:pPr>
+        <w:pStyle w:val="Normal"/>
+        <w:numPr>
+          <w:ilvl w:val="0"/>
+          <w:numId w:val="1"/>
+        </w:numPr>
+        <w:widowControl/>
+      </w:pPr>
+      <w:r>
+        <w:rPr>
+          <w:rFonts w:ascii="Calibri" w:hAnsi="Calibri" w:cs="Calibri"/>
+          <w:b/>
+          <w:bCs/>
+        </w:rPr>
+        <w:t>Evidence:</w:t>
+      </w:r>
+      <w:r>
+        <w:rPr>
+          <w:rFonts w:ascii="Calibri" w:hAnsi="Calibri" w:cs="Calibri"/>
+        </w:rPr>
+        <w:t xml:space="preserve"> Automated geometry/a11y/performance/browser matrices plus retained representative human review.</w:t>
       </w:r>
     </w:p>
     <w:p>
@@ -13984,7 +12951,7 @@
         <w:rPr>
           <w:rFonts w:ascii="Calibri" w:hAnsi="Calibri" w:cs="Calibri"/>
         </w:rPr>
-        <w:t xml:space="preserve"> Arbitrary code/CSS/components or commerce mutation.</w:t>
+        <w:t xml:space="preserve"> Visual approval from isolated component screenshots.</w:t>
       </w:r>
     </w:p>
     <w:p>
@@ -13997,7 +12964,7 @@
         <w:rPr>
           <w:rFonts w:ascii="Calibri" w:hAnsi="Calibri" w:cs="Calibri"/>
         </w:rPr>
-        <w:t>P10C-06 — Scoped AI editing</w:t>
+        <w:t>P10B-18 — Commercial quality and scale gate</w:t>
       </w:r>
     </w:p>
     <w:p>
@@ -14021,45 +12988,31 @@
         <w:rPr>
           <w:rFonts w:ascii="Calibri" w:hAnsi="Calibri" w:cs="Calibri"/>
         </w:rPr>
-        <w:t xml:space="preserve"> Connect merchant routing, clarification, frame/page scope, and proposal review to the existing P10A governed authorities.</w:t>
-      </w:r>
-    </w:p>
-    <w:p>
-      <w:pPr>
-        <w:pStyle w:val="Normal"/>
-        <w:numPr>
-          <w:ilvl w:val="0"/>
-          <w:numId w:val="1"/>
-        </w:numPr>
-        <w:widowControl/>
-      </w:pPr>
-      <w:r>
-        <w:rPr>
-          <w:rFonts w:ascii="Calibri" w:hAnsi="Calibri" w:cs="Calibri"/>
-          <w:b/>
-          <w:bCs/>
-        </w:rPr>
-        <w:t>Status:</w:t>
-      </w:r>
-      <w:r>
-        <w:rPr>
-          <w:rFonts w:ascii="Calibri" w:hAnsi="Calibri" w:cs="Calibri"/>
-        </w:rPr>
-        <w:t xml:space="preserve"> </w:t>
-      </w:r>
-      <w:r>
-        <w:rPr>
-          <w:rFonts w:ascii="Calibri" w:hAnsi="Calibri" w:cs="Calibri"/>
-          <w:b/>
-          <w:bCs/>
-        </w:rPr>
-        <w:t>Planned</w:t>
-      </w:r>
-      <w:r>
-        <w:rPr>
-          <w:rFonts w:ascii="Calibri" w:hAnsi="Calibri" w:cs="Calibri"/>
-        </w:rPr>
-        <w:t>.</w:t>
+        <w:t xml:space="preserve"> Prove repeated generation of publishable, premium, materially different complete storefronts.</w:t>
+      </w:r>
+    </w:p>
+    <w:p>
+      <w:pPr>
+        <w:pStyle w:val="Normal"/>
+        <w:numPr>
+          <w:ilvl w:val="0"/>
+          <w:numId w:val="1"/>
+        </w:numPr>
+        <w:widowControl/>
+      </w:pPr>
+      <w:r>
+        <w:rPr>
+          <w:rFonts w:ascii="Calibri" w:hAnsi="Calibri" w:cs="Calibri"/>
+          <w:b/>
+          <w:bCs/>
+        </w:rPr>
+        <w:t>Authority:</w:t>
+      </w:r>
+      <w:r>
+        <w:rPr>
+          <w:rFonts w:ascii="Calibri" w:hAnsi="Calibri" w:cs="Calibri"/>
+        </w:rPr>
+        <w:t xml:space="preserve"> Existing golden-store/human-review evidence plus the P10B synthesis and fingerprint authorities.</w:t>
       </w:r>
     </w:p>
     <w:p>
@@ -14083,7 +13036,7 @@
         <w:rPr>
           <w:rFonts w:ascii="Calibri" w:hAnsi="Calibri" w:cs="Calibri"/>
         </w:rPr>
-        <w:t xml:space="preserve"> P10C-03 through P10C-05 and P10A internal router/packages.</w:t>
+        <w:t xml:space="preserve"> P10B-17 and every prior P10B task.</w:t>
       </w:r>
     </w:p>
     <w:p>
@@ -14107,31 +13060,55 @@
         <w:rPr>
           <w:rFonts w:ascii="Calibri" w:hAnsi="Calibri" w:cs="Calibri"/>
         </w:rPr>
-        <w:t xml:space="preserve"> The stated outcome and required evidence are accepted.</w:t>
-      </w:r>
-    </w:p>
-    <w:p>
-      <w:pPr>
-        <w:pStyle w:val="Normal"/>
-        <w:numPr>
-          <w:ilvl w:val="0"/>
-          <w:numId w:val="1"/>
-        </w:numPr>
-        <w:widowControl/>
-      </w:pPr>
-      <w:r>
-        <w:rPr>
-          <w:rFonts w:ascii="Calibri" w:hAnsi="Calibri" w:cs="Calibri"/>
-          <w:b/>
-          <w:bCs/>
-        </w:rPr>
-        <w:t>Required evidence:</w:t>
-      </w:r>
-      <w:r>
-        <w:rPr>
-          <w:rFonts w:ascii="Calibri" w:hAnsi="Calibri" w:cs="Calibri"/>
-        </w:rPr>
-        <w:t xml:space="preserve"> Selected-section, frame, page, storefront, ambiguity, stale, and failure browser flows.</w:t>
+        <w:t xml:space="preserve"> At least 100 deterministic complete configurations across representative catalogue/evidence/asset/locale/page-set/direction contexts pass snapshot validity, protected parity, exact-duplicate, near-duplicate, and structural-distribution gates; a fingerprint- stratified subset passes retained four-width human commercial review.</w:t>
+      </w:r>
+    </w:p>
+    <w:p>
+      <w:pPr>
+        <w:pStyle w:val="Normal"/>
+        <w:numPr>
+          <w:ilvl w:val="0"/>
+          <w:numId w:val="1"/>
+        </w:numPr>
+        <w:widowControl/>
+      </w:pPr>
+      <w:r>
+        <w:rPr>
+          <w:rFonts w:ascii="Calibri" w:hAnsi="Calibri" w:cs="Calibri"/>
+          <w:b/>
+          <w:bCs/>
+        </w:rPr>
+        <w:t>Fail closed:</w:t>
+      </w:r>
+      <w:r>
+        <w:rPr>
+          <w:rFonts w:ascii="Calibri" w:hAnsi="Calibri" w:cs="Calibri"/>
+        </w:rPr>
+        <w:t xml:space="preserve"> One polished store, automated checks alone, placeholder assets, registry counts, screenshots without exact authority, or colour-only diversity cannot close P10B.</w:t>
+      </w:r>
+    </w:p>
+    <w:p>
+      <w:pPr>
+        <w:pStyle w:val="Normal"/>
+        <w:numPr>
+          <w:ilvl w:val="0"/>
+          <w:numId w:val="1"/>
+        </w:numPr>
+        <w:widowControl/>
+      </w:pPr>
+      <w:r>
+        <w:rPr>
+          <w:rFonts w:ascii="Calibri" w:hAnsi="Calibri" w:cs="Calibri"/>
+          <w:b/>
+          <w:bCs/>
+        </w:rPr>
+        <w:t>Evidence:</w:t>
+      </w:r>
+      <w:r>
+        <w:rPr>
+          <w:rFonts w:ascii="Calibri" w:hAnsi="Calibri" w:cs="Calibri"/>
+        </w:rPr>
+        <w:t xml:space="preserve"> Scale-generation ledger, fingerprint/diversity analysis, complete capability-chain correlations, retained screenshots, and explicit human acceptance.</w:t>
       </w:r>
     </w:p>
     <w:p>
@@ -14155,7 +13132,20 @@
         <w:rPr>
           <w:rFonts w:ascii="Calibri" w:hAnsi="Calibri" w:cs="Calibri"/>
         </w:rPr>
-        <w:t xml:space="preserve"> Rebuilding the router, packages, proposals, or provider boundary.</w:t>
+        <w:t xml:space="preserve"> P10C merchant editing, Vesko staging, or production-readiness claims.</w:t>
+      </w:r>
+    </w:p>
+    <w:p>
+      <w:pPr>
+        <w:pStyle w:val="Heading2"/>
+        <w:keepNext/>
+        <w:widowControl/>
+      </w:pPr>
+      <w:r>
+        <w:rPr>
+          <w:rFonts w:ascii="Calibri" w:hAnsi="Calibri" w:cs="Calibri"/>
+        </w:rPr>
+        <w:t>P10C — Storefront Studio Editing Experience v1</w:t>
       </w:r>
     </w:p>
     <w:p>
@@ -14168,7 +13158,7 @@
         <w:rPr>
           <w:rFonts w:ascii="Calibri" w:hAnsi="Calibri" w:cs="Calibri"/>
         </w:rPr>
-        <w:t>P10C-07 — Unified AI/manual history</w:t>
+        <w:t>P10C-01 — Brand asset library</w:t>
       </w:r>
     </w:p>
     <w:p>
@@ -14192,7 +13182,7 @@
         <w:rPr>
           <w:rFonts w:ascii="Calibri" w:hAnsi="Calibri" w:cs="Calibri"/>
         </w:rPr>
-        <w:t xml:space="preserve"> Put manual and accepted AI operations into one atomic canonical undo/redo history.</w:t>
+        <w:t xml:space="preserve"> Let merchants view and choose approved presentation assets in Storefront Studio.</w:t>
       </w:r>
     </w:p>
     <w:p>
@@ -14254,7 +13244,7 @@
         <w:rPr>
           <w:rFonts w:ascii="Calibri" w:hAnsi="Calibri" w:cs="Calibri"/>
         </w:rPr>
-        <w:t xml:space="preserve"> P10C-05, P10C-06.</w:t>
+        <w:t xml:space="preserve"> P10B asset authority.</w:t>
       </w:r>
     </w:p>
     <w:p>
@@ -14302,7 +13292,7 @@
         <w:rPr>
           <w:rFonts w:ascii="Calibri" w:hAnsi="Calibri" w:cs="Calibri"/>
         </w:rPr>
-        <w:t xml:space="preserve"> Mixed edits, undo/redo, save/reload, stale protection.</w:t>
+        <w:t xml:space="preserve"> Contract, integration, browser/E2E.</w:t>
       </w:r>
     </w:p>
     <w:p>
@@ -14326,7 +13316,7 @@
         <w:rPr>
           <w:rFonts w:ascii="Calibri" w:hAnsi="Calibri" w:cs="Calibri"/>
         </w:rPr>
-        <w:t xml:space="preserve"> A Puck-only or AI-only history.</w:t>
+        <w:t xml:space="preserve"> Product-media replacement or generic DAM scope.</w:t>
       </w:r>
     </w:p>
     <w:p>
@@ -14339,7 +13329,7 @@
         <w:rPr>
           <w:rFonts w:ascii="Calibri" w:hAnsi="Calibri" w:cs="Calibri"/>
         </w:rPr>
-        <w:t>P10C-08 — Brand and asset editor with Studio shell</w:t>
+        <w:t>P10C-02 — Asset roles and provenance</w:t>
       </w:r>
     </w:p>
     <w:p>
@@ -14363,7 +13353,7 @@
         <w:rPr>
           <w:rFonts w:ascii="Calibri" w:hAnsi="Calibri" w:cs="Calibri"/>
         </w:rPr>
-        <w:t xml:space="preserve"> Deliver the merchant shell subset required to operate assets, canvas, review, save, preview, and publish.</w:t>
+        <w:t xml:space="preserve"> Show and preserve role, source, approval, revision, and assignment authority.</w:t>
       </w:r>
     </w:p>
     <w:p>
@@ -14425,7 +13415,7 @@
         <w:rPr>
           <w:rFonts w:ascii="Calibri" w:hAnsi="Calibri" w:cs="Calibri"/>
         </w:rPr>
-        <w:t xml:space="preserve"> P10C-01 through P10C-07.</w:t>
+        <w:t xml:space="preserve"> P10C-01.</w:t>
       </w:r>
     </w:p>
     <w:p>
@@ -14473,7 +13463,7 @@
         <w:rPr>
           <w:rFonts w:ascii="Calibri" w:hAnsi="Calibri" w:cs="Calibri"/>
         </w:rPr>
-        <w:t xml:space="preserve"> Default/loading/empty/error/stale/success/unsaved states, accessibility, responsive browser/E2E.</w:t>
+        <w:t xml:space="preserve"> Valid assignment and stale/unknown/role-mismatch rejection.</w:t>
       </w:r>
     </w:p>
     <w:p>
@@ -14497,7 +13487,7 @@
         <w:rPr>
           <w:rFonts w:ascii="Calibri" w:hAnsi="Calibri" w:cs="Calibri"/>
         </w:rPr>
-        <w:t xml:space="preserve"> Full CMS or exposure of implementation internals.</w:t>
+        <w:t xml:space="preserve"> Untyped uploads or hidden provenance.</w:t>
       </w:r>
     </w:p>
     <w:p>
@@ -14510,6 +13500,1046 @@
         <w:rPr>
           <w:rFonts w:ascii="Calibri" w:hAnsi="Calibri" w:cs="Calibri"/>
         </w:rPr>
+        <w:t>P10C-03 — Canonical Puck boundary</w:t>
+      </w:r>
+    </w:p>
+    <w:p>
+      <w:pPr>
+        <w:pStyle w:val="Normal"/>
+        <w:numPr>
+          <w:ilvl w:val="0"/>
+          <w:numId w:val="1"/>
+        </w:numPr>
+        <w:widowControl/>
+      </w:pPr>
+      <w:r>
+        <w:rPr>
+          <w:rFonts w:ascii="Calibri" w:hAnsi="Calibri" w:cs="Calibri"/>
+          <w:b/>
+          <w:bCs/>
+        </w:rPr>
+        <w:t>Outcome:</w:t>
+      </w:r>
+      <w:r>
+        <w:rPr>
+          <w:rFonts w:ascii="Calibri" w:hAnsi="Calibri" w:cs="Calibri"/>
+        </w:rPr>
+        <w:t xml:space="preserve"> Project registered canonical content into Puck and validate edits back into the same </w:t>
+      </w:r>
+      <w:r>
+        <w:rPr>
+          <w:rFonts w:ascii="Consolas" w:hAnsi="Consolas" w:cs="Consolas"/>
+          <w:sz w:val="19"/>
+          <w:szCs w:val="19"/>
+        </w:rPr>
+        <w:t>StorefrontSnapshot</w:t>
+      </w:r>
+      <w:r>
+        <w:rPr>
+          <w:rFonts w:ascii="Calibri" w:hAnsi="Calibri" w:cs="Calibri"/>
+        </w:rPr>
+        <w:t>.</w:t>
+      </w:r>
+    </w:p>
+    <w:p>
+      <w:pPr>
+        <w:pStyle w:val="Normal"/>
+        <w:numPr>
+          <w:ilvl w:val="0"/>
+          <w:numId w:val="1"/>
+        </w:numPr>
+        <w:widowControl/>
+      </w:pPr>
+      <w:r>
+        <w:rPr>
+          <w:rFonts w:ascii="Calibri" w:hAnsi="Calibri" w:cs="Calibri"/>
+          <w:b/>
+          <w:bCs/>
+        </w:rPr>
+        <w:t>Status:</w:t>
+      </w:r>
+      <w:r>
+        <w:rPr>
+          <w:rFonts w:ascii="Calibri" w:hAnsi="Calibri" w:cs="Calibri"/>
+        </w:rPr>
+        <w:t xml:space="preserve"> </w:t>
+      </w:r>
+      <w:r>
+        <w:rPr>
+          <w:rFonts w:ascii="Calibri" w:hAnsi="Calibri" w:cs="Calibri"/>
+          <w:b/>
+          <w:bCs/>
+        </w:rPr>
+        <w:t>Planned</w:t>
+      </w:r>
+      <w:r>
+        <w:rPr>
+          <w:rFonts w:ascii="Calibri" w:hAnsi="Calibri" w:cs="Calibri"/>
+        </w:rPr>
+        <w:t>.</w:t>
+      </w:r>
+    </w:p>
+    <w:p>
+      <w:pPr>
+        <w:pStyle w:val="Normal"/>
+        <w:numPr>
+          <w:ilvl w:val="0"/>
+          <w:numId w:val="1"/>
+        </w:numPr>
+        <w:widowControl/>
+      </w:pPr>
+      <w:r>
+        <w:rPr>
+          <w:rFonts w:ascii="Calibri" w:hAnsi="Calibri" w:cs="Calibri"/>
+          <w:b/>
+          <w:bCs/>
+        </w:rPr>
+        <w:t>Depends on:</w:t>
+      </w:r>
+      <w:r>
+        <w:rPr>
+          <w:rFonts w:ascii="Calibri" w:hAnsi="Calibri" w:cs="Calibri"/>
+        </w:rPr>
+        <w:t xml:space="preserve"> P10B component/profile authority.</w:t>
+      </w:r>
+    </w:p>
+    <w:p>
+      <w:pPr>
+        <w:pStyle w:val="Normal"/>
+        <w:numPr>
+          <w:ilvl w:val="0"/>
+          <w:numId w:val="1"/>
+        </w:numPr>
+        <w:widowControl/>
+      </w:pPr>
+      <w:r>
+        <w:rPr>
+          <w:rFonts w:ascii="Calibri" w:hAnsi="Calibri" w:cs="Calibri"/>
+          <w:b/>
+          <w:bCs/>
+        </w:rPr>
+        <w:t>Done when:</w:t>
+      </w:r>
+      <w:r>
+        <w:rPr>
+          <w:rFonts w:ascii="Calibri" w:hAnsi="Calibri" w:cs="Calibri"/>
+        </w:rPr>
+        <w:t xml:space="preserve"> The stated outcome and required evidence are accepted.</w:t>
+      </w:r>
+    </w:p>
+    <w:p>
+      <w:pPr>
+        <w:pStyle w:val="Normal"/>
+        <w:numPr>
+          <w:ilvl w:val="0"/>
+          <w:numId w:val="1"/>
+        </w:numPr>
+        <w:widowControl/>
+      </w:pPr>
+      <w:r>
+        <w:rPr>
+          <w:rFonts w:ascii="Calibri" w:hAnsi="Calibri" w:cs="Calibri"/>
+          <w:b/>
+          <w:bCs/>
+        </w:rPr>
+        <w:t>Required evidence:</w:t>
+      </w:r>
+      <w:r>
+        <w:rPr>
+          <w:rFonts w:ascii="Calibri" w:hAnsi="Calibri" w:cs="Calibri"/>
+        </w:rPr>
+        <w:t xml:space="preserve"> Adapter conformance and save/reload preservation.</w:t>
+      </w:r>
+    </w:p>
+    <w:p>
+      <w:pPr>
+        <w:pStyle w:val="Normal"/>
+        <w:numPr>
+          <w:ilvl w:val="0"/>
+          <w:numId w:val="1"/>
+        </w:numPr>
+        <w:widowControl/>
+      </w:pPr>
+      <w:r>
+        <w:rPr>
+          <w:rFonts w:ascii="Calibri" w:hAnsi="Calibri" w:cs="Calibri"/>
+          <w:b/>
+          <w:bCs/>
+        </w:rPr>
+        <w:t>Non-goal:</w:t>
+      </w:r>
+      <w:r>
+        <w:rPr>
+          <w:rFonts w:ascii="Calibri" w:hAnsi="Calibri" w:cs="Calibri"/>
+        </w:rPr>
+        <w:t xml:space="preserve"> Raw Puck persistence or a second page tree.</w:t>
+      </w:r>
+    </w:p>
+    <w:p>
+      <w:pPr>
+        <w:pStyle w:val="Heading3"/>
+        <w:keepNext/>
+        <w:widowControl/>
+      </w:pPr>
+      <w:r>
+        <w:rPr>
+          <w:rFonts w:ascii="Calibri" w:hAnsi="Calibri" w:cs="Calibri"/>
+        </w:rPr>
+        <w:t>P10C-04 — Stable frame identity and selection</w:t>
+      </w:r>
+    </w:p>
+    <w:p>
+      <w:pPr>
+        <w:pStyle w:val="Normal"/>
+        <w:numPr>
+          <w:ilvl w:val="0"/>
+          <w:numId w:val="1"/>
+        </w:numPr>
+        <w:widowControl/>
+      </w:pPr>
+      <w:r>
+        <w:rPr>
+          <w:rFonts w:ascii="Calibri" w:hAnsi="Calibri" w:cs="Calibri"/>
+          <w:b/>
+          <w:bCs/>
+        </w:rPr>
+        <w:t>Outcome:</w:t>
+      </w:r>
+      <w:r>
+        <w:rPr>
+          <w:rFonts w:ascii="Calibri" w:hAnsi="Calibri" w:cs="Calibri"/>
+        </w:rPr>
+        <w:t xml:space="preserve"> Select and edit one shared frame consistently from every page context.</w:t>
+      </w:r>
+    </w:p>
+    <w:p>
+      <w:pPr>
+        <w:pStyle w:val="Normal"/>
+        <w:numPr>
+          <w:ilvl w:val="0"/>
+          <w:numId w:val="1"/>
+        </w:numPr>
+        <w:widowControl/>
+      </w:pPr>
+      <w:r>
+        <w:rPr>
+          <w:rFonts w:ascii="Calibri" w:hAnsi="Calibri" w:cs="Calibri"/>
+          <w:b/>
+          <w:bCs/>
+        </w:rPr>
+        <w:t>Status:</w:t>
+      </w:r>
+      <w:r>
+        <w:rPr>
+          <w:rFonts w:ascii="Calibri" w:hAnsi="Calibri" w:cs="Calibri"/>
+        </w:rPr>
+        <w:t xml:space="preserve"> </w:t>
+      </w:r>
+      <w:r>
+        <w:rPr>
+          <w:rFonts w:ascii="Calibri" w:hAnsi="Calibri" w:cs="Calibri"/>
+          <w:b/>
+          <w:bCs/>
+        </w:rPr>
+        <w:t>Planned</w:t>
+      </w:r>
+      <w:r>
+        <w:rPr>
+          <w:rFonts w:ascii="Calibri" w:hAnsi="Calibri" w:cs="Calibri"/>
+        </w:rPr>
+        <w:t>.</w:t>
+      </w:r>
+    </w:p>
+    <w:p>
+      <w:pPr>
+        <w:pStyle w:val="Normal"/>
+        <w:numPr>
+          <w:ilvl w:val="0"/>
+          <w:numId w:val="1"/>
+        </w:numPr>
+        <w:widowControl/>
+      </w:pPr>
+      <w:r>
+        <w:rPr>
+          <w:rFonts w:ascii="Calibri" w:hAnsi="Calibri" w:cs="Calibri"/>
+          <w:b/>
+          <w:bCs/>
+        </w:rPr>
+        <w:t>Depends on:</w:t>
+      </w:r>
+      <w:r>
+        <w:rPr>
+          <w:rFonts w:ascii="Calibri" w:hAnsi="Calibri" w:cs="Calibri"/>
+        </w:rPr>
+        <w:t xml:space="preserve"> P10C-03.</w:t>
+      </w:r>
+    </w:p>
+    <w:p>
+      <w:pPr>
+        <w:pStyle w:val="Normal"/>
+        <w:numPr>
+          <w:ilvl w:val="0"/>
+          <w:numId w:val="1"/>
+        </w:numPr>
+        <w:widowControl/>
+      </w:pPr>
+      <w:r>
+        <w:rPr>
+          <w:rFonts w:ascii="Calibri" w:hAnsi="Calibri" w:cs="Calibri"/>
+          <w:b/>
+          <w:bCs/>
+        </w:rPr>
+        <w:t>Done when:</w:t>
+      </w:r>
+      <w:r>
+        <w:rPr>
+          <w:rFonts w:ascii="Calibri" w:hAnsi="Calibri" w:cs="Calibri"/>
+        </w:rPr>
+        <w:t xml:space="preserve"> The stated outcome and required evidence are accepted.</w:t>
+      </w:r>
+    </w:p>
+    <w:p>
+      <w:pPr>
+        <w:pStyle w:val="Normal"/>
+        <w:numPr>
+          <w:ilvl w:val="0"/>
+          <w:numId w:val="1"/>
+        </w:numPr>
+        <w:widowControl/>
+      </w:pPr>
+      <w:r>
+        <w:rPr>
+          <w:rFonts w:ascii="Calibri" w:hAnsi="Calibri" w:cs="Calibri"/>
+          <w:b/>
+          <w:bCs/>
+        </w:rPr>
+        <w:t>Required evidence:</w:t>
+      </w:r>
+      <w:r>
+        <w:rPr>
+          <w:rFonts w:ascii="Calibri" w:hAnsi="Calibri" w:cs="Calibri"/>
+        </w:rPr>
+        <w:t xml:space="preserve"> Stable identity, scope, history, and browser behavior.</w:t>
+      </w:r>
+    </w:p>
+    <w:p>
+      <w:pPr>
+        <w:pStyle w:val="Normal"/>
+        <w:numPr>
+          <w:ilvl w:val="0"/>
+          <w:numId w:val="1"/>
+        </w:numPr>
+        <w:widowControl/>
+      </w:pPr>
+      <w:r>
+        <w:rPr>
+          <w:rFonts w:ascii="Calibri" w:hAnsi="Calibri" w:cs="Calibri"/>
+          <w:b/>
+          <w:bCs/>
+        </w:rPr>
+        <w:t>Non-goal:</w:t>
+      </w:r>
+      <w:r>
+        <w:rPr>
+          <w:rFonts w:ascii="Calibri" w:hAnsi="Calibri" w:cs="Calibri"/>
+        </w:rPr>
+        <w:t xml:space="preserve"> Duplicating frame state per page.</w:t>
+      </w:r>
+    </w:p>
+    <w:p>
+      <w:pPr>
+        <w:pStyle w:val="Heading3"/>
+        <w:keepNext/>
+        <w:widowControl/>
+      </w:pPr>
+      <w:r>
+        <w:rPr>
+          <w:rFonts w:ascii="Calibri" w:hAnsi="Calibri" w:cs="Calibri"/>
+        </w:rPr>
+        <w:t>P10C-05 — Approved manual frame operations</w:t>
+      </w:r>
+    </w:p>
+    <w:p>
+      <w:pPr>
+        <w:pStyle w:val="Normal"/>
+        <w:numPr>
+          <w:ilvl w:val="0"/>
+          <w:numId w:val="1"/>
+        </w:numPr>
+        <w:widowControl/>
+      </w:pPr>
+      <w:r>
+        <w:rPr>
+          <w:rFonts w:ascii="Calibri" w:hAnsi="Calibri" w:cs="Calibri"/>
+          <w:b/>
+          <w:bCs/>
+        </w:rPr>
+        <w:t>Outcome:</w:t>
+      </w:r>
+      <w:r>
+        <w:rPr>
+          <w:rFonts w:ascii="Calibri" w:hAnsi="Calibri" w:cs="Calibri"/>
+        </w:rPr>
+        <w:t xml:space="preserve"> Support bounded manual shared-frame add, remove, reorder, field, asset, and presentation operations.</w:t>
+      </w:r>
+    </w:p>
+    <w:p>
+      <w:pPr>
+        <w:pStyle w:val="Normal"/>
+        <w:numPr>
+          <w:ilvl w:val="0"/>
+          <w:numId w:val="1"/>
+        </w:numPr>
+        <w:widowControl/>
+      </w:pPr>
+      <w:r>
+        <w:rPr>
+          <w:rFonts w:ascii="Calibri" w:hAnsi="Calibri" w:cs="Calibri"/>
+          <w:b/>
+          <w:bCs/>
+        </w:rPr>
+        <w:t>Status:</w:t>
+      </w:r>
+      <w:r>
+        <w:rPr>
+          <w:rFonts w:ascii="Calibri" w:hAnsi="Calibri" w:cs="Calibri"/>
+        </w:rPr>
+        <w:t xml:space="preserve"> </w:t>
+      </w:r>
+      <w:r>
+        <w:rPr>
+          <w:rFonts w:ascii="Calibri" w:hAnsi="Calibri" w:cs="Calibri"/>
+          <w:b/>
+          <w:bCs/>
+        </w:rPr>
+        <w:t>Planned</w:t>
+      </w:r>
+      <w:r>
+        <w:rPr>
+          <w:rFonts w:ascii="Calibri" w:hAnsi="Calibri" w:cs="Calibri"/>
+        </w:rPr>
+        <w:t>.</w:t>
+      </w:r>
+    </w:p>
+    <w:p>
+      <w:pPr>
+        <w:pStyle w:val="Normal"/>
+        <w:numPr>
+          <w:ilvl w:val="0"/>
+          <w:numId w:val="1"/>
+        </w:numPr>
+        <w:widowControl/>
+      </w:pPr>
+      <w:r>
+        <w:rPr>
+          <w:rFonts w:ascii="Calibri" w:hAnsi="Calibri" w:cs="Calibri"/>
+          <w:b/>
+          <w:bCs/>
+        </w:rPr>
+        <w:t>Depends on:</w:t>
+      </w:r>
+      <w:r>
+        <w:rPr>
+          <w:rFonts w:ascii="Calibri" w:hAnsi="Calibri" w:cs="Calibri"/>
+        </w:rPr>
+        <w:t xml:space="preserve"> P10C-02 through P10C-04.</w:t>
+      </w:r>
+    </w:p>
+    <w:p>
+      <w:pPr>
+        <w:pStyle w:val="Normal"/>
+        <w:numPr>
+          <w:ilvl w:val="0"/>
+          <w:numId w:val="1"/>
+        </w:numPr>
+        <w:widowControl/>
+      </w:pPr>
+      <w:r>
+        <w:rPr>
+          <w:rFonts w:ascii="Calibri" w:hAnsi="Calibri" w:cs="Calibri"/>
+          <w:b/>
+          <w:bCs/>
+        </w:rPr>
+        <w:t>Done when:</w:t>
+      </w:r>
+      <w:r>
+        <w:rPr>
+          <w:rFonts w:ascii="Calibri" w:hAnsi="Calibri" w:cs="Calibri"/>
+        </w:rPr>
+        <w:t xml:space="preserve"> The stated outcome and required evidence are accepted.</w:t>
+      </w:r>
+    </w:p>
+    <w:p>
+      <w:pPr>
+        <w:pStyle w:val="Normal"/>
+        <w:numPr>
+          <w:ilvl w:val="0"/>
+          <w:numId w:val="1"/>
+        </w:numPr>
+        <w:widowControl/>
+      </w:pPr>
+      <w:r>
+        <w:rPr>
+          <w:rFonts w:ascii="Calibri" w:hAnsi="Calibri" w:cs="Calibri"/>
+          <w:b/>
+          <w:bCs/>
+        </w:rPr>
+        <w:t>Required evidence:</w:t>
+      </w:r>
+      <w:r>
+        <w:rPr>
+          <w:rFonts w:ascii="Calibri" w:hAnsi="Calibri" w:cs="Calibri"/>
+        </w:rPr>
+        <w:t xml:space="preserve"> Positive and fail-closed integration, undo/redo, browser/E2E.</w:t>
+      </w:r>
+    </w:p>
+    <w:p>
+      <w:pPr>
+        <w:pStyle w:val="Normal"/>
+        <w:numPr>
+          <w:ilvl w:val="0"/>
+          <w:numId w:val="1"/>
+        </w:numPr>
+        <w:widowControl/>
+      </w:pPr>
+      <w:r>
+        <w:rPr>
+          <w:rFonts w:ascii="Calibri" w:hAnsi="Calibri" w:cs="Calibri"/>
+          <w:b/>
+          <w:bCs/>
+        </w:rPr>
+        <w:t>Non-goal:</w:t>
+      </w:r>
+      <w:r>
+        <w:rPr>
+          <w:rFonts w:ascii="Calibri" w:hAnsi="Calibri" w:cs="Calibri"/>
+        </w:rPr>
+        <w:t xml:space="preserve"> Arbitrary code/CSS/components or commerce mutation.</w:t>
+      </w:r>
+    </w:p>
+    <w:p>
+      <w:pPr>
+        <w:pStyle w:val="Heading3"/>
+        <w:keepNext/>
+        <w:widowControl/>
+      </w:pPr>
+      <w:r>
+        <w:rPr>
+          <w:rFonts w:ascii="Calibri" w:hAnsi="Calibri" w:cs="Calibri"/>
+        </w:rPr>
+        <w:t>P10C-06 — Scoped AI editing</w:t>
+      </w:r>
+    </w:p>
+    <w:p>
+      <w:pPr>
+        <w:pStyle w:val="Normal"/>
+        <w:numPr>
+          <w:ilvl w:val="0"/>
+          <w:numId w:val="1"/>
+        </w:numPr>
+        <w:widowControl/>
+      </w:pPr>
+      <w:r>
+        <w:rPr>
+          <w:rFonts w:ascii="Calibri" w:hAnsi="Calibri" w:cs="Calibri"/>
+          <w:b/>
+          <w:bCs/>
+        </w:rPr>
+        <w:t>Outcome:</w:t>
+      </w:r>
+      <w:r>
+        <w:rPr>
+          <w:rFonts w:ascii="Calibri" w:hAnsi="Calibri" w:cs="Calibri"/>
+        </w:rPr>
+        <w:t xml:space="preserve"> Connect merchant routing, clarification, frame/page scope, and proposal review to the existing P10A governed authorities.</w:t>
+      </w:r>
+    </w:p>
+    <w:p>
+      <w:pPr>
+        <w:pStyle w:val="Normal"/>
+        <w:numPr>
+          <w:ilvl w:val="0"/>
+          <w:numId w:val="1"/>
+        </w:numPr>
+        <w:widowControl/>
+      </w:pPr>
+      <w:r>
+        <w:rPr>
+          <w:rFonts w:ascii="Calibri" w:hAnsi="Calibri" w:cs="Calibri"/>
+          <w:b/>
+          <w:bCs/>
+        </w:rPr>
+        <w:t>Status:</w:t>
+      </w:r>
+      <w:r>
+        <w:rPr>
+          <w:rFonts w:ascii="Calibri" w:hAnsi="Calibri" w:cs="Calibri"/>
+        </w:rPr>
+        <w:t xml:space="preserve"> </w:t>
+      </w:r>
+      <w:r>
+        <w:rPr>
+          <w:rFonts w:ascii="Calibri" w:hAnsi="Calibri" w:cs="Calibri"/>
+          <w:b/>
+          <w:bCs/>
+        </w:rPr>
+        <w:t>Planned</w:t>
+      </w:r>
+      <w:r>
+        <w:rPr>
+          <w:rFonts w:ascii="Calibri" w:hAnsi="Calibri" w:cs="Calibri"/>
+        </w:rPr>
+        <w:t>.</w:t>
+      </w:r>
+    </w:p>
+    <w:p>
+      <w:pPr>
+        <w:pStyle w:val="Normal"/>
+        <w:numPr>
+          <w:ilvl w:val="0"/>
+          <w:numId w:val="1"/>
+        </w:numPr>
+        <w:widowControl/>
+      </w:pPr>
+      <w:r>
+        <w:rPr>
+          <w:rFonts w:ascii="Calibri" w:hAnsi="Calibri" w:cs="Calibri"/>
+          <w:b/>
+          <w:bCs/>
+        </w:rPr>
+        <w:t>Depends on:</w:t>
+      </w:r>
+      <w:r>
+        <w:rPr>
+          <w:rFonts w:ascii="Calibri" w:hAnsi="Calibri" w:cs="Calibri"/>
+        </w:rPr>
+        <w:t xml:space="preserve"> P10C-03 through P10C-05 and P10A internal router/packages.</w:t>
+      </w:r>
+    </w:p>
+    <w:p>
+      <w:pPr>
+        <w:pStyle w:val="Normal"/>
+        <w:numPr>
+          <w:ilvl w:val="0"/>
+          <w:numId w:val="1"/>
+        </w:numPr>
+        <w:widowControl/>
+      </w:pPr>
+      <w:r>
+        <w:rPr>
+          <w:rFonts w:ascii="Calibri" w:hAnsi="Calibri" w:cs="Calibri"/>
+          <w:b/>
+          <w:bCs/>
+        </w:rPr>
+        <w:t>Done when:</w:t>
+      </w:r>
+      <w:r>
+        <w:rPr>
+          <w:rFonts w:ascii="Calibri" w:hAnsi="Calibri" w:cs="Calibri"/>
+        </w:rPr>
+        <w:t xml:space="preserve"> The stated outcome and required evidence are accepted.</w:t>
+      </w:r>
+    </w:p>
+    <w:p>
+      <w:pPr>
+        <w:pStyle w:val="Normal"/>
+        <w:numPr>
+          <w:ilvl w:val="0"/>
+          <w:numId w:val="1"/>
+        </w:numPr>
+        <w:widowControl/>
+      </w:pPr>
+      <w:r>
+        <w:rPr>
+          <w:rFonts w:ascii="Calibri" w:hAnsi="Calibri" w:cs="Calibri"/>
+          <w:b/>
+          <w:bCs/>
+        </w:rPr>
+        <w:t>Required evidence:</w:t>
+      </w:r>
+      <w:r>
+        <w:rPr>
+          <w:rFonts w:ascii="Calibri" w:hAnsi="Calibri" w:cs="Calibri"/>
+        </w:rPr>
+        <w:t xml:space="preserve"> Selected-section, frame, page, storefront, ambiguity, stale, and failure browser flows.</w:t>
+      </w:r>
+    </w:p>
+    <w:p>
+      <w:pPr>
+        <w:pStyle w:val="Normal"/>
+        <w:numPr>
+          <w:ilvl w:val="0"/>
+          <w:numId w:val="1"/>
+        </w:numPr>
+        <w:widowControl/>
+      </w:pPr>
+      <w:r>
+        <w:rPr>
+          <w:rFonts w:ascii="Calibri" w:hAnsi="Calibri" w:cs="Calibri"/>
+          <w:b/>
+          <w:bCs/>
+        </w:rPr>
+        <w:t>Non-goal:</w:t>
+      </w:r>
+      <w:r>
+        <w:rPr>
+          <w:rFonts w:ascii="Calibri" w:hAnsi="Calibri" w:cs="Calibri"/>
+        </w:rPr>
+        <w:t xml:space="preserve"> Rebuilding the router, packages, proposals, or provider boundary.</w:t>
+      </w:r>
+    </w:p>
+    <w:p>
+      <w:pPr>
+        <w:pStyle w:val="Heading3"/>
+        <w:keepNext/>
+        <w:widowControl/>
+      </w:pPr>
+      <w:r>
+        <w:rPr>
+          <w:rFonts w:ascii="Calibri" w:hAnsi="Calibri" w:cs="Calibri"/>
+        </w:rPr>
+        <w:t>P10C-07 — Unified AI/manual history</w:t>
+      </w:r>
+    </w:p>
+    <w:p>
+      <w:pPr>
+        <w:pStyle w:val="Normal"/>
+        <w:numPr>
+          <w:ilvl w:val="0"/>
+          <w:numId w:val="1"/>
+        </w:numPr>
+        <w:widowControl/>
+      </w:pPr>
+      <w:r>
+        <w:rPr>
+          <w:rFonts w:ascii="Calibri" w:hAnsi="Calibri" w:cs="Calibri"/>
+          <w:b/>
+          <w:bCs/>
+        </w:rPr>
+        <w:t>Outcome:</w:t>
+      </w:r>
+      <w:r>
+        <w:rPr>
+          <w:rFonts w:ascii="Calibri" w:hAnsi="Calibri" w:cs="Calibri"/>
+        </w:rPr>
+        <w:t xml:space="preserve"> Put manual and accepted AI operations into one atomic canonical undo/redo history.</w:t>
+      </w:r>
+    </w:p>
+    <w:p>
+      <w:pPr>
+        <w:pStyle w:val="Normal"/>
+        <w:numPr>
+          <w:ilvl w:val="0"/>
+          <w:numId w:val="1"/>
+        </w:numPr>
+        <w:widowControl/>
+      </w:pPr>
+      <w:r>
+        <w:rPr>
+          <w:rFonts w:ascii="Calibri" w:hAnsi="Calibri" w:cs="Calibri"/>
+          <w:b/>
+          <w:bCs/>
+        </w:rPr>
+        <w:t>Status:</w:t>
+      </w:r>
+      <w:r>
+        <w:rPr>
+          <w:rFonts w:ascii="Calibri" w:hAnsi="Calibri" w:cs="Calibri"/>
+        </w:rPr>
+        <w:t xml:space="preserve"> </w:t>
+      </w:r>
+      <w:r>
+        <w:rPr>
+          <w:rFonts w:ascii="Calibri" w:hAnsi="Calibri" w:cs="Calibri"/>
+          <w:b/>
+          <w:bCs/>
+        </w:rPr>
+        <w:t>Planned</w:t>
+      </w:r>
+      <w:r>
+        <w:rPr>
+          <w:rFonts w:ascii="Calibri" w:hAnsi="Calibri" w:cs="Calibri"/>
+        </w:rPr>
+        <w:t>.</w:t>
+      </w:r>
+    </w:p>
+    <w:p>
+      <w:pPr>
+        <w:pStyle w:val="Normal"/>
+        <w:numPr>
+          <w:ilvl w:val="0"/>
+          <w:numId w:val="1"/>
+        </w:numPr>
+        <w:widowControl/>
+      </w:pPr>
+      <w:r>
+        <w:rPr>
+          <w:rFonts w:ascii="Calibri" w:hAnsi="Calibri" w:cs="Calibri"/>
+          <w:b/>
+          <w:bCs/>
+        </w:rPr>
+        <w:t>Depends on:</w:t>
+      </w:r>
+      <w:r>
+        <w:rPr>
+          <w:rFonts w:ascii="Calibri" w:hAnsi="Calibri" w:cs="Calibri"/>
+        </w:rPr>
+        <w:t xml:space="preserve"> P10C-05, P10C-06.</w:t>
+      </w:r>
+    </w:p>
+    <w:p>
+      <w:pPr>
+        <w:pStyle w:val="Normal"/>
+        <w:numPr>
+          <w:ilvl w:val="0"/>
+          <w:numId w:val="1"/>
+        </w:numPr>
+        <w:widowControl/>
+      </w:pPr>
+      <w:r>
+        <w:rPr>
+          <w:rFonts w:ascii="Calibri" w:hAnsi="Calibri" w:cs="Calibri"/>
+          <w:b/>
+          <w:bCs/>
+        </w:rPr>
+        <w:t>Done when:</w:t>
+      </w:r>
+      <w:r>
+        <w:rPr>
+          <w:rFonts w:ascii="Calibri" w:hAnsi="Calibri" w:cs="Calibri"/>
+        </w:rPr>
+        <w:t xml:space="preserve"> The stated outcome and required evidence are accepted.</w:t>
+      </w:r>
+    </w:p>
+    <w:p>
+      <w:pPr>
+        <w:pStyle w:val="Normal"/>
+        <w:numPr>
+          <w:ilvl w:val="0"/>
+          <w:numId w:val="1"/>
+        </w:numPr>
+        <w:widowControl/>
+      </w:pPr>
+      <w:r>
+        <w:rPr>
+          <w:rFonts w:ascii="Calibri" w:hAnsi="Calibri" w:cs="Calibri"/>
+          <w:b/>
+          <w:bCs/>
+        </w:rPr>
+        <w:t>Required evidence:</w:t>
+      </w:r>
+      <w:r>
+        <w:rPr>
+          <w:rFonts w:ascii="Calibri" w:hAnsi="Calibri" w:cs="Calibri"/>
+        </w:rPr>
+        <w:t xml:space="preserve"> Mixed edits, undo/redo, save/reload, stale protection.</w:t>
+      </w:r>
+    </w:p>
+    <w:p>
+      <w:pPr>
+        <w:pStyle w:val="Normal"/>
+        <w:numPr>
+          <w:ilvl w:val="0"/>
+          <w:numId w:val="1"/>
+        </w:numPr>
+        <w:widowControl/>
+      </w:pPr>
+      <w:r>
+        <w:rPr>
+          <w:rFonts w:ascii="Calibri" w:hAnsi="Calibri" w:cs="Calibri"/>
+          <w:b/>
+          <w:bCs/>
+        </w:rPr>
+        <w:t>Non-goal:</w:t>
+      </w:r>
+      <w:r>
+        <w:rPr>
+          <w:rFonts w:ascii="Calibri" w:hAnsi="Calibri" w:cs="Calibri"/>
+        </w:rPr>
+        <w:t xml:space="preserve"> A Puck-only or AI-only history.</w:t>
+      </w:r>
+    </w:p>
+    <w:p>
+      <w:pPr>
+        <w:pStyle w:val="Heading3"/>
+        <w:keepNext/>
+        <w:widowControl/>
+      </w:pPr>
+      <w:r>
+        <w:rPr>
+          <w:rFonts w:ascii="Calibri" w:hAnsi="Calibri" w:cs="Calibri"/>
+        </w:rPr>
+        <w:t>P10C-08 — Brand and asset editor with Studio shell</w:t>
+      </w:r>
+    </w:p>
+    <w:p>
+      <w:pPr>
+        <w:pStyle w:val="Normal"/>
+        <w:numPr>
+          <w:ilvl w:val="0"/>
+          <w:numId w:val="1"/>
+        </w:numPr>
+        <w:widowControl/>
+      </w:pPr>
+      <w:r>
+        <w:rPr>
+          <w:rFonts w:ascii="Calibri" w:hAnsi="Calibri" w:cs="Calibri"/>
+          <w:b/>
+          <w:bCs/>
+        </w:rPr>
+        <w:t>Outcome:</w:t>
+      </w:r>
+      <w:r>
+        <w:rPr>
+          <w:rFonts w:ascii="Calibri" w:hAnsi="Calibri" w:cs="Calibri"/>
+        </w:rPr>
+        <w:t xml:space="preserve"> Deliver the merchant shell subset required to operate assets, canvas, review, save, preview, and publish.</w:t>
+      </w:r>
+    </w:p>
+    <w:p>
+      <w:pPr>
+        <w:pStyle w:val="Normal"/>
+        <w:numPr>
+          <w:ilvl w:val="0"/>
+          <w:numId w:val="1"/>
+        </w:numPr>
+        <w:widowControl/>
+      </w:pPr>
+      <w:r>
+        <w:rPr>
+          <w:rFonts w:ascii="Calibri" w:hAnsi="Calibri" w:cs="Calibri"/>
+          <w:b/>
+          <w:bCs/>
+        </w:rPr>
+        <w:t>Status:</w:t>
+      </w:r>
+      <w:r>
+        <w:rPr>
+          <w:rFonts w:ascii="Calibri" w:hAnsi="Calibri" w:cs="Calibri"/>
+        </w:rPr>
+        <w:t xml:space="preserve"> </w:t>
+      </w:r>
+      <w:r>
+        <w:rPr>
+          <w:rFonts w:ascii="Calibri" w:hAnsi="Calibri" w:cs="Calibri"/>
+          <w:b/>
+          <w:bCs/>
+        </w:rPr>
+        <w:t>Planned</w:t>
+      </w:r>
+      <w:r>
+        <w:rPr>
+          <w:rFonts w:ascii="Calibri" w:hAnsi="Calibri" w:cs="Calibri"/>
+        </w:rPr>
+        <w:t>.</w:t>
+      </w:r>
+    </w:p>
+    <w:p>
+      <w:pPr>
+        <w:pStyle w:val="Normal"/>
+        <w:numPr>
+          <w:ilvl w:val="0"/>
+          <w:numId w:val="1"/>
+        </w:numPr>
+        <w:widowControl/>
+      </w:pPr>
+      <w:r>
+        <w:rPr>
+          <w:rFonts w:ascii="Calibri" w:hAnsi="Calibri" w:cs="Calibri"/>
+          <w:b/>
+          <w:bCs/>
+        </w:rPr>
+        <w:t>Depends on:</w:t>
+      </w:r>
+      <w:r>
+        <w:rPr>
+          <w:rFonts w:ascii="Calibri" w:hAnsi="Calibri" w:cs="Calibri"/>
+        </w:rPr>
+        <w:t xml:space="preserve"> P10C-01 through P10C-07.</w:t>
+      </w:r>
+    </w:p>
+    <w:p>
+      <w:pPr>
+        <w:pStyle w:val="Normal"/>
+        <w:numPr>
+          <w:ilvl w:val="0"/>
+          <w:numId w:val="1"/>
+        </w:numPr>
+        <w:widowControl/>
+      </w:pPr>
+      <w:r>
+        <w:rPr>
+          <w:rFonts w:ascii="Calibri" w:hAnsi="Calibri" w:cs="Calibri"/>
+          <w:b/>
+          <w:bCs/>
+        </w:rPr>
+        <w:t>Done when:</w:t>
+      </w:r>
+      <w:r>
+        <w:rPr>
+          <w:rFonts w:ascii="Calibri" w:hAnsi="Calibri" w:cs="Calibri"/>
+        </w:rPr>
+        <w:t xml:space="preserve"> The stated outcome and required evidence are accepted.</w:t>
+      </w:r>
+    </w:p>
+    <w:p>
+      <w:pPr>
+        <w:pStyle w:val="Normal"/>
+        <w:numPr>
+          <w:ilvl w:val="0"/>
+          <w:numId w:val="1"/>
+        </w:numPr>
+        <w:widowControl/>
+      </w:pPr>
+      <w:r>
+        <w:rPr>
+          <w:rFonts w:ascii="Calibri" w:hAnsi="Calibri" w:cs="Calibri"/>
+          <w:b/>
+          <w:bCs/>
+        </w:rPr>
+        <w:t>Required evidence:</w:t>
+      </w:r>
+      <w:r>
+        <w:rPr>
+          <w:rFonts w:ascii="Calibri" w:hAnsi="Calibri" w:cs="Calibri"/>
+        </w:rPr>
+        <w:t xml:space="preserve"> Default/loading/empty/error/stale/success/unsaved states, accessibility, responsive browser/E2E.</w:t>
+      </w:r>
+    </w:p>
+    <w:p>
+      <w:pPr>
+        <w:pStyle w:val="Normal"/>
+        <w:numPr>
+          <w:ilvl w:val="0"/>
+          <w:numId w:val="1"/>
+        </w:numPr>
+        <w:widowControl/>
+      </w:pPr>
+      <w:r>
+        <w:rPr>
+          <w:rFonts w:ascii="Calibri" w:hAnsi="Calibri" w:cs="Calibri"/>
+          <w:b/>
+          <w:bCs/>
+        </w:rPr>
+        <w:t>Non-goal:</w:t>
+      </w:r>
+      <w:r>
+        <w:rPr>
+          <w:rFonts w:ascii="Calibri" w:hAnsi="Calibri" w:cs="Calibri"/>
+        </w:rPr>
+        <w:t xml:space="preserve"> Full CMS or exposure of implementation internals.</w:t>
+      </w:r>
+    </w:p>
+    <w:p>
+      <w:pPr>
+        <w:pStyle w:val="Heading3"/>
+        <w:keepNext/>
+        <w:widowControl/>
+      </w:pPr>
+      <w:r>
+        <w:rPr>
+          <w:rFonts w:ascii="Calibri" w:hAnsi="Calibri" w:cs="Calibri"/>
+        </w:rPr>
         <w:t>P10C-09 — Studio commercial QA</w:t>
       </w:r>
     </w:p>
@@ -15014,7 +15044,7 @@
         </w:rPr>
         <w:t xml:space="preserve"> </w:t>
       </w:r>
-      <w:hyperlink r:id="rIdHyperlink15" w:history="1">
+      <w:hyperlink r:id="rIdHyperlink16" w:history="1">
         <w:r>
           <w:rPr>
             <w:rFonts w:ascii="Calibri" w:hAnsi="Calibri" w:cs="Calibri"/>
@@ -15030,7 +15060,7 @@
         </w:rPr>
         <w:t xml:space="preserve"> and </w:t>
       </w:r>
-      <w:hyperlink r:id="rIdHyperlink16" w:history="1">
+      <w:hyperlink r:id="rIdHyperlink17" w:history="1">
         <w:r>
           <w:rPr>
             <w:rFonts w:ascii="Calibri" w:hAnsi="Calibri" w:cs="Calibri"/>

</xml_diff>

<commit_message>
fix: close commerce utility runtime gaps
</commit_message>
<xml_diff>
--- a/docs/VESKIFY_DEVELOPMENT_DELIVERY_TRACKER_v1.3.0.docx
+++ b/docs/VESKIFY_DEVELOPMENT_DELIVERY_TRACKER_v1.3.0.docx
@@ -2951,7 +2951,7 @@
               <w:rPr>
                 <w:rFonts w:ascii="Calibri" w:hAnsi="Calibri" w:cs="Calibri"/>
               </w:rPr>
-              <w:t>27 definitions/104 variants; structural, query, migration and rejection evidence</w:t>
+              <w:t>28 definitions/111 variants; structural, query, migration and rejection evidence</w:t>
             </w:r>
           </w:p>
         </w:tc>
@@ -4492,7 +4492,7 @@
               <w:rPr>
                 <w:rFonts w:ascii="Calibri" w:hAnsi="Calibri" w:cs="Calibri"/>
               </w:rPr>
-              <w:t>Seven profiles, canonical action boundary, snapshot/publication preservation, 16 responsive views</w:t>
+              <w:t>Six profiles plus route-local loading, canonical action boundary, snapshot/publication preservation, 16 responsive views</w:t>
             </w:r>
           </w:p>
         </w:tc>
@@ -12111,7 +12111,7 @@
         <w:rPr>
           <w:rFonts w:ascii="Calibri" w:hAnsi="Calibri" w:cs="Calibri"/>
         </w:rPr>
-        <w:t xml:space="preserve"> Seven deterministic PageBlueprint profiles materialize one </w:t>
+        <w:t xml:space="preserve"> Six deterministic PageBlueprint profiles materialize one </w:t>
       </w:r>
       <w:r>
         <w:rPr>
@@ -12125,7 +12125,7 @@
         <w:rPr>
           <w:rFonts w:ascii="Calibri" w:hAnsi="Calibri" w:cs="Calibri"/>
         </w:rPr>
-        <w:t xml:space="preserve"> component through the P10B-05 family page. Read-only runtime state supplies canonical cart facts, checkout continuation, P10B-10 query/filter context, and bounded recovery actions while the snapshot preserves presentation only. Shared-frame/Design DNA, save/reload, publication, four- width browser evidence, and no-provider behavior are covered under </w:t>
+        <w:t xml:space="preserve"> component through the P10B-05 family page; registered loading state renders on its pending route instead of replacing the 404 singleton. Read-only runtime state supplies canonical cart facts, checkout continuation, P10B-10 query/filter context, and bounded recovery actions while the snapshot preserves presentation only. Shared-frame/Design DNA, save/reload, publication, four- width browser evidence, and no-provider behavior are covered under </w:t>
       </w:r>
       <w:hyperlink r:id="rIdHyperlink15" w:history="1">
         <w:r>

</xml_diff>

<commit_message>
feat: prove Premium Editorial complete storefront
</commit_message>
<xml_diff>
--- a/docs/VESKIFY_DEVELOPMENT_DELIVERY_TRACKER_v1.3.0.docx
+++ b/docs/VESKIFY_DEVELOPMENT_DELIVERY_TRACKER_v1.3.0.docx
@@ -245,7 +245,7 @@
               <w:rPr>
                 <w:rFonts w:ascii="Calibri" w:hAnsi="Calibri" w:cs="Calibri"/>
               </w:rPr>
-              <w:t>9 August 2026, P10B-10 collection/search, P10B-11 PDP, P10B-12 content/support, and P10B-13 utility presentation</w:t>
+              <w:t>10 August 2026, P10B-14 Premium Editorial complete-storefront vertical slice</w:t>
             </w:r>
           </w:p>
         </w:tc>
@@ -4516,7 +4516,7 @@
               <w:rPr>
                 <w:rFonts w:ascii="Calibri" w:hAnsi="Calibri" w:cs="Calibri"/>
               </w:rPr>
-              <w:t>☐</w:t>
+              <w:t>☑</w:t>
             </w:r>
           </w:p>
         </w:tc>
@@ -4573,7 +4573,7 @@
                 <w:b/>
                 <w:bCs/>
               </w:rPr>
-              <w:t>Planned</w:t>
+              <w:t>Baseline</w:t>
             </w:r>
           </w:p>
         </w:tc>
@@ -4627,7 +4627,7 @@
               <w:rPr>
                 <w:rFonts w:ascii="Calibri" w:hAnsi="Calibri" w:cs="Calibri"/>
               </w:rPr>
-              <w:t>Complete page set, four widths and retained human review</w:t>
+              <w:t>17 routes; canonical generation/save/publish; 15 screenshots; passing 160-scenario human review</w:t>
             </w:r>
           </w:p>
         </w:tc>
@@ -9204,7 +9204,7 @@
         <w:rPr>
           <w:rFonts w:ascii="Calibri" w:hAnsi="Calibri" w:cs="Calibri"/>
         </w:rPr>
-        <w:t xml:space="preserve">. P10B-01 through P10B-13 are </w:t>
+        <w:t xml:space="preserve">. P10B-01 through P10B-14 are </w:t>
       </w:r>
       <w:r>
         <w:rPr>
@@ -9218,7 +9218,7 @@
         <w:rPr>
           <w:rFonts w:ascii="Calibri" w:hAnsi="Calibri" w:cs="Calibri"/>
         </w:rPr>
-        <w:t xml:space="preserve">. P10B-14 through P10B-18 remain </w:t>
+        <w:t xml:space="preserve">. P10B-15 through P10B-18 remain </w:t>
       </w:r>
       <w:r>
         <w:rPr>
@@ -12270,7 +12270,7 @@
         <w:rPr>
           <w:rFonts w:ascii="Calibri" w:hAnsi="Calibri" w:cs="Calibri"/>
         </w:rPr>
-        <w:t>P10B-14 — Premium Editorial complete-storefront vertical slice</w:t>
+        <w:t>P10B-14 — Premium Editorial complete-storefront vertical slice — Baseline</w:t>
       </w:r>
     </w:p>
     <w:p>
@@ -12360,146 +12360,13 @@
           <w:b/>
           <w:bCs/>
         </w:rPr>
-        <w:t>Done when:</w:t>
-      </w:r>
-      <w:r>
-        <w:rPr>
-          <w:rFonts w:ascii="Calibri" w:hAnsi="Calibri" w:cs="Calibri"/>
-        </w:rPr>
-        <w:t xml:space="preserve"> One approved brief with realistic commerce and credible assets generates shared frame, home, collection, simple/configurable PDP, About, Contact/locations, FAQ/service, and required utility/error states; navigation, EN/FI where supported, four widths, protected state, preview/publish, and retained human review pass.</w:t>
-      </w:r>
-    </w:p>
-    <w:p>
-      <w:pPr>
-        <w:pStyle w:val="Normal"/>
-        <w:numPr>
-          <w:ilvl w:val="0"/>
-          <w:numId w:val="1"/>
-        </w:numPr>
-        <w:widowControl/>
-      </w:pPr>
-      <w:r>
-        <w:rPr>
-          <w:rFonts w:ascii="Calibri" w:hAnsi="Calibri" w:cs="Calibri"/>
-          <w:b/>
-          <w:bCs/>
-        </w:rPr>
-        <w:t>Fail closed:</w:t>
-      </w:r>
-      <w:r>
-        <w:rPr>
-          <w:rFonts w:ascii="Calibri" w:hAnsi="Calibri" w:cs="Calibri"/>
-        </w:rPr>
-        <w:t xml:space="preserve"> Missing/disconnected/generic required pages, manual reconstruction, stale authority, or schema-only visual evidence fails the slice.</w:t>
-      </w:r>
-    </w:p>
-    <w:p>
-      <w:pPr>
-        <w:pStyle w:val="Normal"/>
-        <w:numPr>
-          <w:ilvl w:val="0"/>
-          <w:numId w:val="1"/>
-        </w:numPr>
-        <w:widowControl/>
-      </w:pPr>
-      <w:r>
-        <w:rPr>
-          <w:rFonts w:ascii="Calibri" w:hAnsi="Calibri" w:cs="Calibri"/>
-          <w:b/>
-          <w:bCs/>
-        </w:rPr>
-        <w:t>Evidence:</w:t>
-      </w:r>
-      <w:r>
-        <w:rPr>
-          <w:rFonts w:ascii="Calibri" w:hAnsi="Calibri" w:cs="Calibri"/>
-        </w:rPr>
-        <w:t xml:space="preserve"> Complete capability chain, correlated browser/screenshots, protected parity, and signed human commercial review.</w:t>
-      </w:r>
-    </w:p>
-    <w:p>
-      <w:pPr>
-        <w:pStyle w:val="Normal"/>
-        <w:numPr>
-          <w:ilvl w:val="0"/>
-          <w:numId w:val="1"/>
-        </w:numPr>
-        <w:widowControl/>
-      </w:pPr>
-      <w:r>
-        <w:rPr>
-          <w:rFonts w:ascii="Calibri" w:hAnsi="Calibri" w:cs="Calibri"/>
-          <w:b/>
-          <w:bCs/>
-        </w:rPr>
-        <w:t>Non-goal:</w:t>
-      </w:r>
-      <w:r>
-        <w:rPr>
-          <w:rFonts w:ascii="Calibri" w:hAnsi="Calibri" w:cs="Calibri"/>
-        </w:rPr>
-        <w:t xml:space="preserve"> P10B closure or broad direction/diversity proof.</w:t>
-      </w:r>
-    </w:p>
-    <w:p>
-      <w:pPr>
-        <w:pStyle w:val="Heading3"/>
-        <w:keepNext/>
-        <w:widowControl/>
-      </w:pPr>
-      <w:r>
-        <w:rPr>
-          <w:rFonts w:ascii="Calibri" w:hAnsi="Calibri" w:cs="Calibri"/>
-        </w:rPr>
-        <w:t>P10B-15 — Bounded storefront synthesis and narrative engine</w:t>
-      </w:r>
-    </w:p>
-    <w:p>
-      <w:pPr>
-        <w:pStyle w:val="Normal"/>
-        <w:numPr>
-          <w:ilvl w:val="0"/>
-          <w:numId w:val="1"/>
-        </w:numPr>
-        <w:widowControl/>
-      </w:pPr>
-      <w:r>
-        <w:rPr>
-          <w:rFonts w:ascii="Calibri" w:hAnsi="Calibri" w:cs="Calibri"/>
-          <w:b/>
-          <w:bCs/>
-        </w:rPr>
-        <w:t>Outcome:</w:t>
-      </w:r>
-      <w:r>
-        <w:rPr>
-          <w:rFonts w:ascii="Calibri" w:hAnsi="Calibri" w:cs="Calibri"/>
-        </w:rPr>
-        <w:t xml:space="preserve"> Generate complete coherent storefronts from compatible Design DNA, page set, profiles, families/variants, parameters, assets, and narrative roles.</w:t>
-      </w:r>
-    </w:p>
-    <w:p>
-      <w:pPr>
-        <w:pStyle w:val="Normal"/>
-        <w:numPr>
-          <w:ilvl w:val="0"/>
-          <w:numId w:val="1"/>
-        </w:numPr>
-        <w:widowControl/>
-      </w:pPr>
-      <w:r>
-        <w:rPr>
-          <w:rFonts w:ascii="Calibri" w:hAnsi="Calibri" w:cs="Calibri"/>
-          <w:b/>
-          <w:bCs/>
-        </w:rPr>
-        <w:t>Authority:</w:t>
-      </w:r>
-      <w:r>
-        <w:rPr>
-          <w:rFonts w:ascii="Calibri" w:hAnsi="Calibri" w:cs="Calibri"/>
-        </w:rPr>
-        <w:t xml:space="preserve"> Existing governed planning/proposal compiler plus the registered P10B authorities; output remains one </w:t>
+        <w:t>Delivered:</w:t>
+      </w:r>
+      <w:r>
+        <w:rPr>
+          <w:rFonts w:ascii="Calibri" w:hAnsi="Calibri" w:cs="Calibri"/>
+        </w:rPr>
+        <w:t xml:space="preserve"> One approved Lumo brief, read-only two-product commerce projection and approved assets reach a 17-route canonical snapshot through the site-map, commercial PageBlueprint, whole-storefront proposal, save/reload and deterministic publication path. One Design DNA and </w:t>
       </w:r>
       <w:r>
         <w:rPr>
@@ -12507,8 +12374,24 @@
           <w:sz w:val="19"/>
           <w:szCs w:val="19"/>
         </w:rPr>
-        <w:t>StorefrontSnapshot</w:t>
-      </w:r>
+        <w:t>centered-minimal</w:t>
+      </w:r>
+      <w:r>
+        <w:rPr>
+          <w:rFonts w:ascii="Calibri" w:hAnsi="Calibri" w:cs="Calibri"/>
+        </w:rPr>
+        <w:t xml:space="preserve"> frame span all pages; simple/configurable PDP, factual content, utility states, 15 four-width/representative screenshots and the passing 160-scenario human record are retained in </w:t>
+      </w:r>
+      <w:hyperlink r:id="rIdHyperlink17" w:history="1">
+        <w:r>
+          <w:rPr>
+            <w:rFonts w:ascii="Calibri" w:hAnsi="Calibri" w:cs="Calibri"/>
+            <w:color w:val="2E74B5"/>
+            <w:u w:val="single"/>
+          </w:rPr>
+          <w:t>P10B_14_PREMIUM_EDITORIAL_COMPLETE_STOREFRONT_VERTICAL_SLICE.md</w:t>
+        </w:r>
+      </w:hyperlink>
       <w:r>
         <w:rPr>
           <w:rFonts w:ascii="Calibri" w:hAnsi="Calibri" w:cs="Calibri"/>
@@ -12531,61 +12414,13 @@
           <w:b/>
           <w:bCs/>
         </w:rPr>
-        <w:t>Depends on:</w:t>
-      </w:r>
-      <w:r>
-        <w:rPr>
-          <w:rFonts w:ascii="Calibri" w:hAnsi="Calibri" w:cs="Calibri"/>
-        </w:rPr>
-        <w:t xml:space="preserve"> P10B-14 and sufficient real family/profile capability.</w:t>
-      </w:r>
-    </w:p>
-    <w:p>
-      <w:pPr>
-        <w:pStyle w:val="Normal"/>
-        <w:numPr>
-          <w:ilvl w:val="0"/>
-          <w:numId w:val="1"/>
-        </w:numPr>
-        <w:widowControl/>
-      </w:pPr>
-      <w:r>
-        <w:rPr>
-          <w:rFonts w:ascii="Calibri" w:hAnsi="Calibri" w:cs="Calibri"/>
-          <w:b/>
-          <w:bCs/>
-        </w:rPr>
-        <w:t>Done when:</w:t>
-      </w:r>
-      <w:r>
-        <w:rPr>
-          <w:rFonts w:ascii="Calibri" w:hAnsi="Calibri" w:cs="Calibri"/>
-        </w:rPr>
-        <w:t xml:space="preserve"> Deterministic selection preserves cross-page identity, narrative adjacency/ cardinality, repetition limits, bindings/assets, and complete snapshot/lifecycle output for representative inputs.</w:t>
-      </w:r>
-    </w:p>
-    <w:p>
-      <w:pPr>
-        <w:pStyle w:val="Normal"/>
-        <w:numPr>
-          <w:ilvl w:val="0"/>
-          <w:numId w:val="1"/>
-        </w:numPr>
-        <w:widowControl/>
-      </w:pPr>
-      <w:r>
-        <w:rPr>
-          <w:rFonts w:ascii="Calibri" w:hAnsi="Calibri" w:cs="Calibri"/>
-          <w:b/>
-          <w:bCs/>
-        </w:rPr>
         <w:t>Fail closed:</w:t>
       </w:r>
       <w:r>
         <w:rPr>
           <w:rFonts w:ascii="Calibri" w:hAnsi="Calibri" w:cs="Calibri"/>
         </w:rPr>
-        <w:t xml:space="preserve"> Missing, stale, ambiguous, incompatible, unregistered, repetitive, or protected-state-divergent combinations produce no partial proposal/snapshot.</w:t>
+        <w:t xml:space="preserve"> Missing/disconnected/generic required pages, manual reconstruction, stale authority, or schema-only visual evidence fails the slice.</w:t>
       </w:r>
     </w:p>
     <w:p>
@@ -12609,7 +12444,7 @@
         <w:rPr>
           <w:rFonts w:ascii="Calibri" w:hAnsi="Calibri" w:cs="Calibri"/>
         </w:rPr>
-        <w:t xml:space="preserve"> Selection/compatibility/unit, proposal/compiler/lifecycle integration, no-partial- write, deterministic fingerprint inputs, and complete-store browser evidence.</w:t>
+        <w:t xml:space="preserve"> Complete capability chain, correlated browser/screenshots, protected parity, and retained human commercial review.</w:t>
       </w:r>
     </w:p>
     <w:p>
@@ -12633,7 +12468,7 @@
         <w:rPr>
           <w:rFonts w:ascii="Calibri" w:hAnsi="Calibri" w:cs="Calibri"/>
         </w:rPr>
-        <w:t xml:space="preserve"> Arbitrary trees/styles or a second synthesis representation.</w:t>
+        <w:t xml:space="preserve"> P10B closure or broad direction/diversity proof.</w:t>
       </w:r>
     </w:p>
     <w:p>
@@ -12646,7 +12481,7 @@
         <w:rPr>
           <w:rFonts w:ascii="Calibri" w:hAnsi="Calibri" w:cs="Calibri"/>
         </w:rPr>
-        <w:t>P10B-16 — Coordinated directions and diversity control</w:t>
+        <w:t>P10B-15 — Bounded storefront synthesis and narrative engine</w:t>
       </w:r>
     </w:p>
     <w:p>
@@ -12670,7 +12505,7 @@
         <w:rPr>
           <w:rFonts w:ascii="Calibri" w:hAnsi="Calibri" w:cs="Calibri"/>
         </w:rPr>
-        <w:t xml:space="preserve"> Make Premium Editorial, Modern Technical, and Minimal Commerce coordinated constraint packages and prevent duplicates/near duplicates.</w:t>
+        <w:t xml:space="preserve"> Generate complete coherent storefronts from compatible Design DNA, page set, profiles, families/variants, parameters, assets, and narrative roles.</w:t>
       </w:r>
     </w:p>
     <w:p>
@@ -12694,881 +12529,7 @@
         <w:rPr>
           <w:rFonts w:ascii="Calibri" w:hAnsi="Calibri" w:cs="Calibri"/>
         </w:rPr>
-        <w:t xml:space="preserve"> Existing direction-selection authority plus deterministic storefront-design fingerprint/evaluation.</w:t>
-      </w:r>
-    </w:p>
-    <w:p>
-      <w:pPr>
-        <w:pStyle w:val="Normal"/>
-        <w:numPr>
-          <w:ilvl w:val="0"/>
-          <w:numId w:val="1"/>
-        </w:numPr>
-        <w:widowControl/>
-      </w:pPr>
-      <w:r>
-        <w:rPr>
-          <w:rFonts w:ascii="Calibri" w:hAnsi="Calibri" w:cs="Calibri"/>
-          <w:b/>
-          <w:bCs/>
-        </w:rPr>
-        <w:t>Depends on:</w:t>
-      </w:r>
-      <w:r>
-        <w:rPr>
-          <w:rFonts w:ascii="Calibri" w:hAnsi="Calibri" w:cs="Calibri"/>
-        </w:rPr>
-        <w:t xml:space="preserve"> P10B-15.</w:t>
-      </w:r>
-    </w:p>
-    <w:p>
-      <w:pPr>
-        <w:pStyle w:val="Normal"/>
-        <w:numPr>
-          <w:ilvl w:val="0"/>
-          <w:numId w:val="1"/>
-        </w:numPr>
-        <w:widowControl/>
-      </w:pPr>
-      <w:r>
-        <w:rPr>
-          <w:rFonts w:ascii="Calibri" w:hAnsi="Calibri" w:cs="Calibri"/>
-          <w:b/>
-          <w:bCs/>
-        </w:rPr>
-        <w:t>Done when:</w:t>
-      </w:r>
-      <w:r>
-        <w:rPr>
-          <w:rFonts w:ascii="Calibri" w:hAnsi="Calibri" w:cs="Calibri"/>
-        </w:rPr>
-        <w:t xml:space="preserve"> Fingerprints cover Design DNA, page set/profiles, frame, anatomies/variants, structural parameters, image posture, density/responsive posture, and narrative composition; exact and meaningful near duplicates fail, and pairwise stores differ materially beyond colour.</w:t>
-      </w:r>
-    </w:p>
-    <w:p>
-      <w:pPr>
-        <w:pStyle w:val="Normal"/>
-        <w:numPr>
-          <w:ilvl w:val="0"/>
-          <w:numId w:val="1"/>
-        </w:numPr>
-        <w:widowControl/>
-      </w:pPr>
-      <w:r>
-        <w:rPr>
-          <w:rFonts w:ascii="Calibri" w:hAnsi="Calibri" w:cs="Calibri"/>
-          <w:b/>
-          <w:bCs/>
-        </w:rPr>
-        <w:t>Fail closed:</w:t>
-      </w:r>
-      <w:r>
-        <w:rPr>
-          <w:rFonts w:ascii="Calibri" w:hAnsi="Calibri" w:cs="Calibri"/>
-        </w:rPr>
-        <w:t xml:space="preserve"> Fixed-template/token/page direction authority, incompatible references, colour-only differences, and fingerprints that omit material structure are rejected.</w:t>
-      </w:r>
-    </w:p>
-    <w:p>
-      <w:pPr>
-        <w:pStyle w:val="Normal"/>
-        <w:numPr>
-          <w:ilvl w:val="0"/>
-          <w:numId w:val="1"/>
-        </w:numPr>
-        <w:widowControl/>
-      </w:pPr>
-      <w:r>
-        <w:rPr>
-          <w:rFonts w:ascii="Calibri" w:hAnsi="Calibri" w:cs="Calibri"/>
-          <w:b/>
-          <w:bCs/>
-        </w:rPr>
-        <w:t>Evidence:</w:t>
-      </w:r>
-      <w:r>
-        <w:rPr>
-          <w:rFonts w:ascii="Calibri" w:hAnsi="Calibri" w:cs="Calibri"/>
-        </w:rPr>
-        <w:t xml:space="preserve"> Determinism, exact/near-duplicate fixtures, pairwise structural scoring, direction compatibility, complete-store generation, and representative visual evidence.</w:t>
-      </w:r>
-    </w:p>
-    <w:p>
-      <w:pPr>
-        <w:pStyle w:val="Normal"/>
-        <w:numPr>
-          <w:ilvl w:val="0"/>
-          <w:numId w:val="1"/>
-        </w:numPr>
-        <w:widowControl/>
-      </w:pPr>
-      <w:r>
-        <w:rPr>
-          <w:rFonts w:ascii="Calibri" w:hAnsi="Calibri" w:cs="Calibri"/>
-          <w:b/>
-          <w:bCs/>
-        </w:rPr>
-        <w:t>Non-goal:</w:t>
-      </w:r>
-      <w:r>
-        <w:rPr>
-          <w:rFonts w:ascii="Calibri" w:hAnsi="Calibri" w:cs="Calibri"/>
-        </w:rPr>
-        <w:t xml:space="preserve"> Thousands of manually authored templates.</w:t>
-      </w:r>
-    </w:p>
-    <w:p>
-      <w:pPr>
-        <w:pStyle w:val="Heading3"/>
-        <w:keepNext/>
-        <w:widowControl/>
-      </w:pPr>
-      <w:r>
-        <w:rPr>
-          <w:rFonts w:ascii="Calibri" w:hAnsi="Calibri" w:cs="Calibri"/>
-        </w:rPr>
-        <w:t>P10B-17 — Responsive, accessibility and performance closure</w:t>
-      </w:r>
-    </w:p>
-    <w:p>
-      <w:pPr>
-        <w:pStyle w:val="Normal"/>
-        <w:numPr>
-          <w:ilvl w:val="0"/>
-          <w:numId w:val="1"/>
-        </w:numPr>
-        <w:widowControl/>
-      </w:pPr>
-      <w:r>
-        <w:rPr>
-          <w:rFonts w:ascii="Calibri" w:hAnsi="Calibri" w:cs="Calibri"/>
-          <w:b/>
-          <w:bCs/>
-        </w:rPr>
-        <w:t>Outcome:</w:t>
-      </w:r>
-      <w:r>
-        <w:rPr>
-          <w:rFonts w:ascii="Calibri" w:hAnsi="Calibri" w:cs="Calibri"/>
-        </w:rPr>
-        <w:t xml:space="preserve"> Preserve deliberate commercial hierarchy and usability across target widths, locales, accessibility, and bounded performance budgets.</w:t>
-      </w:r>
-    </w:p>
-    <w:p>
-      <w:pPr>
-        <w:pStyle w:val="Normal"/>
-        <w:numPr>
-          <w:ilvl w:val="0"/>
-          <w:numId w:val="1"/>
-        </w:numPr>
-        <w:widowControl/>
-      </w:pPr>
-      <w:r>
-        <w:rPr>
-          <w:rFonts w:ascii="Calibri" w:hAnsi="Calibri" w:cs="Calibri"/>
-          <w:b/>
-          <w:bCs/>
-        </w:rPr>
-        <w:t>Authority:</w:t>
-      </w:r>
-      <w:r>
-        <w:rPr>
-          <w:rFonts w:ascii="Calibri" w:hAnsi="Calibri" w:cs="Calibri"/>
-        </w:rPr>
-        <w:t xml:space="preserve"> Existing responsive/a11y contracts, registered transformations, renderers, and evidence protocol.</w:t>
-      </w:r>
-    </w:p>
-    <w:p>
-      <w:pPr>
-        <w:pStyle w:val="Normal"/>
-        <w:numPr>
-          <w:ilvl w:val="0"/>
-          <w:numId w:val="1"/>
-        </w:numPr>
-        <w:widowControl/>
-      </w:pPr>
-      <w:r>
-        <w:rPr>
-          <w:rFonts w:ascii="Calibri" w:hAnsi="Calibri" w:cs="Calibri"/>
-          <w:b/>
-          <w:bCs/>
-        </w:rPr>
-        <w:t>Depends on:</w:t>
-      </w:r>
-      <w:r>
-        <w:rPr>
-          <w:rFonts w:ascii="Calibri" w:hAnsi="Calibri" w:cs="Calibri"/>
-        </w:rPr>
-        <w:t xml:space="preserve"> Implemented commercial families/profiles/directions through P10B-16.</w:t>
-      </w:r>
-    </w:p>
-    <w:p>
-      <w:pPr>
-        <w:pStyle w:val="Normal"/>
-        <w:numPr>
-          <w:ilvl w:val="0"/>
-          <w:numId w:val="1"/>
-        </w:numPr>
-        <w:widowControl/>
-      </w:pPr>
-      <w:r>
-        <w:rPr>
-          <w:rFonts w:ascii="Calibri" w:hAnsi="Calibri" w:cs="Calibri"/>
-          <w:b/>
-          <w:bCs/>
-        </w:rPr>
-        <w:t>Done when:</w:t>
-      </w:r>
-      <w:r>
-        <w:rPr>
-          <w:rFonts w:ascii="Calibri" w:hAnsi="Calibri" w:cs="Calibri"/>
-        </w:rPr>
-        <w:t xml:space="preserve"> All supported page families/directions pass 375/768/1024/1440 and EN/FI geometry, declared transformations, keyboard/focus/semantics/contrast, content/commerce retention, and explicit performance budgets with correlated evidence.</w:t>
-      </w:r>
-    </w:p>
-    <w:p>
-      <w:pPr>
-        <w:pStyle w:val="Normal"/>
-        <w:numPr>
-          <w:ilvl w:val="0"/>
-          <w:numId w:val="1"/>
-        </w:numPr>
-        <w:widowControl/>
-      </w:pPr>
-      <w:r>
-        <w:rPr>
-          <w:rFonts w:ascii="Calibri" w:hAnsi="Calibri" w:cs="Calibri"/>
-          <w:b/>
-          <w:bCs/>
-        </w:rPr>
-        <w:t>Fail closed:</w:t>
-      </w:r>
-      <w:r>
-        <w:rPr>
-          <w:rFonts w:ascii="Calibri" w:hAnsi="Calibri" w:cs="Calibri"/>
-        </w:rPr>
-        <w:t xml:space="preserve"> Clipping, overlap, inaccessible controls, lost content/commerce, desktop-only approval, or undispositioned budget failure blocks completion.</w:t>
-      </w:r>
-    </w:p>
-    <w:p>
-      <w:pPr>
-        <w:pStyle w:val="Normal"/>
-        <w:numPr>
-          <w:ilvl w:val="0"/>
-          <w:numId w:val="1"/>
-        </w:numPr>
-        <w:widowControl/>
-      </w:pPr>
-      <w:r>
-        <w:rPr>
-          <w:rFonts w:ascii="Calibri" w:hAnsi="Calibri" w:cs="Calibri"/>
-          <w:b/>
-          <w:bCs/>
-        </w:rPr>
-        <w:t>Evidence:</w:t>
-      </w:r>
-      <w:r>
-        <w:rPr>
-          <w:rFonts w:ascii="Calibri" w:hAnsi="Calibri" w:cs="Calibri"/>
-        </w:rPr>
-        <w:t xml:space="preserve"> Automated geometry/a11y/performance/browser matrices plus retained representative human review.</w:t>
-      </w:r>
-    </w:p>
-    <w:p>
-      <w:pPr>
-        <w:pStyle w:val="Normal"/>
-        <w:numPr>
-          <w:ilvl w:val="0"/>
-          <w:numId w:val="1"/>
-        </w:numPr>
-        <w:widowControl/>
-      </w:pPr>
-      <w:r>
-        <w:rPr>
-          <w:rFonts w:ascii="Calibri" w:hAnsi="Calibri" w:cs="Calibri"/>
-          <w:b/>
-          <w:bCs/>
-        </w:rPr>
-        <w:t>Non-goal:</w:t>
-      </w:r>
-      <w:r>
-        <w:rPr>
-          <w:rFonts w:ascii="Calibri" w:hAnsi="Calibri" w:cs="Calibri"/>
-        </w:rPr>
-        <w:t xml:space="preserve"> Visual approval from isolated component screenshots.</w:t>
-      </w:r>
-    </w:p>
-    <w:p>
-      <w:pPr>
-        <w:pStyle w:val="Heading3"/>
-        <w:keepNext/>
-        <w:widowControl/>
-      </w:pPr>
-      <w:r>
-        <w:rPr>
-          <w:rFonts w:ascii="Calibri" w:hAnsi="Calibri" w:cs="Calibri"/>
-        </w:rPr>
-        <w:t>P10B-18 — Commercial quality and scale gate</w:t>
-      </w:r>
-    </w:p>
-    <w:p>
-      <w:pPr>
-        <w:pStyle w:val="Normal"/>
-        <w:numPr>
-          <w:ilvl w:val="0"/>
-          <w:numId w:val="1"/>
-        </w:numPr>
-        <w:widowControl/>
-      </w:pPr>
-      <w:r>
-        <w:rPr>
-          <w:rFonts w:ascii="Calibri" w:hAnsi="Calibri" w:cs="Calibri"/>
-          <w:b/>
-          <w:bCs/>
-        </w:rPr>
-        <w:t>Outcome:</w:t>
-      </w:r>
-      <w:r>
-        <w:rPr>
-          <w:rFonts w:ascii="Calibri" w:hAnsi="Calibri" w:cs="Calibri"/>
-        </w:rPr>
-        <w:t xml:space="preserve"> Prove repeated generation of publishable, premium, materially different complete storefronts.</w:t>
-      </w:r>
-    </w:p>
-    <w:p>
-      <w:pPr>
-        <w:pStyle w:val="Normal"/>
-        <w:numPr>
-          <w:ilvl w:val="0"/>
-          <w:numId w:val="1"/>
-        </w:numPr>
-        <w:widowControl/>
-      </w:pPr>
-      <w:r>
-        <w:rPr>
-          <w:rFonts w:ascii="Calibri" w:hAnsi="Calibri" w:cs="Calibri"/>
-          <w:b/>
-          <w:bCs/>
-        </w:rPr>
-        <w:t>Authority:</w:t>
-      </w:r>
-      <w:r>
-        <w:rPr>
-          <w:rFonts w:ascii="Calibri" w:hAnsi="Calibri" w:cs="Calibri"/>
-        </w:rPr>
-        <w:t xml:space="preserve"> Existing golden-store/human-review evidence plus the P10B synthesis and fingerprint authorities.</w:t>
-      </w:r>
-    </w:p>
-    <w:p>
-      <w:pPr>
-        <w:pStyle w:val="Normal"/>
-        <w:numPr>
-          <w:ilvl w:val="0"/>
-          <w:numId w:val="1"/>
-        </w:numPr>
-        <w:widowControl/>
-      </w:pPr>
-      <w:r>
-        <w:rPr>
-          <w:rFonts w:ascii="Calibri" w:hAnsi="Calibri" w:cs="Calibri"/>
-          <w:b/>
-          <w:bCs/>
-        </w:rPr>
-        <w:t>Depends on:</w:t>
-      </w:r>
-      <w:r>
-        <w:rPr>
-          <w:rFonts w:ascii="Calibri" w:hAnsi="Calibri" w:cs="Calibri"/>
-        </w:rPr>
-        <w:t xml:space="preserve"> P10B-17 and every prior P10B task.</w:t>
-      </w:r>
-    </w:p>
-    <w:p>
-      <w:pPr>
-        <w:pStyle w:val="Normal"/>
-        <w:numPr>
-          <w:ilvl w:val="0"/>
-          <w:numId w:val="1"/>
-        </w:numPr>
-        <w:widowControl/>
-      </w:pPr>
-      <w:r>
-        <w:rPr>
-          <w:rFonts w:ascii="Calibri" w:hAnsi="Calibri" w:cs="Calibri"/>
-          <w:b/>
-          <w:bCs/>
-        </w:rPr>
-        <w:t>Done when:</w:t>
-      </w:r>
-      <w:r>
-        <w:rPr>
-          <w:rFonts w:ascii="Calibri" w:hAnsi="Calibri" w:cs="Calibri"/>
-        </w:rPr>
-        <w:t xml:space="preserve"> At least 100 deterministic complete configurations across representative catalogue/evidence/asset/locale/page-set/direction contexts pass snapshot validity, protected parity, exact-duplicate, near-duplicate, and structural-distribution gates; a fingerprint- stratified subset passes retained four-width human commercial review.</w:t>
-      </w:r>
-    </w:p>
-    <w:p>
-      <w:pPr>
-        <w:pStyle w:val="Normal"/>
-        <w:numPr>
-          <w:ilvl w:val="0"/>
-          <w:numId w:val="1"/>
-        </w:numPr>
-        <w:widowControl/>
-      </w:pPr>
-      <w:r>
-        <w:rPr>
-          <w:rFonts w:ascii="Calibri" w:hAnsi="Calibri" w:cs="Calibri"/>
-          <w:b/>
-          <w:bCs/>
-        </w:rPr>
-        <w:t>Fail closed:</w:t>
-      </w:r>
-      <w:r>
-        <w:rPr>
-          <w:rFonts w:ascii="Calibri" w:hAnsi="Calibri" w:cs="Calibri"/>
-        </w:rPr>
-        <w:t xml:space="preserve"> One polished store, automated checks alone, placeholder assets, registry counts, screenshots without exact authority, or colour-only diversity cannot close P10B.</w:t>
-      </w:r>
-    </w:p>
-    <w:p>
-      <w:pPr>
-        <w:pStyle w:val="Normal"/>
-        <w:numPr>
-          <w:ilvl w:val="0"/>
-          <w:numId w:val="1"/>
-        </w:numPr>
-        <w:widowControl/>
-      </w:pPr>
-      <w:r>
-        <w:rPr>
-          <w:rFonts w:ascii="Calibri" w:hAnsi="Calibri" w:cs="Calibri"/>
-          <w:b/>
-          <w:bCs/>
-        </w:rPr>
-        <w:t>Evidence:</w:t>
-      </w:r>
-      <w:r>
-        <w:rPr>
-          <w:rFonts w:ascii="Calibri" w:hAnsi="Calibri" w:cs="Calibri"/>
-        </w:rPr>
-        <w:t xml:space="preserve"> Scale-generation ledger, fingerprint/diversity analysis, complete capability-chain correlations, retained screenshots, and explicit human acceptance.</w:t>
-      </w:r>
-    </w:p>
-    <w:p>
-      <w:pPr>
-        <w:pStyle w:val="Normal"/>
-        <w:numPr>
-          <w:ilvl w:val="0"/>
-          <w:numId w:val="1"/>
-        </w:numPr>
-        <w:widowControl/>
-      </w:pPr>
-      <w:r>
-        <w:rPr>
-          <w:rFonts w:ascii="Calibri" w:hAnsi="Calibri" w:cs="Calibri"/>
-          <w:b/>
-          <w:bCs/>
-        </w:rPr>
-        <w:t>Non-goal:</w:t>
-      </w:r>
-      <w:r>
-        <w:rPr>
-          <w:rFonts w:ascii="Calibri" w:hAnsi="Calibri" w:cs="Calibri"/>
-        </w:rPr>
-        <w:t xml:space="preserve"> P10C merchant editing, Vesko staging, or production-readiness claims.</w:t>
-      </w:r>
-    </w:p>
-    <w:p>
-      <w:pPr>
-        <w:pStyle w:val="Heading2"/>
-        <w:keepNext/>
-        <w:widowControl/>
-      </w:pPr>
-      <w:r>
-        <w:rPr>
-          <w:rFonts w:ascii="Calibri" w:hAnsi="Calibri" w:cs="Calibri"/>
-        </w:rPr>
-        <w:t>P10C — Storefront Studio Editing Experience v1</w:t>
-      </w:r>
-    </w:p>
-    <w:p>
-      <w:pPr>
-        <w:pStyle w:val="Heading3"/>
-        <w:keepNext/>
-        <w:widowControl/>
-      </w:pPr>
-      <w:r>
-        <w:rPr>
-          <w:rFonts w:ascii="Calibri" w:hAnsi="Calibri" w:cs="Calibri"/>
-        </w:rPr>
-        <w:t>P10C-01 — Brand asset library</w:t>
-      </w:r>
-    </w:p>
-    <w:p>
-      <w:pPr>
-        <w:pStyle w:val="Normal"/>
-        <w:numPr>
-          <w:ilvl w:val="0"/>
-          <w:numId w:val="1"/>
-        </w:numPr>
-        <w:widowControl/>
-      </w:pPr>
-      <w:r>
-        <w:rPr>
-          <w:rFonts w:ascii="Calibri" w:hAnsi="Calibri" w:cs="Calibri"/>
-          <w:b/>
-          <w:bCs/>
-        </w:rPr>
-        <w:t>Outcome:</w:t>
-      </w:r>
-      <w:r>
-        <w:rPr>
-          <w:rFonts w:ascii="Calibri" w:hAnsi="Calibri" w:cs="Calibri"/>
-        </w:rPr>
-        <w:t xml:space="preserve"> Let merchants view and choose approved presentation assets in Storefront Studio.</w:t>
-      </w:r>
-    </w:p>
-    <w:p>
-      <w:pPr>
-        <w:pStyle w:val="Normal"/>
-        <w:numPr>
-          <w:ilvl w:val="0"/>
-          <w:numId w:val="1"/>
-        </w:numPr>
-        <w:widowControl/>
-      </w:pPr>
-      <w:r>
-        <w:rPr>
-          <w:rFonts w:ascii="Calibri" w:hAnsi="Calibri" w:cs="Calibri"/>
-          <w:b/>
-          <w:bCs/>
-        </w:rPr>
-        <w:t>Status:</w:t>
-      </w:r>
-      <w:r>
-        <w:rPr>
-          <w:rFonts w:ascii="Calibri" w:hAnsi="Calibri" w:cs="Calibri"/>
-        </w:rPr>
-        <w:t xml:space="preserve"> </w:t>
-      </w:r>
-      <w:r>
-        <w:rPr>
-          <w:rFonts w:ascii="Calibri" w:hAnsi="Calibri" w:cs="Calibri"/>
-          <w:b/>
-          <w:bCs/>
-        </w:rPr>
-        <w:t>Planned</w:t>
-      </w:r>
-      <w:r>
-        <w:rPr>
-          <w:rFonts w:ascii="Calibri" w:hAnsi="Calibri" w:cs="Calibri"/>
-        </w:rPr>
-        <w:t>.</w:t>
-      </w:r>
-    </w:p>
-    <w:p>
-      <w:pPr>
-        <w:pStyle w:val="Normal"/>
-        <w:numPr>
-          <w:ilvl w:val="0"/>
-          <w:numId w:val="1"/>
-        </w:numPr>
-        <w:widowControl/>
-      </w:pPr>
-      <w:r>
-        <w:rPr>
-          <w:rFonts w:ascii="Calibri" w:hAnsi="Calibri" w:cs="Calibri"/>
-          <w:b/>
-          <w:bCs/>
-        </w:rPr>
-        <w:t>Depends on:</w:t>
-      </w:r>
-      <w:r>
-        <w:rPr>
-          <w:rFonts w:ascii="Calibri" w:hAnsi="Calibri" w:cs="Calibri"/>
-        </w:rPr>
-        <w:t xml:space="preserve"> P10B asset authority.</w:t>
-      </w:r>
-    </w:p>
-    <w:p>
-      <w:pPr>
-        <w:pStyle w:val="Normal"/>
-        <w:numPr>
-          <w:ilvl w:val="0"/>
-          <w:numId w:val="1"/>
-        </w:numPr>
-        <w:widowControl/>
-      </w:pPr>
-      <w:r>
-        <w:rPr>
-          <w:rFonts w:ascii="Calibri" w:hAnsi="Calibri" w:cs="Calibri"/>
-          <w:b/>
-          <w:bCs/>
-        </w:rPr>
-        <w:t>Done when:</w:t>
-      </w:r>
-      <w:r>
-        <w:rPr>
-          <w:rFonts w:ascii="Calibri" w:hAnsi="Calibri" w:cs="Calibri"/>
-        </w:rPr>
-        <w:t xml:space="preserve"> The stated outcome and required evidence are accepted.</w:t>
-      </w:r>
-    </w:p>
-    <w:p>
-      <w:pPr>
-        <w:pStyle w:val="Normal"/>
-        <w:numPr>
-          <w:ilvl w:val="0"/>
-          <w:numId w:val="1"/>
-        </w:numPr>
-        <w:widowControl/>
-      </w:pPr>
-      <w:r>
-        <w:rPr>
-          <w:rFonts w:ascii="Calibri" w:hAnsi="Calibri" w:cs="Calibri"/>
-          <w:b/>
-          <w:bCs/>
-        </w:rPr>
-        <w:t>Required evidence:</w:t>
-      </w:r>
-      <w:r>
-        <w:rPr>
-          <w:rFonts w:ascii="Calibri" w:hAnsi="Calibri" w:cs="Calibri"/>
-        </w:rPr>
-        <w:t xml:space="preserve"> Contract, integration, browser/E2E.</w:t>
-      </w:r>
-    </w:p>
-    <w:p>
-      <w:pPr>
-        <w:pStyle w:val="Normal"/>
-        <w:numPr>
-          <w:ilvl w:val="0"/>
-          <w:numId w:val="1"/>
-        </w:numPr>
-        <w:widowControl/>
-      </w:pPr>
-      <w:r>
-        <w:rPr>
-          <w:rFonts w:ascii="Calibri" w:hAnsi="Calibri" w:cs="Calibri"/>
-          <w:b/>
-          <w:bCs/>
-        </w:rPr>
-        <w:t>Non-goal:</w:t>
-      </w:r>
-      <w:r>
-        <w:rPr>
-          <w:rFonts w:ascii="Calibri" w:hAnsi="Calibri" w:cs="Calibri"/>
-        </w:rPr>
-        <w:t xml:space="preserve"> Product-media replacement or generic DAM scope.</w:t>
-      </w:r>
-    </w:p>
-    <w:p>
-      <w:pPr>
-        <w:pStyle w:val="Heading3"/>
-        <w:keepNext/>
-        <w:widowControl/>
-      </w:pPr>
-      <w:r>
-        <w:rPr>
-          <w:rFonts w:ascii="Calibri" w:hAnsi="Calibri" w:cs="Calibri"/>
-        </w:rPr>
-        <w:t>P10C-02 — Asset roles and provenance</w:t>
-      </w:r>
-    </w:p>
-    <w:p>
-      <w:pPr>
-        <w:pStyle w:val="Normal"/>
-        <w:numPr>
-          <w:ilvl w:val="0"/>
-          <w:numId w:val="1"/>
-        </w:numPr>
-        <w:widowControl/>
-      </w:pPr>
-      <w:r>
-        <w:rPr>
-          <w:rFonts w:ascii="Calibri" w:hAnsi="Calibri" w:cs="Calibri"/>
-          <w:b/>
-          <w:bCs/>
-        </w:rPr>
-        <w:t>Outcome:</w:t>
-      </w:r>
-      <w:r>
-        <w:rPr>
-          <w:rFonts w:ascii="Calibri" w:hAnsi="Calibri" w:cs="Calibri"/>
-        </w:rPr>
-        <w:t xml:space="preserve"> Show and preserve role, source, approval, revision, and assignment authority.</w:t>
-      </w:r>
-    </w:p>
-    <w:p>
-      <w:pPr>
-        <w:pStyle w:val="Normal"/>
-        <w:numPr>
-          <w:ilvl w:val="0"/>
-          <w:numId w:val="1"/>
-        </w:numPr>
-        <w:widowControl/>
-      </w:pPr>
-      <w:r>
-        <w:rPr>
-          <w:rFonts w:ascii="Calibri" w:hAnsi="Calibri" w:cs="Calibri"/>
-          <w:b/>
-          <w:bCs/>
-        </w:rPr>
-        <w:t>Status:</w:t>
-      </w:r>
-      <w:r>
-        <w:rPr>
-          <w:rFonts w:ascii="Calibri" w:hAnsi="Calibri" w:cs="Calibri"/>
-        </w:rPr>
-        <w:t xml:space="preserve"> </w:t>
-      </w:r>
-      <w:r>
-        <w:rPr>
-          <w:rFonts w:ascii="Calibri" w:hAnsi="Calibri" w:cs="Calibri"/>
-          <w:b/>
-          <w:bCs/>
-        </w:rPr>
-        <w:t>Planned</w:t>
-      </w:r>
-      <w:r>
-        <w:rPr>
-          <w:rFonts w:ascii="Calibri" w:hAnsi="Calibri" w:cs="Calibri"/>
-        </w:rPr>
-        <w:t>.</w:t>
-      </w:r>
-    </w:p>
-    <w:p>
-      <w:pPr>
-        <w:pStyle w:val="Normal"/>
-        <w:numPr>
-          <w:ilvl w:val="0"/>
-          <w:numId w:val="1"/>
-        </w:numPr>
-        <w:widowControl/>
-      </w:pPr>
-      <w:r>
-        <w:rPr>
-          <w:rFonts w:ascii="Calibri" w:hAnsi="Calibri" w:cs="Calibri"/>
-          <w:b/>
-          <w:bCs/>
-        </w:rPr>
-        <w:t>Depends on:</w:t>
-      </w:r>
-      <w:r>
-        <w:rPr>
-          <w:rFonts w:ascii="Calibri" w:hAnsi="Calibri" w:cs="Calibri"/>
-        </w:rPr>
-        <w:t xml:space="preserve"> P10C-01.</w:t>
-      </w:r>
-    </w:p>
-    <w:p>
-      <w:pPr>
-        <w:pStyle w:val="Normal"/>
-        <w:numPr>
-          <w:ilvl w:val="0"/>
-          <w:numId w:val="1"/>
-        </w:numPr>
-        <w:widowControl/>
-      </w:pPr>
-      <w:r>
-        <w:rPr>
-          <w:rFonts w:ascii="Calibri" w:hAnsi="Calibri" w:cs="Calibri"/>
-          <w:b/>
-          <w:bCs/>
-        </w:rPr>
-        <w:t>Done when:</w:t>
-      </w:r>
-      <w:r>
-        <w:rPr>
-          <w:rFonts w:ascii="Calibri" w:hAnsi="Calibri" w:cs="Calibri"/>
-        </w:rPr>
-        <w:t xml:space="preserve"> The stated outcome and required evidence are accepted.</w:t>
-      </w:r>
-    </w:p>
-    <w:p>
-      <w:pPr>
-        <w:pStyle w:val="Normal"/>
-        <w:numPr>
-          <w:ilvl w:val="0"/>
-          <w:numId w:val="1"/>
-        </w:numPr>
-        <w:widowControl/>
-      </w:pPr>
-      <w:r>
-        <w:rPr>
-          <w:rFonts w:ascii="Calibri" w:hAnsi="Calibri" w:cs="Calibri"/>
-          <w:b/>
-          <w:bCs/>
-        </w:rPr>
-        <w:t>Required evidence:</w:t>
-      </w:r>
-      <w:r>
-        <w:rPr>
-          <w:rFonts w:ascii="Calibri" w:hAnsi="Calibri" w:cs="Calibri"/>
-        </w:rPr>
-        <w:t xml:space="preserve"> Valid assignment and stale/unknown/role-mismatch rejection.</w:t>
-      </w:r>
-    </w:p>
-    <w:p>
-      <w:pPr>
-        <w:pStyle w:val="Normal"/>
-        <w:numPr>
-          <w:ilvl w:val="0"/>
-          <w:numId w:val="1"/>
-        </w:numPr>
-        <w:widowControl/>
-      </w:pPr>
-      <w:r>
-        <w:rPr>
-          <w:rFonts w:ascii="Calibri" w:hAnsi="Calibri" w:cs="Calibri"/>
-          <w:b/>
-          <w:bCs/>
-        </w:rPr>
-        <w:t>Non-goal:</w:t>
-      </w:r>
-      <w:r>
-        <w:rPr>
-          <w:rFonts w:ascii="Calibri" w:hAnsi="Calibri" w:cs="Calibri"/>
-        </w:rPr>
-        <w:t xml:space="preserve"> Untyped uploads or hidden provenance.</w:t>
-      </w:r>
-    </w:p>
-    <w:p>
-      <w:pPr>
-        <w:pStyle w:val="Heading3"/>
-        <w:keepNext/>
-        <w:widowControl/>
-      </w:pPr>
-      <w:r>
-        <w:rPr>
-          <w:rFonts w:ascii="Calibri" w:hAnsi="Calibri" w:cs="Calibri"/>
-        </w:rPr>
-        <w:t>P10C-03 — Canonical Puck boundary</w:t>
-      </w:r>
-    </w:p>
-    <w:p>
-      <w:pPr>
-        <w:pStyle w:val="Normal"/>
-        <w:numPr>
-          <w:ilvl w:val="0"/>
-          <w:numId w:val="1"/>
-        </w:numPr>
-        <w:widowControl/>
-      </w:pPr>
-      <w:r>
-        <w:rPr>
-          <w:rFonts w:ascii="Calibri" w:hAnsi="Calibri" w:cs="Calibri"/>
-          <w:b/>
-          <w:bCs/>
-        </w:rPr>
-        <w:t>Outcome:</w:t>
-      </w:r>
-      <w:r>
-        <w:rPr>
-          <w:rFonts w:ascii="Calibri" w:hAnsi="Calibri" w:cs="Calibri"/>
-        </w:rPr>
-        <w:t xml:space="preserve"> Project registered canonical content into Puck and validate edits back into the same </w:t>
+        <w:t xml:space="preserve"> Existing governed planning/proposal compiler plus the registered P10B authorities; output remains one </w:t>
       </w:r>
       <w:r>
         <w:rPr>
@@ -13600,51 +12561,13 @@
           <w:b/>
           <w:bCs/>
         </w:rPr>
-        <w:t>Status:</w:t>
-      </w:r>
-      <w:r>
-        <w:rPr>
-          <w:rFonts w:ascii="Calibri" w:hAnsi="Calibri" w:cs="Calibri"/>
-        </w:rPr>
-        <w:t xml:space="preserve"> </w:t>
-      </w:r>
-      <w:r>
-        <w:rPr>
-          <w:rFonts w:ascii="Calibri" w:hAnsi="Calibri" w:cs="Calibri"/>
-          <w:b/>
-          <w:bCs/>
-        </w:rPr>
-        <w:t>Planned</w:t>
-      </w:r>
-      <w:r>
-        <w:rPr>
-          <w:rFonts w:ascii="Calibri" w:hAnsi="Calibri" w:cs="Calibri"/>
-        </w:rPr>
-        <w:t>.</w:t>
-      </w:r>
-    </w:p>
-    <w:p>
-      <w:pPr>
-        <w:pStyle w:val="Normal"/>
-        <w:numPr>
-          <w:ilvl w:val="0"/>
-          <w:numId w:val="1"/>
-        </w:numPr>
-        <w:widowControl/>
-      </w:pPr>
-      <w:r>
-        <w:rPr>
-          <w:rFonts w:ascii="Calibri" w:hAnsi="Calibri" w:cs="Calibri"/>
-          <w:b/>
-          <w:bCs/>
-        </w:rPr>
         <w:t>Depends on:</w:t>
       </w:r>
       <w:r>
         <w:rPr>
           <w:rFonts w:ascii="Calibri" w:hAnsi="Calibri" w:cs="Calibri"/>
         </w:rPr>
-        <w:t xml:space="preserve"> P10B component/profile authority.</w:t>
+        <w:t xml:space="preserve"> P10B-14 and sufficient real family/profile capability.</w:t>
       </w:r>
     </w:p>
     <w:p>
@@ -13668,31 +12591,55 @@
         <w:rPr>
           <w:rFonts w:ascii="Calibri" w:hAnsi="Calibri" w:cs="Calibri"/>
         </w:rPr>
-        <w:t xml:space="preserve"> The stated outcome and required evidence are accepted.</w:t>
-      </w:r>
-    </w:p>
-    <w:p>
-      <w:pPr>
-        <w:pStyle w:val="Normal"/>
-        <w:numPr>
-          <w:ilvl w:val="0"/>
-          <w:numId w:val="1"/>
-        </w:numPr>
-        <w:widowControl/>
-      </w:pPr>
-      <w:r>
-        <w:rPr>
-          <w:rFonts w:ascii="Calibri" w:hAnsi="Calibri" w:cs="Calibri"/>
-          <w:b/>
-          <w:bCs/>
-        </w:rPr>
-        <w:t>Required evidence:</w:t>
-      </w:r>
-      <w:r>
-        <w:rPr>
-          <w:rFonts w:ascii="Calibri" w:hAnsi="Calibri" w:cs="Calibri"/>
-        </w:rPr>
-        <w:t xml:space="preserve"> Adapter conformance and save/reload preservation.</w:t>
+        <w:t xml:space="preserve"> Deterministic selection preserves cross-page identity, narrative adjacency/ cardinality, repetition limits, bindings/assets, and complete snapshot/lifecycle output for representative inputs.</w:t>
+      </w:r>
+    </w:p>
+    <w:p>
+      <w:pPr>
+        <w:pStyle w:val="Normal"/>
+        <w:numPr>
+          <w:ilvl w:val="0"/>
+          <w:numId w:val="1"/>
+        </w:numPr>
+        <w:widowControl/>
+      </w:pPr>
+      <w:r>
+        <w:rPr>
+          <w:rFonts w:ascii="Calibri" w:hAnsi="Calibri" w:cs="Calibri"/>
+          <w:b/>
+          <w:bCs/>
+        </w:rPr>
+        <w:t>Fail closed:</w:t>
+      </w:r>
+      <w:r>
+        <w:rPr>
+          <w:rFonts w:ascii="Calibri" w:hAnsi="Calibri" w:cs="Calibri"/>
+        </w:rPr>
+        <w:t xml:space="preserve"> Missing, stale, ambiguous, incompatible, unregistered, repetitive, or protected-state-divergent combinations produce no partial proposal/snapshot.</w:t>
+      </w:r>
+    </w:p>
+    <w:p>
+      <w:pPr>
+        <w:pStyle w:val="Normal"/>
+        <w:numPr>
+          <w:ilvl w:val="0"/>
+          <w:numId w:val="1"/>
+        </w:numPr>
+        <w:widowControl/>
+      </w:pPr>
+      <w:r>
+        <w:rPr>
+          <w:rFonts w:ascii="Calibri" w:hAnsi="Calibri" w:cs="Calibri"/>
+          <w:b/>
+          <w:bCs/>
+        </w:rPr>
+        <w:t>Evidence:</w:t>
+      </w:r>
+      <w:r>
+        <w:rPr>
+          <w:rFonts w:ascii="Calibri" w:hAnsi="Calibri" w:cs="Calibri"/>
+        </w:rPr>
+        <w:t xml:space="preserve"> Selection/compatibility/unit, proposal/compiler/lifecycle integration, no-partial- write, deterministic fingerprint inputs, and complete-store browser evidence.</w:t>
       </w:r>
     </w:p>
     <w:p>
@@ -13716,7 +12663,7 @@
         <w:rPr>
           <w:rFonts w:ascii="Calibri" w:hAnsi="Calibri" w:cs="Calibri"/>
         </w:rPr>
-        <w:t xml:space="preserve"> Raw Puck persistence or a second page tree.</w:t>
+        <w:t xml:space="preserve"> Arbitrary trees/styles or a second synthesis representation.</w:t>
       </w:r>
     </w:p>
     <w:p>
@@ -13729,7 +12676,7 @@
         <w:rPr>
           <w:rFonts w:ascii="Calibri" w:hAnsi="Calibri" w:cs="Calibri"/>
         </w:rPr>
-        <w:t>P10C-04 — Stable frame identity and selection</w:t>
+        <w:t>P10B-16 — Coordinated directions and diversity control</w:t>
       </w:r>
     </w:p>
     <w:p>
@@ -13753,45 +12700,31 @@
         <w:rPr>
           <w:rFonts w:ascii="Calibri" w:hAnsi="Calibri" w:cs="Calibri"/>
         </w:rPr>
-        <w:t xml:space="preserve"> Select and edit one shared frame consistently from every page context.</w:t>
-      </w:r>
-    </w:p>
-    <w:p>
-      <w:pPr>
-        <w:pStyle w:val="Normal"/>
-        <w:numPr>
-          <w:ilvl w:val="0"/>
-          <w:numId w:val="1"/>
-        </w:numPr>
-        <w:widowControl/>
-      </w:pPr>
-      <w:r>
-        <w:rPr>
-          <w:rFonts w:ascii="Calibri" w:hAnsi="Calibri" w:cs="Calibri"/>
-          <w:b/>
-          <w:bCs/>
-        </w:rPr>
-        <w:t>Status:</w:t>
-      </w:r>
-      <w:r>
-        <w:rPr>
-          <w:rFonts w:ascii="Calibri" w:hAnsi="Calibri" w:cs="Calibri"/>
-        </w:rPr>
-        <w:t xml:space="preserve"> </w:t>
-      </w:r>
-      <w:r>
-        <w:rPr>
-          <w:rFonts w:ascii="Calibri" w:hAnsi="Calibri" w:cs="Calibri"/>
-          <w:b/>
-          <w:bCs/>
-        </w:rPr>
-        <w:t>Planned</w:t>
-      </w:r>
-      <w:r>
-        <w:rPr>
-          <w:rFonts w:ascii="Calibri" w:hAnsi="Calibri" w:cs="Calibri"/>
-        </w:rPr>
-        <w:t>.</w:t>
+        <w:t xml:space="preserve"> Make Premium Editorial, Modern Technical, and Minimal Commerce coordinated constraint packages and prevent duplicates/near duplicates.</w:t>
+      </w:r>
+    </w:p>
+    <w:p>
+      <w:pPr>
+        <w:pStyle w:val="Normal"/>
+        <w:numPr>
+          <w:ilvl w:val="0"/>
+          <w:numId w:val="1"/>
+        </w:numPr>
+        <w:widowControl/>
+      </w:pPr>
+      <w:r>
+        <w:rPr>
+          <w:rFonts w:ascii="Calibri" w:hAnsi="Calibri" w:cs="Calibri"/>
+          <w:b/>
+          <w:bCs/>
+        </w:rPr>
+        <w:t>Authority:</w:t>
+      </w:r>
+      <w:r>
+        <w:rPr>
+          <w:rFonts w:ascii="Calibri" w:hAnsi="Calibri" w:cs="Calibri"/>
+        </w:rPr>
+        <w:t xml:space="preserve"> Existing direction-selection authority plus deterministic storefront-design fingerprint/evaluation.</w:t>
       </w:r>
     </w:p>
     <w:p>
@@ -13815,7 +12748,7 @@
         <w:rPr>
           <w:rFonts w:ascii="Calibri" w:hAnsi="Calibri" w:cs="Calibri"/>
         </w:rPr>
-        <w:t xml:space="preserve"> P10C-03.</w:t>
+        <w:t xml:space="preserve"> P10B-15.</w:t>
       </w:r>
     </w:p>
     <w:p>
@@ -13839,31 +12772,55 @@
         <w:rPr>
           <w:rFonts w:ascii="Calibri" w:hAnsi="Calibri" w:cs="Calibri"/>
         </w:rPr>
-        <w:t xml:space="preserve"> The stated outcome and required evidence are accepted.</w:t>
-      </w:r>
-    </w:p>
-    <w:p>
-      <w:pPr>
-        <w:pStyle w:val="Normal"/>
-        <w:numPr>
-          <w:ilvl w:val="0"/>
-          <w:numId w:val="1"/>
-        </w:numPr>
-        <w:widowControl/>
-      </w:pPr>
-      <w:r>
-        <w:rPr>
-          <w:rFonts w:ascii="Calibri" w:hAnsi="Calibri" w:cs="Calibri"/>
-          <w:b/>
-          <w:bCs/>
-        </w:rPr>
-        <w:t>Required evidence:</w:t>
-      </w:r>
-      <w:r>
-        <w:rPr>
-          <w:rFonts w:ascii="Calibri" w:hAnsi="Calibri" w:cs="Calibri"/>
-        </w:rPr>
-        <w:t xml:space="preserve"> Stable identity, scope, history, and browser behavior.</w:t>
+        <w:t xml:space="preserve"> Fingerprints cover Design DNA, page set/profiles, frame, anatomies/variants, structural parameters, image posture, density/responsive posture, and narrative composition; exact and meaningful near duplicates fail, and pairwise stores differ materially beyond colour.</w:t>
+      </w:r>
+    </w:p>
+    <w:p>
+      <w:pPr>
+        <w:pStyle w:val="Normal"/>
+        <w:numPr>
+          <w:ilvl w:val="0"/>
+          <w:numId w:val="1"/>
+        </w:numPr>
+        <w:widowControl/>
+      </w:pPr>
+      <w:r>
+        <w:rPr>
+          <w:rFonts w:ascii="Calibri" w:hAnsi="Calibri" w:cs="Calibri"/>
+          <w:b/>
+          <w:bCs/>
+        </w:rPr>
+        <w:t>Fail closed:</w:t>
+      </w:r>
+      <w:r>
+        <w:rPr>
+          <w:rFonts w:ascii="Calibri" w:hAnsi="Calibri" w:cs="Calibri"/>
+        </w:rPr>
+        <w:t xml:space="preserve"> Fixed-template/token/page direction authority, incompatible references, colour-only differences, and fingerprints that omit material structure are rejected.</w:t>
+      </w:r>
+    </w:p>
+    <w:p>
+      <w:pPr>
+        <w:pStyle w:val="Normal"/>
+        <w:numPr>
+          <w:ilvl w:val="0"/>
+          <w:numId w:val="1"/>
+        </w:numPr>
+        <w:widowControl/>
+      </w:pPr>
+      <w:r>
+        <w:rPr>
+          <w:rFonts w:ascii="Calibri" w:hAnsi="Calibri" w:cs="Calibri"/>
+          <w:b/>
+          <w:bCs/>
+        </w:rPr>
+        <w:t>Evidence:</w:t>
+      </w:r>
+      <w:r>
+        <w:rPr>
+          <w:rFonts w:ascii="Calibri" w:hAnsi="Calibri" w:cs="Calibri"/>
+        </w:rPr>
+        <w:t xml:space="preserve"> Determinism, exact/near-duplicate fixtures, pairwise structural scoring, direction compatibility, complete-store generation, and representative visual evidence.</w:t>
       </w:r>
     </w:p>
     <w:p>
@@ -13887,7 +12844,7 @@
         <w:rPr>
           <w:rFonts w:ascii="Calibri" w:hAnsi="Calibri" w:cs="Calibri"/>
         </w:rPr>
-        <w:t xml:space="preserve"> Duplicating frame state per page.</w:t>
+        <w:t xml:space="preserve"> Thousands of manually authored templates.</w:t>
       </w:r>
     </w:p>
     <w:p>
@@ -13900,7 +12857,7 @@
         <w:rPr>
           <w:rFonts w:ascii="Calibri" w:hAnsi="Calibri" w:cs="Calibri"/>
         </w:rPr>
-        <w:t>P10C-05 — Approved manual frame operations</w:t>
+        <w:t>P10B-17 — Responsive, accessibility and performance closure</w:t>
       </w:r>
     </w:p>
     <w:p>
@@ -13924,45 +12881,31 @@
         <w:rPr>
           <w:rFonts w:ascii="Calibri" w:hAnsi="Calibri" w:cs="Calibri"/>
         </w:rPr>
-        <w:t xml:space="preserve"> Support bounded manual shared-frame add, remove, reorder, field, asset, and presentation operations.</w:t>
-      </w:r>
-    </w:p>
-    <w:p>
-      <w:pPr>
-        <w:pStyle w:val="Normal"/>
-        <w:numPr>
-          <w:ilvl w:val="0"/>
-          <w:numId w:val="1"/>
-        </w:numPr>
-        <w:widowControl/>
-      </w:pPr>
-      <w:r>
-        <w:rPr>
-          <w:rFonts w:ascii="Calibri" w:hAnsi="Calibri" w:cs="Calibri"/>
-          <w:b/>
-          <w:bCs/>
-        </w:rPr>
-        <w:t>Status:</w:t>
-      </w:r>
-      <w:r>
-        <w:rPr>
-          <w:rFonts w:ascii="Calibri" w:hAnsi="Calibri" w:cs="Calibri"/>
-        </w:rPr>
-        <w:t xml:space="preserve"> </w:t>
-      </w:r>
-      <w:r>
-        <w:rPr>
-          <w:rFonts w:ascii="Calibri" w:hAnsi="Calibri" w:cs="Calibri"/>
-          <w:b/>
-          <w:bCs/>
-        </w:rPr>
-        <w:t>Planned</w:t>
-      </w:r>
-      <w:r>
-        <w:rPr>
-          <w:rFonts w:ascii="Calibri" w:hAnsi="Calibri" w:cs="Calibri"/>
-        </w:rPr>
-        <w:t>.</w:t>
+        <w:t xml:space="preserve"> Preserve deliberate commercial hierarchy and usability across target widths, locales, accessibility, and bounded performance budgets.</w:t>
+      </w:r>
+    </w:p>
+    <w:p>
+      <w:pPr>
+        <w:pStyle w:val="Normal"/>
+        <w:numPr>
+          <w:ilvl w:val="0"/>
+          <w:numId w:val="1"/>
+        </w:numPr>
+        <w:widowControl/>
+      </w:pPr>
+      <w:r>
+        <w:rPr>
+          <w:rFonts w:ascii="Calibri" w:hAnsi="Calibri" w:cs="Calibri"/>
+          <w:b/>
+          <w:bCs/>
+        </w:rPr>
+        <w:t>Authority:</w:t>
+      </w:r>
+      <w:r>
+        <w:rPr>
+          <w:rFonts w:ascii="Calibri" w:hAnsi="Calibri" w:cs="Calibri"/>
+        </w:rPr>
+        <w:t xml:space="preserve"> Existing responsive/a11y contracts, registered transformations, renderers, and evidence protocol.</w:t>
       </w:r>
     </w:p>
     <w:p>
@@ -13986,7 +12929,7 @@
         <w:rPr>
           <w:rFonts w:ascii="Calibri" w:hAnsi="Calibri" w:cs="Calibri"/>
         </w:rPr>
-        <w:t xml:space="preserve"> P10C-02 through P10C-04.</w:t>
+        <w:t xml:space="preserve"> Implemented commercial families/profiles/directions through P10B-16.</w:t>
       </w:r>
     </w:p>
     <w:p>
@@ -14010,31 +12953,55 @@
         <w:rPr>
           <w:rFonts w:ascii="Calibri" w:hAnsi="Calibri" w:cs="Calibri"/>
         </w:rPr>
-        <w:t xml:space="preserve"> The stated outcome and required evidence are accepted.</w:t>
-      </w:r>
-    </w:p>
-    <w:p>
-      <w:pPr>
-        <w:pStyle w:val="Normal"/>
-        <w:numPr>
-          <w:ilvl w:val="0"/>
-          <w:numId w:val="1"/>
-        </w:numPr>
-        <w:widowControl/>
-      </w:pPr>
-      <w:r>
-        <w:rPr>
-          <w:rFonts w:ascii="Calibri" w:hAnsi="Calibri" w:cs="Calibri"/>
-          <w:b/>
-          <w:bCs/>
-        </w:rPr>
-        <w:t>Required evidence:</w:t>
-      </w:r>
-      <w:r>
-        <w:rPr>
-          <w:rFonts w:ascii="Calibri" w:hAnsi="Calibri" w:cs="Calibri"/>
-        </w:rPr>
-        <w:t xml:space="preserve"> Positive and fail-closed integration, undo/redo, browser/E2E.</w:t>
+        <w:t xml:space="preserve"> All supported page families/directions pass 375/768/1024/1440 and EN/FI geometry, declared transformations, keyboard/focus/semantics/contrast, content/commerce retention, and explicit performance budgets with correlated evidence.</w:t>
+      </w:r>
+    </w:p>
+    <w:p>
+      <w:pPr>
+        <w:pStyle w:val="Normal"/>
+        <w:numPr>
+          <w:ilvl w:val="0"/>
+          <w:numId w:val="1"/>
+        </w:numPr>
+        <w:widowControl/>
+      </w:pPr>
+      <w:r>
+        <w:rPr>
+          <w:rFonts w:ascii="Calibri" w:hAnsi="Calibri" w:cs="Calibri"/>
+          <w:b/>
+          <w:bCs/>
+        </w:rPr>
+        <w:t>Fail closed:</w:t>
+      </w:r>
+      <w:r>
+        <w:rPr>
+          <w:rFonts w:ascii="Calibri" w:hAnsi="Calibri" w:cs="Calibri"/>
+        </w:rPr>
+        <w:t xml:space="preserve"> Clipping, overlap, inaccessible controls, lost content/commerce, desktop-only approval, or undispositioned budget failure blocks completion.</w:t>
+      </w:r>
+    </w:p>
+    <w:p>
+      <w:pPr>
+        <w:pStyle w:val="Normal"/>
+        <w:numPr>
+          <w:ilvl w:val="0"/>
+          <w:numId w:val="1"/>
+        </w:numPr>
+        <w:widowControl/>
+      </w:pPr>
+      <w:r>
+        <w:rPr>
+          <w:rFonts w:ascii="Calibri" w:hAnsi="Calibri" w:cs="Calibri"/>
+          <w:b/>
+          <w:bCs/>
+        </w:rPr>
+        <w:t>Evidence:</w:t>
+      </w:r>
+      <w:r>
+        <w:rPr>
+          <w:rFonts w:ascii="Calibri" w:hAnsi="Calibri" w:cs="Calibri"/>
+        </w:rPr>
+        <w:t xml:space="preserve"> Automated geometry/a11y/performance/browser matrices plus retained representative human review.</w:t>
       </w:r>
     </w:p>
     <w:p>
@@ -14058,7 +13025,7 @@
         <w:rPr>
           <w:rFonts w:ascii="Calibri" w:hAnsi="Calibri" w:cs="Calibri"/>
         </w:rPr>
-        <w:t xml:space="preserve"> Arbitrary code/CSS/components or commerce mutation.</w:t>
+        <w:t xml:space="preserve"> Visual approval from isolated component screenshots.</w:t>
       </w:r>
     </w:p>
     <w:p>
@@ -14071,7 +13038,7 @@
         <w:rPr>
           <w:rFonts w:ascii="Calibri" w:hAnsi="Calibri" w:cs="Calibri"/>
         </w:rPr>
-        <w:t>P10C-06 — Scoped AI editing</w:t>
+        <w:t>P10B-18 — Commercial quality and scale gate</w:t>
       </w:r>
     </w:p>
     <w:p>
@@ -14095,45 +13062,31 @@
         <w:rPr>
           <w:rFonts w:ascii="Calibri" w:hAnsi="Calibri" w:cs="Calibri"/>
         </w:rPr>
-        <w:t xml:space="preserve"> Connect merchant routing, clarification, frame/page scope, and proposal review to the existing P10A governed authorities.</w:t>
-      </w:r>
-    </w:p>
-    <w:p>
-      <w:pPr>
-        <w:pStyle w:val="Normal"/>
-        <w:numPr>
-          <w:ilvl w:val="0"/>
-          <w:numId w:val="1"/>
-        </w:numPr>
-        <w:widowControl/>
-      </w:pPr>
-      <w:r>
-        <w:rPr>
-          <w:rFonts w:ascii="Calibri" w:hAnsi="Calibri" w:cs="Calibri"/>
-          <w:b/>
-          <w:bCs/>
-        </w:rPr>
-        <w:t>Status:</w:t>
-      </w:r>
-      <w:r>
-        <w:rPr>
-          <w:rFonts w:ascii="Calibri" w:hAnsi="Calibri" w:cs="Calibri"/>
-        </w:rPr>
-        <w:t xml:space="preserve"> </w:t>
-      </w:r>
-      <w:r>
-        <w:rPr>
-          <w:rFonts w:ascii="Calibri" w:hAnsi="Calibri" w:cs="Calibri"/>
-          <w:b/>
-          <w:bCs/>
-        </w:rPr>
-        <w:t>Planned</w:t>
-      </w:r>
-      <w:r>
-        <w:rPr>
-          <w:rFonts w:ascii="Calibri" w:hAnsi="Calibri" w:cs="Calibri"/>
-        </w:rPr>
-        <w:t>.</w:t>
+        <w:t xml:space="preserve"> Prove repeated generation of publishable, premium, materially different complete storefronts.</w:t>
+      </w:r>
+    </w:p>
+    <w:p>
+      <w:pPr>
+        <w:pStyle w:val="Normal"/>
+        <w:numPr>
+          <w:ilvl w:val="0"/>
+          <w:numId w:val="1"/>
+        </w:numPr>
+        <w:widowControl/>
+      </w:pPr>
+      <w:r>
+        <w:rPr>
+          <w:rFonts w:ascii="Calibri" w:hAnsi="Calibri" w:cs="Calibri"/>
+          <w:b/>
+          <w:bCs/>
+        </w:rPr>
+        <w:t>Authority:</w:t>
+      </w:r>
+      <w:r>
+        <w:rPr>
+          <w:rFonts w:ascii="Calibri" w:hAnsi="Calibri" w:cs="Calibri"/>
+        </w:rPr>
+        <w:t xml:space="preserve"> Existing golden-store/human-review evidence plus the P10B synthesis and fingerprint authorities.</w:t>
       </w:r>
     </w:p>
     <w:p>
@@ -14157,7 +13110,7 @@
         <w:rPr>
           <w:rFonts w:ascii="Calibri" w:hAnsi="Calibri" w:cs="Calibri"/>
         </w:rPr>
-        <w:t xml:space="preserve"> P10C-03 through P10C-05 and P10A internal router/packages.</w:t>
+        <w:t xml:space="preserve"> P10B-17 and every prior P10B task.</w:t>
       </w:r>
     </w:p>
     <w:p>
@@ -14181,31 +13134,55 @@
         <w:rPr>
           <w:rFonts w:ascii="Calibri" w:hAnsi="Calibri" w:cs="Calibri"/>
         </w:rPr>
-        <w:t xml:space="preserve"> The stated outcome and required evidence are accepted.</w:t>
-      </w:r>
-    </w:p>
-    <w:p>
-      <w:pPr>
-        <w:pStyle w:val="Normal"/>
-        <w:numPr>
-          <w:ilvl w:val="0"/>
-          <w:numId w:val="1"/>
-        </w:numPr>
-        <w:widowControl/>
-      </w:pPr>
-      <w:r>
-        <w:rPr>
-          <w:rFonts w:ascii="Calibri" w:hAnsi="Calibri" w:cs="Calibri"/>
-          <w:b/>
-          <w:bCs/>
-        </w:rPr>
-        <w:t>Required evidence:</w:t>
-      </w:r>
-      <w:r>
-        <w:rPr>
-          <w:rFonts w:ascii="Calibri" w:hAnsi="Calibri" w:cs="Calibri"/>
-        </w:rPr>
-        <w:t xml:space="preserve"> Selected-section, frame, page, storefront, ambiguity, stale, and failure browser flows.</w:t>
+        <w:t xml:space="preserve"> At least 100 deterministic complete configurations across representative catalogue/evidence/asset/locale/page-set/direction contexts pass snapshot validity, protected parity, exact-duplicate, near-duplicate, and structural-distribution gates; a fingerprint- stratified subset passes retained four-width human commercial review.</w:t>
+      </w:r>
+    </w:p>
+    <w:p>
+      <w:pPr>
+        <w:pStyle w:val="Normal"/>
+        <w:numPr>
+          <w:ilvl w:val="0"/>
+          <w:numId w:val="1"/>
+        </w:numPr>
+        <w:widowControl/>
+      </w:pPr>
+      <w:r>
+        <w:rPr>
+          <w:rFonts w:ascii="Calibri" w:hAnsi="Calibri" w:cs="Calibri"/>
+          <w:b/>
+          <w:bCs/>
+        </w:rPr>
+        <w:t>Fail closed:</w:t>
+      </w:r>
+      <w:r>
+        <w:rPr>
+          <w:rFonts w:ascii="Calibri" w:hAnsi="Calibri" w:cs="Calibri"/>
+        </w:rPr>
+        <w:t xml:space="preserve"> One polished store, automated checks alone, placeholder assets, registry counts, screenshots without exact authority, or colour-only diversity cannot close P10B.</w:t>
+      </w:r>
+    </w:p>
+    <w:p>
+      <w:pPr>
+        <w:pStyle w:val="Normal"/>
+        <w:numPr>
+          <w:ilvl w:val="0"/>
+          <w:numId w:val="1"/>
+        </w:numPr>
+        <w:widowControl/>
+      </w:pPr>
+      <w:r>
+        <w:rPr>
+          <w:rFonts w:ascii="Calibri" w:hAnsi="Calibri" w:cs="Calibri"/>
+          <w:b/>
+          <w:bCs/>
+        </w:rPr>
+        <w:t>Evidence:</w:t>
+      </w:r>
+      <w:r>
+        <w:rPr>
+          <w:rFonts w:ascii="Calibri" w:hAnsi="Calibri" w:cs="Calibri"/>
+        </w:rPr>
+        <w:t xml:space="preserve"> Scale-generation ledger, fingerprint/diversity analysis, complete capability-chain correlations, retained screenshots, and explicit human acceptance.</w:t>
       </w:r>
     </w:p>
     <w:p>
@@ -14229,7 +13206,20 @@
         <w:rPr>
           <w:rFonts w:ascii="Calibri" w:hAnsi="Calibri" w:cs="Calibri"/>
         </w:rPr>
-        <w:t xml:space="preserve"> Rebuilding the router, packages, proposals, or provider boundary.</w:t>
+        <w:t xml:space="preserve"> P10C merchant editing, Vesko staging, or production-readiness claims.</w:t>
+      </w:r>
+    </w:p>
+    <w:p>
+      <w:pPr>
+        <w:pStyle w:val="Heading2"/>
+        <w:keepNext/>
+        <w:widowControl/>
+      </w:pPr>
+      <w:r>
+        <w:rPr>
+          <w:rFonts w:ascii="Calibri" w:hAnsi="Calibri" w:cs="Calibri"/>
+        </w:rPr>
+        <w:t>P10C — Storefront Studio Editing Experience v1</w:t>
       </w:r>
     </w:p>
     <w:p>
@@ -14242,7 +13232,7 @@
         <w:rPr>
           <w:rFonts w:ascii="Calibri" w:hAnsi="Calibri" w:cs="Calibri"/>
         </w:rPr>
-        <w:t>P10C-07 — Unified AI/manual history</w:t>
+        <w:t>P10C-01 — Brand asset library</w:t>
       </w:r>
     </w:p>
     <w:p>
@@ -14266,7 +13256,7 @@
         <w:rPr>
           <w:rFonts w:ascii="Calibri" w:hAnsi="Calibri" w:cs="Calibri"/>
         </w:rPr>
-        <w:t xml:space="preserve"> Put manual and accepted AI operations into one atomic canonical undo/redo history.</w:t>
+        <w:t xml:space="preserve"> Let merchants view and choose approved presentation assets in Storefront Studio.</w:t>
       </w:r>
     </w:p>
     <w:p>
@@ -14328,7 +13318,7 @@
         <w:rPr>
           <w:rFonts w:ascii="Calibri" w:hAnsi="Calibri" w:cs="Calibri"/>
         </w:rPr>
-        <w:t xml:space="preserve"> P10C-05, P10C-06.</w:t>
+        <w:t xml:space="preserve"> P10B asset authority.</w:t>
       </w:r>
     </w:p>
     <w:p>
@@ -14376,7 +13366,7 @@
         <w:rPr>
           <w:rFonts w:ascii="Calibri" w:hAnsi="Calibri" w:cs="Calibri"/>
         </w:rPr>
-        <w:t xml:space="preserve"> Mixed edits, undo/redo, save/reload, stale protection.</w:t>
+        <w:t xml:space="preserve"> Contract, integration, browser/E2E.</w:t>
       </w:r>
     </w:p>
     <w:p>
@@ -14400,7 +13390,7 @@
         <w:rPr>
           <w:rFonts w:ascii="Calibri" w:hAnsi="Calibri" w:cs="Calibri"/>
         </w:rPr>
-        <w:t xml:space="preserve"> A Puck-only or AI-only history.</w:t>
+        <w:t xml:space="preserve"> Product-media replacement or generic DAM scope.</w:t>
       </w:r>
     </w:p>
     <w:p>
@@ -14413,7 +13403,7 @@
         <w:rPr>
           <w:rFonts w:ascii="Calibri" w:hAnsi="Calibri" w:cs="Calibri"/>
         </w:rPr>
-        <w:t>P10C-08 — Brand and asset editor with Studio shell</w:t>
+        <w:t>P10C-02 — Asset roles and provenance</w:t>
       </w:r>
     </w:p>
     <w:p>
@@ -14437,7 +13427,7 @@
         <w:rPr>
           <w:rFonts w:ascii="Calibri" w:hAnsi="Calibri" w:cs="Calibri"/>
         </w:rPr>
-        <w:t xml:space="preserve"> Deliver the merchant shell subset required to operate assets, canvas, review, save, preview, and publish.</w:t>
+        <w:t xml:space="preserve"> Show and preserve role, source, approval, revision, and assignment authority.</w:t>
       </w:r>
     </w:p>
     <w:p>
@@ -14499,7 +13489,7 @@
         <w:rPr>
           <w:rFonts w:ascii="Calibri" w:hAnsi="Calibri" w:cs="Calibri"/>
         </w:rPr>
-        <w:t xml:space="preserve"> P10C-01 through P10C-07.</w:t>
+        <w:t xml:space="preserve"> P10C-01.</w:t>
       </w:r>
     </w:p>
     <w:p>
@@ -14547,7 +13537,7 @@
         <w:rPr>
           <w:rFonts w:ascii="Calibri" w:hAnsi="Calibri" w:cs="Calibri"/>
         </w:rPr>
-        <w:t xml:space="preserve"> Default/loading/empty/error/stale/success/unsaved states, accessibility, responsive browser/E2E.</w:t>
+        <w:t xml:space="preserve"> Valid assignment and stale/unknown/role-mismatch rejection.</w:t>
       </w:r>
     </w:p>
     <w:p>
@@ -14571,7 +13561,7 @@
         <w:rPr>
           <w:rFonts w:ascii="Calibri" w:hAnsi="Calibri" w:cs="Calibri"/>
         </w:rPr>
-        <w:t xml:space="preserve"> Full CMS or exposure of implementation internals.</w:t>
+        <w:t xml:space="preserve"> Untyped uploads or hidden provenance.</w:t>
       </w:r>
     </w:p>
     <w:p>
@@ -14584,6 +13574,1046 @@
         <w:rPr>
           <w:rFonts w:ascii="Calibri" w:hAnsi="Calibri" w:cs="Calibri"/>
         </w:rPr>
+        <w:t>P10C-03 — Canonical Puck boundary</w:t>
+      </w:r>
+    </w:p>
+    <w:p>
+      <w:pPr>
+        <w:pStyle w:val="Normal"/>
+        <w:numPr>
+          <w:ilvl w:val="0"/>
+          <w:numId w:val="1"/>
+        </w:numPr>
+        <w:widowControl/>
+      </w:pPr>
+      <w:r>
+        <w:rPr>
+          <w:rFonts w:ascii="Calibri" w:hAnsi="Calibri" w:cs="Calibri"/>
+          <w:b/>
+          <w:bCs/>
+        </w:rPr>
+        <w:t>Outcome:</w:t>
+      </w:r>
+      <w:r>
+        <w:rPr>
+          <w:rFonts w:ascii="Calibri" w:hAnsi="Calibri" w:cs="Calibri"/>
+        </w:rPr>
+        <w:t xml:space="preserve"> Project registered canonical content into Puck and validate edits back into the same </w:t>
+      </w:r>
+      <w:r>
+        <w:rPr>
+          <w:rFonts w:ascii="Consolas" w:hAnsi="Consolas" w:cs="Consolas"/>
+          <w:sz w:val="19"/>
+          <w:szCs w:val="19"/>
+        </w:rPr>
+        <w:t>StorefrontSnapshot</w:t>
+      </w:r>
+      <w:r>
+        <w:rPr>
+          <w:rFonts w:ascii="Calibri" w:hAnsi="Calibri" w:cs="Calibri"/>
+        </w:rPr>
+        <w:t>.</w:t>
+      </w:r>
+    </w:p>
+    <w:p>
+      <w:pPr>
+        <w:pStyle w:val="Normal"/>
+        <w:numPr>
+          <w:ilvl w:val="0"/>
+          <w:numId w:val="1"/>
+        </w:numPr>
+        <w:widowControl/>
+      </w:pPr>
+      <w:r>
+        <w:rPr>
+          <w:rFonts w:ascii="Calibri" w:hAnsi="Calibri" w:cs="Calibri"/>
+          <w:b/>
+          <w:bCs/>
+        </w:rPr>
+        <w:t>Status:</w:t>
+      </w:r>
+      <w:r>
+        <w:rPr>
+          <w:rFonts w:ascii="Calibri" w:hAnsi="Calibri" w:cs="Calibri"/>
+        </w:rPr>
+        <w:t xml:space="preserve"> </w:t>
+      </w:r>
+      <w:r>
+        <w:rPr>
+          <w:rFonts w:ascii="Calibri" w:hAnsi="Calibri" w:cs="Calibri"/>
+          <w:b/>
+          <w:bCs/>
+        </w:rPr>
+        <w:t>Planned</w:t>
+      </w:r>
+      <w:r>
+        <w:rPr>
+          <w:rFonts w:ascii="Calibri" w:hAnsi="Calibri" w:cs="Calibri"/>
+        </w:rPr>
+        <w:t>.</w:t>
+      </w:r>
+    </w:p>
+    <w:p>
+      <w:pPr>
+        <w:pStyle w:val="Normal"/>
+        <w:numPr>
+          <w:ilvl w:val="0"/>
+          <w:numId w:val="1"/>
+        </w:numPr>
+        <w:widowControl/>
+      </w:pPr>
+      <w:r>
+        <w:rPr>
+          <w:rFonts w:ascii="Calibri" w:hAnsi="Calibri" w:cs="Calibri"/>
+          <w:b/>
+          <w:bCs/>
+        </w:rPr>
+        <w:t>Depends on:</w:t>
+      </w:r>
+      <w:r>
+        <w:rPr>
+          <w:rFonts w:ascii="Calibri" w:hAnsi="Calibri" w:cs="Calibri"/>
+        </w:rPr>
+        <w:t xml:space="preserve"> P10B component/profile authority.</w:t>
+      </w:r>
+    </w:p>
+    <w:p>
+      <w:pPr>
+        <w:pStyle w:val="Normal"/>
+        <w:numPr>
+          <w:ilvl w:val="0"/>
+          <w:numId w:val="1"/>
+        </w:numPr>
+        <w:widowControl/>
+      </w:pPr>
+      <w:r>
+        <w:rPr>
+          <w:rFonts w:ascii="Calibri" w:hAnsi="Calibri" w:cs="Calibri"/>
+          <w:b/>
+          <w:bCs/>
+        </w:rPr>
+        <w:t>Done when:</w:t>
+      </w:r>
+      <w:r>
+        <w:rPr>
+          <w:rFonts w:ascii="Calibri" w:hAnsi="Calibri" w:cs="Calibri"/>
+        </w:rPr>
+        <w:t xml:space="preserve"> The stated outcome and required evidence are accepted.</w:t>
+      </w:r>
+    </w:p>
+    <w:p>
+      <w:pPr>
+        <w:pStyle w:val="Normal"/>
+        <w:numPr>
+          <w:ilvl w:val="0"/>
+          <w:numId w:val="1"/>
+        </w:numPr>
+        <w:widowControl/>
+      </w:pPr>
+      <w:r>
+        <w:rPr>
+          <w:rFonts w:ascii="Calibri" w:hAnsi="Calibri" w:cs="Calibri"/>
+          <w:b/>
+          <w:bCs/>
+        </w:rPr>
+        <w:t>Required evidence:</w:t>
+      </w:r>
+      <w:r>
+        <w:rPr>
+          <w:rFonts w:ascii="Calibri" w:hAnsi="Calibri" w:cs="Calibri"/>
+        </w:rPr>
+        <w:t xml:space="preserve"> Adapter conformance and save/reload preservation.</w:t>
+      </w:r>
+    </w:p>
+    <w:p>
+      <w:pPr>
+        <w:pStyle w:val="Normal"/>
+        <w:numPr>
+          <w:ilvl w:val="0"/>
+          <w:numId w:val="1"/>
+        </w:numPr>
+        <w:widowControl/>
+      </w:pPr>
+      <w:r>
+        <w:rPr>
+          <w:rFonts w:ascii="Calibri" w:hAnsi="Calibri" w:cs="Calibri"/>
+          <w:b/>
+          <w:bCs/>
+        </w:rPr>
+        <w:t>Non-goal:</w:t>
+      </w:r>
+      <w:r>
+        <w:rPr>
+          <w:rFonts w:ascii="Calibri" w:hAnsi="Calibri" w:cs="Calibri"/>
+        </w:rPr>
+        <w:t xml:space="preserve"> Raw Puck persistence or a second page tree.</w:t>
+      </w:r>
+    </w:p>
+    <w:p>
+      <w:pPr>
+        <w:pStyle w:val="Heading3"/>
+        <w:keepNext/>
+        <w:widowControl/>
+      </w:pPr>
+      <w:r>
+        <w:rPr>
+          <w:rFonts w:ascii="Calibri" w:hAnsi="Calibri" w:cs="Calibri"/>
+        </w:rPr>
+        <w:t>P10C-04 — Stable frame identity and selection</w:t>
+      </w:r>
+    </w:p>
+    <w:p>
+      <w:pPr>
+        <w:pStyle w:val="Normal"/>
+        <w:numPr>
+          <w:ilvl w:val="0"/>
+          <w:numId w:val="1"/>
+        </w:numPr>
+        <w:widowControl/>
+      </w:pPr>
+      <w:r>
+        <w:rPr>
+          <w:rFonts w:ascii="Calibri" w:hAnsi="Calibri" w:cs="Calibri"/>
+          <w:b/>
+          <w:bCs/>
+        </w:rPr>
+        <w:t>Outcome:</w:t>
+      </w:r>
+      <w:r>
+        <w:rPr>
+          <w:rFonts w:ascii="Calibri" w:hAnsi="Calibri" w:cs="Calibri"/>
+        </w:rPr>
+        <w:t xml:space="preserve"> Select and edit one shared frame consistently from every page context.</w:t>
+      </w:r>
+    </w:p>
+    <w:p>
+      <w:pPr>
+        <w:pStyle w:val="Normal"/>
+        <w:numPr>
+          <w:ilvl w:val="0"/>
+          <w:numId w:val="1"/>
+        </w:numPr>
+        <w:widowControl/>
+      </w:pPr>
+      <w:r>
+        <w:rPr>
+          <w:rFonts w:ascii="Calibri" w:hAnsi="Calibri" w:cs="Calibri"/>
+          <w:b/>
+          <w:bCs/>
+        </w:rPr>
+        <w:t>Status:</w:t>
+      </w:r>
+      <w:r>
+        <w:rPr>
+          <w:rFonts w:ascii="Calibri" w:hAnsi="Calibri" w:cs="Calibri"/>
+        </w:rPr>
+        <w:t xml:space="preserve"> </w:t>
+      </w:r>
+      <w:r>
+        <w:rPr>
+          <w:rFonts w:ascii="Calibri" w:hAnsi="Calibri" w:cs="Calibri"/>
+          <w:b/>
+          <w:bCs/>
+        </w:rPr>
+        <w:t>Planned</w:t>
+      </w:r>
+      <w:r>
+        <w:rPr>
+          <w:rFonts w:ascii="Calibri" w:hAnsi="Calibri" w:cs="Calibri"/>
+        </w:rPr>
+        <w:t>.</w:t>
+      </w:r>
+    </w:p>
+    <w:p>
+      <w:pPr>
+        <w:pStyle w:val="Normal"/>
+        <w:numPr>
+          <w:ilvl w:val="0"/>
+          <w:numId w:val="1"/>
+        </w:numPr>
+        <w:widowControl/>
+      </w:pPr>
+      <w:r>
+        <w:rPr>
+          <w:rFonts w:ascii="Calibri" w:hAnsi="Calibri" w:cs="Calibri"/>
+          <w:b/>
+          <w:bCs/>
+        </w:rPr>
+        <w:t>Depends on:</w:t>
+      </w:r>
+      <w:r>
+        <w:rPr>
+          <w:rFonts w:ascii="Calibri" w:hAnsi="Calibri" w:cs="Calibri"/>
+        </w:rPr>
+        <w:t xml:space="preserve"> P10C-03.</w:t>
+      </w:r>
+    </w:p>
+    <w:p>
+      <w:pPr>
+        <w:pStyle w:val="Normal"/>
+        <w:numPr>
+          <w:ilvl w:val="0"/>
+          <w:numId w:val="1"/>
+        </w:numPr>
+        <w:widowControl/>
+      </w:pPr>
+      <w:r>
+        <w:rPr>
+          <w:rFonts w:ascii="Calibri" w:hAnsi="Calibri" w:cs="Calibri"/>
+          <w:b/>
+          <w:bCs/>
+        </w:rPr>
+        <w:t>Done when:</w:t>
+      </w:r>
+      <w:r>
+        <w:rPr>
+          <w:rFonts w:ascii="Calibri" w:hAnsi="Calibri" w:cs="Calibri"/>
+        </w:rPr>
+        <w:t xml:space="preserve"> The stated outcome and required evidence are accepted.</w:t>
+      </w:r>
+    </w:p>
+    <w:p>
+      <w:pPr>
+        <w:pStyle w:val="Normal"/>
+        <w:numPr>
+          <w:ilvl w:val="0"/>
+          <w:numId w:val="1"/>
+        </w:numPr>
+        <w:widowControl/>
+      </w:pPr>
+      <w:r>
+        <w:rPr>
+          <w:rFonts w:ascii="Calibri" w:hAnsi="Calibri" w:cs="Calibri"/>
+          <w:b/>
+          <w:bCs/>
+        </w:rPr>
+        <w:t>Required evidence:</w:t>
+      </w:r>
+      <w:r>
+        <w:rPr>
+          <w:rFonts w:ascii="Calibri" w:hAnsi="Calibri" w:cs="Calibri"/>
+        </w:rPr>
+        <w:t xml:space="preserve"> Stable identity, scope, history, and browser behavior.</w:t>
+      </w:r>
+    </w:p>
+    <w:p>
+      <w:pPr>
+        <w:pStyle w:val="Normal"/>
+        <w:numPr>
+          <w:ilvl w:val="0"/>
+          <w:numId w:val="1"/>
+        </w:numPr>
+        <w:widowControl/>
+      </w:pPr>
+      <w:r>
+        <w:rPr>
+          <w:rFonts w:ascii="Calibri" w:hAnsi="Calibri" w:cs="Calibri"/>
+          <w:b/>
+          <w:bCs/>
+        </w:rPr>
+        <w:t>Non-goal:</w:t>
+      </w:r>
+      <w:r>
+        <w:rPr>
+          <w:rFonts w:ascii="Calibri" w:hAnsi="Calibri" w:cs="Calibri"/>
+        </w:rPr>
+        <w:t xml:space="preserve"> Duplicating frame state per page.</w:t>
+      </w:r>
+    </w:p>
+    <w:p>
+      <w:pPr>
+        <w:pStyle w:val="Heading3"/>
+        <w:keepNext/>
+        <w:widowControl/>
+      </w:pPr>
+      <w:r>
+        <w:rPr>
+          <w:rFonts w:ascii="Calibri" w:hAnsi="Calibri" w:cs="Calibri"/>
+        </w:rPr>
+        <w:t>P10C-05 — Approved manual frame operations</w:t>
+      </w:r>
+    </w:p>
+    <w:p>
+      <w:pPr>
+        <w:pStyle w:val="Normal"/>
+        <w:numPr>
+          <w:ilvl w:val="0"/>
+          <w:numId w:val="1"/>
+        </w:numPr>
+        <w:widowControl/>
+      </w:pPr>
+      <w:r>
+        <w:rPr>
+          <w:rFonts w:ascii="Calibri" w:hAnsi="Calibri" w:cs="Calibri"/>
+          <w:b/>
+          <w:bCs/>
+        </w:rPr>
+        <w:t>Outcome:</w:t>
+      </w:r>
+      <w:r>
+        <w:rPr>
+          <w:rFonts w:ascii="Calibri" w:hAnsi="Calibri" w:cs="Calibri"/>
+        </w:rPr>
+        <w:t xml:space="preserve"> Support bounded manual shared-frame add, remove, reorder, field, asset, and presentation operations.</w:t>
+      </w:r>
+    </w:p>
+    <w:p>
+      <w:pPr>
+        <w:pStyle w:val="Normal"/>
+        <w:numPr>
+          <w:ilvl w:val="0"/>
+          <w:numId w:val="1"/>
+        </w:numPr>
+        <w:widowControl/>
+      </w:pPr>
+      <w:r>
+        <w:rPr>
+          <w:rFonts w:ascii="Calibri" w:hAnsi="Calibri" w:cs="Calibri"/>
+          <w:b/>
+          <w:bCs/>
+        </w:rPr>
+        <w:t>Status:</w:t>
+      </w:r>
+      <w:r>
+        <w:rPr>
+          <w:rFonts w:ascii="Calibri" w:hAnsi="Calibri" w:cs="Calibri"/>
+        </w:rPr>
+        <w:t xml:space="preserve"> </w:t>
+      </w:r>
+      <w:r>
+        <w:rPr>
+          <w:rFonts w:ascii="Calibri" w:hAnsi="Calibri" w:cs="Calibri"/>
+          <w:b/>
+          <w:bCs/>
+        </w:rPr>
+        <w:t>Planned</w:t>
+      </w:r>
+      <w:r>
+        <w:rPr>
+          <w:rFonts w:ascii="Calibri" w:hAnsi="Calibri" w:cs="Calibri"/>
+        </w:rPr>
+        <w:t>.</w:t>
+      </w:r>
+    </w:p>
+    <w:p>
+      <w:pPr>
+        <w:pStyle w:val="Normal"/>
+        <w:numPr>
+          <w:ilvl w:val="0"/>
+          <w:numId w:val="1"/>
+        </w:numPr>
+        <w:widowControl/>
+      </w:pPr>
+      <w:r>
+        <w:rPr>
+          <w:rFonts w:ascii="Calibri" w:hAnsi="Calibri" w:cs="Calibri"/>
+          <w:b/>
+          <w:bCs/>
+        </w:rPr>
+        <w:t>Depends on:</w:t>
+      </w:r>
+      <w:r>
+        <w:rPr>
+          <w:rFonts w:ascii="Calibri" w:hAnsi="Calibri" w:cs="Calibri"/>
+        </w:rPr>
+        <w:t xml:space="preserve"> P10C-02 through P10C-04.</w:t>
+      </w:r>
+    </w:p>
+    <w:p>
+      <w:pPr>
+        <w:pStyle w:val="Normal"/>
+        <w:numPr>
+          <w:ilvl w:val="0"/>
+          <w:numId w:val="1"/>
+        </w:numPr>
+        <w:widowControl/>
+      </w:pPr>
+      <w:r>
+        <w:rPr>
+          <w:rFonts w:ascii="Calibri" w:hAnsi="Calibri" w:cs="Calibri"/>
+          <w:b/>
+          <w:bCs/>
+        </w:rPr>
+        <w:t>Done when:</w:t>
+      </w:r>
+      <w:r>
+        <w:rPr>
+          <w:rFonts w:ascii="Calibri" w:hAnsi="Calibri" w:cs="Calibri"/>
+        </w:rPr>
+        <w:t xml:space="preserve"> The stated outcome and required evidence are accepted.</w:t>
+      </w:r>
+    </w:p>
+    <w:p>
+      <w:pPr>
+        <w:pStyle w:val="Normal"/>
+        <w:numPr>
+          <w:ilvl w:val="0"/>
+          <w:numId w:val="1"/>
+        </w:numPr>
+        <w:widowControl/>
+      </w:pPr>
+      <w:r>
+        <w:rPr>
+          <w:rFonts w:ascii="Calibri" w:hAnsi="Calibri" w:cs="Calibri"/>
+          <w:b/>
+          <w:bCs/>
+        </w:rPr>
+        <w:t>Required evidence:</w:t>
+      </w:r>
+      <w:r>
+        <w:rPr>
+          <w:rFonts w:ascii="Calibri" w:hAnsi="Calibri" w:cs="Calibri"/>
+        </w:rPr>
+        <w:t xml:space="preserve"> Positive and fail-closed integration, undo/redo, browser/E2E.</w:t>
+      </w:r>
+    </w:p>
+    <w:p>
+      <w:pPr>
+        <w:pStyle w:val="Normal"/>
+        <w:numPr>
+          <w:ilvl w:val="0"/>
+          <w:numId w:val="1"/>
+        </w:numPr>
+        <w:widowControl/>
+      </w:pPr>
+      <w:r>
+        <w:rPr>
+          <w:rFonts w:ascii="Calibri" w:hAnsi="Calibri" w:cs="Calibri"/>
+          <w:b/>
+          <w:bCs/>
+        </w:rPr>
+        <w:t>Non-goal:</w:t>
+      </w:r>
+      <w:r>
+        <w:rPr>
+          <w:rFonts w:ascii="Calibri" w:hAnsi="Calibri" w:cs="Calibri"/>
+        </w:rPr>
+        <w:t xml:space="preserve"> Arbitrary code/CSS/components or commerce mutation.</w:t>
+      </w:r>
+    </w:p>
+    <w:p>
+      <w:pPr>
+        <w:pStyle w:val="Heading3"/>
+        <w:keepNext/>
+        <w:widowControl/>
+      </w:pPr>
+      <w:r>
+        <w:rPr>
+          <w:rFonts w:ascii="Calibri" w:hAnsi="Calibri" w:cs="Calibri"/>
+        </w:rPr>
+        <w:t>P10C-06 — Scoped AI editing</w:t>
+      </w:r>
+    </w:p>
+    <w:p>
+      <w:pPr>
+        <w:pStyle w:val="Normal"/>
+        <w:numPr>
+          <w:ilvl w:val="0"/>
+          <w:numId w:val="1"/>
+        </w:numPr>
+        <w:widowControl/>
+      </w:pPr>
+      <w:r>
+        <w:rPr>
+          <w:rFonts w:ascii="Calibri" w:hAnsi="Calibri" w:cs="Calibri"/>
+          <w:b/>
+          <w:bCs/>
+        </w:rPr>
+        <w:t>Outcome:</w:t>
+      </w:r>
+      <w:r>
+        <w:rPr>
+          <w:rFonts w:ascii="Calibri" w:hAnsi="Calibri" w:cs="Calibri"/>
+        </w:rPr>
+        <w:t xml:space="preserve"> Connect merchant routing, clarification, frame/page scope, and proposal review to the existing P10A governed authorities.</w:t>
+      </w:r>
+    </w:p>
+    <w:p>
+      <w:pPr>
+        <w:pStyle w:val="Normal"/>
+        <w:numPr>
+          <w:ilvl w:val="0"/>
+          <w:numId w:val="1"/>
+        </w:numPr>
+        <w:widowControl/>
+      </w:pPr>
+      <w:r>
+        <w:rPr>
+          <w:rFonts w:ascii="Calibri" w:hAnsi="Calibri" w:cs="Calibri"/>
+          <w:b/>
+          <w:bCs/>
+        </w:rPr>
+        <w:t>Status:</w:t>
+      </w:r>
+      <w:r>
+        <w:rPr>
+          <w:rFonts w:ascii="Calibri" w:hAnsi="Calibri" w:cs="Calibri"/>
+        </w:rPr>
+        <w:t xml:space="preserve"> </w:t>
+      </w:r>
+      <w:r>
+        <w:rPr>
+          <w:rFonts w:ascii="Calibri" w:hAnsi="Calibri" w:cs="Calibri"/>
+          <w:b/>
+          <w:bCs/>
+        </w:rPr>
+        <w:t>Planned</w:t>
+      </w:r>
+      <w:r>
+        <w:rPr>
+          <w:rFonts w:ascii="Calibri" w:hAnsi="Calibri" w:cs="Calibri"/>
+        </w:rPr>
+        <w:t>.</w:t>
+      </w:r>
+    </w:p>
+    <w:p>
+      <w:pPr>
+        <w:pStyle w:val="Normal"/>
+        <w:numPr>
+          <w:ilvl w:val="0"/>
+          <w:numId w:val="1"/>
+        </w:numPr>
+        <w:widowControl/>
+      </w:pPr>
+      <w:r>
+        <w:rPr>
+          <w:rFonts w:ascii="Calibri" w:hAnsi="Calibri" w:cs="Calibri"/>
+          <w:b/>
+          <w:bCs/>
+        </w:rPr>
+        <w:t>Depends on:</w:t>
+      </w:r>
+      <w:r>
+        <w:rPr>
+          <w:rFonts w:ascii="Calibri" w:hAnsi="Calibri" w:cs="Calibri"/>
+        </w:rPr>
+        <w:t xml:space="preserve"> P10C-03 through P10C-05 and P10A internal router/packages.</w:t>
+      </w:r>
+    </w:p>
+    <w:p>
+      <w:pPr>
+        <w:pStyle w:val="Normal"/>
+        <w:numPr>
+          <w:ilvl w:val="0"/>
+          <w:numId w:val="1"/>
+        </w:numPr>
+        <w:widowControl/>
+      </w:pPr>
+      <w:r>
+        <w:rPr>
+          <w:rFonts w:ascii="Calibri" w:hAnsi="Calibri" w:cs="Calibri"/>
+          <w:b/>
+          <w:bCs/>
+        </w:rPr>
+        <w:t>Done when:</w:t>
+      </w:r>
+      <w:r>
+        <w:rPr>
+          <w:rFonts w:ascii="Calibri" w:hAnsi="Calibri" w:cs="Calibri"/>
+        </w:rPr>
+        <w:t xml:space="preserve"> The stated outcome and required evidence are accepted.</w:t>
+      </w:r>
+    </w:p>
+    <w:p>
+      <w:pPr>
+        <w:pStyle w:val="Normal"/>
+        <w:numPr>
+          <w:ilvl w:val="0"/>
+          <w:numId w:val="1"/>
+        </w:numPr>
+        <w:widowControl/>
+      </w:pPr>
+      <w:r>
+        <w:rPr>
+          <w:rFonts w:ascii="Calibri" w:hAnsi="Calibri" w:cs="Calibri"/>
+          <w:b/>
+          <w:bCs/>
+        </w:rPr>
+        <w:t>Required evidence:</w:t>
+      </w:r>
+      <w:r>
+        <w:rPr>
+          <w:rFonts w:ascii="Calibri" w:hAnsi="Calibri" w:cs="Calibri"/>
+        </w:rPr>
+        <w:t xml:space="preserve"> Selected-section, frame, page, storefront, ambiguity, stale, and failure browser flows.</w:t>
+      </w:r>
+    </w:p>
+    <w:p>
+      <w:pPr>
+        <w:pStyle w:val="Normal"/>
+        <w:numPr>
+          <w:ilvl w:val="0"/>
+          <w:numId w:val="1"/>
+        </w:numPr>
+        <w:widowControl/>
+      </w:pPr>
+      <w:r>
+        <w:rPr>
+          <w:rFonts w:ascii="Calibri" w:hAnsi="Calibri" w:cs="Calibri"/>
+          <w:b/>
+          <w:bCs/>
+        </w:rPr>
+        <w:t>Non-goal:</w:t>
+      </w:r>
+      <w:r>
+        <w:rPr>
+          <w:rFonts w:ascii="Calibri" w:hAnsi="Calibri" w:cs="Calibri"/>
+        </w:rPr>
+        <w:t xml:space="preserve"> Rebuilding the router, packages, proposals, or provider boundary.</w:t>
+      </w:r>
+    </w:p>
+    <w:p>
+      <w:pPr>
+        <w:pStyle w:val="Heading3"/>
+        <w:keepNext/>
+        <w:widowControl/>
+      </w:pPr>
+      <w:r>
+        <w:rPr>
+          <w:rFonts w:ascii="Calibri" w:hAnsi="Calibri" w:cs="Calibri"/>
+        </w:rPr>
+        <w:t>P10C-07 — Unified AI/manual history</w:t>
+      </w:r>
+    </w:p>
+    <w:p>
+      <w:pPr>
+        <w:pStyle w:val="Normal"/>
+        <w:numPr>
+          <w:ilvl w:val="0"/>
+          <w:numId w:val="1"/>
+        </w:numPr>
+        <w:widowControl/>
+      </w:pPr>
+      <w:r>
+        <w:rPr>
+          <w:rFonts w:ascii="Calibri" w:hAnsi="Calibri" w:cs="Calibri"/>
+          <w:b/>
+          <w:bCs/>
+        </w:rPr>
+        <w:t>Outcome:</w:t>
+      </w:r>
+      <w:r>
+        <w:rPr>
+          <w:rFonts w:ascii="Calibri" w:hAnsi="Calibri" w:cs="Calibri"/>
+        </w:rPr>
+        <w:t xml:space="preserve"> Put manual and accepted AI operations into one atomic canonical undo/redo history.</w:t>
+      </w:r>
+    </w:p>
+    <w:p>
+      <w:pPr>
+        <w:pStyle w:val="Normal"/>
+        <w:numPr>
+          <w:ilvl w:val="0"/>
+          <w:numId w:val="1"/>
+        </w:numPr>
+        <w:widowControl/>
+      </w:pPr>
+      <w:r>
+        <w:rPr>
+          <w:rFonts w:ascii="Calibri" w:hAnsi="Calibri" w:cs="Calibri"/>
+          <w:b/>
+          <w:bCs/>
+        </w:rPr>
+        <w:t>Status:</w:t>
+      </w:r>
+      <w:r>
+        <w:rPr>
+          <w:rFonts w:ascii="Calibri" w:hAnsi="Calibri" w:cs="Calibri"/>
+        </w:rPr>
+        <w:t xml:space="preserve"> </w:t>
+      </w:r>
+      <w:r>
+        <w:rPr>
+          <w:rFonts w:ascii="Calibri" w:hAnsi="Calibri" w:cs="Calibri"/>
+          <w:b/>
+          <w:bCs/>
+        </w:rPr>
+        <w:t>Planned</w:t>
+      </w:r>
+      <w:r>
+        <w:rPr>
+          <w:rFonts w:ascii="Calibri" w:hAnsi="Calibri" w:cs="Calibri"/>
+        </w:rPr>
+        <w:t>.</w:t>
+      </w:r>
+    </w:p>
+    <w:p>
+      <w:pPr>
+        <w:pStyle w:val="Normal"/>
+        <w:numPr>
+          <w:ilvl w:val="0"/>
+          <w:numId w:val="1"/>
+        </w:numPr>
+        <w:widowControl/>
+      </w:pPr>
+      <w:r>
+        <w:rPr>
+          <w:rFonts w:ascii="Calibri" w:hAnsi="Calibri" w:cs="Calibri"/>
+          <w:b/>
+          <w:bCs/>
+        </w:rPr>
+        <w:t>Depends on:</w:t>
+      </w:r>
+      <w:r>
+        <w:rPr>
+          <w:rFonts w:ascii="Calibri" w:hAnsi="Calibri" w:cs="Calibri"/>
+        </w:rPr>
+        <w:t xml:space="preserve"> P10C-05, P10C-06.</w:t>
+      </w:r>
+    </w:p>
+    <w:p>
+      <w:pPr>
+        <w:pStyle w:val="Normal"/>
+        <w:numPr>
+          <w:ilvl w:val="0"/>
+          <w:numId w:val="1"/>
+        </w:numPr>
+        <w:widowControl/>
+      </w:pPr>
+      <w:r>
+        <w:rPr>
+          <w:rFonts w:ascii="Calibri" w:hAnsi="Calibri" w:cs="Calibri"/>
+          <w:b/>
+          <w:bCs/>
+        </w:rPr>
+        <w:t>Done when:</w:t>
+      </w:r>
+      <w:r>
+        <w:rPr>
+          <w:rFonts w:ascii="Calibri" w:hAnsi="Calibri" w:cs="Calibri"/>
+        </w:rPr>
+        <w:t xml:space="preserve"> The stated outcome and required evidence are accepted.</w:t>
+      </w:r>
+    </w:p>
+    <w:p>
+      <w:pPr>
+        <w:pStyle w:val="Normal"/>
+        <w:numPr>
+          <w:ilvl w:val="0"/>
+          <w:numId w:val="1"/>
+        </w:numPr>
+        <w:widowControl/>
+      </w:pPr>
+      <w:r>
+        <w:rPr>
+          <w:rFonts w:ascii="Calibri" w:hAnsi="Calibri" w:cs="Calibri"/>
+          <w:b/>
+          <w:bCs/>
+        </w:rPr>
+        <w:t>Required evidence:</w:t>
+      </w:r>
+      <w:r>
+        <w:rPr>
+          <w:rFonts w:ascii="Calibri" w:hAnsi="Calibri" w:cs="Calibri"/>
+        </w:rPr>
+        <w:t xml:space="preserve"> Mixed edits, undo/redo, save/reload, stale protection.</w:t>
+      </w:r>
+    </w:p>
+    <w:p>
+      <w:pPr>
+        <w:pStyle w:val="Normal"/>
+        <w:numPr>
+          <w:ilvl w:val="0"/>
+          <w:numId w:val="1"/>
+        </w:numPr>
+        <w:widowControl/>
+      </w:pPr>
+      <w:r>
+        <w:rPr>
+          <w:rFonts w:ascii="Calibri" w:hAnsi="Calibri" w:cs="Calibri"/>
+          <w:b/>
+          <w:bCs/>
+        </w:rPr>
+        <w:t>Non-goal:</w:t>
+      </w:r>
+      <w:r>
+        <w:rPr>
+          <w:rFonts w:ascii="Calibri" w:hAnsi="Calibri" w:cs="Calibri"/>
+        </w:rPr>
+        <w:t xml:space="preserve"> A Puck-only or AI-only history.</w:t>
+      </w:r>
+    </w:p>
+    <w:p>
+      <w:pPr>
+        <w:pStyle w:val="Heading3"/>
+        <w:keepNext/>
+        <w:widowControl/>
+      </w:pPr>
+      <w:r>
+        <w:rPr>
+          <w:rFonts w:ascii="Calibri" w:hAnsi="Calibri" w:cs="Calibri"/>
+        </w:rPr>
+        <w:t>P10C-08 — Brand and asset editor with Studio shell</w:t>
+      </w:r>
+    </w:p>
+    <w:p>
+      <w:pPr>
+        <w:pStyle w:val="Normal"/>
+        <w:numPr>
+          <w:ilvl w:val="0"/>
+          <w:numId w:val="1"/>
+        </w:numPr>
+        <w:widowControl/>
+      </w:pPr>
+      <w:r>
+        <w:rPr>
+          <w:rFonts w:ascii="Calibri" w:hAnsi="Calibri" w:cs="Calibri"/>
+          <w:b/>
+          <w:bCs/>
+        </w:rPr>
+        <w:t>Outcome:</w:t>
+      </w:r>
+      <w:r>
+        <w:rPr>
+          <w:rFonts w:ascii="Calibri" w:hAnsi="Calibri" w:cs="Calibri"/>
+        </w:rPr>
+        <w:t xml:space="preserve"> Deliver the merchant shell subset required to operate assets, canvas, review, save, preview, and publish.</w:t>
+      </w:r>
+    </w:p>
+    <w:p>
+      <w:pPr>
+        <w:pStyle w:val="Normal"/>
+        <w:numPr>
+          <w:ilvl w:val="0"/>
+          <w:numId w:val="1"/>
+        </w:numPr>
+        <w:widowControl/>
+      </w:pPr>
+      <w:r>
+        <w:rPr>
+          <w:rFonts w:ascii="Calibri" w:hAnsi="Calibri" w:cs="Calibri"/>
+          <w:b/>
+          <w:bCs/>
+        </w:rPr>
+        <w:t>Status:</w:t>
+      </w:r>
+      <w:r>
+        <w:rPr>
+          <w:rFonts w:ascii="Calibri" w:hAnsi="Calibri" w:cs="Calibri"/>
+        </w:rPr>
+        <w:t xml:space="preserve"> </w:t>
+      </w:r>
+      <w:r>
+        <w:rPr>
+          <w:rFonts w:ascii="Calibri" w:hAnsi="Calibri" w:cs="Calibri"/>
+          <w:b/>
+          <w:bCs/>
+        </w:rPr>
+        <w:t>Planned</w:t>
+      </w:r>
+      <w:r>
+        <w:rPr>
+          <w:rFonts w:ascii="Calibri" w:hAnsi="Calibri" w:cs="Calibri"/>
+        </w:rPr>
+        <w:t>.</w:t>
+      </w:r>
+    </w:p>
+    <w:p>
+      <w:pPr>
+        <w:pStyle w:val="Normal"/>
+        <w:numPr>
+          <w:ilvl w:val="0"/>
+          <w:numId w:val="1"/>
+        </w:numPr>
+        <w:widowControl/>
+      </w:pPr>
+      <w:r>
+        <w:rPr>
+          <w:rFonts w:ascii="Calibri" w:hAnsi="Calibri" w:cs="Calibri"/>
+          <w:b/>
+          <w:bCs/>
+        </w:rPr>
+        <w:t>Depends on:</w:t>
+      </w:r>
+      <w:r>
+        <w:rPr>
+          <w:rFonts w:ascii="Calibri" w:hAnsi="Calibri" w:cs="Calibri"/>
+        </w:rPr>
+        <w:t xml:space="preserve"> P10C-01 through P10C-07.</w:t>
+      </w:r>
+    </w:p>
+    <w:p>
+      <w:pPr>
+        <w:pStyle w:val="Normal"/>
+        <w:numPr>
+          <w:ilvl w:val="0"/>
+          <w:numId w:val="1"/>
+        </w:numPr>
+        <w:widowControl/>
+      </w:pPr>
+      <w:r>
+        <w:rPr>
+          <w:rFonts w:ascii="Calibri" w:hAnsi="Calibri" w:cs="Calibri"/>
+          <w:b/>
+          <w:bCs/>
+        </w:rPr>
+        <w:t>Done when:</w:t>
+      </w:r>
+      <w:r>
+        <w:rPr>
+          <w:rFonts w:ascii="Calibri" w:hAnsi="Calibri" w:cs="Calibri"/>
+        </w:rPr>
+        <w:t xml:space="preserve"> The stated outcome and required evidence are accepted.</w:t>
+      </w:r>
+    </w:p>
+    <w:p>
+      <w:pPr>
+        <w:pStyle w:val="Normal"/>
+        <w:numPr>
+          <w:ilvl w:val="0"/>
+          <w:numId w:val="1"/>
+        </w:numPr>
+        <w:widowControl/>
+      </w:pPr>
+      <w:r>
+        <w:rPr>
+          <w:rFonts w:ascii="Calibri" w:hAnsi="Calibri" w:cs="Calibri"/>
+          <w:b/>
+          <w:bCs/>
+        </w:rPr>
+        <w:t>Required evidence:</w:t>
+      </w:r>
+      <w:r>
+        <w:rPr>
+          <w:rFonts w:ascii="Calibri" w:hAnsi="Calibri" w:cs="Calibri"/>
+        </w:rPr>
+        <w:t xml:space="preserve"> Default/loading/empty/error/stale/success/unsaved states, accessibility, responsive browser/E2E.</w:t>
+      </w:r>
+    </w:p>
+    <w:p>
+      <w:pPr>
+        <w:pStyle w:val="Normal"/>
+        <w:numPr>
+          <w:ilvl w:val="0"/>
+          <w:numId w:val="1"/>
+        </w:numPr>
+        <w:widowControl/>
+      </w:pPr>
+      <w:r>
+        <w:rPr>
+          <w:rFonts w:ascii="Calibri" w:hAnsi="Calibri" w:cs="Calibri"/>
+          <w:b/>
+          <w:bCs/>
+        </w:rPr>
+        <w:t>Non-goal:</w:t>
+      </w:r>
+      <w:r>
+        <w:rPr>
+          <w:rFonts w:ascii="Calibri" w:hAnsi="Calibri" w:cs="Calibri"/>
+        </w:rPr>
+        <w:t xml:space="preserve"> Full CMS or exposure of implementation internals.</w:t>
+      </w:r>
+    </w:p>
+    <w:p>
+      <w:pPr>
+        <w:pStyle w:val="Heading3"/>
+        <w:keepNext/>
+        <w:widowControl/>
+      </w:pPr>
+      <w:r>
+        <w:rPr>
+          <w:rFonts w:ascii="Calibri" w:hAnsi="Calibri" w:cs="Calibri"/>
+        </w:rPr>
         <w:t>P10C-09 — Studio commercial QA</w:t>
       </w:r>
     </w:p>
@@ -15088,7 +15118,7 @@
         </w:rPr>
         <w:t xml:space="preserve"> </w:t>
       </w:r>
-      <w:hyperlink r:id="rIdHyperlink17" w:history="1">
+      <w:hyperlink r:id="rIdHyperlink18" w:history="1">
         <w:r>
           <w:rPr>
             <w:rFonts w:ascii="Calibri" w:hAnsi="Calibri" w:cs="Calibri"/>
@@ -15104,7 +15134,7 @@
         </w:rPr>
         <w:t xml:space="preserve"> and </w:t>
       </w:r>
-      <w:hyperlink r:id="rIdHyperlink18" w:history="1">
+      <w:hyperlink r:id="rIdHyperlink19" w:history="1">
         <w:r>
           <w:rPr>
             <w:rFonts w:ascii="Calibri" w:hAnsi="Calibri" w:cs="Calibri"/>

</xml_diff>

<commit_message>
feat: add bounded storefront synthesis
</commit_message>
<xml_diff>
--- a/docs/VESKIFY_DEVELOPMENT_DELIVERY_TRACKER_v1.3.0.docx
+++ b/docs/VESKIFY_DEVELOPMENT_DELIVERY_TRACKER_v1.3.0.docx
@@ -38,7 +38,7 @@
         <w:rPr>
           <w:rFonts w:ascii="Calibri" w:hAnsi="Calibri" w:cs="Calibri"/>
         </w:rPr>
-        <w:t>Delivery status baseline: 9 August 2026, P10B-10 collection/search, P10B-11 PDP, and P10B-12 content/support profiles</w:t>
+        <w:t>Delivery status baseline: 10 August 2026, P10B-15 bounded storefront synthesis and narrative engine</w:t>
       </w:r>
     </w:p>
     <w:p>
@@ -245,7 +245,7 @@
               <w:rPr>
                 <w:rFonts w:ascii="Calibri" w:hAnsi="Calibri" w:cs="Calibri"/>
               </w:rPr>
-              <w:t>10 August 2026, P10B-14 Premium Editorial complete-storefront vertical slice</w:t>
+              <w:t>10 August 2026, P10B-15 bounded storefront synthesis and narrative engine</w:t>
             </w:r>
           </w:p>
         </w:tc>
@@ -4651,7 +4651,7 @@
               <w:rPr>
                 <w:rFonts w:ascii="Calibri" w:hAnsi="Calibri" w:cs="Calibri"/>
               </w:rPr>
-              <w:t>☐</w:t>
+              <w:t>☑</w:t>
             </w:r>
           </w:p>
         </w:tc>
@@ -4708,7 +4708,7 @@
                 <w:b/>
                 <w:bCs/>
               </w:rPr>
-              <w:t>Planned</w:t>
+              <w:t>Baseline</w:t>
             </w:r>
           </w:p>
         </w:tc>
@@ -4762,7 +4762,7 @@
               <w:rPr>
                 <w:rFonts w:ascii="Calibri" w:hAnsi="Calibri" w:cs="Calibri"/>
               </w:rPr>
-              <w:t>Determinism, compatibility, no-partial snapshot and repetition control</w:t>
+              <w:t>25-case matrix; three complete outcomes; lifecycle; four-width browser; 480-scenario retained human review</w:t>
             </w:r>
           </w:p>
         </w:tc>
@@ -9204,7 +9204,7 @@
         <w:rPr>
           <w:rFonts w:ascii="Calibri" w:hAnsi="Calibri" w:cs="Calibri"/>
         </w:rPr>
-        <w:t xml:space="preserve">. P10B-01 through P10B-14 are </w:t>
+        <w:t xml:space="preserve">. P10B-01 through P10B-15 are </w:t>
       </w:r>
       <w:r>
         <w:rPr>
@@ -9218,7 +9218,7 @@
         <w:rPr>
           <w:rFonts w:ascii="Calibri" w:hAnsi="Calibri" w:cs="Calibri"/>
         </w:rPr>
-        <w:t xml:space="preserve">. P10B-15 through P10B-18 remain </w:t>
+        <w:t xml:space="preserve">. P10B-16 through P10B-18 remain </w:t>
       </w:r>
       <w:r>
         <w:rPr>
@@ -12481,7 +12481,7 @@
         <w:rPr>
           <w:rFonts w:ascii="Calibri" w:hAnsi="Calibri" w:cs="Calibri"/>
         </w:rPr>
-        <w:t>P10B-15 — Bounded storefront synthesis and narrative engine</w:t>
+        <w:t>P10B-15 — Bounded storefront synthesis and narrative engine — Baseline</w:t>
       </w:r>
     </w:p>
     <w:p>
@@ -12585,13 +12585,29 @@
           <w:b/>
           <w:bCs/>
         </w:rPr>
-        <w:t>Done when:</w:t>
-      </w:r>
-      <w:r>
-        <w:rPr>
-          <w:rFonts w:ascii="Calibri" w:hAnsi="Calibri" w:cs="Calibri"/>
-        </w:rPr>
-        <w:t xml:space="preserve"> Deterministic selection preserves cross-page identity, narrative adjacency/ cardinality, repetition limits, bindings/assets, and complete snapshot/lifecycle output for representative inputs.</w:t>
+        <w:t>Delivered:</w:t>
+      </w:r>
+      <w:r>
+        <w:rPr>
+          <w:rFonts w:ascii="Calibri" w:hAnsi="Calibri" w:cs="Calibri"/>
+        </w:rPr>
+        <w:t xml:space="preserve"> One versioned deterministic synthesis contract binds exact merchant, evidence, commerce, asset, Design DNA, site-map, frame, PageBlueprint/profile, component/anatomy, narrative, density, art-direction, responsive, planner, registry and recipe authority. The same approved fixture produces editorial-heavy, commerce/discovery-heavy and restrained/minimal complete 17-route stores through the existing whole-storefront proposal, snapshot, save/reload, renderer and immutable publication chain. Details are retained in </w:t>
+      </w:r>
+      <w:hyperlink r:id="rIdHyperlink18" w:history="1">
+        <w:r>
+          <w:rPr>
+            <w:rFonts w:ascii="Calibri" w:hAnsi="Calibri" w:cs="Calibri"/>
+            <w:color w:val="2E74B5"/>
+            <w:u w:val="single"/>
+          </w:rPr>
+          <w:t>P10B_15_BOUNDED_STOREFRONT_SYNTHESIS_AND_NARRATIVE_ENGINE.md</w:t>
+        </w:r>
+      </w:hyperlink>
+      <w:r>
+        <w:rPr>
+          <w:rFonts w:ascii="Calibri" w:hAnsi="Calibri" w:cs="Calibri"/>
+        </w:rPr>
+        <w:t>.</w:t>
       </w:r>
     </w:p>
     <w:p>
@@ -12639,7 +12655,7 @@
         <w:rPr>
           <w:rFonts w:ascii="Calibri" w:hAnsi="Calibri" w:cs="Calibri"/>
         </w:rPr>
-        <w:t xml:space="preserve"> Selection/compatibility/unit, proposal/compiler/lifecycle integration, no-partial- write, deterministic fingerprint inputs, and complete-store browser evidence.</w:t>
+        <w:t xml:space="preserve"> Required 25-case deterministic matrix; P10B-14 regression; three distinct complete outcomes; exact save/reload and deterministic publication; dedicated 375/768/1024/1440 browser evidence; and three passing 160-scenario retained human commercial reviews (480 scenarios).</w:t>
       </w:r>
     </w:p>
     <w:p>
@@ -12663,7 +12679,7 @@
         <w:rPr>
           <w:rFonts w:ascii="Calibri" w:hAnsi="Calibri" w:cs="Calibri"/>
         </w:rPr>
-        <w:t xml:space="preserve"> Arbitrary trees/styles or a second synthesis representation.</w:t>
+        <w:t xml:space="preserve"> Arbitrary trees/styles, a second synthesis representation, or P10B-16 duplicate/near-duplicate and direction-scale authority.</w:t>
       </w:r>
     </w:p>
     <w:p>
@@ -15118,7 +15134,7 @@
         </w:rPr>
         <w:t xml:space="preserve"> </w:t>
       </w:r>
-      <w:hyperlink r:id="rIdHyperlink18" w:history="1">
+      <w:hyperlink r:id="rIdHyperlink19" w:history="1">
         <w:r>
           <w:rPr>
             <w:rFonts w:ascii="Calibri" w:hAnsi="Calibri" w:cs="Calibri"/>
@@ -15134,7 +15150,7 @@
         </w:rPr>
         <w:t xml:space="preserve"> and </w:t>
       </w:r>
-      <w:hyperlink r:id="rIdHyperlink19" w:history="1">
+      <w:hyperlink r:id="rIdHyperlink20" w:history="1">
         <w:r>
           <w:rPr>
             <w:rFonts w:ascii="Calibri" w:hAnsi="Calibri" w:cs="Calibri"/>

</xml_diff>

<commit_message>
feat: add coordinated storefront directions
</commit_message>
<xml_diff>
--- a/docs/VESKIFY_DEVELOPMENT_DELIVERY_TRACKER_v1.3.0.docx
+++ b/docs/VESKIFY_DEVELOPMENT_DELIVERY_TRACKER_v1.3.0.docx
@@ -38,7 +38,7 @@
         <w:rPr>
           <w:rFonts w:ascii="Calibri" w:hAnsi="Calibri" w:cs="Calibri"/>
         </w:rPr>
-        <w:t>Delivery status baseline: 10 August 2026, P10B-15 bounded storefront synthesis and narrative engine</w:t>
+        <w:t>Delivery status baseline: 10 August 2026, P10B-16 coordinated directions and diversity control</w:t>
       </w:r>
     </w:p>
     <w:p>
@@ -245,7 +245,7 @@
               <w:rPr>
                 <w:rFonts w:ascii="Calibri" w:hAnsi="Calibri" w:cs="Calibri"/>
               </w:rPr>
-              <w:t>10 August 2026, P10B-15 bounded storefront synthesis and narrative engine</w:t>
+              <w:t>10 August 2026, P10B-16 coordinated directions and diversity control</w:t>
             </w:r>
           </w:p>
         </w:tc>
@@ -4786,7 +4786,7 @@
               <w:rPr>
                 <w:rFonts w:ascii="Calibri" w:hAnsi="Calibri" w:cs="Calibri"/>
               </w:rPr>
-              <w:t>☐</w:t>
+              <w:t>☑</w:t>
             </w:r>
           </w:p>
         </w:tc>
@@ -4843,7 +4843,7 @@
                 <w:b/>
                 <w:bCs/>
               </w:rPr>
-              <w:t>Planned</w:t>
+              <w:t>Baseline</w:t>
             </w:r>
           </w:p>
         </w:tc>
@@ -4897,7 +4897,7 @@
               <w:rPr>
                 <w:rFonts w:ascii="Calibri" w:hAnsi="Calibri" w:cs="Calibri"/>
               </w:rPr>
-              <w:t>Fingerprints, duplicate/near-duplicate and pairwise diversity</w:t>
+              <w:t>Three packages; nine outcomes; fingerprint/classification/repetition control; browser and retained human review</w:t>
             </w:r>
           </w:p>
         </w:tc>
@@ -9204,7 +9204,7 @@
         <w:rPr>
           <w:rFonts w:ascii="Calibri" w:hAnsi="Calibri" w:cs="Calibri"/>
         </w:rPr>
-        <w:t xml:space="preserve">. P10B-01 through P10B-15 are </w:t>
+        <w:t xml:space="preserve">. P10B-01 through P10B-16 are </w:t>
       </w:r>
       <w:r>
         <w:rPr>
@@ -9218,7 +9218,7 @@
         <w:rPr>
           <w:rFonts w:ascii="Calibri" w:hAnsi="Calibri" w:cs="Calibri"/>
         </w:rPr>
-        <w:t xml:space="preserve">. P10B-16 through P10B-18 remain </w:t>
+        <w:t xml:space="preserve">. P10B-17 and P10B-18 remain </w:t>
       </w:r>
       <w:r>
         <w:rPr>
@@ -12692,7 +12692,7 @@
         <w:rPr>
           <w:rFonts w:ascii="Calibri" w:hAnsi="Calibri" w:cs="Calibri"/>
         </w:rPr>
-        <w:t>P10B-16 — Coordinated directions and diversity control</w:t>
+        <w:t>P10B-16 — Coordinated directions and diversity control — Baseline</w:t>
       </w:r>
     </w:p>
     <w:p>
@@ -12740,7 +12740,7 @@
         <w:rPr>
           <w:rFonts w:ascii="Calibri" w:hAnsi="Calibri" w:cs="Calibri"/>
         </w:rPr>
-        <w:t xml:space="preserve"> Existing direction-selection authority plus deterministic storefront-design fingerprint/evaluation.</w:t>
+        <w:t xml:space="preserve"> Versioned Premium Editorial, Modern Technical and Minimal Commerce narrowing packages over P10B-15 plus deterministic direction/diversity fingerprint authority.</w:t>
       </w:r>
     </w:p>
     <w:p>
@@ -12782,13 +12782,13 @@
           <w:b/>
           <w:bCs/>
         </w:rPr>
-        <w:t>Done when:</w:t>
-      </w:r>
-      <w:r>
-        <w:rPr>
-          <w:rFonts w:ascii="Calibri" w:hAnsi="Calibri" w:cs="Calibri"/>
-        </w:rPr>
-        <w:t xml:space="preserve"> Fingerprints cover Design DNA, page set/profiles, frame, anatomies/variants, structural parameters, image posture, density/responsive posture, and narrative composition; exact and meaningful near duplicates fail, and pairwise stores differ materially beyond colour.</w:t>
+        <w:t>Done:</w:t>
+      </w:r>
+      <w:r>
+        <w:rPr>
+          <w:rFonts w:ascii="Calibri" w:hAnsi="Calibri" w:cs="Calibri"/>
+        </w:rPr>
+        <w:t xml:space="preserve"> Three canonical packages validate current Design DNA/profile/frame/anatomy/page/evidence references and drive the canonical proposal/snapshot lifecycle. Fingerprints cover Design DNA, page set/profiles, frame, anatomies/variants, bounded parameters, image posture, density/responsive posture and narrative composition; comparison classifies exact, palette-only, shallow, near and material outcomes; repetition control fails closed when novelty is exhausted.</w:t>
       </w:r>
     </w:p>
     <w:p>
@@ -12836,7 +12836,23 @@
         <w:rPr>
           <w:rFonts w:ascii="Calibri" w:hAnsi="Calibri" w:cs="Calibri"/>
         </w:rPr>
-        <w:t xml:space="preserve"> Determinism, exact/near-duplicate fixtures, pairwise structural scoring, direction compatibility, complete-store generation, and representative visual evidence.</w:t>
+        <w:t xml:space="preserve"> 31 focused unit/integration cases; nine representative complete outcomes; exact save/reload and compiled publication; protected commerce/evidence/media parity; dedicated 375/768/1024/1440 browser coverage; three retained human commercial reviews and one exact evidence manifest. See </w:t>
+      </w:r>
+      <w:hyperlink r:id="rIdHyperlink19" w:history="1">
+        <w:r>
+          <w:rPr>
+            <w:rFonts w:ascii="Calibri" w:hAnsi="Calibri" w:cs="Calibri"/>
+            <w:color w:val="2E74B5"/>
+            <w:u w:val="single"/>
+          </w:rPr>
+          <w:t>P10B_16_COORDINATED_DIRECTIONS_AND_DIVERSITY_CONTROL.md</w:t>
+        </w:r>
+      </w:hyperlink>
+      <w:r>
+        <w:rPr>
+          <w:rFonts w:ascii="Calibri" w:hAnsi="Calibri" w:cs="Calibri"/>
+        </w:rPr>
+        <w:t>.</w:t>
       </w:r>
     </w:p>
     <w:p>
@@ -15134,7 +15150,7 @@
         </w:rPr>
         <w:t xml:space="preserve"> </w:t>
       </w:r>
-      <w:hyperlink r:id="rIdHyperlink19" w:history="1">
+      <w:hyperlink r:id="rIdHyperlink20" w:history="1">
         <w:r>
           <w:rPr>
             <w:rFonts w:ascii="Calibri" w:hAnsi="Calibri" w:cs="Calibri"/>
@@ -15150,7 +15166,7 @@
         </w:rPr>
         <w:t xml:space="preserve"> and </w:t>
       </w:r>
-      <w:hyperlink r:id="rIdHyperlink20" w:history="1">
+      <w:hyperlink r:id="rIdHyperlink21" w:history="1">
         <w:r>
           <w:rPr>
             <w:rFonts w:ascii="Calibri" w:hAnsi="Calibri" w:cs="Calibri"/>

</xml_diff>

<commit_message>
feat: compile prompted storefront design intents
</commit_message>
<xml_diff>
--- a/docs/VESKIFY_DEVELOPMENT_DELIVERY_TRACKER_v1.3.0.docx
+++ b/docs/VESKIFY_DEVELOPMENT_DELIVERY_TRACKER_v1.3.0.docx
@@ -245,7 +245,7 @@
               <w:rPr>
                 <w:rFonts w:ascii="Calibri" w:hAnsi="Calibri" w:cs="Calibri"/>
               </w:rPr>
-              <w:t>11 August 2026, P10B-16P-02A prompted Storefront Design Intent V2 authority</w:t>
+              <w:t>12 August 2026, P10B-16P-02B deterministic design-intent compiler and canonical proposal materialization</w:t>
             </w:r>
           </w:p>
         </w:tc>
@@ -5247,7 +5247,7 @@
               <w:rPr>
                 <w:rFonts w:ascii="Calibri" w:hAnsi="Calibri" w:cs="Calibri"/>
               </w:rPr>
-              <w:t>☐</w:t>
+              <w:t>☑</w:t>
             </w:r>
           </w:p>
         </w:tc>
@@ -5304,7 +5304,7 @@
                 <w:b/>
                 <w:bCs/>
               </w:rPr>
-              <w:t>Partial</w:t>
+              <w:t>Baseline</w:t>
             </w:r>
           </w:p>
         </w:tc>
@@ -5358,7 +5358,7 @@
               <w:rPr>
                 <w:rFonts w:ascii="Calibri" w:hAnsi="Calibri" w:cs="Calibri"/>
               </w:rPr>
-              <w:t>Part A strict intent/mock evidence plus Part B deterministic compiler and no-partial lifecycle evidence</w:t>
+              <w:t>Strict intent/mock evidence, bounded metadata compiler, exact current-authority synthesis/proposal and no-partial lifecycle evidence</w:t>
             </w:r>
           </w:p>
         </w:tc>
@@ -5517,7 +5517,7 @@
               <w:rPr>
                 <w:rFonts w:ascii="Calibri" w:hAnsi="Calibri" w:cs="Calibri"/>
               </w:rPr>
-              <w:t>☐</w:t>
+              <w:t>☑</w:t>
             </w:r>
           </w:p>
         </w:tc>
@@ -5574,7 +5574,7 @@
                 <w:b/>
                 <w:bCs/>
               </w:rPr>
-              <w:t>Planned</w:t>
+              <w:t>Baseline</w:t>
             </w:r>
           </w:p>
         </w:tc>
@@ -5628,7 +5628,7 @@
               <w:rPr>
                 <w:rFonts w:ascii="Calibri" w:hAnsi="Calibri" w:cs="Calibri"/>
               </w:rPr>
-              <w:t>Exact refreshed-authority resolution, deterministic compilation, stale/incompatible/no-partial rejection</w:t>
+              <w:t>Exact refreshed-authority resolution, bounded metadata compilation, canonical one-shot synthesis/proposal, diagnostics and stale/incompatible/no-partial rejection</w:t>
             </w:r>
           </w:p>
         </w:tc>
@@ -10396,7 +10396,7 @@
         <w:rPr>
           <w:rFonts w:ascii="Calibri" w:hAnsi="Calibri" w:cs="Calibri"/>
         </w:rPr>
-        <w:t xml:space="preserve">. P10B-01 through P10B-16, P10B-16P-01, and P10B-16P-02A are </w:t>
+        <w:t xml:space="preserve">. P10B-01 through P10B-16 and P10B-16P-01 through P10B-16P-02B are </w:t>
       </w:r>
       <w:r>
         <w:rPr>
@@ -10418,13 +10418,13 @@
           <w:b/>
           <w:bCs/>
         </w:rPr>
-        <w:t>Partial</w:t>
-      </w:r>
-      <w:r>
-        <w:rPr>
-          <w:rFonts w:ascii="Calibri" w:hAnsi="Calibri" w:cs="Calibri"/>
-        </w:rPr>
-        <w:t xml:space="preserve">. P10B-16P-02B, P10B-16P-03, P10B-16P-04, P10B-17, and P10B-18 remain </w:t>
+        <w:t>Baseline</w:t>
+      </w:r>
+      <w:r>
+        <w:rPr>
+          <w:rFonts w:ascii="Calibri" w:hAnsi="Calibri" w:cs="Calibri"/>
+        </w:rPr>
+        <w:t xml:space="preserve">. P10B-16P-03, P10B-16P-04, P10B-17, and P10B-18 remain </w:t>
       </w:r>
       <w:r>
         <w:rPr>
@@ -14414,13 +14414,13 @@
           <w:b/>
           <w:bCs/>
         </w:rPr>
-        <w:t>Partial</w:t>
-      </w:r>
-      <w:r>
-        <w:rPr>
-          <w:rFonts w:ascii="Calibri" w:hAnsi="Calibri" w:cs="Calibri"/>
-        </w:rPr>
-        <w:t>; Part A is Baseline and Part B remains Planned.</w:t>
+        <w:t>Baseline</w:t>
+      </w:r>
+      <w:r>
+        <w:rPr>
+          <w:rFonts w:ascii="Calibri" w:hAnsi="Calibri" w:cs="Calibri"/>
+        </w:rPr>
+        <w:t>; Part A and Part B are Baseline.</w:t>
       </w:r>
     </w:p>
     <w:p>
@@ -14716,7 +14716,7 @@
         <w:rPr>
           <w:rFonts w:ascii="Calibri" w:hAnsi="Calibri" w:cs="Calibri"/>
         </w:rPr>
-        <w:t>P10B-16P-02B — Deterministic design-intent compiler</w:t>
+        <w:t>P10B-16P-02B — Deterministic design-intent compiler — Baseline</w:t>
       </w:r>
     </w:p>
     <w:p>
@@ -14772,13 +14772,13 @@
           <w:b/>
           <w:bCs/>
         </w:rPr>
-        <w:t>Planned</w:t>
-      </w:r>
-      <w:r>
-        <w:rPr>
-          <w:rFonts w:ascii="Calibri" w:hAnsi="Calibri" w:cs="Calibri"/>
-        </w:rPr>
-        <w:t>.</w:t>
+        <w:t>Baseline</w:t>
+      </w:r>
+      <w:r>
+        <w:rPr>
+          <w:rFonts w:ascii="Calibri" w:hAnsi="Calibri" w:cs="Calibri"/>
+        </w:rPr>
+        <w:t>. Completed 12 August 2026 with zero provider and Vesko calls.</w:t>
       </w:r>
     </w:p>
     <w:p>
@@ -14820,27 +14820,37 @@
           <w:b/>
           <w:bCs/>
         </w:rPr>
-        <w:t>Done when:</w:t>
-      </w:r>
-      <w:r>
-        <w:rPr>
-          <w:rFonts w:ascii="Calibri" w:hAnsi="Calibri" w:cs="Calibri"/>
-        </w:rPr>
-        <w:t xml:space="preserve"> Hard constraints are exact, soft/optional preferences are resolved predictably, unavailable/stale/incompatible authority creates no partial result, and the compiled result preserves protected commerce, </w:t>
-      </w:r>
-      <w:r>
-        <w:rPr>
-          <w:rFonts w:ascii="Consolas" w:hAnsi="Consolas" w:cs="Consolas"/>
-          <w:sz w:val="19"/>
-          <w:szCs w:val="19"/>
-        </w:rPr>
-        <w:t>StorefrontSnapshot</w:t>
-      </w:r>
-      <w:r>
-        <w:rPr>
-          <w:rFonts w:ascii="Calibri" w:hAnsi="Calibri" w:cs="Calibri"/>
-        </w:rPr>
-        <w:t>, proposal, lifecycle and fingerprints.</w:t>
+        <w:t>Done:</w:t>
+      </w:r>
+      <w:r>
+        <w:rPr>
+          <w:rFonts w:ascii="Calibri" w:hAnsi="Calibri" w:cs="Calibri"/>
+        </w:rPr>
+        <w:t xml:space="preserve"> Exact authority is refreshed before compilation; a bounded metadata-only solver applies hard/ranked-soft/optional/avoidance semantics and a material-intent gate; the strict transient decision records exact Design DNA, frame, PageBlueprint, dynamic-commerce, component/variant/ bounded-parameter, narrative, responsive/art and evidence/asset resolution with diagnostics and deterministic fingerprints; one successful decision extends canonical synthesis and creates one isolated proposal while failures leave snapshot/history/proposal state unchanged.</w:t>
+      </w:r>
+    </w:p>
+    <w:p>
+      <w:pPr>
+        <w:pStyle w:val="Normal"/>
+        <w:numPr>
+          <w:ilvl w:val="0"/>
+          <w:numId w:val="1"/>
+        </w:numPr>
+        <w:widowControl/>
+      </w:pPr>
+      <w:r>
+        <w:rPr>
+          <w:rFonts w:ascii="Calibri" w:hAnsi="Calibri" w:cs="Calibri"/>
+          <w:b/>
+          <w:bCs/>
+        </w:rPr>
+        <w:t>Evidence:</w:t>
+      </w:r>
+      <w:r>
+        <w:rPr>
+          <w:rFonts w:ascii="Calibri" w:hAnsi="Calibri" w:cs="Calibri"/>
+        </w:rPr>
+        <w:t xml:space="preserve"> Contract/schema, deterministic unit and integration across exact synthesis, PageBlueprint/profile materialization, dynamic archetypes/product-type mappings, proposal lifecycle, protected commerce and no-partial rejection; zero provider and Vesko calls.</w:t>
       </w:r>
     </w:p>
     <w:p>

</xml_diff>

<commit_message>
feat: add Studio prompted storefront generation
</commit_message>
<xml_diff>
--- a/docs/VESKIFY_DEVELOPMENT_DELIVERY_TRACKER_v1.3.0.docx
+++ b/docs/VESKIFY_DEVELOPMENT_DELIVERY_TRACKER_v1.3.0.docx
@@ -38,7 +38,7 @@
         <w:rPr>
           <w:rFonts w:ascii="Calibri" w:hAnsi="Calibri" w:cs="Calibri"/>
         </w:rPr>
-        <w:t>Delivery status baseline: 12 August 2026, P10B-16P-02B deterministic design-intent compiler and canonical proposal materialization</w:t>
+        <w:t>Delivery status baseline: 12 August 2026, P10B-16P-03 Storefront Studio prompted generation journey</w:t>
       </w:r>
     </w:p>
     <w:p>
@@ -245,7 +245,7 @@
               <w:rPr>
                 <w:rFonts w:ascii="Calibri" w:hAnsi="Calibri" w:cs="Calibri"/>
               </w:rPr>
-              <w:t>12 August 2026, P10B-16P-02B deterministic design-intent compiler and canonical proposal materialization</w:t>
+              <w:t>12 August 2026, P10B-16P-03 Storefront Studio prompted generation journey</w:t>
             </w:r>
           </w:p>
         </w:tc>
@@ -5652,7 +5652,7 @@
               <w:rPr>
                 <w:rFonts w:ascii="Calibri" w:hAnsi="Calibri" w:cs="Calibri"/>
               </w:rPr>
-              <w:t>☐</w:t>
+              <w:t>☑</w:t>
             </w:r>
           </w:p>
         </w:tc>
@@ -5709,7 +5709,7 @@
                 <w:b/>
                 <w:bCs/>
               </w:rPr>
-              <w:t>Planned</w:t>
+              <w:t>Baseline</w:t>
             </w:r>
           </w:p>
         </w:tc>
@@ -5763,7 +5763,7 @@
               <w:rPr>
                 <w:rFonts w:ascii="Calibri" w:hAnsi="Calibri" w:cs="Calibri"/>
               </w:rPr>
-              <w:t>Merchant-language integration, proposal lifecycle, browser/E2E and save/publish boundary evidence</w:t>
+              <w:t>Standalone/mock authority; integrated auth fail-closed; one registered operation; exact source/lineage/evidence; full mocked lifecycle and browser/E2E</w:t>
             </w:r>
           </w:p>
         </w:tc>
@@ -6089,7 +6089,7 @@
               <w:rPr>
                 <w:rFonts w:ascii="Calibri" w:hAnsi="Calibri" w:cs="Calibri"/>
               </w:rPr>
-              <w:t>Separately authorized real-provider V2 evidence and explicit P10B-16L bridge disposition</w:t>
+              <w:t>Injected authenticated tenant/project authority, separately authorized real-provider V2 evidence and explicit P10B-16L bridge disposition</w:t>
             </w:r>
           </w:p>
         </w:tc>
@@ -10396,7 +10396,7 @@
         <w:rPr>
           <w:rFonts w:ascii="Calibri" w:hAnsi="Calibri" w:cs="Calibri"/>
         </w:rPr>
-        <w:t xml:space="preserve">. P10B-01 through P10B-16 and P10B-16P-01 through P10B-16P-02B are </w:t>
+        <w:t xml:space="preserve">. P10B-01 through P10B-16 and P10B-16P-01 through P10B-16P-03 are </w:t>
       </w:r>
       <w:r>
         <w:rPr>
@@ -10424,7 +10424,7 @@
         <w:rPr>
           <w:rFonts w:ascii="Calibri" w:hAnsi="Calibri" w:cs="Calibri"/>
         </w:rPr>
-        <w:t xml:space="preserve">. P10B-16P-03, P10B-16P-04, P10B-17, and P10B-18 remain </w:t>
+        <w:t xml:space="preserve">. P10B-16P-04, P10B-17, and P10B-18 remain </w:t>
       </w:r>
       <w:r>
         <w:rPr>
@@ -14943,13 +14943,13 @@
           <w:b/>
           <w:bCs/>
         </w:rPr>
-        <w:t>Planned</w:t>
-      </w:r>
-      <w:r>
-        <w:rPr>
-          <w:rFonts w:ascii="Calibri" w:hAnsi="Calibri" w:cs="Calibri"/>
-        </w:rPr>
-        <w:t>.</w:t>
+        <w:t>Baseline</w:t>
+      </w:r>
+      <w:r>
+        <w:rPr>
+          <w:rFonts w:ascii="Calibri" w:hAnsi="Calibri" w:cs="Calibri"/>
+        </w:rPr>
+        <w:t>. Completed 12 August 2026 with mocked providers and zero real-provider or Vesko calls.</w:t>
       </w:r>
     </w:p>
     <w:p>
@@ -14991,13 +14991,65 @@
           <w:b/>
           <w:bCs/>
         </w:rPr>
-        <w:t>Done when:</w:t>
-      </w:r>
-      <w:r>
-        <w:rPr>
-          <w:rFonts w:ascii="Calibri" w:hAnsi="Calibri" w:cs="Calibri"/>
-        </w:rPr>
-        <w:t xml:space="preserve"> Storefront Studio invokes current plan authority, presents bounded review, preserves accept/reject/undo/redo and save/publish separation, and passes browser/E2E and retained review without another snapshot or bypass.</w:t>
+        <w:t>Done:</w:t>
+      </w:r>
+      <w:r>
+        <w:rPr>
+          <w:rFonts w:ascii="Calibri" w:hAnsi="Calibri" w:cs="Calibri"/>
+        </w:rPr>
+        <w:t xml:space="preserve"> Normal Storefront Studio opens an idempotently seeded raw Karvonen project with no request on load; an explicit Generate action sends the exact prompt and compact current identity to one server route; standalone/mock server-owned current authority invokes one mocked Design Intent V2 provider attempt and P10B-16P-02B once; one registered </w:t>
+      </w:r>
+      <w:r>
+        <w:rPr>
+          <w:rFonts w:ascii="Consolas" w:hAnsi="Consolas" w:cs="Consolas"/>
+          <w:sz w:val="19"/>
+          <w:szCs w:val="19"/>
+        </w:rPr>
+        <w:t>APPLY_CANONICAL_WHOLE_STOREFRONT_GENERATION</w:t>
+      </w:r>
+      <w:r>
+        <w:rPr>
+          <w:rFonts w:ascii="Calibri" w:hAnsi="Calibri" w:cs="Calibri"/>
+        </w:rPr>
+        <w:t xml:space="preserve"> operation with the target-bound </w:t>
+      </w:r>
+      <w:r>
+        <w:rPr>
+          <w:rFonts w:ascii="Consolas" w:hAnsi="Consolas" w:cs="Consolas"/>
+          <w:sz w:val="19"/>
+          <w:szCs w:val="19"/>
+        </w:rPr>
+        <w:t>compilePromptedStorefrontDesignIntentV2@2.0.0</w:t>
+      </w:r>
+      <w:r>
+        <w:rPr>
+          <w:rFonts w:ascii="Calibri" w:hAnsi="Calibri" w:cs="Calibri"/>
+        </w:rPr>
+        <w:t xml:space="preserve"> permission cross-binds the exact P02B source-proposal fingerprint and compiler lineage; one isolated proposal supports homepage, representative dynamic collection/PDP, content and utility review with current approved evidence references; Reject and Generate another preserve the draft; Accept commits one atomic unsaved change; Undo/Redo, Save/reload and normal dynamic-route Preview preserve the exact result. Current content/support evidence is independently resolved from trusted server authority and checked against retained snapshot provenance; snapshots never authorize themselves. Integrated requests without injected authenticated tenant/project and evidence authority fail closed before provider selection. Failures and stale/late responses cause no draft/history mutation and no retry or fallback. Search execution remains explicitly unavailable.</w:t>
+      </w:r>
+    </w:p>
+    <w:p>
+      <w:pPr>
+        <w:pStyle w:val="Normal"/>
+        <w:numPr>
+          <w:ilvl w:val="0"/>
+          <w:numId w:val="1"/>
+        </w:numPr>
+        <w:widowControl/>
+      </w:pPr>
+      <w:r>
+        <w:rPr>
+          <w:rFonts w:ascii="Calibri" w:hAnsi="Calibri" w:cs="Calibri"/>
+          <w:b/>
+          <w:bCs/>
+        </w:rPr>
+        <w:t>Evidence:</w:t>
+      </w:r>
+      <w:r>
+        <w:rPr>
+          <w:rFonts w:ascii="Calibri" w:hAnsi="Calibri" w:cs="Calibri"/>
+        </w:rPr>
+        <w:t xml:space="preserve"> Contract/schema, deterministic unit, integration, dedicated mocked browser/E2E at 375/768/1024/1440 and focused lifecycle/persistence/preview regressions. No real-provider or human commercial-quality claim.</w:t>
       </w:r>
     </w:p>
     <w:p>
@@ -15021,7 +15073,7 @@
         <w:rPr>
           <w:rFonts w:ascii="Calibri" w:hAnsi="Calibri" w:cs="Calibri"/>
         </w:rPr>
-        <w:t xml:space="preserve"> P10C general manual/scoped editing implementation.</w:t>
+        <w:t xml:space="preserve"> Live V2 provider evidence, P10B-16L disposition, executable search, P10C general manual/scoped editing, publication, or commercial-quality closure.</w:t>
       </w:r>
     </w:p>
     <w:p>
@@ -15144,7 +15196,7 @@
         <w:rPr>
           <w:rFonts w:ascii="Calibri" w:hAnsi="Calibri" w:cs="Calibri"/>
         </w:rPr>
-        <w:t xml:space="preserve"> The provider receives capability knowledge before any complete-store execution, returns a strict intent, current authority compiles it through normal Studio proposal review, and safe retained evidence proves call/retry limits, lifecycle, protection and bridge disposition.</w:t>
+        <w:t xml:space="preserve"> The provider receives capability knowledge before any complete-store execution, authenticated tenant/project-backed current authority is injected before provider selection, the provider returns a strict intent, current authority compiles it through normal Studio proposal review, and safe retained evidence proves call/retry limits, lifecycle, protection and bridge disposition.</w:t>
       </w:r>
     </w:p>
     <w:p>

</xml_diff>

<commit_message>
refactor: rationalise prompted storefront generation
</commit_message>
<xml_diff>
--- a/docs/VESKIFY_DEVELOPMENT_DELIVERY_TRACKER_v1.3.0.docx
+++ b/docs/VESKIFY_DEVELOPMENT_DELIVERY_TRACKER_v1.3.0.docx
@@ -38,7 +38,7 @@
         <w:rPr>
           <w:rFonts w:ascii="Calibri" w:hAnsi="Calibri" w:cs="Calibri"/>
         </w:rPr>
-        <w:t>Delivery status baseline: 15 August 2026, P10B-16P-04 real Storefront Studio Design Intent acceptance</w:t>
+        <w:t>Delivery status baseline: 15 August 2026, P10B-16P-05A active production-path and compiler rationalisation</w:t>
       </w:r>
     </w:p>
     <w:p>
@@ -245,7 +245,7 @@
               <w:rPr>
                 <w:rFonts w:ascii="Calibri" w:hAnsi="Calibri" w:cs="Calibri"/>
               </w:rPr>
-              <w:t>15 August 2026, P10B-16P-04 real Studio Design Intent V2 acceptance</w:t>
+              <w:t>15 August 2026, P10B-16P-05A active production-path and compiler rationalisation</w:t>
             </w:r>
           </w:p>
         </w:tc>
@@ -5540,7 +5540,7 @@
               <w:rPr>
                 <w:rFonts w:ascii="Calibri" w:hAnsi="Calibri" w:cs="Calibri"/>
               </w:rPr>
-              <w:t>☐</w:t>
+              <w:t>☑</w:t>
             </w:r>
           </w:p>
         </w:tc>
@@ -5558,7 +5558,7 @@
               <w:rPr>
                 <w:rFonts w:ascii="Calibri" w:hAnsi="Calibri" w:cs="Calibri"/>
               </w:rPr>
-              <w:t>P10B-17</w:t>
+              <w:t>P10B-16P-05A</w:t>
             </w:r>
           </w:p>
         </w:tc>
@@ -5576,7 +5576,7 @@
               <w:rPr>
                 <w:rFonts w:ascii="Calibri" w:hAnsi="Calibri" w:cs="Calibri"/>
               </w:rPr>
-              <w:t>Responsive, accessibility and performance closure</w:t>
+              <w:t>Active production-path and compiler rationalisation</w:t>
             </w:r>
           </w:p>
         </w:tc>
@@ -5597,7 +5597,7 @@
                 <w:b/>
                 <w:bCs/>
               </w:rPr>
-              <w:t>Planned</w:t>
+              <w:t>Baseline</w:t>
             </w:r>
           </w:p>
         </w:tc>
@@ -5615,7 +5615,7 @@
               <w:rPr>
                 <w:rFonts w:ascii="Calibri" w:hAnsi="Calibri" w:cs="Calibri"/>
               </w:rPr>
-              <w:t>Design system and QA</w:t>
+              <w:t>Generation route/compiler</w:t>
             </w:r>
           </w:p>
         </w:tc>
@@ -5633,7 +5633,7 @@
               <w:rPr>
                 <w:rFonts w:ascii="Calibri" w:hAnsi="Calibri" w:cs="Calibri"/>
               </w:rPr>
-              <w:t>P10B-16P-04 and implemented families</w:t>
+              <w:t>P10B-16P-04</w:t>
             </w:r>
           </w:p>
         </w:tc>
@@ -5651,7 +5651,7 @@
               <w:rPr>
                 <w:rFonts w:ascii="Calibri" w:hAnsi="Calibri" w:cs="Calibri"/>
               </w:rPr>
-              <w:t>Four-width EN/FI geometry, a11y, performance and visual evidence</w:t>
+              <w:t>One semantic initial-generation composition; one coordinator/resolver/decision/executor chain; A/B/C replay; migration/publication/protected-state regressions</w:t>
             </w:r>
           </w:p>
         </w:tc>
@@ -5693,7 +5693,7 @@
               <w:rPr>
                 <w:rFonts w:ascii="Calibri" w:hAnsi="Calibri" w:cs="Calibri"/>
               </w:rPr>
-              <w:t>P10B-18</w:t>
+              <w:t>P10B-17</w:t>
             </w:r>
           </w:p>
         </w:tc>
@@ -5711,7 +5711,7 @@
               <w:rPr>
                 <w:rFonts w:ascii="Calibri" w:hAnsi="Calibri" w:cs="Calibri"/>
               </w:rPr>
-              <w:t>Commercial quality and scale gate</w:t>
+              <w:t>Responsive, accessibility and performance closure</w:t>
             </w:r>
           </w:p>
         </w:tc>
@@ -5750,6 +5750,141 @@
               <w:rPr>
                 <w:rFonts w:ascii="Calibri" w:hAnsi="Calibri" w:cs="Calibri"/>
               </w:rPr>
+              <w:t>Design system and QA</w:t>
+            </w:r>
+          </w:p>
+        </w:tc>
+        <w:tc>
+          <w:tcPr>
+            <w:tcW w:w="2500" w:type="dxa"/>
+            <w:vAlign w:val="center"/>
+          </w:tcPr>
+          <w:p>
+            <w:pPr>
+              <w:pStyle w:val="CompactTableText"/>
+              <w:widowControl/>
+            </w:pPr>
+            <w:r>
+              <w:rPr>
+                <w:rFonts w:ascii="Calibri" w:hAnsi="Calibri" w:cs="Calibri"/>
+              </w:rPr>
+              <w:t>P10B-16P-05A and implemented families</w:t>
+            </w:r>
+          </w:p>
+        </w:tc>
+        <w:tc>
+          <w:tcPr>
+            <w:tcW w:w="2890" w:type="dxa"/>
+            <w:vAlign w:val="center"/>
+          </w:tcPr>
+          <w:p>
+            <w:pPr>
+              <w:pStyle w:val="CompactTableText"/>
+              <w:widowControl/>
+            </w:pPr>
+            <w:r>
+              <w:rPr>
+                <w:rFonts w:ascii="Calibri" w:hAnsi="Calibri" w:cs="Calibri"/>
+              </w:rPr>
+              <w:t>Four-width EN/FI geometry, a11y, performance and visual evidence</w:t>
+            </w:r>
+          </w:p>
+        </w:tc>
+      </w:tr>
+      <w:tr>
+        <w:trPr>
+          <w:cantSplit/>
+        </w:trPr>
+        <w:tc>
+          <w:tcPr>
+            <w:tcW w:w="720" w:type="dxa"/>
+            <w:vAlign w:val="center"/>
+          </w:tcPr>
+          <w:p>
+            <w:pPr>
+              <w:pStyle w:val="CompactTableText"/>
+              <w:jc w:val="center"/>
+              <w:widowControl/>
+            </w:pPr>
+            <w:r>
+              <w:rPr>
+                <w:rFonts w:ascii="Calibri" w:hAnsi="Calibri" w:cs="Calibri"/>
+              </w:rPr>
+              <w:t>☐</w:t>
+            </w:r>
+          </w:p>
+        </w:tc>
+        <w:tc>
+          <w:tcPr>
+            <w:tcW w:w="1700" w:type="dxa"/>
+            <w:vAlign w:val="center"/>
+          </w:tcPr>
+          <w:p>
+            <w:pPr>
+              <w:pStyle w:val="CompactTableText"/>
+              <w:widowControl/>
+            </w:pPr>
+            <w:r>
+              <w:rPr>
+                <w:rFonts w:ascii="Calibri" w:hAnsi="Calibri" w:cs="Calibri"/>
+              </w:rPr>
+              <w:t>P10B-18</w:t>
+            </w:r>
+          </w:p>
+        </w:tc>
+        <w:tc>
+          <w:tcPr>
+            <w:tcW w:w="2800" w:type="dxa"/>
+            <w:vAlign w:val="center"/>
+          </w:tcPr>
+          <w:p>
+            <w:pPr>
+              <w:pStyle w:val="CompactTableText"/>
+              <w:widowControl/>
+            </w:pPr>
+            <w:r>
+              <w:rPr>
+                <w:rFonts w:ascii="Calibri" w:hAnsi="Calibri" w:cs="Calibri"/>
+              </w:rPr>
+              <w:t>Commercial quality and scale gate</w:t>
+            </w:r>
+          </w:p>
+        </w:tc>
+        <w:tc>
+          <w:tcPr>
+            <w:tcW w:w="850" w:type="dxa"/>
+            <w:vAlign w:val="center"/>
+          </w:tcPr>
+          <w:p>
+            <w:pPr>
+              <w:pStyle w:val="CompactTableText"/>
+              <w:jc w:val="center"/>
+              <w:widowControl/>
+            </w:pPr>
+            <w:r>
+              <w:rPr>
+                <w:rFonts w:ascii="Calibri" w:hAnsi="Calibri" w:cs="Calibri"/>
+                <w:b/>
+                <w:bCs/>
+              </w:rPr>
+              <w:t>Planned</w:t>
+            </w:r>
+          </w:p>
+        </w:tc>
+        <w:tc>
+          <w:tcPr>
+            <w:tcW w:w="1500" w:type="dxa"/>
+            <w:vAlign w:val="center"/>
+          </w:tcPr>
+          <w:p>
+            <w:pPr>
+              <w:pStyle w:val="CompactTableText"/>
+              <w:widowControl/>
+            </w:pPr>
+            <w:r>
+              <w:rPr>
+                <w:rFonts w:ascii="Calibri" w:hAnsi="Calibri" w:cs="Calibri"/>
+              </w:rPr>
               <w:t>Product owner, generation, QA</w:t>
             </w:r>
           </w:p>
@@ -5787,6 +5922,141 @@
                 <w:rFonts w:ascii="Calibri" w:hAnsi="Calibri" w:cs="Calibri"/>
               </w:rPr>
               <w:t>100+ configurations and fingerprint-stratified human review</w:t>
+            </w:r>
+          </w:p>
+        </w:tc>
+      </w:tr>
+      <w:tr>
+        <w:trPr>
+          <w:cantSplit/>
+        </w:trPr>
+        <w:tc>
+          <w:tcPr>
+            <w:tcW w:w="720" w:type="dxa"/>
+            <w:vAlign w:val="center"/>
+          </w:tcPr>
+          <w:p>
+            <w:pPr>
+              <w:pStyle w:val="CompactTableText"/>
+              <w:jc w:val="center"/>
+              <w:widowControl/>
+            </w:pPr>
+            <w:r>
+              <w:rPr>
+                <w:rFonts w:ascii="Calibri" w:hAnsi="Calibri" w:cs="Calibri"/>
+              </w:rPr>
+              <w:t>☐</w:t>
+            </w:r>
+          </w:p>
+        </w:tc>
+        <w:tc>
+          <w:tcPr>
+            <w:tcW w:w="1700" w:type="dxa"/>
+            <w:vAlign w:val="center"/>
+          </w:tcPr>
+          <w:p>
+            <w:pPr>
+              <w:pStyle w:val="CompactTableText"/>
+              <w:widowControl/>
+            </w:pPr>
+            <w:r>
+              <w:rPr>
+                <w:rFonts w:ascii="Calibri" w:hAnsi="Calibri" w:cs="Calibri"/>
+              </w:rPr>
+              <w:t>P10B-16P-05B</w:t>
+            </w:r>
+          </w:p>
+        </w:tc>
+        <w:tc>
+          <w:tcPr>
+            <w:tcW w:w="2800" w:type="dxa"/>
+            <w:vAlign w:val="center"/>
+          </w:tcPr>
+          <w:p>
+            <w:pPr>
+              <w:pStyle w:val="CompactTableText"/>
+              <w:widowControl/>
+            </w:pPr>
+            <w:r>
+              <w:rPr>
+                <w:rFonts w:ascii="Calibri" w:hAnsi="Calibri" w:cs="Calibri"/>
+              </w:rPr>
+              <w:t>Final historical acceptance cleanup</w:t>
+            </w:r>
+          </w:p>
+        </w:tc>
+        <w:tc>
+          <w:tcPr>
+            <w:tcW w:w="850" w:type="dxa"/>
+            <w:vAlign w:val="center"/>
+          </w:tcPr>
+          <w:p>
+            <w:pPr>
+              <w:pStyle w:val="CompactTableText"/>
+              <w:jc w:val="center"/>
+              <w:widowControl/>
+            </w:pPr>
+            <w:r>
+              <w:rPr>
+                <w:rFonts w:ascii="Calibri" w:hAnsi="Calibri" w:cs="Calibri"/>
+                <w:b/>
+                <w:bCs/>
+              </w:rPr>
+              <w:t>Planned</w:t>
+            </w:r>
+          </w:p>
+        </w:tc>
+        <w:tc>
+          <w:tcPr>
+            <w:tcW w:w="1500" w:type="dxa"/>
+            <w:vAlign w:val="center"/>
+          </w:tcPr>
+          <w:p>
+            <w:pPr>
+              <w:pStyle w:val="CompactTableText"/>
+              <w:widowControl/>
+            </w:pPr>
+            <w:r>
+              <w:rPr>
+                <w:rFonts w:ascii="Calibri" w:hAnsi="Calibri" w:cs="Calibri"/>
+              </w:rPr>
+              <w:t>Generation architecture/evidence</w:t>
+            </w:r>
+          </w:p>
+        </w:tc>
+        <w:tc>
+          <w:tcPr>
+            <w:tcW w:w="2500" w:type="dxa"/>
+            <w:vAlign w:val="center"/>
+          </w:tcPr>
+          <w:p>
+            <w:pPr>
+              <w:pStyle w:val="CompactTableText"/>
+              <w:widowControl/>
+            </w:pPr>
+            <w:r>
+              <w:rPr>
+                <w:rFonts w:ascii="Calibri" w:hAnsi="Calibri" w:cs="Calibri"/>
+              </w:rPr>
+              <w:t>P10B-16P-05A and P10B-18</w:t>
+            </w:r>
+          </w:p>
+        </w:tc>
+        <w:tc>
+          <w:tcPr>
+            <w:tcW w:w="2890" w:type="dxa"/>
+            <w:vAlign w:val="center"/>
+          </w:tcPr>
+          <w:p>
+            <w:pPr>
+              <w:pStyle w:val="CompactTableText"/>
+              <w:widowControl/>
+            </w:pPr>
+            <w:r>
+              <w:rPr>
+                <w:rFonts w:ascii="Calibri" w:hAnsi="Calibri" w:cs="Calibri"/>
+              </w:rPr>
+              <w:t>Consumer-proven removal/archival of remaining historical scaffolding with migration and evidence retention</w:t>
             </w:r>
           </w:p>
         </w:tc>
@@ -9823,7 +10093,7 @@
         <w:rPr>
           <w:rFonts w:ascii="Calibri" w:hAnsi="Calibri" w:cs="Calibri"/>
         </w:rPr>
-        <w:t xml:space="preserve">. P10B-01 through P10B-16 and P10B-16P-01 through P10B-16P-04 are </w:t>
+        <w:t xml:space="preserve">. P10B-01 through P10B-16 and P10B-16P-01 through P10B-16P-05A are </w:t>
       </w:r>
       <w:r>
         <w:rPr>
@@ -9851,7 +10121,7 @@
         <w:rPr>
           <w:rFonts w:ascii="Calibri" w:hAnsi="Calibri" w:cs="Calibri"/>
         </w:rPr>
-        <w:t xml:space="preserve">. P10B-17 and P10B-18 remain </w:t>
+        <w:t xml:space="preserve">. P10B-16P-05B, P10B-17, and P10B-18 remain </w:t>
       </w:r>
       <w:r>
         <w:rPr>
@@ -9881,7 +10151,7 @@
         <w:rPr>
           <w:rFonts w:ascii="Calibri" w:hAnsi="Calibri" w:cs="Calibri"/>
         </w:rPr>
-        <w:t>. The remaining Done conditions are implementation gates, not claims about the current repository. The P10B-16P sequence is a mandatory convergence package between P10B-16 and P10B-17; it supplements rather than renumbers the locked P10B-01 through P10B-18 plan.</w:t>
+        <w:t>. The remaining Done conditions are implementation gates, not claims about the current repository. The P10B-16P-01 through P10B-16P-05A sequence is a mandatory convergence package between P10B-16 and P10B-17; it supplements rather than renumbers the locked P10B-01 through P10B-18 plan. P10B-16P-05B follows P10B-18 as the final consumer-verified historical cleanup. The canonical search query/results adapter is the next focused product task.</w:t>
       </w:r>
     </w:p>
     <w:p>
@@ -14669,7 +14939,7 @@
         <w:rPr>
           <w:rFonts w:ascii="Calibri" w:hAnsi="Calibri" w:cs="Calibri"/>
         </w:rPr>
-        <w:t xml:space="preserve"> and is retained for historical evidence, migration/safety regressions, and later authorized cleanup.</w:t>
+        <w:t>; its active runtime is removed under P10B-16P-05A while historical evidence and required neutral migration/safety fixtures remain.</w:t>
       </w:r>
     </w:p>
     <w:p>
@@ -14730,6 +15000,336 @@
         <w:rPr>
           <w:rFonts w:ascii="Calibri" w:hAnsi="Calibri" w:cs="Calibri"/>
         </w:rPr>
+        <w:t>P10B-16P-05A — Active production-path and compiler rationalisation</w:t>
+      </w:r>
+    </w:p>
+    <w:p>
+      <w:pPr>
+        <w:pStyle w:val="Normal"/>
+        <w:numPr>
+          <w:ilvl w:val="0"/>
+          <w:numId w:val="1"/>
+        </w:numPr>
+        <w:widowControl/>
+      </w:pPr>
+      <w:r>
+        <w:rPr>
+          <w:rFonts w:ascii="Calibri" w:hAnsi="Calibri" w:cs="Calibri"/>
+          <w:b/>
+          <w:bCs/>
+        </w:rPr>
+        <w:t>Outcome:</w:t>
+      </w:r>
+      <w:r>
+        <w:rPr>
+          <w:rFonts w:ascii="Calibri" w:hAnsi="Calibri" w:cs="Calibri"/>
+        </w:rPr>
+        <w:t xml:space="preserve"> Make the normal semantic initial-generation path and the sole prompted compiler/materialization ownership chain obvious while preserving P10B-16P-04 behavior.</w:t>
+      </w:r>
+    </w:p>
+    <w:p>
+      <w:pPr>
+        <w:pStyle w:val="Normal"/>
+        <w:numPr>
+          <w:ilvl w:val="0"/>
+          <w:numId w:val="1"/>
+        </w:numPr>
+        <w:widowControl/>
+      </w:pPr>
+      <w:r>
+        <w:rPr>
+          <w:rFonts w:ascii="Calibri" w:hAnsi="Calibri" w:cs="Calibri"/>
+          <w:b/>
+          <w:bCs/>
+        </w:rPr>
+        <w:t>Status:</w:t>
+      </w:r>
+      <w:r>
+        <w:rPr>
+          <w:rFonts w:ascii="Calibri" w:hAnsi="Calibri" w:cs="Calibri"/>
+        </w:rPr>
+        <w:t xml:space="preserve"> </w:t>
+      </w:r>
+      <w:r>
+        <w:rPr>
+          <w:rFonts w:ascii="Calibri" w:hAnsi="Calibri" w:cs="Calibri"/>
+          <w:b/>
+          <w:bCs/>
+        </w:rPr>
+        <w:t>Baseline</w:t>
+      </w:r>
+      <w:r>
+        <w:rPr>
+          <w:rFonts w:ascii="Calibri" w:hAnsi="Calibri" w:cs="Calibri"/>
+        </w:rPr>
+        <w:t>. Completed 15 August 2026 with zero provider, Vesko, or publication calls.</w:t>
+      </w:r>
+    </w:p>
+    <w:p>
+      <w:pPr>
+        <w:pStyle w:val="Normal"/>
+        <w:numPr>
+          <w:ilvl w:val="0"/>
+          <w:numId w:val="1"/>
+        </w:numPr>
+        <w:widowControl/>
+      </w:pPr>
+      <w:r>
+        <w:rPr>
+          <w:rFonts w:ascii="Calibri" w:hAnsi="Calibri" w:cs="Calibri"/>
+          <w:b/>
+          <w:bCs/>
+        </w:rPr>
+        <w:t>Depends on:</w:t>
+      </w:r>
+      <w:r>
+        <w:rPr>
+          <w:rFonts w:ascii="Calibri" w:hAnsi="Calibri" w:cs="Calibri"/>
+        </w:rPr>
+        <w:t xml:space="preserve"> P10B-16P-04.</w:t>
+      </w:r>
+    </w:p>
+    <w:p>
+      <w:pPr>
+        <w:pStyle w:val="Normal"/>
+        <w:numPr>
+          <w:ilvl w:val="0"/>
+          <w:numId w:val="1"/>
+        </w:numPr>
+        <w:widowControl/>
+      </w:pPr>
+      <w:r>
+        <w:rPr>
+          <w:rFonts w:ascii="Calibri" w:hAnsi="Calibri" w:cs="Calibri"/>
+          <w:b/>
+          <w:bCs/>
+        </w:rPr>
+        <w:t>Done:</w:t>
+      </w:r>
+      <w:r>
+        <w:rPr>
+          <w:rFonts w:ascii="Calibri" w:hAnsi="Calibri" w:cs="Calibri"/>
+        </w:rPr>
+        <w:t xml:space="preserve"> Normal Storefront Studio uses one operation-tagged proposal route, canonical prompted handler, trusted current-authority composition, semantic provider selector, compatibility resolver, exact compiled decision, coordinator, and sole executor/materialization boundary. A missing or ambiguous operation fails closed; registered follow-up remains separately tagged. P03/P04 inject into the same canonical handler only in production-disabled compositions, and normal composition imports no P9/Lumo, P10B-16L, or acceptance/demo authority. The active P10B-16L executable-intent routes/providers/runtime and obsolete P9/Lumo live-generation entry path are removed or isolated; proven migration/publication fixtures and historical evidence stay available. Public compiler exports no longer expose superseded traversal/materialization paths.</w:t>
+      </w:r>
+    </w:p>
+    <w:p>
+      <w:pPr>
+        <w:pStyle w:val="Normal"/>
+        <w:numPr>
+          <w:ilvl w:val="0"/>
+          <w:numId w:val="1"/>
+        </w:numPr>
+        <w:widowControl/>
+      </w:pPr>
+      <w:r>
+        <w:rPr>
+          <w:rFonts w:ascii="Calibri" w:hAnsi="Calibri" w:cs="Calibri"/>
+          <w:b/>
+          <w:bCs/>
+        </w:rPr>
+        <w:t>Evidence:</w:t>
+      </w:r>
+      <w:r>
+        <w:rPr>
+          <w:rFonts w:ascii="Calibri" w:hAnsi="Calibri" w:cs="Calibri"/>
+        </w:rPr>
+        <w:t xml:space="preserve"> Architecture/dependency checks, provider/security and semantic compiler/executor tests, deterministic Prompt A/B/C replay, Prompt C lifecycle, dynamic-route migration, publication separation, and protected commerce/media regressions. The P10B-16P-04 acceptance composition remains production-disabled through P10B-18.</w:t>
+      </w:r>
+    </w:p>
+    <w:p>
+      <w:pPr>
+        <w:pStyle w:val="Normal"/>
+        <w:numPr>
+          <w:ilvl w:val="0"/>
+          <w:numId w:val="1"/>
+        </w:numPr>
+        <w:widowControl/>
+      </w:pPr>
+      <w:r>
+        <w:rPr>
+          <w:rFonts w:ascii="Calibri" w:hAnsi="Calibri" w:cs="Calibri"/>
+          <w:b/>
+          <w:bCs/>
+        </w:rPr>
+        <w:t>Non-goal:</w:t>
+      </w:r>
+      <w:r>
+        <w:rPr>
+          <w:rFonts w:ascii="Calibri" w:hAnsi="Calibri" w:cs="Calibri"/>
+        </w:rPr>
+        <w:t xml:space="preserve"> Search execution, visual redesign, new provider behavior, P10B-17/P10B-18, final historical cleanup, publication, or Vesko integration.</w:t>
+      </w:r>
+    </w:p>
+    <w:p>
+      <w:pPr>
+        <w:pStyle w:val="Heading3"/>
+        <w:keepNext/>
+        <w:widowControl/>
+      </w:pPr>
+      <w:r>
+        <w:rPr>
+          <w:rFonts w:ascii="Calibri" w:hAnsi="Calibri" w:cs="Calibri"/>
+        </w:rPr>
+        <w:t>P10B-16P-05B — Final historical acceptance cleanup</w:t>
+      </w:r>
+    </w:p>
+    <w:p>
+      <w:pPr>
+        <w:pStyle w:val="Normal"/>
+        <w:numPr>
+          <w:ilvl w:val="0"/>
+          <w:numId w:val="1"/>
+        </w:numPr>
+        <w:widowControl/>
+      </w:pPr>
+      <w:r>
+        <w:rPr>
+          <w:rFonts w:ascii="Calibri" w:hAnsi="Calibri" w:cs="Calibri"/>
+          <w:b/>
+          <w:bCs/>
+        </w:rPr>
+        <w:t>Outcome:</w:t>
+      </w:r>
+      <w:r>
+        <w:rPr>
+          <w:rFonts w:ascii="Calibri" w:hAnsi="Calibri" w:cs="Calibri"/>
+        </w:rPr>
+        <w:t xml:space="preserve"> Remove or archive remaining P10B-16L, P9/Lumo, and P04 acceptance scaffolding only after current quality/scale evidence no longer consumes it.</w:t>
+      </w:r>
+    </w:p>
+    <w:p>
+      <w:pPr>
+        <w:pStyle w:val="Normal"/>
+        <w:numPr>
+          <w:ilvl w:val="0"/>
+          <w:numId w:val="1"/>
+        </w:numPr>
+        <w:widowControl/>
+      </w:pPr>
+      <w:r>
+        <w:rPr>
+          <w:rFonts w:ascii="Calibri" w:hAnsi="Calibri" w:cs="Calibri"/>
+          <w:b/>
+          <w:bCs/>
+        </w:rPr>
+        <w:t>Status:</w:t>
+      </w:r>
+      <w:r>
+        <w:rPr>
+          <w:rFonts w:ascii="Calibri" w:hAnsi="Calibri" w:cs="Calibri"/>
+        </w:rPr>
+        <w:t xml:space="preserve"> </w:t>
+      </w:r>
+      <w:r>
+        <w:rPr>
+          <w:rFonts w:ascii="Calibri" w:hAnsi="Calibri" w:cs="Calibri"/>
+          <w:b/>
+          <w:bCs/>
+        </w:rPr>
+        <w:t>Planned</w:t>
+      </w:r>
+      <w:r>
+        <w:rPr>
+          <w:rFonts w:ascii="Calibri" w:hAnsi="Calibri" w:cs="Calibri"/>
+        </w:rPr>
+        <w:t xml:space="preserve"> after P10B-18.</w:t>
+      </w:r>
+    </w:p>
+    <w:p>
+      <w:pPr>
+        <w:pStyle w:val="Normal"/>
+        <w:numPr>
+          <w:ilvl w:val="0"/>
+          <w:numId w:val="1"/>
+        </w:numPr>
+        <w:widowControl/>
+      </w:pPr>
+      <w:r>
+        <w:rPr>
+          <w:rFonts w:ascii="Calibri" w:hAnsi="Calibri" w:cs="Calibri"/>
+          <w:b/>
+          <w:bCs/>
+        </w:rPr>
+        <w:t>Depends on:</w:t>
+      </w:r>
+      <w:r>
+        <w:rPr>
+          <w:rFonts w:ascii="Calibri" w:hAnsi="Calibri" w:cs="Calibri"/>
+        </w:rPr>
+        <w:t xml:space="preserve"> P10B-16P-05A and P10B-18.</w:t>
+      </w:r>
+    </w:p>
+    <w:p>
+      <w:pPr>
+        <w:pStyle w:val="Normal"/>
+        <w:numPr>
+          <w:ilvl w:val="0"/>
+          <w:numId w:val="1"/>
+        </w:numPr>
+        <w:widowControl/>
+      </w:pPr>
+      <w:r>
+        <w:rPr>
+          <w:rFonts w:ascii="Calibri" w:hAnsi="Calibri" w:cs="Calibri"/>
+          <w:b/>
+          <w:bCs/>
+        </w:rPr>
+        <w:t>Done when:</w:t>
+      </w:r>
+      <w:r>
+        <w:rPr>
+          <w:rFonts w:ascii="Calibri" w:hAnsi="Calibri" w:cs="Calibri"/>
+        </w:rPr>
+        <w:t xml:space="preserve"> Consumer search proves no active, migration, publication, replay, or retained evidence dependency; final removal preserves historical records and all valid snapshots/artifacts.</w:t>
+      </w:r>
+    </w:p>
+    <w:p>
+      <w:pPr>
+        <w:pStyle w:val="Normal"/>
+        <w:numPr>
+          <w:ilvl w:val="0"/>
+          <w:numId w:val="1"/>
+        </w:numPr>
+        <w:widowControl/>
+      </w:pPr>
+      <w:r>
+        <w:rPr>
+          <w:rFonts w:ascii="Calibri" w:hAnsi="Calibri" w:cs="Calibri"/>
+          <w:b/>
+          <w:bCs/>
+        </w:rPr>
+        <w:t>Non-goal:</w:t>
+      </w:r>
+      <w:r>
+        <w:rPr>
+          <w:rFonts w:ascii="Calibri" w:hAnsi="Calibri" w:cs="Calibri"/>
+        </w:rPr>
+        <w:t xml:space="preserve"> Deleting P10B-18 visual fixtures or compatibility data before their removal gate.</w:t>
+      </w:r>
+    </w:p>
+    <w:p>
+      <w:pPr>
+        <w:pStyle w:val="Normal"/>
+        <w:widowControl/>
+      </w:pPr>
+      <w:r>
+        <w:rPr>
+          <w:rFonts w:ascii="Calibri" w:hAnsi="Calibri" w:cs="Calibri"/>
+        </w:rPr>
+        <w:t>The next focused product task is the canonical search query/results adapter. Search presentation is registered today, but execution remains fail closed until exact transient query/results authority exists.</w:t>
+      </w:r>
+    </w:p>
+    <w:p>
+      <w:pPr>
+        <w:pStyle w:val="Heading3"/>
+        <w:keepNext/>
+        <w:widowControl/>
+      </w:pPr>
+      <w:r>
+        <w:rPr>
+          <w:rFonts w:ascii="Calibri" w:hAnsi="Calibri" w:cs="Calibri"/>
+        </w:rPr>
         <w:t>P10B-17 — Responsive, accessibility and performance closure</w:t>
       </w:r>
     </w:p>
@@ -14802,7 +15402,7 @@
         <w:rPr>
           <w:rFonts w:ascii="Calibri" w:hAnsi="Calibri" w:cs="Calibri"/>
         </w:rPr>
-        <w:t xml:space="preserve"> P10B-16P-04 and implemented commercial families/profiles/directions.</w:t>
+        <w:t xml:space="preserve"> P10B-16P-05A and implemented commercial families/profiles/directions.</w:t>
       </w:r>
     </w:p>
     <w:p>

</xml_diff>

<commit_message>
feat: add canonical storefront search adapter
</commit_message>
<xml_diff>
--- a/docs/VESKIFY_DEVELOPMENT_DELIVERY_TRACKER_v1.3.0.docx
+++ b/docs/VESKIFY_DEVELOPMENT_DELIVERY_TRACKER_v1.3.0.docx
@@ -38,7 +38,7 @@
         <w:rPr>
           <w:rFonts w:ascii="Calibri" w:hAnsi="Calibri" w:cs="Calibri"/>
         </w:rPr>
-        <w:t>Delivery status baseline: 15 August 2026, P10B-16P-05A active production-path and compiler rationalisation</w:t>
+        <w:t>Delivery status baseline: 15 August 2026, P10B-16P-06 canonical search query/results adapter</w:t>
       </w:r>
     </w:p>
     <w:p>
@@ -245,7 +245,7 @@
               <w:rPr>
                 <w:rFonts w:ascii="Calibri" w:hAnsi="Calibri" w:cs="Calibri"/>
               </w:rPr>
-              <w:t>15 August 2026, P10B-16P-05A active production-path and compiler rationalisation</w:t>
+              <w:t>15 August 2026, P10B-16P-06 canonical search query/results adapter</w:t>
             </w:r>
           </w:p>
         </w:tc>
@@ -5675,7 +5675,7 @@
               <w:rPr>
                 <w:rFonts w:ascii="Calibri" w:hAnsi="Calibri" w:cs="Calibri"/>
               </w:rPr>
-              <w:t>☐</w:t>
+              <w:t>☑</w:t>
             </w:r>
           </w:p>
         </w:tc>
@@ -5693,7 +5693,7 @@
               <w:rPr>
                 <w:rFonts w:ascii="Calibri" w:hAnsi="Calibri" w:cs="Calibri"/>
               </w:rPr>
-              <w:t>P10B-17</w:t>
+              <w:t>P10B-16P-06</w:t>
             </w:r>
           </w:p>
         </w:tc>
@@ -5711,7 +5711,7 @@
               <w:rPr>
                 <w:rFonts w:ascii="Calibri" w:hAnsi="Calibri" w:cs="Calibri"/>
               </w:rPr>
-              <w:t>Responsive, accessibility and performance closure</w:t>
+              <w:t>Canonical search query/results adapter</w:t>
             </w:r>
           </w:p>
         </w:tc>
@@ -5732,6 +5732,141 @@
                 <w:b/>
                 <w:bCs/>
               </w:rPr>
+              <w:t>Baseline</w:t>
+            </w:r>
+          </w:p>
+        </w:tc>
+        <w:tc>
+          <w:tcPr>
+            <w:tcW w:w="1500" w:type="dxa"/>
+            <w:vAlign w:val="center"/>
+          </w:tcPr>
+          <w:p>
+            <w:pPr>
+              <w:pStyle w:val="CompactTableText"/>
+              <w:widowControl/>
+            </w:pPr>
+            <w:r>
+              <w:rPr>
+                <w:rFonts w:ascii="Calibri" w:hAnsi="Calibri" w:cs="Calibri"/>
+              </w:rPr>
+              <w:t>Search runtime/commerce presentation</w:t>
+            </w:r>
+          </w:p>
+        </w:tc>
+        <w:tc>
+          <w:tcPr>
+            <w:tcW w:w="2500" w:type="dxa"/>
+            <w:vAlign w:val="center"/>
+          </w:tcPr>
+          <w:p>
+            <w:pPr>
+              <w:pStyle w:val="CompactTableText"/>
+              <w:widowControl/>
+            </w:pPr>
+            <w:r>
+              <w:rPr>
+                <w:rFonts w:ascii="Calibri" w:hAnsi="Calibri" w:cs="Calibri"/>
+              </w:rPr>
+              <w:t>P10B-16P-05A and dynamic-search authority</w:t>
+            </w:r>
+          </w:p>
+        </w:tc>
+        <w:tc>
+          <w:tcPr>
+            <w:tcW w:w="2890" w:type="dxa"/>
+            <w:vAlign w:val="center"/>
+          </w:tcPr>
+          <w:p>
+            <w:pPr>
+              <w:pStyle w:val="CompactTableText"/>
+              <w:widowControl/>
+            </w:pPr>
+            <w:r>
+              <w:rPr>
+                <w:rFonts w:ascii="Calibri" w:hAnsi="Calibri" w:cs="Calibri"/>
+              </w:rPr>
+              <w:t>Transient exact canonical query/results; ranking/filter/pagination; lifecycle non-persistence; EN/FI browser and publication evidence; protected commerce/media</w:t>
+            </w:r>
+          </w:p>
+        </w:tc>
+      </w:tr>
+      <w:tr>
+        <w:trPr>
+          <w:cantSplit/>
+        </w:trPr>
+        <w:tc>
+          <w:tcPr>
+            <w:tcW w:w="720" w:type="dxa"/>
+            <w:vAlign w:val="center"/>
+          </w:tcPr>
+          <w:p>
+            <w:pPr>
+              <w:pStyle w:val="CompactTableText"/>
+              <w:jc w:val="center"/>
+              <w:widowControl/>
+            </w:pPr>
+            <w:r>
+              <w:rPr>
+                <w:rFonts w:ascii="Calibri" w:hAnsi="Calibri" w:cs="Calibri"/>
+              </w:rPr>
+              <w:t>☐</w:t>
+            </w:r>
+          </w:p>
+        </w:tc>
+        <w:tc>
+          <w:tcPr>
+            <w:tcW w:w="1700" w:type="dxa"/>
+            <w:vAlign w:val="center"/>
+          </w:tcPr>
+          <w:p>
+            <w:pPr>
+              <w:pStyle w:val="CompactTableText"/>
+              <w:widowControl/>
+            </w:pPr>
+            <w:r>
+              <w:rPr>
+                <w:rFonts w:ascii="Calibri" w:hAnsi="Calibri" w:cs="Calibri"/>
+              </w:rPr>
+              <w:t>P10B-17</w:t>
+            </w:r>
+          </w:p>
+        </w:tc>
+        <w:tc>
+          <w:tcPr>
+            <w:tcW w:w="2800" w:type="dxa"/>
+            <w:vAlign w:val="center"/>
+          </w:tcPr>
+          <w:p>
+            <w:pPr>
+              <w:pStyle w:val="CompactTableText"/>
+              <w:widowControl/>
+            </w:pPr>
+            <w:r>
+              <w:rPr>
+                <w:rFonts w:ascii="Calibri" w:hAnsi="Calibri" w:cs="Calibri"/>
+              </w:rPr>
+              <w:t>Responsive, accessibility and performance closure</w:t>
+            </w:r>
+          </w:p>
+        </w:tc>
+        <w:tc>
+          <w:tcPr>
+            <w:tcW w:w="850" w:type="dxa"/>
+            <w:vAlign w:val="center"/>
+          </w:tcPr>
+          <w:p>
+            <w:pPr>
+              <w:pStyle w:val="CompactTableText"/>
+              <w:jc w:val="center"/>
+              <w:widowControl/>
+            </w:pPr>
+            <w:r>
+              <w:rPr>
+                <w:rFonts w:ascii="Calibri" w:hAnsi="Calibri" w:cs="Calibri"/>
+                <w:b/>
+                <w:bCs/>
+              </w:rPr>
               <w:t>Planned</w:t>
             </w:r>
           </w:p>
@@ -5768,7 +5903,7 @@
               <w:rPr>
                 <w:rFonts w:ascii="Calibri" w:hAnsi="Calibri" w:cs="Calibri"/>
               </w:rPr>
-              <w:t>P10B-16P-05A and implemented families</w:t>
+              <w:t>P10B-16P-06 and implemented families</w:t>
             </w:r>
           </w:p>
         </w:tc>
@@ -10093,7 +10228,7 @@
         <w:rPr>
           <w:rFonts w:ascii="Calibri" w:hAnsi="Calibri" w:cs="Calibri"/>
         </w:rPr>
-        <w:t xml:space="preserve">. P10B-01 through P10B-16 and P10B-16P-01 through P10B-16P-05A are </w:t>
+        <w:t xml:space="preserve">. P10B-01 through P10B-16, P10B-16P-01 through P10B-16P-05A, and P10B-16P-06 are </w:t>
       </w:r>
       <w:r>
         <w:rPr>
@@ -10151,7 +10286,7 @@
         <w:rPr>
           <w:rFonts w:ascii="Calibri" w:hAnsi="Calibri" w:cs="Calibri"/>
         </w:rPr>
-        <w:t>. The remaining Done conditions are implementation gates, not claims about the current repository. The P10B-16P-01 through P10B-16P-05A sequence is a mandatory convergence package between P10B-16 and P10B-17; it supplements rather than renumbers the locked P10B-01 through P10B-18 plan. P10B-16P-05B follows P10B-18 as the final consumer-verified historical cleanup. The canonical search query/results adapter is the next focused product task.</w:t>
+        <w:t>. The remaining Done conditions are implementation gates, not claims about the current repository. The P10B-16P-01 through P10B-16P-05A plus P10B-16P-06 sequence is a mandatory convergence package between P10B-16 and P10B-17; it supplements rather than renumbers the locked P10B-01 through P10B-18 plan. P10B-16P-05B follows P10B-18 as the final consumer-verified historical cleanup. P10B-17 is the next focused product task.</w:t>
       </w:r>
     </w:p>
     <w:p>
@@ -13986,7 +14121,7 @@
         <w:rPr>
           <w:rFonts w:ascii="Calibri" w:hAnsi="Calibri" w:cs="Calibri"/>
         </w:rPr>
-        <w:t xml:space="preserve"> inventory and its archetype are registered, but runtime search materialization requires exact transient query/results from a first-class canonical adapter. Until P11 supplies that seam, missing search context fails closed and never substitutes a collection.</w:t>
+        <w:t xml:space="preserve"> inventory and its archetype are registered. P10B-16P-06 now supplies exact transient query/results through the standalone canonical catalogue adapter; missing, invalid, stale, or unresolved runtime context still fails closed and never substitutes a collection. Vesko-backed search remains P11 integration work.</w:t>
       </w:r>
     </w:p>
     <w:p>
@@ -15171,7 +15306,7 @@
         <w:rPr>
           <w:rFonts w:ascii="Calibri" w:hAnsi="Calibri" w:cs="Calibri"/>
         </w:rPr>
-        <w:t>P10B-16P-05B — Final historical acceptance cleanup</w:t>
+        <w:t>P10B-16P-06 — Canonical search query/results adapter</w:t>
       </w:r>
     </w:p>
     <w:p>
@@ -15195,7 +15330,21 @@
         <w:rPr>
           <w:rFonts w:ascii="Calibri" w:hAnsi="Calibri" w:cs="Calibri"/>
         </w:rPr>
-        <w:t xml:space="preserve"> Remove or archive remaining P10B-16L, P9/Lumo, and P04 acceptance scaffolding only after current quality/scale evidence no longer consumes it.</w:t>
+        <w:t xml:space="preserve"> Execute the one persisted </w:t>
+      </w:r>
+      <w:r>
+        <w:rPr>
+          <w:rFonts w:ascii="Consolas" w:hAnsi="Consolas" w:cs="Consolas"/>
+          <w:sz w:val="19"/>
+          <w:szCs w:val="19"/>
+        </w:rPr>
+        <w:t>/search</w:t>
+      </w:r>
+      <w:r>
+        <w:rPr>
+          <w:rFonts w:ascii="Calibri" w:hAnsi="Calibri" w:cs="Calibri"/>
+        </w:rPr>
+        <w:t xml:space="preserve"> route and selected registered search archetype from validated transient query, filter, sort, page, result-ID, and result-count state derived from current canonical commerce.</w:t>
       </w:r>
     </w:p>
     <w:p>
@@ -15227,13 +15376,13 @@
           <w:b/>
           <w:bCs/>
         </w:rPr>
-        <w:t>Planned</w:t>
-      </w:r>
-      <w:r>
-        <w:rPr>
-          <w:rFonts w:ascii="Calibri" w:hAnsi="Calibri" w:cs="Calibri"/>
-        </w:rPr>
-        <w:t xml:space="preserve"> after P10B-18.</w:t>
+        <w:t>Baseline</w:t>
+      </w:r>
+      <w:r>
+        <w:rPr>
+          <w:rFonts w:ascii="Calibri" w:hAnsi="Calibri" w:cs="Calibri"/>
+        </w:rPr>
+        <w:t>. Completed 15 August 2026 with zero provider and Vesko calls.</w:t>
       </w:r>
     </w:p>
     <w:p>
@@ -15257,31 +15406,163 @@
         <w:rPr>
           <w:rFonts w:ascii="Calibri" w:hAnsi="Calibri" w:cs="Calibri"/>
         </w:rPr>
-        <w:t xml:space="preserve"> P10B-16P-05A and P10B-18.</w:t>
-      </w:r>
-    </w:p>
-    <w:p>
-      <w:pPr>
-        <w:pStyle w:val="Normal"/>
-        <w:numPr>
-          <w:ilvl w:val="0"/>
-          <w:numId w:val="1"/>
-        </w:numPr>
-        <w:widowControl/>
-      </w:pPr>
-      <w:r>
-        <w:rPr>
-          <w:rFonts w:ascii="Calibri" w:hAnsi="Calibri" w:cs="Calibri"/>
-          <w:b/>
-          <w:bCs/>
-        </w:rPr>
-        <w:t>Done when:</w:t>
-      </w:r>
-      <w:r>
-        <w:rPr>
-          <w:rFonts w:ascii="Calibri" w:hAnsi="Calibri" w:cs="Calibri"/>
-        </w:rPr>
-        <w:t xml:space="preserve"> Consumer search proves no active, migration, publication, replay, or retained evidence dependency; final removal preserves historical records and all valid snapshots/artifacts.</w:t>
+        <w:t xml:space="preserve"> P10B-16P-05A and existing P10B-16P-01, P10B-10, P10B-13, frame, product-card, persistence, and publication authorities.</w:t>
+      </w:r>
+    </w:p>
+    <w:p>
+      <w:pPr>
+        <w:pStyle w:val="Normal"/>
+        <w:numPr>
+          <w:ilvl w:val="0"/>
+          <w:numId w:val="1"/>
+        </w:numPr>
+        <w:widowControl/>
+      </w:pPr>
+      <w:r>
+        <w:rPr>
+          <w:rFonts w:ascii="Calibri" w:hAnsi="Calibri" w:cs="Calibri"/>
+          <w:b/>
+          <w:bCs/>
+        </w:rPr>
+        <w:t>Done:</w:t>
+      </w:r>
+      <w:r>
+        <w:rPr>
+          <w:rFonts w:ascii="Calibri" w:hAnsi="Calibri" w:cs="Calibri"/>
+        </w:rPr>
+        <w:t xml:space="preserve"> A versioned provider-neutral read-only search contract and standalone </w:t>
+      </w:r>
+      <w:r>
+        <w:rPr>
+          <w:rFonts w:ascii="Consolas" w:hAnsi="Consolas" w:cs="Consolas"/>
+          <w:sz w:val="19"/>
+          <w:szCs w:val="19"/>
+        </w:rPr>
+        <w:t>CatalogueDisplayModel</w:t>
+      </w:r>
+      <w:r>
+        <w:rPr>
+          <w:rFonts w:ascii="Calibri" w:hAnsi="Calibri" w:cs="Calibri"/>
+        </w:rPr>
+        <w:t xml:space="preserve"> adapter validate and normalize EN/FI input, rank exact SKU and localized title matches deterministically, apply only supported filters/sort/pagination with bounded work, and return unique current public product-route IDs. Draft, proposal, saved/history, and published </w:t>
+      </w:r>
+      <w:r>
+        <w:rPr>
+          <w:rFonts w:ascii="Consolas" w:hAnsi="Consolas" w:cs="Consolas"/>
+          <w:sz w:val="19"/>
+          <w:szCs w:val="19"/>
+        </w:rPr>
+        <w:t>/search</w:t>
+      </w:r>
+      <w:r>
+        <w:rPr>
+          <w:rFonts w:ascii="Calibri" w:hAnsi="Calibri" w:cs="Calibri"/>
+        </w:rPr>
+        <w:t xml:space="preserve"> routes resolve that transient result page through the existing selected </w:t>
+      </w:r>
+      <w:r>
+        <w:rPr>
+          <w:rFonts w:ascii="Consolas" w:hAnsi="Consolas" w:cs="Consolas"/>
+          <w:sz w:val="19"/>
+          <w:szCs w:val="19"/>
+        </w:rPr>
+        <w:t>dynamicCollectionCommerce</w:t>
+      </w:r>
+      <w:r>
+        <w:rPr>
+          <w:rFonts w:ascii="Calibri" w:hAnsi="Calibri" w:cs="Calibri"/>
+        </w:rPr>
+        <w:t xml:space="preserve"> archetype, shared frame, product-card renderer, and governed orientation/no-results states. Exact product links resolve through current dynamic PDP authority.</w:t>
+      </w:r>
+    </w:p>
+    <w:p>
+      <w:pPr>
+        <w:pStyle w:val="Normal"/>
+        <w:numPr>
+          <w:ilvl w:val="0"/>
+          <w:numId w:val="1"/>
+        </w:numPr>
+        <w:widowControl/>
+      </w:pPr>
+      <w:r>
+        <w:rPr>
+          <w:rFonts w:ascii="Calibri" w:hAnsi="Calibri" w:cs="Calibri"/>
+          <w:b/>
+          <w:bCs/>
+        </w:rPr>
+        <w:t>Authority boundary:</w:t>
+      </w:r>
+      <w:r>
+        <w:rPr>
+          <w:rFonts w:ascii="Calibri" w:hAnsi="Calibri" w:cs="Calibri"/>
+        </w:rPr>
+        <w:t xml:space="preserve"> </w:t>
+      </w:r>
+      <w:r>
+        <w:rPr>
+          <w:rFonts w:ascii="Consolas" w:hAnsi="Consolas" w:cs="Consolas"/>
+          <w:sz w:val="19"/>
+          <w:szCs w:val="19"/>
+        </w:rPr>
+        <w:t>StorefrontSnapshot</w:t>
+      </w:r>
+      <w:r>
+        <w:rPr>
+          <w:rFonts w:ascii="Calibri" w:hAnsi="Calibri" w:cs="Calibri"/>
+        </w:rPr>
+        <w:t xml:space="preserve"> persists only one </w:t>
+      </w:r>
+      <w:r>
+        <w:rPr>
+          <w:rFonts w:ascii="Consolas" w:hAnsi="Consolas" w:cs="Consolas"/>
+          <w:sz w:val="19"/>
+          <w:szCs w:val="19"/>
+        </w:rPr>
+        <w:t>/search</w:t>
+      </w:r>
+      <w:r>
+        <w:rPr>
+          <w:rFonts w:ascii="Calibri" w:hAnsi="Calibri" w:cs="Calibri"/>
+        </w:rPr>
+        <w:t xml:space="preserve"> route identity and selected presentation archetype. Query text, filters, sort, page, result IDs, and result count remain runtime-only; they never enter </w:t>
+      </w:r>
+      <w:r>
+        <w:rPr>
+          <w:rFonts w:ascii="Consolas" w:hAnsi="Consolas" w:cs="Consolas"/>
+          <w:sz w:val="19"/>
+          <w:szCs w:val="19"/>
+        </w:rPr>
+        <w:t>PageModel</w:t>
+      </w:r>
+      <w:r>
+        <w:rPr>
+          <w:rFonts w:ascii="Calibri" w:hAnsi="Calibri" w:cs="Calibri"/>
+        </w:rPr>
+        <w:t>, snapshot/history, compiler decisions, publication artifacts as editable design state, provider evidence, or fingerprints.</w:t>
+      </w:r>
+    </w:p>
+    <w:p>
+      <w:pPr>
+        <w:pStyle w:val="Normal"/>
+        <w:numPr>
+          <w:ilvl w:val="0"/>
+          <w:numId w:val="1"/>
+        </w:numPr>
+        <w:widowControl/>
+      </w:pPr>
+      <w:r>
+        <w:rPr>
+          <w:rFonts w:ascii="Calibri" w:hAnsi="Calibri" w:cs="Calibri"/>
+          <w:b/>
+          <w:bCs/>
+        </w:rPr>
+        <w:t>Evidence:</w:t>
+      </w:r>
+      <w:r>
+        <w:rPr>
+          <w:rFonts w:ascii="Calibri" w:hAnsi="Calibri" w:cs="Calibri"/>
+        </w:rPr>
+        <w:t xml:space="preserve"> Contract/schema, deterministic unit and integration, bounded 1,000-product work, EN/FI normalization/ranking, dynamic renderer/routes, proposal/save/history/publication non-persistence, browser/E2E, and protected commerce/media regressions.</w:t>
       </w:r>
     </w:p>
     <w:p>
@@ -15305,19 +15586,7 @@
         <w:rPr>
           <w:rFonts w:ascii="Calibri" w:hAnsi="Calibri" w:cs="Calibri"/>
         </w:rPr>
-        <w:t xml:space="preserve"> Deleting P10B-18 visual fixtures or compatibility data before their removal gate.</w:t>
-      </w:r>
-    </w:p>
-    <w:p>
-      <w:pPr>
-        <w:pStyle w:val="Normal"/>
-        <w:widowControl/>
-      </w:pPr>
-      <w:r>
-        <w:rPr>
-          <w:rFonts w:ascii="Calibri" w:hAnsi="Calibri" w:cs="Calibri"/>
-        </w:rPr>
-        <w:t>The next focused product task is the canonical search query/results adapter. Search presentation is registered today, but execution remains fail closed until exact transient query/results authority exists.</w:t>
+        <w:t xml:space="preserve"> Vesko search integration, OpenAI or other provider calls, semantic/vector/fuzzy search, typo correction, recommendations, personalization, analytics, commerce writes, a second search/page graph, or a duplicate collection/product-card renderer.</w:t>
       </w:r>
     </w:p>
     <w:p>
@@ -15330,6 +15599,165 @@
         <w:rPr>
           <w:rFonts w:ascii="Calibri" w:hAnsi="Calibri" w:cs="Calibri"/>
         </w:rPr>
+        <w:t>P10B-16P-05B — Final historical acceptance cleanup</w:t>
+      </w:r>
+    </w:p>
+    <w:p>
+      <w:pPr>
+        <w:pStyle w:val="Normal"/>
+        <w:numPr>
+          <w:ilvl w:val="0"/>
+          <w:numId w:val="1"/>
+        </w:numPr>
+        <w:widowControl/>
+      </w:pPr>
+      <w:r>
+        <w:rPr>
+          <w:rFonts w:ascii="Calibri" w:hAnsi="Calibri" w:cs="Calibri"/>
+          <w:b/>
+          <w:bCs/>
+        </w:rPr>
+        <w:t>Outcome:</w:t>
+      </w:r>
+      <w:r>
+        <w:rPr>
+          <w:rFonts w:ascii="Calibri" w:hAnsi="Calibri" w:cs="Calibri"/>
+        </w:rPr>
+        <w:t xml:space="preserve"> Remove or archive remaining P10B-16L, P9/Lumo, and P04 acceptance scaffolding only after current quality/scale evidence no longer consumes it.</w:t>
+      </w:r>
+    </w:p>
+    <w:p>
+      <w:pPr>
+        <w:pStyle w:val="Normal"/>
+        <w:numPr>
+          <w:ilvl w:val="0"/>
+          <w:numId w:val="1"/>
+        </w:numPr>
+        <w:widowControl/>
+      </w:pPr>
+      <w:r>
+        <w:rPr>
+          <w:rFonts w:ascii="Calibri" w:hAnsi="Calibri" w:cs="Calibri"/>
+          <w:b/>
+          <w:bCs/>
+        </w:rPr>
+        <w:t>Status:</w:t>
+      </w:r>
+      <w:r>
+        <w:rPr>
+          <w:rFonts w:ascii="Calibri" w:hAnsi="Calibri" w:cs="Calibri"/>
+        </w:rPr>
+        <w:t xml:space="preserve"> </w:t>
+      </w:r>
+      <w:r>
+        <w:rPr>
+          <w:rFonts w:ascii="Calibri" w:hAnsi="Calibri" w:cs="Calibri"/>
+          <w:b/>
+          <w:bCs/>
+        </w:rPr>
+        <w:t>Planned</w:t>
+      </w:r>
+      <w:r>
+        <w:rPr>
+          <w:rFonts w:ascii="Calibri" w:hAnsi="Calibri" w:cs="Calibri"/>
+        </w:rPr>
+        <w:t xml:space="preserve"> after P10B-18.</w:t>
+      </w:r>
+    </w:p>
+    <w:p>
+      <w:pPr>
+        <w:pStyle w:val="Normal"/>
+        <w:numPr>
+          <w:ilvl w:val="0"/>
+          <w:numId w:val="1"/>
+        </w:numPr>
+        <w:widowControl/>
+      </w:pPr>
+      <w:r>
+        <w:rPr>
+          <w:rFonts w:ascii="Calibri" w:hAnsi="Calibri" w:cs="Calibri"/>
+          <w:b/>
+          <w:bCs/>
+        </w:rPr>
+        <w:t>Depends on:</w:t>
+      </w:r>
+      <w:r>
+        <w:rPr>
+          <w:rFonts w:ascii="Calibri" w:hAnsi="Calibri" w:cs="Calibri"/>
+        </w:rPr>
+        <w:t xml:space="preserve"> P10B-16P-05A and P10B-18.</w:t>
+      </w:r>
+    </w:p>
+    <w:p>
+      <w:pPr>
+        <w:pStyle w:val="Normal"/>
+        <w:numPr>
+          <w:ilvl w:val="0"/>
+          <w:numId w:val="1"/>
+        </w:numPr>
+        <w:widowControl/>
+      </w:pPr>
+      <w:r>
+        <w:rPr>
+          <w:rFonts w:ascii="Calibri" w:hAnsi="Calibri" w:cs="Calibri"/>
+          <w:b/>
+          <w:bCs/>
+        </w:rPr>
+        <w:t>Done when:</w:t>
+      </w:r>
+      <w:r>
+        <w:rPr>
+          <w:rFonts w:ascii="Calibri" w:hAnsi="Calibri" w:cs="Calibri"/>
+        </w:rPr>
+        <w:t xml:space="preserve"> Consumer search proves no active, migration, publication, replay, or retained evidence dependency; final removal preserves historical records and all valid snapshots/artifacts.</w:t>
+      </w:r>
+    </w:p>
+    <w:p>
+      <w:pPr>
+        <w:pStyle w:val="Normal"/>
+        <w:numPr>
+          <w:ilvl w:val="0"/>
+          <w:numId w:val="1"/>
+        </w:numPr>
+        <w:widowControl/>
+      </w:pPr>
+      <w:r>
+        <w:rPr>
+          <w:rFonts w:ascii="Calibri" w:hAnsi="Calibri" w:cs="Calibri"/>
+          <w:b/>
+          <w:bCs/>
+        </w:rPr>
+        <w:t>Non-goal:</w:t>
+      </w:r>
+      <w:r>
+        <w:rPr>
+          <w:rFonts w:ascii="Calibri" w:hAnsi="Calibri" w:cs="Calibri"/>
+        </w:rPr>
+        <w:t xml:space="preserve"> Deleting P10B-18 visual fixtures or compatibility data before their removal gate.</w:t>
+      </w:r>
+    </w:p>
+    <w:p>
+      <w:pPr>
+        <w:pStyle w:val="Normal"/>
+        <w:widowControl/>
+      </w:pPr>
+      <w:r>
+        <w:rPr>
+          <w:rFonts w:ascii="Calibri" w:hAnsi="Calibri" w:cs="Calibri"/>
+        </w:rPr>
+        <w:t>P10B-17 is the next focused product task. P10B remains Partial; P10B-18 and the P10B-16P-05B final historical cleanup remain Planned.</w:t>
+      </w:r>
+    </w:p>
+    <w:p>
+      <w:pPr>
+        <w:pStyle w:val="Heading3"/>
+        <w:keepNext/>
+        <w:widowControl/>
+      </w:pPr>
+      <w:r>
+        <w:rPr>
+          <w:rFonts w:ascii="Calibri" w:hAnsi="Calibri" w:cs="Calibri"/>
+        </w:rPr>
         <w:t>P10B-17 — Responsive, accessibility and performance closure</w:t>
       </w:r>
     </w:p>
@@ -15402,7 +15830,7 @@
         <w:rPr>
           <w:rFonts w:ascii="Calibri" w:hAnsi="Calibri" w:cs="Calibri"/>
         </w:rPr>
-        <w:t xml:space="preserve"> P10B-16P-05A and implemented commercial families/profiles/directions.</w:t>
+        <w:t xml:space="preserve"> P10B-16P-06 and implemented commercial families/profiles/directions.</w:t>
       </w:r>
     </w:p>
     <w:p>
@@ -19561,11 +19989,12 @@
   <w:p>
     <w:pPr>
       <w:pStyle w:val="Footer"/>
+      <w:jc w:val="left"/>
       <w:pBdr>
         <w:top w:val="single" w:sz="4" w:space="6" w:color="D8E0E8"/>
       </w:pBdr>
       <w:tabs>
-        <w:tab w:val="right" w:pos="11520"/>
+        <w:tab w:val="right" w:pos="12960"/>
       </w:tabs>
     </w:pPr>
     <w:r>

</xml_diff>

<commit_message>
feat: close responsive accessibility and performance
</commit_message>
<xml_diff>
--- a/docs/VESKIFY_DEVELOPMENT_DELIVERY_TRACKER_v1.3.0.docx
+++ b/docs/VESKIFY_DEVELOPMENT_DELIVERY_TRACKER_v1.3.0.docx
@@ -38,7 +38,7 @@
         <w:rPr>
           <w:rFonts w:ascii="Calibri" w:hAnsi="Calibri" w:cs="Calibri"/>
         </w:rPr>
-        <w:t>Delivery status baseline: 15 August 2026, P10B-16P-06 canonical search query/results adapter</w:t>
+        <w:t>Delivery status baseline: 16 August 2026, P10B-17 responsive, accessibility and performance closure</w:t>
       </w:r>
     </w:p>
     <w:p>
@@ -245,7 +245,7 @@
               <w:rPr>
                 <w:rFonts w:ascii="Calibri" w:hAnsi="Calibri" w:cs="Calibri"/>
               </w:rPr>
-              <w:t>15 August 2026, P10B-16P-06 canonical search query/results adapter</w:t>
+              <w:t>16 August 2026, P10B-17 responsive, accessibility and performance closure</w:t>
             </w:r>
           </w:p>
         </w:tc>
@@ -5810,7 +5810,7 @@
               <w:rPr>
                 <w:rFonts w:ascii="Calibri" w:hAnsi="Calibri" w:cs="Calibri"/>
               </w:rPr>
-              <w:t>☐</w:t>
+              <w:t>☑</w:t>
             </w:r>
           </w:p>
         </w:tc>
@@ -5867,7 +5867,7 @@
                 <w:b/>
                 <w:bCs/>
               </w:rPr>
-              <w:t>Planned</w:t>
+              <w:t>Baseline</w:t>
             </w:r>
           </w:p>
         </w:tc>
@@ -5921,7 +5921,7 @@
               <w:rPr>
                 <w:rFonts w:ascii="Calibri" w:hAnsi="Calibri" w:cs="Calibri"/>
               </w:rPr>
-              <w:t>Four-width EN/FI geometry, a11y, performance and visual evidence</w:t>
+              <w:t>Registered transformations; four-width EN/FI geometry; keyboard/semantic/contrast; bounded performance/build budgets; browser and retained human visual evidence</w:t>
             </w:r>
           </w:p>
         </w:tc>
@@ -10228,7 +10228,7 @@
         <w:rPr>
           <w:rFonts w:ascii="Calibri" w:hAnsi="Calibri" w:cs="Calibri"/>
         </w:rPr>
-        <w:t xml:space="preserve">. P10B-01 through P10B-16, P10B-16P-01 through P10B-16P-05A, and P10B-16P-06 are </w:t>
+        <w:t xml:space="preserve">. P10B-01 through P10B-17, P10B-16P-01 through P10B-16P-05A, and P10B-16P-06 are </w:t>
       </w:r>
       <w:r>
         <w:rPr>
@@ -10256,7 +10256,7 @@
         <w:rPr>
           <w:rFonts w:ascii="Calibri" w:hAnsi="Calibri" w:cs="Calibri"/>
         </w:rPr>
-        <w:t xml:space="preserve">. P10B-16P-05B, P10B-17, and P10B-18 remain </w:t>
+        <w:t xml:space="preserve">. P10B-16P-05B and P10B-18 remain </w:t>
       </w:r>
       <w:r>
         <w:rPr>
@@ -10286,7 +10286,7 @@
         <w:rPr>
           <w:rFonts w:ascii="Calibri" w:hAnsi="Calibri" w:cs="Calibri"/>
         </w:rPr>
-        <w:t>. The remaining Done conditions are implementation gates, not claims about the current repository. The P10B-16P-01 through P10B-16P-05A plus P10B-16P-06 sequence is a mandatory convergence package between P10B-16 and P10B-17; it supplements rather than renumbers the locked P10B-01 through P10B-18 plan. P10B-16P-05B follows P10B-18 as the final consumer-verified historical cleanup. P10B-17 is the next focused product task.</w:t>
+        <w:t>. The remaining Done conditions are implementation gates, not claims about the current repository. The P10B-16P-01 through P10B-16P-05A plus P10B-16P-06 sequence is a mandatory convergence package between P10B-16 and P10B-17; it supplements rather than renumbers the locked P10B-01 through P10B-18 plan. P10B-16P-05B follows P10B-18 as the final consumer-verified historical cleanup. P10B-18 is the next focused product task.</w:t>
       </w:r>
     </w:p>
     <w:p>
@@ -15060,7 +15060,7 @@
         <w:rPr>
           <w:rFonts w:ascii="Calibri" w:hAnsi="Calibri" w:cs="Calibri"/>
         </w:rPr>
-        <w:t xml:space="preserve"> A trusted server-owned, production-disabled Aurum acceptance composition loaded current project, draft, evidence, assets, catalogue, and capability authority before explicit provider selection. The cumulative P10B-16P-04 ledger records 16 authorized calls with zero retries or fallback; the final Premium Editorial, Modern Technical, and Minimal Commerce calls each returned strict semantic intent, compiled deterministically, and materialized exactly one isolated proposal through normal Storefront Studio. Prompt A and Prompt B were rejected without draft or history mutation. Prompt C passed Accept, exact Undo/Redo, Save, reload, and normal Preview with no publication. The three results were materially distinct, retained human visual acceptance, and preserved protected commerce and canonical product media. Search presentation remains registered while execution fails closed. P10B-16L is </w:t>
+        <w:t xml:space="preserve"> A trusted server-owned, production-disabled Aurum acceptance composition loaded current project, draft, evidence, assets, catalogue, and capability authority before explicit provider selection. The cumulative P10B-16P-04 ledger records 16 authorized calls with zero retries or fallback; the final Premium Editorial, Modern Technical, and Minimal Commerce calls each returned strict semantic intent, compiled deterministically, and materialized exactly one isolated proposal through normal Storefront Studio. Prompt A and Prompt B were rejected without draft or history mutation. Prompt C passed Accept, exact Undo/Redo, Save, reload, and normal Preview with no publication. The three results were materially distinct, retained human visual acceptance, and preserved protected commerce and canonical product media. At the P10B-16P-04 acceptance point, search presentation remained registered while execution failed closed. P10B-16P-06 later supplied the current canonical transient query/results execution; that later capability does not alter the P10B-16P-04 call ledger, provider evidence, or acceptance result. P10B-16L is </w:t>
       </w:r>
       <w:r>
         <w:rPr>
@@ -15745,7 +15745,7 @@
         <w:rPr>
           <w:rFonts w:ascii="Calibri" w:hAnsi="Calibri" w:cs="Calibri"/>
         </w:rPr>
-        <w:t>P10B-17 is the next focused product task. P10B remains Partial; P10B-18 and the P10B-16P-05B final historical cleanup remain Planned.</w:t>
+        <w:t>P10B-17 is Baseline. P10B remains Partial; P10B-18 is the next focused product task and the P10B-16P-05B final historical cleanup remains Planned after P10B-18.</w:t>
       </w:r>
     </w:p>
     <w:p>
@@ -15800,6 +15800,44 @@
           <w:b/>
           <w:bCs/>
         </w:rPr>
+        <w:t>Status:</w:t>
+      </w:r>
+      <w:r>
+        <w:rPr>
+          <w:rFonts w:ascii="Calibri" w:hAnsi="Calibri" w:cs="Calibri"/>
+        </w:rPr>
+        <w:t xml:space="preserve"> </w:t>
+      </w:r>
+      <w:r>
+        <w:rPr>
+          <w:rFonts w:ascii="Calibri" w:hAnsi="Calibri" w:cs="Calibri"/>
+          <w:b/>
+          <w:bCs/>
+        </w:rPr>
+        <w:t>Baseline</w:t>
+      </w:r>
+      <w:r>
+        <w:rPr>
+          <w:rFonts w:ascii="Calibri" w:hAnsi="Calibri" w:cs="Calibri"/>
+        </w:rPr>
+        <w:t>. Completed 16 August 2026 with zero provider or Vesko calls.</w:t>
+      </w:r>
+    </w:p>
+    <w:p>
+      <w:pPr>
+        <w:pStyle w:val="Normal"/>
+        <w:numPr>
+          <w:ilvl w:val="0"/>
+          <w:numId w:val="1"/>
+        </w:numPr>
+        <w:widowControl/>
+      </w:pPr>
+      <w:r>
+        <w:rPr>
+          <w:rFonts w:ascii="Calibri" w:hAnsi="Calibri" w:cs="Calibri"/>
+          <w:b/>
+          <w:bCs/>
+        </w:rPr>
         <w:t>Authority:</w:t>
       </w:r>
       <w:r>
@@ -15848,13 +15886,13 @@
           <w:b/>
           <w:bCs/>
         </w:rPr>
-        <w:t>Done when:</w:t>
-      </w:r>
-      <w:r>
-        <w:rPr>
-          <w:rFonts w:ascii="Calibri" w:hAnsi="Calibri" w:cs="Calibri"/>
-        </w:rPr>
-        <w:t xml:space="preserve"> All supported page families/directions pass 375/768/1024/1440 and EN/FI geometry, declared transformations, keyboard/focus/semantics/contrast, content/commerce retention, and explicit performance budgets with correlated evidence.</w:t>
+        <w:t>Done:</w:t>
+      </w:r>
+      <w:r>
+        <w:rPr>
+          <w:rFonts w:ascii="Calibri" w:hAnsi="Calibri" w:cs="Calibri"/>
+        </w:rPr>
+        <w:t xml:space="preserve"> Retained Premium Editorial, Modern Technical, Minimal Commerce, neutral, and commerce- integrity authority executes through the existing renderers at 375/768/1024/1440 and EN/FI. Registered navigation, disclosure, stack/reflow, media, merchandising, purchase-flow, content, utility, search, and footer transformations preserve content, protected commerce, and canonical product media. Keyboard/focus, landmark/heading/form/control semantics, announcements, contrast, touch targets, reduced motion, and locale expansion pass the bounded acceptance matrix.</w:t>
       </w:r>
     </w:p>
     <w:p>
@@ -15902,7 +15940,7 @@
         <w:rPr>
           <w:rFonts w:ascii="Calibri" w:hAnsi="Calibri" w:cs="Calibri"/>
         </w:rPr>
-        <w:t xml:space="preserve"> Automated geometry/a11y/performance/browser matrices plus retained representative human review.</w:t>
+        <w:t xml:space="preserve"> Automated geometry, accessibility, performance, build-budget, lifecycle-renderer, and browser matrices plus retained representative four-width human visual review correlated to current authority and protected commerce/media fingerprints.</w:t>
       </w:r>
     </w:p>
     <w:p>
@@ -15926,7 +15964,7 @@
         <w:rPr>
           <w:rFonts w:ascii="Calibri" w:hAnsi="Calibri" w:cs="Calibri"/>
         </w:rPr>
-        <w:t xml:space="preserve"> Visual approval from isolated component screenshots.</w:t>
+        <w:t xml:space="preserve"> P10B-18 designer-grade commercial quality or 100+ scale, Vesko integration/staging, production authentication/performance/readiness, or visual approval from isolated component screenshots.</w:t>
       </w:r>
     </w:p>
     <w:p>

</xml_diff>

<commit_message>
docs: accept P10B-18A commercial authority audit
</commit_message>
<xml_diff>
--- a/docs/VESKIFY_DEVELOPMENT_DELIVERY_TRACKER_v1.3.0.docx
+++ b/docs/VESKIFY_DEVELOPMENT_DELIVERY_TRACKER_v1.3.0.docx
@@ -38,7 +38,7 @@
         <w:rPr>
           <w:rFonts w:ascii="Calibri" w:hAnsi="Calibri" w:cs="Calibri"/>
         </w:rPr>
-        <w:t>Delivery status baseline: 16 August 2026, P10B-17 responsive, accessibility and performance closure</w:t>
+        <w:t>Delivery status baseline: 16 August 2026, accepted P10B-18A commercial-authority audit</w:t>
       </w:r>
     </w:p>
     <w:p>
@@ -245,7 +245,7 @@
               <w:rPr>
                 <w:rFonts w:ascii="Calibri" w:hAnsi="Calibri" w:cs="Calibri"/>
               </w:rPr>
-              <w:t>16 August 2026, P10B-17 responsive, accessibility and performance closure</w:t>
+              <w:t>16 August 2026, accepted P10B-18A commercial-authority audit</w:t>
             </w:r>
           </w:p>
         </w:tc>
@@ -6002,7 +6002,7 @@
                 <w:b/>
                 <w:bCs/>
               </w:rPr>
-              <w:t>Planned</w:t>
+              <w:t>Partial</w:t>
             </w:r>
           </w:p>
         </w:tc>
@@ -6056,7 +6056,7 @@
               <w:rPr>
                 <w:rFonts w:ascii="Calibri" w:hAnsi="Calibri" w:cs="Calibri"/>
               </w:rPr>
-              <w:t>100+ configurations and fingerprint-stratified human review</w:t>
+              <w:t>Accepted audit, source-authority upgrade, then 100+ configurations and fingerprint-stratified human review</w:t>
             </w:r>
           </w:p>
         </w:tc>
@@ -6080,7 +6080,7 @@
               <w:rPr>
                 <w:rFonts w:ascii="Calibri" w:hAnsi="Calibri" w:cs="Calibri"/>
               </w:rPr>
-              <w:t>☐</w:t>
+              <w:t>☑</w:t>
             </w:r>
           </w:p>
         </w:tc>
@@ -6098,7 +6098,7 @@
               <w:rPr>
                 <w:rFonts w:ascii="Calibri" w:hAnsi="Calibri" w:cs="Calibri"/>
               </w:rPr>
-              <w:t>P10B-16P-05B</w:t>
+              <w:t>P10B-18A</w:t>
             </w:r>
           </w:p>
         </w:tc>
@@ -6116,7 +6116,7 @@
               <w:rPr>
                 <w:rFonts w:ascii="Calibri" w:hAnsi="Calibri" w:cs="Calibri"/>
               </w:rPr>
-              <w:t>Final historical acceptance cleanup</w:t>
+              <w:t>Commercial authority audit and ceiling diagnosis</w:t>
             </w:r>
           </w:p>
         </w:tc>
@@ -6137,6 +6137,141 @@
                 <w:b/>
                 <w:bCs/>
               </w:rPr>
+              <w:t>Baseline</w:t>
+            </w:r>
+          </w:p>
+        </w:tc>
+        <w:tc>
+          <w:tcPr>
+            <w:tcW w:w="1500" w:type="dxa"/>
+            <w:vAlign w:val="center"/>
+          </w:tcPr>
+          <w:p>
+            <w:pPr>
+              <w:pStyle w:val="CompactTableText"/>
+              <w:widowControl/>
+            </w:pPr>
+            <w:r>
+              <w:rPr>
+                <w:rFonts w:ascii="Calibri" w:hAnsi="Calibri" w:cs="Calibri"/>
+              </w:rPr>
+              <w:t>Product owner, generation, QA</w:t>
+            </w:r>
+          </w:p>
+        </w:tc>
+        <w:tc>
+          <w:tcPr>
+            <w:tcW w:w="2500" w:type="dxa"/>
+            <w:vAlign w:val="center"/>
+          </w:tcPr>
+          <w:p>
+            <w:pPr>
+              <w:pStyle w:val="CompactTableText"/>
+              <w:widowControl/>
+            </w:pPr>
+            <w:r>
+              <w:rPr>
+                <w:rFonts w:ascii="Calibri" w:hAnsi="Calibri" w:cs="Calibri"/>
+              </w:rPr>
+              <w:t>P10B-17 and current authority</w:t>
+            </w:r>
+          </w:p>
+        </w:tc>
+        <w:tc>
+          <w:tcPr>
+            <w:tcW w:w="2890" w:type="dxa"/>
+            <w:vAlign w:val="center"/>
+          </w:tcPr>
+          <w:p>
+            <w:pPr>
+              <w:pStyle w:val="CompactTableText"/>
+              <w:widowControl/>
+            </w:pPr>
+            <w:r>
+              <w:rPr>
+                <w:rFonts w:ascii="Calibri" w:hAnsi="Calibri" w:cs="Calibri"/>
+              </w:rPr>
+              <w:t>Accepted 72-case matrix, 18-store/108-capture human review, protected commerce/media, zero provider/Vesko/publication traffic</w:t>
+            </w:r>
+          </w:p>
+        </w:tc>
+      </w:tr>
+      <w:tr>
+        <w:trPr>
+          <w:cantSplit/>
+        </w:trPr>
+        <w:tc>
+          <w:tcPr>
+            <w:tcW w:w="720" w:type="dxa"/>
+            <w:vAlign w:val="center"/>
+          </w:tcPr>
+          <w:p>
+            <w:pPr>
+              <w:pStyle w:val="CompactTableText"/>
+              <w:jc w:val="center"/>
+              <w:widowControl/>
+            </w:pPr>
+            <w:r>
+              <w:rPr>
+                <w:rFonts w:ascii="Calibri" w:hAnsi="Calibri" w:cs="Calibri"/>
+              </w:rPr>
+              <w:t>☐</w:t>
+            </w:r>
+          </w:p>
+        </w:tc>
+        <w:tc>
+          <w:tcPr>
+            <w:tcW w:w="1700" w:type="dxa"/>
+            <w:vAlign w:val="center"/>
+          </w:tcPr>
+          <w:p>
+            <w:pPr>
+              <w:pStyle w:val="CompactTableText"/>
+              <w:widowControl/>
+            </w:pPr>
+            <w:r>
+              <w:rPr>
+                <w:rFonts w:ascii="Calibri" w:hAnsi="Calibri" w:cs="Calibri"/>
+              </w:rPr>
+              <w:t>P10B-18B</w:t>
+            </w:r>
+          </w:p>
+        </w:tc>
+        <w:tc>
+          <w:tcPr>
+            <w:tcW w:w="2800" w:type="dxa"/>
+            <w:vAlign w:val="center"/>
+          </w:tcPr>
+          <w:p>
+            <w:pPr>
+              <w:pStyle w:val="CompactTableText"/>
+              <w:widowControl/>
+            </w:pPr>
+            <w:r>
+              <w:rPr>
+                <w:rFonts w:ascii="Calibri" w:hAnsi="Calibri" w:cs="Calibri"/>
+              </w:rPr>
+              <w:t>Commercial source-authority quality upgrade</w:t>
+            </w:r>
+          </w:p>
+        </w:tc>
+        <w:tc>
+          <w:tcPr>
+            <w:tcW w:w="850" w:type="dxa"/>
+            <w:vAlign w:val="center"/>
+          </w:tcPr>
+          <w:p>
+            <w:pPr>
+              <w:pStyle w:val="CompactTableText"/>
+              <w:jc w:val="center"/>
+              <w:widowControl/>
+            </w:pPr>
+            <w:r>
+              <w:rPr>
+                <w:rFonts w:ascii="Calibri" w:hAnsi="Calibri" w:cs="Calibri"/>
+                <w:b/>
+                <w:bCs/>
+              </w:rPr>
               <w:t>Planned</w:t>
             </w:r>
           </w:p>
@@ -6155,6 +6290,276 @@
               <w:rPr>
                 <w:rFonts w:ascii="Calibri" w:hAnsi="Calibri" w:cs="Calibri"/>
               </w:rPr>
+              <w:t>Generation/component/profile owners</w:t>
+            </w:r>
+          </w:p>
+        </w:tc>
+        <w:tc>
+          <w:tcPr>
+            <w:tcW w:w="2500" w:type="dxa"/>
+            <w:vAlign w:val="center"/>
+          </w:tcPr>
+          <w:p>
+            <w:pPr>
+              <w:pStyle w:val="CompactTableText"/>
+              <w:widowControl/>
+            </w:pPr>
+            <w:r>
+              <w:rPr>
+                <w:rFonts w:ascii="Calibri" w:hAnsi="Calibri" w:cs="Calibri"/>
+              </w:rPr>
+              <w:t>Accepted P10B-18A</w:t>
+            </w:r>
+          </w:p>
+        </w:tc>
+        <w:tc>
+          <w:tcPr>
+            <w:tcW w:w="2890" w:type="dxa"/>
+            <w:vAlign w:val="center"/>
+          </w:tcPr>
+          <w:p>
+            <w:pPr>
+              <w:pStyle w:val="CompactTableText"/>
+              <w:widowControl/>
+            </w:pPr>
+            <w:r>
+              <w:rPr>
+                <w:rFonts w:ascii="Calibri" w:hAnsi="Calibri" w:cs="Calibri"/>
+              </w:rPr>
+              <w:t>Six coherent packages with focused and integrated browser/human evidence against the frozen audit baseline</w:t>
+            </w:r>
+          </w:p>
+        </w:tc>
+      </w:tr>
+      <w:tr>
+        <w:trPr>
+          <w:cantSplit/>
+        </w:trPr>
+        <w:tc>
+          <w:tcPr>
+            <w:tcW w:w="720" w:type="dxa"/>
+            <w:vAlign w:val="center"/>
+          </w:tcPr>
+          <w:p>
+            <w:pPr>
+              <w:pStyle w:val="CompactTableText"/>
+              <w:jc w:val="center"/>
+              <w:widowControl/>
+            </w:pPr>
+            <w:r>
+              <w:rPr>
+                <w:rFonts w:ascii="Calibri" w:hAnsi="Calibri" w:cs="Calibri"/>
+              </w:rPr>
+              <w:t>☐</w:t>
+            </w:r>
+          </w:p>
+        </w:tc>
+        <w:tc>
+          <w:tcPr>
+            <w:tcW w:w="1700" w:type="dxa"/>
+            <w:vAlign w:val="center"/>
+          </w:tcPr>
+          <w:p>
+            <w:pPr>
+              <w:pStyle w:val="CompactTableText"/>
+              <w:widowControl/>
+            </w:pPr>
+            <w:r>
+              <w:rPr>
+                <w:rFonts w:ascii="Calibri" w:hAnsi="Calibri" w:cs="Calibri"/>
+              </w:rPr>
+              <w:t>P10B-18C</w:t>
+            </w:r>
+          </w:p>
+        </w:tc>
+        <w:tc>
+          <w:tcPr>
+            <w:tcW w:w="2800" w:type="dxa"/>
+            <w:vAlign w:val="center"/>
+          </w:tcPr>
+          <w:p>
+            <w:pPr>
+              <w:pStyle w:val="CompactTableText"/>
+              <w:widowControl/>
+            </w:pPr>
+            <w:r>
+              <w:rPr>
+                <w:rFonts w:ascii="Calibri" w:hAnsi="Calibri" w:cs="Calibri"/>
+              </w:rPr>
+              <w:t>100+ commercial quality and diversity gate</w:t>
+            </w:r>
+          </w:p>
+        </w:tc>
+        <w:tc>
+          <w:tcPr>
+            <w:tcW w:w="850" w:type="dxa"/>
+            <w:vAlign w:val="center"/>
+          </w:tcPr>
+          <w:p>
+            <w:pPr>
+              <w:pStyle w:val="CompactTableText"/>
+              <w:jc w:val="center"/>
+              <w:widowControl/>
+            </w:pPr>
+            <w:r>
+              <w:rPr>
+                <w:rFonts w:ascii="Calibri" w:hAnsi="Calibri" w:cs="Calibri"/>
+                <w:b/>
+                <w:bCs/>
+              </w:rPr>
+              <w:t>Planned</w:t>
+            </w:r>
+          </w:p>
+        </w:tc>
+        <w:tc>
+          <w:tcPr>
+            <w:tcW w:w="1500" w:type="dxa"/>
+            <w:vAlign w:val="center"/>
+          </w:tcPr>
+          <w:p>
+            <w:pPr>
+              <w:pStyle w:val="CompactTableText"/>
+              <w:widowControl/>
+            </w:pPr>
+            <w:r>
+              <w:rPr>
+                <w:rFonts w:ascii="Calibri" w:hAnsi="Calibri" w:cs="Calibri"/>
+              </w:rPr>
+              <w:t>Product owner, generation, QA</w:t>
+            </w:r>
+          </w:p>
+        </w:tc>
+        <w:tc>
+          <w:tcPr>
+            <w:tcW w:w="2500" w:type="dxa"/>
+            <w:vAlign w:val="center"/>
+          </w:tcPr>
+          <w:p>
+            <w:pPr>
+              <w:pStyle w:val="CompactTableText"/>
+              <w:widowControl/>
+            </w:pPr>
+            <w:r>
+              <w:rPr>
+                <w:rFonts w:ascii="Calibri" w:hAnsi="Calibri" w:cs="Calibri"/>
+              </w:rPr>
+              <w:t>Accepted and integrated P10B-18B packages</w:t>
+            </w:r>
+          </w:p>
+        </w:tc>
+        <w:tc>
+          <w:tcPr>
+            <w:tcW w:w="2890" w:type="dxa"/>
+            <w:vAlign w:val="center"/>
+          </w:tcPr>
+          <w:p>
+            <w:pPr>
+              <w:pStyle w:val="CompactTableText"/>
+              <w:widowControl/>
+            </w:pPr>
+            <w:r>
+              <w:rPr>
+                <w:rFonts w:ascii="Calibri" w:hAnsi="Calibri" w:cs="Calibri"/>
+              </w:rPr>
+              <w:t>100+ complete configurations, protected-state/diversity gates and fingerprint-stratified four-width retained human review</w:t>
+            </w:r>
+          </w:p>
+        </w:tc>
+      </w:tr>
+      <w:tr>
+        <w:trPr>
+          <w:cantSplit/>
+        </w:trPr>
+        <w:tc>
+          <w:tcPr>
+            <w:tcW w:w="720" w:type="dxa"/>
+            <w:vAlign w:val="center"/>
+          </w:tcPr>
+          <w:p>
+            <w:pPr>
+              <w:pStyle w:val="CompactTableText"/>
+              <w:jc w:val="center"/>
+              <w:widowControl/>
+            </w:pPr>
+            <w:r>
+              <w:rPr>
+                <w:rFonts w:ascii="Calibri" w:hAnsi="Calibri" w:cs="Calibri"/>
+              </w:rPr>
+              <w:t>☐</w:t>
+            </w:r>
+          </w:p>
+        </w:tc>
+        <w:tc>
+          <w:tcPr>
+            <w:tcW w:w="1700" w:type="dxa"/>
+            <w:vAlign w:val="center"/>
+          </w:tcPr>
+          <w:p>
+            <w:pPr>
+              <w:pStyle w:val="CompactTableText"/>
+              <w:widowControl/>
+            </w:pPr>
+            <w:r>
+              <w:rPr>
+                <w:rFonts w:ascii="Calibri" w:hAnsi="Calibri" w:cs="Calibri"/>
+              </w:rPr>
+              <w:t>P10B-16P-05B</w:t>
+            </w:r>
+          </w:p>
+        </w:tc>
+        <w:tc>
+          <w:tcPr>
+            <w:tcW w:w="2800" w:type="dxa"/>
+            <w:vAlign w:val="center"/>
+          </w:tcPr>
+          <w:p>
+            <w:pPr>
+              <w:pStyle w:val="CompactTableText"/>
+              <w:widowControl/>
+            </w:pPr>
+            <w:r>
+              <w:rPr>
+                <w:rFonts w:ascii="Calibri" w:hAnsi="Calibri" w:cs="Calibri"/>
+              </w:rPr>
+              <w:t>Final historical acceptance cleanup</w:t>
+            </w:r>
+          </w:p>
+        </w:tc>
+        <w:tc>
+          <w:tcPr>
+            <w:tcW w:w="850" w:type="dxa"/>
+            <w:vAlign w:val="center"/>
+          </w:tcPr>
+          <w:p>
+            <w:pPr>
+              <w:pStyle w:val="CompactTableText"/>
+              <w:jc w:val="center"/>
+              <w:widowControl/>
+            </w:pPr>
+            <w:r>
+              <w:rPr>
+                <w:rFonts w:ascii="Calibri" w:hAnsi="Calibri" w:cs="Calibri"/>
+                <w:b/>
+                <w:bCs/>
+              </w:rPr>
+              <w:t>Planned</w:t>
+            </w:r>
+          </w:p>
+        </w:tc>
+        <w:tc>
+          <w:tcPr>
+            <w:tcW w:w="1500" w:type="dxa"/>
+            <w:vAlign w:val="center"/>
+          </w:tcPr>
+          <w:p>
+            <w:pPr>
+              <w:pStyle w:val="CompactTableText"/>
+              <w:widowControl/>
+            </w:pPr>
+            <w:r>
+              <w:rPr>
+                <w:rFonts w:ascii="Calibri" w:hAnsi="Calibri" w:cs="Calibri"/>
+              </w:rPr>
               <w:t>Generation architecture/evidence</w:t>
             </w:r>
           </w:p>
@@ -6173,7 +6578,7 @@
               <w:rPr>
                 <w:rFonts w:ascii="Calibri" w:hAnsi="Calibri" w:cs="Calibri"/>
               </w:rPr>
-              <w:t>P10B-16P-05A and P10B-18</w:t>
+              <w:t>P10B-16P-05A and P10B-18C</w:t>
             </w:r>
           </w:p>
         </w:tc>
@@ -10228,7 +10633,7 @@
         <w:rPr>
           <w:rFonts w:ascii="Calibri" w:hAnsi="Calibri" w:cs="Calibri"/>
         </w:rPr>
-        <w:t xml:space="preserve">. P10B-01 through P10B-17, P10B-16P-01 through P10B-16P-05A, and P10B-16P-06 are </w:t>
+        <w:t xml:space="preserve">. P10B-01 through P10B-17, P10B-16P-01 through P10B-16P-05A, P10B-16P-06, and accepted P10B-18A are </w:t>
       </w:r>
       <w:r>
         <w:rPr>
@@ -10256,7 +10661,21 @@
         <w:rPr>
           <w:rFonts w:ascii="Calibri" w:hAnsi="Calibri" w:cs="Calibri"/>
         </w:rPr>
-        <w:t xml:space="preserve">. P10B-16P-05B and P10B-18 remain </w:t>
+        <w:t xml:space="preserve">. Parent P10B-18 remains </w:t>
+      </w:r>
+      <w:r>
+        <w:rPr>
+          <w:rFonts w:ascii="Calibri" w:hAnsi="Calibri" w:cs="Calibri"/>
+          <w:b/>
+          <w:bCs/>
+        </w:rPr>
+        <w:t>Partial</w:t>
+      </w:r>
+      <w:r>
+        <w:rPr>
+          <w:rFonts w:ascii="Calibri" w:hAnsi="Calibri" w:cs="Calibri"/>
+        </w:rPr>
+        <w:t xml:space="preserve">; P10B-18B and P10B-18C remain </w:t>
       </w:r>
       <w:r>
         <w:rPr>
@@ -10286,7 +10705,7 @@
         <w:rPr>
           <w:rFonts w:ascii="Calibri" w:hAnsi="Calibri" w:cs="Calibri"/>
         </w:rPr>
-        <w:t>. The remaining Done conditions are implementation gates, not claims about the current repository. The P10B-16P-01 through P10B-16P-05A plus P10B-16P-06 sequence is a mandatory convergence package between P10B-16 and P10B-17; it supplements rather than renumbers the locked P10B-01 through P10B-18 plan. P10B-16P-05B follows P10B-18 as the final consumer-verified historical cleanup. P10B-18 is the next focused product task.</w:t>
+        <w:t>. The remaining Done conditions are implementation gates, not claims about the current repository. The P10B-16P-01 through P10B-16P-05A plus P10B-16P-06 sequence is a mandatory convergence package between P10B-16 and P10B-17; it supplements rather than renumbers the locked P10B-01 through P10B-18 plan. P10B-16P-05B follows P10B-18C as the final consumer-verified historical cleanup. P10B-18B is the next focused product task.</w:t>
       </w:r>
     </w:p>
     <w:p>
@@ -15269,7 +15688,7 @@
         <w:rPr>
           <w:rFonts w:ascii="Calibri" w:hAnsi="Calibri" w:cs="Calibri"/>
         </w:rPr>
-        <w:t xml:space="preserve"> Architecture/dependency checks, provider/security and semantic compiler/executor tests, deterministic Prompt A/B/C replay, Prompt C lifecycle, dynamic-route migration, publication separation, and protected commerce/media regressions. The P10B-16P-04 acceptance composition remains production-disabled through P10B-18.</w:t>
+        <w:t xml:space="preserve"> Architecture/dependency checks, provider/security and semantic compiler/executor tests, deterministic Prompt A/B/C replay, Prompt C lifecycle, dynamic-route migration, publication separation, and protected commerce/media regressions. The P10B-16P-04 acceptance composition remains production-disabled through P10B-18C.</w:t>
       </w:r>
     </w:p>
     <w:p>
@@ -15661,7 +16080,7 @@
         <w:rPr>
           <w:rFonts w:ascii="Calibri" w:hAnsi="Calibri" w:cs="Calibri"/>
         </w:rPr>
-        <w:t xml:space="preserve"> after P10B-18.</w:t>
+        <w:t xml:space="preserve"> after P10B-18C.</w:t>
       </w:r>
     </w:p>
     <w:p>
@@ -15685,7 +16104,7 @@
         <w:rPr>
           <w:rFonts w:ascii="Calibri" w:hAnsi="Calibri" w:cs="Calibri"/>
         </w:rPr>
-        <w:t xml:space="preserve"> P10B-16P-05A and P10B-18.</w:t>
+        <w:t xml:space="preserve"> P10B-16P-05A and P10B-18C.</w:t>
       </w:r>
     </w:p>
     <w:p>
@@ -15745,7 +16164,7 @@
         <w:rPr>
           <w:rFonts w:ascii="Calibri" w:hAnsi="Calibri" w:cs="Calibri"/>
         </w:rPr>
-        <w:t>P10B-17 is Baseline. P10B remains Partial; P10B-18 is the next focused product task and the P10B-16P-05B final historical cleanup remains Planned after P10B-18.</w:t>
+        <w:t>P10B-17 and accepted P10B-18A are Baseline. Parent P10B-18 and P10B remain Partial; P10B-18B is the next focused product task, P10B-18C remains Planned after it, and P10B-16P-05B remains Planned after P10B-18C.</w:t>
       </w:r>
     </w:p>
     <w:p>
@@ -15964,7 +16383,7 @@
         <w:rPr>
           <w:rFonts w:ascii="Calibri" w:hAnsi="Calibri" w:cs="Calibri"/>
         </w:rPr>
-        <w:t xml:space="preserve"> P10B-18 designer-grade commercial quality or 100+ scale, Vesko integration/staging, production authentication/performance/readiness, or visual approval from isolated component screenshots.</w:t>
+        <w:t xml:space="preserve"> P10B-18B source-authority improvement, P10B-18C designer-grade commercial quality or 100+ scale, Vesko integration/staging, production authentication/performance/readiness, or visual approval from isolated component screenshots.</w:t>
       </w:r>
     </w:p>
     <w:p>
@@ -16019,6 +16438,44 @@
           <w:b/>
           <w:bCs/>
         </w:rPr>
+        <w:t>Status:</w:t>
+      </w:r>
+      <w:r>
+        <w:rPr>
+          <w:rFonts w:ascii="Calibri" w:hAnsi="Calibri" w:cs="Calibri"/>
+        </w:rPr>
+        <w:t xml:space="preserve"> </w:t>
+      </w:r>
+      <w:r>
+        <w:rPr>
+          <w:rFonts w:ascii="Calibri" w:hAnsi="Calibri" w:cs="Calibri"/>
+          <w:b/>
+          <w:bCs/>
+        </w:rPr>
+        <w:t>Partial</w:t>
+      </w:r>
+      <w:r>
+        <w:rPr>
+          <w:rFonts w:ascii="Calibri" w:hAnsi="Calibri" w:cs="Calibri"/>
+        </w:rPr>
+        <w:t>. P10B-18A is Baseline; P10B-18B and P10B-18C remain Planned.</w:t>
+      </w:r>
+    </w:p>
+    <w:p>
+      <w:pPr>
+        <w:pStyle w:val="Normal"/>
+        <w:numPr>
+          <w:ilvl w:val="0"/>
+          <w:numId w:val="1"/>
+        </w:numPr>
+        <w:widowControl/>
+      </w:pPr>
+      <w:r>
+        <w:rPr>
+          <w:rFonts w:ascii="Calibri" w:hAnsi="Calibri" w:cs="Calibri"/>
+          <w:b/>
+          <w:bCs/>
+        </w:rPr>
         <w:t>Authority:</w:t>
       </w:r>
       <w:r>
@@ -16146,6 +16603,535 @@
           <w:rFonts w:ascii="Calibri" w:hAnsi="Calibri" w:cs="Calibri"/>
         </w:rPr>
         <w:t xml:space="preserve"> P10C merchant editing, Vesko staging, or production-readiness claims.</w:t>
+      </w:r>
+    </w:p>
+    <w:p>
+      <w:pPr>
+        <w:pStyle w:val="Heading3"/>
+        <w:keepNext/>
+        <w:widowControl/>
+      </w:pPr>
+      <w:r>
+        <w:rPr>
+          <w:rFonts w:ascii="Calibri" w:hAnsi="Calibri" w:cs="Calibri"/>
+        </w:rPr>
+        <w:t>P10B-18A — Commercial authority audit and quality-ceiling diagnosis</w:t>
+      </w:r>
+    </w:p>
+    <w:p>
+      <w:pPr>
+        <w:pStyle w:val="Normal"/>
+        <w:numPr>
+          <w:ilvl w:val="0"/>
+          <w:numId w:val="1"/>
+        </w:numPr>
+        <w:widowControl/>
+      </w:pPr>
+      <w:r>
+        <w:rPr>
+          <w:rFonts w:ascii="Calibri" w:hAnsi="Calibri" w:cs="Calibri"/>
+          <w:b/>
+          <w:bCs/>
+        </w:rPr>
+        <w:t>Outcome:</w:t>
+      </w:r>
+      <w:r>
+        <w:rPr>
+          <w:rFonts w:ascii="Calibri" w:hAnsi="Calibri" w:cs="Calibri"/>
+        </w:rPr>
+        <w:t xml:space="preserve"> Establish the exact commercial ceiling of current registered source authority and assign each observed defect to fixture/source evidence, compatibility, materializer/renderer consumption or missing evaluation authority before any redesign.</w:t>
+      </w:r>
+    </w:p>
+    <w:p>
+      <w:pPr>
+        <w:pStyle w:val="Normal"/>
+        <w:numPr>
+          <w:ilvl w:val="0"/>
+          <w:numId w:val="1"/>
+        </w:numPr>
+        <w:widowControl/>
+      </w:pPr>
+      <w:r>
+        <w:rPr>
+          <w:rFonts w:ascii="Calibri" w:hAnsi="Calibri" w:cs="Calibri"/>
+          <w:b/>
+          <w:bCs/>
+        </w:rPr>
+        <w:t>Status:</w:t>
+      </w:r>
+      <w:r>
+        <w:rPr>
+          <w:rFonts w:ascii="Calibri" w:hAnsi="Calibri" w:cs="Calibri"/>
+        </w:rPr>
+        <w:t xml:space="preserve"> </w:t>
+      </w:r>
+      <w:r>
+        <w:rPr>
+          <w:rFonts w:ascii="Calibri" w:hAnsi="Calibri" w:cs="Calibri"/>
+          <w:b/>
+          <w:bCs/>
+        </w:rPr>
+        <w:t>Baseline</w:t>
+      </w:r>
+      <w:r>
+        <w:rPr>
+          <w:rFonts w:ascii="Calibri" w:hAnsi="Calibri" w:cs="Calibri"/>
+        </w:rPr>
+        <w:t xml:space="preserve">. Accepted by the product owner on 16 August 2026 under </w:t>
+      </w:r>
+      <w:hyperlink r:id="rIdHyperlink23" w:history="1">
+        <w:r>
+          <w:rPr>
+            <w:rFonts w:ascii="Calibri" w:hAnsi="Calibri" w:cs="Calibri"/>
+            <w:color w:val="2E74B5"/>
+            <w:u w:val="single"/>
+          </w:rPr>
+          <w:t>P10B_18_COMMERCIAL_QUALITY_AUDIT.md</w:t>
+        </w:r>
+      </w:hyperlink>
+      <w:r>
+        <w:rPr>
+          <w:rFonts w:ascii="Calibri" w:hAnsi="Calibri" w:cs="Calibri"/>
+        </w:rPr>
+        <w:t>.</w:t>
+      </w:r>
+    </w:p>
+    <w:p>
+      <w:pPr>
+        <w:pStyle w:val="Normal"/>
+        <w:numPr>
+          <w:ilvl w:val="0"/>
+          <w:numId w:val="1"/>
+        </w:numPr>
+        <w:widowControl/>
+      </w:pPr>
+      <w:r>
+        <w:rPr>
+          <w:rFonts w:ascii="Calibri" w:hAnsi="Calibri" w:cs="Calibri"/>
+          <w:b/>
+          <w:bCs/>
+        </w:rPr>
+        <w:t>Depends on:</w:t>
+      </w:r>
+      <w:r>
+        <w:rPr>
+          <w:rFonts w:ascii="Calibri" w:hAnsi="Calibri" w:cs="Calibri"/>
+        </w:rPr>
+        <w:t xml:space="preserve"> P10B-17 and current registered synthesis, profile, renderer, asset and commerce authority.</w:t>
+      </w:r>
+    </w:p>
+    <w:p>
+      <w:pPr>
+        <w:pStyle w:val="Normal"/>
+        <w:numPr>
+          <w:ilvl w:val="0"/>
+          <w:numId w:val="1"/>
+        </w:numPr>
+        <w:widowControl/>
+      </w:pPr>
+      <w:r>
+        <w:rPr>
+          <w:rFonts w:ascii="Calibri" w:hAnsi="Calibri" w:cs="Calibri"/>
+          <w:b/>
+          <w:bCs/>
+        </w:rPr>
+        <w:t>Done:</w:t>
+      </w:r>
+      <w:r>
+        <w:rPr>
+          <w:rFonts w:ascii="Calibri" w:hAnsi="Calibri" w:cs="Calibri"/>
+        </w:rPr>
+        <w:t xml:space="preserve"> A deterministic 72-case matrix, 18-store/108-capture retained human review and exact authority/fingerprint evidence diagnose the current ceiling, preserve canonical commerce/media, and freeze six conditional P10B-18B packages with zero OpenAI/provider, Vesko or publication traffic.</w:t>
+      </w:r>
+    </w:p>
+    <w:p>
+      <w:pPr>
+        <w:pStyle w:val="Normal"/>
+        <w:numPr>
+          <w:ilvl w:val="0"/>
+          <w:numId w:val="1"/>
+        </w:numPr>
+        <w:widowControl/>
+      </w:pPr>
+      <w:r>
+        <w:rPr>
+          <w:rFonts w:ascii="Calibri" w:hAnsi="Calibri" w:cs="Calibri"/>
+          <w:b/>
+          <w:bCs/>
+        </w:rPr>
+        <w:t>Evidence:</w:t>
+      </w:r>
+      <w:r>
+        <w:rPr>
+          <w:rFonts w:ascii="Calibri" w:hAnsi="Calibri" w:cs="Calibri"/>
+        </w:rPr>
+        <w:t xml:space="preserve"> Current authority inventory and reachability, compatibility funnels, fixed-backbone semantic-influence proof, exact collapse witnesses, strongest/typical/weak store review, frozen issue denominators, protected-state parity and accepted checkpoint crosswalk.</w:t>
+      </w:r>
+    </w:p>
+    <w:p>
+      <w:pPr>
+        <w:pStyle w:val="Normal"/>
+        <w:numPr>
+          <w:ilvl w:val="0"/>
+          <w:numId w:val="1"/>
+        </w:numPr>
+        <w:widowControl/>
+      </w:pPr>
+      <w:r>
+        <w:rPr>
+          <w:rFonts w:ascii="Calibri" w:hAnsi="Calibri" w:cs="Calibri"/>
+          <w:b/>
+          <w:bCs/>
+        </w:rPr>
+        <w:t>Non-goal:</w:t>
+      </w:r>
+      <w:r>
+        <w:rPr>
+          <w:rFonts w:ascii="Calibri" w:hAnsi="Calibri" w:cs="Calibri"/>
+        </w:rPr>
+        <w:t xml:space="preserve"> Implementing P10B-18B, proving those packages improve quality, satisfying P10B-18C, or closing parent P10B-18/P10B.</w:t>
+      </w:r>
+    </w:p>
+    <w:p>
+      <w:pPr>
+        <w:pStyle w:val="Heading3"/>
+        <w:keepNext/>
+        <w:widowControl/>
+      </w:pPr>
+      <w:r>
+        <w:rPr>
+          <w:rFonts w:ascii="Calibri" w:hAnsi="Calibri" w:cs="Calibri"/>
+        </w:rPr>
+        <w:t>P10B-18B — Commercial source-authority quality upgrade</w:t>
+      </w:r>
+    </w:p>
+    <w:p>
+      <w:pPr>
+        <w:pStyle w:val="Normal"/>
+        <w:numPr>
+          <w:ilvl w:val="0"/>
+          <w:numId w:val="1"/>
+        </w:numPr>
+        <w:widowControl/>
+      </w:pPr>
+      <w:r>
+        <w:rPr>
+          <w:rFonts w:ascii="Calibri" w:hAnsi="Calibri" w:cs="Calibri"/>
+          <w:b/>
+          <w:bCs/>
+        </w:rPr>
+        <w:t>Outcome:</w:t>
+      </w:r>
+      <w:r>
+        <w:rPr>
+          <w:rFonts w:ascii="Calibri" w:hAnsi="Calibri" w:cs="Calibri"/>
+        </w:rPr>
+        <w:t xml:space="preserve"> Implement the accepted coherent improvements to current Design DNA, compatibility, profiles, component consumers, asset-role selection and evaluation authority.</w:t>
+      </w:r>
+    </w:p>
+    <w:p>
+      <w:pPr>
+        <w:pStyle w:val="Normal"/>
+        <w:numPr>
+          <w:ilvl w:val="0"/>
+          <w:numId w:val="1"/>
+        </w:numPr>
+        <w:widowControl/>
+      </w:pPr>
+      <w:r>
+        <w:rPr>
+          <w:rFonts w:ascii="Calibri" w:hAnsi="Calibri" w:cs="Calibri"/>
+          <w:b/>
+          <w:bCs/>
+        </w:rPr>
+        <w:t>Status:</w:t>
+      </w:r>
+      <w:r>
+        <w:rPr>
+          <w:rFonts w:ascii="Calibri" w:hAnsi="Calibri" w:cs="Calibri"/>
+        </w:rPr>
+        <w:t xml:space="preserve"> </w:t>
+      </w:r>
+      <w:r>
+        <w:rPr>
+          <w:rFonts w:ascii="Calibri" w:hAnsi="Calibri" w:cs="Calibri"/>
+          <w:b/>
+          <w:bCs/>
+        </w:rPr>
+        <w:t>Planned</w:t>
+      </w:r>
+      <w:r>
+        <w:rPr>
+          <w:rFonts w:ascii="Calibri" w:hAnsi="Calibri" w:cs="Calibri"/>
+        </w:rPr>
+        <w:t>.</w:t>
+      </w:r>
+    </w:p>
+    <w:p>
+      <w:pPr>
+        <w:pStyle w:val="Normal"/>
+        <w:numPr>
+          <w:ilvl w:val="0"/>
+          <w:numId w:val="1"/>
+        </w:numPr>
+        <w:widowControl/>
+      </w:pPr>
+      <w:r>
+        <w:rPr>
+          <w:rFonts w:ascii="Calibri" w:hAnsi="Calibri" w:cs="Calibri"/>
+          <w:b/>
+          <w:bCs/>
+        </w:rPr>
+        <w:t>Depends on:</w:t>
+      </w:r>
+      <w:r>
+        <w:rPr>
+          <w:rFonts w:ascii="Calibri" w:hAnsi="Calibri" w:cs="Calibri"/>
+        </w:rPr>
+        <w:t xml:space="preserve"> Accepted P10B-18A and its frozen package order/ownership.</w:t>
+      </w:r>
+    </w:p>
+    <w:p>
+      <w:pPr>
+        <w:pStyle w:val="Normal"/>
+        <w:numPr>
+          <w:ilvl w:val="0"/>
+          <w:numId w:val="1"/>
+        </w:numPr>
+        <w:widowControl/>
+      </w:pPr>
+      <w:r>
+        <w:rPr>
+          <w:rFonts w:ascii="Calibri" w:hAnsi="Calibri" w:cs="Calibri"/>
+          <w:b/>
+          <w:bCs/>
+        </w:rPr>
+        <w:t>Done when:</w:t>
+      </w:r>
+      <w:r>
+        <w:rPr>
+          <w:rFonts w:ascii="Calibri" w:hAnsi="Calibri" w:cs="Calibri"/>
+        </w:rPr>
+        <w:t xml:space="preserve"> Every implemented package has focused positive/fail-closed evidence and the integrated authority produces improved multi-surface output against the frozen P10B-18A baseline without protected commerce/media drift.</w:t>
+      </w:r>
+    </w:p>
+    <w:p>
+      <w:pPr>
+        <w:pStyle w:val="Normal"/>
+        <w:numPr>
+          <w:ilvl w:val="0"/>
+          <w:numId w:val="1"/>
+        </w:numPr>
+        <w:widowControl/>
+      </w:pPr>
+      <w:r>
+        <w:rPr>
+          <w:rFonts w:ascii="Calibri" w:hAnsi="Calibri" w:cs="Calibri"/>
+          <w:b/>
+          <w:bCs/>
+        </w:rPr>
+        <w:t>Required evidence:</w:t>
+      </w:r>
+      <w:r>
+        <w:rPr>
+          <w:rFonts w:ascii="Calibri" w:hAnsi="Calibri" w:cs="Calibri"/>
+        </w:rPr>
+        <w:t xml:space="preserve"> Contract/deterministic/integration evidence as applicable plus exact multi-width browser captures and retained human comparison for the changed authority.</w:t>
+      </w:r>
+    </w:p>
+    <w:p>
+      <w:pPr>
+        <w:pStyle w:val="Normal"/>
+        <w:numPr>
+          <w:ilvl w:val="0"/>
+          <w:numId w:val="1"/>
+        </w:numPr>
+        <w:widowControl/>
+      </w:pPr>
+      <w:r>
+        <w:rPr>
+          <w:rFonts w:ascii="Calibri" w:hAnsi="Calibri" w:cs="Calibri"/>
+          <w:b/>
+          <w:bCs/>
+        </w:rPr>
+        <w:t>Non-goal:</w:t>
+      </w:r>
+      <w:r>
+        <w:rPr>
+          <w:rFonts w:ascii="Calibri" w:hAnsi="Calibri" w:cs="Calibri"/>
+        </w:rPr>
+        <w:t xml:space="preserve"> A second canonical model, page graph, component platform, renderer, commerce model, generated imagery, or an automatic claim that P10B-18C passed.</w:t>
+      </w:r>
+    </w:p>
+    <w:p>
+      <w:pPr>
+        <w:pStyle w:val="Heading3"/>
+        <w:keepNext/>
+        <w:widowControl/>
+      </w:pPr>
+      <w:r>
+        <w:rPr>
+          <w:rFonts w:ascii="Calibri" w:hAnsi="Calibri" w:cs="Calibri"/>
+        </w:rPr>
+        <w:t>P10B-18C — 100+ commercial quality and diversity gate</w:t>
+      </w:r>
+    </w:p>
+    <w:p>
+      <w:pPr>
+        <w:pStyle w:val="Normal"/>
+        <w:numPr>
+          <w:ilvl w:val="0"/>
+          <w:numId w:val="1"/>
+        </w:numPr>
+        <w:widowControl/>
+      </w:pPr>
+      <w:r>
+        <w:rPr>
+          <w:rFonts w:ascii="Calibri" w:hAnsi="Calibri" w:cs="Calibri"/>
+          <w:b/>
+          <w:bCs/>
+        </w:rPr>
+        <w:t>Outcome:</w:t>
+      </w:r>
+      <w:r>
+        <w:rPr>
+          <w:rFonts w:ascii="Calibri" w:hAnsi="Calibri" w:cs="Calibri"/>
+        </w:rPr>
+        <w:t xml:space="preserve"> Prove final breadth, meaningful diversity and designer-grade commercial quality on the integrated P10B-18B authority.</w:t>
+      </w:r>
+    </w:p>
+    <w:p>
+      <w:pPr>
+        <w:pStyle w:val="Normal"/>
+        <w:numPr>
+          <w:ilvl w:val="0"/>
+          <w:numId w:val="1"/>
+        </w:numPr>
+        <w:widowControl/>
+      </w:pPr>
+      <w:r>
+        <w:rPr>
+          <w:rFonts w:ascii="Calibri" w:hAnsi="Calibri" w:cs="Calibri"/>
+          <w:b/>
+          <w:bCs/>
+        </w:rPr>
+        <w:t>Status:</w:t>
+      </w:r>
+      <w:r>
+        <w:rPr>
+          <w:rFonts w:ascii="Calibri" w:hAnsi="Calibri" w:cs="Calibri"/>
+        </w:rPr>
+        <w:t xml:space="preserve"> </w:t>
+      </w:r>
+      <w:r>
+        <w:rPr>
+          <w:rFonts w:ascii="Calibri" w:hAnsi="Calibri" w:cs="Calibri"/>
+          <w:b/>
+          <w:bCs/>
+        </w:rPr>
+        <w:t>Planned</w:t>
+      </w:r>
+      <w:r>
+        <w:rPr>
+          <w:rFonts w:ascii="Calibri" w:hAnsi="Calibri" w:cs="Calibri"/>
+        </w:rPr>
+        <w:t>.</w:t>
+      </w:r>
+    </w:p>
+    <w:p>
+      <w:pPr>
+        <w:pStyle w:val="Normal"/>
+        <w:numPr>
+          <w:ilvl w:val="0"/>
+          <w:numId w:val="1"/>
+        </w:numPr>
+        <w:widowControl/>
+      </w:pPr>
+      <w:r>
+        <w:rPr>
+          <w:rFonts w:ascii="Calibri" w:hAnsi="Calibri" w:cs="Calibri"/>
+          <w:b/>
+          <w:bCs/>
+        </w:rPr>
+        <w:t>Depends on:</w:t>
+      </w:r>
+      <w:r>
+        <w:rPr>
+          <w:rFonts w:ascii="Calibri" w:hAnsi="Calibri" w:cs="Calibri"/>
+        </w:rPr>
+        <w:t xml:space="preserve"> Accepted and integrated P10B-18B packages.</w:t>
+      </w:r>
+    </w:p>
+    <w:p>
+      <w:pPr>
+        <w:pStyle w:val="Normal"/>
+        <w:numPr>
+          <w:ilvl w:val="0"/>
+          <w:numId w:val="1"/>
+        </w:numPr>
+        <w:widowControl/>
+      </w:pPr>
+      <w:r>
+        <w:rPr>
+          <w:rFonts w:ascii="Calibri" w:hAnsi="Calibri" w:cs="Calibri"/>
+          <w:b/>
+          <w:bCs/>
+        </w:rPr>
+        <w:t>Done when:</w:t>
+      </w:r>
+      <w:r>
+        <w:rPr>
+          <w:rFonts w:ascii="Calibri" w:hAnsi="Calibri" w:cs="Calibri"/>
+        </w:rPr>
+        <w:t xml:space="preserve"> At least 100 complete bounded configurations pass snapshot validity, protected- state parity, exact/near-duplicate and structural-distribution gates, and a fingerprint- stratified representative subset passes retained four-width human commercial review.</w:t>
+      </w:r>
+    </w:p>
+    <w:p>
+      <w:pPr>
+        <w:pStyle w:val="Normal"/>
+        <w:numPr>
+          <w:ilvl w:val="0"/>
+          <w:numId w:val="1"/>
+        </w:numPr>
+        <w:widowControl/>
+      </w:pPr>
+      <w:r>
+        <w:rPr>
+          <w:rFonts w:ascii="Calibri" w:hAnsi="Calibri" w:cs="Calibri"/>
+          <w:b/>
+          <w:bCs/>
+        </w:rPr>
+        <w:t>Required evidence:</w:t>
+      </w:r>
+      <w:r>
+        <w:rPr>
+          <w:rFonts w:ascii="Calibri" w:hAnsi="Calibri" w:cs="Calibri"/>
+        </w:rPr>
+        <w:t xml:space="preserve"> Reproducible scale ledger, exact authority/fingerprints, complete-surface captures, explicit product-owner acceptance and unchanged protected commerce/media.</w:t>
+      </w:r>
+    </w:p>
+    <w:p>
+      <w:pPr>
+        <w:pStyle w:val="Normal"/>
+        <w:numPr>
+          <w:ilvl w:val="0"/>
+          <w:numId w:val="1"/>
+        </w:numPr>
+        <w:widowControl/>
+      </w:pPr>
+      <w:r>
+        <w:rPr>
+          <w:rFonts w:ascii="Calibri" w:hAnsi="Calibri" w:cs="Calibri"/>
+          <w:b/>
+          <w:bCs/>
+        </w:rPr>
+        <w:t>Non-goal:</w:t>
+      </w:r>
+      <w:r>
+        <w:rPr>
+          <w:rFonts w:ascii="Calibri" w:hAnsi="Calibri" w:cs="Calibri"/>
+        </w:rPr>
+        <w:t xml:space="preserve"> Treating P10B-18A evidence, registry counts, configuration count, automated checks, or one polished store as final commercial acceptance.</w:t>
       </w:r>
     </w:p>
     <w:p>
@@ -18057,7 +19043,7 @@
         </w:rPr>
         <w:t xml:space="preserve"> </w:t>
       </w:r>
-      <w:hyperlink r:id="rIdHyperlink23" w:history="1">
+      <w:hyperlink r:id="rIdHyperlink24" w:history="1">
         <w:r>
           <w:rPr>
             <w:rFonts w:ascii="Calibri" w:hAnsi="Calibri" w:cs="Calibri"/>
@@ -18073,7 +19059,7 @@
         </w:rPr>
         <w:t xml:space="preserve"> and </w:t>
       </w:r>
-      <w:hyperlink r:id="rIdHyperlink24" w:history="1">
+      <w:hyperlink r:id="rIdHyperlink25" w:history="1">
         <w:r>
           <w:rPr>
             <w:rFonts w:ascii="Calibri" w:hAnsi="Calibri" w:cs="Calibri"/>
@@ -19996,8 +20982,18 @@
         <w:rPr>
           <w:rFonts w:ascii="Calibri" w:hAnsi="Calibri" w:cs="Calibri"/>
         </w:rPr>
-        <w:t xml:space="preserve"> Security, load, recovery, telemetry, and controlled-pilot evidence. </w:t>
-      </w:r>
+        <w:t xml:space="preserve"> Security, load, recovery, telemetry, and controlled-pilot evidence.</w:t>
+      </w:r>
+    </w:p>
+    <w:p>
+      <w:pPr>
+        <w:pStyle w:val="Normal"/>
+        <w:numPr>
+          <w:ilvl w:val="0"/>
+          <w:numId w:val="1"/>
+        </w:numPr>
+        <w:widowControl/>
+      </w:pPr>
       <w:r>
         <w:rPr>
           <w:rFonts w:ascii="Calibri" w:hAnsi="Calibri" w:cs="Calibri"/>

</xml_diff>

<commit_message>
feat: improve design DNA and shared frames
</commit_message>
<xml_diff>
--- a/docs/VESKIFY_DEVELOPMENT_DELIVERY_TRACKER_v1.3.0.docx
+++ b/docs/VESKIFY_DEVELOPMENT_DELIVERY_TRACKER_v1.3.0.docx
@@ -38,7 +38,7 @@
         <w:rPr>
           <w:rFonts w:ascii="Calibri" w:hAnsi="Calibri" w:cs="Calibri"/>
         </w:rPr>
-        <w:t>Delivery status baseline: 16 August 2026, accepted P10B-18A commercial-authority audit</w:t>
+        <w:t>Delivery status baseline: 17 August 2026, accepted P10B-18B-01 Design DNA and shared-frame upgrade</w:t>
       </w:r>
     </w:p>
     <w:p>
@@ -245,7 +245,7 @@
               <w:rPr>
                 <w:rFonts w:ascii="Calibri" w:hAnsi="Calibri" w:cs="Calibri"/>
               </w:rPr>
-              <w:t>16 August 2026, accepted P10B-18A commercial-authority audit</w:t>
+              <w:t>17 August 2026, accepted P10B-18B-01 Design DNA/shared-frame upgrade</w:t>
             </w:r>
           </w:p>
         </w:tc>
@@ -6272,7 +6272,7 @@
                 <w:b/>
                 <w:bCs/>
               </w:rPr>
-              <w:t>Planned</w:t>
+              <w:t>Partial</w:t>
             </w:r>
           </w:p>
         </w:tc>
@@ -6327,6 +6327,141 @@
                 <w:rFonts w:ascii="Calibri" w:hAnsi="Calibri" w:cs="Calibri"/>
               </w:rPr>
               <w:t>Six coherent packages with focused and integrated browser/human evidence against the frozen audit baseline</w:t>
+            </w:r>
+          </w:p>
+        </w:tc>
+      </w:tr>
+      <w:tr>
+        <w:trPr>
+          <w:cantSplit/>
+        </w:trPr>
+        <w:tc>
+          <w:tcPr>
+            <w:tcW w:w="720" w:type="dxa"/>
+            <w:vAlign w:val="center"/>
+          </w:tcPr>
+          <w:p>
+            <w:pPr>
+              <w:pStyle w:val="CompactTableText"/>
+              <w:jc w:val="center"/>
+              <w:widowControl/>
+            </w:pPr>
+            <w:r>
+              <w:rPr>
+                <w:rFonts w:ascii="Calibri" w:hAnsi="Calibri" w:cs="Calibri"/>
+              </w:rPr>
+              <w:t>☑</w:t>
+            </w:r>
+          </w:p>
+        </w:tc>
+        <w:tc>
+          <w:tcPr>
+            <w:tcW w:w="1700" w:type="dxa"/>
+            <w:vAlign w:val="center"/>
+          </w:tcPr>
+          <w:p>
+            <w:pPr>
+              <w:pStyle w:val="CompactTableText"/>
+              <w:widowControl/>
+            </w:pPr>
+            <w:r>
+              <w:rPr>
+                <w:rFonts w:ascii="Calibri" w:hAnsi="Calibri" w:cs="Calibri"/>
+              </w:rPr>
+              <w:t>P10B-18B-01</w:t>
+            </w:r>
+          </w:p>
+        </w:tc>
+        <w:tc>
+          <w:tcPr>
+            <w:tcW w:w="2800" w:type="dxa"/>
+            <w:vAlign w:val="center"/>
+          </w:tcPr>
+          <w:p>
+            <w:pPr>
+              <w:pStyle w:val="CompactTableText"/>
+              <w:widowControl/>
+            </w:pPr>
+            <w:r>
+              <w:rPr>
+                <w:rFonts w:ascii="Calibri" w:hAnsi="Calibri" w:cs="Calibri"/>
+              </w:rPr>
+              <w:t>Design DNA and shared-frames quality upgrade</w:t>
+            </w:r>
+          </w:p>
+        </w:tc>
+        <w:tc>
+          <w:tcPr>
+            <w:tcW w:w="850" w:type="dxa"/>
+            <w:vAlign w:val="center"/>
+          </w:tcPr>
+          <w:p>
+            <w:pPr>
+              <w:pStyle w:val="CompactTableText"/>
+              <w:jc w:val="center"/>
+              <w:widowControl/>
+            </w:pPr>
+            <w:r>
+              <w:rPr>
+                <w:rFonts w:ascii="Calibri" w:hAnsi="Calibri" w:cs="Calibri"/>
+                <w:b/>
+                <w:bCs/>
+              </w:rPr>
+              <w:t>Baseline</w:t>
+            </w:r>
+          </w:p>
+        </w:tc>
+        <w:tc>
+          <w:tcPr>
+            <w:tcW w:w="1500" w:type="dxa"/>
+            <w:vAlign w:val="center"/>
+          </w:tcPr>
+          <w:p>
+            <w:pPr>
+              <w:pStyle w:val="CompactTableText"/>
+              <w:widowControl/>
+            </w:pPr>
+            <w:r>
+              <w:rPr>
+                <w:rFonts w:ascii="Calibri" w:hAnsi="Calibri" w:cs="Calibri"/>
+              </w:rPr>
+              <w:t>Design DNA, direction, frame owners</w:t>
+            </w:r>
+          </w:p>
+        </w:tc>
+        <w:tc>
+          <w:tcPr>
+            <w:tcW w:w="2500" w:type="dxa"/>
+            <w:vAlign w:val="center"/>
+          </w:tcPr>
+          <w:p>
+            <w:pPr>
+              <w:pStyle w:val="CompactTableText"/>
+              <w:widowControl/>
+            </w:pPr>
+            <w:r>
+              <w:rPr>
+                <w:rFonts w:ascii="Calibri" w:hAnsi="Calibri" w:cs="Calibri"/>
+              </w:rPr>
+              <w:t>Accepted P10B-18A</w:t>
+            </w:r>
+          </w:p>
+        </w:tc>
+        <w:tc>
+          <w:tcPr>
+            <w:tcW w:w="2890" w:type="dxa"/>
+            <w:vAlign w:val="center"/>
+          </w:tcPr>
+          <w:p>
+            <w:pPr>
+              <w:pStyle w:val="CompactTableText"/>
+              <w:widowControl/>
+            </w:pPr>
+            <w:r>
+              <w:rPr>
+                <w:rFonts w:ascii="Calibri" w:hAnsi="Calibri" w:cs="Calibri"/>
+              </w:rPr>
+              <w:t>Same-72-case material deltas, compact complete-store proof, 17 accepted captures, responsive/build/lifecycle/protected-state preservation</w:t>
             </w:r>
           </w:p>
         </w:tc>
@@ -10633,7 +10768,7 @@
         <w:rPr>
           <w:rFonts w:ascii="Calibri" w:hAnsi="Calibri" w:cs="Calibri"/>
         </w:rPr>
-        <w:t xml:space="preserve">. P10B-01 through P10B-17, P10B-16P-01 through P10B-16P-05A, P10B-16P-06, and accepted P10B-18A are </w:t>
+        <w:t xml:space="preserve">. P10B-01 through P10B-17, P10B-16P-01 through P10B-16P-05A, P10B-16P-06, accepted P10B-18A, and accepted P10B-18B-01 are </w:t>
       </w:r>
       <w:r>
         <w:rPr>
@@ -10661,7 +10796,7 @@
         <w:rPr>
           <w:rFonts w:ascii="Calibri" w:hAnsi="Calibri" w:cs="Calibri"/>
         </w:rPr>
-        <w:t xml:space="preserve">. Parent P10B-18 remains </w:t>
+        <w:t xml:space="preserve">. Parent P10B-18B, P10B-18, and P10B remain </w:t>
       </w:r>
       <w:r>
         <w:rPr>
@@ -10675,7 +10810,7 @@
         <w:rPr>
           <w:rFonts w:ascii="Calibri" w:hAnsi="Calibri" w:cs="Calibri"/>
         </w:rPr>
-        <w:t xml:space="preserve">; P10B-18B and P10B-18C remain </w:t>
+        <w:t xml:space="preserve">; P10B-18C remains </w:t>
       </w:r>
       <w:r>
         <w:rPr>
@@ -10705,7 +10840,7 @@
         <w:rPr>
           <w:rFonts w:ascii="Calibri" w:hAnsi="Calibri" w:cs="Calibri"/>
         </w:rPr>
-        <w:t>. The remaining Done conditions are implementation gates, not claims about the current repository. The P10B-16P-01 through P10B-16P-05A plus P10B-16P-06 sequence is a mandatory convergence package between P10B-16 and P10B-17; it supplements rather than renumbers the locked P10B-01 through P10B-18 plan. P10B-16P-05B follows P10B-18C as the final consumer-verified historical cleanup. P10B-18B is the next focused product task.</w:t>
+        <w:t>. The remaining Done conditions are implementation gates, not claims about the current repository. The P10B-16P-01 through P10B-16P-05A plus P10B-16P-06 sequence is a mandatory convergence package between P10B-16 and P10B-17; it supplements rather than renumbers the locked P10B-01 through P10B-18 plan. P10B-16P-05B follows P10B-18C as the final consumer-verified historical cleanup. P10B-18B-06 is the next focused product task.</w:t>
       </w:r>
     </w:p>
     <w:p>
@@ -16164,7 +16299,7 @@
         <w:rPr>
           <w:rFonts w:ascii="Calibri" w:hAnsi="Calibri" w:cs="Calibri"/>
         </w:rPr>
-        <w:t>P10B-17 and accepted P10B-18A are Baseline. Parent P10B-18 and P10B remain Partial; P10B-18B is the next focused product task, P10B-18C remains Planned after it, and P10B-16P-05B remains Planned after P10B-18C.</w:t>
+        <w:t>P10B-17, accepted P10B-18A, and accepted P10B-18B-01 are Baseline. Parent P10B-18B, P10B-18 and P10B remain Partial; P10B-18B-06 is next, P10B-18C remains Planned, and P10B-16P-05B remains Planned after P10B-18C.</w:t>
       </w:r>
     </w:p>
     <w:p>
@@ -16458,7 +16593,7 @@
         <w:rPr>
           <w:rFonts w:ascii="Calibri" w:hAnsi="Calibri" w:cs="Calibri"/>
         </w:rPr>
-        <w:t>. P10B-18A is Baseline; P10B-18B and P10B-18C remain Planned.</w:t>
+        <w:t>. P10B-18A and P10B-18B-01 are Baseline; parent P10B-18B is Partial and P10B-18C remains Planned.</w:t>
       </w:r>
     </w:p>
     <w:p>
@@ -16858,8 +16993,195 @@
           <w:b/>
           <w:bCs/>
         </w:rPr>
-        <w:t>Planned</w:t>
-      </w:r>
+        <w:t>Partial</w:t>
+      </w:r>
+      <w:r>
+        <w:rPr>
+          <w:rFonts w:ascii="Calibri" w:hAnsi="Calibri" w:cs="Calibri"/>
+        </w:rPr>
+        <w:t>. P10B-18B-01 is Baseline; the remaining packages are incomplete.</w:t>
+      </w:r>
+    </w:p>
+    <w:p>
+      <w:pPr>
+        <w:pStyle w:val="Normal"/>
+        <w:numPr>
+          <w:ilvl w:val="0"/>
+          <w:numId w:val="1"/>
+        </w:numPr>
+        <w:widowControl/>
+      </w:pPr>
+      <w:r>
+        <w:rPr>
+          <w:rFonts w:ascii="Calibri" w:hAnsi="Calibri" w:cs="Calibri"/>
+          <w:b/>
+          <w:bCs/>
+        </w:rPr>
+        <w:t>Depends on:</w:t>
+      </w:r>
+      <w:r>
+        <w:rPr>
+          <w:rFonts w:ascii="Calibri" w:hAnsi="Calibri" w:cs="Calibri"/>
+        </w:rPr>
+        <w:t xml:space="preserve"> Accepted P10B-18A and its frozen package order/ownership.</w:t>
+      </w:r>
+    </w:p>
+    <w:p>
+      <w:pPr>
+        <w:pStyle w:val="Normal"/>
+        <w:numPr>
+          <w:ilvl w:val="0"/>
+          <w:numId w:val="1"/>
+        </w:numPr>
+        <w:widowControl/>
+      </w:pPr>
+      <w:r>
+        <w:rPr>
+          <w:rFonts w:ascii="Calibri" w:hAnsi="Calibri" w:cs="Calibri"/>
+          <w:b/>
+          <w:bCs/>
+        </w:rPr>
+        <w:t>Done when:</w:t>
+      </w:r>
+      <w:r>
+        <w:rPr>
+          <w:rFonts w:ascii="Calibri" w:hAnsi="Calibri" w:cs="Calibri"/>
+        </w:rPr>
+        <w:t xml:space="preserve"> Every implemented package has focused positive/fail-closed evidence and the integrated authority produces improved multi-surface output against the frozen P10B-18A baseline without protected commerce/media drift.</w:t>
+      </w:r>
+    </w:p>
+    <w:p>
+      <w:pPr>
+        <w:pStyle w:val="Normal"/>
+        <w:numPr>
+          <w:ilvl w:val="0"/>
+          <w:numId w:val="1"/>
+        </w:numPr>
+        <w:widowControl/>
+      </w:pPr>
+      <w:r>
+        <w:rPr>
+          <w:rFonts w:ascii="Calibri" w:hAnsi="Calibri" w:cs="Calibri"/>
+          <w:b/>
+          <w:bCs/>
+        </w:rPr>
+        <w:t>Required evidence:</w:t>
+      </w:r>
+      <w:r>
+        <w:rPr>
+          <w:rFonts w:ascii="Calibri" w:hAnsi="Calibri" w:cs="Calibri"/>
+        </w:rPr>
+        <w:t xml:space="preserve"> Contract/deterministic/integration evidence as applicable plus exact multi-width browser captures and retained human comparison for the changed authority.</w:t>
+      </w:r>
+    </w:p>
+    <w:p>
+      <w:pPr>
+        <w:pStyle w:val="Normal"/>
+        <w:numPr>
+          <w:ilvl w:val="0"/>
+          <w:numId w:val="1"/>
+        </w:numPr>
+        <w:widowControl/>
+      </w:pPr>
+      <w:r>
+        <w:rPr>
+          <w:rFonts w:ascii="Calibri" w:hAnsi="Calibri" w:cs="Calibri"/>
+          <w:b/>
+          <w:bCs/>
+        </w:rPr>
+        <w:t>Non-goal:</w:t>
+      </w:r>
+      <w:r>
+        <w:rPr>
+          <w:rFonts w:ascii="Calibri" w:hAnsi="Calibri" w:cs="Calibri"/>
+        </w:rPr>
+        <w:t xml:space="preserve"> A second canonical model, page graph, component platform, renderer, commerce model, generated imagery, or an automatic claim that P10B-18C passed.</w:t>
+      </w:r>
+    </w:p>
+    <w:p>
+      <w:pPr>
+        <w:pStyle w:val="Heading3"/>
+        <w:keepNext/>
+        <w:widowControl/>
+      </w:pPr>
+      <w:r>
+        <w:rPr>
+          <w:rFonts w:ascii="Calibri" w:hAnsi="Calibri" w:cs="Calibri"/>
+        </w:rPr>
+        <w:t>P10B-18B-01 — Design DNA and shared-frames quality upgrade</w:t>
+      </w:r>
+    </w:p>
+    <w:p>
+      <w:pPr>
+        <w:pStyle w:val="Normal"/>
+        <w:numPr>
+          <w:ilvl w:val="0"/>
+          <w:numId w:val="1"/>
+        </w:numPr>
+        <w:widowControl/>
+      </w:pPr>
+      <w:r>
+        <w:rPr>
+          <w:rFonts w:ascii="Calibri" w:hAnsi="Calibri" w:cs="Calibri"/>
+          <w:b/>
+          <w:bCs/>
+        </w:rPr>
+        <w:t>Outcome:</w:t>
+      </w:r>
+      <w:r>
+        <w:rPr>
+          <w:rFonts w:ascii="Calibri" w:hAnsi="Calibri" w:cs="Calibri"/>
+        </w:rPr>
+        <w:t xml:space="preserve"> Materialize bounded within-direction density, report exact semantic dependencies, make the existing compact frame truthfully complete-store reachable, and refine the four shared frames without adding canonical authority.</w:t>
+      </w:r>
+    </w:p>
+    <w:p>
+      <w:pPr>
+        <w:pStyle w:val="Normal"/>
+        <w:numPr>
+          <w:ilvl w:val="0"/>
+          <w:numId w:val="1"/>
+        </w:numPr>
+        <w:widowControl/>
+      </w:pPr>
+      <w:r>
+        <w:rPr>
+          <w:rFonts w:ascii="Calibri" w:hAnsi="Calibri" w:cs="Calibri"/>
+          <w:b/>
+          <w:bCs/>
+        </w:rPr>
+        <w:t>Status:</w:t>
+      </w:r>
+      <w:r>
+        <w:rPr>
+          <w:rFonts w:ascii="Calibri" w:hAnsi="Calibri" w:cs="Calibri"/>
+        </w:rPr>
+        <w:t xml:space="preserve"> </w:t>
+      </w:r>
+      <w:r>
+        <w:rPr>
+          <w:rFonts w:ascii="Calibri" w:hAnsi="Calibri" w:cs="Calibri"/>
+          <w:b/>
+          <w:bCs/>
+        </w:rPr>
+        <w:t>Baseline</w:t>
+      </w:r>
+      <w:r>
+        <w:rPr>
+          <w:rFonts w:ascii="Calibri" w:hAnsi="Calibri" w:cs="Calibri"/>
+        </w:rPr>
+        <w:t xml:space="preserve">. Accepted by the product owner on 17 August 2026 under </w:t>
+      </w:r>
+      <w:hyperlink r:id="rIdHyperlink23" w:history="1">
+        <w:r>
+          <w:rPr>
+            <w:rFonts w:ascii="Calibri" w:hAnsi="Calibri" w:cs="Calibri"/>
+            <w:color w:val="2E74B5"/>
+            <w:u w:val="single"/>
+          </w:rPr>
+          <w:t>P10B_18_COMMERCIAL_QUALITY_AUDIT.md</w:t>
+        </w:r>
+      </w:hyperlink>
       <w:r>
         <w:rPr>
           <w:rFonts w:ascii="Calibri" w:hAnsi="Calibri" w:cs="Calibri"/>
@@ -16888,55 +17210,69 @@
         <w:rPr>
           <w:rFonts w:ascii="Calibri" w:hAnsi="Calibri" w:cs="Calibri"/>
         </w:rPr>
-        <w:t xml:space="preserve"> Accepted P10B-18A and its frozen package order/ownership.</w:t>
-      </w:r>
-    </w:p>
-    <w:p>
-      <w:pPr>
-        <w:pStyle w:val="Normal"/>
-        <w:numPr>
-          <w:ilvl w:val="0"/>
-          <w:numId w:val="1"/>
-        </w:numPr>
-        <w:widowControl/>
-      </w:pPr>
-      <w:r>
-        <w:rPr>
-          <w:rFonts w:ascii="Calibri" w:hAnsi="Calibri" w:cs="Calibri"/>
-          <w:b/>
-          <w:bCs/>
-        </w:rPr>
-        <w:t>Done when:</w:t>
-      </w:r>
-      <w:r>
-        <w:rPr>
-          <w:rFonts w:ascii="Calibri" w:hAnsi="Calibri" w:cs="Calibri"/>
-        </w:rPr>
-        <w:t xml:space="preserve"> Every implemented package has focused positive/fail-closed evidence and the integrated authority produces improved multi-surface output against the frozen P10B-18A baseline without protected commerce/media drift.</w:t>
-      </w:r>
-    </w:p>
-    <w:p>
-      <w:pPr>
-        <w:pStyle w:val="Normal"/>
-        <w:numPr>
-          <w:ilvl w:val="0"/>
-          <w:numId w:val="1"/>
-        </w:numPr>
-        <w:widowControl/>
-      </w:pPr>
-      <w:r>
-        <w:rPr>
-          <w:rFonts w:ascii="Calibri" w:hAnsi="Calibri" w:cs="Calibri"/>
-          <w:b/>
-          <w:bCs/>
-        </w:rPr>
-        <w:t>Required evidence:</w:t>
-      </w:r>
-      <w:r>
-        <w:rPr>
-          <w:rFonts w:ascii="Calibri" w:hAnsi="Calibri" w:cs="Calibri"/>
-        </w:rPr>
-        <w:t xml:space="preserve"> Contract/deterministic/integration evidence as applicable plus exact multi-width browser captures and retained human comparison for the changed authority.</w:t>
+        <w:t xml:space="preserve"> Accepted P10B-18A and current Design DNA/direction/frame authority.</w:t>
+      </w:r>
+    </w:p>
+    <w:p>
+      <w:pPr>
+        <w:pStyle w:val="Normal"/>
+        <w:numPr>
+          <w:ilvl w:val="0"/>
+          <w:numId w:val="1"/>
+        </w:numPr>
+        <w:widowControl/>
+      </w:pPr>
+      <w:r>
+        <w:rPr>
+          <w:rFonts w:ascii="Calibri" w:hAnsi="Calibri" w:cs="Calibri"/>
+          <w:b/>
+          <w:bCs/>
+        </w:rPr>
+        <w:t>Done:</w:t>
+      </w:r>
+      <w:r>
+        <w:rPr>
+          <w:rFonts w:ascii="Calibri" w:hAnsi="Calibri" w:cs="Calibri"/>
+        </w:rPr>
+        <w:t xml:space="preserve"> Design DNA remains </w:t>
+      </w:r>
+      <w:r>
+        <w:rPr>
+          <w:rFonts w:ascii="Consolas" w:hAnsi="Consolas" w:cs="Consolas"/>
+          <w:sz w:val="19"/>
+          <w:szCs w:val="19"/>
+        </w:rPr>
+        <w:t>1.0.0</w:t>
+      </w:r>
+      <w:r>
+        <w:rPr>
+          <w:rFonts w:ascii="Calibri" w:hAnsi="Calibri" w:cs="Calibri"/>
+        </w:rPr>
+        <w:t xml:space="preserve"> with two exact density outcomes per direction; semantic density and mobile hierarchy are truthfully compound; all nine audit strata have non-zero compact complete-store candidates; the same 72 cases improve from 3 to 6 non-colour DNA bundles and 25 to 36 normalized material topologies; 17 focused captures pass accepted review.</w:t>
+      </w:r>
+    </w:p>
+    <w:p>
+      <w:pPr>
+        <w:pStyle w:val="Normal"/>
+        <w:numPr>
+          <w:ilvl w:val="0"/>
+          <w:numId w:val="1"/>
+        </w:numPr>
+        <w:widowControl/>
+      </w:pPr>
+      <w:r>
+        <w:rPr>
+          <w:rFonts w:ascii="Calibri" w:hAnsi="Calibri" w:cs="Calibri"/>
+          <w:b/>
+          <w:bCs/>
+        </w:rPr>
+        <w:t>Evidence:</w:t>
+      </w:r>
+      <w:r>
+        <w:rPr>
+          <w:rFonts w:ascii="Calibri" w:hAnsi="Calibri" w:cs="Calibri"/>
+        </w:rPr>
+        <w:t xml:space="preserve"> Fixed-backbone DNA/CSS proof, complete-site compatibility and former-blocker direct rendering, exact semantic/factorized authority, persistence/compiler/protected-state regression, final P10B-17 browser gate, production build/budgets, and accepted 17-capture manifest.</w:t>
       </w:r>
     </w:p>
     <w:p>
@@ -16960,7 +17296,31 @@
         <w:rPr>
           <w:rFonts w:ascii="Calibri" w:hAnsi="Calibri" w:cs="Calibri"/>
         </w:rPr>
-        <w:t xml:space="preserve"> A second canonical model, page graph, component platform, renderer, commerce model, generated imagery, or an automatic claim that P10B-18C passed.</w:t>
+        <w:t xml:space="preserve"> Homepage, collection/search/card, PDP, content/utility or asset/art-direction redesign; a fifth frame; schema migration; P10B-18C quality/scale closure.</w:t>
+      </w:r>
+    </w:p>
+    <w:p>
+      <w:pPr>
+        <w:pStyle w:val="Normal"/>
+        <w:numPr>
+          <w:ilvl w:val="0"/>
+          <w:numId w:val="1"/>
+        </w:numPr>
+        <w:widowControl/>
+      </w:pPr>
+      <w:r>
+        <w:rPr>
+          <w:rFonts w:ascii="Calibri" w:hAnsi="Calibri" w:cs="Calibri"/>
+          <w:b/>
+          <w:bCs/>
+        </w:rPr>
+        <w:t>Next:</w:t>
+      </w:r>
+      <w:r>
+        <w:rPr>
+          <w:rFonts w:ascii="Calibri" w:hAnsi="Calibri" w:cs="Calibri"/>
+        </w:rPr>
+        <w:t xml:space="preserve"> P10B-18B-06 — Asset Composition and Art Direction Quality Upgrade.</w:t>
       </w:r>
     </w:p>
     <w:p>

</xml_diff>

<commit_message>
feat: add bounded asset composition authority
</commit_message>
<xml_diff>
--- a/docs/VESKIFY_DEVELOPMENT_DELIVERY_TRACKER_v1.3.0.docx
+++ b/docs/VESKIFY_DEVELOPMENT_DELIVERY_TRACKER_v1.3.0.docx
@@ -38,7 +38,7 @@
         <w:rPr>
           <w:rFonts w:ascii="Calibri" w:hAnsi="Calibri" w:cs="Calibri"/>
         </w:rPr>
-        <w:t>Delivery status baseline: 17 August 2026, accepted P10B-18B-01 Design DNA and shared-frame upgrade</w:t>
+        <w:t>Delivery status baseline: 17 August 2026, accepted P10B-18B-06 bounded asset-composition and art-direction upgrade</w:t>
       </w:r>
     </w:p>
     <w:p>
@@ -6485,6 +6485,276 @@
               <w:rPr>
                 <w:rFonts w:ascii="Calibri" w:hAnsi="Calibri" w:cs="Calibri"/>
               </w:rPr>
+              <w:t>☑</w:t>
+            </w:r>
+          </w:p>
+        </w:tc>
+        <w:tc>
+          <w:tcPr>
+            <w:tcW w:w="1700" w:type="dxa"/>
+            <w:vAlign w:val="center"/>
+          </w:tcPr>
+          <w:p>
+            <w:pPr>
+              <w:pStyle w:val="CompactTableText"/>
+              <w:widowControl/>
+            </w:pPr>
+            <w:r>
+              <w:rPr>
+                <w:rFonts w:ascii="Calibri" w:hAnsi="Calibri" w:cs="Calibri"/>
+              </w:rPr>
+              <w:t>P10B-18B-06</w:t>
+            </w:r>
+          </w:p>
+        </w:tc>
+        <w:tc>
+          <w:tcPr>
+            <w:tcW w:w="2800" w:type="dxa"/>
+            <w:vAlign w:val="center"/>
+          </w:tcPr>
+          <w:p>
+            <w:pPr>
+              <w:pStyle w:val="CompactTableText"/>
+              <w:widowControl/>
+            </w:pPr>
+            <w:r>
+              <w:rPr>
+                <w:rFonts w:ascii="Calibri" w:hAnsi="Calibri" w:cs="Calibri"/>
+              </w:rPr>
+              <w:t>Asset composition and art-direction quality upgrade</w:t>
+            </w:r>
+          </w:p>
+        </w:tc>
+        <w:tc>
+          <w:tcPr>
+            <w:tcW w:w="850" w:type="dxa"/>
+            <w:vAlign w:val="center"/>
+          </w:tcPr>
+          <w:p>
+            <w:pPr>
+              <w:pStyle w:val="CompactTableText"/>
+              <w:jc w:val="center"/>
+              <w:widowControl/>
+            </w:pPr>
+            <w:r>
+              <w:rPr>
+                <w:rFonts w:ascii="Calibri" w:hAnsi="Calibri" w:cs="Calibri"/>
+                <w:b/>
+                <w:bCs/>
+              </w:rPr>
+              <w:t>Baseline</w:t>
+            </w:r>
+          </w:p>
+        </w:tc>
+        <w:tc>
+          <w:tcPr>
+            <w:tcW w:w="1500" w:type="dxa"/>
+            <w:vAlign w:val="center"/>
+          </w:tcPr>
+          <w:p>
+            <w:pPr>
+              <w:pStyle w:val="CompactTableText"/>
+              <w:widowControl/>
+            </w:pPr>
+            <w:r>
+              <w:rPr>
+                <w:rFonts w:ascii="Calibri" w:hAnsi="Calibri" w:cs="Calibri"/>
+              </w:rPr>
+              <w:t>Asset, responsive-image, frame owners</w:t>
+            </w:r>
+          </w:p>
+        </w:tc>
+        <w:tc>
+          <w:tcPr>
+            <w:tcW w:w="2500" w:type="dxa"/>
+            <w:vAlign w:val="center"/>
+          </w:tcPr>
+          <w:p>
+            <w:pPr>
+              <w:pStyle w:val="CompactTableText"/>
+              <w:widowControl/>
+            </w:pPr>
+            <w:r>
+              <w:rPr>
+                <w:rFonts w:ascii="Calibri" w:hAnsi="Calibri" w:cs="Calibri"/>
+              </w:rPr>
+              <w:t>Accepted P10B-18B-01</w:t>
+            </w:r>
+          </w:p>
+        </w:tc>
+        <w:tc>
+          <w:tcPr>
+            <w:tcW w:w="2890" w:type="dxa"/>
+            <w:vAlign w:val="center"/>
+          </w:tcPr>
+          <w:p>
+            <w:pPr>
+              <w:pStyle w:val="CompactTableText"/>
+              <w:widowControl/>
+            </w:pPr>
+            <w:r>
+              <w:rPr>
+                <w:rFonts w:ascii="Calibri" w:hAnsi="Calibri" w:cs="Calibri"/>
+              </w:rPr>
+              <w:t>Accepted bounded purpose affinity, reuse, paired responsive sources, shared-frame logo, same-72-case regression and 13-capture checkpoint; complete-store visual quality remains unaccepted</w:t>
+            </w:r>
+          </w:p>
+        </w:tc>
+      </w:tr>
+      <w:tr>
+        <w:trPr>
+          <w:cantSplit/>
+        </w:trPr>
+        <w:tc>
+          <w:tcPr>
+            <w:tcW w:w="720" w:type="dxa"/>
+            <w:vAlign w:val="center"/>
+          </w:tcPr>
+          <w:p>
+            <w:pPr>
+              <w:pStyle w:val="CompactTableText"/>
+              <w:jc w:val="center"/>
+              <w:widowControl/>
+            </w:pPr>
+            <w:r>
+              <w:rPr>
+                <w:rFonts w:ascii="Calibri" w:hAnsi="Calibri" w:cs="Calibri"/>
+              </w:rPr>
+              <w:t>☐</w:t>
+            </w:r>
+          </w:p>
+        </w:tc>
+        <w:tc>
+          <w:tcPr>
+            <w:tcW w:w="1700" w:type="dxa"/>
+            <w:vAlign w:val="center"/>
+          </w:tcPr>
+          <w:p>
+            <w:pPr>
+              <w:pStyle w:val="CompactTableText"/>
+              <w:widowControl/>
+            </w:pPr>
+            <w:r>
+              <w:rPr>
+                <w:rFonts w:ascii="Calibri" w:hAnsi="Calibri" w:cs="Calibri"/>
+              </w:rPr>
+              <w:t>P10B-18B-02</w:t>
+            </w:r>
+          </w:p>
+        </w:tc>
+        <w:tc>
+          <w:tcPr>
+            <w:tcW w:w="2800" w:type="dxa"/>
+            <w:vAlign w:val="center"/>
+          </w:tcPr>
+          <w:p>
+            <w:pPr>
+              <w:pStyle w:val="CompactTableText"/>
+              <w:widowControl/>
+            </w:pPr>
+            <w:r>
+              <w:rPr>
+                <w:rFonts w:ascii="Calibri" w:hAnsi="Calibri" w:cs="Calibri"/>
+              </w:rPr>
+              <w:t>Homepage / editorial / campaign quality upgrade</w:t>
+            </w:r>
+          </w:p>
+        </w:tc>
+        <w:tc>
+          <w:tcPr>
+            <w:tcW w:w="850" w:type="dxa"/>
+            <w:vAlign w:val="center"/>
+          </w:tcPr>
+          <w:p>
+            <w:pPr>
+              <w:pStyle w:val="CompactTableText"/>
+              <w:jc w:val="center"/>
+              <w:widowControl/>
+            </w:pPr>
+            <w:r>
+              <w:rPr>
+                <w:rFonts w:ascii="Calibri" w:hAnsi="Calibri" w:cs="Calibri"/>
+                <w:b/>
+                <w:bCs/>
+              </w:rPr>
+              <w:t>Planned</w:t>
+            </w:r>
+          </w:p>
+        </w:tc>
+        <w:tc>
+          <w:tcPr>
+            <w:tcW w:w="1500" w:type="dxa"/>
+            <w:vAlign w:val="center"/>
+          </w:tcPr>
+          <w:p>
+            <w:pPr>
+              <w:pStyle w:val="CompactTableText"/>
+              <w:widowControl/>
+            </w:pPr>
+            <w:r>
+              <w:rPr>
+                <w:rFonts w:ascii="Calibri" w:hAnsi="Calibri" w:cs="Calibri"/>
+              </w:rPr>
+              <w:t>Homepage profile/component owners</w:t>
+            </w:r>
+          </w:p>
+        </w:tc>
+        <w:tc>
+          <w:tcPr>
+            <w:tcW w:w="2500" w:type="dxa"/>
+            <w:vAlign w:val="center"/>
+          </w:tcPr>
+          <w:p>
+            <w:pPr>
+              <w:pStyle w:val="CompactTableText"/>
+              <w:widowControl/>
+            </w:pPr>
+            <w:r>
+              <w:rPr>
+                <w:rFonts w:ascii="Calibri" w:hAnsi="Calibri" w:cs="Calibri"/>
+              </w:rPr>
+              <w:t>Accepted P10B-18B-01 and P10B-18B-06</w:t>
+            </w:r>
+          </w:p>
+        </w:tc>
+        <w:tc>
+          <w:tcPr>
+            <w:tcW w:w="2890" w:type="dxa"/>
+            <w:vAlign w:val="center"/>
+          </w:tcPr>
+          <w:p>
+            <w:pPr>
+              <w:pStyle w:val="CompactTableText"/>
+              <w:widowControl/>
+            </w:pPr>
+            <w:r>
+              <w:rPr>
+                <w:rFonts w:ascii="Calibri" w:hAnsi="Calibri" w:cs="Calibri"/>
+              </w:rPr>
+              <w:t>Intentional rich/sparse homepage progression, stronger section hierarchy and merchandising rhythm, four-width retained commercial review</w:t>
+            </w:r>
+          </w:p>
+        </w:tc>
+      </w:tr>
+      <w:tr>
+        <w:trPr>
+          <w:cantSplit/>
+        </w:trPr>
+        <w:tc>
+          <w:tcPr>
+            <w:tcW w:w="720" w:type="dxa"/>
+            <w:vAlign w:val="center"/>
+          </w:tcPr>
+          <w:p>
+            <w:pPr>
+              <w:pStyle w:val="CompactTableText"/>
+              <w:jc w:val="center"/>
+              <w:widowControl/>
+            </w:pPr>
+            <w:r>
+              <w:rPr>
+                <w:rFonts w:ascii="Calibri" w:hAnsi="Calibri" w:cs="Calibri"/>
+              </w:rPr>
               <w:t>☐</w:t>
             </w:r>
           </w:p>
@@ -10768,7 +11038,7 @@
         <w:rPr>
           <w:rFonts w:ascii="Calibri" w:hAnsi="Calibri" w:cs="Calibri"/>
         </w:rPr>
-        <w:t xml:space="preserve">. P10B-01 through P10B-17, P10B-16P-01 through P10B-16P-05A, P10B-16P-06, accepted P10B-18A, and accepted P10B-18B-01 are </w:t>
+        <w:t xml:space="preserve">. P10B-01 through P10B-17, P10B-16P-01 through P10B-16P-05A, P10B-16P-06, accepted P10B-18A, accepted P10B-18B-01 and accepted P10B-18B-06 are </w:t>
       </w:r>
       <w:r>
         <w:rPr>
@@ -10840,7 +11110,7 @@
         <w:rPr>
           <w:rFonts w:ascii="Calibri" w:hAnsi="Calibri" w:cs="Calibri"/>
         </w:rPr>
-        <w:t>. The remaining Done conditions are implementation gates, not claims about the current repository. The P10B-16P-01 through P10B-16P-05A plus P10B-16P-06 sequence is a mandatory convergence package between P10B-16 and P10B-17; it supplements rather than renumbers the locked P10B-01 through P10B-18 plan. P10B-16P-05B follows P10B-18C as the final consumer-verified historical cleanup. P10B-18B-06 is the next focused product task.</w:t>
+        <w:t>. The remaining Done conditions are implementation gates, not claims about the current repository. The P10B-16P-01 through P10B-16P-05A plus P10B-16P-06 sequence is a mandatory convergence package between P10B-16 and P10B-17; it supplements rather than renumbers the locked P10B-01 through P10B-18 plan. P10B-16P-05B follows P10B-18C as the final consumer-verified historical cleanup. P10B-18B-02 is the next focused product task after accepted P10B-18B-06.</w:t>
       </w:r>
     </w:p>
     <w:p>
@@ -16299,7 +16569,7 @@
         <w:rPr>
           <w:rFonts w:ascii="Calibri" w:hAnsi="Calibri" w:cs="Calibri"/>
         </w:rPr>
-        <w:t>P10B-17, accepted P10B-18A, and accepted P10B-18B-01 are Baseline. Parent P10B-18B, P10B-18 and P10B remain Partial; P10B-18B-06 is next, P10B-18C remains Planned, and P10B-16P-05B remains Planned after P10B-18C.</w:t>
+        <w:t>P10B-17, accepted P10B-18A, accepted P10B-18B-01, and accepted P10B-18B-06 are Baseline. Parent P10B-18B, P10B-18 and P10B remain Partial; P10B-18B-02 is next, P10B-18C remains Planned, and P10B-16P-05B remains Planned after P10B-18C.</w:t>
       </w:r>
     </w:p>
     <w:p>
@@ -17314,13 +17584,160 @@
           <w:b/>
           <w:bCs/>
         </w:rPr>
+        <w:t>Historical handoff:</w:t>
+      </w:r>
+      <w:r>
+        <w:rPr>
+          <w:rFonts w:ascii="Calibri" w:hAnsi="Calibri" w:cs="Calibri"/>
+        </w:rPr>
+        <w:t xml:space="preserve"> P10B-18B-06 — Asset Composition and Art Direction Quality Upgrade, subsequently accepted on 17 August 2026.</w:t>
+      </w:r>
+    </w:p>
+    <w:p>
+      <w:pPr>
+        <w:pStyle w:val="Heading3"/>
+        <w:keepNext/>
+        <w:widowControl/>
+      </w:pPr>
+      <w:r>
+        <w:rPr>
+          <w:rFonts w:ascii="Calibri" w:hAnsi="Calibri" w:cs="Calibri"/>
+        </w:rPr>
+        <w:t>P10B-18B-06 — Asset Composition and Art Direction Quality Upgrade</w:t>
+      </w:r>
+    </w:p>
+    <w:p>
+      <w:pPr>
+        <w:pStyle w:val="Normal"/>
+        <w:numPr>
+          <w:ilvl w:val="0"/>
+          <w:numId w:val="1"/>
+        </w:numPr>
+        <w:widowControl/>
+      </w:pPr>
+      <w:r>
+        <w:rPr>
+          <w:rFonts w:ascii="Calibri" w:hAnsi="Calibri" w:cs="Calibri"/>
+          <w:b/>
+          <w:bCs/>
+        </w:rPr>
+        <w:t>Status:</w:t>
+      </w:r>
+      <w:r>
+        <w:rPr>
+          <w:rFonts w:ascii="Calibri" w:hAnsi="Calibri" w:cs="Calibri"/>
+        </w:rPr>
+        <w:t xml:space="preserve"> </w:t>
+      </w:r>
+      <w:r>
+        <w:rPr>
+          <w:rFonts w:ascii="Calibri" w:hAnsi="Calibri" w:cs="Calibri"/>
+          <w:b/>
+          <w:bCs/>
+        </w:rPr>
+        <w:t>Baseline</w:t>
+      </w:r>
+      <w:r>
+        <w:rPr>
+          <w:rFonts w:ascii="Calibri" w:hAnsi="Calibri" w:cs="Calibri"/>
+        </w:rPr>
+        <w:t>. Accepted by the product owner on 17 August 2026 for the bounded shared asset-selection, purpose-affinity, reuse, responsive-source/crop, logo-consumer and art-direction authority.</w:t>
+      </w:r>
+    </w:p>
+    <w:p>
+      <w:pPr>
+        <w:pStyle w:val="Normal"/>
+        <w:numPr>
+          <w:ilvl w:val="0"/>
+          <w:numId w:val="1"/>
+        </w:numPr>
+        <w:widowControl/>
+      </w:pPr>
+      <w:r>
+        <w:rPr>
+          <w:rFonts w:ascii="Calibri" w:hAnsi="Calibri" w:cs="Calibri"/>
+          <w:b/>
+          <w:bCs/>
+        </w:rPr>
+        <w:t>Depends on:</w:t>
+      </w:r>
+      <w:r>
+        <w:rPr>
+          <w:rFonts w:ascii="Calibri" w:hAnsi="Calibri" w:cs="Calibri"/>
+        </w:rPr>
+        <w:t xml:space="preserve"> Accepted P10B-18B-01.</w:t>
+      </w:r>
+    </w:p>
+    <w:p>
+      <w:pPr>
+        <w:pStyle w:val="Normal"/>
+        <w:numPr>
+          <w:ilvl w:val="0"/>
+          <w:numId w:val="1"/>
+        </w:numPr>
+        <w:widowControl/>
+      </w:pPr>
+      <w:r>
+        <w:rPr>
+          <w:rFonts w:ascii="Calibri" w:hAnsi="Calibri" w:cs="Calibri"/>
+          <w:b/>
+          <w:bCs/>
+        </w:rPr>
+        <w:t>Done:</w:t>
+      </w:r>
+      <w:r>
+        <w:rPr>
+          <w:rFonts w:ascii="Calibri" w:hAnsi="Calibri" w:cs="Calibri"/>
+        </w:rPr>
+        <w:t xml:space="preserve"> Exact purpose-affine asset selection, explicit reuse limits, paired responsive hero sources and crops, one registered shared-header logo consumer, same-72-case regression and 13 retained captures preserve snapshot, compiler, renderer and protected product-media truth.</w:t>
+      </w:r>
+    </w:p>
+    <w:p>
+      <w:pPr>
+        <w:pStyle w:val="Normal"/>
+        <w:numPr>
+          <w:ilvl w:val="0"/>
+          <w:numId w:val="1"/>
+        </w:numPr>
+        <w:widowControl/>
+      </w:pPr>
+      <w:r>
+        <w:rPr>
+          <w:rFonts w:ascii="Calibri" w:hAnsi="Calibri" w:cs="Calibri"/>
+          <w:b/>
+          <w:bCs/>
+        </w:rPr>
+        <w:t>Boundary:</w:t>
+      </w:r>
+      <w:r>
+        <w:rPr>
+          <w:rFonts w:ascii="Calibri" w:hAnsi="Calibri" w:cs="Calibri"/>
+        </w:rPr>
+        <w:t xml:space="preserve"> This is not complete-storefront commercial visual acceptance. Excessive whitespace, generic homepage composition, weak merchandising rhythm and insufficient section hierarchy remain owned by P10B-18B-02/03/04/05.</w:t>
+      </w:r>
+    </w:p>
+    <w:p>
+      <w:pPr>
+        <w:pStyle w:val="Normal"/>
+        <w:numPr>
+          <w:ilvl w:val="0"/>
+          <w:numId w:val="1"/>
+        </w:numPr>
+        <w:widowControl/>
+      </w:pPr>
+      <w:r>
+        <w:rPr>
+          <w:rFonts w:ascii="Calibri" w:hAnsi="Calibri" w:cs="Calibri"/>
+          <w:b/>
+          <w:bCs/>
+        </w:rPr>
         <w:t>Next:</w:t>
       </w:r>
       <w:r>
         <w:rPr>
           <w:rFonts w:ascii="Calibri" w:hAnsi="Calibri" w:cs="Calibri"/>
         </w:rPr>
-        <w:t xml:space="preserve"> P10B-18B-06 — Asset Composition and Art Direction Quality Upgrade.</w:t>
+        <w:t xml:space="preserve"> P10B-18B-02 — Homepage / Editorial / Campaign Quality Upgrade.</w:t>
       </w:r>
     </w:p>
     <w:p>

</xml_diff>

<commit_message>
fix: close asset authority review gaps
</commit_message>
<xml_diff>
--- a/docs/VESKIFY_DEVELOPMENT_DELIVERY_TRACKER_v1.3.0.docx
+++ b/docs/VESKIFY_DEVELOPMENT_DELIVERY_TRACKER_v1.3.0.docx
@@ -17690,6 +17690,30 @@
           <w:rFonts w:ascii="Calibri" w:hAnsi="Calibri" w:cs="Calibri"/>
         </w:rPr>
         <w:t xml:space="preserve"> Exact purpose-affine asset selection, explicit reuse limits, paired responsive hero sources and crops, one registered shared-header logo consumer, same-72-case regression and 13 retained captures preserve snapshot, compiler, renderer and protected product-media truth.</w:t>
+      </w:r>
+    </w:p>
+    <w:p>
+      <w:pPr>
+        <w:pStyle w:val="Normal"/>
+        <w:numPr>
+          <w:ilvl w:val="0"/>
+          <w:numId w:val="1"/>
+        </w:numPr>
+        <w:widowControl/>
+      </w:pPr>
+      <w:r>
+        <w:rPr>
+          <w:rFonts w:ascii="Calibri" w:hAnsi="Calibri" w:cs="Calibri"/>
+          <w:b/>
+          <w:bCs/>
+        </w:rPr>
+        <w:t>Review closure:</w:t>
+      </w:r>
+      <w:r>
+        <w:rPr>
+          <w:rFonts w:ascii="Calibri" w:hAnsi="Calibri" w:cs="Calibri"/>
+        </w:rPr>
+        <w:t xml:space="preserve"> The one automatic review was resolved in one focused pass: follow-up reuse ignores replaced homepage/header placements; paired sources enforce independent reuse and exact current provenance; primaries require complete viewport coverage; art direction is keyed by exact placement, upgrades existing authority, preserves approved crop identity/ratio and safe areas; source/treatment fallback stays independent; collection campaign affinity honors collection IDs.</w:t>
       </w:r>
     </w:p>
     <w:p>

</xml_diff>

<commit_message>
feat: upgrade homepage editorial campaign quality
</commit_message>
<xml_diff>
--- a/docs/VESKIFY_DEVELOPMENT_DELIVERY_TRACKER_v1.3.0.docx
+++ b/docs/VESKIFY_DEVELOPMENT_DELIVERY_TRACKER_v1.3.0.docx
@@ -38,7 +38,7 @@
         <w:rPr>
           <w:rFonts w:ascii="Calibri" w:hAnsi="Calibri" w:cs="Calibri"/>
         </w:rPr>
-        <w:t>Delivery status baseline: 17 August 2026, accepted P10B-18B-06 bounded asset-composition and art-direction upgrade</w:t>
+        <w:t>Delivery status baseline: 18 August 2026, accepted P10B-18B-02 homepage/editorial/campaign quality upgrade</w:t>
       </w:r>
     </w:p>
     <w:p>
@@ -245,7 +245,7 @@
               <w:rPr>
                 <w:rFonts w:ascii="Calibri" w:hAnsi="Calibri" w:cs="Calibri"/>
               </w:rPr>
-              <w:t>17 August 2026, accepted P10B-18B-01 Design DNA/shared-frame upgrade</w:t>
+              <w:t>18 August 2026, accepted P10B-18B-02 homepage/editorial/campaign quality upgrade</w:t>
             </w:r>
           </w:p>
         </w:tc>
@@ -6620,7 +6620,7 @@
               <w:rPr>
                 <w:rFonts w:ascii="Calibri" w:hAnsi="Calibri" w:cs="Calibri"/>
               </w:rPr>
-              <w:t>☐</w:t>
+              <w:t>☑</w:t>
             </w:r>
           </w:p>
         </w:tc>
@@ -6677,6 +6677,141 @@
                 <w:b/>
                 <w:bCs/>
               </w:rPr>
+              <w:t>Baseline</w:t>
+            </w:r>
+          </w:p>
+        </w:tc>
+        <w:tc>
+          <w:tcPr>
+            <w:tcW w:w="1500" w:type="dxa"/>
+            <w:vAlign w:val="center"/>
+          </w:tcPr>
+          <w:p>
+            <w:pPr>
+              <w:pStyle w:val="CompactTableText"/>
+              <w:widowControl/>
+            </w:pPr>
+            <w:r>
+              <w:rPr>
+                <w:rFonts w:ascii="Calibri" w:hAnsi="Calibri" w:cs="Calibri"/>
+              </w:rPr>
+              <w:t>Homepage profile/component owners</w:t>
+            </w:r>
+          </w:p>
+        </w:tc>
+        <w:tc>
+          <w:tcPr>
+            <w:tcW w:w="2500" w:type="dxa"/>
+            <w:vAlign w:val="center"/>
+          </w:tcPr>
+          <w:p>
+            <w:pPr>
+              <w:pStyle w:val="CompactTableText"/>
+              <w:widowControl/>
+            </w:pPr>
+            <w:r>
+              <w:rPr>
+                <w:rFonts w:ascii="Calibri" w:hAnsi="Calibri" w:cs="Calibri"/>
+              </w:rPr>
+              <w:t>Accepted P10B-18B-01 and P10B-18B-06</w:t>
+            </w:r>
+          </w:p>
+        </w:tc>
+        <w:tc>
+          <w:tcPr>
+            <w:tcW w:w="2890" w:type="dxa"/>
+            <w:vAlign w:val="center"/>
+          </w:tcPr>
+          <w:p>
+            <w:pPr>
+              <w:pStyle w:val="CompactTableText"/>
+              <w:widowControl/>
+            </w:pPr>
+            <w:r>
+              <w:rPr>
+                <w:rFonts w:ascii="Calibri" w:hAnsi="Calibri" w:cs="Calibri"/>
+              </w:rPr>
+              <w:t>Accepted intentional rich/sparse progression, exact transition authority, stronger hierarchy/rhythm, same-strata accounting, retained review and lifecycle preservation</w:t>
+            </w:r>
+          </w:p>
+        </w:tc>
+      </w:tr>
+      <w:tr>
+        <w:trPr>
+          <w:cantSplit/>
+        </w:trPr>
+        <w:tc>
+          <w:tcPr>
+            <w:tcW w:w="720" w:type="dxa"/>
+            <w:vAlign w:val="center"/>
+          </w:tcPr>
+          <w:p>
+            <w:pPr>
+              <w:pStyle w:val="CompactTableText"/>
+              <w:jc w:val="center"/>
+              <w:widowControl/>
+            </w:pPr>
+            <w:r>
+              <w:rPr>
+                <w:rFonts w:ascii="Calibri" w:hAnsi="Calibri" w:cs="Calibri"/>
+              </w:rPr>
+              <w:t>☐</w:t>
+            </w:r>
+          </w:p>
+        </w:tc>
+        <w:tc>
+          <w:tcPr>
+            <w:tcW w:w="1700" w:type="dxa"/>
+            <w:vAlign w:val="center"/>
+          </w:tcPr>
+          <w:p>
+            <w:pPr>
+              <w:pStyle w:val="CompactTableText"/>
+              <w:widowControl/>
+            </w:pPr>
+            <w:r>
+              <w:rPr>
+                <w:rFonts w:ascii="Calibri" w:hAnsi="Calibri" w:cs="Calibri"/>
+              </w:rPr>
+              <w:t>P10B-18B-03</w:t>
+            </w:r>
+          </w:p>
+        </w:tc>
+        <w:tc>
+          <w:tcPr>
+            <w:tcW w:w="2800" w:type="dxa"/>
+            <w:vAlign w:val="center"/>
+          </w:tcPr>
+          <w:p>
+            <w:pPr>
+              <w:pStyle w:val="CompactTableText"/>
+              <w:widowControl/>
+            </w:pPr>
+            <w:r>
+              <w:rPr>
+                <w:rFonts w:ascii="Calibri" w:hAnsi="Calibri" w:cs="Calibri"/>
+              </w:rPr>
+              <w:t>Collection / search / product-card quality upgrade</w:t>
+            </w:r>
+          </w:p>
+        </w:tc>
+        <w:tc>
+          <w:tcPr>
+            <w:tcW w:w="850" w:type="dxa"/>
+            <w:vAlign w:val="center"/>
+          </w:tcPr>
+          <w:p>
+            <w:pPr>
+              <w:pStyle w:val="CompactTableText"/>
+              <w:jc w:val="center"/>
+              <w:widowControl/>
+            </w:pPr>
+            <w:r>
+              <w:rPr>
+                <w:rFonts w:ascii="Calibri" w:hAnsi="Calibri" w:cs="Calibri"/>
+                <w:b/>
+                <w:bCs/>
+              </w:rPr>
               <w:t>Planned</w:t>
             </w:r>
           </w:p>
@@ -6695,7 +6830,7 @@
               <w:rPr>
                 <w:rFonts w:ascii="Calibri" w:hAnsi="Calibri" w:cs="Calibri"/>
               </w:rPr>
-              <w:t>Homepage profile/component owners</w:t>
+              <w:t>Collection/search/product-card owners</w:t>
             </w:r>
           </w:p>
         </w:tc>
@@ -6713,7 +6848,7 @@
               <w:rPr>
                 <w:rFonts w:ascii="Calibri" w:hAnsi="Calibri" w:cs="Calibri"/>
               </w:rPr>
-              <w:t>Accepted P10B-18B-01 and P10B-18B-06</w:t>
+              <w:t>Accepted P10B-18B-02</w:t>
             </w:r>
           </w:p>
         </w:tc>
@@ -6731,7 +6866,7 @@
               <w:rPr>
                 <w:rFonts w:ascii="Calibri" w:hAnsi="Calibri" w:cs="Calibri"/>
               </w:rPr>
-              <w:t>Intentional rich/sparse homepage progression, stronger section hierarchy and merchandising rhythm, four-width retained commercial review</w:t>
+              <w:t>Stronger collection/search composition, card hierarchy and merchandising density with retained four-width and protected-commerce evidence</w:t>
             </w:r>
           </w:p>
         </w:tc>
@@ -11038,7 +11173,7 @@
         <w:rPr>
           <w:rFonts w:ascii="Calibri" w:hAnsi="Calibri" w:cs="Calibri"/>
         </w:rPr>
-        <w:t xml:space="preserve">. P10B-01 through P10B-17, P10B-16P-01 through P10B-16P-05A, P10B-16P-06, accepted P10B-18A, accepted P10B-18B-01 and accepted P10B-18B-06 are </w:t>
+        <w:t xml:space="preserve">. P10B-01 through P10B-17, P10B-16P-01 through P10B-16P-05A, P10B-16P-06, accepted P10B-18A, accepted P10B-18B-01, accepted P10B-18B-06 and accepted P10B-18B-02 are </w:t>
       </w:r>
       <w:r>
         <w:rPr>
@@ -11110,7 +11245,7 @@
         <w:rPr>
           <w:rFonts w:ascii="Calibri" w:hAnsi="Calibri" w:cs="Calibri"/>
         </w:rPr>
-        <w:t>. The remaining Done conditions are implementation gates, not claims about the current repository. The P10B-16P-01 through P10B-16P-05A plus P10B-16P-06 sequence is a mandatory convergence package between P10B-16 and P10B-17; it supplements rather than renumbers the locked P10B-01 through P10B-18 plan. P10B-16P-05B follows P10B-18C as the final consumer-verified historical cleanup. P10B-18B-02 is the next focused product task after accepted P10B-18B-06.</w:t>
+        <w:t>. The remaining Done conditions are implementation gates, not claims about the current repository. The P10B-16P-01 through P10B-16P-05A plus P10B-16P-06 sequence is a mandatory convergence package between P10B-16 and P10B-17; it supplements rather than renumbers the locked P10B-01 through P10B-18 plan. P10B-16P-05B follows P10B-18C as the final consumer-verified historical cleanup. P10B-18B-03 is the next focused product task after accepted P10B-18B-02.</w:t>
       </w:r>
     </w:p>
     <w:p>
@@ -16569,7 +16704,7 @@
         <w:rPr>
           <w:rFonts w:ascii="Calibri" w:hAnsi="Calibri" w:cs="Calibri"/>
         </w:rPr>
-        <w:t>P10B-17, accepted P10B-18A, accepted P10B-18B-01, and accepted P10B-18B-06 are Baseline. Parent P10B-18B, P10B-18 and P10B remain Partial; P10B-18B-02 is next, P10B-18C remains Planned, and P10B-16P-05B remains Planned after P10B-18C.</w:t>
+        <w:t>P10B-17, accepted P10B-18A, accepted P10B-18B-01, accepted P10B-18B-06, and accepted P10B-18B-02 are Baseline. Parent P10B-18B, P10B-18 and P10B remain Partial; P10B-18B-03 is next, P10B-18C remains Planned, and P10B-16P-05B remains Planned after P10B-18C.</w:t>
       </w:r>
     </w:p>
     <w:p>
@@ -16863,7 +16998,7 @@
         <w:rPr>
           <w:rFonts w:ascii="Calibri" w:hAnsi="Calibri" w:cs="Calibri"/>
         </w:rPr>
-        <w:t>. P10B-18A and P10B-18B-01 are Baseline; parent P10B-18B is Partial and P10B-18C remains Planned.</w:t>
+        <w:t>. P10B-18A, P10B-18B-01, P10B-18B-06 and P10B-18B-02 are Baseline; parent P10B-18B is Partial and P10B-18C remains Planned.</w:t>
       </w:r>
     </w:p>
     <w:p>
@@ -17269,7 +17404,7 @@
         <w:rPr>
           <w:rFonts w:ascii="Calibri" w:hAnsi="Calibri" w:cs="Calibri"/>
         </w:rPr>
-        <w:t>. P10B-18B-01 is Baseline; the remaining packages are incomplete.</w:t>
+        <w:t>. P10B-18B-01, P10B-18B-06 and P10B-18B-02 are Baseline; the remaining packages are incomplete.</w:t>
       </w:r>
     </w:p>
     <w:p>
@@ -17755,13 +17890,184 @@
           <w:b/>
           <w:bCs/>
         </w:rPr>
+        <w:t>Historical handoff:</w:t>
+      </w:r>
+      <w:r>
+        <w:rPr>
+          <w:rFonts w:ascii="Calibri" w:hAnsi="Calibri" w:cs="Calibri"/>
+        </w:rPr>
+        <w:t xml:space="preserve"> P10B-18B-02 — Homepage / Editorial / Campaign Quality Upgrade, subsequently accepted on 18 August 2026.</w:t>
+      </w:r>
+    </w:p>
+    <w:p>
+      <w:pPr>
+        <w:pStyle w:val="Heading3"/>
+        <w:keepNext/>
+        <w:widowControl/>
+      </w:pPr>
+      <w:r>
+        <w:rPr>
+          <w:rFonts w:ascii="Calibri" w:hAnsi="Calibri" w:cs="Calibri"/>
+        </w:rPr>
+        <w:t>P10B-18B-02 — Homepage / Editorial / Campaign Quality Upgrade</w:t>
+      </w:r>
+    </w:p>
+    <w:p>
+      <w:pPr>
+        <w:pStyle w:val="Normal"/>
+        <w:numPr>
+          <w:ilvl w:val="0"/>
+          <w:numId w:val="1"/>
+        </w:numPr>
+        <w:widowControl/>
+      </w:pPr>
+      <w:r>
+        <w:rPr>
+          <w:rFonts w:ascii="Calibri" w:hAnsi="Calibri" w:cs="Calibri"/>
+          <w:b/>
+          <w:bCs/>
+        </w:rPr>
+        <w:t>Status:</w:t>
+      </w:r>
+      <w:r>
+        <w:rPr>
+          <w:rFonts w:ascii="Calibri" w:hAnsi="Calibri" w:cs="Calibri"/>
+        </w:rPr>
+        <w:t xml:space="preserve"> </w:t>
+      </w:r>
+      <w:r>
+        <w:rPr>
+          <w:rFonts w:ascii="Calibri" w:hAnsi="Calibri" w:cs="Calibri"/>
+          <w:b/>
+          <w:bCs/>
+        </w:rPr>
+        <w:t>Baseline</w:t>
+      </w:r>
+      <w:r>
+        <w:rPr>
+          <w:rFonts w:ascii="Calibri" w:hAnsi="Calibri" w:cs="Calibri"/>
+        </w:rPr>
+        <w:t>. Accepted by the product owner on 18 August 2026 for the bounded homepage, editorial and campaign quality authority.</w:t>
+      </w:r>
+    </w:p>
+    <w:p>
+      <w:pPr>
+        <w:pStyle w:val="Normal"/>
+        <w:numPr>
+          <w:ilvl w:val="0"/>
+          <w:numId w:val="1"/>
+        </w:numPr>
+        <w:widowControl/>
+      </w:pPr>
+      <w:r>
+        <w:rPr>
+          <w:rFonts w:ascii="Calibri" w:hAnsi="Calibri" w:cs="Calibri"/>
+          <w:b/>
+          <w:bCs/>
+        </w:rPr>
+        <w:t>Depends on:</w:t>
+      </w:r>
+      <w:r>
+        <w:rPr>
+          <w:rFonts w:ascii="Calibri" w:hAnsi="Calibri" w:cs="Calibri"/>
+        </w:rPr>
+        <w:t xml:space="preserve"> Accepted P10B-18B-01 and P10B-18B-06.</w:t>
+      </w:r>
+    </w:p>
+    <w:p>
+      <w:pPr>
+        <w:pStyle w:val="Normal"/>
+        <w:numPr>
+          <w:ilvl w:val="0"/>
+          <w:numId w:val="1"/>
+        </w:numPr>
+        <w:widowControl/>
+      </w:pPr>
+      <w:r>
+        <w:rPr>
+          <w:rFonts w:ascii="Calibri" w:hAnsi="Calibri" w:cs="Calibri"/>
+          <w:b/>
+          <w:bCs/>
+        </w:rPr>
+        <w:t>Done:</w:t>
+      </w:r>
+      <w:r>
+        <w:rPr>
+          <w:rFonts w:ascii="Calibri" w:hAnsi="Calibri" w:cs="Calibri"/>
+        </w:rPr>
+        <w:t xml:space="preserve"> The six existing homepage profiles now carry explicit transition intent, truthful story/catalogue semantic causality, asset-aware rich/sparse progression and distinct hierarchy; the renderer consumes observable hero, promotion, editorial and proof structures without a second page graph or renderer.</w:t>
+      </w:r>
+    </w:p>
+    <w:p>
+      <w:pPr>
+        <w:pStyle w:val="Normal"/>
+        <w:numPr>
+          <w:ilvl w:val="0"/>
+          <w:numId w:val="1"/>
+        </w:numPr>
+        <w:widowControl/>
+      </w:pPr>
+      <w:r>
+        <w:rPr>
+          <w:rFonts w:ascii="Calibri" w:hAnsi="Calibri" w:cs="Calibri"/>
+          <w:b/>
+          <w:bCs/>
+        </w:rPr>
+        <w:t>Evidence:</w:t>
+      </w:r>
+      <w:r>
+        <w:rPr>
+          <w:rFonts w:ascii="Calibri" w:hAnsi="Calibri" w:cs="Calibri"/>
+        </w:rPr>
+        <w:t xml:space="preserve"> The unchanged nine-by-eight strata produce 38 normalized topologies, 55/72 repeated material memberships, a largest cluster of seven and 17 singletons. Fourteen retained captures prove rich/sparse, three same-direction profile/frame contrasts, compact mobile merchandising, internal overflow bounds, persistence and protected commerce/media parity.</w:t>
+      </w:r>
+    </w:p>
+    <w:p>
+      <w:pPr>
+        <w:pStyle w:val="Normal"/>
+        <w:numPr>
+          <w:ilvl w:val="0"/>
+          <w:numId w:val="1"/>
+        </w:numPr>
+        <w:widowControl/>
+      </w:pPr>
+      <w:r>
+        <w:rPr>
+          <w:rFonts w:ascii="Calibri" w:hAnsi="Calibri" w:cs="Calibri"/>
+          <w:b/>
+          <w:bCs/>
+        </w:rPr>
+        <w:t>Boundary:</w:t>
+      </w:r>
+      <w:r>
+        <w:rPr>
+          <w:rFonts w:ascii="Calibri" w:hAnsi="Calibri" w:cs="Calibri"/>
+        </w:rPr>
+        <w:t xml:space="preserve"> This does not accept collection/search/product-card, PDP or content/utility visual quality and does not satisfy the P10B-18C designer-grade/100+ gate.</w:t>
+      </w:r>
+    </w:p>
+    <w:p>
+      <w:pPr>
+        <w:pStyle w:val="Normal"/>
+        <w:numPr>
+          <w:ilvl w:val="0"/>
+          <w:numId w:val="1"/>
+        </w:numPr>
+        <w:widowControl/>
+      </w:pPr>
+      <w:r>
+        <w:rPr>
+          <w:rFonts w:ascii="Calibri" w:hAnsi="Calibri" w:cs="Calibri"/>
+          <w:b/>
+          <w:bCs/>
+        </w:rPr>
         <w:t>Next:</w:t>
       </w:r>
       <w:r>
         <w:rPr>
           <w:rFonts w:ascii="Calibri" w:hAnsi="Calibri" w:cs="Calibri"/>
         </w:rPr>
-        <w:t xml:space="preserve"> P10B-18B-02 — Homepage / Editorial / Campaign Quality Upgrade.</w:t>
+        <w:t xml:space="preserve"> P10B-18B-03 — Collection / Search / Product-card Quality Upgrade.</w:t>
       </w:r>
     </w:p>
     <w:p>

</xml_diff>

<commit_message>
feat: upgrade collection search and product cards
</commit_message>
<xml_diff>
--- a/docs/VESKIFY_DEVELOPMENT_DELIVERY_TRACKER_v1.3.0.docx
+++ b/docs/VESKIFY_DEVELOPMENT_DELIVERY_TRACKER_v1.3.0.docx
@@ -38,7 +38,7 @@
         <w:rPr>
           <w:rFonts w:ascii="Calibri" w:hAnsi="Calibri" w:cs="Calibri"/>
         </w:rPr>
-        <w:t>Delivery status baseline: 18 August 2026, accepted P10B-18B-02 homepage/editorial/campaign quality upgrade</w:t>
+        <w:t>Delivery status baseline: 18 August 2026, accepted P10B-18B-03 collection/search/product-card quality upgrade</w:t>
       </w:r>
     </w:p>
     <w:p>
@@ -245,7 +245,7 @@
               <w:rPr>
                 <w:rFonts w:ascii="Calibri" w:hAnsi="Calibri" w:cs="Calibri"/>
               </w:rPr>
-              <w:t>18 August 2026, accepted P10B-18B-02 homepage/editorial/campaign quality upgrade</w:t>
+              <w:t>18 August 2026, accepted P10B-18B-03 collection/search/product-card quality upgrade</w:t>
             </w:r>
           </w:p>
         </w:tc>
@@ -6755,7 +6755,7 @@
               <w:rPr>
                 <w:rFonts w:ascii="Calibri" w:hAnsi="Calibri" w:cs="Calibri"/>
               </w:rPr>
-              <w:t>☐</w:t>
+              <w:t>☑</w:t>
             </w:r>
           </w:p>
         </w:tc>
@@ -6812,6 +6812,141 @@
                 <w:b/>
                 <w:bCs/>
               </w:rPr>
+              <w:t>Baseline</w:t>
+            </w:r>
+          </w:p>
+        </w:tc>
+        <w:tc>
+          <w:tcPr>
+            <w:tcW w:w="1500" w:type="dxa"/>
+            <w:vAlign w:val="center"/>
+          </w:tcPr>
+          <w:p>
+            <w:pPr>
+              <w:pStyle w:val="CompactTableText"/>
+              <w:widowControl/>
+            </w:pPr>
+            <w:r>
+              <w:rPr>
+                <w:rFonts w:ascii="Calibri" w:hAnsi="Calibri" w:cs="Calibri"/>
+              </w:rPr>
+              <w:t>Collection/search/product-card owners</w:t>
+            </w:r>
+          </w:p>
+        </w:tc>
+        <w:tc>
+          <w:tcPr>
+            <w:tcW w:w="2500" w:type="dxa"/>
+            <w:vAlign w:val="center"/>
+          </w:tcPr>
+          <w:p>
+            <w:pPr>
+              <w:pStyle w:val="CompactTableText"/>
+              <w:widowControl/>
+            </w:pPr>
+            <w:r>
+              <w:rPr>
+                <w:rFonts w:ascii="Calibri" w:hAnsi="Calibri" w:cs="Calibri"/>
+              </w:rPr>
+              <w:t>Accepted P10B-18B-02</w:t>
+            </w:r>
+          </w:p>
+        </w:tc>
+        <w:tc>
+          <w:tcPr>
+            <w:tcW w:w="2890" w:type="dxa"/>
+            <w:vAlign w:val="center"/>
+          </w:tcPr>
+          <w:p>
+            <w:pPr>
+              <w:pStyle w:val="CompactTableText"/>
+              <w:widowControl/>
+            </w:pPr>
+            <w:r>
+              <w:rPr>
+                <w:rFonts w:ascii="Calibri" w:hAnsi="Calibri" w:cs="Calibri"/>
+              </w:rPr>
+              <w:t>Accepted cardinality/facet hierarchy, four distinct profile purposes, five canonical card anatomies, executable search truth, same-72 accounting and 21-capture retained review</w:t>
+            </w:r>
+          </w:p>
+        </w:tc>
+      </w:tr>
+      <w:tr>
+        <w:trPr>
+          <w:cantSplit/>
+        </w:trPr>
+        <w:tc>
+          <w:tcPr>
+            <w:tcW w:w="720" w:type="dxa"/>
+            <w:vAlign w:val="center"/>
+          </w:tcPr>
+          <w:p>
+            <w:pPr>
+              <w:pStyle w:val="CompactTableText"/>
+              <w:jc w:val="center"/>
+              <w:widowControl/>
+            </w:pPr>
+            <w:r>
+              <w:rPr>
+                <w:rFonts w:ascii="Calibri" w:hAnsi="Calibri" w:cs="Calibri"/>
+              </w:rPr>
+              <w:t>☐</w:t>
+            </w:r>
+          </w:p>
+        </w:tc>
+        <w:tc>
+          <w:tcPr>
+            <w:tcW w:w="1700" w:type="dxa"/>
+            <w:vAlign w:val="center"/>
+          </w:tcPr>
+          <w:p>
+            <w:pPr>
+              <w:pStyle w:val="CompactTableText"/>
+              <w:widowControl/>
+            </w:pPr>
+            <w:r>
+              <w:rPr>
+                <w:rFonts w:ascii="Calibri" w:hAnsi="Calibri" w:cs="Calibri"/>
+              </w:rPr>
+              <w:t>P10B-18B-04</w:t>
+            </w:r>
+          </w:p>
+        </w:tc>
+        <w:tc>
+          <w:tcPr>
+            <w:tcW w:w="2800" w:type="dxa"/>
+            <w:vAlign w:val="center"/>
+          </w:tcPr>
+          <w:p>
+            <w:pPr>
+              <w:pStyle w:val="CompactTableText"/>
+              <w:widowControl/>
+            </w:pPr>
+            <w:r>
+              <w:rPr>
+                <w:rFonts w:ascii="Calibri" w:hAnsi="Calibri" w:cs="Calibri"/>
+              </w:rPr>
+              <w:t>PDP quality upgrade</w:t>
+            </w:r>
+          </w:p>
+        </w:tc>
+        <w:tc>
+          <w:tcPr>
+            <w:tcW w:w="850" w:type="dxa"/>
+            <w:vAlign w:val="center"/>
+          </w:tcPr>
+          <w:p>
+            <w:pPr>
+              <w:pStyle w:val="CompactTableText"/>
+              <w:jc w:val="center"/>
+              <w:widowControl/>
+            </w:pPr>
+            <w:r>
+              <w:rPr>
+                <w:rFonts w:ascii="Calibri" w:hAnsi="Calibri" w:cs="Calibri"/>
+                <w:b/>
+                <w:bCs/>
+              </w:rPr>
               <w:t>Planned</w:t>
             </w:r>
           </w:p>
@@ -6830,7 +6965,7 @@
               <w:rPr>
                 <w:rFonts w:ascii="Calibri" w:hAnsi="Calibri" w:cs="Calibri"/>
               </w:rPr>
-              <w:t>Collection/search/product-card owners</w:t>
+              <w:t>PDP profile/commerce presentation owners</w:t>
             </w:r>
           </w:p>
         </w:tc>
@@ -6848,7 +6983,7 @@
               <w:rPr>
                 <w:rFonts w:ascii="Calibri" w:hAnsi="Calibri" w:cs="Calibri"/>
               </w:rPr>
-              <w:t>Accepted P10B-18B-02</w:t>
+              <w:t>Accepted P10B-18B-03</w:t>
             </w:r>
           </w:p>
         </w:tc>
@@ -6866,7 +7001,142 @@
               <w:rPr>
                 <w:rFonts w:ascii="Calibri" w:hAnsi="Calibri" w:cs="Calibri"/>
               </w:rPr>
-              <w:t>Stronger collection/search composition, card hierarchy and merchandising density with retained four-width and protected-commerce evidence</w:t>
+              <w:t>Stronger PDP opening, gallery, option/purchase and related-merchandising hierarchy with protected variant/price/media and retained four-width evidence</w:t>
+            </w:r>
+          </w:p>
+        </w:tc>
+      </w:tr>
+      <w:tr>
+        <w:trPr>
+          <w:cantSplit/>
+        </w:trPr>
+        <w:tc>
+          <w:tcPr>
+            <w:tcW w:w="720" w:type="dxa"/>
+            <w:vAlign w:val="center"/>
+          </w:tcPr>
+          <w:p>
+            <w:pPr>
+              <w:pStyle w:val="CompactTableText"/>
+              <w:jc w:val="center"/>
+              <w:widowControl/>
+            </w:pPr>
+            <w:r>
+              <w:rPr>
+                <w:rFonts w:ascii="Calibri" w:hAnsi="Calibri" w:cs="Calibri"/>
+              </w:rPr>
+              <w:t>☐</w:t>
+            </w:r>
+          </w:p>
+        </w:tc>
+        <w:tc>
+          <w:tcPr>
+            <w:tcW w:w="1700" w:type="dxa"/>
+            <w:vAlign w:val="center"/>
+          </w:tcPr>
+          <w:p>
+            <w:pPr>
+              <w:pStyle w:val="CompactTableText"/>
+              <w:widowControl/>
+            </w:pPr>
+            <w:r>
+              <w:rPr>
+                <w:rFonts w:ascii="Calibri" w:hAnsi="Calibri" w:cs="Calibri"/>
+              </w:rPr>
+              <w:t>P10B-18B-05</w:t>
+            </w:r>
+          </w:p>
+        </w:tc>
+        <w:tc>
+          <w:tcPr>
+            <w:tcW w:w="2800" w:type="dxa"/>
+            <w:vAlign w:val="center"/>
+          </w:tcPr>
+          <w:p>
+            <w:pPr>
+              <w:pStyle w:val="CompactTableText"/>
+              <w:widowControl/>
+            </w:pPr>
+            <w:r>
+              <w:rPr>
+                <w:rFonts w:ascii="Calibri" w:hAnsi="Calibri" w:cs="Calibri"/>
+              </w:rPr>
+              <w:t>Content / support / utilities quality upgrade</w:t>
+            </w:r>
+          </w:p>
+        </w:tc>
+        <w:tc>
+          <w:tcPr>
+            <w:tcW w:w="850" w:type="dxa"/>
+            <w:vAlign w:val="center"/>
+          </w:tcPr>
+          <w:p>
+            <w:pPr>
+              <w:pStyle w:val="CompactTableText"/>
+              <w:jc w:val="center"/>
+              <w:widowControl/>
+            </w:pPr>
+            <w:r>
+              <w:rPr>
+                <w:rFonts w:ascii="Calibri" w:hAnsi="Calibri" w:cs="Calibri"/>
+                <w:b/>
+                <w:bCs/>
+              </w:rPr>
+              <w:t>Planned</w:t>
+            </w:r>
+          </w:p>
+        </w:tc>
+        <w:tc>
+          <w:tcPr>
+            <w:tcW w:w="1500" w:type="dxa"/>
+            <w:vAlign w:val="center"/>
+          </w:tcPr>
+          <w:p>
+            <w:pPr>
+              <w:pStyle w:val="CompactTableText"/>
+              <w:widowControl/>
+            </w:pPr>
+            <w:r>
+              <w:rPr>
+                <w:rFonts w:ascii="Calibri" w:hAnsi="Calibri" w:cs="Calibri"/>
+              </w:rPr>
+              <w:t>Content/support/utility owners</w:t>
+            </w:r>
+          </w:p>
+        </w:tc>
+        <w:tc>
+          <w:tcPr>
+            <w:tcW w:w="2500" w:type="dxa"/>
+            <w:vAlign w:val="center"/>
+          </w:tcPr>
+          <w:p>
+            <w:pPr>
+              <w:pStyle w:val="CompactTableText"/>
+              <w:widowControl/>
+            </w:pPr>
+            <w:r>
+              <w:rPr>
+                <w:rFonts w:ascii="Calibri" w:hAnsi="Calibri" w:cs="Calibri"/>
+              </w:rPr>
+              <w:t>Accepted P10B-18B-04</w:t>
+            </w:r>
+          </w:p>
+        </w:tc>
+        <w:tc>
+          <w:tcPr>
+            <w:tcW w:w="2890" w:type="dxa"/>
+            <w:vAlign w:val="center"/>
+          </w:tcPr>
+          <w:p>
+            <w:pPr>
+              <w:pStyle w:val="CompactTableText"/>
+              <w:widowControl/>
+            </w:pPr>
+            <w:r>
+              <w:rPr>
+                <w:rFonts w:ascii="Calibri" w:hAnsi="Calibri" w:cs="Calibri"/>
+              </w:rPr>
+              <w:t>Stronger registered content, support and utility compositions with lifecycle, navigation and protected-commerce preservation</w:t>
             </w:r>
           </w:p>
         </w:tc>
@@ -11173,7 +11443,7 @@
         <w:rPr>
           <w:rFonts w:ascii="Calibri" w:hAnsi="Calibri" w:cs="Calibri"/>
         </w:rPr>
-        <w:t xml:space="preserve">. P10B-01 through P10B-17, P10B-16P-01 through P10B-16P-05A, P10B-16P-06, accepted P10B-18A, accepted P10B-18B-01, accepted P10B-18B-06 and accepted P10B-18B-02 are </w:t>
+        <w:t xml:space="preserve">. P10B-01 through P10B-17, P10B-16P-01 through P10B-16P-05A, P10B-16P-06, accepted P10B-18A, accepted P10B-18B-01, accepted P10B-18B-06, accepted P10B-18B-02 and accepted P10B-18B-03 are </w:t>
       </w:r>
       <w:r>
         <w:rPr>
@@ -11245,7 +11515,7 @@
         <w:rPr>
           <w:rFonts w:ascii="Calibri" w:hAnsi="Calibri" w:cs="Calibri"/>
         </w:rPr>
-        <w:t>. The remaining Done conditions are implementation gates, not claims about the current repository. The P10B-16P-01 through P10B-16P-05A plus P10B-16P-06 sequence is a mandatory convergence package between P10B-16 and P10B-17; it supplements rather than renumbers the locked P10B-01 through P10B-18 plan. P10B-16P-05B follows P10B-18C as the final consumer-verified historical cleanup. P10B-18B-03 is the next focused product task after accepted P10B-18B-02.</w:t>
+        <w:t>. The remaining Done conditions are implementation gates, not claims about the current repository. The P10B-16P-01 through P10B-16P-05A plus P10B-16P-06 sequence is a mandatory convergence package between P10B-16 and P10B-17; it supplements rather than renumbers the locked P10B-01 through P10B-18 plan. P10B-16P-05B follows P10B-18C as the final consumer-verified historical cleanup. P10B-18B-04 is the next focused product task after accepted P10B-18B-03.</w:t>
       </w:r>
     </w:p>
     <w:p>
@@ -16704,7 +16974,7 @@
         <w:rPr>
           <w:rFonts w:ascii="Calibri" w:hAnsi="Calibri" w:cs="Calibri"/>
         </w:rPr>
-        <w:t>P10B-17, accepted P10B-18A, accepted P10B-18B-01, accepted P10B-18B-06, and accepted P10B-18B-02 are Baseline. Parent P10B-18B, P10B-18 and P10B remain Partial; P10B-18B-03 is next, P10B-18C remains Planned, and P10B-16P-05B remains Planned after P10B-18C.</w:t>
+        <w:t>P10B-17, accepted P10B-18A, accepted P10B-18B-01, accepted P10B-18B-06, accepted P10B-18B-02, and accepted P10B-18B-03 are Baseline. Parent P10B-18B, P10B-18 and P10B remain Partial; P10B-18B-04 is next, P10B-18C remains Planned, and P10B-16P-05B remains Planned after P10B-18C.</w:t>
       </w:r>
     </w:p>
     <w:p>
@@ -16998,7 +17268,7 @@
         <w:rPr>
           <w:rFonts w:ascii="Calibri" w:hAnsi="Calibri" w:cs="Calibri"/>
         </w:rPr>
-        <w:t>. P10B-18A, P10B-18B-01, P10B-18B-06 and P10B-18B-02 are Baseline; parent P10B-18B is Partial and P10B-18C remains Planned.</w:t>
+        <w:t>. P10B-18A, P10B-18B-01, P10B-18B-06, P10B-18B-02 and P10B-18B-03 are Baseline; parent P10B-18B is Partial and P10B-18C remains Planned.</w:t>
       </w:r>
     </w:p>
     <w:p>
@@ -17404,7 +17674,7 @@
         <w:rPr>
           <w:rFonts w:ascii="Calibri" w:hAnsi="Calibri" w:cs="Calibri"/>
         </w:rPr>
-        <w:t>. P10B-18B-01, P10B-18B-06 and P10B-18B-02 are Baseline; the remaining packages are incomplete.</w:t>
+        <w:t>. P10B-18B-01, P10B-18B-06, P10B-18B-02 and P10B-18B-03 are Baseline; P10B-18B-04/05 remain incomplete.</w:t>
       </w:r>
     </w:p>
     <w:p>
@@ -18061,13 +18331,184 @@
           <w:b/>
           <w:bCs/>
         </w:rPr>
+        <w:t>Historical handoff:</w:t>
+      </w:r>
+      <w:r>
+        <w:rPr>
+          <w:rFonts w:ascii="Calibri" w:hAnsi="Calibri" w:cs="Calibri"/>
+        </w:rPr>
+        <w:t xml:space="preserve"> P10B-18B-03 — Collection / Search / Product-card Quality Upgrade.</w:t>
+      </w:r>
+    </w:p>
+    <w:p>
+      <w:pPr>
+        <w:pStyle w:val="Heading3"/>
+        <w:keepNext/>
+        <w:widowControl/>
+      </w:pPr>
+      <w:r>
+        <w:rPr>
+          <w:rFonts w:ascii="Calibri" w:hAnsi="Calibri" w:cs="Calibri"/>
+        </w:rPr>
+        <w:t>P10B-18B-03 — Collection / Search / Product-card Quality Upgrade</w:t>
+      </w:r>
+    </w:p>
+    <w:p>
+      <w:pPr>
+        <w:pStyle w:val="Normal"/>
+        <w:numPr>
+          <w:ilvl w:val="0"/>
+          <w:numId w:val="1"/>
+        </w:numPr>
+        <w:widowControl/>
+      </w:pPr>
+      <w:r>
+        <w:rPr>
+          <w:rFonts w:ascii="Calibri" w:hAnsi="Calibri" w:cs="Calibri"/>
+          <w:b/>
+          <w:bCs/>
+        </w:rPr>
+        <w:t>Status:</w:t>
+      </w:r>
+      <w:r>
+        <w:rPr>
+          <w:rFonts w:ascii="Calibri" w:hAnsi="Calibri" w:cs="Calibri"/>
+        </w:rPr>
+        <w:t xml:space="preserve"> </w:t>
+      </w:r>
+      <w:r>
+        <w:rPr>
+          <w:rFonts w:ascii="Calibri" w:hAnsi="Calibri" w:cs="Calibri"/>
+          <w:b/>
+          <w:bCs/>
+        </w:rPr>
+        <w:t>Baseline</w:t>
+      </w:r>
+      <w:r>
+        <w:rPr>
+          <w:rFonts w:ascii="Calibri" w:hAnsi="Calibri" w:cs="Calibri"/>
+        </w:rPr>
+        <w:t>. Accepted by the product owner on 18 August 2026 for the bounded collection, search-results and canonical product-card quality authority.</w:t>
+      </w:r>
+    </w:p>
+    <w:p>
+      <w:pPr>
+        <w:pStyle w:val="Normal"/>
+        <w:numPr>
+          <w:ilvl w:val="0"/>
+          <w:numId w:val="1"/>
+        </w:numPr>
+        <w:widowControl/>
+      </w:pPr>
+      <w:r>
+        <w:rPr>
+          <w:rFonts w:ascii="Calibri" w:hAnsi="Calibri" w:cs="Calibri"/>
+          <w:b/>
+          <w:bCs/>
+        </w:rPr>
+        <w:t>Depends on:</w:t>
+      </w:r>
+      <w:r>
+        <w:rPr>
+          <w:rFonts w:ascii="Calibri" w:hAnsi="Calibri" w:cs="Calibri"/>
+        </w:rPr>
+        <w:t xml:space="preserve"> Accepted P10B-18B-02.</w:t>
+      </w:r>
+    </w:p>
+    <w:p>
+      <w:pPr>
+        <w:pStyle w:val="Normal"/>
+        <w:numPr>
+          <w:ilvl w:val="0"/>
+          <w:numId w:val="1"/>
+        </w:numPr>
+        <w:widowControl/>
+      </w:pPr>
+      <w:r>
+        <w:rPr>
+          <w:rFonts w:ascii="Calibri" w:hAnsi="Calibri" w:cs="Calibri"/>
+          <w:b/>
+          <w:bCs/>
+        </w:rPr>
+        <w:t>Delivered:</w:t>
+      </w:r>
+      <w:r>
+        <w:rPr>
+          <w:rFonts w:ascii="Calibri" w:hAnsi="Calibri" w:cs="Calibri"/>
+        </w:rPr>
+        <w:t xml:space="preserve"> Retains the four collection/search profile identities and one renderer while adding deterministic micro/small/medium/dense presentation classification; facet usefulness and profile-specific filter hierarchy; proportional orientation/grid composition; five strengthened canonical card anatomies; comparison and dense executable search presentations; and exact provider-facing transient canonical-search capability truth without changing the provider schema.</w:t>
+      </w:r>
+    </w:p>
+    <w:p>
+      <w:pPr>
+        <w:pStyle w:val="Normal"/>
+        <w:numPr>
+          <w:ilvl w:val="0"/>
+          <w:numId w:val="1"/>
+        </w:numPr>
+        <w:widowControl/>
+      </w:pPr>
+      <w:r>
+        <w:rPr>
+          <w:rFonts w:ascii="Calibri" w:hAnsi="Calibri" w:cs="Calibri"/>
+          <w:b/>
+          <w:bCs/>
+        </w:rPr>
+        <w:t>Evidence:</w:t>
+      </w:r>
+      <w:r>
+        <w:rPr>
+          <w:rFonts w:ascii="Calibri" w:hAnsi="Calibri" w:cs="Calibri"/>
+        </w:rPr>
+        <w:t xml:space="preserve"> The unchanged 72 semantic/catalogue strata produce 39 normalized topologies, 53/72 repeated-cluster memberships, largest cluster 7, collection distribution editorial 35 / dense 27 / comparison 9 / campaign 1 and search distribution dense 63 / comparison 9. Twenty-one retained captures cover all four profile purposes, five card anatomies, Premium/Modern/Minimal outcomes, 375/768/1024/1440 geometry, zero/one/multiple-result search, exact save/reload/render authority and zero external/provider/Vesko/browser generation-endpoint/ publication calls.</w:t>
+      </w:r>
+    </w:p>
+    <w:p>
+      <w:pPr>
+        <w:pStyle w:val="Normal"/>
+        <w:numPr>
+          <w:ilvl w:val="0"/>
+          <w:numId w:val="1"/>
+        </w:numPr>
+        <w:widowControl/>
+      </w:pPr>
+      <w:r>
+        <w:rPr>
+          <w:rFonts w:ascii="Calibri" w:hAnsi="Calibri" w:cs="Calibri"/>
+          <w:b/>
+          <w:bCs/>
+        </w:rPr>
+        <w:t>Boundaries:</w:t>
+      </w:r>
+      <w:r>
+        <w:rPr>
+          <w:rFonts w:ascii="Calibri" w:hAnsi="Calibri" w:cs="Calibri"/>
+        </w:rPr>
+        <w:t xml:space="preserve"> No PDP, content/support/utility redesign, new product/search/filter/card authority, commerce mutation, provider call, Vesko call, generated media or real publication. Parent P10B-18B/P10B-18/P10B remain Partial and P10B-18C designer-grade/100+ acceptance is unproved.</w:t>
+      </w:r>
+    </w:p>
+    <w:p>
+      <w:pPr>
+        <w:pStyle w:val="Normal"/>
+        <w:numPr>
+          <w:ilvl w:val="0"/>
+          <w:numId w:val="1"/>
+        </w:numPr>
+        <w:widowControl/>
+      </w:pPr>
+      <w:r>
+        <w:rPr>
+          <w:rFonts w:ascii="Calibri" w:hAnsi="Calibri" w:cs="Calibri"/>
+          <w:b/>
+          <w:bCs/>
+        </w:rPr>
         <w:t>Next:</w:t>
       </w:r>
       <w:r>
         <w:rPr>
           <w:rFonts w:ascii="Calibri" w:hAnsi="Calibri" w:cs="Calibri"/>
         </w:rPr>
-        <w:t xml:space="preserve"> P10B-18B-03 — Collection / Search / Product-card Quality Upgrade.</w:t>
+        <w:t xml:space="preserve"> P10B-18B-04 — PDP Quality Upgrade. P10B-18B-05 and P10B-18C remain Planned; P10B-16P-05B remains after P10B-18C.</w:t>
       </w:r>
     </w:p>
     <w:p>

</xml_diff>

<commit_message>
feat: upgrade bounded PDP quality
</commit_message>
<xml_diff>
--- a/docs/VESKIFY_DEVELOPMENT_DELIVERY_TRACKER_v1.3.0.docx
+++ b/docs/VESKIFY_DEVELOPMENT_DELIVERY_TRACKER_v1.3.0.docx
@@ -38,7 +38,7 @@
         <w:rPr>
           <w:rFonts w:ascii="Calibri" w:hAnsi="Calibri" w:cs="Calibri"/>
         </w:rPr>
-        <w:t>Delivery status baseline: 18 August 2026, accepted P10B-18B-03 collection/search/product-card quality upgrade</w:t>
+        <w:t>Delivery status baseline: 19 August 2026, accepted P10B-18B-04 PDP quality upgrade</w:t>
       </w:r>
     </w:p>
     <w:p>
@@ -245,7 +245,7 @@
               <w:rPr>
                 <w:rFonts w:ascii="Calibri" w:hAnsi="Calibri" w:cs="Calibri"/>
               </w:rPr>
-              <w:t>18 August 2026, accepted P10B-18B-03 collection/search/product-card quality upgrade</w:t>
+              <w:t>19 August 2026, accepted P10B-18B-04 PDP quality upgrade</w:t>
             </w:r>
           </w:p>
         </w:tc>
@@ -6890,7 +6890,7 @@
               <w:rPr>
                 <w:rFonts w:ascii="Calibri" w:hAnsi="Calibri" w:cs="Calibri"/>
               </w:rPr>
-              <w:t>☐</w:t>
+              <w:t>☑</w:t>
             </w:r>
           </w:p>
         </w:tc>
@@ -6947,7 +6947,7 @@
                 <w:b/>
                 <w:bCs/>
               </w:rPr>
-              <w:t>Planned</w:t>
+              <w:t>Baseline</w:t>
             </w:r>
           </w:p>
         </w:tc>
@@ -7001,7 +7001,7 @@
               <w:rPr>
                 <w:rFonts w:ascii="Calibri" w:hAnsi="Calibri" w:cs="Calibri"/>
               </w:rPr>
-              <w:t>Stronger PDP opening, gallery, option/purchase and related-merchandising hierarchy with protected variant/price/media and retained four-width evidence</w:t>
+              <w:t>Accepted 19 August 2026: stronger PDP opening, gallery, option/purchase and related-merchandising hierarchy with protected variant/price/media and retained four-width evidence</w:t>
             </w:r>
           </w:p>
         </w:tc>
@@ -11515,7 +11515,7 @@
         <w:rPr>
           <w:rFonts w:ascii="Calibri" w:hAnsi="Calibri" w:cs="Calibri"/>
         </w:rPr>
-        <w:t>. The remaining Done conditions are implementation gates, not claims about the current repository. The P10B-16P-01 through P10B-16P-05A plus P10B-16P-06 sequence is a mandatory convergence package between P10B-16 and P10B-17; it supplements rather than renumbers the locked P10B-01 through P10B-18 plan. P10B-16P-05B follows P10B-18C as the final consumer-verified historical cleanup. P10B-18B-04 is the next focused product task after accepted P10B-18B-03.</w:t>
+        <w:t>. The remaining Done conditions are implementation gates, not claims about the current repository. The P10B-16P-01 through P10B-16P-05A plus P10B-16P-06 sequence is a mandatory convergence package between P10B-16 and P10B-17; it supplements rather than renumbers the locked P10B-01 through P10B-18 plan. P10B-16P-05B follows P10B-18C as the final consumer-verified historical cleanup. P10B-18B-05 is the next focused product task after accepted P10B-18B-04.</w:t>
       </w:r>
     </w:p>
     <w:p>
@@ -16974,7 +16974,7 @@
         <w:rPr>
           <w:rFonts w:ascii="Calibri" w:hAnsi="Calibri" w:cs="Calibri"/>
         </w:rPr>
-        <w:t>P10B-17, accepted P10B-18A, accepted P10B-18B-01, accepted P10B-18B-06, accepted P10B-18B-02, and accepted P10B-18B-03 are Baseline. Parent P10B-18B, P10B-18 and P10B remain Partial; P10B-18B-04 is next, P10B-18C remains Planned, and P10B-16P-05B remains Planned after P10B-18C.</w:t>
+        <w:t>P10B-17, accepted P10B-18A, accepted P10B-18B-01, accepted P10B-18B-06, accepted P10B-18B-02, accepted P10B-18B-03 and accepted P10B-18B-04 are Baseline. Parent P10B-18B, P10B-18 and P10B remain Partial; P10B-18B-05 is next, P10B-18C remains Planned, and P10B-16P-05B remains Planned after P10B-18C.</w:t>
       </w:r>
     </w:p>
     <w:p>
@@ -17268,7 +17268,7 @@
         <w:rPr>
           <w:rFonts w:ascii="Calibri" w:hAnsi="Calibri" w:cs="Calibri"/>
         </w:rPr>
-        <w:t>. P10B-18A, P10B-18B-01, P10B-18B-06, P10B-18B-02 and P10B-18B-03 are Baseline; parent P10B-18B is Partial and P10B-18C remains Planned.</w:t>
+        <w:t>. P10B-18A, P10B-18B-01, P10B-18B-06, P10B-18B-02, P10B-18B-03 and P10B-18B-04 are Baseline; parent P10B-18B is Partial and P10B-18C remains Planned.</w:t>
       </w:r>
     </w:p>
     <w:p>
@@ -17674,7 +17674,7 @@
         <w:rPr>
           <w:rFonts w:ascii="Calibri" w:hAnsi="Calibri" w:cs="Calibri"/>
         </w:rPr>
-        <w:t>. P10B-18B-01, P10B-18B-06, P10B-18B-02 and P10B-18B-03 are Baseline; P10B-18B-04/05 remain incomplete.</w:t>
+        <w:t>. P10B-18B-01, P10B-18B-06, P10B-18B-02, P10B-18B-03 and P10B-18B-04 are Baseline; P10B-18B-05 remains incomplete.</w:t>
       </w:r>
     </w:p>
     <w:p>
@@ -18502,13 +18502,184 @@
           <w:b/>
           <w:bCs/>
         </w:rPr>
+        <w:t>Historical handoff:</w:t>
+      </w:r>
+      <w:r>
+        <w:rPr>
+          <w:rFonts w:ascii="Calibri" w:hAnsi="Calibri" w:cs="Calibri"/>
+        </w:rPr>
+        <w:t xml:space="preserve"> P10B-18B-04 — PDP Quality Upgrade, subsequently accepted on 19 August 2026.</w:t>
+      </w:r>
+    </w:p>
+    <w:p>
+      <w:pPr>
+        <w:pStyle w:val="Heading3"/>
+        <w:keepNext/>
+        <w:widowControl/>
+      </w:pPr>
+      <w:r>
+        <w:rPr>
+          <w:rFonts w:ascii="Calibri" w:hAnsi="Calibri" w:cs="Calibri"/>
+        </w:rPr>
+        <w:t>P10B-18B-04 — PDP Quality Upgrade</w:t>
+      </w:r>
+    </w:p>
+    <w:p>
+      <w:pPr>
+        <w:pStyle w:val="Normal"/>
+        <w:numPr>
+          <w:ilvl w:val="0"/>
+          <w:numId w:val="1"/>
+        </w:numPr>
+        <w:widowControl/>
+      </w:pPr>
+      <w:r>
+        <w:rPr>
+          <w:rFonts w:ascii="Calibri" w:hAnsi="Calibri" w:cs="Calibri"/>
+          <w:b/>
+          <w:bCs/>
+        </w:rPr>
+        <w:t>Status:</w:t>
+      </w:r>
+      <w:r>
+        <w:rPr>
+          <w:rFonts w:ascii="Calibri" w:hAnsi="Calibri" w:cs="Calibri"/>
+        </w:rPr>
+        <w:t xml:space="preserve"> </w:t>
+      </w:r>
+      <w:r>
+        <w:rPr>
+          <w:rFonts w:ascii="Calibri" w:hAnsi="Calibri" w:cs="Calibri"/>
+          <w:b/>
+          <w:bCs/>
+        </w:rPr>
+        <w:t>Baseline</w:t>
+      </w:r>
+      <w:r>
+        <w:rPr>
+          <w:rFonts w:ascii="Calibri" w:hAnsi="Calibri" w:cs="Calibri"/>
+        </w:rPr>
+        <w:t>. Accepted by the product owner on 19 August 2026 for bounded PDP quality.</w:t>
+      </w:r>
+    </w:p>
+    <w:p>
+      <w:pPr>
+        <w:pStyle w:val="Normal"/>
+        <w:numPr>
+          <w:ilvl w:val="0"/>
+          <w:numId w:val="1"/>
+        </w:numPr>
+        <w:widowControl/>
+      </w:pPr>
+      <w:r>
+        <w:rPr>
+          <w:rFonts w:ascii="Calibri" w:hAnsi="Calibri" w:cs="Calibri"/>
+          <w:b/>
+          <w:bCs/>
+        </w:rPr>
+        <w:t>Depends on:</w:t>
+      </w:r>
+      <w:r>
+        <w:rPr>
+          <w:rFonts w:ascii="Calibri" w:hAnsi="Calibri" w:cs="Calibri"/>
+        </w:rPr>
+        <w:t xml:space="preserve"> Accepted P10B-18B-03.</w:t>
+      </w:r>
+    </w:p>
+    <w:p>
+      <w:pPr>
+        <w:pStyle w:val="Normal"/>
+        <w:numPr>
+          <w:ilvl w:val="0"/>
+          <w:numId w:val="1"/>
+        </w:numPr>
+        <w:widowControl/>
+      </w:pPr>
+      <w:r>
+        <w:rPr>
+          <w:rFonts w:ascii="Calibri" w:hAnsi="Calibri" w:cs="Calibri"/>
+          <w:b/>
+          <w:bCs/>
+        </w:rPr>
+        <w:t>Delivered:</w:t>
+      </w:r>
+      <w:r>
+        <w:rPr>
+          <w:rFonts w:ascii="Calibri" w:hAnsi="Calibri" w:cs="Calibri"/>
+        </w:rPr>
+        <w:t xml:space="preserve"> Retains the four stable PDP profiles and one canonical renderer/resolver while adding exact-product configuration, media-depth and decision-support matching; bounded content-driven media stages; stronger gallery, purchase, configuration-summary and related- merchandising hierarchy; failure-disabled purchase; and profile-authorized mobile sticky action.</w:t>
+      </w:r>
+    </w:p>
+    <w:p>
+      <w:pPr>
+        <w:pStyle w:val="Normal"/>
+        <w:numPr>
+          <w:ilvl w:val="0"/>
+          <w:numId w:val="1"/>
+        </w:numPr>
+        <w:widowControl/>
+      </w:pPr>
+      <w:r>
+        <w:rPr>
+          <w:rFonts w:ascii="Calibri" w:hAnsi="Calibri" w:cs="Calibri"/>
+          <w:b/>
+          <w:bCs/>
+        </w:rPr>
+        <w:t>Evidence:</w:t>
+      </w:r>
+      <w:r>
+        <w:rPr>
+          <w:rFonts w:ascii="Calibri" w:hAnsi="Calibri" w:cs="Calibri"/>
+        </w:rPr>
+        <w:t xml:space="preserve"> Focused deterministic context and renderer matrices plus 20 retained captures at 375/768/1024/1440 cover standard simple, light configurable, complex variant-led, rich gallery- led, high consideration with and without optional approved evidence, sparse media and zero/one/three related products. The unchanged 72 strata retain 39 normalized material topologies, 53/72 repeated memberships and the prior profile/frame/DNA distributions while preserving exact canonical variants, options, prices and media.</w:t>
+      </w:r>
+    </w:p>
+    <w:p>
+      <w:pPr>
+        <w:pStyle w:val="Normal"/>
+        <w:numPr>
+          <w:ilvl w:val="0"/>
+          <w:numId w:val="1"/>
+        </w:numPr>
+        <w:widowControl/>
+      </w:pPr>
+      <w:r>
+        <w:rPr>
+          <w:rFonts w:ascii="Calibri" w:hAnsi="Calibri" w:cs="Calibri"/>
+          <w:b/>
+          <w:bCs/>
+        </w:rPr>
+        <w:t>Boundaries:</w:t>
+      </w:r>
+      <w:r>
+        <w:rPr>
+          <w:rFonts w:ascii="Calibri" w:hAnsi="Calibri" w:cs="Calibri"/>
+        </w:rPr>
+        <w:t xml:space="preserve"> No content/support/utility redesign, new commerce authority, product-type-name matching, provider call, Vesko call, generated media or real publication. This does not accept complete-store commercial visual quality or P10B-18C designer-grade/100+ quality.</w:t>
+      </w:r>
+    </w:p>
+    <w:p>
+      <w:pPr>
+        <w:pStyle w:val="Normal"/>
+        <w:numPr>
+          <w:ilvl w:val="0"/>
+          <w:numId w:val="1"/>
+        </w:numPr>
+        <w:widowControl/>
+      </w:pPr>
+      <w:r>
+        <w:rPr>
+          <w:rFonts w:ascii="Calibri" w:hAnsi="Calibri" w:cs="Calibri"/>
+          <w:b/>
+          <w:bCs/>
+        </w:rPr>
         <w:t>Next:</w:t>
       </w:r>
       <w:r>
         <w:rPr>
           <w:rFonts w:ascii="Calibri" w:hAnsi="Calibri" w:cs="Calibri"/>
         </w:rPr>
-        <w:t xml:space="preserve"> P10B-18B-04 — PDP Quality Upgrade. P10B-18B-05 and P10B-18C remain Planned; P10B-16P-05B remains after P10B-18C.</w:t>
+        <w:t xml:space="preserve"> P10B-18B-05 — Content / Support / Utilities Quality Upgrade. P10B-18C remains Planned; P10B-16P-05B remains after P10B-18C.</w:t>
       </w:r>
     </w:p>
     <w:p>

</xml_diff>

<commit_message>
feat: improve content support and utility quality
</commit_message>
<xml_diff>
--- a/docs/VESKIFY_DEVELOPMENT_DELIVERY_TRACKER_v1.3.0.docx
+++ b/docs/VESKIFY_DEVELOPMENT_DELIVERY_TRACKER_v1.3.0.docx
@@ -7025,7 +7025,7 @@
               <w:rPr>
                 <w:rFonts w:ascii="Calibri" w:hAnsi="Calibri" w:cs="Calibri"/>
               </w:rPr>
-              <w:t>☐</w:t>
+              <w:t>☑</w:t>
             </w:r>
           </w:p>
         </w:tc>
@@ -7082,7 +7082,7 @@
                 <w:b/>
                 <w:bCs/>
               </w:rPr>
-              <w:t>Planned</w:t>
+              <w:t>Baseline</w:t>
             </w:r>
           </w:p>
         </w:tc>
@@ -11443,7 +11443,7 @@
         <w:rPr>
           <w:rFonts w:ascii="Calibri" w:hAnsi="Calibri" w:cs="Calibri"/>
         </w:rPr>
-        <w:t xml:space="preserve">. P10B-01 through P10B-17, P10B-16P-01 through P10B-16P-05A, P10B-16P-06, accepted P10B-18A, accepted P10B-18B-01, accepted P10B-18B-06, accepted P10B-18B-02 and accepted P10B-18B-03 are </w:t>
+        <w:t xml:space="preserve">. P10B-01 through P10B-17, P10B-16P-01 through P10B-16P-05A, P10B-16P-06, accepted P10B-18A and accepted P10B-18B-01, P10B-18B-06, P10B-18B-02, P10B-18B-03, P10B-18B-04 and P10B-18B-05 are </w:t>
       </w:r>
       <w:r>
         <w:rPr>
@@ -11471,7 +11471,21 @@
         <w:rPr>
           <w:rFonts w:ascii="Calibri" w:hAnsi="Calibri" w:cs="Calibri"/>
         </w:rPr>
-        <w:t xml:space="preserve">. Parent P10B-18B, P10B-18, and P10B remain </w:t>
+        <w:t xml:space="preserve">. Parent P10B-18B is </w:t>
+      </w:r>
+      <w:r>
+        <w:rPr>
+          <w:rFonts w:ascii="Calibri" w:hAnsi="Calibri" w:cs="Calibri"/>
+          <w:b/>
+          <w:bCs/>
+        </w:rPr>
+        <w:t>Baseline</w:t>
+      </w:r>
+      <w:r>
+        <w:rPr>
+          <w:rFonts w:ascii="Calibri" w:hAnsi="Calibri" w:cs="Calibri"/>
+        </w:rPr>
+        <w:t xml:space="preserve"> / complete; P10B-18 and P10B remain </w:t>
       </w:r>
       <w:r>
         <w:rPr>
@@ -11515,7 +11529,7 @@
         <w:rPr>
           <w:rFonts w:ascii="Calibri" w:hAnsi="Calibri" w:cs="Calibri"/>
         </w:rPr>
-        <w:t>. The remaining Done conditions are implementation gates, not claims about the current repository. The P10B-16P-01 through P10B-16P-05A plus P10B-16P-06 sequence is a mandatory convergence package between P10B-16 and P10B-17; it supplements rather than renumbers the locked P10B-01 through P10B-18 plan. P10B-16P-05B follows P10B-18C as the final consumer-verified historical cleanup. P10B-18B-05 is the next focused product task after accepted P10B-18B-04.</w:t>
+        <w:t>. The remaining Done conditions are implementation gates, not claims about the current repository. The P10B-16P-01 through P10B-16P-05A plus P10B-16P-06 sequence is a mandatory convergence package between P10B-16 and P10B-17; it supplements rather than renumbers the locked P10B-01 through P10B-18 plan. P10B-16P-05B follows P10B-18C as the final consumer-verified historical cleanup. P10B-18C is the exact next product task after accepted and completed P10B-18B.</w:t>
       </w:r>
     </w:p>
     <w:p>
@@ -16974,7 +16988,7 @@
         <w:rPr>
           <w:rFonts w:ascii="Calibri" w:hAnsi="Calibri" w:cs="Calibri"/>
         </w:rPr>
-        <w:t>P10B-17, accepted P10B-18A, accepted P10B-18B-01, accepted P10B-18B-06, accepted P10B-18B-02, accepted P10B-18B-03 and accepted P10B-18B-04 are Baseline. Parent P10B-18B, P10B-18 and P10B remain Partial; P10B-18B-05 is next, P10B-18C remains Planned, and P10B-16P-05B remains Planned after P10B-18C.</w:t>
+        <w:t>P10B-17, accepted P10B-18A and accepted P10B-18B-01, P10B-18B-06, P10B-18B-02, P10B-18B-03, P10B-18B-04 and P10B-18B-05 are Baseline. Parent P10B-18B is Baseline/complete; P10B-18 and P10B remain Partial. P10B-18C is the exact next task, and P10B-16P-05B remains Planned after P10B-18C.</w:t>
       </w:r>
     </w:p>
     <w:p>
@@ -17668,13 +17682,13 @@
           <w:b/>
           <w:bCs/>
         </w:rPr>
-        <w:t>Partial</w:t>
-      </w:r>
-      <w:r>
-        <w:rPr>
-          <w:rFonts w:ascii="Calibri" w:hAnsi="Calibri" w:cs="Calibri"/>
-        </w:rPr>
-        <w:t>. P10B-18B-01, P10B-18B-06, P10B-18B-02, P10B-18B-03 and P10B-18B-04 are Baseline; P10B-18B-05 remains incomplete.</w:t>
+        <w:t>Baseline</w:t>
+      </w:r>
+      <w:r>
+        <w:rPr>
+          <w:rFonts w:ascii="Calibri" w:hAnsi="Calibri" w:cs="Calibri"/>
+        </w:rPr>
+        <w:t xml:space="preserve"> / complete. P10B-18B-01, P10B-18B-06, P10B-18B-02, P10B-18B-03, P10B-18B-04 and P10B-18B-05 are Baseline.</w:t>
       </w:r>
     </w:p>
     <w:p>
@@ -18673,13 +18687,13 @@
           <w:b/>
           <w:bCs/>
         </w:rPr>
-        <w:t>Next:</w:t>
-      </w:r>
-      <w:r>
-        <w:rPr>
-          <w:rFonts w:ascii="Calibri" w:hAnsi="Calibri" w:cs="Calibri"/>
-        </w:rPr>
-        <w:t xml:space="preserve"> P10B-18B-05 — Content / Support / Utilities Quality Upgrade. P10B-18C remains Planned; P10B-16P-05B remains after P10B-18C.</w:t>
+        <w:t>Historical handoff:</w:t>
+      </w:r>
+      <w:r>
+        <w:rPr>
+          <w:rFonts w:ascii="Calibri" w:hAnsi="Calibri" w:cs="Calibri"/>
+        </w:rPr>
+        <w:t xml:space="preserve"> P10B-18B-05 — Content / Support / Utilities Quality Upgrade, subsequently accepted on 20 August 2026. P10B-18C is now the exact next task; P10B-16P-05B remains after it.</w:t>
       </w:r>
     </w:p>
     <w:p>
@@ -22726,6 +22740,87 @@
           <w:rFonts w:ascii="Calibri" w:hAnsi="Calibri" w:cs="Calibri"/>
         </w:rPr>
         <w:t xml:space="preserve"> New design, editor, advanced-media, or commerce scope.</w:t>
+      </w:r>
+    </w:p>
+    <w:p>
+      <w:pPr>
+        <w:pStyle w:val="Heading2"/>
+        <w:keepNext/>
+        <w:widowControl/>
+      </w:pPr>
+      <w:r>
+        <w:rPr>
+          <w:rFonts w:ascii="Calibri" w:hAnsi="Calibri" w:cs="Calibri"/>
+        </w:rPr>
+        <w:t>P10B-18B-05 accepted Baseline (20 August 2026)</w:t>
+      </w:r>
+    </w:p>
+    <w:p>
+      <w:pPr>
+        <w:pStyle w:val="Normal"/>
+        <w:widowControl/>
+      </w:pPr>
+      <w:r>
+        <w:rPr>
+          <w:rFonts w:ascii="Calibri" w:hAnsi="Calibri" w:cs="Calibri"/>
+        </w:rPr>
+        <w:t xml:space="preserve">The accepted package preserves one </w:t>
+      </w:r>
+      <w:r>
+        <w:rPr>
+          <w:rFonts w:ascii="Consolas" w:hAnsi="Consolas" w:cs="Consolas"/>
+          <w:sz w:val="19"/>
+          <w:szCs w:val="19"/>
+        </w:rPr>
+        <w:t>StorefrontSnapshot</w:t>
+      </w:r>
+      <w:r>
+        <w:rPr>
+          <w:rFonts w:ascii="Calibri" w:hAnsi="Calibri" w:cs="Calibri"/>
+        </w:rPr>
+        <w:t xml:space="preserve">, one </w:t>
+      </w:r>
+      <w:r>
+        <w:rPr>
+          <w:rFonts w:ascii="Consolas" w:hAnsi="Consolas" w:cs="Consolas"/>
+          <w:sz w:val="19"/>
+          <w:szCs w:val="19"/>
+        </w:rPr>
+        <w:t>PageBlueprint</w:t>
+      </w:r>
+      <w:r>
+        <w:rPr>
+          <w:rFonts w:ascii="Calibri" w:hAnsi="Calibri" w:cs="Calibri"/>
+        </w:rPr>
+        <w:t xml:space="preserve">, one fact/asset/navigation authority, the existing </w:t>
+      </w:r>
+      <w:r>
+        <w:rPr>
+          <w:rFonts w:ascii="Consolas" w:hAnsi="Consolas" w:cs="Consolas"/>
+          <w:sz w:val="19"/>
+          <w:szCs w:val="19"/>
+        </w:rPr>
+        <w:t>contentSupport</w:t>
+      </w:r>
+      <w:r>
+        <w:rPr>
+          <w:rFonts w:ascii="Calibri" w:hAnsi="Calibri" w:cs="Calibri"/>
+        </w:rPr>
+        <w:t xml:space="preserve"> and </w:t>
+      </w:r>
+      <w:r>
+        <w:rPr>
+          <w:rFonts w:ascii="Consolas" w:hAnsi="Consolas" w:cs="Consolas"/>
+          <w:sz w:val="19"/>
+          <w:szCs w:val="19"/>
+        </w:rPr>
+        <w:t>commerceUtility</w:t>
+      </w:r>
+      <w:r>
+        <w:rPr>
+          <w:rFonts w:ascii="Calibri" w:hAnsi="Calibri" w:cs="Calibri"/>
+        </w:rPr>
+        <w:t xml:space="preserve"> families and transient utility runtime projection. Focused evidence is 31/31 final unit tests, 78/78 retained P10B-12/13 browser tests, 70/70 focused authority/lifecycle tests, 2/2 dedicated matrix tests with 30 captures, and the unchanged 72/72 frozen compilation strata. The product owner accepted the exact checkpoint on 20 August 2026. P10B-18B-05 and the completed P10B-18B parent are Baseline; P10B-18/P10B remain Partial and P10B-18C is the exact next task. The mandated complete one-worker Vitest ran exactly once: 2,925 tests passed, three retained assertions failed and one live-gated test was skipped. The three findings were corrected through focused authority/test updates, all affected focused reruns are green, and the final retained browser/lifecycle/compiler regressions are green. PR review, CI and merge remain.</w:t>
       </w:r>
     </w:p>
     <w:sectPr>

</xml_diff>

<commit_message>
feat: complete P10B-18C commercial quality gate
</commit_message>
<xml_diff>
--- a/docs/VESKIFY_DEVELOPMENT_DELIVERY_TRACKER_v1.3.0.docx
+++ b/docs/VESKIFY_DEVELOPMENT_DELIVERY_TRACKER_v1.3.0.docx
@@ -6215,7 +6215,7 @@
               <w:rPr>
                 <w:rFonts w:ascii="Calibri" w:hAnsi="Calibri" w:cs="Calibri"/>
               </w:rPr>
-              <w:t>☐</w:t>
+              <w:t>☑</w:t>
             </w:r>
           </w:p>
         </w:tc>
@@ -6272,7 +6272,7 @@
                 <w:b/>
                 <w:bCs/>
               </w:rPr>
-              <w:t>Partial</w:t>
+              <w:t>Baseline</w:t>
             </w:r>
           </w:p>
         </w:tc>
@@ -6326,7 +6326,7 @@
               <w:rPr>
                 <w:rFonts w:ascii="Calibri" w:hAnsi="Calibri" w:cs="Calibri"/>
               </w:rPr>
-              <w:t>Six coherent packages with focused and integrated browser/human evidence against the frozen audit baseline</w:t>
+              <w:t>Six accepted packages with focused and integrated browser/human evidence against the frozen audit baseline</w:t>
             </w:r>
           </w:p>
         </w:tc>
@@ -7160,7 +7160,7 @@
               <w:rPr>
                 <w:rFonts w:ascii="Calibri" w:hAnsi="Calibri" w:cs="Calibri"/>
               </w:rPr>
-              <w:t>☐</w:t>
+              <w:t>☑</w:t>
             </w:r>
           </w:p>
         </w:tc>
@@ -7217,7 +7217,7 @@
                 <w:b/>
                 <w:bCs/>
               </w:rPr>
-              <w:t>Planned</w:t>
+              <w:t>Baseline</w:t>
             </w:r>
           </w:p>
         </w:tc>
@@ -7271,7 +7271,7 @@
               <w:rPr>
                 <w:rFonts w:ascii="Calibri" w:hAnsi="Calibri" w:cs="Calibri"/>
               </w:rPr>
-              <w:t>100+ complete configurations, protected-state/diversity gates and fingerprint-stratified four-width retained human review</w:t>
+              <w:t>126/126 complete/replay, protected-state/diversity/causality gates, 28 stores and final 280-entry four-width EN/FI review</w:t>
             </w:r>
           </w:p>
         </w:tc>
@@ -7313,7 +7313,7 @@
               <w:rPr>
                 <w:rFonts w:ascii="Calibri" w:hAnsi="Calibri" w:cs="Calibri"/>
               </w:rPr>
-              <w:t>P10B-16P-05B</w:t>
+              <w:t>P10B-18D</w:t>
             </w:r>
           </w:p>
         </w:tc>
@@ -7331,7 +7331,7 @@
               <w:rPr>
                 <w:rFonts w:ascii="Calibri" w:hAnsi="Calibri" w:cs="Calibri"/>
               </w:rPr>
-              <w:t>Final historical acceptance cleanup</w:t>
+              <w:t>Live AI commercial storefront acceptance</w:t>
             </w:r>
           </w:p>
         </w:tc>
@@ -7370,6 +7370,141 @@
               <w:rPr>
                 <w:rFonts w:ascii="Calibri" w:hAnsi="Calibri" w:cs="Calibri"/>
               </w:rPr>
+              <w:t>Product owner, provider, generation, QA</w:t>
+            </w:r>
+          </w:p>
+        </w:tc>
+        <w:tc>
+          <w:tcPr>
+            <w:tcW w:w="2500" w:type="dxa"/>
+            <w:vAlign w:val="center"/>
+          </w:tcPr>
+          <w:p>
+            <w:pPr>
+              <w:pStyle w:val="CompactTableText"/>
+              <w:widowControl/>
+            </w:pPr>
+            <w:r>
+              <w:rPr>
+                <w:rFonts w:ascii="Calibri" w:hAnsi="Calibri" w:cs="Calibri"/>
+              </w:rPr>
+              <w:t>Accepted P10B-18C</w:t>
+            </w:r>
+          </w:p>
+        </w:tc>
+        <w:tc>
+          <w:tcPr>
+            <w:tcW w:w="2890" w:type="dxa"/>
+            <w:vAlign w:val="center"/>
+          </w:tcPr>
+          <w:p>
+            <w:pPr>
+              <w:pStyle w:val="CompactTableText"/>
+              <w:widowControl/>
+            </w:pPr>
+            <w:r>
+              <w:rPr>
+                <w:rFonts w:ascii="Calibri" w:hAnsi="Calibri" w:cs="Calibri"/>
+              </w:rPr>
+              <w:t>Fresh bounded live-provider complete-store evidence, exact lineage, protected truth, lifecycle and retained human acceptance</w:t>
+            </w:r>
+          </w:p>
+        </w:tc>
+      </w:tr>
+      <w:tr>
+        <w:trPr>
+          <w:cantSplit/>
+        </w:trPr>
+        <w:tc>
+          <w:tcPr>
+            <w:tcW w:w="720" w:type="dxa"/>
+            <w:vAlign w:val="center"/>
+          </w:tcPr>
+          <w:p>
+            <w:pPr>
+              <w:pStyle w:val="CompactTableText"/>
+              <w:jc w:val="center"/>
+              <w:widowControl/>
+            </w:pPr>
+            <w:r>
+              <w:rPr>
+                <w:rFonts w:ascii="Calibri" w:hAnsi="Calibri" w:cs="Calibri"/>
+              </w:rPr>
+              <w:t>☐</w:t>
+            </w:r>
+          </w:p>
+        </w:tc>
+        <w:tc>
+          <w:tcPr>
+            <w:tcW w:w="1700" w:type="dxa"/>
+            <w:vAlign w:val="center"/>
+          </w:tcPr>
+          <w:p>
+            <w:pPr>
+              <w:pStyle w:val="CompactTableText"/>
+              <w:widowControl/>
+            </w:pPr>
+            <w:r>
+              <w:rPr>
+                <w:rFonts w:ascii="Calibri" w:hAnsi="Calibri" w:cs="Calibri"/>
+              </w:rPr>
+              <w:t>P10B-16P-05B</w:t>
+            </w:r>
+          </w:p>
+        </w:tc>
+        <w:tc>
+          <w:tcPr>
+            <w:tcW w:w="2800" w:type="dxa"/>
+            <w:vAlign w:val="center"/>
+          </w:tcPr>
+          <w:p>
+            <w:pPr>
+              <w:pStyle w:val="CompactTableText"/>
+              <w:widowControl/>
+            </w:pPr>
+            <w:r>
+              <w:rPr>
+                <w:rFonts w:ascii="Calibri" w:hAnsi="Calibri" w:cs="Calibri"/>
+              </w:rPr>
+              <w:t>Final historical acceptance cleanup</w:t>
+            </w:r>
+          </w:p>
+        </w:tc>
+        <w:tc>
+          <w:tcPr>
+            <w:tcW w:w="850" w:type="dxa"/>
+            <w:vAlign w:val="center"/>
+          </w:tcPr>
+          <w:p>
+            <w:pPr>
+              <w:pStyle w:val="CompactTableText"/>
+              <w:jc w:val="center"/>
+              <w:widowControl/>
+            </w:pPr>
+            <w:r>
+              <w:rPr>
+                <w:rFonts w:ascii="Calibri" w:hAnsi="Calibri" w:cs="Calibri"/>
+                <w:b/>
+                <w:bCs/>
+              </w:rPr>
+              <w:t>Blocked</w:t>
+            </w:r>
+          </w:p>
+        </w:tc>
+        <w:tc>
+          <w:tcPr>
+            <w:tcW w:w="1500" w:type="dxa"/>
+            <w:vAlign w:val="center"/>
+          </w:tcPr>
+          <w:p>
+            <w:pPr>
+              <w:pStyle w:val="CompactTableText"/>
+              <w:widowControl/>
+            </w:pPr>
+            <w:r>
+              <w:rPr>
+                <w:rFonts w:ascii="Calibri" w:hAnsi="Calibri" w:cs="Calibri"/>
+              </w:rPr>
               <w:t>Generation architecture/evidence</w:t>
             </w:r>
           </w:p>
@@ -7388,7 +7523,7 @@
               <w:rPr>
                 <w:rFonts w:ascii="Calibri" w:hAnsi="Calibri" w:cs="Calibri"/>
               </w:rPr>
-              <w:t>P10B-16P-05A and P10B-18C</w:t>
+              <w:t>P10B-16P-05A and P10B-18D</w:t>
             </w:r>
           </w:p>
         </w:tc>
@@ -7406,7 +7541,7 @@
               <w:rPr>
                 <w:rFonts w:ascii="Calibri" w:hAnsi="Calibri" w:cs="Calibri"/>
               </w:rPr>
-              <w:t>Consumer-proven removal/archival of remaining historical scaffolding with migration and evidence retention</w:t>
+              <w:t>Consumer-proven removal/archival only after accepted live-AI evidence no longer needs historical scaffolding</w:t>
             </w:r>
           </w:p>
         </w:tc>
@@ -11457,7 +11592,7 @@
         <w:rPr>
           <w:rFonts w:ascii="Calibri" w:hAnsi="Calibri" w:cs="Calibri"/>
         </w:rPr>
-        <w:t xml:space="preserve">. P10B-16P-02 is </w:t>
+        <w:t xml:space="preserve">. P10B-16P-02, parent P10B-18B and P10B-18C are </w:t>
       </w:r>
       <w:r>
         <w:rPr>
@@ -11471,21 +11606,7 @@
         <w:rPr>
           <w:rFonts w:ascii="Calibri" w:hAnsi="Calibri" w:cs="Calibri"/>
         </w:rPr>
-        <w:t xml:space="preserve">. Parent P10B-18B is </w:t>
-      </w:r>
-      <w:r>
-        <w:rPr>
-          <w:rFonts w:ascii="Calibri" w:hAnsi="Calibri" w:cs="Calibri"/>
-          <w:b/>
-          <w:bCs/>
-        </w:rPr>
-        <w:t>Baseline</w:t>
-      </w:r>
-      <w:r>
-        <w:rPr>
-          <w:rFonts w:ascii="Calibri" w:hAnsi="Calibri" w:cs="Calibri"/>
-        </w:rPr>
-        <w:t xml:space="preserve"> / complete; P10B-18 and P10B remain </w:t>
+        <w:t xml:space="preserve">; P10B-18 and P10B remain </w:t>
       </w:r>
       <w:r>
         <w:rPr>
@@ -11499,7 +11620,7 @@
         <w:rPr>
           <w:rFonts w:ascii="Calibri" w:hAnsi="Calibri" w:cs="Calibri"/>
         </w:rPr>
-        <w:t xml:space="preserve">; P10B-18C remains </w:t>
+        <w:t xml:space="preserve">; P10B-18D remains </w:t>
       </w:r>
       <w:r>
         <w:rPr>
@@ -11529,7 +11650,7 @@
         <w:rPr>
           <w:rFonts w:ascii="Calibri" w:hAnsi="Calibri" w:cs="Calibri"/>
         </w:rPr>
-        <w:t>. The remaining Done conditions are implementation gates, not claims about the current repository. The P10B-16P-01 through P10B-16P-05A plus P10B-16P-06 sequence is a mandatory convergence package between P10B-16 and P10B-17; it supplements rather than renumbers the locked P10B-01 through P10B-18 plan. P10B-16P-05B follows P10B-18C as the final consumer-verified historical cleanup. P10B-18C is the exact next product task after accepted and completed P10B-18B.</w:t>
+        <w:t>. The remaining Done conditions are implementation gates, not claims about the current repository. The P10B-16P-01 through P10B-16P-05A plus P10B-16P-06 sequence is a mandatory convergence package between P10B-16 and P10B-17; it supplements rather than renumbers the locked P10B-01 through P10B-18 plan. P10B-18D is the exact next product task. P10B-16P-05B remains blocked until its fresh live-AI acceptance proves historical evidence consumers can be removed safely.</w:t>
       </w:r>
     </w:p>
     <w:p>
@@ -16898,13 +17019,13 @@
           <w:b/>
           <w:bCs/>
         </w:rPr>
-        <w:t>Planned</w:t>
-      </w:r>
-      <w:r>
-        <w:rPr>
-          <w:rFonts w:ascii="Calibri" w:hAnsi="Calibri" w:cs="Calibri"/>
-        </w:rPr>
-        <w:t xml:space="preserve"> after P10B-18C.</w:t>
+        <w:t>Blocked</w:t>
+      </w:r>
+      <w:r>
+        <w:rPr>
+          <w:rFonts w:ascii="Calibri" w:hAnsi="Calibri" w:cs="Calibri"/>
+        </w:rPr>
+        <w:t xml:space="preserve"> until accepted P10B-18D.</w:t>
       </w:r>
     </w:p>
     <w:p>
@@ -16928,7 +17049,7 @@
         <w:rPr>
           <w:rFonts w:ascii="Calibri" w:hAnsi="Calibri" w:cs="Calibri"/>
         </w:rPr>
-        <w:t xml:space="preserve"> P10B-16P-05A and P10B-18C.</w:t>
+        <w:t xml:space="preserve"> P10B-16P-05A and P10B-18D.</w:t>
       </w:r>
     </w:p>
     <w:p>
@@ -16988,7 +17109,7 @@
         <w:rPr>
           <w:rFonts w:ascii="Calibri" w:hAnsi="Calibri" w:cs="Calibri"/>
         </w:rPr>
-        <w:t>P10B-17, accepted P10B-18A and accepted P10B-18B-01, P10B-18B-06, P10B-18B-02, P10B-18B-03, P10B-18B-04 and P10B-18B-05 are Baseline. Parent P10B-18B is Baseline/complete; P10B-18 and P10B remain Partial. P10B-18C is the exact next task, and P10B-16P-05B remains Planned after P10B-18C.</w:t>
+        <w:t>P10B-17, accepted P10B-18A and accepted P10B-18B-01, P10B-18B-06, P10B-18B-02, P10B-18B-03, P10B-18B-04, P10B-18B-05 and P10B-18C are Baseline. Parent P10B-18B is Baseline/complete; P10B-18 and P10B remain Partial. P10B-18D is the exact next task, and P10B-16P-05B remains blocked behind it.</w:t>
       </w:r>
     </w:p>
     <w:p>
@@ -18762,6 +18883,177 @@
           <w:b/>
           <w:bCs/>
         </w:rPr>
+        <w:t>Baseline</w:t>
+      </w:r>
+      <w:r>
+        <w:rPr>
+          <w:rFonts w:ascii="Calibri" w:hAnsi="Calibri" w:cs="Calibri"/>
+        </w:rPr>
+        <w:t>. Accepted on 22 August 2026.</w:t>
+      </w:r>
+    </w:p>
+    <w:p>
+      <w:pPr>
+        <w:pStyle w:val="Normal"/>
+        <w:numPr>
+          <w:ilvl w:val="0"/>
+          <w:numId w:val="1"/>
+        </w:numPr>
+        <w:widowControl/>
+      </w:pPr>
+      <w:r>
+        <w:rPr>
+          <w:rFonts w:ascii="Calibri" w:hAnsi="Calibri" w:cs="Calibri"/>
+          <w:b/>
+          <w:bCs/>
+        </w:rPr>
+        <w:t>Depends on:</w:t>
+      </w:r>
+      <w:r>
+        <w:rPr>
+          <w:rFonts w:ascii="Calibri" w:hAnsi="Calibri" w:cs="Calibri"/>
+        </w:rPr>
+        <w:t xml:space="preserve"> Accepted and integrated P10B-18B packages.</w:t>
+      </w:r>
+    </w:p>
+    <w:p>
+      <w:pPr>
+        <w:pStyle w:val="Normal"/>
+        <w:numPr>
+          <w:ilvl w:val="0"/>
+          <w:numId w:val="1"/>
+        </w:numPr>
+        <w:widowControl/>
+      </w:pPr>
+      <w:r>
+        <w:rPr>
+          <w:rFonts w:ascii="Calibri" w:hAnsi="Calibri" w:cs="Calibri"/>
+          <w:b/>
+          <w:bCs/>
+        </w:rPr>
+        <w:t>Done:</w:t>
+      </w:r>
+      <w:r>
+        <w:rPr>
+          <w:rFonts w:ascii="Calibri" w:hAnsi="Calibri" w:cs="Calibri"/>
+        </w:rPr>
+        <w:t xml:space="preserve"> 126/126 exact complete-store compiles and deterministic replays, zero protected-state mutation or fabrication, 54 normalized topologies, explicit duplicate/causality accounting, a deterministic 28-store selector and final hash-bound 280-entry EN/FI four-width review with zero primary visual FAIL.</w:t>
+      </w:r>
+    </w:p>
+    <w:p>
+      <w:pPr>
+        <w:pStyle w:val="Normal"/>
+        <w:numPr>
+          <w:ilvl w:val="0"/>
+          <w:numId w:val="1"/>
+        </w:numPr>
+        <w:widowControl/>
+      </w:pPr>
+      <w:r>
+        <w:rPr>
+          <w:rFonts w:ascii="Calibri" w:hAnsi="Calibri" w:cs="Calibri"/>
+          <w:b/>
+          <w:bCs/>
+        </w:rPr>
+        <w:t>Required evidence:</w:t>
+      </w:r>
+      <w:r>
+        <w:rPr>
+          <w:rFonts w:ascii="Calibri" w:hAnsi="Calibri" w:cs="Calibri"/>
+        </w:rPr>
+        <w:t xml:space="preserve"> Retained Stage A reports, complete browser manifest, request/runtime and geometry/accessibility ledgers, final human review, lifecycle/publication regressions and unchanged protected commerce/media.</w:t>
+      </w:r>
+    </w:p>
+    <w:p>
+      <w:pPr>
+        <w:pStyle w:val="Normal"/>
+        <w:numPr>
+          <w:ilvl w:val="0"/>
+          <w:numId w:val="1"/>
+        </w:numPr>
+        <w:widowControl/>
+      </w:pPr>
+      <w:r>
+        <w:rPr>
+          <w:rFonts w:ascii="Calibri" w:hAnsi="Calibri" w:cs="Calibri"/>
+          <w:b/>
+          <w:bCs/>
+        </w:rPr>
+        <w:t>Non-goal:</w:t>
+      </w:r>
+      <w:r>
+        <w:rPr>
+          <w:rFonts w:ascii="Calibri" w:hAnsi="Calibri" w:cs="Calibri"/>
+        </w:rPr>
+        <w:t xml:space="preserve"> Treating P10B-18A evidence, registry counts, configuration count, automated checks, or one polished store as final commercial acceptance.</w:t>
+      </w:r>
+    </w:p>
+    <w:p>
+      <w:pPr>
+        <w:pStyle w:val="Heading3"/>
+        <w:keepNext/>
+        <w:widowControl/>
+      </w:pPr>
+      <w:r>
+        <w:rPr>
+          <w:rFonts w:ascii="Calibri" w:hAnsi="Calibri" w:cs="Calibri"/>
+        </w:rPr>
+        <w:t>P10B-18D — Live AI commercial storefront acceptance</w:t>
+      </w:r>
+    </w:p>
+    <w:p>
+      <w:pPr>
+        <w:pStyle w:val="Normal"/>
+        <w:numPr>
+          <w:ilvl w:val="0"/>
+          <w:numId w:val="1"/>
+        </w:numPr>
+        <w:widowControl/>
+      </w:pPr>
+      <w:r>
+        <w:rPr>
+          <w:rFonts w:ascii="Calibri" w:hAnsi="Calibri" w:cs="Calibri"/>
+          <w:b/>
+          <w:bCs/>
+        </w:rPr>
+        <w:t>Outcome:</w:t>
+      </w:r>
+      <w:r>
+        <w:rPr>
+          <w:rFonts w:ascii="Calibri" w:hAnsi="Calibri" w:cs="Calibri"/>
+        </w:rPr>
+        <w:t xml:space="preserve"> Prove freshly authorized live-AI generation against the final integrated post-18B authority without weakening deterministic compiler/materializer or protected-state boundaries.</w:t>
+      </w:r>
+    </w:p>
+    <w:p>
+      <w:pPr>
+        <w:pStyle w:val="Normal"/>
+        <w:numPr>
+          <w:ilvl w:val="0"/>
+          <w:numId w:val="1"/>
+        </w:numPr>
+        <w:widowControl/>
+      </w:pPr>
+      <w:r>
+        <w:rPr>
+          <w:rFonts w:ascii="Calibri" w:hAnsi="Calibri" w:cs="Calibri"/>
+          <w:b/>
+          <w:bCs/>
+        </w:rPr>
+        <w:t>Status:</w:t>
+      </w:r>
+      <w:r>
+        <w:rPr>
+          <w:rFonts w:ascii="Calibri" w:hAnsi="Calibri" w:cs="Calibri"/>
+        </w:rPr>
+        <w:t xml:space="preserve"> </w:t>
+      </w:r>
+      <w:r>
+        <w:rPr>
+          <w:rFonts w:ascii="Calibri" w:hAnsi="Calibri" w:cs="Calibri"/>
+          <w:b/>
+          <w:bCs/>
+        </w:rPr>
         <w:t>Planned</w:t>
       </w:r>
       <w:r>
@@ -18792,7 +19084,7 @@
         <w:rPr>
           <w:rFonts w:ascii="Calibri" w:hAnsi="Calibri" w:cs="Calibri"/>
         </w:rPr>
-        <w:t xml:space="preserve"> Accepted and integrated P10B-18B packages.</w:t>
+        <w:t xml:space="preserve"> Accepted P10B-18C.</w:t>
       </w:r>
     </w:p>
     <w:p>
@@ -18816,31 +19108,7 @@
         <w:rPr>
           <w:rFonts w:ascii="Calibri" w:hAnsi="Calibri" w:cs="Calibri"/>
         </w:rPr>
-        <w:t xml:space="preserve"> At least 100 complete bounded configurations pass snapshot validity, protected- state parity, exact/near-duplicate and structural-distribution gates, and a fingerprint- stratified representative subset passes retained four-width human commercial review.</w:t>
-      </w:r>
-    </w:p>
-    <w:p>
-      <w:pPr>
-        <w:pStyle w:val="Normal"/>
-        <w:numPr>
-          <w:ilvl w:val="0"/>
-          <w:numId w:val="1"/>
-        </w:numPr>
-        <w:widowControl/>
-      </w:pPr>
-      <w:r>
-        <w:rPr>
-          <w:rFonts w:ascii="Calibri" w:hAnsi="Calibri" w:cs="Calibri"/>
-          <w:b/>
-          <w:bCs/>
-        </w:rPr>
-        <w:t>Required evidence:</w:t>
-      </w:r>
-      <w:r>
-        <w:rPr>
-          <w:rFonts w:ascii="Calibri" w:hAnsi="Calibri" w:cs="Calibri"/>
-        </w:rPr>
-        <w:t xml:space="preserve"> Reproducible scale ledger, exact authority/fingerprints, complete-surface captures, explicit product-owner acceptance and unchanged protected commerce/media.</w:t>
+        <w:t xml:space="preserve"> Bounded live-provider complete-store proposals preserve exact lineage, protected commerce/media, lifecycle and commercial human acceptance.</w:t>
       </w:r>
     </w:p>
     <w:p>
@@ -18864,7 +19132,7 @@
         <w:rPr>
           <w:rFonts w:ascii="Calibri" w:hAnsi="Calibri" w:cs="Calibri"/>
         </w:rPr>
-        <w:t xml:space="preserve"> Treating P10B-18A evidence, registry counts, configuration count, automated checks, or one polished store as final commercial acceptance.</w:t>
+        <w:t xml:space="preserve"> Vesko calls, real publication, production-readiness claims or a second provider/ compiler/materializer authority.</w:t>
       </w:r>
     </w:p>
     <w:p>
@@ -22821,6 +23089,45 @@
           <w:rFonts w:ascii="Calibri" w:hAnsi="Calibri" w:cs="Calibri"/>
         </w:rPr>
         <w:t xml:space="preserve"> families and transient utility runtime projection. Focused evidence is 31/31 final unit tests, 78/78 retained P10B-12/13 browser tests, 70/70 focused authority/lifecycle tests, 2/2 dedicated matrix tests with 30 captures, and the unchanged 72/72 frozen compilation strata. The product owner accepted the exact checkpoint on 20 August 2026. P10B-18B-05 and the completed P10B-18B parent are Baseline; P10B-18/P10B remain Partial and P10B-18C is the exact next task. The mandated complete one-worker Vitest ran exactly once: 2,925 tests passed, three retained assertions failed and one live-gated test was skipped. The three findings were corrected through focused authority/test updates, all affected focused reruns are green, and the final retained browser/lifecycle/compiler regressions are green. PR review, CI and merge remain.</w:t>
+      </w:r>
+    </w:p>
+    <w:p>
+      <w:pPr>
+        <w:pStyle w:val="Heading2"/>
+        <w:keepNext/>
+        <w:widowControl/>
+      </w:pPr>
+      <w:r>
+        <w:rPr>
+          <w:rFonts w:ascii="Calibri" w:hAnsi="Calibri" w:cs="Calibri"/>
+        </w:rPr>
+        <w:t>P10B-18C accepted Baseline (22 August 2026)</w:t>
+      </w:r>
+    </w:p>
+    <w:p>
+      <w:pPr>
+        <w:pStyle w:val="Normal"/>
+        <w:widowControl/>
+      </w:pPr>
+      <w:r>
+        <w:rPr>
+          <w:rFonts w:ascii="Calibri" w:hAnsi="Calibri" w:cs="Calibri"/>
+        </w:rPr>
+        <w:t xml:space="preserve">The accepted deterministic gate uses nine catalogue/evidence shapes by fourteen semantic strata. All 126 cases compile and replay, the frozen 72 remains 39 topologies / 53 repeated memberships / largest seven / 19 singletons, protected commerce/media and external activity are zero, and the expanded matrix contains 54 normalized topologies. The deterministic selector retains 28 stores and the final complete manifest binds 280 captures across 375/768/1024/1440 and EN/FI. The final human verdict is </w:t>
+      </w:r>
+      <w:r>
+        <w:rPr>
+          <w:rFonts w:ascii="Calibri" w:hAnsi="Calibri" w:cs="Calibri"/>
+          <w:b/>
+          <w:bCs/>
+        </w:rPr>
+        <w:t>PASS WITH MINOR LIMITATION</w:t>
+      </w:r>
+      <w:r>
+        <w:rPr>
+          <w:rFonts w:ascii="Calibri" w:hAnsi="Calibri" w:cs="Calibri"/>
+        </w:rPr>
+        <w:t xml:space="preserve"> with zero primary FAIL. P10B-18D is next; historical cleanup remains blocked.</w:t>
       </w:r>
     </w:p>
     <w:sectPr>

</xml_diff>

<commit_message>
chore: consolidate historical acceptance authority
</commit_message>
<xml_diff>
--- a/docs/VESKIFY_DEVELOPMENT_DELIVERY_TRACKER_v1.3.0.docx
+++ b/docs/VESKIFY_DEVELOPMENT_DELIVERY_TRACKER_v1.3.0.docx
@@ -7295,7 +7295,7 @@
               <w:rPr>
                 <w:rFonts w:ascii="Calibri" w:hAnsi="Calibri" w:cs="Calibri"/>
               </w:rPr>
-              <w:t>☐</w:t>
+              <w:t>☑</w:t>
             </w:r>
           </w:p>
         </w:tc>
@@ -7313,7 +7313,7 @@
               <w:rPr>
                 <w:rFonts w:ascii="Calibri" w:hAnsi="Calibri" w:cs="Calibri"/>
               </w:rPr>
-              <w:t>P10B-18D</w:t>
+              <w:t>P10B-16P-05B</w:t>
             </w:r>
           </w:p>
         </w:tc>
@@ -7331,7 +7331,7 @@
               <w:rPr>
                 <w:rFonts w:ascii="Calibri" w:hAnsi="Calibri" w:cs="Calibri"/>
               </w:rPr>
-              <w:t>Live AI commercial storefront acceptance</w:t>
+              <w:t>Major repository and historical-authority cleanup</w:t>
             </w:r>
           </w:p>
         </w:tc>
@@ -7352,7 +7352,7 @@
                 <w:b/>
                 <w:bCs/>
               </w:rPr>
-              <w:t>Planned</w:t>
+              <w:t>Baseline</w:t>
             </w:r>
           </w:p>
         </w:tc>
@@ -7370,7 +7370,7 @@
               <w:rPr>
                 <w:rFonts w:ascii="Calibri" w:hAnsi="Calibri" w:cs="Calibri"/>
               </w:rPr>
-              <w:t>Product owner, provider, generation, QA</w:t>
+              <w:t>Generation architecture/evidence</w:t>
             </w:r>
           </w:p>
         </w:tc>
@@ -7388,7 +7388,7 @@
               <w:rPr>
                 <w:rFonts w:ascii="Calibri" w:hAnsi="Calibri" w:cs="Calibri"/>
               </w:rPr>
-              <w:t>Accepted P10B-18C</w:t>
+              <w:t>P10B-16P-05A and accepted P10B-18C</w:t>
             </w:r>
           </w:p>
         </w:tc>
@@ -7406,7 +7406,7 @@
               <w:rPr>
                 <w:rFonts w:ascii="Calibri" w:hAnsi="Calibri" w:cs="Calibri"/>
               </w:rPr>
-              <w:t>Fresh bounded live-provider complete-store evidence, exact lineage, protected truth, lifecycle and retained human acceptance</w:t>
+              <w:t>Consumer graph; one active generation chain; lean P10B-18D seam; production fail-closed; durable lifecycle, migration and quality regressions</w:t>
             </w:r>
           </w:p>
         </w:tc>
@@ -7448,7 +7448,7 @@
               <w:rPr>
                 <w:rFonts w:ascii="Calibri" w:hAnsi="Calibri" w:cs="Calibri"/>
               </w:rPr>
-              <w:t>P10B-16P-05B</w:t>
+              <w:t>P10B-18D</w:t>
             </w:r>
           </w:p>
         </w:tc>
@@ -7466,7 +7466,7 @@
               <w:rPr>
                 <w:rFonts w:ascii="Calibri" w:hAnsi="Calibri" w:cs="Calibri"/>
               </w:rPr>
-              <w:t>Final historical acceptance cleanup</w:t>
+              <w:t>Live AI commercial storefront acceptance</w:t>
             </w:r>
           </w:p>
         </w:tc>
@@ -7487,7 +7487,7 @@
                 <w:b/>
                 <w:bCs/>
               </w:rPr>
-              <w:t>Blocked</w:t>
+              <w:t>Planned</w:t>
             </w:r>
           </w:p>
         </w:tc>
@@ -7505,7 +7505,7 @@
               <w:rPr>
                 <w:rFonts w:ascii="Calibri" w:hAnsi="Calibri" w:cs="Calibri"/>
               </w:rPr>
-              <w:t>Generation architecture/evidence</w:t>
+              <w:t>Product owner, provider, generation, QA</w:t>
             </w:r>
           </w:p>
         </w:tc>
@@ -7523,7 +7523,7 @@
               <w:rPr>
                 <w:rFonts w:ascii="Calibri" w:hAnsi="Calibri" w:cs="Calibri"/>
               </w:rPr>
-              <w:t>P10B-16P-05A and P10B-18D</w:t>
+              <w:t>P10B-16P-05B and accepted P10B-18C</w:t>
             </w:r>
           </w:p>
         </w:tc>
@@ -7541,7 +7541,277 @@
               <w:rPr>
                 <w:rFonts w:ascii="Calibri" w:hAnsi="Calibri" w:cs="Calibri"/>
               </w:rPr>
-              <w:t>Consumer-proven removal/archival only after accepted live-AI evidence no longer needs historical scaffolding</w:t>
+              <w:t>Fresh bounded live-provider complete-store evidence, exact lineage, protected truth, lifecycle and retained human acceptance</w:t>
+            </w:r>
+          </w:p>
+        </w:tc>
+      </w:tr>
+      <w:tr>
+        <w:trPr>
+          <w:cantSplit/>
+        </w:trPr>
+        <w:tc>
+          <w:tcPr>
+            <w:tcW w:w="720" w:type="dxa"/>
+            <w:vAlign w:val="center"/>
+          </w:tcPr>
+          <w:p>
+            <w:pPr>
+              <w:pStyle w:val="CompactTableText"/>
+              <w:jc w:val="center"/>
+              <w:widowControl/>
+            </w:pPr>
+            <w:r>
+              <w:rPr>
+                <w:rFonts w:ascii="Calibri" w:hAnsi="Calibri" w:cs="Calibri"/>
+              </w:rPr>
+              <w:t>☐</w:t>
+            </w:r>
+          </w:p>
+        </w:tc>
+        <w:tc>
+          <w:tcPr>
+            <w:tcW w:w="1700" w:type="dxa"/>
+            <w:vAlign w:val="center"/>
+          </w:tcPr>
+          <w:p>
+            <w:pPr>
+              <w:pStyle w:val="CompactTableText"/>
+              <w:widowControl/>
+            </w:pPr>
+            <w:r>
+              <w:rPr>
+                <w:rFonts w:ascii="Calibri" w:hAnsi="Calibri" w:cs="Calibri"/>
+              </w:rPr>
+              <w:t>P10B-19 PRE</w:t>
+            </w:r>
+          </w:p>
+        </w:tc>
+        <w:tc>
+          <w:tcPr>
+            <w:tcW w:w="2800" w:type="dxa"/>
+            <w:vAlign w:val="center"/>
+          </w:tcPr>
+          <w:p>
+            <w:pPr>
+              <w:pStyle w:val="CompactTableText"/>
+              <w:widowControl/>
+            </w:pPr>
+            <w:r>
+              <w:rPr>
+                <w:rFonts w:ascii="Calibri" w:hAnsi="Calibri" w:cs="Calibri"/>
+              </w:rPr>
+              <w:t>Structural Design Intelligence Architecture Lock</w:t>
+            </w:r>
+          </w:p>
+        </w:tc>
+        <w:tc>
+          <w:tcPr>
+            <w:tcW w:w="850" w:type="dxa"/>
+            <w:vAlign w:val="center"/>
+          </w:tcPr>
+          <w:p>
+            <w:pPr>
+              <w:pStyle w:val="CompactTableText"/>
+              <w:jc w:val="center"/>
+              <w:widowControl/>
+            </w:pPr>
+            <w:r>
+              <w:rPr>
+                <w:rFonts w:ascii="Calibri" w:hAnsi="Calibri" w:cs="Calibri"/>
+                <w:b/>
+                <w:bCs/>
+              </w:rPr>
+              <w:t>Planned</w:t>
+            </w:r>
+          </w:p>
+        </w:tc>
+        <w:tc>
+          <w:tcPr>
+            <w:tcW w:w="1500" w:type="dxa"/>
+            <w:vAlign w:val="center"/>
+          </w:tcPr>
+          <w:p>
+            <w:pPr>
+              <w:pStyle w:val="CompactTableText"/>
+              <w:widowControl/>
+            </w:pPr>
+            <w:r>
+              <w:rPr>
+                <w:rFonts w:ascii="Calibri" w:hAnsi="Calibri" w:cs="Calibri"/>
+              </w:rPr>
+              <w:t>Product owner and architecture</w:t>
+            </w:r>
+          </w:p>
+        </w:tc>
+        <w:tc>
+          <w:tcPr>
+            <w:tcW w:w="2500" w:type="dxa"/>
+            <w:vAlign w:val="center"/>
+          </w:tcPr>
+          <w:p>
+            <w:pPr>
+              <w:pStyle w:val="CompactTableText"/>
+              <w:widowControl/>
+            </w:pPr>
+            <w:r>
+              <w:rPr>
+                <w:rFonts w:ascii="Calibri" w:hAnsi="Calibri" w:cs="Calibri"/>
+              </w:rPr>
+              <w:t>Accepted P10B-18D</w:t>
+            </w:r>
+          </w:p>
+        </w:tc>
+        <w:tc>
+          <w:tcPr>
+            <w:tcW w:w="2890" w:type="dxa"/>
+            <w:vAlign w:val="center"/>
+          </w:tcPr>
+          <w:p>
+            <w:pPr>
+              <w:pStyle w:val="CompactTableText"/>
+              <w:widowControl/>
+            </w:pPr>
+            <w:r>
+              <w:rPr>
+                <w:rFonts w:ascii="Calibri" w:hAnsi="Calibri" w:cs="Calibri"/>
+              </w:rPr>
+              <w:t>Lock structural-intelligence ownership and the P10B-19A-J sequence before implementation</w:t>
+            </w:r>
+          </w:p>
+        </w:tc>
+      </w:tr>
+      <w:tr>
+        <w:trPr>
+          <w:cantSplit/>
+        </w:trPr>
+        <w:tc>
+          <w:tcPr>
+            <w:tcW w:w="720" w:type="dxa"/>
+            <w:vAlign w:val="center"/>
+          </w:tcPr>
+          <w:p>
+            <w:pPr>
+              <w:pStyle w:val="CompactTableText"/>
+              <w:jc w:val="center"/>
+              <w:widowControl/>
+            </w:pPr>
+            <w:r>
+              <w:rPr>
+                <w:rFonts w:ascii="Calibri" w:hAnsi="Calibri" w:cs="Calibri"/>
+              </w:rPr>
+              <w:t>☐</w:t>
+            </w:r>
+          </w:p>
+        </w:tc>
+        <w:tc>
+          <w:tcPr>
+            <w:tcW w:w="1700" w:type="dxa"/>
+            <w:vAlign w:val="center"/>
+          </w:tcPr>
+          <w:p>
+            <w:pPr>
+              <w:pStyle w:val="CompactTableText"/>
+              <w:widowControl/>
+            </w:pPr>
+            <w:r>
+              <w:rPr>
+                <w:rFonts w:ascii="Calibri" w:hAnsi="Calibri" w:cs="Calibri"/>
+              </w:rPr>
+              <w:t>P10B-19A-J</w:t>
+            </w:r>
+          </w:p>
+        </w:tc>
+        <w:tc>
+          <w:tcPr>
+            <w:tcW w:w="2800" w:type="dxa"/>
+            <w:vAlign w:val="center"/>
+          </w:tcPr>
+          <w:p>
+            <w:pPr>
+              <w:pStyle w:val="CompactTableText"/>
+              <w:widowControl/>
+            </w:pPr>
+            <w:r>
+              <w:rPr>
+                <w:rFonts w:ascii="Calibri" w:hAnsi="Calibri" w:cs="Calibri"/>
+              </w:rPr>
+              <w:t>Structural Design Intelligence implementation</w:t>
+            </w:r>
+          </w:p>
+        </w:tc>
+        <w:tc>
+          <w:tcPr>
+            <w:tcW w:w="850" w:type="dxa"/>
+            <w:vAlign w:val="center"/>
+          </w:tcPr>
+          <w:p>
+            <w:pPr>
+              <w:pStyle w:val="CompactTableText"/>
+              <w:jc w:val="center"/>
+              <w:widowControl/>
+            </w:pPr>
+            <w:r>
+              <w:rPr>
+                <w:rFonts w:ascii="Calibri" w:hAnsi="Calibri" w:cs="Calibri"/>
+                <w:b/>
+                <w:bCs/>
+              </w:rPr>
+              <w:t>Planned</w:t>
+            </w:r>
+          </w:p>
+        </w:tc>
+        <w:tc>
+          <w:tcPr>
+            <w:tcW w:w="1500" w:type="dxa"/>
+            <w:vAlign w:val="center"/>
+          </w:tcPr>
+          <w:p>
+            <w:pPr>
+              <w:pStyle w:val="CompactTableText"/>
+              <w:widowControl/>
+            </w:pPr>
+            <w:r>
+              <w:rPr>
+                <w:rFonts w:ascii="Calibri" w:hAnsi="Calibri" w:cs="Calibri"/>
+              </w:rPr>
+              <w:t>Planned task owners</w:t>
+            </w:r>
+          </w:p>
+        </w:tc>
+        <w:tc>
+          <w:tcPr>
+            <w:tcW w:w="2500" w:type="dxa"/>
+            <w:vAlign w:val="center"/>
+          </w:tcPr>
+          <w:p>
+            <w:pPr>
+              <w:pStyle w:val="CompactTableText"/>
+              <w:widowControl/>
+            </w:pPr>
+            <w:r>
+              <w:rPr>
+                <w:rFonts w:ascii="Calibri" w:hAnsi="Calibri" w:cs="Calibri"/>
+              </w:rPr>
+              <w:t>Accepted P10B-19 PRE</w:t>
+            </w:r>
+          </w:p>
+        </w:tc>
+        <w:tc>
+          <w:tcPr>
+            <w:tcW w:w="2890" w:type="dxa"/>
+            <w:vAlign w:val="center"/>
+          </w:tcPr>
+          <w:p>
+            <w:pPr>
+              <w:pStyle w:val="CompactTableText"/>
+              <w:widowControl/>
+            </w:pPr>
+            <w:r>
+              <w:rPr>
+                <w:rFonts w:ascii="Calibri" w:hAnsi="Calibri" w:cs="Calibri"/>
+              </w:rPr>
+              <w:t>Ten package-specific implementation and acceptance tasks</w:t>
             </w:r>
           </w:p>
         </w:tc>
@@ -11592,7 +11862,7 @@
         <w:rPr>
           <w:rFonts w:ascii="Calibri" w:hAnsi="Calibri" w:cs="Calibri"/>
         </w:rPr>
-        <w:t xml:space="preserve">. P10B-16P-02, parent P10B-18B and P10B-18C are </w:t>
+        <w:t xml:space="preserve">. P10B-16P-02, parent P10B-18B, P10B-18C and P10B-16P-05B are </w:t>
       </w:r>
       <w:r>
         <w:rPr>
@@ -11620,15 +11890,15 @@
         <w:rPr>
           <w:rFonts w:ascii="Calibri" w:hAnsi="Calibri" w:cs="Calibri"/>
         </w:rPr>
-        <w:t xml:space="preserve">; P10B-18D remains </w:t>
-      </w:r>
-      <w:r>
-        <w:rPr>
-          <w:rFonts w:ascii="Calibri" w:hAnsi="Calibri" w:cs="Calibri"/>
-          <w:b/>
-          <w:bCs/>
-        </w:rPr>
-        <w:t>Planned</w:t>
+        <w:t xml:space="preserve">; P10B-18D is </w:t>
+      </w:r>
+      <w:r>
+        <w:rPr>
+          <w:rFonts w:ascii="Calibri" w:hAnsi="Calibri" w:cs="Calibri"/>
+          <w:b/>
+          <w:bCs/>
+        </w:rPr>
+        <w:t>Planned / exact next</w:t>
       </w:r>
       <w:r>
         <w:rPr>
@@ -11650,7 +11920,7 @@
         <w:rPr>
           <w:rFonts w:ascii="Calibri" w:hAnsi="Calibri" w:cs="Calibri"/>
         </w:rPr>
-        <w:t>. The remaining Done conditions are implementation gates, not claims about the current repository. The P10B-16P-01 through P10B-16P-05A plus P10B-16P-06 sequence is a mandatory convergence package between P10B-16 and P10B-17; it supplements rather than renumbers the locked P10B-01 through P10B-18 plan. P10B-18D is the exact next product task. P10B-16P-05B remains blocked until its fresh live-AI acceptance proves historical evidence consumers can be removed safely.</w:t>
+        <w:t>. The remaining Done conditions are implementation gates, not claims about the current repository. The P10B-16P-01 through P10B-16P-05A plus P10B-16P-06 sequence is a mandatory convergence package between P10B-16 and P10B-17; it supplements rather than renumbers the locked P10B-01 through P10B-18 plan. P10B-16P-05B follows accepted P10B-18C and is now Baseline. P10B-18D is the exact next product task, followed by P10B-19 PRE and planned P10B-19A through P10B-19J.</w:t>
       </w:r>
     </w:p>
     <w:p>
@@ -16963,7 +17233,69 @@
         <w:rPr>
           <w:rFonts w:ascii="Calibri" w:hAnsi="Calibri" w:cs="Calibri"/>
         </w:rPr>
-        <w:t>P10B-16P-05B — Final historical acceptance cleanup</w:t>
+        <w:t>P10B-16P-05B — Major repository and historical-authority cleanup</w:t>
+      </w:r>
+    </w:p>
+    <w:p>
+      <w:pPr>
+        <w:pStyle w:val="Normal"/>
+        <w:numPr>
+          <w:ilvl w:val="0"/>
+          <w:numId w:val="1"/>
+        </w:numPr>
+        <w:widowControl/>
+      </w:pPr>
+      <w:r>
+        <w:rPr>
+          <w:rFonts w:ascii="Calibri" w:hAnsi="Calibri" w:cs="Calibri"/>
+          <w:b/>
+          <w:bCs/>
+        </w:rPr>
+        <w:t>Status:</w:t>
+      </w:r>
+      <w:r>
+        <w:rPr>
+          <w:rFonts w:ascii="Calibri" w:hAnsi="Calibri" w:cs="Calibri"/>
+        </w:rPr>
+        <w:t xml:space="preserve"> </w:t>
+      </w:r>
+      <w:r>
+        <w:rPr>
+          <w:rFonts w:ascii="Calibri" w:hAnsi="Calibri" w:cs="Calibri"/>
+          <w:b/>
+          <w:bCs/>
+        </w:rPr>
+        <w:t>Baseline</w:t>
+      </w:r>
+      <w:r>
+        <w:rPr>
+          <w:rFonts w:ascii="Calibri" w:hAnsi="Calibri" w:cs="Calibri"/>
+        </w:rPr>
+        <w:t>.</w:t>
+      </w:r>
+    </w:p>
+    <w:p>
+      <w:pPr>
+        <w:pStyle w:val="Normal"/>
+        <w:numPr>
+          <w:ilvl w:val="0"/>
+          <w:numId w:val="1"/>
+        </w:numPr>
+        <w:widowControl/>
+      </w:pPr>
+      <w:r>
+        <w:rPr>
+          <w:rFonts w:ascii="Calibri" w:hAnsi="Calibri" w:cs="Calibri"/>
+          <w:b/>
+          <w:bCs/>
+        </w:rPr>
+        <w:t>Depends on:</w:t>
+      </w:r>
+      <w:r>
+        <w:rPr>
+          <w:rFonts w:ascii="Calibri" w:hAnsi="Calibri" w:cs="Calibri"/>
+        </w:rPr>
+        <w:t xml:space="preserve"> P10B-16P-05A and accepted P10B-18C.</w:t>
       </w:r>
     </w:p>
     <w:p>
@@ -16987,93 +17319,31 @@
         <w:rPr>
           <w:rFonts w:ascii="Calibri" w:hAnsi="Calibri" w:cs="Calibri"/>
         </w:rPr>
-        <w:t xml:space="preserve"> Remove or archive remaining P10B-16L, P9/Lumo, and P04 acceptance scaffolding only after current quality/scale evidence no longer consumes it.</w:t>
-      </w:r>
-    </w:p>
-    <w:p>
-      <w:pPr>
-        <w:pStyle w:val="Normal"/>
-        <w:numPr>
-          <w:ilvl w:val="0"/>
-          <w:numId w:val="1"/>
-        </w:numPr>
-        <w:widowControl/>
-      </w:pPr>
-      <w:r>
-        <w:rPr>
-          <w:rFonts w:ascii="Calibri" w:hAnsi="Calibri" w:cs="Calibri"/>
-          <w:b/>
-          <w:bCs/>
-        </w:rPr>
-        <w:t>Status:</w:t>
-      </w:r>
-      <w:r>
-        <w:rPr>
-          <w:rFonts w:ascii="Calibri" w:hAnsi="Calibri" w:cs="Calibri"/>
-        </w:rPr>
-        <w:t xml:space="preserve"> </w:t>
-      </w:r>
-      <w:r>
-        <w:rPr>
-          <w:rFonts w:ascii="Calibri" w:hAnsi="Calibri" w:cs="Calibri"/>
-          <w:b/>
-          <w:bCs/>
-        </w:rPr>
-        <w:t>Blocked</w:t>
-      </w:r>
-      <w:r>
-        <w:rPr>
-          <w:rFonts w:ascii="Calibri" w:hAnsi="Calibri" w:cs="Calibri"/>
-        </w:rPr>
-        <w:t xml:space="preserve"> until accepted P10B-18D.</w:t>
-      </w:r>
-    </w:p>
-    <w:p>
-      <w:pPr>
-        <w:pStyle w:val="Normal"/>
-        <w:numPr>
-          <w:ilvl w:val="0"/>
-          <w:numId w:val="1"/>
-        </w:numPr>
-        <w:widowControl/>
-      </w:pPr>
-      <w:r>
-        <w:rPr>
-          <w:rFonts w:ascii="Calibri" w:hAnsi="Calibri" w:cs="Calibri"/>
-          <w:b/>
-          <w:bCs/>
-        </w:rPr>
-        <w:t>Depends on:</w:t>
-      </w:r>
-      <w:r>
-        <w:rPr>
-          <w:rFonts w:ascii="Calibri" w:hAnsi="Calibri" w:cs="Calibri"/>
-        </w:rPr>
-        <w:t xml:space="preserve"> P10B-16P-05A and P10B-18D.</w:t>
-      </w:r>
-    </w:p>
-    <w:p>
-      <w:pPr>
-        <w:pStyle w:val="Normal"/>
-        <w:numPr>
-          <w:ilvl w:val="0"/>
-          <w:numId w:val="1"/>
-        </w:numPr>
-        <w:widowControl/>
-      </w:pPr>
-      <w:r>
-        <w:rPr>
-          <w:rFonts w:ascii="Calibri" w:hAnsi="Calibri" w:cs="Calibri"/>
-          <w:b/>
-          <w:bCs/>
-        </w:rPr>
-        <w:t>Done when:</w:t>
-      </w:r>
-      <w:r>
-        <w:rPr>
-          <w:rFonts w:ascii="Calibri" w:hAnsi="Calibri" w:cs="Calibri"/>
-        </w:rPr>
-        <w:t xml:space="preserve"> Consumer search proves no active, migration, publication, replay, or retained evidence dependency; final removal preserves historical records and all valid snapshots/artifacts.</w:t>
+        <w:t xml:space="preserve"> Consumer-proven removal/consolidation of one-time acceptance infrastructure while retaining the active generation path, P03 lifecycle, one lean P04 mock/live P10B-18D seam, governed P9 follow-up, stable migration/publication identities and durable 126/72 quality gates.</w:t>
+      </w:r>
+    </w:p>
+    <w:p>
+      <w:pPr>
+        <w:pStyle w:val="Normal"/>
+        <w:numPr>
+          <w:ilvl w:val="0"/>
+          <w:numId w:val="1"/>
+        </w:numPr>
+        <w:widowControl/>
+      </w:pPr>
+      <w:r>
+        <w:rPr>
+          <w:rFonts w:ascii="Calibri" w:hAnsi="Calibri" w:cs="Calibri"/>
+          <w:b/>
+          <w:bCs/>
+        </w:rPr>
+        <w:t>Security:</w:t>
+      </w:r>
+      <w:r>
+        <w:rPr>
+          <w:rFonts w:ascii="Calibri" w:hAnsi="Calibri" w:cs="Calibri"/>
+        </w:rPr>
+        <w:t xml:space="preserve"> P04 acceptance is unavailable in production; tokens remain server/test-process authority; mock and live transports remain explicit and cannot silently substitute.</w:t>
       </w:r>
     </w:p>
     <w:p>
@@ -17097,19 +17367,19 @@
         <w:rPr>
           <w:rFonts w:ascii="Calibri" w:hAnsi="Calibri" w:cs="Calibri"/>
         </w:rPr>
-        <w:t xml:space="preserve"> Deleting P10B-18 visual fixtures or compatibility data before their removal gate.</w:t>
-      </w:r>
-    </w:p>
-    <w:p>
-      <w:pPr>
-        <w:pStyle w:val="Normal"/>
-        <w:widowControl/>
-      </w:pPr>
-      <w:r>
-        <w:rPr>
-          <w:rFonts w:ascii="Calibri" w:hAnsi="Calibri" w:cs="Calibri"/>
-        </w:rPr>
-        <w:t>P10B-17, accepted P10B-18A and accepted P10B-18B-01, P10B-18B-06, P10B-18B-02, P10B-18B-03, P10B-18B-04, P10B-18B-05 and P10B-18C are Baseline. Parent P10B-18B is Baseline/complete; P10B-18 and P10B remain Partial. P10B-18D is the exact next task, and P10B-16P-05B remains blocked behind it.</w:t>
+        <w:t xml:space="preserve"> Storefront output, generation semantics, P10B-18D execution, P10B-19 implementation, commerce/media changes or migration breakage.</w:t>
+      </w:r>
+    </w:p>
+    <w:p>
+      <w:pPr>
+        <w:pStyle w:val="Normal"/>
+        <w:widowControl/>
+      </w:pPr>
+      <w:r>
+        <w:rPr>
+          <w:rFonts w:ascii="Calibri" w:hAnsi="Calibri" w:cs="Calibri"/>
+        </w:rPr>
+        <w:t>P10B-18C and P10B-16P-05B are Baseline. P10B-18 and P10B remain Partial. P10B-18D is the exact next task, followed by P10B-19 PRE and planned P10B-19A through P10B-19J.</w:t>
       </w:r>
     </w:p>
     <w:p>
@@ -23127,7 +23397,7 @@
         <w:rPr>
           <w:rFonts w:ascii="Calibri" w:hAnsi="Calibri" w:cs="Calibri"/>
         </w:rPr>
-        <w:t xml:space="preserve"> with zero primary FAIL. P10B-18D is next; historical cleanup remains blocked.</w:t>
+        <w:t xml:space="preserve"> with zero primary FAIL. P10B-16P-05B subsequently removed the one-time capture platform while retaining the bounded quality gate; P10B-18D is the exact next task.</w:t>
       </w:r>
     </w:p>
     <w:sectPr>

</xml_diff>

<commit_message>
test: record P10B-18D live quality diagnostic
</commit_message>
<xml_diff>
--- a/docs/VESKIFY_DEVELOPMENT_DELIVERY_TRACKER_v1.3.0.docx
+++ b/docs/VESKIFY_DEVELOPMENT_DELIVERY_TRACKER_v1.3.0.docx
@@ -7430,7 +7430,7 @@
               <w:rPr>
                 <w:rFonts w:ascii="Calibri" w:hAnsi="Calibri" w:cs="Calibri"/>
               </w:rPr>
-              <w:t>☐</w:t>
+              <w:t>☑</w:t>
             </w:r>
           </w:p>
         </w:tc>
@@ -7466,7 +7466,7 @@
               <w:rPr>
                 <w:rFonts w:ascii="Calibri" w:hAnsi="Calibri" w:cs="Calibri"/>
               </w:rPr>
-              <w:t>Live AI commercial storefront acceptance</w:t>
+              <w:t>Live AI commercial storefront acceptance diagnostic</w:t>
             </w:r>
           </w:p>
         </w:tc>
@@ -7487,7 +7487,7 @@
                 <w:b/>
                 <w:bCs/>
               </w:rPr>
-              <w:t>Planned</w:t>
+              <w:t>Baseline diagnostic / quality rejected</w:t>
             </w:r>
           </w:p>
         </w:tc>
@@ -7541,7 +7541,7 @@
               <w:rPr>
                 <w:rFonts w:ascii="Calibri" w:hAnsi="Calibri" w:cs="Calibri"/>
               </w:rPr>
-              <w:t>Fresh bounded live-provider complete-store evidence, exact lineage, protected truth, lifecycle and retained human acceptance</w:t>
+              <w:t>Six bounded calls and safe evidence accepted; 3/6 fidelity passes, exact Concept 2/6 authority collapse and incomplete final reload/Preview reject live commercial quality</w:t>
             </w:r>
           </w:p>
         </w:tc>
@@ -7622,7 +7622,7 @@
                 <w:b/>
                 <w:bCs/>
               </w:rPr>
-              <w:t>Planned</w:t>
+              <w:t>Planned / exact next</w:t>
             </w:r>
           </w:p>
         </w:tc>
@@ -7658,7 +7658,7 @@
               <w:rPr>
                 <w:rFonts w:ascii="Calibri" w:hAnsi="Calibri" w:cs="Calibri"/>
               </w:rPr>
-              <w:t>Accepted P10B-18D</w:t>
+              <w:t>Completed P10B-18D diagnostic</w:t>
             </w:r>
           </w:p>
         </w:tc>
@@ -7676,7 +7676,7 @@
               <w:rPr>
                 <w:rFonts w:ascii="Calibri" w:hAnsi="Calibri" w:cs="Calibri"/>
               </w:rPr>
-              <w:t>Lock structural-intelligence ownership and the P10B-19A-J sequence before implementation</w:t>
+              <w:t>Lock structural-intelligence ownership and the P10B-19A-J sequence before implementation, grounded in the live diagnostic</w:t>
             </w:r>
           </w:p>
         </w:tc>
@@ -19292,7 +19292,7 @@
         <w:rPr>
           <w:rFonts w:ascii="Calibri" w:hAnsi="Calibri" w:cs="Calibri"/>
         </w:rPr>
-        <w:t xml:space="preserve"> Prove freshly authorized live-AI generation against the final integrated post-18B authority without weakening deterministic compiler/materializer or protected-state boundaries.</w:t>
+        <w:t xml:space="preserve"> Diagnose freshly authorized live-AI generation against the final integrated post-18B authority without weakening deterministic compiler/materializer or protected-state boundaries.</w:t>
       </w:r>
     </w:p>
     <w:p>
@@ -19324,13 +19324,13 @@
           <w:b/>
           <w:bCs/>
         </w:rPr>
-        <w:t>Planned</w:t>
-      </w:r>
-      <w:r>
-        <w:rPr>
-          <w:rFonts w:ascii="Calibri" w:hAnsi="Calibri" w:cs="Calibri"/>
-        </w:rPr>
-        <w:t>.</w:t>
+        <w:t>Baseline diagnostic / live commercial quality rejected</w:t>
+      </w:r>
+      <w:r>
+        <w:rPr>
+          <w:rFonts w:ascii="Calibri" w:hAnsi="Calibri" w:cs="Calibri"/>
+        </w:rPr>
+        <w:t>, 24 August 2026.</w:t>
       </w:r>
     </w:p>
     <w:p>
@@ -19372,13 +19372,37 @@
           <w:b/>
           <w:bCs/>
         </w:rPr>
-        <w:t>Done when:</w:t>
-      </w:r>
-      <w:r>
-        <w:rPr>
-          <w:rFonts w:ascii="Calibri" w:hAnsi="Calibri" w:cs="Calibri"/>
-        </w:rPr>
-        <w:t xml:space="preserve"> Bounded live-provider complete-store proposals preserve exact lineage, protected commerce/media, lifecycle and commercial human acceptance.</w:t>
+        <w:t>Result:</w:t>
+      </w:r>
+      <w:r>
+        <w:rPr>
+          <w:rFonts w:ascii="Calibri" w:hAnsi="Calibri" w:cs="Calibri"/>
+        </w:rPr>
+        <w:t xml:space="preserve"> Six bounded calls preserve exact technical lineage and protected commerce/media, but only Concepts 3, 4 and 5 pass prompt fidelity. Concepts 2 and 6 resolve to the same exact authority. Concept 6 does not complete reload and full Preview proof.</w:t>
+      </w:r>
+    </w:p>
+    <w:p>
+      <w:pPr>
+        <w:pStyle w:val="Normal"/>
+        <w:numPr>
+          <w:ilvl w:val="0"/>
+          <w:numId w:val="1"/>
+        </w:numPr>
+        <w:widowControl/>
+      </w:pPr>
+      <w:r>
+        <w:rPr>
+          <w:rFonts w:ascii="Calibri" w:hAnsi="Calibri" w:cs="Calibri"/>
+          <w:b/>
+          <w:bCs/>
+        </w:rPr>
+        <w:t>Evidence limits:</w:t>
+      </w:r>
+      <w:r>
+        <w:rPr>
+          <w:rFonts w:ascii="Calibri" w:hAnsi="Calibri" w:cs="Calibri"/>
+        </w:rPr>
+        <w:t xml:space="preserve"> Concept 1 safe/Reject evidence is partial; Concept 4 lacks two expired cart captures; Concept 5 lacks explicit Reject proof; Concept 6 is complete only through Save.</w:t>
       </w:r>
     </w:p>
     <w:p>
@@ -19403,6 +19427,32 @@
           <w:rFonts w:ascii="Calibri" w:hAnsi="Calibri" w:cs="Calibri"/>
         </w:rPr>
         <w:t xml:space="preserve"> Vesko calls, real publication, production-readiness claims or a second provider/ compiler/materializer authority.</w:t>
+      </w:r>
+    </w:p>
+    <w:p>
+      <w:pPr>
+        <w:pStyle w:val="Normal"/>
+        <w:widowControl/>
+      </w:pPr>
+      <w:r>
+        <w:rPr>
+          <w:rFonts w:ascii="Calibri" w:hAnsi="Calibri" w:cs="Calibri"/>
+        </w:rPr>
+        <w:t xml:space="preserve">P10B-18 and P10B remain Partial. </w:t>
+      </w:r>
+      <w:r>
+        <w:rPr>
+          <w:rFonts w:ascii="Consolas" w:hAnsi="Consolas" w:cs="Consolas"/>
+          <w:sz w:val="19"/>
+          <w:szCs w:val="19"/>
+        </w:rPr>
+        <w:t>P10B-19 PRE - Structural Design Intelligence Architecture Lock</w:t>
+      </w:r>
+      <w:r>
+        <w:rPr>
+          <w:rFonts w:ascii="Calibri" w:hAnsi="Calibri" w:cs="Calibri"/>
+        </w:rPr>
+        <w:t xml:space="preserve"> is the exact next task; P10B-19A through P10B-19J remain Planned.</w:t>
       </w:r>
     </w:p>
     <w:p>

</xml_diff>

<commit_message>
docs: synchronize P10B-18D diagnostic status
</commit_message>
<xml_diff>
--- a/docs/VESKIFY_DEVELOPMENT_DELIVERY_TRACKER_v1.3.0.docx
+++ b/docs/VESKIFY_DEVELOPMENT_DELIVERY_TRACKER_v1.3.0.docx
@@ -11890,7 +11890,21 @@
         <w:rPr>
           <w:rFonts w:ascii="Calibri" w:hAnsi="Calibri" w:cs="Calibri"/>
         </w:rPr>
-        <w:t xml:space="preserve">; P10B-18D is </w:t>
+        <w:t xml:space="preserve">; P10B-18D is a </w:t>
+      </w:r>
+      <w:r>
+        <w:rPr>
+          <w:rFonts w:ascii="Calibri" w:hAnsi="Calibri" w:cs="Calibri"/>
+          <w:b/>
+          <w:bCs/>
+        </w:rPr>
+        <w:t>Baseline diagnostic with live commercial quality rejected</w:t>
+      </w:r>
+      <w:r>
+        <w:rPr>
+          <w:rFonts w:ascii="Calibri" w:hAnsi="Calibri" w:cs="Calibri"/>
+        </w:rPr>
+        <w:t xml:space="preserve">. P10B-19 PRE is </w:t>
       </w:r>
       <w:r>
         <w:rPr>
@@ -11920,7 +11934,7 @@
         <w:rPr>
           <w:rFonts w:ascii="Calibri" w:hAnsi="Calibri" w:cs="Calibri"/>
         </w:rPr>
-        <w:t>. The remaining Done conditions are implementation gates, not claims about the current repository. The P10B-16P-01 through P10B-16P-05A plus P10B-16P-06 sequence is a mandatory convergence package between P10B-16 and P10B-17; it supplements rather than renumbers the locked P10B-01 through P10B-18 plan. P10B-16P-05B follows accepted P10B-18C and is now Baseline. P10B-18D is the exact next product task, followed by P10B-19 PRE and planned P10B-19A through P10B-19J.</w:t>
+        <w:t>. The remaining Done conditions are implementation gates, not claims about the current repository. The P10B-16P-01 through P10B-16P-05A plus P10B-16P-06 sequence is a mandatory convergence package between P10B-16 and P10B-17; it supplements rather than renumbers the locked P10B-01 through P10B-18 plan. P10B-16P-05B follows accepted P10B-18C and is now Baseline. P10B-18D completed as a rejected-quality diagnostic. P10B-19 PRE is the exact next product task, followed by planned P10B-19A through P10B-19J.</w:t>
       </w:r>
     </w:p>
     <w:p>
@@ -17379,7 +17393,7 @@
         <w:rPr>
           <w:rFonts w:ascii="Calibri" w:hAnsi="Calibri" w:cs="Calibri"/>
         </w:rPr>
-        <w:t>P10B-18C and P10B-16P-05B are Baseline. P10B-18 and P10B remain Partial. P10B-18D is the exact next task, followed by P10B-19 PRE and planned P10B-19A through P10B-19J.</w:t>
+        <w:t>P10B-18C and P10B-16P-05B are Baseline. P10B-18D is a Baseline diagnostic with live commercial quality rejected. P10B-18 and P10B remain Partial. P10B-19 PRE is the exact next task, followed by planned P10B-19A through P10B-19J.</w:t>
       </w:r>
     </w:p>
     <w:p>
@@ -23447,7 +23461,7 @@
         <w:rPr>
           <w:rFonts w:ascii="Calibri" w:hAnsi="Calibri" w:cs="Calibri"/>
         </w:rPr>
-        <w:t xml:space="preserve"> with zero primary FAIL. P10B-16P-05B subsequently removed the one-time capture platform while retaining the bounded quality gate; P10B-18D is the exact next task.</w:t>
+        <w:t xml:space="preserve"> with zero primary FAIL. P10B-16P-05B subsequently removed the one-time capture platform while retaining the bounded quality gate. P10B-18D subsequently completed as a rejected-quality diagnostic; P10B-19 PRE is the exact next task.</w:t>
       </w:r>
     </w:p>
     <w:sectPr>

</xml_diff>

<commit_message>
docs: lock structural design intelligence architecture
</commit_message>
<xml_diff>
--- a/docs/VESKIFY_DEVELOPMENT_DELIVERY_TRACKER_v1.3.0.docx
+++ b/docs/VESKIFY_DEVELOPMENT_DELIVERY_TRACKER_v1.3.0.docx
@@ -7565,7 +7565,7 @@
               <w:rPr>
                 <w:rFonts w:ascii="Calibri" w:hAnsi="Calibri" w:cs="Calibri"/>
               </w:rPr>
-              <w:t>☐</w:t>
+              <w:t>☑</w:t>
             </w:r>
           </w:p>
         </w:tc>
@@ -7622,7 +7622,7 @@
                 <w:b/>
                 <w:bCs/>
               </w:rPr>
-              <w:t>Planned / exact next</w:t>
+              <w:t>Baseline</w:t>
             </w:r>
           </w:p>
         </w:tc>
@@ -7676,7 +7676,7 @@
               <w:rPr>
                 <w:rFonts w:ascii="Calibri" w:hAnsi="Calibri" w:cs="Calibri"/>
               </w:rPr>
-              <w:t>Lock structural-intelligence ownership and the P10B-19A-J sequence before implementation, grounded in the live diagnostic</w:t>
+              <w:t>Accepted ownership, migration, safety, alternatives, and P10B-19A-J implementation sequence; no production implementation</w:t>
             </w:r>
           </w:p>
         </w:tc>
@@ -7718,7 +7718,7 @@
               <w:rPr>
                 <w:rFonts w:ascii="Calibri" w:hAnsi="Calibri" w:cs="Calibri"/>
               </w:rPr>
-              <w:t>P10B-19A-J</w:t>
+              <w:t>P10B-19A</w:t>
             </w:r>
           </w:p>
         </w:tc>
@@ -7736,7 +7736,7 @@
               <w:rPr>
                 <w:rFonts w:ascii="Calibri" w:hAnsi="Calibri" w:cs="Calibri"/>
               </w:rPr>
-              <w:t>Structural Design Intelligence implementation</w:t>
+              <w:t>Structural Storefront Family Contract</w:t>
             </w:r>
           </w:p>
         </w:tc>
@@ -7757,6 +7757,141 @@
                 <w:b/>
                 <w:bCs/>
               </w:rPr>
+              <w:t>Planned / exact next</w:t>
+            </w:r>
+          </w:p>
+        </w:tc>
+        <w:tc>
+          <w:tcPr>
+            <w:tcW w:w="1500" w:type="dxa"/>
+            <w:vAlign w:val="center"/>
+          </w:tcPr>
+          <w:p>
+            <w:pPr>
+              <w:pStyle w:val="CompactTableText"/>
+              <w:widowControl/>
+            </w:pPr>
+            <w:r>
+              <w:rPr>
+                <w:rFonts w:ascii="Calibri" w:hAnsi="Calibri" w:cs="Calibri"/>
+              </w:rPr>
+              <w:t>Planned task owner</w:t>
+            </w:r>
+          </w:p>
+        </w:tc>
+        <w:tc>
+          <w:tcPr>
+            <w:tcW w:w="2500" w:type="dxa"/>
+            <w:vAlign w:val="center"/>
+          </w:tcPr>
+          <w:p>
+            <w:pPr>
+              <w:pStyle w:val="CompactTableText"/>
+              <w:widowControl/>
+            </w:pPr>
+            <w:r>
+              <w:rPr>
+                <w:rFonts w:ascii="Calibri" w:hAnsi="Calibri" w:cs="Calibri"/>
+              </w:rPr>
+              <w:t>Accepted P10B-19 PRE</w:t>
+            </w:r>
+          </w:p>
+        </w:tc>
+        <w:tc>
+          <w:tcPr>
+            <w:tcW w:w="2890" w:type="dxa"/>
+            <w:vAlign w:val="center"/>
+          </w:tcPr>
+          <w:p>
+            <w:pPr>
+              <w:pStyle w:val="CompactTableText"/>
+              <w:widowControl/>
+            </w:pPr>
+            <w:r>
+              <w:rPr>
+                <w:rFonts w:ascii="Calibri" w:hAnsi="Calibri" w:cs="Calibri"/>
+              </w:rPr>
+              <w:t>Versioned family and PageBlueprint v2 contracts, registry, topology identity, deterministic selection, and v1 compatibility</w:t>
+            </w:r>
+          </w:p>
+        </w:tc>
+      </w:tr>
+      <w:tr>
+        <w:trPr>
+          <w:cantSplit/>
+        </w:trPr>
+        <w:tc>
+          <w:tcPr>
+            <w:tcW w:w="720" w:type="dxa"/>
+            <w:vAlign w:val="center"/>
+          </w:tcPr>
+          <w:p>
+            <w:pPr>
+              <w:pStyle w:val="CompactTableText"/>
+              <w:jc w:val="center"/>
+              <w:widowControl/>
+            </w:pPr>
+            <w:r>
+              <w:rPr>
+                <w:rFonts w:ascii="Calibri" w:hAnsi="Calibri" w:cs="Calibri"/>
+              </w:rPr>
+              <w:t>☐</w:t>
+            </w:r>
+          </w:p>
+        </w:tc>
+        <w:tc>
+          <w:tcPr>
+            <w:tcW w:w="1700" w:type="dxa"/>
+            <w:vAlign w:val="center"/>
+          </w:tcPr>
+          <w:p>
+            <w:pPr>
+              <w:pStyle w:val="CompactTableText"/>
+              <w:widowControl/>
+            </w:pPr>
+            <w:r>
+              <w:rPr>
+                <w:rFonts w:ascii="Calibri" w:hAnsi="Calibri" w:cs="Calibri"/>
+              </w:rPr>
+              <w:t>P10B-19B-J</w:t>
+            </w:r>
+          </w:p>
+        </w:tc>
+        <w:tc>
+          <w:tcPr>
+            <w:tcW w:w="2800" w:type="dxa"/>
+            <w:vAlign w:val="center"/>
+          </w:tcPr>
+          <w:p>
+            <w:pPr>
+              <w:pStyle w:val="CompactTableText"/>
+              <w:widowControl/>
+            </w:pPr>
+            <w:r>
+              <w:rPr>
+                <w:rFonts w:ascii="Calibri" w:hAnsi="Calibri" w:cs="Calibri"/>
+              </w:rPr>
+              <w:t>Remaining Structural Design Intelligence sequence</w:t>
+            </w:r>
+          </w:p>
+        </w:tc>
+        <w:tc>
+          <w:tcPr>
+            <w:tcW w:w="850" w:type="dxa"/>
+            <w:vAlign w:val="center"/>
+          </w:tcPr>
+          <w:p>
+            <w:pPr>
+              <w:pStyle w:val="CompactTableText"/>
+              <w:jc w:val="center"/>
+              <w:widowControl/>
+            </w:pPr>
+            <w:r>
+              <w:rPr>
+                <w:rFonts w:ascii="Calibri" w:hAnsi="Calibri" w:cs="Calibri"/>
+                <w:b/>
+                <w:bCs/>
+              </w:rPr>
               <w:t>Planned</w:t>
             </w:r>
           </w:p>
@@ -7793,7 +7928,7 @@
               <w:rPr>
                 <w:rFonts w:ascii="Calibri" w:hAnsi="Calibri" w:cs="Calibri"/>
               </w:rPr>
-              <w:t>Accepted P10B-19 PRE</w:t>
+              <w:t>Accepted P10B-19 PRE and package sequence</w:t>
             </w:r>
           </w:p>
         </w:tc>
@@ -7811,7 +7946,7 @@
               <w:rPr>
                 <w:rFonts w:ascii="Calibri" w:hAnsi="Calibri" w:cs="Calibri"/>
               </w:rPr>
-              <w:t>Ten package-specific implementation and acceptance tasks</w:t>
+              <w:t>Nine package-specific implementation and acceptance tasks</w:t>
             </w:r>
           </w:p>
         </w:tc>
@@ -11912,6 +12047,20 @@
           <w:b/>
           <w:bCs/>
         </w:rPr>
+        <w:t>Baseline</w:t>
+      </w:r>
+      <w:r>
+        <w:rPr>
+          <w:rFonts w:ascii="Calibri" w:hAnsi="Calibri" w:cs="Calibri"/>
+        </w:rPr>
+        <w:t xml:space="preserve">, and P10B-19A is </w:t>
+      </w:r>
+      <w:r>
+        <w:rPr>
+          <w:rFonts w:ascii="Calibri" w:hAnsi="Calibri" w:cs="Calibri"/>
+          <w:b/>
+          <w:bCs/>
+        </w:rPr>
         <w:t>Planned / exact next</w:t>
       </w:r>
       <w:r>
@@ -11934,7 +12083,7 @@
         <w:rPr>
           <w:rFonts w:ascii="Calibri" w:hAnsi="Calibri" w:cs="Calibri"/>
         </w:rPr>
-        <w:t>. The remaining Done conditions are implementation gates, not claims about the current repository. The P10B-16P-01 through P10B-16P-05A plus P10B-16P-06 sequence is a mandatory convergence package between P10B-16 and P10B-17; it supplements rather than renumbers the locked P10B-01 through P10B-18 plan. P10B-16P-05B follows accepted P10B-18C and is now Baseline. P10B-18D completed as a rejected-quality diagnostic. P10B-19 PRE is the exact next product task, followed by planned P10B-19A through P10B-19J.</w:t>
+        <w:t>. The remaining Done conditions are implementation gates, not claims about the current repository. The P10B-16P-01 through P10B-16P-05A plus P10B-16P-06 sequence is a mandatory convergence package between P10B-16 and P10B-17; it supplements rather than renumbers the locked P10B-01 through P10B-18 plan. P10B-16P-05B follows accepted P10B-18C and is now Baseline. P10B-18D completed as a rejected-quality diagnostic. P10B-19 PRE is Baseline. P10B-19A is the exact next product task, followed by planned P10B-19B through P10B-19J.</w:t>
       </w:r>
     </w:p>
     <w:p>
@@ -17393,7 +17542,7 @@
         <w:rPr>
           <w:rFonts w:ascii="Calibri" w:hAnsi="Calibri" w:cs="Calibri"/>
         </w:rPr>
-        <w:t>P10B-18C and P10B-16P-05B are Baseline. P10B-18D is a Baseline diagnostic with live commercial quality rejected. P10B-18 and P10B remain Partial. P10B-19 PRE is the exact next task, followed by planned P10B-19A through P10B-19J.</w:t>
+        <w:t>P10B-18C and P10B-16P-05B are Baseline. P10B-18D is a Baseline diagnostic with live commercial quality rejected. P10B-18 and P10B remain Partial. P10B-19 PRE is Baseline. P10B-19A is the exact next task, followed by planned P10B-19B through P10B-19J.</w:t>
       </w:r>
     </w:p>
     <w:p>
@@ -19466,7 +19615,21 @@
         <w:rPr>
           <w:rFonts w:ascii="Calibri" w:hAnsi="Calibri" w:cs="Calibri"/>
         </w:rPr>
-        <w:t xml:space="preserve"> is the exact next task; P10B-19A through P10B-19J remain Planned.</w:t>
+        <w:t xml:space="preserve"> is Baseline. </w:t>
+      </w:r>
+      <w:r>
+        <w:rPr>
+          <w:rFonts w:ascii="Consolas" w:hAnsi="Consolas" w:cs="Consolas"/>
+          <w:sz w:val="19"/>
+          <w:szCs w:val="19"/>
+        </w:rPr>
+        <w:t>P10B-19A - Structural Storefront Family Contract</w:t>
+      </w:r>
+      <w:r>
+        <w:rPr>
+          <w:rFonts w:ascii="Calibri" w:hAnsi="Calibri" w:cs="Calibri"/>
+        </w:rPr>
+        <w:t xml:space="preserve"> is the exact next task; P10B-19B through P10B-19J remain Planned.</w:t>
       </w:r>
     </w:p>
     <w:p>
@@ -23461,7 +23624,385 @@
         <w:rPr>
           <w:rFonts w:ascii="Calibri" w:hAnsi="Calibri" w:cs="Calibri"/>
         </w:rPr>
-        <w:t xml:space="preserve"> with zero primary FAIL. P10B-16P-05B subsequently removed the one-time capture platform while retaining the bounded quality gate. P10B-18D subsequently completed as a rejected-quality diagnostic; P10B-19 PRE is the exact next task.</w:t>
+        <w:t xml:space="preserve"> with zero primary FAIL. P10B-16P-05B subsequently removed the one-time capture platform while retaining the bounded quality gate. P10B-18D subsequently completed as a rejected-quality diagnostic. P10B-19 PRE is Baseline, and P10B-19A is the exact next task.</w:t>
+      </w:r>
+    </w:p>
+    <w:p>
+      <w:pPr>
+        <w:pStyle w:val="Heading1"/>
+        <w:keepNext/>
+        <w:widowControl/>
+      </w:pPr>
+      <w:r>
+        <w:rPr>
+          <w:rFonts w:ascii="Calibri" w:hAnsi="Calibri" w:cs="Calibri"/>
+        </w:rPr>
+        <w:t>P10B-19 accepted architecture delivery state</w:t>
+      </w:r>
+    </w:p>
+    <w:tbl>
+      <w:tblPr>
+        <w:tblW w:w="12960" w:type="dxa"/>
+        <w:tblInd w:w="0" w:type="dxa"/>
+        <w:tblLayout w:type="fixed"/>
+        <w:tblCellMar>
+          <w:top w:w="80" w:type="dxa"/>
+          <w:left w:w="120" w:type="dxa"/>
+          <w:bottom w:w="80" w:type="dxa"/>
+          <w:right w:w="120" w:type="dxa"/>
+        </w:tblCellMar>
+        <w:tblBorders>
+          <w:top w:val="single" w:sz="4" w:color="B8C4D2"/>
+          <w:left w:val="single" w:sz="4" w:color="B8C4D2"/>
+          <w:bottom w:val="single" w:sz="4" w:color="B8C4D2"/>
+          <w:right w:val="single" w:sz="4" w:color="B8C4D2"/>
+          <w:insideH w:val="single" w:sz="4" w:color="D8E0E8"/>
+          <w:insideV w:val="single" w:sz="4" w:color="D8E0E8"/>
+        </w:tblBorders>
+      </w:tblPr>
+      <w:tblGrid>
+        <w:gridCol w:w="1000"/>
+        <w:gridCol w:w="1500"/>
+        <w:gridCol w:w="2000"/>
+        <w:gridCol w:w="8460"/>
+      </w:tblGrid>
+      <w:tr>
+        <w:trPr>
+          <w:tblHeader/>
+          <w:cantSplit/>
+        </w:trPr>
+        <w:tc>
+          <w:tcPr>
+            <w:tcW w:w="1000" w:type="dxa"/>
+            <w:vAlign w:val="center"/>
+            <w:shd w:val="clear" w:fill="E8EEF5"/>
+          </w:tcPr>
+          <w:p>
+            <w:pPr>
+              <w:pStyle w:val="TableHeader"/>
+              <w:jc w:val="center"/>
+              <w:widowControl/>
+            </w:pPr>
+            <w:r>
+              <w:rPr>
+                <w:rFonts w:ascii="Calibri" w:hAnsi="Calibri" w:cs="Calibri"/>
+              </w:rPr>
+              <w:t>Status</w:t>
+            </w:r>
+          </w:p>
+        </w:tc>
+        <w:tc>
+          <w:tcPr>
+            <w:tcW w:w="1500" w:type="dxa"/>
+            <w:vAlign w:val="center"/>
+            <w:shd w:val="clear" w:fill="E8EEF5"/>
+          </w:tcPr>
+          <w:p>
+            <w:pPr>
+              <w:pStyle w:val="TableHeader"/>
+              <w:jc w:val="center"/>
+              <w:widowControl/>
+            </w:pPr>
+            <w:r>
+              <w:rPr>
+                <w:rFonts w:ascii="Calibri" w:hAnsi="Calibri" w:cs="Calibri"/>
+              </w:rPr>
+              <w:t>Task</w:t>
+            </w:r>
+          </w:p>
+        </w:tc>
+        <w:tc>
+          <w:tcPr>
+            <w:tcW w:w="2000" w:type="dxa"/>
+            <w:vAlign w:val="center"/>
+            <w:shd w:val="clear" w:fill="E8EEF5"/>
+          </w:tcPr>
+          <w:p>
+            <w:pPr>
+              <w:pStyle w:val="TableHeader"/>
+              <w:jc w:val="center"/>
+              <w:widowControl/>
+            </w:pPr>
+            <w:r>
+              <w:rPr>
+                <w:rFonts w:ascii="Calibri" w:hAnsi="Calibri" w:cs="Calibri"/>
+              </w:rPr>
+              <w:t>State</w:t>
+            </w:r>
+          </w:p>
+        </w:tc>
+        <w:tc>
+          <w:tcPr>
+            <w:tcW w:w="8460" w:type="dxa"/>
+            <w:vAlign w:val="center"/>
+            <w:shd w:val="clear" w:fill="E8EEF5"/>
+          </w:tcPr>
+          <w:p>
+            <w:pPr>
+              <w:pStyle w:val="TableHeader"/>
+              <w:jc w:val="center"/>
+              <w:widowControl/>
+            </w:pPr>
+            <w:r>
+              <w:rPr>
+                <w:rFonts w:ascii="Calibri" w:hAnsi="Calibri" w:cs="Calibri"/>
+              </w:rPr>
+              <w:t>Evidence / next boundary</w:t>
+            </w:r>
+          </w:p>
+        </w:tc>
+      </w:tr>
+      <w:tr>
+        <w:trPr/>
+        <w:tc>
+          <w:tcPr>
+            <w:tcW w:w="1000" w:type="dxa"/>
+            <w:vAlign w:val="center"/>
+          </w:tcPr>
+          <w:p>
+            <w:pPr>
+              <w:pStyle w:val="TableText"/>
+              <w:jc w:val="center"/>
+              <w:widowControl/>
+            </w:pPr>
+            <w:r>
+              <w:rPr>
+                <w:rFonts w:ascii="Calibri" w:hAnsi="Calibri" w:cs="Calibri"/>
+              </w:rPr>
+              <w:t>Complete</w:t>
+            </w:r>
+          </w:p>
+        </w:tc>
+        <w:tc>
+          <w:tcPr>
+            <w:tcW w:w="1500" w:type="dxa"/>
+            <w:vAlign w:val="center"/>
+          </w:tcPr>
+          <w:p>
+            <w:pPr>
+              <w:pStyle w:val="TableText"/>
+              <w:widowControl/>
+            </w:pPr>
+            <w:r>
+              <w:rPr>
+                <w:rFonts w:ascii="Calibri" w:hAnsi="Calibri" w:cs="Calibri"/>
+              </w:rPr>
+              <w:t>P10B-19 PRE</w:t>
+            </w:r>
+          </w:p>
+        </w:tc>
+        <w:tc>
+          <w:tcPr>
+            <w:tcW w:w="2000" w:type="dxa"/>
+            <w:vAlign w:val="center"/>
+          </w:tcPr>
+          <w:p>
+            <w:pPr>
+              <w:pStyle w:val="TableText"/>
+              <w:widowControl/>
+            </w:pPr>
+            <w:r>
+              <w:rPr>
+                <w:rFonts w:ascii="Calibri" w:hAnsi="Calibri" w:cs="Calibri"/>
+                <w:b/>
+                <w:bCs/>
+              </w:rPr>
+              <w:t>Baseline</w:t>
+            </w:r>
+          </w:p>
+        </w:tc>
+        <w:tc>
+          <w:tcPr>
+            <w:tcW w:w="8460" w:type="dxa"/>
+            <w:vAlign w:val="center"/>
+          </w:tcPr>
+          <w:p>
+            <w:pPr>
+              <w:pStyle w:val="TableText"/>
+              <w:widowControl/>
+            </w:pPr>
+            <w:r>
+              <w:rPr>
+                <w:rFonts w:ascii="Calibri" w:hAnsi="Calibri" w:cs="Calibri"/>
+              </w:rPr>
+              <w:t>Product owner accepted the structural design intelligence architecture; no production implementation was included</w:t>
+            </w:r>
+          </w:p>
+        </w:tc>
+      </w:tr>
+      <w:tr>
+        <w:trPr/>
+        <w:tc>
+          <w:tcPr>
+            <w:tcW w:w="1000" w:type="dxa"/>
+            <w:vAlign w:val="center"/>
+          </w:tcPr>
+          <w:p>
+            <w:pPr>
+              <w:pStyle w:val="TableText"/>
+              <w:jc w:val="center"/>
+              <w:widowControl/>
+            </w:pPr>
+            <w:r>
+              <w:rPr>
+                <w:rFonts w:ascii="Calibri" w:hAnsi="Calibri" w:cs="Calibri"/>
+              </w:rPr>
+              <w:t>Next</w:t>
+            </w:r>
+          </w:p>
+        </w:tc>
+        <w:tc>
+          <w:tcPr>
+            <w:tcW w:w="1500" w:type="dxa"/>
+            <w:vAlign w:val="center"/>
+          </w:tcPr>
+          <w:p>
+            <w:pPr>
+              <w:pStyle w:val="TableText"/>
+              <w:widowControl/>
+            </w:pPr>
+            <w:r>
+              <w:rPr>
+                <w:rFonts w:ascii="Calibri" w:hAnsi="Calibri" w:cs="Calibri"/>
+              </w:rPr>
+              <w:t>P10B-19A</w:t>
+            </w:r>
+          </w:p>
+        </w:tc>
+        <w:tc>
+          <w:tcPr>
+            <w:tcW w:w="2000" w:type="dxa"/>
+            <w:vAlign w:val="center"/>
+          </w:tcPr>
+          <w:p>
+            <w:pPr>
+              <w:pStyle w:val="TableText"/>
+              <w:widowControl/>
+            </w:pPr>
+            <w:r>
+              <w:rPr>
+                <w:rFonts w:ascii="Calibri" w:hAnsi="Calibri" w:cs="Calibri"/>
+                <w:b/>
+                <w:bCs/>
+              </w:rPr>
+              <w:t>Planned / exact next</w:t>
+            </w:r>
+          </w:p>
+        </w:tc>
+        <w:tc>
+          <w:tcPr>
+            <w:tcW w:w="8460" w:type="dxa"/>
+            <w:vAlign w:val="center"/>
+          </w:tcPr>
+          <w:p>
+            <w:pPr>
+              <w:pStyle w:val="TableText"/>
+              <w:widowControl/>
+            </w:pPr>
+            <w:r>
+              <w:rPr>
+                <w:rFonts w:ascii="Calibri" w:hAnsi="Calibri" w:cs="Calibri"/>
+              </w:rPr>
+              <w:t>Structural Storefront Family and PageBlueprint v2 contracts, registry, topology identity, deterministic selection, and v1 compatibility</w:t>
+            </w:r>
+          </w:p>
+        </w:tc>
+      </w:tr>
+      <w:tr>
+        <w:trPr/>
+        <w:tc>
+          <w:tcPr>
+            <w:tcW w:w="1000" w:type="dxa"/>
+            <w:vAlign w:val="center"/>
+          </w:tcPr>
+          <w:p>
+            <w:pPr>
+              <w:pStyle w:val="TableText"/>
+              <w:jc w:val="center"/>
+              <w:widowControl/>
+            </w:pPr>
+            <w:r>
+              <w:rPr>
+                <w:rFonts w:ascii="Calibri" w:hAnsi="Calibri" w:cs="Calibri"/>
+              </w:rPr>
+              <w:t>Planned</w:t>
+            </w:r>
+          </w:p>
+        </w:tc>
+        <w:tc>
+          <w:tcPr>
+            <w:tcW w:w="1500" w:type="dxa"/>
+            <w:vAlign w:val="center"/>
+          </w:tcPr>
+          <w:p>
+            <w:pPr>
+              <w:pStyle w:val="TableText"/>
+              <w:widowControl/>
+            </w:pPr>
+            <w:r>
+              <w:rPr>
+                <w:rFonts w:ascii="Calibri" w:hAnsi="Calibri" w:cs="Calibri"/>
+              </w:rPr>
+              <w:t>P10B-19B through P10B-19J</w:t>
+            </w:r>
+          </w:p>
+        </w:tc>
+        <w:tc>
+          <w:tcPr>
+            <w:tcW w:w="2000" w:type="dxa"/>
+            <w:vAlign w:val="center"/>
+          </w:tcPr>
+          <w:p>
+            <w:pPr>
+              <w:pStyle w:val="TableText"/>
+              <w:widowControl/>
+            </w:pPr>
+            <w:r>
+              <w:rPr>
+                <w:rFonts w:ascii="Calibri" w:hAnsi="Calibri" w:cs="Calibri"/>
+                <w:b/>
+                <w:bCs/>
+              </w:rPr>
+              <w:t>Planned</w:t>
+            </w:r>
+          </w:p>
+        </w:tc>
+        <w:tc>
+          <w:tcPr>
+            <w:tcW w:w="8460" w:type="dxa"/>
+            <w:vAlign w:val="center"/>
+          </w:tcPr>
+          <w:p>
+            <w:pPr>
+              <w:pStyle w:val="TableText"/>
+              <w:widowControl/>
+            </w:pPr>
+            <w:r>
+              <w:rPr>
+                <w:rFonts w:ascii="Calibri" w:hAnsi="Calibri" w:cs="Calibri"/>
+              </w:rPr>
+              <w:t>Granular Visual Recipe, frame, homepage, discovery, PDP, content/utility, multi-concept, critic, and final live-acceptance packages</w:t>
+            </w:r>
+          </w:p>
+        </w:tc>
+      </w:tr>
+    </w:tbl>
+    <w:p>
+      <w:pPr>
+        <w:pStyle w:val="Normal"/>
+        <w:widowControl/>
+      </w:pPr>
+    </w:p>
+    <w:p>
+      <w:pPr>
+        <w:pStyle w:val="Normal"/>
+        <w:widowControl/>
+      </w:pPr>
+      <w:r>
+        <w:rPr>
+          <w:rFonts w:ascii="Calibri" w:hAnsi="Calibri" w:cs="Calibri"/>
+        </w:rPr>
+        <w:t>The accepted parent plan contains 73 bounded child tasks. Each meaningful visual family requires a focused product-owner screenshot checkpoint before merge. P10B remains Partial.</w:t>
       </w:r>
     </w:p>
     <w:sectPr>

</xml_diff>

<commit_message>
docs: establish sprint verification protocol
</commit_message>
<xml_diff>
--- a/docs/VESKIFY_DEVELOPMENT_DELIVERY_TRACKER_v1.3.0.docx
+++ b/docs/VESKIFY_DEVELOPMENT_DELIVERY_TRACKER_v1.3.0.docx
@@ -499,6 +499,148 @@
           <w:rFonts w:ascii="Calibri" w:hAnsi="Calibri" w:cs="Calibri"/>
         </w:rPr>
         <w:t>Overall phase checklist</w:t>
+      </w:r>
+    </w:p>
+    <w:p>
+      <w:pPr>
+        <w:pStyle w:val="Normal"/>
+        <w:numPr>
+          <w:ilvl w:val="0"/>
+          <w:numId w:val="1"/>
+        </w:numPr>
+        <w:widowControl/>
+      </w:pPr>
+      <w:r>
+        <w:rPr>
+          <w:rFonts w:ascii="Calibri" w:hAnsi="Calibri" w:cs="Calibri"/>
+        </w:rPr>
+        <w:t>[ ] DEVX-01 - Contract-driven development and CI execution enablement</w:t>
+      </w:r>
+    </w:p>
+    <w:p>
+      <w:pPr>
+        <w:pStyle w:val="Normal"/>
+        <w:numPr>
+          <w:ilvl w:val="0"/>
+          <w:numId w:val="1"/>
+        </w:numPr>
+        <w:widowControl/>
+      </w:pPr>
+      <w:r>
+        <w:rPr>
+          <w:rFonts w:ascii="Calibri" w:hAnsi="Calibri" w:cs="Calibri"/>
+        </w:rPr>
+        <w:t>[x] DEVX-01A - Sprint contract and independent verification protocol</w:t>
+      </w:r>
+    </w:p>
+    <w:p>
+      <w:pPr>
+        <w:pStyle w:val="Normal"/>
+        <w:numPr>
+          <w:ilvl w:val="0"/>
+          <w:numId w:val="1"/>
+        </w:numPr>
+        <w:widowControl/>
+      </w:pPr>
+      <w:r>
+        <w:rPr>
+          <w:rFonts w:ascii="Calibri" w:hAnsi="Calibri" w:cs="Calibri"/>
+        </w:rPr>
+        <w:t>[ ] DEVX-01B - Mechanical contract and verifier-verdict enforcement (</w:t>
+      </w:r>
+      <w:r>
+        <w:rPr>
+          <w:rFonts w:ascii="Calibri" w:hAnsi="Calibri" w:cs="Calibri"/>
+          <w:b/>
+          <w:bCs/>
+        </w:rPr>
+        <w:t>exact next engineering task</w:t>
+      </w:r>
+      <w:r>
+        <w:rPr>
+          <w:rFonts w:ascii="Calibri" w:hAnsi="Calibri" w:cs="Calibri"/>
+        </w:rPr>
+        <w:t>)</w:t>
+      </w:r>
+    </w:p>
+    <w:p>
+      <w:pPr>
+        <w:pStyle w:val="Normal"/>
+        <w:numPr>
+          <w:ilvl w:val="0"/>
+          <w:numId w:val="1"/>
+        </w:numPr>
+        <w:widowControl/>
+      </w:pPr>
+      <w:r>
+        <w:rPr>
+          <w:rFonts w:ascii="Calibri" w:hAnsi="Calibri" w:cs="Calibri"/>
+        </w:rPr>
+        <w:t>[ ] DEVX-01C - CI timings, obsolete-run cancellation and Next build caching</w:t>
+      </w:r>
+    </w:p>
+    <w:p>
+      <w:pPr>
+        <w:pStyle w:val="Normal"/>
+        <w:numPr>
+          <w:ilvl w:val="0"/>
+          <w:numId w:val="1"/>
+        </w:numPr>
+        <w:widowControl/>
+      </w:pPr>
+      <w:r>
+        <w:rPr>
+          <w:rFonts w:ascii="Calibri" w:hAnsi="Calibri" w:cs="Calibri"/>
+        </w:rPr>
+        <w:t>[ ] DEVX-01D - Parallel static, Vitest and production-build jobs</w:t>
+      </w:r>
+    </w:p>
+    <w:p>
+      <w:pPr>
+        <w:pStyle w:val="Normal"/>
+        <w:numPr>
+          <w:ilvl w:val="0"/>
+          <w:numId w:val="1"/>
+        </w:numPr>
+        <w:widowControl/>
+      </w:pPr>
+      <w:r>
+        <w:rPr>
+          <w:rFonts w:ascii="Calibri" w:hAnsi="Calibri" w:cs="Calibri"/>
+        </w:rPr>
+        <w:t>[ ] DEVX-01E - Playwright timing inventory and balanced execution groups</w:t>
+      </w:r>
+    </w:p>
+    <w:p>
+      <w:pPr>
+        <w:pStyle w:val="Normal"/>
+        <w:numPr>
+          <w:ilvl w:val="0"/>
+          <w:numId w:val="1"/>
+        </w:numPr>
+        <w:widowControl/>
+      </w:pPr>
+      <w:r>
+        <w:rPr>
+          <w:rFonts w:ascii="Calibri" w:hAnsi="Calibri" w:cs="Calibri"/>
+        </w:rPr>
+        <w:t>[ ] DEVX-01F - Playwright sharding/matrix, merged reports and stable required aggregator</w:t>
+      </w:r>
+    </w:p>
+    <w:p>
+      <w:pPr>
+        <w:pStyle w:val="Normal"/>
+        <w:numPr>
+          <w:ilvl w:val="0"/>
+          <w:numId w:val="1"/>
+        </w:numPr>
+        <w:widowControl/>
+      </w:pPr>
+      <w:r>
+        <w:rPr>
+          <w:rFonts w:ascii="Calibri" w:hAnsi="Calibri" w:cs="Calibri"/>
+        </w:rPr>
+        <w:t>[ ] DEVX-01G - Two-run performance acceptance and workflow closure</w:t>
       </w:r>
     </w:p>
     <w:tbl>
@@ -11059,6 +11201,1695 @@
           <w:rFonts w:ascii="Calibri" w:hAnsi="Calibri" w:cs="Calibri"/>
         </w:rPr>
         <w:t>Task definitions</w:t>
+      </w:r>
+    </w:p>
+    <w:p>
+      <w:pPr>
+        <w:pStyle w:val="Heading2"/>
+        <w:keepNext/>
+        <w:widowControl/>
+      </w:pPr>
+      <w:r>
+        <w:rPr>
+          <w:rFonts w:ascii="Calibri" w:hAnsi="Calibri" w:cs="Calibri"/>
+        </w:rPr>
+        <w:t>DEVX-01 - Contract-driven development and CI execution enablement</w:t>
+      </w:r>
+    </w:p>
+    <w:p>
+      <w:pPr>
+        <w:pStyle w:val="Normal"/>
+        <w:widowControl/>
+      </w:pPr>
+      <w:r>
+        <w:rPr>
+          <w:rFonts w:ascii="Calibri" w:hAnsi="Calibri" w:cs="Calibri"/>
+        </w:rPr>
+        <w:t>DEVX-01 establishes bounded independently verified delivery before changing CI execution. It does not alter storefront, generation, commerce, media, persistence, Puck or merchant-visible behavior.</w:t>
+      </w:r>
+    </w:p>
+    <w:tbl>
+      <w:tblPr>
+        <w:tblW w:w="12960" w:type="dxa"/>
+        <w:tblInd w:w="0" w:type="dxa"/>
+        <w:tblLayout w:type="fixed"/>
+        <w:tblCellMar>
+          <w:top w:w="80" w:type="dxa"/>
+          <w:left w:w="120" w:type="dxa"/>
+          <w:bottom w:w="80" w:type="dxa"/>
+          <w:right w:w="120" w:type="dxa"/>
+        </w:tblCellMar>
+        <w:tblBorders>
+          <w:top w:val="single" w:sz="4" w:color="B8C4D2"/>
+          <w:left w:val="single" w:sz="4" w:color="B8C4D2"/>
+          <w:bottom w:val="single" w:sz="4" w:color="B8C4D2"/>
+          <w:right w:val="single" w:sz="4" w:color="B8C4D2"/>
+          <w:insideH w:val="single" w:sz="4" w:color="D8E0E8"/>
+          <w:insideV w:val="single" w:sz="4" w:color="D8E0E8"/>
+        </w:tblBorders>
+      </w:tblPr>
+      <w:tblGrid>
+        <w:gridCol w:w="2160"/>
+        <w:gridCol w:w="2160"/>
+        <w:gridCol w:w="2160"/>
+        <w:gridCol w:w="2160"/>
+        <w:gridCol w:w="2160"/>
+        <w:gridCol w:w="2160"/>
+      </w:tblGrid>
+      <w:tr>
+        <w:trPr>
+          <w:tblHeader/>
+          <w:cantSplit/>
+        </w:trPr>
+        <w:tc>
+          <w:tcPr>
+            <w:tcW w:w="2160" w:type="dxa"/>
+            <w:vAlign w:val="center"/>
+            <w:shd w:val="clear" w:fill="E8EEF5"/>
+          </w:tcPr>
+          <w:p>
+            <w:pPr>
+              <w:pStyle w:val="TableHeader"/>
+              <w:jc w:val="center"/>
+              <w:widowControl/>
+            </w:pPr>
+            <w:r>
+              <w:rPr>
+                <w:rFonts w:ascii="Calibri" w:hAnsi="Calibri" w:cs="Calibri"/>
+              </w:rPr>
+              <w:t>Task</w:t>
+            </w:r>
+          </w:p>
+        </w:tc>
+        <w:tc>
+          <w:tcPr>
+            <w:tcW w:w="2160" w:type="dxa"/>
+            <w:vAlign w:val="center"/>
+            <w:shd w:val="clear" w:fill="E8EEF5"/>
+          </w:tcPr>
+          <w:p>
+            <w:pPr>
+              <w:pStyle w:val="TableHeader"/>
+              <w:jc w:val="center"/>
+              <w:widowControl/>
+            </w:pPr>
+            <w:r>
+              <w:rPr>
+                <w:rFonts w:ascii="Calibri" w:hAnsi="Calibri" w:cs="Calibri"/>
+              </w:rPr>
+              <w:t>Outcome</w:t>
+            </w:r>
+          </w:p>
+        </w:tc>
+        <w:tc>
+          <w:tcPr>
+            <w:tcW w:w="2160" w:type="dxa"/>
+            <w:vAlign w:val="center"/>
+            <w:shd w:val="clear" w:fill="E8EEF5"/>
+          </w:tcPr>
+          <w:p>
+            <w:pPr>
+              <w:pStyle w:val="TableHeader"/>
+              <w:jc w:val="center"/>
+              <w:widowControl/>
+            </w:pPr>
+            <w:r>
+              <w:rPr>
+                <w:rFonts w:ascii="Calibri" w:hAnsi="Calibri" w:cs="Calibri"/>
+              </w:rPr>
+              <w:t>Status</w:t>
+            </w:r>
+          </w:p>
+        </w:tc>
+        <w:tc>
+          <w:tcPr>
+            <w:tcW w:w="2160" w:type="dxa"/>
+            <w:vAlign w:val="center"/>
+            <w:shd w:val="clear" w:fill="E8EEF5"/>
+          </w:tcPr>
+          <w:p>
+            <w:pPr>
+              <w:pStyle w:val="TableHeader"/>
+              <w:jc w:val="center"/>
+              <w:widowControl/>
+            </w:pPr>
+            <w:r>
+              <w:rPr>
+                <w:rFonts w:ascii="Calibri" w:hAnsi="Calibri" w:cs="Calibri"/>
+              </w:rPr>
+              <w:t>Dependency</w:t>
+            </w:r>
+          </w:p>
+        </w:tc>
+        <w:tc>
+          <w:tcPr>
+            <w:tcW w:w="2160" w:type="dxa"/>
+            <w:vAlign w:val="center"/>
+            <w:shd w:val="clear" w:fill="E8EEF5"/>
+          </w:tcPr>
+          <w:p>
+            <w:pPr>
+              <w:pStyle w:val="TableHeader"/>
+              <w:jc w:val="center"/>
+              <w:widowControl/>
+            </w:pPr>
+            <w:r>
+              <w:rPr>
+                <w:rFonts w:ascii="Calibri" w:hAnsi="Calibri" w:cs="Calibri"/>
+              </w:rPr>
+              <w:t>Evidence</w:t>
+            </w:r>
+          </w:p>
+        </w:tc>
+        <w:tc>
+          <w:tcPr>
+            <w:tcW w:w="2160" w:type="dxa"/>
+            <w:vAlign w:val="center"/>
+            <w:shd w:val="clear" w:fill="E8EEF5"/>
+          </w:tcPr>
+          <w:p>
+            <w:pPr>
+              <w:pStyle w:val="TableHeader"/>
+              <w:jc w:val="center"/>
+              <w:widowControl/>
+            </w:pPr>
+            <w:r>
+              <w:rPr>
+                <w:rFonts w:ascii="Calibri" w:hAnsi="Calibri" w:cs="Calibri"/>
+              </w:rPr>
+              <w:t>Non-goal</w:t>
+            </w:r>
+          </w:p>
+        </w:tc>
+      </w:tr>
+      <w:tr>
+        <w:trPr/>
+        <w:tc>
+          <w:tcPr>
+            <w:tcW w:w="2160" w:type="dxa"/>
+            <w:vAlign w:val="center"/>
+          </w:tcPr>
+          <w:p>
+            <w:pPr>
+              <w:pStyle w:val="TableText"/>
+              <w:widowControl/>
+            </w:pPr>
+            <w:r>
+              <w:rPr>
+                <w:rFonts w:ascii="Calibri" w:hAnsi="Calibri" w:cs="Calibri"/>
+              </w:rPr>
+              <w:t>DEVX-01A - Sprint contract and independent verification protocol</w:t>
+            </w:r>
+          </w:p>
+        </w:tc>
+        <w:tc>
+          <w:tcPr>
+            <w:tcW w:w="2160" w:type="dxa"/>
+            <w:vAlign w:val="center"/>
+          </w:tcPr>
+          <w:p>
+            <w:pPr>
+              <w:pStyle w:val="TableText"/>
+              <w:widowControl/>
+            </w:pPr>
+            <w:r>
+              <w:rPr>
+                <w:rFonts w:ascii="Calibri" w:hAnsi="Calibri" w:cs="Calibri"/>
+              </w:rPr>
+              <w:t>Establish immutable child-task and verdict schemas, exact roles, architecture-quality decisions, PR budgets, rolling waves and a pre-PR independent verifier</w:t>
+            </w:r>
+          </w:p>
+        </w:tc>
+        <w:tc>
+          <w:tcPr>
+            <w:tcW w:w="2160" w:type="dxa"/>
+            <w:vAlign w:val="center"/>
+          </w:tcPr>
+          <w:p>
+            <w:pPr>
+              <w:pStyle w:val="TableText"/>
+              <w:jc w:val="center"/>
+              <w:widowControl/>
+            </w:pPr>
+            <w:r>
+              <w:rPr>
+                <w:rFonts w:ascii="Calibri" w:hAnsi="Calibri" w:cs="Calibri"/>
+                <w:b/>
+                <w:bCs/>
+              </w:rPr>
+              <w:t>Baseline</w:t>
+            </w:r>
+          </w:p>
+        </w:tc>
+        <w:tc>
+          <w:tcPr>
+            <w:tcW w:w="2160" w:type="dxa"/>
+            <w:vAlign w:val="center"/>
+          </w:tcPr>
+          <w:p>
+            <w:pPr>
+              <w:pStyle w:val="TableText"/>
+              <w:widowControl/>
+            </w:pPr>
+            <w:r>
+              <w:rPr>
+                <w:rFonts w:ascii="Calibri" w:hAnsi="Calibri" w:cs="Calibri"/>
+              </w:rPr>
+              <w:t>Accepted P10B-19 PRE</w:t>
+            </w:r>
+          </w:p>
+        </w:tc>
+        <w:tc>
+          <w:tcPr>
+            <w:tcW w:w="2160" w:type="dxa"/>
+            <w:vAlign w:val="center"/>
+          </w:tcPr>
+          <w:p>
+            <w:pPr>
+              <w:pStyle w:val="TableText"/>
+              <w:widowControl/>
+            </w:pPr>
+            <w:r>
+              <w:rPr>
+                <w:rFonts w:ascii="Calibri" w:hAnsi="Calibri" w:cs="Calibri"/>
+              </w:rPr>
+              <w:t>JSON schema/template consistency, docs/tooling checks and independent verifier PASS</w:t>
+            </w:r>
+          </w:p>
+        </w:tc>
+        <w:tc>
+          <w:tcPr>
+            <w:tcW w:w="2160" w:type="dxa"/>
+            <w:vAlign w:val="center"/>
+          </w:tcPr>
+          <w:p>
+            <w:pPr>
+              <w:pStyle w:val="TableText"/>
+              <w:widowControl/>
+            </w:pPr>
+            <w:r>
+              <w:rPr>
+                <w:rFonts w:ascii="Calibri" w:hAnsi="Calibri" w:cs="Calibri"/>
+              </w:rPr>
+              <w:t>Executable verifier or CI changes</w:t>
+            </w:r>
+          </w:p>
+        </w:tc>
+      </w:tr>
+      <w:tr>
+        <w:trPr/>
+        <w:tc>
+          <w:tcPr>
+            <w:tcW w:w="2160" w:type="dxa"/>
+            <w:vAlign w:val="center"/>
+          </w:tcPr>
+          <w:p>
+            <w:pPr>
+              <w:pStyle w:val="TableText"/>
+              <w:widowControl/>
+            </w:pPr>
+            <w:r>
+              <w:rPr>
+                <w:rFonts w:ascii="Calibri" w:hAnsi="Calibri" w:cs="Calibri"/>
+              </w:rPr>
+              <w:t>DEVX-01B - Mechanical contract and verifier-verdict enforcement</w:t>
+            </w:r>
+          </w:p>
+        </w:tc>
+        <w:tc>
+          <w:tcPr>
+            <w:tcW w:w="2160" w:type="dxa"/>
+            <w:vAlign w:val="center"/>
+          </w:tcPr>
+          <w:p>
+            <w:pPr>
+              <w:pStyle w:val="TableText"/>
+              <w:widowControl/>
+            </w:pPr>
+            <w:r>
+              <w:rPr>
+                <w:rFonts w:ascii="Calibri" w:hAnsi="Calibri" w:cs="Calibri"/>
+              </w:rPr>
+              <w:t>Enforce identity, paths, budgets, declarations, criterion coverage and terminal verdicts</w:t>
+            </w:r>
+          </w:p>
+        </w:tc>
+        <w:tc>
+          <w:tcPr>
+            <w:tcW w:w="2160" w:type="dxa"/>
+            <w:vAlign w:val="center"/>
+          </w:tcPr>
+          <w:p>
+            <w:pPr>
+              <w:pStyle w:val="TableText"/>
+              <w:jc w:val="center"/>
+              <w:widowControl/>
+            </w:pPr>
+            <w:r>
+              <w:rPr>
+                <w:rFonts w:ascii="Calibri" w:hAnsi="Calibri" w:cs="Calibri"/>
+                <w:b/>
+                <w:bCs/>
+              </w:rPr>
+              <w:t>Planned / exact next engineering</w:t>
+            </w:r>
+          </w:p>
+        </w:tc>
+        <w:tc>
+          <w:tcPr>
+            <w:tcW w:w="2160" w:type="dxa"/>
+            <w:vAlign w:val="center"/>
+          </w:tcPr>
+          <w:p>
+            <w:pPr>
+              <w:pStyle w:val="TableText"/>
+              <w:widowControl/>
+            </w:pPr>
+            <w:r>
+              <w:rPr>
+                <w:rFonts w:ascii="Calibri" w:hAnsi="Calibri" w:cs="Calibri"/>
+              </w:rPr>
+              <w:t>DEVX-01A</w:t>
+            </w:r>
+          </w:p>
+        </w:tc>
+        <w:tc>
+          <w:tcPr>
+            <w:tcW w:w="2160" w:type="dxa"/>
+            <w:vAlign w:val="center"/>
+          </w:tcPr>
+          <w:p>
+            <w:pPr>
+              <w:pStyle w:val="TableText"/>
+              <w:widowControl/>
+            </w:pPr>
+            <w:r>
+              <w:rPr>
+                <w:rFonts w:ascii="Calibri" w:hAnsi="Calibri" w:cs="Calibri"/>
+              </w:rPr>
+              <w:t>Focused positive/fail-closed contract tests</w:t>
+            </w:r>
+          </w:p>
+        </w:tc>
+        <w:tc>
+          <w:tcPr>
+            <w:tcW w:w="2160" w:type="dxa"/>
+            <w:vAlign w:val="center"/>
+          </w:tcPr>
+          <w:p>
+            <w:pPr>
+              <w:pStyle w:val="TableText"/>
+              <w:widowControl/>
+            </w:pPr>
+            <w:r>
+              <w:rPr>
+                <w:rFonts w:ascii="Calibri" w:hAnsi="Calibri" w:cs="Calibri"/>
+              </w:rPr>
+              <w:t>CI parallelization or P10B-19A implementation</w:t>
+            </w:r>
+          </w:p>
+        </w:tc>
+      </w:tr>
+      <w:tr>
+        <w:trPr/>
+        <w:tc>
+          <w:tcPr>
+            <w:tcW w:w="2160" w:type="dxa"/>
+            <w:vAlign w:val="center"/>
+          </w:tcPr>
+          <w:p>
+            <w:pPr>
+              <w:pStyle w:val="TableText"/>
+              <w:widowControl/>
+            </w:pPr>
+            <w:r>
+              <w:rPr>
+                <w:rFonts w:ascii="Calibri" w:hAnsi="Calibri" w:cs="Calibri"/>
+              </w:rPr>
+              <w:t>DEVX-01C - CI timings, obsolete-run cancellation and Next build caching</w:t>
+            </w:r>
+          </w:p>
+        </w:tc>
+        <w:tc>
+          <w:tcPr>
+            <w:tcW w:w="2160" w:type="dxa"/>
+            <w:vAlign w:val="center"/>
+          </w:tcPr>
+          <w:p>
+            <w:pPr>
+              <w:pStyle w:val="TableText"/>
+              <w:widowControl/>
+            </w:pPr>
+            <w:r>
+              <w:rPr>
+                <w:rFonts w:ascii="Calibri" w:hAnsi="Calibri" w:cs="Calibri"/>
+              </w:rPr>
+              <w:t>Record timings and add safe cancellation/cache authority</w:t>
+            </w:r>
+          </w:p>
+        </w:tc>
+        <w:tc>
+          <w:tcPr>
+            <w:tcW w:w="2160" w:type="dxa"/>
+            <w:vAlign w:val="center"/>
+          </w:tcPr>
+          <w:p>
+            <w:pPr>
+              <w:pStyle w:val="TableText"/>
+              <w:jc w:val="center"/>
+              <w:widowControl/>
+            </w:pPr>
+            <w:r>
+              <w:rPr>
+                <w:rFonts w:ascii="Calibri" w:hAnsi="Calibri" w:cs="Calibri"/>
+                <w:b/>
+                <w:bCs/>
+              </w:rPr>
+              <w:t>Planned</w:t>
+            </w:r>
+          </w:p>
+        </w:tc>
+        <w:tc>
+          <w:tcPr>
+            <w:tcW w:w="2160" w:type="dxa"/>
+            <w:vAlign w:val="center"/>
+          </w:tcPr>
+          <w:p>
+            <w:pPr>
+              <w:pStyle w:val="TableText"/>
+              <w:widowControl/>
+            </w:pPr>
+            <w:r>
+              <w:rPr>
+                <w:rFonts w:ascii="Calibri" w:hAnsi="Calibri" w:cs="Calibri"/>
+              </w:rPr>
+              <w:t>DEVX-01B</w:t>
+            </w:r>
+          </w:p>
+        </w:tc>
+        <w:tc>
+          <w:tcPr>
+            <w:tcW w:w="2160" w:type="dxa"/>
+            <w:vAlign w:val="center"/>
+          </w:tcPr>
+          <w:p>
+            <w:pPr>
+              <w:pStyle w:val="TableText"/>
+              <w:widowControl/>
+            </w:pPr>
+            <w:r>
+              <w:rPr>
+                <w:rFonts w:ascii="Calibri" w:hAnsi="Calibri" w:cs="Calibri"/>
+              </w:rPr>
+              <w:t>Two clean timing records and cache/cancellation proof</w:t>
+            </w:r>
+          </w:p>
+        </w:tc>
+        <w:tc>
+          <w:tcPr>
+            <w:tcW w:w="2160" w:type="dxa"/>
+            <w:vAlign w:val="center"/>
+          </w:tcPr>
+          <w:p>
+            <w:pPr>
+              <w:pStyle w:val="TableText"/>
+              <w:widowControl/>
+            </w:pPr>
+            <w:r>
+              <w:rPr>
+                <w:rFonts w:ascii="Calibri" w:hAnsi="Calibri" w:cs="Calibri"/>
+              </w:rPr>
+              <w:t>Job sharding</w:t>
+            </w:r>
+          </w:p>
+        </w:tc>
+      </w:tr>
+      <w:tr>
+        <w:trPr/>
+        <w:tc>
+          <w:tcPr>
+            <w:tcW w:w="2160" w:type="dxa"/>
+            <w:vAlign w:val="center"/>
+          </w:tcPr>
+          <w:p>
+            <w:pPr>
+              <w:pStyle w:val="TableText"/>
+              <w:widowControl/>
+            </w:pPr>
+            <w:r>
+              <w:rPr>
+                <w:rFonts w:ascii="Calibri" w:hAnsi="Calibri" w:cs="Calibri"/>
+              </w:rPr>
+              <w:t>DEVX-01D - Parallel static, Vitest and production-build jobs</w:t>
+            </w:r>
+          </w:p>
+        </w:tc>
+        <w:tc>
+          <w:tcPr>
+            <w:tcW w:w="2160" w:type="dxa"/>
+            <w:vAlign w:val="center"/>
+          </w:tcPr>
+          <w:p>
+            <w:pPr>
+              <w:pStyle w:val="TableText"/>
+              <w:widowControl/>
+            </w:pPr>
+            <w:r>
+              <w:rPr>
+                <w:rFonts w:ascii="Calibri" w:hAnsi="Calibri" w:cs="Calibri"/>
+              </w:rPr>
+              <w:t>Separate independent CI jobs behind stable required authority</w:t>
+            </w:r>
+          </w:p>
+        </w:tc>
+        <w:tc>
+          <w:tcPr>
+            <w:tcW w:w="2160" w:type="dxa"/>
+            <w:vAlign w:val="center"/>
+          </w:tcPr>
+          <w:p>
+            <w:pPr>
+              <w:pStyle w:val="TableText"/>
+              <w:jc w:val="center"/>
+              <w:widowControl/>
+            </w:pPr>
+            <w:r>
+              <w:rPr>
+                <w:rFonts w:ascii="Calibri" w:hAnsi="Calibri" w:cs="Calibri"/>
+                <w:b/>
+                <w:bCs/>
+              </w:rPr>
+              <w:t>Planned</w:t>
+            </w:r>
+          </w:p>
+        </w:tc>
+        <w:tc>
+          <w:tcPr>
+            <w:tcW w:w="2160" w:type="dxa"/>
+            <w:vAlign w:val="center"/>
+          </w:tcPr>
+          <w:p>
+            <w:pPr>
+              <w:pStyle w:val="TableText"/>
+              <w:widowControl/>
+            </w:pPr>
+            <w:r>
+              <w:rPr>
+                <w:rFonts w:ascii="Calibri" w:hAnsi="Calibri" w:cs="Calibri"/>
+              </w:rPr>
+              <w:t>DEVX-01C</w:t>
+            </w:r>
+          </w:p>
+        </w:tc>
+        <w:tc>
+          <w:tcPr>
+            <w:tcW w:w="2160" w:type="dxa"/>
+            <w:vAlign w:val="center"/>
+          </w:tcPr>
+          <w:p>
+            <w:pPr>
+              <w:pStyle w:val="TableText"/>
+              <w:widowControl/>
+            </w:pPr>
+            <w:r>
+              <w:rPr>
+                <w:rFonts w:ascii="Calibri" w:hAnsi="Calibri" w:cs="Calibri"/>
+              </w:rPr>
+              <w:t>Required-status and failure propagation proof</w:t>
+            </w:r>
+          </w:p>
+        </w:tc>
+        <w:tc>
+          <w:tcPr>
+            <w:tcW w:w="2160" w:type="dxa"/>
+            <w:vAlign w:val="center"/>
+          </w:tcPr>
+          <w:p>
+            <w:pPr>
+              <w:pStyle w:val="TableText"/>
+              <w:widowControl/>
+            </w:pPr>
+            <w:r>
+              <w:rPr>
+                <w:rFonts w:ascii="Calibri" w:hAnsi="Calibri" w:cs="Calibri"/>
+              </w:rPr>
+              <w:t>Playwright sharding</w:t>
+            </w:r>
+          </w:p>
+        </w:tc>
+      </w:tr>
+      <w:tr>
+        <w:trPr/>
+        <w:tc>
+          <w:tcPr>
+            <w:tcW w:w="2160" w:type="dxa"/>
+            <w:vAlign w:val="center"/>
+          </w:tcPr>
+          <w:p>
+            <w:pPr>
+              <w:pStyle w:val="TableText"/>
+              <w:widowControl/>
+            </w:pPr>
+            <w:r>
+              <w:rPr>
+                <w:rFonts w:ascii="Calibri" w:hAnsi="Calibri" w:cs="Calibri"/>
+              </w:rPr>
+              <w:t>DEVX-01E - Playwright timing inventory and balanced execution groups</w:t>
+            </w:r>
+          </w:p>
+        </w:tc>
+        <w:tc>
+          <w:tcPr>
+            <w:tcW w:w="2160" w:type="dxa"/>
+            <w:vAlign w:val="center"/>
+          </w:tcPr>
+          <w:p>
+            <w:pPr>
+              <w:pStyle w:val="TableText"/>
+              <w:widowControl/>
+            </w:pPr>
+            <w:r>
+              <w:rPr>
+                <w:rFonts w:ascii="Calibri" w:hAnsi="Calibri" w:cs="Calibri"/>
+              </w:rPr>
+              <w:t>Measure retained browser suites and define balanced groups</w:t>
+            </w:r>
+          </w:p>
+        </w:tc>
+        <w:tc>
+          <w:tcPr>
+            <w:tcW w:w="2160" w:type="dxa"/>
+            <w:vAlign w:val="center"/>
+          </w:tcPr>
+          <w:p>
+            <w:pPr>
+              <w:pStyle w:val="TableText"/>
+              <w:jc w:val="center"/>
+              <w:widowControl/>
+            </w:pPr>
+            <w:r>
+              <w:rPr>
+                <w:rFonts w:ascii="Calibri" w:hAnsi="Calibri" w:cs="Calibri"/>
+                <w:b/>
+                <w:bCs/>
+              </w:rPr>
+              <w:t>Planned</w:t>
+            </w:r>
+          </w:p>
+        </w:tc>
+        <w:tc>
+          <w:tcPr>
+            <w:tcW w:w="2160" w:type="dxa"/>
+            <w:vAlign w:val="center"/>
+          </w:tcPr>
+          <w:p>
+            <w:pPr>
+              <w:pStyle w:val="TableText"/>
+              <w:widowControl/>
+            </w:pPr>
+            <w:r>
+              <w:rPr>
+                <w:rFonts w:ascii="Calibri" w:hAnsi="Calibri" w:cs="Calibri"/>
+              </w:rPr>
+              <w:t>DEVX-01D</w:t>
+            </w:r>
+          </w:p>
+        </w:tc>
+        <w:tc>
+          <w:tcPr>
+            <w:tcW w:w="2160" w:type="dxa"/>
+            <w:vAlign w:val="center"/>
+          </w:tcPr>
+          <w:p>
+            <w:pPr>
+              <w:pStyle w:val="TableText"/>
+              <w:widowControl/>
+            </w:pPr>
+            <w:r>
+              <w:rPr>
+                <w:rFonts w:ascii="Calibri" w:hAnsi="Calibri" w:cs="Calibri"/>
+              </w:rPr>
+              <w:t>Deterministic timing inventory</w:t>
+            </w:r>
+          </w:p>
+        </w:tc>
+        <w:tc>
+          <w:tcPr>
+            <w:tcW w:w="2160" w:type="dxa"/>
+            <w:vAlign w:val="center"/>
+          </w:tcPr>
+          <w:p>
+            <w:pPr>
+              <w:pStyle w:val="TableText"/>
+              <w:widowControl/>
+            </w:pPr>
+            <w:r>
+              <w:rPr>
+                <w:rFonts w:ascii="Calibri" w:hAnsi="Calibri" w:cs="Calibri"/>
+              </w:rPr>
+              <w:t>Matrix execution</w:t>
+            </w:r>
+          </w:p>
+        </w:tc>
+      </w:tr>
+      <w:tr>
+        <w:trPr/>
+        <w:tc>
+          <w:tcPr>
+            <w:tcW w:w="2160" w:type="dxa"/>
+            <w:vAlign w:val="center"/>
+          </w:tcPr>
+          <w:p>
+            <w:pPr>
+              <w:pStyle w:val="TableText"/>
+              <w:widowControl/>
+            </w:pPr>
+            <w:r>
+              <w:rPr>
+                <w:rFonts w:ascii="Calibri" w:hAnsi="Calibri" w:cs="Calibri"/>
+              </w:rPr>
+              <w:t>DEVX-01F - Playwright sharding/matrix, merged reports and stable required aggregator</w:t>
+            </w:r>
+          </w:p>
+        </w:tc>
+        <w:tc>
+          <w:tcPr>
+            <w:tcW w:w="2160" w:type="dxa"/>
+            <w:vAlign w:val="center"/>
+          </w:tcPr>
+          <w:p>
+            <w:pPr>
+              <w:pStyle w:val="TableText"/>
+              <w:widowControl/>
+            </w:pPr>
+            <w:r>
+              <w:rPr>
+                <w:rFonts w:ascii="Calibri" w:hAnsi="Calibri" w:cs="Calibri"/>
+              </w:rPr>
+              <w:t>Run browser groups in parallel with merged evidence and one required result</w:t>
+            </w:r>
+          </w:p>
+        </w:tc>
+        <w:tc>
+          <w:tcPr>
+            <w:tcW w:w="2160" w:type="dxa"/>
+            <w:vAlign w:val="center"/>
+          </w:tcPr>
+          <w:p>
+            <w:pPr>
+              <w:pStyle w:val="TableText"/>
+              <w:jc w:val="center"/>
+              <w:widowControl/>
+            </w:pPr>
+            <w:r>
+              <w:rPr>
+                <w:rFonts w:ascii="Calibri" w:hAnsi="Calibri" w:cs="Calibri"/>
+                <w:b/>
+                <w:bCs/>
+              </w:rPr>
+              <w:t>Planned</w:t>
+            </w:r>
+          </w:p>
+        </w:tc>
+        <w:tc>
+          <w:tcPr>
+            <w:tcW w:w="2160" w:type="dxa"/>
+            <w:vAlign w:val="center"/>
+          </w:tcPr>
+          <w:p>
+            <w:pPr>
+              <w:pStyle w:val="TableText"/>
+              <w:widowControl/>
+            </w:pPr>
+            <w:r>
+              <w:rPr>
+                <w:rFonts w:ascii="Calibri" w:hAnsi="Calibri" w:cs="Calibri"/>
+              </w:rPr>
+              <w:t>DEVX-01E</w:t>
+            </w:r>
+          </w:p>
+        </w:tc>
+        <w:tc>
+          <w:tcPr>
+            <w:tcW w:w="2160" w:type="dxa"/>
+            <w:vAlign w:val="center"/>
+          </w:tcPr>
+          <w:p>
+            <w:pPr>
+              <w:pStyle w:val="TableText"/>
+              <w:widowControl/>
+            </w:pPr>
+            <w:r>
+              <w:rPr>
+                <w:rFonts w:ascii="Calibri" w:hAnsi="Calibri" w:cs="Calibri"/>
+              </w:rPr>
+              <w:t>Shard failure and merged-report regressions</w:t>
+            </w:r>
+          </w:p>
+        </w:tc>
+        <w:tc>
+          <w:tcPr>
+            <w:tcW w:w="2160" w:type="dxa"/>
+            <w:vAlign w:val="center"/>
+          </w:tcPr>
+          <w:p>
+            <w:pPr>
+              <w:pStyle w:val="TableText"/>
+              <w:widowControl/>
+            </w:pPr>
+            <w:r>
+              <w:rPr>
+                <w:rFonts w:ascii="Calibri" w:hAnsi="Calibri" w:cs="Calibri"/>
+              </w:rPr>
+              <w:t>Weakening retained suites</w:t>
+            </w:r>
+          </w:p>
+        </w:tc>
+      </w:tr>
+      <w:tr>
+        <w:trPr/>
+        <w:tc>
+          <w:tcPr>
+            <w:tcW w:w="2160" w:type="dxa"/>
+            <w:vAlign w:val="center"/>
+          </w:tcPr>
+          <w:p>
+            <w:pPr>
+              <w:pStyle w:val="TableText"/>
+              <w:widowControl/>
+            </w:pPr>
+            <w:r>
+              <w:rPr>
+                <w:rFonts w:ascii="Calibri" w:hAnsi="Calibri" w:cs="Calibri"/>
+              </w:rPr>
+              <w:t>DEVX-01G - Two-run performance acceptance and workflow closure</w:t>
+            </w:r>
+          </w:p>
+        </w:tc>
+        <w:tc>
+          <w:tcPr>
+            <w:tcW w:w="2160" w:type="dxa"/>
+            <w:vAlign w:val="center"/>
+          </w:tcPr>
+          <w:p>
+            <w:pPr>
+              <w:pStyle w:val="TableText"/>
+              <w:widowControl/>
+            </w:pPr>
+            <w:r>
+              <w:rPr>
+                <w:rFonts w:ascii="Calibri" w:hAnsi="Calibri" w:cs="Calibri"/>
+              </w:rPr>
+              <w:t>Prove the bounded workflow and CI improvement over two clean runs</w:t>
+            </w:r>
+          </w:p>
+        </w:tc>
+        <w:tc>
+          <w:tcPr>
+            <w:tcW w:w="2160" w:type="dxa"/>
+            <w:vAlign w:val="center"/>
+          </w:tcPr>
+          <w:p>
+            <w:pPr>
+              <w:pStyle w:val="TableText"/>
+              <w:jc w:val="center"/>
+              <w:widowControl/>
+            </w:pPr>
+            <w:r>
+              <w:rPr>
+                <w:rFonts w:ascii="Calibri" w:hAnsi="Calibri" w:cs="Calibri"/>
+                <w:b/>
+                <w:bCs/>
+              </w:rPr>
+              <w:t>Planned</w:t>
+            </w:r>
+          </w:p>
+        </w:tc>
+        <w:tc>
+          <w:tcPr>
+            <w:tcW w:w="2160" w:type="dxa"/>
+            <w:vAlign w:val="center"/>
+          </w:tcPr>
+          <w:p>
+            <w:pPr>
+              <w:pStyle w:val="TableText"/>
+              <w:widowControl/>
+            </w:pPr>
+            <w:r>
+              <w:rPr>
+                <w:rFonts w:ascii="Calibri" w:hAnsi="Calibri" w:cs="Calibri"/>
+              </w:rPr>
+              <w:t>DEVX-01F</w:t>
+            </w:r>
+          </w:p>
+        </w:tc>
+        <w:tc>
+          <w:tcPr>
+            <w:tcW w:w="2160" w:type="dxa"/>
+            <w:vAlign w:val="center"/>
+          </w:tcPr>
+          <w:p>
+            <w:pPr>
+              <w:pStyle w:val="TableText"/>
+              <w:widowControl/>
+            </w:pPr>
+            <w:r>
+              <w:rPr>
+                <w:rFonts w:ascii="Calibri" w:hAnsi="Calibri" w:cs="Calibri"/>
+              </w:rPr>
+              <w:t>Two-run acceptance and closure record</w:t>
+            </w:r>
+          </w:p>
+        </w:tc>
+        <w:tc>
+          <w:tcPr>
+            <w:tcW w:w="2160" w:type="dxa"/>
+            <w:vAlign w:val="center"/>
+          </w:tcPr>
+          <w:p>
+            <w:pPr>
+              <w:pStyle w:val="TableText"/>
+              <w:widowControl/>
+            </w:pPr>
+            <w:r>
+              <w:rPr>
+                <w:rFonts w:ascii="Calibri" w:hAnsi="Calibri" w:cs="Calibri"/>
+              </w:rPr>
+              <w:t>Product behavior change</w:t>
+            </w:r>
+          </w:p>
+        </w:tc>
+      </w:tr>
+    </w:tbl>
+    <w:p>
+      <w:pPr>
+        <w:pStyle w:val="Normal"/>
+        <w:widowControl/>
+      </w:pPr>
+    </w:p>
+    <w:p>
+      <w:pPr>
+        <w:pStyle w:val="Normal"/>
+        <w:widowControl/>
+      </w:pPr>
+      <w:r>
+        <w:rPr>
+          <w:rFonts w:ascii="Calibri" w:hAnsi="Calibri" w:cs="Calibri"/>
+        </w:rPr>
+        <w:t>P10B remains Partial. P10B-19A is the next product-development sprint after DEVX-01.</w:t>
+      </w:r>
+    </w:p>
+    <w:p>
+      <w:pPr>
+        <w:pStyle w:val="Heading3"/>
+        <w:keepNext/>
+        <w:widowControl/>
+      </w:pPr>
+      <w:r>
+        <w:rPr>
+          <w:rFonts w:ascii="Calibri" w:hAnsi="Calibri" w:cs="Calibri"/>
+        </w:rPr>
+        <w:t>P10B-19A planned micro-pull-request map</w:t>
+      </w:r>
+    </w:p>
+    <w:tbl>
+      <w:tblPr>
+        <w:tblW w:w="12960" w:type="dxa"/>
+        <w:tblInd w:w="0" w:type="dxa"/>
+        <w:tblLayout w:type="fixed"/>
+        <w:tblCellMar>
+          <w:top w:w="80" w:type="dxa"/>
+          <w:left w:w="120" w:type="dxa"/>
+          <w:bottom w:w="80" w:type="dxa"/>
+          <w:right w:w="120" w:type="dxa"/>
+        </w:tblCellMar>
+        <w:tblBorders>
+          <w:top w:val="single" w:sz="4" w:color="B8C4D2"/>
+          <w:left w:val="single" w:sz="4" w:color="B8C4D2"/>
+          <w:bottom w:val="single" w:sz="4" w:color="B8C4D2"/>
+          <w:right w:val="single" w:sz="4" w:color="B8C4D2"/>
+          <w:insideH w:val="single" w:sz="4" w:color="D8E0E8"/>
+          <w:insideV w:val="single" w:sz="4" w:color="D8E0E8"/>
+        </w:tblBorders>
+      </w:tblPr>
+      <w:tblGrid>
+        <w:gridCol w:w="3000"/>
+        <w:gridCol w:w="1300"/>
+        <w:gridCol w:w="8660"/>
+      </w:tblGrid>
+      <w:tr>
+        <w:trPr>
+          <w:tblHeader/>
+          <w:cantSplit/>
+        </w:trPr>
+        <w:tc>
+          <w:tcPr>
+            <w:tcW w:w="3000" w:type="dxa"/>
+            <w:vAlign w:val="center"/>
+            <w:shd w:val="clear" w:fill="E8EEF5"/>
+          </w:tcPr>
+          <w:p>
+            <w:pPr>
+              <w:pStyle w:val="TableHeader"/>
+              <w:jc w:val="center"/>
+              <w:widowControl/>
+            </w:pPr>
+            <w:r>
+              <w:rPr>
+                <w:rFonts w:ascii="Calibri" w:hAnsi="Calibri" w:cs="Calibri"/>
+              </w:rPr>
+              <w:t>Order</w:t>
+            </w:r>
+          </w:p>
+        </w:tc>
+        <w:tc>
+          <w:tcPr>
+            <w:tcW w:w="1300" w:type="dxa"/>
+            <w:vAlign w:val="center"/>
+            <w:shd w:val="clear" w:fill="E8EEF5"/>
+          </w:tcPr>
+          <w:p>
+            <w:pPr>
+              <w:pStyle w:val="TableHeader"/>
+              <w:jc w:val="center"/>
+              <w:widowControl/>
+            </w:pPr>
+            <w:r>
+              <w:rPr>
+                <w:rFonts w:ascii="Calibri" w:hAnsi="Calibri" w:cs="Calibri"/>
+              </w:rPr>
+              <w:t>Child task</w:t>
+            </w:r>
+          </w:p>
+        </w:tc>
+        <w:tc>
+          <w:tcPr>
+            <w:tcW w:w="8660" w:type="dxa"/>
+            <w:vAlign w:val="center"/>
+            <w:shd w:val="clear" w:fill="E8EEF5"/>
+          </w:tcPr>
+          <w:p>
+            <w:pPr>
+              <w:pStyle w:val="TableHeader"/>
+              <w:jc w:val="center"/>
+              <w:widowControl/>
+            </w:pPr>
+            <w:r>
+              <w:rPr>
+                <w:rFonts w:ascii="Calibri" w:hAnsi="Calibri" w:cs="Calibri"/>
+              </w:rPr>
+              <w:t>Merge eligibility</w:t>
+            </w:r>
+          </w:p>
+        </w:tc>
+      </w:tr>
+      <w:tr>
+        <w:trPr/>
+        <w:tc>
+          <w:tcPr>
+            <w:tcW w:w="3000" w:type="dxa"/>
+            <w:vAlign w:val="center"/>
+          </w:tcPr>
+          <w:p>
+            <w:pPr>
+              <w:pStyle w:val="TableText"/>
+              <w:widowControl/>
+            </w:pPr>
+            <w:r>
+              <w:rPr>
+                <w:rFonts w:ascii="Calibri" w:hAnsi="Calibri" w:cs="Calibri"/>
+              </w:rPr>
+              <w:t>1</w:t>
+            </w:r>
+          </w:p>
+        </w:tc>
+        <w:tc>
+          <w:tcPr>
+            <w:tcW w:w="1300" w:type="dxa"/>
+            <w:vAlign w:val="center"/>
+          </w:tcPr>
+          <w:p>
+            <w:pPr>
+              <w:pStyle w:val="TableText"/>
+              <w:widowControl/>
+            </w:pPr>
+            <w:r>
+              <w:rPr>
+                <w:rFonts w:ascii="Calibri" w:hAnsi="Calibri" w:cs="Calibri"/>
+              </w:rPr>
+              <w:t>P10B-19A-01 - Structural family identity, versions, lifecycle states and invariants</w:t>
+            </w:r>
+          </w:p>
+        </w:tc>
+        <w:tc>
+          <w:tcPr>
+            <w:tcW w:w="8660" w:type="dxa"/>
+            <w:vAlign w:val="center"/>
+          </w:tcPr>
+          <w:p>
+            <w:pPr>
+              <w:pStyle w:val="TableText"/>
+              <w:widowControl/>
+            </w:pPr>
+            <w:r>
+              <w:rPr>
+                <w:rFonts w:ascii="Calibri" w:hAnsi="Calibri" w:cs="Calibri"/>
+              </w:rPr>
+              <w:t>DEVX-01 closed</w:t>
+            </w:r>
+          </w:p>
+        </w:tc>
+      </w:tr>
+      <w:tr>
+        <w:trPr/>
+        <w:tc>
+          <w:tcPr>
+            <w:tcW w:w="3000" w:type="dxa"/>
+            <w:vAlign w:val="center"/>
+          </w:tcPr>
+          <w:p>
+            <w:pPr>
+              <w:pStyle w:val="TableText"/>
+              <w:widowControl/>
+            </w:pPr>
+            <w:r>
+              <w:rPr>
+                <w:rFonts w:ascii="Calibri" w:hAnsi="Calibri" w:cs="Calibri"/>
+              </w:rPr>
+              <w:t>2</w:t>
+            </w:r>
+          </w:p>
+        </w:tc>
+        <w:tc>
+          <w:tcPr>
+            <w:tcW w:w="1300" w:type="dxa"/>
+            <w:vAlign w:val="center"/>
+          </w:tcPr>
+          <w:p>
+            <w:pPr>
+              <w:pStyle w:val="TableText"/>
+              <w:widowControl/>
+            </w:pPr>
+            <w:r>
+              <w:rPr>
+                <w:rFonts w:ascii="Calibri" w:hAnsi="Calibri" w:cs="Calibri"/>
+              </w:rPr>
+              <w:t>P10B-19A-02 - Cross-page structural relationship contract</w:t>
+            </w:r>
+          </w:p>
+        </w:tc>
+        <w:tc>
+          <w:tcPr>
+            <w:tcW w:w="8660" w:type="dxa"/>
+            <w:vAlign w:val="center"/>
+          </w:tcPr>
+          <w:p>
+            <w:pPr>
+              <w:pStyle w:val="TableText"/>
+              <w:widowControl/>
+            </w:pPr>
+            <w:r>
+              <w:rPr>
+                <w:rFonts w:ascii="Calibri" w:hAnsi="Calibri" w:cs="Calibri"/>
+              </w:rPr>
+              <w:t>A-01 merged</w:t>
+            </w:r>
+          </w:p>
+        </w:tc>
+      </w:tr>
+      <w:tr>
+        <w:trPr/>
+        <w:tc>
+          <w:tcPr>
+            <w:tcW w:w="3000" w:type="dxa"/>
+            <w:vAlign w:val="center"/>
+          </w:tcPr>
+          <w:p>
+            <w:pPr>
+              <w:pStyle w:val="TableText"/>
+              <w:widowControl/>
+            </w:pPr>
+            <w:r>
+              <w:rPr>
+                <w:rFonts w:ascii="Calibri" w:hAnsi="Calibri" w:cs="Calibri"/>
+              </w:rPr>
+              <w:t>3</w:t>
+            </w:r>
+          </w:p>
+        </w:tc>
+        <w:tc>
+          <w:tcPr>
+            <w:tcW w:w="1300" w:type="dxa"/>
+            <w:vAlign w:val="center"/>
+          </w:tcPr>
+          <w:p>
+            <w:pPr>
+              <w:pStyle w:val="TableText"/>
+              <w:widowControl/>
+            </w:pPr>
+            <w:r>
+              <w:rPr>
+                <w:rFonts w:ascii="Calibri" w:hAnsi="Calibri" w:cs="Calibri"/>
+              </w:rPr>
+              <w:t>P10B-19A-03 - Required page structures, region graph and PageBlueprint v2 dispatch</w:t>
+            </w:r>
+          </w:p>
+        </w:tc>
+        <w:tc>
+          <w:tcPr>
+            <w:tcW w:w="8660" w:type="dxa"/>
+            <w:vAlign w:val="center"/>
+          </w:tcPr>
+          <w:p>
+            <w:pPr>
+              <w:pStyle w:val="TableText"/>
+              <w:widowControl/>
+            </w:pPr>
+            <w:r>
+              <w:rPr>
+                <w:rFonts w:ascii="Calibri" w:hAnsi="Calibri" w:cs="Calibri"/>
+              </w:rPr>
+              <w:t>A-02 merged</w:t>
+            </w:r>
+          </w:p>
+        </w:tc>
+      </w:tr>
+      <w:tr>
+        <w:trPr/>
+        <w:tc>
+          <w:tcPr>
+            <w:tcW w:w="3000" w:type="dxa"/>
+            <w:vAlign w:val="center"/>
+          </w:tcPr>
+          <w:p>
+            <w:pPr>
+              <w:pStyle w:val="TableText"/>
+              <w:widowControl/>
+            </w:pPr>
+            <w:r>
+              <w:rPr>
+                <w:rFonts w:ascii="Calibri" w:hAnsi="Calibri" w:cs="Calibri"/>
+              </w:rPr>
+              <w:t>4</w:t>
+            </w:r>
+          </w:p>
+        </w:tc>
+        <w:tc>
+          <w:tcPr>
+            <w:tcW w:w="1300" w:type="dxa"/>
+            <w:vAlign w:val="center"/>
+          </w:tcPr>
+          <w:p>
+            <w:pPr>
+              <w:pStyle w:val="TableText"/>
+              <w:widowControl/>
+            </w:pPr>
+            <w:r>
+              <w:rPr>
+                <w:rFonts w:ascii="Calibri" w:hAnsi="Calibri" w:cs="Calibri"/>
+              </w:rPr>
+              <w:t>P10B-19A-04 - Asset-role contract</w:t>
+            </w:r>
+          </w:p>
+        </w:tc>
+        <w:tc>
+          <w:tcPr>
+            <w:tcW w:w="8660" w:type="dxa"/>
+            <w:vAlign w:val="center"/>
+          </w:tcPr>
+          <w:p>
+            <w:pPr>
+              <w:pStyle w:val="TableText"/>
+              <w:widowControl/>
+            </w:pPr>
+            <w:r>
+              <w:rPr>
+                <w:rFonts w:ascii="Calibri" w:hAnsi="Calibri" w:cs="Calibri"/>
+              </w:rPr>
+              <w:t>Declared A dependency merged</w:t>
+            </w:r>
+          </w:p>
+        </w:tc>
+      </w:tr>
+      <w:tr>
+        <w:trPr/>
+        <w:tc>
+          <w:tcPr>
+            <w:tcW w:w="3000" w:type="dxa"/>
+            <w:vAlign w:val="center"/>
+          </w:tcPr>
+          <w:p>
+            <w:pPr>
+              <w:pStyle w:val="TableText"/>
+              <w:widowControl/>
+            </w:pPr>
+            <w:r>
+              <w:rPr>
+                <w:rFonts w:ascii="Calibri" w:hAnsi="Calibri" w:cs="Calibri"/>
+              </w:rPr>
+              <w:t>5</w:t>
+            </w:r>
+          </w:p>
+        </w:tc>
+        <w:tc>
+          <w:tcPr>
+            <w:tcW w:w="1300" w:type="dxa"/>
+            <w:vAlign w:val="center"/>
+          </w:tcPr>
+          <w:p>
+            <w:pPr>
+              <w:pStyle w:val="TableText"/>
+              <w:widowControl/>
+            </w:pPr>
+            <w:r>
+              <w:rPr>
+                <w:rFonts w:ascii="Calibri" w:hAnsi="Calibri" w:cs="Calibri"/>
+              </w:rPr>
+              <w:t>P10B-19A-05 - Responsive-rule contract</w:t>
+            </w:r>
+          </w:p>
+        </w:tc>
+        <w:tc>
+          <w:tcPr>
+            <w:tcW w:w="8660" w:type="dxa"/>
+            <w:vAlign w:val="center"/>
+          </w:tcPr>
+          <w:p>
+            <w:pPr>
+              <w:pStyle w:val="TableText"/>
+              <w:widowControl/>
+            </w:pPr>
+            <w:r>
+              <w:rPr>
+                <w:rFonts w:ascii="Calibri" w:hAnsi="Calibri" w:cs="Calibri"/>
+              </w:rPr>
+              <w:t>Declared A dependency merged</w:t>
+            </w:r>
+          </w:p>
+        </w:tc>
+      </w:tr>
+      <w:tr>
+        <w:trPr/>
+        <w:tc>
+          <w:tcPr>
+            <w:tcW w:w="3000" w:type="dxa"/>
+            <w:vAlign w:val="center"/>
+          </w:tcPr>
+          <w:p>
+            <w:pPr>
+              <w:pStyle w:val="TableText"/>
+              <w:widowControl/>
+            </w:pPr>
+            <w:r>
+              <w:rPr>
+                <w:rFonts w:ascii="Calibri" w:hAnsi="Calibri" w:cs="Calibri"/>
+              </w:rPr>
+              <w:t>6</w:t>
+            </w:r>
+          </w:p>
+        </w:tc>
+        <w:tc>
+          <w:tcPr>
+            <w:tcW w:w="1300" w:type="dxa"/>
+            <w:vAlign w:val="center"/>
+          </w:tcPr>
+          <w:p>
+            <w:pPr>
+              <w:pStyle w:val="TableText"/>
+              <w:widowControl/>
+            </w:pPr>
+            <w:r>
+              <w:rPr>
+                <w:rFonts w:ascii="Calibri" w:hAnsi="Calibri" w:cs="Calibri"/>
+              </w:rPr>
+              <w:t>P10B-19A-06 - Omission, substitution and fallback contract</w:t>
+            </w:r>
+          </w:p>
+        </w:tc>
+        <w:tc>
+          <w:tcPr>
+            <w:tcW w:w="8660" w:type="dxa"/>
+            <w:vAlign w:val="center"/>
+          </w:tcPr>
+          <w:p>
+            <w:pPr>
+              <w:pStyle w:val="TableText"/>
+              <w:widowControl/>
+            </w:pPr>
+            <w:r>
+              <w:rPr>
+                <w:rFonts w:ascii="Calibri" w:hAnsi="Calibri" w:cs="Calibri"/>
+              </w:rPr>
+              <w:t>Declared A dependency merged</w:t>
+            </w:r>
+          </w:p>
+        </w:tc>
+      </w:tr>
+      <w:tr>
+        <w:trPr/>
+        <w:tc>
+          <w:tcPr>
+            <w:tcW w:w="3000" w:type="dxa"/>
+            <w:vAlign w:val="center"/>
+          </w:tcPr>
+          <w:p>
+            <w:pPr>
+              <w:pStyle w:val="TableText"/>
+              <w:widowControl/>
+            </w:pPr>
+            <w:r>
+              <w:rPr>
+                <w:rFonts w:ascii="Calibri" w:hAnsi="Calibri" w:cs="Calibri"/>
+              </w:rPr>
+              <w:t>7</w:t>
+            </w:r>
+          </w:p>
+        </w:tc>
+        <w:tc>
+          <w:tcPr>
+            <w:tcW w:w="1300" w:type="dxa"/>
+            <w:vAlign w:val="center"/>
+          </w:tcPr>
+          <w:p>
+            <w:pPr>
+              <w:pStyle w:val="TableText"/>
+              <w:widowControl/>
+            </w:pPr>
+            <w:r>
+              <w:rPr>
+                <w:rFonts w:ascii="Calibri" w:hAnsi="Calibri" w:cs="Calibri"/>
+              </w:rPr>
+              <w:t>P10B-19A-07 - Inactive family registry and candidate fingerprints</w:t>
+            </w:r>
+          </w:p>
+        </w:tc>
+        <w:tc>
+          <w:tcPr>
+            <w:tcW w:w="8660" w:type="dxa"/>
+            <w:vAlign w:val="center"/>
+          </w:tcPr>
+          <w:p>
+            <w:pPr>
+              <w:pStyle w:val="TableText"/>
+              <w:widowControl/>
+            </w:pPr>
+            <w:r>
+              <w:rPr>
+                <w:rFonts w:ascii="Calibri" w:hAnsi="Calibri" w:cs="Calibri"/>
+              </w:rPr>
+              <w:t>A-01 through A-06 authority merged</w:t>
+            </w:r>
+          </w:p>
+        </w:tc>
+      </w:tr>
+      <w:tr>
+        <w:trPr/>
+        <w:tc>
+          <w:tcPr>
+            <w:tcW w:w="3000" w:type="dxa"/>
+            <w:vAlign w:val="center"/>
+          </w:tcPr>
+          <w:p>
+            <w:pPr>
+              <w:pStyle w:val="TableText"/>
+              <w:widowControl/>
+            </w:pPr>
+            <w:r>
+              <w:rPr>
+                <w:rFonts w:ascii="Calibri" w:hAnsi="Calibri" w:cs="Calibri"/>
+              </w:rPr>
+              <w:t>8</w:t>
+            </w:r>
+          </w:p>
+        </w:tc>
+        <w:tc>
+          <w:tcPr>
+            <w:tcW w:w="1300" w:type="dxa"/>
+            <w:vAlign w:val="center"/>
+          </w:tcPr>
+          <w:p>
+            <w:pPr>
+              <w:pStyle w:val="TableText"/>
+              <w:widowControl/>
+            </w:pPr>
+            <w:r>
+              <w:rPr>
+                <w:rFonts w:ascii="Calibri" w:hAnsi="Calibri" w:cs="Calibri"/>
+              </w:rPr>
+              <w:t>P10B-19A-08 - Compatibility, deterministic selection and normalized topology identity</w:t>
+            </w:r>
+          </w:p>
+        </w:tc>
+        <w:tc>
+          <w:tcPr>
+            <w:tcW w:w="8660" w:type="dxa"/>
+            <w:vAlign w:val="center"/>
+          </w:tcPr>
+          <w:p>
+            <w:pPr>
+              <w:pStyle w:val="TableText"/>
+              <w:widowControl/>
+            </w:pPr>
+            <w:r>
+              <w:rPr>
+                <w:rFonts w:ascii="Calibri" w:hAnsi="Calibri" w:cs="Calibri"/>
+              </w:rPr>
+              <w:t>A-07 merged</w:t>
+            </w:r>
+          </w:p>
+        </w:tc>
+      </w:tr>
+      <w:tr>
+        <w:trPr/>
+        <w:tc>
+          <w:tcPr>
+            <w:tcW w:w="3000" w:type="dxa"/>
+            <w:vAlign w:val="center"/>
+          </w:tcPr>
+          <w:p>
+            <w:pPr>
+              <w:pStyle w:val="TableText"/>
+              <w:widowControl/>
+            </w:pPr>
+            <w:r>
+              <w:rPr>
+                <w:rFonts w:ascii="Calibri" w:hAnsi="Calibri" w:cs="Calibri"/>
+              </w:rPr>
+              <w:t>9</w:t>
+            </w:r>
+          </w:p>
+        </w:tc>
+        <w:tc>
+          <w:tcPr>
+            <w:tcW w:w="1300" w:type="dxa"/>
+            <w:vAlign w:val="center"/>
+          </w:tcPr>
+          <w:p>
+            <w:pPr>
+              <w:pStyle w:val="TableText"/>
+              <w:widowControl/>
+            </w:pPr>
+            <w:r>
+              <w:rPr>
+                <w:rFonts w:ascii="Calibri" w:hAnsi="Calibri" w:cs="Calibri"/>
+              </w:rPr>
+              <w:t>P10B-19A-09 - v1 read/render/migration/publication compatibility</w:t>
+            </w:r>
+          </w:p>
+        </w:tc>
+        <w:tc>
+          <w:tcPr>
+            <w:tcW w:w="8660" w:type="dxa"/>
+            <w:vAlign w:val="center"/>
+          </w:tcPr>
+          <w:p>
+            <w:pPr>
+              <w:pStyle w:val="TableText"/>
+              <w:widowControl/>
+            </w:pPr>
+            <w:r>
+              <w:rPr>
+                <w:rFonts w:ascii="Calibri" w:hAnsi="Calibri" w:cs="Calibri"/>
+              </w:rPr>
+              <w:t>A-08 merged</w:t>
+            </w:r>
+          </w:p>
+        </w:tc>
+      </w:tr>
+      <w:tr>
+        <w:trPr/>
+        <w:tc>
+          <w:tcPr>
+            <w:tcW w:w="3000" w:type="dxa"/>
+            <w:vAlign w:val="center"/>
+          </w:tcPr>
+          <w:p>
+            <w:pPr>
+              <w:pStyle w:val="TableText"/>
+              <w:widowControl/>
+            </w:pPr>
+            <w:r>
+              <w:rPr>
+                <w:rFonts w:ascii="Calibri" w:hAnsi="Calibri" w:cs="Calibri"/>
+              </w:rPr>
+              <w:t>10</w:t>
+            </w:r>
+          </w:p>
+        </w:tc>
+        <w:tc>
+          <w:tcPr>
+            <w:tcW w:w="1300" w:type="dxa"/>
+            <w:vAlign w:val="center"/>
+          </w:tcPr>
+          <w:p>
+            <w:pPr>
+              <w:pStyle w:val="TableText"/>
+              <w:widowControl/>
+            </w:pPr>
+            <w:r>
+              <w:rPr>
+                <w:rFonts w:ascii="Calibri" w:hAnsi="Calibri" w:cs="Calibri"/>
+              </w:rPr>
+              <w:t>P10B-19A-10 - Retained matrices, integration and P10B-19A closure</w:t>
+            </w:r>
+          </w:p>
+        </w:tc>
+        <w:tc>
+          <w:tcPr>
+            <w:tcW w:w="8660" w:type="dxa"/>
+            <w:vAlign w:val="center"/>
+          </w:tcPr>
+          <w:p>
+            <w:pPr>
+              <w:pStyle w:val="TableText"/>
+              <w:widowControl/>
+            </w:pPr>
+            <w:r>
+              <w:rPr>
+                <w:rFonts w:ascii="Calibri" w:hAnsi="Calibri" w:cs="Calibri"/>
+              </w:rPr>
+              <w:t>A-01 through A-09 merged</w:t>
+            </w:r>
+          </w:p>
+        </w:tc>
+      </w:tr>
+    </w:tbl>
+    <w:p>
+      <w:pPr>
+        <w:pStyle w:val="Normal"/>
+        <w:widowControl/>
+      </w:pPr>
+    </w:p>
+    <w:p>
+      <w:pPr>
+        <w:pStyle w:val="Normal"/>
+        <w:widowControl/>
+      </w:pPr>
+      <w:r>
+        <w:rPr>
+          <w:rFonts w:ascii="Calibri" w:hAnsi="Calibri" w:cs="Calibri"/>
+        </w:rPr>
+        <w:t>No P10B-19A production authority is implemented by DEVX-01A.</w:t>
       </w:r>
     </w:p>
     <w:p>

</xml_diff>

<commit_message>
docs: resolve sprint protocol review findings
</commit_message>
<xml_diff>
--- a/docs/VESKIFY_DEVELOPMENT_DELIVERY_TRACKER_v1.3.0.docx
+++ b/docs/VESKIFY_DEVELOPMENT_DELIVERY_TRACKER_v1.3.0.docx
@@ -12890,6 +12890,18 @@
           <w:rFonts w:ascii="Calibri" w:hAnsi="Calibri" w:cs="Calibri"/>
         </w:rPr>
         <w:t>No P10B-19A production authority is implemented by DEVX-01A.</w:t>
+      </w:r>
+    </w:p>
+    <w:p>
+      <w:pPr>
+        <w:pStyle w:val="Normal"/>
+        <w:widowControl/>
+      </w:pPr>
+      <w:r>
+        <w:rPr>
+          <w:rFonts w:ascii="Calibri" w:hAnsi="Calibri" w:cs="Calibri"/>
+        </w:rPr>
+        <w:t>The immutable DEVX-01A product-owner contract explicitly replaces the earlier six-child P10B-19A delivery partition with this ten-child merge map. Structural, PageBlueprint v2, registry, compatibility, migration and closure ownership remain exactly as accepted in P10B-19 PRE.</w:t>
       </w:r>
     </w:p>
     <w:p>

</xml_diff>

<commit_message>
feat: enforce mechanical task contract verdicts
</commit_message>
<xml_diff>
--- a/docs/VESKIFY_DEVELOPMENT_DELIVERY_TRACKER_v1.3.0.docx
+++ b/docs/VESKIFY_DEVELOPMENT_DELIVERY_TRACKER_v1.3.0.docx
@@ -546,7 +546,23 @@
         <w:rPr>
           <w:rFonts w:ascii="Calibri" w:hAnsi="Calibri" w:cs="Calibri"/>
         </w:rPr>
-        <w:t>[ ] DEVX-01B - Mechanical contract and verifier-verdict enforcement (</w:t>
+        <w:t>[x] DEVX-01B - Mechanical contract and verifier-verdict enforcement</w:t>
+      </w:r>
+    </w:p>
+    <w:p>
+      <w:pPr>
+        <w:pStyle w:val="Normal"/>
+        <w:numPr>
+          <w:ilvl w:val="0"/>
+          <w:numId w:val="1"/>
+        </w:numPr>
+        <w:widowControl/>
+      </w:pPr>
+      <w:r>
+        <w:rPr>
+          <w:rFonts w:ascii="Calibri" w:hAnsi="Calibri" w:cs="Calibri"/>
+        </w:rPr>
+        <w:t>[ ] DEVX-01C - CI timings, obsolete-run cancellation and Next build caching (</w:t>
       </w:r>
       <w:r>
         <w:rPr>
@@ -561,22 +577,6 @@
           <w:rFonts w:ascii="Calibri" w:hAnsi="Calibri" w:cs="Calibri"/>
         </w:rPr>
         <w:t>)</w:t>
-      </w:r>
-    </w:p>
-    <w:p>
-      <w:pPr>
-        <w:pStyle w:val="Normal"/>
-        <w:numPr>
-          <w:ilvl w:val="0"/>
-          <w:numId w:val="1"/>
-        </w:numPr>
-        <w:widowControl/>
-      </w:pPr>
-      <w:r>
-        <w:rPr>
-          <w:rFonts w:ascii="Calibri" w:hAnsi="Calibri" w:cs="Calibri"/>
-        </w:rPr>
-        <w:t>[ ] DEVX-01C - CI timings, obsolete-run cancellation and Next build caching</w:t>
       </w:r>
     </w:p>
     <w:p>

</xml_diff>

<commit_message>
ci: add timing cancellation and Next cache
</commit_message>
<xml_diff>
--- a/docs/VESKIFY_DEVELOPMENT_DELIVERY_TRACKER_v1.3.0.docx
+++ b/docs/VESKIFY_DEVELOPMENT_DELIVERY_TRACKER_v1.3.0.docx
@@ -562,7 +562,23 @@
         <w:rPr>
           <w:rFonts w:ascii="Calibri" w:hAnsi="Calibri" w:cs="Calibri"/>
         </w:rPr>
-        <w:t>[ ] DEVX-01C - CI timings, obsolete-run cancellation and Next build caching (</w:t>
+        <w:t>[x] DEVX-01C - CI timings, obsolete-run cancellation and Next build caching</w:t>
+      </w:r>
+    </w:p>
+    <w:p>
+      <w:pPr>
+        <w:pStyle w:val="Normal"/>
+        <w:numPr>
+          <w:ilvl w:val="0"/>
+          <w:numId w:val="1"/>
+        </w:numPr>
+        <w:widowControl/>
+      </w:pPr>
+      <w:r>
+        <w:rPr>
+          <w:rFonts w:ascii="Calibri" w:hAnsi="Calibri" w:cs="Calibri"/>
+        </w:rPr>
+        <w:t>[ ] DEVX-01D - Parallel static, Vitest and production-build jobs (</w:t>
       </w:r>
       <w:r>
         <w:rPr>
@@ -577,22 +593,6 @@
           <w:rFonts w:ascii="Calibri" w:hAnsi="Calibri" w:cs="Calibri"/>
         </w:rPr>
         <w:t>)</w:t>
-      </w:r>
-    </w:p>
-    <w:p>
-      <w:pPr>
-        <w:pStyle w:val="Normal"/>
-        <w:numPr>
-          <w:ilvl w:val="0"/>
-          <w:numId w:val="1"/>
-        </w:numPr>
-        <w:widowControl/>
-      </w:pPr>
-      <w:r>
-        <w:rPr>
-          <w:rFonts w:ascii="Calibri" w:hAnsi="Calibri" w:cs="Calibri"/>
-        </w:rPr>
-        <w:t>[ ] DEVX-01D - Parallel static, Vitest and production-build jobs</w:t>
       </w:r>
     </w:p>
     <w:p>
@@ -11551,7 +11551,7 @@
                 <w:b/>
                 <w:bCs/>
               </w:rPr>
-              <w:t>Planned / exact next engineering</w:t>
+              <w:t>Baseline</w:t>
             </w:r>
           </w:p>
         </w:tc>
@@ -11587,7 +11587,7 @@
               <w:rPr>
                 <w:rFonts w:ascii="Calibri" w:hAnsi="Calibri" w:cs="Calibri"/>
               </w:rPr>
-              <w:t>Focused positive/fail-closed contract tests</w:t>
+              <w:t>Focused positive/fail-closed contract tests and exact verifier reconciliation</w:t>
             </w:r>
           </w:p>
         </w:tc>
@@ -11665,7 +11665,7 @@
                 <w:b/>
                 <w:bCs/>
               </w:rPr>
-              <w:t>Planned</w:t>
+              <w:t>Baseline</w:t>
             </w:r>
           </w:p>
         </w:tc>
@@ -11701,7 +11701,7 @@
               <w:rPr>
                 <w:rFonts w:ascii="Calibri" w:hAnsi="Calibri" w:cs="Calibri"/>
               </w:rPr>
-              <w:t>Two clean timing records and cache/cancellation proof</w:t>
+              <w:t>Complete timing artifact, cache authority and static/native cancellation proof</w:t>
             </w:r>
           </w:p>
         </w:tc>
@@ -11779,7 +11779,7 @@
                 <w:b/>
                 <w:bCs/>
               </w:rPr>
-              <w:t>Planned</w:t>
+              <w:t>Planned / exact next engineering</w:t>
             </w:r>
           </w:p>
         </w:tc>
@@ -12196,7 +12196,35 @@
         <w:rPr>
           <w:rFonts w:ascii="Calibri" w:hAnsi="Calibri" w:cs="Calibri"/>
         </w:rPr>
-        <w:t>P10B remains Partial. P10B-19A is the next product-development sprint after DEVX-01.</w:t>
+        <w:t xml:space="preserve">P10B remains Partial. P10B-19A is the next product-development sprint after DEVX-01. DEVX-01C retains one serial </w:t>
+      </w:r>
+      <w:r>
+        <w:rPr>
+          <w:rFonts w:ascii="Consolas" w:hAnsi="Consolas" w:cs="Consolas"/>
+          <w:sz w:val="19"/>
+          <w:szCs w:val="19"/>
+        </w:rPr>
+        <w:t>validate</w:t>
+      </w:r>
+      <w:r>
+        <w:rPr>
+          <w:rFonts w:ascii="Calibri" w:hAnsi="Calibri" w:cs="Calibri"/>
+        </w:rPr>
+        <w:t xml:space="preserve"> job while adding nine safe command timings, PR/ref-scoped native cancellation and compatible </w:t>
+      </w:r>
+      <w:r>
+        <w:rPr>
+          <w:rFonts w:ascii="Consolas" w:hAnsi="Consolas" w:cs="Consolas"/>
+          <w:sz w:val="19"/>
+          <w:szCs w:val="19"/>
+        </w:rPr>
+        <w:t>.next/cache</w:t>
+      </w:r>
+      <w:r>
+        <w:rPr>
+          <w:rFonts w:ascii="Calibri" w:hAnsi="Calibri" w:cs="Calibri"/>
+        </w:rPr>
+        <w:t xml:space="preserve"> reuse. Its PR #211 baseline is 2h 6m 13s; the first instrumented run is bounded measurement evidence, while two-run performance acceptance remains DEVX-01G authority.</w:t>
       </w:r>
     </w:p>
     <w:p>

</xml_diff>

<commit_message>
ci: parallelize validation jobs
</commit_message>
<xml_diff>
--- a/docs/VESKIFY_DEVELOPMENT_DELIVERY_TRACKER_v1.3.0.docx
+++ b/docs/VESKIFY_DEVELOPMENT_DELIVERY_TRACKER_v1.3.0.docx
@@ -11779,7 +11779,7 @@
                 <w:b/>
                 <w:bCs/>
               </w:rPr>
-              <w:t>Planned / exact next engineering</w:t>
+              <w:t>Baseline</w:t>
             </w:r>
           </w:p>
         </w:tc>
@@ -11815,7 +11815,7 @@
               <w:rPr>
                 <w:rFonts w:ascii="Calibri" w:hAnsi="Calibri" w:cs="Calibri"/>
               </w:rPr>
-              <w:t>Required-status and failure propagation proof</w:t>
+              <w:t>Four profile artifacts, stable aggregate status and failure-propagation proof</w:t>
             </w:r>
           </w:p>
         </w:tc>
@@ -11893,7 +11893,7 @@
                 <w:b/>
                 <w:bCs/>
               </w:rPr>
-              <w:t>Planned</w:t>
+              <w:t>Planned / exact next engineering</w:t>
             </w:r>
           </w:p>
         </w:tc>
@@ -12196,7 +12196,7 @@
         <w:rPr>
           <w:rFonts w:ascii="Calibri" w:hAnsi="Calibri" w:cs="Calibri"/>
         </w:rPr>
-        <w:t xml:space="preserve">P10B remains Partial. P10B-19A is the next product-development sprint after DEVX-01. DEVX-01C retains one serial </w:t>
+        <w:t xml:space="preserve">P10B remains Partial. P10B-19A is the next product-development sprint after DEVX-01. DEVX-01C measured the serial gate, retained PR/ref-scoped cancellation and added compatible </w:t>
       </w:r>
       <w:r>
         <w:rPr>
@@ -12204,13 +12204,13 @@
           <w:sz w:val="19"/>
           <w:szCs w:val="19"/>
         </w:rPr>
-        <w:t>validate</w:t>
-      </w:r>
-      <w:r>
-        <w:rPr>
-          <w:rFonts w:ascii="Calibri" w:hAnsi="Calibri" w:cs="Calibri"/>
-        </w:rPr>
-        <w:t xml:space="preserve"> job while adding nine safe command timings, PR/ref-scoped native cancellation and compatible </w:t>
+        <w:t>.next/cache</w:t>
+      </w:r>
+      <w:r>
+        <w:rPr>
+          <w:rFonts w:ascii="Calibri" w:hAnsi="Calibri" w:cs="Calibri"/>
+        </w:rPr>
+        <w:t xml:space="preserve"> reuse. DEVX-01D runs static, one-worker Vitest, production-build and unchanged complete browser validation independently behind the stable fail-closed </w:t>
       </w:r>
       <w:r>
         <w:rPr>
@@ -12218,13 +12218,13 @@
           <w:sz w:val="19"/>
           <w:szCs w:val="19"/>
         </w:rPr>
-        <w:t>.next/cache</w:t>
-      </w:r>
-      <w:r>
-        <w:rPr>
-          <w:rFonts w:ascii="Calibri" w:hAnsi="Calibri" w:cs="Calibri"/>
-        </w:rPr>
-        <w:t xml:space="preserve"> reuse. Its PR #211 baseline is 2h 6m 13s; the first instrumented run is bounded measurement evidence, while two-run performance acceptance remains DEVX-01G authority.</w:t>
+        <w:t>validate</w:t>
+      </w:r>
+      <w:r>
+        <w:rPr>
+          <w:rFonts w:ascii="Calibri" w:hAnsi="Calibri" w:cs="Calibri"/>
+        </w:rPr>
+        <w:t xml:space="preserve"> status, with a separate bounded timing artifact per profile. Its projected command critical path was 1h 11m 24.063s versus 2h 5m 49.513s measured serial work; achieved timings remain run evidence and two-run performance acceptance remains DEVX-01G authority. DEVX-01E is exact next.</w:t>
       </w:r>
     </w:p>
     <w:p>

</xml_diff>

<commit_message>
docs: close DEVX-01D delivery status
</commit_message>
<xml_diff>
--- a/docs/VESKIFY_DEVELOPMENT_DELIVERY_TRACKER_v1.3.0.docx
+++ b/docs/VESKIFY_DEVELOPMENT_DELIVERY_TRACKER_v1.3.0.docx
@@ -578,7 +578,23 @@
         <w:rPr>
           <w:rFonts w:ascii="Calibri" w:hAnsi="Calibri" w:cs="Calibri"/>
         </w:rPr>
-        <w:t>[ ] DEVX-01D - Parallel static, Vitest and production-build jobs (</w:t>
+        <w:t>[x] DEVX-01D - Parallel static, Vitest and production-build jobs</w:t>
+      </w:r>
+    </w:p>
+    <w:p>
+      <w:pPr>
+        <w:pStyle w:val="Normal"/>
+        <w:numPr>
+          <w:ilvl w:val="0"/>
+          <w:numId w:val="1"/>
+        </w:numPr>
+        <w:widowControl/>
+      </w:pPr>
+      <w:r>
+        <w:rPr>
+          <w:rFonts w:ascii="Calibri" w:hAnsi="Calibri" w:cs="Calibri"/>
+        </w:rPr>
+        <w:t>[ ] DEVX-01E - Playwright timing inventory and balanced execution groups (</w:t>
       </w:r>
       <w:r>
         <w:rPr>
@@ -593,22 +609,6 @@
           <w:rFonts w:ascii="Calibri" w:hAnsi="Calibri" w:cs="Calibri"/>
         </w:rPr>
         <w:t>)</w:t>
-      </w:r>
-    </w:p>
-    <w:p>
-      <w:pPr>
-        <w:pStyle w:val="Normal"/>
-        <w:numPr>
-          <w:ilvl w:val="0"/>
-          <w:numId w:val="1"/>
-        </w:numPr>
-        <w:widowControl/>
-      </w:pPr>
-      <w:r>
-        <w:rPr>
-          <w:rFonts w:ascii="Calibri" w:hAnsi="Calibri" w:cs="Calibri"/>
-        </w:rPr>
-        <w:t>[ ] DEVX-01E - Playwright timing inventory and balanced execution groups</w:t>
       </w:r>
     </w:p>
     <w:p>

</xml_diff>

<commit_message>
ci: add Playwright suite timing inventory
</commit_message>
<xml_diff>
--- a/docs/VESKIFY_DEVELOPMENT_DELIVERY_TRACKER_v1.3.0.docx
+++ b/docs/VESKIFY_DEVELOPMENT_DELIVERY_TRACKER_v1.3.0.docx
@@ -594,7 +594,23 @@
         <w:rPr>
           <w:rFonts w:ascii="Calibri" w:hAnsi="Calibri" w:cs="Calibri"/>
         </w:rPr>
-        <w:t>[ ] DEVX-01E - Playwright timing inventory and balanced execution groups (</w:t>
+        <w:t>[x] DEVX-01E - Playwright timing inventory and balanced execution groups</w:t>
+      </w:r>
+    </w:p>
+    <w:p>
+      <w:pPr>
+        <w:pStyle w:val="Normal"/>
+        <w:numPr>
+          <w:ilvl w:val="0"/>
+          <w:numId w:val="1"/>
+        </w:numPr>
+        <w:widowControl/>
+      </w:pPr>
+      <w:r>
+        <w:rPr>
+          <w:rFonts w:ascii="Calibri" w:hAnsi="Calibri" w:cs="Calibri"/>
+        </w:rPr>
+        <w:t>[ ] DEVX-01F - Playwright sharding/matrix, merged reports and stable required aggregator (</w:t>
       </w:r>
       <w:r>
         <w:rPr>
@@ -609,22 +625,6 @@
           <w:rFonts w:ascii="Calibri" w:hAnsi="Calibri" w:cs="Calibri"/>
         </w:rPr>
         <w:t>)</w:t>
-      </w:r>
-    </w:p>
-    <w:p>
-      <w:pPr>
-        <w:pStyle w:val="Normal"/>
-        <w:numPr>
-          <w:ilvl w:val="0"/>
-          <w:numId w:val="1"/>
-        </w:numPr>
-        <w:widowControl/>
-      </w:pPr>
-      <w:r>
-        <w:rPr>
-          <w:rFonts w:ascii="Calibri" w:hAnsi="Calibri" w:cs="Calibri"/>
-        </w:rPr>
-        <w:t>[ ] DEVX-01F - Playwright sharding/matrix, merged reports and stable required aggregator</w:t>
       </w:r>
     </w:p>
     <w:p>
@@ -11893,7 +11893,7 @@
                 <w:b/>
                 <w:bCs/>
               </w:rPr>
-              <w:t>Planned / exact next engineering</w:t>
+              <w:t>Baseline</w:t>
             </w:r>
           </w:p>
         </w:tc>
@@ -12007,7 +12007,7 @@
                 <w:b/>
                 <w:bCs/>
               </w:rPr>
-              <w:t>Planned</w:t>
+              <w:t>Planned / exact next engineering task</w:t>
             </w:r>
           </w:p>
         </w:tc>
@@ -12224,7 +12224,7 @@
         <w:rPr>
           <w:rFonts w:ascii="Calibri" w:hAnsi="Calibri" w:cs="Calibri"/>
         </w:rPr>
-        <w:t xml:space="preserve"> status, with a separate bounded timing artifact per profile. Its projected command critical path was 1h 11m 24.063s versus 2h 5m 49.513s measured serial work; achieved timings remain run evidence and two-run performance acceptance remains DEVX-01G authority. DEVX-01E is exact next.</w:t>
+        <w:t xml:space="preserve"> status, with a separate bounded timing artifact per profile. Its projected command critical path was 1h 11m 24.063s versus 2h 5m 49.513s measured serial work; achieved timings remain run evidence and two-run performance acceptance remains DEVX-01G authority. DEVX-01E is Baseline; DEVX-01F is the exact next engineering task.</w:t>
       </w:r>
     </w:p>
     <w:p>
@@ -25874,6 +25874,185 @@
           <w:rFonts w:ascii="Calibri" w:hAnsi="Calibri" w:cs="Calibri"/>
         </w:rPr>
         <w:t>The accepted parent plan contains 73 bounded child tasks. Each meaningful visual family requires a focused product-owner screenshot checkpoint before merge. P10B remains Partial.</w:t>
+      </w:r>
+    </w:p>
+    <w:p>
+      <w:pPr>
+        <w:pStyle w:val="Heading1"/>
+        <w:keepNext/>
+        <w:widowControl/>
+      </w:pPr>
+      <w:r>
+        <w:rPr>
+          <w:rFonts w:ascii="Calibri" w:hAnsi="Calibri" w:cs="Calibri"/>
+        </w:rPr>
+        <w:t>DEVX-01E browser timing authority</w:t>
+      </w:r>
+    </w:p>
+    <w:p>
+      <w:pPr>
+        <w:pStyle w:val="Normal"/>
+        <w:numPr>
+          <w:ilvl w:val="0"/>
+          <w:numId w:val="1"/>
+        </w:numPr>
+        <w:widowControl/>
+      </w:pPr>
+      <w:r>
+        <w:rPr>
+          <w:rFonts w:ascii="Calibri" w:hAnsi="Calibri" w:cs="Calibri"/>
+        </w:rPr>
+        <w:t>DEVX-01A = Baseline</w:t>
+      </w:r>
+    </w:p>
+    <w:p>
+      <w:pPr>
+        <w:pStyle w:val="Normal"/>
+        <w:numPr>
+          <w:ilvl w:val="0"/>
+          <w:numId w:val="1"/>
+        </w:numPr>
+        <w:widowControl/>
+      </w:pPr>
+      <w:r>
+        <w:rPr>
+          <w:rFonts w:ascii="Calibri" w:hAnsi="Calibri" w:cs="Calibri"/>
+        </w:rPr>
+        <w:t>DEVX-01B = Baseline</w:t>
+      </w:r>
+    </w:p>
+    <w:p>
+      <w:pPr>
+        <w:pStyle w:val="Normal"/>
+        <w:numPr>
+          <w:ilvl w:val="0"/>
+          <w:numId w:val="1"/>
+        </w:numPr>
+        <w:widowControl/>
+      </w:pPr>
+      <w:r>
+        <w:rPr>
+          <w:rFonts w:ascii="Calibri" w:hAnsi="Calibri" w:cs="Calibri"/>
+        </w:rPr>
+        <w:t>DEVX-01C = Baseline</w:t>
+      </w:r>
+    </w:p>
+    <w:p>
+      <w:pPr>
+        <w:pStyle w:val="Normal"/>
+        <w:numPr>
+          <w:ilvl w:val="0"/>
+          <w:numId w:val="1"/>
+        </w:numPr>
+        <w:widowControl/>
+      </w:pPr>
+      <w:r>
+        <w:rPr>
+          <w:rFonts w:ascii="Calibri" w:hAnsi="Calibri" w:cs="Calibri"/>
+        </w:rPr>
+        <w:t>DEVX-01D = Baseline</w:t>
+      </w:r>
+    </w:p>
+    <w:p>
+      <w:pPr>
+        <w:pStyle w:val="Normal"/>
+        <w:numPr>
+          <w:ilvl w:val="0"/>
+          <w:numId w:val="1"/>
+        </w:numPr>
+        <w:widowControl/>
+      </w:pPr>
+      <w:r>
+        <w:rPr>
+          <w:rFonts w:ascii="Calibri" w:hAnsi="Calibri" w:cs="Calibri"/>
+        </w:rPr>
+        <w:t>DEVX-01E = Baseline</w:t>
+      </w:r>
+    </w:p>
+    <w:p>
+      <w:pPr>
+        <w:pStyle w:val="Normal"/>
+        <w:numPr>
+          <w:ilvl w:val="0"/>
+          <w:numId w:val="1"/>
+        </w:numPr>
+        <w:widowControl/>
+      </w:pPr>
+      <w:r>
+        <w:rPr>
+          <w:rFonts w:ascii="Calibri" w:hAnsi="Calibri" w:cs="Calibri"/>
+        </w:rPr>
+        <w:t>DEVX-01F = exact next engineering task</w:t>
+      </w:r>
+    </w:p>
+    <w:p>
+      <w:pPr>
+        <w:pStyle w:val="Normal"/>
+        <w:numPr>
+          <w:ilvl w:val="0"/>
+          <w:numId w:val="1"/>
+        </w:numPr>
+        <w:widowControl/>
+      </w:pPr>
+      <w:r>
+        <w:rPr>
+          <w:rFonts w:ascii="Calibri" w:hAnsi="Calibri" w:cs="Calibri"/>
+        </w:rPr>
+        <w:t>P10B-19A = next product-development sprint after DEVX-01</w:t>
+      </w:r>
+    </w:p>
+    <w:p>
+      <w:pPr>
+        <w:pStyle w:val="Normal"/>
+        <w:widowControl/>
+      </w:pPr>
+      <w:r>
+        <w:rPr>
+          <w:rFonts w:ascii="Calibri" w:hAnsi="Calibri" w:cs="Calibri"/>
+        </w:rPr>
+        <w:t xml:space="preserve">The canonical serial browser command now reads the versioned 12-suite inventory in </w:t>
+      </w:r>
+      <w:r>
+        <w:rPr>
+          <w:rFonts w:ascii="Consolas" w:hAnsi="Consolas" w:cs="Consolas"/>
+          <w:sz w:val="19"/>
+          <w:szCs w:val="19"/>
+        </w:rPr>
+        <w:t>scripts/playwright-ci-suites.v1.json</w:t>
+      </w:r>
+      <w:r>
+        <w:rPr>
+          <w:rFonts w:ascii="Calibri" w:hAnsi="Calibri" w:cs="Calibri"/>
+        </w:rPr>
+        <w:t xml:space="preserve"> through </w:t>
+      </w:r>
+      <w:r>
+        <w:rPr>
+          <w:rFonts w:ascii="Consolas" w:hAnsi="Consolas" w:cs="Consolas"/>
+          <w:sz w:val="19"/>
+          <w:szCs w:val="19"/>
+        </w:rPr>
+        <w:t>scripts/playwright-ci.mjs</w:t>
+      </w:r>
+      <w:r>
+        <w:rPr>
+          <w:rFonts w:ascii="Calibri" w:hAnsi="Calibri" w:cs="Calibri"/>
+        </w:rPr>
+        <w:t xml:space="preserve">. CI still runs one serial </w:t>
+      </w:r>
+      <w:r>
+        <w:rPr>
+          <w:rFonts w:ascii="Consolas" w:hAnsi="Consolas" w:cs="Consolas"/>
+          <w:sz w:val="19"/>
+          <w:szCs w:val="19"/>
+        </w:rPr>
+        <w:t>browser-regression</w:t>
+      </w:r>
+      <w:r>
+        <w:rPr>
+          <w:rFonts w:ascii="Calibri" w:hAnsi="Calibri" w:cs="Calibri"/>
+        </w:rPr>
+        <w:t xml:space="preserve"> job and stops at the first failing suite. Per-suite records contain bounded timing/status metadata only; the deterministic 2–6 group plans are advisory inputs for DEVX-01F and do not create matrix, shard, or parallel execution authority.</w:t>
       </w:r>
     </w:p>
     <w:sectPr>

</xml_diff>

<commit_message>
ci: run Playwright suites in balanced matrix
</commit_message>
<xml_diff>
--- a/docs/VESKIFY_DEVELOPMENT_DELIVERY_TRACKER_v1.3.0.docx
+++ b/docs/VESKIFY_DEVELOPMENT_DELIVERY_TRACKER_v1.3.0.docx
@@ -610,7 +610,23 @@
         <w:rPr>
           <w:rFonts w:ascii="Calibri" w:hAnsi="Calibri" w:cs="Calibri"/>
         </w:rPr>
-        <w:t>[ ] DEVX-01F - Playwright sharding/matrix, merged reports and stable required aggregator (</w:t>
+        <w:t>[x] DEVX-01F - Playwright sharding/matrix, merged reports and stable required aggregator</w:t>
+      </w:r>
+    </w:p>
+    <w:p>
+      <w:pPr>
+        <w:pStyle w:val="Normal"/>
+        <w:numPr>
+          <w:ilvl w:val="0"/>
+          <w:numId w:val="1"/>
+        </w:numPr>
+        <w:widowControl/>
+      </w:pPr>
+      <w:r>
+        <w:rPr>
+          <w:rFonts w:ascii="Calibri" w:hAnsi="Calibri" w:cs="Calibri"/>
+        </w:rPr>
+        <w:t>[ ] DEVX-01G - Two-run performance acceptance and workflow closure (</w:t>
       </w:r>
       <w:r>
         <w:rPr>
@@ -625,22 +641,6 @@
           <w:rFonts w:ascii="Calibri" w:hAnsi="Calibri" w:cs="Calibri"/>
         </w:rPr>
         <w:t>)</w:t>
-      </w:r>
-    </w:p>
-    <w:p>
-      <w:pPr>
-        <w:pStyle w:val="Normal"/>
-        <w:numPr>
-          <w:ilvl w:val="0"/>
-          <w:numId w:val="1"/>
-        </w:numPr>
-        <w:widowControl/>
-      </w:pPr>
-      <w:r>
-        <w:rPr>
-          <w:rFonts w:ascii="Calibri" w:hAnsi="Calibri" w:cs="Calibri"/>
-        </w:rPr>
-        <w:t>[ ] DEVX-01G - Two-run performance acceptance and workflow closure</w:t>
       </w:r>
     </w:p>
     <w:tbl>
@@ -12007,7 +12007,7 @@
                 <w:b/>
                 <w:bCs/>
               </w:rPr>
-              <w:t>Planned / exact next engineering task</w:t>
+              <w:t>Baseline</w:t>
             </w:r>
           </w:p>
         </w:tc>
@@ -12121,7 +12121,7 @@
                 <w:b/>
                 <w:bCs/>
               </w:rPr>
-              <w:t>Planned</w:t>
+              <w:t>Planned / exact next engineering task</w:t>
             </w:r>
           </w:p>
         </w:tc>
@@ -12224,7 +12224,7 @@
         <w:rPr>
           <w:rFonts w:ascii="Calibri" w:hAnsi="Calibri" w:cs="Calibri"/>
         </w:rPr>
-        <w:t xml:space="preserve"> status, with a separate bounded timing artifact per profile. Its projected command critical path was 1h 11m 24.063s versus 2h 5m 49.513s measured serial work; achieved timings remain run evidence and two-run performance acceptance remains DEVX-01G authority. DEVX-01E is Baseline; DEVX-01F is the exact next engineering task.</w:t>
+        <w:t xml:space="preserve"> status, with a separate bounded timing artifact per profile. Its projected command critical path was 1h 11m 24.063s versus 2h 5m 49.513s measured serial work; achieved timings remain run evidence and two-run performance acceptance remains DEVX-01G authority. DEVX-01E and DEVX-01F are Baseline; DEVX-01G is the exact next engineering task.</w:t>
       </w:r>
     </w:p>
     <w:p>
@@ -25982,7 +25982,23 @@
         <w:rPr>
           <w:rFonts w:ascii="Calibri" w:hAnsi="Calibri" w:cs="Calibri"/>
         </w:rPr>
-        <w:t>DEVX-01F = exact next engineering task</w:t>
+        <w:t>DEVX-01F = Baseline</w:t>
+      </w:r>
+    </w:p>
+    <w:p>
+      <w:pPr>
+        <w:pStyle w:val="Normal"/>
+        <w:numPr>
+          <w:ilvl w:val="0"/>
+          <w:numId w:val="1"/>
+        </w:numPr>
+        <w:widowControl/>
+      </w:pPr>
+      <w:r>
+        <w:rPr>
+          <w:rFonts w:ascii="Calibri" w:hAnsi="Calibri" w:cs="Calibri"/>
+        </w:rPr>
+        <w:t>DEVX-01G = exact next engineering task</w:t>
       </w:r>
     </w:p>
     <w:p>
@@ -26052,7 +26068,105 @@
         <w:rPr>
           <w:rFonts w:ascii="Calibri" w:hAnsi="Calibri" w:cs="Calibri"/>
         </w:rPr>
-        <w:t xml:space="preserve"> job and stops at the first failing suite. Per-suite records contain bounded timing/status metadata only; the deterministic 2–6 group plans are advisory inputs for DEVX-01F and do not create matrix, shard, or parallel execution authority.</w:t>
+        <w:t xml:space="preserve"> job and stops at the first failing suite. Per-suite records contain bounded timing/status metadata only; the deterministic 2–6 group plans are advisory inputs for DEVX-01F locks the two-group whole-suite matrix in </w:t>
+      </w:r>
+      <w:r>
+        <w:rPr>
+          <w:rFonts w:ascii="Consolas" w:hAnsi="Consolas" w:cs="Consolas"/>
+          <w:sz w:val="19"/>
+          <w:szCs w:val="19"/>
+        </w:rPr>
+        <w:t>scripts/playwright-ci-execution-plan.v1.json</w:t>
+      </w:r>
+      <w:r>
+        <w:rPr>
+          <w:rFonts w:ascii="Calibri" w:hAnsi="Calibri" w:cs="Calibri"/>
+        </w:rPr>
+        <w:t xml:space="preserve"> and executes it through the canonical </w:t>
+      </w:r>
+      <w:r>
+        <w:rPr>
+          <w:rFonts w:ascii="Consolas" w:hAnsi="Consolas" w:cs="Consolas"/>
+          <w:sz w:val="19"/>
+          <w:szCs w:val="19"/>
+        </w:rPr>
+        <w:t>scripts/playwright-ci.mjs</w:t>
+      </w:r>
+      <w:r>
+        <w:rPr>
+          <w:rFonts w:ascii="Calibri" w:hAnsi="Calibri" w:cs="Calibri"/>
+        </w:rPr>
+        <w:t xml:space="preserve"> authority. The workflow emits only bounded group IDs, runs every canonical suite exactly once, retains per-group timing and blob evidence, rejects missing, duplicate, unexpected or hash-mismatched artifacts before merge, and produces one merged HTML report plus one matrix timing summary behind the stable </w:t>
+      </w:r>
+      <w:r>
+        <w:rPr>
+          <w:rFonts w:ascii="Consolas" w:hAnsi="Consolas" w:cs="Consolas"/>
+          <w:sz w:val="19"/>
+          <w:szCs w:val="19"/>
+        </w:rPr>
+        <w:t>validate</w:t>
+      </w:r>
+      <w:r>
+        <w:rPr>
+          <w:rFonts w:ascii="Calibri" w:hAnsi="Calibri" w:cs="Calibri"/>
+        </w:rPr>
+        <w:t xml:space="preserve"> check. The measured whole-suite plan already meets the bounded makespan and balance targets, so no suite sharding is activated. Audit the plan with </w:t>
+      </w:r>
+      <w:r>
+        <w:rPr>
+          <w:rFonts w:ascii="Consolas" w:hAnsi="Consolas" w:cs="Consolas"/>
+          <w:sz w:val="19"/>
+          <w:szCs w:val="19"/>
+        </w:rPr>
+        <w:t>node scripts/playwright-ci.mjs audit-plan</w:t>
+      </w:r>
+      <w:r>
+        <w:rPr>
+          <w:rFonts w:ascii="Calibri" w:hAnsi="Calibri" w:cs="Calibri"/>
+        </w:rPr>
+        <w:t xml:space="preserve">; matrix rows use </w:t>
+      </w:r>
+      <w:r>
+        <w:rPr>
+          <w:rFonts w:ascii="Consolas" w:hAnsi="Consolas" w:cs="Consolas"/>
+          <w:sz w:val="19"/>
+          <w:szCs w:val="19"/>
+        </w:rPr>
+        <w:t>node scripts/playwright-ci.mjs run-group</w:t>
+      </w:r>
+      <w:r>
+        <w:rPr>
+          <w:rFonts w:ascii="Calibri" w:hAnsi="Calibri" w:cs="Calibri"/>
+        </w:rPr>
+        <w:t xml:space="preserve">; the report job runs </w:t>
+      </w:r>
+      <w:r>
+        <w:rPr>
+          <w:rFonts w:ascii="Consolas" w:hAnsi="Consolas" w:cs="Consolas"/>
+          <w:sz w:val="19"/>
+          <w:szCs w:val="19"/>
+        </w:rPr>
+        <w:t>node scripts/playwright-ci.mjs validate-group-artifacts</w:t>
+      </w:r>
+      <w:r>
+        <w:rPr>
+          <w:rFonts w:ascii="Calibri" w:hAnsi="Calibri" w:cs="Calibri"/>
+        </w:rPr>
+        <w:t xml:space="preserve"> before </w:t>
+      </w:r>
+      <w:r>
+        <w:rPr>
+          <w:rFonts w:ascii="Consolas" w:hAnsi="Consolas" w:cs="Consolas"/>
+          <w:sz w:val="19"/>
+          <w:szCs w:val="19"/>
+        </w:rPr>
+        <w:t>pnpm exec playwright merge-reports</w:t>
+      </w:r>
+      <w:r>
+        <w:rPr>
+          <w:rFonts w:ascii="Calibri" w:hAnsi="Calibri" w:cs="Calibri"/>
+        </w:rPr>
+        <w:t>. DEVX-01G owns two-run performance acceptance and workflow closure.</w:t>
       </w:r>
     </w:p>
     <w:sectPr>

</xml_diff>

<commit_message>
ci: shard vitest across isolated runners
</commit_message>
<xml_diff>
--- a/docs/VESKIFY_DEVELOPMENT_DELIVERY_TRACKER_v1.3.0.docx
+++ b/docs/VESKIFY_DEVELOPMENT_DELIVERY_TRACKER_v1.3.0.docx
@@ -611,6 +611,22 @@
           <w:rFonts w:ascii="Calibri" w:hAnsi="Calibri" w:cs="Calibri"/>
         </w:rPr>
         <w:t>[x] DEVX-01F - Playwright sharding/matrix, merged reports and stable required aggregator</w:t>
+      </w:r>
+    </w:p>
+    <w:p>
+      <w:pPr>
+        <w:pStyle w:val="Normal"/>
+        <w:numPr>
+          <w:ilvl w:val="0"/>
+          <w:numId w:val="1"/>
+        </w:numPr>
+        <w:widowControl/>
+      </w:pPr>
+      <w:r>
+        <w:rPr>
+          <w:rFonts w:ascii="Calibri" w:hAnsi="Calibri" w:cs="Calibri"/>
+        </w:rPr>
+        <w:t>[x] DEVX-01F2 - Contention-safe Vitest sharding</w:t>
       </w:r>
     </w:p>
     <w:p>
@@ -12082,7 +12098,7 @@
               <w:rPr>
                 <w:rFonts w:ascii="Calibri" w:hAnsi="Calibri" w:cs="Calibri"/>
               </w:rPr>
-              <w:t>DEVX-01G - Two-run performance acceptance and workflow closure</w:t>
+              <w:t>DEVX-01F2 - Contention-safe Vitest sharding</w:t>
             </w:r>
           </w:p>
         </w:tc>
@@ -12100,7 +12116,7 @@
               <w:rPr>
                 <w:rFonts w:ascii="Calibri" w:hAnsi="Calibri" w:cs="Calibri"/>
               </w:rPr>
-              <w:t>Prove the bounded workflow and CI improvement over two clean runs</w:t>
+              <w:t>Replace the serial Vitest bottleneck with exact isolated one-worker shards and one validated merged result</w:t>
             </w:r>
           </w:p>
         </w:tc>
@@ -12121,6 +12137,120 @@
                 <w:b/>
                 <w:bCs/>
               </w:rPr>
+              <w:t>Baseline</w:t>
+            </w:r>
+          </w:p>
+        </w:tc>
+        <w:tc>
+          <w:tcPr>
+            <w:tcW w:w="2160" w:type="dxa"/>
+            <w:vAlign w:val="center"/>
+          </w:tcPr>
+          <w:p>
+            <w:pPr>
+              <w:pStyle w:val="TableText"/>
+              <w:widowControl/>
+            </w:pPr>
+            <w:r>
+              <w:rPr>
+                <w:rFonts w:ascii="Calibri" w:hAnsi="Calibri" w:cs="Calibri"/>
+              </w:rPr>
+              <w:t>DEVX-01F</w:t>
+            </w:r>
+          </w:p>
+        </w:tc>
+        <w:tc>
+          <w:tcPr>
+            <w:tcW w:w="2160" w:type="dxa"/>
+            <w:vAlign w:val="center"/>
+          </w:tcPr>
+          <w:p>
+            <w:pPr>
+              <w:pStyle w:val="TableText"/>
+              <w:widowControl/>
+            </w:pPr>
+            <w:r>
+              <w:rPr>
+                <w:rFonts w:ascii="Calibri" w:hAnsi="Calibri" w:cs="Calibri"/>
+              </w:rPr>
+              <w:t>Locked source plan; exact discovery; shard manifests/blobs; merged result</w:t>
+            </w:r>
+          </w:p>
+        </w:tc>
+        <w:tc>
+          <w:tcPr>
+            <w:tcW w:w="2160" w:type="dxa"/>
+            <w:vAlign w:val="center"/>
+          </w:tcPr>
+          <w:p>
+            <w:pPr>
+              <w:pStyle w:val="TableText"/>
+              <w:widowControl/>
+            </w:pPr>
+            <w:r>
+              <w:rPr>
+                <w:rFonts w:ascii="Calibri" w:hAnsi="Calibri" w:cs="Calibri"/>
+              </w:rPr>
+              <w:t>Test, worker, retry or product-semantics change</w:t>
+            </w:r>
+          </w:p>
+        </w:tc>
+      </w:tr>
+      <w:tr>
+        <w:trPr/>
+        <w:tc>
+          <w:tcPr>
+            <w:tcW w:w="2160" w:type="dxa"/>
+            <w:vAlign w:val="center"/>
+          </w:tcPr>
+          <w:p>
+            <w:pPr>
+              <w:pStyle w:val="TableText"/>
+              <w:widowControl/>
+            </w:pPr>
+            <w:r>
+              <w:rPr>
+                <w:rFonts w:ascii="Calibri" w:hAnsi="Calibri" w:cs="Calibri"/>
+              </w:rPr>
+              <w:t>DEVX-01G - Two-run performance acceptance and workflow closure</w:t>
+            </w:r>
+          </w:p>
+        </w:tc>
+        <w:tc>
+          <w:tcPr>
+            <w:tcW w:w="2160" w:type="dxa"/>
+            <w:vAlign w:val="center"/>
+          </w:tcPr>
+          <w:p>
+            <w:pPr>
+              <w:pStyle w:val="TableText"/>
+              <w:widowControl/>
+            </w:pPr>
+            <w:r>
+              <w:rPr>
+                <w:rFonts w:ascii="Calibri" w:hAnsi="Calibri" w:cs="Calibri"/>
+              </w:rPr>
+              <w:t>Prove the bounded workflow and CI improvement over two clean runs</w:t>
+            </w:r>
+          </w:p>
+        </w:tc>
+        <w:tc>
+          <w:tcPr>
+            <w:tcW w:w="2160" w:type="dxa"/>
+            <w:vAlign w:val="center"/>
+          </w:tcPr>
+          <w:p>
+            <w:pPr>
+              <w:pStyle w:val="TableText"/>
+              <w:jc w:val="center"/>
+              <w:widowControl/>
+            </w:pPr>
+            <w:r>
+              <w:rPr>
+                <w:rFonts w:ascii="Calibri" w:hAnsi="Calibri" w:cs="Calibri"/>
+                <w:b/>
+                <w:bCs/>
+              </w:rPr>
               <w:t>Planned / exact next engineering task</w:t>
             </w:r>
           </w:p>
@@ -12139,7 +12269,7 @@
               <w:rPr>
                 <w:rFonts w:ascii="Calibri" w:hAnsi="Calibri" w:cs="Calibri"/>
               </w:rPr>
-              <w:t>DEVX-01F</w:t>
+              <w:t>DEVX-01F2</w:t>
             </w:r>
           </w:p>
         </w:tc>
@@ -12224,7 +12354,7 @@
         <w:rPr>
           <w:rFonts w:ascii="Calibri" w:hAnsi="Calibri" w:cs="Calibri"/>
         </w:rPr>
-        <w:t xml:space="preserve"> status, with a separate bounded timing artifact per profile. Its projected command critical path was 1h 11m 24.063s versus 2h 5m 49.513s measured serial work; achieved timings remain run evidence and two-run performance acceptance remains DEVX-01G authority. DEVX-01E and DEVX-01F are Baseline; DEVX-01G is the exact next engineering task.</w:t>
+        <w:t xml:space="preserve"> status, with a separate bounded timing artifact per profile. Its projected command critical path was 1h 11m 24.063s versus 2h 5m 49.513s measured serial work; achieved timings remain run evidence and two-run performance acceptance remains DEVX-01G authority. DEVX-01E, DEVX-01F and DEVX-01F2 are Baseline; DEVX-01G is the exact next engineering task.</w:t>
       </w:r>
     </w:p>
     <w:p>
@@ -25886,7 +26016,7 @@
         <w:rPr>
           <w:rFonts w:ascii="Calibri" w:hAnsi="Calibri" w:cs="Calibri"/>
         </w:rPr>
-        <w:t>DEVX-01E browser timing authority</w:t>
+        <w:t>DEVX-01 CI matrix authority</w:t>
       </w:r>
     </w:p>
     <w:p>
@@ -25983,6 +26113,22 @@
           <w:rFonts w:ascii="Calibri" w:hAnsi="Calibri" w:cs="Calibri"/>
         </w:rPr>
         <w:t>DEVX-01F = Baseline</w:t>
+      </w:r>
+    </w:p>
+    <w:p>
+      <w:pPr>
+        <w:pStyle w:val="Normal"/>
+        <w:numPr>
+          <w:ilvl w:val="0"/>
+          <w:numId w:val="1"/>
+        </w:numPr>
+        <w:widowControl/>
+      </w:pPr>
+      <w:r>
+        <w:rPr>
+          <w:rFonts w:ascii="Calibri" w:hAnsi="Calibri" w:cs="Calibri"/>
+        </w:rPr>
+        <w:t>DEVX-01F2 = Baseline</w:t>
       </w:r>
     </w:p>
     <w:p>
@@ -26166,7 +26312,35 @@
         <w:rPr>
           <w:rFonts w:ascii="Calibri" w:hAnsi="Calibri" w:cs="Calibri"/>
         </w:rPr>
-        <w:t>. DEVX-01G owns two-run performance acceptance and workflow closure.</w:t>
+        <w:t xml:space="preserve">. DEVX-01F2 locks the three-shard source plan in </w:t>
+      </w:r>
+      <w:r>
+        <w:rPr>
+          <w:rFonts w:ascii="Consolas" w:hAnsi="Consolas" w:cs="Consolas"/>
+          <w:sz w:val="19"/>
+          <w:szCs w:val="19"/>
+        </w:rPr>
+        <w:t>scripts/vitest-ci-plan.v1.json</w:t>
+      </w:r>
+      <w:r>
+        <w:rPr>
+          <w:rFonts w:ascii="Calibri" w:hAnsi="Calibri" w:cs="Calibri"/>
+        </w:rPr>
+        <w:t xml:space="preserve">; runtime discovery binds all current files to official Vitest shards, every row remains one-worker and serial, and </w:t>
+      </w:r>
+      <w:r>
+        <w:rPr>
+          <w:rFonts w:ascii="Consolas" w:hAnsi="Consolas" w:cs="Consolas"/>
+          <w:sz w:val="19"/>
+          <w:szCs w:val="19"/>
+        </w:rPr>
+        <w:t>scripts/vitest-ci.mjs</w:t>
+      </w:r>
+      <w:r>
+        <w:rPr>
+          <w:rFonts w:ascii="Calibri" w:hAnsi="Calibri" w:cs="Calibri"/>
+        </w:rPr>
+        <w:t xml:space="preserve"> rejects incomplete or identity-mismatched manifests and blobs before validating one merged machine-readable result. DEVX-01G owns two-run performance acceptance and workflow closure.</w:t>
       </w:r>
     </w:p>
     <w:sectPr>

</xml_diff>

<commit_message>
docs: close DEVX-01 performance sprint
</commit_message>
<xml_diff>
--- a/docs/VESKIFY_DEVELOPMENT_DELIVERY_TRACKER_v1.3.0.docx
+++ b/docs/VESKIFY_DEVELOPMENT_DELIVERY_TRACKER_v1.3.0.docx
@@ -514,7 +514,21 @@
         <w:rPr>
           <w:rFonts w:ascii="Calibri" w:hAnsi="Calibri" w:cs="Calibri"/>
         </w:rPr>
-        <w:t>[ ] DEVX-01 - Contract-driven development and CI execution enablement</w:t>
+        <w:t>[x] DEVX-01 - Contract-driven development and CI execution enablement (</w:t>
+      </w:r>
+      <w:r>
+        <w:rPr>
+          <w:rFonts w:ascii="Calibri" w:hAnsi="Calibri" w:cs="Calibri"/>
+          <w:b/>
+          <w:bCs/>
+        </w:rPr>
+        <w:t>Baseline / closed</w:t>
+      </w:r>
+      <w:r>
+        <w:rPr>
+          <w:rFonts w:ascii="Calibri" w:hAnsi="Calibri" w:cs="Calibri"/>
+        </w:rPr>
+        <w:t>)</w:t>
       </w:r>
     </w:p>
     <w:p>
@@ -642,21 +656,7 @@
         <w:rPr>
           <w:rFonts w:ascii="Calibri" w:hAnsi="Calibri" w:cs="Calibri"/>
         </w:rPr>
-        <w:t>[ ] DEVX-01G - Two-run performance acceptance and workflow closure (</w:t>
-      </w:r>
-      <w:r>
-        <w:rPr>
-          <w:rFonts w:ascii="Calibri" w:hAnsi="Calibri" w:cs="Calibri"/>
-          <w:b/>
-          <w:bCs/>
-        </w:rPr>
-        <w:t>exact next engineering task</w:t>
-      </w:r>
-      <w:r>
-        <w:rPr>
-          <w:rFonts w:ascii="Calibri" w:hAnsi="Calibri" w:cs="Calibri"/>
-        </w:rPr>
-        <w:t>)</w:t>
+        <w:t>[x] DEVX-01G - Two-run performance acceptance and workflow closure</w:t>
       </w:r>
     </w:p>
     <w:tbl>
@@ -12251,7 +12251,7 @@
                 <w:b/>
                 <w:bCs/>
               </w:rPr>
-              <w:t>Planned / exact next engineering task</w:t>
+              <w:t>Baseline</w:t>
             </w:r>
           </w:p>
         </w:tc>
@@ -12326,7 +12326,7 @@
         <w:rPr>
           <w:rFonts w:ascii="Calibri" w:hAnsi="Calibri" w:cs="Calibri"/>
         </w:rPr>
-        <w:t xml:space="preserve">P10B remains Partial. P10B-19A is the next product-development sprint after DEVX-01. DEVX-01C measured the serial gate, retained PR/ref-scoped cancellation and added compatible </w:t>
+        <w:t xml:space="preserve">P10B remains Partial. DEVX-01A through DEVX-01G are Baseline, and DEVX-01 is Baseline / closed. P10B-19A is the exact next product-development sprint; P10B-19A-01 is the exact next implementation task. DEVX-01C measured the serial gate, retained PR/ref-scoped cancellation and added compatible </w:t>
       </w:r>
       <w:r>
         <w:rPr>
@@ -12354,7 +12354,49 @@
         <w:rPr>
           <w:rFonts w:ascii="Calibri" w:hAnsi="Calibri" w:cs="Calibri"/>
         </w:rPr>
-        <w:t xml:space="preserve"> status, with a separate bounded timing artifact per profile. Its projected command critical path was 1h 11m 24.063s versus 2h 5m 49.513s measured serial work; achieved timings remain run evidence and two-run performance acceptance remains DEVX-01G authority. DEVX-01E, DEVX-01F and DEVX-01F2 are Baseline; DEVX-01G is the exact next engineering task.</w:t>
+        <w:t xml:space="preserve"> status, with a separate bounded timing artifact per profile. Its projected command critical path was 1h 11m 24.063s versus 2h 5m 49.513s measured serial work. Final-architecture Run A (</w:t>
+      </w:r>
+      <w:r>
+        <w:rPr>
+          <w:rFonts w:ascii="Consolas" w:hAnsi="Consolas" w:cs="Consolas"/>
+          <w:sz w:val="19"/>
+          <w:szCs w:val="19"/>
+        </w:rPr>
+        <w:t>33362860614</w:t>
+      </w:r>
+      <w:r>
+        <w:rPr>
+          <w:rFonts w:ascii="Calibri" w:hAnsi="Calibri" w:cs="Calibri"/>
+        </w:rPr>
+        <w:t xml:space="preserve">) completed in 34m27s on a cache miss with 245 Vitest files across </w:t>
+      </w:r>
+      <w:r>
+        <w:rPr>
+          <w:rFonts w:ascii="Consolas" w:hAnsi="Consolas" w:cs="Consolas"/>
+          <w:sz w:val="19"/>
+          <w:szCs w:val="19"/>
+        </w:rPr>
+        <w:t>82 / 82 / 81</w:t>
+      </w:r>
+      <w:r>
+        <w:rPr>
+          <w:rFonts w:ascii="Calibri" w:hAnsi="Calibri" w:cs="Calibri"/>
+        </w:rPr>
+        <w:t xml:space="preserve">, 3,165 passed, one pending, zero failed, all 12 canonical Playwright suites, successful merged reports, and stable </w:t>
+      </w:r>
+      <w:r>
+        <w:rPr>
+          <w:rFonts w:ascii="Consolas" w:hAnsi="Consolas" w:cs="Consolas"/>
+          <w:sz w:val="19"/>
+          <w:szCs w:val="19"/>
+        </w:rPr>
+        <w:t>validate</w:t>
+      </w:r>
+      <w:r>
+        <w:rPr>
+          <w:rFonts w:ascii="Calibri" w:hAnsi="Calibri" w:cs="Calibri"/>
+        </w:rPr>
+        <w:t>. This reduced developer wait time by 1h31m46s (72.706%) from the 2h6m13s original baseline. Summed GitHub job time was 2h9m46s, 3m33s higher than the serial baseline, so lower compute cost is not claimed. Run B remains the final before-merge gate under identical architecture.</w:t>
       </w:r>
     </w:p>
     <w:p>
@@ -26144,23 +26186,55 @@
         <w:rPr>
           <w:rFonts w:ascii="Calibri" w:hAnsi="Calibri" w:cs="Calibri"/>
         </w:rPr>
-        <w:t>DEVX-01G = exact next engineering task</w:t>
-      </w:r>
-    </w:p>
-    <w:p>
-      <w:pPr>
-        <w:pStyle w:val="Normal"/>
-        <w:numPr>
-          <w:ilvl w:val="0"/>
-          <w:numId w:val="1"/>
-        </w:numPr>
-        <w:widowControl/>
-      </w:pPr>
-      <w:r>
-        <w:rPr>
-          <w:rFonts w:ascii="Calibri" w:hAnsi="Calibri" w:cs="Calibri"/>
-        </w:rPr>
-        <w:t>P10B-19A = next product-development sprint after DEVX-01</w:t>
+        <w:t>DEVX-01G = Baseline</w:t>
+      </w:r>
+    </w:p>
+    <w:p>
+      <w:pPr>
+        <w:pStyle w:val="Normal"/>
+        <w:numPr>
+          <w:ilvl w:val="0"/>
+          <w:numId w:val="1"/>
+        </w:numPr>
+        <w:widowControl/>
+      </w:pPr>
+      <w:r>
+        <w:rPr>
+          <w:rFonts w:ascii="Calibri" w:hAnsi="Calibri" w:cs="Calibri"/>
+        </w:rPr>
+        <w:t>DEVX-01 = Baseline / closed</w:t>
+      </w:r>
+    </w:p>
+    <w:p>
+      <w:pPr>
+        <w:pStyle w:val="Normal"/>
+        <w:numPr>
+          <w:ilvl w:val="0"/>
+          <w:numId w:val="1"/>
+        </w:numPr>
+        <w:widowControl/>
+      </w:pPr>
+      <w:r>
+        <w:rPr>
+          <w:rFonts w:ascii="Calibri" w:hAnsi="Calibri" w:cs="Calibri"/>
+        </w:rPr>
+        <w:t>P10B-19A = exact next product-development sprint</w:t>
+      </w:r>
+    </w:p>
+    <w:p>
+      <w:pPr>
+        <w:pStyle w:val="Normal"/>
+        <w:numPr>
+          <w:ilvl w:val="0"/>
+          <w:numId w:val="1"/>
+        </w:numPr>
+        <w:widowControl/>
+      </w:pPr>
+      <w:r>
+        <w:rPr>
+          <w:rFonts w:ascii="Calibri" w:hAnsi="Calibri" w:cs="Calibri"/>
+        </w:rPr>
+        <w:t>P10B-19A-01 = exact next implementation task</w:t>
       </w:r>
     </w:p>
     <w:p>
@@ -26340,7 +26414,7 @@
         <w:rPr>
           <w:rFonts w:ascii="Calibri" w:hAnsi="Calibri" w:cs="Calibri"/>
         </w:rPr>
-        <w:t xml:space="preserve"> rejects incomplete or identity-mismatched manifests and blobs before validating one merged machine-readable result. DEVX-01G owns two-run performance acceptance and workflow closure.</w:t>
+        <w:t xml:space="preserve"> rejects incomplete or identity-mismatched manifests and blobs before validating one merged machine-readable result. DEVX-01G closes the sprint through two comparable clean runs; final Run B remains the merge gate and no CI execution authority changes in this closure task.</w:t>
       </w:r>
     </w:p>
     <w:sectPr>

</xml_diff>

<commit_message>
feat: define structural storefront family identity
</commit_message>
<xml_diff>
--- a/docs/VESKIFY_DEVELOPMENT_DELIVERY_TRACKER_v1.3.0.docx
+++ b/docs/VESKIFY_DEVELOPMENT_DELIVERY_TRACKER_v1.3.0.docx
@@ -7915,6 +7915,276 @@
                 <w:b/>
                 <w:bCs/>
               </w:rPr>
+              <w:t>Partial</w:t>
+            </w:r>
+          </w:p>
+        </w:tc>
+        <w:tc>
+          <w:tcPr>
+            <w:tcW w:w="1500" w:type="dxa"/>
+            <w:vAlign w:val="center"/>
+          </w:tcPr>
+          <w:p>
+            <w:pPr>
+              <w:pStyle w:val="CompactTableText"/>
+              <w:widowControl/>
+            </w:pPr>
+            <w:r>
+              <w:rPr>
+                <w:rFonts w:ascii="Calibri" w:hAnsi="Calibri" w:cs="Calibri"/>
+              </w:rPr>
+              <w:t>Planned task owner</w:t>
+            </w:r>
+          </w:p>
+        </w:tc>
+        <w:tc>
+          <w:tcPr>
+            <w:tcW w:w="2500" w:type="dxa"/>
+            <w:vAlign w:val="center"/>
+          </w:tcPr>
+          <w:p>
+            <w:pPr>
+              <w:pStyle w:val="CompactTableText"/>
+              <w:widowControl/>
+            </w:pPr>
+            <w:r>
+              <w:rPr>
+                <w:rFonts w:ascii="Calibri" w:hAnsi="Calibri" w:cs="Calibri"/>
+              </w:rPr>
+              <w:t>Accepted P10B-19 PRE</w:t>
+            </w:r>
+          </w:p>
+        </w:tc>
+        <w:tc>
+          <w:tcPr>
+            <w:tcW w:w="2890" w:type="dxa"/>
+            <w:vAlign w:val="center"/>
+          </w:tcPr>
+          <w:p>
+            <w:pPr>
+              <w:pStyle w:val="CompactTableText"/>
+              <w:widowControl/>
+            </w:pPr>
+            <w:r>
+              <w:rPr>
+                <w:rFonts w:ascii="Calibri" w:hAnsi="Calibri" w:cs="Calibri"/>
+              </w:rPr>
+              <w:t>Versioned family and PageBlueprint v2 contracts, registry, topology identity, deterministic selection, and v1 compatibility</w:t>
+            </w:r>
+          </w:p>
+        </w:tc>
+      </w:tr>
+      <w:tr>
+        <w:trPr>
+          <w:cantSplit/>
+        </w:trPr>
+        <w:tc>
+          <w:tcPr>
+            <w:tcW w:w="720" w:type="dxa"/>
+            <w:vAlign w:val="center"/>
+          </w:tcPr>
+          <w:p>
+            <w:pPr>
+              <w:pStyle w:val="CompactTableText"/>
+              <w:jc w:val="center"/>
+              <w:widowControl/>
+            </w:pPr>
+            <w:r>
+              <w:rPr>
+                <w:rFonts w:ascii="Calibri" w:hAnsi="Calibri" w:cs="Calibri"/>
+              </w:rPr>
+              <w:t>☑</w:t>
+            </w:r>
+          </w:p>
+        </w:tc>
+        <w:tc>
+          <w:tcPr>
+            <w:tcW w:w="1700" w:type="dxa"/>
+            <w:vAlign w:val="center"/>
+          </w:tcPr>
+          <w:p>
+            <w:pPr>
+              <w:pStyle w:val="CompactTableText"/>
+              <w:widowControl/>
+            </w:pPr>
+            <w:r>
+              <w:rPr>
+                <w:rFonts w:ascii="Calibri" w:hAnsi="Calibri" w:cs="Calibri"/>
+              </w:rPr>
+              <w:t>P10B-19A-01</w:t>
+            </w:r>
+          </w:p>
+        </w:tc>
+        <w:tc>
+          <w:tcPr>
+            <w:tcW w:w="2800" w:type="dxa"/>
+            <w:vAlign w:val="center"/>
+          </w:tcPr>
+          <w:p>
+            <w:pPr>
+              <w:pStyle w:val="CompactTableText"/>
+              <w:widowControl/>
+            </w:pPr>
+            <w:r>
+              <w:rPr>
+                <w:rFonts w:ascii="Calibri" w:hAnsi="Calibri" w:cs="Calibri"/>
+              </w:rPr>
+              <w:t>Structural family identity and lifecycle authority</w:t>
+            </w:r>
+          </w:p>
+        </w:tc>
+        <w:tc>
+          <w:tcPr>
+            <w:tcW w:w="850" w:type="dxa"/>
+            <w:vAlign w:val="center"/>
+          </w:tcPr>
+          <w:p>
+            <w:pPr>
+              <w:pStyle w:val="CompactTableText"/>
+              <w:jc w:val="center"/>
+              <w:widowControl/>
+            </w:pPr>
+            <w:r>
+              <w:rPr>
+                <w:rFonts w:ascii="Calibri" w:hAnsi="Calibri" w:cs="Calibri"/>
+                <w:b/>
+                <w:bCs/>
+              </w:rPr>
+              <w:t>Baseline</w:t>
+            </w:r>
+          </w:p>
+        </w:tc>
+        <w:tc>
+          <w:tcPr>
+            <w:tcW w:w="1500" w:type="dxa"/>
+            <w:vAlign w:val="center"/>
+          </w:tcPr>
+          <w:p>
+            <w:pPr>
+              <w:pStyle w:val="CompactTableText"/>
+              <w:widowControl/>
+            </w:pPr>
+            <w:r>
+              <w:rPr>
+                <w:rFonts w:ascii="Calibri" w:hAnsi="Calibri" w:cs="Calibri"/>
+              </w:rPr>
+              <w:t>P10B-19A task owner</w:t>
+            </w:r>
+          </w:p>
+        </w:tc>
+        <w:tc>
+          <w:tcPr>
+            <w:tcW w:w="2500" w:type="dxa"/>
+            <w:vAlign w:val="center"/>
+          </w:tcPr>
+          <w:p>
+            <w:pPr>
+              <w:pStyle w:val="CompactTableText"/>
+              <w:widowControl/>
+            </w:pPr>
+            <w:r>
+              <w:rPr>
+                <w:rFonts w:ascii="Calibri" w:hAnsi="Calibri" w:cs="Calibri"/>
+              </w:rPr>
+              <w:t>DEVX-01 closed</w:t>
+            </w:r>
+          </w:p>
+        </w:tc>
+        <w:tc>
+          <w:tcPr>
+            <w:tcW w:w="2890" w:type="dxa"/>
+            <w:vAlign w:val="center"/>
+          </w:tcPr>
+          <w:p>
+            <w:pPr>
+              <w:pStyle w:val="CompactTableText"/>
+              <w:widowControl/>
+            </w:pPr>
+            <w:r>
+              <w:rPr>
+                <w:rFonts w:ascii="Calibri" w:hAnsi="Calibri" w:cs="Calibri"/>
+              </w:rPr>
+              <w:t>Exact six-ID vocabulary, supported-major-v1 versions, immutable identity, lifecycle transitions, selectability, and no registry or current-generation wiring</w:t>
+            </w:r>
+          </w:p>
+        </w:tc>
+      </w:tr>
+      <w:tr>
+        <w:trPr>
+          <w:cantSplit/>
+        </w:trPr>
+        <w:tc>
+          <w:tcPr>
+            <w:tcW w:w="720" w:type="dxa"/>
+            <w:vAlign w:val="center"/>
+          </w:tcPr>
+          <w:p>
+            <w:pPr>
+              <w:pStyle w:val="CompactTableText"/>
+              <w:jc w:val="center"/>
+              <w:widowControl/>
+            </w:pPr>
+            <w:r>
+              <w:rPr>
+                <w:rFonts w:ascii="Calibri" w:hAnsi="Calibri" w:cs="Calibri"/>
+              </w:rPr>
+              <w:t>☐</w:t>
+            </w:r>
+          </w:p>
+        </w:tc>
+        <w:tc>
+          <w:tcPr>
+            <w:tcW w:w="1700" w:type="dxa"/>
+            <w:vAlign w:val="center"/>
+          </w:tcPr>
+          <w:p>
+            <w:pPr>
+              <w:pStyle w:val="CompactTableText"/>
+              <w:widowControl/>
+            </w:pPr>
+            <w:r>
+              <w:rPr>
+                <w:rFonts w:ascii="Calibri" w:hAnsi="Calibri" w:cs="Calibri"/>
+              </w:rPr>
+              <w:t>P10B-19A-02</w:t>
+            </w:r>
+          </w:p>
+        </w:tc>
+        <w:tc>
+          <w:tcPr>
+            <w:tcW w:w="2800" w:type="dxa"/>
+            <w:vAlign w:val="center"/>
+          </w:tcPr>
+          <w:p>
+            <w:pPr>
+              <w:pStyle w:val="CompactTableText"/>
+              <w:widowControl/>
+            </w:pPr>
+            <w:r>
+              <w:rPr>
+                <w:rFonts w:ascii="Calibri" w:hAnsi="Calibri" w:cs="Calibri"/>
+              </w:rPr>
+              <w:t>Cross-Page Structural Relationship Contract</w:t>
+            </w:r>
+          </w:p>
+        </w:tc>
+        <w:tc>
+          <w:tcPr>
+            <w:tcW w:w="850" w:type="dxa"/>
+            <w:vAlign w:val="center"/>
+          </w:tcPr>
+          <w:p>
+            <w:pPr>
+              <w:pStyle w:val="CompactTableText"/>
+              <w:jc w:val="center"/>
+              <w:widowControl/>
+            </w:pPr>
+            <w:r>
+              <w:rPr>
+                <w:rFonts w:ascii="Calibri" w:hAnsi="Calibri" w:cs="Calibri"/>
+                <w:b/>
+                <w:bCs/>
+              </w:rPr>
               <w:t>Planned / exact next</w:t>
             </w:r>
           </w:p>
@@ -7951,7 +8221,7 @@
               <w:rPr>
                 <w:rFonts w:ascii="Calibri" w:hAnsi="Calibri" w:cs="Calibri"/>
               </w:rPr>
-              <w:t>Accepted P10B-19 PRE</w:t>
+              <w:t>P10B-19A-01 merged</w:t>
             </w:r>
           </w:p>
         </w:tc>
@@ -7969,7 +8239,7 @@
               <w:rPr>
                 <w:rFonts w:ascii="Calibri" w:hAnsi="Calibri" w:cs="Calibri"/>
               </w:rPr>
-              <w:t>Versioned family and PageBlueprint v2 contracts, registry, topology identity, deterministic selection, and v1 compatibility</w:t>
+              <w:t>Bounded merchant-neutral cross-page relationship authority</w:t>
             </w:r>
           </w:p>
         </w:tc>
@@ -12326,7 +12596,7 @@
         <w:rPr>
           <w:rFonts w:ascii="Calibri" w:hAnsi="Calibri" w:cs="Calibri"/>
         </w:rPr>
-        <w:t xml:space="preserve">P10B remains Partial. DEVX-01A through DEVX-01G are Baseline, and DEVX-01 is Baseline / closed. P10B-19A is the exact next product-development sprint; P10B-19A-01 is the exact next implementation task. DEVX-01C measured the serial gate, retained PR/ref-scoped cancellation and added compatible </w:t>
+        <w:t xml:space="preserve">P10B remains Partial. DEVX-01A through DEVX-01G are Baseline, and DEVX-01 is Baseline / closed. P10B-19A-01 is Baseline, P10B-19A is Partial, and P10B-19A-02 is the exact next implementation task. DEVX-01C measured the serial gate, retained PR/ref-scoped cancellation and added compatible </w:t>
       </w:r>
       <w:r>
         <w:rPr>
@@ -13089,6 +13359,200 @@
         <w:rPr>
           <w:rFonts w:ascii="Calibri" w:hAnsi="Calibri" w:cs="Calibri"/>
         </w:rPr>
+        <w:t xml:space="preserve">P10B-19A-01 is </w:t>
+      </w:r>
+      <w:r>
+        <w:rPr>
+          <w:rFonts w:ascii="Calibri" w:hAnsi="Calibri" w:cs="Calibri"/>
+          <w:b/>
+          <w:bCs/>
+        </w:rPr>
+        <w:t>Baseline</w:t>
+      </w:r>
+      <w:r>
+        <w:rPr>
+          <w:rFonts w:ascii="Calibri" w:hAnsi="Calibri" w:cs="Calibri"/>
+        </w:rPr>
+        <w:t xml:space="preserve">, and parent P10B-19A is </w:t>
+      </w:r>
+      <w:r>
+        <w:rPr>
+          <w:rFonts w:ascii="Calibri" w:hAnsi="Calibri" w:cs="Calibri"/>
+          <w:b/>
+          <w:bCs/>
+        </w:rPr>
+        <w:t>Partial</w:t>
+      </w:r>
+      <w:r>
+        <w:rPr>
+          <w:rFonts w:ascii="Calibri" w:hAnsi="Calibri" w:cs="Calibri"/>
+        </w:rPr>
+        <w:t xml:space="preserve">. P10B-19A-02 - Cross-Page Structural Relationship Contract is the exact next implementation task. P10B-19A-01 establishes </w:t>
+      </w:r>
+      <w:r>
+        <w:rPr>
+          <w:rFonts w:ascii="Consolas" w:hAnsi="Consolas" w:cs="Consolas"/>
+          <w:sz w:val="19"/>
+          <w:szCs w:val="19"/>
+        </w:rPr>
+        <w:t>src/domain/structural-storefront-family</w:t>
+      </w:r>
+      <w:r>
+        <w:rPr>
+          <w:rFonts w:ascii="Calibri" w:hAnsi="Calibri" w:cs="Calibri"/>
+        </w:rPr>
+        <w:t xml:space="preserve"> as the sole family identity authority with the ordered IDs </w:t>
+      </w:r>
+      <w:r>
+        <w:rPr>
+          <w:rFonts w:ascii="Consolas" w:hAnsi="Consolas" w:cs="Consolas"/>
+          <w:sz w:val="19"/>
+          <w:szCs w:val="19"/>
+        </w:rPr>
+        <w:t>editorial-offset</w:t>
+      </w:r>
+      <w:r>
+        <w:rPr>
+          <w:rFonts w:ascii="Calibri" w:hAnsi="Calibri" w:cs="Calibri"/>
+        </w:rPr>
+        <w:t xml:space="preserve">, </w:t>
+      </w:r>
+      <w:r>
+        <w:rPr>
+          <w:rFonts w:ascii="Consolas" w:hAnsi="Consolas" w:cs="Consolas"/>
+          <w:sz w:val="19"/>
+          <w:szCs w:val="19"/>
+        </w:rPr>
+        <w:t>campaign-modular</w:t>
+      </w:r>
+      <w:r>
+        <w:rPr>
+          <w:rFonts w:ascii="Calibri" w:hAnsi="Calibri" w:cs="Calibri"/>
+        </w:rPr>
+        <w:t xml:space="preserve">, </w:t>
+      </w:r>
+      <w:r>
+        <w:rPr>
+          <w:rFonts w:ascii="Consolas" w:hAnsi="Consolas" w:cs="Consolas"/>
+          <w:sz w:val="19"/>
+          <w:szCs w:val="19"/>
+        </w:rPr>
+        <w:t>product-first-commerce</w:t>
+      </w:r>
+      <w:r>
+        <w:rPr>
+          <w:rFonts w:ascii="Calibri" w:hAnsi="Calibri" w:cs="Calibri"/>
+        </w:rPr>
+        <w:t xml:space="preserve">, </w:t>
+      </w:r>
+      <w:r>
+        <w:rPr>
+          <w:rFonts w:ascii="Consolas" w:hAnsi="Consolas" w:cs="Consolas"/>
+          <w:sz w:val="19"/>
+          <w:szCs w:val="19"/>
+        </w:rPr>
+        <w:t>technical-comparison</w:t>
+      </w:r>
+      <w:r>
+        <w:rPr>
+          <w:rFonts w:ascii="Calibri" w:hAnsi="Calibri" w:cs="Calibri"/>
+        </w:rPr>
+        <w:t xml:space="preserve">, </w:t>
+      </w:r>
+      <w:r>
+        <w:rPr>
+          <w:rFonts w:ascii="Consolas" w:hAnsi="Consolas" w:cs="Consolas"/>
+          <w:sz w:val="19"/>
+          <w:szCs w:val="19"/>
+        </w:rPr>
+        <w:t>warm-narrative</w:t>
+      </w:r>
+      <w:r>
+        <w:rPr>
+          <w:rFonts w:ascii="Calibri" w:hAnsi="Calibri" w:cs="Calibri"/>
+        </w:rPr>
+        <w:t xml:space="preserve">, and </w:t>
+      </w:r>
+      <w:r>
+        <w:rPr>
+          <w:rFonts w:ascii="Consolas" w:hAnsi="Consolas" w:cs="Consolas"/>
+          <w:sz w:val="19"/>
+          <w:szCs w:val="19"/>
+        </w:rPr>
+        <w:t>restrained-gallery</w:t>
+      </w:r>
+      <w:r>
+        <w:rPr>
+          <w:rFonts w:ascii="Calibri" w:hAnsi="Calibri" w:cs="Calibri"/>
+        </w:rPr>
+        <w:t xml:space="preserve">; strict supported-major-v1 versions beginning at </w:t>
+      </w:r>
+      <w:r>
+        <w:rPr>
+          <w:rFonts w:ascii="Consolas" w:hAnsi="Consolas" w:cs="Consolas"/>
+          <w:sz w:val="19"/>
+          <w:szCs w:val="19"/>
+        </w:rPr>
+        <w:t>1.0.0</w:t>
+      </w:r>
+      <w:r>
+        <w:rPr>
+          <w:rFonts w:ascii="Calibri" w:hAnsi="Calibri" w:cs="Calibri"/>
+        </w:rPr>
+        <w:t xml:space="preserve">; and lifecycle states </w:t>
+      </w:r>
+      <w:r>
+        <w:rPr>
+          <w:rFonts w:ascii="Consolas" w:hAnsi="Consolas" w:cs="Consolas"/>
+          <w:sz w:val="19"/>
+          <w:szCs w:val="19"/>
+        </w:rPr>
+        <w:t>candidate</w:t>
+      </w:r>
+      <w:r>
+        <w:rPr>
+          <w:rFonts w:ascii="Calibri" w:hAnsi="Calibri" w:cs="Calibri"/>
+        </w:rPr>
+        <w:t xml:space="preserve">, </w:t>
+      </w:r>
+      <w:r>
+        <w:rPr>
+          <w:rFonts w:ascii="Consolas" w:hAnsi="Consolas" w:cs="Consolas"/>
+          <w:sz w:val="19"/>
+          <w:szCs w:val="19"/>
+        </w:rPr>
+        <w:t>active</w:t>
+      </w:r>
+      <w:r>
+        <w:rPr>
+          <w:rFonts w:ascii="Calibri" w:hAnsi="Calibri" w:cs="Calibri"/>
+        </w:rPr>
+        <w:t xml:space="preserve">, and </w:t>
+      </w:r>
+      <w:r>
+        <w:rPr>
+          <w:rFonts w:ascii="Consolas" w:hAnsi="Consolas" w:cs="Consolas"/>
+          <w:sz w:val="19"/>
+          <w:szCs w:val="19"/>
+        </w:rPr>
+        <w:t>deprecated</w:t>
+      </w:r>
+      <w:r>
+        <w:rPr>
+          <w:rFonts w:ascii="Calibri" w:hAnsi="Calibri" w:cs="Calibri"/>
+        </w:rPr>
+        <w:t>. Active-family and candidate- registry-record counts remain zero. No registry, fingerprint, selection, PageBlueprint v2, rendering, or current-generation wiring exists yet.</w:t>
+      </w:r>
+    </w:p>
+    <w:p>
+      <w:pPr>
+        <w:pStyle w:val="Normal"/>
+        <w:widowControl/>
+      </w:pPr>
+      <w:r>
+        <w:rPr>
+          <w:rFonts w:ascii="Calibri" w:hAnsi="Calibri" w:cs="Calibri"/>
+        </w:rPr>
         <w:t>No P10B-19A production authority is implemented by DEVX-01A.</w:t>
       </w:r>
     </w:p>
@@ -14104,6 +14568,34 @@
           <w:b/>
           <w:bCs/>
         </w:rPr>
+        <w:t>Partial</w:t>
+      </w:r>
+      <w:r>
+        <w:rPr>
+          <w:rFonts w:ascii="Calibri" w:hAnsi="Calibri" w:cs="Calibri"/>
+        </w:rPr>
+        <w:t xml:space="preserve">; P10B-19A-01 is </w:t>
+      </w:r>
+      <w:r>
+        <w:rPr>
+          <w:rFonts w:ascii="Calibri" w:hAnsi="Calibri" w:cs="Calibri"/>
+          <w:b/>
+          <w:bCs/>
+        </w:rPr>
+        <w:t>Baseline</w:t>
+      </w:r>
+      <w:r>
+        <w:rPr>
+          <w:rFonts w:ascii="Calibri" w:hAnsi="Calibri" w:cs="Calibri"/>
+        </w:rPr>
+        <w:t xml:space="preserve">, and P10B-19A-02 is </w:t>
+      </w:r>
+      <w:r>
+        <w:rPr>
+          <w:rFonts w:ascii="Calibri" w:hAnsi="Calibri" w:cs="Calibri"/>
+          <w:b/>
+          <w:bCs/>
+        </w:rPr>
         <w:t>Planned / exact next</w:t>
       </w:r>
       <w:r>
@@ -14126,7 +14618,7 @@
         <w:rPr>
           <w:rFonts w:ascii="Calibri" w:hAnsi="Calibri" w:cs="Calibri"/>
         </w:rPr>
-        <w:t>. The remaining Done conditions are implementation gates, not claims about the current repository. The P10B-16P-01 through P10B-16P-05A plus P10B-16P-06 sequence is a mandatory convergence package between P10B-16 and P10B-17; it supplements rather than renumbers the locked P10B-01 through P10B-18 plan. P10B-16P-05B follows accepted P10B-18C and is now Baseline. P10B-18D completed as a rejected-quality diagnostic. P10B-19 PRE is Baseline. P10B-19A is the exact next product task, followed by planned P10B-19B through P10B-19J.</w:t>
+        <w:t>. The remaining Done conditions are implementation gates, not claims about the current repository. The P10B-16P-01 through P10B-16P-05A plus P10B-16P-06 sequence is a mandatory convergence package between P10B-16 and P10B-17; it supplements rather than renumbers the locked P10B-01 through P10B-18 plan. P10B-16P-05B follows accepted P10B-18C and is now Baseline. P10B-18D completed as a rejected-quality diagnostic. P10B-19 PRE is Baseline. P10B-19A is Partial; P10B-19A-02 is the exact next product task, followed by planned P10B-19B through P10B-19J.</w:t>
       </w:r>
     </w:p>
     <w:p>
@@ -25667,7 +26159,7 @@
         <w:rPr>
           <w:rFonts w:ascii="Calibri" w:hAnsi="Calibri" w:cs="Calibri"/>
         </w:rPr>
-        <w:t xml:space="preserve"> with zero primary FAIL. P10B-16P-05B subsequently removed the one-time capture platform while retaining the bounded quality gate. P10B-18D subsequently completed as a rejected-quality diagnostic. P10B-19 PRE is Baseline, and P10B-19A is the exact next task.</w:t>
+        <w:t xml:space="preserve"> with zero primary FAIL. P10B-16P-05B subsequently removed the one-time capture platform while retaining the bounded quality gate. P10B-18D subsequently completed as a rejected-quality diagnostic. P10B-19 PRE is Baseline, and P10B-19A is Partial; P10B-19A-02 is the exact next task.</w:t>
       </w:r>
     </w:p>
     <w:p>
@@ -25890,7 +26382,7 @@
               <w:rPr>
                 <w:rFonts w:ascii="Calibri" w:hAnsi="Calibri" w:cs="Calibri"/>
               </w:rPr>
-              <w:t>Next</w:t>
+              <w:t>Current</w:t>
             </w:r>
           </w:p>
         </w:tc>
@@ -25928,7 +26420,7 @@
                 <w:b/>
                 <w:bCs/>
               </w:rPr>
-              <w:t>Planned / exact next</w:t>
+              <w:t>Partial</w:t>
             </w:r>
           </w:p>
         </w:tc>
@@ -25968,7 +26460,7 @@
               <w:rPr>
                 <w:rFonts w:ascii="Calibri" w:hAnsi="Calibri" w:cs="Calibri"/>
               </w:rPr>
-              <w:t>Planned</w:t>
+              <w:t>Next</w:t>
             </w:r>
           </w:p>
         </w:tc>
@@ -25986,7 +26478,7 @@
               <w:rPr>
                 <w:rFonts w:ascii="Calibri" w:hAnsi="Calibri" w:cs="Calibri"/>
               </w:rPr>
-              <w:t>P10B-19B through P10B-19J</w:t>
+              <w:t>P10B-19A-02</w:t>
             </w:r>
           </w:p>
         </w:tc>
@@ -26006,6 +26498,84 @@
                 <w:b/>
                 <w:bCs/>
               </w:rPr>
+              <w:t>Planned / exact next</w:t>
+            </w:r>
+          </w:p>
+        </w:tc>
+        <w:tc>
+          <w:tcPr>
+            <w:tcW w:w="8460" w:type="dxa"/>
+            <w:vAlign w:val="center"/>
+          </w:tcPr>
+          <w:p>
+            <w:pPr>
+              <w:pStyle w:val="TableText"/>
+              <w:widowControl/>
+            </w:pPr>
+            <w:r>
+              <w:rPr>
+                <w:rFonts w:ascii="Calibri" w:hAnsi="Calibri" w:cs="Calibri"/>
+              </w:rPr>
+              <w:t>Cross-page Structural Storefront Family relationship contract</w:t>
+            </w:r>
+          </w:p>
+        </w:tc>
+      </w:tr>
+      <w:tr>
+        <w:trPr/>
+        <w:tc>
+          <w:tcPr>
+            <w:tcW w:w="1000" w:type="dxa"/>
+            <w:vAlign w:val="center"/>
+          </w:tcPr>
+          <w:p>
+            <w:pPr>
+              <w:pStyle w:val="TableText"/>
+              <w:jc w:val="center"/>
+              <w:widowControl/>
+            </w:pPr>
+            <w:r>
+              <w:rPr>
+                <w:rFonts w:ascii="Calibri" w:hAnsi="Calibri" w:cs="Calibri"/>
+              </w:rPr>
+              <w:t>Planned</w:t>
+            </w:r>
+          </w:p>
+        </w:tc>
+        <w:tc>
+          <w:tcPr>
+            <w:tcW w:w="1500" w:type="dxa"/>
+            <w:vAlign w:val="center"/>
+          </w:tcPr>
+          <w:p>
+            <w:pPr>
+              <w:pStyle w:val="TableText"/>
+              <w:widowControl/>
+            </w:pPr>
+            <w:r>
+              <w:rPr>
+                <w:rFonts w:ascii="Calibri" w:hAnsi="Calibri" w:cs="Calibri"/>
+              </w:rPr>
+              <w:t>P10B-19B through P10B-19J</w:t>
+            </w:r>
+          </w:p>
+        </w:tc>
+        <w:tc>
+          <w:tcPr>
+            <w:tcW w:w="2000" w:type="dxa"/>
+            <w:vAlign w:val="center"/>
+          </w:tcPr>
+          <w:p>
+            <w:pPr>
+              <w:pStyle w:val="TableText"/>
+              <w:widowControl/>
+            </w:pPr>
+            <w:r>
+              <w:rPr>
+                <w:rFonts w:ascii="Calibri" w:hAnsi="Calibri" w:cs="Calibri"/>
+                <w:b/>
+                <w:bCs/>
+              </w:rPr>
               <w:t>Planned</w:t>
             </w:r>
           </w:p>
@@ -26218,23 +26788,39 @@
         <w:rPr>
           <w:rFonts w:ascii="Calibri" w:hAnsi="Calibri" w:cs="Calibri"/>
         </w:rPr>
-        <w:t>P10B-19A = exact next product-development sprint</w:t>
-      </w:r>
-    </w:p>
-    <w:p>
-      <w:pPr>
-        <w:pStyle w:val="Normal"/>
-        <w:numPr>
-          <w:ilvl w:val="0"/>
-          <w:numId w:val="1"/>
-        </w:numPr>
-        <w:widowControl/>
-      </w:pPr>
-      <w:r>
-        <w:rPr>
-          <w:rFonts w:ascii="Calibri" w:hAnsi="Calibri" w:cs="Calibri"/>
-        </w:rPr>
-        <w:t>P10B-19A-01 = exact next implementation task</w:t>
+        <w:t>P10B-19A-01 = Baseline</w:t>
+      </w:r>
+    </w:p>
+    <w:p>
+      <w:pPr>
+        <w:pStyle w:val="Normal"/>
+        <w:numPr>
+          <w:ilvl w:val="0"/>
+          <w:numId w:val="1"/>
+        </w:numPr>
+        <w:widowControl/>
+      </w:pPr>
+      <w:r>
+        <w:rPr>
+          <w:rFonts w:ascii="Calibri" w:hAnsi="Calibri" w:cs="Calibri"/>
+        </w:rPr>
+        <w:t>P10B-19A = Partial</w:t>
+      </w:r>
+    </w:p>
+    <w:p>
+      <w:pPr>
+        <w:pStyle w:val="Normal"/>
+        <w:numPr>
+          <w:ilvl w:val="0"/>
+          <w:numId w:val="1"/>
+        </w:numPr>
+        <w:widowControl/>
+      </w:pPr>
+      <w:r>
+        <w:rPr>
+          <w:rFonts w:ascii="Calibri" w:hAnsi="Calibri" w:cs="Calibri"/>
+        </w:rPr>
+        <w:t>P10B-19A-02 = exact next implementation task</w:t>
       </w:r>
     </w:p>
     <w:p>

</xml_diff>

<commit_message>
feat: add cross-page structural relationship contract
</commit_message>
<xml_diff>
--- a/docs/VESKIFY_DEVELOPMENT_DELIVERY_TRACKER_v1.3.0.docx
+++ b/docs/VESKIFY_DEVELOPMENT_DELIVERY_TRACKER_v1.3.0.docx
@@ -8128,7 +8128,7 @@
               <w:rPr>
                 <w:rFonts w:ascii="Calibri" w:hAnsi="Calibri" w:cs="Calibri"/>
               </w:rPr>
-              <w:t>☐</w:t>
+              <w:t>☑</w:t>
             </w:r>
           </w:p>
         </w:tc>
@@ -8185,6 +8185,141 @@
                 <w:b/>
                 <w:bCs/>
               </w:rPr>
+              <w:t>Baseline</w:t>
+            </w:r>
+          </w:p>
+        </w:tc>
+        <w:tc>
+          <w:tcPr>
+            <w:tcW w:w="1500" w:type="dxa"/>
+            <w:vAlign w:val="center"/>
+          </w:tcPr>
+          <w:p>
+            <w:pPr>
+              <w:pStyle w:val="CompactTableText"/>
+              <w:widowControl/>
+            </w:pPr>
+            <w:r>
+              <w:rPr>
+                <w:rFonts w:ascii="Calibri" w:hAnsi="Calibri" w:cs="Calibri"/>
+              </w:rPr>
+              <w:t>P10B-19A task owner</w:t>
+            </w:r>
+          </w:p>
+        </w:tc>
+        <w:tc>
+          <w:tcPr>
+            <w:tcW w:w="2500" w:type="dxa"/>
+            <w:vAlign w:val="center"/>
+          </w:tcPr>
+          <w:p>
+            <w:pPr>
+              <w:pStyle w:val="CompactTableText"/>
+              <w:widowControl/>
+            </w:pPr>
+            <w:r>
+              <w:rPr>
+                <w:rFonts w:ascii="Calibri" w:hAnsi="Calibri" w:cs="Calibri"/>
+              </w:rPr>
+              <w:t>P10B-19A-01 merged</w:t>
+            </w:r>
+          </w:p>
+        </w:tc>
+        <w:tc>
+          <w:tcPr>
+            <w:tcW w:w="2890" w:type="dxa"/>
+            <w:vAlign w:val="center"/>
+          </w:tcPr>
+          <w:p>
+            <w:pPr>
+              <w:pStyle w:val="CompactTableText"/>
+              <w:widowControl/>
+            </w:pPr>
+            <w:r>
+              <w:rPr>
+                <w:rFonts w:ascii="Calibri" w:hAnsi="Calibri" w:cs="Calibri"/>
+              </w:rPr>
+              <w:t>Exact six-role and seven-kind directed relationship vocabulary, strict immutable value object, deterministic key, duplicate rejection and canonical collection order; zero records or consumers</w:t>
+            </w:r>
+          </w:p>
+        </w:tc>
+      </w:tr>
+      <w:tr>
+        <w:trPr>
+          <w:cantSplit/>
+        </w:trPr>
+        <w:tc>
+          <w:tcPr>
+            <w:tcW w:w="720" w:type="dxa"/>
+            <w:vAlign w:val="center"/>
+          </w:tcPr>
+          <w:p>
+            <w:pPr>
+              <w:pStyle w:val="CompactTableText"/>
+              <w:jc w:val="center"/>
+              <w:widowControl/>
+            </w:pPr>
+            <w:r>
+              <w:rPr>
+                <w:rFonts w:ascii="Calibri" w:hAnsi="Calibri" w:cs="Calibri"/>
+              </w:rPr>
+              <w:t>☐</w:t>
+            </w:r>
+          </w:p>
+        </w:tc>
+        <w:tc>
+          <w:tcPr>
+            <w:tcW w:w="1700" w:type="dxa"/>
+            <w:vAlign w:val="center"/>
+          </w:tcPr>
+          <w:p>
+            <w:pPr>
+              <w:pStyle w:val="CompactTableText"/>
+              <w:widowControl/>
+            </w:pPr>
+            <w:r>
+              <w:rPr>
+                <w:rFonts w:ascii="Calibri" w:hAnsi="Calibri" w:cs="Calibri"/>
+              </w:rPr>
+              <w:t>P10B-19A-03</w:t>
+            </w:r>
+          </w:p>
+        </w:tc>
+        <w:tc>
+          <w:tcPr>
+            <w:tcW w:w="2800" w:type="dxa"/>
+            <w:vAlign w:val="center"/>
+          </w:tcPr>
+          <w:p>
+            <w:pPr>
+              <w:pStyle w:val="CompactTableText"/>
+              <w:widowControl/>
+            </w:pPr>
+            <w:r>
+              <w:rPr>
+                <w:rFonts w:ascii="Calibri" w:hAnsi="Calibri" w:cs="Calibri"/>
+              </w:rPr>
+              <w:t>Required page structures and PageBlueprint v2 dispatch</w:t>
+            </w:r>
+          </w:p>
+        </w:tc>
+        <w:tc>
+          <w:tcPr>
+            <w:tcW w:w="850" w:type="dxa"/>
+            <w:vAlign w:val="center"/>
+          </w:tcPr>
+          <w:p>
+            <w:pPr>
+              <w:pStyle w:val="CompactTableText"/>
+              <w:jc w:val="center"/>
+              <w:widowControl/>
+            </w:pPr>
+            <w:r>
+              <w:rPr>
+                <w:rFonts w:ascii="Calibri" w:hAnsi="Calibri" w:cs="Calibri"/>
+                <w:b/>
+                <w:bCs/>
+              </w:rPr>
               <w:t>Planned / exact next</w:t>
             </w:r>
           </w:p>
@@ -8221,7 +8356,7 @@
               <w:rPr>
                 <w:rFonts w:ascii="Calibri" w:hAnsi="Calibri" w:cs="Calibri"/>
               </w:rPr>
-              <w:t>P10B-19A-01 merged</w:t>
+              <w:t>P10B-19A-02 merged</w:t>
             </w:r>
           </w:p>
         </w:tc>
@@ -8239,7 +8374,7 @@
               <w:rPr>
                 <w:rFonts w:ascii="Calibri" w:hAnsi="Calibri" w:cs="Calibri"/>
               </w:rPr>
-              <w:t>Bounded merchant-neutral cross-page relationship authority</w:t>
+              <w:t>Required page structures, region graph and PageBlueprint v2 dispatch</w:t>
             </w:r>
           </w:p>
         </w:tc>
@@ -12596,7 +12731,7 @@
         <w:rPr>
           <w:rFonts w:ascii="Calibri" w:hAnsi="Calibri" w:cs="Calibri"/>
         </w:rPr>
-        <w:t xml:space="preserve">P10B remains Partial. DEVX-01A through DEVX-01G are Baseline, and DEVX-01 is Baseline / closed. P10B-19A-01 is Baseline, P10B-19A is Partial, and P10B-19A-02 is the exact next implementation task. DEVX-01C measured the serial gate, retained PR/ref-scoped cancellation and added compatible </w:t>
+        <w:t xml:space="preserve">P10B remains Partial. DEVX-01A through DEVX-01G are Baseline, and DEVX-01 is Baseline / closed. P10B-19A-01 and P10B-19A-02 are Baseline, P10B-19A is Partial, and P10B-19A-03 is the exact next implementation task. DEVX-01C measured the serial gate, retained PR/ref-scoped cancellation and added compatible </w:t>
       </w:r>
       <w:r>
         <w:rPr>
@@ -13359,7 +13494,7 @@
         <w:rPr>
           <w:rFonts w:ascii="Calibri" w:hAnsi="Calibri" w:cs="Calibri"/>
         </w:rPr>
-        <w:t xml:space="preserve">P10B-19A-01 is </w:t>
+        <w:t xml:space="preserve">P10B-19A-01 and P10B-19A-02 are </w:t>
       </w:r>
       <w:r>
         <w:rPr>
@@ -13387,7 +13522,7 @@
         <w:rPr>
           <w:rFonts w:ascii="Calibri" w:hAnsi="Calibri" w:cs="Calibri"/>
         </w:rPr>
-        <w:t xml:space="preserve">. P10B-19A-02 - Cross-Page Structural Relationship Contract is the exact next implementation task. P10B-19A-01 establishes </w:t>
+        <w:t xml:space="preserve">. P10B-19A-03 - Required Page Structures, Region Graph and PageBlueprint v2 Dispatch is the exact next implementation task. P10B-19A-02 adds the strict six-role and seven-kind directed relationship value object, deterministic key, bounded duplicate evidence and canonical collection ordering. It adds zero active family records, candidate registry records, persisted relationships, production-selected relationships or current-generation consumers. P10B-19A-01 establishes </w:t>
       </w:r>
       <w:r>
         <w:rPr>
@@ -14574,7 +14709,7 @@
         <w:rPr>
           <w:rFonts w:ascii="Calibri" w:hAnsi="Calibri" w:cs="Calibri"/>
         </w:rPr>
-        <w:t xml:space="preserve">; P10B-19A-01 is </w:t>
+        <w:t xml:space="preserve">; P10B-19A-01 and P10B-19A-02 are </w:t>
       </w:r>
       <w:r>
         <w:rPr>
@@ -14588,7 +14723,7 @@
         <w:rPr>
           <w:rFonts w:ascii="Calibri" w:hAnsi="Calibri" w:cs="Calibri"/>
         </w:rPr>
-        <w:t xml:space="preserve">, and P10B-19A-02 is </w:t>
+        <w:t xml:space="preserve">, and P10B-19A-03 is </w:t>
       </w:r>
       <w:r>
         <w:rPr>
@@ -14618,7 +14753,7 @@
         <w:rPr>
           <w:rFonts w:ascii="Calibri" w:hAnsi="Calibri" w:cs="Calibri"/>
         </w:rPr>
-        <w:t>. The remaining Done conditions are implementation gates, not claims about the current repository. The P10B-16P-01 through P10B-16P-05A plus P10B-16P-06 sequence is a mandatory convergence package between P10B-16 and P10B-17; it supplements rather than renumbers the locked P10B-01 through P10B-18 plan. P10B-16P-05B follows accepted P10B-18C and is now Baseline. P10B-18D completed as a rejected-quality diagnostic. P10B-19 PRE is Baseline. P10B-19A is Partial; P10B-19A-02 is the exact next product task, followed by planned P10B-19B through P10B-19J.</w:t>
+        <w:t>. The remaining Done conditions are implementation gates, not claims about the current repository. The P10B-16P-01 through P10B-16P-05A plus P10B-16P-06 sequence is a mandatory convergence package between P10B-16 and P10B-17; it supplements rather than renumbers the locked P10B-01 through P10B-18 plan. P10B-16P-05B follows accepted P10B-18C and is now Baseline. P10B-18D completed as a rejected-quality diagnostic. P10B-19 PRE is Baseline. P10B-19A is Partial; P10B-19A-01 and P10B-19A-02 are Baseline, P10B-19A-03 is the exact next product task, followed by planned P10B-19B through P10B-19J.</w:t>
       </w:r>
     </w:p>
     <w:p>
@@ -26460,7 +26595,7 @@
               <w:rPr>
                 <w:rFonts w:ascii="Calibri" w:hAnsi="Calibri" w:cs="Calibri"/>
               </w:rPr>
-              <w:t>Next</w:t>
+              <w:t>Baseline</w:t>
             </w:r>
           </w:p>
         </w:tc>
@@ -26478,7 +26613,7 @@
               <w:rPr>
                 <w:rFonts w:ascii="Calibri" w:hAnsi="Calibri" w:cs="Calibri"/>
               </w:rPr>
-              <w:t>P10B-19A-02</w:t>
+              <w:t>P10B-19A-01</w:t>
             </w:r>
           </w:p>
         </w:tc>
@@ -26498,7 +26633,7 @@
                 <w:b/>
                 <w:bCs/>
               </w:rPr>
-              <w:t>Planned / exact next</w:t>
+              <w:t>Baseline</w:t>
             </w:r>
           </w:p>
         </w:tc>
@@ -26516,7 +26651,7 @@
               <w:rPr>
                 <w:rFonts w:ascii="Calibri" w:hAnsi="Calibri" w:cs="Calibri"/>
               </w:rPr>
-              <w:t>Cross-page Structural Storefront Family relationship contract</w:t>
+              <w:t>Structural family identity, version and lifecycle authority</w:t>
             </w:r>
           </w:p>
         </w:tc>
@@ -26538,7 +26673,7 @@
               <w:rPr>
                 <w:rFonts w:ascii="Calibri" w:hAnsi="Calibri" w:cs="Calibri"/>
               </w:rPr>
-              <w:t>Planned</w:t>
+              <w:t>Baseline</w:t>
             </w:r>
           </w:p>
         </w:tc>
@@ -26556,7 +26691,7 @@
               <w:rPr>
                 <w:rFonts w:ascii="Calibri" w:hAnsi="Calibri" w:cs="Calibri"/>
               </w:rPr>
-              <w:t>P10B-19B through P10B-19J</w:t>
+              <w:t>P10B-19A-02</w:t>
             </w:r>
           </w:p>
         </w:tc>
@@ -26576,6 +26711,162 @@
                 <w:b/>
                 <w:bCs/>
               </w:rPr>
+              <w:t>Baseline</w:t>
+            </w:r>
+          </w:p>
+        </w:tc>
+        <w:tc>
+          <w:tcPr>
+            <w:tcW w:w="8460" w:type="dxa"/>
+            <w:vAlign w:val="center"/>
+          </w:tcPr>
+          <w:p>
+            <w:pPr>
+              <w:pStyle w:val="TableText"/>
+              <w:widowControl/>
+            </w:pPr>
+            <w:r>
+              <w:rPr>
+                <w:rFonts w:ascii="Calibri" w:hAnsi="Calibri" w:cs="Calibri"/>
+              </w:rPr>
+              <w:t>Cross-page Structural Storefront Family relationship contract</w:t>
+            </w:r>
+          </w:p>
+        </w:tc>
+      </w:tr>
+      <w:tr>
+        <w:trPr/>
+        <w:tc>
+          <w:tcPr>
+            <w:tcW w:w="1000" w:type="dxa"/>
+            <w:vAlign w:val="center"/>
+          </w:tcPr>
+          <w:p>
+            <w:pPr>
+              <w:pStyle w:val="TableText"/>
+              <w:jc w:val="center"/>
+              <w:widowControl/>
+            </w:pPr>
+            <w:r>
+              <w:rPr>
+                <w:rFonts w:ascii="Calibri" w:hAnsi="Calibri" w:cs="Calibri"/>
+              </w:rPr>
+              <w:t>Next</w:t>
+            </w:r>
+          </w:p>
+        </w:tc>
+        <w:tc>
+          <w:tcPr>
+            <w:tcW w:w="1500" w:type="dxa"/>
+            <w:vAlign w:val="center"/>
+          </w:tcPr>
+          <w:p>
+            <w:pPr>
+              <w:pStyle w:val="TableText"/>
+              <w:widowControl/>
+            </w:pPr>
+            <w:r>
+              <w:rPr>
+                <w:rFonts w:ascii="Calibri" w:hAnsi="Calibri" w:cs="Calibri"/>
+              </w:rPr>
+              <w:t>P10B-19A-03</w:t>
+            </w:r>
+          </w:p>
+        </w:tc>
+        <w:tc>
+          <w:tcPr>
+            <w:tcW w:w="2000" w:type="dxa"/>
+            <w:vAlign w:val="center"/>
+          </w:tcPr>
+          <w:p>
+            <w:pPr>
+              <w:pStyle w:val="TableText"/>
+              <w:widowControl/>
+            </w:pPr>
+            <w:r>
+              <w:rPr>
+                <w:rFonts w:ascii="Calibri" w:hAnsi="Calibri" w:cs="Calibri"/>
+                <w:b/>
+                <w:bCs/>
+              </w:rPr>
+              <w:t>Planned / exact next</w:t>
+            </w:r>
+          </w:p>
+        </w:tc>
+        <w:tc>
+          <w:tcPr>
+            <w:tcW w:w="8460" w:type="dxa"/>
+            <w:vAlign w:val="center"/>
+          </w:tcPr>
+          <w:p>
+            <w:pPr>
+              <w:pStyle w:val="TableText"/>
+              <w:widowControl/>
+            </w:pPr>
+            <w:r>
+              <w:rPr>
+                <w:rFonts w:ascii="Calibri" w:hAnsi="Calibri" w:cs="Calibri"/>
+              </w:rPr>
+              <w:t>Required page structures, region graph and PageBlueprint v2 dispatch</w:t>
+            </w:r>
+          </w:p>
+        </w:tc>
+      </w:tr>
+      <w:tr>
+        <w:trPr/>
+        <w:tc>
+          <w:tcPr>
+            <w:tcW w:w="1000" w:type="dxa"/>
+            <w:vAlign w:val="center"/>
+          </w:tcPr>
+          <w:p>
+            <w:pPr>
+              <w:pStyle w:val="TableText"/>
+              <w:jc w:val="center"/>
+              <w:widowControl/>
+            </w:pPr>
+            <w:r>
+              <w:rPr>
+                <w:rFonts w:ascii="Calibri" w:hAnsi="Calibri" w:cs="Calibri"/>
+              </w:rPr>
+              <w:t>Planned</w:t>
+            </w:r>
+          </w:p>
+        </w:tc>
+        <w:tc>
+          <w:tcPr>
+            <w:tcW w:w="1500" w:type="dxa"/>
+            <w:vAlign w:val="center"/>
+          </w:tcPr>
+          <w:p>
+            <w:pPr>
+              <w:pStyle w:val="TableText"/>
+              <w:widowControl/>
+            </w:pPr>
+            <w:r>
+              <w:rPr>
+                <w:rFonts w:ascii="Calibri" w:hAnsi="Calibri" w:cs="Calibri"/>
+              </w:rPr>
+              <w:t>P10B-19B through P10B-19J</w:t>
+            </w:r>
+          </w:p>
+        </w:tc>
+        <w:tc>
+          <w:tcPr>
+            <w:tcW w:w="2000" w:type="dxa"/>
+            <w:vAlign w:val="center"/>
+          </w:tcPr>
+          <w:p>
+            <w:pPr>
+              <w:pStyle w:val="TableText"/>
+              <w:widowControl/>
+            </w:pPr>
+            <w:r>
+              <w:rPr>
+                <w:rFonts w:ascii="Calibri" w:hAnsi="Calibri" w:cs="Calibri"/>
+                <w:b/>
+                <w:bCs/>
+              </w:rPr>
               <w:t>Planned</w:t>
             </w:r>
           </w:p>
@@ -26804,6 +27095,22 @@
         <w:rPr>
           <w:rFonts w:ascii="Calibri" w:hAnsi="Calibri" w:cs="Calibri"/>
         </w:rPr>
+        <w:t>P10B-19A-02 = Baseline</w:t>
+      </w:r>
+    </w:p>
+    <w:p>
+      <w:pPr>
+        <w:pStyle w:val="Normal"/>
+        <w:numPr>
+          <w:ilvl w:val="0"/>
+          <w:numId w:val="1"/>
+        </w:numPr>
+        <w:widowControl/>
+      </w:pPr>
+      <w:r>
+        <w:rPr>
+          <w:rFonts w:ascii="Calibri" w:hAnsi="Calibri" w:cs="Calibri"/>
+        </w:rPr>
         <w:t>P10B-19A = Partial</w:t>
       </w:r>
     </w:p>
@@ -26820,7 +27127,7 @@
         <w:rPr>
           <w:rFonts w:ascii="Calibri" w:hAnsi="Calibri" w:cs="Calibri"/>
         </w:rPr>
-        <w:t>P10B-19A-02 = exact next implementation task</w:t>
+        <w:t>P10B-19A-03 = exact next implementation task</w:t>
       </w:r>
     </w:p>
     <w:p>

</xml_diff>

<commit_message>
feat: add PageBlueprint v2 structural contract
</commit_message>
<xml_diff>
--- a/docs/VESKIFY_DEVELOPMENT_DELIVERY_TRACKER_v1.3.0.docx
+++ b/docs/VESKIFY_DEVELOPMENT_DELIVERY_TRACKER_v1.3.0.docx
@@ -38,7 +38,7 @@
         <w:rPr>
           <w:rFonts w:ascii="Calibri" w:hAnsi="Calibri" w:cs="Calibri"/>
         </w:rPr>
-        <w:t>Delivery status baseline: 19 August 2026, accepted P10B-18B-04 PDP quality upgrade</w:t>
+        <w:t>Delivery status baseline: 1 September 2026, P10B-19A-03 required page structures, region graph and PageBlueprint v2 dispatch Baseline</w:t>
       </w:r>
     </w:p>
     <w:p>
@@ -245,7 +245,7 @@
               <w:rPr>
                 <w:rFonts w:ascii="Calibri" w:hAnsi="Calibri" w:cs="Calibri"/>
               </w:rPr>
-              <w:t>19 August 2026, accepted P10B-18B-04 PDP quality upgrade</w:t>
+              <w:t>1 September 2026, P10B-19A-03 required page structures, region graph and PageBlueprint v2 dispatch Baseline</w:t>
             </w:r>
           </w:p>
         </w:tc>
@@ -8263,7 +8263,7 @@
               <w:rPr>
                 <w:rFonts w:ascii="Calibri" w:hAnsi="Calibri" w:cs="Calibri"/>
               </w:rPr>
-              <w:t>☐</w:t>
+              <w:t>☑</w:t>
             </w:r>
           </w:p>
         </w:tc>
@@ -8320,6 +8320,141 @@
                 <w:b/>
                 <w:bCs/>
               </w:rPr>
+              <w:t>Baseline</w:t>
+            </w:r>
+          </w:p>
+        </w:tc>
+        <w:tc>
+          <w:tcPr>
+            <w:tcW w:w="1500" w:type="dxa"/>
+            <w:vAlign w:val="center"/>
+          </w:tcPr>
+          <w:p>
+            <w:pPr>
+              <w:pStyle w:val="CompactTableText"/>
+              <w:widowControl/>
+            </w:pPr>
+            <w:r>
+              <w:rPr>
+                <w:rFonts w:ascii="Calibri" w:hAnsi="Calibri" w:cs="Calibri"/>
+              </w:rPr>
+              <w:t>P10B-19A task owner</w:t>
+            </w:r>
+          </w:p>
+        </w:tc>
+        <w:tc>
+          <w:tcPr>
+            <w:tcW w:w="2500" w:type="dxa"/>
+            <w:vAlign w:val="center"/>
+          </w:tcPr>
+          <w:p>
+            <w:pPr>
+              <w:pStyle w:val="CompactTableText"/>
+              <w:widowControl/>
+            </w:pPr>
+            <w:r>
+              <w:rPr>
+                <w:rFonts w:ascii="Calibri" w:hAnsi="Calibri" w:cs="Calibri"/>
+              </w:rPr>
+              <w:t>P10B-19A-02 merged</w:t>
+            </w:r>
+          </w:p>
+        </w:tc>
+        <w:tc>
+          <w:tcPr>
+            <w:tcW w:w="2890" w:type="dxa"/>
+            <w:vAlign w:val="center"/>
+          </w:tcPr>
+          <w:p>
+            <w:pPr>
+              <w:pStyle w:val="CompactTableText"/>
+              <w:widowControl/>
+            </w:pPr>
+            <w:r>
+              <w:rPr>
+                <w:rFonts w:ascii="Calibri" w:hAnsi="Calibri" w:cs="Calibri"/>
+              </w:rPr>
+              <w:t>Explicit v1/v2 contract dispatch, strict inactive v2 regions, minimum roles, bounded graph/order invariants and deterministic canonicalization; zero v2 records, registry, persistence or consumers</w:t>
+            </w:r>
+          </w:p>
+        </w:tc>
+      </w:tr>
+      <w:tr>
+        <w:trPr>
+          <w:cantSplit/>
+        </w:trPr>
+        <w:tc>
+          <w:tcPr>
+            <w:tcW w:w="720" w:type="dxa"/>
+            <w:vAlign w:val="center"/>
+          </w:tcPr>
+          <w:p>
+            <w:pPr>
+              <w:pStyle w:val="CompactTableText"/>
+              <w:jc w:val="center"/>
+              <w:widowControl/>
+            </w:pPr>
+            <w:r>
+              <w:rPr>
+                <w:rFonts w:ascii="Calibri" w:hAnsi="Calibri" w:cs="Calibri"/>
+              </w:rPr>
+              <w:t>☐</w:t>
+            </w:r>
+          </w:p>
+        </w:tc>
+        <w:tc>
+          <w:tcPr>
+            <w:tcW w:w="1700" w:type="dxa"/>
+            <w:vAlign w:val="center"/>
+          </w:tcPr>
+          <w:p>
+            <w:pPr>
+              <w:pStyle w:val="CompactTableText"/>
+              <w:widowControl/>
+            </w:pPr>
+            <w:r>
+              <w:rPr>
+                <w:rFonts w:ascii="Calibri" w:hAnsi="Calibri" w:cs="Calibri"/>
+              </w:rPr>
+              <w:t>P10B-19A-04</w:t>
+            </w:r>
+          </w:p>
+        </w:tc>
+        <w:tc>
+          <w:tcPr>
+            <w:tcW w:w="2800" w:type="dxa"/>
+            <w:vAlign w:val="center"/>
+          </w:tcPr>
+          <w:p>
+            <w:pPr>
+              <w:pStyle w:val="CompactTableText"/>
+              <w:widowControl/>
+            </w:pPr>
+            <w:r>
+              <w:rPr>
+                <w:rFonts w:ascii="Calibri" w:hAnsi="Calibri" w:cs="Calibri"/>
+              </w:rPr>
+              <w:t>Asset-Role Contract</w:t>
+            </w:r>
+          </w:p>
+        </w:tc>
+        <w:tc>
+          <w:tcPr>
+            <w:tcW w:w="850" w:type="dxa"/>
+            <w:vAlign w:val="center"/>
+          </w:tcPr>
+          <w:p>
+            <w:pPr>
+              <w:pStyle w:val="CompactTableText"/>
+              <w:jc w:val="center"/>
+              <w:widowControl/>
+            </w:pPr>
+            <w:r>
+              <w:rPr>
+                <w:rFonts w:ascii="Calibri" w:hAnsi="Calibri" w:cs="Calibri"/>
+                <w:b/>
+                <w:bCs/>
+              </w:rPr>
               <w:t>Planned / exact next</w:t>
             </w:r>
           </w:p>
@@ -8356,7 +8491,7 @@
               <w:rPr>
                 <w:rFonts w:ascii="Calibri" w:hAnsi="Calibri" w:cs="Calibri"/>
               </w:rPr>
-              <w:t>P10B-19A-02 merged</w:t>
+              <w:t>P10B-19A-03 merged</w:t>
             </w:r>
           </w:p>
         </w:tc>
@@ -8374,7 +8509,7 @@
               <w:rPr>
                 <w:rFonts w:ascii="Calibri" w:hAnsi="Calibri" w:cs="Calibri"/>
               </w:rPr>
-              <w:t>Required page structures, region graph and PageBlueprint v2 dispatch</w:t>
+              <w:t>Add the bounded PageBlueprint v2 asset-role contract without beginning responsive or fallback authority</w:t>
             </w:r>
           </w:p>
         </w:tc>
@@ -12731,7 +12866,7 @@
         <w:rPr>
           <w:rFonts w:ascii="Calibri" w:hAnsi="Calibri" w:cs="Calibri"/>
         </w:rPr>
-        <w:t xml:space="preserve">P10B remains Partial. DEVX-01A through DEVX-01G are Baseline, and DEVX-01 is Baseline / closed. P10B-19A-01 and P10B-19A-02 are Baseline, P10B-19A is Partial, and P10B-19A-03 is the exact next implementation task. DEVX-01C measured the serial gate, retained PR/ref-scoped cancellation and added compatible </w:t>
+        <w:t xml:space="preserve">P10B remains Partial. DEVX-01A through DEVX-01G are Baseline, and DEVX-01 is Baseline / closed. P10B-19A-01, P10B-19A-02 and P10B-19A-03 are Baseline, P10B-19A is Partial, and P10B-19A-04 is the exact next implementation task. DEVX-01C measured the serial gate, retained PR/ref-scoped cancellation and added compatible </w:t>
       </w:r>
       <w:r>
         <w:rPr>
@@ -13494,7 +13629,7 @@
         <w:rPr>
           <w:rFonts w:ascii="Calibri" w:hAnsi="Calibri" w:cs="Calibri"/>
         </w:rPr>
-        <w:t xml:space="preserve">P10B-19A-01 and P10B-19A-02 are </w:t>
+        <w:t xml:space="preserve">P10B-19A-01, P10B-19A-02 and P10B-19A-03 are </w:t>
       </w:r>
       <w:r>
         <w:rPr>
@@ -13522,7 +13657,147 @@
         <w:rPr>
           <w:rFonts w:ascii="Calibri" w:hAnsi="Calibri" w:cs="Calibri"/>
         </w:rPr>
-        <w:t xml:space="preserve">. P10B-19A-03 - Required Page Structures, Region Graph and PageBlueprint v2 Dispatch is the exact next implementation task. P10B-19A-02 adds the strict six-role and seven-kind directed relationship value object, deterministic key, bounded duplicate evidence and canonical collection ordering. It adds zero active family records, candidate registry records, persisted relationships, production-selected relationships or current-generation consumers. P10B-19A-01 establishes </w:t>
+        <w:t xml:space="preserve">. P10B-19A-04 - Asset-Role Contract is the exact next implementation task. P10B-19A-03 adds the strict inactive PageBlueprint v2 structural contract and explicit v1 </w:t>
+      </w:r>
+      <w:r>
+        <w:rPr>
+          <w:rFonts w:ascii="Consolas" w:hAnsi="Consolas" w:cs="Consolas"/>
+          <w:sz w:val="19"/>
+          <w:szCs w:val="19"/>
+        </w:rPr>
+        <w:t>1.0.0</w:t>
+      </w:r>
+      <w:r>
+        <w:rPr>
+          <w:rFonts w:ascii="Calibri" w:hAnsi="Calibri" w:cs="Calibri"/>
+        </w:rPr>
+        <w:t xml:space="preserve"> / v2 </w:t>
+      </w:r>
+      <w:r>
+        <w:rPr>
+          <w:rFonts w:ascii="Consolas" w:hAnsi="Consolas" w:cs="Consolas"/>
+          <w:sz w:val="19"/>
+          <w:szCs w:val="19"/>
+        </w:rPr>
+        <w:t>2.0.0</w:t>
+      </w:r>
+      <w:r>
+        <w:rPr>
+          <w:rFonts w:ascii="Calibri" w:hAnsi="Calibri" w:cs="Calibri"/>
+        </w:rPr>
+        <w:t xml:space="preserve"> </w:t>
+      </w:r>
+      <w:r>
+        <w:rPr>
+          <w:rFonts w:ascii="Consolas" w:hAnsi="Consolas" w:cs="Consolas"/>
+          <w:sz w:val="19"/>
+          <w:szCs w:val="19"/>
+        </w:rPr>
+        <w:t>contractSchemaVersion</w:t>
+      </w:r>
+      <w:r>
+        <w:rPr>
+          <w:rFonts w:ascii="Calibri" w:hAnsi="Calibri" w:cs="Calibri"/>
+        </w:rPr>
+        <w:t xml:space="preserve"> dispatch under </w:t>
+      </w:r>
+      <w:r>
+        <w:rPr>
+          <w:rFonts w:ascii="Consolas" w:hAnsi="Consolas" w:cs="Consolas"/>
+          <w:sz w:val="19"/>
+          <w:szCs w:val="19"/>
+        </w:rPr>
+        <w:t>src/application/storefront-templates</w:t>
+      </w:r>
+      <w:r>
+        <w:rPr>
+          <w:rFonts w:ascii="Calibri" w:hAnsi="Calibri" w:cs="Calibri"/>
+        </w:rPr>
+        <w:t xml:space="preserve">. It reuses canonical page-family, narrative-role and visual-weight authority; locks </w:t>
+      </w:r>
+      <w:r>
+        <w:rPr>
+          <w:rFonts w:ascii="Consolas" w:hAnsi="Consolas" w:cs="Consolas"/>
+          <w:sz w:val="19"/>
+          <w:szCs w:val="19"/>
+        </w:rPr>
+        <w:t>precedes</w:t>
+      </w:r>
+      <w:r>
+        <w:rPr>
+          <w:rFonts w:ascii="Calibri" w:hAnsi="Calibri" w:cs="Calibri"/>
+        </w:rPr>
+        <w:t xml:space="preserve">, </w:t>
+      </w:r>
+      <w:r>
+        <w:rPr>
+          <w:rFonts w:ascii="Consolas" w:hAnsi="Consolas" w:cs="Consolas"/>
+          <w:sz w:val="19"/>
+          <w:szCs w:val="19"/>
+        </w:rPr>
+        <w:t>pairs-with</w:t>
+      </w:r>
+      <w:r>
+        <w:rPr>
+          <w:rFonts w:ascii="Calibri" w:hAnsi="Calibri" w:cs="Calibri"/>
+        </w:rPr>
+        <w:t xml:space="preserve">, </w:t>
+      </w:r>
+      <w:r>
+        <w:rPr>
+          <w:rFonts w:ascii="Consolas" w:hAnsi="Consolas" w:cs="Consolas"/>
+          <w:sz w:val="19"/>
+          <w:szCs w:val="19"/>
+        </w:rPr>
+        <w:t>offsets</w:t>
+      </w:r>
+      <w:r>
+        <w:rPr>
+          <w:rFonts w:ascii="Calibri" w:hAnsi="Calibri" w:cs="Calibri"/>
+        </w:rPr>
+        <w:t xml:space="preserve">, </w:t>
+      </w:r>
+      <w:r>
+        <w:rPr>
+          <w:rFonts w:ascii="Consolas" w:hAnsi="Consolas" w:cs="Consolas"/>
+          <w:sz w:val="19"/>
+          <w:szCs w:val="19"/>
+        </w:rPr>
+        <w:t>contains</w:t>
+      </w:r>
+      <w:r>
+        <w:rPr>
+          <w:rFonts w:ascii="Calibri" w:hAnsi="Calibri" w:cs="Calibri"/>
+        </w:rPr>
+        <w:t xml:space="preserve">, </w:t>
+      </w:r>
+      <w:r>
+        <w:rPr>
+          <w:rFonts w:ascii="Consolas" w:hAnsi="Consolas" w:cs="Consolas"/>
+          <w:sz w:val="19"/>
+          <w:szCs w:val="19"/>
+        </w:rPr>
+        <w:t>spans</w:t>
+      </w:r>
+      <w:r>
+        <w:rPr>
+          <w:rFonts w:ascii="Calibri" w:hAnsi="Calibri" w:cs="Calibri"/>
+        </w:rPr>
+        <w:t xml:space="preserve"> and </w:t>
+      </w:r>
+      <w:r>
+        <w:rPr>
+          <w:rFonts w:ascii="Consolas" w:hAnsi="Consolas" w:cs="Consolas"/>
+          <w:sz w:val="19"/>
+          <w:szCs w:val="19"/>
+        </w:rPr>
+        <w:t>anchors</w:t>
+      </w:r>
+      <w:r>
+        <w:rPr>
+          <w:rFonts w:ascii="Calibri" w:hAnsi="Calibri" w:cs="Calibri"/>
+        </w:rPr>
+        <w:t xml:space="preserve">; validates required-role minimums, bounded graph invariants and complete accessible order alternatives; and canonicalizes only valid authority. Existing v1 profiles are unchanged. Active-family, candidate-family-registry, v2-record, v2-registry, persisted-v2 and current-generation-v2-consumer counts remain zero. Asset-role, responsive and fallback authority remain unimplemented. P10B-19A-02 adds the strict six-role and seven-kind directed relationship value object, deterministic key, bounded duplicate evidence and canonical collection ordering. It adds zero active family records, candidate registry records, persisted relationships, production-selected relationships or current-generation consumers. P10B-19A-01 establishes </w:t>
       </w:r>
       <w:r>
         <w:rPr>
@@ -14709,7 +14984,7 @@
         <w:rPr>
           <w:rFonts w:ascii="Calibri" w:hAnsi="Calibri" w:cs="Calibri"/>
         </w:rPr>
-        <w:t xml:space="preserve">; P10B-19A-01 and P10B-19A-02 are </w:t>
+        <w:t xml:space="preserve">; P10B-19A-01, P10B-19A-02 and P10B-19A-03 are </w:t>
       </w:r>
       <w:r>
         <w:rPr>
@@ -14723,7 +14998,7 @@
         <w:rPr>
           <w:rFonts w:ascii="Calibri" w:hAnsi="Calibri" w:cs="Calibri"/>
         </w:rPr>
-        <w:t xml:space="preserve">, and P10B-19A-03 is </w:t>
+        <w:t xml:space="preserve">, and P10B-19A-04 is </w:t>
       </w:r>
       <w:r>
         <w:rPr>
@@ -14753,7 +15028,7 @@
         <w:rPr>
           <w:rFonts w:ascii="Calibri" w:hAnsi="Calibri" w:cs="Calibri"/>
         </w:rPr>
-        <w:t>. The remaining Done conditions are implementation gates, not claims about the current repository. The P10B-16P-01 through P10B-16P-05A plus P10B-16P-06 sequence is a mandatory convergence package between P10B-16 and P10B-17; it supplements rather than renumbers the locked P10B-01 through P10B-18 plan. P10B-16P-05B follows accepted P10B-18C and is now Baseline. P10B-18D completed as a rejected-quality diagnostic. P10B-19 PRE is Baseline. P10B-19A is Partial; P10B-19A-01 and P10B-19A-02 are Baseline, P10B-19A-03 is the exact next product task, followed by planned P10B-19B through P10B-19J.</w:t>
+        <w:t>. The remaining Done conditions are implementation gates, not claims about the current repository. The P10B-16P-01 through P10B-16P-05A plus P10B-16P-06 sequence is a mandatory convergence package between P10B-16 and P10B-17; it supplements rather than renumbers the locked P10B-01 through P10B-18 plan. P10B-16P-05B follows accepted P10B-18C and is now Baseline. P10B-18D completed as a rejected-quality diagnostic. P10B-19 PRE is Baseline. P10B-19A is Partial; P10B-19A-01, P10B-19A-02 and P10B-19A-03 are Baseline, P10B-19A-04 is the exact next product task, followed by planned P10B-19B through P10B-19J.</w:t>
       </w:r>
     </w:p>
     <w:p>
@@ -26294,7 +26569,7 @@
         <w:rPr>
           <w:rFonts w:ascii="Calibri" w:hAnsi="Calibri" w:cs="Calibri"/>
         </w:rPr>
-        <w:t xml:space="preserve"> with zero primary FAIL. P10B-16P-05B subsequently removed the one-time capture platform while retaining the bounded quality gate. P10B-18D subsequently completed as a rejected-quality diagnostic. P10B-19 PRE is Baseline, and P10B-19A is Partial; P10B-19A-01 and P10B-19A-02 are Baseline, and P10B-19A-03 is the exact next task.</w:t>
+        <w:t xml:space="preserve"> with zero primary FAIL. P10B-16P-05B subsequently removed the one-time capture platform while retaining the bounded quality gate. P10B-18D subsequently completed as a rejected-quality diagnostic. P10B-19 PRE is Baseline, and P10B-19A is Partial; P10B-19A-01, P10B-19A-02 and P10B-19A-03 are Baseline, and P10B-19A-04 is the exact next task.</w:t>
       </w:r>
     </w:p>
     <w:p>
@@ -26751,7 +27026,7 @@
               <w:rPr>
                 <w:rFonts w:ascii="Calibri" w:hAnsi="Calibri" w:cs="Calibri"/>
               </w:rPr>
-              <w:t>Next</w:t>
+              <w:t>Baseline</w:t>
             </w:r>
           </w:p>
         </w:tc>
@@ -26789,7 +27064,7 @@
                 <w:b/>
                 <w:bCs/>
               </w:rPr>
-              <w:t>Planned / exact next</w:t>
+              <w:t>Baseline</w:t>
             </w:r>
           </w:p>
         </w:tc>
@@ -26807,7 +27082,7 @@
               <w:rPr>
                 <w:rFonts w:ascii="Calibri" w:hAnsi="Calibri" w:cs="Calibri"/>
               </w:rPr>
-              <w:t>Required page structures, region graph and PageBlueprint v2 dispatch</w:t>
+              <w:t>Required page structures, region graph and explicit PageBlueprint v1/v2 dispatch; zero v2 records or production consumers</w:t>
             </w:r>
           </w:p>
         </w:tc>
@@ -26829,7 +27104,7 @@
               <w:rPr>
                 <w:rFonts w:ascii="Calibri" w:hAnsi="Calibri" w:cs="Calibri"/>
               </w:rPr>
-              <w:t>Planned</w:t>
+              <w:t>Next</w:t>
             </w:r>
           </w:p>
         </w:tc>
@@ -26847,7 +27122,7 @@
               <w:rPr>
                 <w:rFonts w:ascii="Calibri" w:hAnsi="Calibri" w:cs="Calibri"/>
               </w:rPr>
-              <w:t>P10B-19B through P10B-19J</w:t>
+              <w:t>P10B-19A-04</w:t>
             </w:r>
           </w:p>
         </w:tc>
@@ -26867,6 +27142,84 @@
                 <w:b/>
                 <w:bCs/>
               </w:rPr>
+              <w:t>Planned / exact next</w:t>
+            </w:r>
+          </w:p>
+        </w:tc>
+        <w:tc>
+          <w:tcPr>
+            <w:tcW w:w="8460" w:type="dxa"/>
+            <w:vAlign w:val="center"/>
+          </w:tcPr>
+          <w:p>
+            <w:pPr>
+              <w:pStyle w:val="TableText"/>
+              <w:widowControl/>
+            </w:pPr>
+            <w:r>
+              <w:rPr>
+                <w:rFonts w:ascii="Calibri" w:hAnsi="Calibri" w:cs="Calibri"/>
+              </w:rPr>
+              <w:t>Asset-role contract</w:t>
+            </w:r>
+          </w:p>
+        </w:tc>
+      </w:tr>
+      <w:tr>
+        <w:trPr/>
+        <w:tc>
+          <w:tcPr>
+            <w:tcW w:w="1000" w:type="dxa"/>
+            <w:vAlign w:val="center"/>
+          </w:tcPr>
+          <w:p>
+            <w:pPr>
+              <w:pStyle w:val="TableText"/>
+              <w:jc w:val="center"/>
+              <w:widowControl/>
+            </w:pPr>
+            <w:r>
+              <w:rPr>
+                <w:rFonts w:ascii="Calibri" w:hAnsi="Calibri" w:cs="Calibri"/>
+              </w:rPr>
+              <w:t>Planned</w:t>
+            </w:r>
+          </w:p>
+        </w:tc>
+        <w:tc>
+          <w:tcPr>
+            <w:tcW w:w="1500" w:type="dxa"/>
+            <w:vAlign w:val="center"/>
+          </w:tcPr>
+          <w:p>
+            <w:pPr>
+              <w:pStyle w:val="TableText"/>
+              <w:widowControl/>
+            </w:pPr>
+            <w:r>
+              <w:rPr>
+                <w:rFonts w:ascii="Calibri" w:hAnsi="Calibri" w:cs="Calibri"/>
+              </w:rPr>
+              <w:t>P10B-19B through P10B-19J</w:t>
+            </w:r>
+          </w:p>
+        </w:tc>
+        <w:tc>
+          <w:tcPr>
+            <w:tcW w:w="2000" w:type="dxa"/>
+            <w:vAlign w:val="center"/>
+          </w:tcPr>
+          <w:p>
+            <w:pPr>
+              <w:pStyle w:val="TableText"/>
+              <w:widowControl/>
+            </w:pPr>
+            <w:r>
+              <w:rPr>
+                <w:rFonts w:ascii="Calibri" w:hAnsi="Calibri" w:cs="Calibri"/>
+                <w:b/>
+                <w:bCs/>
+              </w:rPr>
               <w:t>Planned</w:t>
             </w:r>
           </w:p>
@@ -27111,6 +27464,22 @@
         <w:rPr>
           <w:rFonts w:ascii="Calibri" w:hAnsi="Calibri" w:cs="Calibri"/>
         </w:rPr>
+        <w:t>P10B-19A-03 = Baseline</w:t>
+      </w:r>
+    </w:p>
+    <w:p>
+      <w:pPr>
+        <w:pStyle w:val="Normal"/>
+        <w:numPr>
+          <w:ilvl w:val="0"/>
+          <w:numId w:val="1"/>
+        </w:numPr>
+        <w:widowControl/>
+      </w:pPr>
+      <w:r>
+        <w:rPr>
+          <w:rFonts w:ascii="Calibri" w:hAnsi="Calibri" w:cs="Calibri"/>
+        </w:rPr>
         <w:t>P10B-19A = Partial</w:t>
       </w:r>
     </w:p>
@@ -27127,7 +27496,7 @@
         <w:rPr>
           <w:rFonts w:ascii="Calibri" w:hAnsi="Calibri" w:cs="Calibri"/>
         </w:rPr>
-        <w:t>P10B-19A-03 = exact next implementation task</w:t>
+        <w:t>P10B-19A-04 = exact next implementation task</w:t>
       </w:r>
     </w:p>
     <w:p>

</xml_diff>

<commit_message>
feat: add PageBlueprint v2 asset-role compatibility contract
</commit_message>
<xml_diff>
--- a/docs/VESKIFY_DEVELOPMENT_DELIVERY_TRACKER_v1.3.0.docx
+++ b/docs/VESKIFY_DEVELOPMENT_DELIVERY_TRACKER_v1.3.0.docx
@@ -38,7 +38,7 @@
         <w:rPr>
           <w:rFonts w:ascii="Calibri" w:hAnsi="Calibri" w:cs="Calibri"/>
         </w:rPr>
-        <w:t>Delivery status baseline: 1 September 2026, P10B-19A-03 required page structures, region graph and PageBlueprint v2 dispatch Baseline</w:t>
+        <w:t>Delivery status baseline: 1 September 2026, P10B-19A-04 PageBlueprint v2 asset-role compatibility contract Baseline</w:t>
       </w:r>
     </w:p>
     <w:p>
@@ -245,7 +245,7 @@
               <w:rPr>
                 <w:rFonts w:ascii="Calibri" w:hAnsi="Calibri" w:cs="Calibri"/>
               </w:rPr>
-              <w:t>1 September 2026, P10B-19A-03 required page structures, region graph and PageBlueprint v2 dispatch Baseline</w:t>
+              <w:t>1 September 2026, P10B-19A-04 PageBlueprint v2 asset-role compatibility contract Baseline</w:t>
             </w:r>
           </w:p>
         </w:tc>
@@ -8398,7 +8398,7 @@
               <w:rPr>
                 <w:rFonts w:ascii="Calibri" w:hAnsi="Calibri" w:cs="Calibri"/>
               </w:rPr>
-              <w:t>☐</w:t>
+              <w:t>☑</w:t>
             </w:r>
           </w:p>
         </w:tc>
@@ -8434,7 +8434,7 @@
               <w:rPr>
                 <w:rFonts w:ascii="Calibri" w:hAnsi="Calibri" w:cs="Calibri"/>
               </w:rPr>
-              <w:t>Asset-Role Contract</w:t>
+              <w:t>Asset-Role Compatibility Contract</w:t>
             </w:r>
           </w:p>
         </w:tc>
@@ -8455,6 +8455,141 @@
                 <w:b/>
                 <w:bCs/>
               </w:rPr>
+              <w:t>Baseline</w:t>
+            </w:r>
+          </w:p>
+        </w:tc>
+        <w:tc>
+          <w:tcPr>
+            <w:tcW w:w="1500" w:type="dxa"/>
+            <w:vAlign w:val="center"/>
+          </w:tcPr>
+          <w:p>
+            <w:pPr>
+              <w:pStyle w:val="CompactTableText"/>
+              <w:widowControl/>
+            </w:pPr>
+            <w:r>
+              <w:rPr>
+                <w:rFonts w:ascii="Calibri" w:hAnsi="Calibri" w:cs="Calibri"/>
+              </w:rPr>
+              <w:t>P10B-19A task owner</w:t>
+            </w:r>
+          </w:p>
+        </w:tc>
+        <w:tc>
+          <w:tcPr>
+            <w:tcW w:w="2500" w:type="dxa"/>
+            <w:vAlign w:val="center"/>
+          </w:tcPr>
+          <w:p>
+            <w:pPr>
+              <w:pStyle w:val="CompactTableText"/>
+              <w:widowControl/>
+            </w:pPr>
+            <w:r>
+              <w:rPr>
+                <w:rFonts w:ascii="Calibri" w:hAnsi="Calibri" w:cs="Calibri"/>
+              </w:rPr>
+              <w:t>P10B-19A-03 merged</w:t>
+            </w:r>
+          </w:p>
+        </w:tc>
+        <w:tc>
+          <w:tcPr>
+            <w:tcW w:w="2890" w:type="dxa"/>
+            <w:vAlign w:val="center"/>
+          </w:tcPr>
+          <w:p>
+            <w:pPr>
+              <w:pStyle w:val="CompactTableText"/>
+              <w:widowControl/>
+            </w:pPr>
+            <w:r>
+              <w:rPr>
+                <w:rFonts w:ascii="Calibri" w:hAnsi="Calibri" w:cs="Calibri"/>
+              </w:rPr>
+              <w:t>Exact ordered nine-role authority, strict blueprint/region binding, bounded per-role cardinality and deterministic canonicalization; zero records or runtime consumers</w:t>
+            </w:r>
+          </w:p>
+        </w:tc>
+      </w:tr>
+      <w:tr>
+        <w:trPr>
+          <w:cantSplit/>
+        </w:trPr>
+        <w:tc>
+          <w:tcPr>
+            <w:tcW w:w="720" w:type="dxa"/>
+            <w:vAlign w:val="center"/>
+          </w:tcPr>
+          <w:p>
+            <w:pPr>
+              <w:pStyle w:val="CompactTableText"/>
+              <w:jc w:val="center"/>
+              <w:widowControl/>
+            </w:pPr>
+            <w:r>
+              <w:rPr>
+                <w:rFonts w:ascii="Calibri" w:hAnsi="Calibri" w:cs="Calibri"/>
+              </w:rPr>
+              <w:t>☐</w:t>
+            </w:r>
+          </w:p>
+        </w:tc>
+        <w:tc>
+          <w:tcPr>
+            <w:tcW w:w="1700" w:type="dxa"/>
+            <w:vAlign w:val="center"/>
+          </w:tcPr>
+          <w:p>
+            <w:pPr>
+              <w:pStyle w:val="CompactTableText"/>
+              <w:widowControl/>
+            </w:pPr>
+            <w:r>
+              <w:rPr>
+                <w:rFonts w:ascii="Calibri" w:hAnsi="Calibri" w:cs="Calibri"/>
+              </w:rPr>
+              <w:t>P10B-19A-05</w:t>
+            </w:r>
+          </w:p>
+        </w:tc>
+        <w:tc>
+          <w:tcPr>
+            <w:tcW w:w="2800" w:type="dxa"/>
+            <w:vAlign w:val="center"/>
+          </w:tcPr>
+          <w:p>
+            <w:pPr>
+              <w:pStyle w:val="CompactTableText"/>
+              <w:widowControl/>
+            </w:pPr>
+            <w:r>
+              <w:rPr>
+                <w:rFonts w:ascii="Calibri" w:hAnsi="Calibri" w:cs="Calibri"/>
+              </w:rPr>
+              <w:t>Responsive-Rule Contract</w:t>
+            </w:r>
+          </w:p>
+        </w:tc>
+        <w:tc>
+          <w:tcPr>
+            <w:tcW w:w="850" w:type="dxa"/>
+            <w:vAlign w:val="center"/>
+          </w:tcPr>
+          <w:p>
+            <w:pPr>
+              <w:pStyle w:val="CompactTableText"/>
+              <w:jc w:val="center"/>
+              <w:widowControl/>
+            </w:pPr>
+            <w:r>
+              <w:rPr>
+                <w:rFonts w:ascii="Calibri" w:hAnsi="Calibri" w:cs="Calibri"/>
+                <w:b/>
+                <w:bCs/>
+              </w:rPr>
               <w:t>Planned / exact next</w:t>
             </w:r>
           </w:p>
@@ -8491,7 +8626,7 @@
               <w:rPr>
                 <w:rFonts w:ascii="Calibri" w:hAnsi="Calibri" w:cs="Calibri"/>
               </w:rPr>
-              <w:t>P10B-19A-03 merged</w:t>
+              <w:t>P10B-19A-04 merged</w:t>
             </w:r>
           </w:p>
         </w:tc>
@@ -8509,7 +8644,7 @@
               <w:rPr>
                 <w:rFonts w:ascii="Calibri" w:hAnsi="Calibri" w:cs="Calibri"/>
               </w:rPr>
-              <w:t>Add the bounded PageBlueprint v2 asset-role contract without beginning responsive or fallback authority</w:t>
+              <w:t>Add the bounded PageBlueprint v2 responsive-rule contract without beginning omission, substitution or fallback authority</w:t>
             </w:r>
           </w:p>
         </w:tc>
@@ -12866,7 +13001,7 @@
         <w:rPr>
           <w:rFonts w:ascii="Calibri" w:hAnsi="Calibri" w:cs="Calibri"/>
         </w:rPr>
-        <w:t xml:space="preserve">P10B remains Partial. DEVX-01A through DEVX-01G are Baseline, and DEVX-01 is Baseline / closed. P10B-19A-01, P10B-19A-02 and P10B-19A-03 are Baseline, P10B-19A is Partial, and P10B-19A-04 is the exact next implementation task. DEVX-01C measured the serial gate, retained PR/ref-scoped cancellation and added compatible </w:t>
+        <w:t xml:space="preserve">P10B remains Partial. DEVX-01A through DEVX-01G are Baseline, and DEVX-01 is Baseline / closed. P10B-19A-01 through P10B-19A-04 are Baseline, P10B-19A is Partial, and P10B-19A-05 is the exact next implementation task. DEVX-01C measured the serial gate, retained PR/ref-scoped cancellation and added compatible </w:t>
       </w:r>
       <w:r>
         <w:rPr>
@@ -13629,7 +13764,7 @@
         <w:rPr>
           <w:rFonts w:ascii="Calibri" w:hAnsi="Calibri" w:cs="Calibri"/>
         </w:rPr>
-        <w:t xml:space="preserve">P10B-19A-01, P10B-19A-02 and P10B-19A-03 are </w:t>
+        <w:t xml:space="preserve">P10B-19A-01 through P10B-19A-04 are </w:t>
       </w:r>
       <w:r>
         <w:rPr>
@@ -13657,7 +13792,7 @@
         <w:rPr>
           <w:rFonts w:ascii="Calibri" w:hAnsi="Calibri" w:cs="Calibri"/>
         </w:rPr>
-        <w:t xml:space="preserve">. P10B-19A-04 - Asset-Role Contract is the exact next implementation task. P10B-19A-03 adds the strict inactive PageBlueprint v2 structural contract and explicit v1 </w:t>
+        <w:t xml:space="preserve">. P10B-19A-05 - Responsive-Rule Contract is the exact next implementation task. P10B-19A-04 adds one strict, deeply readonly PageBlueprint v2 asset-role compatibility companion. It reuses the canonical ordered nine-role vocabulary; binds exact blueprint ID/version and known regions; validates explicit required/optional role cardinality through maximum 32; and canonicalizes only valid authority by structural default reading order and canonical role order. It adds no exact asset, availability, reuse, responsive/fallback, record, registry, persistence, selector, renderer or current-generation authority. P10B-19A-03 adds the strict inactive PageBlueprint v2 structural contract and explicit v1 </w:t>
       </w:r>
       <w:r>
         <w:rPr>
@@ -13797,7 +13932,7 @@
         <w:rPr>
           <w:rFonts w:ascii="Calibri" w:hAnsi="Calibri" w:cs="Calibri"/>
         </w:rPr>
-        <w:t xml:space="preserve">; validates required-role minimums, bounded graph invariants and complete accessible order alternatives; and canonicalizes only valid authority. Existing v1 profiles are unchanged. Active-family, candidate-family-registry, v2-record, v2-registry, persisted-v2 and current-generation-v2-consumer counts remain zero. Asset-role, responsive and fallback authority remain unimplemented. P10B-19A-02 adds the strict six-role and seven-kind directed relationship value object, deterministic key, bounded duplicate evidence and canonical collection ordering. It adds zero active family records, candidate registry records, persisted relationships, production-selected relationships or current-generation consumers. P10B-19A-01 establishes </w:t>
+        <w:t xml:space="preserve">; validates required-role minimums, bounded graph invariants and complete accessible order alternatives; and canonicalizes only valid authority. Existing v1 profiles are unchanged. Active-family, candidate-family-registry, v2-record, v2-registry, persisted-v2 and current-generation-v2-consumer counts remain zero. Responsive and fallback authority remain unimplemented. P10B-19A-02 adds the strict six-role and seven-kind directed relationship value object, deterministic key, bounded duplicate evidence and canonical collection ordering. It adds zero active family records, candidate registry records, persisted relationships, production-selected relationships or current-generation consumers. P10B-19A-01 establishes </w:t>
       </w:r>
       <w:r>
         <w:rPr>
@@ -14984,7 +15119,7 @@
         <w:rPr>
           <w:rFonts w:ascii="Calibri" w:hAnsi="Calibri" w:cs="Calibri"/>
         </w:rPr>
-        <w:t xml:space="preserve">; P10B-19A-01, P10B-19A-02 and P10B-19A-03 are </w:t>
+        <w:t xml:space="preserve">; P10B-19A-01 through P10B-19A-04 are </w:t>
       </w:r>
       <w:r>
         <w:rPr>
@@ -14998,7 +15133,7 @@
         <w:rPr>
           <w:rFonts w:ascii="Calibri" w:hAnsi="Calibri" w:cs="Calibri"/>
         </w:rPr>
-        <w:t xml:space="preserve">, and P10B-19A-04 is </w:t>
+        <w:t xml:space="preserve">, and P10B-19A-05 is </w:t>
       </w:r>
       <w:r>
         <w:rPr>
@@ -15028,7 +15163,7 @@
         <w:rPr>
           <w:rFonts w:ascii="Calibri" w:hAnsi="Calibri" w:cs="Calibri"/>
         </w:rPr>
-        <w:t>. The remaining Done conditions are implementation gates, not claims about the current repository. The P10B-16P-01 through P10B-16P-05A plus P10B-16P-06 sequence is a mandatory convergence package between P10B-16 and P10B-17; it supplements rather than renumbers the locked P10B-01 through P10B-18 plan. P10B-16P-05B follows accepted P10B-18C and is now Baseline. P10B-18D completed as a rejected-quality diagnostic. P10B-19 PRE is Baseline. P10B-19A is Partial; P10B-19A-01, P10B-19A-02 and P10B-19A-03 are Baseline, P10B-19A-04 is the exact next product task, followed by planned P10B-19B through P10B-19J.</w:t>
+        <w:t>. The remaining Done conditions are implementation gates, not claims about the current repository. The P10B-16P-01 through P10B-16P-05A plus P10B-16P-06 sequence is a mandatory convergence package between P10B-16 and P10B-17; it supplements rather than renumbers the locked P10B-01 through P10B-18 plan. P10B-16P-05B follows accepted P10B-18C and is now Baseline. P10B-18D completed as a rejected-quality diagnostic. P10B-19 PRE is Baseline. P10B-19A is Partial; P10B-19A-01 through P10B-19A-04 are Baseline, P10B-19A-05 is the exact next product task, followed by planned P10B-19B through P10B-19J.</w:t>
       </w:r>
     </w:p>
     <w:p>
@@ -20487,7 +20622,7 @@
         <w:rPr>
           <w:rFonts w:ascii="Calibri" w:hAnsi="Calibri" w:cs="Calibri"/>
         </w:rPr>
-        <w:t>P10B-18C and P10B-16P-05B are Baseline. P10B-18D is a Baseline diagnostic with live commercial quality rejected. P10B-18 and P10B remain Partial. P10B-19 PRE is Baseline. P10B-19A is the exact next task, followed by planned P10B-19B through P10B-19J.</w:t>
+        <w:t>P10B-18C and P10B-16P-05B are Baseline. P10B-18D is a Baseline diagnostic with live commercial quality rejected. P10B-18 and P10B remain Partial. P10B-19 PRE is Baseline. P10B-19A is Partial; P10B-19A-01 through P10B-19A-04 are Baseline, and P10B-19A-05 is the exact next task, followed by planned P10B-19B through P10B-19J.</w:t>
       </w:r>
     </w:p>
     <w:p>
@@ -22574,7 +22709,7 @@
         <w:rPr>
           <w:rFonts w:ascii="Calibri" w:hAnsi="Calibri" w:cs="Calibri"/>
         </w:rPr>
-        <w:t xml:space="preserve"> is the exact next task; P10B-19B through P10B-19J remain Planned.</w:t>
+        <w:t xml:space="preserve"> is Partial; P10B-19A-01 through P10B-19A-04 are Baseline, P10B-19A-05 is the exact next task, and P10B-19B through P10B-19J remain Planned.</w:t>
       </w:r>
     </w:p>
     <w:p>
@@ -26569,7 +26704,7 @@
         <w:rPr>
           <w:rFonts w:ascii="Calibri" w:hAnsi="Calibri" w:cs="Calibri"/>
         </w:rPr>
-        <w:t xml:space="preserve"> with zero primary FAIL. P10B-16P-05B subsequently removed the one-time capture platform while retaining the bounded quality gate. P10B-18D subsequently completed as a rejected-quality diagnostic. P10B-19 PRE is Baseline, and P10B-19A is Partial; P10B-19A-01, P10B-19A-02 and P10B-19A-03 are Baseline, and P10B-19A-04 is the exact next task.</w:t>
+        <w:t xml:space="preserve"> with zero primary FAIL. P10B-16P-05B subsequently removed the one-time capture platform while retaining the bounded quality gate. P10B-18D subsequently completed as a rejected-quality diagnostic. P10B-19 PRE is Baseline, and P10B-19A is Partial; P10B-19A-01 through P10B-19A-04 are Baseline, and P10B-19A-05 is the exact next task.</w:t>
       </w:r>
     </w:p>
     <w:p>
@@ -27104,7 +27239,7 @@
               <w:rPr>
                 <w:rFonts w:ascii="Calibri" w:hAnsi="Calibri" w:cs="Calibri"/>
               </w:rPr>
-              <w:t>Next</w:t>
+              <w:t>Baseline</w:t>
             </w:r>
           </w:p>
         </w:tc>
@@ -27142,7 +27277,7 @@
                 <w:b/>
                 <w:bCs/>
               </w:rPr>
-              <w:t>Planned / exact next</w:t>
+              <w:t>Baseline</w:t>
             </w:r>
           </w:p>
         </w:tc>
@@ -27160,7 +27295,7 @@
               <w:rPr>
                 <w:rFonts w:ascii="Calibri" w:hAnsi="Calibri" w:cs="Calibri"/>
               </w:rPr>
-              <w:t>Asset-role contract</w:t>
+              <w:t>Asset-role compatibility contract bound to exact PageBlueprint v2 identity and regions; zero records or production consumers</w:t>
             </w:r>
           </w:p>
         </w:tc>
@@ -27182,7 +27317,7 @@
               <w:rPr>
                 <w:rFonts w:ascii="Calibri" w:hAnsi="Calibri" w:cs="Calibri"/>
               </w:rPr>
-              <w:t>Planned</w:t>
+              <w:t>Next</w:t>
             </w:r>
           </w:p>
         </w:tc>
@@ -27200,7 +27335,7 @@
               <w:rPr>
                 <w:rFonts w:ascii="Calibri" w:hAnsi="Calibri" w:cs="Calibri"/>
               </w:rPr>
-              <w:t>P10B-19B through P10B-19J</w:t>
+              <w:t>P10B-19A-05</w:t>
             </w:r>
           </w:p>
         </w:tc>
@@ -27220,6 +27355,84 @@
                 <w:b/>
                 <w:bCs/>
               </w:rPr>
+              <w:t>Planned / exact next</w:t>
+            </w:r>
+          </w:p>
+        </w:tc>
+        <w:tc>
+          <w:tcPr>
+            <w:tcW w:w="8460" w:type="dxa"/>
+            <w:vAlign w:val="center"/>
+          </w:tcPr>
+          <w:p>
+            <w:pPr>
+              <w:pStyle w:val="TableText"/>
+              <w:widowControl/>
+            </w:pPr>
+            <w:r>
+              <w:rPr>
+                <w:rFonts w:ascii="Calibri" w:hAnsi="Calibri" w:cs="Calibri"/>
+              </w:rPr>
+              <w:t>Responsive-rule contract</w:t>
+            </w:r>
+          </w:p>
+        </w:tc>
+      </w:tr>
+      <w:tr>
+        <w:trPr/>
+        <w:tc>
+          <w:tcPr>
+            <w:tcW w:w="1000" w:type="dxa"/>
+            <w:vAlign w:val="center"/>
+          </w:tcPr>
+          <w:p>
+            <w:pPr>
+              <w:pStyle w:val="TableText"/>
+              <w:jc w:val="center"/>
+              <w:widowControl/>
+            </w:pPr>
+            <w:r>
+              <w:rPr>
+                <w:rFonts w:ascii="Calibri" w:hAnsi="Calibri" w:cs="Calibri"/>
+              </w:rPr>
+              <w:t>Planned</w:t>
+            </w:r>
+          </w:p>
+        </w:tc>
+        <w:tc>
+          <w:tcPr>
+            <w:tcW w:w="1500" w:type="dxa"/>
+            <w:vAlign w:val="center"/>
+          </w:tcPr>
+          <w:p>
+            <w:pPr>
+              <w:pStyle w:val="TableText"/>
+              <w:widowControl/>
+            </w:pPr>
+            <w:r>
+              <w:rPr>
+                <w:rFonts w:ascii="Calibri" w:hAnsi="Calibri" w:cs="Calibri"/>
+              </w:rPr>
+              <w:t>P10B-19B through P10B-19J</w:t>
+            </w:r>
+          </w:p>
+        </w:tc>
+        <w:tc>
+          <w:tcPr>
+            <w:tcW w:w="2000" w:type="dxa"/>
+            <w:vAlign w:val="center"/>
+          </w:tcPr>
+          <w:p>
+            <w:pPr>
+              <w:pStyle w:val="TableText"/>
+              <w:widowControl/>
+            </w:pPr>
+            <w:r>
+              <w:rPr>
+                <w:rFonts w:ascii="Calibri" w:hAnsi="Calibri" w:cs="Calibri"/>
+                <w:b/>
+                <w:bCs/>
+              </w:rPr>
               <w:t>Planned</w:t>
             </w:r>
           </w:p>
@@ -27480,6 +27693,22 @@
         <w:rPr>
           <w:rFonts w:ascii="Calibri" w:hAnsi="Calibri" w:cs="Calibri"/>
         </w:rPr>
+        <w:t>P10B-19A-04 = Baseline</w:t>
+      </w:r>
+    </w:p>
+    <w:p>
+      <w:pPr>
+        <w:pStyle w:val="Normal"/>
+        <w:numPr>
+          <w:ilvl w:val="0"/>
+          <w:numId w:val="1"/>
+        </w:numPr>
+        <w:widowControl/>
+      </w:pPr>
+      <w:r>
+        <w:rPr>
+          <w:rFonts w:ascii="Calibri" w:hAnsi="Calibri" w:cs="Calibri"/>
+        </w:rPr>
         <w:t>P10B-19A = Partial</w:t>
       </w:r>
     </w:p>
@@ -27496,7 +27725,7 @@
         <w:rPr>
           <w:rFonts w:ascii="Calibri" w:hAnsi="Calibri" w:cs="Calibri"/>
         </w:rPr>
-        <w:t>P10B-19A-04 = exact next implementation task</w:t>
+        <w:t>P10B-19A-05 = exact next implementation task</w:t>
       </w:r>
     </w:p>
     <w:p>

</xml_diff>

<commit_message>
feat: add PageBlueprint v2 responsive-rule contract
</commit_message>
<xml_diff>
--- a/docs/VESKIFY_DEVELOPMENT_DELIVERY_TRACKER_v1.3.0.docx
+++ b/docs/VESKIFY_DEVELOPMENT_DELIVERY_TRACKER_v1.3.0.docx
@@ -38,7 +38,7 @@
         <w:rPr>
           <w:rFonts w:ascii="Calibri" w:hAnsi="Calibri" w:cs="Calibri"/>
         </w:rPr>
-        <w:t>Delivery status baseline: 1 September 2026, P10B-19A-04 PageBlueprint v2 asset-role compatibility contract Baseline</w:t>
+        <w:t>Delivery status baseline: 1 September 2026, P10B-19A-05 PageBlueprint v2 responsive-rule contract Baseline</w:t>
       </w:r>
     </w:p>
     <w:p>
@@ -173,7 +173,9 @@
         </w:tc>
       </w:tr>
       <w:tr>
-        <w:trPr/>
+        <w:trPr>
+          <w:cantSplit/>
+        </w:trPr>
         <w:tc>
           <w:tcPr>
             <w:tcW w:w="2600" w:type="dxa"/>
@@ -212,7 +214,9 @@
         </w:tc>
       </w:tr>
       <w:tr>
-        <w:trPr/>
+        <w:trPr>
+          <w:cantSplit/>
+        </w:trPr>
         <w:tc>
           <w:tcPr>
             <w:tcW w:w="2600" w:type="dxa"/>
@@ -245,13 +249,15 @@
               <w:rPr>
                 <w:rFonts w:ascii="Calibri" w:hAnsi="Calibri" w:cs="Calibri"/>
               </w:rPr>
-              <w:t>1 September 2026, P10B-19A-04 PageBlueprint v2 asset-role compatibility contract Baseline</w:t>
+              <w:t>1 September 2026, P10B-19A-05 PageBlueprint v2 responsive-rule contract Baseline</w:t>
             </w:r>
           </w:p>
         </w:tc>
       </w:tr>
       <w:tr>
-        <w:trPr/>
+        <w:trPr>
+          <w:cantSplit/>
+        </w:trPr>
         <w:tc>
           <w:tcPr>
             <w:tcW w:w="2600" w:type="dxa"/>
@@ -304,7 +310,9 @@
         </w:tc>
       </w:tr>
       <w:tr>
-        <w:trPr/>
+        <w:trPr>
+          <w:cantSplit/>
+        </w:trPr>
         <w:tc>
           <w:tcPr>
             <w:tcW w:w="2600" w:type="dxa"/>
@@ -345,7 +353,9 @@
         </w:tc>
       </w:tr>
       <w:tr>
-        <w:trPr/>
+        <w:trPr>
+          <w:cantSplit/>
+        </w:trPr>
         <w:tc>
           <w:tcPr>
             <w:tcW w:w="2600" w:type="dxa"/>
@@ -388,7 +398,9 @@
         </w:tc>
       </w:tr>
       <w:tr>
-        <w:trPr/>
+        <w:trPr>
+          <w:cantSplit/>
+        </w:trPr>
         <w:tc>
           <w:tcPr>
             <w:tcW w:w="2600" w:type="dxa"/>
@@ -431,7 +443,9 @@
         </w:tc>
       </w:tr>
       <w:tr>
-        <w:trPr/>
+        <w:trPr>
+          <w:cantSplit/>
+        </w:trPr>
         <w:tc>
           <w:tcPr>
             <w:tcW w:w="2600" w:type="dxa"/>
@@ -8533,7 +8547,7 @@
               <w:rPr>
                 <w:rFonts w:ascii="Calibri" w:hAnsi="Calibri" w:cs="Calibri"/>
               </w:rPr>
-              <w:t>☐</w:t>
+              <w:t>☑</w:t>
             </w:r>
           </w:p>
         </w:tc>
@@ -8590,6 +8604,141 @@
                 <w:b/>
                 <w:bCs/>
               </w:rPr>
+              <w:t>Baseline</w:t>
+            </w:r>
+          </w:p>
+        </w:tc>
+        <w:tc>
+          <w:tcPr>
+            <w:tcW w:w="1500" w:type="dxa"/>
+            <w:vAlign w:val="center"/>
+          </w:tcPr>
+          <w:p>
+            <w:pPr>
+              <w:pStyle w:val="CompactTableText"/>
+              <w:widowControl/>
+            </w:pPr>
+            <w:r>
+              <w:rPr>
+                <w:rFonts w:ascii="Calibri" w:hAnsi="Calibri" w:cs="Calibri"/>
+              </w:rPr>
+              <w:t>P10B-19A task owner</w:t>
+            </w:r>
+          </w:p>
+        </w:tc>
+        <w:tc>
+          <w:tcPr>
+            <w:tcW w:w="2500" w:type="dxa"/>
+            <w:vAlign w:val="center"/>
+          </w:tcPr>
+          <w:p>
+            <w:pPr>
+              <w:pStyle w:val="CompactTableText"/>
+              <w:widowControl/>
+            </w:pPr>
+            <w:r>
+              <w:rPr>
+                <w:rFonts w:ascii="Calibri" w:hAnsi="Calibri" w:cs="Calibri"/>
+              </w:rPr>
+              <w:t>P10B-19A-04 merged</w:t>
+            </w:r>
+          </w:p>
+        </w:tc>
+        <w:tc>
+          <w:tcPr>
+            <w:tcW w:w="2890" w:type="dxa"/>
+            <w:vAlign w:val="center"/>
+          </w:tcPr>
+          <w:p>
+            <w:pPr>
+              <w:pStyle w:val="CompactTableText"/>
+              <w:widowControl/>
+            </w:pPr>
+            <w:r>
+              <w:rPr>
+                <w:rFonts w:ascii="Calibri" w:hAnsi="Calibri" w:cs="Calibri"/>
+              </w:rPr>
+              <w:t>Strict four-breakpoint structural responsive contract, explicit order/region/relationship coverage and deterministic accessible canonicalization; zero records or runtime consumers</w:t>
+            </w:r>
+          </w:p>
+        </w:tc>
+      </w:tr>
+      <w:tr>
+        <w:trPr>
+          <w:cantSplit/>
+        </w:trPr>
+        <w:tc>
+          <w:tcPr>
+            <w:tcW w:w="720" w:type="dxa"/>
+            <w:vAlign w:val="center"/>
+          </w:tcPr>
+          <w:p>
+            <w:pPr>
+              <w:pStyle w:val="CompactTableText"/>
+              <w:jc w:val="center"/>
+              <w:widowControl/>
+            </w:pPr>
+            <w:r>
+              <w:rPr>
+                <w:rFonts w:ascii="Calibri" w:hAnsi="Calibri" w:cs="Calibri"/>
+              </w:rPr>
+              <w:t>☐</w:t>
+            </w:r>
+          </w:p>
+        </w:tc>
+        <w:tc>
+          <w:tcPr>
+            <w:tcW w:w="1700" w:type="dxa"/>
+            <w:vAlign w:val="center"/>
+          </w:tcPr>
+          <w:p>
+            <w:pPr>
+              <w:pStyle w:val="CompactTableText"/>
+              <w:widowControl/>
+            </w:pPr>
+            <w:r>
+              <w:rPr>
+                <w:rFonts w:ascii="Calibri" w:hAnsi="Calibri" w:cs="Calibri"/>
+              </w:rPr>
+              <w:t>P10B-19A-06</w:t>
+            </w:r>
+          </w:p>
+        </w:tc>
+        <w:tc>
+          <w:tcPr>
+            <w:tcW w:w="2800" w:type="dxa"/>
+            <w:vAlign w:val="center"/>
+          </w:tcPr>
+          <w:p>
+            <w:pPr>
+              <w:pStyle w:val="CompactTableText"/>
+              <w:widowControl/>
+            </w:pPr>
+            <w:r>
+              <w:rPr>
+                <w:rFonts w:ascii="Calibri" w:hAnsi="Calibri" w:cs="Calibri"/>
+              </w:rPr>
+              <w:t>Omission, Substitution and Fallback Contract</w:t>
+            </w:r>
+          </w:p>
+        </w:tc>
+        <w:tc>
+          <w:tcPr>
+            <w:tcW w:w="850" w:type="dxa"/>
+            <w:vAlign w:val="center"/>
+          </w:tcPr>
+          <w:p>
+            <w:pPr>
+              <w:pStyle w:val="CompactTableText"/>
+              <w:jc w:val="center"/>
+              <w:widowControl/>
+            </w:pPr>
+            <w:r>
+              <w:rPr>
+                <w:rFonts w:ascii="Calibri" w:hAnsi="Calibri" w:cs="Calibri"/>
+                <w:b/>
+                <w:bCs/>
+              </w:rPr>
               <w:t>Planned / exact next</w:t>
             </w:r>
           </w:p>
@@ -8626,7 +8775,7 @@
               <w:rPr>
                 <w:rFonts w:ascii="Calibri" w:hAnsi="Calibri" w:cs="Calibri"/>
               </w:rPr>
-              <w:t>P10B-19A-04 merged</w:t>
+              <w:t>P10B-19A-05 merged</w:t>
             </w:r>
           </w:p>
         </w:tc>
@@ -8644,7 +8793,7 @@
               <w:rPr>
                 <w:rFonts w:ascii="Calibri" w:hAnsi="Calibri" w:cs="Calibri"/>
               </w:rPr>
-              <w:t>Add the bounded PageBlueprint v2 responsive-rule contract without beginning omission, substitution or fallback authority</w:t>
+              <w:t>Add bounded omission, substitution and fallback authority without beginning registry, selection or runtime integration</w:t>
             </w:r>
           </w:p>
         </w:tc>
@@ -12074,7 +12223,9 @@
         </w:tc>
       </w:tr>
       <w:tr>
-        <w:trPr/>
+        <w:trPr>
+          <w:cantSplit/>
+        </w:trPr>
         <w:tc>
           <w:tcPr>
             <w:tcW w:w="2160" w:type="dxa"/>
@@ -12188,7 +12339,9 @@
         </w:tc>
       </w:tr>
       <w:tr>
-        <w:trPr/>
+        <w:trPr>
+          <w:cantSplit/>
+        </w:trPr>
         <w:tc>
           <w:tcPr>
             <w:tcW w:w="2160" w:type="dxa"/>
@@ -12302,7 +12455,9 @@
         </w:tc>
       </w:tr>
       <w:tr>
-        <w:trPr/>
+        <w:trPr>
+          <w:cantSplit/>
+        </w:trPr>
         <w:tc>
           <w:tcPr>
             <w:tcW w:w="2160" w:type="dxa"/>
@@ -12416,7 +12571,9 @@
         </w:tc>
       </w:tr>
       <w:tr>
-        <w:trPr/>
+        <w:trPr>
+          <w:cantSplit/>
+        </w:trPr>
         <w:tc>
           <w:tcPr>
             <w:tcW w:w="2160" w:type="dxa"/>
@@ -12530,7 +12687,9 @@
         </w:tc>
       </w:tr>
       <w:tr>
-        <w:trPr/>
+        <w:trPr>
+          <w:cantSplit/>
+        </w:trPr>
         <w:tc>
           <w:tcPr>
             <w:tcW w:w="2160" w:type="dxa"/>
@@ -12644,7 +12803,9 @@
         </w:tc>
       </w:tr>
       <w:tr>
-        <w:trPr/>
+        <w:trPr>
+          <w:cantSplit/>
+        </w:trPr>
         <w:tc>
           <w:tcPr>
             <w:tcW w:w="2160" w:type="dxa"/>
@@ -12758,7 +12919,9 @@
         </w:tc>
       </w:tr>
       <w:tr>
-        <w:trPr/>
+        <w:trPr>
+          <w:cantSplit/>
+        </w:trPr>
         <w:tc>
           <w:tcPr>
             <w:tcW w:w="2160" w:type="dxa"/>
@@ -12872,7 +13035,9 @@
         </w:tc>
       </w:tr>
       <w:tr>
-        <w:trPr/>
+        <w:trPr>
+          <w:cantSplit/>
+        </w:trPr>
         <w:tc>
           <w:tcPr>
             <w:tcW w:w="2160" w:type="dxa"/>
@@ -13001,7 +13166,7 @@
         <w:rPr>
           <w:rFonts w:ascii="Calibri" w:hAnsi="Calibri" w:cs="Calibri"/>
         </w:rPr>
-        <w:t xml:space="preserve">P10B remains Partial. DEVX-01A through DEVX-01G are Baseline, and DEVX-01 is Baseline / closed. P10B-19A-01 through P10B-19A-04 are Baseline, P10B-19A is Partial, and P10B-19A-05 is the exact next implementation task. DEVX-01C measured the serial gate, retained PR/ref-scoped cancellation and added compatible </w:t>
+        <w:t xml:space="preserve">P10B remains Partial. DEVX-01A through DEVX-01G are Baseline, and DEVX-01 is Baseline / closed. P10B-19A-01 through P10B-19A-05 are Baseline, P10B-19A is Partial, and P10B-19A-06 is the exact next implementation task. DEVX-01C measured the serial gate, retained PR/ref-scoped cancellation and added compatible </w:t>
       </w:r>
       <w:r>
         <w:rPr>
@@ -13179,7 +13344,9 @@
         </w:tc>
       </w:tr>
       <w:tr>
-        <w:trPr/>
+        <w:trPr>
+          <w:cantSplit/>
+        </w:trPr>
         <w:tc>
           <w:tcPr>
             <w:tcW w:w="3000" w:type="dxa"/>
@@ -13236,7 +13403,9 @@
         </w:tc>
       </w:tr>
       <w:tr>
-        <w:trPr/>
+        <w:trPr>
+          <w:cantSplit/>
+        </w:trPr>
         <w:tc>
           <w:tcPr>
             <w:tcW w:w="3000" w:type="dxa"/>
@@ -13293,7 +13462,9 @@
         </w:tc>
       </w:tr>
       <w:tr>
-        <w:trPr/>
+        <w:trPr>
+          <w:cantSplit/>
+        </w:trPr>
         <w:tc>
           <w:tcPr>
             <w:tcW w:w="3000" w:type="dxa"/>
@@ -13350,7 +13521,9 @@
         </w:tc>
       </w:tr>
       <w:tr>
-        <w:trPr/>
+        <w:trPr>
+          <w:cantSplit/>
+        </w:trPr>
         <w:tc>
           <w:tcPr>
             <w:tcW w:w="3000" w:type="dxa"/>
@@ -13407,7 +13580,9 @@
         </w:tc>
       </w:tr>
       <w:tr>
-        <w:trPr/>
+        <w:trPr>
+          <w:cantSplit/>
+        </w:trPr>
         <w:tc>
           <w:tcPr>
             <w:tcW w:w="3000" w:type="dxa"/>
@@ -13464,7 +13639,9 @@
         </w:tc>
       </w:tr>
       <w:tr>
-        <w:trPr/>
+        <w:trPr>
+          <w:cantSplit/>
+        </w:trPr>
         <w:tc>
           <w:tcPr>
             <w:tcW w:w="3000" w:type="dxa"/>
@@ -13521,7 +13698,9 @@
         </w:tc>
       </w:tr>
       <w:tr>
-        <w:trPr/>
+        <w:trPr>
+          <w:cantSplit/>
+        </w:trPr>
         <w:tc>
           <w:tcPr>
             <w:tcW w:w="3000" w:type="dxa"/>
@@ -13578,7 +13757,9 @@
         </w:tc>
       </w:tr>
       <w:tr>
-        <w:trPr/>
+        <w:trPr>
+          <w:cantSplit/>
+        </w:trPr>
         <w:tc>
           <w:tcPr>
             <w:tcW w:w="3000" w:type="dxa"/>
@@ -13635,7 +13816,9 @@
         </w:tc>
       </w:tr>
       <w:tr>
-        <w:trPr/>
+        <w:trPr>
+          <w:cantSplit/>
+        </w:trPr>
         <w:tc>
           <w:tcPr>
             <w:tcW w:w="3000" w:type="dxa"/>
@@ -13692,7 +13875,9 @@
         </w:tc>
       </w:tr>
       <w:tr>
-        <w:trPr/>
+        <w:trPr>
+          <w:cantSplit/>
+        </w:trPr>
         <w:tc>
           <w:tcPr>
             <w:tcW w:w="3000" w:type="dxa"/>
@@ -13764,7 +13949,7 @@
         <w:rPr>
           <w:rFonts w:ascii="Calibri" w:hAnsi="Calibri" w:cs="Calibri"/>
         </w:rPr>
-        <w:t xml:space="preserve">P10B-19A-01 through P10B-19A-04 are </w:t>
+        <w:t xml:space="preserve">P10B-19A-01 through P10B-19A-05 are </w:t>
       </w:r>
       <w:r>
         <w:rPr>
@@ -13792,7 +13977,147 @@
         <w:rPr>
           <w:rFonts w:ascii="Calibri" w:hAnsi="Calibri" w:cs="Calibri"/>
         </w:rPr>
-        <w:t xml:space="preserve">. P10B-19A-05 - Responsive-Rule Contract is the exact next implementation task. P10B-19A-04 adds one strict, deeply readonly PageBlueprint v2 asset-role compatibility companion. It reuses the canonical ordered nine-role vocabulary; binds exact blueprint ID/version and known regions; validates explicit required/optional role cardinality through maximum 32; and canonicalizes only valid authority by structural default reading order and canonical role order. It adds no exact asset, availability, reuse, responsive/fallback, record, registry, persistence, selector, renderer or current-generation authority. P10B-19A-03 adds the strict inactive PageBlueprint v2 structural contract and explicit v1 </w:t>
+        <w:t xml:space="preserve">. P10B-19A-06 - Omission, Substitution and Fallback Contract is the exact next implementation task. P10B-19A-05 adds one strict, deeply readonly PageBlueprint v2 responsive-rule companion at schema version </w:t>
+      </w:r>
+      <w:r>
+        <w:rPr>
+          <w:rFonts w:ascii="Consolas" w:hAnsi="Consolas" w:cs="Consolas"/>
+          <w:sz w:val="19"/>
+          <w:szCs w:val="19"/>
+        </w:rPr>
+        <w:t>1.0.0</w:t>
+      </w:r>
+      <w:r>
+        <w:rPr>
+          <w:rFonts w:ascii="Calibri" w:hAnsi="Calibri" w:cs="Calibri"/>
+        </w:rPr>
+        <w:t xml:space="preserve">. Its exactly four breakpoint rules bind </w:t>
+      </w:r>
+      <w:r>
+        <w:rPr>
+          <w:rFonts w:ascii="Consolas" w:hAnsi="Consolas" w:cs="Consolas"/>
+          <w:sz w:val="19"/>
+          <w:szCs w:val="19"/>
+        </w:rPr>
+        <w:t>mobile</w:t>
+      </w:r>
+      <w:r>
+        <w:rPr>
+          <w:rFonts w:ascii="Calibri" w:hAnsi="Calibri" w:cs="Calibri"/>
+        </w:rPr>
+        <w:t xml:space="preserve">/375, </w:t>
+      </w:r>
+      <w:r>
+        <w:rPr>
+          <w:rFonts w:ascii="Consolas" w:hAnsi="Consolas" w:cs="Consolas"/>
+          <w:sz w:val="19"/>
+          <w:szCs w:val="19"/>
+        </w:rPr>
+        <w:t>tablet</w:t>
+      </w:r>
+      <w:r>
+        <w:rPr>
+          <w:rFonts w:ascii="Calibri" w:hAnsi="Calibri" w:cs="Calibri"/>
+        </w:rPr>
+        <w:t xml:space="preserve">/768, </w:t>
+      </w:r>
+      <w:r>
+        <w:rPr>
+          <w:rFonts w:ascii="Consolas" w:hAnsi="Consolas" w:cs="Consolas"/>
+          <w:sz w:val="19"/>
+          <w:szCs w:val="19"/>
+        </w:rPr>
+        <w:t>desktop</w:t>
+      </w:r>
+      <w:r>
+        <w:rPr>
+          <w:rFonts w:ascii="Calibri" w:hAnsi="Calibri" w:cs="Calibri"/>
+        </w:rPr>
+        <w:t xml:space="preserve">/1024, and </w:t>
+      </w:r>
+      <w:r>
+        <w:rPr>
+          <w:rFonts w:ascii="Consolas" w:hAnsi="Consolas" w:cs="Consolas"/>
+          <w:sz w:val="19"/>
+          <w:szCs w:val="19"/>
+        </w:rPr>
+        <w:t>wide</w:t>
+      </w:r>
+      <w:r>
+        <w:rPr>
+          <w:rFonts w:ascii="Calibri" w:hAnsi="Calibri" w:cs="Calibri"/>
+        </w:rPr>
+        <w:t xml:space="preserve">/1440 to an existing structural order alternative, every structural region, and every structural relationship. Region proportions are limited to </w:t>
+      </w:r>
+      <w:r>
+        <w:rPr>
+          <w:rFonts w:ascii="Consolas" w:hAnsi="Consolas" w:cs="Consolas"/>
+          <w:sz w:val="19"/>
+          <w:szCs w:val="19"/>
+        </w:rPr>
+        <w:t>preserve</w:t>
+      </w:r>
+      <w:r>
+        <w:rPr>
+          <w:rFonts w:ascii="Calibri" w:hAnsi="Calibri" w:cs="Calibri"/>
+        </w:rPr>
+        <w:t xml:space="preserve">, </w:t>
+      </w:r>
+      <w:r>
+        <w:rPr>
+          <w:rFonts w:ascii="Consolas" w:hAnsi="Consolas" w:cs="Consolas"/>
+          <w:sz w:val="19"/>
+          <w:szCs w:val="19"/>
+        </w:rPr>
+        <w:t>compress</w:t>
+      </w:r>
+      <w:r>
+        <w:rPr>
+          <w:rFonts w:ascii="Calibri" w:hAnsi="Calibri" w:cs="Calibri"/>
+        </w:rPr>
+        <w:t xml:space="preserve">, </w:t>
+      </w:r>
+      <w:r>
+        <w:rPr>
+          <w:rFonts w:ascii="Consolas" w:hAnsi="Consolas" w:cs="Consolas"/>
+          <w:sz w:val="19"/>
+          <w:szCs w:val="19"/>
+        </w:rPr>
+        <w:t>expand</w:t>
+      </w:r>
+      <w:r>
+        <w:rPr>
+          <w:rFonts w:ascii="Calibri" w:hAnsi="Calibri" w:cs="Calibri"/>
+        </w:rPr>
+        <w:t xml:space="preserve">, and </w:t>
+      </w:r>
+      <w:r>
+        <w:rPr>
+          <w:rFonts w:ascii="Consolas" w:hAnsi="Consolas" w:cs="Consolas"/>
+          <w:sz w:val="19"/>
+          <w:szCs w:val="19"/>
+        </w:rPr>
+        <w:t>full-width</w:t>
+      </w:r>
+      <w:r>
+        <w:rPr>
+          <w:rFonts w:ascii="Calibri" w:hAnsi="Calibri" w:cs="Calibri"/>
+        </w:rPr>
+        <w:t xml:space="preserve">; relationship transformations are limited by relationship kind while </w:t>
+      </w:r>
+      <w:r>
+        <w:rPr>
+          <w:rFonts w:ascii="Consolas" w:hAnsi="Consolas" w:cs="Consolas"/>
+          <w:sz w:val="19"/>
+          <w:szCs w:val="19"/>
+        </w:rPr>
+        <w:t>precedes</w:t>
+      </w:r>
+      <w:r>
+        <w:rPr>
+          <w:rFonts w:ascii="Calibri" w:hAnsi="Calibri" w:cs="Calibri"/>
+        </w:rPr>
+        <w:t xml:space="preserve"> always preserves. Canonicalization uses breakpoint order, selected reading order, and canonical A-03 relationship order and preserves complete accessible reading order, semantic roles, cardinality, precedence, and parent-before-child containment. It adds no visibility, omission, media, fallback, rendering, records, registry, persistence, selection, or current-generation consumers. P10B-19A-04 adds one strict, deeply readonly PageBlueprint v2 asset-role compatibility companion. It reuses the canonical ordered nine-role vocabulary; binds exact blueprint ID/version and known regions; validates explicit required/optional role cardinality through maximum 32; and canonicalizes only valid authority by structural default reading order and canonical role order. It adds no exact asset, availability, reuse, responsive/fallback, record, registry, persistence, selector, renderer or current-generation authority. P10B-19A-03 adds the strict inactive PageBlueprint v2 structural contract and explicit v1 </w:t>
       </w:r>
       <w:r>
         <w:rPr>
@@ -15119,7 +15444,7 @@
         <w:rPr>
           <w:rFonts w:ascii="Calibri" w:hAnsi="Calibri" w:cs="Calibri"/>
         </w:rPr>
-        <w:t xml:space="preserve">; P10B-19A-01 through P10B-19A-04 are </w:t>
+        <w:t xml:space="preserve">; P10B-19A-01 through P10B-19A-05 are </w:t>
       </w:r>
       <w:r>
         <w:rPr>
@@ -15133,7 +15458,7 @@
         <w:rPr>
           <w:rFonts w:ascii="Calibri" w:hAnsi="Calibri" w:cs="Calibri"/>
         </w:rPr>
-        <w:t xml:space="preserve">, and P10B-19A-05 is </w:t>
+        <w:t xml:space="preserve">, and P10B-19A-06 is </w:t>
       </w:r>
       <w:r>
         <w:rPr>
@@ -15163,7 +15488,7 @@
         <w:rPr>
           <w:rFonts w:ascii="Calibri" w:hAnsi="Calibri" w:cs="Calibri"/>
         </w:rPr>
-        <w:t>. The remaining Done conditions are implementation gates, not claims about the current repository. The P10B-16P-01 through P10B-16P-05A plus P10B-16P-06 sequence is a mandatory convergence package between P10B-16 and P10B-17; it supplements rather than renumbers the locked P10B-01 through P10B-18 plan. P10B-16P-05B follows accepted P10B-18C and is now Baseline. P10B-18D completed as a rejected-quality diagnostic. P10B-19 PRE is Baseline. P10B-19A is Partial; P10B-19A-01 through P10B-19A-04 are Baseline, P10B-19A-05 is the exact next product task, followed by planned P10B-19B through P10B-19J.</w:t>
+        <w:t>. The remaining Done conditions are implementation gates, not claims about the current repository. The P10B-16P-01 through P10B-16P-05A plus P10B-16P-06 sequence is a mandatory convergence package between P10B-16 and P10B-17; it supplements rather than renumbers the locked P10B-01 through P10B-18 plan. P10B-16P-05B follows accepted P10B-18C and is now Baseline. P10B-18D completed as a rejected-quality diagnostic. P10B-19 PRE is Baseline. P10B-19A is Partial; P10B-19A-01 through P10B-19A-05 are Baseline, P10B-19A-06 is the exact next product task, followed by planned P10B-19B through P10B-19J.</w:t>
       </w:r>
     </w:p>
     <w:p>
@@ -20622,7 +20947,7 @@
         <w:rPr>
           <w:rFonts w:ascii="Calibri" w:hAnsi="Calibri" w:cs="Calibri"/>
         </w:rPr>
-        <w:t>P10B-18C and P10B-16P-05B are Baseline. P10B-18D is a Baseline diagnostic with live commercial quality rejected. P10B-18 and P10B remain Partial. P10B-19 PRE is Baseline. P10B-19A is Partial; P10B-19A-01 through P10B-19A-04 are Baseline, and P10B-19A-05 is the exact next task, followed by planned P10B-19B through P10B-19J.</w:t>
+        <w:t>P10B-18C and P10B-16P-05B are Baseline. P10B-18D is a Baseline diagnostic with live commercial quality rejected. P10B-18 and P10B remain Partial. P10B-19 PRE is Baseline. P10B-19A is Partial; P10B-19A-01 through P10B-19A-05 are Baseline, and P10B-19A-06 is the exact next task, followed by planned P10B-19B through P10B-19J.</w:t>
       </w:r>
     </w:p>
     <w:p>
@@ -22709,7 +23034,7 @@
         <w:rPr>
           <w:rFonts w:ascii="Calibri" w:hAnsi="Calibri" w:cs="Calibri"/>
         </w:rPr>
-        <w:t xml:space="preserve"> is Partial; P10B-19A-01 through P10B-19A-04 are Baseline, P10B-19A-05 is the exact next task, and P10B-19B through P10B-19J remain Planned.</w:t>
+        <w:t xml:space="preserve"> is Partial; P10B-19A-01 through P10B-19A-05 are Baseline, P10B-19A-06 is the exact next task, and P10B-19B through P10B-19J remain Planned.</w:t>
       </w:r>
     </w:p>
     <w:p>
@@ -26704,11 +27029,12 @@
         <w:rPr>
           <w:rFonts w:ascii="Calibri" w:hAnsi="Calibri" w:cs="Calibri"/>
         </w:rPr>
-        <w:t xml:space="preserve"> with zero primary FAIL. P10B-16P-05B subsequently removed the one-time capture platform while retaining the bounded quality gate. P10B-18D subsequently completed as a rejected-quality diagnostic. P10B-19 PRE is Baseline, and P10B-19A is Partial; P10B-19A-01 through P10B-19A-04 are Baseline, and P10B-19A-05 is the exact next task.</w:t>
-      </w:r>
-    </w:p>
-    <w:p>
-      <w:pPr>
+        <w:t xml:space="preserve"> with zero primary FAIL. P10B-16P-05B subsequently removed the one-time capture platform while retaining the bounded quality gate. P10B-18D subsequently completed as a rejected-quality diagnostic. P10B-19 PRE is Baseline, and P10B-19A is Partial; P10B-19A-01 through P10B-19A-05 are Baseline, and P10B-19A-06 is the exact next task.</w:t>
+      </w:r>
+    </w:p>
+    <w:p>
+      <w:pPr>
+        <w:pageBreakBefore/>
         <w:pStyle w:val="Heading1"/>
         <w:keepNext/>
         <w:widowControl/>
@@ -26833,7 +27159,9 @@
         </w:tc>
       </w:tr>
       <w:tr>
-        <w:trPr/>
+        <w:trPr>
+          <w:cantSplit/>
+        </w:trPr>
         <w:tc>
           <w:tcPr>
             <w:tcW w:w="1000" w:type="dxa"/>
@@ -26911,7 +27239,9 @@
         </w:tc>
       </w:tr>
       <w:tr>
-        <w:trPr/>
+        <w:trPr>
+          <w:cantSplit/>
+        </w:trPr>
         <w:tc>
           <w:tcPr>
             <w:tcW w:w="1000" w:type="dxa"/>
@@ -26989,7 +27319,9 @@
         </w:tc>
       </w:tr>
       <w:tr>
-        <w:trPr/>
+        <w:trPr>
+          <w:cantSplit/>
+        </w:trPr>
         <w:tc>
           <w:tcPr>
             <w:tcW w:w="1000" w:type="dxa"/>
@@ -27067,7 +27399,9 @@
         </w:tc>
       </w:tr>
       <w:tr>
-        <w:trPr/>
+        <w:trPr>
+          <w:cantSplit/>
+        </w:trPr>
         <w:tc>
           <w:tcPr>
             <w:tcW w:w="1000" w:type="dxa"/>
@@ -27145,7 +27479,9 @@
         </w:tc>
       </w:tr>
       <w:tr>
-        <w:trPr/>
+        <w:trPr>
+          <w:cantSplit/>
+        </w:trPr>
         <w:tc>
           <w:tcPr>
             <w:tcW w:w="1000" w:type="dxa"/>
@@ -27223,7 +27559,9 @@
         </w:tc>
       </w:tr>
       <w:tr>
-        <w:trPr/>
+        <w:trPr>
+          <w:cantSplit/>
+        </w:trPr>
         <w:tc>
           <w:tcPr>
             <w:tcW w:w="1000" w:type="dxa"/>
@@ -27301,7 +27639,9 @@
         </w:tc>
       </w:tr>
       <w:tr>
-        <w:trPr/>
+        <w:trPr>
+          <w:cantSplit/>
+        </w:trPr>
         <w:tc>
           <w:tcPr>
             <w:tcW w:w="1000" w:type="dxa"/>
@@ -27317,7 +27657,7 @@
               <w:rPr>
                 <w:rFonts w:ascii="Calibri" w:hAnsi="Calibri" w:cs="Calibri"/>
               </w:rPr>
-              <w:t>Next</w:t>
+              <w:t>Baseline</w:t>
             </w:r>
           </w:p>
         </w:tc>
@@ -27355,7 +27695,7 @@
                 <w:b/>
                 <w:bCs/>
               </w:rPr>
-              <w:t>Planned / exact next</w:t>
+              <w:t>Baseline</w:t>
             </w:r>
           </w:p>
         </w:tc>
@@ -27373,13 +27713,15 @@
               <w:rPr>
                 <w:rFonts w:ascii="Calibri" w:hAnsi="Calibri" w:cs="Calibri"/>
               </w:rPr>
-              <w:t>Responsive-rule contract</w:t>
+              <w:t>Responsive-rule contract bound to four breakpoints and complete structural coverage; zero records or production consumers</w:t>
             </w:r>
           </w:p>
         </w:tc>
       </w:tr>
       <w:tr>
-        <w:trPr/>
+        <w:trPr>
+          <w:cantSplit/>
+        </w:trPr>
         <w:tc>
           <w:tcPr>
             <w:tcW w:w="1000" w:type="dxa"/>
@@ -27395,7 +27737,7 @@
               <w:rPr>
                 <w:rFonts w:ascii="Calibri" w:hAnsi="Calibri" w:cs="Calibri"/>
               </w:rPr>
-              <w:t>Planned</w:t>
+              <w:t>Next</w:t>
             </w:r>
           </w:p>
         </w:tc>
@@ -27413,7 +27755,7 @@
               <w:rPr>
                 <w:rFonts w:ascii="Calibri" w:hAnsi="Calibri" w:cs="Calibri"/>
               </w:rPr>
-              <w:t>P10B-19B through P10B-19J</w:t>
+              <w:t>P10B-19A-06</w:t>
             </w:r>
           </w:p>
         </w:tc>
@@ -27433,6 +27775,86 @@
                 <w:b/>
                 <w:bCs/>
               </w:rPr>
+              <w:t>Planned / exact next</w:t>
+            </w:r>
+          </w:p>
+        </w:tc>
+        <w:tc>
+          <w:tcPr>
+            <w:tcW w:w="8460" w:type="dxa"/>
+            <w:vAlign w:val="center"/>
+          </w:tcPr>
+          <w:p>
+            <w:pPr>
+              <w:pStyle w:val="TableText"/>
+              <w:widowControl/>
+            </w:pPr>
+            <w:r>
+              <w:rPr>
+                <w:rFonts w:ascii="Calibri" w:hAnsi="Calibri" w:cs="Calibri"/>
+              </w:rPr>
+              <w:t>Omission, substitution and fallback contract</w:t>
+            </w:r>
+          </w:p>
+        </w:tc>
+      </w:tr>
+      <w:tr>
+        <w:trPr>
+          <w:cantSplit/>
+        </w:trPr>
+        <w:tc>
+          <w:tcPr>
+            <w:tcW w:w="1000" w:type="dxa"/>
+            <w:vAlign w:val="center"/>
+          </w:tcPr>
+          <w:p>
+            <w:pPr>
+              <w:pStyle w:val="TableText"/>
+              <w:jc w:val="center"/>
+              <w:widowControl/>
+            </w:pPr>
+            <w:r>
+              <w:rPr>
+                <w:rFonts w:ascii="Calibri" w:hAnsi="Calibri" w:cs="Calibri"/>
+              </w:rPr>
+              <w:t>Planned</w:t>
+            </w:r>
+          </w:p>
+        </w:tc>
+        <w:tc>
+          <w:tcPr>
+            <w:tcW w:w="1500" w:type="dxa"/>
+            <w:vAlign w:val="center"/>
+          </w:tcPr>
+          <w:p>
+            <w:pPr>
+              <w:pStyle w:val="TableText"/>
+              <w:widowControl/>
+            </w:pPr>
+            <w:r>
+              <w:rPr>
+                <w:rFonts w:ascii="Calibri" w:hAnsi="Calibri" w:cs="Calibri"/>
+              </w:rPr>
+              <w:t>P10B-19B through P10B-19J</w:t>
+            </w:r>
+          </w:p>
+        </w:tc>
+        <w:tc>
+          <w:tcPr>
+            <w:tcW w:w="2000" w:type="dxa"/>
+            <w:vAlign w:val="center"/>
+          </w:tcPr>
+          <w:p>
+            <w:pPr>
+              <w:pStyle w:val="TableText"/>
+              <w:widowControl/>
+            </w:pPr>
+            <w:r>
+              <w:rPr>
+                <w:rFonts w:ascii="Calibri" w:hAnsi="Calibri" w:cs="Calibri"/>
+                <w:b/>
+                <w:bCs/>
+              </w:rPr>
               <w:t>Planned</w:t>
             </w:r>
           </w:p>
@@ -27709,6 +28131,22 @@
         <w:rPr>
           <w:rFonts w:ascii="Calibri" w:hAnsi="Calibri" w:cs="Calibri"/>
         </w:rPr>
+        <w:t>P10B-19A-05 = Baseline</w:t>
+      </w:r>
+    </w:p>
+    <w:p>
+      <w:pPr>
+        <w:pStyle w:val="Normal"/>
+        <w:numPr>
+          <w:ilvl w:val="0"/>
+          <w:numId w:val="1"/>
+        </w:numPr>
+        <w:widowControl/>
+      </w:pPr>
+      <w:r>
+        <w:rPr>
+          <w:rFonts w:ascii="Calibri" w:hAnsi="Calibri" w:cs="Calibri"/>
+        </w:rPr>
         <w:t>P10B-19A = Partial</w:t>
       </w:r>
     </w:p>
@@ -27725,7 +28163,7 @@
         <w:rPr>
           <w:rFonts w:ascii="Calibri" w:hAnsi="Calibri" w:cs="Calibri"/>
         </w:rPr>
-        <w:t>P10B-19A-05 = exact next implementation task</w:t>
+        <w:t>P10B-19A-06 = exact next implementation task</w:t>
       </w:r>
     </w:p>
     <w:p>

</xml_diff>

<commit_message>
feat: add PageBlueprint v2 fallback contract
</commit_message>
<xml_diff>
--- a/docs/VESKIFY_DEVELOPMENT_DELIVERY_TRACKER_v1.3.0.docx
+++ b/docs/VESKIFY_DEVELOPMENT_DELIVERY_TRACKER_v1.3.0.docx
@@ -38,7 +38,7 @@
         <w:rPr>
           <w:rFonts w:ascii="Calibri" w:hAnsi="Calibri" w:cs="Calibri"/>
         </w:rPr>
-        <w:t>Delivery status baseline: 1 September 2026, P10B-19A-05 PageBlueprint v2 responsive-rule contract Baseline</w:t>
+        <w:t>Delivery status baseline: 1 September 2026, P10B-19A-06 PageBlueprint v2 omission, substitution and fallback contract Baseline</w:t>
       </w:r>
     </w:p>
     <w:p>
@@ -249,7 +249,7 @@
               <w:rPr>
                 <w:rFonts w:ascii="Calibri" w:hAnsi="Calibri" w:cs="Calibri"/>
               </w:rPr>
-              <w:t>1 September 2026, P10B-19A-05 PageBlueprint v2 responsive-rule contract Baseline</w:t>
+              <w:t>1 September 2026, P10B-19A-06 PageBlueprint v2 omission, substitution and fallback contract Baseline</w:t>
             </w:r>
           </w:p>
         </w:tc>
@@ -8682,7 +8682,7 @@
               <w:rPr>
                 <w:rFonts w:ascii="Calibri" w:hAnsi="Calibri" w:cs="Calibri"/>
               </w:rPr>
-              <w:t>☐</w:t>
+              <w:t>☑</w:t>
             </w:r>
           </w:p>
         </w:tc>
@@ -8739,6 +8739,141 @@
                 <w:b/>
                 <w:bCs/>
               </w:rPr>
+              <w:t>Baseline</w:t>
+            </w:r>
+          </w:p>
+        </w:tc>
+        <w:tc>
+          <w:tcPr>
+            <w:tcW w:w="1500" w:type="dxa"/>
+            <w:vAlign w:val="center"/>
+          </w:tcPr>
+          <w:p>
+            <w:pPr>
+              <w:pStyle w:val="CompactTableText"/>
+              <w:widowControl/>
+            </w:pPr>
+            <w:r>
+              <w:rPr>
+                <w:rFonts w:ascii="Calibri" w:hAnsi="Calibri" w:cs="Calibri"/>
+              </w:rPr>
+              <w:t>P10B-19A task owner</w:t>
+            </w:r>
+          </w:p>
+        </w:tc>
+        <w:tc>
+          <w:tcPr>
+            <w:tcW w:w="2500" w:type="dxa"/>
+            <w:vAlign w:val="center"/>
+          </w:tcPr>
+          <w:p>
+            <w:pPr>
+              <w:pStyle w:val="CompactTableText"/>
+              <w:widowControl/>
+            </w:pPr>
+            <w:r>
+              <w:rPr>
+                <w:rFonts w:ascii="Calibri" w:hAnsi="Calibri" w:cs="Calibri"/>
+              </w:rPr>
+              <w:t>P10B-19A-05 merged</w:t>
+            </w:r>
+          </w:p>
+        </w:tc>
+        <w:tc>
+          <w:tcPr>
+            <w:tcW w:w="2890" w:type="dxa"/>
+            <w:vAlign w:val="center"/>
+          </w:tcPr>
+          <w:p>
+            <w:pPr>
+              <w:pStyle w:val="CompactTableText"/>
+              <w:widowControl/>
+            </w:pPr>
+            <w:r>
+              <w:rPr>
+                <w:rFonts w:ascii="Calibri" w:hAnsi="Calibri" w:cs="Calibri"/>
+              </w:rPr>
+              <w:t>Strict required-asset-role trigger coverage, safe optional omission and ordered whole-blueprint substitution references; zero records or runtime consumers</w:t>
+            </w:r>
+          </w:p>
+        </w:tc>
+      </w:tr>
+      <w:tr>
+        <w:trPr>
+          <w:cantSplit/>
+        </w:trPr>
+        <w:tc>
+          <w:tcPr>
+            <w:tcW w:w="720" w:type="dxa"/>
+            <w:vAlign w:val="center"/>
+          </w:tcPr>
+          <w:p>
+            <w:pPr>
+              <w:pStyle w:val="CompactTableText"/>
+              <w:jc w:val="center"/>
+              <w:widowControl/>
+            </w:pPr>
+            <w:r>
+              <w:rPr>
+                <w:rFonts w:ascii="Calibri" w:hAnsi="Calibri" w:cs="Calibri"/>
+              </w:rPr>
+              <w:t>☐</w:t>
+            </w:r>
+          </w:p>
+        </w:tc>
+        <w:tc>
+          <w:tcPr>
+            <w:tcW w:w="1700" w:type="dxa"/>
+            <w:vAlign w:val="center"/>
+          </w:tcPr>
+          <w:p>
+            <w:pPr>
+              <w:pStyle w:val="CompactTableText"/>
+              <w:widowControl/>
+            </w:pPr>
+            <w:r>
+              <w:rPr>
+                <w:rFonts w:ascii="Calibri" w:hAnsi="Calibri" w:cs="Calibri"/>
+              </w:rPr>
+              <w:t>P10B-19A-07</w:t>
+            </w:r>
+          </w:p>
+        </w:tc>
+        <w:tc>
+          <w:tcPr>
+            <w:tcW w:w="2800" w:type="dxa"/>
+            <w:vAlign w:val="center"/>
+          </w:tcPr>
+          <w:p>
+            <w:pPr>
+              <w:pStyle w:val="CompactTableText"/>
+              <w:widowControl/>
+            </w:pPr>
+            <w:r>
+              <w:rPr>
+                <w:rFonts w:ascii="Calibri" w:hAnsi="Calibri" w:cs="Calibri"/>
+              </w:rPr>
+              <w:t>Inactive Family Registry and Candidate Fingerprints</w:t>
+            </w:r>
+          </w:p>
+        </w:tc>
+        <w:tc>
+          <w:tcPr>
+            <w:tcW w:w="850" w:type="dxa"/>
+            <w:vAlign w:val="center"/>
+          </w:tcPr>
+          <w:p>
+            <w:pPr>
+              <w:pStyle w:val="CompactTableText"/>
+              <w:jc w:val="center"/>
+              <w:widowControl/>
+            </w:pPr>
+            <w:r>
+              <w:rPr>
+                <w:rFonts w:ascii="Calibri" w:hAnsi="Calibri" w:cs="Calibri"/>
+                <w:b/>
+                <w:bCs/>
+              </w:rPr>
               <w:t>Planned / exact next</w:t>
             </w:r>
           </w:p>
@@ -8775,7 +8910,7 @@
               <w:rPr>
                 <w:rFonts w:ascii="Calibri" w:hAnsi="Calibri" w:cs="Calibri"/>
               </w:rPr>
-              <w:t>P10B-19A-05 merged</w:t>
+              <w:t>P10B-19A-01 through P10B-19A-06 merged</w:t>
             </w:r>
           </w:p>
         </w:tc>
@@ -8793,7 +8928,7 @@
               <w:rPr>
                 <w:rFonts w:ascii="Calibri" w:hAnsi="Calibri" w:cs="Calibri"/>
               </w:rPr>
-              <w:t>Add bounded omission, substitution and fallback authority without beginning registry, selection or runtime integration</w:t>
+              <w:t>Add inactive family registry and candidate fingerprints without beginning current selection or runtime integration</w:t>
             </w:r>
           </w:p>
         </w:tc>
@@ -13166,7 +13301,7 @@
         <w:rPr>
           <w:rFonts w:ascii="Calibri" w:hAnsi="Calibri" w:cs="Calibri"/>
         </w:rPr>
-        <w:t xml:space="preserve">P10B remains Partial. DEVX-01A through DEVX-01G are Baseline, and DEVX-01 is Baseline / closed. P10B-19A-01 through P10B-19A-05 are Baseline, P10B-19A is Partial, and P10B-19A-06 is the exact next implementation task. DEVX-01C measured the serial gate, retained PR/ref-scoped cancellation and added compatible </w:t>
+        <w:t xml:space="preserve">P10B remains Partial. DEVX-01A through DEVX-01G are Baseline, and DEVX-01 is Baseline / closed. P10B-19A-01 through P10B-19A-06 are Baseline, P10B-19A is Partial, and P10B-19A-07 - Inactive Family Registry and Candidate Fingerprints is the exact next implementation task. DEVX-01C measured the serial gate, retained PR/ref-scoped cancellation and added compatible </w:t>
       </w:r>
       <w:r>
         <w:rPr>
@@ -13949,7 +14084,7 @@
         <w:rPr>
           <w:rFonts w:ascii="Calibri" w:hAnsi="Calibri" w:cs="Calibri"/>
         </w:rPr>
-        <w:t xml:space="preserve">P10B-19A-01 through P10B-19A-05 are </w:t>
+        <w:t xml:space="preserve">P10B-19A-01 through P10B-19A-06 are </w:t>
       </w:r>
       <w:r>
         <w:rPr>
@@ -13963,7 +14098,7 @@
         <w:rPr>
           <w:rFonts w:ascii="Calibri" w:hAnsi="Calibri" w:cs="Calibri"/>
         </w:rPr>
-        <w:t xml:space="preserve">, and parent P10B-19A is </w:t>
+        <w:t xml:space="preserve">, parent P10B-19A is </w:t>
       </w:r>
       <w:r>
         <w:rPr>
@@ -13977,7 +14112,7 @@
         <w:rPr>
           <w:rFonts w:ascii="Calibri" w:hAnsi="Calibri" w:cs="Calibri"/>
         </w:rPr>
-        <w:t xml:space="preserve">. P10B-19A-06 - Omission, Substitution and Fallback Contract is the exact next implementation task. P10B-19A-05 adds one strict, deeply readonly PageBlueprint v2 responsive-rule companion at schema version </w:t>
+        <w:t xml:space="preserve">, and P10B-19A-07 - Inactive Family Registry and Candidate Fingerprints is the exact next implementation task. P10B-19A-06 adds one strict, deeply readonly PageBlueprint v2 omission, substitution and fallback companion at schema version </w:t>
       </w:r>
       <w:r>
         <w:rPr>
@@ -13991,7 +14126,7 @@
         <w:rPr>
           <w:rFonts w:ascii="Calibri" w:hAnsi="Calibri" w:cs="Calibri"/>
         </w:rPr>
-        <w:t xml:space="preserve">. Its exactly four breakpoint rules bind </w:t>
+        <w:t xml:space="preserve">. It composes the exact A-03 structural, A-04 asset-role and A-05 responsive identity; owns only </w:t>
       </w:r>
       <w:r>
         <w:rPr>
@@ -13999,13 +14134,13 @@
           <w:sz w:val="19"/>
           <w:szCs w:val="19"/>
         </w:rPr>
-        <w:t>mobile</w:t>
-      </w:r>
-      <w:r>
-        <w:rPr>
-          <w:rFonts w:ascii="Calibri" w:hAnsi="Calibri" w:cs="Calibri"/>
-        </w:rPr>
-        <w:t xml:space="preserve">/375, </w:t>
+        <w:t>required-asset-role-cardinality-unsatisfied</w:t>
+      </w:r>
+      <w:r>
+        <w:rPr>
+          <w:rFonts w:ascii="Calibri" w:hAnsi="Calibri" w:cs="Calibri"/>
+        </w:rPr>
+        <w:t xml:space="preserve">; covers every and only required-role region with one explicit </w:t>
       </w:r>
       <w:r>
         <w:rPr>
@@ -14013,13 +14148,13 @@
           <w:sz w:val="19"/>
           <w:szCs w:val="19"/>
         </w:rPr>
-        <w:t>tablet</w:t>
-      </w:r>
-      <w:r>
-        <w:rPr>
-          <w:rFonts w:ascii="Calibri" w:hAnsi="Calibri" w:cs="Calibri"/>
-        </w:rPr>
-        <w:t xml:space="preserve">/768, </w:t>
+        <w:t>omit-region</w:t>
+      </w:r>
+      <w:r>
+        <w:rPr>
+          <w:rFonts w:ascii="Calibri" w:hAnsi="Calibri" w:cs="Calibri"/>
+        </w:rPr>
+        <w:t xml:space="preserve"> or </w:t>
       </w:r>
       <w:r>
         <w:rPr>
@@ -14027,97 +14162,13 @@
           <w:sz w:val="19"/>
           <w:szCs w:val="19"/>
         </w:rPr>
-        <w:t>desktop</w:t>
-      </w:r>
-      <w:r>
-        <w:rPr>
-          <w:rFonts w:ascii="Calibri" w:hAnsi="Calibri" w:cs="Calibri"/>
-        </w:rPr>
-        <w:t xml:space="preserve">/1024, and </w:t>
-      </w:r>
-      <w:r>
-        <w:rPr>
-          <w:rFonts w:ascii="Consolas" w:hAnsi="Consolas" w:cs="Consolas"/>
-          <w:sz w:val="19"/>
-          <w:szCs w:val="19"/>
-        </w:rPr>
-        <w:t>wide</w:t>
-      </w:r>
-      <w:r>
-        <w:rPr>
-          <w:rFonts w:ascii="Calibri" w:hAnsi="Calibri" w:cs="Calibri"/>
-        </w:rPr>
-        <w:t xml:space="preserve">/1440 to an existing structural order alternative, every structural region, and every structural relationship. Region proportions are limited to </w:t>
-      </w:r>
-      <w:r>
-        <w:rPr>
-          <w:rFonts w:ascii="Consolas" w:hAnsi="Consolas" w:cs="Consolas"/>
-          <w:sz w:val="19"/>
-          <w:szCs w:val="19"/>
-        </w:rPr>
-        <w:t>preserve</w:t>
-      </w:r>
-      <w:r>
-        <w:rPr>
-          <w:rFonts w:ascii="Calibri" w:hAnsi="Calibri" w:cs="Calibri"/>
-        </w:rPr>
-        <w:t xml:space="preserve">, </w:t>
-      </w:r>
-      <w:r>
-        <w:rPr>
-          <w:rFonts w:ascii="Consolas" w:hAnsi="Consolas" w:cs="Consolas"/>
-          <w:sz w:val="19"/>
-          <w:szCs w:val="19"/>
-        </w:rPr>
-        <w:t>compress</w:t>
-      </w:r>
-      <w:r>
-        <w:rPr>
-          <w:rFonts w:ascii="Calibri" w:hAnsi="Calibri" w:cs="Calibri"/>
-        </w:rPr>
-        <w:t xml:space="preserve">, </w:t>
-      </w:r>
-      <w:r>
-        <w:rPr>
-          <w:rFonts w:ascii="Consolas" w:hAnsi="Consolas" w:cs="Consolas"/>
-          <w:sz w:val="19"/>
-          <w:szCs w:val="19"/>
-        </w:rPr>
-        <w:t>expand</w:t>
-      </w:r>
-      <w:r>
-        <w:rPr>
-          <w:rFonts w:ascii="Calibri" w:hAnsi="Calibri" w:cs="Calibri"/>
-        </w:rPr>
-        <w:t xml:space="preserve">, and </w:t>
-      </w:r>
-      <w:r>
-        <w:rPr>
-          <w:rFonts w:ascii="Consolas" w:hAnsi="Consolas" w:cs="Consolas"/>
-          <w:sz w:val="19"/>
-          <w:szCs w:val="19"/>
-        </w:rPr>
-        <w:t>full-width</w:t>
-      </w:r>
-      <w:r>
-        <w:rPr>
-          <w:rFonts w:ascii="Calibri" w:hAnsi="Calibri" w:cs="Calibri"/>
-        </w:rPr>
-        <w:t xml:space="preserve">; relationship transformations are limited by relationship kind while </w:t>
-      </w:r>
-      <w:r>
-        <w:rPr>
-          <w:rFonts w:ascii="Consolas" w:hAnsi="Consolas" w:cs="Consolas"/>
-          <w:sz w:val="19"/>
-          <w:szCs w:val="19"/>
-        </w:rPr>
-        <w:t>precedes</w:t>
-      </w:r>
-      <w:r>
-        <w:rPr>
-          <w:rFonts w:ascii="Calibri" w:hAnsi="Calibri" w:cs="Calibri"/>
-        </w:rPr>
-        <w:t xml:space="preserve"> always preserves. Canonicalization uses breakpoint order, selected reading order, and canonical A-03 relationship order and preserves complete accessible reading order, semantic roles, cardinality, precedence, and parent-before-child containment. It adds no visibility, omission, media, fallback, rendering, records, registry, persistence, selection, or current-generation consumers. P10B-19A-04 adds one strict, deeply readonly PageBlueprint v2 asset-role compatibility companion. It reuses the canonical ordered nine-role vocabulary; binds exact blueprint ID/version and known regions; validates explicit required/optional role cardinality through maximum 32; and canonicalizes only valid authority by structural default reading order and canonical role order. It adds no exact asset, availability, reuse, responsive/fallback, record, registry, persistence, selector, renderer or current-generation authority. P10B-19A-03 adds the strict inactive PageBlueprint v2 structural contract and explicit v1 </w:t>
+        <w:t>fail-closed</w:t>
+      </w:r>
+      <w:r>
+        <w:rPr>
+          <w:rFonts w:ascii="Calibri" w:hAnsi="Calibri" w:cs="Calibri"/>
+        </w:rPr>
+        <w:t xml:space="preserve"> terminal rule; and preserves up to eight whole-blueprint substitution references in declared priority order. Required regions cannot be omitted, and a bounded internal A-03 projection revalidates the maximum simultaneous optional omission without export, persistence or fingerprinting. It adds no availability, target lookup, compatibility, selection, execution, records, registry, persistence, rendering or current- generation consumer. P10B-19A-05 retains the strict responsive-rule companion; P10B-19A-04 adds one strict, deeply readonly PageBlueprint v2 asset-role compatibility companion. It reuses the canonical ordered nine-role vocabulary; binds exact blueprint ID/version and known regions; validates explicit required/optional role cardinality through maximum 32; and canonicalizes only valid authority by structural default reading order and canonical role order. It adds no exact asset, availability, reuse, responsive/fallback, record, registry, persistence, selector, renderer or current-generation authority. P10B-19A-03 adds the strict inactive PageBlueprint v2 structural contract and explicit v1 </w:t>
       </w:r>
       <w:r>
         <w:rPr>
@@ -15444,7 +15495,7 @@
         <w:rPr>
           <w:rFonts w:ascii="Calibri" w:hAnsi="Calibri" w:cs="Calibri"/>
         </w:rPr>
-        <w:t xml:space="preserve">; P10B-19A-01 through P10B-19A-05 are </w:t>
+        <w:t xml:space="preserve">; P10B-19A-01 through P10B-19A-06 are </w:t>
       </w:r>
       <w:r>
         <w:rPr>
@@ -15458,7 +15509,7 @@
         <w:rPr>
           <w:rFonts w:ascii="Calibri" w:hAnsi="Calibri" w:cs="Calibri"/>
         </w:rPr>
-        <w:t xml:space="preserve">, and P10B-19A-06 is </w:t>
+        <w:t xml:space="preserve">, and P10B-19A-07 is </w:t>
       </w:r>
       <w:r>
         <w:rPr>
@@ -15488,7 +15539,7 @@
         <w:rPr>
           <w:rFonts w:ascii="Calibri" w:hAnsi="Calibri" w:cs="Calibri"/>
         </w:rPr>
-        <w:t>. The remaining Done conditions are implementation gates, not claims about the current repository. The P10B-16P-01 through P10B-16P-05A plus P10B-16P-06 sequence is a mandatory convergence package between P10B-16 and P10B-17; it supplements rather than renumbers the locked P10B-01 through P10B-18 plan. P10B-16P-05B follows accepted P10B-18C and is now Baseline. P10B-18D completed as a rejected-quality diagnostic. P10B-19 PRE is Baseline. P10B-19A is Partial; P10B-19A-01 through P10B-19A-05 are Baseline, P10B-19A-06 is the exact next product task, followed by planned P10B-19B through P10B-19J.</w:t>
+        <w:t>. The remaining Done conditions are implementation gates, not claims about the current repository. The P10B-16P-01 through P10B-16P-05A plus P10B-16P-06 sequence is a mandatory convergence package between P10B-16 and P10B-17; it supplements rather than renumbers the locked P10B-01 through P10B-18 plan. P10B-16P-05B follows accepted P10B-18C and is now Baseline. P10B-18D completed as a rejected-quality diagnostic. P10B-19 PRE is Baseline. P10B-19A-01 through P10B-19A-06 are Baseline, P10B-19A is Partial, and P10B-19A-07 - Inactive Family Registry and Candidate Fingerprints is the exact next implementation task, followed by planned P10B-19B through P10B-19J.</w:t>
       </w:r>
     </w:p>
     <w:p>
@@ -20947,7 +20998,7 @@
         <w:rPr>
           <w:rFonts w:ascii="Calibri" w:hAnsi="Calibri" w:cs="Calibri"/>
         </w:rPr>
-        <w:t>P10B-18C and P10B-16P-05B are Baseline. P10B-18D is a Baseline diagnostic with live commercial quality rejected. P10B-18 and P10B remain Partial. P10B-19 PRE is Baseline. P10B-19A is Partial; P10B-19A-01 through P10B-19A-05 are Baseline, and P10B-19A-06 is the exact next task, followed by planned P10B-19B through P10B-19J.</w:t>
+        <w:t>P10B-18C and P10B-16P-05B are Baseline. P10B-18D is a Baseline diagnostic with live commercial quality rejected. P10B-18 and P10B remain Partial. P10B-19 PRE is Baseline. P10B-19A-01 through P10B-19A-06 are Baseline, P10B-19A is Partial, and P10B-19A-07 - Inactive Family Registry and Candidate Fingerprints is the exact next implementation task, followed by planned P10B-19B through P10B-19J.</w:t>
       </w:r>
     </w:p>
     <w:p>
@@ -23034,7 +23085,7 @@
         <w:rPr>
           <w:rFonts w:ascii="Calibri" w:hAnsi="Calibri" w:cs="Calibri"/>
         </w:rPr>
-        <w:t xml:space="preserve"> is Partial; P10B-19A-01 through P10B-19A-05 are Baseline, P10B-19A-06 is the exact next task, and P10B-19B through P10B-19J remain Planned.</w:t>
+        <w:t xml:space="preserve"> is Partial; P10B-19A-01 through P10B-19A-06 are Baseline, P10B-19A-07 - Inactive Family Registry and Candidate Fingerprints is the exact next implementation task, and P10B-19B through P10B-19J remain Planned.</w:t>
       </w:r>
     </w:p>
     <w:p>
@@ -27029,7 +27080,7 @@
         <w:rPr>
           <w:rFonts w:ascii="Calibri" w:hAnsi="Calibri" w:cs="Calibri"/>
         </w:rPr>
-        <w:t xml:space="preserve"> with zero primary FAIL. P10B-16P-05B subsequently removed the one-time capture platform while retaining the bounded quality gate. P10B-18D subsequently completed as a rejected-quality diagnostic. P10B-19 PRE is Baseline, and P10B-19A is Partial; P10B-19A-01 through P10B-19A-05 are Baseline, and P10B-19A-06 is the exact next task.</w:t>
+        <w:t xml:space="preserve"> with zero primary FAIL. P10B-16P-05B subsequently removed the one-time capture platform while retaining the bounded quality gate. P10B-18D subsequently completed as a rejected-quality diagnostic. P10B-19 PRE is Baseline. P10B-19A-01 through P10B-19A-06 are Baseline, P10B-19A is Partial, and P10B-19A-07 - Inactive Family Registry and Candidate Fingerprints is the exact next implementation task.</w:t>
       </w:r>
     </w:p>
     <w:p>
@@ -27737,7 +27788,7 @@
               <w:rPr>
                 <w:rFonts w:ascii="Calibri" w:hAnsi="Calibri" w:cs="Calibri"/>
               </w:rPr>
-              <w:t>Next</w:t>
+              <w:t>Baseline</w:t>
             </w:r>
           </w:p>
         </w:tc>
@@ -27775,7 +27826,7 @@
                 <w:b/>
                 <w:bCs/>
               </w:rPr>
-              <w:t>Planned / exact next</w:t>
+              <w:t>Baseline</w:t>
             </w:r>
           </w:p>
         </w:tc>
@@ -27793,7 +27844,7 @@
               <w:rPr>
                 <w:rFonts w:ascii="Calibri" w:hAnsi="Calibri" w:cs="Calibri"/>
               </w:rPr>
-              <w:t>Omission, substitution and fallback contract</w:t>
+              <w:t>Omission, substitution and fallback contract bound to required asset-role regions; zero records or production consumers</w:t>
             </w:r>
           </w:p>
         </w:tc>
@@ -27817,7 +27868,7 @@
               <w:rPr>
                 <w:rFonts w:ascii="Calibri" w:hAnsi="Calibri" w:cs="Calibri"/>
               </w:rPr>
-              <w:t>Planned</w:t>
+              <w:t>Next</w:t>
             </w:r>
           </w:p>
         </w:tc>
@@ -27835,7 +27886,7 @@
               <w:rPr>
                 <w:rFonts w:ascii="Calibri" w:hAnsi="Calibri" w:cs="Calibri"/>
               </w:rPr>
-              <w:t>P10B-19B through P10B-19J</w:t>
+              <w:t>P10B-19A-07</w:t>
             </w:r>
           </w:p>
         </w:tc>
@@ -27855,6 +27906,86 @@
                 <w:b/>
                 <w:bCs/>
               </w:rPr>
+              <w:t>Planned / exact next</w:t>
+            </w:r>
+          </w:p>
+        </w:tc>
+        <w:tc>
+          <w:tcPr>
+            <w:tcW w:w="8460" w:type="dxa"/>
+            <w:vAlign w:val="center"/>
+          </w:tcPr>
+          <w:p>
+            <w:pPr>
+              <w:pStyle w:val="TableText"/>
+              <w:widowControl/>
+            </w:pPr>
+            <w:r>
+              <w:rPr>
+                <w:rFonts w:ascii="Calibri" w:hAnsi="Calibri" w:cs="Calibri"/>
+              </w:rPr>
+              <w:t>Inactive family registry and candidate fingerprints</w:t>
+            </w:r>
+          </w:p>
+        </w:tc>
+      </w:tr>
+      <w:tr>
+        <w:trPr>
+          <w:cantSplit/>
+        </w:trPr>
+        <w:tc>
+          <w:tcPr>
+            <w:tcW w:w="1000" w:type="dxa"/>
+            <w:vAlign w:val="center"/>
+          </w:tcPr>
+          <w:p>
+            <w:pPr>
+              <w:pStyle w:val="TableText"/>
+              <w:jc w:val="center"/>
+              <w:widowControl/>
+            </w:pPr>
+            <w:r>
+              <w:rPr>
+                <w:rFonts w:ascii="Calibri" w:hAnsi="Calibri" w:cs="Calibri"/>
+              </w:rPr>
+              <w:t>Planned</w:t>
+            </w:r>
+          </w:p>
+        </w:tc>
+        <w:tc>
+          <w:tcPr>
+            <w:tcW w:w="1500" w:type="dxa"/>
+            <w:vAlign w:val="center"/>
+          </w:tcPr>
+          <w:p>
+            <w:pPr>
+              <w:pStyle w:val="TableText"/>
+              <w:widowControl/>
+            </w:pPr>
+            <w:r>
+              <w:rPr>
+                <w:rFonts w:ascii="Calibri" w:hAnsi="Calibri" w:cs="Calibri"/>
+              </w:rPr>
+              <w:t>P10B-19B through P10B-19J</w:t>
+            </w:r>
+          </w:p>
+        </w:tc>
+        <w:tc>
+          <w:tcPr>
+            <w:tcW w:w="2000" w:type="dxa"/>
+            <w:vAlign w:val="center"/>
+          </w:tcPr>
+          <w:p>
+            <w:pPr>
+              <w:pStyle w:val="TableText"/>
+              <w:widowControl/>
+            </w:pPr>
+            <w:r>
+              <w:rPr>
+                <w:rFonts w:ascii="Calibri" w:hAnsi="Calibri" w:cs="Calibri"/>
+                <w:b/>
+                <w:bCs/>
+              </w:rPr>
               <w:t>Planned</w:t>
             </w:r>
           </w:p>
@@ -28147,6 +28278,22 @@
         <w:rPr>
           <w:rFonts w:ascii="Calibri" w:hAnsi="Calibri" w:cs="Calibri"/>
         </w:rPr>
+        <w:t>P10B-19A-06 = Baseline</w:t>
+      </w:r>
+    </w:p>
+    <w:p>
+      <w:pPr>
+        <w:pStyle w:val="Normal"/>
+        <w:numPr>
+          <w:ilvl w:val="0"/>
+          <w:numId w:val="1"/>
+        </w:numPr>
+        <w:widowControl/>
+      </w:pPr>
+      <w:r>
+        <w:rPr>
+          <w:rFonts w:ascii="Calibri" w:hAnsi="Calibri" w:cs="Calibri"/>
+        </w:rPr>
         <w:t>P10B-19A = Partial</w:t>
       </w:r>
     </w:p>
@@ -28163,7 +28310,7 @@
         <w:rPr>
           <w:rFonts w:ascii="Calibri" w:hAnsi="Calibri" w:cs="Calibri"/>
         </w:rPr>
-        <w:t>P10B-19A-06 = exact next implementation task</w:t>
+        <w:t>P10B-19A-07 = exact next implementation task</w:t>
       </w:r>
     </w:p>
     <w:p>

</xml_diff>

<commit_message>
feat: add inactive family candidate registry
</commit_message>
<xml_diff>
--- a/docs/VESKIFY_DEVELOPMENT_DELIVERY_TRACKER_v1.3.0.docx
+++ b/docs/VESKIFY_DEVELOPMENT_DELIVERY_TRACKER_v1.3.0.docx
@@ -38,7 +38,7 @@
         <w:rPr>
           <w:rFonts w:ascii="Calibri" w:hAnsi="Calibri" w:cs="Calibri"/>
         </w:rPr>
-        <w:t>Delivery status baseline: 1 September 2026, P10B-19A-06 PageBlueprint v2 omission, substitution and fallback contract Baseline</w:t>
+        <w:t>Delivery status baseline: 1 September 2026, P10B-19A-07 Inactive Family Registry and Candidate Fingerprints Baseline</w:t>
       </w:r>
     </w:p>
     <w:p>
@@ -249,7 +249,7 @@
               <w:rPr>
                 <w:rFonts w:ascii="Calibri" w:hAnsi="Calibri" w:cs="Calibri"/>
               </w:rPr>
-              <w:t>1 September 2026, P10B-19A-06 PageBlueprint v2 omission, substitution and fallback contract Baseline</w:t>
+              <w:t>1 September 2026, P10B-19A-07 Inactive Family Registry and Candidate Fingerprints Baseline</w:t>
             </w:r>
           </w:p>
         </w:tc>
@@ -8817,7 +8817,7 @@
               <w:rPr>
                 <w:rFonts w:ascii="Calibri" w:hAnsi="Calibri" w:cs="Calibri"/>
               </w:rPr>
-              <w:t>☐</w:t>
+              <w:t>☑</w:t>
             </w:r>
           </w:p>
         </w:tc>
@@ -8874,6 +8874,141 @@
                 <w:b/>
                 <w:bCs/>
               </w:rPr>
+              <w:t>Baseline</w:t>
+            </w:r>
+          </w:p>
+        </w:tc>
+        <w:tc>
+          <w:tcPr>
+            <w:tcW w:w="1500" w:type="dxa"/>
+            <w:vAlign w:val="center"/>
+          </w:tcPr>
+          <w:p>
+            <w:pPr>
+              <w:pStyle w:val="CompactTableText"/>
+              <w:widowControl/>
+            </w:pPr>
+            <w:r>
+              <w:rPr>
+                <w:rFonts w:ascii="Calibri" w:hAnsi="Calibri" w:cs="Calibri"/>
+              </w:rPr>
+              <w:t>P10B-19A task owner</w:t>
+            </w:r>
+          </w:p>
+        </w:tc>
+        <w:tc>
+          <w:tcPr>
+            <w:tcW w:w="2500" w:type="dxa"/>
+            <w:vAlign w:val="center"/>
+          </w:tcPr>
+          <w:p>
+            <w:pPr>
+              <w:pStyle w:val="CompactTableText"/>
+              <w:widowControl/>
+            </w:pPr>
+            <w:r>
+              <w:rPr>
+                <w:rFonts w:ascii="Calibri" w:hAnsi="Calibri" w:cs="Calibri"/>
+              </w:rPr>
+              <w:t>P10B-19A-01 through P10B-19A-06 merged</w:t>
+            </w:r>
+          </w:p>
+        </w:tc>
+        <w:tc>
+          <w:tcPr>
+            <w:tcW w:w="2890" w:type="dxa"/>
+            <w:vAlign w:val="center"/>
+          </w:tcPr>
+          <w:p>
+            <w:pPr>
+              <w:pStyle w:val="CompactTableText"/>
+              <w:widowControl/>
+            </w:pPr>
+            <w:r>
+              <w:rPr>
+                <w:rFonts w:ascii="Calibri" w:hAnsi="Calibri" w:cs="Calibri"/>
+              </w:rPr>
+              <w:t>Exact candidate composition/fingerprints; six A-02 profiles; resolved same-family A-06 targets and acyclic substitutions; sole production registry exactly empty; zero records, selection or runtime consumers</w:t>
+            </w:r>
+          </w:p>
+        </w:tc>
+      </w:tr>
+      <w:tr>
+        <w:trPr>
+          <w:cantSplit/>
+        </w:trPr>
+        <w:tc>
+          <w:tcPr>
+            <w:tcW w:w="720" w:type="dxa"/>
+            <w:vAlign w:val="center"/>
+          </w:tcPr>
+          <w:p>
+            <w:pPr>
+              <w:pStyle w:val="CompactTableText"/>
+              <w:jc w:val="center"/>
+              <w:widowControl/>
+            </w:pPr>
+            <w:r>
+              <w:rPr>
+                <w:rFonts w:ascii="Calibri" w:hAnsi="Calibri" w:cs="Calibri"/>
+              </w:rPr>
+              <w:t>☐</w:t>
+            </w:r>
+          </w:p>
+        </w:tc>
+        <w:tc>
+          <w:tcPr>
+            <w:tcW w:w="1700" w:type="dxa"/>
+            <w:vAlign w:val="center"/>
+          </w:tcPr>
+          <w:p>
+            <w:pPr>
+              <w:pStyle w:val="CompactTableText"/>
+              <w:widowControl/>
+            </w:pPr>
+            <w:r>
+              <w:rPr>
+                <w:rFonts w:ascii="Calibri" w:hAnsi="Calibri" w:cs="Calibri"/>
+              </w:rPr>
+              <w:t>P10B-19A-08</w:t>
+            </w:r>
+          </w:p>
+        </w:tc>
+        <w:tc>
+          <w:tcPr>
+            <w:tcW w:w="2800" w:type="dxa"/>
+            <w:vAlign w:val="center"/>
+          </w:tcPr>
+          <w:p>
+            <w:pPr>
+              <w:pStyle w:val="CompactTableText"/>
+              <w:widowControl/>
+            </w:pPr>
+            <w:r>
+              <w:rPr>
+                <w:rFonts w:ascii="Calibri" w:hAnsi="Calibri" w:cs="Calibri"/>
+              </w:rPr>
+              <w:t>Compatibility, Deterministic Selection and Normalized Topology Identity</w:t>
+            </w:r>
+          </w:p>
+        </w:tc>
+        <w:tc>
+          <w:tcPr>
+            <w:tcW w:w="850" w:type="dxa"/>
+            <w:vAlign w:val="center"/>
+          </w:tcPr>
+          <w:p>
+            <w:pPr>
+              <w:pStyle w:val="CompactTableText"/>
+              <w:jc w:val="center"/>
+              <w:widowControl/>
+            </w:pPr>
+            <w:r>
+              <w:rPr>
+                <w:rFonts w:ascii="Calibri" w:hAnsi="Calibri" w:cs="Calibri"/>
+                <w:b/>
+                <w:bCs/>
+              </w:rPr>
               <w:t>Planned / exact next</w:t>
             </w:r>
           </w:p>
@@ -8910,7 +9045,7 @@
               <w:rPr>
                 <w:rFonts w:ascii="Calibri" w:hAnsi="Calibri" w:cs="Calibri"/>
               </w:rPr>
-              <w:t>P10B-19A-01 through P10B-19A-06 merged</w:t>
+              <w:t>P10B-19A-07 merged</w:t>
             </w:r>
           </w:p>
         </w:tc>
@@ -8928,7 +9063,7 @@
               <w:rPr>
                 <w:rFonts w:ascii="Calibri" w:hAnsi="Calibri" w:cs="Calibri"/>
               </w:rPr>
-              <w:t>Add inactive family registry and candidate fingerprints without beginning current selection or runtime integration</w:t>
+              <w:t>Add compatibility, deterministic selection and normalized topology identity without beginning v1 migration or runtime integration</w:t>
             </w:r>
           </w:p>
         </w:tc>
@@ -13301,7 +13436,7 @@
         <w:rPr>
           <w:rFonts w:ascii="Calibri" w:hAnsi="Calibri" w:cs="Calibri"/>
         </w:rPr>
-        <w:t xml:space="preserve">P10B remains Partial. DEVX-01A through DEVX-01G are Baseline, and DEVX-01 is Baseline / closed. P10B-19A-01 through P10B-19A-06 are Baseline, P10B-19A is Partial, and P10B-19A-07 - Inactive Family Registry and Candidate Fingerprints is the exact next implementation task. DEVX-01C measured the serial gate, retained PR/ref-scoped cancellation and added compatible </w:t>
+        <w:t xml:space="preserve">P10B remains Partial. DEVX-01A through DEVX-01G are Baseline, and DEVX-01 is Baseline / closed. P10B-19A-01 through P10B-19A-07 are Baseline, P10B-19A is Partial, and P10B-19A-08 - Compatibility, Deterministic Selection and Normalized Topology Identity is the exact next implementation task. DEVX-01C measured the serial gate, retained PR/ref-scoped cancellation and added compatible </w:t>
       </w:r>
       <w:r>
         <w:rPr>
@@ -14084,7 +14219,7 @@
         <w:rPr>
           <w:rFonts w:ascii="Calibri" w:hAnsi="Calibri" w:cs="Calibri"/>
         </w:rPr>
-        <w:t xml:space="preserve">P10B-19A-01 through P10B-19A-06 are </w:t>
+        <w:t xml:space="preserve">P10B-19A-01 through P10B-19A-07 are </w:t>
       </w:r>
       <w:r>
         <w:rPr>
@@ -14112,7 +14247,7 @@
         <w:rPr>
           <w:rFonts w:ascii="Calibri" w:hAnsi="Calibri" w:cs="Calibri"/>
         </w:rPr>
-        <w:t xml:space="preserve">, and P10B-19A-07 - Inactive Family Registry and Candidate Fingerprints is the exact next implementation task. P10B-19A-06 adds one strict, deeply readonly PageBlueprint v2 omission, substitution and fallback companion at schema version </w:t>
+        <w:t xml:space="preserve">, and P10B-19A-08 - Compatibility, Deterministic Selection and Normalized Topology Identity is the exact next implementation task. P10B-19A-07 adds strict, deeply readonly PageBlueprint v2 and Structural Storefront Family candidate authorities at candidate schema version </w:t>
       </w:r>
       <w:r>
         <w:rPr>
@@ -14126,7 +14261,7 @@
         <w:rPr>
           <w:rFonts w:ascii="Calibri" w:hAnsi="Calibri" w:cs="Calibri"/>
         </w:rPr>
-        <w:t xml:space="preserve">. It composes the exact A-03 structural, A-04 asset-role and A-05 responsive identity; owns only </w:t>
+        <w:t xml:space="preserve">. PageBlueprint candidates compose exact A-03/A-04/A-05/A-06 authority and use stale-checked </w:t>
       </w:r>
       <w:r>
         <w:rPr>
@@ -14134,13 +14269,13 @@
           <w:sz w:val="19"/>
           <w:szCs w:val="19"/>
         </w:rPr>
-        <w:t>required-asset-role-cardinality-unsatisfied</w:t>
-      </w:r>
-      <w:r>
-        <w:rPr>
-          <w:rFonts w:ascii="Calibri" w:hAnsi="Calibri" w:cs="Calibri"/>
-        </w:rPr>
-        <w:t xml:space="preserve">; covers every and only required-role region with one explicit </w:t>
+        <w:t>page-blueprint-v2-candidate-v1_&lt;canonical-length&gt;_&lt;sha256&gt;</w:t>
+      </w:r>
+      <w:r>
+        <w:rPr>
+          <w:rFonts w:ascii="Calibri" w:hAnsi="Calibri" w:cs="Calibri"/>
+        </w:rPr>
+        <w:t xml:space="preserve"> exact-content fingerprints. Family candidates keep exact A-01 identity and lifecycle </w:t>
       </w:r>
       <w:r>
         <w:rPr>
@@ -14148,13 +14283,13 @@
           <w:sz w:val="19"/>
           <w:szCs w:val="19"/>
         </w:rPr>
-        <w:t>omit-region</w:t>
-      </w:r>
-      <w:r>
-        <w:rPr>
-          <w:rFonts w:ascii="Calibri" w:hAnsi="Calibri" w:cs="Calibri"/>
-        </w:rPr>
-        <w:t xml:space="preserve"> or </w:t>
+        <w:t>candidate</w:t>
+      </w:r>
+      <w:r>
+        <w:rPr>
+          <w:rFonts w:ascii="Calibri" w:hAnsi="Calibri" w:cs="Calibri"/>
+        </w:rPr>
+        <w:t xml:space="preserve">, cover all six A-02 page-family roles with nonempty profile references and canonical A-02 relationships, and use stale-checked </w:t>
       </w:r>
       <w:r>
         <w:rPr>
@@ -14162,13 +14297,13 @@
           <w:sz w:val="19"/>
           <w:szCs w:val="19"/>
         </w:rPr>
-        <w:t>fail-closed</w:t>
-      </w:r>
-      <w:r>
-        <w:rPr>
-          <w:rFonts w:ascii="Calibri" w:hAnsi="Calibri" w:cs="Calibri"/>
-        </w:rPr>
-        <w:t xml:space="preserve"> terminal rule; and preserves up to eight whole-blueprint substitution references in declared priority order. Required regions cannot be omitted, and a bounded internal A-03 projection revalidates the maximum simultaneous optional omission without export, persistence or fingerprinting. It adds no availability, target lookup, compatibility, selection, execution, records, registry, persistence, rendering or current- generation consumer. P10B-19A-05 retains the strict responsive-rule companion; P10B-19A-04 adds one strict, deeply readonly PageBlueprint v2 asset-role compatibility companion. It reuses the canonical ordered nine-role vocabulary; binds exact blueprint ID/version and known regions; validates explicit required/optional role cardinality through maximum 32; and canonicalizes only valid authority by structural default reading order and canonical role order. It adds no exact asset, availability, reuse, responsive/fallback, record, registry, persistence, selector, renderer or current-generation authority. P10B-19A-03 adds the strict inactive PageBlueprint v2 structural contract and explicit v1 </w:t>
+        <w:t>structural-storefront-family-candidate-v1_&lt;canonical-length&gt;_&lt;sha256&gt;</w:t>
+      </w:r>
+      <w:r>
+        <w:rPr>
+          <w:rFonts w:ascii="Calibri" w:hAnsi="Calibri" w:cs="Calibri"/>
+        </w:rPr>
+        <w:t xml:space="preserve"> fingerprints that exclude lifecycle. The inactive registry rejects duplicate identities, unresolved or page-family-mismatched A-06 targets, and direct, indirect, or cross-version substitution cycles while preserving target priority. Its sole production value has two exactly empty candidate arrays. These fingerprints are content integrity, not normalized topology; active or candidate records, selection, activation, persistence, publication, and runtime consumers remain zero. A-01 through A-06 and v1 remain unchanged; A-08 owns compatibility, deterministic selection, and normalized topology. P10B-19A-06 adds one strict, deeply readonly PageBlueprint v2 omission, substitution and fallback companion at schema version </w:t>
       </w:r>
       <w:r>
         <w:rPr>
@@ -14182,7 +14317,7 @@
         <w:rPr>
           <w:rFonts w:ascii="Calibri" w:hAnsi="Calibri" w:cs="Calibri"/>
         </w:rPr>
-        <w:t xml:space="preserve"> / v2 </w:t>
+        <w:t xml:space="preserve">. It composes the exact A-03 structural, A-04 asset-role and A-05 responsive identity; owns only </w:t>
       </w:r>
       <w:r>
         <w:rPr>
@@ -14190,13 +14325,13 @@
           <w:sz w:val="19"/>
           <w:szCs w:val="19"/>
         </w:rPr>
-        <w:t>2.0.0</w:t>
-      </w:r>
-      <w:r>
-        <w:rPr>
-          <w:rFonts w:ascii="Calibri" w:hAnsi="Calibri" w:cs="Calibri"/>
-        </w:rPr>
-        <w:t xml:space="preserve"> </w:t>
+        <w:t>required-asset-role-cardinality-unsatisfied</w:t>
+      </w:r>
+      <w:r>
+        <w:rPr>
+          <w:rFonts w:ascii="Calibri" w:hAnsi="Calibri" w:cs="Calibri"/>
+        </w:rPr>
+        <w:t xml:space="preserve">; covers every and only required-role region with one explicit </w:t>
       </w:r>
       <w:r>
         <w:rPr>
@@ -14204,13 +14339,13 @@
           <w:sz w:val="19"/>
           <w:szCs w:val="19"/>
         </w:rPr>
-        <w:t>contractSchemaVersion</w:t>
-      </w:r>
-      <w:r>
-        <w:rPr>
-          <w:rFonts w:ascii="Calibri" w:hAnsi="Calibri" w:cs="Calibri"/>
-        </w:rPr>
-        <w:t xml:space="preserve"> dispatch under </w:t>
+        <w:t>omit-region</w:t>
+      </w:r>
+      <w:r>
+        <w:rPr>
+          <w:rFonts w:ascii="Calibri" w:hAnsi="Calibri" w:cs="Calibri"/>
+        </w:rPr>
+        <w:t xml:space="preserve"> or </w:t>
       </w:r>
       <w:r>
         <w:rPr>
@@ -14218,13 +14353,13 @@
           <w:sz w:val="19"/>
           <w:szCs w:val="19"/>
         </w:rPr>
-        <w:t>src/application/storefront-templates</w:t>
-      </w:r>
-      <w:r>
-        <w:rPr>
-          <w:rFonts w:ascii="Calibri" w:hAnsi="Calibri" w:cs="Calibri"/>
-        </w:rPr>
-        <w:t xml:space="preserve">. It reuses canonical page-family, narrative-role and visual-weight authority; locks </w:t>
+        <w:t>fail-closed</w:t>
+      </w:r>
+      <w:r>
+        <w:rPr>
+          <w:rFonts w:ascii="Calibri" w:hAnsi="Calibri" w:cs="Calibri"/>
+        </w:rPr>
+        <w:t xml:space="preserve"> terminal rule; and preserves up to eight whole-blueprint substitution references in declared priority order. Required regions cannot be omitted, and a bounded internal A-03 projection revalidates the maximum simultaneous optional omission without export, persistence or fingerprinting. It adds no availability, target lookup, compatibility, selection, execution, records, registry, persistence, rendering or current- generation consumer. P10B-19A-05 retains the strict responsive-rule companion; P10B-19A-04 adds one strict, deeply readonly PageBlueprint v2 asset-role compatibility companion. It reuses the canonical ordered nine-role vocabulary; binds exact blueprint ID/version and known regions; validates explicit required/optional role cardinality through maximum 32; and canonicalizes only valid authority by structural default reading order and canonical role order. It adds no exact asset, availability, reuse, responsive/fallback, record, registry, persistence, selector, renderer or current-generation authority. P10B-19A-03 adds the strict inactive PageBlueprint v2 structural contract and explicit v1 </w:t>
       </w:r>
       <w:r>
         <w:rPr>
@@ -14232,13 +14367,13 @@
           <w:sz w:val="19"/>
           <w:szCs w:val="19"/>
         </w:rPr>
-        <w:t>precedes</w:t>
-      </w:r>
-      <w:r>
-        <w:rPr>
-          <w:rFonts w:ascii="Calibri" w:hAnsi="Calibri" w:cs="Calibri"/>
-        </w:rPr>
-        <w:t xml:space="preserve">, </w:t>
+        <w:t>1.0.0</w:t>
+      </w:r>
+      <w:r>
+        <w:rPr>
+          <w:rFonts w:ascii="Calibri" w:hAnsi="Calibri" w:cs="Calibri"/>
+        </w:rPr>
+        <w:t xml:space="preserve"> / v2 </w:t>
       </w:r>
       <w:r>
         <w:rPr>
@@ -14246,13 +14381,13 @@
           <w:sz w:val="19"/>
           <w:szCs w:val="19"/>
         </w:rPr>
-        <w:t>pairs-with</w:t>
-      </w:r>
-      <w:r>
-        <w:rPr>
-          <w:rFonts w:ascii="Calibri" w:hAnsi="Calibri" w:cs="Calibri"/>
-        </w:rPr>
-        <w:t xml:space="preserve">, </w:t>
+        <w:t>2.0.0</w:t>
+      </w:r>
+      <w:r>
+        <w:rPr>
+          <w:rFonts w:ascii="Calibri" w:hAnsi="Calibri" w:cs="Calibri"/>
+        </w:rPr>
+        <w:t xml:space="preserve"> </w:t>
       </w:r>
       <w:r>
         <w:rPr>
@@ -14260,13 +14395,13 @@
           <w:sz w:val="19"/>
           <w:szCs w:val="19"/>
         </w:rPr>
-        <w:t>offsets</w:t>
-      </w:r>
-      <w:r>
-        <w:rPr>
-          <w:rFonts w:ascii="Calibri" w:hAnsi="Calibri" w:cs="Calibri"/>
-        </w:rPr>
-        <w:t xml:space="preserve">, </w:t>
+        <w:t>contractSchemaVersion</w:t>
+      </w:r>
+      <w:r>
+        <w:rPr>
+          <w:rFonts w:ascii="Calibri" w:hAnsi="Calibri" w:cs="Calibri"/>
+        </w:rPr>
+        <w:t xml:space="preserve"> dispatch under </w:t>
       </w:r>
       <w:r>
         <w:rPr>
@@ -14274,13 +14409,13 @@
           <w:sz w:val="19"/>
           <w:szCs w:val="19"/>
         </w:rPr>
-        <w:t>contains</w:t>
-      </w:r>
-      <w:r>
-        <w:rPr>
-          <w:rFonts w:ascii="Calibri" w:hAnsi="Calibri" w:cs="Calibri"/>
-        </w:rPr>
-        <w:t xml:space="preserve">, </w:t>
+        <w:t>src/application/storefront-templates</w:t>
+      </w:r>
+      <w:r>
+        <w:rPr>
+          <w:rFonts w:ascii="Calibri" w:hAnsi="Calibri" w:cs="Calibri"/>
+        </w:rPr>
+        <w:t xml:space="preserve">. It reuses canonical page-family, narrative-role and visual-weight authority; locks </w:t>
       </w:r>
       <w:r>
         <w:rPr>
@@ -14288,13 +14423,13 @@
           <w:sz w:val="19"/>
           <w:szCs w:val="19"/>
         </w:rPr>
-        <w:t>spans</w:t>
-      </w:r>
-      <w:r>
-        <w:rPr>
-          <w:rFonts w:ascii="Calibri" w:hAnsi="Calibri" w:cs="Calibri"/>
-        </w:rPr>
-        <w:t xml:space="preserve"> and </w:t>
+        <w:t>precedes</w:t>
+      </w:r>
+      <w:r>
+        <w:rPr>
+          <w:rFonts w:ascii="Calibri" w:hAnsi="Calibri" w:cs="Calibri"/>
+        </w:rPr>
+        <w:t xml:space="preserve">, </w:t>
       </w:r>
       <w:r>
         <w:rPr>
@@ -14302,13 +14437,13 @@
           <w:sz w:val="19"/>
           <w:szCs w:val="19"/>
         </w:rPr>
-        <w:t>anchors</w:t>
-      </w:r>
-      <w:r>
-        <w:rPr>
-          <w:rFonts w:ascii="Calibri" w:hAnsi="Calibri" w:cs="Calibri"/>
-        </w:rPr>
-        <w:t xml:space="preserve">; validates required-role minimums, bounded graph invariants and complete accessible order alternatives; and canonicalizes only valid authority. Existing v1 profiles are unchanged. Active-family, candidate-family-registry, v2-record, v2-registry, persisted-v2 and current-generation-v2-consumer counts remain zero. Responsive and fallback authority remain unimplemented. P10B-19A-02 adds the strict six-role and seven-kind directed relationship value object, deterministic key, bounded duplicate evidence and canonical collection ordering. It adds zero active family records, candidate registry records, persisted relationships, production-selected relationships or current-generation consumers. P10B-19A-01 establishes </w:t>
+        <w:t>pairs-with</w:t>
+      </w:r>
+      <w:r>
+        <w:rPr>
+          <w:rFonts w:ascii="Calibri" w:hAnsi="Calibri" w:cs="Calibri"/>
+        </w:rPr>
+        <w:t xml:space="preserve">, </w:t>
       </w:r>
       <w:r>
         <w:rPr>
@@ -14316,13 +14451,13 @@
           <w:sz w:val="19"/>
           <w:szCs w:val="19"/>
         </w:rPr>
-        <w:t>src/domain/structural-storefront-family</w:t>
-      </w:r>
-      <w:r>
-        <w:rPr>
-          <w:rFonts w:ascii="Calibri" w:hAnsi="Calibri" w:cs="Calibri"/>
-        </w:rPr>
-        <w:t xml:space="preserve"> as the sole family identity authority with the ordered IDs </w:t>
+        <w:t>offsets</w:t>
+      </w:r>
+      <w:r>
+        <w:rPr>
+          <w:rFonts w:ascii="Calibri" w:hAnsi="Calibri" w:cs="Calibri"/>
+        </w:rPr>
+        <w:t xml:space="preserve">, </w:t>
       </w:r>
       <w:r>
         <w:rPr>
@@ -14330,7 +14465,7 @@
           <w:sz w:val="19"/>
           <w:szCs w:val="19"/>
         </w:rPr>
-        <w:t>editorial-offset</w:t>
+        <w:t>contains</w:t>
       </w:r>
       <w:r>
         <w:rPr>
@@ -14344,13 +14479,13 @@
           <w:sz w:val="19"/>
           <w:szCs w:val="19"/>
         </w:rPr>
-        <w:t>campaign-modular</w:t>
-      </w:r>
-      <w:r>
-        <w:rPr>
-          <w:rFonts w:ascii="Calibri" w:hAnsi="Calibri" w:cs="Calibri"/>
-        </w:rPr>
-        <w:t xml:space="preserve">, </w:t>
+        <w:t>spans</w:t>
+      </w:r>
+      <w:r>
+        <w:rPr>
+          <w:rFonts w:ascii="Calibri" w:hAnsi="Calibri" w:cs="Calibri"/>
+        </w:rPr>
+        <w:t xml:space="preserve"> and </w:t>
       </w:r>
       <w:r>
         <w:rPr>
@@ -14358,13 +14493,13 @@
           <w:sz w:val="19"/>
           <w:szCs w:val="19"/>
         </w:rPr>
-        <w:t>product-first-commerce</w:t>
-      </w:r>
-      <w:r>
-        <w:rPr>
-          <w:rFonts w:ascii="Calibri" w:hAnsi="Calibri" w:cs="Calibri"/>
-        </w:rPr>
-        <w:t xml:space="preserve">, </w:t>
+        <w:t>anchors</w:t>
+      </w:r>
+      <w:r>
+        <w:rPr>
+          <w:rFonts w:ascii="Calibri" w:hAnsi="Calibri" w:cs="Calibri"/>
+        </w:rPr>
+        <w:t xml:space="preserve">; validates required-role minimums, bounded graph invariants and complete accessible order alternatives; and canonicalizes only valid authority. Existing v1 profiles are unchanged. Active-family, candidate-family-registry, v2-record, v2-registry, persisted-v2 and current-generation-v2-consumer counts remain zero. A-03 itself added no responsive or fallback authority. P10B-19A-02 adds the strict six-role and seven-kind directed relationship value object, deterministic key, bounded duplicate evidence and canonical collection ordering. It adds zero active family records, candidate registry records, persisted relationships, production-selected relationships or current-generation consumers. P10B-19A-01 establishes </w:t>
       </w:r>
       <w:r>
         <w:rPr>
@@ -14372,13 +14507,13 @@
           <w:sz w:val="19"/>
           <w:szCs w:val="19"/>
         </w:rPr>
-        <w:t>technical-comparison</w:t>
-      </w:r>
-      <w:r>
-        <w:rPr>
-          <w:rFonts w:ascii="Calibri" w:hAnsi="Calibri" w:cs="Calibri"/>
-        </w:rPr>
-        <w:t xml:space="preserve">, </w:t>
+        <w:t>src/domain/structural-storefront-family</w:t>
+      </w:r>
+      <w:r>
+        <w:rPr>
+          <w:rFonts w:ascii="Calibri" w:hAnsi="Calibri" w:cs="Calibri"/>
+        </w:rPr>
+        <w:t xml:space="preserve"> as the sole family identity authority with the ordered IDs </w:t>
       </w:r>
       <w:r>
         <w:rPr>
@@ -14386,13 +14521,13 @@
           <w:sz w:val="19"/>
           <w:szCs w:val="19"/>
         </w:rPr>
-        <w:t>warm-narrative</w:t>
-      </w:r>
-      <w:r>
-        <w:rPr>
-          <w:rFonts w:ascii="Calibri" w:hAnsi="Calibri" w:cs="Calibri"/>
-        </w:rPr>
-        <w:t xml:space="preserve">, and </w:t>
+        <w:t>editorial-offset</w:t>
+      </w:r>
+      <w:r>
+        <w:rPr>
+          <w:rFonts w:ascii="Calibri" w:hAnsi="Calibri" w:cs="Calibri"/>
+        </w:rPr>
+        <w:t xml:space="preserve">, </w:t>
       </w:r>
       <w:r>
         <w:rPr>
@@ -14400,13 +14535,13 @@
           <w:sz w:val="19"/>
           <w:szCs w:val="19"/>
         </w:rPr>
-        <w:t>restrained-gallery</w:t>
-      </w:r>
-      <w:r>
-        <w:rPr>
-          <w:rFonts w:ascii="Calibri" w:hAnsi="Calibri" w:cs="Calibri"/>
-        </w:rPr>
-        <w:t xml:space="preserve">; strict supported-major-v1 versions beginning at </w:t>
+        <w:t>campaign-modular</w:t>
+      </w:r>
+      <w:r>
+        <w:rPr>
+          <w:rFonts w:ascii="Calibri" w:hAnsi="Calibri" w:cs="Calibri"/>
+        </w:rPr>
+        <w:t xml:space="preserve">, </w:t>
       </w:r>
       <w:r>
         <w:rPr>
@@ -14414,13 +14549,13 @@
           <w:sz w:val="19"/>
           <w:szCs w:val="19"/>
         </w:rPr>
-        <w:t>1.0.0</w:t>
-      </w:r>
-      <w:r>
-        <w:rPr>
-          <w:rFonts w:ascii="Calibri" w:hAnsi="Calibri" w:cs="Calibri"/>
-        </w:rPr>
-        <w:t xml:space="preserve">; and lifecycle states </w:t>
+        <w:t>product-first-commerce</w:t>
+      </w:r>
+      <w:r>
+        <w:rPr>
+          <w:rFonts w:ascii="Calibri" w:hAnsi="Calibri" w:cs="Calibri"/>
+        </w:rPr>
+        <w:t xml:space="preserve">, </w:t>
       </w:r>
       <w:r>
         <w:rPr>
@@ -14428,7 +14563,7 @@
           <w:sz w:val="19"/>
           <w:szCs w:val="19"/>
         </w:rPr>
-        <w:t>candidate</w:t>
+        <w:t>technical-comparison</w:t>
       </w:r>
       <w:r>
         <w:rPr>
@@ -14442,7 +14577,7 @@
           <w:sz w:val="19"/>
           <w:szCs w:val="19"/>
         </w:rPr>
-        <w:t>active</w:t>
+        <w:t>warm-narrative</w:t>
       </w:r>
       <w:r>
         <w:rPr>
@@ -14456,13 +14591,69 @@
           <w:sz w:val="19"/>
           <w:szCs w:val="19"/>
         </w:rPr>
+        <w:t>restrained-gallery</w:t>
+      </w:r>
+      <w:r>
+        <w:rPr>
+          <w:rFonts w:ascii="Calibri" w:hAnsi="Calibri" w:cs="Calibri"/>
+        </w:rPr>
+        <w:t xml:space="preserve">; strict supported-major-v1 versions beginning at </w:t>
+      </w:r>
+      <w:r>
+        <w:rPr>
+          <w:rFonts w:ascii="Consolas" w:hAnsi="Consolas" w:cs="Consolas"/>
+          <w:sz w:val="19"/>
+          <w:szCs w:val="19"/>
+        </w:rPr>
+        <w:t>1.0.0</w:t>
+      </w:r>
+      <w:r>
+        <w:rPr>
+          <w:rFonts w:ascii="Calibri" w:hAnsi="Calibri" w:cs="Calibri"/>
+        </w:rPr>
+        <w:t xml:space="preserve">; and lifecycle states </w:t>
+      </w:r>
+      <w:r>
+        <w:rPr>
+          <w:rFonts w:ascii="Consolas" w:hAnsi="Consolas" w:cs="Consolas"/>
+          <w:sz w:val="19"/>
+          <w:szCs w:val="19"/>
+        </w:rPr>
+        <w:t>candidate</w:t>
+      </w:r>
+      <w:r>
+        <w:rPr>
+          <w:rFonts w:ascii="Calibri" w:hAnsi="Calibri" w:cs="Calibri"/>
+        </w:rPr>
+        <w:t xml:space="preserve">, </w:t>
+      </w:r>
+      <w:r>
+        <w:rPr>
+          <w:rFonts w:ascii="Consolas" w:hAnsi="Consolas" w:cs="Consolas"/>
+          <w:sz w:val="19"/>
+          <w:szCs w:val="19"/>
+        </w:rPr>
+        <w:t>active</w:t>
+      </w:r>
+      <w:r>
+        <w:rPr>
+          <w:rFonts w:ascii="Calibri" w:hAnsi="Calibri" w:cs="Calibri"/>
+        </w:rPr>
+        <w:t xml:space="preserve">, and </w:t>
+      </w:r>
+      <w:r>
+        <w:rPr>
+          <w:rFonts w:ascii="Consolas" w:hAnsi="Consolas" w:cs="Consolas"/>
+          <w:sz w:val="19"/>
+          <w:szCs w:val="19"/>
+        </w:rPr>
         <w:t>deprecated</w:t>
       </w:r>
       <w:r>
         <w:rPr>
           <w:rFonts w:ascii="Calibri" w:hAnsi="Calibri" w:cs="Calibri"/>
         </w:rPr>
-        <w:t>. Active-family and candidate- registry-record counts remain zero. No registry, fingerprint, selection, PageBlueprint v2, rendering, or current-generation wiring exists yet.</w:t>
+        <w:t>. Active-family and candidate- registry-record counts remain zero. A-01 itself added no registry, fingerprint, selection, PageBlueprint v2, rendering, or current-generation wiring.</w:t>
       </w:r>
     </w:p>
     <w:p>
@@ -15495,7 +15686,7 @@
         <w:rPr>
           <w:rFonts w:ascii="Calibri" w:hAnsi="Calibri" w:cs="Calibri"/>
         </w:rPr>
-        <w:t xml:space="preserve">; P10B-19A-01 through P10B-19A-06 are </w:t>
+        <w:t xml:space="preserve">; P10B-19A-01 through P10B-19A-07 are </w:t>
       </w:r>
       <w:r>
         <w:rPr>
@@ -15509,7 +15700,7 @@
         <w:rPr>
           <w:rFonts w:ascii="Calibri" w:hAnsi="Calibri" w:cs="Calibri"/>
         </w:rPr>
-        <w:t xml:space="preserve">, and P10B-19A-07 is </w:t>
+        <w:t xml:space="preserve">, and P10B-19A-08 is </w:t>
       </w:r>
       <w:r>
         <w:rPr>
@@ -15539,7 +15730,7 @@
         <w:rPr>
           <w:rFonts w:ascii="Calibri" w:hAnsi="Calibri" w:cs="Calibri"/>
         </w:rPr>
-        <w:t>. The remaining Done conditions are implementation gates, not claims about the current repository. The P10B-16P-01 through P10B-16P-05A plus P10B-16P-06 sequence is a mandatory convergence package between P10B-16 and P10B-17; it supplements rather than renumbers the locked P10B-01 through P10B-18 plan. P10B-16P-05B follows accepted P10B-18C and is now Baseline. P10B-18D completed as a rejected-quality diagnostic. P10B-19 PRE is Baseline. P10B-19A-01 through P10B-19A-06 are Baseline, P10B-19A is Partial, and P10B-19A-07 - Inactive Family Registry and Candidate Fingerprints is the exact next implementation task, followed by planned P10B-19B through P10B-19J.</w:t>
+        <w:t>. The remaining Done conditions are implementation gates, not claims about the current repository. The P10B-16P-01 through P10B-16P-05A plus P10B-16P-06 sequence is a mandatory convergence package between P10B-16 and P10B-17; it supplements rather than renumbers the locked P10B-01 through P10B-18 plan. P10B-16P-05B follows accepted P10B-18C and is now Baseline. P10B-18D completed as a rejected-quality diagnostic. P10B-19 PRE is Baseline. P10B-19A-01 through P10B-19A-07 are Baseline, P10B-19A is Partial, and P10B-19A-08 - Compatibility, Deterministic Selection and Normalized Topology Identity is the exact next implementation task, followed by planned P10B-19B through P10B-19J.</w:t>
       </w:r>
     </w:p>
     <w:p>
@@ -20998,7 +21189,7 @@
         <w:rPr>
           <w:rFonts w:ascii="Calibri" w:hAnsi="Calibri" w:cs="Calibri"/>
         </w:rPr>
-        <w:t>P10B-18C and P10B-16P-05B are Baseline. P10B-18D is a Baseline diagnostic with live commercial quality rejected. P10B-18 and P10B remain Partial. P10B-19 PRE is Baseline. P10B-19A-01 through P10B-19A-06 are Baseline, P10B-19A is Partial, and P10B-19A-07 - Inactive Family Registry and Candidate Fingerprints is the exact next implementation task, followed by planned P10B-19B through P10B-19J.</w:t>
+        <w:t>P10B-18C and P10B-16P-05B are Baseline. P10B-18D is a Baseline diagnostic with live commercial quality rejected. P10B-18 and P10B remain Partial. P10B-19 PRE is Baseline. P10B-19A-01 through P10B-19A-07 are Baseline, P10B-19A is Partial, and P10B-19A-08 - Compatibility, Deterministic Selection and Normalized Topology Identity is the exact next implementation task, followed by planned P10B-19B through P10B-19J.</w:t>
       </w:r>
     </w:p>
     <w:p>
@@ -23085,7 +23276,7 @@
         <w:rPr>
           <w:rFonts w:ascii="Calibri" w:hAnsi="Calibri" w:cs="Calibri"/>
         </w:rPr>
-        <w:t xml:space="preserve"> is Partial; P10B-19A-01 through P10B-19A-06 are Baseline, P10B-19A-07 - Inactive Family Registry and Candidate Fingerprints is the exact next implementation task, and P10B-19B through P10B-19J remain Planned.</w:t>
+        <w:t xml:space="preserve"> is Partial; P10B-19A-01 through P10B-19A-07 are Baseline, P10B-19A-08 - Compatibility, Deterministic Selection and Normalized Topology Identity is the exact next implementation task, and P10B-19B through P10B-19J remain Planned.</w:t>
       </w:r>
     </w:p>
     <w:p>
@@ -27080,7 +27271,7 @@
         <w:rPr>
           <w:rFonts w:ascii="Calibri" w:hAnsi="Calibri" w:cs="Calibri"/>
         </w:rPr>
-        <w:t xml:space="preserve"> with zero primary FAIL. P10B-16P-05B subsequently removed the one-time capture platform while retaining the bounded quality gate. P10B-18D subsequently completed as a rejected-quality diagnostic. P10B-19 PRE is Baseline. P10B-19A-01 through P10B-19A-06 are Baseline, P10B-19A is Partial, and P10B-19A-07 - Inactive Family Registry and Candidate Fingerprints is the exact next implementation task.</w:t>
+        <w:t xml:space="preserve"> with zero primary FAIL. P10B-16P-05B subsequently removed the one-time capture platform while retaining the bounded quality gate. P10B-18D subsequently completed as a rejected-quality diagnostic. P10B-19 PRE is Baseline. P10B-19A-01 through P10B-19A-07 are Baseline, P10B-19A is Partial, and P10B-19A-08 - Compatibility, Deterministic Selection and Normalized Topology Identity is the exact next implementation task.</w:t>
       </w:r>
     </w:p>
     <w:p>
@@ -27868,7 +28059,7 @@
               <w:rPr>
                 <w:rFonts w:ascii="Calibri" w:hAnsi="Calibri" w:cs="Calibri"/>
               </w:rPr>
-              <w:t>Next</w:t>
+              <w:t>Baseline</w:t>
             </w:r>
           </w:p>
         </w:tc>
@@ -27906,7 +28097,7 @@
                 <w:b/>
                 <w:bCs/>
               </w:rPr>
-              <w:t>Planned / exact next</w:t>
+              <w:t>Baseline</w:t>
             </w:r>
           </w:p>
         </w:tc>
@@ -27924,7 +28115,7 @@
               <w:rPr>
                 <w:rFonts w:ascii="Calibri" w:hAnsi="Calibri" w:cs="Calibri"/>
               </w:rPr>
-              <w:t>Inactive family registry and candidate fingerprints</w:t>
+              <w:t>Exact candidate fingerprints and six-profile inactive family registry authority; sole production registry value remains exactly empty</w:t>
             </w:r>
           </w:p>
         </w:tc>
@@ -27948,7 +28139,7 @@
               <w:rPr>
                 <w:rFonts w:ascii="Calibri" w:hAnsi="Calibri" w:cs="Calibri"/>
               </w:rPr>
-              <w:t>Planned</w:t>
+              <w:t>Next</w:t>
             </w:r>
           </w:p>
         </w:tc>
@@ -27966,7 +28157,7 @@
               <w:rPr>
                 <w:rFonts w:ascii="Calibri" w:hAnsi="Calibri" w:cs="Calibri"/>
               </w:rPr>
-              <w:t>P10B-19B through P10B-19J</w:t>
+              <w:t>P10B-19A-08</w:t>
             </w:r>
           </w:p>
         </w:tc>
@@ -27986,6 +28177,86 @@
                 <w:b/>
                 <w:bCs/>
               </w:rPr>
+              <w:t>Planned / exact next</w:t>
+            </w:r>
+          </w:p>
+        </w:tc>
+        <w:tc>
+          <w:tcPr>
+            <w:tcW w:w="8460" w:type="dxa"/>
+            <w:vAlign w:val="center"/>
+          </w:tcPr>
+          <w:p>
+            <w:pPr>
+              <w:pStyle w:val="TableText"/>
+              <w:widowControl/>
+            </w:pPr>
+            <w:r>
+              <w:rPr>
+                <w:rFonts w:ascii="Calibri" w:hAnsi="Calibri" w:cs="Calibri"/>
+              </w:rPr>
+              <w:t>Compatibility, deterministic selection and normalized topology identity</w:t>
+            </w:r>
+          </w:p>
+        </w:tc>
+      </w:tr>
+      <w:tr>
+        <w:trPr>
+          <w:cantSplit/>
+        </w:trPr>
+        <w:tc>
+          <w:tcPr>
+            <w:tcW w:w="1000" w:type="dxa"/>
+            <w:vAlign w:val="center"/>
+          </w:tcPr>
+          <w:p>
+            <w:pPr>
+              <w:pStyle w:val="TableText"/>
+              <w:jc w:val="center"/>
+              <w:widowControl/>
+            </w:pPr>
+            <w:r>
+              <w:rPr>
+                <w:rFonts w:ascii="Calibri" w:hAnsi="Calibri" w:cs="Calibri"/>
+              </w:rPr>
+              <w:t>Planned</w:t>
+            </w:r>
+          </w:p>
+        </w:tc>
+        <w:tc>
+          <w:tcPr>
+            <w:tcW w:w="1500" w:type="dxa"/>
+            <w:vAlign w:val="center"/>
+          </w:tcPr>
+          <w:p>
+            <w:pPr>
+              <w:pStyle w:val="TableText"/>
+              <w:widowControl/>
+            </w:pPr>
+            <w:r>
+              <w:rPr>
+                <w:rFonts w:ascii="Calibri" w:hAnsi="Calibri" w:cs="Calibri"/>
+              </w:rPr>
+              <w:t>P10B-19B through P10B-19J</w:t>
+            </w:r>
+          </w:p>
+        </w:tc>
+        <w:tc>
+          <w:tcPr>
+            <w:tcW w:w="2000" w:type="dxa"/>
+            <w:vAlign w:val="center"/>
+          </w:tcPr>
+          <w:p>
+            <w:pPr>
+              <w:pStyle w:val="TableText"/>
+              <w:widowControl/>
+            </w:pPr>
+            <w:r>
+              <w:rPr>
+                <w:rFonts w:ascii="Calibri" w:hAnsi="Calibri" w:cs="Calibri"/>
+                <w:b/>
+                <w:bCs/>
+              </w:rPr>
               <w:t>Planned</w:t>
             </w:r>
           </w:p>
@@ -28294,6 +28565,22 @@
         <w:rPr>
           <w:rFonts w:ascii="Calibri" w:hAnsi="Calibri" w:cs="Calibri"/>
         </w:rPr>
+        <w:t>P10B-19A-07 = Baseline</w:t>
+      </w:r>
+    </w:p>
+    <w:p>
+      <w:pPr>
+        <w:pStyle w:val="Normal"/>
+        <w:numPr>
+          <w:ilvl w:val="0"/>
+          <w:numId w:val="1"/>
+        </w:numPr>
+        <w:widowControl/>
+      </w:pPr>
+      <w:r>
+        <w:rPr>
+          <w:rFonts w:ascii="Calibri" w:hAnsi="Calibri" w:cs="Calibri"/>
+        </w:rPr>
         <w:t>P10B-19A = Partial</w:t>
       </w:r>
     </w:p>
@@ -28310,7 +28597,7 @@
         <w:rPr>
           <w:rFonts w:ascii="Calibri" w:hAnsi="Calibri" w:cs="Calibri"/>
         </w:rPr>
-        <w:t>P10B-19A-07 = exact next implementation task</w:t>
+        <w:t>P10B-19A-08 = exact next implementation task</w:t>
       </w:r>
     </w:p>
     <w:p>

</xml_diff>

<commit_message>
feat: add normalized topology identity
</commit_message>
<xml_diff>
--- a/docs/VESKIFY_DEVELOPMENT_DELIVERY_TRACKER_v1.3.0.docx
+++ b/docs/VESKIFY_DEVELOPMENT_DELIVERY_TRACKER_v1.3.0.docx
@@ -38,7 +38,7 @@
         <w:rPr>
           <w:rFonts w:ascii="Calibri" w:hAnsi="Calibri" w:cs="Calibri"/>
         </w:rPr>
-        <w:t>Delivery status baseline: 1 September 2026, P10B-19A-07 Inactive Family Registry and Candidate Fingerprints Baseline</w:t>
+        <w:t>Delivery status baseline: 1 September 2026, P10B-19A-08A Normalized Topology Identity Baseline</w:t>
       </w:r>
     </w:p>
     <w:p>
@@ -249,7 +249,7 @@
               <w:rPr>
                 <w:rFonts w:ascii="Calibri" w:hAnsi="Calibri" w:cs="Calibri"/>
               </w:rPr>
-              <w:t>1 September 2026, P10B-19A-07 Inactive Family Registry and Candidate Fingerprints Baseline</w:t>
+              <w:t>1 September 2026, P10B-19A-08A Normalized Topology Identity Baseline</w:t>
             </w:r>
           </w:p>
         </w:tc>
@@ -9009,6 +9009,276 @@
                 <w:b/>
                 <w:bCs/>
               </w:rPr>
+              <w:t>Partial</w:t>
+            </w:r>
+          </w:p>
+        </w:tc>
+        <w:tc>
+          <w:tcPr>
+            <w:tcW w:w="1500" w:type="dxa"/>
+            <w:vAlign w:val="center"/>
+          </w:tcPr>
+          <w:p>
+            <w:pPr>
+              <w:pStyle w:val="CompactTableText"/>
+              <w:widowControl/>
+            </w:pPr>
+            <w:r>
+              <w:rPr>
+                <w:rFonts w:ascii="Calibri" w:hAnsi="Calibri" w:cs="Calibri"/>
+              </w:rPr>
+              <w:t>P10B-19A task owner</w:t>
+            </w:r>
+          </w:p>
+        </w:tc>
+        <w:tc>
+          <w:tcPr>
+            <w:tcW w:w="2500" w:type="dxa"/>
+            <w:vAlign w:val="center"/>
+          </w:tcPr>
+          <w:p>
+            <w:pPr>
+              <w:pStyle w:val="CompactTableText"/>
+              <w:widowControl/>
+            </w:pPr>
+            <w:r>
+              <w:rPr>
+                <w:rFonts w:ascii="Calibri" w:hAnsi="Calibri" w:cs="Calibri"/>
+              </w:rPr>
+              <w:t>P10B-19A-07 merged</w:t>
+            </w:r>
+          </w:p>
+        </w:tc>
+        <w:tc>
+          <w:tcPr>
+            <w:tcW w:w="2890" w:type="dxa"/>
+            <w:vAlign w:val="center"/>
+          </w:tcPr>
+          <w:p>
+            <w:pPr>
+              <w:pStyle w:val="CompactTableText"/>
+              <w:widowControl/>
+            </w:pPr>
+            <w:r>
+              <w:rPr>
+                <w:rFonts w:ascii="Calibri" w:hAnsi="Calibri" w:cs="Calibri"/>
+              </w:rPr>
+              <w:t>Delivery-only A-08A/A-08B/A-08C sequence; normalized identity is Baseline, compatibility and selection remain incomplete</w:t>
+            </w:r>
+          </w:p>
+        </w:tc>
+      </w:tr>
+      <w:tr>
+        <w:trPr>
+          <w:cantSplit/>
+        </w:trPr>
+        <w:tc>
+          <w:tcPr>
+            <w:tcW w:w="720" w:type="dxa"/>
+            <w:vAlign w:val="center"/>
+          </w:tcPr>
+          <w:p>
+            <w:pPr>
+              <w:pStyle w:val="CompactTableText"/>
+              <w:jc w:val="center"/>
+              <w:widowControl/>
+            </w:pPr>
+            <w:r>
+              <w:rPr>
+                <w:rFonts w:ascii="Calibri" w:hAnsi="Calibri" w:cs="Calibri"/>
+              </w:rPr>
+              <w:t>☑</w:t>
+            </w:r>
+          </w:p>
+        </w:tc>
+        <w:tc>
+          <w:tcPr>
+            <w:tcW w:w="1700" w:type="dxa"/>
+            <w:vAlign w:val="center"/>
+          </w:tcPr>
+          <w:p>
+            <w:pPr>
+              <w:pStyle w:val="CompactTableText"/>
+              <w:widowControl/>
+            </w:pPr>
+            <w:r>
+              <w:rPr>
+                <w:rFonts w:ascii="Calibri" w:hAnsi="Calibri" w:cs="Calibri"/>
+              </w:rPr>
+              <w:t>P10B-19A-08A</w:t>
+            </w:r>
+          </w:p>
+        </w:tc>
+        <w:tc>
+          <w:tcPr>
+            <w:tcW w:w="2800" w:type="dxa"/>
+            <w:vAlign w:val="center"/>
+          </w:tcPr>
+          <w:p>
+            <w:pPr>
+              <w:pStyle w:val="CompactTableText"/>
+              <w:widowControl/>
+            </w:pPr>
+            <w:r>
+              <w:rPr>
+                <w:rFonts w:ascii="Calibri" w:hAnsi="Calibri" w:cs="Calibri"/>
+              </w:rPr>
+              <w:t>Normalized Topology Identity</w:t>
+            </w:r>
+          </w:p>
+        </w:tc>
+        <w:tc>
+          <w:tcPr>
+            <w:tcW w:w="850" w:type="dxa"/>
+            <w:vAlign w:val="center"/>
+          </w:tcPr>
+          <w:p>
+            <w:pPr>
+              <w:pStyle w:val="CompactTableText"/>
+              <w:jc w:val="center"/>
+              <w:widowControl/>
+            </w:pPr>
+            <w:r>
+              <w:rPr>
+                <w:rFonts w:ascii="Calibri" w:hAnsi="Calibri" w:cs="Calibri"/>
+                <w:b/>
+                <w:bCs/>
+              </w:rPr>
+              <w:t>Baseline</w:t>
+            </w:r>
+          </w:p>
+        </w:tc>
+        <w:tc>
+          <w:tcPr>
+            <w:tcW w:w="1500" w:type="dxa"/>
+            <w:vAlign w:val="center"/>
+          </w:tcPr>
+          <w:p>
+            <w:pPr>
+              <w:pStyle w:val="CompactTableText"/>
+              <w:widowControl/>
+            </w:pPr>
+            <w:r>
+              <w:rPr>
+                <w:rFonts w:ascii="Calibri" w:hAnsi="Calibri" w:cs="Calibri"/>
+              </w:rPr>
+              <w:t>P10B-19A task owner</w:t>
+            </w:r>
+          </w:p>
+        </w:tc>
+        <w:tc>
+          <w:tcPr>
+            <w:tcW w:w="2500" w:type="dxa"/>
+            <w:vAlign w:val="center"/>
+          </w:tcPr>
+          <w:p>
+            <w:pPr>
+              <w:pStyle w:val="CompactTableText"/>
+              <w:widowControl/>
+            </w:pPr>
+            <w:r>
+              <w:rPr>
+                <w:rFonts w:ascii="Calibri" w:hAnsi="Calibri" w:cs="Calibri"/>
+              </w:rPr>
+              <w:t>P10B-19A-07 merged</w:t>
+            </w:r>
+          </w:p>
+        </w:tc>
+        <w:tc>
+          <w:tcPr>
+            <w:tcW w:w="2890" w:type="dxa"/>
+            <w:vAlign w:val="center"/>
+          </w:tcPr>
+          <w:p>
+            <w:pPr>
+              <w:pStyle w:val="CompactTableText"/>
+              <w:widowControl/>
+            </w:pPr>
+            <w:r>
+              <w:rPr>
+                <w:rFonts w:ascii="Calibri" w:hAnsi="Calibri" w:cs="Calibri"/>
+              </w:rPr>
+              <w:t>Strict normalized page/family topology identity and pure inactive duplicate index; zero production records, compatibility, selection or runtime consumers</w:t>
+            </w:r>
+          </w:p>
+        </w:tc>
+      </w:tr>
+      <w:tr>
+        <w:trPr>
+          <w:cantSplit/>
+        </w:trPr>
+        <w:tc>
+          <w:tcPr>
+            <w:tcW w:w="720" w:type="dxa"/>
+            <w:vAlign w:val="center"/>
+          </w:tcPr>
+          <w:p>
+            <w:pPr>
+              <w:pStyle w:val="CompactTableText"/>
+              <w:jc w:val="center"/>
+              <w:widowControl/>
+            </w:pPr>
+            <w:r>
+              <w:rPr>
+                <w:rFonts w:ascii="Calibri" w:hAnsi="Calibri" w:cs="Calibri"/>
+              </w:rPr>
+              <w:t>☐</w:t>
+            </w:r>
+          </w:p>
+        </w:tc>
+        <w:tc>
+          <w:tcPr>
+            <w:tcW w:w="1700" w:type="dxa"/>
+            <w:vAlign w:val="center"/>
+          </w:tcPr>
+          <w:p>
+            <w:pPr>
+              <w:pStyle w:val="CompactTableText"/>
+              <w:widowControl/>
+            </w:pPr>
+            <w:r>
+              <w:rPr>
+                <w:rFonts w:ascii="Calibri" w:hAnsi="Calibri" w:cs="Calibri"/>
+              </w:rPr>
+              <w:t>P10B-19A-08B</w:t>
+            </w:r>
+          </w:p>
+        </w:tc>
+        <w:tc>
+          <w:tcPr>
+            <w:tcW w:w="2800" w:type="dxa"/>
+            <w:vAlign w:val="center"/>
+          </w:tcPr>
+          <w:p>
+            <w:pPr>
+              <w:pStyle w:val="CompactTableText"/>
+              <w:widowControl/>
+            </w:pPr>
+            <w:r>
+              <w:rPr>
+                <w:rFonts w:ascii="Calibri" w:hAnsi="Calibri" w:cs="Calibri"/>
+              </w:rPr>
+              <w:t>Candidate Compatibility Contract and Evaluation</w:t>
+            </w:r>
+          </w:p>
+        </w:tc>
+        <w:tc>
+          <w:tcPr>
+            <w:tcW w:w="850" w:type="dxa"/>
+            <w:vAlign w:val="center"/>
+          </w:tcPr>
+          <w:p>
+            <w:pPr>
+              <w:pStyle w:val="CompactTableText"/>
+              <w:jc w:val="center"/>
+              <w:widowControl/>
+            </w:pPr>
+            <w:r>
+              <w:rPr>
+                <w:rFonts w:ascii="Calibri" w:hAnsi="Calibri" w:cs="Calibri"/>
+                <w:b/>
+                <w:bCs/>
+              </w:rPr>
               <w:t>Planned / exact next</w:t>
             </w:r>
           </w:p>
@@ -9045,7 +9315,7 @@
               <w:rPr>
                 <w:rFonts w:ascii="Calibri" w:hAnsi="Calibri" w:cs="Calibri"/>
               </w:rPr>
-              <w:t>P10B-19A-07 merged</w:t>
+              <w:t>P10B-19A-08A merged</w:t>
             </w:r>
           </w:p>
         </w:tc>
@@ -9063,7 +9333,277 @@
               <w:rPr>
                 <w:rFonts w:ascii="Calibri" w:hAnsi="Calibri" w:cs="Calibri"/>
               </w:rPr>
-              <w:t>Add compatibility, deterministic selection and normalized topology identity without beginning v1 migration or runtime integration</w:t>
+              <w:t>Add deterministic candidate compatibility contract and evaluation without selection, v1 migration or runtime integration</w:t>
+            </w:r>
+          </w:p>
+        </w:tc>
+      </w:tr>
+      <w:tr>
+        <w:trPr>
+          <w:cantSplit/>
+        </w:trPr>
+        <w:tc>
+          <w:tcPr>
+            <w:tcW w:w="720" w:type="dxa"/>
+            <w:vAlign w:val="center"/>
+          </w:tcPr>
+          <w:p>
+            <w:pPr>
+              <w:pStyle w:val="CompactTableText"/>
+              <w:jc w:val="center"/>
+              <w:widowControl/>
+            </w:pPr>
+            <w:r>
+              <w:rPr>
+                <w:rFonts w:ascii="Calibri" w:hAnsi="Calibri" w:cs="Calibri"/>
+              </w:rPr>
+              <w:t>☐</w:t>
+            </w:r>
+          </w:p>
+        </w:tc>
+        <w:tc>
+          <w:tcPr>
+            <w:tcW w:w="1700" w:type="dxa"/>
+            <w:vAlign w:val="center"/>
+          </w:tcPr>
+          <w:p>
+            <w:pPr>
+              <w:pStyle w:val="CompactTableText"/>
+              <w:widowControl/>
+            </w:pPr>
+            <w:r>
+              <w:rPr>
+                <w:rFonts w:ascii="Calibri" w:hAnsi="Calibri" w:cs="Calibri"/>
+              </w:rPr>
+              <w:t>P10B-19A-08C</w:t>
+            </w:r>
+          </w:p>
+        </w:tc>
+        <w:tc>
+          <w:tcPr>
+            <w:tcW w:w="2800" w:type="dxa"/>
+            <w:vAlign w:val="center"/>
+          </w:tcPr>
+          <w:p>
+            <w:pPr>
+              <w:pStyle w:val="CompactTableText"/>
+              <w:widowControl/>
+            </w:pPr>
+            <w:r>
+              <w:rPr>
+                <w:rFonts w:ascii="Calibri" w:hAnsi="Calibri" w:cs="Calibri"/>
+              </w:rPr>
+              <w:t>Deterministic Candidate Selection</w:t>
+            </w:r>
+          </w:p>
+        </w:tc>
+        <w:tc>
+          <w:tcPr>
+            <w:tcW w:w="850" w:type="dxa"/>
+            <w:vAlign w:val="center"/>
+          </w:tcPr>
+          <w:p>
+            <w:pPr>
+              <w:pStyle w:val="CompactTableText"/>
+              <w:jc w:val="center"/>
+              <w:widowControl/>
+            </w:pPr>
+            <w:r>
+              <w:rPr>
+                <w:rFonts w:ascii="Calibri" w:hAnsi="Calibri" w:cs="Calibri"/>
+                <w:b/>
+                <w:bCs/>
+              </w:rPr>
+              <w:t>Planned</w:t>
+            </w:r>
+          </w:p>
+        </w:tc>
+        <w:tc>
+          <w:tcPr>
+            <w:tcW w:w="1500" w:type="dxa"/>
+            <w:vAlign w:val="center"/>
+          </w:tcPr>
+          <w:p>
+            <w:pPr>
+              <w:pStyle w:val="CompactTableText"/>
+              <w:widowControl/>
+            </w:pPr>
+            <w:r>
+              <w:rPr>
+                <w:rFonts w:ascii="Calibri" w:hAnsi="Calibri" w:cs="Calibri"/>
+              </w:rPr>
+              <w:t>Planned task owner</w:t>
+            </w:r>
+          </w:p>
+        </w:tc>
+        <w:tc>
+          <w:tcPr>
+            <w:tcW w:w="2500" w:type="dxa"/>
+            <w:vAlign w:val="center"/>
+          </w:tcPr>
+          <w:p>
+            <w:pPr>
+              <w:pStyle w:val="CompactTableText"/>
+              <w:widowControl/>
+            </w:pPr>
+            <w:r>
+              <w:rPr>
+                <w:rFonts w:ascii="Calibri" w:hAnsi="Calibri" w:cs="Calibri"/>
+              </w:rPr>
+              <w:t>P10B-19A-08B merged</w:t>
+            </w:r>
+          </w:p>
+        </w:tc>
+        <w:tc>
+          <w:tcPr>
+            <w:tcW w:w="2890" w:type="dxa"/>
+            <w:vAlign w:val="center"/>
+          </w:tcPr>
+          <w:p>
+            <w:pPr>
+              <w:pStyle w:val="CompactTableText"/>
+              <w:widowControl/>
+            </w:pPr>
+            <w:r>
+              <w:rPr>
+                <w:rFonts w:ascii="Calibri" w:hAnsi="Calibri" w:cs="Calibri"/>
+              </w:rPr>
+              <w:t>Add deterministic candidate selection without beginning v1 migration or runtime integration</w:t>
+            </w:r>
+          </w:p>
+        </w:tc>
+      </w:tr>
+      <w:tr>
+        <w:trPr>
+          <w:cantSplit/>
+        </w:trPr>
+        <w:tc>
+          <w:tcPr>
+            <w:tcW w:w="720" w:type="dxa"/>
+            <w:vAlign w:val="center"/>
+          </w:tcPr>
+          <w:p>
+            <w:pPr>
+              <w:pStyle w:val="CompactTableText"/>
+              <w:jc w:val="center"/>
+              <w:widowControl/>
+            </w:pPr>
+            <w:r>
+              <w:rPr>
+                <w:rFonts w:ascii="Calibri" w:hAnsi="Calibri" w:cs="Calibri"/>
+              </w:rPr>
+              <w:t>☐</w:t>
+            </w:r>
+          </w:p>
+        </w:tc>
+        <w:tc>
+          <w:tcPr>
+            <w:tcW w:w="1700" w:type="dxa"/>
+            <w:vAlign w:val="center"/>
+          </w:tcPr>
+          <w:p>
+            <w:pPr>
+              <w:pStyle w:val="CompactTableText"/>
+              <w:widowControl/>
+            </w:pPr>
+            <w:r>
+              <w:rPr>
+                <w:rFonts w:ascii="Calibri" w:hAnsi="Calibri" w:cs="Calibri"/>
+              </w:rPr>
+              <w:t>P10B-19A-09</w:t>
+            </w:r>
+          </w:p>
+        </w:tc>
+        <w:tc>
+          <w:tcPr>
+            <w:tcW w:w="2800" w:type="dxa"/>
+            <w:vAlign w:val="center"/>
+          </w:tcPr>
+          <w:p>
+            <w:pPr>
+              <w:pStyle w:val="CompactTableText"/>
+              <w:widowControl/>
+            </w:pPr>
+            <w:r>
+              <w:rPr>
+                <w:rFonts w:ascii="Calibri" w:hAnsi="Calibri" w:cs="Calibri"/>
+              </w:rPr>
+              <w:t>v1 read/render/migration/publication compatibility</w:t>
+            </w:r>
+          </w:p>
+        </w:tc>
+        <w:tc>
+          <w:tcPr>
+            <w:tcW w:w="850" w:type="dxa"/>
+            <w:vAlign w:val="center"/>
+          </w:tcPr>
+          <w:p>
+            <w:pPr>
+              <w:pStyle w:val="CompactTableText"/>
+              <w:jc w:val="center"/>
+              <w:widowControl/>
+            </w:pPr>
+            <w:r>
+              <w:rPr>
+                <w:rFonts w:ascii="Calibri" w:hAnsi="Calibri" w:cs="Calibri"/>
+                <w:b/>
+                <w:bCs/>
+              </w:rPr>
+              <w:t>Planned</w:t>
+            </w:r>
+          </w:p>
+        </w:tc>
+        <w:tc>
+          <w:tcPr>
+            <w:tcW w:w="1500" w:type="dxa"/>
+            <w:vAlign w:val="center"/>
+          </w:tcPr>
+          <w:p>
+            <w:pPr>
+              <w:pStyle w:val="CompactTableText"/>
+              <w:widowControl/>
+            </w:pPr>
+            <w:r>
+              <w:rPr>
+                <w:rFonts w:ascii="Calibri" w:hAnsi="Calibri" w:cs="Calibri"/>
+              </w:rPr>
+              <w:t>Planned task owner</w:t>
+            </w:r>
+          </w:p>
+        </w:tc>
+        <w:tc>
+          <w:tcPr>
+            <w:tcW w:w="2500" w:type="dxa"/>
+            <w:vAlign w:val="center"/>
+          </w:tcPr>
+          <w:p>
+            <w:pPr>
+              <w:pStyle w:val="CompactTableText"/>
+              <w:widowControl/>
+            </w:pPr>
+            <w:r>
+              <w:rPr>
+                <w:rFonts w:ascii="Calibri" w:hAnsi="Calibri" w:cs="Calibri"/>
+              </w:rPr>
+              <w:t>P10B-19A-08C merged</w:t>
+            </w:r>
+          </w:p>
+        </w:tc>
+        <w:tc>
+          <w:tcPr>
+            <w:tcW w:w="2890" w:type="dxa"/>
+            <w:vAlign w:val="center"/>
+          </w:tcPr>
+          <w:p>
+            <w:pPr>
+              <w:pStyle w:val="CompactTableText"/>
+              <w:widowControl/>
+            </w:pPr>
+            <w:r>
+              <w:rPr>
+                <w:rFonts w:ascii="Calibri" w:hAnsi="Calibri" w:cs="Calibri"/>
+              </w:rPr>
+              <w:t>Preserve v1 read, render, migration and publication compatibility after the complete A-08 delivery</w:t>
             </w:r>
           </w:p>
         </w:tc>
@@ -13436,7 +13976,7 @@
         <w:rPr>
           <w:rFonts w:ascii="Calibri" w:hAnsi="Calibri" w:cs="Calibri"/>
         </w:rPr>
-        <w:t xml:space="preserve">P10B remains Partial. DEVX-01A through DEVX-01G are Baseline, and DEVX-01 is Baseline / closed. P10B-19A-01 through P10B-19A-07 are Baseline, P10B-19A is Partial, and P10B-19A-08 - Compatibility, Deterministic Selection and Normalized Topology Identity is the exact next implementation task. DEVX-01C measured the serial gate, retained PR/ref-scoped cancellation and added compatible </w:t>
+        <w:t xml:space="preserve">P10B remains Partial. DEVX-01A through DEVX-01G are Baseline, and DEVX-01 is Baseline / closed. P10B-19A-01 through P10B-19A-07 and P10B-19A-08A are Baseline; parent P10B-19A-08 and P10B-19A are Partial; P10B-19A-08B - Candidate Compatibility Contract and Evaluation is the exact next implementation task; P10B-19A-08C is Planned after P10B-19A-08B; P10B-19A-09 remains Planned after P10B-19A-08C; P10B remains Partial. DEVX-01C measured the serial gate, retained PR/ref-scoped cancellation and added compatible </w:t>
       </w:r>
       <w:r>
         <w:rPr>
@@ -13543,9 +14083,9 @@
         </w:tblBorders>
       </w:tblPr>
       <w:tblGrid>
-        <w:gridCol w:w="3000"/>
-        <w:gridCol w:w="1300"/>
-        <w:gridCol w:w="8660"/>
+        <w:gridCol w:w="900"/>
+        <w:gridCol w:w="7600"/>
+        <w:gridCol w:w="4460"/>
       </w:tblGrid>
       <w:tr>
         <w:trPr>
@@ -13554,7 +14094,7 @@
         </w:trPr>
         <w:tc>
           <w:tcPr>
-            <w:tcW w:w="3000" w:type="dxa"/>
+            <w:tcW w:w="900" w:type="dxa"/>
             <w:vAlign w:val="center"/>
             <w:shd w:val="clear" w:fill="E8EEF5"/>
           </w:tcPr>
@@ -13574,7 +14114,7 @@
         </w:tc>
         <w:tc>
           <w:tcPr>
-            <w:tcW w:w="1300" w:type="dxa"/>
+            <w:tcW w:w="7600" w:type="dxa"/>
             <w:vAlign w:val="center"/>
             <w:shd w:val="clear" w:fill="E8EEF5"/>
           </w:tcPr>
@@ -13594,7 +14134,7 @@
         </w:tc>
         <w:tc>
           <w:tcPr>
-            <w:tcW w:w="8660" w:type="dxa"/>
+            <w:tcW w:w="4460" w:type="dxa"/>
             <w:vAlign w:val="center"/>
             <w:shd w:val="clear" w:fill="E8EEF5"/>
           </w:tcPr>
@@ -13619,7 +14159,7 @@
         </w:trPr>
         <w:tc>
           <w:tcPr>
-            <w:tcW w:w="3000" w:type="dxa"/>
+            <w:tcW w:w="900" w:type="dxa"/>
             <w:vAlign w:val="center"/>
           </w:tcPr>
           <w:p>
@@ -13637,7 +14177,7 @@
         </w:tc>
         <w:tc>
           <w:tcPr>
-            <w:tcW w:w="1300" w:type="dxa"/>
+            <w:tcW w:w="7600" w:type="dxa"/>
             <w:vAlign w:val="center"/>
           </w:tcPr>
           <w:p>
@@ -13655,7 +14195,7 @@
         </w:tc>
         <w:tc>
           <w:tcPr>
-            <w:tcW w:w="8660" w:type="dxa"/>
+            <w:tcW w:w="4460" w:type="dxa"/>
             <w:vAlign w:val="center"/>
           </w:tcPr>
           <w:p>
@@ -13678,7 +14218,7 @@
         </w:trPr>
         <w:tc>
           <w:tcPr>
-            <w:tcW w:w="3000" w:type="dxa"/>
+            <w:tcW w:w="900" w:type="dxa"/>
             <w:vAlign w:val="center"/>
           </w:tcPr>
           <w:p>
@@ -13696,7 +14236,7 @@
         </w:tc>
         <w:tc>
           <w:tcPr>
-            <w:tcW w:w="1300" w:type="dxa"/>
+            <w:tcW w:w="7600" w:type="dxa"/>
             <w:vAlign w:val="center"/>
           </w:tcPr>
           <w:p>
@@ -13714,7 +14254,7 @@
         </w:tc>
         <w:tc>
           <w:tcPr>
-            <w:tcW w:w="8660" w:type="dxa"/>
+            <w:tcW w:w="4460" w:type="dxa"/>
             <w:vAlign w:val="center"/>
           </w:tcPr>
           <w:p>
@@ -13737,7 +14277,7 @@
         </w:trPr>
         <w:tc>
           <w:tcPr>
-            <w:tcW w:w="3000" w:type="dxa"/>
+            <w:tcW w:w="900" w:type="dxa"/>
             <w:vAlign w:val="center"/>
           </w:tcPr>
           <w:p>
@@ -13755,7 +14295,7 @@
         </w:tc>
         <w:tc>
           <w:tcPr>
-            <w:tcW w:w="1300" w:type="dxa"/>
+            <w:tcW w:w="7600" w:type="dxa"/>
             <w:vAlign w:val="center"/>
           </w:tcPr>
           <w:p>
@@ -13773,7 +14313,7 @@
         </w:tc>
         <w:tc>
           <w:tcPr>
-            <w:tcW w:w="8660" w:type="dxa"/>
+            <w:tcW w:w="4460" w:type="dxa"/>
             <w:vAlign w:val="center"/>
           </w:tcPr>
           <w:p>
@@ -13796,7 +14336,7 @@
         </w:trPr>
         <w:tc>
           <w:tcPr>
-            <w:tcW w:w="3000" w:type="dxa"/>
+            <w:tcW w:w="900" w:type="dxa"/>
             <w:vAlign w:val="center"/>
           </w:tcPr>
           <w:p>
@@ -13814,7 +14354,7 @@
         </w:tc>
         <w:tc>
           <w:tcPr>
-            <w:tcW w:w="1300" w:type="dxa"/>
+            <w:tcW w:w="7600" w:type="dxa"/>
             <w:vAlign w:val="center"/>
           </w:tcPr>
           <w:p>
@@ -13832,7 +14372,7 @@
         </w:tc>
         <w:tc>
           <w:tcPr>
-            <w:tcW w:w="8660" w:type="dxa"/>
+            <w:tcW w:w="4460" w:type="dxa"/>
             <w:vAlign w:val="center"/>
           </w:tcPr>
           <w:p>
@@ -13855,7 +14395,7 @@
         </w:trPr>
         <w:tc>
           <w:tcPr>
-            <w:tcW w:w="3000" w:type="dxa"/>
+            <w:tcW w:w="900" w:type="dxa"/>
             <w:vAlign w:val="center"/>
           </w:tcPr>
           <w:p>
@@ -13873,7 +14413,7 @@
         </w:tc>
         <w:tc>
           <w:tcPr>
-            <w:tcW w:w="1300" w:type="dxa"/>
+            <w:tcW w:w="7600" w:type="dxa"/>
             <w:vAlign w:val="center"/>
           </w:tcPr>
           <w:p>
@@ -13891,7 +14431,7 @@
         </w:tc>
         <w:tc>
           <w:tcPr>
-            <w:tcW w:w="8660" w:type="dxa"/>
+            <w:tcW w:w="4460" w:type="dxa"/>
             <w:vAlign w:val="center"/>
           </w:tcPr>
           <w:p>
@@ -13914,7 +14454,7 @@
         </w:trPr>
         <w:tc>
           <w:tcPr>
-            <w:tcW w:w="3000" w:type="dxa"/>
+            <w:tcW w:w="900" w:type="dxa"/>
             <w:vAlign w:val="center"/>
           </w:tcPr>
           <w:p>
@@ -13932,7 +14472,7 @@
         </w:tc>
         <w:tc>
           <w:tcPr>
-            <w:tcW w:w="1300" w:type="dxa"/>
+            <w:tcW w:w="7600" w:type="dxa"/>
             <w:vAlign w:val="center"/>
           </w:tcPr>
           <w:p>
@@ -13950,7 +14490,7 @@
         </w:tc>
         <w:tc>
           <w:tcPr>
-            <w:tcW w:w="8660" w:type="dxa"/>
+            <w:tcW w:w="4460" w:type="dxa"/>
             <w:vAlign w:val="center"/>
           </w:tcPr>
           <w:p>
@@ -13973,7 +14513,7 @@
         </w:trPr>
         <w:tc>
           <w:tcPr>
-            <w:tcW w:w="3000" w:type="dxa"/>
+            <w:tcW w:w="900" w:type="dxa"/>
             <w:vAlign w:val="center"/>
           </w:tcPr>
           <w:p>
@@ -13991,7 +14531,7 @@
         </w:tc>
         <w:tc>
           <w:tcPr>
-            <w:tcW w:w="1300" w:type="dxa"/>
+            <w:tcW w:w="7600" w:type="dxa"/>
             <w:vAlign w:val="center"/>
           </w:tcPr>
           <w:p>
@@ -14009,7 +14549,7 @@
         </w:tc>
         <w:tc>
           <w:tcPr>
-            <w:tcW w:w="8660" w:type="dxa"/>
+            <w:tcW w:w="4460" w:type="dxa"/>
             <w:vAlign w:val="center"/>
           </w:tcPr>
           <w:p>
@@ -14032,7 +14572,7 @@
         </w:trPr>
         <w:tc>
           <w:tcPr>
-            <w:tcW w:w="3000" w:type="dxa"/>
+            <w:tcW w:w="900" w:type="dxa"/>
             <w:vAlign w:val="center"/>
           </w:tcPr>
           <w:p>
@@ -14050,7 +14590,7 @@
         </w:tc>
         <w:tc>
           <w:tcPr>
-            <w:tcW w:w="1300" w:type="dxa"/>
+            <w:tcW w:w="7600" w:type="dxa"/>
             <w:vAlign w:val="center"/>
           </w:tcPr>
           <w:p>
@@ -14068,7 +14608,7 @@
         </w:tc>
         <w:tc>
           <w:tcPr>
-            <w:tcW w:w="8660" w:type="dxa"/>
+            <w:tcW w:w="4460" w:type="dxa"/>
             <w:vAlign w:val="center"/>
           </w:tcPr>
           <w:p>
@@ -14091,7 +14631,7 @@
         </w:trPr>
         <w:tc>
           <w:tcPr>
-            <w:tcW w:w="3000" w:type="dxa"/>
+            <w:tcW w:w="900" w:type="dxa"/>
             <w:vAlign w:val="center"/>
           </w:tcPr>
           <w:p>
@@ -14103,13 +14643,13 @@
               <w:rPr>
                 <w:rFonts w:ascii="Calibri" w:hAnsi="Calibri" w:cs="Calibri"/>
               </w:rPr>
-              <w:t>9</w:t>
-            </w:r>
-          </w:p>
-        </w:tc>
-        <w:tc>
-          <w:tcPr>
-            <w:tcW w:w="1300" w:type="dxa"/>
+              <w:t>8A</w:t>
+            </w:r>
+          </w:p>
+        </w:tc>
+        <w:tc>
+          <w:tcPr>
+            <w:tcW w:w="7600" w:type="dxa"/>
             <w:vAlign w:val="center"/>
           </w:tcPr>
           <w:p>
@@ -14121,13 +14661,13 @@
               <w:rPr>
                 <w:rFonts w:ascii="Calibri" w:hAnsi="Calibri" w:cs="Calibri"/>
               </w:rPr>
-              <w:t>P10B-19A-09 - v1 read/render/migration/publication compatibility</w:t>
-            </w:r>
-          </w:p>
-        </w:tc>
-        <w:tc>
-          <w:tcPr>
-            <w:tcW w:w="8660" w:type="dxa"/>
+              <w:t>P10B-19A-08A - Normalized Topology Identity</w:t>
+            </w:r>
+          </w:p>
+        </w:tc>
+        <w:tc>
+          <w:tcPr>
+            <w:tcW w:w="4460" w:type="dxa"/>
             <w:vAlign w:val="center"/>
           </w:tcPr>
           <w:p>
@@ -14139,7 +14679,7 @@
               <w:rPr>
                 <w:rFonts w:ascii="Calibri" w:hAnsi="Calibri" w:cs="Calibri"/>
               </w:rPr>
-              <w:t>A-08 merged</w:t>
+              <w:t>A-07 merged</w:t>
             </w:r>
           </w:p>
         </w:tc>
@@ -14150,7 +14690,7 @@
         </w:trPr>
         <w:tc>
           <w:tcPr>
-            <w:tcW w:w="3000" w:type="dxa"/>
+            <w:tcW w:w="900" w:type="dxa"/>
             <w:vAlign w:val="center"/>
           </w:tcPr>
           <w:p>
@@ -14162,13 +14702,190 @@
               <w:rPr>
                 <w:rFonts w:ascii="Calibri" w:hAnsi="Calibri" w:cs="Calibri"/>
               </w:rPr>
+              <w:t>8B</w:t>
+            </w:r>
+          </w:p>
+        </w:tc>
+        <w:tc>
+          <w:tcPr>
+            <w:tcW w:w="7600" w:type="dxa"/>
+            <w:vAlign w:val="center"/>
+          </w:tcPr>
+          <w:p>
+            <w:pPr>
+              <w:pStyle w:val="TableText"/>
+              <w:widowControl/>
+            </w:pPr>
+            <w:r>
+              <w:rPr>
+                <w:rFonts w:ascii="Calibri" w:hAnsi="Calibri" w:cs="Calibri"/>
+              </w:rPr>
+              <w:t>P10B-19A-08B - Candidate Compatibility Contract and Evaluation</w:t>
+            </w:r>
+          </w:p>
+        </w:tc>
+        <w:tc>
+          <w:tcPr>
+            <w:tcW w:w="4460" w:type="dxa"/>
+            <w:vAlign w:val="center"/>
+          </w:tcPr>
+          <w:p>
+            <w:pPr>
+              <w:pStyle w:val="TableText"/>
+              <w:widowControl/>
+            </w:pPr>
+            <w:r>
+              <w:rPr>
+                <w:rFonts w:ascii="Calibri" w:hAnsi="Calibri" w:cs="Calibri"/>
+              </w:rPr>
+              <w:t>A-08A merged</w:t>
+            </w:r>
+          </w:p>
+        </w:tc>
+      </w:tr>
+      <w:tr>
+        <w:trPr>
+          <w:cantSplit/>
+        </w:trPr>
+        <w:tc>
+          <w:tcPr>
+            <w:tcW w:w="900" w:type="dxa"/>
+            <w:vAlign w:val="center"/>
+          </w:tcPr>
+          <w:p>
+            <w:pPr>
+              <w:pStyle w:val="TableText"/>
+              <w:widowControl/>
+            </w:pPr>
+            <w:r>
+              <w:rPr>
+                <w:rFonts w:ascii="Calibri" w:hAnsi="Calibri" w:cs="Calibri"/>
+              </w:rPr>
+              <w:t>8C</w:t>
+            </w:r>
+          </w:p>
+        </w:tc>
+        <w:tc>
+          <w:tcPr>
+            <w:tcW w:w="7600" w:type="dxa"/>
+            <w:vAlign w:val="center"/>
+          </w:tcPr>
+          <w:p>
+            <w:pPr>
+              <w:pStyle w:val="TableText"/>
+              <w:widowControl/>
+            </w:pPr>
+            <w:r>
+              <w:rPr>
+                <w:rFonts w:ascii="Calibri" w:hAnsi="Calibri" w:cs="Calibri"/>
+              </w:rPr>
+              <w:t>P10B-19A-08C - Deterministic Candidate Selection</w:t>
+            </w:r>
+          </w:p>
+        </w:tc>
+        <w:tc>
+          <w:tcPr>
+            <w:tcW w:w="4460" w:type="dxa"/>
+            <w:vAlign w:val="center"/>
+          </w:tcPr>
+          <w:p>
+            <w:pPr>
+              <w:pStyle w:val="TableText"/>
+              <w:widowControl/>
+            </w:pPr>
+            <w:r>
+              <w:rPr>
+                <w:rFonts w:ascii="Calibri" w:hAnsi="Calibri" w:cs="Calibri"/>
+              </w:rPr>
+              <w:t>A-08B merged</w:t>
+            </w:r>
+          </w:p>
+        </w:tc>
+      </w:tr>
+      <w:tr>
+        <w:trPr>
+          <w:cantSplit/>
+        </w:trPr>
+        <w:tc>
+          <w:tcPr>
+            <w:tcW w:w="900" w:type="dxa"/>
+            <w:vAlign w:val="center"/>
+          </w:tcPr>
+          <w:p>
+            <w:pPr>
+              <w:pStyle w:val="TableText"/>
+              <w:widowControl/>
+            </w:pPr>
+            <w:r>
+              <w:rPr>
+                <w:rFonts w:ascii="Calibri" w:hAnsi="Calibri" w:cs="Calibri"/>
+              </w:rPr>
+              <w:t>9</w:t>
+            </w:r>
+          </w:p>
+        </w:tc>
+        <w:tc>
+          <w:tcPr>
+            <w:tcW w:w="7600" w:type="dxa"/>
+            <w:vAlign w:val="center"/>
+          </w:tcPr>
+          <w:p>
+            <w:pPr>
+              <w:pStyle w:val="TableText"/>
+              <w:widowControl/>
+            </w:pPr>
+            <w:r>
+              <w:rPr>
+                <w:rFonts w:ascii="Calibri" w:hAnsi="Calibri" w:cs="Calibri"/>
+              </w:rPr>
+              <w:t>P10B-19A-09 - v1 read/render/migration/publication compatibility</w:t>
+            </w:r>
+          </w:p>
+        </w:tc>
+        <w:tc>
+          <w:tcPr>
+            <w:tcW w:w="4460" w:type="dxa"/>
+            <w:vAlign w:val="center"/>
+          </w:tcPr>
+          <w:p>
+            <w:pPr>
+              <w:pStyle w:val="TableText"/>
+              <w:widowControl/>
+            </w:pPr>
+            <w:r>
+              <w:rPr>
+                <w:rFonts w:ascii="Calibri" w:hAnsi="Calibri" w:cs="Calibri"/>
+              </w:rPr>
+              <w:t>A-08C merged</w:t>
+            </w:r>
+          </w:p>
+        </w:tc>
+      </w:tr>
+      <w:tr>
+        <w:trPr>
+          <w:cantSplit/>
+        </w:trPr>
+        <w:tc>
+          <w:tcPr>
+            <w:tcW w:w="900" w:type="dxa"/>
+            <w:vAlign w:val="center"/>
+          </w:tcPr>
+          <w:p>
+            <w:pPr>
+              <w:pStyle w:val="TableText"/>
+              <w:widowControl/>
+            </w:pPr>
+            <w:r>
+              <w:rPr>
+                <w:rFonts w:ascii="Calibri" w:hAnsi="Calibri" w:cs="Calibri"/>
+              </w:rPr>
               <w:t>10</w:t>
             </w:r>
           </w:p>
         </w:tc>
         <w:tc>
           <w:tcPr>
-            <w:tcW w:w="1300" w:type="dxa"/>
+            <w:tcW w:w="7600" w:type="dxa"/>
             <w:vAlign w:val="center"/>
           </w:tcPr>
           <w:p>
@@ -14186,7 +14903,7 @@
         </w:tc>
         <w:tc>
           <w:tcPr>
-            <w:tcW w:w="8660" w:type="dxa"/>
+            <w:tcW w:w="4460" w:type="dxa"/>
             <w:vAlign w:val="center"/>
           </w:tcPr>
           <w:p>
@@ -14219,7 +14936,7 @@
         <w:rPr>
           <w:rFonts w:ascii="Calibri" w:hAnsi="Calibri" w:cs="Calibri"/>
         </w:rPr>
-        <w:t xml:space="preserve">P10B-19A-01 through P10B-19A-07 are </w:t>
+        <w:t xml:space="preserve">P10B-19A-01 through P10B-19A-07 and P10B-19A-08A are </w:t>
       </w:r>
       <w:r>
         <w:rPr>
@@ -14233,7 +14950,7 @@
         <w:rPr>
           <w:rFonts w:ascii="Calibri" w:hAnsi="Calibri" w:cs="Calibri"/>
         </w:rPr>
-        <w:t xml:space="preserve">, parent P10B-19A is </w:t>
+        <w:t xml:space="preserve">; parent P10B-19A-08 and P10B-19A are </w:t>
       </w:r>
       <w:r>
         <w:rPr>
@@ -14247,7 +14964,113 @@
         <w:rPr>
           <w:rFonts w:ascii="Calibri" w:hAnsi="Calibri" w:cs="Calibri"/>
         </w:rPr>
-        <w:t xml:space="preserve">, and P10B-19A-08 - Compatibility, Deterministic Selection and Normalized Topology Identity is the exact next implementation task. P10B-19A-07 adds strict, deeply readonly PageBlueprint v2 and Structural Storefront Family candidate authorities at candidate schema version </w:t>
+        <w:t>. P10B-19A-08B - Candidate Compatibility Contract and Evaluation is the exact next implementation task; P10B-19A-08C is Planned after P10B-19A-08B; P10B-19A-09 remains Planned after P10B-19A-08C.</w:t>
+      </w:r>
+    </w:p>
+    <w:p>
+      <w:pPr>
+        <w:pStyle w:val="Normal"/>
+        <w:widowControl/>
+      </w:pPr>
+      <w:r>
+        <w:rPr>
+          <w:rFonts w:ascii="Calibri" w:hAnsi="Calibri" w:cs="Calibri"/>
+        </w:rPr>
+        <w:t xml:space="preserve">P10B-19A-08A establishes strict normalized PageBlueprint v2 and Structural Storefront Family topology projections at schema version </w:t>
+      </w:r>
+      <w:r>
+        <w:rPr>
+          <w:rFonts w:ascii="Consolas" w:hAnsi="Consolas" w:cs="Consolas"/>
+          <w:sz w:val="19"/>
+          <w:szCs w:val="19"/>
+        </w:rPr>
+        <w:t>1.0.0</w:t>
+      </w:r>
+      <w:r>
+        <w:rPr>
+          <w:rFonts w:ascii="Calibri" w:hAnsi="Calibri" w:cs="Calibri"/>
+        </w:rPr>
+        <w:t xml:space="preserve">. Deterministic </w:t>
+      </w:r>
+      <w:r>
+        <w:rPr>
+          <w:rFonts w:ascii="Consolas" w:hAnsi="Consolas" w:cs="Consolas"/>
+          <w:sz w:val="19"/>
+          <w:szCs w:val="19"/>
+        </w:rPr>
+        <w:t>r0</w:t>
+      </w:r>
+      <w:r>
+        <w:rPr>
+          <w:rFonts w:ascii="Calibri" w:hAnsi="Calibri" w:cs="Calibri"/>
+        </w:rPr>
+        <w:t xml:space="preserve">, </w:t>
+      </w:r>
+      <w:r>
+        <w:rPr>
+          <w:rFonts w:ascii="Consolas" w:hAnsi="Consolas" w:cs="Consolas"/>
+          <w:sz w:val="19"/>
+          <w:szCs w:val="19"/>
+        </w:rPr>
+        <w:t>r1</w:t>
+      </w:r>
+      <w:r>
+        <w:rPr>
+          <w:rFonts w:ascii="Calibri" w:hAnsi="Calibri" w:cs="Calibri"/>
+        </w:rPr>
+        <w:t xml:space="preserve">, ... tokens follow the A-03 default reading order. Page topology includes A-03 structural relationships and A-05 responsive rules and excludes A-04 asset-role and A-06 fallback authority. Page fingerprints use </w:t>
+      </w:r>
+      <w:r>
+        <w:rPr>
+          <w:rFonts w:ascii="Consolas" w:hAnsi="Consolas" w:cs="Consolas"/>
+          <w:sz w:val="19"/>
+          <w:szCs w:val="19"/>
+        </w:rPr>
+        <w:t>page-blueprint-v2-normalized-topology-v1_&lt;canonical-length&gt;_&lt;sha256&gt;</w:t>
+      </w:r>
+      <w:r>
+        <w:rPr>
+          <w:rFonts w:ascii="Calibri" w:hAnsi="Calibri" w:cs="Calibri"/>
+        </w:rPr>
+        <w:t xml:space="preserve">. Family topology covers all six canonical A-02 page-family roles plus A-02 relationships; family fingerprints use </w:t>
+      </w:r>
+      <w:r>
+        <w:rPr>
+          <w:rFonts w:ascii="Consolas" w:hAnsi="Consolas" w:cs="Consolas"/>
+          <w:sz w:val="19"/>
+          <w:szCs w:val="19"/>
+        </w:rPr>
+        <w:t>structural-storefront-family-normalized-topology-v1_&lt;canonical-length&gt;_&lt;sha256&gt;</w:t>
+      </w:r>
+      <w:r>
+        <w:rPr>
+          <w:rFonts w:ascii="Calibri" w:hAnsi="Calibri" w:cs="Calibri"/>
+        </w:rPr>
+        <w:t>. The pure, non-persisted inactive normalized-topology index groups duplicate PageBlueprint and family identities but does not reject, evaluate compatibility, select, activate, persist or expose runtime records. Production PageBlueprint v2, Structural Storefront Family and normalized-topology index record counts remain exactly zero.</w:t>
+      </w:r>
+    </w:p>
+    <w:p>
+      <w:pPr>
+        <w:pStyle w:val="Normal"/>
+        <w:widowControl/>
+      </w:pPr>
+      <w:r>
+        <w:rPr>
+          <w:rFonts w:ascii="Calibri" w:hAnsi="Calibri" w:cs="Calibri"/>
+        </w:rPr>
+        <w:t>The A-08A/A-08B/A-08C split is delivery-only. It preserves the accepted P10B-19 PRE architecture, parent A-08 outcome and P10B-19A-09 ownership.</w:t>
+      </w:r>
+    </w:p>
+    <w:p>
+      <w:pPr>
+        <w:pStyle w:val="Normal"/>
+        <w:widowControl/>
+      </w:pPr>
+      <w:r>
+        <w:rPr>
+          <w:rFonts w:ascii="Calibri" w:hAnsi="Calibri" w:cs="Calibri"/>
+        </w:rPr>
+        <w:t xml:space="preserve">P10B-19A-07 adds strict, deeply readonly PageBlueprint v2 and Structural Storefront Family candidate authorities at candidate schema version </w:t>
       </w:r>
       <w:r>
         <w:rPr>
@@ -15672,7 +16495,21 @@
         <w:rPr>
           <w:rFonts w:ascii="Calibri" w:hAnsi="Calibri" w:cs="Calibri"/>
         </w:rPr>
-        <w:t xml:space="preserve">, and P10B-19A is </w:t>
+        <w:t xml:space="preserve">. P10B-19A-01 through P10B-19A-07 and P10B-19A-08A are </w:t>
+      </w:r>
+      <w:r>
+        <w:rPr>
+          <w:rFonts w:ascii="Calibri" w:hAnsi="Calibri" w:cs="Calibri"/>
+          <w:b/>
+          <w:bCs/>
+        </w:rPr>
+        <w:t>Baseline</w:t>
+      </w:r>
+      <w:r>
+        <w:rPr>
+          <w:rFonts w:ascii="Calibri" w:hAnsi="Calibri" w:cs="Calibri"/>
+        </w:rPr>
+        <w:t xml:space="preserve">; parent P10B-19A-08 and P10B-19A are </w:t>
       </w:r>
       <w:r>
         <w:rPr>
@@ -15686,21 +16523,7 @@
         <w:rPr>
           <w:rFonts w:ascii="Calibri" w:hAnsi="Calibri" w:cs="Calibri"/>
         </w:rPr>
-        <w:t xml:space="preserve">; P10B-19A-01 through P10B-19A-07 are </w:t>
-      </w:r>
-      <w:r>
-        <w:rPr>
-          <w:rFonts w:ascii="Calibri" w:hAnsi="Calibri" w:cs="Calibri"/>
-          <w:b/>
-          <w:bCs/>
-        </w:rPr>
-        <w:t>Baseline</w:t>
-      </w:r>
-      <w:r>
-        <w:rPr>
-          <w:rFonts w:ascii="Calibri" w:hAnsi="Calibri" w:cs="Calibri"/>
-        </w:rPr>
-        <w:t xml:space="preserve">, and P10B-19A-08 is </w:t>
+        <w:t xml:space="preserve">; P10B-19A-08B - Candidate Compatibility Contract and Evaluation is </w:t>
       </w:r>
       <w:r>
         <w:rPr>
@@ -15714,7 +16537,21 @@
         <w:rPr>
           <w:rFonts w:ascii="Calibri" w:hAnsi="Calibri" w:cs="Calibri"/>
         </w:rPr>
-        <w:t xml:space="preserve">. P10B-16P-04 acceptance evidence is retained in </w:t>
+        <w:t xml:space="preserve">; P10B-19A-08C and P10B-19A-09 are </w:t>
+      </w:r>
+      <w:r>
+        <w:rPr>
+          <w:rFonts w:ascii="Calibri" w:hAnsi="Calibri" w:cs="Calibri"/>
+          <w:b/>
+          <w:bCs/>
+        </w:rPr>
+        <w:t>Planned</w:t>
+      </w:r>
+      <w:r>
+        <w:rPr>
+          <w:rFonts w:ascii="Calibri" w:hAnsi="Calibri" w:cs="Calibri"/>
+        </w:rPr>
+        <w:t xml:space="preserve"> in that order. P10B-16P-04 acceptance evidence is retained in </w:t>
       </w:r>
       <w:hyperlink r:id="rIdHyperlink5" w:history="1">
         <w:r>
@@ -15730,7 +16567,7 @@
         <w:rPr>
           <w:rFonts w:ascii="Calibri" w:hAnsi="Calibri" w:cs="Calibri"/>
         </w:rPr>
-        <w:t>. The remaining Done conditions are implementation gates, not claims about the current repository. The P10B-16P-01 through P10B-16P-05A plus P10B-16P-06 sequence is a mandatory convergence package between P10B-16 and P10B-17; it supplements rather than renumbers the locked P10B-01 through P10B-18 plan. P10B-16P-05B follows accepted P10B-18C and is now Baseline. P10B-18D completed as a rejected-quality diagnostic. P10B-19 PRE is Baseline. P10B-19A-01 through P10B-19A-07 are Baseline, P10B-19A is Partial, and P10B-19A-08 - Compatibility, Deterministic Selection and Normalized Topology Identity is the exact next implementation task, followed by planned P10B-19B through P10B-19J.</w:t>
+        <w:t>. The remaining Done conditions are implementation gates, not claims about the current repository. The P10B-16P-01 through P10B-16P-05A plus P10B-16P-06 sequence is a mandatory convergence package between P10B-16 and P10B-17; it supplements rather than renumbers the locked P10B-01 through P10B-18 plan. P10B-16P-05B follows accepted P10B-18C and is now Baseline. P10B-18D completed as a rejected-quality diagnostic. P10B-19 PRE is Baseline. P10B-19A-01 through P10B-19A-07 and P10B-19A-08A are Baseline; parent P10B-19A-08 and P10B-19A are Partial; P10B-19A-08B - Candidate Compatibility Contract and Evaluation is the exact next implementation task; P10B-19A-08C is Planned after P10B-19A-08B; P10B-19A-09 remains Planned after P10B-19A-08C; P10B-19B through P10B-19J remain Planned.</w:t>
       </w:r>
     </w:p>
     <w:p>
@@ -21189,7 +22026,7 @@
         <w:rPr>
           <w:rFonts w:ascii="Calibri" w:hAnsi="Calibri" w:cs="Calibri"/>
         </w:rPr>
-        <w:t>P10B-18C and P10B-16P-05B are Baseline. P10B-18D is a Baseline diagnostic with live commercial quality rejected. P10B-18 and P10B remain Partial. P10B-19 PRE is Baseline. P10B-19A-01 through P10B-19A-07 are Baseline, P10B-19A is Partial, and P10B-19A-08 - Compatibility, Deterministic Selection and Normalized Topology Identity is the exact next implementation task, followed by planned P10B-19B through P10B-19J.</w:t>
+        <w:t>P10B-18C and P10B-16P-05B are Baseline. P10B-18D is a Baseline diagnostic with live commercial quality rejected. P10B-18 and P10B remain Partial. P10B-19 PRE is Baseline. P10B-19A-01 through P10B-19A-07 and P10B-19A-08A are Baseline; parent P10B-19A-08 and P10B-19A are Partial; P10B-19A-08B - Candidate Compatibility Contract and Evaluation is the exact next implementation task; P10B-19A-08C is Planned after P10B-19A-08B; P10B-19A-09 remains Planned after P10B-19A-08C; P10B-19B through P10B-19J remain Planned.</w:t>
       </w:r>
     </w:p>
     <w:p>
@@ -23262,7 +24099,7 @@
         <w:rPr>
           <w:rFonts w:ascii="Calibri" w:hAnsi="Calibri" w:cs="Calibri"/>
         </w:rPr>
-        <w:t xml:space="preserve"> is Baseline. </w:t>
+        <w:t xml:space="preserve"> is Baseline. P10B-19A-01 through P10B-19A-07 and P10B-19A-08A are Baseline; parent P10B-19A-08 and </w:t>
       </w:r>
       <w:r>
         <w:rPr>
@@ -23276,7 +24113,7 @@
         <w:rPr>
           <w:rFonts w:ascii="Calibri" w:hAnsi="Calibri" w:cs="Calibri"/>
         </w:rPr>
-        <w:t xml:space="preserve"> is Partial; P10B-19A-01 through P10B-19A-07 are Baseline, P10B-19A-08 - Compatibility, Deterministic Selection and Normalized Topology Identity is the exact next implementation task, and P10B-19B through P10B-19J remain Planned.</w:t>
+        <w:t xml:space="preserve"> are Partial; P10B-19A-08B - Candidate Compatibility Contract and Evaluation is the exact next implementation task; P10B-19A-08C is Planned after P10B-19A-08B; P10B-19A-09 remains Planned after P10B-19A-08C; P10B-19B through P10B-19J remain Planned.</w:t>
       </w:r>
     </w:p>
     <w:p>
@@ -27271,7 +28108,7 @@
         <w:rPr>
           <w:rFonts w:ascii="Calibri" w:hAnsi="Calibri" w:cs="Calibri"/>
         </w:rPr>
-        <w:t xml:space="preserve"> with zero primary FAIL. P10B-16P-05B subsequently removed the one-time capture platform while retaining the bounded quality gate. P10B-18D subsequently completed as a rejected-quality diagnostic. P10B-19 PRE is Baseline. P10B-19A-01 through P10B-19A-07 are Baseline, P10B-19A is Partial, and P10B-19A-08 - Compatibility, Deterministic Selection and Normalized Topology Identity is the exact next implementation task.</w:t>
+        <w:t xml:space="preserve"> with zero primary FAIL. P10B-16P-05B subsequently removed the one-time capture platform while retaining the bounded quality gate. P10B-18D subsequently completed as a rejected-quality diagnostic. P10B-19 PRE is Baseline. P10B-19A-01 through P10B-19A-07 and P10B-19A-08A are Baseline; parent P10B-19A-08 and P10B-19A are Partial; P10B-19A-08B - Candidate Compatibility Contract and Evaluation is the exact next implementation task; P10B-19A-08C is Planned after P10B-19A-08B; P10B-19A-09 remains Planned after P10B-19A-08C.</w:t>
       </w:r>
     </w:p>
     <w:p>
@@ -27555,7 +28392,7 @@
               <w:rPr>
                 <w:rFonts w:ascii="Calibri" w:hAnsi="Calibri" w:cs="Calibri"/>
               </w:rPr>
-              <w:t>Structural Storefront Family and PageBlueprint v2 contracts, registry, topology identity, deterministic selection, and v1 compatibility</w:t>
+              <w:t>Structural Storefront Family and PageBlueprint v2 contracts, registry, A-08 delivery, and v1 compatibility</w:t>
             </w:r>
           </w:p>
         </w:tc>
@@ -27579,7 +28416,7 @@
               <w:rPr>
                 <w:rFonts w:ascii="Calibri" w:hAnsi="Calibri" w:cs="Calibri"/>
               </w:rPr>
-              <w:t>Baseline</w:t>
+              <w:t>Partial</w:t>
             </w:r>
           </w:p>
         </w:tc>
@@ -27597,7 +28434,7 @@
               <w:rPr>
                 <w:rFonts w:ascii="Calibri" w:hAnsi="Calibri" w:cs="Calibri"/>
               </w:rPr>
-              <w:t>P10B-19A-01</w:t>
+              <w:t>P10B-19A-08</w:t>
             </w:r>
           </w:p>
         </w:tc>
@@ -27617,7 +28454,7 @@
                 <w:b/>
                 <w:bCs/>
               </w:rPr>
-              <w:t>Baseline</w:t>
+              <w:t>Partial</w:t>
             </w:r>
           </w:p>
         </w:tc>
@@ -27635,7 +28472,7 @@
               <w:rPr>
                 <w:rFonts w:ascii="Calibri" w:hAnsi="Calibri" w:cs="Calibri"/>
               </w:rPr>
-              <w:t>Structural family identity, version and lifecycle authority</w:t>
+              <w:t>A-08A normalized topology identity is Baseline; candidate compatibility and deterministic selection remain incomplete</w:t>
             </w:r>
           </w:p>
         </w:tc>
@@ -27677,7 +28514,7 @@
               <w:rPr>
                 <w:rFonts w:ascii="Calibri" w:hAnsi="Calibri" w:cs="Calibri"/>
               </w:rPr>
-              <w:t>P10B-19A-02</w:t>
+              <w:t>P10B-19A-01</w:t>
             </w:r>
           </w:p>
         </w:tc>
@@ -27715,7 +28552,7 @@
               <w:rPr>
                 <w:rFonts w:ascii="Calibri" w:hAnsi="Calibri" w:cs="Calibri"/>
               </w:rPr>
-              <w:t>Cross-page Structural Storefront Family relationship contract</w:t>
+              <w:t>Structural family identity, version and lifecycle authority</w:t>
             </w:r>
           </w:p>
         </w:tc>
@@ -27757,7 +28594,7 @@
               <w:rPr>
                 <w:rFonts w:ascii="Calibri" w:hAnsi="Calibri" w:cs="Calibri"/>
               </w:rPr>
-              <w:t>P10B-19A-03</w:t>
+              <w:t>P10B-19A-02</w:t>
             </w:r>
           </w:p>
         </w:tc>
@@ -27795,7 +28632,7 @@
               <w:rPr>
                 <w:rFonts w:ascii="Calibri" w:hAnsi="Calibri" w:cs="Calibri"/>
               </w:rPr>
-              <w:t>Required page structures, region graph and explicit PageBlueprint v1/v2 dispatch; zero v2 records or production consumers</w:t>
+              <w:t>Cross-page Structural Storefront Family relationship contract</w:t>
             </w:r>
           </w:p>
         </w:tc>
@@ -27837,7 +28674,7 @@
               <w:rPr>
                 <w:rFonts w:ascii="Calibri" w:hAnsi="Calibri" w:cs="Calibri"/>
               </w:rPr>
-              <w:t>P10B-19A-04</w:t>
+              <w:t>P10B-19A-03</w:t>
             </w:r>
           </w:p>
         </w:tc>
@@ -27875,7 +28712,7 @@
               <w:rPr>
                 <w:rFonts w:ascii="Calibri" w:hAnsi="Calibri" w:cs="Calibri"/>
               </w:rPr>
-              <w:t>Asset-role compatibility contract bound to exact PageBlueprint v2 identity and regions; zero records or production consumers</w:t>
+              <w:t>Required page structures, region graph and explicit PageBlueprint v1/v2 dispatch; zero v2 records or production consumers</w:t>
             </w:r>
           </w:p>
         </w:tc>
@@ -27917,7 +28754,7 @@
               <w:rPr>
                 <w:rFonts w:ascii="Calibri" w:hAnsi="Calibri" w:cs="Calibri"/>
               </w:rPr>
-              <w:t>P10B-19A-05</w:t>
+              <w:t>P10B-19A-04</w:t>
             </w:r>
           </w:p>
         </w:tc>
@@ -27955,7 +28792,7 @@
               <w:rPr>
                 <w:rFonts w:ascii="Calibri" w:hAnsi="Calibri" w:cs="Calibri"/>
               </w:rPr>
-              <w:t>Responsive-rule contract bound to four breakpoints and complete structural coverage; zero records or production consumers</w:t>
+              <w:t>Asset-role compatibility contract bound to exact PageBlueprint v2 identity and regions; zero records or production consumers</w:t>
             </w:r>
           </w:p>
         </w:tc>
@@ -27997,7 +28834,7 @@
               <w:rPr>
                 <w:rFonts w:ascii="Calibri" w:hAnsi="Calibri" w:cs="Calibri"/>
               </w:rPr>
-              <w:t>P10B-19A-06</w:t>
+              <w:t>P10B-19A-05</w:t>
             </w:r>
           </w:p>
         </w:tc>
@@ -28035,7 +28872,7 @@
               <w:rPr>
                 <w:rFonts w:ascii="Calibri" w:hAnsi="Calibri" w:cs="Calibri"/>
               </w:rPr>
-              <w:t>Omission, substitution and fallback contract bound to required asset-role regions; zero records or production consumers</w:t>
+              <w:t>Responsive-rule contract bound to four breakpoints and complete structural coverage; zero records or production consumers</w:t>
             </w:r>
           </w:p>
         </w:tc>
@@ -28077,7 +28914,7 @@
               <w:rPr>
                 <w:rFonts w:ascii="Calibri" w:hAnsi="Calibri" w:cs="Calibri"/>
               </w:rPr>
-              <w:t>P10B-19A-07</w:t>
+              <w:t>P10B-19A-06</w:t>
             </w:r>
           </w:p>
         </w:tc>
@@ -28115,7 +28952,7 @@
               <w:rPr>
                 <w:rFonts w:ascii="Calibri" w:hAnsi="Calibri" w:cs="Calibri"/>
               </w:rPr>
-              <w:t>Exact candidate fingerprints and six-profile inactive family registry authority; sole production registry value remains exactly empty</w:t>
+              <w:t>Omission, substitution and fallback contract bound to required asset-role regions; zero records or production consumers</w:t>
             </w:r>
           </w:p>
         </w:tc>
@@ -28139,7 +28976,7 @@
               <w:rPr>
                 <w:rFonts w:ascii="Calibri" w:hAnsi="Calibri" w:cs="Calibri"/>
               </w:rPr>
-              <w:t>Next</w:t>
+              <w:t>Baseline</w:t>
             </w:r>
           </w:p>
         </w:tc>
@@ -28157,7 +28994,7 @@
               <w:rPr>
                 <w:rFonts w:ascii="Calibri" w:hAnsi="Calibri" w:cs="Calibri"/>
               </w:rPr>
-              <w:t>P10B-19A-08</w:t>
+              <w:t>P10B-19A-07</w:t>
             </w:r>
           </w:p>
         </w:tc>
@@ -28177,7 +29014,7 @@
                 <w:b/>
                 <w:bCs/>
               </w:rPr>
-              <w:t>Planned / exact next</w:t>
+              <w:t>Baseline</w:t>
             </w:r>
           </w:p>
         </w:tc>
@@ -28195,7 +29032,7 @@
               <w:rPr>
                 <w:rFonts w:ascii="Calibri" w:hAnsi="Calibri" w:cs="Calibri"/>
               </w:rPr>
-              <w:t>Compatibility, deterministic selection and normalized topology identity</w:t>
+              <w:t>Exact candidate fingerprints and six-profile inactive family registry authority; sole production registry value remains exactly empty</w:t>
             </w:r>
           </w:p>
         </w:tc>
@@ -28219,7 +29056,7 @@
               <w:rPr>
                 <w:rFonts w:ascii="Calibri" w:hAnsi="Calibri" w:cs="Calibri"/>
               </w:rPr>
-              <w:t>Planned</w:t>
+              <w:t>Baseline</w:t>
             </w:r>
           </w:p>
         </w:tc>
@@ -28237,7 +29074,7 @@
               <w:rPr>
                 <w:rFonts w:ascii="Calibri" w:hAnsi="Calibri" w:cs="Calibri"/>
               </w:rPr>
-              <w:t>P10B-19B through P10B-19J</w:t>
+              <w:t>P10B-19A-08A</w:t>
             </w:r>
           </w:p>
         </w:tc>
@@ -28257,6 +29094,326 @@
                 <w:b/>
                 <w:bCs/>
               </w:rPr>
+              <w:t>Baseline</w:t>
+            </w:r>
+          </w:p>
+        </w:tc>
+        <w:tc>
+          <w:tcPr>
+            <w:tcW w:w="8460" w:type="dxa"/>
+            <w:vAlign w:val="center"/>
+          </w:tcPr>
+          <w:p>
+            <w:pPr>
+              <w:pStyle w:val="TableText"/>
+              <w:widowControl/>
+            </w:pPr>
+            <w:r>
+              <w:rPr>
+                <w:rFonts w:ascii="Calibri" w:hAnsi="Calibri" w:cs="Calibri"/>
+              </w:rPr>
+              <w:t>Normalized PageBlueprint v2/family topology identity and pure duplicate index; all production record counts remain zero</w:t>
+            </w:r>
+          </w:p>
+        </w:tc>
+      </w:tr>
+      <w:tr>
+        <w:trPr>
+          <w:cantSplit/>
+        </w:trPr>
+        <w:tc>
+          <w:tcPr>
+            <w:tcW w:w="1000" w:type="dxa"/>
+            <w:vAlign w:val="center"/>
+          </w:tcPr>
+          <w:p>
+            <w:pPr>
+              <w:pStyle w:val="TableText"/>
+              <w:jc w:val="center"/>
+              <w:widowControl/>
+            </w:pPr>
+            <w:r>
+              <w:rPr>
+                <w:rFonts w:ascii="Calibri" w:hAnsi="Calibri" w:cs="Calibri"/>
+              </w:rPr>
+              <w:t>Next</w:t>
+            </w:r>
+          </w:p>
+        </w:tc>
+        <w:tc>
+          <w:tcPr>
+            <w:tcW w:w="1500" w:type="dxa"/>
+            <w:vAlign w:val="center"/>
+          </w:tcPr>
+          <w:p>
+            <w:pPr>
+              <w:pStyle w:val="TableText"/>
+              <w:widowControl/>
+            </w:pPr>
+            <w:r>
+              <w:rPr>
+                <w:rFonts w:ascii="Calibri" w:hAnsi="Calibri" w:cs="Calibri"/>
+              </w:rPr>
+              <w:t>P10B-19A-08B</w:t>
+            </w:r>
+          </w:p>
+        </w:tc>
+        <w:tc>
+          <w:tcPr>
+            <w:tcW w:w="2000" w:type="dxa"/>
+            <w:vAlign w:val="center"/>
+          </w:tcPr>
+          <w:p>
+            <w:pPr>
+              <w:pStyle w:val="TableText"/>
+              <w:widowControl/>
+            </w:pPr>
+            <w:r>
+              <w:rPr>
+                <w:rFonts w:ascii="Calibri" w:hAnsi="Calibri" w:cs="Calibri"/>
+                <w:b/>
+                <w:bCs/>
+              </w:rPr>
+              <w:t>Planned / exact next</w:t>
+            </w:r>
+          </w:p>
+        </w:tc>
+        <w:tc>
+          <w:tcPr>
+            <w:tcW w:w="8460" w:type="dxa"/>
+            <w:vAlign w:val="center"/>
+          </w:tcPr>
+          <w:p>
+            <w:pPr>
+              <w:pStyle w:val="TableText"/>
+              <w:widowControl/>
+            </w:pPr>
+            <w:r>
+              <w:rPr>
+                <w:rFonts w:ascii="Calibri" w:hAnsi="Calibri" w:cs="Calibri"/>
+              </w:rPr>
+              <w:t>Candidate Compatibility Contract and Evaluation</w:t>
+            </w:r>
+          </w:p>
+        </w:tc>
+      </w:tr>
+      <w:tr>
+        <w:trPr>
+          <w:cantSplit/>
+        </w:trPr>
+        <w:tc>
+          <w:tcPr>
+            <w:tcW w:w="1000" w:type="dxa"/>
+            <w:vAlign w:val="center"/>
+          </w:tcPr>
+          <w:p>
+            <w:pPr>
+              <w:pStyle w:val="TableText"/>
+              <w:jc w:val="center"/>
+              <w:widowControl/>
+            </w:pPr>
+            <w:r>
+              <w:rPr>
+                <w:rFonts w:ascii="Calibri" w:hAnsi="Calibri" w:cs="Calibri"/>
+              </w:rPr>
+              <w:t>Planned</w:t>
+            </w:r>
+          </w:p>
+        </w:tc>
+        <w:tc>
+          <w:tcPr>
+            <w:tcW w:w="1500" w:type="dxa"/>
+            <w:vAlign w:val="center"/>
+          </w:tcPr>
+          <w:p>
+            <w:pPr>
+              <w:pStyle w:val="TableText"/>
+              <w:widowControl/>
+            </w:pPr>
+            <w:r>
+              <w:rPr>
+                <w:rFonts w:ascii="Calibri" w:hAnsi="Calibri" w:cs="Calibri"/>
+              </w:rPr>
+              <w:t>P10B-19A-08C</w:t>
+            </w:r>
+          </w:p>
+        </w:tc>
+        <w:tc>
+          <w:tcPr>
+            <w:tcW w:w="2000" w:type="dxa"/>
+            <w:vAlign w:val="center"/>
+          </w:tcPr>
+          <w:p>
+            <w:pPr>
+              <w:pStyle w:val="TableText"/>
+              <w:widowControl/>
+            </w:pPr>
+            <w:r>
+              <w:rPr>
+                <w:rFonts w:ascii="Calibri" w:hAnsi="Calibri" w:cs="Calibri"/>
+                <w:b/>
+                <w:bCs/>
+              </w:rPr>
+              <w:t>Planned</w:t>
+            </w:r>
+          </w:p>
+        </w:tc>
+        <w:tc>
+          <w:tcPr>
+            <w:tcW w:w="8460" w:type="dxa"/>
+            <w:vAlign w:val="center"/>
+          </w:tcPr>
+          <w:p>
+            <w:pPr>
+              <w:pStyle w:val="TableText"/>
+              <w:widowControl/>
+            </w:pPr>
+            <w:r>
+              <w:rPr>
+                <w:rFonts w:ascii="Calibri" w:hAnsi="Calibri" w:cs="Calibri"/>
+              </w:rPr>
+              <w:t>Deterministic Candidate Selection after P10B-19A-08B</w:t>
+            </w:r>
+          </w:p>
+        </w:tc>
+      </w:tr>
+      <w:tr>
+        <w:trPr>
+          <w:cantSplit/>
+        </w:trPr>
+        <w:tc>
+          <w:tcPr>
+            <w:tcW w:w="1000" w:type="dxa"/>
+            <w:vAlign w:val="center"/>
+          </w:tcPr>
+          <w:p>
+            <w:pPr>
+              <w:pStyle w:val="TableText"/>
+              <w:jc w:val="center"/>
+              <w:widowControl/>
+            </w:pPr>
+            <w:r>
+              <w:rPr>
+                <w:rFonts w:ascii="Calibri" w:hAnsi="Calibri" w:cs="Calibri"/>
+              </w:rPr>
+              <w:t>Planned</w:t>
+            </w:r>
+          </w:p>
+        </w:tc>
+        <w:tc>
+          <w:tcPr>
+            <w:tcW w:w="1500" w:type="dxa"/>
+            <w:vAlign w:val="center"/>
+          </w:tcPr>
+          <w:p>
+            <w:pPr>
+              <w:pStyle w:val="TableText"/>
+              <w:widowControl/>
+            </w:pPr>
+            <w:r>
+              <w:rPr>
+                <w:rFonts w:ascii="Calibri" w:hAnsi="Calibri" w:cs="Calibri"/>
+              </w:rPr>
+              <w:t>P10B-19A-09</w:t>
+            </w:r>
+          </w:p>
+        </w:tc>
+        <w:tc>
+          <w:tcPr>
+            <w:tcW w:w="2000" w:type="dxa"/>
+            <w:vAlign w:val="center"/>
+          </w:tcPr>
+          <w:p>
+            <w:pPr>
+              <w:pStyle w:val="TableText"/>
+              <w:widowControl/>
+            </w:pPr>
+            <w:r>
+              <w:rPr>
+                <w:rFonts w:ascii="Calibri" w:hAnsi="Calibri" w:cs="Calibri"/>
+                <w:b/>
+                <w:bCs/>
+              </w:rPr>
+              <w:t>Planned</w:t>
+            </w:r>
+          </w:p>
+        </w:tc>
+        <w:tc>
+          <w:tcPr>
+            <w:tcW w:w="8460" w:type="dxa"/>
+            <w:vAlign w:val="center"/>
+          </w:tcPr>
+          <w:p>
+            <w:pPr>
+              <w:pStyle w:val="TableText"/>
+              <w:widowControl/>
+            </w:pPr>
+            <w:r>
+              <w:rPr>
+                <w:rFonts w:ascii="Calibri" w:hAnsi="Calibri" w:cs="Calibri"/>
+              </w:rPr>
+              <w:t>v1 read/render/migration/publication compatibility after P10B-19A-08C</w:t>
+            </w:r>
+          </w:p>
+        </w:tc>
+      </w:tr>
+      <w:tr>
+        <w:trPr>
+          <w:cantSplit/>
+        </w:trPr>
+        <w:tc>
+          <w:tcPr>
+            <w:tcW w:w="1000" w:type="dxa"/>
+            <w:vAlign w:val="center"/>
+          </w:tcPr>
+          <w:p>
+            <w:pPr>
+              <w:pStyle w:val="TableText"/>
+              <w:jc w:val="center"/>
+              <w:widowControl/>
+            </w:pPr>
+            <w:r>
+              <w:rPr>
+                <w:rFonts w:ascii="Calibri" w:hAnsi="Calibri" w:cs="Calibri"/>
+              </w:rPr>
+              <w:t>Planned</w:t>
+            </w:r>
+          </w:p>
+        </w:tc>
+        <w:tc>
+          <w:tcPr>
+            <w:tcW w:w="1500" w:type="dxa"/>
+            <w:vAlign w:val="center"/>
+          </w:tcPr>
+          <w:p>
+            <w:pPr>
+              <w:pStyle w:val="TableText"/>
+              <w:widowControl/>
+            </w:pPr>
+            <w:r>
+              <w:rPr>
+                <w:rFonts w:ascii="Calibri" w:hAnsi="Calibri" w:cs="Calibri"/>
+              </w:rPr>
+              <w:t>P10B-19B through P10B-19J</w:t>
+            </w:r>
+          </w:p>
+        </w:tc>
+        <w:tc>
+          <w:tcPr>
+            <w:tcW w:w="2000" w:type="dxa"/>
+            <w:vAlign w:val="center"/>
+          </w:tcPr>
+          <w:p>
+            <w:pPr>
+              <w:pStyle w:val="TableText"/>
+              <w:widowControl/>
+            </w:pPr>
+            <w:r>
+              <w:rPr>
+                <w:rFonts w:ascii="Calibri" w:hAnsi="Calibri" w:cs="Calibri"/>
+                <w:b/>
+                <w:bCs/>
+              </w:rPr>
               <w:t>Planned</w:t>
             </w:r>
           </w:p>
@@ -28581,6 +29738,86 @@
         <w:rPr>
           <w:rFonts w:ascii="Calibri" w:hAnsi="Calibri" w:cs="Calibri"/>
         </w:rPr>
+        <w:t>P10B-19A-08A = Baseline</w:t>
+      </w:r>
+    </w:p>
+    <w:p>
+      <w:pPr>
+        <w:pStyle w:val="Normal"/>
+        <w:numPr>
+          <w:ilvl w:val="0"/>
+          <w:numId w:val="1"/>
+        </w:numPr>
+        <w:widowControl/>
+      </w:pPr>
+      <w:r>
+        <w:rPr>
+          <w:rFonts w:ascii="Calibri" w:hAnsi="Calibri" w:cs="Calibri"/>
+        </w:rPr>
+        <w:t>P10B-19A-08 = Partial</w:t>
+      </w:r>
+    </w:p>
+    <w:p>
+      <w:pPr>
+        <w:pStyle w:val="Normal"/>
+        <w:numPr>
+          <w:ilvl w:val="0"/>
+          <w:numId w:val="1"/>
+        </w:numPr>
+        <w:widowControl/>
+      </w:pPr>
+      <w:r>
+        <w:rPr>
+          <w:rFonts w:ascii="Calibri" w:hAnsi="Calibri" w:cs="Calibri"/>
+        </w:rPr>
+        <w:t>P10B-19A-08B = exact next implementation task</w:t>
+      </w:r>
+    </w:p>
+    <w:p>
+      <w:pPr>
+        <w:pStyle w:val="Normal"/>
+        <w:numPr>
+          <w:ilvl w:val="0"/>
+          <w:numId w:val="1"/>
+        </w:numPr>
+        <w:widowControl/>
+      </w:pPr>
+      <w:r>
+        <w:rPr>
+          <w:rFonts w:ascii="Calibri" w:hAnsi="Calibri" w:cs="Calibri"/>
+        </w:rPr>
+        <w:t>P10B-19A-08C = Planned after P10B-19A-08B</w:t>
+      </w:r>
+    </w:p>
+    <w:p>
+      <w:pPr>
+        <w:pStyle w:val="Normal"/>
+        <w:numPr>
+          <w:ilvl w:val="0"/>
+          <w:numId w:val="1"/>
+        </w:numPr>
+        <w:widowControl/>
+      </w:pPr>
+      <w:r>
+        <w:rPr>
+          <w:rFonts w:ascii="Calibri" w:hAnsi="Calibri" w:cs="Calibri"/>
+        </w:rPr>
+        <w:t>P10B-19A-09 = Planned after P10B-19A-08C</w:t>
+      </w:r>
+    </w:p>
+    <w:p>
+      <w:pPr>
+        <w:pStyle w:val="Normal"/>
+        <w:numPr>
+          <w:ilvl w:val="0"/>
+          <w:numId w:val="1"/>
+        </w:numPr>
+        <w:widowControl/>
+      </w:pPr>
+      <w:r>
+        <w:rPr>
+          <w:rFonts w:ascii="Calibri" w:hAnsi="Calibri" w:cs="Calibri"/>
+        </w:rPr>
         <w:t>P10B-19A = Partial</w:t>
       </w:r>
     </w:p>
@@ -28597,7 +29834,7 @@
         <w:rPr>
           <w:rFonts w:ascii="Calibri" w:hAnsi="Calibri" w:cs="Calibri"/>
         </w:rPr>
-        <w:t>P10B-19A-08 = exact next implementation task</w:t>
+        <w:t>P10B = Partial</w:t>
       </w:r>
     </w:p>
     <w:p>

</xml_diff>

<commit_message>
feat: add candidate compatibility evaluation
</commit_message>
<xml_diff>
--- a/docs/VESKIFY_DEVELOPMENT_DELIVERY_TRACKER_v1.3.0.docx
+++ b/docs/VESKIFY_DEVELOPMENT_DELIVERY_TRACKER_v1.3.0.docx
@@ -38,7 +38,7 @@
         <w:rPr>
           <w:rFonts w:ascii="Calibri" w:hAnsi="Calibri" w:cs="Calibri"/>
         </w:rPr>
-        <w:t>Delivery status baseline: 1 September 2026, P10B-19A-08A Normalized Topology Identity Baseline</w:t>
+        <w:t>Delivery status baseline: 2 September 2026, P10B-19A-08B Candidate Compatibility Contract and Evaluation Baseline</w:t>
       </w:r>
     </w:p>
     <w:p>
@@ -249,7 +249,7 @@
               <w:rPr>
                 <w:rFonts w:ascii="Calibri" w:hAnsi="Calibri" w:cs="Calibri"/>
               </w:rPr>
-              <w:t>1 September 2026, P10B-19A-08A Normalized Topology Identity Baseline</w:t>
+              <w:t>2 September 2026, P10B-19A-08B Candidate Compatibility Contract and Evaluation Baseline</w:t>
             </w:r>
           </w:p>
         </w:tc>
@@ -9063,7 +9063,7 @@
               <w:rPr>
                 <w:rFonts w:ascii="Calibri" w:hAnsi="Calibri" w:cs="Calibri"/>
               </w:rPr>
-              <w:t>Delivery-only A-08A/A-08B/A-08C sequence; normalized identity is Baseline, compatibility and selection remain incomplete</w:t>
+              <w:t>Delivery-only A-08A/A-08B/A-08C sequence; normalized identity and compatibility are Baseline, deterministic selection remains incomplete</w:t>
             </w:r>
           </w:p>
         </w:tc>
@@ -9222,7 +9222,7 @@
               <w:rPr>
                 <w:rFonts w:ascii="Calibri" w:hAnsi="Calibri" w:cs="Calibri"/>
               </w:rPr>
-              <w:t>☐</w:t>
+              <w:t>☑</w:t>
             </w:r>
           </w:p>
         </w:tc>
@@ -9279,7 +9279,7 @@
                 <w:b/>
                 <w:bCs/>
               </w:rPr>
-              <w:t>Planned / exact next</w:t>
+              <w:t>Baseline</w:t>
             </w:r>
           </w:p>
         </w:tc>
@@ -9297,7 +9297,7 @@
               <w:rPr>
                 <w:rFonts w:ascii="Calibri" w:hAnsi="Calibri" w:cs="Calibri"/>
               </w:rPr>
-              <w:t>Planned task owner</w:t>
+              <w:t>P10B-19A task owner</w:t>
             </w:r>
           </w:p>
         </w:tc>
@@ -9333,7 +9333,7 @@
               <w:rPr>
                 <w:rFonts w:ascii="Calibri" w:hAnsi="Calibri" w:cs="Calibri"/>
               </w:rPr>
-              <w:t>Add deterministic candidate compatibility contract and evaluation without selection, v1 migration or runtime integration</w:t>
+              <w:t>Strict transient context/profile contracts and deterministic PageBlueprint/family compatibility evaluation; empty production authority and no selection or runtime reach</w:t>
             </w:r>
           </w:p>
         </w:tc>
@@ -9414,7 +9414,7 @@
                 <w:b/>
                 <w:bCs/>
               </w:rPr>
-              <w:t>Planned</w:t>
+              <w:t>Planned / exact next</w:t>
             </w:r>
           </w:p>
         </w:tc>
@@ -13976,7 +13976,7 @@
         <w:rPr>
           <w:rFonts w:ascii="Calibri" w:hAnsi="Calibri" w:cs="Calibri"/>
         </w:rPr>
-        <w:t xml:space="preserve">P10B remains Partial. DEVX-01A through DEVX-01G are Baseline, and DEVX-01 is Baseline / closed. P10B-19A-01 through P10B-19A-07 and P10B-19A-08A are Baseline; parent P10B-19A-08 and P10B-19A are Partial; P10B-19A-08B - Candidate Compatibility Contract and Evaluation is the exact next implementation task; P10B-19A-08C is Planned after P10B-19A-08B; P10B-19A-09 remains Planned after P10B-19A-08C; P10B remains Partial. DEVX-01C measured the serial gate, retained PR/ref-scoped cancellation and added compatible </w:t>
+        <w:t xml:space="preserve">P10B remains Partial. DEVX-01A through DEVX-01G are Baseline, and DEVX-01 is Baseline / closed. P10B-19A-01 through P10B-19A-07, P10B-19A-08A and P10B-19A-08B are Baseline; parent P10B-19A-08 and P10B-19A are Partial; P10B-19A-08C - Deterministic Candidate Selection is the exact next implementation task; P10B-19A-09 remains Planned after P10B-19A-08C; P10B remains Partial. DEVX-01C measured the serial gate, retained PR/ref-scoped cancellation and added compatible </w:t>
       </w:r>
       <w:r>
         <w:rPr>
@@ -14936,7 +14936,7 @@
         <w:rPr>
           <w:rFonts w:ascii="Calibri" w:hAnsi="Calibri" w:cs="Calibri"/>
         </w:rPr>
-        <w:t xml:space="preserve">P10B-19A-01 through P10B-19A-07 and P10B-19A-08A are </w:t>
+        <w:t xml:space="preserve">P10B-19A-01 through P10B-19A-07, P10B-19A-08A and P10B-19A-08B are </w:t>
       </w:r>
       <w:r>
         <w:rPr>
@@ -14964,7 +14964,7 @@
         <w:rPr>
           <w:rFonts w:ascii="Calibri" w:hAnsi="Calibri" w:cs="Calibri"/>
         </w:rPr>
-        <w:t>. P10B-19A-08B - Candidate Compatibility Contract and Evaluation is the exact next implementation task; P10B-19A-08C is Planned after P10B-19A-08B; P10B-19A-09 remains Planned after P10B-19A-08C.</w:t>
+        <w:t>. P10B-19A-08C - Deterministic Candidate Selection is the exact next implementation task; P10B-19A-09 remains Planned after P10B-19A-08C.</w:t>
       </w:r>
     </w:p>
     <w:p>
@@ -15047,6 +15047,60 @@
           <w:rFonts w:ascii="Calibri" w:hAnsi="Calibri" w:cs="Calibri"/>
         </w:rPr>
         <w:t>. The pure, non-persisted inactive normalized-topology index groups duplicate PageBlueprint and family identities but does not reject, evaluate compatibility, select, activate, persist or expose runtime records. Production PageBlueprint v2, Structural Storefront Family and normalized-topology index record counts remain exactly zero.</w:t>
+      </w:r>
+    </w:p>
+    <w:p>
+      <w:pPr>
+        <w:pStyle w:val="Normal"/>
+        <w:widowControl/>
+      </w:pPr>
+      <w:r>
+        <w:rPr>
+          <w:rFonts w:ascii="Calibri" w:hAnsi="Calibri" w:cs="Calibri"/>
+        </w:rPr>
+        <w:t xml:space="preserve">P10B-19A-08B establishes strict schema-version </w:t>
+      </w:r>
+      <w:r>
+        <w:rPr>
+          <w:rFonts w:ascii="Consolas" w:hAnsi="Consolas" w:cs="Consolas"/>
+          <w:sz w:val="19"/>
+          <w:szCs w:val="19"/>
+        </w:rPr>
+        <w:t>1.0.0</w:t>
+      </w:r>
+      <w:r>
+        <w:rPr>
+          <w:rFonts w:ascii="Calibri" w:hAnsi="Calibri" w:cs="Calibri"/>
+        </w:rPr>
+        <w:t xml:space="preserve"> compatibility contracts and deterministic evaluation. The transient context uses the ordered catalogue-cardinality, fact-depth, product-complexity, navigation-depth and canonical </w:t>
+      </w:r>
+      <w:r>
+        <w:rPr>
+          <w:rFonts w:ascii="Consolas" w:hAnsi="Consolas" w:cs="Consolas"/>
+          <w:sz w:val="19"/>
+          <w:szCs w:val="19"/>
+        </w:rPr>
+        <w:t>en</w:t>
+      </w:r>
+      <w:r>
+        <w:rPr>
+          <w:rFonts w:ascii="Calibri" w:hAnsi="Calibri" w:cs="Calibri"/>
+        </w:rPr>
+        <w:t>/</w:t>
+      </w:r>
+      <w:r>
+        <w:rPr>
+          <w:rFonts w:ascii="Consolas" w:hAnsi="Consolas" w:cs="Consolas"/>
+          <w:sz w:val="19"/>
+          <w:szCs w:val="19"/>
+        </w:rPr>
+        <w:t>fi</w:t>
+      </w:r>
+      <w:r>
+        <w:rPr>
+          <w:rFonts w:ascii="Calibri" w:hAnsi="Calibri" w:cs="Calibri"/>
+        </w:rPr>
+        <w:t xml:space="preserve"> locale dimensions, and carries exact candidate-scoped capacity for every required A-04 region/role through maximum 32. Family profiles bind exact A-07 candidate fingerprints and explicitly partition all five vocabularies; the sole production profile catalogue is empty. Memoized A-06 DAG evaluation retains every compatible substitution target in declared order without choosing one. PageBlueprint statuses are directly-compatible, substitution-compatible, omission-compatible and incompatible; family statuses are directly-compatible, conditionally-compatible and incompatible. A-08A topology is provenance only. Stale-checked context, profile and evaluation fingerprints introduce no score, rank, winner, selected receipt, activation, persistence or runtime wiring. Production candidates, profiles, contexts, evaluations, active/selectable/selected records and current-generation consumers remain zero.</w:t>
       </w:r>
     </w:p>
     <w:p>
@@ -16495,7 +16549,7 @@
         <w:rPr>
           <w:rFonts w:ascii="Calibri" w:hAnsi="Calibri" w:cs="Calibri"/>
         </w:rPr>
-        <w:t xml:space="preserve">. P10B-19A-01 through P10B-19A-07 and P10B-19A-08A are </w:t>
+        <w:t xml:space="preserve">. P10B-19A-01 through P10B-19A-07, P10B-19A-08A and P10B-19A-08B are </w:t>
       </w:r>
       <w:r>
         <w:rPr>
@@ -16523,7 +16577,7 @@
         <w:rPr>
           <w:rFonts w:ascii="Calibri" w:hAnsi="Calibri" w:cs="Calibri"/>
         </w:rPr>
-        <w:t xml:space="preserve">; P10B-19A-08B - Candidate Compatibility Contract and Evaluation is </w:t>
+        <w:t xml:space="preserve">; P10B-19A-08C - Deterministic Candidate Selection is </w:t>
       </w:r>
       <w:r>
         <w:rPr>
@@ -16537,7 +16591,7 @@
         <w:rPr>
           <w:rFonts w:ascii="Calibri" w:hAnsi="Calibri" w:cs="Calibri"/>
         </w:rPr>
-        <w:t xml:space="preserve">; P10B-19A-08C and P10B-19A-09 are </w:t>
+        <w:t xml:space="preserve">; P10B-19A-09 is </w:t>
       </w:r>
       <w:r>
         <w:rPr>
@@ -16551,7 +16605,7 @@
         <w:rPr>
           <w:rFonts w:ascii="Calibri" w:hAnsi="Calibri" w:cs="Calibri"/>
         </w:rPr>
-        <w:t xml:space="preserve"> in that order. P10B-16P-04 acceptance evidence is retained in </w:t>
+        <w:t xml:space="preserve"> after P10B-19A-08C. P10B-16P-04 acceptance evidence is retained in </w:t>
       </w:r>
       <w:hyperlink r:id="rIdHyperlink5" w:history="1">
         <w:r>
@@ -16567,7 +16621,7 @@
         <w:rPr>
           <w:rFonts w:ascii="Calibri" w:hAnsi="Calibri" w:cs="Calibri"/>
         </w:rPr>
-        <w:t>. The remaining Done conditions are implementation gates, not claims about the current repository. The P10B-16P-01 through P10B-16P-05A plus P10B-16P-06 sequence is a mandatory convergence package between P10B-16 and P10B-17; it supplements rather than renumbers the locked P10B-01 through P10B-18 plan. P10B-16P-05B follows accepted P10B-18C and is now Baseline. P10B-18D completed as a rejected-quality diagnostic. P10B-19 PRE is Baseline. P10B-19A-01 through P10B-19A-07 and P10B-19A-08A are Baseline; parent P10B-19A-08 and P10B-19A are Partial; P10B-19A-08B - Candidate Compatibility Contract and Evaluation is the exact next implementation task; P10B-19A-08C is Planned after P10B-19A-08B; P10B-19A-09 remains Planned after P10B-19A-08C; P10B-19B through P10B-19J remain Planned.</w:t>
+        <w:t>. The remaining Done conditions are implementation gates, not claims about the current repository. The P10B-16P-01 through P10B-16P-05A plus P10B-16P-06 sequence is a mandatory convergence package between P10B-16 and P10B-17; it supplements rather than renumbers the locked P10B-01 through P10B-18 plan. P10B-16P-05B follows accepted P10B-18C and is now Baseline. P10B-18D completed as a rejected-quality diagnostic. P10B-19 PRE is Baseline. P10B-19A-01 through P10B-19A-07, P10B-19A-08A and P10B-19A-08B are Baseline; parent P10B-19A-08 and P10B-19A are Partial; P10B-19A-08C - Deterministic Candidate Selection is the exact next implementation task; P10B-19A-09 remains Planned after P10B-19A-08C; P10B-19B through P10B-19J remain Planned.</w:t>
       </w:r>
     </w:p>
     <w:p>
@@ -22026,7 +22080,7 @@
         <w:rPr>
           <w:rFonts w:ascii="Calibri" w:hAnsi="Calibri" w:cs="Calibri"/>
         </w:rPr>
-        <w:t>P10B-18C and P10B-16P-05B are Baseline. P10B-18D is a Baseline diagnostic with live commercial quality rejected. P10B-18 and P10B remain Partial. P10B-19 PRE is Baseline. P10B-19A-01 through P10B-19A-07 and P10B-19A-08A are Baseline; parent P10B-19A-08 and P10B-19A are Partial; P10B-19A-08B - Candidate Compatibility Contract and Evaluation is the exact next implementation task; P10B-19A-08C is Planned after P10B-19A-08B; P10B-19A-09 remains Planned after P10B-19A-08C; P10B-19B through P10B-19J remain Planned.</w:t>
+        <w:t>P10B-18C and P10B-16P-05B are Baseline. P10B-18D is a Baseline diagnostic with live commercial quality rejected. P10B-18 and P10B remain Partial. P10B-19 PRE is Baseline. P10B-19A-01 through P10B-19A-07, P10B-19A-08A and P10B-19A-08B are Baseline; parent P10B-19A-08 and P10B-19A are Partial; P10B-19A-08C - Deterministic Candidate Selection is the exact next implementation task; P10B-19A-09 remains Planned after P10B-19A-08C; P10B-19B through P10B-19J remain Planned.</w:t>
       </w:r>
     </w:p>
     <w:p>
@@ -24099,7 +24153,7 @@
         <w:rPr>
           <w:rFonts w:ascii="Calibri" w:hAnsi="Calibri" w:cs="Calibri"/>
         </w:rPr>
-        <w:t xml:space="preserve"> is Baseline. P10B-19A-01 through P10B-19A-07 and P10B-19A-08A are Baseline; parent P10B-19A-08 and </w:t>
+        <w:t xml:space="preserve"> is Baseline. P10B-19A-01 through P10B-19A-07, P10B-19A-08A and P10B-19A-08B are Baseline; parent P10B-19A-08 and </w:t>
       </w:r>
       <w:r>
         <w:rPr>
@@ -24113,7 +24167,7 @@
         <w:rPr>
           <w:rFonts w:ascii="Calibri" w:hAnsi="Calibri" w:cs="Calibri"/>
         </w:rPr>
-        <w:t xml:space="preserve"> are Partial; P10B-19A-08B - Candidate Compatibility Contract and Evaluation is the exact next implementation task; P10B-19A-08C is Planned after P10B-19A-08B; P10B-19A-09 remains Planned after P10B-19A-08C; P10B-19B through P10B-19J remain Planned.</w:t>
+        <w:t xml:space="preserve"> are Partial; P10B-19A-08C - Deterministic Candidate Selection is the exact next implementation task; P10B-19A-09 remains Planned after P10B-19A-08C; P10B-19B through P10B-19J remain Planned.</w:t>
       </w:r>
     </w:p>
     <w:p>
@@ -28108,7 +28162,7 @@
         <w:rPr>
           <w:rFonts w:ascii="Calibri" w:hAnsi="Calibri" w:cs="Calibri"/>
         </w:rPr>
-        <w:t xml:space="preserve"> with zero primary FAIL. P10B-16P-05B subsequently removed the one-time capture platform while retaining the bounded quality gate. P10B-18D subsequently completed as a rejected-quality diagnostic. P10B-19 PRE is Baseline. P10B-19A-01 through P10B-19A-07 and P10B-19A-08A are Baseline; parent P10B-19A-08 and P10B-19A are Partial; P10B-19A-08B - Candidate Compatibility Contract and Evaluation is the exact next implementation task; P10B-19A-08C is Planned after P10B-19A-08B; P10B-19A-09 remains Planned after P10B-19A-08C.</w:t>
+        <w:t xml:space="preserve"> with zero primary FAIL. P10B-16P-05B subsequently removed the one-time capture platform while retaining the bounded quality gate. P10B-18D subsequently completed as a rejected-quality diagnostic. P10B-19 PRE is Baseline. P10B-19A-01 through P10B-19A-07, P10B-19A-08A and P10B-19A-08B are Baseline; parent P10B-19A-08 and P10B-19A are Partial; P10B-19A-08C - Deterministic Candidate Selection is the exact next implementation task; P10B-19A-09 remains Planned after P10B-19A-08C.</w:t>
       </w:r>
     </w:p>
     <w:p>
@@ -28472,7 +28526,7 @@
               <w:rPr>
                 <w:rFonts w:ascii="Calibri" w:hAnsi="Calibri" w:cs="Calibri"/>
               </w:rPr>
-              <w:t>A-08A normalized topology identity is Baseline; candidate compatibility and deterministic selection remain incomplete</w:t>
+              <w:t>A-08A normalized topology and A-08B compatibility are Baseline; deterministic selection remains incomplete</w:t>
             </w:r>
           </w:p>
         </w:tc>
@@ -29136,7 +29190,7 @@
               <w:rPr>
                 <w:rFonts w:ascii="Calibri" w:hAnsi="Calibri" w:cs="Calibri"/>
               </w:rPr>
-              <w:t>Next</w:t>
+              <w:t>Baseline</w:t>
             </w:r>
           </w:p>
         </w:tc>
@@ -29174,7 +29228,7 @@
                 <w:b/>
                 <w:bCs/>
               </w:rPr>
-              <w:t>Planned / exact next</w:t>
+              <w:t>Baseline</w:t>
             </w:r>
           </w:p>
         </w:tc>
@@ -29192,7 +29246,7 @@
               <w:rPr>
                 <w:rFonts w:ascii="Calibri" w:hAnsi="Calibri" w:cs="Calibri"/>
               </w:rPr>
-              <w:t>Candidate Compatibility Contract and Evaluation</w:t>
+              <w:t>Candidate compatibility contracts and deterministic evaluation; empty production profile catalogue and zero runtime reach</w:t>
             </w:r>
           </w:p>
         </w:tc>
@@ -29216,7 +29270,7 @@
               <w:rPr>
                 <w:rFonts w:ascii="Calibri" w:hAnsi="Calibri" w:cs="Calibri"/>
               </w:rPr>
-              <w:t>Planned</w:t>
+              <w:t>Next</w:t>
             </w:r>
           </w:p>
         </w:tc>
@@ -29254,7 +29308,7 @@
                 <w:b/>
                 <w:bCs/>
               </w:rPr>
-              <w:t>Planned</w:t>
+              <w:t>Planned / exact next</w:t>
             </w:r>
           </w:p>
         </w:tc>
@@ -29272,7 +29326,7 @@
               <w:rPr>
                 <w:rFonts w:ascii="Calibri" w:hAnsi="Calibri" w:cs="Calibri"/>
               </w:rPr>
-              <w:t>Deterministic Candidate Selection after P10B-19A-08B</w:t>
+              <w:t>Deterministic Candidate Selection</w:t>
             </w:r>
           </w:p>
         </w:tc>
@@ -29754,6 +29808,22 @@
         <w:rPr>
           <w:rFonts w:ascii="Calibri" w:hAnsi="Calibri" w:cs="Calibri"/>
         </w:rPr>
+        <w:t>P10B-19A-08B = Baseline</w:t>
+      </w:r>
+    </w:p>
+    <w:p>
+      <w:pPr>
+        <w:pStyle w:val="Normal"/>
+        <w:numPr>
+          <w:ilvl w:val="0"/>
+          <w:numId w:val="1"/>
+        </w:numPr>
+        <w:widowControl/>
+      </w:pPr>
+      <w:r>
+        <w:rPr>
+          <w:rFonts w:ascii="Calibri" w:hAnsi="Calibri" w:cs="Calibri"/>
+        </w:rPr>
         <w:t>P10B-19A-08 = Partial</w:t>
       </w:r>
     </w:p>
@@ -29770,23 +29840,7 @@
         <w:rPr>
           <w:rFonts w:ascii="Calibri" w:hAnsi="Calibri" w:cs="Calibri"/>
         </w:rPr>
-        <w:t>P10B-19A-08B = exact next implementation task</w:t>
-      </w:r>
-    </w:p>
-    <w:p>
-      <w:pPr>
-        <w:pStyle w:val="Normal"/>
-        <w:numPr>
-          <w:ilvl w:val="0"/>
-          <w:numId w:val="1"/>
-        </w:numPr>
-        <w:widowControl/>
-      </w:pPr>
-      <w:r>
-        <w:rPr>
-          <w:rFonts w:ascii="Calibri" w:hAnsi="Calibri" w:cs="Calibri"/>
-        </w:rPr>
-        <w:t>P10B-19A-08C = Planned after P10B-19A-08B</w:t>
+        <w:t>P10B-19A-08C = exact next implementation task</w:t>
       </w:r>
     </w:p>
     <w:p>

</xml_diff>

<commit_message>
feat: add deterministic structural candidate selection
</commit_message>
<xml_diff>
--- a/docs/VESKIFY_DEVELOPMENT_DELIVERY_TRACKER_v1.3.0.docx
+++ b/docs/VESKIFY_DEVELOPMENT_DELIVERY_TRACKER_v1.3.0.docx
@@ -38,7 +38,7 @@
         <w:rPr>
           <w:rFonts w:ascii="Calibri" w:hAnsi="Calibri" w:cs="Calibri"/>
         </w:rPr>
-        <w:t>Delivery status baseline: 2 September 2026, P10B-19A-08B Candidate Compatibility Contract and Evaluation Baseline</w:t>
+        <w:t>Delivery status baseline: 2 September 2026, P10B-19A-08C Deterministic Candidate Selection Baseline</w:t>
       </w:r>
     </w:p>
     <w:p>
@@ -249,7 +249,7 @@
               <w:rPr>
                 <w:rFonts w:ascii="Calibri" w:hAnsi="Calibri" w:cs="Calibri"/>
               </w:rPr>
-              <w:t>2 September 2026, P10B-19A-08B Candidate Compatibility Contract and Evaluation Baseline</w:t>
+              <w:t>2 September 2026, P10B-19A-08C Deterministic Candidate Selection Baseline</w:t>
             </w:r>
           </w:p>
         </w:tc>
@@ -8952,7 +8952,7 @@
               <w:rPr>
                 <w:rFonts w:ascii="Calibri" w:hAnsi="Calibri" w:cs="Calibri"/>
               </w:rPr>
-              <w:t>☐</w:t>
+              <w:t>☑</w:t>
             </w:r>
           </w:p>
         </w:tc>
@@ -9009,7 +9009,7 @@
                 <w:b/>
                 <w:bCs/>
               </w:rPr>
-              <w:t>Partial</w:t>
+              <w:t>Baseline / closed</w:t>
             </w:r>
           </w:p>
         </w:tc>
@@ -9063,7 +9063,7 @@
               <w:rPr>
                 <w:rFonts w:ascii="Calibri" w:hAnsi="Calibri" w:cs="Calibri"/>
               </w:rPr>
-              <w:t>Delivery-only A-08A/A-08B/A-08C sequence; normalized identity and compatibility are Baseline, deterministic selection remains incomplete</w:t>
+              <w:t>Delivery-only A-08A/A-08B/A-08C sequence completes normalized identity, compatibility and deterministic selection with empty production/runtime authority</w:t>
             </w:r>
           </w:p>
         </w:tc>
@@ -9357,7 +9357,7 @@
               <w:rPr>
                 <w:rFonts w:ascii="Calibri" w:hAnsi="Calibri" w:cs="Calibri"/>
               </w:rPr>
-              <w:t>☐</w:t>
+              <w:t>☑</w:t>
             </w:r>
           </w:p>
         </w:tc>
@@ -9414,7 +9414,7 @@
                 <w:b/>
                 <w:bCs/>
               </w:rPr>
-              <w:t>Planned / exact next</w:t>
+              <w:t>Baseline</w:t>
             </w:r>
           </w:p>
         </w:tc>
@@ -9432,7 +9432,7 @@
               <w:rPr>
                 <w:rFonts w:ascii="Calibri" w:hAnsi="Calibri" w:cs="Calibri"/>
               </w:rPr>
-              <w:t>Planned task owner</w:t>
+              <w:t>P10B-19A task owner</w:t>
             </w:r>
           </w:p>
         </w:tc>
@@ -9468,7 +9468,7 @@
               <w:rPr>
                 <w:rFonts w:ascii="Calibri" w:hAnsi="Calibri" w:cs="Calibri"/>
               </w:rPr>
-              <w:t>Add deterministic candidate selection without beginning v1 migration or runtime integration</w:t>
+              <w:t>Strict scoring-free six-page selection, bounded topology exclusions, immutable replayed receipts and zero production/runtime reach</w:t>
             </w:r>
           </w:p>
         </w:tc>
@@ -9549,6 +9549,141 @@
                 <w:b/>
                 <w:bCs/>
               </w:rPr>
+              <w:t>Planned / exact next</w:t>
+            </w:r>
+          </w:p>
+        </w:tc>
+        <w:tc>
+          <w:tcPr>
+            <w:tcW w:w="1500" w:type="dxa"/>
+            <w:vAlign w:val="center"/>
+          </w:tcPr>
+          <w:p>
+            <w:pPr>
+              <w:pStyle w:val="CompactTableText"/>
+              <w:widowControl/>
+            </w:pPr>
+            <w:r>
+              <w:rPr>
+                <w:rFonts w:ascii="Calibri" w:hAnsi="Calibri" w:cs="Calibri"/>
+              </w:rPr>
+              <w:t>Planned task owner</w:t>
+            </w:r>
+          </w:p>
+        </w:tc>
+        <w:tc>
+          <w:tcPr>
+            <w:tcW w:w="2500" w:type="dxa"/>
+            <w:vAlign w:val="center"/>
+          </w:tcPr>
+          <w:p>
+            <w:pPr>
+              <w:pStyle w:val="CompactTableText"/>
+              <w:widowControl/>
+            </w:pPr>
+            <w:r>
+              <w:rPr>
+                <w:rFonts w:ascii="Calibri" w:hAnsi="Calibri" w:cs="Calibri"/>
+              </w:rPr>
+              <w:t>P10B-19A-08C merged</w:t>
+            </w:r>
+          </w:p>
+        </w:tc>
+        <w:tc>
+          <w:tcPr>
+            <w:tcW w:w="2890" w:type="dxa"/>
+            <w:vAlign w:val="center"/>
+          </w:tcPr>
+          <w:p>
+            <w:pPr>
+              <w:pStyle w:val="CompactTableText"/>
+              <w:widowControl/>
+            </w:pPr>
+            <w:r>
+              <w:rPr>
+                <w:rFonts w:ascii="Calibri" w:hAnsi="Calibri" w:cs="Calibri"/>
+              </w:rPr>
+              <w:t>Preserve v1 read, render, migration and publication compatibility after the complete A-08 delivery</w:t>
+            </w:r>
+          </w:p>
+        </w:tc>
+      </w:tr>
+      <w:tr>
+        <w:trPr>
+          <w:cantSplit/>
+        </w:trPr>
+        <w:tc>
+          <w:tcPr>
+            <w:tcW w:w="720" w:type="dxa"/>
+            <w:vAlign w:val="center"/>
+          </w:tcPr>
+          <w:p>
+            <w:pPr>
+              <w:pStyle w:val="CompactTableText"/>
+              <w:jc w:val="center"/>
+              <w:widowControl/>
+            </w:pPr>
+            <w:r>
+              <w:rPr>
+                <w:rFonts w:ascii="Calibri" w:hAnsi="Calibri" w:cs="Calibri"/>
+              </w:rPr>
+              <w:t>☐</w:t>
+            </w:r>
+          </w:p>
+        </w:tc>
+        <w:tc>
+          <w:tcPr>
+            <w:tcW w:w="1700" w:type="dxa"/>
+            <w:vAlign w:val="center"/>
+          </w:tcPr>
+          <w:p>
+            <w:pPr>
+              <w:pStyle w:val="CompactTableText"/>
+              <w:widowControl/>
+            </w:pPr>
+            <w:r>
+              <w:rPr>
+                <w:rFonts w:ascii="Calibri" w:hAnsi="Calibri" w:cs="Calibri"/>
+              </w:rPr>
+              <w:t>P10B-19A-10</w:t>
+            </w:r>
+          </w:p>
+        </w:tc>
+        <w:tc>
+          <w:tcPr>
+            <w:tcW w:w="2800" w:type="dxa"/>
+            <w:vAlign w:val="center"/>
+          </w:tcPr>
+          <w:p>
+            <w:pPr>
+              <w:pStyle w:val="CompactTableText"/>
+              <w:widowControl/>
+            </w:pPr>
+            <w:r>
+              <w:rPr>
+                <w:rFonts w:ascii="Calibri" w:hAnsi="Calibri" w:cs="Calibri"/>
+              </w:rPr>
+              <w:t>Retained matrices, integration and P10B-19A closure</w:t>
+            </w:r>
+          </w:p>
+        </w:tc>
+        <w:tc>
+          <w:tcPr>
+            <w:tcW w:w="850" w:type="dxa"/>
+            <w:vAlign w:val="center"/>
+          </w:tcPr>
+          <w:p>
+            <w:pPr>
+              <w:pStyle w:val="CompactTableText"/>
+              <w:jc w:val="center"/>
+              <w:widowControl/>
+            </w:pPr>
+            <w:r>
+              <w:rPr>
+                <w:rFonts w:ascii="Calibri" w:hAnsi="Calibri" w:cs="Calibri"/>
+                <w:b/>
+                <w:bCs/>
+              </w:rPr>
               <w:t>Planned</w:t>
             </w:r>
           </w:p>
@@ -9585,7 +9720,7 @@
               <w:rPr>
                 <w:rFonts w:ascii="Calibri" w:hAnsi="Calibri" w:cs="Calibri"/>
               </w:rPr>
-              <w:t>P10B-19A-08C merged</w:t>
+              <w:t>P10B-19A-09 merged</w:t>
             </w:r>
           </w:p>
         </w:tc>
@@ -9603,7 +9738,7 @@
               <w:rPr>
                 <w:rFonts w:ascii="Calibri" w:hAnsi="Calibri" w:cs="Calibri"/>
               </w:rPr>
-              <w:t>Preserve v1 read, render, migration and publication compatibility after the complete A-08 delivery</w:t>
+              <w:t>Run retained integration matrices and close P10B-19A without pulling in later P10B-19 packages</w:t>
             </w:r>
           </w:p>
         </w:tc>
@@ -13976,7 +14111,7 @@
         <w:rPr>
           <w:rFonts w:ascii="Calibri" w:hAnsi="Calibri" w:cs="Calibri"/>
         </w:rPr>
-        <w:t xml:space="preserve">P10B remains Partial. DEVX-01A through DEVX-01G are Baseline, and DEVX-01 is Baseline / closed. P10B-19A-01 through P10B-19A-07, P10B-19A-08A and P10B-19A-08B are Baseline; parent P10B-19A-08 and P10B-19A are Partial; P10B-19A-08C - Deterministic Candidate Selection is the exact next implementation task; P10B-19A-09 remains Planned after P10B-19A-08C; P10B remains Partial. DEVX-01C measured the serial gate, retained PR/ref-scoped cancellation and added compatible </w:t>
+        <w:t xml:space="preserve">P10B remains Partial. DEVX-01A through DEVX-01G are Baseline, and DEVX-01 is Baseline / closed. P10B-19A-01 through P10B-19A-07 and P10B-19A-08A through P10B-19A-08C are Baseline; parent P10B-19A-08 is Baseline / closed, while P10B-19A remains Partial; P10B-19A-09 is Planned / exact next; P10B-19A-10 remains Planned after P10B-19A-09; P10B remains Partial. DEVX-01C measured the serial gate, retained PR/ref-scoped cancellation and added compatible </w:t>
       </w:r>
       <w:r>
         <w:rPr>
@@ -14936,7 +15071,7 @@
         <w:rPr>
           <w:rFonts w:ascii="Calibri" w:hAnsi="Calibri" w:cs="Calibri"/>
         </w:rPr>
-        <w:t xml:space="preserve">P10B-19A-01 through P10B-19A-07, P10B-19A-08A and P10B-19A-08B are </w:t>
+        <w:t xml:space="preserve">P10B-19A-01 through P10B-19A-07 and P10B-19A-08A through P10B-19A-08C are </w:t>
       </w:r>
       <w:r>
         <w:rPr>
@@ -14950,7 +15085,21 @@
         <w:rPr>
           <w:rFonts w:ascii="Calibri" w:hAnsi="Calibri" w:cs="Calibri"/>
         </w:rPr>
-        <w:t xml:space="preserve">; parent P10B-19A-08 and P10B-19A are </w:t>
+        <w:t xml:space="preserve">; parent P10B-19A-08 is </w:t>
+      </w:r>
+      <w:r>
+        <w:rPr>
+          <w:rFonts w:ascii="Calibri" w:hAnsi="Calibri" w:cs="Calibri"/>
+          <w:b/>
+          <w:bCs/>
+        </w:rPr>
+        <w:t>Baseline / closed</w:t>
+      </w:r>
+      <w:r>
+        <w:rPr>
+          <w:rFonts w:ascii="Calibri" w:hAnsi="Calibri" w:cs="Calibri"/>
+        </w:rPr>
+        <w:t xml:space="preserve">, while P10B-19A remains </w:t>
       </w:r>
       <w:r>
         <w:rPr>
@@ -14964,7 +15113,21 @@
         <w:rPr>
           <w:rFonts w:ascii="Calibri" w:hAnsi="Calibri" w:cs="Calibri"/>
         </w:rPr>
-        <w:t>. P10B-19A-08C - Deterministic Candidate Selection is the exact next implementation task; P10B-19A-09 remains Planned after P10B-19A-08C.</w:t>
+        <w:t xml:space="preserve">. P10B-19A-09 is </w:t>
+      </w:r>
+      <w:r>
+        <w:rPr>
+          <w:rFonts w:ascii="Calibri" w:hAnsi="Calibri" w:cs="Calibri"/>
+          <w:b/>
+          <w:bCs/>
+        </w:rPr>
+        <w:t>Planned / exact next</w:t>
+      </w:r>
+      <w:r>
+        <w:rPr>
+          <w:rFonts w:ascii="Calibri" w:hAnsi="Calibri" w:cs="Calibri"/>
+        </w:rPr>
+        <w:t>, and P10B-19A-10 remains Planned after P10B-19A-09.</w:t>
       </w:r>
     </w:p>
     <w:p>
@@ -15101,6 +15264,32 @@
           <w:rFonts w:ascii="Calibri" w:hAnsi="Calibri" w:cs="Calibri"/>
         </w:rPr>
         <w:t xml:space="preserve"> locale dimensions, and carries exact candidate-scoped capacity for every required A-04 region/role through maximum 32. Family profiles bind exact A-07 candidate fingerprints and explicitly partition all five vocabularies; the sole production profile catalogue is empty. Memoized A-06 DAG evaluation retains every compatible substitution target in declared order without choosing one. PageBlueprint statuses are directly-compatible, substitution-compatible, omission-compatible and incompatible; family statuses are directly-compatible, conditionally-compatible and incompatible. A-08A topology is provenance only. Stale-checked context, profile and evaluation fingerprints introduce no score, rank, winner, selected receipt, activation, persistence or runtime wiring. Production candidates, profiles, contexts, evaluations, active/selectable/selected records and current-generation consumers remain zero.</w:t>
+      </w:r>
+    </w:p>
+    <w:p>
+      <w:pPr>
+        <w:pStyle w:val="Normal"/>
+        <w:widowControl/>
+      </w:pPr>
+      <w:r>
+        <w:rPr>
+          <w:rFonts w:ascii="Calibri" w:hAnsi="Calibri" w:cs="Calibri"/>
+        </w:rPr>
+        <w:t xml:space="preserve">P10B-19A-08C establishes strict schema-version </w:t>
+      </w:r>
+      <w:r>
+        <w:rPr>
+          <w:rFonts w:ascii="Consolas" w:hAnsi="Consolas" w:cs="Consolas"/>
+          <w:sz w:val="19"/>
+          <w:szCs w:val="19"/>
+        </w:rPr>
+        <w:t>1.0.0</w:t>
+      </w:r>
+      <w:r>
+        <w:rPr>
+          <w:rFonts w:ascii="Calibri" w:hAnsi="Calibri" w:cs="Calibri"/>
+        </w:rPr>
+        <w:t xml:space="preserve"> deterministic selection requests and immutable receipts over exact A-07/A-08A/A-08B authority. Scoring-free family and PageBlueprint precedence uses case-bound canonical-fingerprint tie-breaks; selection covers all six page families, follows A-06 recursive substitution priority and retains safe omission declarations without executing them. Complete-store combinations share one global 4,096 evaluation bound and yield an identity-free complete topology, while receipt parsing replays selection to reject stale or contradictory authority. Production registry, profile, request, receipt and current-generation runtime counts remain zero; visual behavior, runtime wiring, providers, persistence and publication are unchanged. Parent P10B-19A-08 is Baseline / closed.</w:t>
       </w:r>
     </w:p>
     <w:p>
@@ -16549,7 +16738,7 @@
         <w:rPr>
           <w:rFonts w:ascii="Calibri" w:hAnsi="Calibri" w:cs="Calibri"/>
         </w:rPr>
-        <w:t xml:space="preserve">. P10B-19A-01 through P10B-19A-07, P10B-19A-08A and P10B-19A-08B are </w:t>
+        <w:t xml:space="preserve">. P10B-19A-01 through P10B-19A-07 and P10B-19A-08A through P10B-19A-08C are </w:t>
       </w:r>
       <w:r>
         <w:rPr>
@@ -16563,7 +16752,21 @@
         <w:rPr>
           <w:rFonts w:ascii="Calibri" w:hAnsi="Calibri" w:cs="Calibri"/>
         </w:rPr>
-        <w:t xml:space="preserve">; parent P10B-19A-08 and P10B-19A are </w:t>
+        <w:t xml:space="preserve">; parent P10B-19A-08 is </w:t>
+      </w:r>
+      <w:r>
+        <w:rPr>
+          <w:rFonts w:ascii="Calibri" w:hAnsi="Calibri" w:cs="Calibri"/>
+          <w:b/>
+          <w:bCs/>
+        </w:rPr>
+        <w:t>Baseline / closed</w:t>
+      </w:r>
+      <w:r>
+        <w:rPr>
+          <w:rFonts w:ascii="Calibri" w:hAnsi="Calibri" w:cs="Calibri"/>
+        </w:rPr>
+        <w:t xml:space="preserve">, while P10B-19A is </w:t>
       </w:r>
       <w:r>
         <w:rPr>
@@ -16577,7 +16780,7 @@
         <w:rPr>
           <w:rFonts w:ascii="Calibri" w:hAnsi="Calibri" w:cs="Calibri"/>
         </w:rPr>
-        <w:t xml:space="preserve">; P10B-19A-08C - Deterministic Candidate Selection is </w:t>
+        <w:t xml:space="preserve">. P10B-19A-09 is </w:t>
       </w:r>
       <w:r>
         <w:rPr>
@@ -16591,7 +16794,7 @@
         <w:rPr>
           <w:rFonts w:ascii="Calibri" w:hAnsi="Calibri" w:cs="Calibri"/>
         </w:rPr>
-        <w:t xml:space="preserve">; P10B-19A-09 is </w:t>
+        <w:t xml:space="preserve">, and P10B-19A-10 remains </w:t>
       </w:r>
       <w:r>
         <w:rPr>
@@ -16605,7 +16808,7 @@
         <w:rPr>
           <w:rFonts w:ascii="Calibri" w:hAnsi="Calibri" w:cs="Calibri"/>
         </w:rPr>
-        <w:t xml:space="preserve"> after P10B-19A-08C. P10B-16P-04 acceptance evidence is retained in </w:t>
+        <w:t xml:space="preserve"> after P10B-19A-09. P10B-16P-04 acceptance evidence is retained in </w:t>
       </w:r>
       <w:hyperlink r:id="rIdHyperlink5" w:history="1">
         <w:r>
@@ -16621,7 +16824,7 @@
         <w:rPr>
           <w:rFonts w:ascii="Calibri" w:hAnsi="Calibri" w:cs="Calibri"/>
         </w:rPr>
-        <w:t>. The remaining Done conditions are implementation gates, not claims about the current repository. The P10B-16P-01 through P10B-16P-05A plus P10B-16P-06 sequence is a mandatory convergence package between P10B-16 and P10B-17; it supplements rather than renumbers the locked P10B-01 through P10B-18 plan. P10B-16P-05B follows accepted P10B-18C and is now Baseline. P10B-18D completed as a rejected-quality diagnostic. P10B-19 PRE is Baseline. P10B-19A-01 through P10B-19A-07, P10B-19A-08A and P10B-19A-08B are Baseline; parent P10B-19A-08 and P10B-19A are Partial; P10B-19A-08C - Deterministic Candidate Selection is the exact next implementation task; P10B-19A-09 remains Planned after P10B-19A-08C; P10B-19B through P10B-19J remain Planned.</w:t>
+        <w:t>. The remaining Done conditions are implementation gates, not claims about the current repository. The P10B-16P-01 through P10B-16P-05A plus P10B-16P-06 sequence is a mandatory convergence package between P10B-16 and P10B-17; it supplements rather than renumbers the locked P10B-01 through P10B-18 plan. P10B-16P-05B follows accepted P10B-18C and is now Baseline. P10B-18D completed as a rejected-quality diagnostic. P10B-19 PRE is Baseline. P10B-19A-01 through P10B-19A-07 and P10B-19A-08A through P10B-19A-08C are Baseline; parent P10B-19A-08 is Baseline / closed, while P10B-19A remains Partial. P10B-19A-09 is Planned / exact next; P10B-19A-10 remains Planned after P10B-19A-09; P10B-19B through P10B-19J remain Planned.</w:t>
       </w:r>
     </w:p>
     <w:p>
@@ -22080,7 +22283,7 @@
         <w:rPr>
           <w:rFonts w:ascii="Calibri" w:hAnsi="Calibri" w:cs="Calibri"/>
         </w:rPr>
-        <w:t>P10B-18C and P10B-16P-05B are Baseline. P10B-18D is a Baseline diagnostic with live commercial quality rejected. P10B-18 and P10B remain Partial. P10B-19 PRE is Baseline. P10B-19A-01 through P10B-19A-07, P10B-19A-08A and P10B-19A-08B are Baseline; parent P10B-19A-08 and P10B-19A are Partial; P10B-19A-08C - Deterministic Candidate Selection is the exact next implementation task; P10B-19A-09 remains Planned after P10B-19A-08C; P10B-19B through P10B-19J remain Planned.</w:t>
+        <w:t>P10B-18C and P10B-16P-05B are Baseline. P10B-18D is a Baseline diagnostic with live commercial quality rejected. P10B-18 and P10B remain Partial. P10B-19 PRE is Baseline. P10B-19A-01 through P10B-19A-07 and P10B-19A-08A through P10B-19A-08C are Baseline; parent P10B-19A-08 is Baseline / closed, while P10B-19A remains Partial. P10B-19A-09 is Planned / exact next; P10B-19A-10 remains Planned after P10B-19A-09; P10B-19B through P10B-19J remain Planned.</w:t>
       </w:r>
     </w:p>
     <w:p>
@@ -24153,7 +24356,7 @@
         <w:rPr>
           <w:rFonts w:ascii="Calibri" w:hAnsi="Calibri" w:cs="Calibri"/>
         </w:rPr>
-        <w:t xml:space="preserve"> is Baseline. P10B-19A-01 through P10B-19A-07, P10B-19A-08A and P10B-19A-08B are Baseline; parent P10B-19A-08 and </w:t>
+        <w:t xml:space="preserve"> is Baseline. P10B-19A-01 through P10B-19A-07 and P10B-19A-08A through P10B-19A-08C are Baseline; parent P10B-19A-08 is Baseline / closed, while </w:t>
       </w:r>
       <w:r>
         <w:rPr>
@@ -24167,7 +24370,7 @@
         <w:rPr>
           <w:rFonts w:ascii="Calibri" w:hAnsi="Calibri" w:cs="Calibri"/>
         </w:rPr>
-        <w:t xml:space="preserve"> are Partial; P10B-19A-08C - Deterministic Candidate Selection is the exact next implementation task; P10B-19A-09 remains Planned after P10B-19A-08C; P10B-19B through P10B-19J remain Planned.</w:t>
+        <w:t xml:space="preserve"> remains Partial. P10B-19A-09 is Planned / exact next; P10B-19A-10 remains Planned after P10B-19A-09; P10B-19B through P10B-19J remain Planned.</w:t>
       </w:r>
     </w:p>
     <w:p>
@@ -28162,7 +28365,7 @@
         <w:rPr>
           <w:rFonts w:ascii="Calibri" w:hAnsi="Calibri" w:cs="Calibri"/>
         </w:rPr>
-        <w:t xml:space="preserve"> with zero primary FAIL. P10B-16P-05B subsequently removed the one-time capture platform while retaining the bounded quality gate. P10B-18D subsequently completed as a rejected-quality diagnostic. P10B-19 PRE is Baseline. P10B-19A-01 through P10B-19A-07, P10B-19A-08A and P10B-19A-08B are Baseline; parent P10B-19A-08 and P10B-19A are Partial; P10B-19A-08C - Deterministic Candidate Selection is the exact next implementation task; P10B-19A-09 remains Planned after P10B-19A-08C.</w:t>
+        <w:t xml:space="preserve"> with zero primary FAIL. P10B-16P-05B subsequently removed the one-time capture platform while retaining the bounded quality gate. P10B-18D subsequently completed as a rejected-quality diagnostic. P10B-19 PRE is Baseline. P10B-19A-01 through P10B-19A-07 and P10B-19A-08A through P10B-19A-08C are Baseline; parent P10B-19A-08 is Baseline / closed, while P10B-19A remains Partial. P10B-19A-09 is Planned / exact next, and P10B-19A-10 remains Planned after P10B-19A-09.</w:t>
       </w:r>
     </w:p>
     <w:p>
@@ -28470,7 +28673,7 @@
               <w:rPr>
                 <w:rFonts w:ascii="Calibri" w:hAnsi="Calibri" w:cs="Calibri"/>
               </w:rPr>
-              <w:t>Partial</w:t>
+              <w:t>Baseline</w:t>
             </w:r>
           </w:p>
         </w:tc>
@@ -28508,7 +28711,7 @@
                 <w:b/>
                 <w:bCs/>
               </w:rPr>
-              <w:t>Partial</w:t>
+              <w:t>Baseline / closed</w:t>
             </w:r>
           </w:p>
         </w:tc>
@@ -28526,7 +28729,7 @@
               <w:rPr>
                 <w:rFonts w:ascii="Calibri" w:hAnsi="Calibri" w:cs="Calibri"/>
               </w:rPr>
-              <w:t>A-08A normalized topology and A-08B compatibility are Baseline; deterministic selection remains incomplete</w:t>
+              <w:t>A-08A normalized topology, A-08B compatibility and A-08C deterministic selection complete the accepted parent outcome</w:t>
             </w:r>
           </w:p>
         </w:tc>
@@ -29270,7 +29473,7 @@
               <w:rPr>
                 <w:rFonts w:ascii="Calibri" w:hAnsi="Calibri" w:cs="Calibri"/>
               </w:rPr>
-              <w:t>Next</w:t>
+              <w:t>Baseline</w:t>
             </w:r>
           </w:p>
         </w:tc>
@@ -29308,7 +29511,7 @@
                 <w:b/>
                 <w:bCs/>
               </w:rPr>
-              <w:t>Planned / exact next</w:t>
+              <w:t>Baseline</w:t>
             </w:r>
           </w:p>
         </w:tc>
@@ -29326,7 +29529,7 @@
               <w:rPr>
                 <w:rFonts w:ascii="Calibri" w:hAnsi="Calibri" w:cs="Calibri"/>
               </w:rPr>
-              <w:t>Deterministic Candidate Selection</w:t>
+              <w:t>Scoring-free deterministic selection, identity-free complete topology, immutable replay receipt and zero runtime reach</w:t>
             </w:r>
           </w:p>
         </w:tc>
@@ -29350,7 +29553,7 @@
               <w:rPr>
                 <w:rFonts w:ascii="Calibri" w:hAnsi="Calibri" w:cs="Calibri"/>
               </w:rPr>
-              <w:t>Planned</w:t>
+              <w:t>Next</w:t>
             </w:r>
           </w:p>
         </w:tc>
@@ -29388,7 +29591,7 @@
                 <w:b/>
                 <w:bCs/>
               </w:rPr>
-              <w:t>Planned</w:t>
+              <w:t>Planned / exact next</w:t>
             </w:r>
           </w:p>
         </w:tc>
@@ -29406,7 +29609,7 @@
               <w:rPr>
                 <w:rFonts w:ascii="Calibri" w:hAnsi="Calibri" w:cs="Calibri"/>
               </w:rPr>
-              <w:t>v1 read/render/migration/publication compatibility after P10B-19A-08C</w:t>
+              <w:t>v1 read/render/migration/publication compatibility after completed P10B-19A-08</w:t>
             </w:r>
           </w:p>
         </w:tc>
@@ -29448,7 +29651,7 @@
               <w:rPr>
                 <w:rFonts w:ascii="Calibri" w:hAnsi="Calibri" w:cs="Calibri"/>
               </w:rPr>
-              <w:t>P10B-19B through P10B-19J</w:t>
+              <w:t>P10B-19A-10</w:t>
             </w:r>
           </w:p>
         </w:tc>
@@ -29486,6 +29689,86 @@
               <w:rPr>
                 <w:rFonts w:ascii="Calibri" w:hAnsi="Calibri" w:cs="Calibri"/>
               </w:rPr>
+              <w:t>Retained matrices, integration and P10B-19A closure after P10B-19A-09</w:t>
+            </w:r>
+          </w:p>
+        </w:tc>
+      </w:tr>
+      <w:tr>
+        <w:trPr>
+          <w:cantSplit/>
+        </w:trPr>
+        <w:tc>
+          <w:tcPr>
+            <w:tcW w:w="1000" w:type="dxa"/>
+            <w:vAlign w:val="center"/>
+          </w:tcPr>
+          <w:p>
+            <w:pPr>
+              <w:pStyle w:val="TableText"/>
+              <w:jc w:val="center"/>
+              <w:widowControl/>
+            </w:pPr>
+            <w:r>
+              <w:rPr>
+                <w:rFonts w:ascii="Calibri" w:hAnsi="Calibri" w:cs="Calibri"/>
+              </w:rPr>
+              <w:t>Planned</w:t>
+            </w:r>
+          </w:p>
+        </w:tc>
+        <w:tc>
+          <w:tcPr>
+            <w:tcW w:w="1500" w:type="dxa"/>
+            <w:vAlign w:val="center"/>
+          </w:tcPr>
+          <w:p>
+            <w:pPr>
+              <w:pStyle w:val="TableText"/>
+              <w:widowControl/>
+            </w:pPr>
+            <w:r>
+              <w:rPr>
+                <w:rFonts w:ascii="Calibri" w:hAnsi="Calibri" w:cs="Calibri"/>
+              </w:rPr>
+              <w:t>P10B-19B through P10B-19J</w:t>
+            </w:r>
+          </w:p>
+        </w:tc>
+        <w:tc>
+          <w:tcPr>
+            <w:tcW w:w="2000" w:type="dxa"/>
+            <w:vAlign w:val="center"/>
+          </w:tcPr>
+          <w:p>
+            <w:pPr>
+              <w:pStyle w:val="TableText"/>
+              <w:widowControl/>
+            </w:pPr>
+            <w:r>
+              <w:rPr>
+                <w:rFonts w:ascii="Calibri" w:hAnsi="Calibri" w:cs="Calibri"/>
+                <w:b/>
+                <w:bCs/>
+              </w:rPr>
+              <w:t>Planned</w:t>
+            </w:r>
+          </w:p>
+        </w:tc>
+        <w:tc>
+          <w:tcPr>
+            <w:tcW w:w="8460" w:type="dxa"/>
+            <w:vAlign w:val="center"/>
+          </w:tcPr>
+          <w:p>
+            <w:pPr>
+              <w:pStyle w:val="TableText"/>
+              <w:widowControl/>
+            </w:pPr>
+            <w:r>
+              <w:rPr>
+                <w:rFonts w:ascii="Calibri" w:hAnsi="Calibri" w:cs="Calibri"/>
+              </w:rPr>
               <w:t>Granular Visual Recipe, frame, homepage, discovery, PDP, content/utility, multi-concept, critic, and final live-acceptance packages</w:t>
             </w:r>
           </w:p>
@@ -29824,39 +30107,55 @@
         <w:rPr>
           <w:rFonts w:ascii="Calibri" w:hAnsi="Calibri" w:cs="Calibri"/>
         </w:rPr>
-        <w:t>P10B-19A-08 = Partial</w:t>
-      </w:r>
-    </w:p>
-    <w:p>
-      <w:pPr>
-        <w:pStyle w:val="Normal"/>
-        <w:numPr>
-          <w:ilvl w:val="0"/>
-          <w:numId w:val="1"/>
-        </w:numPr>
-        <w:widowControl/>
-      </w:pPr>
-      <w:r>
-        <w:rPr>
-          <w:rFonts w:ascii="Calibri" w:hAnsi="Calibri" w:cs="Calibri"/>
-        </w:rPr>
-        <w:t>P10B-19A-08C = exact next implementation task</w:t>
-      </w:r>
-    </w:p>
-    <w:p>
-      <w:pPr>
-        <w:pStyle w:val="Normal"/>
-        <w:numPr>
-          <w:ilvl w:val="0"/>
-          <w:numId w:val="1"/>
-        </w:numPr>
-        <w:widowControl/>
-      </w:pPr>
-      <w:r>
-        <w:rPr>
-          <w:rFonts w:ascii="Calibri" w:hAnsi="Calibri" w:cs="Calibri"/>
-        </w:rPr>
-        <w:t>P10B-19A-09 = Planned after P10B-19A-08C</w:t>
+        <w:t>P10B-19A-08C = Baseline</w:t>
+      </w:r>
+    </w:p>
+    <w:p>
+      <w:pPr>
+        <w:pStyle w:val="Normal"/>
+        <w:numPr>
+          <w:ilvl w:val="0"/>
+          <w:numId w:val="1"/>
+        </w:numPr>
+        <w:widowControl/>
+      </w:pPr>
+      <w:r>
+        <w:rPr>
+          <w:rFonts w:ascii="Calibri" w:hAnsi="Calibri" w:cs="Calibri"/>
+        </w:rPr>
+        <w:t>P10B-19A-08 = Baseline / closed</w:t>
+      </w:r>
+    </w:p>
+    <w:p>
+      <w:pPr>
+        <w:pStyle w:val="Normal"/>
+        <w:numPr>
+          <w:ilvl w:val="0"/>
+          <w:numId w:val="1"/>
+        </w:numPr>
+        <w:widowControl/>
+      </w:pPr>
+      <w:r>
+        <w:rPr>
+          <w:rFonts w:ascii="Calibri" w:hAnsi="Calibri" w:cs="Calibri"/>
+        </w:rPr>
+        <w:t>P10B-19A-09 = Planned / exact next implementation task</w:t>
+      </w:r>
+    </w:p>
+    <w:p>
+      <w:pPr>
+        <w:pStyle w:val="Normal"/>
+        <w:numPr>
+          <w:ilvl w:val="0"/>
+          <w:numId w:val="1"/>
+        </w:numPr>
+        <w:widowControl/>
+      </w:pPr>
+      <w:r>
+        <w:rPr>
+          <w:rFonts w:ascii="Calibri" w:hAnsi="Calibri" w:cs="Calibri"/>
+        </w:rPr>
+        <w:t>P10B-19A-10 = Planned after P10B-19A-09</w:t>
       </w:r>
     </w:p>
     <w:p>

</xml_diff>

<commit_message>
feat: add legacy v1 replay alias authority
</commit_message>
<xml_diff>
--- a/docs/VESKIFY_DEVELOPMENT_DELIVERY_TRACKER_v1.3.0.docx
+++ b/docs/VESKIFY_DEVELOPMENT_DELIVERY_TRACKER_v1.3.0.docx
@@ -38,7 +38,7 @@
         <w:rPr>
           <w:rFonts w:ascii="Calibri" w:hAnsi="Calibri" w:cs="Calibri"/>
         </w:rPr>
-        <w:t>Delivery status baseline: 2 September 2026, P10B-19A-08C Deterministic Candidate Selection Baseline</w:t>
+        <w:t>Delivery status baseline: 2 September 2026, P10B-19A-09A Legacy v1 Replay Alias and Compatibility Reference Baseline</w:t>
       </w:r>
     </w:p>
     <w:p>
@@ -249,7 +249,7 @@
               <w:rPr>
                 <w:rFonts w:ascii="Calibri" w:hAnsi="Calibri" w:cs="Calibri"/>
               </w:rPr>
-              <w:t>2 September 2026, P10B-19A-08C Deterministic Candidate Selection Baseline</w:t>
+              <w:t>2 September 2026, P10B-19A-09A Legacy v1 Replay Alias and Compatibility Reference Baseline</w:t>
             </w:r>
           </w:p>
         </w:tc>
@@ -9549,7 +9549,7 @@
                 <w:b/>
                 <w:bCs/>
               </w:rPr>
-              <w:t>Planned / exact next</w:t>
+              <w:t>Partial</w:t>
             </w:r>
           </w:p>
         </w:tc>
@@ -9567,7 +9567,7 @@
               <w:rPr>
                 <w:rFonts w:ascii="Calibri" w:hAnsi="Calibri" w:cs="Calibri"/>
               </w:rPr>
-              <w:t>Planned task owner</w:t>
+              <w:t>P10B-19A task owner</w:t>
             </w:r>
           </w:p>
         </w:tc>
@@ -9603,7 +9603,7 @@
               <w:rPr>
                 <w:rFonts w:ascii="Calibri" w:hAnsi="Calibri" w:cs="Calibri"/>
               </w:rPr>
-              <w:t>Preserve v1 read, render, migration and publication compatibility after the complete A-08 delivery</w:t>
+              <w:t>A-09A opaque alias/reference authority is Baseline; A-09B historical read/render replay and A-09C publication replay remain</w:t>
             </w:r>
           </w:p>
         </w:tc>
@@ -9627,7 +9627,7 @@
               <w:rPr>
                 <w:rFonts w:ascii="Calibri" w:hAnsi="Calibri" w:cs="Calibri"/>
               </w:rPr>
-              <w:t>☐</w:t>
+              <w:t>☑</w:t>
             </w:r>
           </w:p>
         </w:tc>
@@ -9645,7 +9645,7 @@
               <w:rPr>
                 <w:rFonts w:ascii="Calibri" w:hAnsi="Calibri" w:cs="Calibri"/>
               </w:rPr>
-              <w:t>P10B-19A-10</w:t>
+              <w:t>P10B-19A-09A</w:t>
             </w:r>
           </w:p>
         </w:tc>
@@ -9663,7 +9663,7 @@
               <w:rPr>
                 <w:rFonts w:ascii="Calibri" w:hAnsi="Calibri" w:cs="Calibri"/>
               </w:rPr>
-              <w:t>Retained matrices, integration and P10B-19A closure</w:t>
+              <w:t>Legacy v1 Replay Alias and Compatibility Reference</w:t>
             </w:r>
           </w:p>
         </w:tc>
@@ -9684,6 +9684,276 @@
                 <w:b/>
                 <w:bCs/>
               </w:rPr>
+              <w:t>Baseline</w:t>
+            </w:r>
+          </w:p>
+        </w:tc>
+        <w:tc>
+          <w:tcPr>
+            <w:tcW w:w="1500" w:type="dxa"/>
+            <w:vAlign w:val="center"/>
+          </w:tcPr>
+          <w:p>
+            <w:pPr>
+              <w:pStyle w:val="CompactTableText"/>
+              <w:widowControl/>
+            </w:pPr>
+            <w:r>
+              <w:rPr>
+                <w:rFonts w:ascii="Calibri" w:hAnsi="Calibri" w:cs="Calibri"/>
+              </w:rPr>
+              <w:t>P10B-19A task owner</w:t>
+            </w:r>
+          </w:p>
+        </w:tc>
+        <w:tc>
+          <w:tcPr>
+            <w:tcW w:w="2500" w:type="dxa"/>
+            <w:vAlign w:val="center"/>
+          </w:tcPr>
+          <w:p>
+            <w:pPr>
+              <w:pStyle w:val="CompactTableText"/>
+              <w:widowControl/>
+            </w:pPr>
+            <w:r>
+              <w:rPr>
+                <w:rFonts w:ascii="Calibri" w:hAnsi="Calibri" w:cs="Calibri"/>
+              </w:rPr>
+              <w:t>P10B-19A-08C merged</w:t>
+            </w:r>
+          </w:p>
+        </w:tc>
+        <w:tc>
+          <w:tcPr>
+            <w:tcW w:w="2890" w:type="dxa"/>
+            <w:vAlign w:val="center"/>
+          </w:tcPr>
+          <w:p>
+            <w:pPr>
+              <w:pStyle w:val="CompactTableText"/>
+              <w:widowControl/>
+            </w:pPr>
+            <w:r>
+              <w:rPr>
+                <w:rFonts w:ascii="Calibri" w:hAnsi="Calibri" w:cs="Calibri"/>
+              </w:rPr>
+              <w:t>Exact three opaque aliases, current 1.1.0 direction binding, strict v1 narrowing replay identity, selectionId exclusion and fail-closed stale checks</w:t>
+            </w:r>
+          </w:p>
+        </w:tc>
+      </w:tr>
+      <w:tr>
+        <w:trPr>
+          <w:cantSplit/>
+        </w:trPr>
+        <w:tc>
+          <w:tcPr>
+            <w:tcW w:w="720" w:type="dxa"/>
+            <w:vAlign w:val="center"/>
+          </w:tcPr>
+          <w:p>
+            <w:pPr>
+              <w:pStyle w:val="CompactTableText"/>
+              <w:jc w:val="center"/>
+              <w:widowControl/>
+            </w:pPr>
+            <w:r>
+              <w:rPr>
+                <w:rFonts w:ascii="Calibri" w:hAnsi="Calibri" w:cs="Calibri"/>
+              </w:rPr>
+              <w:t>☐</w:t>
+            </w:r>
+          </w:p>
+        </w:tc>
+        <w:tc>
+          <w:tcPr>
+            <w:tcW w:w="1700" w:type="dxa"/>
+            <w:vAlign w:val="center"/>
+          </w:tcPr>
+          <w:p>
+            <w:pPr>
+              <w:pStyle w:val="CompactTableText"/>
+              <w:widowControl/>
+            </w:pPr>
+            <w:r>
+              <w:rPr>
+                <w:rFonts w:ascii="Calibri" w:hAnsi="Calibri" w:cs="Calibri"/>
+              </w:rPr>
+              <w:t>P10B-19A-09B</w:t>
+            </w:r>
+          </w:p>
+        </w:tc>
+        <w:tc>
+          <w:tcPr>
+            <w:tcW w:w="2800" w:type="dxa"/>
+            <w:vAlign w:val="center"/>
+          </w:tcPr>
+          <w:p>
+            <w:pPr>
+              <w:pStyle w:val="CompactTableText"/>
+              <w:widowControl/>
+            </w:pPr>
+            <w:r>
+              <w:rPr>
+                <w:rFonts w:ascii="Calibri" w:hAnsi="Calibri" w:cs="Calibri"/>
+              </w:rPr>
+              <w:t>Historical v1 Snapshot Read and Render Replay</w:t>
+            </w:r>
+          </w:p>
+        </w:tc>
+        <w:tc>
+          <w:tcPr>
+            <w:tcW w:w="850" w:type="dxa"/>
+            <w:vAlign w:val="center"/>
+          </w:tcPr>
+          <w:p>
+            <w:pPr>
+              <w:pStyle w:val="CompactTableText"/>
+              <w:jc w:val="center"/>
+              <w:widowControl/>
+            </w:pPr>
+            <w:r>
+              <w:rPr>
+                <w:rFonts w:ascii="Calibri" w:hAnsi="Calibri" w:cs="Calibri"/>
+                <w:b/>
+                <w:bCs/>
+              </w:rPr>
+              <w:t>Planned / exact next</w:t>
+            </w:r>
+          </w:p>
+        </w:tc>
+        <w:tc>
+          <w:tcPr>
+            <w:tcW w:w="1500" w:type="dxa"/>
+            <w:vAlign w:val="center"/>
+          </w:tcPr>
+          <w:p>
+            <w:pPr>
+              <w:pStyle w:val="CompactTableText"/>
+              <w:widowControl/>
+            </w:pPr>
+            <w:r>
+              <w:rPr>
+                <w:rFonts w:ascii="Calibri" w:hAnsi="Calibri" w:cs="Calibri"/>
+              </w:rPr>
+              <w:t>Planned task owner</w:t>
+            </w:r>
+          </w:p>
+        </w:tc>
+        <w:tc>
+          <w:tcPr>
+            <w:tcW w:w="2500" w:type="dxa"/>
+            <w:vAlign w:val="center"/>
+          </w:tcPr>
+          <w:p>
+            <w:pPr>
+              <w:pStyle w:val="CompactTableText"/>
+              <w:widowControl/>
+            </w:pPr>
+            <w:r>
+              <w:rPr>
+                <w:rFonts w:ascii="Calibri" w:hAnsi="Calibri" w:cs="Calibri"/>
+              </w:rPr>
+              <w:t>P10B-19A-09A merged</w:t>
+            </w:r>
+          </w:p>
+        </w:tc>
+        <w:tc>
+          <w:tcPr>
+            <w:tcW w:w="2890" w:type="dxa"/>
+            <w:vAlign w:val="center"/>
+          </w:tcPr>
+          <w:p>
+            <w:pPr>
+              <w:pStyle w:val="CompactTableText"/>
+              <w:widowControl/>
+            </w:pPr>
+            <w:r>
+              <w:rPr>
+                <w:rFonts w:ascii="Calibri" w:hAnsi="Calibri" w:cs="Calibri"/>
+              </w:rPr>
+              <w:t>Read historical v1 snapshots and prove exact render replay without inference or write-back</w:t>
+            </w:r>
+          </w:p>
+        </w:tc>
+      </w:tr>
+      <w:tr>
+        <w:trPr>
+          <w:cantSplit/>
+        </w:trPr>
+        <w:tc>
+          <w:tcPr>
+            <w:tcW w:w="720" w:type="dxa"/>
+            <w:vAlign w:val="center"/>
+          </w:tcPr>
+          <w:p>
+            <w:pPr>
+              <w:pStyle w:val="CompactTableText"/>
+              <w:jc w:val="center"/>
+              <w:widowControl/>
+            </w:pPr>
+            <w:r>
+              <w:rPr>
+                <w:rFonts w:ascii="Calibri" w:hAnsi="Calibri" w:cs="Calibri"/>
+              </w:rPr>
+              <w:t>☐</w:t>
+            </w:r>
+          </w:p>
+        </w:tc>
+        <w:tc>
+          <w:tcPr>
+            <w:tcW w:w="1700" w:type="dxa"/>
+            <w:vAlign w:val="center"/>
+          </w:tcPr>
+          <w:p>
+            <w:pPr>
+              <w:pStyle w:val="CompactTableText"/>
+              <w:widowControl/>
+            </w:pPr>
+            <w:r>
+              <w:rPr>
+                <w:rFonts w:ascii="Calibri" w:hAnsi="Calibri" w:cs="Calibri"/>
+              </w:rPr>
+              <w:t>P10B-19A-09C</w:t>
+            </w:r>
+          </w:p>
+        </w:tc>
+        <w:tc>
+          <w:tcPr>
+            <w:tcW w:w="2800" w:type="dxa"/>
+            <w:vAlign w:val="center"/>
+          </w:tcPr>
+          <w:p>
+            <w:pPr>
+              <w:pStyle w:val="CompactTableText"/>
+              <w:widowControl/>
+            </w:pPr>
+            <w:r>
+              <w:rPr>
+                <w:rFonts w:ascii="Calibri" w:hAnsi="Calibri" w:cs="Calibri"/>
+              </w:rPr>
+              <w:t>Publication Replay and A-09 Closure</w:t>
+            </w:r>
+          </w:p>
+        </w:tc>
+        <w:tc>
+          <w:tcPr>
+            <w:tcW w:w="850" w:type="dxa"/>
+            <w:vAlign w:val="center"/>
+          </w:tcPr>
+          <w:p>
+            <w:pPr>
+              <w:pStyle w:val="CompactTableText"/>
+              <w:jc w:val="center"/>
+              <w:widowControl/>
+            </w:pPr>
+            <w:r>
+              <w:rPr>
+                <w:rFonts w:ascii="Calibri" w:hAnsi="Calibri" w:cs="Calibri"/>
+                <w:b/>
+                <w:bCs/>
+              </w:rPr>
               <w:t>Planned</w:t>
             </w:r>
           </w:p>
@@ -9720,7 +9990,142 @@
               <w:rPr>
                 <w:rFonts w:ascii="Calibri" w:hAnsi="Calibri" w:cs="Calibri"/>
               </w:rPr>
-              <w:t>P10B-19A-09 merged</w:t>
+              <w:t>P10B-19A-09B merged</w:t>
+            </w:r>
+          </w:p>
+        </w:tc>
+        <w:tc>
+          <w:tcPr>
+            <w:tcW w:w="2890" w:type="dxa"/>
+            <w:vAlign w:val="center"/>
+          </w:tcPr>
+          <w:p>
+            <w:pPr>
+              <w:pStyle w:val="CompactTableText"/>
+              <w:widowControl/>
+            </w:pPr>
+            <w:r>
+              <w:rPr>
+                <w:rFonts w:ascii="Calibri" w:hAnsi="Calibri" w:cs="Calibri"/>
+              </w:rPr>
+              <w:t>Prove publication replay and close parent A-09 without changing current generation</w:t>
+            </w:r>
+          </w:p>
+        </w:tc>
+      </w:tr>
+      <w:tr>
+        <w:trPr>
+          <w:cantSplit/>
+        </w:trPr>
+        <w:tc>
+          <w:tcPr>
+            <w:tcW w:w="720" w:type="dxa"/>
+            <w:vAlign w:val="center"/>
+          </w:tcPr>
+          <w:p>
+            <w:pPr>
+              <w:pStyle w:val="CompactTableText"/>
+              <w:jc w:val="center"/>
+              <w:widowControl/>
+            </w:pPr>
+            <w:r>
+              <w:rPr>
+                <w:rFonts w:ascii="Calibri" w:hAnsi="Calibri" w:cs="Calibri"/>
+              </w:rPr>
+              <w:t>☐</w:t>
+            </w:r>
+          </w:p>
+        </w:tc>
+        <w:tc>
+          <w:tcPr>
+            <w:tcW w:w="1700" w:type="dxa"/>
+            <w:vAlign w:val="center"/>
+          </w:tcPr>
+          <w:p>
+            <w:pPr>
+              <w:pStyle w:val="CompactTableText"/>
+              <w:widowControl/>
+            </w:pPr>
+            <w:r>
+              <w:rPr>
+                <w:rFonts w:ascii="Calibri" w:hAnsi="Calibri" w:cs="Calibri"/>
+              </w:rPr>
+              <w:t>P10B-19A-10</w:t>
+            </w:r>
+          </w:p>
+        </w:tc>
+        <w:tc>
+          <w:tcPr>
+            <w:tcW w:w="2800" w:type="dxa"/>
+            <w:vAlign w:val="center"/>
+          </w:tcPr>
+          <w:p>
+            <w:pPr>
+              <w:pStyle w:val="CompactTableText"/>
+              <w:widowControl/>
+            </w:pPr>
+            <w:r>
+              <w:rPr>
+                <w:rFonts w:ascii="Calibri" w:hAnsi="Calibri" w:cs="Calibri"/>
+              </w:rPr>
+              <w:t>Retained matrices, integration and P10B-19A closure</w:t>
+            </w:r>
+          </w:p>
+        </w:tc>
+        <w:tc>
+          <w:tcPr>
+            <w:tcW w:w="850" w:type="dxa"/>
+            <w:vAlign w:val="center"/>
+          </w:tcPr>
+          <w:p>
+            <w:pPr>
+              <w:pStyle w:val="CompactTableText"/>
+              <w:jc w:val="center"/>
+              <w:widowControl/>
+            </w:pPr>
+            <w:r>
+              <w:rPr>
+                <w:rFonts w:ascii="Calibri" w:hAnsi="Calibri" w:cs="Calibri"/>
+                <w:b/>
+                <w:bCs/>
+              </w:rPr>
+              <w:t>Planned</w:t>
+            </w:r>
+          </w:p>
+        </w:tc>
+        <w:tc>
+          <w:tcPr>
+            <w:tcW w:w="1500" w:type="dxa"/>
+            <w:vAlign w:val="center"/>
+          </w:tcPr>
+          <w:p>
+            <w:pPr>
+              <w:pStyle w:val="CompactTableText"/>
+              <w:widowControl/>
+            </w:pPr>
+            <w:r>
+              <w:rPr>
+                <w:rFonts w:ascii="Calibri" w:hAnsi="Calibri" w:cs="Calibri"/>
+              </w:rPr>
+              <w:t>Planned task owner</w:t>
+            </w:r>
+          </w:p>
+        </w:tc>
+        <w:tc>
+          <w:tcPr>
+            <w:tcW w:w="2500" w:type="dxa"/>
+            <w:vAlign w:val="center"/>
+          </w:tcPr>
+          <w:p>
+            <w:pPr>
+              <w:pStyle w:val="CompactTableText"/>
+              <w:widowControl/>
+            </w:pPr>
+            <w:r>
+              <w:rPr>
+                <w:rFonts w:ascii="Calibri" w:hAnsi="Calibri" w:cs="Calibri"/>
+              </w:rPr>
+              <w:t>P10B-19A-09C merged</w:t>
             </w:r>
           </w:p>
         </w:tc>
@@ -14111,7 +14516,7 @@
         <w:rPr>
           <w:rFonts w:ascii="Calibri" w:hAnsi="Calibri" w:cs="Calibri"/>
         </w:rPr>
-        <w:t xml:space="preserve">P10B remains Partial. DEVX-01A through DEVX-01G are Baseline, and DEVX-01 is Baseline / closed. P10B-19A-01 through P10B-19A-07 and P10B-19A-08A through P10B-19A-08C are Baseline; parent P10B-19A-08 is Baseline / closed, while P10B-19A remains Partial; P10B-19A-09 is Planned / exact next; P10B-19A-10 remains Planned after P10B-19A-09; P10B remains Partial. DEVX-01C measured the serial gate, retained PR/ref-scoped cancellation and added compatible </w:t>
+        <w:t xml:space="preserve">P10B remains Partial. DEVX-01A through DEVX-01G are Baseline, and DEVX-01 is Baseline / closed. P10B-19A-01 through P10B-19A-07 and P10B-19A-08A through P10B-19A-08C are Baseline; parent P10B-19A-08 is Baseline / closed; P10B-19A-09A is Baseline; parent P10B-19A-09 and P10B-19A remain Partial; P10B-19A-09B is the exact next implementation task; P10B-19A-09C is Planned after A-09B; P10B-19A-10 is Planned after A-09C; P10B remains Partial. DEVX-01C measured the serial gate, retained PR/ref-scoped cancellation and added compatible </w:t>
       </w:r>
       <w:r>
         <w:rPr>
@@ -15014,6 +15419,183 @@
               <w:rPr>
                 <w:rFonts w:ascii="Calibri" w:hAnsi="Calibri" w:cs="Calibri"/>
               </w:rPr>
+              <w:t>9A</w:t>
+            </w:r>
+          </w:p>
+        </w:tc>
+        <w:tc>
+          <w:tcPr>
+            <w:tcW w:w="7600" w:type="dxa"/>
+            <w:vAlign w:val="center"/>
+          </w:tcPr>
+          <w:p>
+            <w:pPr>
+              <w:pStyle w:val="TableText"/>
+              <w:widowControl/>
+            </w:pPr>
+            <w:r>
+              <w:rPr>
+                <w:rFonts w:ascii="Calibri" w:hAnsi="Calibri" w:cs="Calibri"/>
+              </w:rPr>
+              <w:t>P10B-19A-09A - Legacy v1 Replay Alias and Compatibility Reference</w:t>
+            </w:r>
+          </w:p>
+        </w:tc>
+        <w:tc>
+          <w:tcPr>
+            <w:tcW w:w="4460" w:type="dxa"/>
+            <w:vAlign w:val="center"/>
+          </w:tcPr>
+          <w:p>
+            <w:pPr>
+              <w:pStyle w:val="TableText"/>
+              <w:widowControl/>
+            </w:pPr>
+            <w:r>
+              <w:rPr>
+                <w:rFonts w:ascii="Calibri" w:hAnsi="Calibri" w:cs="Calibri"/>
+              </w:rPr>
+              <w:t>A-08C merged</w:t>
+            </w:r>
+          </w:p>
+        </w:tc>
+      </w:tr>
+      <w:tr>
+        <w:trPr>
+          <w:cantSplit/>
+        </w:trPr>
+        <w:tc>
+          <w:tcPr>
+            <w:tcW w:w="900" w:type="dxa"/>
+            <w:vAlign w:val="center"/>
+          </w:tcPr>
+          <w:p>
+            <w:pPr>
+              <w:pStyle w:val="TableText"/>
+              <w:widowControl/>
+            </w:pPr>
+            <w:r>
+              <w:rPr>
+                <w:rFonts w:ascii="Calibri" w:hAnsi="Calibri" w:cs="Calibri"/>
+              </w:rPr>
+              <w:t>9B</w:t>
+            </w:r>
+          </w:p>
+        </w:tc>
+        <w:tc>
+          <w:tcPr>
+            <w:tcW w:w="7600" w:type="dxa"/>
+            <w:vAlign w:val="center"/>
+          </w:tcPr>
+          <w:p>
+            <w:pPr>
+              <w:pStyle w:val="TableText"/>
+              <w:widowControl/>
+            </w:pPr>
+            <w:r>
+              <w:rPr>
+                <w:rFonts w:ascii="Calibri" w:hAnsi="Calibri" w:cs="Calibri"/>
+              </w:rPr>
+              <w:t>P10B-19A-09B - Historical v1 Snapshot Read and Render Replay</w:t>
+            </w:r>
+          </w:p>
+        </w:tc>
+        <w:tc>
+          <w:tcPr>
+            <w:tcW w:w="4460" w:type="dxa"/>
+            <w:vAlign w:val="center"/>
+          </w:tcPr>
+          <w:p>
+            <w:pPr>
+              <w:pStyle w:val="TableText"/>
+              <w:widowControl/>
+            </w:pPr>
+            <w:r>
+              <w:rPr>
+                <w:rFonts w:ascii="Calibri" w:hAnsi="Calibri" w:cs="Calibri"/>
+              </w:rPr>
+              <w:t>A-09A merged</w:t>
+            </w:r>
+          </w:p>
+        </w:tc>
+      </w:tr>
+      <w:tr>
+        <w:trPr>
+          <w:cantSplit/>
+        </w:trPr>
+        <w:tc>
+          <w:tcPr>
+            <w:tcW w:w="900" w:type="dxa"/>
+            <w:vAlign w:val="center"/>
+          </w:tcPr>
+          <w:p>
+            <w:pPr>
+              <w:pStyle w:val="TableText"/>
+              <w:widowControl/>
+            </w:pPr>
+            <w:r>
+              <w:rPr>
+                <w:rFonts w:ascii="Calibri" w:hAnsi="Calibri" w:cs="Calibri"/>
+              </w:rPr>
+              <w:t>9C</w:t>
+            </w:r>
+          </w:p>
+        </w:tc>
+        <w:tc>
+          <w:tcPr>
+            <w:tcW w:w="7600" w:type="dxa"/>
+            <w:vAlign w:val="center"/>
+          </w:tcPr>
+          <w:p>
+            <w:pPr>
+              <w:pStyle w:val="TableText"/>
+              <w:widowControl/>
+            </w:pPr>
+            <w:r>
+              <w:rPr>
+                <w:rFonts w:ascii="Calibri" w:hAnsi="Calibri" w:cs="Calibri"/>
+              </w:rPr>
+              <w:t>P10B-19A-09C - Publication Replay and A-09 Closure</w:t>
+            </w:r>
+          </w:p>
+        </w:tc>
+        <w:tc>
+          <w:tcPr>
+            <w:tcW w:w="4460" w:type="dxa"/>
+            <w:vAlign w:val="center"/>
+          </w:tcPr>
+          <w:p>
+            <w:pPr>
+              <w:pStyle w:val="TableText"/>
+              <w:widowControl/>
+            </w:pPr>
+            <w:r>
+              <w:rPr>
+                <w:rFonts w:ascii="Calibri" w:hAnsi="Calibri" w:cs="Calibri"/>
+              </w:rPr>
+              <w:t>A-09B merged</w:t>
+            </w:r>
+          </w:p>
+        </w:tc>
+      </w:tr>
+      <w:tr>
+        <w:trPr>
+          <w:cantSplit/>
+        </w:trPr>
+        <w:tc>
+          <w:tcPr>
+            <w:tcW w:w="900" w:type="dxa"/>
+            <w:vAlign w:val="center"/>
+          </w:tcPr>
+          <w:p>
+            <w:pPr>
+              <w:pStyle w:val="TableText"/>
+              <w:widowControl/>
+            </w:pPr>
+            <w:r>
+              <w:rPr>
+                <w:rFonts w:ascii="Calibri" w:hAnsi="Calibri" w:cs="Calibri"/>
+              </w:rPr>
               <w:t>10</w:t>
             </w:r>
           </w:p>
@@ -15050,7 +15632,7 @@
               <w:rPr>
                 <w:rFonts w:ascii="Calibri" w:hAnsi="Calibri" w:cs="Calibri"/>
               </w:rPr>
-              <w:t>A-01 through A-09 merged</w:t>
+              <w:t>A-09C merged</w:t>
             </w:r>
           </w:p>
         </w:tc>
@@ -15099,7 +15681,21 @@
         <w:rPr>
           <w:rFonts w:ascii="Calibri" w:hAnsi="Calibri" w:cs="Calibri"/>
         </w:rPr>
-        <w:t xml:space="preserve">, while P10B-19A remains </w:t>
+        <w:t xml:space="preserve">. P10B-19A-09A is </w:t>
+      </w:r>
+      <w:r>
+        <w:rPr>
+          <w:rFonts w:ascii="Calibri" w:hAnsi="Calibri" w:cs="Calibri"/>
+          <w:b/>
+          <w:bCs/>
+        </w:rPr>
+        <w:t>Baseline</w:t>
+      </w:r>
+      <w:r>
+        <w:rPr>
+          <w:rFonts w:ascii="Calibri" w:hAnsi="Calibri" w:cs="Calibri"/>
+        </w:rPr>
+        <w:t xml:space="preserve">; parent P10B-19A-09 and P10B-19A remain </w:t>
       </w:r>
       <w:r>
         <w:rPr>
@@ -15113,21 +15709,21 @@
         <w:rPr>
           <w:rFonts w:ascii="Calibri" w:hAnsi="Calibri" w:cs="Calibri"/>
         </w:rPr>
-        <w:t xml:space="preserve">. P10B-19A-09 is </w:t>
-      </w:r>
-      <w:r>
-        <w:rPr>
-          <w:rFonts w:ascii="Calibri" w:hAnsi="Calibri" w:cs="Calibri"/>
-          <w:b/>
-          <w:bCs/>
-        </w:rPr>
-        <w:t>Planned / exact next</w:t>
-      </w:r>
-      <w:r>
-        <w:rPr>
-          <w:rFonts w:ascii="Calibri" w:hAnsi="Calibri" w:cs="Calibri"/>
-        </w:rPr>
-        <w:t>, and P10B-19A-10 remains Planned after P10B-19A-09.</w:t>
+        <w:t xml:space="preserve">. P10B-19A-09B is the </w:t>
+      </w:r>
+      <w:r>
+        <w:rPr>
+          <w:rFonts w:ascii="Calibri" w:hAnsi="Calibri" w:cs="Calibri"/>
+          <w:b/>
+          <w:bCs/>
+        </w:rPr>
+        <w:t>exact next implementation task</w:t>
+      </w:r>
+      <w:r>
+        <w:rPr>
+          <w:rFonts w:ascii="Calibri" w:hAnsi="Calibri" w:cs="Calibri"/>
+        </w:rPr>
+        <w:t>, P10B-19A-09C is Planned after A-09B, and P10B-19A-10 is Planned after A-09C.</w:t>
       </w:r>
     </w:p>
     <w:p>
@@ -15290,6 +15886,88 @@
           <w:rFonts w:ascii="Calibri" w:hAnsi="Calibri" w:cs="Calibri"/>
         </w:rPr>
         <w:t xml:space="preserve"> deterministic selection requests and immutable receipts over exact A-07/A-08A/A-08B authority. Scoring-free family and PageBlueprint precedence uses case-bound canonical-fingerprint tie-breaks; selection covers all six page families, follows A-06 recursive substitution priority and retains safe omission declarations without executing them. Complete-store combinations share one global 4,096 evaluation bound and yield an identity-free complete topology, while receipt parsing replays selection to reject stale or contradictory authority. Production registry, profile, request, receipt and current-generation runtime counts remain zero; visual behavior, runtime wiring, providers, persistence and publication are unchanged. Parent P10B-19A-08 is Baseline / closed.</w:t>
+      </w:r>
+    </w:p>
+    <w:p>
+      <w:pPr>
+        <w:pStyle w:val="Normal"/>
+        <w:widowControl/>
+      </w:pPr>
+      <w:r>
+        <w:rPr>
+          <w:rFonts w:ascii="Calibri" w:hAnsi="Calibri" w:cs="Calibri"/>
+        </w:rPr>
+        <w:t xml:space="preserve">P10B-19A-09A establishes one immutable populated registry for exactly </w:t>
+      </w:r>
+      <w:r>
+        <w:rPr>
+          <w:rFonts w:ascii="Consolas" w:hAnsi="Consolas" w:cs="Consolas"/>
+          <w:sz w:val="19"/>
+          <w:szCs w:val="19"/>
+        </w:rPr>
+        <w:t>legacy-v1:premium-editorial</w:t>
+      </w:r>
+      <w:r>
+        <w:rPr>
+          <w:rFonts w:ascii="Calibri" w:hAnsi="Calibri" w:cs="Calibri"/>
+        </w:rPr>
+        <w:t xml:space="preserve">, </w:t>
+      </w:r>
+      <w:r>
+        <w:rPr>
+          <w:rFonts w:ascii="Consolas" w:hAnsi="Consolas" w:cs="Consolas"/>
+          <w:sz w:val="19"/>
+          <w:szCs w:val="19"/>
+        </w:rPr>
+        <w:t>legacy-v1:modern-technical</w:t>
+      </w:r>
+      <w:r>
+        <w:rPr>
+          <w:rFonts w:ascii="Calibri" w:hAnsi="Calibri" w:cs="Calibri"/>
+        </w:rPr>
+        <w:t xml:space="preserve">, and </w:t>
+      </w:r>
+      <w:r>
+        <w:rPr>
+          <w:rFonts w:ascii="Consolas" w:hAnsi="Consolas" w:cs="Consolas"/>
+          <w:sz w:val="19"/>
+          <w:szCs w:val="19"/>
+        </w:rPr>
+        <w:t>legacy-v1:minimal-commerce</w:t>
+      </w:r>
+      <w:r>
+        <w:rPr>
+          <w:rFonts w:ascii="Calibri" w:hAnsi="Calibri" w:cs="Calibri"/>
+        </w:rPr>
+        <w:t xml:space="preserve">, bound in order to the existing coordinated directions, current authority version </w:t>
+      </w:r>
+      <w:r>
+        <w:rPr>
+          <w:rFonts w:ascii="Consolas" w:hAnsi="Consolas" w:cs="Consolas"/>
+          <w:sz w:val="19"/>
+          <w:szCs w:val="19"/>
+        </w:rPr>
+        <w:t>1.1.0</w:t>
+      </w:r>
+      <w:r>
+        <w:rPr>
+          <w:rFonts w:ascii="Calibri" w:hAnsi="Calibri" w:cs="Calibri"/>
+        </w:rPr>
+        <w:t xml:space="preserve">, and their exact package fingerprints. Its strict replay reference retains and validates the complete current v1 selection narrowing, derives executable authority through the existing exact projection, and excludes incidental </w:t>
+      </w:r>
+      <w:r>
+        <w:rPr>
+          <w:rFonts w:ascii="Consolas" w:hAnsi="Consolas" w:cs="Consolas"/>
+          <w:sz w:val="19"/>
+          <w:szCs w:val="19"/>
+        </w:rPr>
+        <w:t>selectionId</w:t>
+      </w:r>
+      <w:r>
+        <w:rPr>
+          <w:rFonts w:ascii="Calibri" w:hAnsi="Calibri" w:cs="Calibri"/>
+        </w:rPr>
+        <w:t xml:space="preserve"> from replay fingerprint identity. It performs no snapshot, appearance, profile or topology inference, creates no v2 identity, and does not read, write, render or publish historical state. Historical snapshot read/render replay remains A-09B; publication replay and parent A-09 closure remain A-09C. Current generation and merchant-visible behavior are unchanged.</w:t>
       </w:r>
     </w:p>
     <w:p>
@@ -16766,7 +17444,21 @@
         <w:rPr>
           <w:rFonts w:ascii="Calibri" w:hAnsi="Calibri" w:cs="Calibri"/>
         </w:rPr>
-        <w:t xml:space="preserve">, while P10B-19A is </w:t>
+        <w:t xml:space="preserve">. P10B-19A-09A is </w:t>
+      </w:r>
+      <w:r>
+        <w:rPr>
+          <w:rFonts w:ascii="Calibri" w:hAnsi="Calibri" w:cs="Calibri"/>
+          <w:b/>
+          <w:bCs/>
+        </w:rPr>
+        <w:t>Baseline</w:t>
+      </w:r>
+      <w:r>
+        <w:rPr>
+          <w:rFonts w:ascii="Calibri" w:hAnsi="Calibri" w:cs="Calibri"/>
+        </w:rPr>
+        <w:t xml:space="preserve">; parent P10B-19A-09 and P10B-19A are </w:t>
       </w:r>
       <w:r>
         <w:rPr>
@@ -16780,21 +17472,21 @@
         <w:rPr>
           <w:rFonts w:ascii="Calibri" w:hAnsi="Calibri" w:cs="Calibri"/>
         </w:rPr>
-        <w:t xml:space="preserve">. P10B-19A-09 is </w:t>
-      </w:r>
-      <w:r>
-        <w:rPr>
-          <w:rFonts w:ascii="Calibri" w:hAnsi="Calibri" w:cs="Calibri"/>
-          <w:b/>
-          <w:bCs/>
-        </w:rPr>
-        <w:t>Planned / exact next</w:t>
-      </w:r>
-      <w:r>
-        <w:rPr>
-          <w:rFonts w:ascii="Calibri" w:hAnsi="Calibri" w:cs="Calibri"/>
-        </w:rPr>
-        <w:t xml:space="preserve">, and P10B-19A-10 remains </w:t>
+        <w:t xml:space="preserve">. P10B-19A-09B is the </w:t>
+      </w:r>
+      <w:r>
+        <w:rPr>
+          <w:rFonts w:ascii="Calibri" w:hAnsi="Calibri" w:cs="Calibri"/>
+          <w:b/>
+          <w:bCs/>
+        </w:rPr>
+        <w:t>exact next implementation task</w:t>
+      </w:r>
+      <w:r>
+        <w:rPr>
+          <w:rFonts w:ascii="Calibri" w:hAnsi="Calibri" w:cs="Calibri"/>
+        </w:rPr>
+        <w:t xml:space="preserve">, P10B-19A-09C is </w:t>
       </w:r>
       <w:r>
         <w:rPr>
@@ -16808,7 +17500,21 @@
         <w:rPr>
           <w:rFonts w:ascii="Calibri" w:hAnsi="Calibri" w:cs="Calibri"/>
         </w:rPr>
-        <w:t xml:space="preserve"> after P10B-19A-09. P10B-16P-04 acceptance evidence is retained in </w:t>
+        <w:t xml:space="preserve"> after A-09B, and P10B-19A-10 remains </w:t>
+      </w:r>
+      <w:r>
+        <w:rPr>
+          <w:rFonts w:ascii="Calibri" w:hAnsi="Calibri" w:cs="Calibri"/>
+          <w:b/>
+          <w:bCs/>
+        </w:rPr>
+        <w:t>Planned</w:t>
+      </w:r>
+      <w:r>
+        <w:rPr>
+          <w:rFonts w:ascii="Calibri" w:hAnsi="Calibri" w:cs="Calibri"/>
+        </w:rPr>
+        <w:t xml:space="preserve"> after A-09C. P10B-16P-04 acceptance evidence is retained in </w:t>
       </w:r>
       <w:hyperlink r:id="rIdHyperlink5" w:history="1">
         <w:r>
@@ -16824,7 +17530,7 @@
         <w:rPr>
           <w:rFonts w:ascii="Calibri" w:hAnsi="Calibri" w:cs="Calibri"/>
         </w:rPr>
-        <w:t>. The remaining Done conditions are implementation gates, not claims about the current repository. The P10B-16P-01 through P10B-16P-05A plus P10B-16P-06 sequence is a mandatory convergence package between P10B-16 and P10B-17; it supplements rather than renumbers the locked P10B-01 through P10B-18 plan. P10B-16P-05B follows accepted P10B-18C and is now Baseline. P10B-18D completed as a rejected-quality diagnostic. P10B-19 PRE is Baseline. P10B-19A-01 through P10B-19A-07 and P10B-19A-08A through P10B-19A-08C are Baseline; parent P10B-19A-08 is Baseline / closed, while P10B-19A remains Partial. P10B-19A-09 is Planned / exact next; P10B-19A-10 remains Planned after P10B-19A-09; P10B-19B through P10B-19J remain Planned.</w:t>
+        <w:t>. The remaining Done conditions are implementation gates, not claims about the current repository. The P10B-16P-01 through P10B-16P-05A plus P10B-16P-06 sequence is a mandatory convergence package between P10B-16 and P10B-17; it supplements rather than renumbers the locked P10B-01 through P10B-18 plan. P10B-16P-05B follows accepted P10B-18C and is now Baseline. P10B-18D completed as a rejected-quality diagnostic. P10B-19 PRE is Baseline. P10B-19A-01 through P10B-19A-07 and P10B-19A-08A through P10B-19A-08C are Baseline; parent P10B-19A-08 is Baseline / closed. P10B-19A-09A is Baseline; parent P10B-19A-09 and P10B-19A remain Partial. P10B-19A-09B is the exact next implementation task; P10B-19A-09C is Planned after A-09B; P10B-19A-10 remains Planned after A-09C; P10B-19B through P10B-19J remain Planned.</w:t>
       </w:r>
     </w:p>
     <w:p>
@@ -22283,7 +22989,7 @@
         <w:rPr>
           <w:rFonts w:ascii="Calibri" w:hAnsi="Calibri" w:cs="Calibri"/>
         </w:rPr>
-        <w:t>P10B-18C and P10B-16P-05B are Baseline. P10B-18D is a Baseline diagnostic with live commercial quality rejected. P10B-18 and P10B remain Partial. P10B-19 PRE is Baseline. P10B-19A-01 through P10B-19A-07 and P10B-19A-08A through P10B-19A-08C are Baseline; parent P10B-19A-08 is Baseline / closed, while P10B-19A remains Partial. P10B-19A-09 is Planned / exact next; P10B-19A-10 remains Planned after P10B-19A-09; P10B-19B through P10B-19J remain Planned.</w:t>
+        <w:t>P10B-18C and P10B-16P-05B are Baseline. P10B-18D is a Baseline diagnostic with live commercial quality rejected. P10B-18 and P10B remain Partial. P10B-19 PRE is Baseline. P10B-19A-01 through P10B-19A-07 and P10B-19A-08A through P10B-19A-08C are Baseline; parent P10B-19A-08 is Baseline / closed. P10B-19A-09A is Baseline; parent P10B-19A-09 and P10B-19A remain Partial. P10B-19A-09B is the exact next implementation task; P10B-19A-09C is Planned after A-09B; P10B-19A-10 remains Planned after A-09C; P10B-19B through P10B-19J remain Planned.</w:t>
       </w:r>
     </w:p>
     <w:p>
@@ -22577,7 +23283,7 @@
         <w:rPr>
           <w:rFonts w:ascii="Calibri" w:hAnsi="Calibri" w:cs="Calibri"/>
         </w:rPr>
-        <w:t>. P10B-18A, P10B-18B-01, P10B-18B-06, P10B-18B-02, P10B-18B-03 and P10B-18B-04 are Baseline; parent P10B-18B is Partial and P10B-18C remains Planned.</w:t>
+        <w:t>. P10B-18A, P10B-18B-01, P10B-18B-06, P10B-18B-02, P10B-18B-03, P10B-18B-04, P10B-18B-05, parent P10B-18B and P10B-18C are Baseline; P10B-18D is a rejected-quality diagnostic Baseline.</w:t>
       </w:r>
     </w:p>
     <w:p>
@@ -24356,7 +25062,7 @@
         <w:rPr>
           <w:rFonts w:ascii="Calibri" w:hAnsi="Calibri" w:cs="Calibri"/>
         </w:rPr>
-        <w:t xml:space="preserve"> is Baseline. P10B-19A-01 through P10B-19A-07 and P10B-19A-08A through P10B-19A-08C are Baseline; parent P10B-19A-08 is Baseline / closed, while </w:t>
+        <w:t xml:space="preserve"> is Baseline. P10B-19A-01 through P10B-19A-07 and P10B-19A-08A through P10B-19A-08C are Baseline; parent P10B-19A-08 is Baseline / closed. P10B-19A-09A is Baseline, while </w:t>
       </w:r>
       <w:r>
         <w:rPr>
@@ -24364,13 +25070,27 @@
           <w:sz w:val="19"/>
           <w:szCs w:val="19"/>
         </w:rPr>
+        <w:t>P10B-19A-09 - v1 read/render/migration/publication compatibility</w:t>
+      </w:r>
+      <w:r>
+        <w:rPr>
+          <w:rFonts w:ascii="Calibri" w:hAnsi="Calibri" w:cs="Calibri"/>
+        </w:rPr>
+        <w:t xml:space="preserve"> and </w:t>
+      </w:r>
+      <w:r>
+        <w:rPr>
+          <w:rFonts w:ascii="Consolas" w:hAnsi="Consolas" w:cs="Consolas"/>
+          <w:sz w:val="19"/>
+          <w:szCs w:val="19"/>
+        </w:rPr>
         <w:t>P10B-19A - Structural Storefront Family Contract</w:t>
       </w:r>
       <w:r>
         <w:rPr>
           <w:rFonts w:ascii="Calibri" w:hAnsi="Calibri" w:cs="Calibri"/>
         </w:rPr>
-        <w:t xml:space="preserve"> remains Partial. P10B-19A-09 is Planned / exact next; P10B-19A-10 remains Planned after P10B-19A-09; P10B-19B through P10B-19J remain Planned.</w:t>
+        <w:t xml:space="preserve"> remain Partial. P10B-19A-09B is the exact next implementation task; P10B-19A-09C is Planned after A-09B; P10B-19A-10 remains Planned after A-09C; P10B-19B through P10B-19J remain Planned.</w:t>
       </w:r>
     </w:p>
     <w:p>
@@ -28331,6 +29051,7 @@
     </w:p>
     <w:p>
       <w:pPr>
+        <w:pageBreakBefore/>
         <w:pStyle w:val="Heading2"/>
         <w:keepNext/>
         <w:widowControl/>
@@ -28365,7 +29086,7 @@
         <w:rPr>
           <w:rFonts w:ascii="Calibri" w:hAnsi="Calibri" w:cs="Calibri"/>
         </w:rPr>
-        <w:t xml:space="preserve"> with zero primary FAIL. P10B-16P-05B subsequently removed the one-time capture platform while retaining the bounded quality gate. P10B-18D subsequently completed as a rejected-quality diagnostic. P10B-19 PRE is Baseline. P10B-19A-01 through P10B-19A-07 and P10B-19A-08A through P10B-19A-08C are Baseline; parent P10B-19A-08 is Baseline / closed, while P10B-19A remains Partial. P10B-19A-09 is Planned / exact next, and P10B-19A-10 remains Planned after P10B-19A-09.</w:t>
+        <w:t xml:space="preserve"> with zero primary FAIL. P10B-16P-05B subsequently removed the one-time capture platform while retaining the bounded quality gate. P10B-18D subsequently completed as a rejected-quality diagnostic. P10B-19 PRE is Baseline. P10B-19A-01 through P10B-19A-07 and P10B-19A-08A through P10B-19A-08C are Baseline; parent P10B-19A-08 is Baseline / closed. P10B-19A-09A is Baseline; parent P10B-19A-09 and P10B-19A remain Partial. P10B-19A-09B is the exact next implementation task, P10B-19A-09C is Planned after A-09B, and P10B-19A-10 remains Planned after A-09C.</w:t>
       </w:r>
     </w:p>
     <w:p>
@@ -29553,7 +30274,7 @@
               <w:rPr>
                 <w:rFonts w:ascii="Calibri" w:hAnsi="Calibri" w:cs="Calibri"/>
               </w:rPr>
-              <w:t>Next</w:t>
+              <w:t>Current</w:t>
             </w:r>
           </w:p>
         </w:tc>
@@ -29591,7 +30312,7 @@
                 <w:b/>
                 <w:bCs/>
               </w:rPr>
-              <w:t>Planned / exact next</w:t>
+              <w:t>Partial</w:t>
             </w:r>
           </w:p>
         </w:tc>
@@ -29609,7 +30330,7 @@
               <w:rPr>
                 <w:rFonts w:ascii="Calibri" w:hAnsi="Calibri" w:cs="Calibri"/>
               </w:rPr>
-              <w:t>v1 read/render/migration/publication compatibility after completed P10B-19A-08</w:t>
+              <w:t>A-09A opaque alias/reference authority is Baseline; read/render and publication replay remain</w:t>
             </w:r>
           </w:p>
         </w:tc>
@@ -29633,7 +30354,7 @@
               <w:rPr>
                 <w:rFonts w:ascii="Calibri" w:hAnsi="Calibri" w:cs="Calibri"/>
               </w:rPr>
-              <w:t>Planned</w:t>
+              <w:t>Baseline</w:t>
             </w:r>
           </w:p>
         </w:tc>
@@ -29651,7 +30372,7 @@
               <w:rPr>
                 <w:rFonts w:ascii="Calibri" w:hAnsi="Calibri" w:cs="Calibri"/>
               </w:rPr>
-              <w:t>P10B-19A-10</w:t>
+              <w:t>P10B-19A-09A</w:t>
             </w:r>
           </w:p>
         </w:tc>
@@ -29671,7 +30392,7 @@
                 <w:b/>
                 <w:bCs/>
               </w:rPr>
-              <w:t>Planned</w:t>
+              <w:t>Baseline</w:t>
             </w:r>
           </w:p>
         </w:tc>
@@ -29689,7 +30410,7 @@
               <w:rPr>
                 <w:rFonts w:ascii="Calibri" w:hAnsi="Calibri" w:cs="Calibri"/>
               </w:rPr>
-              <w:t>Retained matrices, integration and P10B-19A closure after P10B-19A-09</w:t>
+              <w:t>Exact three legacy-v1 aliases and strict stale-checked v1 selection replay reference; no snapshot/render/publication execution</w:t>
             </w:r>
           </w:p>
         </w:tc>
@@ -29713,7 +30434,7 @@
               <w:rPr>
                 <w:rFonts w:ascii="Calibri" w:hAnsi="Calibri" w:cs="Calibri"/>
               </w:rPr>
-              <w:t>Planned</w:t>
+              <w:t>Next</w:t>
             </w:r>
           </w:p>
         </w:tc>
@@ -29731,7 +30452,7 @@
               <w:rPr>
                 <w:rFonts w:ascii="Calibri" w:hAnsi="Calibri" w:cs="Calibri"/>
               </w:rPr>
-              <w:t>P10B-19B through P10B-19J</w:t>
+              <w:t>P10B-19A-09B</w:t>
             </w:r>
           </w:p>
         </w:tc>
@@ -29751,6 +30472,246 @@
                 <w:b/>
                 <w:bCs/>
               </w:rPr>
+              <w:t>Planned / exact next</w:t>
+            </w:r>
+          </w:p>
+        </w:tc>
+        <w:tc>
+          <w:tcPr>
+            <w:tcW w:w="8460" w:type="dxa"/>
+            <w:vAlign w:val="center"/>
+          </w:tcPr>
+          <w:p>
+            <w:pPr>
+              <w:pStyle w:val="TableText"/>
+              <w:widowControl/>
+            </w:pPr>
+            <w:r>
+              <w:rPr>
+                <w:rFonts w:ascii="Calibri" w:hAnsi="Calibri" w:cs="Calibri"/>
+              </w:rPr>
+              <w:t>Historical v1 snapshot read and render replay without inference or write-back</w:t>
+            </w:r>
+          </w:p>
+        </w:tc>
+      </w:tr>
+      <w:tr>
+        <w:trPr>
+          <w:cantSplit/>
+        </w:trPr>
+        <w:tc>
+          <w:tcPr>
+            <w:tcW w:w="1000" w:type="dxa"/>
+            <w:vAlign w:val="center"/>
+          </w:tcPr>
+          <w:p>
+            <w:pPr>
+              <w:pStyle w:val="TableText"/>
+              <w:jc w:val="center"/>
+              <w:widowControl/>
+            </w:pPr>
+            <w:r>
+              <w:rPr>
+                <w:rFonts w:ascii="Calibri" w:hAnsi="Calibri" w:cs="Calibri"/>
+              </w:rPr>
+              <w:t>Planned</w:t>
+            </w:r>
+          </w:p>
+        </w:tc>
+        <w:tc>
+          <w:tcPr>
+            <w:tcW w:w="1500" w:type="dxa"/>
+            <w:vAlign w:val="center"/>
+          </w:tcPr>
+          <w:p>
+            <w:pPr>
+              <w:pStyle w:val="TableText"/>
+              <w:widowControl/>
+            </w:pPr>
+            <w:r>
+              <w:rPr>
+                <w:rFonts w:ascii="Calibri" w:hAnsi="Calibri" w:cs="Calibri"/>
+              </w:rPr>
+              <w:t>P10B-19A-09C</w:t>
+            </w:r>
+          </w:p>
+        </w:tc>
+        <w:tc>
+          <w:tcPr>
+            <w:tcW w:w="2000" w:type="dxa"/>
+            <w:vAlign w:val="center"/>
+          </w:tcPr>
+          <w:p>
+            <w:pPr>
+              <w:pStyle w:val="TableText"/>
+              <w:widowControl/>
+            </w:pPr>
+            <w:r>
+              <w:rPr>
+                <w:rFonts w:ascii="Calibri" w:hAnsi="Calibri" w:cs="Calibri"/>
+                <w:b/>
+                <w:bCs/>
+              </w:rPr>
+              <w:t>Planned</w:t>
+            </w:r>
+          </w:p>
+        </w:tc>
+        <w:tc>
+          <w:tcPr>
+            <w:tcW w:w="8460" w:type="dxa"/>
+            <w:vAlign w:val="center"/>
+          </w:tcPr>
+          <w:p>
+            <w:pPr>
+              <w:pStyle w:val="TableText"/>
+              <w:widowControl/>
+            </w:pPr>
+            <w:r>
+              <w:rPr>
+                <w:rFonts w:ascii="Calibri" w:hAnsi="Calibri" w:cs="Calibri"/>
+              </w:rPr>
+              <w:t>Publication replay and parent A-09 closure after A-09B</w:t>
+            </w:r>
+          </w:p>
+        </w:tc>
+      </w:tr>
+      <w:tr>
+        <w:trPr>
+          <w:cantSplit/>
+        </w:trPr>
+        <w:tc>
+          <w:tcPr>
+            <w:tcW w:w="1000" w:type="dxa"/>
+            <w:vAlign w:val="center"/>
+          </w:tcPr>
+          <w:p>
+            <w:pPr>
+              <w:pStyle w:val="TableText"/>
+              <w:jc w:val="center"/>
+              <w:widowControl/>
+            </w:pPr>
+            <w:r>
+              <w:rPr>
+                <w:rFonts w:ascii="Calibri" w:hAnsi="Calibri" w:cs="Calibri"/>
+              </w:rPr>
+              <w:t>Planned</w:t>
+            </w:r>
+          </w:p>
+        </w:tc>
+        <w:tc>
+          <w:tcPr>
+            <w:tcW w:w="1500" w:type="dxa"/>
+            <w:vAlign w:val="center"/>
+          </w:tcPr>
+          <w:p>
+            <w:pPr>
+              <w:pStyle w:val="TableText"/>
+              <w:widowControl/>
+            </w:pPr>
+            <w:r>
+              <w:rPr>
+                <w:rFonts w:ascii="Calibri" w:hAnsi="Calibri" w:cs="Calibri"/>
+              </w:rPr>
+              <w:t>P10B-19A-10</w:t>
+            </w:r>
+          </w:p>
+        </w:tc>
+        <w:tc>
+          <w:tcPr>
+            <w:tcW w:w="2000" w:type="dxa"/>
+            <w:vAlign w:val="center"/>
+          </w:tcPr>
+          <w:p>
+            <w:pPr>
+              <w:pStyle w:val="TableText"/>
+              <w:widowControl/>
+            </w:pPr>
+            <w:r>
+              <w:rPr>
+                <w:rFonts w:ascii="Calibri" w:hAnsi="Calibri" w:cs="Calibri"/>
+                <w:b/>
+                <w:bCs/>
+              </w:rPr>
+              <w:t>Planned</w:t>
+            </w:r>
+          </w:p>
+        </w:tc>
+        <w:tc>
+          <w:tcPr>
+            <w:tcW w:w="8460" w:type="dxa"/>
+            <w:vAlign w:val="center"/>
+          </w:tcPr>
+          <w:p>
+            <w:pPr>
+              <w:pStyle w:val="TableText"/>
+              <w:widowControl/>
+            </w:pPr>
+            <w:r>
+              <w:rPr>
+                <w:rFonts w:ascii="Calibri" w:hAnsi="Calibri" w:cs="Calibri"/>
+              </w:rPr>
+              <w:t>Retained matrices, integration and P10B-19A closure after P10B-19A-09C</w:t>
+            </w:r>
+          </w:p>
+        </w:tc>
+      </w:tr>
+      <w:tr>
+        <w:trPr>
+          <w:cantSplit/>
+        </w:trPr>
+        <w:tc>
+          <w:tcPr>
+            <w:tcW w:w="1000" w:type="dxa"/>
+            <w:vAlign w:val="center"/>
+          </w:tcPr>
+          <w:p>
+            <w:pPr>
+              <w:pStyle w:val="TableText"/>
+              <w:jc w:val="center"/>
+              <w:widowControl/>
+            </w:pPr>
+            <w:r>
+              <w:rPr>
+                <w:rFonts w:ascii="Calibri" w:hAnsi="Calibri" w:cs="Calibri"/>
+              </w:rPr>
+              <w:t>Planned</w:t>
+            </w:r>
+          </w:p>
+        </w:tc>
+        <w:tc>
+          <w:tcPr>
+            <w:tcW w:w="1500" w:type="dxa"/>
+            <w:vAlign w:val="center"/>
+          </w:tcPr>
+          <w:p>
+            <w:pPr>
+              <w:pStyle w:val="TableText"/>
+              <w:widowControl/>
+            </w:pPr>
+            <w:r>
+              <w:rPr>
+                <w:rFonts w:ascii="Calibri" w:hAnsi="Calibri" w:cs="Calibri"/>
+              </w:rPr>
+              <w:t>P10B-19B through P10B-19J</w:t>
+            </w:r>
+          </w:p>
+        </w:tc>
+        <w:tc>
+          <w:tcPr>
+            <w:tcW w:w="2000" w:type="dxa"/>
+            <w:vAlign w:val="center"/>
+          </w:tcPr>
+          <w:p>
+            <w:pPr>
+              <w:pStyle w:val="TableText"/>
+              <w:widowControl/>
+            </w:pPr>
+            <w:r>
+              <w:rPr>
+                <w:rFonts w:ascii="Calibri" w:hAnsi="Calibri" w:cs="Calibri"/>
+                <w:b/>
+                <w:bCs/>
+              </w:rPr>
               <w:t>Planned</w:t>
             </w:r>
           </w:p>
@@ -30139,23 +31100,71 @@
         <w:rPr>
           <w:rFonts w:ascii="Calibri" w:hAnsi="Calibri" w:cs="Calibri"/>
         </w:rPr>
-        <w:t>P10B-19A-09 = Planned / exact next implementation task</w:t>
-      </w:r>
-    </w:p>
-    <w:p>
-      <w:pPr>
-        <w:pStyle w:val="Normal"/>
-        <w:numPr>
-          <w:ilvl w:val="0"/>
-          <w:numId w:val="1"/>
-        </w:numPr>
-        <w:widowControl/>
-      </w:pPr>
-      <w:r>
-        <w:rPr>
-          <w:rFonts w:ascii="Calibri" w:hAnsi="Calibri" w:cs="Calibri"/>
-        </w:rPr>
-        <w:t>P10B-19A-10 = Planned after P10B-19A-09</w:t>
+        <w:t>P10B-19A-09A = Baseline</w:t>
+      </w:r>
+    </w:p>
+    <w:p>
+      <w:pPr>
+        <w:pStyle w:val="Normal"/>
+        <w:numPr>
+          <w:ilvl w:val="0"/>
+          <w:numId w:val="1"/>
+        </w:numPr>
+        <w:widowControl/>
+      </w:pPr>
+      <w:r>
+        <w:rPr>
+          <w:rFonts w:ascii="Calibri" w:hAnsi="Calibri" w:cs="Calibri"/>
+        </w:rPr>
+        <w:t>P10B-19A-09 = Partial</w:t>
+      </w:r>
+    </w:p>
+    <w:p>
+      <w:pPr>
+        <w:pStyle w:val="Normal"/>
+        <w:numPr>
+          <w:ilvl w:val="0"/>
+          <w:numId w:val="1"/>
+        </w:numPr>
+        <w:widowControl/>
+      </w:pPr>
+      <w:r>
+        <w:rPr>
+          <w:rFonts w:ascii="Calibri" w:hAnsi="Calibri" w:cs="Calibri"/>
+        </w:rPr>
+        <w:t>P10B-19A-09B = exact next implementation task</w:t>
+      </w:r>
+    </w:p>
+    <w:p>
+      <w:pPr>
+        <w:pStyle w:val="Normal"/>
+        <w:numPr>
+          <w:ilvl w:val="0"/>
+          <w:numId w:val="1"/>
+        </w:numPr>
+        <w:widowControl/>
+      </w:pPr>
+      <w:r>
+        <w:rPr>
+          <w:rFonts w:ascii="Calibri" w:hAnsi="Calibri" w:cs="Calibri"/>
+        </w:rPr>
+        <w:t>P10B-19A-09C = Planned after P10B-19A-09B</w:t>
+      </w:r>
+    </w:p>
+    <w:p>
+      <w:pPr>
+        <w:pStyle w:val="Normal"/>
+        <w:numPr>
+          <w:ilvl w:val="0"/>
+          <w:numId w:val="1"/>
+        </w:numPr>
+        <w:widowControl/>
+      </w:pPr>
+      <w:r>
+        <w:rPr>
+          <w:rFonts w:ascii="Calibri" w:hAnsi="Calibri" w:cs="Calibri"/>
+        </w:rPr>
+        <w:t>P10B-19A-10 = Planned after P10B-19A-09C</w:t>
       </w:r>
     </w:p>
     <w:p>

</xml_diff>

<commit_message>
feat: add historical v1 snapshot read replay
</commit_message>
<xml_diff>
--- a/docs/VESKIFY_DEVELOPMENT_DELIVERY_TRACKER_v1.3.0.docx
+++ b/docs/VESKIFY_DEVELOPMENT_DELIVERY_TRACKER_v1.3.0.docx
@@ -38,7 +38,7 @@
         <w:rPr>
           <w:rFonts w:ascii="Calibri" w:hAnsi="Calibri" w:cs="Calibri"/>
         </w:rPr>
-        <w:t>Delivery status baseline: 2 September 2026, P10B-19A-09A Legacy v1 Replay Alias and Compatibility Reference Baseline</w:t>
+        <w:t>Delivery status baseline: 3 September 2026, P10B-19A-09B Historical v1 Snapshot Read and Render Replay Baseline</w:t>
       </w:r>
     </w:p>
     <w:p>
@@ -249,7 +249,7 @@
               <w:rPr>
                 <w:rFonts w:ascii="Calibri" w:hAnsi="Calibri" w:cs="Calibri"/>
               </w:rPr>
-              <w:t>2 September 2026, P10B-19A-09A Legacy v1 Replay Alias and Compatibility Reference Baseline</w:t>
+              <w:t>3 September 2026, P10B-19A-09B Historical v1 Snapshot Read and Render Replay Baseline</w:t>
             </w:r>
           </w:p>
         </w:tc>
@@ -9603,7 +9603,7 @@
               <w:rPr>
                 <w:rFonts w:ascii="Calibri" w:hAnsi="Calibri" w:cs="Calibri"/>
               </w:rPr>
-              <w:t>A-09A opaque alias/reference authority is Baseline; A-09B historical read/render replay and A-09C publication replay remain</w:t>
+              <w:t>A-09A alias/reference and A-09B historical read/render replay are Baseline; A-09C publication replay remains</w:t>
             </w:r>
           </w:p>
         </w:tc>
@@ -9762,7 +9762,7 @@
               <w:rPr>
                 <w:rFonts w:ascii="Calibri" w:hAnsi="Calibri" w:cs="Calibri"/>
               </w:rPr>
-              <w:t>☐</w:t>
+              <w:t>☑</w:t>
             </w:r>
           </w:p>
         </w:tc>
@@ -9819,7 +9819,7 @@
                 <w:b/>
                 <w:bCs/>
               </w:rPr>
-              <w:t>Planned / exact next</w:t>
+              <w:t>Baseline</w:t>
             </w:r>
           </w:p>
         </w:tc>
@@ -9837,7 +9837,7 @@
               <w:rPr>
                 <w:rFonts w:ascii="Calibri" w:hAnsi="Calibri" w:cs="Calibri"/>
               </w:rPr>
-              <w:t>Planned task owner</w:t>
+              <w:t>P10B-19A task owner</w:t>
             </w:r>
           </w:p>
         </w:tc>
@@ -9873,7 +9873,7 @@
               <w:rPr>
                 <w:rFonts w:ascii="Calibri" w:hAnsi="Calibri" w:cs="Calibri"/>
               </w:rPr>
-              <w:t>Read historical v1 snapshots and prove exact render replay without inference or write-back</w:t>
+              <w:t>Strict read-only canonical validation, exact-bound or readable-unattributed receipts, seven verified/seven unverified fields and 36/36 current-renderer replay with zero writes</w:t>
             </w:r>
           </w:p>
         </w:tc>
@@ -9954,7 +9954,7 @@
                 <w:b/>
                 <w:bCs/>
               </w:rPr>
-              <w:t>Planned</w:t>
+              <w:t>Planned / exact next</w:t>
             </w:r>
           </w:p>
         </w:tc>
@@ -14516,7 +14516,7 @@
         <w:rPr>
           <w:rFonts w:ascii="Calibri" w:hAnsi="Calibri" w:cs="Calibri"/>
         </w:rPr>
-        <w:t xml:space="preserve">P10B remains Partial. DEVX-01A through DEVX-01G are Baseline, and DEVX-01 is Baseline / closed. P10B-19A-01 through P10B-19A-07 and P10B-19A-08A through P10B-19A-08C are Baseline; parent P10B-19A-08 is Baseline / closed; P10B-19A-09A is Baseline; parent P10B-19A-09 and P10B-19A remain Partial; P10B-19A-09B is the exact next implementation task; P10B-19A-09C is Planned after A-09B; P10B-19A-10 is Planned after A-09C; P10B remains Partial. DEVX-01C measured the serial gate, retained PR/ref-scoped cancellation and added compatible </w:t>
+        <w:t xml:space="preserve">P10B remains Partial. DEVX-01A through DEVX-01G are Baseline, and DEVX-01 is Baseline / closed. P10B-19A-01 through P10B-19A-07 and P10B-19A-08A through P10B-19A-08C are Baseline; parent P10B-19A-08 is Baseline / closed; P10B-19A-09A and P10B-19A-09B are Baseline; parent P10B-19A-09 and P10B-19A remain Partial; P10B-19A-09C is the exact next implementation task; P10B-19A-10 is Planned after A-09C; P10B remains Partial. DEVX-01C measured the serial gate, retained PR/ref-scoped cancellation and added compatible </w:t>
       </w:r>
       <w:r>
         <w:rPr>
@@ -15681,7 +15681,7 @@
         <w:rPr>
           <w:rFonts w:ascii="Calibri" w:hAnsi="Calibri" w:cs="Calibri"/>
         </w:rPr>
-        <w:t xml:space="preserve">. P10B-19A-09A is </w:t>
+        <w:t xml:space="preserve">. P10B-19A-09A and P10B-19A-09B are </w:t>
       </w:r>
       <w:r>
         <w:rPr>
@@ -15709,7 +15709,7 @@
         <w:rPr>
           <w:rFonts w:ascii="Calibri" w:hAnsi="Calibri" w:cs="Calibri"/>
         </w:rPr>
-        <w:t xml:space="preserve">. P10B-19A-09B is the </w:t>
+        <w:t xml:space="preserve">. P10B-19A-09C is the </w:t>
       </w:r>
       <w:r>
         <w:rPr>
@@ -15723,7 +15723,7 @@
         <w:rPr>
           <w:rFonts w:ascii="Calibri" w:hAnsi="Calibri" w:cs="Calibri"/>
         </w:rPr>
-        <w:t>, P10B-19A-09C is Planned after A-09B, and P10B-19A-10 is Planned after A-09C.</w:t>
+        <w:t>, and P10B-19A-10 is Planned after A-09C.</w:t>
       </w:r>
     </w:p>
     <w:p>
@@ -15968,6 +15968,74 @@
           <w:rFonts w:ascii="Calibri" w:hAnsi="Calibri" w:cs="Calibri"/>
         </w:rPr>
         <w:t xml:space="preserve"> from replay fingerprint identity. It performs no snapshot, appearance, profile or topology inference, creates no v2 identity, and does not read, write, render or publish historical state. Historical snapshot read/render replay remains A-09B; publication replay and parent A-09 closure remain A-09C. Current generation and merchant-visible behavior are unchanged.</w:t>
+      </w:r>
+    </w:p>
+    <w:p>
+      <w:pPr>
+        <w:pStyle w:val="Normal"/>
+        <w:widowControl/>
+      </w:pPr>
+      <w:r>
+        <w:rPr>
+          <w:rFonts w:ascii="Calibri" w:hAnsi="Calibri" w:cs="Calibri"/>
+        </w:rPr>
+        <w:t xml:space="preserve">P10B-19A-09B adds a strict read-only historical-v1 adapter over current canonical snapshot, registered component, PageBlueprint-profile, shared-frame, navigation, dynamic-commerce and catalogue validation. A supplied A-09A replay reference must bind exactly; otherwise the adapter fails closed. Without a reference, it reports </w:t>
+      </w:r>
+      <w:r>
+        <w:rPr>
+          <w:rFonts w:ascii="Consolas" w:hAnsi="Consolas" w:cs="Consolas"/>
+          <w:sz w:val="19"/>
+          <w:szCs w:val="19"/>
+        </w:rPr>
+        <w:t>readable-unattributed</w:t>
+      </w:r>
+      <w:r>
+        <w:rPr>
+          <w:rFonts w:ascii="Calibri" w:hAnsi="Calibri" w:cs="Calibri"/>
+        </w:rPr>
+        <w:t xml:space="preserve"> and never infers lineage. The deterministic deeply immutable receipt records seven present persisted selection fields as verified, seven absent fields as unverified, normalization disposition </w:t>
+      </w:r>
+      <w:r>
+        <w:rPr>
+          <w:rFonts w:ascii="Consolas" w:hAnsi="Consolas" w:cs="Consolas"/>
+          <w:sz w:val="19"/>
+          <w:szCs w:val="19"/>
+        </w:rPr>
+        <w:t>none</w:t>
+      </w:r>
+      <w:r>
+        <w:rPr>
+          <w:rFonts w:ascii="Calibri" w:hAnsi="Calibri" w:cs="Calibri"/>
+        </w:rPr>
+        <w:t xml:space="preserve"> or </w:t>
+      </w:r>
+      <w:r>
+        <w:rPr>
+          <w:rFonts w:ascii="Consolas" w:hAnsi="Consolas" w:cs="Consolas"/>
+          <w:sz w:val="19"/>
+          <w:szCs w:val="19"/>
+        </w:rPr>
+        <w:t>canonical-read-defaults</w:t>
+      </w:r>
+      <w:r>
+        <w:rPr>
+          <w:rFonts w:ascii="Calibri" w:hAnsi="Calibri" w:cs="Calibri"/>
+        </w:rPr>
+        <w:t xml:space="preserve">, and fingerprint form </w:t>
+      </w:r>
+      <w:r>
+        <w:rPr>
+          <w:rFonts w:ascii="Consolas" w:hAnsi="Consolas" w:cs="Consolas"/>
+          <w:sz w:val="19"/>
+          <w:szCs w:val="19"/>
+        </w:rPr>
+        <w:t>legacy-v1-historical-snapshot-read-v1_&lt;canonical-length&gt;_&lt;sha256&gt;</w:t>
+      </w:r>
+      <w:r>
+        <w:rPr>
+          <w:rFonts w:ascii="Calibri" w:hAnsi="Calibri" w:cs="Calibri"/>
+        </w:rPr>
+        <w:t>. Frozen exact-base evidence matches 36 of 36 bounded current-renderer observations for the three representatives across EN/FI, with zero snapshot mutation, repository write, commerce change, media change, or route/profile/frame mismatch. This is not raw HTML equality, original-lineage recovery, migration, publication replay, v2 authority, or merchant-visible change. A-09C owns publication replay and parent A-09 closure and is the exact next implementation task.</w:t>
       </w:r>
     </w:p>
     <w:p>
@@ -17444,7 +17512,7 @@
         <w:rPr>
           <w:rFonts w:ascii="Calibri" w:hAnsi="Calibri" w:cs="Calibri"/>
         </w:rPr>
-        <w:t xml:space="preserve">. P10B-19A-09A is </w:t>
+        <w:t xml:space="preserve">. P10B-19A-09A and P10B-19A-09B are </w:t>
       </w:r>
       <w:r>
         <w:rPr>
@@ -17472,7 +17540,7 @@
         <w:rPr>
           <w:rFonts w:ascii="Calibri" w:hAnsi="Calibri" w:cs="Calibri"/>
         </w:rPr>
-        <w:t xml:space="preserve">. P10B-19A-09B is the </w:t>
+        <w:t xml:space="preserve">. P10B-19A-09C is the </w:t>
       </w:r>
       <w:r>
         <w:rPr>
@@ -17486,21 +17554,7 @@
         <w:rPr>
           <w:rFonts w:ascii="Calibri" w:hAnsi="Calibri" w:cs="Calibri"/>
         </w:rPr>
-        <w:t xml:space="preserve">, P10B-19A-09C is </w:t>
-      </w:r>
-      <w:r>
-        <w:rPr>
-          <w:rFonts w:ascii="Calibri" w:hAnsi="Calibri" w:cs="Calibri"/>
-          <w:b/>
-          <w:bCs/>
-        </w:rPr>
-        <w:t>Planned</w:t>
-      </w:r>
-      <w:r>
-        <w:rPr>
-          <w:rFonts w:ascii="Calibri" w:hAnsi="Calibri" w:cs="Calibri"/>
-        </w:rPr>
-        <w:t xml:space="preserve"> after A-09B, and P10B-19A-10 remains </w:t>
+        <w:t xml:space="preserve">, and P10B-19A-10 remains </w:t>
       </w:r>
       <w:r>
         <w:rPr>
@@ -17530,7 +17584,7 @@
         <w:rPr>
           <w:rFonts w:ascii="Calibri" w:hAnsi="Calibri" w:cs="Calibri"/>
         </w:rPr>
-        <w:t>. The remaining Done conditions are implementation gates, not claims about the current repository. The P10B-16P-01 through P10B-16P-05A plus P10B-16P-06 sequence is a mandatory convergence package between P10B-16 and P10B-17; it supplements rather than renumbers the locked P10B-01 through P10B-18 plan. P10B-16P-05B follows accepted P10B-18C and is now Baseline. P10B-18D completed as a rejected-quality diagnostic. P10B-19 PRE is Baseline. P10B-19A-01 through P10B-19A-07 and P10B-19A-08A through P10B-19A-08C are Baseline; parent P10B-19A-08 is Baseline / closed. P10B-19A-09A is Baseline; parent P10B-19A-09 and P10B-19A remain Partial. P10B-19A-09B is the exact next implementation task; P10B-19A-09C is Planned after A-09B; P10B-19A-10 remains Planned after A-09C; P10B-19B through P10B-19J remain Planned.</w:t>
+        <w:t>. The remaining Done conditions are implementation gates, not claims about the current repository. The P10B-16P-01 through P10B-16P-05A plus P10B-16P-06 sequence is a mandatory convergence package between P10B-16 and P10B-17; it supplements rather than renumbers the locked P10B-01 through P10B-18 plan. P10B-16P-05B follows accepted P10B-18C and is now Baseline. P10B-18D completed as a rejected-quality diagnostic. P10B-19 PRE is Baseline. P10B-19A-01 through P10B-19A-07 and P10B-19A-08A through P10B-19A-08C are Baseline; parent P10B-19A-08 is Baseline / closed. P10B-19A-09A and P10B-19A-09B are Baseline; parent P10B-19A-09 and P10B-19A remain Partial. P10B-19A-09C is the exact next implementation task; P10B-19A-10 remains Planned after A-09C; P10B-19B through P10B-19J remain Planned.</w:t>
       </w:r>
     </w:p>
     <w:p>
@@ -22989,7 +23043,7 @@
         <w:rPr>
           <w:rFonts w:ascii="Calibri" w:hAnsi="Calibri" w:cs="Calibri"/>
         </w:rPr>
-        <w:t>P10B-18C and P10B-16P-05B are Baseline. P10B-18D is a Baseline diagnostic with live commercial quality rejected. P10B-18 and P10B remain Partial. P10B-19 PRE is Baseline. P10B-19A-01 through P10B-19A-07 and P10B-19A-08A through P10B-19A-08C are Baseline; parent P10B-19A-08 is Baseline / closed. P10B-19A-09A is Baseline; parent P10B-19A-09 and P10B-19A remain Partial. P10B-19A-09B is the exact next implementation task; P10B-19A-09C is Planned after A-09B; P10B-19A-10 remains Planned after A-09C; P10B-19B through P10B-19J remain Planned.</w:t>
+        <w:t>P10B-18C and P10B-16P-05B are Baseline. P10B-18D is a Baseline diagnostic with live commercial quality rejected. P10B-18 and P10B remain Partial. P10B-19 PRE is Baseline. P10B-19A-01 through P10B-19A-07 and P10B-19A-08A through P10B-19A-08C are Baseline; parent P10B-19A-08 is Baseline / closed. P10B-19A-09A and P10B-19A-09B are Baseline; parent P10B-19A-09 and P10B-19A remain Partial. P10B-19A-09C is the exact next implementation task; P10B-19A-10 remains Planned after A-09C; P10B-19B through P10B-19J remain Planned.</w:t>
       </w:r>
     </w:p>
     <w:p>
@@ -25062,7 +25116,7 @@
         <w:rPr>
           <w:rFonts w:ascii="Calibri" w:hAnsi="Calibri" w:cs="Calibri"/>
         </w:rPr>
-        <w:t xml:space="preserve"> is Baseline. P10B-19A-01 through P10B-19A-07 and P10B-19A-08A through P10B-19A-08C are Baseline; parent P10B-19A-08 is Baseline / closed. P10B-19A-09A is Baseline, while </w:t>
+        <w:t xml:space="preserve"> is Baseline. P10B-19A-01 through P10B-19A-07 and P10B-19A-08A through P10B-19A-08C are Baseline; parent P10B-19A-08 is Baseline / closed. P10B-19A-09A and P10B-19A-09B are Baseline, while </w:t>
       </w:r>
       <w:r>
         <w:rPr>
@@ -25090,7 +25144,7 @@
         <w:rPr>
           <w:rFonts w:ascii="Calibri" w:hAnsi="Calibri" w:cs="Calibri"/>
         </w:rPr>
-        <w:t xml:space="preserve"> remain Partial. P10B-19A-09B is the exact next implementation task; P10B-19A-09C is Planned after A-09B; P10B-19A-10 remains Planned after A-09C; P10B-19B through P10B-19J remain Planned.</w:t>
+        <w:t xml:space="preserve"> remain Partial. P10B-19A-09C is the exact next implementation task; P10B-19A-10 remains Planned after A-09C; P10B-19B through P10B-19J remain Planned.</w:t>
       </w:r>
     </w:p>
     <w:p>
@@ -29086,7 +29140,7 @@
         <w:rPr>
           <w:rFonts w:ascii="Calibri" w:hAnsi="Calibri" w:cs="Calibri"/>
         </w:rPr>
-        <w:t xml:space="preserve"> with zero primary FAIL. P10B-16P-05B subsequently removed the one-time capture platform while retaining the bounded quality gate. P10B-18D subsequently completed as a rejected-quality diagnostic. P10B-19 PRE is Baseline. P10B-19A-01 through P10B-19A-07 and P10B-19A-08A through P10B-19A-08C are Baseline; parent P10B-19A-08 is Baseline / closed. P10B-19A-09A is Baseline; parent P10B-19A-09 and P10B-19A remain Partial. P10B-19A-09B is the exact next implementation task, P10B-19A-09C is Planned after A-09B, and P10B-19A-10 remains Planned after A-09C.</w:t>
+        <w:t xml:space="preserve"> with zero primary FAIL. P10B-16P-05B subsequently removed the one-time capture platform while retaining the bounded quality gate. P10B-18D subsequently completed as a rejected-quality diagnostic. P10B-19 PRE is Baseline. P10B-19A-01 through P10B-19A-07 and P10B-19A-08A through P10B-19A-08C are Baseline; parent P10B-19A-08 is Baseline / closed. P10B-19A-09A and P10B-19A-09B are Baseline; parent P10B-19A-09 and P10B-19A remain Partial. P10B-19A-09C is the exact next implementation task, and P10B-19A-10 remains Planned after A-09C.</w:t>
       </w:r>
     </w:p>
     <w:p>
@@ -30330,7 +30384,7 @@
               <w:rPr>
                 <w:rFonts w:ascii="Calibri" w:hAnsi="Calibri" w:cs="Calibri"/>
               </w:rPr>
-              <w:t>A-09A opaque alias/reference authority is Baseline; read/render and publication replay remain</w:t>
+              <w:t>A-09A alias/reference and A-09B historical read/render replay are Baseline; publication replay remains</w:t>
             </w:r>
           </w:p>
         </w:tc>
@@ -30434,7 +30488,7 @@
               <w:rPr>
                 <w:rFonts w:ascii="Calibri" w:hAnsi="Calibri" w:cs="Calibri"/>
               </w:rPr>
-              <w:t>Next</w:t>
+              <w:t>Baseline</w:t>
             </w:r>
           </w:p>
         </w:tc>
@@ -30472,7 +30526,7 @@
                 <w:b/>
                 <w:bCs/>
               </w:rPr>
-              <w:t>Planned / exact next</w:t>
+              <w:t>Baseline</w:t>
             </w:r>
           </w:p>
         </w:tc>
@@ -30490,7 +30544,7 @@
               <w:rPr>
                 <w:rFonts w:ascii="Calibri" w:hAnsi="Calibri" w:cs="Calibri"/>
               </w:rPr>
-              <w:t>Historical v1 snapshot read and render replay without inference or write-back</w:t>
+              <w:t>Strict read-only current-canonical validation, exact-bound or readable-unattributed receipt, and 36/36 current-renderer replay</w:t>
             </w:r>
           </w:p>
         </w:tc>
@@ -30514,7 +30568,7 @@
               <w:rPr>
                 <w:rFonts w:ascii="Calibri" w:hAnsi="Calibri" w:cs="Calibri"/>
               </w:rPr>
-              <w:t>Planned</w:t>
+              <w:t>Next</w:t>
             </w:r>
           </w:p>
         </w:tc>
@@ -30552,7 +30606,7 @@
                 <w:b/>
                 <w:bCs/>
               </w:rPr>
-              <w:t>Planned</w:t>
+              <w:t>Planned / exact next</w:t>
             </w:r>
           </w:p>
         </w:tc>
@@ -31116,6 +31170,22 @@
         <w:rPr>
           <w:rFonts w:ascii="Calibri" w:hAnsi="Calibri" w:cs="Calibri"/>
         </w:rPr>
+        <w:t>P10B-19A-09B = Baseline</w:t>
+      </w:r>
+    </w:p>
+    <w:p>
+      <w:pPr>
+        <w:pStyle w:val="Normal"/>
+        <w:numPr>
+          <w:ilvl w:val="0"/>
+          <w:numId w:val="1"/>
+        </w:numPr>
+        <w:widowControl/>
+      </w:pPr>
+      <w:r>
+        <w:rPr>
+          <w:rFonts w:ascii="Calibri" w:hAnsi="Calibri" w:cs="Calibri"/>
+        </w:rPr>
         <w:t>P10B-19A-09 = Partial</w:t>
       </w:r>
     </w:p>
@@ -31132,23 +31202,7 @@
         <w:rPr>
           <w:rFonts w:ascii="Calibri" w:hAnsi="Calibri" w:cs="Calibri"/>
         </w:rPr>
-        <w:t>P10B-19A-09B = exact next implementation task</w:t>
-      </w:r>
-    </w:p>
-    <w:p>
-      <w:pPr>
-        <w:pStyle w:val="Normal"/>
-        <w:numPr>
-          <w:ilvl w:val="0"/>
-          <w:numId w:val="1"/>
-        </w:numPr>
-        <w:widowControl/>
-      </w:pPr>
-      <w:r>
-        <w:rPr>
-          <w:rFonts w:ascii="Calibri" w:hAnsi="Calibri" w:cs="Calibri"/>
-        </w:rPr>
-        <w:t>P10B-19A-09C = Planned after P10B-19A-09B</w:t>
+        <w:t>P10B-19A-09C = exact next implementation task</w:t>
       </w:r>
     </w:p>
     <w:p>

</xml_diff>

<commit_message>
feat: add legacy v1 publication replay authority
</commit_message>
<xml_diff>
--- a/docs/VESKIFY_DEVELOPMENT_DELIVERY_TRACKER_v1.3.0.docx
+++ b/docs/VESKIFY_DEVELOPMENT_DELIVERY_TRACKER_v1.3.0.docx
@@ -38,7 +38,7 @@
         <w:rPr>
           <w:rFonts w:ascii="Calibri" w:hAnsi="Calibri" w:cs="Calibri"/>
         </w:rPr>
-        <w:t>Delivery status baseline: 3 September 2026, P10B-19A-09B Historical v1 Snapshot Read and Render Replay Baseline</w:t>
+        <w:t>Delivery status baseline: 3 September 2026, P10B-19A-09C Publication Replay and P10B-19A-09 Closure Baseline</w:t>
       </w:r>
     </w:p>
     <w:p>
@@ -249,7 +249,7 @@
               <w:rPr>
                 <w:rFonts w:ascii="Calibri" w:hAnsi="Calibri" w:cs="Calibri"/>
               </w:rPr>
-              <w:t>3 September 2026, P10B-19A-09B Historical v1 Snapshot Read and Render Replay Baseline</w:t>
+              <w:t>3 September 2026, P10B-19A-09C Publication Replay and P10B-19A-09 Closure Baseline</w:t>
             </w:r>
           </w:p>
         </w:tc>
@@ -9492,7 +9492,7 @@
               <w:rPr>
                 <w:rFonts w:ascii="Calibri" w:hAnsi="Calibri" w:cs="Calibri"/>
               </w:rPr>
-              <w:t>☐</w:t>
+              <w:t>☑</w:t>
             </w:r>
           </w:p>
         </w:tc>
@@ -9549,7 +9549,7 @@
                 <w:b/>
                 <w:bCs/>
               </w:rPr>
-              <w:t>Partial</w:t>
+              <w:t>Baseline / closed</w:t>
             </w:r>
           </w:p>
         </w:tc>
@@ -9603,7 +9603,7 @@
               <w:rPr>
                 <w:rFonts w:ascii="Calibri" w:hAnsi="Calibri" w:cs="Calibri"/>
               </w:rPr>
-              <w:t>A-09A alias/reference and A-09B historical read/render replay are Baseline; A-09C publication replay remains</w:t>
+              <w:t>A-09A identity, A-09B read/render replay and A-09C publication replay complete the accepted v1 compatibility outcome</w:t>
             </w:r>
           </w:p>
         </w:tc>
@@ -9897,7 +9897,7 @@
               <w:rPr>
                 <w:rFonts w:ascii="Calibri" w:hAnsi="Calibri" w:cs="Calibri"/>
               </w:rPr>
-              <w:t>☐</w:t>
+              <w:t>☑</w:t>
             </w:r>
           </w:p>
         </w:tc>
@@ -9954,7 +9954,7 @@
                 <w:b/>
                 <w:bCs/>
               </w:rPr>
-              <w:t>Planned / exact next</w:t>
+              <w:t>Baseline</w:t>
             </w:r>
           </w:p>
         </w:tc>
@@ -9972,7 +9972,7 @@
               <w:rPr>
                 <w:rFonts w:ascii="Calibri" w:hAnsi="Calibri" w:cs="Calibri"/>
               </w:rPr>
-              <w:t>Planned task owner</w:t>
+              <w:t>P10B-19A task owner</w:t>
             </w:r>
           </w:p>
         </w:tc>
@@ -10008,7 +10008,7 @@
               <w:rPr>
                 <w:rFonts w:ascii="Calibri" w:hAnsi="Calibri" w:cs="Calibri"/>
               </w:rPr>
-              <w:t>Prove publication replay and close parent A-09 without changing current generation</w:t>
+              <w:t>Current compiler/manual-source replay, A-09B binding, three atomic confirmations, active-version integrity, and 36/36 published plus 36/36 normalized Preview parity observations</w:t>
             </w:r>
           </w:p>
         </w:tc>
@@ -10089,7 +10089,7 @@
                 <w:b/>
                 <w:bCs/>
               </w:rPr>
-              <w:t>Planned</w:t>
+              <w:t>Planned / exact next</w:t>
             </w:r>
           </w:p>
         </w:tc>
@@ -14516,7 +14516,7 @@
         <w:rPr>
           <w:rFonts w:ascii="Calibri" w:hAnsi="Calibri" w:cs="Calibri"/>
         </w:rPr>
-        <w:t xml:space="preserve">P10B remains Partial. DEVX-01A through DEVX-01G are Baseline, and DEVX-01 is Baseline / closed. P10B-19A-01 through P10B-19A-07 and P10B-19A-08A through P10B-19A-08C are Baseline; parent P10B-19A-08 is Baseline / closed; P10B-19A-09A and P10B-19A-09B are Baseline; parent P10B-19A-09 and P10B-19A remain Partial; P10B-19A-09C is the exact next implementation task; P10B-19A-10 is Planned after A-09C; P10B remains Partial. DEVX-01C measured the serial gate, retained PR/ref-scoped cancellation and added compatible </w:t>
+        <w:t xml:space="preserve">P10B remains Partial. DEVX-01A through DEVX-01G are Baseline, and DEVX-01 is Baseline / closed. P10B-19A-01 through P10B-19A-07 and P10B-19A-08A through P10B-19A-08C are Baseline; parent P10B-19A-08 is Baseline / closed; P10B-19A-09A, P10B-19A-09B and P10B-19A-09C are Baseline; parent P10B-19A-09 is Baseline / closed; P10B-19A remains Partial; P10B-19A-10 is the exact next implementation task; P10B remains Partial. DEVX-01C measured the serial gate, retained PR/ref-scoped cancellation and added compatible </w:t>
       </w:r>
       <w:r>
         <w:rPr>
@@ -15681,7 +15681,7 @@
         <w:rPr>
           <w:rFonts w:ascii="Calibri" w:hAnsi="Calibri" w:cs="Calibri"/>
         </w:rPr>
-        <w:t xml:space="preserve">. P10B-19A-09A and P10B-19A-09B are </w:t>
+        <w:t xml:space="preserve">. P10B-19A-09A, P10B-19A-09B and P10B-19A-09C are </w:t>
       </w:r>
       <w:r>
         <w:rPr>
@@ -15695,7 +15695,21 @@
         <w:rPr>
           <w:rFonts w:ascii="Calibri" w:hAnsi="Calibri" w:cs="Calibri"/>
         </w:rPr>
-        <w:t xml:space="preserve">; parent P10B-19A-09 and P10B-19A remain </w:t>
+        <w:t xml:space="preserve">; parent P10B-19A-09 is </w:t>
+      </w:r>
+      <w:r>
+        <w:rPr>
+          <w:rFonts w:ascii="Calibri" w:hAnsi="Calibri" w:cs="Calibri"/>
+          <w:b/>
+          <w:bCs/>
+        </w:rPr>
+        <w:t>Baseline / closed</w:t>
+      </w:r>
+      <w:r>
+        <w:rPr>
+          <w:rFonts w:ascii="Calibri" w:hAnsi="Calibri" w:cs="Calibri"/>
+        </w:rPr>
+        <w:t xml:space="preserve">. P10B-19A remains </w:t>
       </w:r>
       <w:r>
         <w:rPr>
@@ -15709,7 +15723,7 @@
         <w:rPr>
           <w:rFonts w:ascii="Calibri" w:hAnsi="Calibri" w:cs="Calibri"/>
         </w:rPr>
-        <w:t xml:space="preserve">. P10B-19A-09C is the </w:t>
+        <w:t xml:space="preserve">, and P10B-19A-10 is the </w:t>
       </w:r>
       <w:r>
         <w:rPr>
@@ -15723,7 +15737,7 @@
         <w:rPr>
           <w:rFonts w:ascii="Calibri" w:hAnsi="Calibri" w:cs="Calibri"/>
         </w:rPr>
-        <w:t>, and P10B-19A-10 is Planned after A-09C.</w:t>
+        <w:t>.</w:t>
       </w:r>
     </w:p>
     <w:p>
@@ -15967,7 +15981,7 @@
         <w:rPr>
           <w:rFonts w:ascii="Calibri" w:hAnsi="Calibri" w:cs="Calibri"/>
         </w:rPr>
-        <w:t xml:space="preserve"> from replay fingerprint identity. It performs no snapshot, appearance, profile or topology inference, creates no v2 identity, and does not read, write, render or publish historical state. Historical snapshot read/render replay remains A-09B; publication replay and parent A-09 closure remain A-09C. Current generation and merchant-visible behavior are unchanged.</w:t>
+        <w:t xml:space="preserve"> from replay fingerprint identity. It performs no snapshot, appearance, profile or topology inference, creates no v2 identity, and does not read, write, render or publish historical state. Historical snapshot read/render replay is owned by A-09B; publication replay and parent A-09 closure are owned by A-09C. Current generation and merchant-visible behavior are unchanged.</w:t>
       </w:r>
     </w:p>
     <w:p>
@@ -16035,7 +16049,33 @@
         <w:rPr>
           <w:rFonts w:ascii="Calibri" w:hAnsi="Calibri" w:cs="Calibri"/>
         </w:rPr>
-        <w:t>. Frozen exact-base evidence matches 36 of 36 bounded current-renderer observations for the three representatives across EN/FI, with zero snapshot mutation, repository write, commerce change, media change, or route/profile/frame mismatch. This is not raw HTML equality, original-lineage recovery, migration, publication replay, v2 authority, or merchant-visible change. A-09C owns publication replay and parent A-09 closure and is the exact next implementation task.</w:t>
+        <w:t>. Frozen exact-base evidence matches 36 of 36 bounded current-renderer observations for the three representatives across EN/FI, with zero snapshot mutation, repository write, commerce change, media change, or route/profile/frame mismatch. This is not raw HTML equality, original-lineage recovery, migration, publication replay, v2 authority, or merchant-visible change.</w:t>
+      </w:r>
+    </w:p>
+    <w:p>
+      <w:pPr>
+        <w:pStyle w:val="Normal"/>
+        <w:widowControl/>
+      </w:pPr>
+      <w:r>
+        <w:rPr>
+          <w:rFonts w:ascii="Calibri" w:hAnsi="Calibri" w:cs="Calibri"/>
+        </w:rPr>
+        <w:t xml:space="preserve">P10B-19A-09C consumes the exact A-09B result and receipt, projects the historical snapshot only as a detached transient draft, and reuses the current canonical publication compiler with truthful </w:t>
+      </w:r>
+      <w:r>
+        <w:rPr>
+          <w:rFonts w:ascii="Consolas" w:hAnsi="Consolas" w:cs="Consolas"/>
+          <w:sz w:val="19"/>
+          <w:szCs w:val="19"/>
+        </w:rPr>
+        <w:t>manual</w:t>
+      </w:r>
+      <w:r>
+        <w:rPr>
+          <w:rFonts w:ascii="Calibri" w:hAnsi="Calibri" w:cs="Calibri"/>
+        </w:rPr>
+        <w:t xml:space="preserve"> source authority. It requires current migration status without write-back and returns one strict immutable replay receipt bound to A-09B and compiler fingerprints. Frozen exact-base evidence matches three direct compilations, three preparations and exactly three isolated atomic publication confirmations, including exact active compiled-artifact and added-version integrity. All 36 of 36 published renderer observations and all 36 of 36 normalized Preview/published structural observations match. Source aggregates and snapshots remain unchanged; provider, Vesko and external-publication calls are zero. No production/runtime consumer, v2 activation or merchant-visible change is added. Parent P10B-19A-09 is Baseline / closed; P10B-19A remains Partial until A-10, the exact next implementation task.</w:t>
       </w:r>
     </w:p>
     <w:p>
@@ -17512,7 +17552,7 @@
         <w:rPr>
           <w:rFonts w:ascii="Calibri" w:hAnsi="Calibri" w:cs="Calibri"/>
         </w:rPr>
-        <w:t xml:space="preserve">. P10B-19A-09A and P10B-19A-09B are </w:t>
+        <w:t xml:space="preserve">. P10B-19A-09A, P10B-19A-09B and P10B-19A-09C are </w:t>
       </w:r>
       <w:r>
         <w:rPr>
@@ -17526,7 +17566,21 @@
         <w:rPr>
           <w:rFonts w:ascii="Calibri" w:hAnsi="Calibri" w:cs="Calibri"/>
         </w:rPr>
-        <w:t xml:space="preserve">; parent P10B-19A-09 and P10B-19A are </w:t>
+        <w:t xml:space="preserve">; parent P10B-19A-09 is </w:t>
+      </w:r>
+      <w:r>
+        <w:rPr>
+          <w:rFonts w:ascii="Calibri" w:hAnsi="Calibri" w:cs="Calibri"/>
+          <w:b/>
+          <w:bCs/>
+        </w:rPr>
+        <w:t>Baseline / closed</w:t>
+      </w:r>
+      <w:r>
+        <w:rPr>
+          <w:rFonts w:ascii="Calibri" w:hAnsi="Calibri" w:cs="Calibri"/>
+        </w:rPr>
+        <w:t xml:space="preserve">. P10B-19A remains </w:t>
       </w:r>
       <w:r>
         <w:rPr>
@@ -17540,7 +17594,7 @@
         <w:rPr>
           <w:rFonts w:ascii="Calibri" w:hAnsi="Calibri" w:cs="Calibri"/>
         </w:rPr>
-        <w:t xml:space="preserve">. P10B-19A-09C is the </w:t>
+        <w:t xml:space="preserve">, and P10B-19A-10 is the </w:t>
       </w:r>
       <w:r>
         <w:rPr>
@@ -17554,21 +17608,7 @@
         <w:rPr>
           <w:rFonts w:ascii="Calibri" w:hAnsi="Calibri" w:cs="Calibri"/>
         </w:rPr>
-        <w:t xml:space="preserve">, and P10B-19A-10 remains </w:t>
-      </w:r>
-      <w:r>
-        <w:rPr>
-          <w:rFonts w:ascii="Calibri" w:hAnsi="Calibri" w:cs="Calibri"/>
-          <w:b/>
-          <w:bCs/>
-        </w:rPr>
-        <w:t>Planned</w:t>
-      </w:r>
-      <w:r>
-        <w:rPr>
-          <w:rFonts w:ascii="Calibri" w:hAnsi="Calibri" w:cs="Calibri"/>
-        </w:rPr>
-        <w:t xml:space="preserve"> after A-09C. P10B-16P-04 acceptance evidence is retained in </w:t>
+        <w:t xml:space="preserve">. P10B-16P-04 acceptance evidence is retained in </w:t>
       </w:r>
       <w:hyperlink r:id="rIdHyperlink5" w:history="1">
         <w:r>
@@ -17584,7 +17624,7 @@
         <w:rPr>
           <w:rFonts w:ascii="Calibri" w:hAnsi="Calibri" w:cs="Calibri"/>
         </w:rPr>
-        <w:t>. The remaining Done conditions are implementation gates, not claims about the current repository. The P10B-16P-01 through P10B-16P-05A plus P10B-16P-06 sequence is a mandatory convergence package between P10B-16 and P10B-17; it supplements rather than renumbers the locked P10B-01 through P10B-18 plan. P10B-16P-05B follows accepted P10B-18C and is now Baseline. P10B-18D completed as a rejected-quality diagnostic. P10B-19 PRE is Baseline. P10B-19A-01 through P10B-19A-07 and P10B-19A-08A through P10B-19A-08C are Baseline; parent P10B-19A-08 is Baseline / closed. P10B-19A-09A and P10B-19A-09B are Baseline; parent P10B-19A-09 and P10B-19A remain Partial. P10B-19A-09C is the exact next implementation task; P10B-19A-10 remains Planned after A-09C; P10B-19B through P10B-19J remain Planned.</w:t>
+        <w:t>. The remaining Done conditions are implementation gates, not claims about the current repository. The P10B-16P-01 through P10B-16P-05A plus P10B-16P-06 sequence is a mandatory convergence package between P10B-16 and P10B-17; it supplements rather than renumbers the locked P10B-01 through P10B-18 plan. P10B-16P-05B follows accepted P10B-18C and is now Baseline. P10B-18D completed as a rejected-quality diagnostic. P10B-19 PRE is Baseline. P10B-19A-01 through P10B-19A-07 and P10B-19A-08A through P10B-19A-08C are Baseline; parent P10B-19A-08 is Baseline / closed. P10B-19A-09A, P10B-19A-09B and P10B-19A-09C are Baseline; parent P10B-19A-09 is Baseline / closed. P10B-19A remains Partial; P10B-19A-10 is the exact next implementation task; P10B-19B through P10B-19J remain Planned.</w:t>
       </w:r>
     </w:p>
     <w:p>
@@ -23043,7 +23083,7 @@
         <w:rPr>
           <w:rFonts w:ascii="Calibri" w:hAnsi="Calibri" w:cs="Calibri"/>
         </w:rPr>
-        <w:t>P10B-18C and P10B-16P-05B are Baseline. P10B-18D is a Baseline diagnostic with live commercial quality rejected. P10B-18 and P10B remain Partial. P10B-19 PRE is Baseline. P10B-19A-01 through P10B-19A-07 and P10B-19A-08A through P10B-19A-08C are Baseline; parent P10B-19A-08 is Baseline / closed. P10B-19A-09A and P10B-19A-09B are Baseline; parent P10B-19A-09 and P10B-19A remain Partial. P10B-19A-09C is the exact next implementation task; P10B-19A-10 remains Planned after A-09C; P10B-19B through P10B-19J remain Planned.</w:t>
+        <w:t>P10B-18C and P10B-16P-05B are Baseline. P10B-18D is a Baseline diagnostic with live commercial quality rejected. P10B-18 and P10B remain Partial. P10B-19 PRE is Baseline. P10B-19A-01 through P10B-19A-07 and P10B-19A-08A through P10B-19A-08C are Baseline; parent P10B-19A-08 is Baseline / closed. P10B-19A-09A, P10B-19A-09B and P10B-19A-09C are Baseline; parent P10B-19A-09 is Baseline / closed. P10B-19A remains Partial; P10B-19A-10 is the exact next implementation task; P10B-19B through P10B-19J remain Planned.</w:t>
       </w:r>
     </w:p>
     <w:p>
@@ -25130,7 +25170,7 @@
         <w:rPr>
           <w:rFonts w:ascii="Calibri" w:hAnsi="Calibri" w:cs="Calibri"/>
         </w:rPr>
-        <w:t xml:space="preserve"> and </w:t>
+        <w:t xml:space="preserve"> is Baseline / closed, while </w:t>
       </w:r>
       <w:r>
         <w:rPr>
@@ -25144,7 +25184,7 @@
         <w:rPr>
           <w:rFonts w:ascii="Calibri" w:hAnsi="Calibri" w:cs="Calibri"/>
         </w:rPr>
-        <w:t xml:space="preserve"> remain Partial. P10B-19A-09C is the exact next implementation task; P10B-19A-10 remains Planned after A-09C; P10B-19B through P10B-19J remain Planned.</w:t>
+        <w:t xml:space="preserve"> remains Partial. P10B-19A-10 is the exact next implementation task; P10B-19B through P10B-19J remain Planned.</w:t>
       </w:r>
     </w:p>
     <w:p>
@@ -29140,7 +29180,7 @@
         <w:rPr>
           <w:rFonts w:ascii="Calibri" w:hAnsi="Calibri" w:cs="Calibri"/>
         </w:rPr>
-        <w:t xml:space="preserve"> with zero primary FAIL. P10B-16P-05B subsequently removed the one-time capture platform while retaining the bounded quality gate. P10B-18D subsequently completed as a rejected-quality diagnostic. P10B-19 PRE is Baseline. P10B-19A-01 through P10B-19A-07 and P10B-19A-08A through P10B-19A-08C are Baseline; parent P10B-19A-08 is Baseline / closed. P10B-19A-09A and P10B-19A-09B are Baseline; parent P10B-19A-09 and P10B-19A remain Partial. P10B-19A-09C is the exact next implementation task, and P10B-19A-10 remains Planned after A-09C.</w:t>
+        <w:t xml:space="preserve"> with zero primary FAIL. P10B-16P-05B subsequently removed the one-time capture platform while retaining the bounded quality gate. P10B-18D subsequently completed as a rejected-quality diagnostic. P10B-19 PRE is Baseline. P10B-19A-01 through P10B-19A-07 and P10B-19A-08A through P10B-19A-08C are Baseline; parent P10B-19A-08 is Baseline / closed. P10B-19A-09A, P10B-19A-09B and P10B-19A-09C are Baseline; parent P10B-19A-09 is Baseline / closed. P10B-19A remains Partial, and P10B-19A-10 is the exact next implementation task.</w:t>
       </w:r>
     </w:p>
     <w:p>
@@ -30328,7 +30368,7 @@
               <w:rPr>
                 <w:rFonts w:ascii="Calibri" w:hAnsi="Calibri" w:cs="Calibri"/>
               </w:rPr>
-              <w:t>Current</w:t>
+              <w:t>Baseline</w:t>
             </w:r>
           </w:p>
         </w:tc>
@@ -30366,7 +30406,7 @@
                 <w:b/>
                 <w:bCs/>
               </w:rPr>
-              <w:t>Partial</w:t>
+              <w:t>Baseline / closed</w:t>
             </w:r>
           </w:p>
         </w:tc>
@@ -30384,7 +30424,7 @@
               <w:rPr>
                 <w:rFonts w:ascii="Calibri" w:hAnsi="Calibri" w:cs="Calibri"/>
               </w:rPr>
-              <w:t>A-09A alias/reference and A-09B historical read/render replay are Baseline; publication replay remains</w:t>
+              <w:t>A-09A identity, A-09B historical read/render replay and A-09C publication replay complete the accepted v1 compatibility outcome</w:t>
             </w:r>
           </w:p>
         </w:tc>
@@ -30568,7 +30608,7 @@
               <w:rPr>
                 <w:rFonts w:ascii="Calibri" w:hAnsi="Calibri" w:cs="Calibri"/>
               </w:rPr>
-              <w:t>Next</w:t>
+              <w:t>Baseline</w:t>
             </w:r>
           </w:p>
         </w:tc>
@@ -30606,7 +30646,7 @@
                 <w:b/>
                 <w:bCs/>
               </w:rPr>
-              <w:t>Planned / exact next</w:t>
+              <w:t>Baseline</w:t>
             </w:r>
           </w:p>
         </w:tc>
@@ -30624,7 +30664,7 @@
               <w:rPr>
                 <w:rFonts w:ascii="Calibri" w:hAnsi="Calibri" w:cs="Calibri"/>
               </w:rPr>
-              <w:t>Publication replay and parent A-09 closure after A-09B</w:t>
+              <w:t>Exact A-09B/compiler binding, manual-source replay, three atomic confirmations, active-version integrity and 36/36 published/parity proof</w:t>
             </w:r>
           </w:p>
         </w:tc>
@@ -30648,7 +30688,7 @@
               <w:rPr>
                 <w:rFonts w:ascii="Calibri" w:hAnsi="Calibri" w:cs="Calibri"/>
               </w:rPr>
-              <w:t>Planned</w:t>
+              <w:t>Next</w:t>
             </w:r>
           </w:p>
         </w:tc>
@@ -30686,7 +30726,7 @@
                 <w:b/>
                 <w:bCs/>
               </w:rPr>
-              <w:t>Planned</w:t>
+              <w:t>Planned / exact next</w:t>
             </w:r>
           </w:p>
         </w:tc>
@@ -31186,39 +31226,39 @@
         <w:rPr>
           <w:rFonts w:ascii="Calibri" w:hAnsi="Calibri" w:cs="Calibri"/>
         </w:rPr>
-        <w:t>P10B-19A-09 = Partial</w:t>
-      </w:r>
-    </w:p>
-    <w:p>
-      <w:pPr>
-        <w:pStyle w:val="Normal"/>
-        <w:numPr>
-          <w:ilvl w:val="0"/>
-          <w:numId w:val="1"/>
-        </w:numPr>
-        <w:widowControl/>
-      </w:pPr>
-      <w:r>
-        <w:rPr>
-          <w:rFonts w:ascii="Calibri" w:hAnsi="Calibri" w:cs="Calibri"/>
-        </w:rPr>
-        <w:t>P10B-19A-09C = exact next implementation task</w:t>
-      </w:r>
-    </w:p>
-    <w:p>
-      <w:pPr>
-        <w:pStyle w:val="Normal"/>
-        <w:numPr>
-          <w:ilvl w:val="0"/>
-          <w:numId w:val="1"/>
-        </w:numPr>
-        <w:widowControl/>
-      </w:pPr>
-      <w:r>
-        <w:rPr>
-          <w:rFonts w:ascii="Calibri" w:hAnsi="Calibri" w:cs="Calibri"/>
-        </w:rPr>
-        <w:t>P10B-19A-10 = Planned after P10B-19A-09C</w:t>
+        <w:t>P10B-19A-09C = Baseline</w:t>
+      </w:r>
+    </w:p>
+    <w:p>
+      <w:pPr>
+        <w:pStyle w:val="Normal"/>
+        <w:numPr>
+          <w:ilvl w:val="0"/>
+          <w:numId w:val="1"/>
+        </w:numPr>
+        <w:widowControl/>
+      </w:pPr>
+      <w:r>
+        <w:rPr>
+          <w:rFonts w:ascii="Calibri" w:hAnsi="Calibri" w:cs="Calibri"/>
+        </w:rPr>
+        <w:t>P10B-19A-09 = Baseline / closed</w:t>
+      </w:r>
+    </w:p>
+    <w:p>
+      <w:pPr>
+        <w:pStyle w:val="Normal"/>
+        <w:numPr>
+          <w:ilvl w:val="0"/>
+          <w:numId w:val="1"/>
+        </w:numPr>
+        <w:widowControl/>
+      </w:pPr>
+      <w:r>
+        <w:rPr>
+          <w:rFonts w:ascii="Calibri" w:hAnsi="Calibri" w:cs="Calibri"/>
+        </w:rPr>
+        <w:t>P10B-19A-10 = exact next implementation task</w:t>
       </w:r>
     </w:p>
     <w:p>

</xml_diff>

<commit_message>
test: lock retained matrix inventory baseline
</commit_message>
<xml_diff>
--- a/docs/VESKIFY_DEVELOPMENT_DELIVERY_TRACKER_v1.3.0.docx
+++ b/docs/VESKIFY_DEVELOPMENT_DELIVERY_TRACKER_v1.3.0.docx
@@ -38,7 +38,7 @@
         <w:rPr>
           <w:rFonts w:ascii="Calibri" w:hAnsi="Calibri" w:cs="Calibri"/>
         </w:rPr>
-        <w:t>Delivery status baseline: 3 September 2026, P10B-19A-09C Publication Replay and P10B-19A-09 Closure Baseline</w:t>
+        <w:t>Delivery status baseline: 3 September 2026, P10B-19A-10A Retained Matrix Inventory and Frozen Baseline Lock</w:t>
       </w:r>
     </w:p>
     <w:p>
@@ -249,7 +249,7 @@
               <w:rPr>
                 <w:rFonts w:ascii="Calibri" w:hAnsi="Calibri" w:cs="Calibri"/>
               </w:rPr>
-              <w:t>3 September 2026, P10B-19A-09C Publication Replay and P10B-19A-09 Closure Baseline</w:t>
+              <w:t>3 September 2026, P10B-19A-10A Retained Matrix Inventory and Frozen Baseline Lock</w:t>
             </w:r>
           </w:p>
         </w:tc>
@@ -10089,6 +10089,276 @@
                 <w:b/>
                 <w:bCs/>
               </w:rPr>
+              <w:t>Partial</w:t>
+            </w:r>
+          </w:p>
+        </w:tc>
+        <w:tc>
+          <w:tcPr>
+            <w:tcW w:w="1500" w:type="dxa"/>
+            <w:vAlign w:val="center"/>
+          </w:tcPr>
+          <w:p>
+            <w:pPr>
+              <w:pStyle w:val="CompactTableText"/>
+              <w:widowControl/>
+            </w:pPr>
+            <w:r>
+              <w:rPr>
+                <w:rFonts w:ascii="Calibri" w:hAnsi="Calibri" w:cs="Calibri"/>
+              </w:rPr>
+              <w:t>P10B-19A task owner</w:t>
+            </w:r>
+          </w:p>
+        </w:tc>
+        <w:tc>
+          <w:tcPr>
+            <w:tcW w:w="2500" w:type="dxa"/>
+            <w:vAlign w:val="center"/>
+          </w:tcPr>
+          <w:p>
+            <w:pPr>
+              <w:pStyle w:val="CompactTableText"/>
+              <w:widowControl/>
+            </w:pPr>
+            <w:r>
+              <w:rPr>
+                <w:rFonts w:ascii="Calibri" w:hAnsi="Calibri" w:cs="Calibri"/>
+              </w:rPr>
+              <w:t>P10B-19A-09C merged</w:t>
+            </w:r>
+          </w:p>
+        </w:tc>
+        <w:tc>
+          <w:tcPr>
+            <w:tcW w:w="2890" w:type="dxa"/>
+            <w:vAlign w:val="center"/>
+          </w:tcPr>
+          <w:p>
+            <w:pPr>
+              <w:pStyle w:val="CompactTableText"/>
+              <w:widowControl/>
+            </w:pPr>
+            <w:r>
+              <w:rPr>
+                <w:rFonts w:ascii="Calibri" w:hAnsi="Calibri" w:cs="Calibri"/>
+              </w:rPr>
+              <w:t>A-10A inventory complete; A-10B integration/failure matrix and A-10C retained closure gate remain</w:t>
+            </w:r>
+          </w:p>
+        </w:tc>
+      </w:tr>
+      <w:tr>
+        <w:trPr>
+          <w:cantSplit/>
+        </w:trPr>
+        <w:tc>
+          <w:tcPr>
+            <w:tcW w:w="720" w:type="dxa"/>
+            <w:vAlign w:val="center"/>
+          </w:tcPr>
+          <w:p>
+            <w:pPr>
+              <w:pStyle w:val="CompactTableText"/>
+              <w:jc w:val="center"/>
+              <w:widowControl/>
+            </w:pPr>
+            <w:r>
+              <w:rPr>
+                <w:rFonts w:ascii="Calibri" w:hAnsi="Calibri" w:cs="Calibri"/>
+              </w:rPr>
+              <w:t>☑</w:t>
+            </w:r>
+          </w:p>
+        </w:tc>
+        <w:tc>
+          <w:tcPr>
+            <w:tcW w:w="1700" w:type="dxa"/>
+            <w:vAlign w:val="center"/>
+          </w:tcPr>
+          <w:p>
+            <w:pPr>
+              <w:pStyle w:val="CompactTableText"/>
+              <w:widowControl/>
+            </w:pPr>
+            <w:r>
+              <w:rPr>
+                <w:rFonts w:ascii="Calibri" w:hAnsi="Calibri" w:cs="Calibri"/>
+              </w:rPr>
+              <w:t>P10B-19A-10A</w:t>
+            </w:r>
+          </w:p>
+        </w:tc>
+        <w:tc>
+          <w:tcPr>
+            <w:tcW w:w="2800" w:type="dxa"/>
+            <w:vAlign w:val="center"/>
+          </w:tcPr>
+          <w:p>
+            <w:pPr>
+              <w:pStyle w:val="CompactTableText"/>
+              <w:widowControl/>
+            </w:pPr>
+            <w:r>
+              <w:rPr>
+                <w:rFonts w:ascii="Calibri" w:hAnsi="Calibri" w:cs="Calibri"/>
+              </w:rPr>
+              <w:t>Retained Matrix Inventory and Frozen Baseline Lock</w:t>
+            </w:r>
+          </w:p>
+        </w:tc>
+        <w:tc>
+          <w:tcPr>
+            <w:tcW w:w="850" w:type="dxa"/>
+            <w:vAlign w:val="center"/>
+          </w:tcPr>
+          <w:p>
+            <w:pPr>
+              <w:pStyle w:val="CompactTableText"/>
+              <w:jc w:val="center"/>
+              <w:widowControl/>
+            </w:pPr>
+            <w:r>
+              <w:rPr>
+                <w:rFonts w:ascii="Calibri" w:hAnsi="Calibri" w:cs="Calibri"/>
+                <w:b/>
+                <w:bCs/>
+              </w:rPr>
+              <w:t>Baseline</w:t>
+            </w:r>
+          </w:p>
+        </w:tc>
+        <w:tc>
+          <w:tcPr>
+            <w:tcW w:w="1500" w:type="dxa"/>
+            <w:vAlign w:val="center"/>
+          </w:tcPr>
+          <w:p>
+            <w:pPr>
+              <w:pStyle w:val="CompactTableText"/>
+              <w:widowControl/>
+            </w:pPr>
+            <w:r>
+              <w:rPr>
+                <w:rFonts w:ascii="Calibri" w:hAnsi="Calibri" w:cs="Calibri"/>
+              </w:rPr>
+              <w:t>P10B-19A task owner</w:t>
+            </w:r>
+          </w:p>
+        </w:tc>
+        <w:tc>
+          <w:tcPr>
+            <w:tcW w:w="2500" w:type="dxa"/>
+            <w:vAlign w:val="center"/>
+          </w:tcPr>
+          <w:p>
+            <w:pPr>
+              <w:pStyle w:val="CompactTableText"/>
+              <w:widowControl/>
+            </w:pPr>
+            <w:r>
+              <w:rPr>
+                <w:rFonts w:ascii="Calibri" w:hAnsi="Calibri" w:cs="Calibri"/>
+              </w:rPr>
+              <w:t>P10B-19A-09C merged</w:t>
+            </w:r>
+          </w:p>
+        </w:tc>
+        <w:tc>
+          <w:tcPr>
+            <w:tcW w:w="2890" w:type="dxa"/>
+            <w:vAlign w:val="center"/>
+          </w:tcPr>
+          <w:p>
+            <w:pPr>
+              <w:pStyle w:val="CompactTableText"/>
+              <w:widowControl/>
+            </w:pPr>
+            <w:r>
+              <w:rPr>
+                <w:rFonts w:ascii="Calibri" w:hAnsi="Calibri" w:cs="Calibri"/>
+              </w:rPr>
+              <w:t>24 explicit gates, exact 126/72 and A-09 metrics, 76 protected hashes, nine inactivity zeroes and dynamic CI discovery; zero production changes</w:t>
+            </w:r>
+          </w:p>
+        </w:tc>
+      </w:tr>
+      <w:tr>
+        <w:trPr>
+          <w:cantSplit/>
+        </w:trPr>
+        <w:tc>
+          <w:tcPr>
+            <w:tcW w:w="720" w:type="dxa"/>
+            <w:vAlign w:val="center"/>
+          </w:tcPr>
+          <w:p>
+            <w:pPr>
+              <w:pStyle w:val="CompactTableText"/>
+              <w:jc w:val="center"/>
+              <w:widowControl/>
+            </w:pPr>
+            <w:r>
+              <w:rPr>
+                <w:rFonts w:ascii="Calibri" w:hAnsi="Calibri" w:cs="Calibri"/>
+              </w:rPr>
+              <w:t>☐</w:t>
+            </w:r>
+          </w:p>
+        </w:tc>
+        <w:tc>
+          <w:tcPr>
+            <w:tcW w:w="1700" w:type="dxa"/>
+            <w:vAlign w:val="center"/>
+          </w:tcPr>
+          <w:p>
+            <w:pPr>
+              <w:pStyle w:val="CompactTableText"/>
+              <w:widowControl/>
+            </w:pPr>
+            <w:r>
+              <w:rPr>
+                <w:rFonts w:ascii="Calibri" w:hAnsi="Calibri" w:cs="Calibri"/>
+              </w:rPr>
+              <w:t>P10B-19A-10B</w:t>
+            </w:r>
+          </w:p>
+        </w:tc>
+        <w:tc>
+          <w:tcPr>
+            <w:tcW w:w="2800" w:type="dxa"/>
+            <w:vAlign w:val="center"/>
+          </w:tcPr>
+          <w:p>
+            <w:pPr>
+              <w:pStyle w:val="CompactTableText"/>
+              <w:widowControl/>
+            </w:pPr>
+            <w:r>
+              <w:rPr>
+                <w:rFonts w:ascii="Calibri" w:hAnsi="Calibri" w:cs="Calibri"/>
+              </w:rPr>
+              <w:t>Cross-Authority Integration and Failure Matrix</w:t>
+            </w:r>
+          </w:p>
+        </w:tc>
+        <w:tc>
+          <w:tcPr>
+            <w:tcW w:w="850" w:type="dxa"/>
+            <w:vAlign w:val="center"/>
+          </w:tcPr>
+          <w:p>
+            <w:pPr>
+              <w:pStyle w:val="CompactTableText"/>
+              <w:jc w:val="center"/>
+              <w:widowControl/>
+            </w:pPr>
+            <w:r>
+              <w:rPr>
+                <w:rFonts w:ascii="Calibri" w:hAnsi="Calibri" w:cs="Calibri"/>
+                <w:b/>
+                <w:bCs/>
+              </w:rPr>
               <w:t>Planned / exact next</w:t>
             </w:r>
           </w:p>
@@ -10125,7 +10395,7 @@
               <w:rPr>
                 <w:rFonts w:ascii="Calibri" w:hAnsi="Calibri" w:cs="Calibri"/>
               </w:rPr>
-              <w:t>P10B-19A-09C merged</w:t>
+              <w:t>P10B-19A-10A merged</w:t>
             </w:r>
           </w:p>
         </w:tc>
@@ -10143,7 +10413,277 @@
               <w:rPr>
                 <w:rFonts w:ascii="Calibri" w:hAnsi="Calibri" w:cs="Calibri"/>
               </w:rPr>
-              <w:t>Run retained integration matrices and close P10B-19A without pulling in later P10B-19 packages</w:t>
+              <w:t>Consume the frozen A-10A inventory for bounded cross-authority positive and negative integration evidence</w:t>
+            </w:r>
+          </w:p>
+        </w:tc>
+      </w:tr>
+      <w:tr>
+        <w:trPr>
+          <w:cantSplit/>
+        </w:trPr>
+        <w:tc>
+          <w:tcPr>
+            <w:tcW w:w="720" w:type="dxa"/>
+            <w:vAlign w:val="center"/>
+          </w:tcPr>
+          <w:p>
+            <w:pPr>
+              <w:pStyle w:val="CompactTableText"/>
+              <w:jc w:val="center"/>
+              <w:widowControl/>
+            </w:pPr>
+            <w:r>
+              <w:rPr>
+                <w:rFonts w:ascii="Calibri" w:hAnsi="Calibri" w:cs="Calibri"/>
+              </w:rPr>
+              <w:t>☐</w:t>
+            </w:r>
+          </w:p>
+        </w:tc>
+        <w:tc>
+          <w:tcPr>
+            <w:tcW w:w="1700" w:type="dxa"/>
+            <w:vAlign w:val="center"/>
+          </w:tcPr>
+          <w:p>
+            <w:pPr>
+              <w:pStyle w:val="CompactTableText"/>
+              <w:widowControl/>
+            </w:pPr>
+            <w:r>
+              <w:rPr>
+                <w:rFonts w:ascii="Calibri" w:hAnsi="Calibri" w:cs="Calibri"/>
+              </w:rPr>
+              <w:t>P10B-19A-10C</w:t>
+            </w:r>
+          </w:p>
+        </w:tc>
+        <w:tc>
+          <w:tcPr>
+            <w:tcW w:w="2800" w:type="dxa"/>
+            <w:vAlign w:val="center"/>
+          </w:tcPr>
+          <w:p>
+            <w:pPr>
+              <w:pStyle w:val="CompactTableText"/>
+              <w:widowControl/>
+            </w:pPr>
+            <w:r>
+              <w:rPr>
+                <w:rFonts w:ascii="Calibri" w:hAnsi="Calibri" w:cs="Calibri"/>
+              </w:rPr>
+              <w:t>P10B-19A Closure and Product-Owner Architecture Gate</w:t>
+            </w:r>
+          </w:p>
+        </w:tc>
+        <w:tc>
+          <w:tcPr>
+            <w:tcW w:w="850" w:type="dxa"/>
+            <w:vAlign w:val="center"/>
+          </w:tcPr>
+          <w:p>
+            <w:pPr>
+              <w:pStyle w:val="CompactTableText"/>
+              <w:jc w:val="center"/>
+              <w:widowControl/>
+            </w:pPr>
+            <w:r>
+              <w:rPr>
+                <w:rFonts w:ascii="Calibri" w:hAnsi="Calibri" w:cs="Calibri"/>
+                <w:b/>
+                <w:bCs/>
+              </w:rPr>
+              <w:t>Planned</w:t>
+            </w:r>
+          </w:p>
+        </w:tc>
+        <w:tc>
+          <w:tcPr>
+            <w:tcW w:w="1500" w:type="dxa"/>
+            <w:vAlign w:val="center"/>
+          </w:tcPr>
+          <w:p>
+            <w:pPr>
+              <w:pStyle w:val="CompactTableText"/>
+              <w:widowControl/>
+            </w:pPr>
+            <w:r>
+              <w:rPr>
+                <w:rFonts w:ascii="Calibri" w:hAnsi="Calibri" w:cs="Calibri"/>
+              </w:rPr>
+              <w:t>Planned task owner</w:t>
+            </w:r>
+          </w:p>
+        </w:tc>
+        <w:tc>
+          <w:tcPr>
+            <w:tcW w:w="2500" w:type="dxa"/>
+            <w:vAlign w:val="center"/>
+          </w:tcPr>
+          <w:p>
+            <w:pPr>
+              <w:pStyle w:val="CompactTableText"/>
+              <w:widowControl/>
+            </w:pPr>
+            <w:r>
+              <w:rPr>
+                <w:rFonts w:ascii="Calibri" w:hAnsi="Calibri" w:cs="Calibri"/>
+              </w:rPr>
+              <w:t>P10B-19A-10B merged</w:t>
+            </w:r>
+          </w:p>
+        </w:tc>
+        <w:tc>
+          <w:tcPr>
+            <w:tcW w:w="2890" w:type="dxa"/>
+            <w:vAlign w:val="center"/>
+          </w:tcPr>
+          <w:p>
+            <w:pPr>
+              <w:pStyle w:val="CompactTableText"/>
+              <w:widowControl/>
+            </w:pPr>
+            <w:r>
+              <w:rPr>
+                <w:rFonts w:ascii="Calibri" w:hAnsi="Calibri" w:cs="Calibri"/>
+              </w:rPr>
+              <w:t>Complete retained execution, closure report and explicit product-owner architecture gate</w:t>
+            </w:r>
+          </w:p>
+        </w:tc>
+      </w:tr>
+      <w:tr>
+        <w:trPr>
+          <w:cantSplit/>
+        </w:trPr>
+        <w:tc>
+          <w:tcPr>
+            <w:tcW w:w="720" w:type="dxa"/>
+            <w:vAlign w:val="center"/>
+          </w:tcPr>
+          <w:p>
+            <w:pPr>
+              <w:pStyle w:val="CompactTableText"/>
+              <w:jc w:val="center"/>
+              <w:widowControl/>
+            </w:pPr>
+            <w:r>
+              <w:rPr>
+                <w:rFonts w:ascii="Calibri" w:hAnsi="Calibri" w:cs="Calibri"/>
+              </w:rPr>
+              <w:t>☐</w:t>
+            </w:r>
+          </w:p>
+        </w:tc>
+        <w:tc>
+          <w:tcPr>
+            <w:tcW w:w="1700" w:type="dxa"/>
+            <w:vAlign w:val="center"/>
+          </w:tcPr>
+          <w:p>
+            <w:pPr>
+              <w:pStyle w:val="CompactTableText"/>
+              <w:widowControl/>
+            </w:pPr>
+            <w:r>
+              <w:rPr>
+                <w:rFonts w:ascii="Calibri" w:hAnsi="Calibri" w:cs="Calibri"/>
+              </w:rPr>
+              <w:t>P10B-19B-01</w:t>
+            </w:r>
+          </w:p>
+        </w:tc>
+        <w:tc>
+          <w:tcPr>
+            <w:tcW w:w="2800" w:type="dxa"/>
+            <w:vAlign w:val="center"/>
+          </w:tcPr>
+          <w:p>
+            <w:pPr>
+              <w:pStyle w:val="CompactTableText"/>
+              <w:widowControl/>
+            </w:pPr>
+            <w:r>
+              <w:rPr>
+                <w:rFonts w:ascii="Calibri" w:hAnsi="Calibri" w:cs="Calibri"/>
+              </w:rPr>
+              <w:t>First Visual Recipe child</w:t>
+            </w:r>
+          </w:p>
+        </w:tc>
+        <w:tc>
+          <w:tcPr>
+            <w:tcW w:w="850" w:type="dxa"/>
+            <w:vAlign w:val="center"/>
+          </w:tcPr>
+          <w:p>
+            <w:pPr>
+              <w:pStyle w:val="CompactTableText"/>
+              <w:jc w:val="center"/>
+              <w:widowControl/>
+            </w:pPr>
+            <w:r>
+              <w:rPr>
+                <w:rFonts w:ascii="Calibri" w:hAnsi="Calibri" w:cs="Calibri"/>
+                <w:b/>
+                <w:bCs/>
+              </w:rPr>
+              <w:t>Planned</w:t>
+            </w:r>
+          </w:p>
+        </w:tc>
+        <w:tc>
+          <w:tcPr>
+            <w:tcW w:w="1500" w:type="dxa"/>
+            <w:vAlign w:val="center"/>
+          </w:tcPr>
+          <w:p>
+            <w:pPr>
+              <w:pStyle w:val="CompactTableText"/>
+              <w:widowControl/>
+            </w:pPr>
+            <w:r>
+              <w:rPr>
+                <w:rFonts w:ascii="Calibri" w:hAnsi="Calibri" w:cs="Calibri"/>
+              </w:rPr>
+              <w:t>Planned task owner</w:t>
+            </w:r>
+          </w:p>
+        </w:tc>
+        <w:tc>
+          <w:tcPr>
+            <w:tcW w:w="2500" w:type="dxa"/>
+            <w:vAlign w:val="center"/>
+          </w:tcPr>
+          <w:p>
+            <w:pPr>
+              <w:pStyle w:val="CompactTableText"/>
+              <w:widowControl/>
+            </w:pPr>
+            <w:r>
+              <w:rPr>
+                <w:rFonts w:ascii="Calibri" w:hAnsi="Calibri" w:cs="Calibri"/>
+              </w:rPr>
+              <w:t>P10B-19A-10C merged</w:t>
+            </w:r>
+          </w:p>
+        </w:tc>
+        <w:tc>
+          <w:tcPr>
+            <w:tcW w:w="2890" w:type="dxa"/>
+            <w:vAlign w:val="center"/>
+          </w:tcPr>
+          <w:p>
+            <w:pPr>
+              <w:pStyle w:val="CompactTableText"/>
+              <w:widowControl/>
+            </w:pPr>
+            <w:r>
+              <w:rPr>
+                <w:rFonts w:ascii="Calibri" w:hAnsi="Calibri" w:cs="Calibri"/>
+              </w:rPr>
+              <w:t>Begin only after parent P10B-19A closes</w:t>
             </w:r>
           </w:p>
         </w:tc>
@@ -14516,7 +15056,7 @@
         <w:rPr>
           <w:rFonts w:ascii="Calibri" w:hAnsi="Calibri" w:cs="Calibri"/>
         </w:rPr>
-        <w:t xml:space="preserve">P10B remains Partial. DEVX-01A through DEVX-01G are Baseline, and DEVX-01 is Baseline / closed. P10B-19A-01 through P10B-19A-07 and P10B-19A-08A through P10B-19A-08C are Baseline; parent P10B-19A-08 is Baseline / closed; P10B-19A-09A, P10B-19A-09B and P10B-19A-09C are Baseline; parent P10B-19A-09 is Baseline / closed; P10B-19A remains Partial; P10B-19A-10 is the exact next implementation task; P10B remains Partial. DEVX-01C measured the serial gate, retained PR/ref-scoped cancellation and added compatible </w:t>
+        <w:t xml:space="preserve">P10B remains Partial. DEVX-01A through DEVX-01G are Baseline, and DEVX-01 is Baseline / closed. P10B-19A-01 through P10B-19A-07, P10B-19A-08A through P10B-19A-08C, P10B-19A-09A through P10B-19A-09C, and P10B-19A-10A are Baseline; parents P10B-19A-08 and P10B-19A-09 are Baseline / closed; parent P10B-19A-10 and P10B-19A remain Partial; P10B-19A-10B is the exact next implementation task; P10B-19A-10C is Planned after A-10B; P10B-19B-01 is Planned after A-10C; P10B remains Partial. DEVX-01C measured the serial gate, retained PR/ref-scoped cancellation and added compatible </w:t>
       </w:r>
       <w:r>
         <w:rPr>
@@ -15637,6 +16177,183 @@
           </w:p>
         </w:tc>
       </w:tr>
+      <w:tr>
+        <w:trPr>
+          <w:cantSplit/>
+        </w:trPr>
+        <w:tc>
+          <w:tcPr>
+            <w:tcW w:w="900" w:type="dxa"/>
+            <w:vAlign w:val="center"/>
+          </w:tcPr>
+          <w:p>
+            <w:pPr>
+              <w:pStyle w:val="TableText"/>
+              <w:widowControl/>
+            </w:pPr>
+            <w:r>
+              <w:rPr>
+                <w:rFonts w:ascii="Calibri" w:hAnsi="Calibri" w:cs="Calibri"/>
+              </w:rPr>
+              <w:t>10A</w:t>
+            </w:r>
+          </w:p>
+        </w:tc>
+        <w:tc>
+          <w:tcPr>
+            <w:tcW w:w="7600" w:type="dxa"/>
+            <w:vAlign w:val="center"/>
+          </w:tcPr>
+          <w:p>
+            <w:pPr>
+              <w:pStyle w:val="TableText"/>
+              <w:widowControl/>
+            </w:pPr>
+            <w:r>
+              <w:rPr>
+                <w:rFonts w:ascii="Calibri" w:hAnsi="Calibri" w:cs="Calibri"/>
+              </w:rPr>
+              <w:t>P10B-19A-10A - Retained Matrix Inventory and Frozen Baseline Lock</w:t>
+            </w:r>
+          </w:p>
+        </w:tc>
+        <w:tc>
+          <w:tcPr>
+            <w:tcW w:w="4460" w:type="dxa"/>
+            <w:vAlign w:val="center"/>
+          </w:tcPr>
+          <w:p>
+            <w:pPr>
+              <w:pStyle w:val="TableText"/>
+              <w:widowControl/>
+            </w:pPr>
+            <w:r>
+              <w:rPr>
+                <w:rFonts w:ascii="Calibri" w:hAnsi="Calibri" w:cs="Calibri"/>
+              </w:rPr>
+              <w:t>A-09C merged</w:t>
+            </w:r>
+          </w:p>
+        </w:tc>
+      </w:tr>
+      <w:tr>
+        <w:trPr>
+          <w:cantSplit/>
+        </w:trPr>
+        <w:tc>
+          <w:tcPr>
+            <w:tcW w:w="900" w:type="dxa"/>
+            <w:vAlign w:val="center"/>
+          </w:tcPr>
+          <w:p>
+            <w:pPr>
+              <w:pStyle w:val="TableText"/>
+              <w:widowControl/>
+            </w:pPr>
+            <w:r>
+              <w:rPr>
+                <w:rFonts w:ascii="Calibri" w:hAnsi="Calibri" w:cs="Calibri"/>
+              </w:rPr>
+              <w:t>10B</w:t>
+            </w:r>
+          </w:p>
+        </w:tc>
+        <w:tc>
+          <w:tcPr>
+            <w:tcW w:w="7600" w:type="dxa"/>
+            <w:vAlign w:val="center"/>
+          </w:tcPr>
+          <w:p>
+            <w:pPr>
+              <w:pStyle w:val="TableText"/>
+              <w:widowControl/>
+            </w:pPr>
+            <w:r>
+              <w:rPr>
+                <w:rFonts w:ascii="Calibri" w:hAnsi="Calibri" w:cs="Calibri"/>
+              </w:rPr>
+              <w:t>P10B-19A-10B - Cross-Authority Integration and Failure Matrix</w:t>
+            </w:r>
+          </w:p>
+        </w:tc>
+        <w:tc>
+          <w:tcPr>
+            <w:tcW w:w="4460" w:type="dxa"/>
+            <w:vAlign w:val="center"/>
+          </w:tcPr>
+          <w:p>
+            <w:pPr>
+              <w:pStyle w:val="TableText"/>
+              <w:widowControl/>
+            </w:pPr>
+            <w:r>
+              <w:rPr>
+                <w:rFonts w:ascii="Calibri" w:hAnsi="Calibri" w:cs="Calibri"/>
+              </w:rPr>
+              <w:t>A-10A merged</w:t>
+            </w:r>
+          </w:p>
+        </w:tc>
+      </w:tr>
+      <w:tr>
+        <w:trPr>
+          <w:cantSplit/>
+        </w:trPr>
+        <w:tc>
+          <w:tcPr>
+            <w:tcW w:w="900" w:type="dxa"/>
+            <w:vAlign w:val="center"/>
+          </w:tcPr>
+          <w:p>
+            <w:pPr>
+              <w:pStyle w:val="TableText"/>
+              <w:widowControl/>
+            </w:pPr>
+            <w:r>
+              <w:rPr>
+                <w:rFonts w:ascii="Calibri" w:hAnsi="Calibri" w:cs="Calibri"/>
+              </w:rPr>
+              <w:t>10C</w:t>
+            </w:r>
+          </w:p>
+        </w:tc>
+        <w:tc>
+          <w:tcPr>
+            <w:tcW w:w="7600" w:type="dxa"/>
+            <w:vAlign w:val="center"/>
+          </w:tcPr>
+          <w:p>
+            <w:pPr>
+              <w:pStyle w:val="TableText"/>
+              <w:widowControl/>
+            </w:pPr>
+            <w:r>
+              <w:rPr>
+                <w:rFonts w:ascii="Calibri" w:hAnsi="Calibri" w:cs="Calibri"/>
+              </w:rPr>
+              <w:t>P10B-19A-10C - P10B-19A Closure and Product-Owner Architecture Gate</w:t>
+            </w:r>
+          </w:p>
+        </w:tc>
+        <w:tc>
+          <w:tcPr>
+            <w:tcW w:w="4460" w:type="dxa"/>
+            <w:vAlign w:val="center"/>
+          </w:tcPr>
+          <w:p>
+            <w:pPr>
+              <w:pStyle w:val="TableText"/>
+              <w:widowControl/>
+            </w:pPr>
+            <w:r>
+              <w:rPr>
+                <w:rFonts w:ascii="Calibri" w:hAnsi="Calibri" w:cs="Calibri"/>
+              </w:rPr>
+              <w:t>A-10B merged</w:t>
+            </w:r>
+          </w:p>
+        </w:tc>
+      </w:tr>
     </w:tbl>
     <w:p>
       <w:pPr>
@@ -15709,7 +16426,21 @@
         <w:rPr>
           <w:rFonts w:ascii="Calibri" w:hAnsi="Calibri" w:cs="Calibri"/>
         </w:rPr>
-        <w:t xml:space="preserve">. P10B-19A remains </w:t>
+        <w:t xml:space="preserve">. P10B-19A-10A is </w:t>
+      </w:r>
+      <w:r>
+        <w:rPr>
+          <w:rFonts w:ascii="Calibri" w:hAnsi="Calibri" w:cs="Calibri"/>
+          <w:b/>
+          <w:bCs/>
+        </w:rPr>
+        <w:t>Baseline</w:t>
+      </w:r>
+      <w:r>
+        <w:rPr>
+          <w:rFonts w:ascii="Calibri" w:hAnsi="Calibri" w:cs="Calibri"/>
+        </w:rPr>
+        <w:t xml:space="preserve">; parent P10B-19A-10 and P10B-19A remain </w:t>
       </w:r>
       <w:r>
         <w:rPr>
@@ -15723,7 +16454,7 @@
         <w:rPr>
           <w:rFonts w:ascii="Calibri" w:hAnsi="Calibri" w:cs="Calibri"/>
         </w:rPr>
-        <w:t xml:space="preserve">, and P10B-19A-10 is the </w:t>
+        <w:t xml:space="preserve">. P10B-19A-10B is the </w:t>
       </w:r>
       <w:r>
         <w:rPr>
@@ -15737,7 +16468,35 @@
         <w:rPr>
           <w:rFonts w:ascii="Calibri" w:hAnsi="Calibri" w:cs="Calibri"/>
         </w:rPr>
-        <w:t>.</w:t>
+        <w:t xml:space="preserve">; A-10C is </w:t>
+      </w:r>
+      <w:r>
+        <w:rPr>
+          <w:rFonts w:ascii="Calibri" w:hAnsi="Calibri" w:cs="Calibri"/>
+          <w:b/>
+          <w:bCs/>
+        </w:rPr>
+        <w:t>Planned</w:t>
+      </w:r>
+      <w:r>
+        <w:rPr>
+          <w:rFonts w:ascii="Calibri" w:hAnsi="Calibri" w:cs="Calibri"/>
+        </w:rPr>
+        <w:t xml:space="preserve"> after it, and P10B-19B-01 is </w:t>
+      </w:r>
+      <w:r>
+        <w:rPr>
+          <w:rFonts w:ascii="Calibri" w:hAnsi="Calibri" w:cs="Calibri"/>
+          <w:b/>
+          <w:bCs/>
+        </w:rPr>
+        <w:t>Planned</w:t>
+      </w:r>
+      <w:r>
+        <w:rPr>
+          <w:rFonts w:ascii="Calibri" w:hAnsi="Calibri" w:cs="Calibri"/>
+        </w:rPr>
+        <w:t xml:space="preserve"> after A-10C.</w:t>
       </w:r>
     </w:p>
     <w:p>
@@ -16075,19 +16834,31 @@
         <w:rPr>
           <w:rFonts w:ascii="Calibri" w:hAnsi="Calibri" w:cs="Calibri"/>
         </w:rPr>
-        <w:t xml:space="preserve"> source authority. It requires current migration status without write-back and returns one strict immutable replay receipt bound to A-09B and compiler fingerprints. Frozen exact-base evidence matches three direct compilations, three preparations and exactly three isolated atomic publication confirmations, including exact active compiled-artifact and added-version integrity. All 36 of 36 published renderer observations and all 36 of 36 normalized Preview/published structural observations match. Source aggregates and snapshots remain unchanged; provider, Vesko and external-publication calls are zero. No production/runtime consumer, v2 activation or merchant-visible change is added. Parent P10B-19A-09 is Baseline / closed; P10B-19A remains Partial until A-10, the exact next implementation task.</w:t>
-      </w:r>
-    </w:p>
-    <w:p>
-      <w:pPr>
-        <w:pStyle w:val="Normal"/>
-        <w:widowControl/>
-      </w:pPr>
-      <w:r>
-        <w:rPr>
-          <w:rFonts w:ascii="Calibri" w:hAnsi="Calibri" w:cs="Calibri"/>
-        </w:rPr>
-        <w:t>The A-08A/A-08B/A-08C split is delivery-only. It preserves the accepted P10B-19 PRE architecture, parent A-08 outcome and P10B-19A-09 ownership.</w:t>
+        <w:t xml:space="preserve"> source authority. It requires current migration status without write-back and returns one strict immutable replay receipt bound to A-09B and compiler fingerprints. Frozen exact-base evidence matches three direct compilations, three preparations and exactly three isolated atomic publication confirmations, including exact active compiled-artifact and added-version integrity. All 36 of 36 published renderer observations and all 36 of 36 normalized Preview/published structural observations match. Source aggregates and snapshots remain unchanged; provider, Vesko and external-publication calls are zero. No production/runtime consumer, v2 activation or merchant-visible change is added. Parent P10B-19A-09 is Baseline / closed.</w:t>
+      </w:r>
+    </w:p>
+    <w:p>
+      <w:pPr>
+        <w:pStyle w:val="Normal"/>
+        <w:widowControl/>
+      </w:pPr>
+      <w:r>
+        <w:rPr>
+          <w:rFonts w:ascii="Calibri" w:hAnsi="Calibri" w:cs="Calibri"/>
+        </w:rPr>
+        <w:t>P10B-19A-10A records the A-10A/A-10B/A-10C delivery decomposition without changing accepted architecture. Its checked, fresh-clone-safe inventory freezes 24 explicit retained matrices, commands and semantic outcomes; exact 126-case/frozen-72 and A-09 metrics; 76 task-base production-source hashes; nine v2 production-inactivity zeroes; and dynamic DEVX-01 discovery under one canonical fingerprint. It adds zero production files and no runtime consumer. A-10A is Baseline; parent A-10 and P10B-19A remain Partial. A-10B is exact next, A-10C follows, and P10B-19B-01 remains Planned after A-10C.</w:t>
+      </w:r>
+    </w:p>
+    <w:p>
+      <w:pPr>
+        <w:pStyle w:val="Normal"/>
+        <w:widowControl/>
+      </w:pPr>
+      <w:r>
+        <w:rPr>
+          <w:rFonts w:ascii="Calibri" w:hAnsi="Calibri" w:cs="Calibri"/>
+        </w:rPr>
+        <w:t>The A-08A/A-08B/A-08C, A-09A/A-09B/A-09C and A-10A/A-10B/A-10C rows are delivery-only decompositions of their accepted parent tasks. They preserve the accepted P10B-19 PRE architecture, parent outcomes and P10B-19B ordering.</w:t>
       </w:r>
     </w:p>
     <w:p>
@@ -17580,7 +18351,21 @@
         <w:rPr>
           <w:rFonts w:ascii="Calibri" w:hAnsi="Calibri" w:cs="Calibri"/>
         </w:rPr>
-        <w:t xml:space="preserve">. P10B-19A remains </w:t>
+        <w:t xml:space="preserve">. P10B-19A-10A is </w:t>
+      </w:r>
+      <w:r>
+        <w:rPr>
+          <w:rFonts w:ascii="Calibri" w:hAnsi="Calibri" w:cs="Calibri"/>
+          <w:b/>
+          <w:bCs/>
+        </w:rPr>
+        <w:t>Baseline</w:t>
+      </w:r>
+      <w:r>
+        <w:rPr>
+          <w:rFonts w:ascii="Calibri" w:hAnsi="Calibri" w:cs="Calibri"/>
+        </w:rPr>
+        <w:t xml:space="preserve">; parent P10B-19A-10 and P10B-19A remain </w:t>
       </w:r>
       <w:r>
         <w:rPr>
@@ -17594,7 +18379,7 @@
         <w:rPr>
           <w:rFonts w:ascii="Calibri" w:hAnsi="Calibri" w:cs="Calibri"/>
         </w:rPr>
-        <w:t xml:space="preserve">, and P10B-19A-10 is the </w:t>
+        <w:t xml:space="preserve">, and P10B-19A-10B is the </w:t>
       </w:r>
       <w:r>
         <w:rPr>
@@ -17624,7 +18409,7 @@
         <w:rPr>
           <w:rFonts w:ascii="Calibri" w:hAnsi="Calibri" w:cs="Calibri"/>
         </w:rPr>
-        <w:t>. The remaining Done conditions are implementation gates, not claims about the current repository. The P10B-16P-01 through P10B-16P-05A plus P10B-16P-06 sequence is a mandatory convergence package between P10B-16 and P10B-17; it supplements rather than renumbers the locked P10B-01 through P10B-18 plan. P10B-16P-05B follows accepted P10B-18C and is now Baseline. P10B-18D completed as a rejected-quality diagnostic. P10B-19 PRE is Baseline. P10B-19A-01 through P10B-19A-07 and P10B-19A-08A through P10B-19A-08C are Baseline; parent P10B-19A-08 is Baseline / closed. P10B-19A-09A, P10B-19A-09B and P10B-19A-09C are Baseline; parent P10B-19A-09 is Baseline / closed. P10B-19A remains Partial; P10B-19A-10 is the exact next implementation task; P10B-19B through P10B-19J remain Planned.</w:t>
+        <w:t>. The remaining Done conditions are implementation gates, not claims about the current repository. The P10B-16P-01 through P10B-16P-05A plus P10B-16P-06 sequence is a mandatory convergence package between P10B-16 and P10B-17; it supplements rather than renumbers the locked P10B-01 through P10B-18 plan. P10B-16P-05B follows accepted P10B-18C and is now Baseline. P10B-18D completed as a rejected-quality diagnostic. P10B-19 PRE is Baseline. P10B-19A-01 through P10B-19A-07 and P10B-19A-08A through P10B-19A-08C are Baseline; parent P10B-19A-08 is Baseline / closed. P10B-19A-09A, P10B-19A-09B and P10B-19A-09C are Baseline; parent P10B-19A-09 is Baseline / closed. P10B-19A remains Partial; P10B-19A-10A is Baseline; parent P10B-19A-10 remains Partial; P10B-19A-10B is exact next; A-10C and P10B-19B-01 follow in order; P10B-19B through P10B-19J remain Planned.</w:t>
       </w:r>
     </w:p>
     <w:p>
@@ -23083,7 +23868,7 @@
         <w:rPr>
           <w:rFonts w:ascii="Calibri" w:hAnsi="Calibri" w:cs="Calibri"/>
         </w:rPr>
-        <w:t>P10B-18C and P10B-16P-05B are Baseline. P10B-18D is a Baseline diagnostic with live commercial quality rejected. P10B-18 and P10B remain Partial. P10B-19 PRE is Baseline. P10B-19A-01 through P10B-19A-07 and P10B-19A-08A through P10B-19A-08C are Baseline; parent P10B-19A-08 is Baseline / closed. P10B-19A-09A, P10B-19A-09B and P10B-19A-09C are Baseline; parent P10B-19A-09 is Baseline / closed. P10B-19A remains Partial; P10B-19A-10 is the exact next implementation task; P10B-19B through P10B-19J remain Planned.</w:t>
+        <w:t>P10B-18C and P10B-16P-05B are Baseline. P10B-18D is a Baseline diagnostic with live commercial quality rejected. P10B-18 and P10B remain Partial. P10B-19 PRE is Baseline. P10B-19A-01 through P10B-19A-07 and P10B-19A-08A through P10B-19A-08C are Baseline; parent P10B-19A-08 is Baseline / closed. P10B-19A-09A, P10B-19A-09B and P10B-19A-09C are Baseline; parent P10B-19A-09 is Baseline / closed. P10B-19A-10A is Baseline; parent P10B-19A-10 and P10B-19A remain Partial; P10B-19A-10B is exact next; A-10C and P10B-19B-01 follow in order; P10B-19B through P10B-19J remain Planned.</w:t>
       </w:r>
     </w:p>
     <w:p>
@@ -25156,7 +25941,7 @@
         <w:rPr>
           <w:rFonts w:ascii="Calibri" w:hAnsi="Calibri" w:cs="Calibri"/>
         </w:rPr>
-        <w:t xml:space="preserve"> is Baseline. P10B-19A-01 through P10B-19A-07 and P10B-19A-08A through P10B-19A-08C are Baseline; parent P10B-19A-08 is Baseline / closed. P10B-19A-09A and P10B-19A-09B are Baseline, while </w:t>
+        <w:t xml:space="preserve"> is Baseline. P10B-19A-01 through P10B-19A-07 and P10B-19A-08A through P10B-19A-08C are Baseline; parent P10B-19A-08 is Baseline / closed. P10B-19A-09A, P10B-19A-09B and P10B-19A-09C are Baseline; </w:t>
       </w:r>
       <w:r>
         <w:rPr>
@@ -25184,7 +25969,7 @@
         <w:rPr>
           <w:rFonts w:ascii="Calibri" w:hAnsi="Calibri" w:cs="Calibri"/>
         </w:rPr>
-        <w:t xml:space="preserve"> remains Partial. P10B-19A-10 is the exact next implementation task; P10B-19B through P10B-19J remain Planned.</w:t>
+        <w:t xml:space="preserve"> remains Partial. P10B-19A-10A is Baseline; parent P10B-19A-10 remains Partial; P10B-19A-10B is exact next; A-10C and P10B-19B-01 follow in order; P10B-19B through P10B-19J remain Planned.</w:t>
       </w:r>
     </w:p>
     <w:p>
@@ -29180,7 +29965,7 @@
         <w:rPr>
           <w:rFonts w:ascii="Calibri" w:hAnsi="Calibri" w:cs="Calibri"/>
         </w:rPr>
-        <w:t xml:space="preserve"> with zero primary FAIL. P10B-16P-05B subsequently removed the one-time capture platform while retaining the bounded quality gate. P10B-18D subsequently completed as a rejected-quality diagnostic. P10B-19 PRE is Baseline. P10B-19A-01 through P10B-19A-07 and P10B-19A-08A through P10B-19A-08C are Baseline; parent P10B-19A-08 is Baseline / closed. P10B-19A-09A, P10B-19A-09B and P10B-19A-09C are Baseline; parent P10B-19A-09 is Baseline / closed. P10B-19A remains Partial, and P10B-19A-10 is the exact next implementation task.</w:t>
+        <w:t xml:space="preserve"> with zero primary FAIL. P10B-16P-05B subsequently removed the one-time capture platform while retaining the bounded quality gate. P10B-18D subsequently completed as a rejected-quality diagnostic. P10B-19 PRE is Baseline. P10B-19A-01 through P10B-19A-07 and P10B-19A-08A through P10B-19A-08C are Baseline; parent P10B-19A-08 is Baseline / closed. P10B-19A-09A, P10B-19A-09B and P10B-19A-09C are Baseline; parent P10B-19A-09 is Baseline / closed. P10B-19A-10A is Baseline; parent P10B-19A-10 and P10B-19A remain Partial; P10B-19A-10B is the exact next implementation task.</w:t>
       </w:r>
     </w:p>
     <w:p>
@@ -30688,7 +31473,7 @@
               <w:rPr>
                 <w:rFonts w:ascii="Calibri" w:hAnsi="Calibri" w:cs="Calibri"/>
               </w:rPr>
-              <w:t>Next</w:t>
+              <w:t>Current</w:t>
             </w:r>
           </w:p>
         </w:tc>
@@ -30726,7 +31511,7 @@
                 <w:b/>
                 <w:bCs/>
               </w:rPr>
-              <w:t>Planned / exact next</w:t>
+              <w:t>Partial</w:t>
             </w:r>
           </w:p>
         </w:tc>
@@ -30744,7 +31529,7 @@
               <w:rPr>
                 <w:rFonts w:ascii="Calibri" w:hAnsi="Calibri" w:cs="Calibri"/>
               </w:rPr>
-              <w:t>Retained matrices, integration and P10B-19A closure after P10B-19A-09C</w:t>
+              <w:t>A-10A inventory complete; A-10B cross-authority evidence and A-10C closure gate remain</w:t>
             </w:r>
           </w:p>
         </w:tc>
@@ -30768,7 +31553,7 @@
               <w:rPr>
                 <w:rFonts w:ascii="Calibri" w:hAnsi="Calibri" w:cs="Calibri"/>
               </w:rPr>
-              <w:t>Planned</w:t>
+              <w:t>Baseline</w:t>
             </w:r>
           </w:p>
         </w:tc>
@@ -30786,7 +31571,7 @@
               <w:rPr>
                 <w:rFonts w:ascii="Calibri" w:hAnsi="Calibri" w:cs="Calibri"/>
               </w:rPr>
-              <w:t>P10B-19B through P10B-19J</w:t>
+              <w:t>P10B-19A-10A</w:t>
             </w:r>
           </w:p>
         </w:tc>
@@ -30806,6 +31591,326 @@
                 <w:b/>
                 <w:bCs/>
               </w:rPr>
+              <w:t>Baseline</w:t>
+            </w:r>
+          </w:p>
+        </w:tc>
+        <w:tc>
+          <w:tcPr>
+            <w:tcW w:w="8460" w:type="dxa"/>
+            <w:vAlign w:val="center"/>
+          </w:tcPr>
+          <w:p>
+            <w:pPr>
+              <w:pStyle w:val="TableText"/>
+              <w:widowControl/>
+            </w:pPr>
+            <w:r>
+              <w:rPr>
+                <w:rFonts w:ascii="Calibri" w:hAnsi="Calibri" w:cs="Calibri"/>
+              </w:rPr>
+              <w:t>Checked 24-entry inventory; exact 126/72 and A-09 metrics; 76 hashes; nine inactivity zeroes; dynamic CI discovery; zero production diff</w:t>
+            </w:r>
+          </w:p>
+        </w:tc>
+      </w:tr>
+      <w:tr>
+        <w:trPr>
+          <w:cantSplit/>
+        </w:trPr>
+        <w:tc>
+          <w:tcPr>
+            <w:tcW w:w="1000" w:type="dxa"/>
+            <w:vAlign w:val="center"/>
+          </w:tcPr>
+          <w:p>
+            <w:pPr>
+              <w:pStyle w:val="TableText"/>
+              <w:jc w:val="center"/>
+              <w:widowControl/>
+            </w:pPr>
+            <w:r>
+              <w:rPr>
+                <w:rFonts w:ascii="Calibri" w:hAnsi="Calibri" w:cs="Calibri"/>
+              </w:rPr>
+              <w:t>Next</w:t>
+            </w:r>
+          </w:p>
+        </w:tc>
+        <w:tc>
+          <w:tcPr>
+            <w:tcW w:w="1500" w:type="dxa"/>
+            <w:vAlign w:val="center"/>
+          </w:tcPr>
+          <w:p>
+            <w:pPr>
+              <w:pStyle w:val="TableText"/>
+              <w:widowControl/>
+            </w:pPr>
+            <w:r>
+              <w:rPr>
+                <w:rFonts w:ascii="Calibri" w:hAnsi="Calibri" w:cs="Calibri"/>
+              </w:rPr>
+              <w:t>P10B-19A-10B</w:t>
+            </w:r>
+          </w:p>
+        </w:tc>
+        <w:tc>
+          <w:tcPr>
+            <w:tcW w:w="2000" w:type="dxa"/>
+            <w:vAlign w:val="center"/>
+          </w:tcPr>
+          <w:p>
+            <w:pPr>
+              <w:pStyle w:val="TableText"/>
+              <w:widowControl/>
+            </w:pPr>
+            <w:r>
+              <w:rPr>
+                <w:rFonts w:ascii="Calibri" w:hAnsi="Calibri" w:cs="Calibri"/>
+                <w:b/>
+                <w:bCs/>
+              </w:rPr>
+              <w:t>Planned / exact next</w:t>
+            </w:r>
+          </w:p>
+        </w:tc>
+        <w:tc>
+          <w:tcPr>
+            <w:tcW w:w="8460" w:type="dxa"/>
+            <w:vAlign w:val="center"/>
+          </w:tcPr>
+          <w:p>
+            <w:pPr>
+              <w:pStyle w:val="TableText"/>
+              <w:widowControl/>
+            </w:pPr>
+            <w:r>
+              <w:rPr>
+                <w:rFonts w:ascii="Calibri" w:hAnsi="Calibri" w:cs="Calibri"/>
+              </w:rPr>
+              <w:t>Cross-authority integration and negative-failure matrix over the frozen A-10A inventory</w:t>
+            </w:r>
+          </w:p>
+        </w:tc>
+      </w:tr>
+      <w:tr>
+        <w:trPr>
+          <w:cantSplit/>
+        </w:trPr>
+        <w:tc>
+          <w:tcPr>
+            <w:tcW w:w="1000" w:type="dxa"/>
+            <w:vAlign w:val="center"/>
+          </w:tcPr>
+          <w:p>
+            <w:pPr>
+              <w:pStyle w:val="TableText"/>
+              <w:jc w:val="center"/>
+              <w:widowControl/>
+            </w:pPr>
+            <w:r>
+              <w:rPr>
+                <w:rFonts w:ascii="Calibri" w:hAnsi="Calibri" w:cs="Calibri"/>
+              </w:rPr>
+              <w:t>Planned</w:t>
+            </w:r>
+          </w:p>
+        </w:tc>
+        <w:tc>
+          <w:tcPr>
+            <w:tcW w:w="1500" w:type="dxa"/>
+            <w:vAlign w:val="center"/>
+          </w:tcPr>
+          <w:p>
+            <w:pPr>
+              <w:pStyle w:val="TableText"/>
+              <w:widowControl/>
+            </w:pPr>
+            <w:r>
+              <w:rPr>
+                <w:rFonts w:ascii="Calibri" w:hAnsi="Calibri" w:cs="Calibri"/>
+              </w:rPr>
+              <w:t>P10B-19A-10C</w:t>
+            </w:r>
+          </w:p>
+        </w:tc>
+        <w:tc>
+          <w:tcPr>
+            <w:tcW w:w="2000" w:type="dxa"/>
+            <w:vAlign w:val="center"/>
+          </w:tcPr>
+          <w:p>
+            <w:pPr>
+              <w:pStyle w:val="TableText"/>
+              <w:widowControl/>
+            </w:pPr>
+            <w:r>
+              <w:rPr>
+                <w:rFonts w:ascii="Calibri" w:hAnsi="Calibri" w:cs="Calibri"/>
+                <w:b/>
+                <w:bCs/>
+              </w:rPr>
+              <w:t>Planned</w:t>
+            </w:r>
+          </w:p>
+        </w:tc>
+        <w:tc>
+          <w:tcPr>
+            <w:tcW w:w="8460" w:type="dxa"/>
+            <w:vAlign w:val="center"/>
+          </w:tcPr>
+          <w:p>
+            <w:pPr>
+              <w:pStyle w:val="TableText"/>
+              <w:widowControl/>
+            </w:pPr>
+            <w:r>
+              <w:rPr>
+                <w:rFonts w:ascii="Calibri" w:hAnsi="Calibri" w:cs="Calibri"/>
+              </w:rPr>
+              <w:t>Complete retained execution, closure report and product-owner architecture gate after A-10B</w:t>
+            </w:r>
+          </w:p>
+        </w:tc>
+      </w:tr>
+      <w:tr>
+        <w:trPr>
+          <w:cantSplit/>
+        </w:trPr>
+        <w:tc>
+          <w:tcPr>
+            <w:tcW w:w="1000" w:type="dxa"/>
+            <w:vAlign w:val="center"/>
+          </w:tcPr>
+          <w:p>
+            <w:pPr>
+              <w:pStyle w:val="TableText"/>
+              <w:jc w:val="center"/>
+              <w:widowControl/>
+            </w:pPr>
+            <w:r>
+              <w:rPr>
+                <w:rFonts w:ascii="Calibri" w:hAnsi="Calibri" w:cs="Calibri"/>
+              </w:rPr>
+              <w:t>Planned</w:t>
+            </w:r>
+          </w:p>
+        </w:tc>
+        <w:tc>
+          <w:tcPr>
+            <w:tcW w:w="1500" w:type="dxa"/>
+            <w:vAlign w:val="center"/>
+          </w:tcPr>
+          <w:p>
+            <w:pPr>
+              <w:pStyle w:val="TableText"/>
+              <w:widowControl/>
+            </w:pPr>
+            <w:r>
+              <w:rPr>
+                <w:rFonts w:ascii="Calibri" w:hAnsi="Calibri" w:cs="Calibri"/>
+              </w:rPr>
+              <w:t>P10B-19B-01</w:t>
+            </w:r>
+          </w:p>
+        </w:tc>
+        <w:tc>
+          <w:tcPr>
+            <w:tcW w:w="2000" w:type="dxa"/>
+            <w:vAlign w:val="center"/>
+          </w:tcPr>
+          <w:p>
+            <w:pPr>
+              <w:pStyle w:val="TableText"/>
+              <w:widowControl/>
+            </w:pPr>
+            <w:r>
+              <w:rPr>
+                <w:rFonts w:ascii="Calibri" w:hAnsi="Calibri" w:cs="Calibri"/>
+                <w:b/>
+                <w:bCs/>
+              </w:rPr>
+              <w:t>Planned</w:t>
+            </w:r>
+          </w:p>
+        </w:tc>
+        <w:tc>
+          <w:tcPr>
+            <w:tcW w:w="8460" w:type="dxa"/>
+            <w:vAlign w:val="center"/>
+          </w:tcPr>
+          <w:p>
+            <w:pPr>
+              <w:pStyle w:val="TableText"/>
+              <w:widowControl/>
+            </w:pPr>
+            <w:r>
+              <w:rPr>
+                <w:rFonts w:ascii="Calibri" w:hAnsi="Calibri" w:cs="Calibri"/>
+              </w:rPr>
+              <w:t>First next-package child only after A-10C</w:t>
+            </w:r>
+          </w:p>
+        </w:tc>
+      </w:tr>
+      <w:tr>
+        <w:trPr>
+          <w:cantSplit/>
+        </w:trPr>
+        <w:tc>
+          <w:tcPr>
+            <w:tcW w:w="1000" w:type="dxa"/>
+            <w:vAlign w:val="center"/>
+          </w:tcPr>
+          <w:p>
+            <w:pPr>
+              <w:pStyle w:val="TableText"/>
+              <w:jc w:val="center"/>
+              <w:widowControl/>
+            </w:pPr>
+            <w:r>
+              <w:rPr>
+                <w:rFonts w:ascii="Calibri" w:hAnsi="Calibri" w:cs="Calibri"/>
+              </w:rPr>
+              <w:t>Planned</w:t>
+            </w:r>
+          </w:p>
+        </w:tc>
+        <w:tc>
+          <w:tcPr>
+            <w:tcW w:w="1500" w:type="dxa"/>
+            <w:vAlign w:val="center"/>
+          </w:tcPr>
+          <w:p>
+            <w:pPr>
+              <w:pStyle w:val="TableText"/>
+              <w:widowControl/>
+            </w:pPr>
+            <w:r>
+              <w:rPr>
+                <w:rFonts w:ascii="Calibri" w:hAnsi="Calibri" w:cs="Calibri"/>
+              </w:rPr>
+              <w:t>P10B-19B through P10B-19J</w:t>
+            </w:r>
+          </w:p>
+        </w:tc>
+        <w:tc>
+          <w:tcPr>
+            <w:tcW w:w="2000" w:type="dxa"/>
+            <w:vAlign w:val="center"/>
+          </w:tcPr>
+          <w:p>
+            <w:pPr>
+              <w:pStyle w:val="TableText"/>
+              <w:widowControl/>
+            </w:pPr>
+            <w:r>
+              <w:rPr>
+                <w:rFonts w:ascii="Calibri" w:hAnsi="Calibri" w:cs="Calibri"/>
+                <w:b/>
+                <w:bCs/>
+              </w:rPr>
               <w:t>Planned</w:t>
             </w:r>
           </w:p>
@@ -30845,7 +31950,7 @@
         <w:rPr>
           <w:rFonts w:ascii="Calibri" w:hAnsi="Calibri" w:cs="Calibri"/>
         </w:rPr>
-        <w:t>The accepted parent plan contains 73 bounded child tasks. Each meaningful visual family requires a focused product-owner screenshot checkpoint before merge. P10B remains Partial.</w:t>
+        <w:t>The accepted architecture remains the 73-child granular plan. The A-10A/A-10B/A-10C rows are nested delivery micro-PRs within accepted parent A-10 and do not renumber or expand that architecture count. Each meaningful visual family requires a focused product-owner screenshot checkpoint before merge. P10B remains Partial.</w:t>
       </w:r>
     </w:p>
     <w:p>
@@ -31258,7 +32363,71 @@
         <w:rPr>
           <w:rFonts w:ascii="Calibri" w:hAnsi="Calibri" w:cs="Calibri"/>
         </w:rPr>
-        <w:t>P10B-19A-10 = exact next implementation task</w:t>
+        <w:t>P10B-19A-10A = Baseline</w:t>
+      </w:r>
+    </w:p>
+    <w:p>
+      <w:pPr>
+        <w:pStyle w:val="Normal"/>
+        <w:numPr>
+          <w:ilvl w:val="0"/>
+          <w:numId w:val="1"/>
+        </w:numPr>
+        <w:widowControl/>
+      </w:pPr>
+      <w:r>
+        <w:rPr>
+          <w:rFonts w:ascii="Calibri" w:hAnsi="Calibri" w:cs="Calibri"/>
+        </w:rPr>
+        <w:t>P10B-19A-10 = Partial</w:t>
+      </w:r>
+    </w:p>
+    <w:p>
+      <w:pPr>
+        <w:pStyle w:val="Normal"/>
+        <w:numPr>
+          <w:ilvl w:val="0"/>
+          <w:numId w:val="1"/>
+        </w:numPr>
+        <w:widowControl/>
+      </w:pPr>
+      <w:r>
+        <w:rPr>
+          <w:rFonts w:ascii="Calibri" w:hAnsi="Calibri" w:cs="Calibri"/>
+        </w:rPr>
+        <w:t>P10B-19A-10B = exact next implementation task</w:t>
+      </w:r>
+    </w:p>
+    <w:p>
+      <w:pPr>
+        <w:pStyle w:val="Normal"/>
+        <w:numPr>
+          <w:ilvl w:val="0"/>
+          <w:numId w:val="1"/>
+        </w:numPr>
+        <w:widowControl/>
+      </w:pPr>
+      <w:r>
+        <w:rPr>
+          <w:rFonts w:ascii="Calibri" w:hAnsi="Calibri" w:cs="Calibri"/>
+        </w:rPr>
+        <w:t>P10B-19A-10C = Planned after P10B-19A-10B</w:t>
+      </w:r>
+    </w:p>
+    <w:p>
+      <w:pPr>
+        <w:pStyle w:val="Normal"/>
+        <w:numPr>
+          <w:ilvl w:val="0"/>
+          <w:numId w:val="1"/>
+        </w:numPr>
+        <w:widowControl/>
+      </w:pPr>
+      <w:r>
+        <w:rPr>
+          <w:rFonts w:ascii="Calibri" w:hAnsi="Calibri" w:cs="Calibri"/>
+        </w:rPr>
+        <w:t>P10B-19B-01 = Planned after P10B-19A-10C</w:t>
       </w:r>
     </w:p>
     <w:p>

</xml_diff>

<commit_message>
test: add A-10B2 fail-closed authority matrix
</commit_message>
<xml_diff>
--- a/docs/VESKIFY_DEVELOPMENT_DELIVERY_TRACKER_v1.3.0.docx
+++ b/docs/VESKIFY_DEVELOPMENT_DELIVERY_TRACKER_v1.3.0.docx
@@ -38,7 +38,7 @@
         <w:rPr>
           <w:rFonts w:ascii="Calibri" w:hAnsi="Calibri" w:cs="Calibri"/>
         </w:rPr>
-        <w:t>Delivery status baseline: 4 September 2026, P10B-19A-10B1 Positive Cross-Authority Integration Matrix</w:t>
+        <w:t>Delivery status baseline: 4 September 2026, P10B-19A-10B2 Fail-Closed Cross-Authority Failure Matrix and A-10B Closure</w:t>
       </w:r>
     </w:p>
     <w:p>
@@ -249,7 +249,7 @@
               <w:rPr>
                 <w:rFonts w:ascii="Calibri" w:hAnsi="Calibri" w:cs="Calibri"/>
               </w:rPr>
-              <w:t>4 September 2026, P10B-19A-10B1 Positive Cross-Authority Integration Matrix</w:t>
+              <w:t>4 September 2026, P10B-19A-10B2 Fail-Closed Cross-Authority Failure Matrix and A-10B Closure</w:t>
             </w:r>
           </w:p>
         </w:tc>
@@ -11480,7 +11480,7 @@
               <w:rPr>
                 <w:rFonts w:ascii="Calibri" w:hAnsi="Calibri" w:cs="Calibri"/>
               </w:rPr>
-              <w:t>A-10A and A-10B1 complete; A-10B2 and A-10C remain</w:t>
+              <w:t>A-10A and A-10B complete; A-10C remains</w:t>
             </w:r>
           </w:p>
         </w:tc>
@@ -11830,7 +11830,7 @@
               <w:rPr>
                 <w:rFonts w:ascii="Calibri" w:hAnsi="Calibri" w:cs="Calibri"/>
               </w:rPr>
-              <w:t>☐</w:t>
+              <w:t>☑</w:t>
             </w:r>
           </w:p>
         </w:tc>
@@ -11887,7 +11887,7 @@
                 <w:b/>
                 <w:bCs/>
               </w:rPr>
-              <w:t>Partial</w:t>
+              <w:t>Baseline / closed</w:t>
             </w:r>
           </w:p>
         </w:tc>
@@ -11941,7 +11941,7 @@
               <w:rPr>
                 <w:rFonts w:ascii="Calibri" w:hAnsi="Calibri" w:cs="Calibri"/>
               </w:rPr>
-              <w:t>A-10B1 positive integration complete; A-10B2 fail-closed failure matrix and parent closure remain</w:t>
+              <w:t>A-10B1 positive integration and A-10B2 exact 36-case fail-closed matrix complete; zero production</w:t>
             </w:r>
           </w:p>
         </w:tc>
@@ -12100,7 +12100,7 @@
               <w:rPr>
                 <w:rFonts w:ascii="Calibri" w:hAnsi="Calibri" w:cs="Calibri"/>
               </w:rPr>
-              <w:t>☐</w:t>
+              <w:t>☑</w:t>
             </w:r>
           </w:p>
         </w:tc>
@@ -12157,7 +12157,7 @@
                 <w:b/>
                 <w:bCs/>
               </w:rPr>
-              <w:t>Planned / exact next</w:t>
+              <w:t>Baseline</w:t>
             </w:r>
           </w:p>
         </w:tc>
@@ -12175,7 +12175,7 @@
               <w:rPr>
                 <w:rFonts w:ascii="Calibri" w:hAnsi="Calibri" w:cs="Calibri"/>
               </w:rPr>
-              <w:t>Planned task owner</w:t>
+              <w:t>P10B-19A task owner</w:t>
             </w:r>
           </w:p>
         </w:tc>
@@ -12211,7 +12211,7 @@
               <w:rPr>
                 <w:rFonts w:ascii="Calibri" w:hAnsi="Calibri" w:cs="Calibri"/>
               </w:rPr>
-              <w:t>Deliberate bounded failure matrix and parent A-10B closure</w:t>
+              <w:t>36 exact ordered failures; owner/phase isolation; no partial output or source mutation; four strict legacy/v2 rejections; A-10A/B1 unchanged; zero production</w:t>
             </w:r>
           </w:p>
         </w:tc>
@@ -12292,7 +12292,7 @@
                 <w:b/>
                 <w:bCs/>
               </w:rPr>
-              <w:t>Planned</w:t>
+              <w:t>Planned / exact next</w:t>
             </w:r>
           </w:p>
         </w:tc>
@@ -16854,7 +16854,7 @@
         <w:rPr>
           <w:rFonts w:ascii="Calibri" w:hAnsi="Calibri" w:cs="Calibri"/>
         </w:rPr>
-        <w:t xml:space="preserve">P10B remains Partial. DEVX-01A through DEVX-01G are Baseline, and DEVX-01 is Baseline / closed. P10B-19A-01 through P10B-19A-07, P10B-19A-08A through P10B-19A-08C, P10B-19A-09A through P10B-19A-09C, P10B-19A-10A, and P10B-19A-10B1 are Baseline; parents P10B-19A-08 and P10B-19A-09 are Baseline / closed; parent P10B-19A-10B, P10B-19A-10 and P10B-19A remain Partial; P10B-19A-10B2 is the exact next implementation task; P10B-19A-10C is Planned after A-10B2; P10B-19B-01 is Planned after A-10C; P10B remains Partial. DEVX-01C measured the serial gate, retained PR/ref-scoped cancellation and added compatible </w:t>
+        <w:t xml:space="preserve">P10B remains Partial. DEVX-01A through DEVX-01G are Baseline, and DEVX-01 is Baseline / closed. P10B-19A-01 through P10B-19A-07, P10B-19A-08A through P10B-19A-08C, P10B-19A-09A through P10B-19A-09C, P10B-19A-10A, P10B-19A-10B1 and P10B-19A-10B2 are Baseline; parents P10B-19A-08, P10B-19A-09 and P10B-19A-10B are Baseline / closed. P10B-19A-10 and P10B-19A remain Partial; P10B-19A-10C is the exact next implementation task; P10B-19B-01 is Planned after A-10C; P10B remains Partial. DEVX-01C measured the serial gate, retained PR/ref-scoped cancellation and added compatible </w:t>
       </w:r>
       <w:r>
         <w:rPr>
@@ -18342,7 +18342,7 @@
         <w:rPr>
           <w:rFonts w:ascii="Calibri" w:hAnsi="Calibri" w:cs="Calibri"/>
         </w:rPr>
-        <w:t xml:space="preserve">. P10B-19A-10A and P10B-19A-10B1 are </w:t>
+        <w:t xml:space="preserve">. P10B-19A-10A, P10B-19A-10B1 and P10B-19A-10B2 are </w:t>
       </w:r>
       <w:r>
         <w:rPr>
@@ -18356,7 +18356,21 @@
         <w:rPr>
           <w:rFonts w:ascii="Calibri" w:hAnsi="Calibri" w:cs="Calibri"/>
         </w:rPr>
-        <w:t xml:space="preserve">; parent P10B-19A-10B, P10B-19A-10 and P10B-19A remain </w:t>
+        <w:t xml:space="preserve">; parent P10B-19A-10B is </w:t>
+      </w:r>
+      <w:r>
+        <w:rPr>
+          <w:rFonts w:ascii="Calibri" w:hAnsi="Calibri" w:cs="Calibri"/>
+          <w:b/>
+          <w:bCs/>
+        </w:rPr>
+        <w:t>Baseline / closed</w:t>
+      </w:r>
+      <w:r>
+        <w:rPr>
+          <w:rFonts w:ascii="Calibri" w:hAnsi="Calibri" w:cs="Calibri"/>
+        </w:rPr>
+        <w:t xml:space="preserve">. P10B-19A-10 and P10B-19A remain </w:t>
       </w:r>
       <w:r>
         <w:rPr>
@@ -18370,7 +18384,7 @@
         <w:rPr>
           <w:rFonts w:ascii="Calibri" w:hAnsi="Calibri" w:cs="Calibri"/>
         </w:rPr>
-        <w:t xml:space="preserve">. P10B-19A-10B2 is the </w:t>
+        <w:t xml:space="preserve">; A-10C is the </w:t>
       </w:r>
       <w:r>
         <w:rPr>
@@ -18384,21 +18398,7 @@
         <w:rPr>
           <w:rFonts w:ascii="Calibri" w:hAnsi="Calibri" w:cs="Calibri"/>
         </w:rPr>
-        <w:t xml:space="preserve">; A-10C is </w:t>
-      </w:r>
-      <w:r>
-        <w:rPr>
-          <w:rFonts w:ascii="Calibri" w:hAnsi="Calibri" w:cs="Calibri"/>
-          <w:b/>
-          <w:bCs/>
-        </w:rPr>
-        <w:t>Planned</w:t>
-      </w:r>
-      <w:r>
-        <w:rPr>
-          <w:rFonts w:ascii="Calibri" w:hAnsi="Calibri" w:cs="Calibri"/>
-        </w:rPr>
-        <w:t xml:space="preserve"> after A-10B2, and P10B-19B-01 is </w:t>
+        <w:t xml:space="preserve">, and P10B-19B-01 is </w:t>
       </w:r>
       <w:r>
         <w:rPr>
@@ -18774,7 +18774,63 @@
         <w:rPr>
           <w:rFonts w:ascii="Calibri" w:hAnsi="Calibri" w:cs="Calibri"/>
         </w:rPr>
-        <w:t>A-10B is delivered through two nested delivery-only children: A-10B1 owns the positive cross-authority integration matrix, while A-10B2 owns fail-closed negative coverage and parent A-10B closure. A-10B1 proves the exact 8/6/6/3 candidate/profile/context authority, three two-identity normalized topology groups, two-hop product-detail substitution, optional content/support omission, six family-constrained receipts and three sequential topology-distinct receipts. It preserves A-09 coexistence and frozen A-10A without production or runtime reach. A-10A and A-10B1 are Baseline; parent A-10B, A-10 and P10B-19A remain Partial. A-10B2 is exact next, A-10C follows, and P10B-19B-01 remains Planned after A-10C.</w:t>
+        <w:t xml:space="preserve">A-10B is delivered through two nested delivery-only children: A-10B1 owns the positive cross-authority integration matrix, while A-10B2 owns fail-closed negative coverage and parent A-10B closure. A-10B1 proves the exact 8/6/6/3 candidate/profile/context authority, three two-identity normalized topology groups, two-hop product-detail substitution, optional content/support omission, six family-constrained receipts and three sequential topology-distinct receipts. It preserves A-09 coexistence and frozen A-10A without production or runtime reach. A-10B2 binds 36 ordered fail-closed cases to the exact A-03 through A-09C owner and terminal phase. Each starts from fresh A-10B1 authority, applies one atomic corruption, completes no downstream phase, produces no partial output, preserves source fingerprints and records zero repair, fallback, default, repository-write, provider, Vesko or external-publication activity. Cases 17/18/20 alone permit native </w:t>
+      </w:r>
+      <w:r>
+        <w:rPr>
+          <w:rFonts w:ascii="Consolas" w:hAnsi="Consolas" w:cs="Consolas"/>
+          <w:sz w:val="19"/>
+          <w:szCs w:val="19"/>
+        </w:rPr>
+        <w:t>Error</w:t>
+      </w:r>
+      <w:r>
+        <w:rPr>
+          <w:rFonts w:ascii="Calibri" w:hAnsi="Calibri" w:cs="Calibri"/>
+        </w:rPr>
+        <w:t xml:space="preserve"> with null code; case 25 binds to </w:t>
+      </w:r>
+      <w:r>
+        <w:rPr>
+          <w:rFonts w:ascii="Consolas" w:hAnsi="Consolas" w:cs="Consolas"/>
+          <w:sz w:val="19"/>
+          <w:szCs w:val="19"/>
+        </w:rPr>
+        <w:t>stale-selection-authority</w:t>
+      </w:r>
+      <w:r>
+        <w:rPr>
+          <w:rFonts w:ascii="Calibri" w:hAnsi="Calibri" w:cs="Calibri"/>
+        </w:rPr>
+        <w:t xml:space="preserve">; case 28 is one coherent production-empty root replacement; and four legacy/v2 substitutions fail without coercion. The checked baseline fingerprint is </w:t>
+      </w:r>
+      <w:r>
+        <w:rPr>
+          <w:rFonts w:ascii="Consolas" w:hAnsi="Consolas" w:cs="Consolas"/>
+          <w:sz w:val="19"/>
+          <w:szCs w:val="19"/>
+        </w:rPr>
+        <w:t>p10b-19a-fail-closed-cross-authority-matrix-v1_30308_ffae8e9700b84c08fcf1fe7315846077b01170f0be0d82743dce4e8a0ac8d307</w:t>
+      </w:r>
+      <w:r>
+        <w:rPr>
+          <w:rFonts w:ascii="Calibri" w:hAnsi="Calibri" w:cs="Calibri"/>
+        </w:rPr>
+        <w:t xml:space="preserve">; the fixture SHA-256 is </w:t>
+      </w:r>
+      <w:r>
+        <w:rPr>
+          <w:rFonts w:ascii="Consolas" w:hAnsi="Consolas" w:cs="Consolas"/>
+          <w:sz w:val="19"/>
+          <w:szCs w:val="19"/>
+        </w:rPr>
+        <w:t>8708a2282749796c9d27d2dcd382384989c7738a5eb0b2f72f87c1ad73cb6a64</w:t>
+      </w:r>
+      <w:r>
+        <w:rPr>
+          <w:rFonts w:ascii="Calibri" w:hAnsi="Calibri" w:cs="Calibri"/>
+        </w:rPr>
+        <w:t>. A-10A and A-10B1 remain byte-identical, accepted 24/76/9 and 126/72/A-09 authority remains unchanged, and all nine production-v2 authority counts remain zero. A-10A, A-10B1 and A-10B2 are Baseline; parent A-10B is Baseline / closed. A-10 and P10B-19A remain Partial; A-10C is exact next, and P10B-19B-01 remains Planned after A-10C.</w:t>
       </w:r>
     </w:p>
     <w:p>
@@ -20279,7 +20335,7 @@
         <w:rPr>
           <w:rFonts w:ascii="Calibri" w:hAnsi="Calibri" w:cs="Calibri"/>
         </w:rPr>
-        <w:t xml:space="preserve">. P10B-19A-10A and P10B-19A-10B1 are </w:t>
+        <w:t xml:space="preserve">. P10B-19A-10A, P10B-19A-10B1 and P10B-19A-10B2 are </w:t>
       </w:r>
       <w:r>
         <w:rPr>
@@ -20293,7 +20349,21 @@
         <w:rPr>
           <w:rFonts w:ascii="Calibri" w:hAnsi="Calibri" w:cs="Calibri"/>
         </w:rPr>
-        <w:t xml:space="preserve">; parent P10B-19A-10B, P10B-19A-10 and P10B-19A remain </w:t>
+        <w:t xml:space="preserve">; parent P10B-19A-10B is </w:t>
+      </w:r>
+      <w:r>
+        <w:rPr>
+          <w:rFonts w:ascii="Calibri" w:hAnsi="Calibri" w:cs="Calibri"/>
+          <w:b/>
+          <w:bCs/>
+        </w:rPr>
+        <w:t>Baseline / closed</w:t>
+      </w:r>
+      <w:r>
+        <w:rPr>
+          <w:rFonts w:ascii="Calibri" w:hAnsi="Calibri" w:cs="Calibri"/>
+        </w:rPr>
+        <w:t xml:space="preserve">. P10B-19A-10 and P10B-19A remain </w:t>
       </w:r>
       <w:r>
         <w:rPr>
@@ -20307,21 +20377,7 @@
         <w:rPr>
           <w:rFonts w:ascii="Calibri" w:hAnsi="Calibri" w:cs="Calibri"/>
         </w:rPr>
-        <w:t xml:space="preserve">, and P10B-19A-10B2 is the </w:t>
-      </w:r>
-      <w:r>
-        <w:rPr>
-          <w:rFonts w:ascii="Calibri" w:hAnsi="Calibri" w:cs="Calibri"/>
-          <w:b/>
-          <w:bCs/>
-        </w:rPr>
-        <w:t>exact next implementation task</w:t>
-      </w:r>
-      <w:r>
-        <w:rPr>
-          <w:rFonts w:ascii="Calibri" w:hAnsi="Calibri" w:cs="Calibri"/>
-        </w:rPr>
-        <w:t xml:space="preserve">. P10B-16P-04 acceptance evidence is retained in </w:t>
+        <w:t xml:space="preserve">, and A-10C is the exact next implementation task. P10B-16P-04 acceptance evidence is retained in </w:t>
       </w:r>
       <w:hyperlink r:id="rIdHyperlink5" w:history="1">
         <w:r>
@@ -20337,7 +20393,7 @@
         <w:rPr>
           <w:rFonts w:ascii="Calibri" w:hAnsi="Calibri" w:cs="Calibri"/>
         </w:rPr>
-        <w:t>. The remaining Done conditions are implementation gates, not claims about the current repository. The P10B-16P-01 through P10B-16P-05A plus P10B-16P-06 sequence is a mandatory convergence package between P10B-16 and P10B-17; it supplements rather than renumbers the locked P10B-01 through P10B-18 plan. P10B-16P-05B follows accepted P10B-18C and is now Baseline. P10B-18D completed as a rejected-quality diagnostic. P10B-19 PRE is Baseline. P10B-19A-01 through P10B-19A-07 and P10B-19A-08A through P10B-19A-08C are Baseline; parent P10B-19A-08 is Baseline / closed. P10B-19A-09A, P10B-19A-09B and P10B-19A-09C are Baseline; parent P10B-19A-09 is Baseline / closed. P10B-19A remains Partial; P10B-19A-10A and P10B-19A-10B1 are Baseline; parent P10B-19A-10B and P10B-19A-10 remain Partial; P10B-19A-10B2 is exact next; A-10C and P10B-19B-01 follow in order; P10B-19B through P10B-19J remain Planned.</w:t>
+        <w:t>. The remaining Done conditions are implementation gates, not claims about the current repository. The P10B-16P-01 through P10B-16P-05A plus P10B-16P-06 sequence is a mandatory convergence package between P10B-16 and P10B-17; it supplements rather than renumbers the locked P10B-01 through P10B-18 plan. P10B-16P-05B follows accepted P10B-18C and is now Baseline. P10B-18D completed as a rejected-quality diagnostic. P10B-19 PRE is Baseline. P10B-19A-01 through P10B-19A-07 and P10B-19A-08A through P10B-19A-08C are Baseline; parent P10B-19A-08 is Baseline / closed. P10B-19A-09A, P10B-19A-09B and P10B-19A-09C are Baseline; parent P10B-19A-09 is Baseline / closed. P10B-19A remains Partial; P10B-19A-10A, P10B-19A-10B1 and P10B-19A-10B2 are Baseline; parent P10B-19A-10B is Baseline / closed; P10B-19A-10 remains Partial. A-10C is the exact next implementation task and P10B-19B-01 follows it; P10B-19B through P10B-19J remain Planned.</w:t>
       </w:r>
     </w:p>
     <w:p>
@@ -25796,7 +25852,7 @@
         <w:rPr>
           <w:rFonts w:ascii="Calibri" w:hAnsi="Calibri" w:cs="Calibri"/>
         </w:rPr>
-        <w:t>P10B-18C and P10B-16P-05B are Baseline. P10B-18D is a Baseline diagnostic with live commercial quality rejected. P10B-18 and P10B remain Partial. P10B-19 PRE is Baseline. P10B-19A-01 through P10B-19A-07 and P10B-19A-08A through P10B-19A-08C are Baseline; parent P10B-19A-08 is Baseline / closed. P10B-19A-09A, P10B-19A-09B and P10B-19A-09C are Baseline; parent P10B-19A-09 is Baseline / closed. P10B-19A-10A and P10B-19A-10B1 are Baseline; parent P10B-19A-10B, P10B-19A-10 and P10B-19A remain Partial; P10B-19A-10B2 is exact next; A-10C and P10B-19B-01 follow in order; P10B-19B through P10B-19J remain Planned.</w:t>
+        <w:t>P10B-18C and P10B-16P-05B are Baseline. P10B-18D is a Baseline diagnostic with live commercial quality rejected. P10B-18 and P10B remain Partial. P10B-19 PRE is Baseline. P10B-19A-01 through P10B-19A-07 and P10B-19A-08A through P10B-19A-08C are Baseline; parent P10B-19A-08 is Baseline / closed. P10B-19A-09A, P10B-19A-09B and P10B-19A-09C are Baseline; parent P10B-19A-09 is Baseline / closed. P10B-19A-10A, P10B-19A-10B1 and P10B-19A-10B2 are Baseline; parent P10B-19A-10B is Baseline / closed. P10B-19A-10 and P10B-19A remain Partial; A-10C is the exact next implementation task and P10B-19B-01 follows it; P10B-19B through P10B-19J remain Planned.</w:t>
       </w:r>
     </w:p>
     <w:p>
@@ -27897,7 +27953,7 @@
         <w:rPr>
           <w:rFonts w:ascii="Calibri" w:hAnsi="Calibri" w:cs="Calibri"/>
         </w:rPr>
-        <w:t xml:space="preserve"> remains Partial. P10B-19A-10A and P10B-19A-10B1 are Baseline; parent P10B-19A-10B and P10B-19A-10 remain Partial; P10B-19A-10B2 is exact next; A-10C and P10B-19B-01 follow in order; P10B-19B through P10B-19J remain Planned.</w:t>
+        <w:t xml:space="preserve"> remains Partial. P10B-19A-10A and P10B-19A-10B1 and P10B-19A-10B2 are Baseline; parent P10B-19A-10B is Baseline / closed; P10B-19A-10 remains Partial. A-10C is the exact next implementation task, P10B-19B-01 follows it, and P10B-19B through P10B-19J remain Planned.</w:t>
       </w:r>
     </w:p>
     <w:p>
@@ -31893,7 +31949,7 @@
         <w:rPr>
           <w:rFonts w:ascii="Calibri" w:hAnsi="Calibri" w:cs="Calibri"/>
         </w:rPr>
-        <w:t xml:space="preserve"> with zero primary FAIL. P10B-16P-05B subsequently removed the one-time capture platform while retaining the bounded quality gate. P10B-18D subsequently completed as a rejected-quality diagnostic. P10B-19 PRE is Baseline. P10B-19A-01 through P10B-19A-07 and P10B-19A-08A through P10B-19A-08C are Baseline; parent P10B-19A-08 is Baseline / closed. P10B-19A-09A, P10B-19A-09B and P10B-19A-09C are Baseline; parent P10B-19A-09 is Baseline / closed. P10B-19A-10A and P10B-19A-10B1 are Baseline; parent P10B-19A-10B, P10B-19A-10 and P10B-19A remain Partial; P10B-19A-10B2 is the exact next implementation task.</w:t>
+        <w:t xml:space="preserve"> with zero primary FAIL. P10B-16P-05B subsequently removed the one-time capture platform while retaining the bounded quality gate. P10B-18D subsequently completed as a rejected-quality diagnostic. P10B-19 PRE is Baseline. P10B-19A-01 through P10B-19A-07 and P10B-19A-08A through P10B-19A-08C are Baseline; parent P10B-19A-08 is Baseline / closed. P10B-19A-09A, P10B-19A-09B and P10B-19A-09C are Baseline; parent P10B-19A-09 is Baseline / closed. P10B-19A-10A, P10B-19A-10B1 and P10B-19A-10B2 are Baseline; parent P10B-19A-10B is Baseline / closed. P10B-19A-10 and P10B-19A remain Partial; A-10C is the exact next implementation task.</w:t>
       </w:r>
     </w:p>
     <w:p>
@@ -33457,7 +33513,7 @@
               <w:rPr>
                 <w:rFonts w:ascii="Calibri" w:hAnsi="Calibri" w:cs="Calibri"/>
               </w:rPr>
-              <w:t>A-10A and A-10B1 complete; A-10B2 and A-10C remain</w:t>
+              <w:t>A-10A and A-10B complete; A-10C remains</w:t>
             </w:r>
           </w:p>
         </w:tc>
@@ -33561,7 +33617,7 @@
               <w:rPr>
                 <w:rFonts w:ascii="Calibri" w:hAnsi="Calibri" w:cs="Calibri"/>
               </w:rPr>
-              <w:t>Current</w:t>
+              <w:t>Baseline</w:t>
             </w:r>
           </w:p>
         </w:tc>
@@ -33599,7 +33655,7 @@
                 <w:b/>
                 <w:bCs/>
               </w:rPr>
-              <w:t>Partial</w:t>
+              <w:t>Baseline / closed</w:t>
             </w:r>
           </w:p>
         </w:tc>
@@ -33617,7 +33673,7 @@
               <w:rPr>
                 <w:rFonts w:ascii="Calibri" w:hAnsi="Calibri" w:cs="Calibri"/>
               </w:rPr>
-              <w:t>Positive B1 complete; fail-closed B2 closure remains</w:t>
+              <w:t>Positive B1 and exact 36-case fail-closed B2 complete; zero production</w:t>
             </w:r>
           </w:p>
         </w:tc>
@@ -33721,7 +33777,7 @@
               <w:rPr>
                 <w:rFonts w:ascii="Calibri" w:hAnsi="Calibri" w:cs="Calibri"/>
               </w:rPr>
-              <w:t>Next</w:t>
+              <w:t>Baseline</w:t>
             </w:r>
           </w:p>
         </w:tc>
@@ -33759,7 +33815,7 @@
                 <w:b/>
                 <w:bCs/>
               </w:rPr>
-              <w:t>Planned / exact next</w:t>
+              <w:t>Baseline</w:t>
             </w:r>
           </w:p>
         </w:tc>
@@ -33777,7 +33833,7 @@
               <w:rPr>
                 <w:rFonts w:ascii="Calibri" w:hAnsi="Calibri" w:cs="Calibri"/>
               </w:rPr>
-              <w:t>Fail-closed cross-authority failure matrix and parent A-10B closure</w:t>
+              <w:t>Exact 36-case owner/phase matrix; no downstream work, partial output, source mutation or production change</w:t>
             </w:r>
           </w:p>
         </w:tc>
@@ -33801,7 +33857,7 @@
               <w:rPr>
                 <w:rFonts w:ascii="Calibri" w:hAnsi="Calibri" w:cs="Calibri"/>
               </w:rPr>
-              <w:t>Planned</w:t>
+              <w:t>Next</w:t>
             </w:r>
           </w:p>
         </w:tc>
@@ -33839,7 +33895,7 @@
                 <w:b/>
                 <w:bCs/>
               </w:rPr>
-              <w:t>Planned</w:t>
+              <w:t>Planned / exact next</w:t>
             </w:r>
           </w:p>
         </w:tc>
@@ -33857,7 +33913,7 @@
               <w:rPr>
                 <w:rFonts w:ascii="Calibri" w:hAnsi="Calibri" w:cs="Calibri"/>
               </w:rPr>
-              <w:t>Complete retained execution, closure report and product-owner architecture gate after A-10B2</w:t>
+              <w:t>Complete retained execution, closure report and product-owner architecture gate</w:t>
             </w:r>
           </w:p>
         </w:tc>
@@ -34483,7 +34539,7 @@
         <w:rPr>
           <w:rFonts w:ascii="Calibri" w:hAnsi="Calibri" w:cs="Calibri"/>
         </w:rPr>
-        <w:t>P10B-19A-10B = Partial</w:t>
+        <w:t>P10B-19A-10B = Baseline / closed</w:t>
       </w:r>
     </w:p>
     <w:p>
@@ -34515,23 +34571,23 @@
         <w:rPr>
           <w:rFonts w:ascii="Calibri" w:hAnsi="Calibri" w:cs="Calibri"/>
         </w:rPr>
-        <w:t>P10B-19A-10B2 = exact next implementation task</w:t>
-      </w:r>
-    </w:p>
-    <w:p>
-      <w:pPr>
-        <w:pStyle w:val="Normal"/>
-        <w:numPr>
-          <w:ilvl w:val="0"/>
-          <w:numId w:val="1"/>
-        </w:numPr>
-        <w:widowControl/>
-      </w:pPr>
-      <w:r>
-        <w:rPr>
-          <w:rFonts w:ascii="Calibri" w:hAnsi="Calibri" w:cs="Calibri"/>
-        </w:rPr>
-        <w:t>P10B-19A-10C = Planned after P10B-19A-10B2</w:t>
+        <w:t>P10B-19A-10B2 = Baseline</w:t>
+      </w:r>
+    </w:p>
+    <w:p>
+      <w:pPr>
+        <w:pStyle w:val="Normal"/>
+        <w:numPr>
+          <w:ilvl w:val="0"/>
+          <w:numId w:val="1"/>
+        </w:numPr>
+        <w:widowControl/>
+      </w:pPr>
+      <w:r>
+        <w:rPr>
+          <w:rFonts w:ascii="Calibri" w:hAnsi="Calibri" w:cs="Calibri"/>
+        </w:rPr>
+        <w:t>P10B-19A-10C = exact next implementation task</w:t>
       </w:r>
     </w:p>
     <w:p>

</xml_diff>

<commit_message>
test: close P10B-19A structural architecture
</commit_message>
<xml_diff>
--- a/docs/VESKIFY_DEVELOPMENT_DELIVERY_TRACKER_v1.3.0.docx
+++ b/docs/VESKIFY_DEVELOPMENT_DELIVERY_TRACKER_v1.3.0.docx
@@ -38,7 +38,7 @@
         <w:rPr>
           <w:rFonts w:ascii="Calibri" w:hAnsi="Calibri" w:cs="Calibri"/>
         </w:rPr>
-        <w:t>Delivery status baseline: 4 September 2026, P10B-19A-10B2 Fail-Closed Cross-Authority Failure Matrix and A-10B Closure</w:t>
+        <w:t>Delivery status baseline: 4 September 2026, P10B-19A-10C P10B-19A Closure and Product-Owner Architecture Gate</w:t>
       </w:r>
     </w:p>
     <w:p>
@@ -249,7 +249,7 @@
               <w:rPr>
                 <w:rFonts w:ascii="Calibri" w:hAnsi="Calibri" w:cs="Calibri"/>
               </w:rPr>
-              <w:t>4 September 2026, P10B-19A-10B2 Fail-Closed Cross-Authority Failure Matrix and A-10B Closure</w:t>
+              <w:t>4 September 2026, P10B-19A-10C P10B-19A Closure and Product-Owner Architecture Gate</w:t>
             </w:r>
           </w:p>
         </w:tc>
@@ -8827,7 +8827,7 @@
               <w:rPr>
                 <w:rFonts w:ascii="Calibri" w:hAnsi="Calibri" w:cs="Calibri"/>
               </w:rPr>
-              <w:t>☐</w:t>
+              <w:t>☑</w:t>
             </w:r>
           </w:p>
         </w:tc>
@@ -8884,7 +8884,7 @@
                 <w:b/>
                 <w:bCs/>
               </w:rPr>
-              <w:t>Partial</w:t>
+              <w:t>Baseline / closed</w:t>
             </w:r>
           </w:p>
         </w:tc>
@@ -8902,7 +8902,7 @@
               <w:rPr>
                 <w:rFonts w:ascii="Calibri" w:hAnsi="Calibri" w:cs="Calibri"/>
               </w:rPr>
-              <w:t>Planned task owner</w:t>
+              <w:t>P10B-19A task owner</w:t>
             </w:r>
           </w:p>
         </w:tc>
@@ -8938,7 +8938,7 @@
               <w:rPr>
                 <w:rFonts w:ascii="Calibri" w:hAnsi="Calibri" w:cs="Calibri"/>
               </w:rPr>
-              <w:t>Versioned family and PageBlueprint v2 contracts, registry, topology identity, deterministic selection, and v1 compatibility</w:t>
+              <w:t>Accepted structural closure; retained execution; frozen architecture, predecessor and zero-production authority; explicit product-owner acceptance</w:t>
             </w:r>
           </w:p>
         </w:tc>
@@ -11369,7 +11369,7 @@
               <w:rPr>
                 <w:rFonts w:ascii="Calibri" w:hAnsi="Calibri" w:cs="Calibri"/>
               </w:rPr>
-              <w:t>☐</w:t>
+              <w:t>☑</w:t>
             </w:r>
           </w:p>
         </w:tc>
@@ -11426,7 +11426,7 @@
                 <w:b/>
                 <w:bCs/>
               </w:rPr>
-              <w:t>Partial</w:t>
+              <w:t>Baseline / closed</w:t>
             </w:r>
           </w:p>
         </w:tc>
@@ -11480,7 +11480,7 @@
               <w:rPr>
                 <w:rFonts w:ascii="Calibri" w:hAnsi="Calibri" w:cs="Calibri"/>
               </w:rPr>
-              <w:t>A-10A and A-10B complete; A-10C remains</w:t>
+              <w:t>A-10A inventory, A-10B positive/fail-closed integration and A-10C retained execution/product-owner architecture closure complete</w:t>
             </w:r>
           </w:p>
         </w:tc>
@@ -12235,7 +12235,7 @@
               <w:rPr>
                 <w:rFonts w:ascii="Calibri" w:hAnsi="Calibri" w:cs="Calibri"/>
               </w:rPr>
-              <w:t>☐</w:t>
+              <w:t>☑</w:t>
             </w:r>
           </w:p>
         </w:tc>
@@ -12292,7 +12292,7 @@
                 <w:b/>
                 <w:bCs/>
               </w:rPr>
-              <w:t>Planned / exact next</w:t>
+              <w:t>Baseline</w:t>
             </w:r>
           </w:p>
         </w:tc>
@@ -12310,7 +12310,7 @@
               <w:rPr>
                 <w:rFonts w:ascii="Calibri" w:hAnsi="Calibri" w:cs="Calibri"/>
               </w:rPr>
-              <w:t>Planned task owner</w:t>
+              <w:t>P10B-19A task owner</w:t>
             </w:r>
           </w:p>
         </w:tc>
@@ -12346,7 +12346,7 @@
               <w:rPr>
                 <w:rFonts w:ascii="Calibri" w:hAnsi="Calibri" w:cs="Calibri"/>
               </w:rPr>
-              <w:t>Complete retained execution, closure report and explicit product-owner architecture gate</w:t>
+              <w:t>Accepted closure manifest; retained 26-file execution/discovery authority; frozen predecessors/architecture and explicit product-owner decision; zero production</w:t>
             </w:r>
           </w:p>
         </w:tc>
@@ -12406,7 +12406,7 @@
               <w:rPr>
                 <w:rFonts w:ascii="Calibri" w:hAnsi="Calibri" w:cs="Calibri"/>
               </w:rPr>
-              <w:t>First Visual Recipe child</w:t>
+              <w:t>VisualRecipeIntentV1 Safe Schema and Capability Projection</w:t>
             </w:r>
           </w:p>
         </w:tc>
@@ -12427,7 +12427,7 @@
                 <w:b/>
                 <w:bCs/>
               </w:rPr>
-              <w:t>Planned</w:t>
+              <w:t>Planned / exact next</w:t>
             </w:r>
           </w:p>
         </w:tc>
@@ -12481,7 +12481,7 @@
               <w:rPr>
                 <w:rFonts w:ascii="Calibri" w:hAnsi="Calibri" w:cs="Calibri"/>
               </w:rPr>
-              <w:t>Begin only after parent P10B-19A closes</w:t>
+              <w:t>Begin only after A-10C merges; B-01 has not begun</w:t>
             </w:r>
           </w:p>
         </w:tc>
@@ -16854,7 +16854,7 @@
         <w:rPr>
           <w:rFonts w:ascii="Calibri" w:hAnsi="Calibri" w:cs="Calibri"/>
         </w:rPr>
-        <w:t xml:space="preserve">P10B remains Partial. DEVX-01A through DEVX-01G are Baseline, and DEVX-01 is Baseline / closed. P10B-19A-01 through P10B-19A-07, P10B-19A-08A through P10B-19A-08C, P10B-19A-09A through P10B-19A-09C, P10B-19A-10A, P10B-19A-10B1 and P10B-19A-10B2 are Baseline; parents P10B-19A-08, P10B-19A-09 and P10B-19A-10B are Baseline / closed. P10B-19A-10 and P10B-19A remain Partial; P10B-19A-10C is the exact next implementation task; P10B-19B-01 is Planned after A-10C; P10B remains Partial. DEVX-01C measured the serial gate, retained PR/ref-scoped cancellation and added compatible </w:t>
+        <w:t xml:space="preserve">P10B remains Partial. DEVX-01A through DEVX-01G are Baseline, and DEVX-01 is Baseline / closed. P10B-19A-01 through P10B-19A-07, P10B-19A-08A through P10B-19A-08C, P10B-19A-09A through P10B-19A-09C, P10B-19A-10A, P10B-19A-10B1, P10B-19A-10B2 and P10B-19A-10C are Baseline; parents P10B-19A-08, P10B-19A-09, P10B-19A-10B, P10B-19A-10 and P10B-19A are Baseline / closed. P10B-19B-01 is the exact next implementation task and is Planned / exact next; it has not begun. P10B-19 and P10B remain Partial. DEVX-01C measured the serial gate, retained PR/ref-scoped cancellation and added compatible </w:t>
       </w:r>
       <w:r>
         <w:rPr>
@@ -18342,7 +18342,7 @@
         <w:rPr>
           <w:rFonts w:ascii="Calibri" w:hAnsi="Calibri" w:cs="Calibri"/>
         </w:rPr>
-        <w:t xml:space="preserve">. P10B-19A-10A, P10B-19A-10B1 and P10B-19A-10B2 are </w:t>
+        <w:t xml:space="preserve">. P10B-19A-10A, P10B-19A-10B1 and P10B-19A-10B2 and P10B-19A-10C are </w:t>
       </w:r>
       <w:r>
         <w:rPr>
@@ -18356,7 +18356,7 @@
         <w:rPr>
           <w:rFonts w:ascii="Calibri" w:hAnsi="Calibri" w:cs="Calibri"/>
         </w:rPr>
-        <w:t xml:space="preserve">; parent P10B-19A-10B is </w:t>
+        <w:t xml:space="preserve">; parents P10B-19A-10B, P10B-19A-10 and P10B-19A are </w:t>
       </w:r>
       <w:r>
         <w:rPr>
@@ -18370,7 +18370,35 @@
         <w:rPr>
           <w:rFonts w:ascii="Calibri" w:hAnsi="Calibri" w:cs="Calibri"/>
         </w:rPr>
-        <w:t xml:space="preserve">. P10B-19A-10 and P10B-19A remain </w:t>
+        <w:t xml:space="preserve">. P10B-19B-01 is the </w:t>
+      </w:r>
+      <w:r>
+        <w:rPr>
+          <w:rFonts w:ascii="Calibri" w:hAnsi="Calibri" w:cs="Calibri"/>
+          <w:b/>
+          <w:bCs/>
+        </w:rPr>
+        <w:t>exact next implementation task</w:t>
+      </w:r>
+      <w:r>
+        <w:rPr>
+          <w:rFonts w:ascii="Calibri" w:hAnsi="Calibri" w:cs="Calibri"/>
+        </w:rPr>
+        <w:t xml:space="preserve"> and is </w:t>
+      </w:r>
+      <w:r>
+        <w:rPr>
+          <w:rFonts w:ascii="Calibri" w:hAnsi="Calibri" w:cs="Calibri"/>
+          <w:b/>
+          <w:bCs/>
+        </w:rPr>
+        <w:t>Planned / exact next</w:t>
+      </w:r>
+      <w:r>
+        <w:rPr>
+          <w:rFonts w:ascii="Calibri" w:hAnsi="Calibri" w:cs="Calibri"/>
+        </w:rPr>
+        <w:t xml:space="preserve">; it has not begun. P10B-19 and P10B remain </w:t>
       </w:r>
       <w:r>
         <w:rPr>
@@ -18384,35 +18412,7 @@
         <w:rPr>
           <w:rFonts w:ascii="Calibri" w:hAnsi="Calibri" w:cs="Calibri"/>
         </w:rPr>
-        <w:t xml:space="preserve">; A-10C is the </w:t>
-      </w:r>
-      <w:r>
-        <w:rPr>
-          <w:rFonts w:ascii="Calibri" w:hAnsi="Calibri" w:cs="Calibri"/>
-          <w:b/>
-          <w:bCs/>
-        </w:rPr>
-        <w:t>exact next implementation task</w:t>
-      </w:r>
-      <w:r>
-        <w:rPr>
-          <w:rFonts w:ascii="Calibri" w:hAnsi="Calibri" w:cs="Calibri"/>
-        </w:rPr>
-        <w:t xml:space="preserve">, and P10B-19B-01 is </w:t>
-      </w:r>
-      <w:r>
-        <w:rPr>
-          <w:rFonts w:ascii="Calibri" w:hAnsi="Calibri" w:cs="Calibri"/>
-          <w:b/>
-          <w:bCs/>
-        </w:rPr>
-        <w:t>Planned</w:t>
-      </w:r>
-      <w:r>
-        <w:rPr>
-          <w:rFonts w:ascii="Calibri" w:hAnsi="Calibri" w:cs="Calibri"/>
-        </w:rPr>
-        <w:t xml:space="preserve"> after A-10C.</w:t>
+        <w:t>.</w:t>
       </w:r>
     </w:p>
     <w:p>
@@ -18830,7 +18830,375 @@
         <w:rPr>
           <w:rFonts w:ascii="Calibri" w:hAnsi="Calibri" w:cs="Calibri"/>
         </w:rPr>
-        <w:t>. A-10A and A-10B1 remain byte-identical, accepted 24/76/9 and 126/72/A-09 authority remains unchanged, and all nine production-v2 authority counts remain zero. A-10A, A-10B1 and A-10B2 are Baseline; parent A-10B is Baseline / closed. A-10 and P10B-19A remain Partial; A-10C is exact next, and P10B-19B-01 remains Planned after A-10C.</w:t>
+        <w:t>. A-10A and A-10B1 remain byte-identical, accepted 24/76/9 and 126/72/A-09 authority remains unchanged, and all nine production-v2 authority counts remain zero. A-10A, A-10B1 and A-10B2 are Baseline; parent A-10B is Baseline / closed.</w:t>
+      </w:r>
+    </w:p>
+    <w:p>
+      <w:pPr>
+        <w:pStyle w:val="Normal"/>
+        <w:widowControl/>
+      </w:pPr>
+      <w:r>
+        <w:rPr>
+          <w:rFonts w:ascii="Calibri" w:hAnsi="Calibri" w:cs="Calibri"/>
+        </w:rPr>
+        <w:t xml:space="preserve">P10B-19A-10C closes A-10 and P10B-19A through the checked </w:t>
+      </w:r>
+      <w:r>
+        <w:rPr>
+          <w:rFonts w:ascii="Consolas" w:hAnsi="Consolas" w:cs="Consolas"/>
+          <w:sz w:val="19"/>
+          <w:szCs w:val="19"/>
+        </w:rPr>
+        <w:t>tests/fixtures/p10b-19a-10c-architecture-closure-manifest.v1.json</w:t>
+      </w:r>
+      <w:r>
+        <w:rPr>
+          <w:rFonts w:ascii="Calibri" w:hAnsi="Calibri" w:cs="Calibri"/>
+        </w:rPr>
+        <w:t xml:space="preserve"> authority at base </w:t>
+      </w:r>
+      <w:r>
+        <w:rPr>
+          <w:rFonts w:ascii="Consolas" w:hAnsi="Consolas" w:cs="Consolas"/>
+          <w:sz w:val="19"/>
+          <w:szCs w:val="19"/>
+        </w:rPr>
+        <w:t>f9af2b2f007ff1bcb0f20a046edf33bc1f10ea37</w:t>
+      </w:r>
+      <w:r>
+        <w:rPr>
+          <w:rFonts w:ascii="Calibri" w:hAnsi="Calibri" w:cs="Calibri"/>
+        </w:rPr>
+        <w:t xml:space="preserve">. Product-owner decision </w:t>
+      </w:r>
+      <w:r>
+        <w:rPr>
+          <w:rFonts w:ascii="Consolas" w:hAnsi="Consolas" w:cs="Consolas"/>
+          <w:sz w:val="19"/>
+          <w:szCs w:val="19"/>
+        </w:rPr>
+        <w:t>ACCEPT P10B-19A STRUCTURAL ARCHITECTURE CLOSURE</w:t>
+      </w:r>
+      <w:r>
+        <w:rPr>
+          <w:rFonts w:ascii="Calibri" w:hAnsi="Calibri" w:cs="Calibri"/>
+        </w:rPr>
+        <w:t xml:space="preserve"> accepts candidate </w:t>
+      </w:r>
+      <w:r>
+        <w:rPr>
+          <w:rFonts w:ascii="Consolas" w:hAnsi="Consolas" w:cs="Consolas"/>
+          <w:sz w:val="19"/>
+          <w:szCs w:val="19"/>
+        </w:rPr>
+        <w:t>p10b-19a-structural-architecture-closure-candidate-v1_11823_e1482cb9f76b470302823bc25f767243cf108776cfe318dd9194821e0ce55e8e</w:t>
+      </w:r>
+      <w:r>
+        <w:rPr>
+          <w:rFonts w:ascii="Calibri" w:hAnsi="Calibri" w:cs="Calibri"/>
+        </w:rPr>
+        <w:t xml:space="preserve"> under decision fingerprint </w:t>
+      </w:r>
+      <w:r>
+        <w:rPr>
+          <w:rFonts w:ascii="Consolas" w:hAnsi="Consolas" w:cs="Consolas"/>
+          <w:sz w:val="19"/>
+          <w:szCs w:val="19"/>
+        </w:rPr>
+        <w:t>p10b-19a-product-owner-architecture-decision-v1_653_1e2f42c02bcac0e507b032eb81885aa3797d734ba94371f3f97047d22523e88b</w:t>
+      </w:r>
+      <w:r>
+        <w:rPr>
+          <w:rFonts w:ascii="Calibri" w:hAnsi="Calibri" w:cs="Calibri"/>
+        </w:rPr>
+        <w:t xml:space="preserve">. The final closure fingerprint is </w:t>
+      </w:r>
+      <w:r>
+        <w:rPr>
+          <w:rFonts w:ascii="Consolas" w:hAnsi="Consolas" w:cs="Consolas"/>
+          <w:sz w:val="19"/>
+          <w:szCs w:val="19"/>
+        </w:rPr>
+        <w:t>p10b-19a-structural-architecture-closure-v1_12651_76316ec1e4c4edc48b02942ec27624b6a05926b91cf11dbcf08a64c65d18e728</w:t>
+      </w:r>
+      <w:r>
+        <w:rPr>
+          <w:rFonts w:ascii="Calibri" w:hAnsi="Calibri" w:cs="Calibri"/>
+        </w:rPr>
+        <w:t xml:space="preserve">; its canonical material SHA-256 is </w:t>
+      </w:r>
+      <w:r>
+        <w:rPr>
+          <w:rFonts w:ascii="Consolas" w:hAnsi="Consolas" w:cs="Consolas"/>
+          <w:sz w:val="19"/>
+          <w:szCs w:val="19"/>
+        </w:rPr>
+        <w:t>76316ec1e4c4edc48b02942ec27624b6a05926b91cf11dbcf08a64c65d18e728</w:t>
+      </w:r>
+      <w:r>
+        <w:rPr>
+          <w:rFonts w:ascii="Calibri" w:hAnsi="Calibri" w:cs="Calibri"/>
+        </w:rPr>
+        <w:t xml:space="preserve">, the checked fixture SHA-256 is </w:t>
+      </w:r>
+      <w:r>
+        <w:rPr>
+          <w:rFonts w:ascii="Consolas" w:hAnsi="Consolas" w:cs="Consolas"/>
+          <w:sz w:val="19"/>
+          <w:szCs w:val="19"/>
+        </w:rPr>
+        <w:t>757c0febf40da2e893f99795dc12bbf1e5bf933fe55b326cab512f80f35d67b1</w:t>
+      </w:r>
+      <w:r>
+        <w:rPr>
+          <w:rFonts w:ascii="Calibri" w:hAnsi="Calibri" w:cs="Calibri"/>
+        </w:rPr>
+        <w:t xml:space="preserve">, and the read-only external baseline SHA-256 is </w:t>
+      </w:r>
+      <w:r>
+        <w:rPr>
+          <w:rFonts w:ascii="Consolas" w:hAnsi="Consolas" w:cs="Consolas"/>
+          <w:sz w:val="19"/>
+          <w:szCs w:val="19"/>
+        </w:rPr>
+        <w:t>529da1152e5d088a9ff3bff075829d8f22f5b4bed95446eac119f9d79e338122</w:t>
+      </w:r>
+      <w:r>
+        <w:rPr>
+          <w:rFonts w:ascii="Calibri" w:hAnsi="Calibri" w:cs="Calibri"/>
+        </w:rPr>
+        <w:t>.</w:t>
+      </w:r>
+    </w:p>
+    <w:p>
+      <w:pPr>
+        <w:pStyle w:val="Normal"/>
+        <w:widowControl/>
+      </w:pPr>
+      <w:r>
+        <w:rPr>
+          <w:rFonts w:ascii="Calibri" w:hAnsi="Calibri" w:cs="Calibri"/>
+        </w:rPr>
+        <w:t xml:space="preserve">The closure preserves all 11 frozen A-10A/A-10B1/A-10B2 predecessor files, the sorted 26-file retained plan, the 24-entry/76-hash/9-inactivity inventory, accepted 126/72 and A-09 metrics, and exact CI discovery/sharding authority. The architecture lock remains SHA-256 </w:t>
+      </w:r>
+      <w:r>
+        <w:rPr>
+          <w:rFonts w:ascii="Consolas" w:hAnsi="Consolas" w:cs="Consolas"/>
+          <w:sz w:val="19"/>
+          <w:szCs w:val="19"/>
+        </w:rPr>
+        <w:t>5292792dae97273411702eeaf468575172c0cf46b026103216423de29eaf47fd</w:t>
+      </w:r>
+      <w:r>
+        <w:rPr>
+          <w:rFonts w:ascii="Calibri" w:hAnsi="Calibri" w:cs="Calibri"/>
+        </w:rPr>
+        <w:t xml:space="preserve"> with 21 numbered sections, four Mermaid diagrams, 73 accepted children and zero nested-delivery child delta. Production files, active/selectable v2 families, current-generation consumers, client-runtime consumers, merchant-visible changes, provider/Vesko/external-publication/image-generation calls and secret-file access all remain zero. Architecture acceptance is not merge authority; A-10C has no screenshot gate, and B-01 has not begun.</w:t>
+      </w:r>
+    </w:p>
+    <w:p>
+      <w:pPr>
+        <w:pStyle w:val="Normal"/>
+        <w:widowControl/>
+      </w:pPr>
+      <w:r>
+        <w:rPr>
+          <w:rFonts w:ascii="Calibri" w:hAnsi="Calibri" w:cs="Calibri"/>
+        </w:rPr>
+        <w:t>The accepted limitations remain, in order:</w:t>
+      </w:r>
+    </w:p>
+    <w:p>
+      <w:pPr>
+        <w:pStyle w:val="Normal"/>
+        <w:numPr>
+          <w:ilvl w:val="0"/>
+          <w:numId w:val="2"/>
+        </w:numPr>
+        <w:widowControl/>
+      </w:pPr>
+      <w:r>
+        <w:rPr>
+          <w:rFonts w:ascii="Consolas" w:hAnsi="Consolas" w:cs="Consolas"/>
+          <w:sz w:val="19"/>
+          <w:szCs w:val="19"/>
+        </w:rPr>
+        <w:t>no-active-v2-family</w:t>
+      </w:r>
+    </w:p>
+    <w:p>
+      <w:pPr>
+        <w:pStyle w:val="Normal"/>
+        <w:numPr>
+          <w:ilvl w:val="0"/>
+          <w:numId w:val="2"/>
+        </w:numPr>
+        <w:widowControl/>
+      </w:pPr>
+      <w:r>
+        <w:rPr>
+          <w:rFonts w:ascii="Consolas" w:hAnsi="Consolas" w:cs="Consolas"/>
+          <w:sz w:val="19"/>
+          <w:szCs w:val="19"/>
+        </w:rPr>
+        <w:t>no-v2-rendered-storefront</w:t>
+      </w:r>
+    </w:p>
+    <w:p>
+      <w:pPr>
+        <w:pStyle w:val="Normal"/>
+        <w:numPr>
+          <w:ilvl w:val="0"/>
+          <w:numId w:val="2"/>
+        </w:numPr>
+        <w:widowControl/>
+      </w:pPr>
+      <w:r>
+        <w:rPr>
+          <w:rFonts w:ascii="Consolas" w:hAnsi="Consolas" w:cs="Consolas"/>
+          <w:sz w:val="19"/>
+          <w:szCs w:val="19"/>
+        </w:rPr>
+        <w:t>no-visual-recipe</w:t>
+      </w:r>
+    </w:p>
+    <w:p>
+      <w:pPr>
+        <w:pStyle w:val="Normal"/>
+        <w:numPr>
+          <w:ilvl w:val="0"/>
+          <w:numId w:val="2"/>
+        </w:numPr>
+        <w:widowControl/>
+      </w:pPr>
+      <w:r>
+        <w:rPr>
+          <w:rFonts w:ascii="Consolas" w:hAnsi="Consolas" w:cs="Consolas"/>
+          <w:sz w:val="19"/>
+          <w:szCs w:val="19"/>
+        </w:rPr>
+        <w:t>no-design-dna-v2</w:t>
+      </w:r>
+    </w:p>
+    <w:p>
+      <w:pPr>
+        <w:pStyle w:val="Normal"/>
+        <w:numPr>
+          <w:ilvl w:val="0"/>
+          <w:numId w:val="2"/>
+        </w:numPr>
+        <w:widowControl/>
+      </w:pPr>
+      <w:r>
+        <w:rPr>
+          <w:rFonts w:ascii="Consolas" w:hAnsi="Consolas" w:cs="Consolas"/>
+          <w:sz w:val="19"/>
+          <w:szCs w:val="19"/>
+        </w:rPr>
+        <w:t>no-v2-frame-family</w:t>
+      </w:r>
+    </w:p>
+    <w:p>
+      <w:pPr>
+        <w:pStyle w:val="Normal"/>
+        <w:numPr>
+          <w:ilvl w:val="0"/>
+          <w:numId w:val="2"/>
+        </w:numPr>
+        <w:widowControl/>
+      </w:pPr>
+      <w:r>
+        <w:rPr>
+          <w:rFonts w:ascii="Consolas" w:hAnsi="Consolas" w:cs="Consolas"/>
+          <w:sz w:val="19"/>
+          <w:szCs w:val="19"/>
+        </w:rPr>
+        <w:t>no-v2-page-family-realization</w:t>
+      </w:r>
+    </w:p>
+    <w:p>
+      <w:pPr>
+        <w:pStyle w:val="Normal"/>
+        <w:numPr>
+          <w:ilvl w:val="0"/>
+          <w:numId w:val="2"/>
+        </w:numPr>
+        <w:widowControl/>
+      </w:pPr>
+      <w:r>
+        <w:rPr>
+          <w:rFonts w:ascii="Consolas" w:hAnsi="Consolas" w:cs="Consolas"/>
+          <w:sz w:val="19"/>
+          <w:szCs w:val="19"/>
+        </w:rPr>
+        <w:t>no-ai-design-director</w:t>
+      </w:r>
+    </w:p>
+    <w:p>
+      <w:pPr>
+        <w:pStyle w:val="Normal"/>
+        <w:numPr>
+          <w:ilvl w:val="0"/>
+          <w:numId w:val="2"/>
+        </w:numPr>
+        <w:widowControl/>
+      </w:pPr>
+      <w:r>
+        <w:rPr>
+          <w:rFonts w:ascii="Consolas" w:hAnsi="Consolas" w:cs="Consolas"/>
+          <w:sz w:val="19"/>
+          <w:szCs w:val="19"/>
+        </w:rPr>
+        <w:t>no-screenshot-critic</w:t>
+      </w:r>
+    </w:p>
+    <w:p>
+      <w:pPr>
+        <w:pStyle w:val="Normal"/>
+        <w:numPr>
+          <w:ilvl w:val="0"/>
+          <w:numId w:val="2"/>
+        </w:numPr>
+        <w:widowControl/>
+      </w:pPr>
+      <w:r>
+        <w:rPr>
+          <w:rFonts w:ascii="Consolas" w:hAnsi="Consolas" w:cs="Consolas"/>
+          <w:sz w:val="19"/>
+          <w:szCs w:val="19"/>
+        </w:rPr>
+        <w:t>no-live-ai-quality-evidence</w:t>
+      </w:r>
+    </w:p>
+    <w:p>
+      <w:pPr>
+        <w:pStyle w:val="Normal"/>
+        <w:numPr>
+          <w:ilvl w:val="0"/>
+          <w:numId w:val="2"/>
+        </w:numPr>
+        <w:widowControl/>
+      </w:pPr>
+      <w:r>
+        <w:rPr>
+          <w:rFonts w:ascii="Consolas" w:hAnsi="Consolas" w:cs="Consolas"/>
+          <w:sz w:val="19"/>
+          <w:szCs w:val="19"/>
+        </w:rPr>
+        <w:t>no-v2-commercial-quality-claim</w:t>
+      </w:r>
+    </w:p>
+    <w:p>
+      <w:pPr>
+        <w:pStyle w:val="Normal"/>
+        <w:widowControl/>
+      </w:pPr>
+      <w:r>
+        <w:rPr>
+          <w:rFonts w:ascii="Calibri" w:hAnsi="Calibri" w:cs="Calibri"/>
+        </w:rPr>
+        <w:t>P10B-19A-10C is Baseline; P10B-19A-10 and P10B-19A are Baseline / closed. P10B-19B-01 is the exact next implementation task and is Planned / exact next; it has not begun. P10B-19 and P10B remain Partial.</w:t>
       </w:r>
     </w:p>
     <w:p>
@@ -20335,7 +20703,7 @@
         <w:rPr>
           <w:rFonts w:ascii="Calibri" w:hAnsi="Calibri" w:cs="Calibri"/>
         </w:rPr>
-        <w:t xml:space="preserve">. P10B-19A-10A, P10B-19A-10B1 and P10B-19A-10B2 are </w:t>
+        <w:t xml:space="preserve">. P10B-19A-10A, P10B-19A-10B1, P10B-19A-10B2 and P10B-19A-10C are </w:t>
       </w:r>
       <w:r>
         <w:rPr>
@@ -20349,7 +20717,7 @@
         <w:rPr>
           <w:rFonts w:ascii="Calibri" w:hAnsi="Calibri" w:cs="Calibri"/>
         </w:rPr>
-        <w:t xml:space="preserve">; parent P10B-19A-10B is </w:t>
+        <w:t xml:space="preserve">; parents P10B-19A-10B, P10B-19A-10 and P10B-19A are </w:t>
       </w:r>
       <w:r>
         <w:rPr>
@@ -20363,7 +20731,21 @@
         <w:rPr>
           <w:rFonts w:ascii="Calibri" w:hAnsi="Calibri" w:cs="Calibri"/>
         </w:rPr>
-        <w:t xml:space="preserve">. P10B-19A-10 and P10B-19A remain </w:t>
+        <w:t xml:space="preserve">. P10B-19B-01 is the exact next implementation task and is </w:t>
+      </w:r>
+      <w:r>
+        <w:rPr>
+          <w:rFonts w:ascii="Calibri" w:hAnsi="Calibri" w:cs="Calibri"/>
+          <w:b/>
+          <w:bCs/>
+        </w:rPr>
+        <w:t>Planned / exact next</w:t>
+      </w:r>
+      <w:r>
+        <w:rPr>
+          <w:rFonts w:ascii="Calibri" w:hAnsi="Calibri" w:cs="Calibri"/>
+        </w:rPr>
+        <w:t xml:space="preserve">; it has not begun. P10B-19 and P10B remain </w:t>
       </w:r>
       <w:r>
         <w:rPr>
@@ -20377,7 +20759,7 @@
         <w:rPr>
           <w:rFonts w:ascii="Calibri" w:hAnsi="Calibri" w:cs="Calibri"/>
         </w:rPr>
-        <w:t xml:space="preserve">, and A-10C is the exact next implementation task. P10B-16P-04 acceptance evidence is retained in </w:t>
+        <w:t xml:space="preserve">. P10B-16P-04 acceptance evidence is retained in </w:t>
       </w:r>
       <w:hyperlink r:id="rIdHyperlink5" w:history="1">
         <w:r>
@@ -20393,7 +20775,7 @@
         <w:rPr>
           <w:rFonts w:ascii="Calibri" w:hAnsi="Calibri" w:cs="Calibri"/>
         </w:rPr>
-        <w:t>. The remaining Done conditions are implementation gates, not claims about the current repository. The P10B-16P-01 through P10B-16P-05A plus P10B-16P-06 sequence is a mandatory convergence package between P10B-16 and P10B-17; it supplements rather than renumbers the locked P10B-01 through P10B-18 plan. P10B-16P-05B follows accepted P10B-18C and is now Baseline. P10B-18D completed as a rejected-quality diagnostic. P10B-19 PRE is Baseline. P10B-19A-01 through P10B-19A-07 and P10B-19A-08A through P10B-19A-08C are Baseline; parent P10B-19A-08 is Baseline / closed. P10B-19A-09A, P10B-19A-09B and P10B-19A-09C are Baseline; parent P10B-19A-09 is Baseline / closed. P10B-19A remains Partial; P10B-19A-10A, P10B-19A-10B1 and P10B-19A-10B2 are Baseline; parent P10B-19A-10B is Baseline / closed; P10B-19A-10 remains Partial. A-10C is the exact next implementation task and P10B-19B-01 follows it; P10B-19B through P10B-19J remain Planned.</w:t>
+        <w:t>. The remaining Done conditions are implementation gates, not claims about the current repository. The P10B-16P-01 through P10B-16P-05A plus P10B-16P-06 sequence is a mandatory convergence package between P10B-16 and P10B-17; it supplements rather than renumbers the locked P10B-01 through P10B-18 plan. P10B-16P-05B follows accepted P10B-18C and is now Baseline. P10B-18D completed as a rejected-quality diagnostic. P10B-19 PRE is Baseline. P10B-19A-01 through P10B-19A-07 and P10B-19A-08A through P10B-19A-08C are Baseline; parent P10B-19A-08 is Baseline / closed. P10B-19A-09A, P10B-19A-09B and P10B-19A-09C are Baseline; parent P10B-19A-09 is Baseline / closed. P10B-19A-10A, P10B-19A-10B1, P10B-19A-10B2 and P10B-19A-10C are Baseline; parents P10B-19A-10B, P10B-19A-10 and P10B-19A are Baseline / closed. P10B-19B-01 is the exact next implementation task and is Planned / exact next; it has not begun. P10B-19 and P10B remain Partial; P10B-19B through P10B-19J remain Planned.</w:t>
       </w:r>
     </w:p>
     <w:p>
@@ -25852,7 +26234,7 @@
         <w:rPr>
           <w:rFonts w:ascii="Calibri" w:hAnsi="Calibri" w:cs="Calibri"/>
         </w:rPr>
-        <w:t>P10B-18C and P10B-16P-05B are Baseline. P10B-18D is a Baseline diagnostic with live commercial quality rejected. P10B-18 and P10B remain Partial. P10B-19 PRE is Baseline. P10B-19A-01 through P10B-19A-07 and P10B-19A-08A through P10B-19A-08C are Baseline; parent P10B-19A-08 is Baseline / closed. P10B-19A-09A, P10B-19A-09B and P10B-19A-09C are Baseline; parent P10B-19A-09 is Baseline / closed. P10B-19A-10A, P10B-19A-10B1 and P10B-19A-10B2 are Baseline; parent P10B-19A-10B is Baseline / closed. P10B-19A-10 and P10B-19A remain Partial; A-10C is the exact next implementation task and P10B-19B-01 follows it; P10B-19B through P10B-19J remain Planned.</w:t>
+        <w:t>P10B-18C and P10B-16P-05B are Baseline. P10B-18D is a Baseline diagnostic with live commercial quality rejected. P10B-18 and P10B remain Partial. P10B-19 PRE is Baseline. P10B-19A-01 through P10B-19A-07 and P10B-19A-08A through P10B-19A-08C are Baseline; parent P10B-19A-08 is Baseline / closed. P10B-19A-09A, P10B-19A-09B and P10B-19A-09C are Baseline; parent P10B-19A-09 is Baseline / closed. P10B-19A-10A, P10B-19A-10B1 and P10B-19A-10B2 are Baseline; parent P10B-19A-10B is Baseline / closed. P10B-19A-10C is Baseline; P10B-19A-10 and P10B-19A are Baseline / closed. P10B-19B-01 is the exact next implementation task and is Planned / exact next; it has not begun. P10B-19 and P10B remain Partial; P10B-19B through P10B-19J remain Planned.</w:t>
       </w:r>
     </w:p>
     <w:p>
@@ -27953,7 +28335,7 @@
         <w:rPr>
           <w:rFonts w:ascii="Calibri" w:hAnsi="Calibri" w:cs="Calibri"/>
         </w:rPr>
-        <w:t xml:space="preserve"> remains Partial. P10B-19A-10A and P10B-19A-10B1 and P10B-19A-10B2 are Baseline; parent P10B-19A-10B is Baseline / closed; P10B-19A-10 remains Partial. A-10C is the exact next implementation task, P10B-19B-01 follows it, and P10B-19B through P10B-19J remain Planned.</w:t>
+        <w:t xml:space="preserve"> is Baseline / closed. P10B-19A-10A, P10B-19A-10B1, P10B-19A-10B2 and P10B-19A-10C are Baseline; parents P10B-19A-10B and P10B-19A-10 are Baseline / closed. P10B-19B-01 is the exact next implementation task and is Planned / exact next; it has not begun. P10B-19 and P10B remain Partial, and P10B-19B through P10B-19J remain Planned.</w:t>
       </w:r>
     </w:p>
     <w:p>
@@ -31846,6 +32228,7 @@
     </w:p>
     <w:p>
       <w:pPr>
+        <w:keepLines/>
         <w:pStyle w:val="Normal"/>
         <w:widowControl/>
       </w:pPr>
@@ -31949,7 +32332,7 @@
         <w:rPr>
           <w:rFonts w:ascii="Calibri" w:hAnsi="Calibri" w:cs="Calibri"/>
         </w:rPr>
-        <w:t xml:space="preserve"> with zero primary FAIL. P10B-16P-05B subsequently removed the one-time capture platform while retaining the bounded quality gate. P10B-18D subsequently completed as a rejected-quality diagnostic. P10B-19 PRE is Baseline. P10B-19A-01 through P10B-19A-07 and P10B-19A-08A through P10B-19A-08C are Baseline; parent P10B-19A-08 is Baseline / closed. P10B-19A-09A, P10B-19A-09B and P10B-19A-09C are Baseline; parent P10B-19A-09 is Baseline / closed. P10B-19A-10A, P10B-19A-10B1 and P10B-19A-10B2 are Baseline; parent P10B-19A-10B is Baseline / closed. P10B-19A-10 and P10B-19A remain Partial; A-10C is the exact next implementation task.</w:t>
+        <w:t xml:space="preserve"> with zero primary FAIL. P10B-16P-05B subsequently removed the one-time capture platform while retaining the bounded quality gate. P10B-18D subsequently completed as a rejected-quality diagnostic. P10B-19 PRE is Baseline. P10B-19A-01 through P10B-19A-07 and P10B-19A-08A through P10B-19A-08C are Baseline; parent P10B-19A-08 is Baseline / closed. P10B-19A-09A, P10B-19A-09B and P10B-19A-09C are Baseline; parent P10B-19A-09 is Baseline / closed. P10B-19A-10A, P10B-19A-10B1 and P10B-19A-10B2 are Baseline; parent P10B-19A-10B is Baseline / closed. P10B-19A-10C is Baseline; P10B-19A-10 and P10B-19A are Baseline / closed. P10B-19B-01 is the exact next implementation task and is Planned / exact next; it has not begun. P10B-19 and P10B remain Partial.</w:t>
       </w:r>
     </w:p>
     <w:p>
@@ -32177,7 +32560,7 @@
               <w:rPr>
                 <w:rFonts w:ascii="Calibri" w:hAnsi="Calibri" w:cs="Calibri"/>
               </w:rPr>
-              <w:t>Current</w:t>
+              <w:t>Baseline</w:t>
             </w:r>
           </w:p>
         </w:tc>
@@ -32215,7 +32598,7 @@
                 <w:b/>
                 <w:bCs/>
               </w:rPr>
-              <w:t>Partial</w:t>
+              <w:t>Baseline / closed</w:t>
             </w:r>
           </w:p>
         </w:tc>
@@ -32233,7 +32616,7 @@
               <w:rPr>
                 <w:rFonts w:ascii="Calibri" w:hAnsi="Calibri" w:cs="Calibri"/>
               </w:rPr>
-              <w:t>Structural Storefront Family and PageBlueprint v2 contracts, registry, A-08 delivery, and v1 compatibility</w:t>
+              <w:t>Accepted structural closure preserves frozen architecture, predecessors and zero-production boundary</w:t>
             </w:r>
           </w:p>
         </w:tc>
@@ -33457,7 +33840,7 @@
               <w:rPr>
                 <w:rFonts w:ascii="Calibri" w:hAnsi="Calibri" w:cs="Calibri"/>
               </w:rPr>
-              <w:t>Current</w:t>
+              <w:t>Baseline</w:t>
             </w:r>
           </w:p>
         </w:tc>
@@ -33495,7 +33878,7 @@
                 <w:b/>
                 <w:bCs/>
               </w:rPr>
-              <w:t>Partial</w:t>
+              <w:t>Baseline / closed</w:t>
             </w:r>
           </w:p>
         </w:tc>
@@ -33513,7 +33896,7 @@
               <w:rPr>
                 <w:rFonts w:ascii="Calibri" w:hAnsi="Calibri" w:cs="Calibri"/>
               </w:rPr>
-              <w:t>A-10A and A-10B complete; A-10C remains</w:t>
+              <w:t>A-10A retained inventory, A-10B integration/failure matrix and A-10C accepted closure complete</w:t>
             </w:r>
           </w:p>
         </w:tc>
@@ -33857,7 +34240,7 @@
               <w:rPr>
                 <w:rFonts w:ascii="Calibri" w:hAnsi="Calibri" w:cs="Calibri"/>
               </w:rPr>
-              <w:t>Next</w:t>
+              <w:t>Baseline</w:t>
             </w:r>
           </w:p>
         </w:tc>
@@ -33895,7 +34278,7 @@
                 <w:b/>
                 <w:bCs/>
               </w:rPr>
-              <w:t>Planned / exact next</w:t>
+              <w:t>Baseline</w:t>
             </w:r>
           </w:p>
         </w:tc>
@@ -33913,7 +34296,7 @@
               <w:rPr>
                 <w:rFonts w:ascii="Calibri" w:hAnsi="Calibri" w:cs="Calibri"/>
               </w:rPr>
-              <w:t>Complete retained execution, closure report and product-owner architecture gate</w:t>
+              <w:t>Product-owner-accepted closure manifest; exact retained plan/discovery; frozen architecture/predecessors; zero production</w:t>
             </w:r>
           </w:p>
         </w:tc>
@@ -33937,7 +34320,7 @@
               <w:rPr>
                 <w:rFonts w:ascii="Calibri" w:hAnsi="Calibri" w:cs="Calibri"/>
               </w:rPr>
-              <w:t>Planned</w:t>
+              <w:t>Next</w:t>
             </w:r>
           </w:p>
         </w:tc>
@@ -33975,7 +34358,7 @@
                 <w:b/>
                 <w:bCs/>
               </w:rPr>
-              <w:t>Planned</w:t>
+              <w:t>Planned / exact next</w:t>
             </w:r>
           </w:p>
         </w:tc>
@@ -33993,7 +34376,7 @@
               <w:rPr>
                 <w:rFonts w:ascii="Calibri" w:hAnsi="Calibri" w:cs="Calibri"/>
               </w:rPr>
-              <w:t>First next-package child only after A-10C</w:t>
+              <w:t>VisualRecipeIntentV1 safe schema and capability projection; has not begun</w:t>
             </w:r>
           </w:p>
         </w:tc>
@@ -34555,7 +34938,7 @@
         <w:rPr>
           <w:rFonts w:ascii="Calibri" w:hAnsi="Calibri" w:cs="Calibri"/>
         </w:rPr>
-        <w:t>P10B-19A-10 = Partial</w:t>
+        <w:t>P10B-19A-10 = Baseline / closed</w:t>
       </w:r>
     </w:p>
     <w:p>
@@ -34587,39 +34970,55 @@
         <w:rPr>
           <w:rFonts w:ascii="Calibri" w:hAnsi="Calibri" w:cs="Calibri"/>
         </w:rPr>
-        <w:t>P10B-19A-10C = exact next implementation task</w:t>
-      </w:r>
-    </w:p>
-    <w:p>
-      <w:pPr>
-        <w:pStyle w:val="Normal"/>
-        <w:numPr>
-          <w:ilvl w:val="0"/>
-          <w:numId w:val="1"/>
-        </w:numPr>
-        <w:widowControl/>
-      </w:pPr>
-      <w:r>
-        <w:rPr>
-          <w:rFonts w:ascii="Calibri" w:hAnsi="Calibri" w:cs="Calibri"/>
-        </w:rPr>
-        <w:t>P10B-19B-01 = Planned after P10B-19A-10C</w:t>
-      </w:r>
-    </w:p>
-    <w:p>
-      <w:pPr>
-        <w:pStyle w:val="Normal"/>
-        <w:numPr>
-          <w:ilvl w:val="0"/>
-          <w:numId w:val="1"/>
-        </w:numPr>
-        <w:widowControl/>
-      </w:pPr>
-      <w:r>
-        <w:rPr>
-          <w:rFonts w:ascii="Calibri" w:hAnsi="Calibri" w:cs="Calibri"/>
-        </w:rPr>
-        <w:t>P10B-19A = Partial</w:t>
+        <w:t>P10B-19A-10C = Baseline</w:t>
+      </w:r>
+    </w:p>
+    <w:p>
+      <w:pPr>
+        <w:pStyle w:val="Normal"/>
+        <w:numPr>
+          <w:ilvl w:val="0"/>
+          <w:numId w:val="1"/>
+        </w:numPr>
+        <w:widowControl/>
+      </w:pPr>
+      <w:r>
+        <w:rPr>
+          <w:rFonts w:ascii="Calibri" w:hAnsi="Calibri" w:cs="Calibri"/>
+        </w:rPr>
+        <w:t>P10B-19B-01 = exact next implementation task</w:t>
+      </w:r>
+    </w:p>
+    <w:p>
+      <w:pPr>
+        <w:pStyle w:val="Normal"/>
+        <w:numPr>
+          <w:ilvl w:val="0"/>
+          <w:numId w:val="1"/>
+        </w:numPr>
+        <w:widowControl/>
+      </w:pPr>
+      <w:r>
+        <w:rPr>
+          <w:rFonts w:ascii="Calibri" w:hAnsi="Calibri" w:cs="Calibri"/>
+        </w:rPr>
+        <w:t>P10B-19A = Baseline / closed</w:t>
+      </w:r>
+    </w:p>
+    <w:p>
+      <w:pPr>
+        <w:pStyle w:val="Normal"/>
+        <w:numPr>
+          <w:ilvl w:val="0"/>
+          <w:numId w:val="1"/>
+        </w:numPr>
+        <w:widowControl/>
+      </w:pPr>
+      <w:r>
+        <w:rPr>
+          <w:rFonts w:ascii="Calibri" w:hAnsi="Calibri" w:cs="Calibri"/>
+        </w:rPr>
+        <w:t>P10B-19 = Partial</w:t>
       </w:r>
     </w:p>
     <w:p>

</xml_diff>

<commit_message>
AR-00: adopt template-scoped architecture and delivery roadmap
</commit_message>
<xml_diff>
--- a/docs/VESKIFY_DEVELOPMENT_DELIVERY_TRACKER_v1.3.0.docx
+++ b/docs/VESKIFY_DEVELOPMENT_DELIVERY_TRACKER_v1.3.0.docx
@@ -51,7 +51,7 @@
         <w:rPr>
           <w:rFonts w:ascii="Calibri" w:hAnsi="Calibri" w:cs="Calibri"/>
         </w:rPr>
-        <w:t>Overall product status: Partial</w:t>
+        <w:t>AR-00 active pending adoption/merge; AR-01 sole next after that gate</w:t>
       </w:r>
     </w:p>
     <w:p>
@@ -64,7 +64,7 @@
         <w:rPr>
           <w:rFonts w:ascii="Calibri" w:hAnsi="Calibri" w:cs="Calibri"/>
         </w:rPr>
-        <w:t>Active phase: P10B Commercial Storefront Generation System v1 (Partial)</w:t>
+        <w:t>Overall product status: Partial</w:t>
       </w:r>
     </w:p>
     <w:p>
@@ -77,6 +77,19 @@
         <w:rPr>
           <w:rFonts w:ascii="Calibri" w:hAnsi="Calibri" w:cs="Calibri"/>
         </w:rPr>
+        <w:t>Active phase: P10B Commercial Storefront Generation System v1 (Partial)</w:t>
+      </w:r>
+    </w:p>
+    <w:p>
+      <w:pPr>
+        <w:pStyle w:val="CoverMeta"/>
+        <w:jc w:val="center"/>
+        <w:widowControl/>
+      </w:pPr>
+      <w:r>
+        <w:rPr>
+          <w:rFonts w:ascii="Calibri" w:hAnsi="Calibri" w:cs="Calibri"/>
+        </w:rPr>
         <w:t>Authoritative source: docs/VESKIFY_DEVELOPMENT_DELIVERY_TRACKER.md</w:t>
       </w:r>
     </w:p>
@@ -87,6 +100,73 @@
       </w:pPr>
       <w:r>
         <w:br w:type="page"/>
+      </w:r>
+    </w:p>
+    <w:p>
+      <w:pPr>
+        <w:pStyle w:val="Quote"/>
+        <w:ind w:left="360"/>
+        <w:pBdr>
+          <w:left w:val="single" w:sz="18" w:space="12" w:color="2E74B5"/>
+        </w:pBdr>
+        <w:shd w:val="clear" w:fill="F4F6F9"/>
+        <w:widowControl/>
+      </w:pPr>
+      <w:r>
+        <w:rPr>
+          <w:rFonts w:ascii="Calibri" w:hAnsi="Calibri" w:cs="Calibri"/>
+          <w:b/>
+          <w:bCs/>
+        </w:rPr>
+        <w:t>AR-00 current status authority:</w:t>
+      </w:r>
+      <w:r>
+        <w:rPr>
+          <w:rFonts w:ascii="Calibri" w:hAnsi="Calibri" w:cs="Calibri"/>
+        </w:rPr>
+        <w:t xml:space="preserve"> </w:t>
+      </w:r>
+      <w:r>
+        <w:rPr>
+          <w:rFonts w:ascii="Calibri" w:hAnsi="Calibri" w:cs="Calibri"/>
+          <w:b/>
+          <w:bCs/>
+        </w:rPr>
+        <w:t>Active — pending adoption/merge.</w:t>
+      </w:r>
+      <w:r>
+        <w:rPr>
+          <w:rFonts w:ascii="Calibri" w:hAnsi="Calibri" w:cs="Calibri"/>
+        </w:rPr>
+        <w:t xml:space="preserve"> AR-01 is </w:t>
+      </w:r>
+      <w:r>
+        <w:rPr>
+          <w:rFonts w:ascii="Calibri" w:hAnsi="Calibri" w:cs="Calibri"/>
+          <w:b/>
+          <w:bCs/>
+        </w:rPr>
+        <w:t>Planned — sole next task after AR-00 adoption/merge</w:t>
+      </w:r>
+      <w:r>
+        <w:rPr>
+          <w:rFonts w:ascii="Calibri" w:hAnsi="Calibri" w:cs="Calibri"/>
+        </w:rPr>
+        <w:t xml:space="preserve">. AR-23 depends on AR-01 and is not serialized behind visual work. This tracker owns current status; the roadmap owns dependency order. Retained B01 exact-next, fixed-two-call/mandatory-three-concept, transient-only, and 73-child future-sequence statements are </w:t>
+      </w:r>
+      <w:r>
+        <w:rPr>
+          <w:rFonts w:ascii="Calibri" w:hAnsi="Calibri" w:cs="Calibri"/>
+          <w:b/>
+          <w:bCs/>
+        </w:rPr>
+        <w:t>historical pre-AR future policy</w:t>
+      </w:r>
+      <w:r>
+        <w:rPr>
+          <w:rFonts w:ascii="Calibri" w:hAnsi="Calibri" w:cs="Calibri"/>
+        </w:rPr>
+        <w:t xml:space="preserve"> superseded by the incorporated addendum; accepted history, functional requirements, and current capability truth remain binding.</w:t>
       </w:r>
     </w:p>
     <w:p>

</xml_diff>

<commit_message>
AR-00: correct adoption status timing and complete whitespace checks
</commit_message>
<xml_diff>
--- a/docs/VESKIFY_DEVELOPMENT_DELIVERY_TRACKER_v1.3.0.docx
+++ b/docs/VESKIFY_DEVELOPMENT_DELIVERY_TRACKER_v1.3.0.docx
@@ -51,7 +51,7 @@
         <w:rPr>
           <w:rFonts w:ascii="Calibri" w:hAnsi="Calibri" w:cs="Calibri"/>
         </w:rPr>
-        <w:t>AR-00 active pending adoption/merge; AR-01 sole next after that gate</w:t>
+        <w:t>Effective upon explicit owner adoption/merge: AR-00 Baseline / closed; AR-01 Planned / exact next, not started</w:t>
       </w:r>
     </w:p>
     <w:p>
@@ -118,6 +118,20 @@
           <w:b/>
           <w:bCs/>
         </w:rPr>
+        <w:t>Repository status effective upon explicit owner adoption/merge:</w:t>
+      </w:r>
+      <w:r>
+        <w:rPr>
+          <w:rFonts w:ascii="Calibri" w:hAnsi="Calibri" w:cs="Calibri"/>
+        </w:rPr>
+        <w:t xml:space="preserve"> This projection does not claim that this PR has merged or that owner acceptance has occurred. </w:t>
+      </w:r>
+      <w:r>
+        <w:rPr>
+          <w:rFonts w:ascii="Calibri" w:hAnsi="Calibri" w:cs="Calibri"/>
+          <w:b/>
+          <w:bCs/>
+        </w:rPr>
         <w:t>AR-00 current status authority:</w:t>
       </w:r>
       <w:r>
@@ -132,7 +146,7 @@
           <w:b/>
           <w:bCs/>
         </w:rPr>
-        <w:t>Active — pending adoption/merge.</w:t>
+        <w:t>Baseline / closed.</w:t>
       </w:r>
       <w:r>
         <w:rPr>
@@ -146,7 +160,7 @@
           <w:b/>
           <w:bCs/>
         </w:rPr>
-        <w:t>Planned — sole next task after AR-00 adoption/merge</w:t>
+        <w:t>Planned — exact next task, not started</w:t>
       </w:r>
       <w:r>
         <w:rPr>

</xml_diff>

<commit_message>
AR-01: inventory dependencies and characterize current behaviour
</commit_message>
<xml_diff>
--- a/docs/VESKIFY_DEVELOPMENT_DELIVERY_TRACKER_v1.3.0.docx
+++ b/docs/VESKIFY_DEVELOPMENT_DELIVERY_TRACKER_v1.3.0.docx
@@ -51,7 +51,7 @@
         <w:rPr>
           <w:rFonts w:ascii="Calibri" w:hAnsi="Calibri" w:cs="Calibri"/>
         </w:rPr>
-        <w:t>Effective upon explicit owner adoption/merge: AR-00 Baseline / closed; AR-01 Planned / exact next, not started</w:t>
+        <w:t>Effective upon explicit AR-01 acceptance/merge: AR-00 and AR-01 Baseline / closed; AR-02 Planned / exact next, not started</w:t>
       </w:r>
     </w:p>
     <w:p>
@@ -118,7 +118,7 @@
           <w:b/>
           <w:bCs/>
         </w:rPr>
-        <w:t>Repository status effective upon explicit owner adoption/merge:</w:t>
+        <w:t>Repository status effective upon explicit owner adoption/merge of AR-01:</w:t>
       </w:r>
       <w:r>
         <w:rPr>
@@ -153,6 +153,20 @@
           <w:rFonts w:ascii="Calibri" w:hAnsi="Calibri" w:cs="Calibri"/>
         </w:rPr>
         <w:t xml:space="preserve"> AR-01 is </w:t>
+      </w:r>
+      <w:r>
+        <w:rPr>
+          <w:rFonts w:ascii="Calibri" w:hAnsi="Calibri" w:cs="Calibri"/>
+          <w:b/>
+          <w:bCs/>
+        </w:rPr>
+        <w:t>Baseline / closed.</w:t>
+      </w:r>
+      <w:r>
+        <w:rPr>
+          <w:rFonts w:ascii="Calibri" w:hAnsi="Calibri" w:cs="Calibri"/>
+        </w:rPr>
+        <w:t xml:space="preserve"> AR-02 is </w:t>
       </w:r>
       <w:r>
         <w:rPr>

</xml_diff>

<commit_message>
AR-02A: separate renderer observation from conformance evaluation
</commit_message>
<xml_diff>
--- a/docs/VESKIFY_DEVELOPMENT_DELIVERY_TRACKER_v1.3.0.docx
+++ b/docs/VESKIFY_DEVELOPMENT_DELIVERY_TRACKER_v1.3.0.docx
@@ -51,7 +51,7 @@
         <w:rPr>
           <w:rFonts w:ascii="Calibri" w:hAnsi="Calibri" w:cs="Calibri"/>
         </w:rPr>
-        <w:t>Effective upon explicit AR-01 acceptance/merge: AR-00 and AR-01 Baseline / closed; AR-02 Planned / exact next, not started</w:t>
+        <w:t>Effective upon explicit AR-02A acceptance/merge: AR-02A Baseline / closed; AR-02 Partial; AR-03A next selected child</w:t>
       </w:r>
     </w:p>
     <w:p>
@@ -118,7 +118,7 @@
           <w:b/>
           <w:bCs/>
         </w:rPr>
-        <w:t>Repository status effective upon explicit owner adoption/merge of AR-01:</w:t>
+        <w:t>Candidate status effective upon explicit owner acceptance/merge of AR-02A:</w:t>
       </w:r>
       <w:r>
         <w:rPr>
@@ -166,6 +166,20 @@
         <w:rPr>
           <w:rFonts w:ascii="Calibri" w:hAnsi="Calibri" w:cs="Calibri"/>
         </w:rPr>
+        <w:t xml:space="preserve"> AR-02A is </w:t>
+      </w:r>
+      <w:r>
+        <w:rPr>
+          <w:rFonts w:ascii="Calibri" w:hAnsi="Calibri" w:cs="Calibri"/>
+          <w:b/>
+          <w:bCs/>
+        </w:rPr>
+        <w:t>Baseline / closed.</w:t>
+      </w:r>
+      <w:r>
+        <w:rPr>
+          <w:rFonts w:ascii="Calibri" w:hAnsi="Calibri" w:cs="Calibri"/>
+        </w:rPr>
         <w:t xml:space="preserve"> AR-02 is </w:t>
       </w:r>
       <w:r>
@@ -174,7 +188,35 @@
           <w:b/>
           <w:bCs/>
         </w:rPr>
-        <w:t>Planned — exact next task, not started</w:t>
+        <w:t>Partial</w:t>
+      </w:r>
+      <w:r>
+        <w:rPr>
+          <w:rFonts w:ascii="Calibri" w:hAnsi="Calibri" w:cs="Calibri"/>
+        </w:rPr>
+        <w:t xml:space="preserve">; definition/materializer isolation remains. AR-03 is </w:t>
+      </w:r>
+      <w:r>
+        <w:rPr>
+          <w:rFonts w:ascii="Calibri" w:hAnsi="Calibri" w:cs="Calibri"/>
+          <w:b/>
+          <w:bCs/>
+        </w:rPr>
+        <w:t>Planned</w:t>
+      </w:r>
+      <w:r>
+        <w:rPr>
+          <w:rFonts w:ascii="Calibri" w:hAnsi="Calibri" w:cs="Calibri"/>
+        </w:rPr>
+        <w:t xml:space="preserve">. It is unstarted. AR-03A is </w:t>
+      </w:r>
+      <w:r>
+        <w:rPr>
+          <w:rFonts w:ascii="Calibri" w:hAnsi="Calibri" w:cs="Calibri"/>
+          <w:b/>
+          <w:bCs/>
+        </w:rPr>
+        <w:t>Planned — exact next selected child</w:t>
       </w:r>
       <w:r>
         <w:rPr>
@@ -609,6 +651,325 @@
         </w:rPr>
         <w:t>Implementation status and evidence level are separate. A task is not done because a contract, test, or partial implementation exists. The checkbox changes only when the task's complete outcome and required evidence are accepted.</w:t>
       </w:r>
+    </w:p>
+    <w:tbl>
+      <w:tblPr>
+        <w:tblW w:w="12960" w:type="dxa"/>
+        <w:tblInd w:w="0" w:type="dxa"/>
+        <w:tblLayout w:type="fixed"/>
+        <w:tblCellMar>
+          <w:top w:w="80" w:type="dxa"/>
+          <w:left w:w="120" w:type="dxa"/>
+          <w:bottom w:w="80" w:type="dxa"/>
+          <w:right w:w="120" w:type="dxa"/>
+        </w:tblCellMar>
+        <w:tblBorders>
+          <w:top w:val="single" w:sz="4" w:color="B8C4D2"/>
+          <w:left w:val="single" w:sz="4" w:color="B8C4D2"/>
+          <w:bottom w:val="single" w:sz="4" w:color="B8C4D2"/>
+          <w:right w:val="single" w:sz="4" w:color="B8C4D2"/>
+          <w:insideH w:val="single" w:sz="4" w:color="D8E0E8"/>
+          <w:insideV w:val="single" w:sz="4" w:color="D8E0E8"/>
+        </w:tblBorders>
+      </w:tblPr>
+      <w:tblGrid>
+        <w:gridCol w:w="1000"/>
+        <w:gridCol w:w="1500"/>
+        <w:gridCol w:w="2000"/>
+        <w:gridCol w:w="8460"/>
+      </w:tblGrid>
+      <w:tr>
+        <w:trPr>
+          <w:tblHeader/>
+          <w:cantSplit/>
+        </w:trPr>
+        <w:tc>
+          <w:tcPr>
+            <w:tcW w:w="1000" w:type="dxa"/>
+            <w:vAlign w:val="center"/>
+            <w:shd w:val="clear" w:fill="E8EEF5"/>
+          </w:tcPr>
+          <w:p>
+            <w:pPr>
+              <w:pStyle w:val="TableHeader"/>
+              <w:jc w:val="center"/>
+              <w:widowControl/>
+            </w:pPr>
+            <w:r>
+              <w:rPr>
+                <w:rFonts w:ascii="Calibri" w:hAnsi="Calibri" w:cs="Calibri"/>
+              </w:rPr>
+              <w:t>Child</w:t>
+            </w:r>
+          </w:p>
+        </w:tc>
+        <w:tc>
+          <w:tcPr>
+            <w:tcW w:w="1500" w:type="dxa"/>
+            <w:vAlign w:val="center"/>
+            <w:shd w:val="clear" w:fill="E8EEF5"/>
+          </w:tcPr>
+          <w:p>
+            <w:pPr>
+              <w:pStyle w:val="TableHeader"/>
+              <w:jc w:val="center"/>
+              <w:widowControl/>
+            </w:pPr>
+            <w:r>
+              <w:rPr>
+                <w:rFonts w:ascii="Calibri" w:hAnsi="Calibri" w:cs="Calibri"/>
+              </w:rPr>
+              <w:t>Parent</w:t>
+            </w:r>
+          </w:p>
+        </w:tc>
+        <w:tc>
+          <w:tcPr>
+            <w:tcW w:w="2000" w:type="dxa"/>
+            <w:vAlign w:val="center"/>
+            <w:shd w:val="clear" w:fill="E8EEF5"/>
+          </w:tcPr>
+          <w:p>
+            <w:pPr>
+              <w:pStyle w:val="TableHeader"/>
+              <w:jc w:val="center"/>
+              <w:widowControl/>
+            </w:pPr>
+            <w:r>
+              <w:rPr>
+                <w:rFonts w:ascii="Calibri" w:hAnsi="Calibri" w:cs="Calibri"/>
+              </w:rPr>
+              <w:t>Bounded outcome and evidence</w:t>
+            </w:r>
+          </w:p>
+        </w:tc>
+        <w:tc>
+          <w:tcPr>
+            <w:tcW w:w="8460" w:type="dxa"/>
+            <w:vAlign w:val="center"/>
+            <w:shd w:val="clear" w:fill="E8EEF5"/>
+          </w:tcPr>
+          <w:p>
+            <w:pPr>
+              <w:pStyle w:val="TableHeader"/>
+              <w:jc w:val="center"/>
+              <w:widowControl/>
+            </w:pPr>
+            <w:r>
+              <w:rPr>
+                <w:rFonts w:ascii="Calibri" w:hAnsi="Calibri" w:cs="Calibri"/>
+              </w:rPr>
+              <w:t>Status effective on AR-02A acceptance/merge</w:t>
+            </w:r>
+          </w:p>
+        </w:tc>
+      </w:tr>
+      <w:tr>
+        <w:trPr>
+          <w:cantSplit/>
+        </w:trPr>
+        <w:tc>
+          <w:tcPr>
+            <w:tcW w:w="1000" w:type="dxa"/>
+            <w:vAlign w:val="center"/>
+          </w:tcPr>
+          <w:p>
+            <w:pPr>
+              <w:pStyle w:val="TableText"/>
+              <w:widowControl/>
+            </w:pPr>
+            <w:r>
+              <w:rPr>
+                <w:rFonts w:ascii="Calibri" w:hAnsi="Calibri" w:cs="Calibri"/>
+              </w:rPr>
+              <w:t>AR-02A</w:t>
+            </w:r>
+          </w:p>
+        </w:tc>
+        <w:tc>
+          <w:tcPr>
+            <w:tcW w:w="1500" w:type="dxa"/>
+            <w:vAlign w:val="center"/>
+          </w:tcPr>
+          <w:p>
+            <w:pPr>
+              <w:pStyle w:val="TableText"/>
+              <w:widowControl/>
+            </w:pPr>
+            <w:r>
+              <w:rPr>
+                <w:rFonts w:ascii="Calibri" w:hAnsi="Calibri" w:cs="Calibri"/>
+              </w:rPr>
+              <w:t>AR-02</w:t>
+            </w:r>
+          </w:p>
+        </w:tc>
+        <w:tc>
+          <w:tcPr>
+            <w:tcW w:w="2000" w:type="dxa"/>
+            <w:vAlign w:val="center"/>
+          </w:tcPr>
+          <w:p>
+            <w:pPr>
+              <w:pStyle w:val="TableText"/>
+              <w:widowControl/>
+            </w:pPr>
+            <w:r>
+              <w:rPr>
+                <w:rFonts w:ascii="Calibri" w:hAnsi="Calibri" w:cs="Calibri"/>
+              </w:rPr>
+              <w:t xml:space="preserve">Separate live renderer observation and composition; </w:t>
+            </w:r>
+            <w:hyperlink r:id="rIdHyperlink3" w:history="1">
+              <w:r>
+                <w:rPr>
+                  <w:rFonts w:ascii="Calibri" w:hAnsi="Calibri" w:cs="Calibri"/>
+                  <w:color w:val="2E74B5"/>
+                  <w:u w:val="single"/>
+                </w:rPr>
+                <w:t>contract</w:t>
+              </w:r>
+            </w:hyperlink>
+            <w:r>
+              <w:rPr>
+                <w:rFonts w:ascii="Calibri" w:hAnsi="Calibri" w:cs="Calibri"/>
+              </w:rPr>
+              <w:t xml:space="preserve">, </w:t>
+            </w:r>
+            <w:hyperlink r:id="rIdHyperlink4" w:history="1">
+              <w:r>
+                <w:rPr>
+                  <w:rFonts w:ascii="Calibri" w:hAnsi="Calibri" w:cs="Calibri"/>
+                  <w:color w:val="2E74B5"/>
+                  <w:u w:val="single"/>
+                </w:rPr>
+                <w:t>report</w:t>
+              </w:r>
+            </w:hyperlink>
+          </w:p>
+        </w:tc>
+        <w:tc>
+          <w:tcPr>
+            <w:tcW w:w="8460" w:type="dxa"/>
+            <w:vAlign w:val="center"/>
+          </w:tcPr>
+          <w:p>
+            <w:pPr>
+              <w:pStyle w:val="TableText"/>
+              <w:widowControl/>
+            </w:pPr>
+            <w:r>
+              <w:rPr>
+                <w:rFonts w:ascii="Calibri" w:hAnsi="Calibri" w:cs="Calibri"/>
+                <w:b/>
+                <w:bCs/>
+              </w:rPr>
+              <w:t>Baseline / closed</w:t>
+            </w:r>
+          </w:p>
+        </w:tc>
+      </w:tr>
+      <w:tr>
+        <w:trPr>
+          <w:cantSplit/>
+        </w:trPr>
+        <w:tc>
+          <w:tcPr>
+            <w:tcW w:w="1000" w:type="dxa"/>
+            <w:vAlign w:val="center"/>
+          </w:tcPr>
+          <w:p>
+            <w:pPr>
+              <w:pStyle w:val="TableText"/>
+              <w:widowControl/>
+            </w:pPr>
+            <w:r>
+              <w:rPr>
+                <w:rFonts w:ascii="Calibri" w:hAnsi="Calibri" w:cs="Calibri"/>
+              </w:rPr>
+              <w:t>AR-03A</w:t>
+            </w:r>
+          </w:p>
+        </w:tc>
+        <w:tc>
+          <w:tcPr>
+            <w:tcW w:w="1500" w:type="dxa"/>
+            <w:vAlign w:val="center"/>
+          </w:tcPr>
+          <w:p>
+            <w:pPr>
+              <w:pStyle w:val="TableText"/>
+              <w:widowControl/>
+            </w:pPr>
+            <w:r>
+              <w:rPr>
+                <w:rFonts w:ascii="Calibri" w:hAnsi="Calibri" w:cs="Calibri"/>
+              </w:rPr>
+              <w:t>AR-03</w:t>
+            </w:r>
+          </w:p>
+        </w:tc>
+        <w:tc>
+          <w:tcPr>
+            <w:tcW w:w="2000" w:type="dxa"/>
+            <w:vAlign w:val="center"/>
+          </w:tcPr>
+          <w:p>
+            <w:pPr>
+              <w:pStyle w:val="TableText"/>
+              <w:widowControl/>
+            </w:pPr>
+            <w:r>
+              <w:rPr>
+                <w:rFonts w:ascii="Calibri" w:hAnsi="Calibri" w:cs="Calibri"/>
+              </w:rPr>
+              <w:t xml:space="preserve">Extract route matching and errors; </w:t>
+            </w:r>
+            <w:hyperlink r:id="rIdHyperlink5" w:history="1">
+              <w:r>
+                <w:rPr>
+                  <w:rFonts w:ascii="Calibri" w:hAnsi="Calibri" w:cs="Calibri"/>
+                  <w:color w:val="2E74B5"/>
+                  <w:u w:val="single"/>
+                </w:rPr>
+                <w:t>approved queue</w:t>
+              </w:r>
+            </w:hyperlink>
+          </w:p>
+        </w:tc>
+        <w:tc>
+          <w:tcPr>
+            <w:tcW w:w="8460" w:type="dxa"/>
+            <w:vAlign w:val="center"/>
+          </w:tcPr>
+          <w:p>
+            <w:pPr>
+              <w:pStyle w:val="TableText"/>
+              <w:widowControl/>
+            </w:pPr>
+            <w:r>
+              <w:rPr>
+                <w:rFonts w:ascii="Calibri" w:hAnsi="Calibri" w:cs="Calibri"/>
+                <w:b/>
+                <w:bCs/>
+              </w:rPr>
+              <w:t>Planned</w:t>
+            </w:r>
+            <w:r>
+              <w:rPr>
+                <w:rFonts w:ascii="Calibri" w:hAnsi="Calibri" w:cs="Calibri"/>
+              </w:rPr>
+              <w:t xml:space="preserve"> — next selected child; unstarted</w:t>
+            </w:r>
+          </w:p>
+        </w:tc>
+      </w:tr>
+    </w:tbl>
+    <w:p>
+      <w:pPr>
+        <w:pStyle w:val="Normal"/>
+        <w:widowControl/>
+      </w:pPr>
     </w:p>
     <w:p>
       <w:pPr>
@@ -20534,7 +20895,7 @@
         </w:rPr>
         <w:t xml:space="preserve">. Completed 7 August 2026; see </w:t>
       </w:r>
-      <w:hyperlink r:id="rIdHyperlink3" w:history="1">
+      <w:hyperlink r:id="rIdHyperlink6" w:history="1">
         <w:r>
           <w:rPr>
             <w:rFonts w:ascii="Calibri" w:hAnsi="Calibri" w:cs="Calibri"/>
@@ -20671,7 +21032,7 @@
         </w:rPr>
         <w:t xml:space="preserve">The binding details and minimum coverage are in </w:t>
       </w:r>
-      <w:hyperlink r:id="rIdHyperlink4" w:history="1">
+      <w:hyperlink r:id="rIdHyperlink7" w:history="1">
         <w:r>
           <w:rPr>
             <w:rFonts w:ascii="Calibri" w:hAnsi="Calibri" w:cs="Calibri"/>
@@ -20869,7 +21230,7 @@
         </w:rPr>
         <w:t xml:space="preserve">. P10B-16P-04 acceptance evidence is retained in </w:t>
       </w:r>
-      <w:hyperlink r:id="rIdHyperlink5" w:history="1">
+      <w:hyperlink r:id="rIdHyperlink8" w:history="1">
         <w:r>
           <w:rPr>
             <w:rFonts w:ascii="Calibri" w:hAnsi="Calibri" w:cs="Calibri"/>
@@ -21118,7 +21479,7 @@
         </w:rPr>
         <w:t xml:space="preserve">. See </w:t>
       </w:r>
-      <w:hyperlink r:id="rIdHyperlink6" w:history="1">
+      <w:hyperlink r:id="rIdHyperlink9" w:history="1">
         <w:r>
           <w:rPr>
             <w:rFonts w:ascii="Calibri" w:hAnsi="Calibri" w:cs="Calibri"/>
@@ -21367,7 +21728,7 @@
         </w:rPr>
         <w:t xml:space="preserve">. See </w:t>
       </w:r>
-      <w:hyperlink r:id="rIdHyperlink7" w:history="1">
+      <w:hyperlink r:id="rIdHyperlink10" w:history="1">
         <w:r>
           <w:rPr>
             <w:rFonts w:ascii="Calibri" w:hAnsi="Calibri" w:cs="Calibri"/>
@@ -21616,7 +21977,7 @@
         </w:rPr>
         <w:t xml:space="preserve">. At P10B-03 delivery, all then-current 25 V2 definitions and 91 variants were classified explicitly without false commercial-ready promotion. Later family tasks extend that same authority rather than replacing it. See </w:t>
       </w:r>
-      <w:hyperlink r:id="rIdHyperlink8" w:history="1">
+      <w:hyperlink r:id="rIdHyperlink11" w:history="1">
         <w:r>
           <w:rPr>
             <w:rFonts w:ascii="Calibri" w:hAnsi="Calibri" w:cs="Calibri"/>
@@ -21865,7 +22226,7 @@
         </w:rPr>
         <w:t xml:space="preserve"> embeds exact lineage and bounded treatment in the existing approved presentation, consumes Design DNA and registered anatomy, projects protected same-product media, preserves authority through lifecycle/compiler boundaries, and renders semantic four-breakpoint evidence. Production CDN transforms and retained commercial visual acceptance remain deferred. See </w:t>
       </w:r>
-      <w:hyperlink r:id="rIdHyperlink9" w:history="1">
+      <w:hyperlink r:id="rIdHyperlink12" w:history="1">
         <w:r>
           <w:rPr>
             <w:rFonts w:ascii="Calibri" w:hAnsi="Calibri" w:cs="Calibri"/>
@@ -22114,7 +22475,7 @@
         </w:rPr>
         <w:t xml:space="preserve">. See </w:t>
       </w:r>
-      <w:hyperlink r:id="rIdHyperlink10" w:history="1">
+      <w:hyperlink r:id="rIdHyperlink13" w:history="1">
         <w:r>
           <w:rPr>
             <w:rFonts w:ascii="Calibri" w:hAnsi="Calibri" w:cs="Calibri"/>
@@ -22349,7 +22710,7 @@
         </w:rPr>
         <w:t xml:space="preserve">. Four exact root-frame profiles, three mobile modes, and four footer compositions preserve canonical navigation and frame identity through snapshot, save/reload, Puck root, preview, publication compilation, EN/FI, and 375/768/1024/1440 px evidence. See </w:t>
       </w:r>
-      <w:hyperlink r:id="rIdHyperlink11" w:history="1">
+      <w:hyperlink r:id="rIdHyperlink14" w:history="1">
         <w:r>
           <w:rPr>
             <w:rFonts w:ascii="Calibri" w:hAnsi="Calibri" w:cs="Calibri"/>
@@ -22584,7 +22945,7 @@
         </w:rPr>
         <w:t xml:space="preserve">. Six meaningful hero anatomies, five editorial/story anatomies, five campaign/promotion anatomies and three evidence-grounded proof/service anatomies are registered, PageBlueprint-selectable, deterministically generated, snapshot/publish preserved and rendered through one shared implementation. Focused deterministic coverage and a zero-provider Chromium scenario retain evidence at 375, 768, 1024 and 1440 px. See </w:t>
       </w:r>
-      <w:hyperlink r:id="rIdHyperlink12" w:history="1">
+      <w:hyperlink r:id="rIdHyperlink15" w:history="1">
         <w:r>
           <w:rPr>
             <w:rFonts w:ascii="Calibri" w:hAnsi="Calibri" w:cs="Calibri"/>
@@ -22633,7 +22994,7 @@
         </w:rPr>
         <w:t xml:space="preserve"> Baseline. One fingerprinted authority and renderer now serve homepage merchandising, collection/results, related products, and legacy compatibility. Five meaningful anatomies preserve canonical facts and P10B-04 media lineage through plan, proposal, snapshot, save/reload, publish, and responsive browser evidence. See </w:t>
       </w:r>
-      <w:hyperlink r:id="rIdHyperlink13" w:history="1">
+      <w:hyperlink r:id="rIdHyperlink16" w:history="1">
         <w:r>
           <w:rPr>
             <w:rFonts w:ascii="Calibri" w:hAnsi="Calibri" w:cs="Calibri"/>
@@ -22850,7 +23211,7 @@
         </w:rPr>
         <w:t xml:space="preserve"> Baseline. Six versioned, structurally fingerprinted homepage PageBlueprint profiles compose current shared-frame, commercial storytelling, canonical product-card, approved-media, and Design DNA authority. Evidence/cardinality guards fail closed; deterministic lifecycle and 24 retained four-width browser images pass. See </w:t>
       </w:r>
-      <w:hyperlink r:id="rIdHyperlink14" w:history="1">
+      <w:hyperlink r:id="rIdHyperlink17" w:history="1">
         <w:r>
           <w:rPr>
             <w:rFonts w:ascii="Calibri" w:hAnsi="Calibri" w:cs="Calibri"/>
@@ -23081,7 +23442,7 @@
         </w:rPr>
         <w:t xml:space="preserve"> anatomy, P10B-08 canonical card anatomy, and P10B-04 approved media treatment. Exact canonical catalogue bindings preserve product membership/order, facts, product media, filters/sort state, and child-collection order. Campaign media is approved collection/editorial media, not a product-media replacement. A transient revision-checked zero-result context keeps the query without fabricating products. Deterministic lifecycle and 16-view Chromium evidence pass with zero provider calls. See </w:t>
       </w:r>
-      <w:hyperlink r:id="rIdHyperlink15" w:history="1">
+      <w:hyperlink r:id="rIdHyperlink18" w:history="1">
         <w:r>
           <w:rPr>
             <w:rFonts w:ascii="Calibri" w:hAnsi="Calibri" w:cs="Calibri"/>
@@ -23611,7 +23972,7 @@
         </w:rPr>
         <w:t xml:space="preserve">. Fifteen structurally distinct registered profiles resolve exact current approved brief evidence into strict localized fact documents. P10B-05 preserves page-set, route, locale, and transitive navigation authority; P10B-06 frames and P10B-07 editorial/campaign renderers are reused. Snapshot save/reload and deterministic publication preserve the exact document. See </w:t>
       </w:r>
-      <w:hyperlink r:id="rIdHyperlink16" w:history="1">
+      <w:hyperlink r:id="rIdHyperlink19" w:history="1">
         <w:r>
           <w:rPr>
             <w:rFonts w:ascii="Calibri" w:hAnsi="Calibri" w:cs="Calibri"/>
@@ -23822,7 +24183,7 @@
         </w:rPr>
         <w:t xml:space="preserve"> component through the P10B-05 family page; registered loading state renders on its pending route instead of replacing the 404 singleton. Read-only runtime state supplies canonical cart facts, checkout continuation, P10B-10 query/filter context, and bounded recovery actions while the snapshot preserves presentation only. Shared-frame/Design DNA, save/reload, publication, four- width browser evidence, and no-provider behavior are covered under </w:t>
       </w:r>
-      <w:hyperlink r:id="rIdHyperlink17" w:history="1">
+      <w:hyperlink r:id="rIdHyperlink20" w:history="1">
         <w:r>
           <w:rPr>
             <w:rFonts w:ascii="Calibri" w:hAnsi="Calibri" w:cs="Calibri"/>
@@ -24033,7 +24394,7 @@
         </w:rPr>
         <w:t xml:space="preserve"> frame span all pages; simple/configurable PDP, factual content, utility states, 15 four-width/representative screenshots and the passing 160-scenario human record are retained in </w:t>
       </w:r>
-      <w:hyperlink r:id="rIdHyperlink18" w:history="1">
+      <w:hyperlink r:id="rIdHyperlink21" w:history="1">
         <w:r>
           <w:rPr>
             <w:rFonts w:ascii="Calibri" w:hAnsi="Calibri" w:cs="Calibri"/>
@@ -24244,7 +24605,7 @@
         </w:rPr>
         <w:t xml:space="preserve"> One versioned deterministic synthesis contract binds exact merchant, evidence, commerce, asset, Design DNA, site-map, frame, PageBlueprint/profile, component/anatomy, narrative, density, art-direction, responsive, planner, registry and recipe authority. The same approved fixture produces editorial-heavy, commerce/discovery-heavy and restrained/minimal complete 17-route stores through the existing whole-storefront proposal, snapshot, save/reload, renderer and immutable publication chain. Details are retained in </w:t>
       </w:r>
-      <w:hyperlink r:id="rIdHyperlink19" w:history="1">
+      <w:hyperlink r:id="rIdHyperlink22" w:history="1">
         <w:r>
           <w:rPr>
             <w:rFonts w:ascii="Calibri" w:hAnsi="Calibri" w:cs="Calibri"/>
@@ -24489,7 +24850,7 @@
         </w:rPr>
         <w:t xml:space="preserve"> 31 focused unit/integration cases; nine representative complete outcomes; exact save/reload and compiled publication; protected commerce/evidence/media parity; dedicated 375/768/1024/1440 browser coverage; three retained human commercial reviews and one exact evidence manifest. See </w:t>
       </w:r>
-      <w:hyperlink r:id="rIdHyperlink20" w:history="1">
+      <w:hyperlink r:id="rIdHyperlink23" w:history="1">
         <w:r>
           <w:rPr>
             <w:rFonts w:ascii="Calibri" w:hAnsi="Calibri" w:cs="Calibri"/>
@@ -24666,7 +25027,7 @@
         </w:rPr>
         <w:t xml:space="preserve"> A compact route inventory, four collection/search archetypes, four maintained PDP profiles plus generic fallback, exact collection and product-type mappings, bounded matching rules, transient editor/runtime projection, deterministic legacy convergence, and complete snapshot/lifecycle/publication preservation. Exact primary and related-product bindings survive convergence. A server-owned, storefront-scoped proposal transition binds legacy and reviewed canonical projections for deterministic acceptance replay. Storefront Studio lists archetypes rather than one page per commerce URL; representative context is not persisted. See </w:t>
       </w:r>
-      <w:hyperlink r:id="rIdHyperlink21" w:history="1">
+      <w:hyperlink r:id="rIdHyperlink24" w:history="1">
         <w:r>
           <w:rPr>
             <w:rFonts w:ascii="Calibri" w:hAnsi="Calibri" w:cs="Calibri"/>
@@ -25134,7 +25495,7 @@
         </w:rPr>
         <w:t xml:space="preserve"> </w:t>
       </w:r>
-      <w:hyperlink r:id="rIdHyperlink22" w:history="1">
+      <w:hyperlink r:id="rIdHyperlink25" w:history="1">
         <w:r>
           <w:rPr>
             <w:rFonts w:ascii="Calibri" w:hAnsi="Calibri" w:cs="Calibri"/>
@@ -25595,7 +25956,7 @@
         </w:rPr>
         <w:t xml:space="preserve">. Completed 15 August 2026; see </w:t>
       </w:r>
-      <w:hyperlink r:id="rIdHyperlink5" w:history="1">
+      <w:hyperlink r:id="rIdHyperlink8" w:history="1">
         <w:r>
           <w:rPr>
             <w:rFonts w:ascii="Calibri" w:hAnsi="Calibri" w:cs="Calibri"/>
@@ -26857,7 +27218,7 @@
         </w:rPr>
         <w:t xml:space="preserve">. Accepted by the product owner on 16 August 2026 under </w:t>
       </w:r>
-      <w:hyperlink r:id="rIdHyperlink23" w:history="1">
+      <w:hyperlink r:id="rIdHyperlink26" w:history="1">
         <w:r>
           <w:rPr>
             <w:rFonts w:ascii="Calibri" w:hAnsi="Calibri" w:cs="Calibri"/>
@@ -27215,7 +27576,7 @@
         </w:rPr>
         <w:t xml:space="preserve">. Accepted by the product owner on 17 August 2026 under </w:t>
       </w:r>
-      <w:hyperlink r:id="rIdHyperlink23" w:history="1">
+      <w:hyperlink r:id="rIdHyperlink26" w:history="1">
         <w:r>
           <w:rPr>
             <w:rFonts w:ascii="Calibri" w:hAnsi="Calibri" w:cs="Calibri"/>
@@ -30355,7 +30716,7 @@
         </w:rPr>
         <w:t xml:space="preserve"> </w:t>
       </w:r>
-      <w:hyperlink r:id="rIdHyperlink24" w:history="1">
+      <w:hyperlink r:id="rIdHyperlink27" w:history="1">
         <w:r>
           <w:rPr>
             <w:rFonts w:ascii="Calibri" w:hAnsi="Calibri" w:cs="Calibri"/>
@@ -30371,7 +30732,7 @@
         </w:rPr>
         <w:t xml:space="preserve"> and </w:t>
       </w:r>
-      <w:hyperlink r:id="rIdHyperlink25" w:history="1">
+      <w:hyperlink r:id="rIdHyperlink28" w:history="1">
         <w:r>
           <w:rPr>
             <w:rFonts w:ascii="Calibri" w:hAnsi="Calibri" w:cs="Calibri"/>

</xml_diff>

<commit_message>
AR-03A: extract route matching and error authority
</commit_message>
<xml_diff>
--- a/docs/VESKIFY_DEVELOPMENT_DELIVERY_TRACKER_v1.3.0.docx
+++ b/docs/VESKIFY_DEVELOPMENT_DELIVERY_TRACKER_v1.3.0.docx
@@ -51,7 +51,7 @@
         <w:rPr>
           <w:rFonts w:ascii="Calibri" w:hAnsi="Calibri" w:cs="Calibri"/>
         </w:rPr>
-        <w:t>Effective upon explicit AR-02A acceptance/merge: AR-02A Baseline / closed; AR-02 Partial; AR-03A next selected child</w:t>
+        <w:t>Effective upon explicit AR-03A acceptance/merge: AR-02A and AR-03A Baseline / closed; AR-02 and AR-03 Partial; no selected successor</w:t>
       </w:r>
     </w:p>
     <w:p>
@@ -118,7 +118,7 @@
           <w:b/>
           <w:bCs/>
         </w:rPr>
-        <w:t>Candidate status effective upon explicit owner acceptance/merge of AR-02A:</w:t>
+        <w:t>Candidate status effective upon explicit owner acceptance/merge of AR-03A:</w:t>
       </w:r>
       <w:r>
         <w:rPr>
@@ -202,27 +202,27 @@
           <w:b/>
           <w:bCs/>
         </w:rPr>
-        <w:t>Planned</w:t>
-      </w:r>
-      <w:r>
-        <w:rPr>
-          <w:rFonts w:ascii="Calibri" w:hAnsi="Calibri" w:cs="Calibri"/>
-        </w:rPr>
-        <w:t xml:space="preserve">. It is unstarted. AR-03A is </w:t>
-      </w:r>
-      <w:r>
-        <w:rPr>
-          <w:rFonts w:ascii="Calibri" w:hAnsi="Calibri" w:cs="Calibri"/>
-          <w:b/>
-          <w:bCs/>
-        </w:rPr>
-        <w:t>Planned — exact next selected child</w:t>
-      </w:r>
-      <w:r>
-        <w:rPr>
-          <w:rFonts w:ascii="Calibri" w:hAnsi="Calibri" w:cs="Calibri"/>
-        </w:rPr>
-        <w:t xml:space="preserve">. AR-23 depends on AR-01 and is not serialized behind visual work. This tracker owns current status; the roadmap owns dependency order. Retained B01 exact-next, fixed-two-call/mandatory-three-concept, transient-only, and 73-child future-sequence statements are </w:t>
+        <w:t>Partial</w:t>
+      </w:r>
+      <w:r>
+        <w:rPr>
+          <w:rFonts w:ascii="Calibri" w:hAnsi="Calibri" w:cs="Calibri"/>
+        </w:rPr>
+        <w:t xml:space="preserve">; route resolution, editor, migration, and expand/fold isolation remain. AR-03A is </w:t>
+      </w:r>
+      <w:r>
+        <w:rPr>
+          <w:rFonts w:ascii="Calibri" w:hAnsi="Calibri" w:cs="Calibri"/>
+          <w:b/>
+          <w:bCs/>
+        </w:rPr>
+        <w:t>Baseline / closed upon explicit owner acceptance/merge</w:t>
+      </w:r>
+      <w:r>
+        <w:rPr>
+          <w:rFonts w:ascii="Calibri" w:hAnsi="Calibri" w:cs="Calibri"/>
+        </w:rPr>
+        <w:t xml:space="preserve">. The pilot has no selected successor; remaining AR-02 work is future planning only. AR-23 depends on AR-01 and is not serialized behind visual work. This tracker owns current status; the roadmap owns dependency order. Retained B01 exact-next, fixed-two-call/mandatory-three-concept, transient-only, and 73-child future-sequence statements are </w:t>
       </w:r>
       <w:r>
         <w:rPr>
@@ -759,7 +759,7 @@
               <w:rPr>
                 <w:rFonts w:ascii="Calibri" w:hAnsi="Calibri" w:cs="Calibri"/>
               </w:rPr>
-              <w:t>Status effective on AR-02A acceptance/merge</w:t>
+              <w:t>Status effective on AR-03A acceptance/merge</w:t>
             </w:r>
           </w:p>
         </w:tc>
@@ -932,9 +932,25 @@
                   <w:color w:val="2E74B5"/>
                   <w:u w:val="single"/>
                 </w:rPr>
-                <w:t>approved queue</w:t>
+                <w:t>contract</w:t>
               </w:r>
             </w:hyperlink>
+            <w:r>
+              <w:rPr>
+                <w:rFonts w:ascii="Calibri" w:hAnsi="Calibri" w:cs="Calibri"/>
+              </w:rPr>
+              <w:t xml:space="preserve">, </w:t>
+            </w:r>
+            <w:hyperlink r:id="rIdHyperlink6" w:history="1">
+              <w:r>
+                <w:rPr>
+                  <w:rFonts w:ascii="Calibri" w:hAnsi="Calibri" w:cs="Calibri"/>
+                  <w:color w:val="2E74B5"/>
+                  <w:u w:val="single"/>
+                </w:rPr>
+                <w:t>report</w:t>
+              </w:r>
+            </w:hyperlink>
           </w:p>
         </w:tc>
         <w:tc>
@@ -953,13 +969,13 @@
                 <w:b/>
                 <w:bCs/>
               </w:rPr>
-              <w:t>Planned</w:t>
-            </w:r>
-            <w:r>
-              <w:rPr>
-                <w:rFonts w:ascii="Calibri" w:hAnsi="Calibri" w:cs="Calibri"/>
-              </w:rPr>
-              <w:t xml:space="preserve"> — next selected child; unstarted</w:t>
+              <w:t>Baseline / closed</w:t>
+            </w:r>
+            <w:r>
+              <w:rPr>
+                <w:rFonts w:ascii="Calibri" w:hAnsi="Calibri" w:cs="Calibri"/>
+              </w:rPr>
+              <w:t xml:space="preserve"> upon acceptance/merge</w:t>
             </w:r>
           </w:p>
         </w:tc>
@@ -20895,7 +20911,7 @@
         </w:rPr>
         <w:t xml:space="preserve">. Completed 7 August 2026; see </w:t>
       </w:r>
-      <w:hyperlink r:id="rIdHyperlink6" w:history="1">
+      <w:hyperlink r:id="rIdHyperlink7" w:history="1">
         <w:r>
           <w:rPr>
             <w:rFonts w:ascii="Calibri" w:hAnsi="Calibri" w:cs="Calibri"/>
@@ -21032,7 +21048,7 @@
         </w:rPr>
         <w:t xml:space="preserve">The binding details and minimum coverage are in </w:t>
       </w:r>
-      <w:hyperlink r:id="rIdHyperlink7" w:history="1">
+      <w:hyperlink r:id="rIdHyperlink8" w:history="1">
         <w:r>
           <w:rPr>
             <w:rFonts w:ascii="Calibri" w:hAnsi="Calibri" w:cs="Calibri"/>
@@ -21230,7 +21246,7 @@
         </w:rPr>
         <w:t xml:space="preserve">. P10B-16P-04 acceptance evidence is retained in </w:t>
       </w:r>
-      <w:hyperlink r:id="rIdHyperlink8" w:history="1">
+      <w:hyperlink r:id="rIdHyperlink9" w:history="1">
         <w:r>
           <w:rPr>
             <w:rFonts w:ascii="Calibri" w:hAnsi="Calibri" w:cs="Calibri"/>
@@ -21479,7 +21495,7 @@
         </w:rPr>
         <w:t xml:space="preserve">. See </w:t>
       </w:r>
-      <w:hyperlink r:id="rIdHyperlink9" w:history="1">
+      <w:hyperlink r:id="rIdHyperlink10" w:history="1">
         <w:r>
           <w:rPr>
             <w:rFonts w:ascii="Calibri" w:hAnsi="Calibri" w:cs="Calibri"/>
@@ -21728,7 +21744,7 @@
         </w:rPr>
         <w:t xml:space="preserve">. See </w:t>
       </w:r>
-      <w:hyperlink r:id="rIdHyperlink10" w:history="1">
+      <w:hyperlink r:id="rIdHyperlink11" w:history="1">
         <w:r>
           <w:rPr>
             <w:rFonts w:ascii="Calibri" w:hAnsi="Calibri" w:cs="Calibri"/>
@@ -21977,7 +21993,7 @@
         </w:rPr>
         <w:t xml:space="preserve">. At P10B-03 delivery, all then-current 25 V2 definitions and 91 variants were classified explicitly without false commercial-ready promotion. Later family tasks extend that same authority rather than replacing it. See </w:t>
       </w:r>
-      <w:hyperlink r:id="rIdHyperlink11" w:history="1">
+      <w:hyperlink r:id="rIdHyperlink12" w:history="1">
         <w:r>
           <w:rPr>
             <w:rFonts w:ascii="Calibri" w:hAnsi="Calibri" w:cs="Calibri"/>
@@ -22226,7 +22242,7 @@
         </w:rPr>
         <w:t xml:space="preserve"> embeds exact lineage and bounded treatment in the existing approved presentation, consumes Design DNA and registered anatomy, projects protected same-product media, preserves authority through lifecycle/compiler boundaries, and renders semantic four-breakpoint evidence. Production CDN transforms and retained commercial visual acceptance remain deferred. See </w:t>
       </w:r>
-      <w:hyperlink r:id="rIdHyperlink12" w:history="1">
+      <w:hyperlink r:id="rIdHyperlink13" w:history="1">
         <w:r>
           <w:rPr>
             <w:rFonts w:ascii="Calibri" w:hAnsi="Calibri" w:cs="Calibri"/>
@@ -22475,7 +22491,7 @@
         </w:rPr>
         <w:t xml:space="preserve">. See </w:t>
       </w:r>
-      <w:hyperlink r:id="rIdHyperlink13" w:history="1">
+      <w:hyperlink r:id="rIdHyperlink14" w:history="1">
         <w:r>
           <w:rPr>
             <w:rFonts w:ascii="Calibri" w:hAnsi="Calibri" w:cs="Calibri"/>
@@ -22710,7 +22726,7 @@
         </w:rPr>
         <w:t xml:space="preserve">. Four exact root-frame profiles, three mobile modes, and four footer compositions preserve canonical navigation and frame identity through snapshot, save/reload, Puck root, preview, publication compilation, EN/FI, and 375/768/1024/1440 px evidence. See </w:t>
       </w:r>
-      <w:hyperlink r:id="rIdHyperlink14" w:history="1">
+      <w:hyperlink r:id="rIdHyperlink15" w:history="1">
         <w:r>
           <w:rPr>
             <w:rFonts w:ascii="Calibri" w:hAnsi="Calibri" w:cs="Calibri"/>
@@ -22945,7 +22961,7 @@
         </w:rPr>
         <w:t xml:space="preserve">. Six meaningful hero anatomies, five editorial/story anatomies, five campaign/promotion anatomies and three evidence-grounded proof/service anatomies are registered, PageBlueprint-selectable, deterministically generated, snapshot/publish preserved and rendered through one shared implementation. Focused deterministic coverage and a zero-provider Chromium scenario retain evidence at 375, 768, 1024 and 1440 px. See </w:t>
       </w:r>
-      <w:hyperlink r:id="rIdHyperlink15" w:history="1">
+      <w:hyperlink r:id="rIdHyperlink16" w:history="1">
         <w:r>
           <w:rPr>
             <w:rFonts w:ascii="Calibri" w:hAnsi="Calibri" w:cs="Calibri"/>
@@ -22994,7 +23010,7 @@
         </w:rPr>
         <w:t xml:space="preserve"> Baseline. One fingerprinted authority and renderer now serve homepage merchandising, collection/results, related products, and legacy compatibility. Five meaningful anatomies preserve canonical facts and P10B-04 media lineage through plan, proposal, snapshot, save/reload, publish, and responsive browser evidence. See </w:t>
       </w:r>
-      <w:hyperlink r:id="rIdHyperlink16" w:history="1">
+      <w:hyperlink r:id="rIdHyperlink17" w:history="1">
         <w:r>
           <w:rPr>
             <w:rFonts w:ascii="Calibri" w:hAnsi="Calibri" w:cs="Calibri"/>
@@ -23211,7 +23227,7 @@
         </w:rPr>
         <w:t xml:space="preserve"> Baseline. Six versioned, structurally fingerprinted homepage PageBlueprint profiles compose current shared-frame, commercial storytelling, canonical product-card, approved-media, and Design DNA authority. Evidence/cardinality guards fail closed; deterministic lifecycle and 24 retained four-width browser images pass. See </w:t>
       </w:r>
-      <w:hyperlink r:id="rIdHyperlink17" w:history="1">
+      <w:hyperlink r:id="rIdHyperlink18" w:history="1">
         <w:r>
           <w:rPr>
             <w:rFonts w:ascii="Calibri" w:hAnsi="Calibri" w:cs="Calibri"/>
@@ -23442,7 +23458,7 @@
         </w:rPr>
         <w:t xml:space="preserve"> anatomy, P10B-08 canonical card anatomy, and P10B-04 approved media treatment. Exact canonical catalogue bindings preserve product membership/order, facts, product media, filters/sort state, and child-collection order. Campaign media is approved collection/editorial media, not a product-media replacement. A transient revision-checked zero-result context keeps the query without fabricating products. Deterministic lifecycle and 16-view Chromium evidence pass with zero provider calls. See </w:t>
       </w:r>
-      <w:hyperlink r:id="rIdHyperlink18" w:history="1">
+      <w:hyperlink r:id="rIdHyperlink19" w:history="1">
         <w:r>
           <w:rPr>
             <w:rFonts w:ascii="Calibri" w:hAnsi="Calibri" w:cs="Calibri"/>
@@ -23972,7 +23988,7 @@
         </w:rPr>
         <w:t xml:space="preserve">. Fifteen structurally distinct registered profiles resolve exact current approved brief evidence into strict localized fact documents. P10B-05 preserves page-set, route, locale, and transitive navigation authority; P10B-06 frames and P10B-07 editorial/campaign renderers are reused. Snapshot save/reload and deterministic publication preserve the exact document. See </w:t>
       </w:r>
-      <w:hyperlink r:id="rIdHyperlink19" w:history="1">
+      <w:hyperlink r:id="rIdHyperlink20" w:history="1">
         <w:r>
           <w:rPr>
             <w:rFonts w:ascii="Calibri" w:hAnsi="Calibri" w:cs="Calibri"/>
@@ -24183,7 +24199,7 @@
         </w:rPr>
         <w:t xml:space="preserve"> component through the P10B-05 family page; registered loading state renders on its pending route instead of replacing the 404 singleton. Read-only runtime state supplies canonical cart facts, checkout continuation, P10B-10 query/filter context, and bounded recovery actions while the snapshot preserves presentation only. Shared-frame/Design DNA, save/reload, publication, four- width browser evidence, and no-provider behavior are covered under </w:t>
       </w:r>
-      <w:hyperlink r:id="rIdHyperlink20" w:history="1">
+      <w:hyperlink r:id="rIdHyperlink21" w:history="1">
         <w:r>
           <w:rPr>
             <w:rFonts w:ascii="Calibri" w:hAnsi="Calibri" w:cs="Calibri"/>
@@ -24394,7 +24410,7 @@
         </w:rPr>
         <w:t xml:space="preserve"> frame span all pages; simple/configurable PDP, factual content, utility states, 15 four-width/representative screenshots and the passing 160-scenario human record are retained in </w:t>
       </w:r>
-      <w:hyperlink r:id="rIdHyperlink21" w:history="1">
+      <w:hyperlink r:id="rIdHyperlink22" w:history="1">
         <w:r>
           <w:rPr>
             <w:rFonts w:ascii="Calibri" w:hAnsi="Calibri" w:cs="Calibri"/>
@@ -24605,7 +24621,7 @@
         </w:rPr>
         <w:t xml:space="preserve"> One versioned deterministic synthesis contract binds exact merchant, evidence, commerce, asset, Design DNA, site-map, frame, PageBlueprint/profile, component/anatomy, narrative, density, art-direction, responsive, planner, registry and recipe authority. The same approved fixture produces editorial-heavy, commerce/discovery-heavy and restrained/minimal complete 17-route stores through the existing whole-storefront proposal, snapshot, save/reload, renderer and immutable publication chain. Details are retained in </w:t>
       </w:r>
-      <w:hyperlink r:id="rIdHyperlink22" w:history="1">
+      <w:hyperlink r:id="rIdHyperlink23" w:history="1">
         <w:r>
           <w:rPr>
             <w:rFonts w:ascii="Calibri" w:hAnsi="Calibri" w:cs="Calibri"/>
@@ -24850,7 +24866,7 @@
         </w:rPr>
         <w:t xml:space="preserve"> 31 focused unit/integration cases; nine representative complete outcomes; exact save/reload and compiled publication; protected commerce/evidence/media parity; dedicated 375/768/1024/1440 browser coverage; three retained human commercial reviews and one exact evidence manifest. See </w:t>
       </w:r>
-      <w:hyperlink r:id="rIdHyperlink23" w:history="1">
+      <w:hyperlink r:id="rIdHyperlink24" w:history="1">
         <w:r>
           <w:rPr>
             <w:rFonts w:ascii="Calibri" w:hAnsi="Calibri" w:cs="Calibri"/>
@@ -25027,7 +25043,7 @@
         </w:rPr>
         <w:t xml:space="preserve"> A compact route inventory, four collection/search archetypes, four maintained PDP profiles plus generic fallback, exact collection and product-type mappings, bounded matching rules, transient editor/runtime projection, deterministic legacy convergence, and complete snapshot/lifecycle/publication preservation. Exact primary and related-product bindings survive convergence. A server-owned, storefront-scoped proposal transition binds legacy and reviewed canonical projections for deterministic acceptance replay. Storefront Studio lists archetypes rather than one page per commerce URL; representative context is not persisted. See </w:t>
       </w:r>
-      <w:hyperlink r:id="rIdHyperlink24" w:history="1">
+      <w:hyperlink r:id="rIdHyperlink25" w:history="1">
         <w:r>
           <w:rPr>
             <w:rFonts w:ascii="Calibri" w:hAnsi="Calibri" w:cs="Calibri"/>
@@ -25495,7 +25511,7 @@
         </w:rPr>
         <w:t xml:space="preserve"> </w:t>
       </w:r>
-      <w:hyperlink r:id="rIdHyperlink25" w:history="1">
+      <w:hyperlink r:id="rIdHyperlink26" w:history="1">
         <w:r>
           <w:rPr>
             <w:rFonts w:ascii="Calibri" w:hAnsi="Calibri" w:cs="Calibri"/>
@@ -25956,7 +25972,7 @@
         </w:rPr>
         <w:t xml:space="preserve">. Completed 15 August 2026; see </w:t>
       </w:r>
-      <w:hyperlink r:id="rIdHyperlink8" w:history="1">
+      <w:hyperlink r:id="rIdHyperlink9" w:history="1">
         <w:r>
           <w:rPr>
             <w:rFonts w:ascii="Calibri" w:hAnsi="Calibri" w:cs="Calibri"/>
@@ -27218,7 +27234,7 @@
         </w:rPr>
         <w:t xml:space="preserve">. Accepted by the product owner on 16 August 2026 under </w:t>
       </w:r>
-      <w:hyperlink r:id="rIdHyperlink26" w:history="1">
+      <w:hyperlink r:id="rIdHyperlink27" w:history="1">
         <w:r>
           <w:rPr>
             <w:rFonts w:ascii="Calibri" w:hAnsi="Calibri" w:cs="Calibri"/>
@@ -27576,7 +27592,7 @@
         </w:rPr>
         <w:t xml:space="preserve">. Accepted by the product owner on 17 August 2026 under </w:t>
       </w:r>
-      <w:hyperlink r:id="rIdHyperlink26" w:history="1">
+      <w:hyperlink r:id="rIdHyperlink27" w:history="1">
         <w:r>
           <w:rPr>
             <w:rFonts w:ascii="Calibri" w:hAnsi="Calibri" w:cs="Calibri"/>
@@ -30716,7 +30732,7 @@
         </w:rPr>
         <w:t xml:space="preserve"> </w:t>
       </w:r>
-      <w:hyperlink r:id="rIdHyperlink27" w:history="1">
+      <w:hyperlink r:id="rIdHyperlink28" w:history="1">
         <w:r>
           <w:rPr>
             <w:rFonts w:ascii="Calibri" w:hAnsi="Calibri" w:cs="Calibri"/>
@@ -30732,7 +30748,7 @@
         </w:rPr>
         <w:t xml:space="preserve"> and </w:t>
       </w:r>
-      <w:hyperlink r:id="rIdHyperlink28" w:history="1">
+      <w:hyperlink r:id="rIdHyperlink29" w:history="1">
         <w:r>
           <w:rPr>
             <w:rFonts w:ascii="Calibri" w:hAnsi="Calibri" w:cs="Calibri"/>

</xml_diff>

<commit_message>
AR-02B: isolate renderer-free conformance evaluation
</commit_message>
<xml_diff>
--- a/docs/VESKIFY_DEVELOPMENT_DELIVERY_TRACKER_v1.3.0.docx
+++ b/docs/VESKIFY_DEVELOPMENT_DELIVERY_TRACKER_v1.3.0.docx
@@ -51,7 +51,7 @@
         <w:rPr>
           <w:rFonts w:ascii="Calibri" w:hAnsi="Calibri" w:cs="Calibri"/>
         </w:rPr>
-        <w:t>Effective upon explicit AR-03A acceptance/merge: AR-02A and AR-03A Baseline / closed; AR-02 and AR-03 Partial; no selected successor</w:t>
+        <w:t>Effective upon explicit AR-02B acceptance/merge: AR-02A, AR-02B, and AR-03A Baseline / closed; AR-02 and AR-03 Partial; AR-02C Planned / unstarted and exact selected child</w:t>
       </w:r>
     </w:p>
     <w:p>
@@ -118,7 +118,7 @@
           <w:b/>
           <w:bCs/>
         </w:rPr>
-        <w:t>Candidate status effective upon explicit owner acceptance/merge of AR-03A:</w:t>
+        <w:t>Candidate status effective upon explicit owner acceptance/merge of AR-02B:</w:t>
       </w:r>
       <w:r>
         <w:rPr>
@@ -180,6 +180,20 @@
         <w:rPr>
           <w:rFonts w:ascii="Calibri" w:hAnsi="Calibri" w:cs="Calibri"/>
         </w:rPr>
+        <w:t xml:space="preserve"> AR-02B is </w:t>
+      </w:r>
+      <w:r>
+        <w:rPr>
+          <w:rFonts w:ascii="Calibri" w:hAnsi="Calibri" w:cs="Calibri"/>
+          <w:b/>
+          <w:bCs/>
+        </w:rPr>
+        <w:t>Baseline / closed upon explicit owner acceptance/merge.</w:t>
+      </w:r>
+      <w:r>
+        <w:rPr>
+          <w:rFonts w:ascii="Calibri" w:hAnsi="Calibri" w:cs="Calibri"/>
+        </w:rPr>
         <w:t xml:space="preserve"> AR-02 is </w:t>
       </w:r>
       <w:r>
@@ -216,13 +230,41 @@
           <w:b/>
           <w:bCs/>
         </w:rPr>
-        <w:t>Baseline / closed upon explicit owner acceptance/merge</w:t>
-      </w:r>
-      <w:r>
-        <w:rPr>
-          <w:rFonts w:ascii="Calibri" w:hAnsi="Calibri" w:cs="Calibri"/>
-        </w:rPr>
-        <w:t xml:space="preserve">. The pilot has no selected successor; remaining AR-02 work is future planning only. AR-23 depends on AR-01 and is not serialized behind visual work. This tracker owns current status; the roadmap owns dependency order. Retained B01 exact-next, fixed-two-call/mandatory-three-concept, transient-only, and 73-child future-sequence statements are </w:t>
+        <w:t>Baseline / closed.</w:t>
+      </w:r>
+      <w:r>
+        <w:rPr>
+          <w:rFonts w:ascii="Calibri" w:hAnsi="Calibri" w:cs="Calibri"/>
+        </w:rPr>
+        <w:t xml:space="preserve"> AR-02C is </w:t>
+      </w:r>
+      <w:r>
+        <w:rPr>
+          <w:rFonts w:ascii="Calibri" w:hAnsi="Calibri" w:cs="Calibri"/>
+          <w:b/>
+          <w:bCs/>
+        </w:rPr>
+        <w:t>Planned / unstarted.</w:t>
+      </w:r>
+      <w:r>
+        <w:rPr>
+          <w:rFonts w:ascii="Calibri" w:hAnsi="Calibri" w:cs="Calibri"/>
+        </w:rPr>
+        <w:t xml:space="preserve"> AR-02C is the </w:t>
+      </w:r>
+      <w:r>
+        <w:rPr>
+          <w:rFonts w:ascii="Calibri" w:hAnsi="Calibri" w:cs="Calibri"/>
+          <w:b/>
+          <w:bCs/>
+        </w:rPr>
+        <w:t>exact next selected child</w:t>
+      </w:r>
+      <w:r>
+        <w:rPr>
+          <w:rFonts w:ascii="Calibri" w:hAnsi="Calibri" w:cs="Calibri"/>
+        </w:rPr>
+        <w:t xml:space="preserve">. AR-23 depends on AR-01 and is not serialized behind visual work. This tracker owns current status; the roadmap owns dependency order. Retained B01 exact-next, fixed-two-call/mandatory-three-concept, transient-only, and 73-child future-sequence statements are </w:t>
       </w:r>
       <w:r>
         <w:rPr>
@@ -759,7 +801,7 @@
               <w:rPr>
                 <w:rFonts w:ascii="Calibri" w:hAnsi="Calibri" w:cs="Calibri"/>
               </w:rPr>
-              <w:t>Status effective on AR-03A acceptance/merge</w:t>
+              <w:t>Status effective on AR-02B acceptance/merge</w:t>
             </w:r>
           </w:p>
         </w:tc>
@@ -887,7 +929,7 @@
               <w:rPr>
                 <w:rFonts w:ascii="Calibri" w:hAnsi="Calibri" w:cs="Calibri"/>
               </w:rPr>
-              <w:t>AR-03A</w:t>
+              <w:t>AR-02B</w:t>
             </w:r>
           </w:p>
         </w:tc>
@@ -905,7 +947,7 @@
               <w:rPr>
                 <w:rFonts w:ascii="Calibri" w:hAnsi="Calibri" w:cs="Calibri"/>
               </w:rPr>
-              <w:t>AR-03</w:t>
+              <w:t>AR-02</w:t>
             </w:r>
           </w:p>
         </w:tc>
@@ -923,7 +965,7 @@
               <w:rPr>
                 <w:rFonts w:ascii="Calibri" w:hAnsi="Calibri" w:cs="Calibri"/>
               </w:rPr>
-              <w:t xml:space="preserve">Extract route matching and errors; </w:t>
+              <w:t xml:space="preserve">Extract renderer-free deterministic conformance evaluation; </w:t>
             </w:r>
             <w:hyperlink r:id="rIdHyperlink5" w:history="1">
               <w:r>
@@ -976,6 +1018,190 @@
                 <w:rFonts w:ascii="Calibri" w:hAnsi="Calibri" w:cs="Calibri"/>
               </w:rPr>
               <w:t xml:space="preserve"> upon acceptance/merge</w:t>
+            </w:r>
+          </w:p>
+        </w:tc>
+      </w:tr>
+      <w:tr>
+        <w:trPr>
+          <w:cantSplit/>
+        </w:trPr>
+        <w:tc>
+          <w:tcPr>
+            <w:tcW w:w="1000" w:type="dxa"/>
+            <w:vAlign w:val="center"/>
+          </w:tcPr>
+          <w:p>
+            <w:pPr>
+              <w:pStyle w:val="TableText"/>
+              <w:widowControl/>
+            </w:pPr>
+            <w:r>
+              <w:rPr>
+                <w:rFonts w:ascii="Calibri" w:hAnsi="Calibri" w:cs="Calibri"/>
+              </w:rPr>
+              <w:t>AR-03A</w:t>
+            </w:r>
+          </w:p>
+        </w:tc>
+        <w:tc>
+          <w:tcPr>
+            <w:tcW w:w="1500" w:type="dxa"/>
+            <w:vAlign w:val="center"/>
+          </w:tcPr>
+          <w:p>
+            <w:pPr>
+              <w:pStyle w:val="TableText"/>
+              <w:widowControl/>
+            </w:pPr>
+            <w:r>
+              <w:rPr>
+                <w:rFonts w:ascii="Calibri" w:hAnsi="Calibri" w:cs="Calibri"/>
+              </w:rPr>
+              <w:t>AR-03</w:t>
+            </w:r>
+          </w:p>
+        </w:tc>
+        <w:tc>
+          <w:tcPr>
+            <w:tcW w:w="2000" w:type="dxa"/>
+            <w:vAlign w:val="center"/>
+          </w:tcPr>
+          <w:p>
+            <w:pPr>
+              <w:pStyle w:val="TableText"/>
+              <w:widowControl/>
+            </w:pPr>
+            <w:r>
+              <w:rPr>
+                <w:rFonts w:ascii="Calibri" w:hAnsi="Calibri" w:cs="Calibri"/>
+              </w:rPr>
+              <w:t xml:space="preserve">Extract route matching and errors; </w:t>
+            </w:r>
+            <w:hyperlink r:id="rIdHyperlink7" w:history="1">
+              <w:r>
+                <w:rPr>
+                  <w:rFonts w:ascii="Calibri" w:hAnsi="Calibri" w:cs="Calibri"/>
+                  <w:color w:val="2E74B5"/>
+                  <w:u w:val="single"/>
+                </w:rPr>
+                <w:t>contract</w:t>
+              </w:r>
+            </w:hyperlink>
+            <w:r>
+              <w:rPr>
+                <w:rFonts w:ascii="Calibri" w:hAnsi="Calibri" w:cs="Calibri"/>
+              </w:rPr>
+              <w:t xml:space="preserve">, </w:t>
+            </w:r>
+            <w:hyperlink r:id="rIdHyperlink8" w:history="1">
+              <w:r>
+                <w:rPr>
+                  <w:rFonts w:ascii="Calibri" w:hAnsi="Calibri" w:cs="Calibri"/>
+                  <w:color w:val="2E74B5"/>
+                  <w:u w:val="single"/>
+                </w:rPr>
+                <w:t>report</w:t>
+              </w:r>
+            </w:hyperlink>
+          </w:p>
+        </w:tc>
+        <w:tc>
+          <w:tcPr>
+            <w:tcW w:w="8460" w:type="dxa"/>
+            <w:vAlign w:val="center"/>
+          </w:tcPr>
+          <w:p>
+            <w:pPr>
+              <w:pStyle w:val="TableText"/>
+              <w:widowControl/>
+            </w:pPr>
+            <w:r>
+              <w:rPr>
+                <w:rFonts w:ascii="Calibri" w:hAnsi="Calibri" w:cs="Calibri"/>
+                <w:b/>
+                <w:bCs/>
+              </w:rPr>
+              <w:t>Baseline / closed</w:t>
+            </w:r>
+          </w:p>
+        </w:tc>
+      </w:tr>
+      <w:tr>
+        <w:trPr>
+          <w:cantSplit/>
+        </w:trPr>
+        <w:tc>
+          <w:tcPr>
+            <w:tcW w:w="1000" w:type="dxa"/>
+            <w:vAlign w:val="center"/>
+          </w:tcPr>
+          <w:p>
+            <w:pPr>
+              <w:pStyle w:val="TableText"/>
+              <w:widowControl/>
+            </w:pPr>
+            <w:r>
+              <w:rPr>
+                <w:rFonts w:ascii="Calibri" w:hAnsi="Calibri" w:cs="Calibri"/>
+              </w:rPr>
+              <w:t>AR-02C</w:t>
+            </w:r>
+          </w:p>
+        </w:tc>
+        <w:tc>
+          <w:tcPr>
+            <w:tcW w:w="1500" w:type="dxa"/>
+            <w:vAlign w:val="center"/>
+          </w:tcPr>
+          <w:p>
+            <w:pPr>
+              <w:pStyle w:val="TableText"/>
+              <w:widowControl/>
+            </w:pPr>
+            <w:r>
+              <w:rPr>
+                <w:rFonts w:ascii="Calibri" w:hAnsi="Calibri" w:cs="Calibri"/>
+              </w:rPr>
+              <w:t>AR-02</w:t>
+            </w:r>
+          </w:p>
+        </w:tc>
+        <w:tc>
+          <w:tcPr>
+            <w:tcW w:w="2000" w:type="dxa"/>
+            <w:vAlign w:val="center"/>
+          </w:tcPr>
+          <w:p>
+            <w:pPr>
+              <w:pStyle w:val="TableText"/>
+              <w:widowControl/>
+            </w:pPr>
+            <w:r>
+              <w:rPr>
+                <w:rFonts w:ascii="Calibri" w:hAnsi="Calibri" w:cs="Calibri"/>
+              </w:rPr>
+              <w:t>Extract utility metadata and remove the supported-vocabulary renderer edge</w:t>
+            </w:r>
+          </w:p>
+        </w:tc>
+        <w:tc>
+          <w:tcPr>
+            <w:tcW w:w="8460" w:type="dxa"/>
+            <w:vAlign w:val="center"/>
+          </w:tcPr>
+          <w:p>
+            <w:pPr>
+              <w:pStyle w:val="TableText"/>
+              <w:widowControl/>
+            </w:pPr>
+            <w:r>
+              <w:rPr>
+                <w:rFonts w:ascii="Calibri" w:hAnsi="Calibri" w:cs="Calibri"/>
+                <w:b/>
+                <w:bCs/>
+              </w:rPr>
+              <w:t>Planned / unstarted</w:t>
             </w:r>
           </w:p>
         </w:tc>
@@ -20911,7 +21137,7 @@
         </w:rPr>
         <w:t xml:space="preserve">. Completed 7 August 2026; see </w:t>
       </w:r>
-      <w:hyperlink r:id="rIdHyperlink7" w:history="1">
+      <w:hyperlink r:id="rIdHyperlink9" w:history="1">
         <w:r>
           <w:rPr>
             <w:rFonts w:ascii="Calibri" w:hAnsi="Calibri" w:cs="Calibri"/>
@@ -21048,7 +21274,7 @@
         </w:rPr>
         <w:t xml:space="preserve">The binding details and minimum coverage are in </w:t>
       </w:r>
-      <w:hyperlink r:id="rIdHyperlink8" w:history="1">
+      <w:hyperlink r:id="rIdHyperlink10" w:history="1">
         <w:r>
           <w:rPr>
             <w:rFonts w:ascii="Calibri" w:hAnsi="Calibri" w:cs="Calibri"/>
@@ -21246,7 +21472,7 @@
         </w:rPr>
         <w:t xml:space="preserve">. P10B-16P-04 acceptance evidence is retained in </w:t>
       </w:r>
-      <w:hyperlink r:id="rIdHyperlink9" w:history="1">
+      <w:hyperlink r:id="rIdHyperlink11" w:history="1">
         <w:r>
           <w:rPr>
             <w:rFonts w:ascii="Calibri" w:hAnsi="Calibri" w:cs="Calibri"/>
@@ -21495,7 +21721,7 @@
         </w:rPr>
         <w:t xml:space="preserve">. See </w:t>
       </w:r>
-      <w:hyperlink r:id="rIdHyperlink10" w:history="1">
+      <w:hyperlink r:id="rIdHyperlink12" w:history="1">
         <w:r>
           <w:rPr>
             <w:rFonts w:ascii="Calibri" w:hAnsi="Calibri" w:cs="Calibri"/>
@@ -21744,7 +21970,7 @@
         </w:rPr>
         <w:t xml:space="preserve">. See </w:t>
       </w:r>
-      <w:hyperlink r:id="rIdHyperlink11" w:history="1">
+      <w:hyperlink r:id="rIdHyperlink13" w:history="1">
         <w:r>
           <w:rPr>
             <w:rFonts w:ascii="Calibri" w:hAnsi="Calibri" w:cs="Calibri"/>
@@ -21993,7 +22219,7 @@
         </w:rPr>
         <w:t xml:space="preserve">. At P10B-03 delivery, all then-current 25 V2 definitions and 91 variants were classified explicitly without false commercial-ready promotion. Later family tasks extend that same authority rather than replacing it. See </w:t>
       </w:r>
-      <w:hyperlink r:id="rIdHyperlink12" w:history="1">
+      <w:hyperlink r:id="rIdHyperlink14" w:history="1">
         <w:r>
           <w:rPr>
             <w:rFonts w:ascii="Calibri" w:hAnsi="Calibri" w:cs="Calibri"/>
@@ -22242,7 +22468,7 @@
         </w:rPr>
         <w:t xml:space="preserve"> embeds exact lineage and bounded treatment in the existing approved presentation, consumes Design DNA and registered anatomy, projects protected same-product media, preserves authority through lifecycle/compiler boundaries, and renders semantic four-breakpoint evidence. Production CDN transforms and retained commercial visual acceptance remain deferred. See </w:t>
       </w:r>
-      <w:hyperlink r:id="rIdHyperlink13" w:history="1">
+      <w:hyperlink r:id="rIdHyperlink15" w:history="1">
         <w:r>
           <w:rPr>
             <w:rFonts w:ascii="Calibri" w:hAnsi="Calibri" w:cs="Calibri"/>
@@ -22491,7 +22717,7 @@
         </w:rPr>
         <w:t xml:space="preserve">. See </w:t>
       </w:r>
-      <w:hyperlink r:id="rIdHyperlink14" w:history="1">
+      <w:hyperlink r:id="rIdHyperlink16" w:history="1">
         <w:r>
           <w:rPr>
             <w:rFonts w:ascii="Calibri" w:hAnsi="Calibri" w:cs="Calibri"/>
@@ -22726,7 +22952,7 @@
         </w:rPr>
         <w:t xml:space="preserve">. Four exact root-frame profiles, three mobile modes, and four footer compositions preserve canonical navigation and frame identity through snapshot, save/reload, Puck root, preview, publication compilation, EN/FI, and 375/768/1024/1440 px evidence. See </w:t>
       </w:r>
-      <w:hyperlink r:id="rIdHyperlink15" w:history="1">
+      <w:hyperlink r:id="rIdHyperlink17" w:history="1">
         <w:r>
           <w:rPr>
             <w:rFonts w:ascii="Calibri" w:hAnsi="Calibri" w:cs="Calibri"/>
@@ -22961,7 +23187,7 @@
         </w:rPr>
         <w:t xml:space="preserve">. Six meaningful hero anatomies, five editorial/story anatomies, five campaign/promotion anatomies and three evidence-grounded proof/service anatomies are registered, PageBlueprint-selectable, deterministically generated, snapshot/publish preserved and rendered through one shared implementation. Focused deterministic coverage and a zero-provider Chromium scenario retain evidence at 375, 768, 1024 and 1440 px. See </w:t>
       </w:r>
-      <w:hyperlink r:id="rIdHyperlink16" w:history="1">
+      <w:hyperlink r:id="rIdHyperlink18" w:history="1">
         <w:r>
           <w:rPr>
             <w:rFonts w:ascii="Calibri" w:hAnsi="Calibri" w:cs="Calibri"/>
@@ -23010,7 +23236,7 @@
         </w:rPr>
         <w:t xml:space="preserve"> Baseline. One fingerprinted authority and renderer now serve homepage merchandising, collection/results, related products, and legacy compatibility. Five meaningful anatomies preserve canonical facts and P10B-04 media lineage through plan, proposal, snapshot, save/reload, publish, and responsive browser evidence. See </w:t>
       </w:r>
-      <w:hyperlink r:id="rIdHyperlink17" w:history="1">
+      <w:hyperlink r:id="rIdHyperlink19" w:history="1">
         <w:r>
           <w:rPr>
             <w:rFonts w:ascii="Calibri" w:hAnsi="Calibri" w:cs="Calibri"/>
@@ -23227,7 +23453,7 @@
         </w:rPr>
         <w:t xml:space="preserve"> Baseline. Six versioned, structurally fingerprinted homepage PageBlueprint profiles compose current shared-frame, commercial storytelling, canonical product-card, approved-media, and Design DNA authority. Evidence/cardinality guards fail closed; deterministic lifecycle and 24 retained four-width browser images pass. See </w:t>
       </w:r>
-      <w:hyperlink r:id="rIdHyperlink18" w:history="1">
+      <w:hyperlink r:id="rIdHyperlink20" w:history="1">
         <w:r>
           <w:rPr>
             <w:rFonts w:ascii="Calibri" w:hAnsi="Calibri" w:cs="Calibri"/>
@@ -23458,7 +23684,7 @@
         </w:rPr>
         <w:t xml:space="preserve"> anatomy, P10B-08 canonical card anatomy, and P10B-04 approved media treatment. Exact canonical catalogue bindings preserve product membership/order, facts, product media, filters/sort state, and child-collection order. Campaign media is approved collection/editorial media, not a product-media replacement. A transient revision-checked zero-result context keeps the query without fabricating products. Deterministic lifecycle and 16-view Chromium evidence pass with zero provider calls. See </w:t>
       </w:r>
-      <w:hyperlink r:id="rIdHyperlink19" w:history="1">
+      <w:hyperlink r:id="rIdHyperlink21" w:history="1">
         <w:r>
           <w:rPr>
             <w:rFonts w:ascii="Calibri" w:hAnsi="Calibri" w:cs="Calibri"/>
@@ -23988,7 +24214,7 @@
         </w:rPr>
         <w:t xml:space="preserve">. Fifteen structurally distinct registered profiles resolve exact current approved brief evidence into strict localized fact documents. P10B-05 preserves page-set, route, locale, and transitive navigation authority; P10B-06 frames and P10B-07 editorial/campaign renderers are reused. Snapshot save/reload and deterministic publication preserve the exact document. See </w:t>
       </w:r>
-      <w:hyperlink r:id="rIdHyperlink20" w:history="1">
+      <w:hyperlink r:id="rIdHyperlink22" w:history="1">
         <w:r>
           <w:rPr>
             <w:rFonts w:ascii="Calibri" w:hAnsi="Calibri" w:cs="Calibri"/>
@@ -24199,7 +24425,7 @@
         </w:rPr>
         <w:t xml:space="preserve"> component through the P10B-05 family page; registered loading state renders on its pending route instead of replacing the 404 singleton. Read-only runtime state supplies canonical cart facts, checkout continuation, P10B-10 query/filter context, and bounded recovery actions while the snapshot preserves presentation only. Shared-frame/Design DNA, save/reload, publication, four- width browser evidence, and no-provider behavior are covered under </w:t>
       </w:r>
-      <w:hyperlink r:id="rIdHyperlink21" w:history="1">
+      <w:hyperlink r:id="rIdHyperlink23" w:history="1">
         <w:r>
           <w:rPr>
             <w:rFonts w:ascii="Calibri" w:hAnsi="Calibri" w:cs="Calibri"/>
@@ -24410,7 +24636,7 @@
         </w:rPr>
         <w:t xml:space="preserve"> frame span all pages; simple/configurable PDP, factual content, utility states, 15 four-width/representative screenshots and the passing 160-scenario human record are retained in </w:t>
       </w:r>
-      <w:hyperlink r:id="rIdHyperlink22" w:history="1">
+      <w:hyperlink r:id="rIdHyperlink24" w:history="1">
         <w:r>
           <w:rPr>
             <w:rFonts w:ascii="Calibri" w:hAnsi="Calibri" w:cs="Calibri"/>
@@ -24621,7 +24847,7 @@
         </w:rPr>
         <w:t xml:space="preserve"> One versioned deterministic synthesis contract binds exact merchant, evidence, commerce, asset, Design DNA, site-map, frame, PageBlueprint/profile, component/anatomy, narrative, density, art-direction, responsive, planner, registry and recipe authority. The same approved fixture produces editorial-heavy, commerce/discovery-heavy and restrained/minimal complete 17-route stores through the existing whole-storefront proposal, snapshot, save/reload, renderer and immutable publication chain. Details are retained in </w:t>
       </w:r>
-      <w:hyperlink r:id="rIdHyperlink23" w:history="1">
+      <w:hyperlink r:id="rIdHyperlink25" w:history="1">
         <w:r>
           <w:rPr>
             <w:rFonts w:ascii="Calibri" w:hAnsi="Calibri" w:cs="Calibri"/>
@@ -24866,7 +25092,7 @@
         </w:rPr>
         <w:t xml:space="preserve"> 31 focused unit/integration cases; nine representative complete outcomes; exact save/reload and compiled publication; protected commerce/evidence/media parity; dedicated 375/768/1024/1440 browser coverage; three retained human commercial reviews and one exact evidence manifest. See </w:t>
       </w:r>
-      <w:hyperlink r:id="rIdHyperlink24" w:history="1">
+      <w:hyperlink r:id="rIdHyperlink26" w:history="1">
         <w:r>
           <w:rPr>
             <w:rFonts w:ascii="Calibri" w:hAnsi="Calibri" w:cs="Calibri"/>
@@ -25043,7 +25269,7 @@
         </w:rPr>
         <w:t xml:space="preserve"> A compact route inventory, four collection/search archetypes, four maintained PDP profiles plus generic fallback, exact collection and product-type mappings, bounded matching rules, transient editor/runtime projection, deterministic legacy convergence, and complete snapshot/lifecycle/publication preservation. Exact primary and related-product bindings survive convergence. A server-owned, storefront-scoped proposal transition binds legacy and reviewed canonical projections for deterministic acceptance replay. Storefront Studio lists archetypes rather than one page per commerce URL; representative context is not persisted. See </w:t>
       </w:r>
-      <w:hyperlink r:id="rIdHyperlink25" w:history="1">
+      <w:hyperlink r:id="rIdHyperlink27" w:history="1">
         <w:r>
           <w:rPr>
             <w:rFonts w:ascii="Calibri" w:hAnsi="Calibri" w:cs="Calibri"/>
@@ -25511,7 +25737,7 @@
         </w:rPr>
         <w:t xml:space="preserve"> </w:t>
       </w:r>
-      <w:hyperlink r:id="rIdHyperlink26" w:history="1">
+      <w:hyperlink r:id="rIdHyperlink28" w:history="1">
         <w:r>
           <w:rPr>
             <w:rFonts w:ascii="Calibri" w:hAnsi="Calibri" w:cs="Calibri"/>
@@ -25972,7 +26198,7 @@
         </w:rPr>
         <w:t xml:space="preserve">. Completed 15 August 2026; see </w:t>
       </w:r>
-      <w:hyperlink r:id="rIdHyperlink9" w:history="1">
+      <w:hyperlink r:id="rIdHyperlink11" w:history="1">
         <w:r>
           <w:rPr>
             <w:rFonts w:ascii="Calibri" w:hAnsi="Calibri" w:cs="Calibri"/>
@@ -27234,7 +27460,7 @@
         </w:rPr>
         <w:t xml:space="preserve">. Accepted by the product owner on 16 August 2026 under </w:t>
       </w:r>
-      <w:hyperlink r:id="rIdHyperlink27" w:history="1">
+      <w:hyperlink r:id="rIdHyperlink29" w:history="1">
         <w:r>
           <w:rPr>
             <w:rFonts w:ascii="Calibri" w:hAnsi="Calibri" w:cs="Calibri"/>
@@ -27592,7 +27818,7 @@
         </w:rPr>
         <w:t xml:space="preserve">. Accepted by the product owner on 17 August 2026 under </w:t>
       </w:r>
-      <w:hyperlink r:id="rIdHyperlink27" w:history="1">
+      <w:hyperlink r:id="rIdHyperlink29" w:history="1">
         <w:r>
           <w:rPr>
             <w:rFonts w:ascii="Calibri" w:hAnsi="Calibri" w:cs="Calibri"/>
@@ -30732,7 +30958,7 @@
         </w:rPr>
         <w:t xml:space="preserve"> </w:t>
       </w:r>
-      <w:hyperlink r:id="rIdHyperlink28" w:history="1">
+      <w:hyperlink r:id="rIdHyperlink30" w:history="1">
         <w:r>
           <w:rPr>
             <w:rFonts w:ascii="Calibri" w:hAnsi="Calibri" w:cs="Calibri"/>
@@ -30748,7 +30974,7 @@
         </w:rPr>
         <w:t xml:space="preserve"> and </w:t>
       </w:r>
-      <w:hyperlink r:id="rIdHyperlink29" w:history="1">
+      <w:hyperlink r:id="rIdHyperlink31" w:history="1">
         <w:r>
           <w:rPr>
             <w:rFonts w:ascii="Calibri" w:hAnsi="Calibri" w:cs="Calibri"/>

</xml_diff>

<commit_message>
refactor: extract renderer-free commerce utility metadata
</commit_message>
<xml_diff>
--- a/docs/VESKIFY_DEVELOPMENT_DELIVERY_TRACKER_v1.3.0.docx
+++ b/docs/VESKIFY_DEVELOPMENT_DELIVERY_TRACKER_v1.3.0.docx
@@ -51,7 +51,7 @@
         <w:rPr>
           <w:rFonts w:ascii="Calibri" w:hAnsi="Calibri" w:cs="Calibri"/>
         </w:rPr>
-        <w:t>Effective upon explicit AR-02B acceptance/merge: AR-02A, AR-02B, and AR-03A Baseline / closed; AR-02 and AR-03 Partial; AR-02C Planned / unstarted and exact selected child</w:t>
+        <w:t>Effective upon explicit AR-02C acceptance/merge: AR-02A, AR-02B, AR-02C, and AR-03A Baseline / closed; AR-02 and AR-03 Partial; AR-23 eligible / unstarted; no third child selected</w:t>
       </w:r>
     </w:p>
     <w:p>
@@ -118,7 +118,7 @@
           <w:b/>
           <w:bCs/>
         </w:rPr>
-        <w:t>Candidate status effective upon explicit owner acceptance/merge of AR-02B:</w:t>
+        <w:t>Candidate status effective upon explicit owner acceptance/merge of AR-02C:</w:t>
       </w:r>
       <w:r>
         <w:rPr>
@@ -188,6 +188,20 @@
           <w:b/>
           <w:bCs/>
         </w:rPr>
+        <w:t>Baseline / closed.</w:t>
+      </w:r>
+      <w:r>
+        <w:rPr>
+          <w:rFonts w:ascii="Calibri" w:hAnsi="Calibri" w:cs="Calibri"/>
+        </w:rPr>
+        <w:t xml:space="preserve"> AR-02C is </w:t>
+      </w:r>
+      <w:r>
+        <w:rPr>
+          <w:rFonts w:ascii="Calibri" w:hAnsi="Calibri" w:cs="Calibri"/>
+          <w:b/>
+          <w:bCs/>
+        </w:rPr>
         <w:t>Baseline / closed upon explicit owner acceptance/merge.</w:t>
       </w:r>
       <w:r>
@@ -236,35 +250,21 @@
         <w:rPr>
           <w:rFonts w:ascii="Calibri" w:hAnsi="Calibri" w:cs="Calibri"/>
         </w:rPr>
-        <w:t xml:space="preserve"> AR-02C is </w:t>
-      </w:r>
-      <w:r>
-        <w:rPr>
-          <w:rFonts w:ascii="Calibri" w:hAnsi="Calibri" w:cs="Calibri"/>
-          <w:b/>
-          <w:bCs/>
-        </w:rPr>
-        <w:t>Planned / unstarted.</w:t>
-      </w:r>
-      <w:r>
-        <w:rPr>
-          <w:rFonts w:ascii="Calibri" w:hAnsi="Calibri" w:cs="Calibri"/>
-        </w:rPr>
-        <w:t xml:space="preserve"> AR-02C is the </w:t>
-      </w:r>
-      <w:r>
-        <w:rPr>
-          <w:rFonts w:ascii="Calibri" w:hAnsi="Calibri" w:cs="Calibri"/>
-          <w:b/>
-          <w:bCs/>
-        </w:rPr>
-        <w:t>exact next selected child</w:t>
-      </w:r>
-      <w:r>
-        <w:rPr>
-          <w:rFonts w:ascii="Calibri" w:hAnsi="Calibri" w:cs="Calibri"/>
-        </w:rPr>
-        <w:t xml:space="preserve">. AR-23 depends on AR-01 and is not serialized behind visual work. This tracker owns current status; the roadmap owns dependency order. Retained B01 exact-next, fixed-two-call/mandatory-three-concept, transient-only, and 73-child future-sequence statements are </w:t>
+        <w:t xml:space="preserve"> AR-23 is </w:t>
+      </w:r>
+      <w:r>
+        <w:rPr>
+          <w:rFonts w:ascii="Calibri" w:hAnsi="Calibri" w:cs="Calibri"/>
+          <w:b/>
+          <w:bCs/>
+        </w:rPr>
+        <w:t>Planned / unstarted</w:t>
+      </w:r>
+      <w:r>
+        <w:rPr>
+          <w:rFonts w:ascii="Calibri" w:hAnsi="Calibri" w:cs="Calibri"/>
+        </w:rPr>
+        <w:t xml:space="preserve">. AR-23 depends on AR-01 and is not serialized behind visual work. No third child is selected. This tracker owns current status; the roadmap owns dependency order. Retained B01 exact-next, fixed-two-call/mandatory-three-concept, transient-only, and 73-child future-sequence statements are </w:t>
       </w:r>
       <w:r>
         <w:rPr>
@@ -801,7 +801,7 @@
               <w:rPr>
                 <w:rFonts w:ascii="Calibri" w:hAnsi="Calibri" w:cs="Calibri"/>
               </w:rPr>
-              <w:t>Status effective on AR-02B acceptance/merge</w:t>
+              <w:t>Status effective on AR-02C acceptance/merge</w:t>
             </w:r>
           </w:p>
         </w:tc>
@@ -1013,12 +1013,6 @@
               </w:rPr>
               <w:t>Baseline / closed</w:t>
             </w:r>
-            <w:r>
-              <w:rPr>
-                <w:rFonts w:ascii="Calibri" w:hAnsi="Calibri" w:cs="Calibri"/>
-              </w:rPr>
-              <w:t xml:space="preserve"> upon acceptance/merge</w:t>
-            </w:r>
           </w:p>
         </w:tc>
       </w:tr>
@@ -1181,8 +1175,34 @@
               <w:rPr>
                 <w:rFonts w:ascii="Calibri" w:hAnsi="Calibri" w:cs="Calibri"/>
               </w:rPr>
-              <w:t>Extract utility metadata and remove the supported-vocabulary renderer edge</w:t>
-            </w:r>
+              <w:t xml:space="preserve">Extract utility metadata and remove the supported-vocabulary renderer edge; </w:t>
+            </w:r>
+            <w:hyperlink r:id="rIdHyperlink9" w:history="1">
+              <w:r>
+                <w:rPr>
+                  <w:rFonts w:ascii="Calibri" w:hAnsi="Calibri" w:cs="Calibri"/>
+                  <w:color w:val="2E74B5"/>
+                  <w:u w:val="single"/>
+                </w:rPr>
+                <w:t>contract</w:t>
+              </w:r>
+            </w:hyperlink>
+            <w:r>
+              <w:rPr>
+                <w:rFonts w:ascii="Calibri" w:hAnsi="Calibri" w:cs="Calibri"/>
+              </w:rPr>
+              <w:t xml:space="preserve">, </w:t>
+            </w:r>
+            <w:hyperlink r:id="rIdHyperlink10" w:history="1">
+              <w:r>
+                <w:rPr>
+                  <w:rFonts w:ascii="Calibri" w:hAnsi="Calibri" w:cs="Calibri"/>
+                  <w:color w:val="2E74B5"/>
+                  <w:u w:val="single"/>
+                </w:rPr>
+                <w:t>report</w:t>
+              </w:r>
+            </w:hyperlink>
           </w:p>
         </w:tc>
         <w:tc>
@@ -1201,7 +1221,13 @@
                 <w:b/>
                 <w:bCs/>
               </w:rPr>
-              <w:t>Planned / unstarted</w:t>
+              <w:t>Baseline / closed</w:t>
+            </w:r>
+            <w:r>
+              <w:rPr>
+                <w:rFonts w:ascii="Calibri" w:hAnsi="Calibri" w:cs="Calibri"/>
+              </w:rPr>
+              <w:t xml:space="preserve"> upon acceptance/merge</w:t>
             </w:r>
           </w:p>
         </w:tc>
@@ -21137,7 +21163,7 @@
         </w:rPr>
         <w:t xml:space="preserve">. Completed 7 August 2026; see </w:t>
       </w:r>
-      <w:hyperlink r:id="rIdHyperlink9" w:history="1">
+      <w:hyperlink r:id="rIdHyperlink11" w:history="1">
         <w:r>
           <w:rPr>
             <w:rFonts w:ascii="Calibri" w:hAnsi="Calibri" w:cs="Calibri"/>
@@ -21274,7 +21300,7 @@
         </w:rPr>
         <w:t xml:space="preserve">The binding details and minimum coverage are in </w:t>
       </w:r>
-      <w:hyperlink r:id="rIdHyperlink10" w:history="1">
+      <w:hyperlink r:id="rIdHyperlink12" w:history="1">
         <w:r>
           <w:rPr>
             <w:rFonts w:ascii="Calibri" w:hAnsi="Calibri" w:cs="Calibri"/>
@@ -21472,7 +21498,7 @@
         </w:rPr>
         <w:t xml:space="preserve">. P10B-16P-04 acceptance evidence is retained in </w:t>
       </w:r>
-      <w:hyperlink r:id="rIdHyperlink11" w:history="1">
+      <w:hyperlink r:id="rIdHyperlink13" w:history="1">
         <w:r>
           <w:rPr>
             <w:rFonts w:ascii="Calibri" w:hAnsi="Calibri" w:cs="Calibri"/>
@@ -21721,7 +21747,7 @@
         </w:rPr>
         <w:t xml:space="preserve">. See </w:t>
       </w:r>
-      <w:hyperlink r:id="rIdHyperlink12" w:history="1">
+      <w:hyperlink r:id="rIdHyperlink14" w:history="1">
         <w:r>
           <w:rPr>
             <w:rFonts w:ascii="Calibri" w:hAnsi="Calibri" w:cs="Calibri"/>
@@ -21970,7 +21996,7 @@
         </w:rPr>
         <w:t xml:space="preserve">. See </w:t>
       </w:r>
-      <w:hyperlink r:id="rIdHyperlink13" w:history="1">
+      <w:hyperlink r:id="rIdHyperlink15" w:history="1">
         <w:r>
           <w:rPr>
             <w:rFonts w:ascii="Calibri" w:hAnsi="Calibri" w:cs="Calibri"/>
@@ -22219,7 +22245,7 @@
         </w:rPr>
         <w:t xml:space="preserve">. At P10B-03 delivery, all then-current 25 V2 definitions and 91 variants were classified explicitly without false commercial-ready promotion. Later family tasks extend that same authority rather than replacing it. See </w:t>
       </w:r>
-      <w:hyperlink r:id="rIdHyperlink14" w:history="1">
+      <w:hyperlink r:id="rIdHyperlink16" w:history="1">
         <w:r>
           <w:rPr>
             <w:rFonts w:ascii="Calibri" w:hAnsi="Calibri" w:cs="Calibri"/>
@@ -22468,7 +22494,7 @@
         </w:rPr>
         <w:t xml:space="preserve"> embeds exact lineage and bounded treatment in the existing approved presentation, consumes Design DNA and registered anatomy, projects protected same-product media, preserves authority through lifecycle/compiler boundaries, and renders semantic four-breakpoint evidence. Production CDN transforms and retained commercial visual acceptance remain deferred. See </w:t>
       </w:r>
-      <w:hyperlink r:id="rIdHyperlink15" w:history="1">
+      <w:hyperlink r:id="rIdHyperlink17" w:history="1">
         <w:r>
           <w:rPr>
             <w:rFonts w:ascii="Calibri" w:hAnsi="Calibri" w:cs="Calibri"/>
@@ -22717,7 +22743,7 @@
         </w:rPr>
         <w:t xml:space="preserve">. See </w:t>
       </w:r>
-      <w:hyperlink r:id="rIdHyperlink16" w:history="1">
+      <w:hyperlink r:id="rIdHyperlink18" w:history="1">
         <w:r>
           <w:rPr>
             <w:rFonts w:ascii="Calibri" w:hAnsi="Calibri" w:cs="Calibri"/>
@@ -22952,7 +22978,7 @@
         </w:rPr>
         <w:t xml:space="preserve">. Four exact root-frame profiles, three mobile modes, and four footer compositions preserve canonical navigation and frame identity through snapshot, save/reload, Puck root, preview, publication compilation, EN/FI, and 375/768/1024/1440 px evidence. See </w:t>
       </w:r>
-      <w:hyperlink r:id="rIdHyperlink17" w:history="1">
+      <w:hyperlink r:id="rIdHyperlink19" w:history="1">
         <w:r>
           <w:rPr>
             <w:rFonts w:ascii="Calibri" w:hAnsi="Calibri" w:cs="Calibri"/>
@@ -23187,7 +23213,7 @@
         </w:rPr>
         <w:t xml:space="preserve">. Six meaningful hero anatomies, five editorial/story anatomies, five campaign/promotion anatomies and three evidence-grounded proof/service anatomies are registered, PageBlueprint-selectable, deterministically generated, snapshot/publish preserved and rendered through one shared implementation. Focused deterministic coverage and a zero-provider Chromium scenario retain evidence at 375, 768, 1024 and 1440 px. See </w:t>
       </w:r>
-      <w:hyperlink r:id="rIdHyperlink18" w:history="1">
+      <w:hyperlink r:id="rIdHyperlink20" w:history="1">
         <w:r>
           <w:rPr>
             <w:rFonts w:ascii="Calibri" w:hAnsi="Calibri" w:cs="Calibri"/>
@@ -23236,7 +23262,7 @@
         </w:rPr>
         <w:t xml:space="preserve"> Baseline. One fingerprinted authority and renderer now serve homepage merchandising, collection/results, related products, and legacy compatibility. Five meaningful anatomies preserve canonical facts and P10B-04 media lineage through plan, proposal, snapshot, save/reload, publish, and responsive browser evidence. See </w:t>
       </w:r>
-      <w:hyperlink r:id="rIdHyperlink19" w:history="1">
+      <w:hyperlink r:id="rIdHyperlink21" w:history="1">
         <w:r>
           <w:rPr>
             <w:rFonts w:ascii="Calibri" w:hAnsi="Calibri" w:cs="Calibri"/>
@@ -23453,7 +23479,7 @@
         </w:rPr>
         <w:t xml:space="preserve"> Baseline. Six versioned, structurally fingerprinted homepage PageBlueprint profiles compose current shared-frame, commercial storytelling, canonical product-card, approved-media, and Design DNA authority. Evidence/cardinality guards fail closed; deterministic lifecycle and 24 retained four-width browser images pass. See </w:t>
       </w:r>
-      <w:hyperlink r:id="rIdHyperlink20" w:history="1">
+      <w:hyperlink r:id="rIdHyperlink22" w:history="1">
         <w:r>
           <w:rPr>
             <w:rFonts w:ascii="Calibri" w:hAnsi="Calibri" w:cs="Calibri"/>
@@ -23684,7 +23710,7 @@
         </w:rPr>
         <w:t xml:space="preserve"> anatomy, P10B-08 canonical card anatomy, and P10B-04 approved media treatment. Exact canonical catalogue bindings preserve product membership/order, facts, product media, filters/sort state, and child-collection order. Campaign media is approved collection/editorial media, not a product-media replacement. A transient revision-checked zero-result context keeps the query without fabricating products. Deterministic lifecycle and 16-view Chromium evidence pass with zero provider calls. See </w:t>
       </w:r>
-      <w:hyperlink r:id="rIdHyperlink21" w:history="1">
+      <w:hyperlink r:id="rIdHyperlink23" w:history="1">
         <w:r>
           <w:rPr>
             <w:rFonts w:ascii="Calibri" w:hAnsi="Calibri" w:cs="Calibri"/>
@@ -24214,7 +24240,7 @@
         </w:rPr>
         <w:t xml:space="preserve">. Fifteen structurally distinct registered profiles resolve exact current approved brief evidence into strict localized fact documents. P10B-05 preserves page-set, route, locale, and transitive navigation authority; P10B-06 frames and P10B-07 editorial/campaign renderers are reused. Snapshot save/reload and deterministic publication preserve the exact document. See </w:t>
       </w:r>
-      <w:hyperlink r:id="rIdHyperlink22" w:history="1">
+      <w:hyperlink r:id="rIdHyperlink24" w:history="1">
         <w:r>
           <w:rPr>
             <w:rFonts w:ascii="Calibri" w:hAnsi="Calibri" w:cs="Calibri"/>
@@ -24425,7 +24451,7 @@
         </w:rPr>
         <w:t xml:space="preserve"> component through the P10B-05 family page; registered loading state renders on its pending route instead of replacing the 404 singleton. Read-only runtime state supplies canonical cart facts, checkout continuation, P10B-10 query/filter context, and bounded recovery actions while the snapshot preserves presentation only. Shared-frame/Design DNA, save/reload, publication, four- width browser evidence, and no-provider behavior are covered under </w:t>
       </w:r>
-      <w:hyperlink r:id="rIdHyperlink23" w:history="1">
+      <w:hyperlink r:id="rIdHyperlink25" w:history="1">
         <w:r>
           <w:rPr>
             <w:rFonts w:ascii="Calibri" w:hAnsi="Calibri" w:cs="Calibri"/>
@@ -24636,7 +24662,7 @@
         </w:rPr>
         <w:t xml:space="preserve"> frame span all pages; simple/configurable PDP, factual content, utility states, 15 four-width/representative screenshots and the passing 160-scenario human record are retained in </w:t>
       </w:r>
-      <w:hyperlink r:id="rIdHyperlink24" w:history="1">
+      <w:hyperlink r:id="rIdHyperlink26" w:history="1">
         <w:r>
           <w:rPr>
             <w:rFonts w:ascii="Calibri" w:hAnsi="Calibri" w:cs="Calibri"/>
@@ -24847,7 +24873,7 @@
         </w:rPr>
         <w:t xml:space="preserve"> One versioned deterministic synthesis contract binds exact merchant, evidence, commerce, asset, Design DNA, site-map, frame, PageBlueprint/profile, component/anatomy, narrative, density, art-direction, responsive, planner, registry and recipe authority. The same approved fixture produces editorial-heavy, commerce/discovery-heavy and restrained/minimal complete 17-route stores through the existing whole-storefront proposal, snapshot, save/reload, renderer and immutable publication chain. Details are retained in </w:t>
       </w:r>
-      <w:hyperlink r:id="rIdHyperlink25" w:history="1">
+      <w:hyperlink r:id="rIdHyperlink27" w:history="1">
         <w:r>
           <w:rPr>
             <w:rFonts w:ascii="Calibri" w:hAnsi="Calibri" w:cs="Calibri"/>
@@ -25092,7 +25118,7 @@
         </w:rPr>
         <w:t xml:space="preserve"> 31 focused unit/integration cases; nine representative complete outcomes; exact save/reload and compiled publication; protected commerce/evidence/media parity; dedicated 375/768/1024/1440 browser coverage; three retained human commercial reviews and one exact evidence manifest. See </w:t>
       </w:r>
-      <w:hyperlink r:id="rIdHyperlink26" w:history="1">
+      <w:hyperlink r:id="rIdHyperlink28" w:history="1">
         <w:r>
           <w:rPr>
             <w:rFonts w:ascii="Calibri" w:hAnsi="Calibri" w:cs="Calibri"/>
@@ -25269,7 +25295,7 @@
         </w:rPr>
         <w:t xml:space="preserve"> A compact route inventory, four collection/search archetypes, four maintained PDP profiles plus generic fallback, exact collection and product-type mappings, bounded matching rules, transient editor/runtime projection, deterministic legacy convergence, and complete snapshot/lifecycle/publication preservation. Exact primary and related-product bindings survive convergence. A server-owned, storefront-scoped proposal transition binds legacy and reviewed canonical projections for deterministic acceptance replay. Storefront Studio lists archetypes rather than one page per commerce URL; representative context is not persisted. See </w:t>
       </w:r>
-      <w:hyperlink r:id="rIdHyperlink27" w:history="1">
+      <w:hyperlink r:id="rIdHyperlink29" w:history="1">
         <w:r>
           <w:rPr>
             <w:rFonts w:ascii="Calibri" w:hAnsi="Calibri" w:cs="Calibri"/>
@@ -25737,7 +25763,7 @@
         </w:rPr>
         <w:t xml:space="preserve"> </w:t>
       </w:r>
-      <w:hyperlink r:id="rIdHyperlink28" w:history="1">
+      <w:hyperlink r:id="rIdHyperlink30" w:history="1">
         <w:r>
           <w:rPr>
             <w:rFonts w:ascii="Calibri" w:hAnsi="Calibri" w:cs="Calibri"/>
@@ -26198,7 +26224,7 @@
         </w:rPr>
         <w:t xml:space="preserve">. Completed 15 August 2026; see </w:t>
       </w:r>
-      <w:hyperlink r:id="rIdHyperlink11" w:history="1">
+      <w:hyperlink r:id="rIdHyperlink13" w:history="1">
         <w:r>
           <w:rPr>
             <w:rFonts w:ascii="Calibri" w:hAnsi="Calibri" w:cs="Calibri"/>
@@ -27460,7 +27486,7 @@
         </w:rPr>
         <w:t xml:space="preserve">. Accepted by the product owner on 16 August 2026 under </w:t>
       </w:r>
-      <w:hyperlink r:id="rIdHyperlink29" w:history="1">
+      <w:hyperlink r:id="rIdHyperlink31" w:history="1">
         <w:r>
           <w:rPr>
             <w:rFonts w:ascii="Calibri" w:hAnsi="Calibri" w:cs="Calibri"/>
@@ -27818,7 +27844,7 @@
         </w:rPr>
         <w:t xml:space="preserve">. Accepted by the product owner on 17 August 2026 under </w:t>
       </w:r>
-      <w:hyperlink r:id="rIdHyperlink29" w:history="1">
+      <w:hyperlink r:id="rIdHyperlink31" w:history="1">
         <w:r>
           <w:rPr>
             <w:rFonts w:ascii="Calibri" w:hAnsi="Calibri" w:cs="Calibri"/>
@@ -30958,7 +30984,7 @@
         </w:rPr>
         <w:t xml:space="preserve"> </w:t>
       </w:r>
-      <w:hyperlink r:id="rIdHyperlink30" w:history="1">
+      <w:hyperlink r:id="rIdHyperlink32" w:history="1">
         <w:r>
           <w:rPr>
             <w:rFonts w:ascii="Calibri" w:hAnsi="Calibri" w:cs="Calibri"/>
@@ -30974,7 +31000,7 @@
         </w:rPr>
         <w:t xml:space="preserve"> and </w:t>
       </w:r>
-      <w:hyperlink r:id="rIdHyperlink31" w:history="1">
+      <w:hyperlink r:id="rIdHyperlink33" w:history="1">
         <w:r>
           <w:rPr>
             <w:rFonts w:ascii="Calibri" w:hAnsi="Calibri" w:cs="Calibri"/>

</xml_diff>

<commit_message>
refactor: extract homepage and hero metadata
</commit_message>
<xml_diff>
--- a/docs/VESKIFY_DEVELOPMENT_DELIVERY_TRACKER_v1.3.0.docx
+++ b/docs/VESKIFY_DEVELOPMENT_DELIVERY_TRACKER_v1.3.0.docx
@@ -51,7 +51,7 @@
         <w:rPr>
           <w:rFonts w:ascii="Calibri" w:hAnsi="Calibri" w:cs="Calibri"/>
         </w:rPr>
-        <w:t>Effective upon explicit AR-02C acceptance/merge: AR-02A, AR-02B, AR-02C, and AR-03A Baseline / closed; AR-02 and AR-03 Partial; AR-23 eligible / unstarted; no third child selected</w:t>
+        <w:t>Effective upon explicit AR-02D acceptance/merge: AR-02A, AR-02B, AR-02C, AR-02D, and AR-03A Baseline / closed; AR-02 and AR-03 Partial; AR-23 eligible / unstarted; AR-02E selected after AR-02D acceptance</w:t>
       </w:r>
     </w:p>
     <w:p>
@@ -118,7 +118,7 @@
           <w:b/>
           <w:bCs/>
         </w:rPr>
-        <w:t>Candidate status effective upon explicit owner acceptance/merge of AR-02C:</w:t>
+        <w:t>Candidate status effective upon explicit owner acceptance/merge of AR-02D:</w:t>
       </w:r>
       <w:r>
         <w:rPr>
@@ -202,6 +202,20 @@
           <w:b/>
           <w:bCs/>
         </w:rPr>
+        <w:t>Baseline / closed.</w:t>
+      </w:r>
+      <w:r>
+        <w:rPr>
+          <w:rFonts w:ascii="Calibri" w:hAnsi="Calibri" w:cs="Calibri"/>
+        </w:rPr>
+        <w:t xml:space="preserve"> AR-02D is </w:t>
+      </w:r>
+      <w:r>
+        <w:rPr>
+          <w:rFonts w:ascii="Calibri" w:hAnsi="Calibri" w:cs="Calibri"/>
+          <w:b/>
+          <w:bCs/>
+        </w:rPr>
         <w:t>Baseline / closed upon explicit owner acceptance/merge.</w:t>
       </w:r>
       <w:r>
@@ -264,7 +278,7 @@
         <w:rPr>
           <w:rFonts w:ascii="Calibri" w:hAnsi="Calibri" w:cs="Calibri"/>
         </w:rPr>
-        <w:t xml:space="preserve">. AR-23 depends on AR-01 and is not serialized behind visual work. No third child is selected. This tracker owns current status; the roadmap owns dependency order. Retained B01 exact-next, fixed-two-call/mandatory-three-concept, transient-only, and 73-child future-sequence statements are </w:t>
+        <w:t xml:space="preserve">. AR-23 depends on AR-01 and is not serialized behind visual work. AR-02E is the selected successor after AR-02D acceptance; AR-02F remains contingent on AR-02E acceptance. This tracker owns current status; the roadmap owns dependency order. Retained B01 exact-next, fixed-two-call/mandatory-three-concept, transient-only, and 73-child future-sequence statements are </w:t>
       </w:r>
       <w:r>
         <w:rPr>
@@ -801,7 +815,7 @@
               <w:rPr>
                 <w:rFonts w:ascii="Calibri" w:hAnsi="Calibri" w:cs="Calibri"/>
               </w:rPr>
-              <w:t>Status effective on AR-02C acceptance/merge</w:t>
+              <w:t>Status effective on AR-02D acceptance/merge</w:t>
             </w:r>
           </w:p>
         </w:tc>
@@ -1194,6 +1208,117 @@
               <w:t xml:space="preserve">, </w:t>
             </w:r>
             <w:hyperlink r:id="rIdHyperlink10" w:history="1">
+              <w:r>
+                <w:rPr>
+                  <w:rFonts w:ascii="Calibri" w:hAnsi="Calibri" w:cs="Calibri"/>
+                  <w:color w:val="2E74B5"/>
+                  <w:u w:val="single"/>
+                </w:rPr>
+                <w:t>report</w:t>
+              </w:r>
+            </w:hyperlink>
+          </w:p>
+        </w:tc>
+        <w:tc>
+          <w:tcPr>
+            <w:tcW w:w="8460" w:type="dxa"/>
+            <w:vAlign w:val="center"/>
+          </w:tcPr>
+          <w:p>
+            <w:pPr>
+              <w:pStyle w:val="TableText"/>
+              <w:widowControl/>
+            </w:pPr>
+            <w:r>
+              <w:rPr>
+                <w:rFonts w:ascii="Calibri" w:hAnsi="Calibri" w:cs="Calibri"/>
+                <w:b/>
+                <w:bCs/>
+              </w:rPr>
+              <w:t>Baseline / closed</w:t>
+            </w:r>
+            <w:r>
+              <w:rPr>
+                <w:rFonts w:ascii="Calibri" w:hAnsi="Calibri" w:cs="Calibri"/>
+              </w:rPr>
+              <w:t xml:space="preserve"> upon acceptance/merge</w:t>
+            </w:r>
+          </w:p>
+        </w:tc>
+      </w:tr>
+      <w:tr>
+        <w:trPr>
+          <w:cantSplit/>
+        </w:trPr>
+        <w:tc>
+          <w:tcPr>
+            <w:tcW w:w="1000" w:type="dxa"/>
+            <w:vAlign w:val="center"/>
+          </w:tcPr>
+          <w:p>
+            <w:pPr>
+              <w:pStyle w:val="TableText"/>
+              <w:widowControl/>
+            </w:pPr>
+            <w:r>
+              <w:rPr>
+                <w:rFonts w:ascii="Calibri" w:hAnsi="Calibri" w:cs="Calibri"/>
+              </w:rPr>
+              <w:t>AR-02D</w:t>
+            </w:r>
+          </w:p>
+        </w:tc>
+        <w:tc>
+          <w:tcPr>
+            <w:tcW w:w="1500" w:type="dxa"/>
+            <w:vAlign w:val="center"/>
+          </w:tcPr>
+          <w:p>
+            <w:pPr>
+              <w:pStyle w:val="TableText"/>
+              <w:widowControl/>
+            </w:pPr>
+            <w:r>
+              <w:rPr>
+                <w:rFonts w:ascii="Calibri" w:hAnsi="Calibri" w:cs="Calibri"/>
+              </w:rPr>
+              <w:t>AR-02</w:t>
+            </w:r>
+          </w:p>
+        </w:tc>
+        <w:tc>
+          <w:tcPr>
+            <w:tcW w:w="2000" w:type="dxa"/>
+            <w:vAlign w:val="center"/>
+          </w:tcPr>
+          <w:p>
+            <w:pPr>
+              <w:pStyle w:val="TableText"/>
+              <w:widowControl/>
+            </w:pPr>
+            <w:r>
+              <w:rPr>
+                <w:rFonts w:ascii="Calibri" w:hAnsi="Calibri" w:cs="Calibri"/>
+              </w:rPr>
+              <w:t xml:space="preserve">Extract homepage and hero renderer-free metadata; </w:t>
+            </w:r>
+            <w:hyperlink r:id="rIdHyperlink11" w:history="1">
+              <w:r>
+                <w:rPr>
+                  <w:rFonts w:ascii="Calibri" w:hAnsi="Calibri" w:cs="Calibri"/>
+                  <w:color w:val="2E74B5"/>
+                  <w:u w:val="single"/>
+                </w:rPr>
+                <w:t>contract</w:t>
+              </w:r>
+            </w:hyperlink>
+            <w:r>
+              <w:rPr>
+                <w:rFonts w:ascii="Calibri" w:hAnsi="Calibri" w:cs="Calibri"/>
+              </w:rPr>
+              <w:t xml:space="preserve">, </w:t>
+            </w:r>
+            <w:hyperlink r:id="rIdHyperlink12" w:history="1">
               <w:r>
                 <w:rPr>
                   <w:rFonts w:ascii="Calibri" w:hAnsi="Calibri" w:cs="Calibri"/>
@@ -21163,7 +21288,7 @@
         </w:rPr>
         <w:t xml:space="preserve">. Completed 7 August 2026; see </w:t>
       </w:r>
-      <w:hyperlink r:id="rIdHyperlink11" w:history="1">
+      <w:hyperlink r:id="rIdHyperlink13" w:history="1">
         <w:r>
           <w:rPr>
             <w:rFonts w:ascii="Calibri" w:hAnsi="Calibri" w:cs="Calibri"/>
@@ -21300,7 +21425,7 @@
         </w:rPr>
         <w:t xml:space="preserve">The binding details and minimum coverage are in </w:t>
       </w:r>
-      <w:hyperlink r:id="rIdHyperlink12" w:history="1">
+      <w:hyperlink r:id="rIdHyperlink14" w:history="1">
         <w:r>
           <w:rPr>
             <w:rFonts w:ascii="Calibri" w:hAnsi="Calibri" w:cs="Calibri"/>
@@ -21498,7 +21623,7 @@
         </w:rPr>
         <w:t xml:space="preserve">. P10B-16P-04 acceptance evidence is retained in </w:t>
       </w:r>
-      <w:hyperlink r:id="rIdHyperlink13" w:history="1">
+      <w:hyperlink r:id="rIdHyperlink15" w:history="1">
         <w:r>
           <w:rPr>
             <w:rFonts w:ascii="Calibri" w:hAnsi="Calibri" w:cs="Calibri"/>
@@ -21747,7 +21872,7 @@
         </w:rPr>
         <w:t xml:space="preserve">. See </w:t>
       </w:r>
-      <w:hyperlink r:id="rIdHyperlink14" w:history="1">
+      <w:hyperlink r:id="rIdHyperlink16" w:history="1">
         <w:r>
           <w:rPr>
             <w:rFonts w:ascii="Calibri" w:hAnsi="Calibri" w:cs="Calibri"/>
@@ -21996,7 +22121,7 @@
         </w:rPr>
         <w:t xml:space="preserve">. See </w:t>
       </w:r>
-      <w:hyperlink r:id="rIdHyperlink15" w:history="1">
+      <w:hyperlink r:id="rIdHyperlink17" w:history="1">
         <w:r>
           <w:rPr>
             <w:rFonts w:ascii="Calibri" w:hAnsi="Calibri" w:cs="Calibri"/>
@@ -22245,7 +22370,7 @@
         </w:rPr>
         <w:t xml:space="preserve">. At P10B-03 delivery, all then-current 25 V2 definitions and 91 variants were classified explicitly without false commercial-ready promotion. Later family tasks extend that same authority rather than replacing it. See </w:t>
       </w:r>
-      <w:hyperlink r:id="rIdHyperlink16" w:history="1">
+      <w:hyperlink r:id="rIdHyperlink18" w:history="1">
         <w:r>
           <w:rPr>
             <w:rFonts w:ascii="Calibri" w:hAnsi="Calibri" w:cs="Calibri"/>
@@ -22494,7 +22619,7 @@
         </w:rPr>
         <w:t xml:space="preserve"> embeds exact lineage and bounded treatment in the existing approved presentation, consumes Design DNA and registered anatomy, projects protected same-product media, preserves authority through lifecycle/compiler boundaries, and renders semantic four-breakpoint evidence. Production CDN transforms and retained commercial visual acceptance remain deferred. See </w:t>
       </w:r>
-      <w:hyperlink r:id="rIdHyperlink17" w:history="1">
+      <w:hyperlink r:id="rIdHyperlink19" w:history="1">
         <w:r>
           <w:rPr>
             <w:rFonts w:ascii="Calibri" w:hAnsi="Calibri" w:cs="Calibri"/>
@@ -22743,7 +22868,7 @@
         </w:rPr>
         <w:t xml:space="preserve">. See </w:t>
       </w:r>
-      <w:hyperlink r:id="rIdHyperlink18" w:history="1">
+      <w:hyperlink r:id="rIdHyperlink20" w:history="1">
         <w:r>
           <w:rPr>
             <w:rFonts w:ascii="Calibri" w:hAnsi="Calibri" w:cs="Calibri"/>
@@ -22978,7 +23103,7 @@
         </w:rPr>
         <w:t xml:space="preserve">. Four exact root-frame profiles, three mobile modes, and four footer compositions preserve canonical navigation and frame identity through snapshot, save/reload, Puck root, preview, publication compilation, EN/FI, and 375/768/1024/1440 px evidence. See </w:t>
       </w:r>
-      <w:hyperlink r:id="rIdHyperlink19" w:history="1">
+      <w:hyperlink r:id="rIdHyperlink21" w:history="1">
         <w:r>
           <w:rPr>
             <w:rFonts w:ascii="Calibri" w:hAnsi="Calibri" w:cs="Calibri"/>
@@ -23213,7 +23338,7 @@
         </w:rPr>
         <w:t xml:space="preserve">. Six meaningful hero anatomies, five editorial/story anatomies, five campaign/promotion anatomies and three evidence-grounded proof/service anatomies are registered, PageBlueprint-selectable, deterministically generated, snapshot/publish preserved and rendered through one shared implementation. Focused deterministic coverage and a zero-provider Chromium scenario retain evidence at 375, 768, 1024 and 1440 px. See </w:t>
       </w:r>
-      <w:hyperlink r:id="rIdHyperlink20" w:history="1">
+      <w:hyperlink r:id="rIdHyperlink22" w:history="1">
         <w:r>
           <w:rPr>
             <w:rFonts w:ascii="Calibri" w:hAnsi="Calibri" w:cs="Calibri"/>
@@ -23262,7 +23387,7 @@
         </w:rPr>
         <w:t xml:space="preserve"> Baseline. One fingerprinted authority and renderer now serve homepage merchandising, collection/results, related products, and legacy compatibility. Five meaningful anatomies preserve canonical facts and P10B-04 media lineage through plan, proposal, snapshot, save/reload, publish, and responsive browser evidence. See </w:t>
       </w:r>
-      <w:hyperlink r:id="rIdHyperlink21" w:history="1">
+      <w:hyperlink r:id="rIdHyperlink23" w:history="1">
         <w:r>
           <w:rPr>
             <w:rFonts w:ascii="Calibri" w:hAnsi="Calibri" w:cs="Calibri"/>
@@ -23479,7 +23604,7 @@
         </w:rPr>
         <w:t xml:space="preserve"> Baseline. Six versioned, structurally fingerprinted homepage PageBlueprint profiles compose current shared-frame, commercial storytelling, canonical product-card, approved-media, and Design DNA authority. Evidence/cardinality guards fail closed; deterministic lifecycle and 24 retained four-width browser images pass. See </w:t>
       </w:r>
-      <w:hyperlink r:id="rIdHyperlink22" w:history="1">
+      <w:hyperlink r:id="rIdHyperlink24" w:history="1">
         <w:r>
           <w:rPr>
             <w:rFonts w:ascii="Calibri" w:hAnsi="Calibri" w:cs="Calibri"/>
@@ -23710,7 +23835,7 @@
         </w:rPr>
         <w:t xml:space="preserve"> anatomy, P10B-08 canonical card anatomy, and P10B-04 approved media treatment. Exact canonical catalogue bindings preserve product membership/order, facts, product media, filters/sort state, and child-collection order. Campaign media is approved collection/editorial media, not a product-media replacement. A transient revision-checked zero-result context keeps the query without fabricating products. Deterministic lifecycle and 16-view Chromium evidence pass with zero provider calls. See </w:t>
       </w:r>
-      <w:hyperlink r:id="rIdHyperlink23" w:history="1">
+      <w:hyperlink r:id="rIdHyperlink25" w:history="1">
         <w:r>
           <w:rPr>
             <w:rFonts w:ascii="Calibri" w:hAnsi="Calibri" w:cs="Calibri"/>
@@ -24240,7 +24365,7 @@
         </w:rPr>
         <w:t xml:space="preserve">. Fifteen structurally distinct registered profiles resolve exact current approved brief evidence into strict localized fact documents. P10B-05 preserves page-set, route, locale, and transitive navigation authority; P10B-06 frames and P10B-07 editorial/campaign renderers are reused. Snapshot save/reload and deterministic publication preserve the exact document. See </w:t>
       </w:r>
-      <w:hyperlink r:id="rIdHyperlink24" w:history="1">
+      <w:hyperlink r:id="rIdHyperlink26" w:history="1">
         <w:r>
           <w:rPr>
             <w:rFonts w:ascii="Calibri" w:hAnsi="Calibri" w:cs="Calibri"/>
@@ -24451,7 +24576,7 @@
         </w:rPr>
         <w:t xml:space="preserve"> component through the P10B-05 family page; registered loading state renders on its pending route instead of replacing the 404 singleton. Read-only runtime state supplies canonical cart facts, checkout continuation, P10B-10 query/filter context, and bounded recovery actions while the snapshot preserves presentation only. Shared-frame/Design DNA, save/reload, publication, four- width browser evidence, and no-provider behavior are covered under </w:t>
       </w:r>
-      <w:hyperlink r:id="rIdHyperlink25" w:history="1">
+      <w:hyperlink r:id="rIdHyperlink27" w:history="1">
         <w:r>
           <w:rPr>
             <w:rFonts w:ascii="Calibri" w:hAnsi="Calibri" w:cs="Calibri"/>
@@ -24662,7 +24787,7 @@
         </w:rPr>
         <w:t xml:space="preserve"> frame span all pages; simple/configurable PDP, factual content, utility states, 15 four-width/representative screenshots and the passing 160-scenario human record are retained in </w:t>
       </w:r>
-      <w:hyperlink r:id="rIdHyperlink26" w:history="1">
+      <w:hyperlink r:id="rIdHyperlink28" w:history="1">
         <w:r>
           <w:rPr>
             <w:rFonts w:ascii="Calibri" w:hAnsi="Calibri" w:cs="Calibri"/>
@@ -24873,7 +24998,7 @@
         </w:rPr>
         <w:t xml:space="preserve"> One versioned deterministic synthesis contract binds exact merchant, evidence, commerce, asset, Design DNA, site-map, frame, PageBlueprint/profile, component/anatomy, narrative, density, art-direction, responsive, planner, registry and recipe authority. The same approved fixture produces editorial-heavy, commerce/discovery-heavy and restrained/minimal complete 17-route stores through the existing whole-storefront proposal, snapshot, save/reload, renderer and immutable publication chain. Details are retained in </w:t>
       </w:r>
-      <w:hyperlink r:id="rIdHyperlink27" w:history="1">
+      <w:hyperlink r:id="rIdHyperlink29" w:history="1">
         <w:r>
           <w:rPr>
             <w:rFonts w:ascii="Calibri" w:hAnsi="Calibri" w:cs="Calibri"/>
@@ -25118,7 +25243,7 @@
         </w:rPr>
         <w:t xml:space="preserve"> 31 focused unit/integration cases; nine representative complete outcomes; exact save/reload and compiled publication; protected commerce/evidence/media parity; dedicated 375/768/1024/1440 browser coverage; three retained human commercial reviews and one exact evidence manifest. See </w:t>
       </w:r>
-      <w:hyperlink r:id="rIdHyperlink28" w:history="1">
+      <w:hyperlink r:id="rIdHyperlink30" w:history="1">
         <w:r>
           <w:rPr>
             <w:rFonts w:ascii="Calibri" w:hAnsi="Calibri" w:cs="Calibri"/>
@@ -25295,7 +25420,7 @@
         </w:rPr>
         <w:t xml:space="preserve"> A compact route inventory, four collection/search archetypes, four maintained PDP profiles plus generic fallback, exact collection and product-type mappings, bounded matching rules, transient editor/runtime projection, deterministic legacy convergence, and complete snapshot/lifecycle/publication preservation. Exact primary and related-product bindings survive convergence. A server-owned, storefront-scoped proposal transition binds legacy and reviewed canonical projections for deterministic acceptance replay. Storefront Studio lists archetypes rather than one page per commerce URL; representative context is not persisted. See </w:t>
       </w:r>
-      <w:hyperlink r:id="rIdHyperlink29" w:history="1">
+      <w:hyperlink r:id="rIdHyperlink31" w:history="1">
         <w:r>
           <w:rPr>
             <w:rFonts w:ascii="Calibri" w:hAnsi="Calibri" w:cs="Calibri"/>
@@ -25763,7 +25888,7 @@
         </w:rPr>
         <w:t xml:space="preserve"> </w:t>
       </w:r>
-      <w:hyperlink r:id="rIdHyperlink30" w:history="1">
+      <w:hyperlink r:id="rIdHyperlink32" w:history="1">
         <w:r>
           <w:rPr>
             <w:rFonts w:ascii="Calibri" w:hAnsi="Calibri" w:cs="Calibri"/>
@@ -26224,7 +26349,7 @@
         </w:rPr>
         <w:t xml:space="preserve">. Completed 15 August 2026; see </w:t>
       </w:r>
-      <w:hyperlink r:id="rIdHyperlink13" w:history="1">
+      <w:hyperlink r:id="rIdHyperlink15" w:history="1">
         <w:r>
           <w:rPr>
             <w:rFonts w:ascii="Calibri" w:hAnsi="Calibri" w:cs="Calibri"/>
@@ -27486,7 +27611,7 @@
         </w:rPr>
         <w:t xml:space="preserve">. Accepted by the product owner on 16 August 2026 under </w:t>
       </w:r>
-      <w:hyperlink r:id="rIdHyperlink31" w:history="1">
+      <w:hyperlink r:id="rIdHyperlink33" w:history="1">
         <w:r>
           <w:rPr>
             <w:rFonts w:ascii="Calibri" w:hAnsi="Calibri" w:cs="Calibri"/>
@@ -27844,7 +27969,7 @@
         </w:rPr>
         <w:t xml:space="preserve">. Accepted by the product owner on 17 August 2026 under </w:t>
       </w:r>
-      <w:hyperlink r:id="rIdHyperlink31" w:history="1">
+      <w:hyperlink r:id="rIdHyperlink33" w:history="1">
         <w:r>
           <w:rPr>
             <w:rFonts w:ascii="Calibri" w:hAnsi="Calibri" w:cs="Calibri"/>
@@ -30984,7 +31109,7 @@
         </w:rPr>
         <w:t xml:space="preserve"> </w:t>
       </w:r>
-      <w:hyperlink r:id="rIdHyperlink32" w:history="1">
+      <w:hyperlink r:id="rIdHyperlink34" w:history="1">
         <w:r>
           <w:rPr>
             <w:rFonts w:ascii="Calibri" w:hAnsi="Calibri" w:cs="Calibri"/>
@@ -31000,7 +31125,7 @@
         </w:rPr>
         <w:t xml:space="preserve"> and </w:t>
       </w:r>
-      <w:hyperlink r:id="rIdHyperlink33" w:history="1">
+      <w:hyperlink r:id="rIdHyperlink35" w:history="1">
         <w:r>
           <w:rPr>
             <w:rFonts w:ascii="Calibri" w:hAnsi="Calibri" w:cs="Calibri"/>

</xml_diff>

<commit_message>
refactor(ar-02e): extract renderer-free commerce metadata
</commit_message>
<xml_diff>
--- a/docs/VESKIFY_DEVELOPMENT_DELIVERY_TRACKER_v1.3.0.docx
+++ b/docs/VESKIFY_DEVELOPMENT_DELIVERY_TRACKER_v1.3.0.docx
@@ -51,7 +51,7 @@
         <w:rPr>
           <w:rFonts w:ascii="Calibri" w:hAnsi="Calibri" w:cs="Calibri"/>
         </w:rPr>
-        <w:t>Effective upon explicit AR-02D acceptance/merge: AR-02A, AR-02B, AR-02C, AR-02D, and AR-03A Baseline / closed; AR-02 and AR-03 Partial; AR-23 eligible / unstarted; AR-02E selected after AR-02D acceptance</w:t>
+        <w:t>Effective upon explicit AR-02E acceptance/merge: AR-02A, AR-02B, AR-02C, AR-02D, AR-02E, and AR-03A Baseline / closed; AR-02 and AR-03 Partial; AR-23 eligible / unstarted; AR-02F selected after AR-02E acceptance</w:t>
       </w:r>
     </w:p>
     <w:p>
@@ -118,7 +118,7 @@
           <w:b/>
           <w:bCs/>
         </w:rPr>
-        <w:t>Candidate status effective upon explicit owner acceptance/merge of AR-02D:</w:t>
+        <w:t>Candidate status effective upon explicit owner acceptance/merge of AR-02E:</w:t>
       </w:r>
       <w:r>
         <w:rPr>
@@ -216,6 +216,20 @@
           <w:b/>
           <w:bCs/>
         </w:rPr>
+        <w:t>Baseline / closed.</w:t>
+      </w:r>
+      <w:r>
+        <w:rPr>
+          <w:rFonts w:ascii="Calibri" w:hAnsi="Calibri" w:cs="Calibri"/>
+        </w:rPr>
+        <w:t xml:space="preserve"> AR-02E is </w:t>
+      </w:r>
+      <w:r>
+        <w:rPr>
+          <w:rFonts w:ascii="Calibri" w:hAnsi="Calibri" w:cs="Calibri"/>
+          <w:b/>
+          <w:bCs/>
+        </w:rPr>
         <w:t>Baseline / closed upon explicit owner acceptance/merge.</w:t>
       </w:r>
       <w:r>
@@ -278,7 +292,7 @@
         <w:rPr>
           <w:rFonts w:ascii="Calibri" w:hAnsi="Calibri" w:cs="Calibri"/>
         </w:rPr>
-        <w:t xml:space="preserve">. AR-23 depends on AR-01 and is not serialized behind visual work. AR-02E is the selected successor after AR-02D acceptance; AR-02F remains contingent on AR-02E acceptance. This tracker owns current status; the roadmap owns dependency order. Retained B01 exact-next, fixed-two-call/mandatory-three-concept, transient-only, and 73-child future-sequence statements are </w:t>
+        <w:t xml:space="preserve">. AR-23 depends on AR-01 and is not serialized behind visual work. AR-02F is the selected successor after AR-02E acceptance. This tracker owns current status; the roadmap owns dependency order. Retained B01 exact-next, fixed-two-call/mandatory-three-concept, transient-only, and 73-child future-sequence statements are </w:t>
       </w:r>
       <w:r>
         <w:rPr>
@@ -815,7 +829,7 @@
               <w:rPr>
                 <w:rFonts w:ascii="Calibri" w:hAnsi="Calibri" w:cs="Calibri"/>
               </w:rPr>
-              <w:t>Status effective on AR-02D acceptance/merge</w:t>
+              <w:t>Status effective on AR-02E acceptance/merge</w:t>
             </w:r>
           </w:p>
         </w:tc>
@@ -1237,12 +1251,6 @@
               </w:rPr>
               <w:t>Baseline / closed</w:t>
             </w:r>
-            <w:r>
-              <w:rPr>
-                <w:rFonts w:ascii="Calibri" w:hAnsi="Calibri" w:cs="Calibri"/>
-              </w:rPr>
-              <w:t xml:space="preserve"> upon acceptance/merge</w:t>
-            </w:r>
           </w:p>
         </w:tc>
       </w:tr>
@@ -1319,6 +1327,111 @@
               <w:t xml:space="preserve">, </w:t>
             </w:r>
             <w:hyperlink r:id="rIdHyperlink12" w:history="1">
+              <w:r>
+                <w:rPr>
+                  <w:rFonts w:ascii="Calibri" w:hAnsi="Calibri" w:cs="Calibri"/>
+                  <w:color w:val="2E74B5"/>
+                  <w:u w:val="single"/>
+                </w:rPr>
+                <w:t>report</w:t>
+              </w:r>
+            </w:hyperlink>
+          </w:p>
+        </w:tc>
+        <w:tc>
+          <w:tcPr>
+            <w:tcW w:w="8460" w:type="dxa"/>
+            <w:vAlign w:val="center"/>
+          </w:tcPr>
+          <w:p>
+            <w:pPr>
+              <w:pStyle w:val="TableText"/>
+              <w:widowControl/>
+            </w:pPr>
+            <w:r>
+              <w:rPr>
+                <w:rFonts w:ascii="Calibri" w:hAnsi="Calibri" w:cs="Calibri"/>
+                <w:b/>
+                <w:bCs/>
+              </w:rPr>
+              <w:t>Baseline / closed</w:t>
+            </w:r>
+          </w:p>
+        </w:tc>
+      </w:tr>
+      <w:tr>
+        <w:trPr>
+          <w:cantSplit/>
+        </w:trPr>
+        <w:tc>
+          <w:tcPr>
+            <w:tcW w:w="1000" w:type="dxa"/>
+            <w:vAlign w:val="center"/>
+          </w:tcPr>
+          <w:p>
+            <w:pPr>
+              <w:pStyle w:val="TableText"/>
+              <w:widowControl/>
+            </w:pPr>
+            <w:r>
+              <w:rPr>
+                <w:rFonts w:ascii="Calibri" w:hAnsi="Calibri" w:cs="Calibri"/>
+              </w:rPr>
+              <w:t>AR-02E</w:t>
+            </w:r>
+          </w:p>
+        </w:tc>
+        <w:tc>
+          <w:tcPr>
+            <w:tcW w:w="1500" w:type="dxa"/>
+            <w:vAlign w:val="center"/>
+          </w:tcPr>
+          <w:p>
+            <w:pPr>
+              <w:pStyle w:val="TableText"/>
+              <w:widowControl/>
+            </w:pPr>
+            <w:r>
+              <w:rPr>
+                <w:rFonts w:ascii="Calibri" w:hAnsi="Calibri" w:cs="Calibri"/>
+              </w:rPr>
+              <w:t>AR-02</w:t>
+            </w:r>
+          </w:p>
+        </w:tc>
+        <w:tc>
+          <w:tcPr>
+            <w:tcW w:w="2000" w:type="dxa"/>
+            <w:vAlign w:val="center"/>
+          </w:tcPr>
+          <w:p>
+            <w:pPr>
+              <w:pStyle w:val="TableText"/>
+              <w:widowControl/>
+            </w:pPr>
+            <w:r>
+              <w:rPr>
+                <w:rFonts w:ascii="Calibri" w:hAnsi="Calibri" w:cs="Calibri"/>
+              </w:rPr>
+              <w:t xml:space="preserve">Extract collection and product renderer-free metadata; </w:t>
+            </w:r>
+            <w:hyperlink r:id="rIdHyperlink13" w:history="1">
+              <w:r>
+                <w:rPr>
+                  <w:rFonts w:ascii="Calibri" w:hAnsi="Calibri" w:cs="Calibri"/>
+                  <w:color w:val="2E74B5"/>
+                  <w:u w:val="single"/>
+                </w:rPr>
+                <w:t>contract</w:t>
+              </w:r>
+            </w:hyperlink>
+            <w:r>
+              <w:rPr>
+                <w:rFonts w:ascii="Calibri" w:hAnsi="Calibri" w:cs="Calibri"/>
+              </w:rPr>
+              <w:t xml:space="preserve">, </w:t>
+            </w:r>
+            <w:hyperlink r:id="rIdHyperlink14" w:history="1">
               <w:r>
                 <w:rPr>
                   <w:rFonts w:ascii="Calibri" w:hAnsi="Calibri" w:cs="Calibri"/>
@@ -21288,7 +21401,7 @@
         </w:rPr>
         <w:t xml:space="preserve">. Completed 7 August 2026; see </w:t>
       </w:r>
-      <w:hyperlink r:id="rIdHyperlink13" w:history="1">
+      <w:hyperlink r:id="rIdHyperlink15" w:history="1">
         <w:r>
           <w:rPr>
             <w:rFonts w:ascii="Calibri" w:hAnsi="Calibri" w:cs="Calibri"/>
@@ -21425,7 +21538,7 @@
         </w:rPr>
         <w:t xml:space="preserve">The binding details and minimum coverage are in </w:t>
       </w:r>
-      <w:hyperlink r:id="rIdHyperlink14" w:history="1">
+      <w:hyperlink r:id="rIdHyperlink16" w:history="1">
         <w:r>
           <w:rPr>
             <w:rFonts w:ascii="Calibri" w:hAnsi="Calibri" w:cs="Calibri"/>
@@ -21623,7 +21736,7 @@
         </w:rPr>
         <w:t xml:space="preserve">. P10B-16P-04 acceptance evidence is retained in </w:t>
       </w:r>
-      <w:hyperlink r:id="rIdHyperlink15" w:history="1">
+      <w:hyperlink r:id="rIdHyperlink17" w:history="1">
         <w:r>
           <w:rPr>
             <w:rFonts w:ascii="Calibri" w:hAnsi="Calibri" w:cs="Calibri"/>
@@ -21872,7 +21985,7 @@
         </w:rPr>
         <w:t xml:space="preserve">. See </w:t>
       </w:r>
-      <w:hyperlink r:id="rIdHyperlink16" w:history="1">
+      <w:hyperlink r:id="rIdHyperlink18" w:history="1">
         <w:r>
           <w:rPr>
             <w:rFonts w:ascii="Calibri" w:hAnsi="Calibri" w:cs="Calibri"/>
@@ -22121,7 +22234,7 @@
         </w:rPr>
         <w:t xml:space="preserve">. See </w:t>
       </w:r>
-      <w:hyperlink r:id="rIdHyperlink17" w:history="1">
+      <w:hyperlink r:id="rIdHyperlink19" w:history="1">
         <w:r>
           <w:rPr>
             <w:rFonts w:ascii="Calibri" w:hAnsi="Calibri" w:cs="Calibri"/>
@@ -22370,7 +22483,7 @@
         </w:rPr>
         <w:t xml:space="preserve">. At P10B-03 delivery, all then-current 25 V2 definitions and 91 variants were classified explicitly without false commercial-ready promotion. Later family tasks extend that same authority rather than replacing it. See </w:t>
       </w:r>
-      <w:hyperlink r:id="rIdHyperlink18" w:history="1">
+      <w:hyperlink r:id="rIdHyperlink20" w:history="1">
         <w:r>
           <w:rPr>
             <w:rFonts w:ascii="Calibri" w:hAnsi="Calibri" w:cs="Calibri"/>
@@ -22619,7 +22732,7 @@
         </w:rPr>
         <w:t xml:space="preserve"> embeds exact lineage and bounded treatment in the existing approved presentation, consumes Design DNA and registered anatomy, projects protected same-product media, preserves authority through lifecycle/compiler boundaries, and renders semantic four-breakpoint evidence. Production CDN transforms and retained commercial visual acceptance remain deferred. See </w:t>
       </w:r>
-      <w:hyperlink r:id="rIdHyperlink19" w:history="1">
+      <w:hyperlink r:id="rIdHyperlink21" w:history="1">
         <w:r>
           <w:rPr>
             <w:rFonts w:ascii="Calibri" w:hAnsi="Calibri" w:cs="Calibri"/>
@@ -22868,7 +22981,7 @@
         </w:rPr>
         <w:t xml:space="preserve">. See </w:t>
       </w:r>
-      <w:hyperlink r:id="rIdHyperlink20" w:history="1">
+      <w:hyperlink r:id="rIdHyperlink22" w:history="1">
         <w:r>
           <w:rPr>
             <w:rFonts w:ascii="Calibri" w:hAnsi="Calibri" w:cs="Calibri"/>
@@ -23103,7 +23216,7 @@
         </w:rPr>
         <w:t xml:space="preserve">. Four exact root-frame profiles, three mobile modes, and four footer compositions preserve canonical navigation and frame identity through snapshot, save/reload, Puck root, preview, publication compilation, EN/FI, and 375/768/1024/1440 px evidence. See </w:t>
       </w:r>
-      <w:hyperlink r:id="rIdHyperlink21" w:history="1">
+      <w:hyperlink r:id="rIdHyperlink23" w:history="1">
         <w:r>
           <w:rPr>
             <w:rFonts w:ascii="Calibri" w:hAnsi="Calibri" w:cs="Calibri"/>
@@ -23338,7 +23451,7 @@
         </w:rPr>
         <w:t xml:space="preserve">. Six meaningful hero anatomies, five editorial/story anatomies, five campaign/promotion anatomies and three evidence-grounded proof/service anatomies are registered, PageBlueprint-selectable, deterministically generated, snapshot/publish preserved and rendered through one shared implementation. Focused deterministic coverage and a zero-provider Chromium scenario retain evidence at 375, 768, 1024 and 1440 px. See </w:t>
       </w:r>
-      <w:hyperlink r:id="rIdHyperlink22" w:history="1">
+      <w:hyperlink r:id="rIdHyperlink24" w:history="1">
         <w:r>
           <w:rPr>
             <w:rFonts w:ascii="Calibri" w:hAnsi="Calibri" w:cs="Calibri"/>
@@ -23387,7 +23500,7 @@
         </w:rPr>
         <w:t xml:space="preserve"> Baseline. One fingerprinted authority and renderer now serve homepage merchandising, collection/results, related products, and legacy compatibility. Five meaningful anatomies preserve canonical facts and P10B-04 media lineage through plan, proposal, snapshot, save/reload, publish, and responsive browser evidence. See </w:t>
       </w:r>
-      <w:hyperlink r:id="rIdHyperlink23" w:history="1">
+      <w:hyperlink r:id="rIdHyperlink25" w:history="1">
         <w:r>
           <w:rPr>
             <w:rFonts w:ascii="Calibri" w:hAnsi="Calibri" w:cs="Calibri"/>
@@ -23604,7 +23717,7 @@
         </w:rPr>
         <w:t xml:space="preserve"> Baseline. Six versioned, structurally fingerprinted homepage PageBlueprint profiles compose current shared-frame, commercial storytelling, canonical product-card, approved-media, and Design DNA authority. Evidence/cardinality guards fail closed; deterministic lifecycle and 24 retained four-width browser images pass. See </w:t>
       </w:r>
-      <w:hyperlink r:id="rIdHyperlink24" w:history="1">
+      <w:hyperlink r:id="rIdHyperlink26" w:history="1">
         <w:r>
           <w:rPr>
             <w:rFonts w:ascii="Calibri" w:hAnsi="Calibri" w:cs="Calibri"/>
@@ -23835,7 +23948,7 @@
         </w:rPr>
         <w:t xml:space="preserve"> anatomy, P10B-08 canonical card anatomy, and P10B-04 approved media treatment. Exact canonical catalogue bindings preserve product membership/order, facts, product media, filters/sort state, and child-collection order. Campaign media is approved collection/editorial media, not a product-media replacement. A transient revision-checked zero-result context keeps the query without fabricating products. Deterministic lifecycle and 16-view Chromium evidence pass with zero provider calls. See </w:t>
       </w:r>
-      <w:hyperlink r:id="rIdHyperlink25" w:history="1">
+      <w:hyperlink r:id="rIdHyperlink27" w:history="1">
         <w:r>
           <w:rPr>
             <w:rFonts w:ascii="Calibri" w:hAnsi="Calibri" w:cs="Calibri"/>
@@ -24365,7 +24478,7 @@
         </w:rPr>
         <w:t xml:space="preserve">. Fifteen structurally distinct registered profiles resolve exact current approved brief evidence into strict localized fact documents. P10B-05 preserves page-set, route, locale, and transitive navigation authority; P10B-06 frames and P10B-07 editorial/campaign renderers are reused. Snapshot save/reload and deterministic publication preserve the exact document. See </w:t>
       </w:r>
-      <w:hyperlink r:id="rIdHyperlink26" w:history="1">
+      <w:hyperlink r:id="rIdHyperlink28" w:history="1">
         <w:r>
           <w:rPr>
             <w:rFonts w:ascii="Calibri" w:hAnsi="Calibri" w:cs="Calibri"/>
@@ -24576,7 +24689,7 @@
         </w:rPr>
         <w:t xml:space="preserve"> component through the P10B-05 family page; registered loading state renders on its pending route instead of replacing the 404 singleton. Read-only runtime state supplies canonical cart facts, checkout continuation, P10B-10 query/filter context, and bounded recovery actions while the snapshot preserves presentation only. Shared-frame/Design DNA, save/reload, publication, four- width browser evidence, and no-provider behavior are covered under </w:t>
       </w:r>
-      <w:hyperlink r:id="rIdHyperlink27" w:history="1">
+      <w:hyperlink r:id="rIdHyperlink29" w:history="1">
         <w:r>
           <w:rPr>
             <w:rFonts w:ascii="Calibri" w:hAnsi="Calibri" w:cs="Calibri"/>
@@ -24787,7 +24900,7 @@
         </w:rPr>
         <w:t xml:space="preserve"> frame span all pages; simple/configurable PDP, factual content, utility states, 15 four-width/representative screenshots and the passing 160-scenario human record are retained in </w:t>
       </w:r>
-      <w:hyperlink r:id="rIdHyperlink28" w:history="1">
+      <w:hyperlink r:id="rIdHyperlink30" w:history="1">
         <w:r>
           <w:rPr>
             <w:rFonts w:ascii="Calibri" w:hAnsi="Calibri" w:cs="Calibri"/>
@@ -24998,7 +25111,7 @@
         </w:rPr>
         <w:t xml:space="preserve"> One versioned deterministic synthesis contract binds exact merchant, evidence, commerce, asset, Design DNA, site-map, frame, PageBlueprint/profile, component/anatomy, narrative, density, art-direction, responsive, planner, registry and recipe authority. The same approved fixture produces editorial-heavy, commerce/discovery-heavy and restrained/minimal complete 17-route stores through the existing whole-storefront proposal, snapshot, save/reload, renderer and immutable publication chain. Details are retained in </w:t>
       </w:r>
-      <w:hyperlink r:id="rIdHyperlink29" w:history="1">
+      <w:hyperlink r:id="rIdHyperlink31" w:history="1">
         <w:r>
           <w:rPr>
             <w:rFonts w:ascii="Calibri" w:hAnsi="Calibri" w:cs="Calibri"/>
@@ -25243,7 +25356,7 @@
         </w:rPr>
         <w:t xml:space="preserve"> 31 focused unit/integration cases; nine representative complete outcomes; exact save/reload and compiled publication; protected commerce/evidence/media parity; dedicated 375/768/1024/1440 browser coverage; three retained human commercial reviews and one exact evidence manifest. See </w:t>
       </w:r>
-      <w:hyperlink r:id="rIdHyperlink30" w:history="1">
+      <w:hyperlink r:id="rIdHyperlink32" w:history="1">
         <w:r>
           <w:rPr>
             <w:rFonts w:ascii="Calibri" w:hAnsi="Calibri" w:cs="Calibri"/>
@@ -25420,7 +25533,7 @@
         </w:rPr>
         <w:t xml:space="preserve"> A compact route inventory, four collection/search archetypes, four maintained PDP profiles plus generic fallback, exact collection and product-type mappings, bounded matching rules, transient editor/runtime projection, deterministic legacy convergence, and complete snapshot/lifecycle/publication preservation. Exact primary and related-product bindings survive convergence. A server-owned, storefront-scoped proposal transition binds legacy and reviewed canonical projections for deterministic acceptance replay. Storefront Studio lists archetypes rather than one page per commerce URL; representative context is not persisted. See </w:t>
       </w:r>
-      <w:hyperlink r:id="rIdHyperlink31" w:history="1">
+      <w:hyperlink r:id="rIdHyperlink33" w:history="1">
         <w:r>
           <w:rPr>
             <w:rFonts w:ascii="Calibri" w:hAnsi="Calibri" w:cs="Calibri"/>
@@ -25888,7 +26001,7 @@
         </w:rPr>
         <w:t xml:space="preserve"> </w:t>
       </w:r>
-      <w:hyperlink r:id="rIdHyperlink32" w:history="1">
+      <w:hyperlink r:id="rIdHyperlink34" w:history="1">
         <w:r>
           <w:rPr>
             <w:rFonts w:ascii="Calibri" w:hAnsi="Calibri" w:cs="Calibri"/>
@@ -26349,7 +26462,7 @@
         </w:rPr>
         <w:t xml:space="preserve">. Completed 15 August 2026; see </w:t>
       </w:r>
-      <w:hyperlink r:id="rIdHyperlink15" w:history="1">
+      <w:hyperlink r:id="rIdHyperlink17" w:history="1">
         <w:r>
           <w:rPr>
             <w:rFonts w:ascii="Calibri" w:hAnsi="Calibri" w:cs="Calibri"/>
@@ -27611,7 +27724,7 @@
         </w:rPr>
         <w:t xml:space="preserve">. Accepted by the product owner on 16 August 2026 under </w:t>
       </w:r>
-      <w:hyperlink r:id="rIdHyperlink33" w:history="1">
+      <w:hyperlink r:id="rIdHyperlink35" w:history="1">
         <w:r>
           <w:rPr>
             <w:rFonts w:ascii="Calibri" w:hAnsi="Calibri" w:cs="Calibri"/>
@@ -27969,7 +28082,7 @@
         </w:rPr>
         <w:t xml:space="preserve">. Accepted by the product owner on 17 August 2026 under </w:t>
       </w:r>
-      <w:hyperlink r:id="rIdHyperlink33" w:history="1">
+      <w:hyperlink r:id="rIdHyperlink35" w:history="1">
         <w:r>
           <w:rPr>
             <w:rFonts w:ascii="Calibri" w:hAnsi="Calibri" w:cs="Calibri"/>
@@ -31109,7 +31222,7 @@
         </w:rPr>
         <w:t xml:space="preserve"> </w:t>
       </w:r>
-      <w:hyperlink r:id="rIdHyperlink34" w:history="1">
+      <w:hyperlink r:id="rIdHyperlink36" w:history="1">
         <w:r>
           <w:rPr>
             <w:rFonts w:ascii="Calibri" w:hAnsi="Calibri" w:cs="Calibri"/>
@@ -31125,7 +31238,7 @@
         </w:rPr>
         <w:t xml:space="preserve"> and </w:t>
       </w:r>
-      <w:hyperlink r:id="rIdHyperlink35" w:history="1">
+      <w:hyperlink r:id="rIdHyperlink37" w:history="1">
         <w:r>
           <w:rPr>
             <w:rFonts w:ascii="Calibri" w:hAnsi="Calibri" w:cs="Calibri"/>

</xml_diff>

<commit_message>
AR-02F: adapt V2 definitions from renderer-free metadata
</commit_message>
<xml_diff>
--- a/docs/VESKIFY_DEVELOPMENT_DELIVERY_TRACKER_v1.3.0.docx
+++ b/docs/VESKIFY_DEVELOPMENT_DELIVERY_TRACKER_v1.3.0.docx
@@ -51,7 +51,7 @@
         <w:rPr>
           <w:rFonts w:ascii="Calibri" w:hAnsi="Calibri" w:cs="Calibri"/>
         </w:rPr>
-        <w:t>Effective upon explicit AR-02E acceptance/merge: AR-02A, AR-02B, AR-02C, AR-02D, AR-02E, and AR-03A Baseline / closed; AR-02 and AR-03 Partial; AR-23 eligible / unstarted; AR-02F selected after AR-02E acceptance</w:t>
+        <w:t>Effective upon explicit AR-02F acceptance/merge: AR-02A, AR-02B, AR-02C, AR-02D, AR-02E, AR-02F, and AR-03A Baseline / closed; AR-02 and AR-03 Partial; AR-23 eligible / unstarted; BATCH-03 has no successor child</w:t>
       </w:r>
     </w:p>
     <w:p>
@@ -118,7 +118,7 @@
           <w:b/>
           <w:bCs/>
         </w:rPr>
-        <w:t>Candidate status effective upon explicit owner acceptance/merge of AR-02E:</w:t>
+        <w:t>Candidate status effective upon explicit owner acceptance/merge of AR-02F:</w:t>
       </w:r>
       <w:r>
         <w:rPr>
@@ -230,6 +230,20 @@
           <w:b/>
           <w:bCs/>
         </w:rPr>
+        <w:t>Baseline / closed.</w:t>
+      </w:r>
+      <w:r>
+        <w:rPr>
+          <w:rFonts w:ascii="Calibri" w:hAnsi="Calibri" w:cs="Calibri"/>
+        </w:rPr>
+        <w:t xml:space="preserve"> AR-02F is </w:t>
+      </w:r>
+      <w:r>
+        <w:rPr>
+          <w:rFonts w:ascii="Calibri" w:hAnsi="Calibri" w:cs="Calibri"/>
+          <w:b/>
+          <w:bCs/>
+        </w:rPr>
         <w:t>Baseline / closed upon explicit owner acceptance/merge.</w:t>
       </w:r>
       <w:r>
@@ -250,7 +264,7 @@
         <w:rPr>
           <w:rFonts w:ascii="Calibri" w:hAnsi="Calibri" w:cs="Calibri"/>
         </w:rPr>
-        <w:t xml:space="preserve">; definition/materializer isolation remains. AR-03 is </w:t>
+        <w:t xml:space="preserve">; remaining consumer/materializer isolation remains. AR-03 is </w:t>
       </w:r>
       <w:r>
         <w:rPr>
@@ -292,7 +306,7 @@
         <w:rPr>
           <w:rFonts w:ascii="Calibri" w:hAnsi="Calibri" w:cs="Calibri"/>
         </w:rPr>
-        <w:t xml:space="preserve">. AR-23 depends on AR-01 and is not serialized behind visual work. AR-02F is the selected successor after AR-02E acceptance. This tracker owns current status; the roadmap owns dependency order. Retained B01 exact-next, fixed-two-call/mandatory-three-concept, transient-only, and 73-child future-sequence statements are </w:t>
+        <w:t xml:space="preserve">. AR-23 depends on AR-01 and is not serialized behind visual work. BATCH-03 has no successor child. This tracker owns current status; the roadmap owns dependency order. Retained B01 exact-next, fixed-two-call/mandatory-three-concept, transient-only, and 73-child future-sequence statements are </w:t>
       </w:r>
       <w:r>
         <w:rPr>
@@ -829,7 +843,7 @@
               <w:rPr>
                 <w:rFonts w:ascii="Calibri" w:hAnsi="Calibri" w:cs="Calibri"/>
               </w:rPr>
-              <w:t>Status effective on AR-02E acceptance/merge</w:t>
+              <w:t>Status effective on AR-02F acceptance/merge</w:t>
             </w:r>
           </w:p>
         </w:tc>
@@ -1432,6 +1446,111 @@
               <w:t xml:space="preserve">, </w:t>
             </w:r>
             <w:hyperlink r:id="rIdHyperlink14" w:history="1">
+              <w:r>
+                <w:rPr>
+                  <w:rFonts w:ascii="Calibri" w:hAnsi="Calibri" w:cs="Calibri"/>
+                  <w:color w:val="2E74B5"/>
+                  <w:u w:val="single"/>
+                </w:rPr>
+                <w:t>report</w:t>
+              </w:r>
+            </w:hyperlink>
+          </w:p>
+        </w:tc>
+        <w:tc>
+          <w:tcPr>
+            <w:tcW w:w="8460" w:type="dxa"/>
+            <w:vAlign w:val="center"/>
+          </w:tcPr>
+          <w:p>
+            <w:pPr>
+              <w:pStyle w:val="TableText"/>
+              <w:widowControl/>
+            </w:pPr>
+            <w:r>
+              <w:rPr>
+                <w:rFonts w:ascii="Calibri" w:hAnsi="Calibri" w:cs="Calibri"/>
+                <w:b/>
+                <w:bCs/>
+              </w:rPr>
+              <w:t>Baseline / closed</w:t>
+            </w:r>
+          </w:p>
+        </w:tc>
+      </w:tr>
+      <w:tr>
+        <w:trPr>
+          <w:cantSplit/>
+        </w:trPr>
+        <w:tc>
+          <w:tcPr>
+            <w:tcW w:w="1000" w:type="dxa"/>
+            <w:vAlign w:val="center"/>
+          </w:tcPr>
+          <w:p>
+            <w:pPr>
+              <w:pStyle w:val="TableText"/>
+              <w:widowControl/>
+            </w:pPr>
+            <w:r>
+              <w:rPr>
+                <w:rFonts w:ascii="Calibri" w:hAnsi="Calibri" w:cs="Calibri"/>
+              </w:rPr>
+              <w:t>AR-02F</w:t>
+            </w:r>
+          </w:p>
+        </w:tc>
+        <w:tc>
+          <w:tcPr>
+            <w:tcW w:w="1500" w:type="dxa"/>
+            <w:vAlign w:val="center"/>
+          </w:tcPr>
+          <w:p>
+            <w:pPr>
+              <w:pStyle w:val="TableText"/>
+              <w:widowControl/>
+            </w:pPr>
+            <w:r>
+              <w:rPr>
+                <w:rFonts w:ascii="Calibri" w:hAnsi="Calibri" w:cs="Calibri"/>
+              </w:rPr>
+              <w:t>AR-02</w:t>
+            </w:r>
+          </w:p>
+        </w:tc>
+        <w:tc>
+          <w:tcPr>
+            <w:tcW w:w="2000" w:type="dxa"/>
+            <w:vAlign w:val="center"/>
+          </w:tcPr>
+          <w:p>
+            <w:pPr>
+              <w:pStyle w:val="TableText"/>
+              <w:widowControl/>
+            </w:pPr>
+            <w:r>
+              <w:rPr>
+                <w:rFonts w:ascii="Calibri" w:hAnsi="Calibri" w:cs="Calibri"/>
+              </w:rPr>
+              <w:t xml:space="preserve">Adapt V2 definitions from shared renderer-free metadata; </w:t>
+            </w:r>
+            <w:hyperlink r:id="rIdHyperlink15" w:history="1">
+              <w:r>
+                <w:rPr>
+                  <w:rFonts w:ascii="Calibri" w:hAnsi="Calibri" w:cs="Calibri"/>
+                  <w:color w:val="2E74B5"/>
+                  <w:u w:val="single"/>
+                </w:rPr>
+                <w:t>contract</w:t>
+              </w:r>
+            </w:hyperlink>
+            <w:r>
+              <w:rPr>
+                <w:rFonts w:ascii="Calibri" w:hAnsi="Calibri" w:cs="Calibri"/>
+              </w:rPr>
+              <w:t xml:space="preserve">, </w:t>
+            </w:r>
+            <w:hyperlink r:id="rIdHyperlink16" w:history="1">
               <w:r>
                 <w:rPr>
                   <w:rFonts w:ascii="Calibri" w:hAnsi="Calibri" w:cs="Calibri"/>
@@ -21401,7 +21520,7 @@
         </w:rPr>
         <w:t xml:space="preserve">. Completed 7 August 2026; see </w:t>
       </w:r>
-      <w:hyperlink r:id="rIdHyperlink15" w:history="1">
+      <w:hyperlink r:id="rIdHyperlink17" w:history="1">
         <w:r>
           <w:rPr>
             <w:rFonts w:ascii="Calibri" w:hAnsi="Calibri" w:cs="Calibri"/>
@@ -21538,7 +21657,7 @@
         </w:rPr>
         <w:t xml:space="preserve">The binding details and minimum coverage are in </w:t>
       </w:r>
-      <w:hyperlink r:id="rIdHyperlink16" w:history="1">
+      <w:hyperlink r:id="rIdHyperlink18" w:history="1">
         <w:r>
           <w:rPr>
             <w:rFonts w:ascii="Calibri" w:hAnsi="Calibri" w:cs="Calibri"/>
@@ -21736,7 +21855,7 @@
         </w:rPr>
         <w:t xml:space="preserve">. P10B-16P-04 acceptance evidence is retained in </w:t>
       </w:r>
-      <w:hyperlink r:id="rIdHyperlink17" w:history="1">
+      <w:hyperlink r:id="rIdHyperlink19" w:history="1">
         <w:r>
           <w:rPr>
             <w:rFonts w:ascii="Calibri" w:hAnsi="Calibri" w:cs="Calibri"/>
@@ -21985,7 +22104,7 @@
         </w:rPr>
         <w:t xml:space="preserve">. See </w:t>
       </w:r>
-      <w:hyperlink r:id="rIdHyperlink18" w:history="1">
+      <w:hyperlink r:id="rIdHyperlink20" w:history="1">
         <w:r>
           <w:rPr>
             <w:rFonts w:ascii="Calibri" w:hAnsi="Calibri" w:cs="Calibri"/>
@@ -22234,7 +22353,7 @@
         </w:rPr>
         <w:t xml:space="preserve">. See </w:t>
       </w:r>
-      <w:hyperlink r:id="rIdHyperlink19" w:history="1">
+      <w:hyperlink r:id="rIdHyperlink21" w:history="1">
         <w:r>
           <w:rPr>
             <w:rFonts w:ascii="Calibri" w:hAnsi="Calibri" w:cs="Calibri"/>
@@ -22483,7 +22602,7 @@
         </w:rPr>
         <w:t xml:space="preserve">. At P10B-03 delivery, all then-current 25 V2 definitions and 91 variants were classified explicitly without false commercial-ready promotion. Later family tasks extend that same authority rather than replacing it. See </w:t>
       </w:r>
-      <w:hyperlink r:id="rIdHyperlink20" w:history="1">
+      <w:hyperlink r:id="rIdHyperlink22" w:history="1">
         <w:r>
           <w:rPr>
             <w:rFonts w:ascii="Calibri" w:hAnsi="Calibri" w:cs="Calibri"/>
@@ -22732,7 +22851,7 @@
         </w:rPr>
         <w:t xml:space="preserve"> embeds exact lineage and bounded treatment in the existing approved presentation, consumes Design DNA and registered anatomy, projects protected same-product media, preserves authority through lifecycle/compiler boundaries, and renders semantic four-breakpoint evidence. Production CDN transforms and retained commercial visual acceptance remain deferred. See </w:t>
       </w:r>
-      <w:hyperlink r:id="rIdHyperlink21" w:history="1">
+      <w:hyperlink r:id="rIdHyperlink23" w:history="1">
         <w:r>
           <w:rPr>
             <w:rFonts w:ascii="Calibri" w:hAnsi="Calibri" w:cs="Calibri"/>
@@ -22981,7 +23100,7 @@
         </w:rPr>
         <w:t xml:space="preserve">. See </w:t>
       </w:r>
-      <w:hyperlink r:id="rIdHyperlink22" w:history="1">
+      <w:hyperlink r:id="rIdHyperlink24" w:history="1">
         <w:r>
           <w:rPr>
             <w:rFonts w:ascii="Calibri" w:hAnsi="Calibri" w:cs="Calibri"/>
@@ -23216,7 +23335,7 @@
         </w:rPr>
         <w:t xml:space="preserve">. Four exact root-frame profiles, three mobile modes, and four footer compositions preserve canonical navigation and frame identity through snapshot, save/reload, Puck root, preview, publication compilation, EN/FI, and 375/768/1024/1440 px evidence. See </w:t>
       </w:r>
-      <w:hyperlink r:id="rIdHyperlink23" w:history="1">
+      <w:hyperlink r:id="rIdHyperlink25" w:history="1">
         <w:r>
           <w:rPr>
             <w:rFonts w:ascii="Calibri" w:hAnsi="Calibri" w:cs="Calibri"/>
@@ -23451,7 +23570,7 @@
         </w:rPr>
         <w:t xml:space="preserve">. Six meaningful hero anatomies, five editorial/story anatomies, five campaign/promotion anatomies and three evidence-grounded proof/service anatomies are registered, PageBlueprint-selectable, deterministically generated, snapshot/publish preserved and rendered through one shared implementation. Focused deterministic coverage and a zero-provider Chromium scenario retain evidence at 375, 768, 1024 and 1440 px. See </w:t>
       </w:r>
-      <w:hyperlink r:id="rIdHyperlink24" w:history="1">
+      <w:hyperlink r:id="rIdHyperlink26" w:history="1">
         <w:r>
           <w:rPr>
             <w:rFonts w:ascii="Calibri" w:hAnsi="Calibri" w:cs="Calibri"/>
@@ -23500,7 +23619,7 @@
         </w:rPr>
         <w:t xml:space="preserve"> Baseline. One fingerprinted authority and renderer now serve homepage merchandising, collection/results, related products, and legacy compatibility. Five meaningful anatomies preserve canonical facts and P10B-04 media lineage through plan, proposal, snapshot, save/reload, publish, and responsive browser evidence. See </w:t>
       </w:r>
-      <w:hyperlink r:id="rIdHyperlink25" w:history="1">
+      <w:hyperlink r:id="rIdHyperlink27" w:history="1">
         <w:r>
           <w:rPr>
             <w:rFonts w:ascii="Calibri" w:hAnsi="Calibri" w:cs="Calibri"/>
@@ -23717,7 +23836,7 @@
         </w:rPr>
         <w:t xml:space="preserve"> Baseline. Six versioned, structurally fingerprinted homepage PageBlueprint profiles compose current shared-frame, commercial storytelling, canonical product-card, approved-media, and Design DNA authority. Evidence/cardinality guards fail closed; deterministic lifecycle and 24 retained four-width browser images pass. See </w:t>
       </w:r>
-      <w:hyperlink r:id="rIdHyperlink26" w:history="1">
+      <w:hyperlink r:id="rIdHyperlink28" w:history="1">
         <w:r>
           <w:rPr>
             <w:rFonts w:ascii="Calibri" w:hAnsi="Calibri" w:cs="Calibri"/>
@@ -23948,7 +24067,7 @@
         </w:rPr>
         <w:t xml:space="preserve"> anatomy, P10B-08 canonical card anatomy, and P10B-04 approved media treatment. Exact canonical catalogue bindings preserve product membership/order, facts, product media, filters/sort state, and child-collection order. Campaign media is approved collection/editorial media, not a product-media replacement. A transient revision-checked zero-result context keeps the query without fabricating products. Deterministic lifecycle and 16-view Chromium evidence pass with zero provider calls. See </w:t>
       </w:r>
-      <w:hyperlink r:id="rIdHyperlink27" w:history="1">
+      <w:hyperlink r:id="rIdHyperlink29" w:history="1">
         <w:r>
           <w:rPr>
             <w:rFonts w:ascii="Calibri" w:hAnsi="Calibri" w:cs="Calibri"/>
@@ -24478,7 +24597,7 @@
         </w:rPr>
         <w:t xml:space="preserve">. Fifteen structurally distinct registered profiles resolve exact current approved brief evidence into strict localized fact documents. P10B-05 preserves page-set, route, locale, and transitive navigation authority; P10B-06 frames and P10B-07 editorial/campaign renderers are reused. Snapshot save/reload and deterministic publication preserve the exact document. See </w:t>
       </w:r>
-      <w:hyperlink r:id="rIdHyperlink28" w:history="1">
+      <w:hyperlink r:id="rIdHyperlink30" w:history="1">
         <w:r>
           <w:rPr>
             <w:rFonts w:ascii="Calibri" w:hAnsi="Calibri" w:cs="Calibri"/>
@@ -24689,7 +24808,7 @@
         </w:rPr>
         <w:t xml:space="preserve"> component through the P10B-05 family page; registered loading state renders on its pending route instead of replacing the 404 singleton. Read-only runtime state supplies canonical cart facts, checkout continuation, P10B-10 query/filter context, and bounded recovery actions while the snapshot preserves presentation only. Shared-frame/Design DNA, save/reload, publication, four- width browser evidence, and no-provider behavior are covered under </w:t>
       </w:r>
-      <w:hyperlink r:id="rIdHyperlink29" w:history="1">
+      <w:hyperlink r:id="rIdHyperlink31" w:history="1">
         <w:r>
           <w:rPr>
             <w:rFonts w:ascii="Calibri" w:hAnsi="Calibri" w:cs="Calibri"/>
@@ -24900,7 +25019,7 @@
         </w:rPr>
         <w:t xml:space="preserve"> frame span all pages; simple/configurable PDP, factual content, utility states, 15 four-width/representative screenshots and the passing 160-scenario human record are retained in </w:t>
       </w:r>
-      <w:hyperlink r:id="rIdHyperlink30" w:history="1">
+      <w:hyperlink r:id="rIdHyperlink32" w:history="1">
         <w:r>
           <w:rPr>
             <w:rFonts w:ascii="Calibri" w:hAnsi="Calibri" w:cs="Calibri"/>
@@ -25111,7 +25230,7 @@
         </w:rPr>
         <w:t xml:space="preserve"> One versioned deterministic synthesis contract binds exact merchant, evidence, commerce, asset, Design DNA, site-map, frame, PageBlueprint/profile, component/anatomy, narrative, density, art-direction, responsive, planner, registry and recipe authority. The same approved fixture produces editorial-heavy, commerce/discovery-heavy and restrained/minimal complete 17-route stores through the existing whole-storefront proposal, snapshot, save/reload, renderer and immutable publication chain. Details are retained in </w:t>
       </w:r>
-      <w:hyperlink r:id="rIdHyperlink31" w:history="1">
+      <w:hyperlink r:id="rIdHyperlink33" w:history="1">
         <w:r>
           <w:rPr>
             <w:rFonts w:ascii="Calibri" w:hAnsi="Calibri" w:cs="Calibri"/>
@@ -25356,7 +25475,7 @@
         </w:rPr>
         <w:t xml:space="preserve"> 31 focused unit/integration cases; nine representative complete outcomes; exact save/reload and compiled publication; protected commerce/evidence/media parity; dedicated 375/768/1024/1440 browser coverage; three retained human commercial reviews and one exact evidence manifest. See </w:t>
       </w:r>
-      <w:hyperlink r:id="rIdHyperlink32" w:history="1">
+      <w:hyperlink r:id="rIdHyperlink34" w:history="1">
         <w:r>
           <w:rPr>
             <w:rFonts w:ascii="Calibri" w:hAnsi="Calibri" w:cs="Calibri"/>
@@ -25533,7 +25652,7 @@
         </w:rPr>
         <w:t xml:space="preserve"> A compact route inventory, four collection/search archetypes, four maintained PDP profiles plus generic fallback, exact collection and product-type mappings, bounded matching rules, transient editor/runtime projection, deterministic legacy convergence, and complete snapshot/lifecycle/publication preservation. Exact primary and related-product bindings survive convergence. A server-owned, storefront-scoped proposal transition binds legacy and reviewed canonical projections for deterministic acceptance replay. Storefront Studio lists archetypes rather than one page per commerce URL; representative context is not persisted. See </w:t>
       </w:r>
-      <w:hyperlink r:id="rIdHyperlink33" w:history="1">
+      <w:hyperlink r:id="rIdHyperlink35" w:history="1">
         <w:r>
           <w:rPr>
             <w:rFonts w:ascii="Calibri" w:hAnsi="Calibri" w:cs="Calibri"/>
@@ -26001,7 +26120,7 @@
         </w:rPr>
         <w:t xml:space="preserve"> </w:t>
       </w:r>
-      <w:hyperlink r:id="rIdHyperlink34" w:history="1">
+      <w:hyperlink r:id="rIdHyperlink36" w:history="1">
         <w:r>
           <w:rPr>
             <w:rFonts w:ascii="Calibri" w:hAnsi="Calibri" w:cs="Calibri"/>
@@ -26462,7 +26581,7 @@
         </w:rPr>
         <w:t xml:space="preserve">. Completed 15 August 2026; see </w:t>
       </w:r>
-      <w:hyperlink r:id="rIdHyperlink17" w:history="1">
+      <w:hyperlink r:id="rIdHyperlink19" w:history="1">
         <w:r>
           <w:rPr>
             <w:rFonts w:ascii="Calibri" w:hAnsi="Calibri" w:cs="Calibri"/>
@@ -27724,7 +27843,7 @@
         </w:rPr>
         <w:t xml:space="preserve">. Accepted by the product owner on 16 August 2026 under </w:t>
       </w:r>
-      <w:hyperlink r:id="rIdHyperlink35" w:history="1">
+      <w:hyperlink r:id="rIdHyperlink37" w:history="1">
         <w:r>
           <w:rPr>
             <w:rFonts w:ascii="Calibri" w:hAnsi="Calibri" w:cs="Calibri"/>
@@ -28082,7 +28201,7 @@
         </w:rPr>
         <w:t xml:space="preserve">. Accepted by the product owner on 17 August 2026 under </w:t>
       </w:r>
-      <w:hyperlink r:id="rIdHyperlink35" w:history="1">
+      <w:hyperlink r:id="rIdHyperlink37" w:history="1">
         <w:r>
           <w:rPr>
             <w:rFonts w:ascii="Calibri" w:hAnsi="Calibri" w:cs="Calibri"/>
@@ -31222,7 +31341,7 @@
         </w:rPr>
         <w:t xml:space="preserve"> </w:t>
       </w:r>
-      <w:hyperlink r:id="rIdHyperlink36" w:history="1">
+      <w:hyperlink r:id="rIdHyperlink38" w:history="1">
         <w:r>
           <w:rPr>
             <w:rFonts w:ascii="Calibri" w:hAnsi="Calibri" w:cs="Calibri"/>
@@ -31238,7 +31357,7 @@
         </w:rPr>
         <w:t xml:space="preserve"> and </w:t>
       </w:r>
-      <w:hyperlink r:id="rIdHyperlink37" w:history="1">
+      <w:hyperlink r:id="rIdHyperlink39" w:history="1">
         <w:r>
           <w:rPr>
             <w:rFonts w:ascii="Calibri" w:hAnsi="Calibri" w:cs="Calibri"/>

</xml_diff>

<commit_message>
refactor: isolate template capability metadata (AR-02G)
</commit_message>
<xml_diff>
--- a/docs/VESKIFY_DEVELOPMENT_DELIVERY_TRACKER_v1.3.0.docx
+++ b/docs/VESKIFY_DEVELOPMENT_DELIVERY_TRACKER_v1.3.0.docx
@@ -51,7 +51,7 @@
         <w:rPr>
           <w:rFonts w:ascii="Calibri" w:hAnsi="Calibri" w:cs="Calibri"/>
         </w:rPr>
-        <w:t>Effective upon explicit AR-02F acceptance/merge: AR-02A, AR-02B, AR-02C, AR-02D, AR-02E, AR-02F, and AR-03A Baseline / closed; AR-02 and AR-03 Partial; AR-23 eligible / unstarted; BATCH-03 has no successor child</w:t>
+        <w:t>Effective upon explicit AR-02G acceptance/merge: AR-02A through AR-02G and AR-03A Baseline / closed; AR-02 and AR-03 Partial; AR-23 eligible / unstarted; BATCH-03 complete; AR-02H next after G merge</w:t>
       </w:r>
     </w:p>
     <w:p>
@@ -118,7 +118,7 @@
           <w:b/>
           <w:bCs/>
         </w:rPr>
-        <w:t>Candidate status effective upon explicit owner acceptance/merge of AR-02F:</w:t>
+        <w:t>Candidate status effective upon explicit owner acceptance/merge of AR-02G:</w:t>
       </w:r>
       <w:r>
         <w:rPr>
@@ -244,6 +244,20 @@
           <w:b/>
           <w:bCs/>
         </w:rPr>
+        <w:t>Baseline / closed.</w:t>
+      </w:r>
+      <w:r>
+        <w:rPr>
+          <w:rFonts w:ascii="Calibri" w:hAnsi="Calibri" w:cs="Calibri"/>
+        </w:rPr>
+        <w:t xml:space="preserve"> AR-02G is </w:t>
+      </w:r>
+      <w:r>
+        <w:rPr>
+          <w:rFonts w:ascii="Calibri" w:hAnsi="Calibri" w:cs="Calibri"/>
+          <w:b/>
+          <w:bCs/>
+        </w:rPr>
         <w:t>Baseline / closed upon explicit owner acceptance/merge.</w:t>
       </w:r>
       <w:r>
@@ -306,7 +320,7 @@
         <w:rPr>
           <w:rFonts w:ascii="Calibri" w:hAnsi="Calibri" w:cs="Calibri"/>
         </w:rPr>
-        <w:t xml:space="preserve">. AR-23 depends on AR-01 and is not serialized behind visual work. BATCH-03 has no successor child. This tracker owns current status; the roadmap owns dependency order. Retained B01 exact-next, fixed-two-call/mandatory-three-concept, transient-only, and 73-child future-sequence statements are </w:t>
+        <w:t xml:space="preserve">. AR-23 depends on AR-01 and is not serialized behind visual work. BATCH-03 is complete. AR-02H is the sole next reset task, eligible only after AR-02G acceptance/merge. This tracker owns current status; the roadmap owns dependency order. Retained B01 exact-next, fixed-two-call/mandatory-three-concept, transient-only, and 73-child future-sequence statements are </w:t>
       </w:r>
       <w:r>
         <w:rPr>
@@ -843,7 +857,7 @@
               <w:rPr>
                 <w:rFonts w:ascii="Calibri" w:hAnsi="Calibri" w:cs="Calibri"/>
               </w:rPr>
-              <w:t>Status effective on AR-02F acceptance/merge</w:t>
+              <w:t>Status effective on AR-02G acceptance/merge</w:t>
             </w:r>
           </w:p>
         </w:tc>
@@ -1580,11 +1594,211 @@
               </w:rPr>
               <w:t>Baseline / closed</w:t>
             </w:r>
+          </w:p>
+        </w:tc>
+      </w:tr>
+      <w:tr>
+        <w:trPr>
+          <w:cantSplit/>
+        </w:trPr>
+        <w:tc>
+          <w:tcPr>
+            <w:tcW w:w="1000" w:type="dxa"/>
+            <w:vAlign w:val="center"/>
+          </w:tcPr>
+          <w:p>
+            <w:pPr>
+              <w:pStyle w:val="TableText"/>
+              <w:widowControl/>
+            </w:pPr>
+            <w:r>
+              <w:rPr>
+                <w:rFonts w:ascii="Calibri" w:hAnsi="Calibri" w:cs="Calibri"/>
+              </w:rPr>
+              <w:t>AR-02G</w:t>
+            </w:r>
+          </w:p>
+        </w:tc>
+        <w:tc>
+          <w:tcPr>
+            <w:tcW w:w="1500" w:type="dxa"/>
+            <w:vAlign w:val="center"/>
+          </w:tcPr>
+          <w:p>
+            <w:pPr>
+              <w:pStyle w:val="TableText"/>
+              <w:widowControl/>
+            </w:pPr>
+            <w:r>
+              <w:rPr>
+                <w:rFonts w:ascii="Calibri" w:hAnsi="Calibri" w:cs="Calibri"/>
+              </w:rPr>
+              <w:t>AR-02</w:t>
+            </w:r>
+          </w:p>
+        </w:tc>
+        <w:tc>
+          <w:tcPr>
+            <w:tcW w:w="2000" w:type="dxa"/>
+            <w:vAlign w:val="center"/>
+          </w:tcPr>
+          <w:p>
+            <w:pPr>
+              <w:pStyle w:val="TableText"/>
+              <w:widowControl/>
+            </w:pPr>
+            <w:r>
+              <w:rPr>
+                <w:rFonts w:ascii="Calibri" w:hAnsi="Calibri" w:cs="Calibri"/>
+              </w:rPr>
+              <w:t xml:space="preserve">Renderer-free template capability boundary and explicit utility historical-source transition; </w:t>
+            </w:r>
+            <w:hyperlink r:id="rIdHyperlink17" w:history="1">
+              <w:r>
+                <w:rPr>
+                  <w:rFonts w:ascii="Calibri" w:hAnsi="Calibri" w:cs="Calibri"/>
+                  <w:color w:val="2E74B5"/>
+                  <w:u w:val="single"/>
+                </w:rPr>
+                <w:t>contract</w:t>
+              </w:r>
+            </w:hyperlink>
+            <w:r>
+              <w:rPr>
+                <w:rFonts w:ascii="Calibri" w:hAnsi="Calibri" w:cs="Calibri"/>
+              </w:rPr>
+              <w:t xml:space="preserve">, </w:t>
+            </w:r>
+            <w:hyperlink r:id="rIdHyperlink18" w:history="1">
+              <w:r>
+                <w:rPr>
+                  <w:rFonts w:ascii="Calibri" w:hAnsi="Calibri" w:cs="Calibri"/>
+                  <w:color w:val="2E74B5"/>
+                  <w:u w:val="single"/>
+                </w:rPr>
+                <w:t>report</w:t>
+              </w:r>
+            </w:hyperlink>
+          </w:p>
+        </w:tc>
+        <w:tc>
+          <w:tcPr>
+            <w:tcW w:w="8460" w:type="dxa"/>
+            <w:vAlign w:val="center"/>
+          </w:tcPr>
+          <w:p>
+            <w:pPr>
+              <w:pStyle w:val="TableText"/>
+              <w:widowControl/>
+            </w:pPr>
+            <w:r>
+              <w:rPr>
+                <w:rFonts w:ascii="Calibri" w:hAnsi="Calibri" w:cs="Calibri"/>
+                <w:b/>
+                <w:bCs/>
+              </w:rPr>
+              <w:t>Baseline / closed</w:t>
+            </w:r>
             <w:r>
               <w:rPr>
                 <w:rFonts w:ascii="Calibri" w:hAnsi="Calibri" w:cs="Calibri"/>
               </w:rPr>
               <w:t xml:space="preserve"> upon acceptance/merge</w:t>
+            </w:r>
+          </w:p>
+        </w:tc>
+      </w:tr>
+      <w:tr>
+        <w:trPr>
+          <w:cantSplit/>
+        </w:trPr>
+        <w:tc>
+          <w:tcPr>
+            <w:tcW w:w="1000" w:type="dxa"/>
+            <w:vAlign w:val="center"/>
+          </w:tcPr>
+          <w:p>
+            <w:pPr>
+              <w:pStyle w:val="TableText"/>
+              <w:widowControl/>
+            </w:pPr>
+            <w:r>
+              <w:rPr>
+                <w:rFonts w:ascii="Calibri" w:hAnsi="Calibri" w:cs="Calibri"/>
+              </w:rPr>
+              <w:t>AR-02H</w:t>
+            </w:r>
+          </w:p>
+        </w:tc>
+        <w:tc>
+          <w:tcPr>
+            <w:tcW w:w="1500" w:type="dxa"/>
+            <w:vAlign w:val="center"/>
+          </w:tcPr>
+          <w:p>
+            <w:pPr>
+              <w:pStyle w:val="TableText"/>
+              <w:widowControl/>
+            </w:pPr>
+            <w:r>
+              <w:rPr>
+                <w:rFonts w:ascii="Calibri" w:hAnsi="Calibri" w:cs="Calibri"/>
+              </w:rPr>
+              <w:t>AR-02</w:t>
+            </w:r>
+          </w:p>
+        </w:tc>
+        <w:tc>
+          <w:tcPr>
+            <w:tcW w:w="2000" w:type="dxa"/>
+            <w:vAlign w:val="center"/>
+          </w:tcPr>
+          <w:p>
+            <w:pPr>
+              <w:pStyle w:val="TableText"/>
+              <w:widowControl/>
+            </w:pPr>
+            <w:r>
+              <w:rPr>
+                <w:rFonts w:ascii="Calibri" w:hAnsi="Calibri" w:cs="Calibri"/>
+              </w:rPr>
+              <w:t xml:space="preserve">Narrow semantic-request schema imports; second named child in </w:t>
+            </w:r>
+            <w:hyperlink r:id="rIdHyperlink19" w:history="1">
+              <w:r>
+                <w:rPr>
+                  <w:rFonts w:ascii="Calibri" w:hAnsi="Calibri" w:cs="Calibri"/>
+                  <w:color w:val="2E74B5"/>
+                  <w:u w:val="single"/>
+                </w:rPr>
+                <w:t>BATCH-04</w:t>
+              </w:r>
+            </w:hyperlink>
+            <w:r>
+              <w:rPr>
+                <w:rFonts w:ascii="Calibri" w:hAnsi="Calibri" w:cs="Calibri"/>
+              </w:rPr>
+              <w:t>, eligible after G merge</w:t>
+            </w:r>
+          </w:p>
+        </w:tc>
+        <w:tc>
+          <w:tcPr>
+            <w:tcW w:w="8460" w:type="dxa"/>
+            <w:vAlign w:val="center"/>
+          </w:tcPr>
+          <w:p>
+            <w:pPr>
+              <w:pStyle w:val="TableText"/>
+              <w:widowControl/>
+            </w:pPr>
+            <w:r>
+              <w:rPr>
+                <w:rFonts w:ascii="Calibri" w:hAnsi="Calibri" w:cs="Calibri"/>
+                <w:b/>
+                <w:bCs/>
+              </w:rPr>
+              <w:t>Planned / unstarted</w:t>
             </w:r>
           </w:p>
         </w:tc>
@@ -21520,7 +21734,7 @@
         </w:rPr>
         <w:t xml:space="preserve">. Completed 7 August 2026; see </w:t>
       </w:r>
-      <w:hyperlink r:id="rIdHyperlink17" w:history="1">
+      <w:hyperlink r:id="rIdHyperlink20" w:history="1">
         <w:r>
           <w:rPr>
             <w:rFonts w:ascii="Calibri" w:hAnsi="Calibri" w:cs="Calibri"/>
@@ -21657,7 +21871,7 @@
         </w:rPr>
         <w:t xml:space="preserve">The binding details and minimum coverage are in </w:t>
       </w:r>
-      <w:hyperlink r:id="rIdHyperlink18" w:history="1">
+      <w:hyperlink r:id="rIdHyperlink21" w:history="1">
         <w:r>
           <w:rPr>
             <w:rFonts w:ascii="Calibri" w:hAnsi="Calibri" w:cs="Calibri"/>
@@ -21855,7 +22069,7 @@
         </w:rPr>
         <w:t xml:space="preserve">. P10B-16P-04 acceptance evidence is retained in </w:t>
       </w:r>
-      <w:hyperlink r:id="rIdHyperlink19" w:history="1">
+      <w:hyperlink r:id="rIdHyperlink22" w:history="1">
         <w:r>
           <w:rPr>
             <w:rFonts w:ascii="Calibri" w:hAnsi="Calibri" w:cs="Calibri"/>
@@ -22104,7 +22318,7 @@
         </w:rPr>
         <w:t xml:space="preserve">. See </w:t>
       </w:r>
-      <w:hyperlink r:id="rIdHyperlink20" w:history="1">
+      <w:hyperlink r:id="rIdHyperlink23" w:history="1">
         <w:r>
           <w:rPr>
             <w:rFonts w:ascii="Calibri" w:hAnsi="Calibri" w:cs="Calibri"/>
@@ -22353,7 +22567,7 @@
         </w:rPr>
         <w:t xml:space="preserve">. See </w:t>
       </w:r>
-      <w:hyperlink r:id="rIdHyperlink21" w:history="1">
+      <w:hyperlink r:id="rIdHyperlink24" w:history="1">
         <w:r>
           <w:rPr>
             <w:rFonts w:ascii="Calibri" w:hAnsi="Calibri" w:cs="Calibri"/>
@@ -22602,7 +22816,7 @@
         </w:rPr>
         <w:t xml:space="preserve">. At P10B-03 delivery, all then-current 25 V2 definitions and 91 variants were classified explicitly without false commercial-ready promotion. Later family tasks extend that same authority rather than replacing it. See </w:t>
       </w:r>
-      <w:hyperlink r:id="rIdHyperlink22" w:history="1">
+      <w:hyperlink r:id="rIdHyperlink25" w:history="1">
         <w:r>
           <w:rPr>
             <w:rFonts w:ascii="Calibri" w:hAnsi="Calibri" w:cs="Calibri"/>
@@ -22851,7 +23065,7 @@
         </w:rPr>
         <w:t xml:space="preserve"> embeds exact lineage and bounded treatment in the existing approved presentation, consumes Design DNA and registered anatomy, projects protected same-product media, preserves authority through lifecycle/compiler boundaries, and renders semantic four-breakpoint evidence. Production CDN transforms and retained commercial visual acceptance remain deferred. See </w:t>
       </w:r>
-      <w:hyperlink r:id="rIdHyperlink23" w:history="1">
+      <w:hyperlink r:id="rIdHyperlink26" w:history="1">
         <w:r>
           <w:rPr>
             <w:rFonts w:ascii="Calibri" w:hAnsi="Calibri" w:cs="Calibri"/>
@@ -23100,7 +23314,7 @@
         </w:rPr>
         <w:t xml:space="preserve">. See </w:t>
       </w:r>
-      <w:hyperlink r:id="rIdHyperlink24" w:history="1">
+      <w:hyperlink r:id="rIdHyperlink27" w:history="1">
         <w:r>
           <w:rPr>
             <w:rFonts w:ascii="Calibri" w:hAnsi="Calibri" w:cs="Calibri"/>
@@ -23335,7 +23549,7 @@
         </w:rPr>
         <w:t xml:space="preserve">. Four exact root-frame profiles, three mobile modes, and four footer compositions preserve canonical navigation and frame identity through snapshot, save/reload, Puck root, preview, publication compilation, EN/FI, and 375/768/1024/1440 px evidence. See </w:t>
       </w:r>
-      <w:hyperlink r:id="rIdHyperlink25" w:history="1">
+      <w:hyperlink r:id="rIdHyperlink28" w:history="1">
         <w:r>
           <w:rPr>
             <w:rFonts w:ascii="Calibri" w:hAnsi="Calibri" w:cs="Calibri"/>
@@ -23570,7 +23784,7 @@
         </w:rPr>
         <w:t xml:space="preserve">. Six meaningful hero anatomies, five editorial/story anatomies, five campaign/promotion anatomies and three evidence-grounded proof/service anatomies are registered, PageBlueprint-selectable, deterministically generated, snapshot/publish preserved and rendered through one shared implementation. Focused deterministic coverage and a zero-provider Chromium scenario retain evidence at 375, 768, 1024 and 1440 px. See </w:t>
       </w:r>
-      <w:hyperlink r:id="rIdHyperlink26" w:history="1">
+      <w:hyperlink r:id="rIdHyperlink29" w:history="1">
         <w:r>
           <w:rPr>
             <w:rFonts w:ascii="Calibri" w:hAnsi="Calibri" w:cs="Calibri"/>
@@ -23619,7 +23833,7 @@
         </w:rPr>
         <w:t xml:space="preserve"> Baseline. One fingerprinted authority and renderer now serve homepage merchandising, collection/results, related products, and legacy compatibility. Five meaningful anatomies preserve canonical facts and P10B-04 media lineage through plan, proposal, snapshot, save/reload, publish, and responsive browser evidence. See </w:t>
       </w:r>
-      <w:hyperlink r:id="rIdHyperlink27" w:history="1">
+      <w:hyperlink r:id="rIdHyperlink30" w:history="1">
         <w:r>
           <w:rPr>
             <w:rFonts w:ascii="Calibri" w:hAnsi="Calibri" w:cs="Calibri"/>
@@ -23836,7 +24050,7 @@
         </w:rPr>
         <w:t xml:space="preserve"> Baseline. Six versioned, structurally fingerprinted homepage PageBlueprint profiles compose current shared-frame, commercial storytelling, canonical product-card, approved-media, and Design DNA authority. Evidence/cardinality guards fail closed; deterministic lifecycle and 24 retained four-width browser images pass. See </w:t>
       </w:r>
-      <w:hyperlink r:id="rIdHyperlink28" w:history="1">
+      <w:hyperlink r:id="rIdHyperlink31" w:history="1">
         <w:r>
           <w:rPr>
             <w:rFonts w:ascii="Calibri" w:hAnsi="Calibri" w:cs="Calibri"/>
@@ -24067,7 +24281,7 @@
         </w:rPr>
         <w:t xml:space="preserve"> anatomy, P10B-08 canonical card anatomy, and P10B-04 approved media treatment. Exact canonical catalogue bindings preserve product membership/order, facts, product media, filters/sort state, and child-collection order. Campaign media is approved collection/editorial media, not a product-media replacement. A transient revision-checked zero-result context keeps the query without fabricating products. Deterministic lifecycle and 16-view Chromium evidence pass with zero provider calls. See </w:t>
       </w:r>
-      <w:hyperlink r:id="rIdHyperlink29" w:history="1">
+      <w:hyperlink r:id="rIdHyperlink32" w:history="1">
         <w:r>
           <w:rPr>
             <w:rFonts w:ascii="Calibri" w:hAnsi="Calibri" w:cs="Calibri"/>
@@ -24597,7 +24811,7 @@
         </w:rPr>
         <w:t xml:space="preserve">. Fifteen structurally distinct registered profiles resolve exact current approved brief evidence into strict localized fact documents. P10B-05 preserves page-set, route, locale, and transitive navigation authority; P10B-06 frames and P10B-07 editorial/campaign renderers are reused. Snapshot save/reload and deterministic publication preserve the exact document. See </w:t>
       </w:r>
-      <w:hyperlink r:id="rIdHyperlink30" w:history="1">
+      <w:hyperlink r:id="rIdHyperlink33" w:history="1">
         <w:r>
           <w:rPr>
             <w:rFonts w:ascii="Calibri" w:hAnsi="Calibri" w:cs="Calibri"/>
@@ -24808,7 +25022,7 @@
         </w:rPr>
         <w:t xml:space="preserve"> component through the P10B-05 family page; registered loading state renders on its pending route instead of replacing the 404 singleton. Read-only runtime state supplies canonical cart facts, checkout continuation, P10B-10 query/filter context, and bounded recovery actions while the snapshot preserves presentation only. Shared-frame/Design DNA, save/reload, publication, four- width browser evidence, and no-provider behavior are covered under </w:t>
       </w:r>
-      <w:hyperlink r:id="rIdHyperlink31" w:history="1">
+      <w:hyperlink r:id="rIdHyperlink34" w:history="1">
         <w:r>
           <w:rPr>
             <w:rFonts w:ascii="Calibri" w:hAnsi="Calibri" w:cs="Calibri"/>
@@ -25019,7 +25233,7 @@
         </w:rPr>
         <w:t xml:space="preserve"> frame span all pages; simple/configurable PDP, factual content, utility states, 15 four-width/representative screenshots and the passing 160-scenario human record are retained in </w:t>
       </w:r>
-      <w:hyperlink r:id="rIdHyperlink32" w:history="1">
+      <w:hyperlink r:id="rIdHyperlink35" w:history="1">
         <w:r>
           <w:rPr>
             <w:rFonts w:ascii="Calibri" w:hAnsi="Calibri" w:cs="Calibri"/>
@@ -25230,7 +25444,7 @@
         </w:rPr>
         <w:t xml:space="preserve"> One versioned deterministic synthesis contract binds exact merchant, evidence, commerce, asset, Design DNA, site-map, frame, PageBlueprint/profile, component/anatomy, narrative, density, art-direction, responsive, planner, registry and recipe authority. The same approved fixture produces editorial-heavy, commerce/discovery-heavy and restrained/minimal complete 17-route stores through the existing whole-storefront proposal, snapshot, save/reload, renderer and immutable publication chain. Details are retained in </w:t>
       </w:r>
-      <w:hyperlink r:id="rIdHyperlink33" w:history="1">
+      <w:hyperlink r:id="rIdHyperlink36" w:history="1">
         <w:r>
           <w:rPr>
             <w:rFonts w:ascii="Calibri" w:hAnsi="Calibri" w:cs="Calibri"/>
@@ -25475,7 +25689,7 @@
         </w:rPr>
         <w:t xml:space="preserve"> 31 focused unit/integration cases; nine representative complete outcomes; exact save/reload and compiled publication; protected commerce/evidence/media parity; dedicated 375/768/1024/1440 browser coverage; three retained human commercial reviews and one exact evidence manifest. See </w:t>
       </w:r>
-      <w:hyperlink r:id="rIdHyperlink34" w:history="1">
+      <w:hyperlink r:id="rIdHyperlink37" w:history="1">
         <w:r>
           <w:rPr>
             <w:rFonts w:ascii="Calibri" w:hAnsi="Calibri" w:cs="Calibri"/>
@@ -25652,7 +25866,7 @@
         </w:rPr>
         <w:t xml:space="preserve"> A compact route inventory, four collection/search archetypes, four maintained PDP profiles plus generic fallback, exact collection and product-type mappings, bounded matching rules, transient editor/runtime projection, deterministic legacy convergence, and complete snapshot/lifecycle/publication preservation. Exact primary and related-product bindings survive convergence. A server-owned, storefront-scoped proposal transition binds legacy and reviewed canonical projections for deterministic acceptance replay. Storefront Studio lists archetypes rather than one page per commerce URL; representative context is not persisted. See </w:t>
       </w:r>
-      <w:hyperlink r:id="rIdHyperlink35" w:history="1">
+      <w:hyperlink r:id="rIdHyperlink38" w:history="1">
         <w:r>
           <w:rPr>
             <w:rFonts w:ascii="Calibri" w:hAnsi="Calibri" w:cs="Calibri"/>
@@ -26120,7 +26334,7 @@
         </w:rPr>
         <w:t xml:space="preserve"> </w:t>
       </w:r>
-      <w:hyperlink r:id="rIdHyperlink36" w:history="1">
+      <w:hyperlink r:id="rIdHyperlink39" w:history="1">
         <w:r>
           <w:rPr>
             <w:rFonts w:ascii="Calibri" w:hAnsi="Calibri" w:cs="Calibri"/>
@@ -26581,7 +26795,7 @@
         </w:rPr>
         <w:t xml:space="preserve">. Completed 15 August 2026; see </w:t>
       </w:r>
-      <w:hyperlink r:id="rIdHyperlink19" w:history="1">
+      <w:hyperlink r:id="rIdHyperlink22" w:history="1">
         <w:r>
           <w:rPr>
             <w:rFonts w:ascii="Calibri" w:hAnsi="Calibri" w:cs="Calibri"/>
@@ -27843,7 +28057,7 @@
         </w:rPr>
         <w:t xml:space="preserve">. Accepted by the product owner on 16 August 2026 under </w:t>
       </w:r>
-      <w:hyperlink r:id="rIdHyperlink37" w:history="1">
+      <w:hyperlink r:id="rIdHyperlink40" w:history="1">
         <w:r>
           <w:rPr>
             <w:rFonts w:ascii="Calibri" w:hAnsi="Calibri" w:cs="Calibri"/>
@@ -28201,7 +28415,7 @@
         </w:rPr>
         <w:t xml:space="preserve">. Accepted by the product owner on 17 August 2026 under </w:t>
       </w:r>
-      <w:hyperlink r:id="rIdHyperlink37" w:history="1">
+      <w:hyperlink r:id="rIdHyperlink40" w:history="1">
         <w:r>
           <w:rPr>
             <w:rFonts w:ascii="Calibri" w:hAnsi="Calibri" w:cs="Calibri"/>
@@ -31341,7 +31555,7 @@
         </w:rPr>
         <w:t xml:space="preserve"> </w:t>
       </w:r>
-      <w:hyperlink r:id="rIdHyperlink38" w:history="1">
+      <w:hyperlink r:id="rIdHyperlink41" w:history="1">
         <w:r>
           <w:rPr>
             <w:rFonts w:ascii="Calibri" w:hAnsi="Calibri" w:cs="Calibri"/>
@@ -31357,7 +31571,7 @@
         </w:rPr>
         <w:t xml:space="preserve"> and </w:t>
       </w:r>
-      <w:hyperlink r:id="rIdHyperlink39" w:history="1">
+      <w:hyperlink r:id="rIdHyperlink42" w:history="1">
         <w:r>
           <w:rPr>
             <w:rFonts w:ascii="Calibri" w:hAnsi="Calibri" w:cs="Calibri"/>

</xml_diff>

<commit_message>
refactor: isolate semantic request preparation (AR-02H)
</commit_message>
<xml_diff>
--- a/docs/VESKIFY_DEVELOPMENT_DELIVERY_TRACKER_v1.3.0.docx
+++ b/docs/VESKIFY_DEVELOPMENT_DELIVERY_TRACKER_v1.3.0.docx
@@ -51,7 +51,7 @@
         <w:rPr>
           <w:rFonts w:ascii="Calibri" w:hAnsi="Calibri" w:cs="Calibri"/>
         </w:rPr>
-        <w:t>Effective upon explicit AR-02G acceptance/merge: AR-02A through AR-02G and AR-03A Baseline / closed; AR-02 and AR-03 Partial; AR-23 eligible / unstarted; BATCH-03 complete; AR-02H next after G merge</w:t>
+        <w:t>Effective upon explicit AR-02H acceptance/merge: AR-02A through AR-02H and AR-03A Baseline / closed; AR-02 and AR-03 Partial; AR-23 eligible / unstarted; BATCH-04 complete; no next child selected</w:t>
       </w:r>
     </w:p>
     <w:p>
@@ -118,7 +118,7 @@
           <w:b/>
           <w:bCs/>
         </w:rPr>
-        <w:t>Candidate status effective upon explicit owner acceptance/merge of AR-02G:</w:t>
+        <w:t>Candidate status effective upon explicit owner acceptance/merge of AR-02H:</w:t>
       </w:r>
       <w:r>
         <w:rPr>
@@ -258,6 +258,20 @@
           <w:b/>
           <w:bCs/>
         </w:rPr>
+        <w:t>Baseline / closed.</w:t>
+      </w:r>
+      <w:r>
+        <w:rPr>
+          <w:rFonts w:ascii="Calibri" w:hAnsi="Calibri" w:cs="Calibri"/>
+        </w:rPr>
+        <w:t xml:space="preserve"> AR-02H is </w:t>
+      </w:r>
+      <w:r>
+        <w:rPr>
+          <w:rFonts w:ascii="Calibri" w:hAnsi="Calibri" w:cs="Calibri"/>
+          <w:b/>
+          <w:bCs/>
+        </w:rPr>
         <w:t>Baseline / closed upon explicit owner acceptance/merge.</w:t>
       </w:r>
       <w:r>
@@ -320,7 +334,7 @@
         <w:rPr>
           <w:rFonts w:ascii="Calibri" w:hAnsi="Calibri" w:cs="Calibri"/>
         </w:rPr>
-        <w:t xml:space="preserve">. AR-23 depends on AR-01 and is not serialized behind visual work. BATCH-03 is complete. AR-02H is the sole next reset task, eligible only after AR-02G acceptance/merge. This tracker owns current status; the roadmap owns dependency order. Retained B01 exact-next, fixed-two-call/mandatory-three-concept, transient-only, and 73-child future-sequence statements are </w:t>
+        <w:t xml:space="preserve">. AR-23 depends on AR-01 and is not serialized behind visual work. BATCH-03 is complete. BATCH-04 is complete upon H acceptance/merge. No next reset task is selected. This tracker owns current status; the roadmap owns dependency order. Retained B01 exact-next, fixed-two-call/mandatory-three-concept, transient-only, and 73-child future-sequence statements are </w:t>
       </w:r>
       <w:r>
         <w:rPr>
@@ -857,7 +871,7 @@
               <w:rPr>
                 <w:rFonts w:ascii="Calibri" w:hAnsi="Calibri" w:cs="Calibri"/>
               </w:rPr>
-              <w:t>Status effective on AR-02G acceptance/merge</w:t>
+              <w:t>Status effective on AR-02H acceptance/merge</w:t>
             </w:r>
           </w:p>
         </w:tc>
@@ -1699,12 +1713,6 @@
               </w:rPr>
               <w:t>Baseline / closed</w:t>
             </w:r>
-            <w:r>
-              <w:rPr>
-                <w:rFonts w:ascii="Calibri" w:hAnsi="Calibri" w:cs="Calibri"/>
-              </w:rPr>
-              <w:t xml:space="preserve"> upon acceptance/merge</w:t>
-            </w:r>
           </w:p>
         </w:tc>
       </w:tr>
@@ -1762,7 +1770,7 @@
               <w:rPr>
                 <w:rFonts w:ascii="Calibri" w:hAnsi="Calibri" w:cs="Calibri"/>
               </w:rPr>
-              <w:t xml:space="preserve">Narrow semantic-request schema imports; second named child in </w:t>
+              <w:t xml:space="preserve">Semantic request boundary and explicit direction historical-source transition; </w:t>
             </w:r>
             <w:hyperlink r:id="rIdHyperlink19" w:history="1">
               <w:r>
@@ -1771,15 +1779,25 @@
                   <w:color w:val="2E74B5"/>
                   <w:u w:val="single"/>
                 </w:rPr>
-                <w:t>BATCH-04</w:t>
+                <w:t>contract</w:t>
               </w:r>
             </w:hyperlink>
             <w:r>
               <w:rPr>
                 <w:rFonts w:ascii="Calibri" w:hAnsi="Calibri" w:cs="Calibri"/>
               </w:rPr>
-              <w:t>, eligible after G merge</w:t>
-            </w:r>
+              <w:t xml:space="preserve">, </w:t>
+            </w:r>
+            <w:hyperlink r:id="rIdHyperlink20" w:history="1">
+              <w:r>
+                <w:rPr>
+                  <w:rFonts w:ascii="Calibri" w:hAnsi="Calibri" w:cs="Calibri"/>
+                  <w:color w:val="2E74B5"/>
+                  <w:u w:val="single"/>
+                </w:rPr>
+                <w:t>report</w:t>
+              </w:r>
+            </w:hyperlink>
           </w:p>
         </w:tc>
         <w:tc>
@@ -1798,7 +1816,13 @@
                 <w:b/>
                 <w:bCs/>
               </w:rPr>
-              <w:t>Planned / unstarted</w:t>
+              <w:t>Baseline / closed</w:t>
+            </w:r>
+            <w:r>
+              <w:rPr>
+                <w:rFonts w:ascii="Calibri" w:hAnsi="Calibri" w:cs="Calibri"/>
+              </w:rPr>
+              <w:t xml:space="preserve"> upon acceptance/merge</w:t>
             </w:r>
           </w:p>
         </w:tc>
@@ -21734,7 +21758,7 @@
         </w:rPr>
         <w:t xml:space="preserve">. Completed 7 August 2026; see </w:t>
       </w:r>
-      <w:hyperlink r:id="rIdHyperlink20" w:history="1">
+      <w:hyperlink r:id="rIdHyperlink21" w:history="1">
         <w:r>
           <w:rPr>
             <w:rFonts w:ascii="Calibri" w:hAnsi="Calibri" w:cs="Calibri"/>
@@ -21871,7 +21895,7 @@
         </w:rPr>
         <w:t xml:space="preserve">The binding details and minimum coverage are in </w:t>
       </w:r>
-      <w:hyperlink r:id="rIdHyperlink21" w:history="1">
+      <w:hyperlink r:id="rIdHyperlink22" w:history="1">
         <w:r>
           <w:rPr>
             <w:rFonts w:ascii="Calibri" w:hAnsi="Calibri" w:cs="Calibri"/>
@@ -22069,7 +22093,7 @@
         </w:rPr>
         <w:t xml:space="preserve">. P10B-16P-04 acceptance evidence is retained in </w:t>
       </w:r>
-      <w:hyperlink r:id="rIdHyperlink22" w:history="1">
+      <w:hyperlink r:id="rIdHyperlink23" w:history="1">
         <w:r>
           <w:rPr>
             <w:rFonts w:ascii="Calibri" w:hAnsi="Calibri" w:cs="Calibri"/>
@@ -22318,7 +22342,7 @@
         </w:rPr>
         <w:t xml:space="preserve">. See </w:t>
       </w:r>
-      <w:hyperlink r:id="rIdHyperlink23" w:history="1">
+      <w:hyperlink r:id="rIdHyperlink24" w:history="1">
         <w:r>
           <w:rPr>
             <w:rFonts w:ascii="Calibri" w:hAnsi="Calibri" w:cs="Calibri"/>
@@ -22567,7 +22591,7 @@
         </w:rPr>
         <w:t xml:space="preserve">. See </w:t>
       </w:r>
-      <w:hyperlink r:id="rIdHyperlink24" w:history="1">
+      <w:hyperlink r:id="rIdHyperlink25" w:history="1">
         <w:r>
           <w:rPr>
             <w:rFonts w:ascii="Calibri" w:hAnsi="Calibri" w:cs="Calibri"/>
@@ -22816,7 +22840,7 @@
         </w:rPr>
         <w:t xml:space="preserve">. At P10B-03 delivery, all then-current 25 V2 definitions and 91 variants were classified explicitly without false commercial-ready promotion. Later family tasks extend that same authority rather than replacing it. See </w:t>
       </w:r>
-      <w:hyperlink r:id="rIdHyperlink25" w:history="1">
+      <w:hyperlink r:id="rIdHyperlink26" w:history="1">
         <w:r>
           <w:rPr>
             <w:rFonts w:ascii="Calibri" w:hAnsi="Calibri" w:cs="Calibri"/>
@@ -23065,7 +23089,7 @@
         </w:rPr>
         <w:t xml:space="preserve"> embeds exact lineage and bounded treatment in the existing approved presentation, consumes Design DNA and registered anatomy, projects protected same-product media, preserves authority through lifecycle/compiler boundaries, and renders semantic four-breakpoint evidence. Production CDN transforms and retained commercial visual acceptance remain deferred. See </w:t>
       </w:r>
-      <w:hyperlink r:id="rIdHyperlink26" w:history="1">
+      <w:hyperlink r:id="rIdHyperlink27" w:history="1">
         <w:r>
           <w:rPr>
             <w:rFonts w:ascii="Calibri" w:hAnsi="Calibri" w:cs="Calibri"/>
@@ -23314,7 +23338,7 @@
         </w:rPr>
         <w:t xml:space="preserve">. See </w:t>
       </w:r>
-      <w:hyperlink r:id="rIdHyperlink27" w:history="1">
+      <w:hyperlink r:id="rIdHyperlink28" w:history="1">
         <w:r>
           <w:rPr>
             <w:rFonts w:ascii="Calibri" w:hAnsi="Calibri" w:cs="Calibri"/>
@@ -23549,7 +23573,7 @@
         </w:rPr>
         <w:t xml:space="preserve">. Four exact root-frame profiles, three mobile modes, and four footer compositions preserve canonical navigation and frame identity through snapshot, save/reload, Puck root, preview, publication compilation, EN/FI, and 375/768/1024/1440 px evidence. See </w:t>
       </w:r>
-      <w:hyperlink r:id="rIdHyperlink28" w:history="1">
+      <w:hyperlink r:id="rIdHyperlink29" w:history="1">
         <w:r>
           <w:rPr>
             <w:rFonts w:ascii="Calibri" w:hAnsi="Calibri" w:cs="Calibri"/>
@@ -23784,7 +23808,7 @@
         </w:rPr>
         <w:t xml:space="preserve">. Six meaningful hero anatomies, five editorial/story anatomies, five campaign/promotion anatomies and three evidence-grounded proof/service anatomies are registered, PageBlueprint-selectable, deterministically generated, snapshot/publish preserved and rendered through one shared implementation. Focused deterministic coverage and a zero-provider Chromium scenario retain evidence at 375, 768, 1024 and 1440 px. See </w:t>
       </w:r>
-      <w:hyperlink r:id="rIdHyperlink29" w:history="1">
+      <w:hyperlink r:id="rIdHyperlink30" w:history="1">
         <w:r>
           <w:rPr>
             <w:rFonts w:ascii="Calibri" w:hAnsi="Calibri" w:cs="Calibri"/>
@@ -23833,7 +23857,7 @@
         </w:rPr>
         <w:t xml:space="preserve"> Baseline. One fingerprinted authority and renderer now serve homepage merchandising, collection/results, related products, and legacy compatibility. Five meaningful anatomies preserve canonical facts and P10B-04 media lineage through plan, proposal, snapshot, save/reload, publish, and responsive browser evidence. See </w:t>
       </w:r>
-      <w:hyperlink r:id="rIdHyperlink30" w:history="1">
+      <w:hyperlink r:id="rIdHyperlink31" w:history="1">
         <w:r>
           <w:rPr>
             <w:rFonts w:ascii="Calibri" w:hAnsi="Calibri" w:cs="Calibri"/>
@@ -24050,7 +24074,7 @@
         </w:rPr>
         <w:t xml:space="preserve"> Baseline. Six versioned, structurally fingerprinted homepage PageBlueprint profiles compose current shared-frame, commercial storytelling, canonical product-card, approved-media, and Design DNA authority. Evidence/cardinality guards fail closed; deterministic lifecycle and 24 retained four-width browser images pass. See </w:t>
       </w:r>
-      <w:hyperlink r:id="rIdHyperlink31" w:history="1">
+      <w:hyperlink r:id="rIdHyperlink32" w:history="1">
         <w:r>
           <w:rPr>
             <w:rFonts w:ascii="Calibri" w:hAnsi="Calibri" w:cs="Calibri"/>
@@ -24281,7 +24305,7 @@
         </w:rPr>
         <w:t xml:space="preserve"> anatomy, P10B-08 canonical card anatomy, and P10B-04 approved media treatment. Exact canonical catalogue bindings preserve product membership/order, facts, product media, filters/sort state, and child-collection order. Campaign media is approved collection/editorial media, not a product-media replacement. A transient revision-checked zero-result context keeps the query without fabricating products. Deterministic lifecycle and 16-view Chromium evidence pass with zero provider calls. See </w:t>
       </w:r>
-      <w:hyperlink r:id="rIdHyperlink32" w:history="1">
+      <w:hyperlink r:id="rIdHyperlink33" w:history="1">
         <w:r>
           <w:rPr>
             <w:rFonts w:ascii="Calibri" w:hAnsi="Calibri" w:cs="Calibri"/>
@@ -24811,7 +24835,7 @@
         </w:rPr>
         <w:t xml:space="preserve">. Fifteen structurally distinct registered profiles resolve exact current approved brief evidence into strict localized fact documents. P10B-05 preserves page-set, route, locale, and transitive navigation authority; P10B-06 frames and P10B-07 editorial/campaign renderers are reused. Snapshot save/reload and deterministic publication preserve the exact document. See </w:t>
       </w:r>
-      <w:hyperlink r:id="rIdHyperlink33" w:history="1">
+      <w:hyperlink r:id="rIdHyperlink34" w:history="1">
         <w:r>
           <w:rPr>
             <w:rFonts w:ascii="Calibri" w:hAnsi="Calibri" w:cs="Calibri"/>
@@ -25022,7 +25046,7 @@
         </w:rPr>
         <w:t xml:space="preserve"> component through the P10B-05 family page; registered loading state renders on its pending route instead of replacing the 404 singleton. Read-only runtime state supplies canonical cart facts, checkout continuation, P10B-10 query/filter context, and bounded recovery actions while the snapshot preserves presentation only. Shared-frame/Design DNA, save/reload, publication, four- width browser evidence, and no-provider behavior are covered under </w:t>
       </w:r>
-      <w:hyperlink r:id="rIdHyperlink34" w:history="1">
+      <w:hyperlink r:id="rIdHyperlink35" w:history="1">
         <w:r>
           <w:rPr>
             <w:rFonts w:ascii="Calibri" w:hAnsi="Calibri" w:cs="Calibri"/>
@@ -25233,7 +25257,7 @@
         </w:rPr>
         <w:t xml:space="preserve"> frame span all pages; simple/configurable PDP, factual content, utility states, 15 four-width/representative screenshots and the passing 160-scenario human record are retained in </w:t>
       </w:r>
-      <w:hyperlink r:id="rIdHyperlink35" w:history="1">
+      <w:hyperlink r:id="rIdHyperlink36" w:history="1">
         <w:r>
           <w:rPr>
             <w:rFonts w:ascii="Calibri" w:hAnsi="Calibri" w:cs="Calibri"/>
@@ -25444,7 +25468,7 @@
         </w:rPr>
         <w:t xml:space="preserve"> One versioned deterministic synthesis contract binds exact merchant, evidence, commerce, asset, Design DNA, site-map, frame, PageBlueprint/profile, component/anatomy, narrative, density, art-direction, responsive, planner, registry and recipe authority. The same approved fixture produces editorial-heavy, commerce/discovery-heavy and restrained/minimal complete 17-route stores through the existing whole-storefront proposal, snapshot, save/reload, renderer and immutable publication chain. Details are retained in </w:t>
       </w:r>
-      <w:hyperlink r:id="rIdHyperlink36" w:history="1">
+      <w:hyperlink r:id="rIdHyperlink37" w:history="1">
         <w:r>
           <w:rPr>
             <w:rFonts w:ascii="Calibri" w:hAnsi="Calibri" w:cs="Calibri"/>
@@ -25689,7 +25713,7 @@
         </w:rPr>
         <w:t xml:space="preserve"> 31 focused unit/integration cases; nine representative complete outcomes; exact save/reload and compiled publication; protected commerce/evidence/media parity; dedicated 375/768/1024/1440 browser coverage; three retained human commercial reviews and one exact evidence manifest. See </w:t>
       </w:r>
-      <w:hyperlink r:id="rIdHyperlink37" w:history="1">
+      <w:hyperlink r:id="rIdHyperlink38" w:history="1">
         <w:r>
           <w:rPr>
             <w:rFonts w:ascii="Calibri" w:hAnsi="Calibri" w:cs="Calibri"/>
@@ -25866,7 +25890,7 @@
         </w:rPr>
         <w:t xml:space="preserve"> A compact route inventory, four collection/search archetypes, four maintained PDP profiles plus generic fallback, exact collection and product-type mappings, bounded matching rules, transient editor/runtime projection, deterministic legacy convergence, and complete snapshot/lifecycle/publication preservation. Exact primary and related-product bindings survive convergence. A server-owned, storefront-scoped proposal transition binds legacy and reviewed canonical projections for deterministic acceptance replay. Storefront Studio lists archetypes rather than one page per commerce URL; representative context is not persisted. See </w:t>
       </w:r>
-      <w:hyperlink r:id="rIdHyperlink38" w:history="1">
+      <w:hyperlink r:id="rIdHyperlink39" w:history="1">
         <w:r>
           <w:rPr>
             <w:rFonts w:ascii="Calibri" w:hAnsi="Calibri" w:cs="Calibri"/>
@@ -26334,7 +26358,7 @@
         </w:rPr>
         <w:t xml:space="preserve"> </w:t>
       </w:r>
-      <w:hyperlink r:id="rIdHyperlink39" w:history="1">
+      <w:hyperlink r:id="rIdHyperlink40" w:history="1">
         <w:r>
           <w:rPr>
             <w:rFonts w:ascii="Calibri" w:hAnsi="Calibri" w:cs="Calibri"/>
@@ -26795,7 +26819,7 @@
         </w:rPr>
         <w:t xml:space="preserve">. Completed 15 August 2026; see </w:t>
       </w:r>
-      <w:hyperlink r:id="rIdHyperlink22" w:history="1">
+      <w:hyperlink r:id="rIdHyperlink23" w:history="1">
         <w:r>
           <w:rPr>
             <w:rFonts w:ascii="Calibri" w:hAnsi="Calibri" w:cs="Calibri"/>
@@ -28057,7 +28081,7 @@
         </w:rPr>
         <w:t xml:space="preserve">. Accepted by the product owner on 16 August 2026 under </w:t>
       </w:r>
-      <w:hyperlink r:id="rIdHyperlink40" w:history="1">
+      <w:hyperlink r:id="rIdHyperlink41" w:history="1">
         <w:r>
           <w:rPr>
             <w:rFonts w:ascii="Calibri" w:hAnsi="Calibri" w:cs="Calibri"/>
@@ -28415,7 +28439,7 @@
         </w:rPr>
         <w:t xml:space="preserve">. Accepted by the product owner on 17 August 2026 under </w:t>
       </w:r>
-      <w:hyperlink r:id="rIdHyperlink40" w:history="1">
+      <w:hyperlink r:id="rIdHyperlink41" w:history="1">
         <w:r>
           <w:rPr>
             <w:rFonts w:ascii="Calibri" w:hAnsi="Calibri" w:cs="Calibri"/>
@@ -31555,7 +31579,7 @@
         </w:rPr>
         <w:t xml:space="preserve"> </w:t>
       </w:r>
-      <w:hyperlink r:id="rIdHyperlink41" w:history="1">
+      <w:hyperlink r:id="rIdHyperlink42" w:history="1">
         <w:r>
           <w:rPr>
             <w:rFonts w:ascii="Calibri" w:hAnsi="Calibri" w:cs="Calibri"/>
@@ -31571,7 +31595,7 @@
         </w:rPr>
         <w:t xml:space="preserve"> and </w:t>
       </w:r>
-      <w:hyperlink r:id="rIdHyperlink42" w:history="1">
+      <w:hyperlink r:id="rIdHyperlink43" w:history="1">
         <w:r>
           <w:rPr>
             <w:rFonts w:ascii="Calibri" w:hAnsi="Calibri" w:cs="Calibri"/>

</xml_diff>

<commit_message>
refactor: isolate dynamic-commerce presentation support
</commit_message>
<xml_diff>
--- a/docs/VESKIFY_DEVELOPMENT_DELIVERY_TRACKER_v1.3.0.docx
+++ b/docs/VESKIFY_DEVELOPMENT_DELIVERY_TRACKER_v1.3.0.docx
@@ -51,7 +51,7 @@
         <w:rPr>
           <w:rFonts w:ascii="Calibri" w:hAnsi="Calibri" w:cs="Calibri"/>
         </w:rPr>
-        <w:t>Effective upon explicit AR-02H acceptance/merge: AR-02A through AR-02H and AR-03A Baseline / closed; AR-02 and AR-03 Partial; AR-23 eligible / unstarted; BATCH-04 complete; no next child selected</w:t>
+        <w:t>Effective upon explicit AR-03B acceptance/merge: AR-02A through AR-02H and AR-03A/AR-03B Baseline / closed; AR-02 and AR-03 Partial; AR-23 eligible / unstarted; BATCH-04 complete; AR-03C next only after B merge and safe synchronization</w:t>
       </w:r>
     </w:p>
     <w:p>
@@ -118,7 +118,7 @@
           <w:b/>
           <w:bCs/>
         </w:rPr>
-        <w:t>Candidate status effective upon explicit owner acceptance/merge of AR-02H:</w:t>
+        <w:t>Candidate status effective upon explicit owner acceptance/merge of AR-03B:</w:t>
       </w:r>
       <w:r>
         <w:rPr>
@@ -272,54 +272,68 @@
           <w:b/>
           <w:bCs/>
         </w:rPr>
+        <w:t>Baseline / closed.</w:t>
+      </w:r>
+      <w:r>
+        <w:rPr>
+          <w:rFonts w:ascii="Calibri" w:hAnsi="Calibri" w:cs="Calibri"/>
+        </w:rPr>
+        <w:t xml:space="preserve"> AR-02 is </w:t>
+      </w:r>
+      <w:r>
+        <w:rPr>
+          <w:rFonts w:ascii="Calibri" w:hAnsi="Calibri" w:cs="Calibri"/>
+          <w:b/>
+          <w:bCs/>
+        </w:rPr>
+        <w:t>Partial</w:t>
+      </w:r>
+      <w:r>
+        <w:rPr>
+          <w:rFonts w:ascii="Calibri" w:hAnsi="Calibri" w:cs="Calibri"/>
+        </w:rPr>
+        <w:t xml:space="preserve">; remaining consumer/materializer isolation remains. AR-03 is </w:t>
+      </w:r>
+      <w:r>
+        <w:rPr>
+          <w:rFonts w:ascii="Calibri" w:hAnsi="Calibri" w:cs="Calibri"/>
+          <w:b/>
+          <w:bCs/>
+        </w:rPr>
+        <w:t>Partial</w:t>
+      </w:r>
+      <w:r>
+        <w:rPr>
+          <w:rFonts w:ascii="Calibri" w:hAnsi="Calibri" w:cs="Calibri"/>
+        </w:rPr>
+        <w:t xml:space="preserve">; route resolution, editor, migration, and expand/fold isolation remain. AR-03A is </w:t>
+      </w:r>
+      <w:r>
+        <w:rPr>
+          <w:rFonts w:ascii="Calibri" w:hAnsi="Calibri" w:cs="Calibri"/>
+          <w:b/>
+          <w:bCs/>
+        </w:rPr>
+        <w:t>Baseline / closed.</w:t>
+      </w:r>
+      <w:r>
+        <w:rPr>
+          <w:rFonts w:ascii="Calibri" w:hAnsi="Calibri" w:cs="Calibri"/>
+        </w:rPr>
+        <w:t xml:space="preserve"> AR-03B is </w:t>
+      </w:r>
+      <w:r>
+        <w:rPr>
+          <w:rFonts w:ascii="Calibri" w:hAnsi="Calibri" w:cs="Calibri"/>
+          <w:b/>
+          <w:bCs/>
+        </w:rPr>
         <w:t>Baseline / closed upon explicit owner acceptance/merge.</w:t>
       </w:r>
       <w:r>
         <w:rPr>
           <w:rFonts w:ascii="Calibri" w:hAnsi="Calibri" w:cs="Calibri"/>
         </w:rPr>
-        <w:t xml:space="preserve"> AR-02 is </w:t>
-      </w:r>
-      <w:r>
-        <w:rPr>
-          <w:rFonts w:ascii="Calibri" w:hAnsi="Calibri" w:cs="Calibri"/>
-          <w:b/>
-          <w:bCs/>
-        </w:rPr>
-        <w:t>Partial</w:t>
-      </w:r>
-      <w:r>
-        <w:rPr>
-          <w:rFonts w:ascii="Calibri" w:hAnsi="Calibri" w:cs="Calibri"/>
-        </w:rPr>
-        <w:t xml:space="preserve">; remaining consumer/materializer isolation remains. AR-03 is </w:t>
-      </w:r>
-      <w:r>
-        <w:rPr>
-          <w:rFonts w:ascii="Calibri" w:hAnsi="Calibri" w:cs="Calibri"/>
-          <w:b/>
-          <w:bCs/>
-        </w:rPr>
-        <w:t>Partial</w:t>
-      </w:r>
-      <w:r>
-        <w:rPr>
-          <w:rFonts w:ascii="Calibri" w:hAnsi="Calibri" w:cs="Calibri"/>
-        </w:rPr>
-        <w:t xml:space="preserve">; route resolution, editor, migration, and expand/fold isolation remain. AR-03A is </w:t>
-      </w:r>
-      <w:r>
-        <w:rPr>
-          <w:rFonts w:ascii="Calibri" w:hAnsi="Calibri" w:cs="Calibri"/>
-          <w:b/>
-          <w:bCs/>
-        </w:rPr>
-        <w:t>Baseline / closed.</w:t>
-      </w:r>
-      <w:r>
-        <w:rPr>
-          <w:rFonts w:ascii="Calibri" w:hAnsi="Calibri" w:cs="Calibri"/>
-        </w:rPr>
         <w:t xml:space="preserve"> AR-23 is </w:t>
       </w:r>
       <w:r>
@@ -334,7 +348,7 @@
         <w:rPr>
           <w:rFonts w:ascii="Calibri" w:hAnsi="Calibri" w:cs="Calibri"/>
         </w:rPr>
-        <w:t xml:space="preserve">. AR-23 depends on AR-01 and is not serialized behind visual work. BATCH-03 is complete. BATCH-04 is complete upon H acceptance/merge. No next reset task is selected. This tracker owns current status; the roadmap owns dependency order. Retained B01 exact-next, fixed-two-call/mandatory-three-concept, transient-only, and 73-child future-sequence statements are </w:t>
+        <w:t xml:space="preserve">. AR-23 depends on AR-01 and is not serialized behind visual work. BATCH-03 is complete. BATCH-04 is complete. AR-03C is the sole next task after AR-03B acceptance/merge and safe main synchronization. BATCH-05 selects no third task. This tracker owns current status; the roadmap owns dependency order. Retained B01 exact-next, fixed-two-call/mandatory-three-concept, transient-only, and 73-child future-sequence statements are </w:t>
       </w:r>
       <w:r>
         <w:rPr>
@@ -871,7 +885,7 @@
               <w:rPr>
                 <w:rFonts w:ascii="Calibri" w:hAnsi="Calibri" w:cs="Calibri"/>
               </w:rPr>
-              <w:t>Status effective on AR-02H acceptance/merge</w:t>
+              <w:t>Status effective on AR-03B acceptance/merge</w:t>
             </w:r>
           </w:p>
         </w:tc>
@@ -1789,6 +1803,111 @@
               <w:t xml:space="preserve">, </w:t>
             </w:r>
             <w:hyperlink r:id="rIdHyperlink20" w:history="1">
+              <w:r>
+                <w:rPr>
+                  <w:rFonts w:ascii="Calibri" w:hAnsi="Calibri" w:cs="Calibri"/>
+                  <w:color w:val="2E74B5"/>
+                  <w:u w:val="single"/>
+                </w:rPr>
+                <w:t>report</w:t>
+              </w:r>
+            </w:hyperlink>
+          </w:p>
+        </w:tc>
+        <w:tc>
+          <w:tcPr>
+            <w:tcW w:w="8460" w:type="dxa"/>
+            <w:vAlign w:val="center"/>
+          </w:tcPr>
+          <w:p>
+            <w:pPr>
+              <w:pStyle w:val="TableText"/>
+              <w:widowControl/>
+            </w:pPr>
+            <w:r>
+              <w:rPr>
+                <w:rFonts w:ascii="Calibri" w:hAnsi="Calibri" w:cs="Calibri"/>
+                <w:b/>
+                <w:bCs/>
+              </w:rPr>
+              <w:t>Baseline / closed</w:t>
+            </w:r>
+          </w:p>
+        </w:tc>
+      </w:tr>
+      <w:tr>
+        <w:trPr>
+          <w:cantSplit/>
+        </w:trPr>
+        <w:tc>
+          <w:tcPr>
+            <w:tcW w:w="1000" w:type="dxa"/>
+            <w:vAlign w:val="center"/>
+          </w:tcPr>
+          <w:p>
+            <w:pPr>
+              <w:pStyle w:val="TableText"/>
+              <w:widowControl/>
+            </w:pPr>
+            <w:r>
+              <w:rPr>
+                <w:rFonts w:ascii="Calibri" w:hAnsi="Calibri" w:cs="Calibri"/>
+              </w:rPr>
+              <w:t>AR-03B</w:t>
+            </w:r>
+          </w:p>
+        </w:tc>
+        <w:tc>
+          <w:tcPr>
+            <w:tcW w:w="1500" w:type="dxa"/>
+            <w:vAlign w:val="center"/>
+          </w:tcPr>
+          <w:p>
+            <w:pPr>
+              <w:pStyle w:val="TableText"/>
+              <w:widowControl/>
+            </w:pPr>
+            <w:r>
+              <w:rPr>
+                <w:rFonts w:ascii="Calibri" w:hAnsi="Calibri" w:cs="Calibri"/>
+              </w:rPr>
+              <w:t>AR-03</w:t>
+            </w:r>
+          </w:p>
+        </w:tc>
+        <w:tc>
+          <w:tcPr>
+            <w:tcW w:w="2000" w:type="dxa"/>
+            <w:vAlign w:val="center"/>
+          </w:tcPr>
+          <w:p>
+            <w:pPr>
+              <w:pStyle w:val="TableText"/>
+              <w:widowControl/>
+            </w:pPr>
+            <w:r>
+              <w:rPr>
+                <w:rFonts w:ascii="Calibri" w:hAnsi="Calibri" w:cs="Calibri"/>
+              </w:rPr>
+              <w:t xml:space="preserve">Renderer-free presentation construction and exact historical compatibility; </w:t>
+            </w:r>
+            <w:hyperlink r:id="rIdHyperlink21" w:history="1">
+              <w:r>
+                <w:rPr>
+                  <w:rFonts w:ascii="Calibri" w:hAnsi="Calibri" w:cs="Calibri"/>
+                  <w:color w:val="2E74B5"/>
+                  <w:u w:val="single"/>
+                </w:rPr>
+                <w:t>contract</w:t>
+              </w:r>
+            </w:hyperlink>
+            <w:r>
+              <w:rPr>
+                <w:rFonts w:ascii="Calibri" w:hAnsi="Calibri" w:cs="Calibri"/>
+              </w:rPr>
+              <w:t xml:space="preserve">, </w:t>
+            </w:r>
+            <w:hyperlink r:id="rIdHyperlink22" w:history="1">
               <w:r>
                 <w:rPr>
                   <w:rFonts w:ascii="Calibri" w:hAnsi="Calibri" w:cs="Calibri"/>
@@ -21758,7 +21877,7 @@
         </w:rPr>
         <w:t xml:space="preserve">. Completed 7 August 2026; see </w:t>
       </w:r>
-      <w:hyperlink r:id="rIdHyperlink21" w:history="1">
+      <w:hyperlink r:id="rIdHyperlink23" w:history="1">
         <w:r>
           <w:rPr>
             <w:rFonts w:ascii="Calibri" w:hAnsi="Calibri" w:cs="Calibri"/>
@@ -21895,7 +22014,7 @@
         </w:rPr>
         <w:t xml:space="preserve">The binding details and minimum coverage are in </w:t>
       </w:r>
-      <w:hyperlink r:id="rIdHyperlink22" w:history="1">
+      <w:hyperlink r:id="rIdHyperlink24" w:history="1">
         <w:r>
           <w:rPr>
             <w:rFonts w:ascii="Calibri" w:hAnsi="Calibri" w:cs="Calibri"/>
@@ -22093,7 +22212,7 @@
         </w:rPr>
         <w:t xml:space="preserve">. P10B-16P-04 acceptance evidence is retained in </w:t>
       </w:r>
-      <w:hyperlink r:id="rIdHyperlink23" w:history="1">
+      <w:hyperlink r:id="rIdHyperlink25" w:history="1">
         <w:r>
           <w:rPr>
             <w:rFonts w:ascii="Calibri" w:hAnsi="Calibri" w:cs="Calibri"/>
@@ -22342,7 +22461,7 @@
         </w:rPr>
         <w:t xml:space="preserve">. See </w:t>
       </w:r>
-      <w:hyperlink r:id="rIdHyperlink24" w:history="1">
+      <w:hyperlink r:id="rIdHyperlink26" w:history="1">
         <w:r>
           <w:rPr>
             <w:rFonts w:ascii="Calibri" w:hAnsi="Calibri" w:cs="Calibri"/>
@@ -22591,7 +22710,7 @@
         </w:rPr>
         <w:t xml:space="preserve">. See </w:t>
       </w:r>
-      <w:hyperlink r:id="rIdHyperlink25" w:history="1">
+      <w:hyperlink r:id="rIdHyperlink27" w:history="1">
         <w:r>
           <w:rPr>
             <w:rFonts w:ascii="Calibri" w:hAnsi="Calibri" w:cs="Calibri"/>
@@ -22840,7 +22959,7 @@
         </w:rPr>
         <w:t xml:space="preserve">. At P10B-03 delivery, all then-current 25 V2 definitions and 91 variants were classified explicitly without false commercial-ready promotion. Later family tasks extend that same authority rather than replacing it. See </w:t>
       </w:r>
-      <w:hyperlink r:id="rIdHyperlink26" w:history="1">
+      <w:hyperlink r:id="rIdHyperlink28" w:history="1">
         <w:r>
           <w:rPr>
             <w:rFonts w:ascii="Calibri" w:hAnsi="Calibri" w:cs="Calibri"/>
@@ -23089,7 +23208,7 @@
         </w:rPr>
         <w:t xml:space="preserve"> embeds exact lineage and bounded treatment in the existing approved presentation, consumes Design DNA and registered anatomy, projects protected same-product media, preserves authority through lifecycle/compiler boundaries, and renders semantic four-breakpoint evidence. Production CDN transforms and retained commercial visual acceptance remain deferred. See </w:t>
       </w:r>
-      <w:hyperlink r:id="rIdHyperlink27" w:history="1">
+      <w:hyperlink r:id="rIdHyperlink29" w:history="1">
         <w:r>
           <w:rPr>
             <w:rFonts w:ascii="Calibri" w:hAnsi="Calibri" w:cs="Calibri"/>
@@ -23338,7 +23457,7 @@
         </w:rPr>
         <w:t xml:space="preserve">. See </w:t>
       </w:r>
-      <w:hyperlink r:id="rIdHyperlink28" w:history="1">
+      <w:hyperlink r:id="rIdHyperlink30" w:history="1">
         <w:r>
           <w:rPr>
             <w:rFonts w:ascii="Calibri" w:hAnsi="Calibri" w:cs="Calibri"/>
@@ -23573,7 +23692,7 @@
         </w:rPr>
         <w:t xml:space="preserve">. Four exact root-frame profiles, three mobile modes, and four footer compositions preserve canonical navigation and frame identity through snapshot, save/reload, Puck root, preview, publication compilation, EN/FI, and 375/768/1024/1440 px evidence. See </w:t>
       </w:r>
-      <w:hyperlink r:id="rIdHyperlink29" w:history="1">
+      <w:hyperlink r:id="rIdHyperlink31" w:history="1">
         <w:r>
           <w:rPr>
             <w:rFonts w:ascii="Calibri" w:hAnsi="Calibri" w:cs="Calibri"/>
@@ -23808,7 +23927,7 @@
         </w:rPr>
         <w:t xml:space="preserve">. Six meaningful hero anatomies, five editorial/story anatomies, five campaign/promotion anatomies and three evidence-grounded proof/service anatomies are registered, PageBlueprint-selectable, deterministically generated, snapshot/publish preserved and rendered through one shared implementation. Focused deterministic coverage and a zero-provider Chromium scenario retain evidence at 375, 768, 1024 and 1440 px. See </w:t>
       </w:r>
-      <w:hyperlink r:id="rIdHyperlink30" w:history="1">
+      <w:hyperlink r:id="rIdHyperlink32" w:history="1">
         <w:r>
           <w:rPr>
             <w:rFonts w:ascii="Calibri" w:hAnsi="Calibri" w:cs="Calibri"/>
@@ -23857,7 +23976,7 @@
         </w:rPr>
         <w:t xml:space="preserve"> Baseline. One fingerprinted authority and renderer now serve homepage merchandising, collection/results, related products, and legacy compatibility. Five meaningful anatomies preserve canonical facts and P10B-04 media lineage through plan, proposal, snapshot, save/reload, publish, and responsive browser evidence. See </w:t>
       </w:r>
-      <w:hyperlink r:id="rIdHyperlink31" w:history="1">
+      <w:hyperlink r:id="rIdHyperlink33" w:history="1">
         <w:r>
           <w:rPr>
             <w:rFonts w:ascii="Calibri" w:hAnsi="Calibri" w:cs="Calibri"/>
@@ -24074,7 +24193,7 @@
         </w:rPr>
         <w:t xml:space="preserve"> Baseline. Six versioned, structurally fingerprinted homepage PageBlueprint profiles compose current shared-frame, commercial storytelling, canonical product-card, approved-media, and Design DNA authority. Evidence/cardinality guards fail closed; deterministic lifecycle and 24 retained four-width browser images pass. See </w:t>
       </w:r>
-      <w:hyperlink r:id="rIdHyperlink32" w:history="1">
+      <w:hyperlink r:id="rIdHyperlink34" w:history="1">
         <w:r>
           <w:rPr>
             <w:rFonts w:ascii="Calibri" w:hAnsi="Calibri" w:cs="Calibri"/>
@@ -24305,7 +24424,7 @@
         </w:rPr>
         <w:t xml:space="preserve"> anatomy, P10B-08 canonical card anatomy, and P10B-04 approved media treatment. Exact canonical catalogue bindings preserve product membership/order, facts, product media, filters/sort state, and child-collection order. Campaign media is approved collection/editorial media, not a product-media replacement. A transient revision-checked zero-result context keeps the query without fabricating products. Deterministic lifecycle and 16-view Chromium evidence pass with zero provider calls. See </w:t>
       </w:r>
-      <w:hyperlink r:id="rIdHyperlink33" w:history="1">
+      <w:hyperlink r:id="rIdHyperlink35" w:history="1">
         <w:r>
           <w:rPr>
             <w:rFonts w:ascii="Calibri" w:hAnsi="Calibri" w:cs="Calibri"/>
@@ -24835,7 +24954,7 @@
         </w:rPr>
         <w:t xml:space="preserve">. Fifteen structurally distinct registered profiles resolve exact current approved brief evidence into strict localized fact documents. P10B-05 preserves page-set, route, locale, and transitive navigation authority; P10B-06 frames and P10B-07 editorial/campaign renderers are reused. Snapshot save/reload and deterministic publication preserve the exact document. See </w:t>
       </w:r>
-      <w:hyperlink r:id="rIdHyperlink34" w:history="1">
+      <w:hyperlink r:id="rIdHyperlink36" w:history="1">
         <w:r>
           <w:rPr>
             <w:rFonts w:ascii="Calibri" w:hAnsi="Calibri" w:cs="Calibri"/>
@@ -25046,7 +25165,7 @@
         </w:rPr>
         <w:t xml:space="preserve"> component through the P10B-05 family page; registered loading state renders on its pending route instead of replacing the 404 singleton. Read-only runtime state supplies canonical cart facts, checkout continuation, P10B-10 query/filter context, and bounded recovery actions while the snapshot preserves presentation only. Shared-frame/Design DNA, save/reload, publication, four- width browser evidence, and no-provider behavior are covered under </w:t>
       </w:r>
-      <w:hyperlink r:id="rIdHyperlink35" w:history="1">
+      <w:hyperlink r:id="rIdHyperlink37" w:history="1">
         <w:r>
           <w:rPr>
             <w:rFonts w:ascii="Calibri" w:hAnsi="Calibri" w:cs="Calibri"/>
@@ -25257,7 +25376,7 @@
         </w:rPr>
         <w:t xml:space="preserve"> frame span all pages; simple/configurable PDP, factual content, utility states, 15 four-width/representative screenshots and the passing 160-scenario human record are retained in </w:t>
       </w:r>
-      <w:hyperlink r:id="rIdHyperlink36" w:history="1">
+      <w:hyperlink r:id="rIdHyperlink38" w:history="1">
         <w:r>
           <w:rPr>
             <w:rFonts w:ascii="Calibri" w:hAnsi="Calibri" w:cs="Calibri"/>
@@ -25468,7 +25587,7 @@
         </w:rPr>
         <w:t xml:space="preserve"> One versioned deterministic synthesis contract binds exact merchant, evidence, commerce, asset, Design DNA, site-map, frame, PageBlueprint/profile, component/anatomy, narrative, density, art-direction, responsive, planner, registry and recipe authority. The same approved fixture produces editorial-heavy, commerce/discovery-heavy and restrained/minimal complete 17-route stores through the existing whole-storefront proposal, snapshot, save/reload, renderer and immutable publication chain. Details are retained in </w:t>
       </w:r>
-      <w:hyperlink r:id="rIdHyperlink37" w:history="1">
+      <w:hyperlink r:id="rIdHyperlink39" w:history="1">
         <w:r>
           <w:rPr>
             <w:rFonts w:ascii="Calibri" w:hAnsi="Calibri" w:cs="Calibri"/>
@@ -25713,7 +25832,7 @@
         </w:rPr>
         <w:t xml:space="preserve"> 31 focused unit/integration cases; nine representative complete outcomes; exact save/reload and compiled publication; protected commerce/evidence/media parity; dedicated 375/768/1024/1440 browser coverage; three retained human commercial reviews and one exact evidence manifest. See </w:t>
       </w:r>
-      <w:hyperlink r:id="rIdHyperlink38" w:history="1">
+      <w:hyperlink r:id="rIdHyperlink40" w:history="1">
         <w:r>
           <w:rPr>
             <w:rFonts w:ascii="Calibri" w:hAnsi="Calibri" w:cs="Calibri"/>
@@ -25890,7 +26009,7 @@
         </w:rPr>
         <w:t xml:space="preserve"> A compact route inventory, four collection/search archetypes, four maintained PDP profiles plus generic fallback, exact collection and product-type mappings, bounded matching rules, transient editor/runtime projection, deterministic legacy convergence, and complete snapshot/lifecycle/publication preservation. Exact primary and related-product bindings survive convergence. A server-owned, storefront-scoped proposal transition binds legacy and reviewed canonical projections for deterministic acceptance replay. Storefront Studio lists archetypes rather than one page per commerce URL; representative context is not persisted. See </w:t>
       </w:r>
-      <w:hyperlink r:id="rIdHyperlink39" w:history="1">
+      <w:hyperlink r:id="rIdHyperlink41" w:history="1">
         <w:r>
           <w:rPr>
             <w:rFonts w:ascii="Calibri" w:hAnsi="Calibri" w:cs="Calibri"/>
@@ -26358,7 +26477,7 @@
         </w:rPr>
         <w:t xml:space="preserve"> </w:t>
       </w:r>
-      <w:hyperlink r:id="rIdHyperlink40" w:history="1">
+      <w:hyperlink r:id="rIdHyperlink42" w:history="1">
         <w:r>
           <w:rPr>
             <w:rFonts w:ascii="Calibri" w:hAnsi="Calibri" w:cs="Calibri"/>
@@ -26819,7 +26938,7 @@
         </w:rPr>
         <w:t xml:space="preserve">. Completed 15 August 2026; see </w:t>
       </w:r>
-      <w:hyperlink r:id="rIdHyperlink23" w:history="1">
+      <w:hyperlink r:id="rIdHyperlink25" w:history="1">
         <w:r>
           <w:rPr>
             <w:rFonts w:ascii="Calibri" w:hAnsi="Calibri" w:cs="Calibri"/>
@@ -28081,7 +28200,7 @@
         </w:rPr>
         <w:t xml:space="preserve">. Accepted by the product owner on 16 August 2026 under </w:t>
       </w:r>
-      <w:hyperlink r:id="rIdHyperlink41" w:history="1">
+      <w:hyperlink r:id="rIdHyperlink43" w:history="1">
         <w:r>
           <w:rPr>
             <w:rFonts w:ascii="Calibri" w:hAnsi="Calibri" w:cs="Calibri"/>
@@ -28439,7 +28558,7 @@
         </w:rPr>
         <w:t xml:space="preserve">. Accepted by the product owner on 17 August 2026 under </w:t>
       </w:r>
-      <w:hyperlink r:id="rIdHyperlink41" w:history="1">
+      <w:hyperlink r:id="rIdHyperlink43" w:history="1">
         <w:r>
           <w:rPr>
             <w:rFonts w:ascii="Calibri" w:hAnsi="Calibri" w:cs="Calibri"/>
@@ -31579,7 +31698,7 @@
         </w:rPr>
         <w:t xml:space="preserve"> </w:t>
       </w:r>
-      <w:hyperlink r:id="rIdHyperlink42" w:history="1">
+      <w:hyperlink r:id="rIdHyperlink44" w:history="1">
         <w:r>
           <w:rPr>
             <w:rFonts w:ascii="Calibri" w:hAnsi="Calibri" w:cs="Calibri"/>
@@ -31595,7 +31714,7 @@
         </w:rPr>
         <w:t xml:space="preserve"> and </w:t>
       </w:r>
-      <w:hyperlink r:id="rIdHyperlink43" w:history="1">
+      <w:hyperlink r:id="rIdHyperlink45" w:history="1">
         <w:r>
           <w:rPr>
             <w:rFonts w:ascii="Calibri" w:hAnsi="Calibri" w:cs="Calibri"/>

</xml_diff>

<commit_message>
refactor: isolate dynamic-commerce route resolution (AR-03C)
</commit_message>
<xml_diff>
--- a/docs/VESKIFY_DEVELOPMENT_DELIVERY_TRACKER_v1.3.0.docx
+++ b/docs/VESKIFY_DEVELOPMENT_DELIVERY_TRACKER_v1.3.0.docx
@@ -51,7 +51,7 @@
         <w:rPr>
           <w:rFonts w:ascii="Calibri" w:hAnsi="Calibri" w:cs="Calibri"/>
         </w:rPr>
-        <w:t>Effective upon explicit AR-03B acceptance/merge: AR-02A through AR-02H and AR-03A/AR-03B Baseline / closed; AR-02 and AR-03 Partial; AR-23 eligible / unstarted; BATCH-04 complete; AR-03C next only after B merge and safe synchronization</w:t>
+        <w:t>Effective upon explicit AR-03C acceptance/merge: AR-02A through AR-02H and AR-03A/AR-03B/AR-03C Baseline / closed; AR-02 and AR-03 Partial; AR-23 eligible / unstarted; BATCH-04 complete; BATCH-05 complete upon C merge and safe closeout; no next child selected</w:t>
       </w:r>
     </w:p>
     <w:p>
@@ -118,7 +118,7 @@
           <w:b/>
           <w:bCs/>
         </w:rPr>
-        <w:t>Candidate status effective upon explicit owner acceptance/merge of AR-03B:</w:t>
+        <w:t>Candidate status effective upon explicit owner acceptance/merge of AR-03C:</w:t>
       </w:r>
       <w:r>
         <w:rPr>
@@ -306,7 +306,7 @@
         <w:rPr>
           <w:rFonts w:ascii="Calibri" w:hAnsi="Calibri" w:cs="Calibri"/>
         </w:rPr>
-        <w:t xml:space="preserve">; route resolution, editor, migration, and expand/fold isolation remain. AR-03A is </w:t>
+        <w:t xml:space="preserve">; runtime validation/projection/resolution are isolated; editor, migration, and expand/fold isolation remain. AR-03A is </w:t>
       </w:r>
       <w:r>
         <w:rPr>
@@ -328,6 +328,20 @@
           <w:b/>
           <w:bCs/>
         </w:rPr>
+        <w:t>Baseline / closed.</w:t>
+      </w:r>
+      <w:r>
+        <w:rPr>
+          <w:rFonts w:ascii="Calibri" w:hAnsi="Calibri" w:cs="Calibri"/>
+        </w:rPr>
+        <w:t xml:space="preserve"> AR-03C is </w:t>
+      </w:r>
+      <w:r>
+        <w:rPr>
+          <w:rFonts w:ascii="Calibri" w:hAnsi="Calibri" w:cs="Calibri"/>
+          <w:b/>
+          <w:bCs/>
+        </w:rPr>
         <w:t>Baseline / closed upon explicit owner acceptance/merge.</w:t>
       </w:r>
       <w:r>
@@ -348,7 +362,7 @@
         <w:rPr>
           <w:rFonts w:ascii="Calibri" w:hAnsi="Calibri" w:cs="Calibri"/>
         </w:rPr>
-        <w:t xml:space="preserve">. AR-23 depends on AR-01 and is not serialized behind visual work. BATCH-03 is complete. BATCH-04 is complete. AR-03C is the sole next task after AR-03B acceptance/merge and safe main synchronization. BATCH-05 selects no third task. This tracker owns current status; the roadmap owns dependency order. Retained B01 exact-next, fixed-two-call/mandatory-three-concept, transient-only, and 73-child future-sequence statements are </w:t>
+        <w:t xml:space="preserve">. AR-23 depends on AR-01 and is not serialized behind visual work. BATCH-03 is complete. BATCH-04 is complete. BATCH-05 is complete upon AR-03C acceptance/merge and safe closeout. No next reset task is selected. BATCH-05 selects no third task. This tracker owns current status; the roadmap owns dependency order. Retained B01 exact-next, fixed-two-call/mandatory-three-concept, transient-only, and 73-child future-sequence statements are </w:t>
       </w:r>
       <w:r>
         <w:rPr>
@@ -885,7 +899,7 @@
               <w:rPr>
                 <w:rFonts w:ascii="Calibri" w:hAnsi="Calibri" w:cs="Calibri"/>
               </w:rPr>
-              <w:t>Status effective on AR-03B acceptance/merge</w:t>
+              <w:t>Status effective on AR-03C acceptance/merge</w:t>
             </w:r>
           </w:p>
         </w:tc>
@@ -1908,6 +1922,111 @@
               <w:t xml:space="preserve">, </w:t>
             </w:r>
             <w:hyperlink r:id="rIdHyperlink22" w:history="1">
+              <w:r>
+                <w:rPr>
+                  <w:rFonts w:ascii="Calibri" w:hAnsi="Calibri" w:cs="Calibri"/>
+                  <w:color w:val="2E74B5"/>
+                  <w:u w:val="single"/>
+                </w:rPr>
+                <w:t>report</w:t>
+              </w:r>
+            </w:hyperlink>
+          </w:p>
+        </w:tc>
+        <w:tc>
+          <w:tcPr>
+            <w:tcW w:w="8460" w:type="dxa"/>
+            <w:vAlign w:val="center"/>
+          </w:tcPr>
+          <w:p>
+            <w:pPr>
+              <w:pStyle w:val="TableText"/>
+              <w:widowControl/>
+            </w:pPr>
+            <w:r>
+              <w:rPr>
+                <w:rFonts w:ascii="Calibri" w:hAnsi="Calibri" w:cs="Calibri"/>
+                <w:b/>
+                <w:bCs/>
+              </w:rPr>
+              <w:t>Baseline / closed</w:t>
+            </w:r>
+          </w:p>
+        </w:tc>
+      </w:tr>
+      <w:tr>
+        <w:trPr>
+          <w:cantSplit/>
+        </w:trPr>
+        <w:tc>
+          <w:tcPr>
+            <w:tcW w:w="1000" w:type="dxa"/>
+            <w:vAlign w:val="center"/>
+          </w:tcPr>
+          <w:p>
+            <w:pPr>
+              <w:pStyle w:val="TableText"/>
+              <w:widowControl/>
+            </w:pPr>
+            <w:r>
+              <w:rPr>
+                <w:rFonts w:ascii="Calibri" w:hAnsi="Calibri" w:cs="Calibri"/>
+              </w:rPr>
+              <w:t>AR-03C</w:t>
+            </w:r>
+          </w:p>
+        </w:tc>
+        <w:tc>
+          <w:tcPr>
+            <w:tcW w:w="1500" w:type="dxa"/>
+            <w:vAlign w:val="center"/>
+          </w:tcPr>
+          <w:p>
+            <w:pPr>
+              <w:pStyle w:val="TableText"/>
+              <w:widowControl/>
+            </w:pPr>
+            <w:r>
+              <w:rPr>
+                <w:rFonts w:ascii="Calibri" w:hAnsi="Calibri" w:cs="Calibri"/>
+              </w:rPr>
+              <w:t>AR-03</w:t>
+            </w:r>
+          </w:p>
+        </w:tc>
+        <w:tc>
+          <w:tcPr>
+            <w:tcW w:w="2000" w:type="dxa"/>
+            <w:vAlign w:val="center"/>
+          </w:tcPr>
+          <w:p>
+            <w:pPr>
+              <w:pStyle w:val="TableText"/>
+              <w:widowControl/>
+            </w:pPr>
+            <w:r>
+              <w:rPr>
+                <w:rFonts w:ascii="Calibri" w:hAnsi="Calibri" w:cs="Calibri"/>
+              </w:rPr>
+              <w:t xml:space="preserve">Current-authority validation, route projection/resolution and four preview import cutovers; </w:t>
+            </w:r>
+            <w:hyperlink r:id="rIdHyperlink23" w:history="1">
+              <w:r>
+                <w:rPr>
+                  <w:rFonts w:ascii="Calibri" w:hAnsi="Calibri" w:cs="Calibri"/>
+                  <w:color w:val="2E74B5"/>
+                  <w:u w:val="single"/>
+                </w:rPr>
+                <w:t>contract</w:t>
+              </w:r>
+            </w:hyperlink>
+            <w:r>
+              <w:rPr>
+                <w:rFonts w:ascii="Calibri" w:hAnsi="Calibri" w:cs="Calibri"/>
+              </w:rPr>
+              <w:t xml:space="preserve">, </w:t>
+            </w:r>
+            <w:hyperlink r:id="rIdHyperlink24" w:history="1">
               <w:r>
                 <w:rPr>
                   <w:rFonts w:ascii="Calibri" w:hAnsi="Calibri" w:cs="Calibri"/>
@@ -21877,7 +21996,7 @@
         </w:rPr>
         <w:t xml:space="preserve">. Completed 7 August 2026; see </w:t>
       </w:r>
-      <w:hyperlink r:id="rIdHyperlink23" w:history="1">
+      <w:hyperlink r:id="rIdHyperlink25" w:history="1">
         <w:r>
           <w:rPr>
             <w:rFonts w:ascii="Calibri" w:hAnsi="Calibri" w:cs="Calibri"/>
@@ -22014,7 +22133,7 @@
         </w:rPr>
         <w:t xml:space="preserve">The binding details and minimum coverage are in </w:t>
       </w:r>
-      <w:hyperlink r:id="rIdHyperlink24" w:history="1">
+      <w:hyperlink r:id="rIdHyperlink26" w:history="1">
         <w:r>
           <w:rPr>
             <w:rFonts w:ascii="Calibri" w:hAnsi="Calibri" w:cs="Calibri"/>
@@ -22212,7 +22331,7 @@
         </w:rPr>
         <w:t xml:space="preserve">. P10B-16P-04 acceptance evidence is retained in </w:t>
       </w:r>
-      <w:hyperlink r:id="rIdHyperlink25" w:history="1">
+      <w:hyperlink r:id="rIdHyperlink27" w:history="1">
         <w:r>
           <w:rPr>
             <w:rFonts w:ascii="Calibri" w:hAnsi="Calibri" w:cs="Calibri"/>
@@ -22461,7 +22580,7 @@
         </w:rPr>
         <w:t xml:space="preserve">. See </w:t>
       </w:r>
-      <w:hyperlink r:id="rIdHyperlink26" w:history="1">
+      <w:hyperlink r:id="rIdHyperlink28" w:history="1">
         <w:r>
           <w:rPr>
             <w:rFonts w:ascii="Calibri" w:hAnsi="Calibri" w:cs="Calibri"/>
@@ -22710,7 +22829,7 @@
         </w:rPr>
         <w:t xml:space="preserve">. See </w:t>
       </w:r>
-      <w:hyperlink r:id="rIdHyperlink27" w:history="1">
+      <w:hyperlink r:id="rIdHyperlink29" w:history="1">
         <w:r>
           <w:rPr>
             <w:rFonts w:ascii="Calibri" w:hAnsi="Calibri" w:cs="Calibri"/>
@@ -22959,7 +23078,7 @@
         </w:rPr>
         <w:t xml:space="preserve">. At P10B-03 delivery, all then-current 25 V2 definitions and 91 variants were classified explicitly without false commercial-ready promotion. Later family tasks extend that same authority rather than replacing it. See </w:t>
       </w:r>
-      <w:hyperlink r:id="rIdHyperlink28" w:history="1">
+      <w:hyperlink r:id="rIdHyperlink30" w:history="1">
         <w:r>
           <w:rPr>
             <w:rFonts w:ascii="Calibri" w:hAnsi="Calibri" w:cs="Calibri"/>
@@ -23208,7 +23327,7 @@
         </w:rPr>
         <w:t xml:space="preserve"> embeds exact lineage and bounded treatment in the existing approved presentation, consumes Design DNA and registered anatomy, projects protected same-product media, preserves authority through lifecycle/compiler boundaries, and renders semantic four-breakpoint evidence. Production CDN transforms and retained commercial visual acceptance remain deferred. See </w:t>
       </w:r>
-      <w:hyperlink r:id="rIdHyperlink29" w:history="1">
+      <w:hyperlink r:id="rIdHyperlink31" w:history="1">
         <w:r>
           <w:rPr>
             <w:rFonts w:ascii="Calibri" w:hAnsi="Calibri" w:cs="Calibri"/>
@@ -23457,7 +23576,7 @@
         </w:rPr>
         <w:t xml:space="preserve">. See </w:t>
       </w:r>
-      <w:hyperlink r:id="rIdHyperlink30" w:history="1">
+      <w:hyperlink r:id="rIdHyperlink32" w:history="1">
         <w:r>
           <w:rPr>
             <w:rFonts w:ascii="Calibri" w:hAnsi="Calibri" w:cs="Calibri"/>
@@ -23692,7 +23811,7 @@
         </w:rPr>
         <w:t xml:space="preserve">. Four exact root-frame profiles, three mobile modes, and four footer compositions preserve canonical navigation and frame identity through snapshot, save/reload, Puck root, preview, publication compilation, EN/FI, and 375/768/1024/1440 px evidence. See </w:t>
       </w:r>
-      <w:hyperlink r:id="rIdHyperlink31" w:history="1">
+      <w:hyperlink r:id="rIdHyperlink33" w:history="1">
         <w:r>
           <w:rPr>
             <w:rFonts w:ascii="Calibri" w:hAnsi="Calibri" w:cs="Calibri"/>
@@ -23927,7 +24046,7 @@
         </w:rPr>
         <w:t xml:space="preserve">. Six meaningful hero anatomies, five editorial/story anatomies, five campaign/promotion anatomies and three evidence-grounded proof/service anatomies are registered, PageBlueprint-selectable, deterministically generated, snapshot/publish preserved and rendered through one shared implementation. Focused deterministic coverage and a zero-provider Chromium scenario retain evidence at 375, 768, 1024 and 1440 px. See </w:t>
       </w:r>
-      <w:hyperlink r:id="rIdHyperlink32" w:history="1">
+      <w:hyperlink r:id="rIdHyperlink34" w:history="1">
         <w:r>
           <w:rPr>
             <w:rFonts w:ascii="Calibri" w:hAnsi="Calibri" w:cs="Calibri"/>
@@ -23976,7 +24095,7 @@
         </w:rPr>
         <w:t xml:space="preserve"> Baseline. One fingerprinted authority and renderer now serve homepage merchandising, collection/results, related products, and legacy compatibility. Five meaningful anatomies preserve canonical facts and P10B-04 media lineage through plan, proposal, snapshot, save/reload, publish, and responsive browser evidence. See </w:t>
       </w:r>
-      <w:hyperlink r:id="rIdHyperlink33" w:history="1">
+      <w:hyperlink r:id="rIdHyperlink35" w:history="1">
         <w:r>
           <w:rPr>
             <w:rFonts w:ascii="Calibri" w:hAnsi="Calibri" w:cs="Calibri"/>
@@ -24193,7 +24312,7 @@
         </w:rPr>
         <w:t xml:space="preserve"> Baseline. Six versioned, structurally fingerprinted homepage PageBlueprint profiles compose current shared-frame, commercial storytelling, canonical product-card, approved-media, and Design DNA authority. Evidence/cardinality guards fail closed; deterministic lifecycle and 24 retained four-width browser images pass. See </w:t>
       </w:r>
-      <w:hyperlink r:id="rIdHyperlink34" w:history="1">
+      <w:hyperlink r:id="rIdHyperlink36" w:history="1">
         <w:r>
           <w:rPr>
             <w:rFonts w:ascii="Calibri" w:hAnsi="Calibri" w:cs="Calibri"/>
@@ -24424,7 +24543,7 @@
         </w:rPr>
         <w:t xml:space="preserve"> anatomy, P10B-08 canonical card anatomy, and P10B-04 approved media treatment. Exact canonical catalogue bindings preserve product membership/order, facts, product media, filters/sort state, and child-collection order. Campaign media is approved collection/editorial media, not a product-media replacement. A transient revision-checked zero-result context keeps the query without fabricating products. Deterministic lifecycle and 16-view Chromium evidence pass with zero provider calls. See </w:t>
       </w:r>
-      <w:hyperlink r:id="rIdHyperlink35" w:history="1">
+      <w:hyperlink r:id="rIdHyperlink37" w:history="1">
         <w:r>
           <w:rPr>
             <w:rFonts w:ascii="Calibri" w:hAnsi="Calibri" w:cs="Calibri"/>
@@ -24954,7 +25073,7 @@
         </w:rPr>
         <w:t xml:space="preserve">. Fifteen structurally distinct registered profiles resolve exact current approved brief evidence into strict localized fact documents. P10B-05 preserves page-set, route, locale, and transitive navigation authority; P10B-06 frames and P10B-07 editorial/campaign renderers are reused. Snapshot save/reload and deterministic publication preserve the exact document. See </w:t>
       </w:r>
-      <w:hyperlink r:id="rIdHyperlink36" w:history="1">
+      <w:hyperlink r:id="rIdHyperlink38" w:history="1">
         <w:r>
           <w:rPr>
             <w:rFonts w:ascii="Calibri" w:hAnsi="Calibri" w:cs="Calibri"/>
@@ -25165,7 +25284,7 @@
         </w:rPr>
         <w:t xml:space="preserve"> component through the P10B-05 family page; registered loading state renders on its pending route instead of replacing the 404 singleton. Read-only runtime state supplies canonical cart facts, checkout continuation, P10B-10 query/filter context, and bounded recovery actions while the snapshot preserves presentation only. Shared-frame/Design DNA, save/reload, publication, four- width browser evidence, and no-provider behavior are covered under </w:t>
       </w:r>
-      <w:hyperlink r:id="rIdHyperlink37" w:history="1">
+      <w:hyperlink r:id="rIdHyperlink39" w:history="1">
         <w:r>
           <w:rPr>
             <w:rFonts w:ascii="Calibri" w:hAnsi="Calibri" w:cs="Calibri"/>
@@ -25376,7 +25495,7 @@
         </w:rPr>
         <w:t xml:space="preserve"> frame span all pages; simple/configurable PDP, factual content, utility states, 15 four-width/representative screenshots and the passing 160-scenario human record are retained in </w:t>
       </w:r>
-      <w:hyperlink r:id="rIdHyperlink38" w:history="1">
+      <w:hyperlink r:id="rIdHyperlink40" w:history="1">
         <w:r>
           <w:rPr>
             <w:rFonts w:ascii="Calibri" w:hAnsi="Calibri" w:cs="Calibri"/>
@@ -25587,7 +25706,7 @@
         </w:rPr>
         <w:t xml:space="preserve"> One versioned deterministic synthesis contract binds exact merchant, evidence, commerce, asset, Design DNA, site-map, frame, PageBlueprint/profile, component/anatomy, narrative, density, art-direction, responsive, planner, registry and recipe authority. The same approved fixture produces editorial-heavy, commerce/discovery-heavy and restrained/minimal complete 17-route stores through the existing whole-storefront proposal, snapshot, save/reload, renderer and immutable publication chain. Details are retained in </w:t>
       </w:r>
-      <w:hyperlink r:id="rIdHyperlink39" w:history="1">
+      <w:hyperlink r:id="rIdHyperlink41" w:history="1">
         <w:r>
           <w:rPr>
             <w:rFonts w:ascii="Calibri" w:hAnsi="Calibri" w:cs="Calibri"/>
@@ -25832,7 +25951,7 @@
         </w:rPr>
         <w:t xml:space="preserve"> 31 focused unit/integration cases; nine representative complete outcomes; exact save/reload and compiled publication; protected commerce/evidence/media parity; dedicated 375/768/1024/1440 browser coverage; three retained human commercial reviews and one exact evidence manifest. See </w:t>
       </w:r>
-      <w:hyperlink r:id="rIdHyperlink40" w:history="1">
+      <w:hyperlink r:id="rIdHyperlink42" w:history="1">
         <w:r>
           <w:rPr>
             <w:rFonts w:ascii="Calibri" w:hAnsi="Calibri" w:cs="Calibri"/>
@@ -26009,7 +26128,7 @@
         </w:rPr>
         <w:t xml:space="preserve"> A compact route inventory, four collection/search archetypes, four maintained PDP profiles plus generic fallback, exact collection and product-type mappings, bounded matching rules, transient editor/runtime projection, deterministic legacy convergence, and complete snapshot/lifecycle/publication preservation. Exact primary and related-product bindings survive convergence. A server-owned, storefront-scoped proposal transition binds legacy and reviewed canonical projections for deterministic acceptance replay. Storefront Studio lists archetypes rather than one page per commerce URL; representative context is not persisted. See </w:t>
       </w:r>
-      <w:hyperlink r:id="rIdHyperlink41" w:history="1">
+      <w:hyperlink r:id="rIdHyperlink43" w:history="1">
         <w:r>
           <w:rPr>
             <w:rFonts w:ascii="Calibri" w:hAnsi="Calibri" w:cs="Calibri"/>
@@ -26477,7 +26596,7 @@
         </w:rPr>
         <w:t xml:space="preserve"> </w:t>
       </w:r>
-      <w:hyperlink r:id="rIdHyperlink42" w:history="1">
+      <w:hyperlink r:id="rIdHyperlink44" w:history="1">
         <w:r>
           <w:rPr>
             <w:rFonts w:ascii="Calibri" w:hAnsi="Calibri" w:cs="Calibri"/>
@@ -26938,7 +27057,7 @@
         </w:rPr>
         <w:t xml:space="preserve">. Completed 15 August 2026; see </w:t>
       </w:r>
-      <w:hyperlink r:id="rIdHyperlink25" w:history="1">
+      <w:hyperlink r:id="rIdHyperlink27" w:history="1">
         <w:r>
           <w:rPr>
             <w:rFonts w:ascii="Calibri" w:hAnsi="Calibri" w:cs="Calibri"/>
@@ -28200,7 +28319,7 @@
         </w:rPr>
         <w:t xml:space="preserve">. Accepted by the product owner on 16 August 2026 under </w:t>
       </w:r>
-      <w:hyperlink r:id="rIdHyperlink43" w:history="1">
+      <w:hyperlink r:id="rIdHyperlink45" w:history="1">
         <w:r>
           <w:rPr>
             <w:rFonts w:ascii="Calibri" w:hAnsi="Calibri" w:cs="Calibri"/>
@@ -28558,7 +28677,7 @@
         </w:rPr>
         <w:t xml:space="preserve">. Accepted by the product owner on 17 August 2026 under </w:t>
       </w:r>
-      <w:hyperlink r:id="rIdHyperlink43" w:history="1">
+      <w:hyperlink r:id="rIdHyperlink45" w:history="1">
         <w:r>
           <w:rPr>
             <w:rFonts w:ascii="Calibri" w:hAnsi="Calibri" w:cs="Calibri"/>
@@ -31698,7 +31817,7 @@
         </w:rPr>
         <w:t xml:space="preserve"> </w:t>
       </w:r>
-      <w:hyperlink r:id="rIdHyperlink44" w:history="1">
+      <w:hyperlink r:id="rIdHyperlink46" w:history="1">
         <w:r>
           <w:rPr>
             <w:rFonts w:ascii="Calibri" w:hAnsi="Calibri" w:cs="Calibri"/>
@@ -31714,7 +31833,7 @@
         </w:rPr>
         <w:t xml:space="preserve"> and </w:t>
       </w:r>
-      <w:hyperlink r:id="rIdHyperlink45" w:history="1">
+      <w:hyperlink r:id="rIdHyperlink47" w:history="1">
         <w:r>
           <w:rPr>
             <w:rFonts w:ascii="Calibri" w:hAnsi="Calibri" w:cs="Calibri"/>

</xml_diff>

<commit_message>
refactor: separate dynamic commerce authoring owners
</commit_message>
<xml_diff>
--- a/docs/VESKIFY_DEVELOPMENT_DELIVERY_TRACKER_v1.3.0.docx
+++ b/docs/VESKIFY_DEVELOPMENT_DELIVERY_TRACKER_v1.3.0.docx
@@ -51,7 +51,7 @@
         <w:rPr>
           <w:rFonts w:ascii="Calibri" w:hAnsi="Calibri" w:cs="Calibri"/>
         </w:rPr>
-        <w:t>Effective upon explicit AR-03C acceptance/merge: AR-02A through AR-02H and AR-03A/AR-03B/AR-03C Baseline / closed; AR-02 and AR-03 Partial; AR-23 eligible / unstarted; BATCH-04 complete; BATCH-05 complete upon C merge and safe closeout; no next child selected</w:t>
+        <w:t>Effective upon explicit AR-03D acceptance/merge: AR-02A through AR-02H and AR-03A through AR-03D Baseline / closed; AR-02 and AR-03 Partial; AR-23 eligible / unstarted; BATCH-05 complete; BATCH-06 selects AR-03E after D merge and safe synchronization; no third task</w:t>
       </w:r>
     </w:p>
     <w:p>
@@ -118,7 +118,7 @@
           <w:b/>
           <w:bCs/>
         </w:rPr>
-        <w:t>Candidate status effective upon explicit owner acceptance/merge of AR-03C:</w:t>
+        <w:t>Candidate status effective upon explicit owner acceptance/merge of AR-03D:</w:t>
       </w:r>
       <w:r>
         <w:rPr>
@@ -306,7 +306,7 @@
         <w:rPr>
           <w:rFonts w:ascii="Calibri" w:hAnsi="Calibri" w:cs="Calibri"/>
         </w:rPr>
-        <w:t xml:space="preserve">; runtime validation/projection/resolution are isolated; editor, migration, and expand/fold isolation remain. AR-03A is </w:t>
+        <w:t xml:space="preserve">; runtime validation/projection/resolution and authoring are isolated; migration and expand/fold isolation remain. AR-03A is </w:t>
       </w:r>
       <w:r>
         <w:rPr>
@@ -342,6 +342,20 @@
           <w:b/>
           <w:bCs/>
         </w:rPr>
+        <w:t>Baseline / closed.</w:t>
+      </w:r>
+      <w:r>
+        <w:rPr>
+          <w:rFonts w:ascii="Calibri" w:hAnsi="Calibri" w:cs="Calibri"/>
+        </w:rPr>
+        <w:t xml:space="preserve"> AR-03D is </w:t>
+      </w:r>
+      <w:r>
+        <w:rPr>
+          <w:rFonts w:ascii="Calibri" w:hAnsi="Calibri" w:cs="Calibri"/>
+          <w:b/>
+          <w:bCs/>
+        </w:rPr>
         <w:t>Baseline / closed upon explicit owner acceptance/merge.</w:t>
       </w:r>
       <w:r>
@@ -362,7 +376,7 @@
         <w:rPr>
           <w:rFonts w:ascii="Calibri" w:hAnsi="Calibri" w:cs="Calibri"/>
         </w:rPr>
-        <w:t xml:space="preserve">. AR-23 depends on AR-01 and is not serialized behind visual work. BATCH-03 is complete. BATCH-04 is complete. BATCH-05 is complete upon AR-03C acceptance/merge and safe closeout. No next reset task is selected. BATCH-05 selects no third task. This tracker owns current status; the roadmap owns dependency order. Retained B01 exact-next, fixed-two-call/mandatory-three-concept, transient-only, and 73-child future-sequence statements are </w:t>
+        <w:t xml:space="preserve">. AR-23 depends on AR-01 and is not serialized behind visual work. BATCH-03 is complete. BATCH-04 is complete. BATCH-05 is complete. BATCH-06 continues with AR-03E after AR-03D merges and safe synchronization. AR-03E is the exact next selected child after AR-03D merges and safe synchronization. BATCH-06 selects no third task. This tracker owns current status; the roadmap owns dependency order. Retained B01 exact-next, fixed-two-call/mandatory-three-concept, transient-only, and 73-child future-sequence statements are </w:t>
       </w:r>
       <w:r>
         <w:rPr>
@@ -899,7 +913,7 @@
               <w:rPr>
                 <w:rFonts w:ascii="Calibri" w:hAnsi="Calibri" w:cs="Calibri"/>
               </w:rPr>
-              <w:t>Status effective on AR-03C acceptance/merge</w:t>
+              <w:t>Status effective on AR-03D acceptance/merge</w:t>
             </w:r>
           </w:p>
         </w:tc>
@@ -2027,6 +2041,111 @@
               <w:t xml:space="preserve">, </w:t>
             </w:r>
             <w:hyperlink r:id="rIdHyperlink24" w:history="1">
+              <w:r>
+                <w:rPr>
+                  <w:rFonts w:ascii="Calibri" w:hAnsi="Calibri" w:cs="Calibri"/>
+                  <w:color w:val="2E74B5"/>
+                  <w:u w:val="single"/>
+                </w:rPr>
+                <w:t>report</w:t>
+              </w:r>
+            </w:hyperlink>
+          </w:p>
+        </w:tc>
+        <w:tc>
+          <w:tcPr>
+            <w:tcW w:w="8460" w:type="dxa"/>
+            <w:vAlign w:val="center"/>
+          </w:tcPr>
+          <w:p>
+            <w:pPr>
+              <w:pStyle w:val="TableText"/>
+              <w:widowControl/>
+            </w:pPr>
+            <w:r>
+              <w:rPr>
+                <w:rFonts w:ascii="Calibri" w:hAnsi="Calibri" w:cs="Calibri"/>
+                <w:b/>
+                <w:bCs/>
+              </w:rPr>
+              <w:t>Baseline / closed</w:t>
+            </w:r>
+          </w:p>
+        </w:tc>
+      </w:tr>
+      <w:tr>
+        <w:trPr>
+          <w:cantSplit/>
+        </w:trPr>
+        <w:tc>
+          <w:tcPr>
+            <w:tcW w:w="1000" w:type="dxa"/>
+            <w:vAlign w:val="center"/>
+          </w:tcPr>
+          <w:p>
+            <w:pPr>
+              <w:pStyle w:val="TableText"/>
+              <w:widowControl/>
+            </w:pPr>
+            <w:r>
+              <w:rPr>
+                <w:rFonts w:ascii="Calibri" w:hAnsi="Calibri" w:cs="Calibri"/>
+              </w:rPr>
+              <w:t>AR-03D</w:t>
+            </w:r>
+          </w:p>
+        </w:tc>
+        <w:tc>
+          <w:tcPr>
+            <w:tcW w:w="1500" w:type="dxa"/>
+            <w:vAlign w:val="center"/>
+          </w:tcPr>
+          <w:p>
+            <w:pPr>
+              <w:pStyle w:val="TableText"/>
+              <w:widowControl/>
+            </w:pPr>
+            <w:r>
+              <w:rPr>
+                <w:rFonts w:ascii="Calibri" w:hAnsi="Calibri" w:cs="Calibri"/>
+              </w:rPr>
+              <w:t>AR-03</w:t>
+            </w:r>
+          </w:p>
+        </w:tc>
+        <w:tc>
+          <w:tcPr>
+            <w:tcW w:w="2000" w:type="dxa"/>
+            <w:vAlign w:val="center"/>
+          </w:tcPr>
+          <w:p>
+            <w:pPr>
+              <w:pStyle w:val="TableText"/>
+              <w:widowControl/>
+            </w:pPr>
+            <w:r>
+              <w:rPr>
+                <w:rFonts w:ascii="Calibri" w:hAnsi="Calibri" w:cs="Calibri"/>
+              </w:rPr>
+              <w:t xml:space="preserve">Design-selection contracts/operations and editor projection with three named consumer cutovers; </w:t>
+            </w:r>
+            <w:hyperlink r:id="rIdHyperlink25" w:history="1">
+              <w:r>
+                <w:rPr>
+                  <w:rFonts w:ascii="Calibri" w:hAnsi="Calibri" w:cs="Calibri"/>
+                  <w:color w:val="2E74B5"/>
+                  <w:u w:val="single"/>
+                </w:rPr>
+                <w:t>contract</w:t>
+              </w:r>
+            </w:hyperlink>
+            <w:r>
+              <w:rPr>
+                <w:rFonts w:ascii="Calibri" w:hAnsi="Calibri" w:cs="Calibri"/>
+              </w:rPr>
+              <w:t xml:space="preserve">, </w:t>
+            </w:r>
+            <w:hyperlink r:id="rIdHyperlink26" w:history="1">
               <w:r>
                 <w:rPr>
                   <w:rFonts w:ascii="Calibri" w:hAnsi="Calibri" w:cs="Calibri"/>
@@ -21996,7 +22115,7 @@
         </w:rPr>
         <w:t xml:space="preserve">. Completed 7 August 2026; see </w:t>
       </w:r>
-      <w:hyperlink r:id="rIdHyperlink25" w:history="1">
+      <w:hyperlink r:id="rIdHyperlink27" w:history="1">
         <w:r>
           <w:rPr>
             <w:rFonts w:ascii="Calibri" w:hAnsi="Calibri" w:cs="Calibri"/>
@@ -22133,7 +22252,7 @@
         </w:rPr>
         <w:t xml:space="preserve">The binding details and minimum coverage are in </w:t>
       </w:r>
-      <w:hyperlink r:id="rIdHyperlink26" w:history="1">
+      <w:hyperlink r:id="rIdHyperlink28" w:history="1">
         <w:r>
           <w:rPr>
             <w:rFonts w:ascii="Calibri" w:hAnsi="Calibri" w:cs="Calibri"/>
@@ -22331,7 +22450,7 @@
         </w:rPr>
         <w:t xml:space="preserve">. P10B-16P-04 acceptance evidence is retained in </w:t>
       </w:r>
-      <w:hyperlink r:id="rIdHyperlink27" w:history="1">
+      <w:hyperlink r:id="rIdHyperlink29" w:history="1">
         <w:r>
           <w:rPr>
             <w:rFonts w:ascii="Calibri" w:hAnsi="Calibri" w:cs="Calibri"/>
@@ -22580,7 +22699,7 @@
         </w:rPr>
         <w:t xml:space="preserve">. See </w:t>
       </w:r>
-      <w:hyperlink r:id="rIdHyperlink28" w:history="1">
+      <w:hyperlink r:id="rIdHyperlink30" w:history="1">
         <w:r>
           <w:rPr>
             <w:rFonts w:ascii="Calibri" w:hAnsi="Calibri" w:cs="Calibri"/>
@@ -22829,7 +22948,7 @@
         </w:rPr>
         <w:t xml:space="preserve">. See </w:t>
       </w:r>
-      <w:hyperlink r:id="rIdHyperlink29" w:history="1">
+      <w:hyperlink r:id="rIdHyperlink31" w:history="1">
         <w:r>
           <w:rPr>
             <w:rFonts w:ascii="Calibri" w:hAnsi="Calibri" w:cs="Calibri"/>
@@ -23078,7 +23197,7 @@
         </w:rPr>
         <w:t xml:space="preserve">. At P10B-03 delivery, all then-current 25 V2 definitions and 91 variants were classified explicitly without false commercial-ready promotion. Later family tasks extend that same authority rather than replacing it. See </w:t>
       </w:r>
-      <w:hyperlink r:id="rIdHyperlink30" w:history="1">
+      <w:hyperlink r:id="rIdHyperlink32" w:history="1">
         <w:r>
           <w:rPr>
             <w:rFonts w:ascii="Calibri" w:hAnsi="Calibri" w:cs="Calibri"/>
@@ -23327,7 +23446,7 @@
         </w:rPr>
         <w:t xml:space="preserve"> embeds exact lineage and bounded treatment in the existing approved presentation, consumes Design DNA and registered anatomy, projects protected same-product media, preserves authority through lifecycle/compiler boundaries, and renders semantic four-breakpoint evidence. Production CDN transforms and retained commercial visual acceptance remain deferred. See </w:t>
       </w:r>
-      <w:hyperlink r:id="rIdHyperlink31" w:history="1">
+      <w:hyperlink r:id="rIdHyperlink33" w:history="1">
         <w:r>
           <w:rPr>
             <w:rFonts w:ascii="Calibri" w:hAnsi="Calibri" w:cs="Calibri"/>
@@ -23576,7 +23695,7 @@
         </w:rPr>
         <w:t xml:space="preserve">. See </w:t>
       </w:r>
-      <w:hyperlink r:id="rIdHyperlink32" w:history="1">
+      <w:hyperlink r:id="rIdHyperlink34" w:history="1">
         <w:r>
           <w:rPr>
             <w:rFonts w:ascii="Calibri" w:hAnsi="Calibri" w:cs="Calibri"/>
@@ -23811,7 +23930,7 @@
         </w:rPr>
         <w:t xml:space="preserve">. Four exact root-frame profiles, three mobile modes, and four footer compositions preserve canonical navigation and frame identity through snapshot, save/reload, Puck root, preview, publication compilation, EN/FI, and 375/768/1024/1440 px evidence. See </w:t>
       </w:r>
-      <w:hyperlink r:id="rIdHyperlink33" w:history="1">
+      <w:hyperlink r:id="rIdHyperlink35" w:history="1">
         <w:r>
           <w:rPr>
             <w:rFonts w:ascii="Calibri" w:hAnsi="Calibri" w:cs="Calibri"/>
@@ -24046,7 +24165,7 @@
         </w:rPr>
         <w:t xml:space="preserve">. Six meaningful hero anatomies, five editorial/story anatomies, five campaign/promotion anatomies and three evidence-grounded proof/service anatomies are registered, PageBlueprint-selectable, deterministically generated, snapshot/publish preserved and rendered through one shared implementation. Focused deterministic coverage and a zero-provider Chromium scenario retain evidence at 375, 768, 1024 and 1440 px. See </w:t>
       </w:r>
-      <w:hyperlink r:id="rIdHyperlink34" w:history="1">
+      <w:hyperlink r:id="rIdHyperlink36" w:history="1">
         <w:r>
           <w:rPr>
             <w:rFonts w:ascii="Calibri" w:hAnsi="Calibri" w:cs="Calibri"/>
@@ -24095,7 +24214,7 @@
         </w:rPr>
         <w:t xml:space="preserve"> Baseline. One fingerprinted authority and renderer now serve homepage merchandising, collection/results, related products, and legacy compatibility. Five meaningful anatomies preserve canonical facts and P10B-04 media lineage through plan, proposal, snapshot, save/reload, publish, and responsive browser evidence. See </w:t>
       </w:r>
-      <w:hyperlink r:id="rIdHyperlink35" w:history="1">
+      <w:hyperlink r:id="rIdHyperlink37" w:history="1">
         <w:r>
           <w:rPr>
             <w:rFonts w:ascii="Calibri" w:hAnsi="Calibri" w:cs="Calibri"/>
@@ -24312,7 +24431,7 @@
         </w:rPr>
         <w:t xml:space="preserve"> Baseline. Six versioned, structurally fingerprinted homepage PageBlueprint profiles compose current shared-frame, commercial storytelling, canonical product-card, approved-media, and Design DNA authority. Evidence/cardinality guards fail closed; deterministic lifecycle and 24 retained four-width browser images pass. See </w:t>
       </w:r>
-      <w:hyperlink r:id="rIdHyperlink36" w:history="1">
+      <w:hyperlink r:id="rIdHyperlink38" w:history="1">
         <w:r>
           <w:rPr>
             <w:rFonts w:ascii="Calibri" w:hAnsi="Calibri" w:cs="Calibri"/>
@@ -24543,7 +24662,7 @@
         </w:rPr>
         <w:t xml:space="preserve"> anatomy, P10B-08 canonical card anatomy, and P10B-04 approved media treatment. Exact canonical catalogue bindings preserve product membership/order, facts, product media, filters/sort state, and child-collection order. Campaign media is approved collection/editorial media, not a product-media replacement. A transient revision-checked zero-result context keeps the query without fabricating products. Deterministic lifecycle and 16-view Chromium evidence pass with zero provider calls. See </w:t>
       </w:r>
-      <w:hyperlink r:id="rIdHyperlink37" w:history="1">
+      <w:hyperlink r:id="rIdHyperlink39" w:history="1">
         <w:r>
           <w:rPr>
             <w:rFonts w:ascii="Calibri" w:hAnsi="Calibri" w:cs="Calibri"/>
@@ -25073,7 +25192,7 @@
         </w:rPr>
         <w:t xml:space="preserve">. Fifteen structurally distinct registered profiles resolve exact current approved brief evidence into strict localized fact documents. P10B-05 preserves page-set, route, locale, and transitive navigation authority; P10B-06 frames and P10B-07 editorial/campaign renderers are reused. Snapshot save/reload and deterministic publication preserve the exact document. See </w:t>
       </w:r>
-      <w:hyperlink r:id="rIdHyperlink38" w:history="1">
+      <w:hyperlink r:id="rIdHyperlink40" w:history="1">
         <w:r>
           <w:rPr>
             <w:rFonts w:ascii="Calibri" w:hAnsi="Calibri" w:cs="Calibri"/>
@@ -25284,7 +25403,7 @@
         </w:rPr>
         <w:t xml:space="preserve"> component through the P10B-05 family page; registered loading state renders on its pending route instead of replacing the 404 singleton. Read-only runtime state supplies canonical cart facts, checkout continuation, P10B-10 query/filter context, and bounded recovery actions while the snapshot preserves presentation only. Shared-frame/Design DNA, save/reload, publication, four- width browser evidence, and no-provider behavior are covered under </w:t>
       </w:r>
-      <w:hyperlink r:id="rIdHyperlink39" w:history="1">
+      <w:hyperlink r:id="rIdHyperlink41" w:history="1">
         <w:r>
           <w:rPr>
             <w:rFonts w:ascii="Calibri" w:hAnsi="Calibri" w:cs="Calibri"/>
@@ -25495,7 +25614,7 @@
         </w:rPr>
         <w:t xml:space="preserve"> frame span all pages; simple/configurable PDP, factual content, utility states, 15 four-width/representative screenshots and the passing 160-scenario human record are retained in </w:t>
       </w:r>
-      <w:hyperlink r:id="rIdHyperlink40" w:history="1">
+      <w:hyperlink r:id="rIdHyperlink42" w:history="1">
         <w:r>
           <w:rPr>
             <w:rFonts w:ascii="Calibri" w:hAnsi="Calibri" w:cs="Calibri"/>
@@ -25706,7 +25825,7 @@
         </w:rPr>
         <w:t xml:space="preserve"> One versioned deterministic synthesis contract binds exact merchant, evidence, commerce, asset, Design DNA, site-map, frame, PageBlueprint/profile, component/anatomy, narrative, density, art-direction, responsive, planner, registry and recipe authority. The same approved fixture produces editorial-heavy, commerce/discovery-heavy and restrained/minimal complete 17-route stores through the existing whole-storefront proposal, snapshot, save/reload, renderer and immutable publication chain. Details are retained in </w:t>
       </w:r>
-      <w:hyperlink r:id="rIdHyperlink41" w:history="1">
+      <w:hyperlink r:id="rIdHyperlink43" w:history="1">
         <w:r>
           <w:rPr>
             <w:rFonts w:ascii="Calibri" w:hAnsi="Calibri" w:cs="Calibri"/>
@@ -25951,7 +26070,7 @@
         </w:rPr>
         <w:t xml:space="preserve"> 31 focused unit/integration cases; nine representative complete outcomes; exact save/reload and compiled publication; protected commerce/evidence/media parity; dedicated 375/768/1024/1440 browser coverage; three retained human commercial reviews and one exact evidence manifest. See </w:t>
       </w:r>
-      <w:hyperlink r:id="rIdHyperlink42" w:history="1">
+      <w:hyperlink r:id="rIdHyperlink44" w:history="1">
         <w:r>
           <w:rPr>
             <w:rFonts w:ascii="Calibri" w:hAnsi="Calibri" w:cs="Calibri"/>
@@ -26128,7 +26247,7 @@
         </w:rPr>
         <w:t xml:space="preserve"> A compact route inventory, four collection/search archetypes, four maintained PDP profiles plus generic fallback, exact collection and product-type mappings, bounded matching rules, transient editor/runtime projection, deterministic legacy convergence, and complete snapshot/lifecycle/publication preservation. Exact primary and related-product bindings survive convergence. A server-owned, storefront-scoped proposal transition binds legacy and reviewed canonical projections for deterministic acceptance replay. Storefront Studio lists archetypes rather than one page per commerce URL; representative context is not persisted. See </w:t>
       </w:r>
-      <w:hyperlink r:id="rIdHyperlink43" w:history="1">
+      <w:hyperlink r:id="rIdHyperlink45" w:history="1">
         <w:r>
           <w:rPr>
             <w:rFonts w:ascii="Calibri" w:hAnsi="Calibri" w:cs="Calibri"/>
@@ -26596,7 +26715,7 @@
         </w:rPr>
         <w:t xml:space="preserve"> </w:t>
       </w:r>
-      <w:hyperlink r:id="rIdHyperlink44" w:history="1">
+      <w:hyperlink r:id="rIdHyperlink46" w:history="1">
         <w:r>
           <w:rPr>
             <w:rFonts w:ascii="Calibri" w:hAnsi="Calibri" w:cs="Calibri"/>
@@ -27057,7 +27176,7 @@
         </w:rPr>
         <w:t xml:space="preserve">. Completed 15 August 2026; see </w:t>
       </w:r>
-      <w:hyperlink r:id="rIdHyperlink27" w:history="1">
+      <w:hyperlink r:id="rIdHyperlink29" w:history="1">
         <w:r>
           <w:rPr>
             <w:rFonts w:ascii="Calibri" w:hAnsi="Calibri" w:cs="Calibri"/>
@@ -28319,7 +28438,7 @@
         </w:rPr>
         <w:t xml:space="preserve">. Accepted by the product owner on 16 August 2026 under </w:t>
       </w:r>
-      <w:hyperlink r:id="rIdHyperlink45" w:history="1">
+      <w:hyperlink r:id="rIdHyperlink47" w:history="1">
         <w:r>
           <w:rPr>
             <w:rFonts w:ascii="Calibri" w:hAnsi="Calibri" w:cs="Calibri"/>
@@ -28677,7 +28796,7 @@
         </w:rPr>
         <w:t xml:space="preserve">. Accepted by the product owner on 17 August 2026 under </w:t>
       </w:r>
-      <w:hyperlink r:id="rIdHyperlink45" w:history="1">
+      <w:hyperlink r:id="rIdHyperlink47" w:history="1">
         <w:r>
           <w:rPr>
             <w:rFonts w:ascii="Calibri" w:hAnsi="Calibri" w:cs="Calibri"/>
@@ -31817,7 +31936,7 @@
         </w:rPr>
         <w:t xml:space="preserve"> </w:t>
       </w:r>
-      <w:hyperlink r:id="rIdHyperlink46" w:history="1">
+      <w:hyperlink r:id="rIdHyperlink48" w:history="1">
         <w:r>
           <w:rPr>
             <w:rFonts w:ascii="Calibri" w:hAnsi="Calibri" w:cs="Calibri"/>
@@ -31833,7 +31952,7 @@
         </w:rPr>
         <w:t xml:space="preserve"> and </w:t>
       </w:r>
-      <w:hyperlink r:id="rIdHyperlink47" w:history="1">
+      <w:hyperlink r:id="rIdHyperlink49" w:history="1">
         <w:r>
           <w:rPr>
             <w:rFonts w:ascii="Calibri" w:hAnsi="Calibri" w:cs="Calibri"/>

</xml_diff>

<commit_message>
AR-03E: separate legacy migration and route projection ownership
</commit_message>
<xml_diff>
--- a/docs/VESKIFY_DEVELOPMENT_DELIVERY_TRACKER_v1.3.0.docx
+++ b/docs/VESKIFY_DEVELOPMENT_DELIVERY_TRACKER_v1.3.0.docx
@@ -51,7 +51,7 @@
         <w:rPr>
           <w:rFonts w:ascii="Calibri" w:hAnsi="Calibri" w:cs="Calibri"/>
         </w:rPr>
-        <w:t>Effective upon explicit AR-03D acceptance/merge: AR-02A through AR-02H and AR-03A through AR-03D Baseline / closed; AR-02 and AR-03 Partial; AR-23 eligible / unstarted; BATCH-05 complete; BATCH-06 selects AR-03E after D merge and safe synchronization; no third task</w:t>
+        <w:t>Effective upon explicit AR-03E acceptance/merge: AR-02A through AR-02H, AR-03 and AR-03A through AR-03E Baseline / closed; AR-02 Partial; AR-23 eligible / unstarted; BATCH-05 complete; BATCH-06 complete upon E merge and safe closeout; no next child selected</w:t>
       </w:r>
     </w:p>
     <w:p>
@@ -118,7 +118,7 @@
           <w:b/>
           <w:bCs/>
         </w:rPr>
-        <w:t>Candidate status effective upon explicit owner acceptance/merge of AR-03D:</w:t>
+        <w:t>Candidate status effective upon explicit owner acceptance/merge of AR-03E:</w:t>
       </w:r>
       <w:r>
         <w:rPr>
@@ -300,13 +300,13 @@
           <w:b/>
           <w:bCs/>
         </w:rPr>
-        <w:t>Partial</w:t>
-      </w:r>
-      <w:r>
-        <w:rPr>
-          <w:rFonts w:ascii="Calibri" w:hAnsi="Calibri" w:cs="Calibri"/>
-        </w:rPr>
-        <w:t xml:space="preserve">; runtime validation/projection/resolution and authoring are isolated; migration and expand/fold isolation remain. AR-03A is </w:t>
+        <w:t>Baseline / closed upon explicit owner acceptance/merge</w:t>
+      </w:r>
+      <w:r>
+        <w:rPr>
+          <w:rFonts w:ascii="Calibri" w:hAnsi="Calibri" w:cs="Calibri"/>
+        </w:rPr>
+        <w:t xml:space="preserve">; original same-input characterization and separate ownership are verified. AR-03A is </w:t>
       </w:r>
       <w:r>
         <w:rPr>
@@ -356,6 +356,20 @@
           <w:b/>
           <w:bCs/>
         </w:rPr>
+        <w:t>Baseline / closed.</w:t>
+      </w:r>
+      <w:r>
+        <w:rPr>
+          <w:rFonts w:ascii="Calibri" w:hAnsi="Calibri" w:cs="Calibri"/>
+        </w:rPr>
+        <w:t xml:space="preserve"> AR-03E is </w:t>
+      </w:r>
+      <w:r>
+        <w:rPr>
+          <w:rFonts w:ascii="Calibri" w:hAnsi="Calibri" w:cs="Calibri"/>
+          <w:b/>
+          <w:bCs/>
+        </w:rPr>
         <w:t>Baseline / closed upon explicit owner acceptance/merge.</w:t>
       </w:r>
       <w:r>
@@ -376,7 +390,7 @@
         <w:rPr>
           <w:rFonts w:ascii="Calibri" w:hAnsi="Calibri" w:cs="Calibri"/>
         </w:rPr>
-        <w:t xml:space="preserve">. AR-23 depends on AR-01 and is not serialized behind visual work. BATCH-03 is complete. BATCH-04 is complete. BATCH-05 is complete. BATCH-06 continues with AR-03E after AR-03D merges and safe synchronization. AR-03E is the exact next selected child after AR-03D merges and safe synchronization. BATCH-06 selects no third task. This tracker owns current status; the roadmap owns dependency order. Retained B01 exact-next, fixed-two-call/mandatory-three-concept, transient-only, and 73-child future-sequence statements are </w:t>
+        <w:t xml:space="preserve">. AR-23 depends on AR-01 and is not serialized behind visual work. BATCH-03 is complete. BATCH-04 is complete. BATCH-05 is complete. BATCH-06 is complete upon AR-03E acceptance/merge and safe closeout. No next reset task is selected. BATCH-06 selects no third task. This tracker owns current status; the roadmap owns dependency order. Retained B01 exact-next, fixed-two-call/mandatory-three-concept, transient-only, and 73-child future-sequence statements are </w:t>
       </w:r>
       <w:r>
         <w:rPr>
@@ -913,7 +927,7 @@
               <w:rPr>
                 <w:rFonts w:ascii="Calibri" w:hAnsi="Calibri" w:cs="Calibri"/>
               </w:rPr>
-              <w:t>Status effective on AR-03D acceptance/merge</w:t>
+              <w:t>Status effective on AR-03E acceptance/merge</w:t>
             </w:r>
           </w:p>
         </w:tc>
@@ -2153,6 +2167,127 @@
                   <w:u w:val="single"/>
                 </w:rPr>
                 <w:t>report</w:t>
+              </w:r>
+            </w:hyperlink>
+          </w:p>
+        </w:tc>
+        <w:tc>
+          <w:tcPr>
+            <w:tcW w:w="8460" w:type="dxa"/>
+            <w:vAlign w:val="center"/>
+          </w:tcPr>
+          <w:p>
+            <w:pPr>
+              <w:pStyle w:val="TableText"/>
+              <w:widowControl/>
+            </w:pPr>
+            <w:r>
+              <w:rPr>
+                <w:rFonts w:ascii="Calibri" w:hAnsi="Calibri" w:cs="Calibri"/>
+                <w:b/>
+                <w:bCs/>
+              </w:rPr>
+              <w:t>Baseline / closed</w:t>
+            </w:r>
+          </w:p>
+        </w:tc>
+      </w:tr>
+      <w:tr>
+        <w:trPr>
+          <w:cantSplit/>
+        </w:trPr>
+        <w:tc>
+          <w:tcPr>
+            <w:tcW w:w="1000" w:type="dxa"/>
+            <w:vAlign w:val="center"/>
+          </w:tcPr>
+          <w:p>
+            <w:pPr>
+              <w:pStyle w:val="TableText"/>
+              <w:widowControl/>
+            </w:pPr>
+            <w:r>
+              <w:rPr>
+                <w:rFonts w:ascii="Calibri" w:hAnsi="Calibri" w:cs="Calibri"/>
+              </w:rPr>
+              <w:t>AR-03E</w:t>
+            </w:r>
+          </w:p>
+        </w:tc>
+        <w:tc>
+          <w:tcPr>
+            <w:tcW w:w="1500" w:type="dxa"/>
+            <w:vAlign w:val="center"/>
+          </w:tcPr>
+          <w:p>
+            <w:pPr>
+              <w:pStyle w:val="TableText"/>
+              <w:widowControl/>
+            </w:pPr>
+            <w:r>
+              <w:rPr>
+                <w:rFonts w:ascii="Calibri" w:hAnsi="Calibri" w:cs="Calibri"/>
+              </w:rPr>
+              <w:t>AR-03</w:t>
+            </w:r>
+          </w:p>
+        </w:tc>
+        <w:tc>
+          <w:tcPr>
+            <w:tcW w:w="2000" w:type="dxa"/>
+            <w:vAlign w:val="center"/>
+          </w:tcPr>
+          <w:p>
+            <w:pPr>
+              <w:pStyle w:val="TableText"/>
+              <w:widowControl/>
+            </w:pPr>
+            <w:r>
+              <w:rPr>
+                <w:rFonts w:ascii="Calibri" w:hAnsi="Calibri" w:cs="Calibri"/>
+              </w:rPr>
+              <w:t xml:space="preserve">Legacy migration, distinct transient projections and shared bridge schemas; </w:t>
+            </w:r>
+            <w:hyperlink r:id="rIdHyperlink27" w:history="1">
+              <w:r>
+                <w:rPr>
+                  <w:rFonts w:ascii="Calibri" w:hAnsi="Calibri" w:cs="Calibri"/>
+                  <w:color w:val="2E74B5"/>
+                  <w:u w:val="single"/>
+                </w:rPr>
+                <w:t>contract</w:t>
+              </w:r>
+            </w:hyperlink>
+            <w:r>
+              <w:rPr>
+                <w:rFonts w:ascii="Calibri" w:hAnsi="Calibri" w:cs="Calibri"/>
+              </w:rPr>
+              <w:t xml:space="preserve">, </w:t>
+            </w:r>
+            <w:hyperlink r:id="rIdHyperlink28" w:history="1">
+              <w:r>
+                <w:rPr>
+                  <w:rFonts w:ascii="Calibri" w:hAnsi="Calibri" w:cs="Calibri"/>
+                  <w:color w:val="2E74B5"/>
+                  <w:u w:val="single"/>
+                </w:rPr>
+                <w:t>report</w:t>
+              </w:r>
+            </w:hyperlink>
+            <w:r>
+              <w:rPr>
+                <w:rFonts w:ascii="Calibri" w:hAnsi="Calibri" w:cs="Calibri"/>
+              </w:rPr>
+              <w:t xml:space="preserve">, </w:t>
+            </w:r>
+            <w:hyperlink r:id="rIdHyperlink29" w:history="1">
+              <w:r>
+                <w:rPr>
+                  <w:rFonts w:ascii="Calibri" w:hAnsi="Calibri" w:cs="Calibri"/>
+                  <w:color w:val="2E74B5"/>
+                  <w:u w:val="single"/>
+                </w:rPr>
+                <w:t>parent acceptance</w:t>
               </w:r>
             </w:hyperlink>
           </w:p>
@@ -22115,7 +22250,7 @@
         </w:rPr>
         <w:t xml:space="preserve">. Completed 7 August 2026; see </w:t>
       </w:r>
-      <w:hyperlink r:id="rIdHyperlink27" w:history="1">
+      <w:hyperlink r:id="rIdHyperlink30" w:history="1">
         <w:r>
           <w:rPr>
             <w:rFonts w:ascii="Calibri" w:hAnsi="Calibri" w:cs="Calibri"/>
@@ -22252,7 +22387,7 @@
         </w:rPr>
         <w:t xml:space="preserve">The binding details and minimum coverage are in </w:t>
       </w:r>
-      <w:hyperlink r:id="rIdHyperlink28" w:history="1">
+      <w:hyperlink r:id="rIdHyperlink31" w:history="1">
         <w:r>
           <w:rPr>
             <w:rFonts w:ascii="Calibri" w:hAnsi="Calibri" w:cs="Calibri"/>
@@ -22450,7 +22585,7 @@
         </w:rPr>
         <w:t xml:space="preserve">. P10B-16P-04 acceptance evidence is retained in </w:t>
       </w:r>
-      <w:hyperlink r:id="rIdHyperlink29" w:history="1">
+      <w:hyperlink r:id="rIdHyperlink32" w:history="1">
         <w:r>
           <w:rPr>
             <w:rFonts w:ascii="Calibri" w:hAnsi="Calibri" w:cs="Calibri"/>
@@ -22699,7 +22834,7 @@
         </w:rPr>
         <w:t xml:space="preserve">. See </w:t>
       </w:r>
-      <w:hyperlink r:id="rIdHyperlink30" w:history="1">
+      <w:hyperlink r:id="rIdHyperlink33" w:history="1">
         <w:r>
           <w:rPr>
             <w:rFonts w:ascii="Calibri" w:hAnsi="Calibri" w:cs="Calibri"/>
@@ -22948,7 +23083,7 @@
         </w:rPr>
         <w:t xml:space="preserve">. See </w:t>
       </w:r>
-      <w:hyperlink r:id="rIdHyperlink31" w:history="1">
+      <w:hyperlink r:id="rIdHyperlink34" w:history="1">
         <w:r>
           <w:rPr>
             <w:rFonts w:ascii="Calibri" w:hAnsi="Calibri" w:cs="Calibri"/>
@@ -23197,7 +23332,7 @@
         </w:rPr>
         <w:t xml:space="preserve">. At P10B-03 delivery, all then-current 25 V2 definitions and 91 variants were classified explicitly without false commercial-ready promotion. Later family tasks extend that same authority rather than replacing it. See </w:t>
       </w:r>
-      <w:hyperlink r:id="rIdHyperlink32" w:history="1">
+      <w:hyperlink r:id="rIdHyperlink35" w:history="1">
         <w:r>
           <w:rPr>
             <w:rFonts w:ascii="Calibri" w:hAnsi="Calibri" w:cs="Calibri"/>
@@ -23446,7 +23581,7 @@
         </w:rPr>
         <w:t xml:space="preserve"> embeds exact lineage and bounded treatment in the existing approved presentation, consumes Design DNA and registered anatomy, projects protected same-product media, preserves authority through lifecycle/compiler boundaries, and renders semantic four-breakpoint evidence. Production CDN transforms and retained commercial visual acceptance remain deferred. See </w:t>
       </w:r>
-      <w:hyperlink r:id="rIdHyperlink33" w:history="1">
+      <w:hyperlink r:id="rIdHyperlink36" w:history="1">
         <w:r>
           <w:rPr>
             <w:rFonts w:ascii="Calibri" w:hAnsi="Calibri" w:cs="Calibri"/>
@@ -23695,7 +23830,7 @@
         </w:rPr>
         <w:t xml:space="preserve">. See </w:t>
       </w:r>
-      <w:hyperlink r:id="rIdHyperlink34" w:history="1">
+      <w:hyperlink r:id="rIdHyperlink37" w:history="1">
         <w:r>
           <w:rPr>
             <w:rFonts w:ascii="Calibri" w:hAnsi="Calibri" w:cs="Calibri"/>
@@ -23930,7 +24065,7 @@
         </w:rPr>
         <w:t xml:space="preserve">. Four exact root-frame profiles, three mobile modes, and four footer compositions preserve canonical navigation and frame identity through snapshot, save/reload, Puck root, preview, publication compilation, EN/FI, and 375/768/1024/1440 px evidence. See </w:t>
       </w:r>
-      <w:hyperlink r:id="rIdHyperlink35" w:history="1">
+      <w:hyperlink r:id="rIdHyperlink38" w:history="1">
         <w:r>
           <w:rPr>
             <w:rFonts w:ascii="Calibri" w:hAnsi="Calibri" w:cs="Calibri"/>
@@ -24165,7 +24300,7 @@
         </w:rPr>
         <w:t xml:space="preserve">. Six meaningful hero anatomies, five editorial/story anatomies, five campaign/promotion anatomies and three evidence-grounded proof/service anatomies are registered, PageBlueprint-selectable, deterministically generated, snapshot/publish preserved and rendered through one shared implementation. Focused deterministic coverage and a zero-provider Chromium scenario retain evidence at 375, 768, 1024 and 1440 px. See </w:t>
       </w:r>
-      <w:hyperlink r:id="rIdHyperlink36" w:history="1">
+      <w:hyperlink r:id="rIdHyperlink39" w:history="1">
         <w:r>
           <w:rPr>
             <w:rFonts w:ascii="Calibri" w:hAnsi="Calibri" w:cs="Calibri"/>
@@ -24214,7 +24349,7 @@
         </w:rPr>
         <w:t xml:space="preserve"> Baseline. One fingerprinted authority and renderer now serve homepage merchandising, collection/results, related products, and legacy compatibility. Five meaningful anatomies preserve canonical facts and P10B-04 media lineage through plan, proposal, snapshot, save/reload, publish, and responsive browser evidence. See </w:t>
       </w:r>
-      <w:hyperlink r:id="rIdHyperlink37" w:history="1">
+      <w:hyperlink r:id="rIdHyperlink40" w:history="1">
         <w:r>
           <w:rPr>
             <w:rFonts w:ascii="Calibri" w:hAnsi="Calibri" w:cs="Calibri"/>
@@ -24431,7 +24566,7 @@
         </w:rPr>
         <w:t xml:space="preserve"> Baseline. Six versioned, structurally fingerprinted homepage PageBlueprint profiles compose current shared-frame, commercial storytelling, canonical product-card, approved-media, and Design DNA authority. Evidence/cardinality guards fail closed; deterministic lifecycle and 24 retained four-width browser images pass. See </w:t>
       </w:r>
-      <w:hyperlink r:id="rIdHyperlink38" w:history="1">
+      <w:hyperlink r:id="rIdHyperlink41" w:history="1">
         <w:r>
           <w:rPr>
             <w:rFonts w:ascii="Calibri" w:hAnsi="Calibri" w:cs="Calibri"/>
@@ -24662,7 +24797,7 @@
         </w:rPr>
         <w:t xml:space="preserve"> anatomy, P10B-08 canonical card anatomy, and P10B-04 approved media treatment. Exact canonical catalogue bindings preserve product membership/order, facts, product media, filters/sort state, and child-collection order. Campaign media is approved collection/editorial media, not a product-media replacement. A transient revision-checked zero-result context keeps the query without fabricating products. Deterministic lifecycle and 16-view Chromium evidence pass with zero provider calls. See </w:t>
       </w:r>
-      <w:hyperlink r:id="rIdHyperlink39" w:history="1">
+      <w:hyperlink r:id="rIdHyperlink42" w:history="1">
         <w:r>
           <w:rPr>
             <w:rFonts w:ascii="Calibri" w:hAnsi="Calibri" w:cs="Calibri"/>
@@ -25192,7 +25327,7 @@
         </w:rPr>
         <w:t xml:space="preserve">. Fifteen structurally distinct registered profiles resolve exact current approved brief evidence into strict localized fact documents. P10B-05 preserves page-set, route, locale, and transitive navigation authority; P10B-06 frames and P10B-07 editorial/campaign renderers are reused. Snapshot save/reload and deterministic publication preserve the exact document. See </w:t>
       </w:r>
-      <w:hyperlink r:id="rIdHyperlink40" w:history="1">
+      <w:hyperlink r:id="rIdHyperlink43" w:history="1">
         <w:r>
           <w:rPr>
             <w:rFonts w:ascii="Calibri" w:hAnsi="Calibri" w:cs="Calibri"/>
@@ -25403,7 +25538,7 @@
         </w:rPr>
         <w:t xml:space="preserve"> component through the P10B-05 family page; registered loading state renders on its pending route instead of replacing the 404 singleton. Read-only runtime state supplies canonical cart facts, checkout continuation, P10B-10 query/filter context, and bounded recovery actions while the snapshot preserves presentation only. Shared-frame/Design DNA, save/reload, publication, four- width browser evidence, and no-provider behavior are covered under </w:t>
       </w:r>
-      <w:hyperlink r:id="rIdHyperlink41" w:history="1">
+      <w:hyperlink r:id="rIdHyperlink44" w:history="1">
         <w:r>
           <w:rPr>
             <w:rFonts w:ascii="Calibri" w:hAnsi="Calibri" w:cs="Calibri"/>
@@ -25614,7 +25749,7 @@
         </w:rPr>
         <w:t xml:space="preserve"> frame span all pages; simple/configurable PDP, factual content, utility states, 15 four-width/representative screenshots and the passing 160-scenario human record are retained in </w:t>
       </w:r>
-      <w:hyperlink r:id="rIdHyperlink42" w:history="1">
+      <w:hyperlink r:id="rIdHyperlink45" w:history="1">
         <w:r>
           <w:rPr>
             <w:rFonts w:ascii="Calibri" w:hAnsi="Calibri" w:cs="Calibri"/>
@@ -25825,7 +25960,7 @@
         </w:rPr>
         <w:t xml:space="preserve"> One versioned deterministic synthesis contract binds exact merchant, evidence, commerce, asset, Design DNA, site-map, frame, PageBlueprint/profile, component/anatomy, narrative, density, art-direction, responsive, planner, registry and recipe authority. The same approved fixture produces editorial-heavy, commerce/discovery-heavy and restrained/minimal complete 17-route stores through the existing whole-storefront proposal, snapshot, save/reload, renderer and immutable publication chain. Details are retained in </w:t>
       </w:r>
-      <w:hyperlink r:id="rIdHyperlink43" w:history="1">
+      <w:hyperlink r:id="rIdHyperlink46" w:history="1">
         <w:r>
           <w:rPr>
             <w:rFonts w:ascii="Calibri" w:hAnsi="Calibri" w:cs="Calibri"/>
@@ -26070,7 +26205,7 @@
         </w:rPr>
         <w:t xml:space="preserve"> 31 focused unit/integration cases; nine representative complete outcomes; exact save/reload and compiled publication; protected commerce/evidence/media parity; dedicated 375/768/1024/1440 browser coverage; three retained human commercial reviews and one exact evidence manifest. See </w:t>
       </w:r>
-      <w:hyperlink r:id="rIdHyperlink44" w:history="1">
+      <w:hyperlink r:id="rIdHyperlink47" w:history="1">
         <w:r>
           <w:rPr>
             <w:rFonts w:ascii="Calibri" w:hAnsi="Calibri" w:cs="Calibri"/>
@@ -26247,7 +26382,7 @@
         </w:rPr>
         <w:t xml:space="preserve"> A compact route inventory, four collection/search archetypes, four maintained PDP profiles plus generic fallback, exact collection and product-type mappings, bounded matching rules, transient editor/runtime projection, deterministic legacy convergence, and complete snapshot/lifecycle/publication preservation. Exact primary and related-product bindings survive convergence. A server-owned, storefront-scoped proposal transition binds legacy and reviewed canonical projections for deterministic acceptance replay. Storefront Studio lists archetypes rather than one page per commerce URL; representative context is not persisted. See </w:t>
       </w:r>
-      <w:hyperlink r:id="rIdHyperlink45" w:history="1">
+      <w:hyperlink r:id="rIdHyperlink48" w:history="1">
         <w:r>
           <w:rPr>
             <w:rFonts w:ascii="Calibri" w:hAnsi="Calibri" w:cs="Calibri"/>
@@ -26715,7 +26850,7 @@
         </w:rPr>
         <w:t xml:space="preserve"> </w:t>
       </w:r>
-      <w:hyperlink r:id="rIdHyperlink46" w:history="1">
+      <w:hyperlink r:id="rIdHyperlink49" w:history="1">
         <w:r>
           <w:rPr>
             <w:rFonts w:ascii="Calibri" w:hAnsi="Calibri" w:cs="Calibri"/>
@@ -27176,7 +27311,7 @@
         </w:rPr>
         <w:t xml:space="preserve">. Completed 15 August 2026; see </w:t>
       </w:r>
-      <w:hyperlink r:id="rIdHyperlink29" w:history="1">
+      <w:hyperlink r:id="rIdHyperlink32" w:history="1">
         <w:r>
           <w:rPr>
             <w:rFonts w:ascii="Calibri" w:hAnsi="Calibri" w:cs="Calibri"/>
@@ -28438,7 +28573,7 @@
         </w:rPr>
         <w:t xml:space="preserve">. Accepted by the product owner on 16 August 2026 under </w:t>
       </w:r>
-      <w:hyperlink r:id="rIdHyperlink47" w:history="1">
+      <w:hyperlink r:id="rIdHyperlink50" w:history="1">
         <w:r>
           <w:rPr>
             <w:rFonts w:ascii="Calibri" w:hAnsi="Calibri" w:cs="Calibri"/>
@@ -28796,7 +28931,7 @@
         </w:rPr>
         <w:t xml:space="preserve">. Accepted by the product owner on 17 August 2026 under </w:t>
       </w:r>
-      <w:hyperlink r:id="rIdHyperlink47" w:history="1">
+      <w:hyperlink r:id="rIdHyperlink50" w:history="1">
         <w:r>
           <w:rPr>
             <w:rFonts w:ascii="Calibri" w:hAnsi="Calibri" w:cs="Calibri"/>
@@ -31936,7 +32071,7 @@
         </w:rPr>
         <w:t xml:space="preserve"> </w:t>
       </w:r>
-      <w:hyperlink r:id="rIdHyperlink48" w:history="1">
+      <w:hyperlink r:id="rIdHyperlink51" w:history="1">
         <w:r>
           <w:rPr>
             <w:rFonts w:ascii="Calibri" w:hAnsi="Calibri" w:cs="Calibri"/>
@@ -31952,7 +32087,7 @@
         </w:rPr>
         <w:t xml:space="preserve"> and </w:t>
       </w:r>
-      <w:hyperlink r:id="rIdHyperlink49" w:history="1">
+      <w:hyperlink r:id="rIdHyperlink52" w:history="1">
         <w:r>
           <w:rPr>
             <w:rFonts w:ascii="Calibri" w:hAnsi="Calibri" w:cs="Calibri"/>

</xml_diff>

<commit_message>
refactor(ar-02i): isolate planner metadata consumption
</commit_message>
<xml_diff>
--- a/docs/VESKIFY_DEVELOPMENT_DELIVERY_TRACKER_v1.3.0.docx
+++ b/docs/VESKIFY_DEVELOPMENT_DELIVERY_TRACKER_v1.3.0.docx
@@ -51,7 +51,7 @@
         <w:rPr>
           <w:rFonts w:ascii="Calibri" w:hAnsi="Calibri" w:cs="Calibri"/>
         </w:rPr>
-        <w:t>Effective upon explicit AR-03E acceptance/merge: AR-02A through AR-02H, AR-03 and AR-03A through AR-03E Baseline / closed; AR-02 Partial; AR-23 eligible / unstarted; BATCH-05 complete; BATCH-06 complete upon E merge and safe closeout; no next child selected</w:t>
+        <w:t>Effective upon explicit AR-02I acceptance/merge: AR-02A through AR-02I Baseline / closed; AR-03 and AR-03A through AR-03E remain closed; AR-02 Partial with mapped metadata-consumer gaps; AR-23 eligible / unstarted; BATCH-06 complete; BATCH-07 complete upon I merge and safe closeout; no next task selected</w:t>
       </w:r>
     </w:p>
     <w:p>
@@ -118,7 +118,7 @@
           <w:b/>
           <w:bCs/>
         </w:rPr>
-        <w:t>Candidate status effective upon explicit owner acceptance/merge of AR-03E:</w:t>
+        <w:t>Candidate status effective upon explicit owner acceptance/merge of AR-02I:</w:t>
       </w:r>
       <w:r>
         <w:rPr>
@@ -278,6 +278,20 @@
         <w:rPr>
           <w:rFonts w:ascii="Calibri" w:hAnsi="Calibri" w:cs="Calibri"/>
         </w:rPr>
+        <w:t xml:space="preserve"> AR-02I is </w:t>
+      </w:r>
+      <w:r>
+        <w:rPr>
+          <w:rFonts w:ascii="Calibri" w:hAnsi="Calibri" w:cs="Calibri"/>
+          <w:b/>
+          <w:bCs/>
+        </w:rPr>
+        <w:t>Baseline / closed upon explicit owner acceptance/merge.</w:t>
+      </w:r>
+      <w:r>
+        <w:rPr>
+          <w:rFonts w:ascii="Calibri" w:hAnsi="Calibri" w:cs="Calibri"/>
+        </w:rPr>
         <w:t xml:space="preserve"> AR-02 is </w:t>
       </w:r>
       <w:r>
@@ -292,15 +306,15 @@
         <w:rPr>
           <w:rFonts w:ascii="Calibri" w:hAnsi="Calibri" w:cs="Calibri"/>
         </w:rPr>
-        <w:t xml:space="preserve">; remaining consumer/materializer isolation remains. AR-03 is </w:t>
-      </w:r>
-      <w:r>
-        <w:rPr>
-          <w:rFonts w:ascii="Calibri" w:hAnsi="Calibri" w:cs="Calibri"/>
-          <w:b/>
-          <w:bCs/>
-        </w:rPr>
-        <w:t>Baseline / closed upon explicit owner acceptance/merge</w:t>
+        <w:t xml:space="preserve">; remaining metadata consumers are mapped in AR_02_BOUNDARY_ACCEPTANCE.md. AR-03 is </w:t>
+      </w:r>
+      <w:r>
+        <w:rPr>
+          <w:rFonts w:ascii="Calibri" w:hAnsi="Calibri" w:cs="Calibri"/>
+          <w:b/>
+          <w:bCs/>
+        </w:rPr>
+        <w:t>Baseline / closed</w:t>
       </w:r>
       <w:r>
         <w:rPr>
@@ -370,7 +384,7 @@
           <w:b/>
           <w:bCs/>
         </w:rPr>
-        <w:t>Baseline / closed upon explicit owner acceptance/merge.</w:t>
+        <w:t>Baseline / closed.</w:t>
       </w:r>
       <w:r>
         <w:rPr>
@@ -390,7 +404,7 @@
         <w:rPr>
           <w:rFonts w:ascii="Calibri" w:hAnsi="Calibri" w:cs="Calibri"/>
         </w:rPr>
-        <w:t xml:space="preserve">. AR-23 depends on AR-01 and is not serialized behind visual work. BATCH-03 is complete. BATCH-04 is complete. BATCH-05 is complete. BATCH-06 is complete upon AR-03E acceptance/merge and safe closeout. No next reset task is selected. BATCH-06 selects no third task. This tracker owns current status; the roadmap owns dependency order. Retained B01 exact-next, fixed-two-call/mandatory-three-concept, transient-only, and 73-child future-sequence statements are </w:t>
+        <w:t xml:space="preserve">. AR-23 depends on AR-01 and is not serialized behind visual work. BATCH-03 is complete. BATCH-04 is complete. BATCH-05 is complete. BATCH-06 is complete. BATCH-07 is complete upon AR-02I acceptance/merge and safe closeout. No next reset task is selected. BATCH-07 selects no additional task. This tracker owns current status; the roadmap owns dependency order. Retained B01 exact-next, fixed-two-call/mandatory-three-concept, transient-only, and 73-child future-sequence statements are </w:t>
       </w:r>
       <w:r>
         <w:rPr>
@@ -927,7 +941,7 @@
               <w:rPr>
                 <w:rFonts w:ascii="Calibri" w:hAnsi="Calibri" w:cs="Calibri"/>
               </w:rPr>
-              <w:t>Status effective on AR-03E acceptance/merge</w:t>
+              <w:t>Status; I conditional on acceptance/merge</w:t>
             </w:r>
           </w:p>
         </w:tc>
@@ -1895,7 +1909,7 @@
               <w:rPr>
                 <w:rFonts w:ascii="Calibri" w:hAnsi="Calibri" w:cs="Calibri"/>
               </w:rPr>
-              <w:t>AR-03B</w:t>
+              <w:t>AR-02I</w:t>
             </w:r>
           </w:p>
         </w:tc>
@@ -1913,7 +1927,7 @@
               <w:rPr>
                 <w:rFonts w:ascii="Calibri" w:hAnsi="Calibri" w:cs="Calibri"/>
               </w:rPr>
-              <w:t>AR-03</w:t>
+              <w:t>AR-02</w:t>
             </w:r>
           </w:p>
         </w:tc>
@@ -1931,7 +1945,7 @@
               <w:rPr>
                 <w:rFonts w:ascii="Calibri" w:hAnsi="Calibri" w:cs="Calibri"/>
               </w:rPr>
-              <w:t xml:space="preserve">Renderer-free presentation construction and exact historical compatibility; </w:t>
+              <w:t xml:space="preserve">Renderer-free existing planner, recipe and provider metadata consumption; </w:t>
             </w:r>
             <w:hyperlink r:id="rIdHyperlink21" w:history="1">
               <w:r>
@@ -1959,6 +1973,22 @@
                 <w:t>report</w:t>
               </w:r>
             </w:hyperlink>
+            <w:r>
+              <w:rPr>
+                <w:rFonts w:ascii="Calibri" w:hAnsi="Calibri" w:cs="Calibri"/>
+              </w:rPr>
+              <w:t xml:space="preserve">, </w:t>
+            </w:r>
+            <w:hyperlink r:id="rIdHyperlink23" w:history="1">
+              <w:r>
+                <w:rPr>
+                  <w:rFonts w:ascii="Calibri" w:hAnsi="Calibri" w:cs="Calibri"/>
+                  <w:color w:val="2E74B5"/>
+                  <w:u w:val="single"/>
+                </w:rPr>
+                <w:t>parent evidence</w:t>
+              </w:r>
+            </w:hyperlink>
           </w:p>
         </w:tc>
         <w:tc>
@@ -1978,6 +2008,12 @@
                 <w:bCs/>
               </w:rPr>
               <w:t>Baseline / closed</w:t>
+            </w:r>
+            <w:r>
+              <w:rPr>
+                <w:rFonts w:ascii="Calibri" w:hAnsi="Calibri" w:cs="Calibri"/>
+              </w:rPr>
+              <w:t xml:space="preserve"> upon acceptance/merge</w:t>
             </w:r>
           </w:p>
         </w:tc>
@@ -2000,7 +2036,7 @@
               <w:rPr>
                 <w:rFonts w:ascii="Calibri" w:hAnsi="Calibri" w:cs="Calibri"/>
               </w:rPr>
-              <w:t>AR-03C</w:t>
+              <w:t>AR-03B</w:t>
             </w:r>
           </w:p>
         </w:tc>
@@ -2036,9 +2072,9 @@
               <w:rPr>
                 <w:rFonts w:ascii="Calibri" w:hAnsi="Calibri" w:cs="Calibri"/>
               </w:rPr>
-              <w:t xml:space="preserve">Current-authority validation, route projection/resolution and four preview import cutovers; </w:t>
-            </w:r>
-            <w:hyperlink r:id="rIdHyperlink23" w:history="1">
+              <w:t xml:space="preserve">Renderer-free presentation construction and exact historical compatibility; </w:t>
+            </w:r>
+            <w:hyperlink r:id="rIdHyperlink24" w:history="1">
               <w:r>
                 <w:rPr>
                   <w:rFonts w:ascii="Calibri" w:hAnsi="Calibri" w:cs="Calibri"/>
@@ -2054,7 +2090,7 @@
               </w:rPr>
               <w:t xml:space="preserve">, </w:t>
             </w:r>
-            <w:hyperlink r:id="rIdHyperlink24" w:history="1">
+            <w:hyperlink r:id="rIdHyperlink25" w:history="1">
               <w:r>
                 <w:rPr>
                   <w:rFonts w:ascii="Calibri" w:hAnsi="Calibri" w:cs="Calibri"/>
@@ -2105,7 +2141,7 @@
               <w:rPr>
                 <w:rFonts w:ascii="Calibri" w:hAnsi="Calibri" w:cs="Calibri"/>
               </w:rPr>
-              <w:t>AR-03D</w:t>
+              <w:t>AR-03C</w:t>
             </w:r>
           </w:p>
         </w:tc>
@@ -2141,9 +2177,9 @@
               <w:rPr>
                 <w:rFonts w:ascii="Calibri" w:hAnsi="Calibri" w:cs="Calibri"/>
               </w:rPr>
-              <w:t xml:space="preserve">Design-selection contracts/operations and editor projection with three named consumer cutovers; </w:t>
-            </w:r>
-            <w:hyperlink r:id="rIdHyperlink25" w:history="1">
+              <w:t xml:space="preserve">Current-authority validation, route projection/resolution and four preview import cutovers; </w:t>
+            </w:r>
+            <w:hyperlink r:id="rIdHyperlink26" w:history="1">
               <w:r>
                 <w:rPr>
                   <w:rFonts w:ascii="Calibri" w:hAnsi="Calibri" w:cs="Calibri"/>
@@ -2159,7 +2195,7 @@
               </w:rPr>
               <w:t xml:space="preserve">, </w:t>
             </w:r>
-            <w:hyperlink r:id="rIdHyperlink26" w:history="1">
+            <w:hyperlink r:id="rIdHyperlink27" w:history="1">
               <w:r>
                 <w:rPr>
                   <w:rFonts w:ascii="Calibri" w:hAnsi="Calibri" w:cs="Calibri"/>
@@ -2210,7 +2246,7 @@
               <w:rPr>
                 <w:rFonts w:ascii="Calibri" w:hAnsi="Calibri" w:cs="Calibri"/>
               </w:rPr>
-              <w:t>AR-03E</w:t>
+              <w:t>AR-03D</w:t>
             </w:r>
           </w:p>
         </w:tc>
@@ -2246,9 +2282,9 @@
               <w:rPr>
                 <w:rFonts w:ascii="Calibri" w:hAnsi="Calibri" w:cs="Calibri"/>
               </w:rPr>
-              <w:t xml:space="preserve">Legacy migration, distinct transient projections and shared bridge schemas; </w:t>
-            </w:r>
-            <w:hyperlink r:id="rIdHyperlink27" w:history="1">
+              <w:t xml:space="preserve">Design-selection contracts/operations and editor projection with three named consumer cutovers; </w:t>
+            </w:r>
+            <w:hyperlink r:id="rIdHyperlink28" w:history="1">
               <w:r>
                 <w:rPr>
                   <w:rFonts w:ascii="Calibri" w:hAnsi="Calibri" w:cs="Calibri"/>
@@ -2264,7 +2300,7 @@
               </w:rPr>
               <w:t xml:space="preserve">, </w:t>
             </w:r>
-            <w:hyperlink r:id="rIdHyperlink28" w:history="1">
+            <w:hyperlink r:id="rIdHyperlink29" w:history="1">
               <w:r>
                 <w:rPr>
                   <w:rFonts w:ascii="Calibri" w:hAnsi="Calibri" w:cs="Calibri"/>
@@ -2274,13 +2310,118 @@
                 <w:t>report</w:t>
               </w:r>
             </w:hyperlink>
+          </w:p>
+        </w:tc>
+        <w:tc>
+          <w:tcPr>
+            <w:tcW w:w="8460" w:type="dxa"/>
+            <w:vAlign w:val="center"/>
+          </w:tcPr>
+          <w:p>
+            <w:pPr>
+              <w:pStyle w:val="TableText"/>
+              <w:widowControl/>
+            </w:pPr>
+            <w:r>
+              <w:rPr>
+                <w:rFonts w:ascii="Calibri" w:hAnsi="Calibri" w:cs="Calibri"/>
+                <w:b/>
+                <w:bCs/>
+              </w:rPr>
+              <w:t>Baseline / closed</w:t>
+            </w:r>
+          </w:p>
+        </w:tc>
+      </w:tr>
+      <w:tr>
+        <w:trPr>
+          <w:cantSplit/>
+        </w:trPr>
+        <w:tc>
+          <w:tcPr>
+            <w:tcW w:w="1000" w:type="dxa"/>
+            <w:vAlign w:val="center"/>
+          </w:tcPr>
+          <w:p>
+            <w:pPr>
+              <w:pStyle w:val="TableText"/>
+              <w:widowControl/>
+            </w:pPr>
+            <w:r>
+              <w:rPr>
+                <w:rFonts w:ascii="Calibri" w:hAnsi="Calibri" w:cs="Calibri"/>
+              </w:rPr>
+              <w:t>AR-03E</w:t>
+            </w:r>
+          </w:p>
+        </w:tc>
+        <w:tc>
+          <w:tcPr>
+            <w:tcW w:w="1500" w:type="dxa"/>
+            <w:vAlign w:val="center"/>
+          </w:tcPr>
+          <w:p>
+            <w:pPr>
+              <w:pStyle w:val="TableText"/>
+              <w:widowControl/>
+            </w:pPr>
+            <w:r>
+              <w:rPr>
+                <w:rFonts w:ascii="Calibri" w:hAnsi="Calibri" w:cs="Calibri"/>
+              </w:rPr>
+              <w:t>AR-03</w:t>
+            </w:r>
+          </w:p>
+        </w:tc>
+        <w:tc>
+          <w:tcPr>
+            <w:tcW w:w="2000" w:type="dxa"/>
+            <w:vAlign w:val="center"/>
+          </w:tcPr>
+          <w:p>
+            <w:pPr>
+              <w:pStyle w:val="TableText"/>
+              <w:widowControl/>
+            </w:pPr>
+            <w:r>
+              <w:rPr>
+                <w:rFonts w:ascii="Calibri" w:hAnsi="Calibri" w:cs="Calibri"/>
+              </w:rPr>
+              <w:t xml:space="preserve">Legacy migration, distinct transient projections and shared bridge schemas; </w:t>
+            </w:r>
+            <w:hyperlink r:id="rIdHyperlink30" w:history="1">
+              <w:r>
+                <w:rPr>
+                  <w:rFonts w:ascii="Calibri" w:hAnsi="Calibri" w:cs="Calibri"/>
+                  <w:color w:val="2E74B5"/>
+                  <w:u w:val="single"/>
+                </w:rPr>
+                <w:t>contract</w:t>
+              </w:r>
+            </w:hyperlink>
             <w:r>
               <w:rPr>
                 <w:rFonts w:ascii="Calibri" w:hAnsi="Calibri" w:cs="Calibri"/>
               </w:rPr>
               <w:t xml:space="preserve">, </w:t>
             </w:r>
-            <w:hyperlink r:id="rIdHyperlink29" w:history="1">
+            <w:hyperlink r:id="rIdHyperlink31" w:history="1">
+              <w:r>
+                <w:rPr>
+                  <w:rFonts w:ascii="Calibri" w:hAnsi="Calibri" w:cs="Calibri"/>
+                  <w:color w:val="2E74B5"/>
+                  <w:u w:val="single"/>
+                </w:rPr>
+                <w:t>report</w:t>
+              </w:r>
+            </w:hyperlink>
+            <w:r>
+              <w:rPr>
+                <w:rFonts w:ascii="Calibri" w:hAnsi="Calibri" w:cs="Calibri"/>
+              </w:rPr>
+              <w:t xml:space="preserve">, </w:t>
+            </w:r>
+            <w:hyperlink r:id="rIdHyperlink32" w:history="1">
               <w:r>
                 <w:rPr>
                   <w:rFonts w:ascii="Calibri" w:hAnsi="Calibri" w:cs="Calibri"/>
@@ -2309,12 +2450,6 @@
                 <w:bCs/>
               </w:rPr>
               <w:t>Baseline / closed</w:t>
-            </w:r>
-            <w:r>
-              <w:rPr>
-                <w:rFonts w:ascii="Calibri" w:hAnsi="Calibri" w:cs="Calibri"/>
-              </w:rPr>
-              <w:t xml:space="preserve"> upon acceptance/merge</w:t>
             </w:r>
           </w:p>
         </w:tc>
@@ -22250,7 +22385,7 @@
         </w:rPr>
         <w:t xml:space="preserve">. Completed 7 August 2026; see </w:t>
       </w:r>
-      <w:hyperlink r:id="rIdHyperlink30" w:history="1">
+      <w:hyperlink r:id="rIdHyperlink33" w:history="1">
         <w:r>
           <w:rPr>
             <w:rFonts w:ascii="Calibri" w:hAnsi="Calibri" w:cs="Calibri"/>
@@ -22387,7 +22522,7 @@
         </w:rPr>
         <w:t xml:space="preserve">The binding details and minimum coverage are in </w:t>
       </w:r>
-      <w:hyperlink r:id="rIdHyperlink31" w:history="1">
+      <w:hyperlink r:id="rIdHyperlink34" w:history="1">
         <w:r>
           <w:rPr>
             <w:rFonts w:ascii="Calibri" w:hAnsi="Calibri" w:cs="Calibri"/>
@@ -22585,7 +22720,7 @@
         </w:rPr>
         <w:t xml:space="preserve">. P10B-16P-04 acceptance evidence is retained in </w:t>
       </w:r>
-      <w:hyperlink r:id="rIdHyperlink32" w:history="1">
+      <w:hyperlink r:id="rIdHyperlink35" w:history="1">
         <w:r>
           <w:rPr>
             <w:rFonts w:ascii="Calibri" w:hAnsi="Calibri" w:cs="Calibri"/>
@@ -22834,7 +22969,7 @@
         </w:rPr>
         <w:t xml:space="preserve">. See </w:t>
       </w:r>
-      <w:hyperlink r:id="rIdHyperlink33" w:history="1">
+      <w:hyperlink r:id="rIdHyperlink36" w:history="1">
         <w:r>
           <w:rPr>
             <w:rFonts w:ascii="Calibri" w:hAnsi="Calibri" w:cs="Calibri"/>
@@ -23083,7 +23218,7 @@
         </w:rPr>
         <w:t xml:space="preserve">. See </w:t>
       </w:r>
-      <w:hyperlink r:id="rIdHyperlink34" w:history="1">
+      <w:hyperlink r:id="rIdHyperlink37" w:history="1">
         <w:r>
           <w:rPr>
             <w:rFonts w:ascii="Calibri" w:hAnsi="Calibri" w:cs="Calibri"/>
@@ -23332,7 +23467,7 @@
         </w:rPr>
         <w:t xml:space="preserve">. At P10B-03 delivery, all then-current 25 V2 definitions and 91 variants were classified explicitly without false commercial-ready promotion. Later family tasks extend that same authority rather than replacing it. See </w:t>
       </w:r>
-      <w:hyperlink r:id="rIdHyperlink35" w:history="1">
+      <w:hyperlink r:id="rIdHyperlink38" w:history="1">
         <w:r>
           <w:rPr>
             <w:rFonts w:ascii="Calibri" w:hAnsi="Calibri" w:cs="Calibri"/>
@@ -23581,7 +23716,7 @@
         </w:rPr>
         <w:t xml:space="preserve"> embeds exact lineage and bounded treatment in the existing approved presentation, consumes Design DNA and registered anatomy, projects protected same-product media, preserves authority through lifecycle/compiler boundaries, and renders semantic four-breakpoint evidence. Production CDN transforms and retained commercial visual acceptance remain deferred. See </w:t>
       </w:r>
-      <w:hyperlink r:id="rIdHyperlink36" w:history="1">
+      <w:hyperlink r:id="rIdHyperlink39" w:history="1">
         <w:r>
           <w:rPr>
             <w:rFonts w:ascii="Calibri" w:hAnsi="Calibri" w:cs="Calibri"/>
@@ -23830,7 +23965,7 @@
         </w:rPr>
         <w:t xml:space="preserve">. See </w:t>
       </w:r>
-      <w:hyperlink r:id="rIdHyperlink37" w:history="1">
+      <w:hyperlink r:id="rIdHyperlink40" w:history="1">
         <w:r>
           <w:rPr>
             <w:rFonts w:ascii="Calibri" w:hAnsi="Calibri" w:cs="Calibri"/>
@@ -24065,7 +24200,7 @@
         </w:rPr>
         <w:t xml:space="preserve">. Four exact root-frame profiles, three mobile modes, and four footer compositions preserve canonical navigation and frame identity through snapshot, save/reload, Puck root, preview, publication compilation, EN/FI, and 375/768/1024/1440 px evidence. See </w:t>
       </w:r>
-      <w:hyperlink r:id="rIdHyperlink38" w:history="1">
+      <w:hyperlink r:id="rIdHyperlink41" w:history="1">
         <w:r>
           <w:rPr>
             <w:rFonts w:ascii="Calibri" w:hAnsi="Calibri" w:cs="Calibri"/>
@@ -24300,7 +24435,7 @@
         </w:rPr>
         <w:t xml:space="preserve">. Six meaningful hero anatomies, five editorial/story anatomies, five campaign/promotion anatomies and three evidence-grounded proof/service anatomies are registered, PageBlueprint-selectable, deterministically generated, snapshot/publish preserved and rendered through one shared implementation. Focused deterministic coverage and a zero-provider Chromium scenario retain evidence at 375, 768, 1024 and 1440 px. See </w:t>
       </w:r>
-      <w:hyperlink r:id="rIdHyperlink39" w:history="1">
+      <w:hyperlink r:id="rIdHyperlink42" w:history="1">
         <w:r>
           <w:rPr>
             <w:rFonts w:ascii="Calibri" w:hAnsi="Calibri" w:cs="Calibri"/>
@@ -24349,7 +24484,7 @@
         </w:rPr>
         <w:t xml:space="preserve"> Baseline. One fingerprinted authority and renderer now serve homepage merchandising, collection/results, related products, and legacy compatibility. Five meaningful anatomies preserve canonical facts and P10B-04 media lineage through plan, proposal, snapshot, save/reload, publish, and responsive browser evidence. See </w:t>
       </w:r>
-      <w:hyperlink r:id="rIdHyperlink40" w:history="1">
+      <w:hyperlink r:id="rIdHyperlink43" w:history="1">
         <w:r>
           <w:rPr>
             <w:rFonts w:ascii="Calibri" w:hAnsi="Calibri" w:cs="Calibri"/>
@@ -24566,7 +24701,7 @@
         </w:rPr>
         <w:t xml:space="preserve"> Baseline. Six versioned, structurally fingerprinted homepage PageBlueprint profiles compose current shared-frame, commercial storytelling, canonical product-card, approved-media, and Design DNA authority. Evidence/cardinality guards fail closed; deterministic lifecycle and 24 retained four-width browser images pass. See </w:t>
       </w:r>
-      <w:hyperlink r:id="rIdHyperlink41" w:history="1">
+      <w:hyperlink r:id="rIdHyperlink44" w:history="1">
         <w:r>
           <w:rPr>
             <w:rFonts w:ascii="Calibri" w:hAnsi="Calibri" w:cs="Calibri"/>
@@ -24797,7 +24932,7 @@
         </w:rPr>
         <w:t xml:space="preserve"> anatomy, P10B-08 canonical card anatomy, and P10B-04 approved media treatment. Exact canonical catalogue bindings preserve product membership/order, facts, product media, filters/sort state, and child-collection order. Campaign media is approved collection/editorial media, not a product-media replacement. A transient revision-checked zero-result context keeps the query without fabricating products. Deterministic lifecycle and 16-view Chromium evidence pass with zero provider calls. See </w:t>
       </w:r>
-      <w:hyperlink r:id="rIdHyperlink42" w:history="1">
+      <w:hyperlink r:id="rIdHyperlink45" w:history="1">
         <w:r>
           <w:rPr>
             <w:rFonts w:ascii="Calibri" w:hAnsi="Calibri" w:cs="Calibri"/>
@@ -25327,7 +25462,7 @@
         </w:rPr>
         <w:t xml:space="preserve">. Fifteen structurally distinct registered profiles resolve exact current approved brief evidence into strict localized fact documents. P10B-05 preserves page-set, route, locale, and transitive navigation authority; P10B-06 frames and P10B-07 editorial/campaign renderers are reused. Snapshot save/reload and deterministic publication preserve the exact document. See </w:t>
       </w:r>
-      <w:hyperlink r:id="rIdHyperlink43" w:history="1">
+      <w:hyperlink r:id="rIdHyperlink46" w:history="1">
         <w:r>
           <w:rPr>
             <w:rFonts w:ascii="Calibri" w:hAnsi="Calibri" w:cs="Calibri"/>
@@ -25538,7 +25673,7 @@
         </w:rPr>
         <w:t xml:space="preserve"> component through the P10B-05 family page; registered loading state renders on its pending route instead of replacing the 404 singleton. Read-only runtime state supplies canonical cart facts, checkout continuation, P10B-10 query/filter context, and bounded recovery actions while the snapshot preserves presentation only. Shared-frame/Design DNA, save/reload, publication, four- width browser evidence, and no-provider behavior are covered under </w:t>
       </w:r>
-      <w:hyperlink r:id="rIdHyperlink44" w:history="1">
+      <w:hyperlink r:id="rIdHyperlink47" w:history="1">
         <w:r>
           <w:rPr>
             <w:rFonts w:ascii="Calibri" w:hAnsi="Calibri" w:cs="Calibri"/>
@@ -25749,7 +25884,7 @@
         </w:rPr>
         <w:t xml:space="preserve"> frame span all pages; simple/configurable PDP, factual content, utility states, 15 four-width/representative screenshots and the passing 160-scenario human record are retained in </w:t>
       </w:r>
-      <w:hyperlink r:id="rIdHyperlink45" w:history="1">
+      <w:hyperlink r:id="rIdHyperlink48" w:history="1">
         <w:r>
           <w:rPr>
             <w:rFonts w:ascii="Calibri" w:hAnsi="Calibri" w:cs="Calibri"/>
@@ -25960,7 +26095,7 @@
         </w:rPr>
         <w:t xml:space="preserve"> One versioned deterministic synthesis contract binds exact merchant, evidence, commerce, asset, Design DNA, site-map, frame, PageBlueprint/profile, component/anatomy, narrative, density, art-direction, responsive, planner, registry and recipe authority. The same approved fixture produces editorial-heavy, commerce/discovery-heavy and restrained/minimal complete 17-route stores through the existing whole-storefront proposal, snapshot, save/reload, renderer and immutable publication chain. Details are retained in </w:t>
       </w:r>
-      <w:hyperlink r:id="rIdHyperlink46" w:history="1">
+      <w:hyperlink r:id="rIdHyperlink49" w:history="1">
         <w:r>
           <w:rPr>
             <w:rFonts w:ascii="Calibri" w:hAnsi="Calibri" w:cs="Calibri"/>
@@ -26205,7 +26340,7 @@
         </w:rPr>
         <w:t xml:space="preserve"> 31 focused unit/integration cases; nine representative complete outcomes; exact save/reload and compiled publication; protected commerce/evidence/media parity; dedicated 375/768/1024/1440 browser coverage; three retained human commercial reviews and one exact evidence manifest. See </w:t>
       </w:r>
-      <w:hyperlink r:id="rIdHyperlink47" w:history="1">
+      <w:hyperlink r:id="rIdHyperlink50" w:history="1">
         <w:r>
           <w:rPr>
             <w:rFonts w:ascii="Calibri" w:hAnsi="Calibri" w:cs="Calibri"/>
@@ -26382,7 +26517,7 @@
         </w:rPr>
         <w:t xml:space="preserve"> A compact route inventory, four collection/search archetypes, four maintained PDP profiles plus generic fallback, exact collection and product-type mappings, bounded matching rules, transient editor/runtime projection, deterministic legacy convergence, and complete snapshot/lifecycle/publication preservation. Exact primary and related-product bindings survive convergence. A server-owned, storefront-scoped proposal transition binds legacy and reviewed canonical projections for deterministic acceptance replay. Storefront Studio lists archetypes rather than one page per commerce URL; representative context is not persisted. See </w:t>
       </w:r>
-      <w:hyperlink r:id="rIdHyperlink48" w:history="1">
+      <w:hyperlink r:id="rIdHyperlink51" w:history="1">
         <w:r>
           <w:rPr>
             <w:rFonts w:ascii="Calibri" w:hAnsi="Calibri" w:cs="Calibri"/>
@@ -26850,7 +26985,7 @@
         </w:rPr>
         <w:t xml:space="preserve"> </w:t>
       </w:r>
-      <w:hyperlink r:id="rIdHyperlink49" w:history="1">
+      <w:hyperlink r:id="rIdHyperlink52" w:history="1">
         <w:r>
           <w:rPr>
             <w:rFonts w:ascii="Calibri" w:hAnsi="Calibri" w:cs="Calibri"/>
@@ -27311,7 +27446,7 @@
         </w:rPr>
         <w:t xml:space="preserve">. Completed 15 August 2026; see </w:t>
       </w:r>
-      <w:hyperlink r:id="rIdHyperlink32" w:history="1">
+      <w:hyperlink r:id="rIdHyperlink35" w:history="1">
         <w:r>
           <w:rPr>
             <w:rFonts w:ascii="Calibri" w:hAnsi="Calibri" w:cs="Calibri"/>
@@ -28573,7 +28708,7 @@
         </w:rPr>
         <w:t xml:space="preserve">. Accepted by the product owner on 16 August 2026 under </w:t>
       </w:r>
-      <w:hyperlink r:id="rIdHyperlink50" w:history="1">
+      <w:hyperlink r:id="rIdHyperlink53" w:history="1">
         <w:r>
           <w:rPr>
             <w:rFonts w:ascii="Calibri" w:hAnsi="Calibri" w:cs="Calibri"/>
@@ -28931,7 +29066,7 @@
         </w:rPr>
         <w:t xml:space="preserve">. Accepted by the product owner on 17 August 2026 under </w:t>
       </w:r>
-      <w:hyperlink r:id="rIdHyperlink50" w:history="1">
+      <w:hyperlink r:id="rIdHyperlink53" w:history="1">
         <w:r>
           <w:rPr>
             <w:rFonts w:ascii="Calibri" w:hAnsi="Calibri" w:cs="Calibri"/>
@@ -32071,7 +32206,7 @@
         </w:rPr>
         <w:t xml:space="preserve"> </w:t>
       </w:r>
-      <w:hyperlink r:id="rIdHyperlink51" w:history="1">
+      <w:hyperlink r:id="rIdHyperlink54" w:history="1">
         <w:r>
           <w:rPr>
             <w:rFonts w:ascii="Calibri" w:hAnsi="Calibri" w:cs="Calibri"/>
@@ -32087,7 +32222,7 @@
         </w:rPr>
         <w:t xml:space="preserve"> and </w:t>
       </w:r>
-      <w:hyperlink r:id="rIdHyperlink52" w:history="1">
+      <w:hyperlink r:id="rIdHyperlink55" w:history="1">
         <w:r>
           <w:rPr>
             <w:rFonts w:ascii="Calibri" w:hAnsi="Calibri" w:cs="Calibri"/>

</xml_diff>

<commit_message>
AR-02J: isolate provider descriptions and operation schemas
</commit_message>
<xml_diff>
--- a/docs/VESKIFY_DEVELOPMENT_DELIVERY_TRACKER_v1.3.0.docx
+++ b/docs/VESKIFY_DEVELOPMENT_DELIVERY_TRACKER_v1.3.0.docx
@@ -51,7 +51,7 @@
         <w:rPr>
           <w:rFonts w:ascii="Calibri" w:hAnsi="Calibri" w:cs="Calibri"/>
         </w:rPr>
-        <w:t>Effective upon explicit AR-02I acceptance/merge: AR-02A through AR-02I Baseline / closed; AR-03 and AR-03A through AR-03E remain closed; AR-02 Partial with mapped metadata-consumer gaps; AR-23 eligible / unstarted; BATCH-06 complete; BATCH-07 complete upon I merge and safe closeout; no next task selected</w:t>
+        <w:t>Effective upon explicit AR-02J acceptance/merge: AR-02A through AR-02J Baseline / closed; AR-03 and AR-03A through AR-03E remain closed; AR-02 Partial pending K and complete parent assessment; AR-23 eligible / unstarted; BATCH-07 complete; BATCH-08 authorizes J then K only after J merge and safe synchronization; no third task</w:t>
       </w:r>
     </w:p>
     <w:p>
@@ -118,7 +118,7 @@
           <w:b/>
           <w:bCs/>
         </w:rPr>
-        <w:t>Candidate status effective upon explicit owner acceptance/merge of AR-02I:</w:t>
+        <w:t>Candidate status effective upon explicit owner acceptance/merge of AR-02J:</w:t>
       </w:r>
       <w:r>
         <w:rPr>
@@ -286,6 +286,20 @@
           <w:b/>
           <w:bCs/>
         </w:rPr>
+        <w:t>Baseline / closed.</w:t>
+      </w:r>
+      <w:r>
+        <w:rPr>
+          <w:rFonts w:ascii="Calibri" w:hAnsi="Calibri" w:cs="Calibri"/>
+        </w:rPr>
+        <w:t xml:space="preserve"> AR-02J is </w:t>
+      </w:r>
+      <w:r>
+        <w:rPr>
+          <w:rFonts w:ascii="Calibri" w:hAnsi="Calibri" w:cs="Calibri"/>
+          <w:b/>
+          <w:bCs/>
+        </w:rPr>
         <w:t>Baseline / closed upon explicit owner acceptance/merge.</w:t>
       </w:r>
       <w:r>
@@ -404,7 +418,7 @@
         <w:rPr>
           <w:rFonts w:ascii="Calibri" w:hAnsi="Calibri" w:cs="Calibri"/>
         </w:rPr>
-        <w:t xml:space="preserve">. AR-23 depends on AR-01 and is not serialized behind visual work. BATCH-03 is complete. BATCH-04 is complete. BATCH-05 is complete. BATCH-06 is complete. BATCH-07 is complete upon AR-02I acceptance/merge and safe closeout. No next reset task is selected. BATCH-07 selects no additional task. This tracker owns current status; the roadmap owns dependency order. Retained B01 exact-next, fixed-two-call/mandatory-three-concept, transient-only, and 73-child future-sequence statements are </w:t>
+        <w:t xml:space="preserve">. AR-23 depends on AR-01 and is not serialized behind visual work. BATCH-03 is complete. BATCH-04 is complete. BATCH-05 is complete. BATCH-06 is complete. BATCH-07 is complete. BATCH-08 authorizes AR-02J then AR-02K. AR-02K is the selected successor only after AR-02J merges and safe synchronization. No third task is authorized. This tracker owns current status; the roadmap owns dependency order. Retained B01 exact-next, fixed-two-call/mandatory-three-concept, transient-only, and 73-child future-sequence statements are </w:t>
       </w:r>
       <w:r>
         <w:rPr>
@@ -941,7 +955,7 @@
               <w:rPr>
                 <w:rFonts w:ascii="Calibri" w:hAnsi="Calibri" w:cs="Calibri"/>
               </w:rPr>
-              <w:t>Status; I conditional on acceptance/merge</w:t>
+              <w:t>Status; J conditional on acceptance/merge</w:t>
             </w:r>
           </w:p>
         </w:tc>
@@ -2009,12 +2023,6 @@
               </w:rPr>
               <w:t>Baseline / closed</w:t>
             </w:r>
-            <w:r>
-              <w:rPr>
-                <w:rFonts w:ascii="Calibri" w:hAnsi="Calibri" w:cs="Calibri"/>
-              </w:rPr>
-              <w:t xml:space="preserve"> upon acceptance/merge</w:t>
-            </w:r>
           </w:p>
         </w:tc>
       </w:tr>
@@ -2036,7 +2044,7 @@
               <w:rPr>
                 <w:rFonts w:ascii="Calibri" w:hAnsi="Calibri" w:cs="Calibri"/>
               </w:rPr>
-              <w:t>AR-03B</w:t>
+              <w:t>AR-02J</w:t>
             </w:r>
           </w:p>
         </w:tc>
@@ -2054,7 +2062,7 @@
               <w:rPr>
                 <w:rFonts w:ascii="Calibri" w:hAnsi="Calibri" w:cs="Calibri"/>
               </w:rPr>
-              <w:t>AR-03</w:t>
+              <w:t>AR-02</w:t>
             </w:r>
           </w:p>
         </w:tc>
@@ -2072,7 +2080,7 @@
               <w:rPr>
                 <w:rFonts w:ascii="Calibri" w:hAnsi="Calibri" w:cs="Calibri"/>
               </w:rPr>
-              <w:t xml:space="preserve">Renderer-free presentation construction and exact historical compatibility; </w:t>
+              <w:t xml:space="preserve">Renderer-free actual provider descriptions and operation schemas; </w:t>
             </w:r>
             <w:hyperlink r:id="rIdHyperlink24" w:history="1">
               <w:r>
@@ -2118,7 +2126,7 @@
                 <w:b/>
                 <w:bCs/>
               </w:rPr>
-              <w:t>Baseline / closed</w:t>
+              <w:t>Baseline / closed upon explicit owner acceptance/merge</w:t>
             </w:r>
           </w:p>
         </w:tc>
@@ -2141,7 +2149,7 @@
               <w:rPr>
                 <w:rFonts w:ascii="Calibri" w:hAnsi="Calibri" w:cs="Calibri"/>
               </w:rPr>
-              <w:t>AR-03C</w:t>
+              <w:t>AR-03B</w:t>
             </w:r>
           </w:p>
         </w:tc>
@@ -2177,7 +2185,7 @@
               <w:rPr>
                 <w:rFonts w:ascii="Calibri" w:hAnsi="Calibri" w:cs="Calibri"/>
               </w:rPr>
-              <w:t xml:space="preserve">Current-authority validation, route projection/resolution and four preview import cutovers; </w:t>
+              <w:t xml:space="preserve">Renderer-free presentation construction and exact historical compatibility; </w:t>
             </w:r>
             <w:hyperlink r:id="rIdHyperlink26" w:history="1">
               <w:r>
@@ -2246,7 +2254,7 @@
               <w:rPr>
                 <w:rFonts w:ascii="Calibri" w:hAnsi="Calibri" w:cs="Calibri"/>
               </w:rPr>
-              <w:t>AR-03D</w:t>
+              <w:t>AR-03C</w:t>
             </w:r>
           </w:p>
         </w:tc>
@@ -2282,7 +2290,7 @@
               <w:rPr>
                 <w:rFonts w:ascii="Calibri" w:hAnsi="Calibri" w:cs="Calibri"/>
               </w:rPr>
-              <w:t xml:space="preserve">Design-selection contracts/operations and editor projection with three named consumer cutovers; </w:t>
+              <w:t xml:space="preserve">Current-authority validation, route projection/resolution and four preview import cutovers; </w:t>
             </w:r>
             <w:hyperlink r:id="rIdHyperlink28" w:history="1">
               <w:r>
@@ -2351,7 +2359,7 @@
               <w:rPr>
                 <w:rFonts w:ascii="Calibri" w:hAnsi="Calibri" w:cs="Calibri"/>
               </w:rPr>
-              <w:t>AR-03E</w:t>
+              <w:t>AR-03D</w:t>
             </w:r>
           </w:p>
         </w:tc>
@@ -2387,7 +2395,7 @@
               <w:rPr>
                 <w:rFonts w:ascii="Calibri" w:hAnsi="Calibri" w:cs="Calibri"/>
               </w:rPr>
-              <w:t xml:space="preserve">Legacy migration, distinct transient projections and shared bridge schemas; </w:t>
+              <w:t xml:space="preserve">Design-selection contracts/operations and editor projection with three named consumer cutovers; </w:t>
             </w:r>
             <w:hyperlink r:id="rIdHyperlink30" w:history="1">
               <w:r>
@@ -2415,13 +2423,118 @@
                 <w:t>report</w:t>
               </w:r>
             </w:hyperlink>
+          </w:p>
+        </w:tc>
+        <w:tc>
+          <w:tcPr>
+            <w:tcW w:w="8460" w:type="dxa"/>
+            <w:vAlign w:val="center"/>
+          </w:tcPr>
+          <w:p>
+            <w:pPr>
+              <w:pStyle w:val="TableText"/>
+              <w:widowControl/>
+            </w:pPr>
+            <w:r>
+              <w:rPr>
+                <w:rFonts w:ascii="Calibri" w:hAnsi="Calibri" w:cs="Calibri"/>
+                <w:b/>
+                <w:bCs/>
+              </w:rPr>
+              <w:t>Baseline / closed</w:t>
+            </w:r>
+          </w:p>
+        </w:tc>
+      </w:tr>
+      <w:tr>
+        <w:trPr>
+          <w:cantSplit/>
+        </w:trPr>
+        <w:tc>
+          <w:tcPr>
+            <w:tcW w:w="1000" w:type="dxa"/>
+            <w:vAlign w:val="center"/>
+          </w:tcPr>
+          <w:p>
+            <w:pPr>
+              <w:pStyle w:val="TableText"/>
+              <w:widowControl/>
+            </w:pPr>
+            <w:r>
+              <w:rPr>
+                <w:rFonts w:ascii="Calibri" w:hAnsi="Calibri" w:cs="Calibri"/>
+              </w:rPr>
+              <w:t>AR-03E</w:t>
+            </w:r>
+          </w:p>
+        </w:tc>
+        <w:tc>
+          <w:tcPr>
+            <w:tcW w:w="1500" w:type="dxa"/>
+            <w:vAlign w:val="center"/>
+          </w:tcPr>
+          <w:p>
+            <w:pPr>
+              <w:pStyle w:val="TableText"/>
+              <w:widowControl/>
+            </w:pPr>
+            <w:r>
+              <w:rPr>
+                <w:rFonts w:ascii="Calibri" w:hAnsi="Calibri" w:cs="Calibri"/>
+              </w:rPr>
+              <w:t>AR-03</w:t>
+            </w:r>
+          </w:p>
+        </w:tc>
+        <w:tc>
+          <w:tcPr>
+            <w:tcW w:w="2000" w:type="dxa"/>
+            <w:vAlign w:val="center"/>
+          </w:tcPr>
+          <w:p>
+            <w:pPr>
+              <w:pStyle w:val="TableText"/>
+              <w:widowControl/>
+            </w:pPr>
+            <w:r>
+              <w:rPr>
+                <w:rFonts w:ascii="Calibri" w:hAnsi="Calibri" w:cs="Calibri"/>
+              </w:rPr>
+              <w:t xml:space="preserve">Legacy migration, distinct transient projections and shared bridge schemas; </w:t>
+            </w:r>
+            <w:hyperlink r:id="rIdHyperlink32" w:history="1">
+              <w:r>
+                <w:rPr>
+                  <w:rFonts w:ascii="Calibri" w:hAnsi="Calibri" w:cs="Calibri"/>
+                  <w:color w:val="2E74B5"/>
+                  <w:u w:val="single"/>
+                </w:rPr>
+                <w:t>contract</w:t>
+              </w:r>
+            </w:hyperlink>
             <w:r>
               <w:rPr>
                 <w:rFonts w:ascii="Calibri" w:hAnsi="Calibri" w:cs="Calibri"/>
               </w:rPr>
               <w:t xml:space="preserve">, </w:t>
             </w:r>
-            <w:hyperlink r:id="rIdHyperlink32" w:history="1">
+            <w:hyperlink r:id="rIdHyperlink33" w:history="1">
+              <w:r>
+                <w:rPr>
+                  <w:rFonts w:ascii="Calibri" w:hAnsi="Calibri" w:cs="Calibri"/>
+                  <w:color w:val="2E74B5"/>
+                  <w:u w:val="single"/>
+                </w:rPr>
+                <w:t>report</w:t>
+              </w:r>
+            </w:hyperlink>
+            <w:r>
+              <w:rPr>
+                <w:rFonts w:ascii="Calibri" w:hAnsi="Calibri" w:cs="Calibri"/>
+              </w:rPr>
+              <w:t xml:space="preserve">, </w:t>
+            </w:r>
+            <w:hyperlink r:id="rIdHyperlink34" w:history="1">
               <w:r>
                 <w:rPr>
                   <w:rFonts w:ascii="Calibri" w:hAnsi="Calibri" w:cs="Calibri"/>
@@ -22385,7 +22498,7 @@
         </w:rPr>
         <w:t xml:space="preserve">. Completed 7 August 2026; see </w:t>
       </w:r>
-      <w:hyperlink r:id="rIdHyperlink33" w:history="1">
+      <w:hyperlink r:id="rIdHyperlink35" w:history="1">
         <w:r>
           <w:rPr>
             <w:rFonts w:ascii="Calibri" w:hAnsi="Calibri" w:cs="Calibri"/>
@@ -22522,7 +22635,7 @@
         </w:rPr>
         <w:t xml:space="preserve">The binding details and minimum coverage are in </w:t>
       </w:r>
-      <w:hyperlink r:id="rIdHyperlink34" w:history="1">
+      <w:hyperlink r:id="rIdHyperlink36" w:history="1">
         <w:r>
           <w:rPr>
             <w:rFonts w:ascii="Calibri" w:hAnsi="Calibri" w:cs="Calibri"/>
@@ -22720,7 +22833,7 @@
         </w:rPr>
         <w:t xml:space="preserve">. P10B-16P-04 acceptance evidence is retained in </w:t>
       </w:r>
-      <w:hyperlink r:id="rIdHyperlink35" w:history="1">
+      <w:hyperlink r:id="rIdHyperlink37" w:history="1">
         <w:r>
           <w:rPr>
             <w:rFonts w:ascii="Calibri" w:hAnsi="Calibri" w:cs="Calibri"/>
@@ -22969,7 +23082,7 @@
         </w:rPr>
         <w:t xml:space="preserve">. See </w:t>
       </w:r>
-      <w:hyperlink r:id="rIdHyperlink36" w:history="1">
+      <w:hyperlink r:id="rIdHyperlink38" w:history="1">
         <w:r>
           <w:rPr>
             <w:rFonts w:ascii="Calibri" w:hAnsi="Calibri" w:cs="Calibri"/>
@@ -23218,7 +23331,7 @@
         </w:rPr>
         <w:t xml:space="preserve">. See </w:t>
       </w:r>
-      <w:hyperlink r:id="rIdHyperlink37" w:history="1">
+      <w:hyperlink r:id="rIdHyperlink39" w:history="1">
         <w:r>
           <w:rPr>
             <w:rFonts w:ascii="Calibri" w:hAnsi="Calibri" w:cs="Calibri"/>
@@ -23467,7 +23580,7 @@
         </w:rPr>
         <w:t xml:space="preserve">. At P10B-03 delivery, all then-current 25 V2 definitions and 91 variants were classified explicitly without false commercial-ready promotion. Later family tasks extend that same authority rather than replacing it. See </w:t>
       </w:r>
-      <w:hyperlink r:id="rIdHyperlink38" w:history="1">
+      <w:hyperlink r:id="rIdHyperlink40" w:history="1">
         <w:r>
           <w:rPr>
             <w:rFonts w:ascii="Calibri" w:hAnsi="Calibri" w:cs="Calibri"/>
@@ -23716,7 +23829,7 @@
         </w:rPr>
         <w:t xml:space="preserve"> embeds exact lineage and bounded treatment in the existing approved presentation, consumes Design DNA and registered anatomy, projects protected same-product media, preserves authority through lifecycle/compiler boundaries, and renders semantic four-breakpoint evidence. Production CDN transforms and retained commercial visual acceptance remain deferred. See </w:t>
       </w:r>
-      <w:hyperlink r:id="rIdHyperlink39" w:history="1">
+      <w:hyperlink r:id="rIdHyperlink41" w:history="1">
         <w:r>
           <w:rPr>
             <w:rFonts w:ascii="Calibri" w:hAnsi="Calibri" w:cs="Calibri"/>
@@ -23965,7 +24078,7 @@
         </w:rPr>
         <w:t xml:space="preserve">. See </w:t>
       </w:r>
-      <w:hyperlink r:id="rIdHyperlink40" w:history="1">
+      <w:hyperlink r:id="rIdHyperlink42" w:history="1">
         <w:r>
           <w:rPr>
             <w:rFonts w:ascii="Calibri" w:hAnsi="Calibri" w:cs="Calibri"/>
@@ -24200,7 +24313,7 @@
         </w:rPr>
         <w:t xml:space="preserve">. Four exact root-frame profiles, three mobile modes, and four footer compositions preserve canonical navigation and frame identity through snapshot, save/reload, Puck root, preview, publication compilation, EN/FI, and 375/768/1024/1440 px evidence. See </w:t>
       </w:r>
-      <w:hyperlink r:id="rIdHyperlink41" w:history="1">
+      <w:hyperlink r:id="rIdHyperlink43" w:history="1">
         <w:r>
           <w:rPr>
             <w:rFonts w:ascii="Calibri" w:hAnsi="Calibri" w:cs="Calibri"/>
@@ -24435,7 +24548,7 @@
         </w:rPr>
         <w:t xml:space="preserve">. Six meaningful hero anatomies, five editorial/story anatomies, five campaign/promotion anatomies and three evidence-grounded proof/service anatomies are registered, PageBlueprint-selectable, deterministically generated, snapshot/publish preserved and rendered through one shared implementation. Focused deterministic coverage and a zero-provider Chromium scenario retain evidence at 375, 768, 1024 and 1440 px. See </w:t>
       </w:r>
-      <w:hyperlink r:id="rIdHyperlink42" w:history="1">
+      <w:hyperlink r:id="rIdHyperlink44" w:history="1">
         <w:r>
           <w:rPr>
             <w:rFonts w:ascii="Calibri" w:hAnsi="Calibri" w:cs="Calibri"/>
@@ -24484,7 +24597,7 @@
         </w:rPr>
         <w:t xml:space="preserve"> Baseline. One fingerprinted authority and renderer now serve homepage merchandising, collection/results, related products, and legacy compatibility. Five meaningful anatomies preserve canonical facts and P10B-04 media lineage through plan, proposal, snapshot, save/reload, publish, and responsive browser evidence. See </w:t>
       </w:r>
-      <w:hyperlink r:id="rIdHyperlink43" w:history="1">
+      <w:hyperlink r:id="rIdHyperlink45" w:history="1">
         <w:r>
           <w:rPr>
             <w:rFonts w:ascii="Calibri" w:hAnsi="Calibri" w:cs="Calibri"/>
@@ -24701,7 +24814,7 @@
         </w:rPr>
         <w:t xml:space="preserve"> Baseline. Six versioned, structurally fingerprinted homepage PageBlueprint profiles compose current shared-frame, commercial storytelling, canonical product-card, approved-media, and Design DNA authority. Evidence/cardinality guards fail closed; deterministic lifecycle and 24 retained four-width browser images pass. See </w:t>
       </w:r>
-      <w:hyperlink r:id="rIdHyperlink44" w:history="1">
+      <w:hyperlink r:id="rIdHyperlink46" w:history="1">
         <w:r>
           <w:rPr>
             <w:rFonts w:ascii="Calibri" w:hAnsi="Calibri" w:cs="Calibri"/>
@@ -24932,7 +25045,7 @@
         </w:rPr>
         <w:t xml:space="preserve"> anatomy, P10B-08 canonical card anatomy, and P10B-04 approved media treatment. Exact canonical catalogue bindings preserve product membership/order, facts, product media, filters/sort state, and child-collection order. Campaign media is approved collection/editorial media, not a product-media replacement. A transient revision-checked zero-result context keeps the query without fabricating products. Deterministic lifecycle and 16-view Chromium evidence pass with zero provider calls. See </w:t>
       </w:r>
-      <w:hyperlink r:id="rIdHyperlink45" w:history="1">
+      <w:hyperlink r:id="rIdHyperlink47" w:history="1">
         <w:r>
           <w:rPr>
             <w:rFonts w:ascii="Calibri" w:hAnsi="Calibri" w:cs="Calibri"/>
@@ -25462,7 +25575,7 @@
         </w:rPr>
         <w:t xml:space="preserve">. Fifteen structurally distinct registered profiles resolve exact current approved brief evidence into strict localized fact documents. P10B-05 preserves page-set, route, locale, and transitive navigation authority; P10B-06 frames and P10B-07 editorial/campaign renderers are reused. Snapshot save/reload and deterministic publication preserve the exact document. See </w:t>
       </w:r>
-      <w:hyperlink r:id="rIdHyperlink46" w:history="1">
+      <w:hyperlink r:id="rIdHyperlink48" w:history="1">
         <w:r>
           <w:rPr>
             <w:rFonts w:ascii="Calibri" w:hAnsi="Calibri" w:cs="Calibri"/>
@@ -25673,7 +25786,7 @@
         </w:rPr>
         <w:t xml:space="preserve"> component through the P10B-05 family page; registered loading state renders on its pending route instead of replacing the 404 singleton. Read-only runtime state supplies canonical cart facts, checkout continuation, P10B-10 query/filter context, and bounded recovery actions while the snapshot preserves presentation only. Shared-frame/Design DNA, save/reload, publication, four- width browser evidence, and no-provider behavior are covered under </w:t>
       </w:r>
-      <w:hyperlink r:id="rIdHyperlink47" w:history="1">
+      <w:hyperlink r:id="rIdHyperlink49" w:history="1">
         <w:r>
           <w:rPr>
             <w:rFonts w:ascii="Calibri" w:hAnsi="Calibri" w:cs="Calibri"/>
@@ -25884,7 +25997,7 @@
         </w:rPr>
         <w:t xml:space="preserve"> frame span all pages; simple/configurable PDP, factual content, utility states, 15 four-width/representative screenshots and the passing 160-scenario human record are retained in </w:t>
       </w:r>
-      <w:hyperlink r:id="rIdHyperlink48" w:history="1">
+      <w:hyperlink r:id="rIdHyperlink50" w:history="1">
         <w:r>
           <w:rPr>
             <w:rFonts w:ascii="Calibri" w:hAnsi="Calibri" w:cs="Calibri"/>
@@ -26095,7 +26208,7 @@
         </w:rPr>
         <w:t xml:space="preserve"> One versioned deterministic synthesis contract binds exact merchant, evidence, commerce, asset, Design DNA, site-map, frame, PageBlueprint/profile, component/anatomy, narrative, density, art-direction, responsive, planner, registry and recipe authority. The same approved fixture produces editorial-heavy, commerce/discovery-heavy and restrained/minimal complete 17-route stores through the existing whole-storefront proposal, snapshot, save/reload, renderer and immutable publication chain. Details are retained in </w:t>
       </w:r>
-      <w:hyperlink r:id="rIdHyperlink49" w:history="1">
+      <w:hyperlink r:id="rIdHyperlink51" w:history="1">
         <w:r>
           <w:rPr>
             <w:rFonts w:ascii="Calibri" w:hAnsi="Calibri" w:cs="Calibri"/>
@@ -26340,7 +26453,7 @@
         </w:rPr>
         <w:t xml:space="preserve"> 31 focused unit/integration cases; nine representative complete outcomes; exact save/reload and compiled publication; protected commerce/evidence/media parity; dedicated 375/768/1024/1440 browser coverage; three retained human commercial reviews and one exact evidence manifest. See </w:t>
       </w:r>
-      <w:hyperlink r:id="rIdHyperlink50" w:history="1">
+      <w:hyperlink r:id="rIdHyperlink52" w:history="1">
         <w:r>
           <w:rPr>
             <w:rFonts w:ascii="Calibri" w:hAnsi="Calibri" w:cs="Calibri"/>
@@ -26517,7 +26630,7 @@
         </w:rPr>
         <w:t xml:space="preserve"> A compact route inventory, four collection/search archetypes, four maintained PDP profiles plus generic fallback, exact collection and product-type mappings, bounded matching rules, transient editor/runtime projection, deterministic legacy convergence, and complete snapshot/lifecycle/publication preservation. Exact primary and related-product bindings survive convergence. A server-owned, storefront-scoped proposal transition binds legacy and reviewed canonical projections for deterministic acceptance replay. Storefront Studio lists archetypes rather than one page per commerce URL; representative context is not persisted. See </w:t>
       </w:r>
-      <w:hyperlink r:id="rIdHyperlink51" w:history="1">
+      <w:hyperlink r:id="rIdHyperlink53" w:history="1">
         <w:r>
           <w:rPr>
             <w:rFonts w:ascii="Calibri" w:hAnsi="Calibri" w:cs="Calibri"/>
@@ -26985,7 +27098,7 @@
         </w:rPr>
         <w:t xml:space="preserve"> </w:t>
       </w:r>
-      <w:hyperlink r:id="rIdHyperlink52" w:history="1">
+      <w:hyperlink r:id="rIdHyperlink54" w:history="1">
         <w:r>
           <w:rPr>
             <w:rFonts w:ascii="Calibri" w:hAnsi="Calibri" w:cs="Calibri"/>
@@ -27446,7 +27559,7 @@
         </w:rPr>
         <w:t xml:space="preserve">. Completed 15 August 2026; see </w:t>
       </w:r>
-      <w:hyperlink r:id="rIdHyperlink35" w:history="1">
+      <w:hyperlink r:id="rIdHyperlink37" w:history="1">
         <w:r>
           <w:rPr>
             <w:rFonts w:ascii="Calibri" w:hAnsi="Calibri" w:cs="Calibri"/>
@@ -28708,7 +28821,7 @@
         </w:rPr>
         <w:t xml:space="preserve">. Accepted by the product owner on 16 August 2026 under </w:t>
       </w:r>
-      <w:hyperlink r:id="rIdHyperlink53" w:history="1">
+      <w:hyperlink r:id="rIdHyperlink55" w:history="1">
         <w:r>
           <w:rPr>
             <w:rFonts w:ascii="Calibri" w:hAnsi="Calibri" w:cs="Calibri"/>
@@ -29066,7 +29179,7 @@
         </w:rPr>
         <w:t xml:space="preserve">. Accepted by the product owner on 17 August 2026 under </w:t>
       </w:r>
-      <w:hyperlink r:id="rIdHyperlink53" w:history="1">
+      <w:hyperlink r:id="rIdHyperlink55" w:history="1">
         <w:r>
           <w:rPr>
             <w:rFonts w:ascii="Calibri" w:hAnsi="Calibri" w:cs="Calibri"/>
@@ -32206,7 +32319,7 @@
         </w:rPr>
         <w:t xml:space="preserve"> </w:t>
       </w:r>
-      <w:hyperlink r:id="rIdHyperlink54" w:history="1">
+      <w:hyperlink r:id="rIdHyperlink56" w:history="1">
         <w:r>
           <w:rPr>
             <w:rFonts w:ascii="Calibri" w:hAnsi="Calibri" w:cs="Calibri"/>
@@ -32222,7 +32335,7 @@
         </w:rPr>
         <w:t xml:space="preserve"> and </w:t>
       </w:r>
-      <w:hyperlink r:id="rIdHyperlink55" w:history="1">
+      <w:hyperlink r:id="rIdHyperlink57" w:history="1">
         <w:r>
           <w:rPr>
             <w:rFonts w:ascii="Calibri" w:hAnsi="Calibri" w:cs="Calibri"/>

</xml_diff>

<commit_message>
refactor: isolate skill capability and grammar metadata
</commit_message>
<xml_diff>
--- a/docs/VESKIFY_DEVELOPMENT_DELIVERY_TRACKER_v1.3.0.docx
+++ b/docs/VESKIFY_DEVELOPMENT_DELIVERY_TRACKER_v1.3.0.docx
@@ -51,7 +51,7 @@
         <w:rPr>
           <w:rFonts w:ascii="Calibri" w:hAnsi="Calibri" w:cs="Calibri"/>
         </w:rPr>
-        <w:t>Effective upon explicit AR-02J acceptance/merge: AR-02A through AR-02J Baseline / closed; AR-03 and AR-03A through AR-03E remain closed; AR-02 Partial pending K and complete parent assessment; AR-23 eligible / unstarted; BATCH-07 complete; BATCH-08 authorizes J then K only after J merge and safe synchronization; no third task</w:t>
+        <w:t>Effective upon independently verified AR-02K acceptance/merge: AR-02A through AR-02K Baseline / closed; AR-02 Partial with the semantic-capability-features metadata edge remaining; AR-03 and AR-03A through AR-03E remain closed; AR-04/AR-05 dependency-blocked and unstarted; AR-06 depends on AR-05; AR-23 eligible / unstarted; BATCH-08 complete after K merge and safe closeout; no next task</w:t>
       </w:r>
     </w:p>
     <w:p>
@@ -118,7 +118,7 @@
           <w:b/>
           <w:bCs/>
         </w:rPr>
-        <w:t>Candidate status effective upon explicit owner acceptance/merge of AR-02J:</w:t>
+        <w:t>Candidate status effective upon explicit owner acceptance/merge of AR-02K:</w:t>
       </w:r>
       <w:r>
         <w:rPr>
@@ -300,6 +300,20 @@
           <w:b/>
           <w:bCs/>
         </w:rPr>
+        <w:t>Baseline / closed.</w:t>
+      </w:r>
+      <w:r>
+        <w:rPr>
+          <w:rFonts w:ascii="Calibri" w:hAnsi="Calibri" w:cs="Calibri"/>
+        </w:rPr>
+        <w:t xml:space="preserve"> AR-02K is </w:t>
+      </w:r>
+      <w:r>
+        <w:rPr>
+          <w:rFonts w:ascii="Calibri" w:hAnsi="Calibri" w:cs="Calibri"/>
+          <w:b/>
+          <w:bCs/>
+        </w:rPr>
         <w:t>Baseline / closed upon explicit owner acceptance/merge.</w:t>
       </w:r>
       <w:r>
@@ -320,7 +334,7 @@
         <w:rPr>
           <w:rFonts w:ascii="Calibri" w:hAnsi="Calibri" w:cs="Calibri"/>
         </w:rPr>
-        <w:t xml:space="preserve">; remaining metadata consumers are mapped in AR_02_BOUNDARY_ACCEPTANCE.md. AR-03 is </w:t>
+        <w:t xml:space="preserve">; the semantic-capability-features.ts metadata dependency remains mapped in AR_02_BOUNDARY_ACCEPTANCE.md. AR-04/AR-05 remain dependency-blocked. AR-03 is </w:t>
       </w:r>
       <w:r>
         <w:rPr>
@@ -418,7 +432,7 @@
         <w:rPr>
           <w:rFonts w:ascii="Calibri" w:hAnsi="Calibri" w:cs="Calibri"/>
         </w:rPr>
-        <w:t xml:space="preserve">. AR-23 depends on AR-01 and is not serialized behind visual work. BATCH-03 is complete. BATCH-04 is complete. BATCH-05 is complete. BATCH-06 is complete. BATCH-07 is complete. BATCH-08 authorizes AR-02J then AR-02K. AR-02K is the selected successor only after AR-02J merges and safe synchronization. No third task is authorized. This tracker owns current status; the roadmap owns dependency order. Retained B01 exact-next, fixed-two-call/mandatory-three-concept, transient-only, and 73-child future-sequence statements are </w:t>
+        <w:t xml:space="preserve">. AR-23 depends on AR-01 and is not serialized behind visual work. BATCH-03 is complete. BATCH-04 is complete. BATCH-05 is complete. BATCH-06 is complete. BATCH-07 is complete. BATCH-08 is complete upon AR-02K acceptance/merge and safe closeout. No next reset task is selected. No third task is authorized. This tracker owns current status; the roadmap owns dependency order. Retained B01 exact-next, fixed-two-call/mandatory-three-concept, transient-only, and 73-child future-sequence statements are </w:t>
       </w:r>
       <w:r>
         <w:rPr>
@@ -955,7 +969,7 @@
               <w:rPr>
                 <w:rFonts w:ascii="Calibri" w:hAnsi="Calibri" w:cs="Calibri"/>
               </w:rPr>
-              <w:t>Status; J conditional on acceptance/merge</w:t>
+              <w:t>Status; K conditional on independent acceptance/merge</w:t>
             </w:r>
           </w:p>
         </w:tc>
@@ -2126,7 +2140,7 @@
                 <w:b/>
                 <w:bCs/>
               </w:rPr>
-              <w:t>Baseline / closed upon explicit owner acceptance/merge</w:t>
+              <w:t>Baseline / closed</w:t>
             </w:r>
           </w:p>
         </w:tc>
@@ -2149,7 +2163,7 @@
               <w:rPr>
                 <w:rFonts w:ascii="Calibri" w:hAnsi="Calibri" w:cs="Calibri"/>
               </w:rPr>
-              <w:t>AR-03B</w:t>
+              <w:t>AR-02K</w:t>
             </w:r>
           </w:p>
         </w:tc>
@@ -2167,7 +2181,7 @@
               <w:rPr>
                 <w:rFonts w:ascii="Calibri" w:hAnsi="Calibri" w:cs="Calibri"/>
               </w:rPr>
-              <w:t>AR-03</w:t>
+              <w:t>AR-02</w:t>
             </w:r>
           </w:p>
         </w:tc>
@@ -2185,7 +2199,7 @@
               <w:rPr>
                 <w:rFonts w:ascii="Calibri" w:hAnsi="Calibri" w:cs="Calibri"/>
               </w:rPr>
-              <w:t xml:space="preserve">Renderer-free presentation construction and exact historical compatibility; </w:t>
+              <w:t xml:space="preserve">Renderer-free actual governed capability and commercial grammar consumers; </w:t>
             </w:r>
             <w:hyperlink r:id="rIdHyperlink26" w:history="1">
               <w:r>
@@ -2231,7 +2245,7 @@
                 <w:b/>
                 <w:bCs/>
               </w:rPr>
-              <w:t>Baseline / closed</w:t>
+              <w:t>Baseline / closed upon explicit owner acceptance/merge</w:t>
             </w:r>
           </w:p>
         </w:tc>
@@ -2254,7 +2268,7 @@
               <w:rPr>
                 <w:rFonts w:ascii="Calibri" w:hAnsi="Calibri" w:cs="Calibri"/>
               </w:rPr>
-              <w:t>AR-03C</w:t>
+              <w:t>AR-03B</w:t>
             </w:r>
           </w:p>
         </w:tc>
@@ -2290,7 +2304,7 @@
               <w:rPr>
                 <w:rFonts w:ascii="Calibri" w:hAnsi="Calibri" w:cs="Calibri"/>
               </w:rPr>
-              <w:t xml:space="preserve">Current-authority validation, route projection/resolution and four preview import cutovers; </w:t>
+              <w:t xml:space="preserve">Renderer-free presentation construction and exact historical compatibility; </w:t>
             </w:r>
             <w:hyperlink r:id="rIdHyperlink28" w:history="1">
               <w:r>
@@ -2359,7 +2373,7 @@
               <w:rPr>
                 <w:rFonts w:ascii="Calibri" w:hAnsi="Calibri" w:cs="Calibri"/>
               </w:rPr>
-              <w:t>AR-03D</w:t>
+              <w:t>AR-03C</w:t>
             </w:r>
           </w:p>
         </w:tc>
@@ -2395,7 +2409,7 @@
               <w:rPr>
                 <w:rFonts w:ascii="Calibri" w:hAnsi="Calibri" w:cs="Calibri"/>
               </w:rPr>
-              <w:t xml:space="preserve">Design-selection contracts/operations and editor projection with three named consumer cutovers; </w:t>
+              <w:t xml:space="preserve">Current-authority validation, route projection/resolution and four preview import cutovers; </w:t>
             </w:r>
             <w:hyperlink r:id="rIdHyperlink30" w:history="1">
               <w:r>
@@ -2464,7 +2478,7 @@
               <w:rPr>
                 <w:rFonts w:ascii="Calibri" w:hAnsi="Calibri" w:cs="Calibri"/>
               </w:rPr>
-              <w:t>AR-03E</w:t>
+              <w:t>AR-03D</w:t>
             </w:r>
           </w:p>
         </w:tc>
@@ -2500,7 +2514,7 @@
               <w:rPr>
                 <w:rFonts w:ascii="Calibri" w:hAnsi="Calibri" w:cs="Calibri"/>
               </w:rPr>
-              <w:t xml:space="preserve">Legacy migration, distinct transient projections and shared bridge schemas; </w:t>
+              <w:t xml:space="preserve">Design-selection contracts/operations and editor projection with three named consumer cutovers; </w:t>
             </w:r>
             <w:hyperlink r:id="rIdHyperlink32" w:history="1">
               <w:r>
@@ -2528,13 +2542,118 @@
                 <w:t>report</w:t>
               </w:r>
             </w:hyperlink>
+          </w:p>
+        </w:tc>
+        <w:tc>
+          <w:tcPr>
+            <w:tcW w:w="8460" w:type="dxa"/>
+            <w:vAlign w:val="center"/>
+          </w:tcPr>
+          <w:p>
+            <w:pPr>
+              <w:pStyle w:val="TableText"/>
+              <w:widowControl/>
+            </w:pPr>
+            <w:r>
+              <w:rPr>
+                <w:rFonts w:ascii="Calibri" w:hAnsi="Calibri" w:cs="Calibri"/>
+                <w:b/>
+                <w:bCs/>
+              </w:rPr>
+              <w:t>Baseline / closed</w:t>
+            </w:r>
+          </w:p>
+        </w:tc>
+      </w:tr>
+      <w:tr>
+        <w:trPr>
+          <w:cantSplit/>
+        </w:trPr>
+        <w:tc>
+          <w:tcPr>
+            <w:tcW w:w="1000" w:type="dxa"/>
+            <w:vAlign w:val="center"/>
+          </w:tcPr>
+          <w:p>
+            <w:pPr>
+              <w:pStyle w:val="TableText"/>
+              <w:widowControl/>
+            </w:pPr>
+            <w:r>
+              <w:rPr>
+                <w:rFonts w:ascii="Calibri" w:hAnsi="Calibri" w:cs="Calibri"/>
+              </w:rPr>
+              <w:t>AR-03E</w:t>
+            </w:r>
+          </w:p>
+        </w:tc>
+        <w:tc>
+          <w:tcPr>
+            <w:tcW w:w="1500" w:type="dxa"/>
+            <w:vAlign w:val="center"/>
+          </w:tcPr>
+          <w:p>
+            <w:pPr>
+              <w:pStyle w:val="TableText"/>
+              <w:widowControl/>
+            </w:pPr>
+            <w:r>
+              <w:rPr>
+                <w:rFonts w:ascii="Calibri" w:hAnsi="Calibri" w:cs="Calibri"/>
+              </w:rPr>
+              <w:t>AR-03</w:t>
+            </w:r>
+          </w:p>
+        </w:tc>
+        <w:tc>
+          <w:tcPr>
+            <w:tcW w:w="2000" w:type="dxa"/>
+            <w:vAlign w:val="center"/>
+          </w:tcPr>
+          <w:p>
+            <w:pPr>
+              <w:pStyle w:val="TableText"/>
+              <w:widowControl/>
+            </w:pPr>
+            <w:r>
+              <w:rPr>
+                <w:rFonts w:ascii="Calibri" w:hAnsi="Calibri" w:cs="Calibri"/>
+              </w:rPr>
+              <w:t xml:space="preserve">Legacy migration, distinct transient projections and shared bridge schemas; </w:t>
+            </w:r>
+            <w:hyperlink r:id="rIdHyperlink34" w:history="1">
+              <w:r>
+                <w:rPr>
+                  <w:rFonts w:ascii="Calibri" w:hAnsi="Calibri" w:cs="Calibri"/>
+                  <w:color w:val="2E74B5"/>
+                  <w:u w:val="single"/>
+                </w:rPr>
+                <w:t>contract</w:t>
+              </w:r>
+            </w:hyperlink>
             <w:r>
               <w:rPr>
                 <w:rFonts w:ascii="Calibri" w:hAnsi="Calibri" w:cs="Calibri"/>
               </w:rPr>
               <w:t xml:space="preserve">, </w:t>
             </w:r>
-            <w:hyperlink r:id="rIdHyperlink34" w:history="1">
+            <w:hyperlink r:id="rIdHyperlink35" w:history="1">
+              <w:r>
+                <w:rPr>
+                  <w:rFonts w:ascii="Calibri" w:hAnsi="Calibri" w:cs="Calibri"/>
+                  <w:color w:val="2E74B5"/>
+                  <w:u w:val="single"/>
+                </w:rPr>
+                <w:t>report</w:t>
+              </w:r>
+            </w:hyperlink>
+            <w:r>
+              <w:rPr>
+                <w:rFonts w:ascii="Calibri" w:hAnsi="Calibri" w:cs="Calibri"/>
+              </w:rPr>
+              <w:t xml:space="preserve">, </w:t>
+            </w:r>
+            <w:hyperlink r:id="rIdHyperlink36" w:history="1">
               <w:r>
                 <w:rPr>
                   <w:rFonts w:ascii="Calibri" w:hAnsi="Calibri" w:cs="Calibri"/>
@@ -22498,7 +22617,7 @@
         </w:rPr>
         <w:t xml:space="preserve">. Completed 7 August 2026; see </w:t>
       </w:r>
-      <w:hyperlink r:id="rIdHyperlink35" w:history="1">
+      <w:hyperlink r:id="rIdHyperlink37" w:history="1">
         <w:r>
           <w:rPr>
             <w:rFonts w:ascii="Calibri" w:hAnsi="Calibri" w:cs="Calibri"/>
@@ -22635,7 +22754,7 @@
         </w:rPr>
         <w:t xml:space="preserve">The binding details and minimum coverage are in </w:t>
       </w:r>
-      <w:hyperlink r:id="rIdHyperlink36" w:history="1">
+      <w:hyperlink r:id="rIdHyperlink38" w:history="1">
         <w:r>
           <w:rPr>
             <w:rFonts w:ascii="Calibri" w:hAnsi="Calibri" w:cs="Calibri"/>
@@ -22833,7 +22952,7 @@
         </w:rPr>
         <w:t xml:space="preserve">. P10B-16P-04 acceptance evidence is retained in </w:t>
       </w:r>
-      <w:hyperlink r:id="rIdHyperlink37" w:history="1">
+      <w:hyperlink r:id="rIdHyperlink39" w:history="1">
         <w:r>
           <w:rPr>
             <w:rFonts w:ascii="Calibri" w:hAnsi="Calibri" w:cs="Calibri"/>
@@ -23082,7 +23201,7 @@
         </w:rPr>
         <w:t xml:space="preserve">. See </w:t>
       </w:r>
-      <w:hyperlink r:id="rIdHyperlink38" w:history="1">
+      <w:hyperlink r:id="rIdHyperlink40" w:history="1">
         <w:r>
           <w:rPr>
             <w:rFonts w:ascii="Calibri" w:hAnsi="Calibri" w:cs="Calibri"/>
@@ -23331,7 +23450,7 @@
         </w:rPr>
         <w:t xml:space="preserve">. See </w:t>
       </w:r>
-      <w:hyperlink r:id="rIdHyperlink39" w:history="1">
+      <w:hyperlink r:id="rIdHyperlink41" w:history="1">
         <w:r>
           <w:rPr>
             <w:rFonts w:ascii="Calibri" w:hAnsi="Calibri" w:cs="Calibri"/>
@@ -23580,7 +23699,7 @@
         </w:rPr>
         <w:t xml:space="preserve">. At P10B-03 delivery, all then-current 25 V2 definitions and 91 variants were classified explicitly without false commercial-ready promotion. Later family tasks extend that same authority rather than replacing it. See </w:t>
       </w:r>
-      <w:hyperlink r:id="rIdHyperlink40" w:history="1">
+      <w:hyperlink r:id="rIdHyperlink42" w:history="1">
         <w:r>
           <w:rPr>
             <w:rFonts w:ascii="Calibri" w:hAnsi="Calibri" w:cs="Calibri"/>
@@ -23829,7 +23948,7 @@
         </w:rPr>
         <w:t xml:space="preserve"> embeds exact lineage and bounded treatment in the existing approved presentation, consumes Design DNA and registered anatomy, projects protected same-product media, preserves authority through lifecycle/compiler boundaries, and renders semantic four-breakpoint evidence. Production CDN transforms and retained commercial visual acceptance remain deferred. See </w:t>
       </w:r>
-      <w:hyperlink r:id="rIdHyperlink41" w:history="1">
+      <w:hyperlink r:id="rIdHyperlink43" w:history="1">
         <w:r>
           <w:rPr>
             <w:rFonts w:ascii="Calibri" w:hAnsi="Calibri" w:cs="Calibri"/>
@@ -24078,7 +24197,7 @@
         </w:rPr>
         <w:t xml:space="preserve">. See </w:t>
       </w:r>
-      <w:hyperlink r:id="rIdHyperlink42" w:history="1">
+      <w:hyperlink r:id="rIdHyperlink44" w:history="1">
         <w:r>
           <w:rPr>
             <w:rFonts w:ascii="Calibri" w:hAnsi="Calibri" w:cs="Calibri"/>
@@ -24313,7 +24432,7 @@
         </w:rPr>
         <w:t xml:space="preserve">. Four exact root-frame profiles, three mobile modes, and four footer compositions preserve canonical navigation and frame identity through snapshot, save/reload, Puck root, preview, publication compilation, EN/FI, and 375/768/1024/1440 px evidence. See </w:t>
       </w:r>
-      <w:hyperlink r:id="rIdHyperlink43" w:history="1">
+      <w:hyperlink r:id="rIdHyperlink45" w:history="1">
         <w:r>
           <w:rPr>
             <w:rFonts w:ascii="Calibri" w:hAnsi="Calibri" w:cs="Calibri"/>
@@ -24548,7 +24667,7 @@
         </w:rPr>
         <w:t xml:space="preserve">. Six meaningful hero anatomies, five editorial/story anatomies, five campaign/promotion anatomies and three evidence-grounded proof/service anatomies are registered, PageBlueprint-selectable, deterministically generated, snapshot/publish preserved and rendered through one shared implementation. Focused deterministic coverage and a zero-provider Chromium scenario retain evidence at 375, 768, 1024 and 1440 px. See </w:t>
       </w:r>
-      <w:hyperlink r:id="rIdHyperlink44" w:history="1">
+      <w:hyperlink r:id="rIdHyperlink46" w:history="1">
         <w:r>
           <w:rPr>
             <w:rFonts w:ascii="Calibri" w:hAnsi="Calibri" w:cs="Calibri"/>
@@ -24597,7 +24716,7 @@
         </w:rPr>
         <w:t xml:space="preserve"> Baseline. One fingerprinted authority and renderer now serve homepage merchandising, collection/results, related products, and legacy compatibility. Five meaningful anatomies preserve canonical facts and P10B-04 media lineage through plan, proposal, snapshot, save/reload, publish, and responsive browser evidence. See </w:t>
       </w:r>
-      <w:hyperlink r:id="rIdHyperlink45" w:history="1">
+      <w:hyperlink r:id="rIdHyperlink47" w:history="1">
         <w:r>
           <w:rPr>
             <w:rFonts w:ascii="Calibri" w:hAnsi="Calibri" w:cs="Calibri"/>
@@ -24814,7 +24933,7 @@
         </w:rPr>
         <w:t xml:space="preserve"> Baseline. Six versioned, structurally fingerprinted homepage PageBlueprint profiles compose current shared-frame, commercial storytelling, canonical product-card, approved-media, and Design DNA authority. Evidence/cardinality guards fail closed; deterministic lifecycle and 24 retained four-width browser images pass. See </w:t>
       </w:r>
-      <w:hyperlink r:id="rIdHyperlink46" w:history="1">
+      <w:hyperlink r:id="rIdHyperlink48" w:history="1">
         <w:r>
           <w:rPr>
             <w:rFonts w:ascii="Calibri" w:hAnsi="Calibri" w:cs="Calibri"/>
@@ -25045,7 +25164,7 @@
         </w:rPr>
         <w:t xml:space="preserve"> anatomy, P10B-08 canonical card anatomy, and P10B-04 approved media treatment. Exact canonical catalogue bindings preserve product membership/order, facts, product media, filters/sort state, and child-collection order. Campaign media is approved collection/editorial media, not a product-media replacement. A transient revision-checked zero-result context keeps the query without fabricating products. Deterministic lifecycle and 16-view Chromium evidence pass with zero provider calls. See </w:t>
       </w:r>
-      <w:hyperlink r:id="rIdHyperlink47" w:history="1">
+      <w:hyperlink r:id="rIdHyperlink49" w:history="1">
         <w:r>
           <w:rPr>
             <w:rFonts w:ascii="Calibri" w:hAnsi="Calibri" w:cs="Calibri"/>
@@ -25575,7 +25694,7 @@
         </w:rPr>
         <w:t xml:space="preserve">. Fifteen structurally distinct registered profiles resolve exact current approved brief evidence into strict localized fact documents. P10B-05 preserves page-set, route, locale, and transitive navigation authority; P10B-06 frames and P10B-07 editorial/campaign renderers are reused. Snapshot save/reload and deterministic publication preserve the exact document. See </w:t>
       </w:r>
-      <w:hyperlink r:id="rIdHyperlink48" w:history="1">
+      <w:hyperlink r:id="rIdHyperlink50" w:history="1">
         <w:r>
           <w:rPr>
             <w:rFonts w:ascii="Calibri" w:hAnsi="Calibri" w:cs="Calibri"/>
@@ -25786,7 +25905,7 @@
         </w:rPr>
         <w:t xml:space="preserve"> component through the P10B-05 family page; registered loading state renders on its pending route instead of replacing the 404 singleton. Read-only runtime state supplies canonical cart facts, checkout continuation, P10B-10 query/filter context, and bounded recovery actions while the snapshot preserves presentation only. Shared-frame/Design DNA, save/reload, publication, four- width browser evidence, and no-provider behavior are covered under </w:t>
       </w:r>
-      <w:hyperlink r:id="rIdHyperlink49" w:history="1">
+      <w:hyperlink r:id="rIdHyperlink51" w:history="1">
         <w:r>
           <w:rPr>
             <w:rFonts w:ascii="Calibri" w:hAnsi="Calibri" w:cs="Calibri"/>
@@ -25997,7 +26116,7 @@
         </w:rPr>
         <w:t xml:space="preserve"> frame span all pages; simple/configurable PDP, factual content, utility states, 15 four-width/representative screenshots and the passing 160-scenario human record are retained in </w:t>
       </w:r>
-      <w:hyperlink r:id="rIdHyperlink50" w:history="1">
+      <w:hyperlink r:id="rIdHyperlink52" w:history="1">
         <w:r>
           <w:rPr>
             <w:rFonts w:ascii="Calibri" w:hAnsi="Calibri" w:cs="Calibri"/>
@@ -26208,7 +26327,7 @@
         </w:rPr>
         <w:t xml:space="preserve"> One versioned deterministic synthesis contract binds exact merchant, evidence, commerce, asset, Design DNA, site-map, frame, PageBlueprint/profile, component/anatomy, narrative, density, art-direction, responsive, planner, registry and recipe authority. The same approved fixture produces editorial-heavy, commerce/discovery-heavy and restrained/minimal complete 17-route stores through the existing whole-storefront proposal, snapshot, save/reload, renderer and immutable publication chain. Details are retained in </w:t>
       </w:r>
-      <w:hyperlink r:id="rIdHyperlink51" w:history="1">
+      <w:hyperlink r:id="rIdHyperlink53" w:history="1">
         <w:r>
           <w:rPr>
             <w:rFonts w:ascii="Calibri" w:hAnsi="Calibri" w:cs="Calibri"/>
@@ -26453,7 +26572,7 @@
         </w:rPr>
         <w:t xml:space="preserve"> 31 focused unit/integration cases; nine representative complete outcomes; exact save/reload and compiled publication; protected commerce/evidence/media parity; dedicated 375/768/1024/1440 browser coverage; three retained human commercial reviews and one exact evidence manifest. See </w:t>
       </w:r>
-      <w:hyperlink r:id="rIdHyperlink52" w:history="1">
+      <w:hyperlink r:id="rIdHyperlink54" w:history="1">
         <w:r>
           <w:rPr>
             <w:rFonts w:ascii="Calibri" w:hAnsi="Calibri" w:cs="Calibri"/>
@@ -26630,7 +26749,7 @@
         </w:rPr>
         <w:t xml:space="preserve"> A compact route inventory, four collection/search archetypes, four maintained PDP profiles plus generic fallback, exact collection and product-type mappings, bounded matching rules, transient editor/runtime projection, deterministic legacy convergence, and complete snapshot/lifecycle/publication preservation. Exact primary and related-product bindings survive convergence. A server-owned, storefront-scoped proposal transition binds legacy and reviewed canonical projections for deterministic acceptance replay. Storefront Studio lists archetypes rather than one page per commerce URL; representative context is not persisted. See </w:t>
       </w:r>
-      <w:hyperlink r:id="rIdHyperlink53" w:history="1">
+      <w:hyperlink r:id="rIdHyperlink55" w:history="1">
         <w:r>
           <w:rPr>
             <w:rFonts w:ascii="Calibri" w:hAnsi="Calibri" w:cs="Calibri"/>
@@ -27098,7 +27217,7 @@
         </w:rPr>
         <w:t xml:space="preserve"> </w:t>
       </w:r>
-      <w:hyperlink r:id="rIdHyperlink54" w:history="1">
+      <w:hyperlink r:id="rIdHyperlink56" w:history="1">
         <w:r>
           <w:rPr>
             <w:rFonts w:ascii="Calibri" w:hAnsi="Calibri" w:cs="Calibri"/>
@@ -27559,7 +27678,7 @@
         </w:rPr>
         <w:t xml:space="preserve">. Completed 15 August 2026; see </w:t>
       </w:r>
-      <w:hyperlink r:id="rIdHyperlink37" w:history="1">
+      <w:hyperlink r:id="rIdHyperlink39" w:history="1">
         <w:r>
           <w:rPr>
             <w:rFonts w:ascii="Calibri" w:hAnsi="Calibri" w:cs="Calibri"/>
@@ -28821,7 +28940,7 @@
         </w:rPr>
         <w:t xml:space="preserve">. Accepted by the product owner on 16 August 2026 under </w:t>
       </w:r>
-      <w:hyperlink r:id="rIdHyperlink55" w:history="1">
+      <w:hyperlink r:id="rIdHyperlink57" w:history="1">
         <w:r>
           <w:rPr>
             <w:rFonts w:ascii="Calibri" w:hAnsi="Calibri" w:cs="Calibri"/>
@@ -29179,7 +29298,7 @@
         </w:rPr>
         <w:t xml:space="preserve">. Accepted by the product owner on 17 August 2026 under </w:t>
       </w:r>
-      <w:hyperlink r:id="rIdHyperlink55" w:history="1">
+      <w:hyperlink r:id="rIdHyperlink57" w:history="1">
         <w:r>
           <w:rPr>
             <w:rFonts w:ascii="Calibri" w:hAnsi="Calibri" w:cs="Calibri"/>
@@ -32319,7 +32438,7 @@
         </w:rPr>
         <w:t xml:space="preserve"> </w:t>
       </w:r>
-      <w:hyperlink r:id="rIdHyperlink56" w:history="1">
+      <w:hyperlink r:id="rIdHyperlink58" w:history="1">
         <w:r>
           <w:rPr>
             <w:rFonts w:ascii="Calibri" w:hAnsi="Calibri" w:cs="Calibri"/>
@@ -32335,7 +32454,7 @@
         </w:rPr>
         <w:t xml:space="preserve"> and </w:t>
       </w:r>
-      <w:hyperlink r:id="rIdHyperlink57" w:history="1">
+      <w:hyperlink r:id="rIdHyperlink59" w:history="1">
         <w:r>
           <w:rPr>
             <w:rFonts w:ascii="Calibri" w:hAnsi="Calibri" w:cs="Calibri"/>

</xml_diff>

<commit_message>
AR-02L: isolate semantic feature metadata imports
</commit_message>
<xml_diff>
--- a/docs/VESKIFY_DEVELOPMENT_DELIVERY_TRACKER_v1.3.0.docx
+++ b/docs/VESKIFY_DEVELOPMENT_DELIVERY_TRACKER_v1.3.0.docx
@@ -51,7 +51,7 @@
         <w:rPr>
           <w:rFonts w:ascii="Calibri" w:hAnsi="Calibri" w:cs="Calibri"/>
         </w:rPr>
-        <w:t>Effective upon independently verified AR-02K acceptance/merge: AR-02A through AR-02K Baseline / closed; AR-02 Partial with the semantic-capability-features metadata edge remaining; AR-03 and AR-03A through AR-03E remain closed; AR-04/AR-05 dependency-blocked and unstarted; AR-06 depends on AR-05; AR-23 eligible / unstarted; BATCH-08 complete after K merge and safe closeout; no next task</w:t>
+        <w:t>Effective upon independently verified AR-02L acceptance/merge: AR-02A through AR-02L Baseline / closed; AR-02 Partial with the coordinated-direction metadata path remaining; AR-03 and AR-03A through AR-03E remain closed; AR-04/AR-05 dependency-blocked and unstarted; AR-06 depends on AR-05; AR-23 eligible / unstarted; BATCH-09 complete after L merge and safe closeout; no next task</w:t>
       </w:r>
     </w:p>
     <w:p>
@@ -118,7 +118,7 @@
           <w:b/>
           <w:bCs/>
         </w:rPr>
-        <w:t>Candidate status effective upon explicit owner acceptance/merge of AR-02K:</w:t>
+        <w:t>Candidate status effective upon explicit owner acceptance/merge of AR-02L:</w:t>
       </w:r>
       <w:r>
         <w:rPr>
@@ -314,6 +314,20 @@
           <w:b/>
           <w:bCs/>
         </w:rPr>
+        <w:t>Baseline / closed.</w:t>
+      </w:r>
+      <w:r>
+        <w:rPr>
+          <w:rFonts w:ascii="Calibri" w:hAnsi="Calibri" w:cs="Calibri"/>
+        </w:rPr>
+        <w:t xml:space="preserve"> AR-02L is </w:t>
+      </w:r>
+      <w:r>
+        <w:rPr>
+          <w:rFonts w:ascii="Calibri" w:hAnsi="Calibri" w:cs="Calibri"/>
+          <w:b/>
+          <w:bCs/>
+        </w:rPr>
         <w:t>Baseline / closed upon explicit owner acceptance/merge.</w:t>
       </w:r>
       <w:r>
@@ -334,7 +348,7 @@
         <w:rPr>
           <w:rFonts w:ascii="Calibri" w:hAnsi="Calibri" w:cs="Calibri"/>
         </w:rPr>
-        <w:t xml:space="preserve">; the semantic-capability-features.ts metadata dependency remains mapped in AR_02_BOUNDARY_ACCEPTANCE.md. AR-04/AR-05 remain dependency-blocked. AR-03 is </w:t>
+        <w:t xml:space="preserve">; the coordinated-direction metadata dependency remains mapped in AR_02_BOUNDARY_ACCEPTANCE.md. AR-04/AR-05 remain dependency-blocked. AR-03 is </w:t>
       </w:r>
       <w:r>
         <w:rPr>
@@ -432,7 +446,7 @@
         <w:rPr>
           <w:rFonts w:ascii="Calibri" w:hAnsi="Calibri" w:cs="Calibri"/>
         </w:rPr>
-        <w:t xml:space="preserve">. AR-23 depends on AR-01 and is not serialized behind visual work. BATCH-03 is complete. BATCH-04 is complete. BATCH-05 is complete. BATCH-06 is complete. BATCH-07 is complete. BATCH-08 is complete upon AR-02K acceptance/merge and safe closeout. No next reset task is selected. No third task is authorized. This tracker owns current status; the roadmap owns dependency order. Retained B01 exact-next, fixed-two-call/mandatory-three-concept, transient-only, and 73-child future-sequence statements are </w:t>
+        <w:t xml:space="preserve">. AR-23 depends on AR-01 and is not serialized behind visual work. BATCH-03 is complete. BATCH-04 is complete. BATCH-05 is complete. BATCH-06 is complete. BATCH-07 is complete. BATCH-08 is complete. BATCH-09 is complete upon AR-02L acceptance/merge and safe closeout. No next reset task is selected. No third task is authorized. This tracker owns current status; the roadmap owns dependency order. Retained B01 exact-next, fixed-two-call/mandatory-three-concept, transient-only, and 73-child future-sequence statements are </w:t>
       </w:r>
       <w:r>
         <w:rPr>
@@ -969,7 +983,7 @@
               <w:rPr>
                 <w:rFonts w:ascii="Calibri" w:hAnsi="Calibri" w:cs="Calibri"/>
               </w:rPr>
-              <w:t>Status; K conditional on independent acceptance/merge</w:t>
+              <w:t>Status; L conditional on independent acceptance/merge</w:t>
             </w:r>
           </w:p>
         </w:tc>
@@ -2245,7 +2259,7 @@
                 <w:b/>
                 <w:bCs/>
               </w:rPr>
-              <w:t>Baseline / closed upon explicit owner acceptance/merge</w:t>
+              <w:t>Baseline / closed</w:t>
             </w:r>
           </w:p>
         </w:tc>
@@ -2268,7 +2282,7 @@
               <w:rPr>
                 <w:rFonts w:ascii="Calibri" w:hAnsi="Calibri" w:cs="Calibri"/>
               </w:rPr>
-              <w:t>AR-03B</w:t>
+              <w:t>AR-02L</w:t>
             </w:r>
           </w:p>
         </w:tc>
@@ -2286,7 +2300,7 @@
               <w:rPr>
                 <w:rFonts w:ascii="Calibri" w:hAnsi="Calibri" w:cs="Calibri"/>
               </w:rPr>
-              <w:t>AR-03</w:t>
+              <w:t>AR-02</w:t>
             </w:r>
           </w:p>
         </w:tc>
@@ -2304,7 +2318,7 @@
               <w:rPr>
                 <w:rFonts w:ascii="Calibri" w:hAnsi="Calibri" w:cs="Calibri"/>
               </w:rPr>
-              <w:t xml:space="preserve">Renderer-free presentation construction and exact historical compatibility; </w:t>
+              <w:t xml:space="preserve">Renderer-free semantic feature metadata; </w:t>
             </w:r>
             <w:hyperlink r:id="rIdHyperlink28" w:history="1">
               <w:r>
@@ -2350,7 +2364,7 @@
                 <w:b/>
                 <w:bCs/>
               </w:rPr>
-              <w:t>Baseline / closed</w:t>
+              <w:t>Baseline / closed upon explicit owner acceptance/merge</w:t>
             </w:r>
           </w:p>
         </w:tc>
@@ -2373,7 +2387,7 @@
               <w:rPr>
                 <w:rFonts w:ascii="Calibri" w:hAnsi="Calibri" w:cs="Calibri"/>
               </w:rPr>
-              <w:t>AR-03C</w:t>
+              <w:t>AR-03B</w:t>
             </w:r>
           </w:p>
         </w:tc>
@@ -2409,7 +2423,7 @@
               <w:rPr>
                 <w:rFonts w:ascii="Calibri" w:hAnsi="Calibri" w:cs="Calibri"/>
               </w:rPr>
-              <w:t xml:space="preserve">Current-authority validation, route projection/resolution and four preview import cutovers; </w:t>
+              <w:t xml:space="preserve">Renderer-free presentation construction and exact historical compatibility; </w:t>
             </w:r>
             <w:hyperlink r:id="rIdHyperlink30" w:history="1">
               <w:r>
@@ -2478,7 +2492,7 @@
               <w:rPr>
                 <w:rFonts w:ascii="Calibri" w:hAnsi="Calibri" w:cs="Calibri"/>
               </w:rPr>
-              <w:t>AR-03D</w:t>
+              <w:t>AR-03C</w:t>
             </w:r>
           </w:p>
         </w:tc>
@@ -2514,7 +2528,7 @@
               <w:rPr>
                 <w:rFonts w:ascii="Calibri" w:hAnsi="Calibri" w:cs="Calibri"/>
               </w:rPr>
-              <w:t xml:space="preserve">Design-selection contracts/operations and editor projection with three named consumer cutovers; </w:t>
+              <w:t xml:space="preserve">Current-authority validation, route projection/resolution and four preview import cutovers; </w:t>
             </w:r>
             <w:hyperlink r:id="rIdHyperlink32" w:history="1">
               <w:r>
@@ -2583,7 +2597,7 @@
               <w:rPr>
                 <w:rFonts w:ascii="Calibri" w:hAnsi="Calibri" w:cs="Calibri"/>
               </w:rPr>
-              <w:t>AR-03E</w:t>
+              <w:t>AR-03D</w:t>
             </w:r>
           </w:p>
         </w:tc>
@@ -2619,7 +2633,7 @@
               <w:rPr>
                 <w:rFonts w:ascii="Calibri" w:hAnsi="Calibri" w:cs="Calibri"/>
               </w:rPr>
-              <w:t xml:space="preserve">Legacy migration, distinct transient projections and shared bridge schemas; </w:t>
+              <w:t xml:space="preserve">Design-selection contracts/operations and editor projection with three named consumer cutovers; </w:t>
             </w:r>
             <w:hyperlink r:id="rIdHyperlink34" w:history="1">
               <w:r>
@@ -2647,13 +2661,118 @@
                 <w:t>report</w:t>
               </w:r>
             </w:hyperlink>
+          </w:p>
+        </w:tc>
+        <w:tc>
+          <w:tcPr>
+            <w:tcW w:w="8460" w:type="dxa"/>
+            <w:vAlign w:val="center"/>
+          </w:tcPr>
+          <w:p>
+            <w:pPr>
+              <w:pStyle w:val="TableText"/>
+              <w:widowControl/>
+            </w:pPr>
+            <w:r>
+              <w:rPr>
+                <w:rFonts w:ascii="Calibri" w:hAnsi="Calibri" w:cs="Calibri"/>
+                <w:b/>
+                <w:bCs/>
+              </w:rPr>
+              <w:t>Baseline / closed</w:t>
+            </w:r>
+          </w:p>
+        </w:tc>
+      </w:tr>
+      <w:tr>
+        <w:trPr>
+          <w:cantSplit/>
+        </w:trPr>
+        <w:tc>
+          <w:tcPr>
+            <w:tcW w:w="1000" w:type="dxa"/>
+            <w:vAlign w:val="center"/>
+          </w:tcPr>
+          <w:p>
+            <w:pPr>
+              <w:pStyle w:val="TableText"/>
+              <w:widowControl/>
+            </w:pPr>
+            <w:r>
+              <w:rPr>
+                <w:rFonts w:ascii="Calibri" w:hAnsi="Calibri" w:cs="Calibri"/>
+              </w:rPr>
+              <w:t>AR-03E</w:t>
+            </w:r>
+          </w:p>
+        </w:tc>
+        <w:tc>
+          <w:tcPr>
+            <w:tcW w:w="1500" w:type="dxa"/>
+            <w:vAlign w:val="center"/>
+          </w:tcPr>
+          <w:p>
+            <w:pPr>
+              <w:pStyle w:val="TableText"/>
+              <w:widowControl/>
+            </w:pPr>
+            <w:r>
+              <w:rPr>
+                <w:rFonts w:ascii="Calibri" w:hAnsi="Calibri" w:cs="Calibri"/>
+              </w:rPr>
+              <w:t>AR-03</w:t>
+            </w:r>
+          </w:p>
+        </w:tc>
+        <w:tc>
+          <w:tcPr>
+            <w:tcW w:w="2000" w:type="dxa"/>
+            <w:vAlign w:val="center"/>
+          </w:tcPr>
+          <w:p>
+            <w:pPr>
+              <w:pStyle w:val="TableText"/>
+              <w:widowControl/>
+            </w:pPr>
+            <w:r>
+              <w:rPr>
+                <w:rFonts w:ascii="Calibri" w:hAnsi="Calibri" w:cs="Calibri"/>
+              </w:rPr>
+              <w:t xml:space="preserve">Legacy migration, distinct transient projections and shared bridge schemas; </w:t>
+            </w:r>
+            <w:hyperlink r:id="rIdHyperlink36" w:history="1">
+              <w:r>
+                <w:rPr>
+                  <w:rFonts w:ascii="Calibri" w:hAnsi="Calibri" w:cs="Calibri"/>
+                  <w:color w:val="2E74B5"/>
+                  <w:u w:val="single"/>
+                </w:rPr>
+                <w:t>contract</w:t>
+              </w:r>
+            </w:hyperlink>
             <w:r>
               <w:rPr>
                 <w:rFonts w:ascii="Calibri" w:hAnsi="Calibri" w:cs="Calibri"/>
               </w:rPr>
               <w:t xml:space="preserve">, </w:t>
             </w:r>
-            <w:hyperlink r:id="rIdHyperlink36" w:history="1">
+            <w:hyperlink r:id="rIdHyperlink37" w:history="1">
+              <w:r>
+                <w:rPr>
+                  <w:rFonts w:ascii="Calibri" w:hAnsi="Calibri" w:cs="Calibri"/>
+                  <w:color w:val="2E74B5"/>
+                  <w:u w:val="single"/>
+                </w:rPr>
+                <w:t>report</w:t>
+              </w:r>
+            </w:hyperlink>
+            <w:r>
+              <w:rPr>
+                <w:rFonts w:ascii="Calibri" w:hAnsi="Calibri" w:cs="Calibri"/>
+              </w:rPr>
+              <w:t xml:space="preserve">, </w:t>
+            </w:r>
+            <w:hyperlink r:id="rIdHyperlink38" w:history="1">
               <w:r>
                 <w:rPr>
                   <w:rFonts w:ascii="Calibri" w:hAnsi="Calibri" w:cs="Calibri"/>
@@ -22617,7 +22736,7 @@
         </w:rPr>
         <w:t xml:space="preserve">. Completed 7 August 2026; see </w:t>
       </w:r>
-      <w:hyperlink r:id="rIdHyperlink37" w:history="1">
+      <w:hyperlink r:id="rIdHyperlink39" w:history="1">
         <w:r>
           <w:rPr>
             <w:rFonts w:ascii="Calibri" w:hAnsi="Calibri" w:cs="Calibri"/>
@@ -22754,7 +22873,7 @@
         </w:rPr>
         <w:t xml:space="preserve">The binding details and minimum coverage are in </w:t>
       </w:r>
-      <w:hyperlink r:id="rIdHyperlink38" w:history="1">
+      <w:hyperlink r:id="rIdHyperlink40" w:history="1">
         <w:r>
           <w:rPr>
             <w:rFonts w:ascii="Calibri" w:hAnsi="Calibri" w:cs="Calibri"/>
@@ -22952,7 +23071,7 @@
         </w:rPr>
         <w:t xml:space="preserve">. P10B-16P-04 acceptance evidence is retained in </w:t>
       </w:r>
-      <w:hyperlink r:id="rIdHyperlink39" w:history="1">
+      <w:hyperlink r:id="rIdHyperlink41" w:history="1">
         <w:r>
           <w:rPr>
             <w:rFonts w:ascii="Calibri" w:hAnsi="Calibri" w:cs="Calibri"/>
@@ -23201,7 +23320,7 @@
         </w:rPr>
         <w:t xml:space="preserve">. See </w:t>
       </w:r>
-      <w:hyperlink r:id="rIdHyperlink40" w:history="1">
+      <w:hyperlink r:id="rIdHyperlink42" w:history="1">
         <w:r>
           <w:rPr>
             <w:rFonts w:ascii="Calibri" w:hAnsi="Calibri" w:cs="Calibri"/>
@@ -23450,7 +23569,7 @@
         </w:rPr>
         <w:t xml:space="preserve">. See </w:t>
       </w:r>
-      <w:hyperlink r:id="rIdHyperlink41" w:history="1">
+      <w:hyperlink r:id="rIdHyperlink43" w:history="1">
         <w:r>
           <w:rPr>
             <w:rFonts w:ascii="Calibri" w:hAnsi="Calibri" w:cs="Calibri"/>
@@ -23699,7 +23818,7 @@
         </w:rPr>
         <w:t xml:space="preserve">. At P10B-03 delivery, all then-current 25 V2 definitions and 91 variants were classified explicitly without false commercial-ready promotion. Later family tasks extend that same authority rather than replacing it. See </w:t>
       </w:r>
-      <w:hyperlink r:id="rIdHyperlink42" w:history="1">
+      <w:hyperlink r:id="rIdHyperlink44" w:history="1">
         <w:r>
           <w:rPr>
             <w:rFonts w:ascii="Calibri" w:hAnsi="Calibri" w:cs="Calibri"/>
@@ -23948,7 +24067,7 @@
         </w:rPr>
         <w:t xml:space="preserve"> embeds exact lineage and bounded treatment in the existing approved presentation, consumes Design DNA and registered anatomy, projects protected same-product media, preserves authority through lifecycle/compiler boundaries, and renders semantic four-breakpoint evidence. Production CDN transforms and retained commercial visual acceptance remain deferred. See </w:t>
       </w:r>
-      <w:hyperlink r:id="rIdHyperlink43" w:history="1">
+      <w:hyperlink r:id="rIdHyperlink45" w:history="1">
         <w:r>
           <w:rPr>
             <w:rFonts w:ascii="Calibri" w:hAnsi="Calibri" w:cs="Calibri"/>
@@ -24197,7 +24316,7 @@
         </w:rPr>
         <w:t xml:space="preserve">. See </w:t>
       </w:r>
-      <w:hyperlink r:id="rIdHyperlink44" w:history="1">
+      <w:hyperlink r:id="rIdHyperlink46" w:history="1">
         <w:r>
           <w:rPr>
             <w:rFonts w:ascii="Calibri" w:hAnsi="Calibri" w:cs="Calibri"/>
@@ -24432,7 +24551,7 @@
         </w:rPr>
         <w:t xml:space="preserve">. Four exact root-frame profiles, three mobile modes, and four footer compositions preserve canonical navigation and frame identity through snapshot, save/reload, Puck root, preview, publication compilation, EN/FI, and 375/768/1024/1440 px evidence. See </w:t>
       </w:r>
-      <w:hyperlink r:id="rIdHyperlink45" w:history="1">
+      <w:hyperlink r:id="rIdHyperlink47" w:history="1">
         <w:r>
           <w:rPr>
             <w:rFonts w:ascii="Calibri" w:hAnsi="Calibri" w:cs="Calibri"/>
@@ -24667,7 +24786,7 @@
         </w:rPr>
         <w:t xml:space="preserve">. Six meaningful hero anatomies, five editorial/story anatomies, five campaign/promotion anatomies and three evidence-grounded proof/service anatomies are registered, PageBlueprint-selectable, deterministically generated, snapshot/publish preserved and rendered through one shared implementation. Focused deterministic coverage and a zero-provider Chromium scenario retain evidence at 375, 768, 1024 and 1440 px. See </w:t>
       </w:r>
-      <w:hyperlink r:id="rIdHyperlink46" w:history="1">
+      <w:hyperlink r:id="rIdHyperlink48" w:history="1">
         <w:r>
           <w:rPr>
             <w:rFonts w:ascii="Calibri" w:hAnsi="Calibri" w:cs="Calibri"/>
@@ -24716,7 +24835,7 @@
         </w:rPr>
         <w:t xml:space="preserve"> Baseline. One fingerprinted authority and renderer now serve homepage merchandising, collection/results, related products, and legacy compatibility. Five meaningful anatomies preserve canonical facts and P10B-04 media lineage through plan, proposal, snapshot, save/reload, publish, and responsive browser evidence. See </w:t>
       </w:r>
-      <w:hyperlink r:id="rIdHyperlink47" w:history="1">
+      <w:hyperlink r:id="rIdHyperlink49" w:history="1">
         <w:r>
           <w:rPr>
             <w:rFonts w:ascii="Calibri" w:hAnsi="Calibri" w:cs="Calibri"/>
@@ -24933,7 +25052,7 @@
         </w:rPr>
         <w:t xml:space="preserve"> Baseline. Six versioned, structurally fingerprinted homepage PageBlueprint profiles compose current shared-frame, commercial storytelling, canonical product-card, approved-media, and Design DNA authority. Evidence/cardinality guards fail closed; deterministic lifecycle and 24 retained four-width browser images pass. See </w:t>
       </w:r>
-      <w:hyperlink r:id="rIdHyperlink48" w:history="1">
+      <w:hyperlink r:id="rIdHyperlink50" w:history="1">
         <w:r>
           <w:rPr>
             <w:rFonts w:ascii="Calibri" w:hAnsi="Calibri" w:cs="Calibri"/>
@@ -25164,7 +25283,7 @@
         </w:rPr>
         <w:t xml:space="preserve"> anatomy, P10B-08 canonical card anatomy, and P10B-04 approved media treatment. Exact canonical catalogue bindings preserve product membership/order, facts, product media, filters/sort state, and child-collection order. Campaign media is approved collection/editorial media, not a product-media replacement. A transient revision-checked zero-result context keeps the query without fabricating products. Deterministic lifecycle and 16-view Chromium evidence pass with zero provider calls. See </w:t>
       </w:r>
-      <w:hyperlink r:id="rIdHyperlink49" w:history="1">
+      <w:hyperlink r:id="rIdHyperlink51" w:history="1">
         <w:r>
           <w:rPr>
             <w:rFonts w:ascii="Calibri" w:hAnsi="Calibri" w:cs="Calibri"/>
@@ -25694,7 +25813,7 @@
         </w:rPr>
         <w:t xml:space="preserve">. Fifteen structurally distinct registered profiles resolve exact current approved brief evidence into strict localized fact documents. P10B-05 preserves page-set, route, locale, and transitive navigation authority; P10B-06 frames and P10B-07 editorial/campaign renderers are reused. Snapshot save/reload and deterministic publication preserve the exact document. See </w:t>
       </w:r>
-      <w:hyperlink r:id="rIdHyperlink50" w:history="1">
+      <w:hyperlink r:id="rIdHyperlink52" w:history="1">
         <w:r>
           <w:rPr>
             <w:rFonts w:ascii="Calibri" w:hAnsi="Calibri" w:cs="Calibri"/>
@@ -25905,7 +26024,7 @@
         </w:rPr>
         <w:t xml:space="preserve"> component through the P10B-05 family page; registered loading state renders on its pending route instead of replacing the 404 singleton. Read-only runtime state supplies canonical cart facts, checkout continuation, P10B-10 query/filter context, and bounded recovery actions while the snapshot preserves presentation only. Shared-frame/Design DNA, save/reload, publication, four- width browser evidence, and no-provider behavior are covered under </w:t>
       </w:r>
-      <w:hyperlink r:id="rIdHyperlink51" w:history="1">
+      <w:hyperlink r:id="rIdHyperlink53" w:history="1">
         <w:r>
           <w:rPr>
             <w:rFonts w:ascii="Calibri" w:hAnsi="Calibri" w:cs="Calibri"/>
@@ -26116,7 +26235,7 @@
         </w:rPr>
         <w:t xml:space="preserve"> frame span all pages; simple/configurable PDP, factual content, utility states, 15 four-width/representative screenshots and the passing 160-scenario human record are retained in </w:t>
       </w:r>
-      <w:hyperlink r:id="rIdHyperlink52" w:history="1">
+      <w:hyperlink r:id="rIdHyperlink54" w:history="1">
         <w:r>
           <w:rPr>
             <w:rFonts w:ascii="Calibri" w:hAnsi="Calibri" w:cs="Calibri"/>
@@ -26327,7 +26446,7 @@
         </w:rPr>
         <w:t xml:space="preserve"> One versioned deterministic synthesis contract binds exact merchant, evidence, commerce, asset, Design DNA, site-map, frame, PageBlueprint/profile, component/anatomy, narrative, density, art-direction, responsive, planner, registry and recipe authority. The same approved fixture produces editorial-heavy, commerce/discovery-heavy and restrained/minimal complete 17-route stores through the existing whole-storefront proposal, snapshot, save/reload, renderer and immutable publication chain. Details are retained in </w:t>
       </w:r>
-      <w:hyperlink r:id="rIdHyperlink53" w:history="1">
+      <w:hyperlink r:id="rIdHyperlink55" w:history="1">
         <w:r>
           <w:rPr>
             <w:rFonts w:ascii="Calibri" w:hAnsi="Calibri" w:cs="Calibri"/>
@@ -26572,7 +26691,7 @@
         </w:rPr>
         <w:t xml:space="preserve"> 31 focused unit/integration cases; nine representative complete outcomes; exact save/reload and compiled publication; protected commerce/evidence/media parity; dedicated 375/768/1024/1440 browser coverage; three retained human commercial reviews and one exact evidence manifest. See </w:t>
       </w:r>
-      <w:hyperlink r:id="rIdHyperlink54" w:history="1">
+      <w:hyperlink r:id="rIdHyperlink56" w:history="1">
         <w:r>
           <w:rPr>
             <w:rFonts w:ascii="Calibri" w:hAnsi="Calibri" w:cs="Calibri"/>
@@ -26749,7 +26868,7 @@
         </w:rPr>
         <w:t xml:space="preserve"> A compact route inventory, four collection/search archetypes, four maintained PDP profiles plus generic fallback, exact collection and product-type mappings, bounded matching rules, transient editor/runtime projection, deterministic legacy convergence, and complete snapshot/lifecycle/publication preservation. Exact primary and related-product bindings survive convergence. A server-owned, storefront-scoped proposal transition binds legacy and reviewed canonical projections for deterministic acceptance replay. Storefront Studio lists archetypes rather than one page per commerce URL; representative context is not persisted. See </w:t>
       </w:r>
-      <w:hyperlink r:id="rIdHyperlink55" w:history="1">
+      <w:hyperlink r:id="rIdHyperlink57" w:history="1">
         <w:r>
           <w:rPr>
             <w:rFonts w:ascii="Calibri" w:hAnsi="Calibri" w:cs="Calibri"/>
@@ -27217,7 +27336,7 @@
         </w:rPr>
         <w:t xml:space="preserve"> </w:t>
       </w:r>
-      <w:hyperlink r:id="rIdHyperlink56" w:history="1">
+      <w:hyperlink r:id="rIdHyperlink58" w:history="1">
         <w:r>
           <w:rPr>
             <w:rFonts w:ascii="Calibri" w:hAnsi="Calibri" w:cs="Calibri"/>
@@ -27678,7 +27797,7 @@
         </w:rPr>
         <w:t xml:space="preserve">. Completed 15 August 2026; see </w:t>
       </w:r>
-      <w:hyperlink r:id="rIdHyperlink39" w:history="1">
+      <w:hyperlink r:id="rIdHyperlink41" w:history="1">
         <w:r>
           <w:rPr>
             <w:rFonts w:ascii="Calibri" w:hAnsi="Calibri" w:cs="Calibri"/>
@@ -28940,7 +29059,7 @@
         </w:rPr>
         <w:t xml:space="preserve">. Accepted by the product owner on 16 August 2026 under </w:t>
       </w:r>
-      <w:hyperlink r:id="rIdHyperlink57" w:history="1">
+      <w:hyperlink r:id="rIdHyperlink59" w:history="1">
         <w:r>
           <w:rPr>
             <w:rFonts w:ascii="Calibri" w:hAnsi="Calibri" w:cs="Calibri"/>
@@ -29298,7 +29417,7 @@
         </w:rPr>
         <w:t xml:space="preserve">. Accepted by the product owner on 17 August 2026 under </w:t>
       </w:r>
-      <w:hyperlink r:id="rIdHyperlink57" w:history="1">
+      <w:hyperlink r:id="rIdHyperlink59" w:history="1">
         <w:r>
           <w:rPr>
             <w:rFonts w:ascii="Calibri" w:hAnsi="Calibri" w:cs="Calibri"/>
@@ -32438,7 +32557,7 @@
         </w:rPr>
         <w:t xml:space="preserve"> </w:t>
       </w:r>
-      <w:hyperlink r:id="rIdHyperlink58" w:history="1">
+      <w:hyperlink r:id="rIdHyperlink60" w:history="1">
         <w:r>
           <w:rPr>
             <w:rFonts w:ascii="Calibri" w:hAnsi="Calibri" w:cs="Calibri"/>
@@ -32454,7 +32573,7 @@
         </w:rPr>
         <w:t xml:space="preserve"> and </w:t>
       </w:r>
-      <w:hyperlink r:id="rIdHyperlink59" w:history="1">
+      <w:hyperlink r:id="rIdHyperlink61" w:history="1">
         <w:r>
           <w:rPr>
             <w:rFonts w:ascii="Calibri" w:hAnsi="Calibri" w:cs="Calibri"/>

</xml_diff>